<commit_message>
Add a transformers backup slide and a simple-words bonus chapter to the study guide
</commit_message>
<xml_diff>
--- a/docs/oral_study_guide.docx
+++ b/docs/oral_study_guide.docx
@@ -93,7 +93,7 @@
     <w:sdt>
       <w:sdtPr>
         <w:alias w:val="Contents"/>
-        <w:id w:val="-555551702"/>
+        <w:id w:val="1062133137"/>
       </w:sdtPr>
       <w:sdtEndPr/>
       <w:sdtContent>
@@ -116,7 +116,7 @@
           <w:r>
             <w:fldChar w:fldCharType="separate"/>
           </w:r>
-          <w:hyperlink w:anchor="_Toc243404991" w:history="1">
+          <w:hyperlink w:anchor="_Toc243410287" w:history="1">
             <w:r>
               <w:rPr>
                 <w:rStyle w:val="Lienhypertexte"/>
@@ -140,7 +140,7 @@
               <w:rPr>
                 <w:noProof/>
               </w:rPr>
-              <w:instrText xml:space="preserve"> PAGEREF _Toc243404991 \h </w:instrText>
+              <w:instrText xml:space="preserve"> PAGEREF _Toc243410287 \h </w:instrText>
             </w:r>
             <w:r>
               <w:rPr>
@@ -177,7 +177,7 @@
               <w:noProof/>
             </w:rPr>
           </w:pPr>
-          <w:hyperlink w:anchor="_Toc243404992" w:history="1">
+          <w:hyperlink w:anchor="_Toc243410288" w:history="1">
             <w:r>
               <w:rPr>
                 <w:rStyle w:val="Lienhypertexte"/>
@@ -201,7 +201,7 @@
               <w:rPr>
                 <w:noProof/>
               </w:rPr>
-              <w:instrText xml:space="preserve"> PAGEREF _Toc243404992 \h </w:instrText>
+              <w:instrText xml:space="preserve"> PAGEREF _Toc243410288 \h </w:instrText>
             </w:r>
             <w:r>
               <w:rPr>
@@ -238,7 +238,7 @@
               <w:noProof/>
             </w:rPr>
           </w:pPr>
-          <w:hyperlink w:anchor="_Toc243404993" w:history="1">
+          <w:hyperlink w:anchor="_Toc243410289" w:history="1">
             <w:r>
               <w:rPr>
                 <w:rStyle w:val="Lienhypertexte"/>
@@ -262,7 +262,7 @@
               <w:rPr>
                 <w:noProof/>
               </w:rPr>
-              <w:instrText xml:space="preserve"> PAGEREF _Toc243404993 \h </w:instrText>
+              <w:instrText xml:space="preserve"> PAGEREF _Toc243410289 \h </w:instrText>
             </w:r>
             <w:r>
               <w:rPr>
@@ -299,7 +299,7 @@
               <w:noProof/>
             </w:rPr>
           </w:pPr>
-          <w:hyperlink w:anchor="_Toc243404994" w:history="1">
+          <w:hyperlink w:anchor="_Toc243410290" w:history="1">
             <w:r>
               <w:rPr>
                 <w:rStyle w:val="Lienhypertexte"/>
@@ -323,7 +323,7 @@
               <w:rPr>
                 <w:noProof/>
               </w:rPr>
-              <w:instrText xml:space="preserve"> PAGEREF _Toc243404994 \h </w:instrText>
+              <w:instrText xml:space="preserve"> PAGEREF _Toc243410290 \h </w:instrText>
             </w:r>
             <w:r>
               <w:rPr>
@@ -360,7 +360,7 @@
               <w:noProof/>
             </w:rPr>
           </w:pPr>
-          <w:hyperlink w:anchor="_Toc243404995" w:history="1">
+          <w:hyperlink w:anchor="_Toc243410291" w:history="1">
             <w:r>
               <w:rPr>
                 <w:rStyle w:val="Lienhypertexte"/>
@@ -384,7 +384,7 @@
               <w:rPr>
                 <w:noProof/>
               </w:rPr>
-              <w:instrText xml:space="preserve"> PAGEREF _Toc243404995 \h </w:instrText>
+              <w:instrText xml:space="preserve"> PAGEREF _Toc243410291 \h </w:instrText>
             </w:r>
             <w:r>
               <w:rPr>
@@ -421,7 +421,7 @@
               <w:noProof/>
             </w:rPr>
           </w:pPr>
-          <w:hyperlink w:anchor="_Toc243404996" w:history="1">
+          <w:hyperlink w:anchor="_Toc243410292" w:history="1">
             <w:r>
               <w:rPr>
                 <w:rStyle w:val="Lienhypertexte"/>
@@ -445,7 +445,7 @@
               <w:rPr>
                 <w:noProof/>
               </w:rPr>
-              <w:instrText xml:space="preserve"> PAGEREF _Toc243404996 \h </w:instrText>
+              <w:instrText xml:space="preserve"> PAGEREF _Toc243410292 \h </w:instrText>
             </w:r>
             <w:r>
               <w:rPr>
@@ -482,7 +482,7 @@
               <w:noProof/>
             </w:rPr>
           </w:pPr>
-          <w:hyperlink w:anchor="_Toc243404997" w:history="1">
+          <w:hyperlink w:anchor="_Toc243410293" w:history="1">
             <w:r>
               <w:rPr>
                 <w:rStyle w:val="Lienhypertexte"/>
@@ -506,7 +506,7 @@
               <w:rPr>
                 <w:noProof/>
               </w:rPr>
-              <w:instrText xml:space="preserve"> PAGEREF _Toc243404997 \h </w:instrText>
+              <w:instrText xml:space="preserve"> PAGEREF _Toc243410293 \h </w:instrText>
             </w:r>
             <w:r>
               <w:rPr>
@@ -543,7 +543,7 @@
               <w:noProof/>
             </w:rPr>
           </w:pPr>
-          <w:hyperlink w:anchor="_Toc243404998" w:history="1">
+          <w:hyperlink w:anchor="_Toc243410294" w:history="1">
             <w:r>
               <w:rPr>
                 <w:rStyle w:val="Lienhypertexte"/>
@@ -567,7 +567,7 @@
               <w:rPr>
                 <w:noProof/>
               </w:rPr>
-              <w:instrText xml:space="preserve"> PAGEREF _Toc243404998 \h </w:instrText>
+              <w:instrText xml:space="preserve"> PAGEREF _Toc243410294 \h </w:instrText>
             </w:r>
             <w:r>
               <w:rPr>
@@ -604,7 +604,7 @@
               <w:noProof/>
             </w:rPr>
           </w:pPr>
-          <w:hyperlink w:anchor="_Toc243404999" w:history="1">
+          <w:hyperlink w:anchor="_Toc243410295" w:history="1">
             <w:r>
               <w:rPr>
                 <w:rStyle w:val="Lienhypertexte"/>
@@ -628,7 +628,7 @@
               <w:rPr>
                 <w:noProof/>
               </w:rPr>
-              <w:instrText xml:space="preserve"> PAGEREF _Toc243404999 \h </w:instrText>
+              <w:instrText xml:space="preserve"> PAGEREF _Toc243410295 \h </w:instrText>
             </w:r>
             <w:r>
               <w:rPr>
@@ -665,7 +665,7 @@
               <w:noProof/>
             </w:rPr>
           </w:pPr>
-          <w:hyperlink w:anchor="_Toc243405000" w:history="1">
+          <w:hyperlink w:anchor="_Toc243410296" w:history="1">
             <w:r>
               <w:rPr>
                 <w:rStyle w:val="Lienhypertexte"/>
@@ -689,7 +689,7 @@
               <w:rPr>
                 <w:noProof/>
               </w:rPr>
-              <w:instrText xml:space="preserve"> PAGEREF _Toc243405000 \h </w:instrText>
+              <w:instrText xml:space="preserve"> PAGEREF _Toc243410296 \h </w:instrText>
             </w:r>
             <w:r>
               <w:rPr>
@@ -726,7 +726,7 @@
               <w:noProof/>
             </w:rPr>
           </w:pPr>
-          <w:hyperlink w:anchor="_Toc243405001" w:history="1">
+          <w:hyperlink w:anchor="_Toc243410297" w:history="1">
             <w:r>
               <w:rPr>
                 <w:rStyle w:val="Lienhypertexte"/>
@@ -750,7 +750,7 @@
               <w:rPr>
                 <w:noProof/>
               </w:rPr>
-              <w:instrText xml:space="preserve"> PAGEREF _Toc243405001 \h </w:instrText>
+              <w:instrText xml:space="preserve"> PAGEREF _Toc243410297 \h </w:instrText>
             </w:r>
             <w:r>
               <w:rPr>
@@ -787,7 +787,7 @@
               <w:noProof/>
             </w:rPr>
           </w:pPr>
-          <w:hyperlink w:anchor="_Toc243405002" w:history="1">
+          <w:hyperlink w:anchor="_Toc243410298" w:history="1">
             <w:r>
               <w:rPr>
                 <w:rStyle w:val="Lienhypertexte"/>
@@ -811,7 +811,7 @@
               <w:rPr>
                 <w:noProof/>
               </w:rPr>
-              <w:instrText xml:space="preserve"> PAGEREF _Toc243405002 \h </w:instrText>
+              <w:instrText xml:space="preserve"> PAGEREF _Toc243410298 \h </w:instrText>
             </w:r>
             <w:r>
               <w:rPr>
@@ -848,7 +848,7 @@
               <w:noProof/>
             </w:rPr>
           </w:pPr>
-          <w:hyperlink w:anchor="_Toc243405003" w:history="1">
+          <w:hyperlink w:anchor="_Toc243410299" w:history="1">
             <w:r>
               <w:rPr>
                 <w:rStyle w:val="Lienhypertexte"/>
@@ -872,7 +872,7 @@
               <w:rPr>
                 <w:noProof/>
               </w:rPr>
-              <w:instrText xml:space="preserve"> PAGEREF _Toc243405003 \h </w:instrText>
+              <w:instrText xml:space="preserve"> PAGEREF _Toc243410299 \h </w:instrText>
             </w:r>
             <w:r>
               <w:rPr>
@@ -909,7 +909,7 @@
               <w:noProof/>
             </w:rPr>
           </w:pPr>
-          <w:hyperlink w:anchor="_Toc243405004" w:history="1">
+          <w:hyperlink w:anchor="_Toc243410300" w:history="1">
             <w:r>
               <w:rPr>
                 <w:rStyle w:val="Lienhypertexte"/>
@@ -933,7 +933,7 @@
               <w:rPr>
                 <w:noProof/>
               </w:rPr>
-              <w:instrText xml:space="preserve"> PAGEREF _Toc243405004 \h </w:instrText>
+              <w:instrText xml:space="preserve"> PAGEREF _Toc243410300 \h </w:instrText>
             </w:r>
             <w:r>
               <w:rPr>
@@ -970,7 +970,7 @@
               <w:noProof/>
             </w:rPr>
           </w:pPr>
-          <w:hyperlink w:anchor="_Toc243405005" w:history="1">
+          <w:hyperlink w:anchor="_Toc243410301" w:history="1">
             <w:r>
               <w:rPr>
                 <w:rStyle w:val="Lienhypertexte"/>
@@ -994,7 +994,7 @@
               <w:rPr>
                 <w:noProof/>
               </w:rPr>
-              <w:instrText xml:space="preserve"> PAGEREF _Toc243405005 \h </w:instrText>
+              <w:instrText xml:space="preserve"> PAGEREF _Toc243410301 \h </w:instrText>
             </w:r>
             <w:r>
               <w:rPr>
@@ -1031,7 +1031,7 @@
               <w:noProof/>
             </w:rPr>
           </w:pPr>
-          <w:hyperlink w:anchor="_Toc243405006" w:history="1">
+          <w:hyperlink w:anchor="_Toc243410302" w:history="1">
             <w:r>
               <w:rPr>
                 <w:rStyle w:val="Lienhypertexte"/>
@@ -1055,7 +1055,7 @@
               <w:rPr>
                 <w:noProof/>
               </w:rPr>
-              <w:instrText xml:space="preserve"> PAGEREF _Toc243405006 \h </w:instrText>
+              <w:instrText xml:space="preserve"> PAGEREF _Toc243410302 \h </w:instrText>
             </w:r>
             <w:r>
               <w:rPr>
@@ -1092,7 +1092,7 @@
               <w:noProof/>
             </w:rPr>
           </w:pPr>
-          <w:hyperlink w:anchor="_Toc243405007" w:history="1">
+          <w:hyperlink w:anchor="_Toc243410303" w:history="1">
             <w:r>
               <w:rPr>
                 <w:rStyle w:val="Lienhypertexte"/>
@@ -1116,7 +1116,7 @@
               <w:rPr>
                 <w:noProof/>
               </w:rPr>
-              <w:instrText xml:space="preserve"> PAGEREF _Toc243405007 \h </w:instrText>
+              <w:instrText xml:space="preserve"> PAGEREF _Toc243410303 \h </w:instrText>
             </w:r>
             <w:r>
               <w:rPr>
@@ -1153,7 +1153,7 @@
               <w:noProof/>
             </w:rPr>
           </w:pPr>
-          <w:hyperlink w:anchor="_Toc243405008" w:history="1">
+          <w:hyperlink w:anchor="_Toc243410304" w:history="1">
             <w:r>
               <w:rPr>
                 <w:rStyle w:val="Lienhypertexte"/>
@@ -1177,7 +1177,7 @@
               <w:rPr>
                 <w:noProof/>
               </w:rPr>
-              <w:instrText xml:space="preserve"> PAGEREF _Toc243405008 \h </w:instrText>
+              <w:instrText xml:space="preserve"> PAGEREF _Toc243410304 \h </w:instrText>
             </w:r>
             <w:r>
               <w:rPr>
@@ -1214,7 +1214,7 @@
               <w:noProof/>
             </w:rPr>
           </w:pPr>
-          <w:hyperlink w:anchor="_Toc243405009" w:history="1">
+          <w:hyperlink w:anchor="_Toc243410305" w:history="1">
             <w:r>
               <w:rPr>
                 <w:rStyle w:val="Lienhypertexte"/>
@@ -1238,7 +1238,7 @@
               <w:rPr>
                 <w:noProof/>
               </w:rPr>
-              <w:instrText xml:space="preserve"> PAGEREF _Toc243405009 \h </w:instrText>
+              <w:instrText xml:space="preserve"> PAGEREF _Toc243410305 \h </w:instrText>
             </w:r>
             <w:r>
               <w:rPr>
@@ -1275,7 +1275,7 @@
               <w:noProof/>
             </w:rPr>
           </w:pPr>
-          <w:hyperlink w:anchor="_Toc243405010" w:history="1">
+          <w:hyperlink w:anchor="_Toc243410306" w:history="1">
             <w:r>
               <w:rPr>
                 <w:rStyle w:val="Lienhypertexte"/>
@@ -1299,7 +1299,7 @@
               <w:rPr>
                 <w:noProof/>
               </w:rPr>
-              <w:instrText xml:space="preserve"> PAGEREF _Toc243405010 \h </w:instrText>
+              <w:instrText xml:space="preserve"> PAGEREF _Toc243410306 \h </w:instrText>
             </w:r>
             <w:r>
               <w:rPr>
@@ -1336,7 +1336,7 @@
               <w:noProof/>
             </w:rPr>
           </w:pPr>
-          <w:hyperlink w:anchor="_Toc243405011" w:history="1">
+          <w:hyperlink w:anchor="_Toc243410307" w:history="1">
             <w:r>
               <w:rPr>
                 <w:rStyle w:val="Lienhypertexte"/>
@@ -1360,7 +1360,7 @@
               <w:rPr>
                 <w:noProof/>
               </w:rPr>
-              <w:instrText xml:space="preserve"> PAGEREF _Toc243405011 \h </w:instrText>
+              <w:instrText xml:space="preserve"> PAGEREF _Toc243410307 \h </w:instrText>
             </w:r>
             <w:r>
               <w:rPr>
@@ -1397,7 +1397,7 @@
               <w:noProof/>
             </w:rPr>
           </w:pPr>
-          <w:hyperlink w:anchor="_Toc243405012" w:history="1">
+          <w:hyperlink w:anchor="_Toc243410308" w:history="1">
             <w:r>
               <w:rPr>
                 <w:rStyle w:val="Lienhypertexte"/>
@@ -1421,7 +1421,7 @@
               <w:rPr>
                 <w:noProof/>
               </w:rPr>
-              <w:instrText xml:space="preserve"> PAGEREF _Toc243405012 \h </w:instrText>
+              <w:instrText xml:space="preserve"> PAGEREF _Toc243410308 \h </w:instrText>
             </w:r>
             <w:r>
               <w:rPr>
@@ -1458,7 +1458,7 @@
               <w:noProof/>
             </w:rPr>
           </w:pPr>
-          <w:hyperlink w:anchor="_Toc243405013" w:history="1">
+          <w:hyperlink w:anchor="_Toc243410309" w:history="1">
             <w:r>
               <w:rPr>
                 <w:rStyle w:val="Lienhypertexte"/>
@@ -1482,7 +1482,7 @@
               <w:rPr>
                 <w:noProof/>
               </w:rPr>
-              <w:instrText xml:space="preserve"> PAGEREF _Toc243405013 \h </w:instrText>
+              <w:instrText xml:space="preserve"> PAGEREF _Toc243410309 \h </w:instrText>
             </w:r>
             <w:r>
               <w:rPr>
@@ -1519,7 +1519,7 @@
               <w:noProof/>
             </w:rPr>
           </w:pPr>
-          <w:hyperlink w:anchor="_Toc243405014" w:history="1">
+          <w:hyperlink w:anchor="_Toc243410310" w:history="1">
             <w:r>
               <w:rPr>
                 <w:rStyle w:val="Lienhypertexte"/>
@@ -1543,7 +1543,7 @@
               <w:rPr>
                 <w:noProof/>
               </w:rPr>
-              <w:instrText xml:space="preserve"> PAGEREF _Toc243405014 \h </w:instrText>
+              <w:instrText xml:space="preserve"> PAGEREF _Toc243410310 \h </w:instrText>
             </w:r>
             <w:r>
               <w:rPr>
@@ -1580,7 +1580,7 @@
               <w:noProof/>
             </w:rPr>
           </w:pPr>
-          <w:hyperlink w:anchor="_Toc243405015" w:history="1">
+          <w:hyperlink w:anchor="_Toc243410311" w:history="1">
             <w:r>
               <w:rPr>
                 <w:rStyle w:val="Lienhypertexte"/>
@@ -1604,7 +1604,7 @@
               <w:rPr>
                 <w:noProof/>
               </w:rPr>
-              <w:instrText xml:space="preserve"> PAGEREF _Toc243405015 \h </w:instrText>
+              <w:instrText xml:space="preserve"> PAGEREF _Toc243410311 \h </w:instrText>
             </w:r>
             <w:r>
               <w:rPr>
@@ -1641,7 +1641,7 @@
               <w:noProof/>
             </w:rPr>
           </w:pPr>
-          <w:hyperlink w:anchor="_Toc243405016" w:history="1">
+          <w:hyperlink w:anchor="_Toc243410312" w:history="1">
             <w:r>
               <w:rPr>
                 <w:rStyle w:val="Lienhypertexte"/>
@@ -1665,7 +1665,7 @@
               <w:rPr>
                 <w:noProof/>
               </w:rPr>
-              <w:instrText xml:space="preserve"> PAGEREF _Toc243405016 \h </w:instrText>
+              <w:instrText xml:space="preserve"> PAGEREF _Toc243410312 \h </w:instrText>
             </w:r>
             <w:r>
               <w:rPr>
@@ -1702,7 +1702,7 @@
               <w:noProof/>
             </w:rPr>
           </w:pPr>
-          <w:hyperlink w:anchor="_Toc243405017" w:history="1">
+          <w:hyperlink w:anchor="_Toc243410313" w:history="1">
             <w:r>
               <w:rPr>
                 <w:rStyle w:val="Lienhypertexte"/>
@@ -1726,7 +1726,7 @@
               <w:rPr>
                 <w:noProof/>
               </w:rPr>
-              <w:instrText xml:space="preserve"> PAGEREF _Toc243405017 \h </w:instrText>
+              <w:instrText xml:space="preserve"> PAGEREF _Toc243410313 \h </w:instrText>
             </w:r>
             <w:r>
               <w:rPr>
@@ -1763,7 +1763,7 @@
               <w:noProof/>
             </w:rPr>
           </w:pPr>
-          <w:hyperlink w:anchor="_Toc243405018" w:history="1">
+          <w:hyperlink w:anchor="_Toc243410314" w:history="1">
             <w:r>
               <w:rPr>
                 <w:rStyle w:val="Lienhypertexte"/>
@@ -1787,7 +1787,7 @@
               <w:rPr>
                 <w:noProof/>
               </w:rPr>
-              <w:instrText xml:space="preserve"> PAGEREF _Toc243405018 \h </w:instrText>
+              <w:instrText xml:space="preserve"> PAGEREF _Toc243410314 \h </w:instrText>
             </w:r>
             <w:r>
               <w:rPr>
@@ -1824,7 +1824,7 @@
               <w:noProof/>
             </w:rPr>
           </w:pPr>
-          <w:hyperlink w:anchor="_Toc243405019" w:history="1">
+          <w:hyperlink w:anchor="_Toc243410315" w:history="1">
             <w:r>
               <w:rPr>
                 <w:rStyle w:val="Lienhypertexte"/>
@@ -1848,7 +1848,7 @@
               <w:rPr>
                 <w:noProof/>
               </w:rPr>
-              <w:instrText xml:space="preserve"> PAGEREF _Toc243405019 \h </w:instrText>
+              <w:instrText xml:space="preserve"> PAGEREF _Toc243410315 \h </w:instrText>
             </w:r>
             <w:r>
               <w:rPr>
@@ -1885,7 +1885,7 @@
               <w:noProof/>
             </w:rPr>
           </w:pPr>
-          <w:hyperlink w:anchor="_Toc243405020" w:history="1">
+          <w:hyperlink w:anchor="_Toc243410316" w:history="1">
             <w:r>
               <w:rPr>
                 <w:rStyle w:val="Lienhypertexte"/>
@@ -1909,7 +1909,7 @@
               <w:rPr>
                 <w:noProof/>
               </w:rPr>
-              <w:instrText xml:space="preserve"> PAGEREF _Toc243405020 \h </w:instrText>
+              <w:instrText xml:space="preserve"> PAGEREF _Toc243410316 \h </w:instrText>
             </w:r>
             <w:r>
               <w:rPr>
@@ -1946,7 +1946,7 @@
               <w:noProof/>
             </w:rPr>
           </w:pPr>
-          <w:hyperlink w:anchor="_Toc243405021" w:history="1">
+          <w:hyperlink w:anchor="_Toc243410317" w:history="1">
             <w:r>
               <w:rPr>
                 <w:rStyle w:val="Lienhypertexte"/>
@@ -1970,7 +1970,7 @@
               <w:rPr>
                 <w:noProof/>
               </w:rPr>
-              <w:instrText xml:space="preserve"> PAGEREF _Toc243405021 \h </w:instrText>
+              <w:instrText xml:space="preserve"> PAGEREF _Toc243410317 \h </w:instrText>
             </w:r>
             <w:r>
               <w:rPr>
@@ -2007,7 +2007,7 @@
               <w:noProof/>
             </w:rPr>
           </w:pPr>
-          <w:hyperlink w:anchor="_Toc243405022" w:history="1">
+          <w:hyperlink w:anchor="_Toc243410318" w:history="1">
             <w:r>
               <w:rPr>
                 <w:rStyle w:val="Lienhypertexte"/>
@@ -2031,7 +2031,7 @@
               <w:rPr>
                 <w:noProof/>
               </w:rPr>
-              <w:instrText xml:space="preserve"> PAGEREF _Toc243405022 \h </w:instrText>
+              <w:instrText xml:space="preserve"> PAGEREF _Toc243410318 \h </w:instrText>
             </w:r>
             <w:r>
               <w:rPr>
@@ -2068,7 +2068,7 @@
               <w:noProof/>
             </w:rPr>
           </w:pPr>
-          <w:hyperlink w:anchor="_Toc243405023" w:history="1">
+          <w:hyperlink w:anchor="_Toc243410319" w:history="1">
             <w:r>
               <w:rPr>
                 <w:rStyle w:val="Lienhypertexte"/>
@@ -2092,7 +2092,7 @@
               <w:rPr>
                 <w:noProof/>
               </w:rPr>
-              <w:instrText xml:space="preserve"> PAGEREF _Toc243405023 \h </w:instrText>
+              <w:instrText xml:space="preserve"> PAGEREF _Toc243410319 \h </w:instrText>
             </w:r>
             <w:r>
               <w:rPr>
@@ -2129,7 +2129,7 @@
               <w:noProof/>
             </w:rPr>
           </w:pPr>
-          <w:hyperlink w:anchor="_Toc243405024" w:history="1">
+          <w:hyperlink w:anchor="_Toc243410320" w:history="1">
             <w:r>
               <w:rPr>
                 <w:rStyle w:val="Lienhypertexte"/>
@@ -2153,7 +2153,7 @@
               <w:rPr>
                 <w:noProof/>
               </w:rPr>
-              <w:instrText xml:space="preserve"> PAGEREF _Toc243405024 \h </w:instrText>
+              <w:instrText xml:space="preserve"> PAGEREF _Toc243410320 \h </w:instrText>
             </w:r>
             <w:r>
               <w:rPr>
@@ -2190,7 +2190,7 @@
               <w:noProof/>
             </w:rPr>
           </w:pPr>
-          <w:hyperlink w:anchor="_Toc243405025" w:history="1">
+          <w:hyperlink w:anchor="_Toc243410321" w:history="1">
             <w:r>
               <w:rPr>
                 <w:rStyle w:val="Lienhypertexte"/>
@@ -2214,7 +2214,7 @@
               <w:rPr>
                 <w:noProof/>
               </w:rPr>
-              <w:instrText xml:space="preserve"> PAGEREF _Toc243405025 \h </w:instrText>
+              <w:instrText xml:space="preserve"> PAGEREF _Toc243410321 \h </w:instrText>
             </w:r>
             <w:r>
               <w:rPr>
@@ -2251,7 +2251,7 @@
               <w:noProof/>
             </w:rPr>
           </w:pPr>
-          <w:hyperlink w:anchor="_Toc243405026" w:history="1">
+          <w:hyperlink w:anchor="_Toc243410322" w:history="1">
             <w:r>
               <w:rPr>
                 <w:rStyle w:val="Lienhypertexte"/>
@@ -2275,7 +2275,7 @@
               <w:rPr>
                 <w:noProof/>
               </w:rPr>
-              <w:instrText xml:space="preserve"> PAGEREF _Toc243405026 \h </w:instrText>
+              <w:instrText xml:space="preserve"> PAGEREF _Toc243410322 \h </w:instrText>
             </w:r>
             <w:r>
               <w:rPr>
@@ -2312,7 +2312,7 @@
               <w:noProof/>
             </w:rPr>
           </w:pPr>
-          <w:hyperlink w:anchor="_Toc243405027" w:history="1">
+          <w:hyperlink w:anchor="_Toc243410323" w:history="1">
             <w:r>
               <w:rPr>
                 <w:rStyle w:val="Lienhypertexte"/>
@@ -2336,7 +2336,7 @@
               <w:rPr>
                 <w:noProof/>
               </w:rPr>
-              <w:instrText xml:space="preserve"> PAGEREF _Toc243405027 \h </w:instrText>
+              <w:instrText xml:space="preserve"> PAGEREF _Toc243410323 \h </w:instrText>
             </w:r>
             <w:r>
               <w:rPr>
@@ -2373,7 +2373,7 @@
               <w:noProof/>
             </w:rPr>
           </w:pPr>
-          <w:hyperlink w:anchor="_Toc243405028" w:history="1">
+          <w:hyperlink w:anchor="_Toc243410324" w:history="1">
             <w:r>
               <w:rPr>
                 <w:rStyle w:val="Lienhypertexte"/>
@@ -2397,7 +2397,7 @@
               <w:rPr>
                 <w:noProof/>
               </w:rPr>
-              <w:instrText xml:space="preserve"> PAGEREF _Toc243405028 \h </w:instrText>
+              <w:instrText xml:space="preserve"> PAGEREF _Toc243410324 \h </w:instrText>
             </w:r>
             <w:r>
               <w:rPr>
@@ -2434,7 +2434,7 @@
               <w:noProof/>
             </w:rPr>
           </w:pPr>
-          <w:hyperlink w:anchor="_Toc243405029" w:history="1">
+          <w:hyperlink w:anchor="_Toc243410325" w:history="1">
             <w:r>
               <w:rPr>
                 <w:rStyle w:val="Lienhypertexte"/>
@@ -2458,7 +2458,7 @@
               <w:rPr>
                 <w:noProof/>
               </w:rPr>
-              <w:instrText xml:space="preserve"> PAGEREF _Toc243405029 \h </w:instrText>
+              <w:instrText xml:space="preserve"> PAGEREF _Toc243410325 \h </w:instrText>
             </w:r>
             <w:r>
               <w:rPr>
@@ -2495,7 +2495,7 @@
               <w:noProof/>
             </w:rPr>
           </w:pPr>
-          <w:hyperlink w:anchor="_Toc243405030" w:history="1">
+          <w:hyperlink w:anchor="_Toc243410326" w:history="1">
             <w:r>
               <w:rPr>
                 <w:rStyle w:val="Lienhypertexte"/>
@@ -2519,7 +2519,7 @@
               <w:rPr>
                 <w:noProof/>
               </w:rPr>
-              <w:instrText xml:space="preserve"> PAGEREF _Toc243405030 \h </w:instrText>
+              <w:instrText xml:space="preserve"> PAGEREF _Toc243410326 \h </w:instrText>
             </w:r>
             <w:r>
               <w:rPr>
@@ -2556,7 +2556,7 @@
               <w:noProof/>
             </w:rPr>
           </w:pPr>
-          <w:hyperlink w:anchor="_Toc243405031" w:history="1">
+          <w:hyperlink w:anchor="_Toc243410327" w:history="1">
             <w:r>
               <w:rPr>
                 <w:rStyle w:val="Lienhypertexte"/>
@@ -2580,7 +2580,7 @@
               <w:rPr>
                 <w:noProof/>
               </w:rPr>
-              <w:instrText xml:space="preserve"> PAGEREF _Toc243405031 \h </w:instrText>
+              <w:instrText xml:space="preserve"> PAGEREF _Toc243410327 \h </w:instrText>
             </w:r>
             <w:r>
               <w:rPr>
@@ -2617,7 +2617,7 @@
               <w:noProof/>
             </w:rPr>
           </w:pPr>
-          <w:hyperlink w:anchor="_Toc243405032" w:history="1">
+          <w:hyperlink w:anchor="_Toc243410328" w:history="1">
             <w:r>
               <w:rPr>
                 <w:rStyle w:val="Lienhypertexte"/>
@@ -2641,7 +2641,7 @@
               <w:rPr>
                 <w:noProof/>
               </w:rPr>
-              <w:instrText xml:space="preserve"> PAGEREF _Toc243405032 \h </w:instrText>
+              <w:instrText xml:space="preserve"> PAGEREF _Toc243410328 \h </w:instrText>
             </w:r>
             <w:r>
               <w:rPr>
@@ -2678,7 +2678,7 @@
               <w:noProof/>
             </w:rPr>
           </w:pPr>
-          <w:hyperlink w:anchor="_Toc243405033" w:history="1">
+          <w:hyperlink w:anchor="_Toc243410329" w:history="1">
             <w:r>
               <w:rPr>
                 <w:rStyle w:val="Lienhypertexte"/>
@@ -2702,7 +2702,7 @@
               <w:rPr>
                 <w:noProof/>
               </w:rPr>
-              <w:instrText xml:space="preserve"> PAGEREF _Toc243405033 \h </w:instrText>
+              <w:instrText xml:space="preserve"> PAGEREF _Toc243410329 \h </w:instrText>
             </w:r>
             <w:r>
               <w:rPr>
@@ -2739,7 +2739,7 @@
               <w:noProof/>
             </w:rPr>
           </w:pPr>
-          <w:hyperlink w:anchor="_Toc243405034" w:history="1">
+          <w:hyperlink w:anchor="_Toc243410330" w:history="1">
             <w:r>
               <w:rPr>
                 <w:rStyle w:val="Lienhypertexte"/>
@@ -2763,7 +2763,7 @@
               <w:rPr>
                 <w:noProof/>
               </w:rPr>
-              <w:instrText xml:space="preserve"> PAGEREF _Toc243405034 \h </w:instrText>
+              <w:instrText xml:space="preserve"> PAGEREF _Toc243410330 \h </w:instrText>
             </w:r>
             <w:r>
               <w:rPr>
@@ -2800,7 +2800,7 @@
               <w:noProof/>
             </w:rPr>
           </w:pPr>
-          <w:hyperlink w:anchor="_Toc243405035" w:history="1">
+          <w:hyperlink w:anchor="_Toc243410331" w:history="1">
             <w:r>
               <w:rPr>
                 <w:rStyle w:val="Lienhypertexte"/>
@@ -2824,7 +2824,7 @@
               <w:rPr>
                 <w:noProof/>
               </w:rPr>
-              <w:instrText xml:space="preserve"> PAGEREF _Toc243405035 \h </w:instrText>
+              <w:instrText xml:space="preserve"> PAGEREF _Toc243410331 \h </w:instrText>
             </w:r>
             <w:r>
               <w:rPr>
@@ -2861,7 +2861,7 @@
               <w:noProof/>
             </w:rPr>
           </w:pPr>
-          <w:hyperlink w:anchor="_Toc243405036" w:history="1">
+          <w:hyperlink w:anchor="_Toc243410332" w:history="1">
             <w:r>
               <w:rPr>
                 <w:rStyle w:val="Lienhypertexte"/>
@@ -2885,7 +2885,7 @@
               <w:rPr>
                 <w:noProof/>
               </w:rPr>
-              <w:instrText xml:space="preserve"> PAGEREF _Toc243405036 \h </w:instrText>
+              <w:instrText xml:space="preserve"> PAGEREF _Toc243410332 \h </w:instrText>
             </w:r>
             <w:r>
               <w:rPr>
@@ -2922,7 +2922,7 @@
               <w:noProof/>
             </w:rPr>
           </w:pPr>
-          <w:hyperlink w:anchor="_Toc243405037" w:history="1">
+          <w:hyperlink w:anchor="_Toc243410333" w:history="1">
             <w:r>
               <w:rPr>
                 <w:rStyle w:val="Lienhypertexte"/>
@@ -2946,7 +2946,7 @@
               <w:rPr>
                 <w:noProof/>
               </w:rPr>
-              <w:instrText xml:space="preserve"> PAGEREF _Toc243405037 \h </w:instrText>
+              <w:instrText xml:space="preserve"> PAGEREF _Toc243410333 \h </w:instrText>
             </w:r>
             <w:r>
               <w:rPr>
@@ -2983,7 +2983,7 @@
               <w:noProof/>
             </w:rPr>
           </w:pPr>
-          <w:hyperlink w:anchor="_Toc243405038" w:history="1">
+          <w:hyperlink w:anchor="_Toc243410334" w:history="1">
             <w:r>
               <w:rPr>
                 <w:rStyle w:val="Lienhypertexte"/>
@@ -3007,7 +3007,7 @@
               <w:rPr>
                 <w:noProof/>
               </w:rPr>
-              <w:instrText xml:space="preserve"> PAGEREF _Toc243405038 \h </w:instrText>
+              <w:instrText xml:space="preserve"> PAGEREF _Toc243410334 \h </w:instrText>
             </w:r>
             <w:r>
               <w:rPr>
@@ -3044,7 +3044,7 @@
               <w:noProof/>
             </w:rPr>
           </w:pPr>
-          <w:hyperlink w:anchor="_Toc243405039" w:history="1">
+          <w:hyperlink w:anchor="_Toc243410335" w:history="1">
             <w:r>
               <w:rPr>
                 <w:rStyle w:val="Lienhypertexte"/>
@@ -3068,7 +3068,7 @@
               <w:rPr>
                 <w:noProof/>
               </w:rPr>
-              <w:instrText xml:space="preserve"> PAGEREF _Toc243405039 \h </w:instrText>
+              <w:instrText xml:space="preserve"> PAGEREF _Toc243410335 \h </w:instrText>
             </w:r>
             <w:r>
               <w:rPr>
@@ -3105,13 +3105,13 @@
               <w:noProof/>
             </w:rPr>
           </w:pPr>
-          <w:hyperlink w:anchor="_Toc243405040" w:history="1">
+          <w:hyperlink w:anchor="_Toc243410336" w:history="1">
             <w:r>
               <w:rPr>
                 <w:rStyle w:val="Lienhypertexte"/>
                 <w:noProof/>
               </w:rPr>
-              <w:t>9. Key numbers to know by heart</w:t>
+              <w:t>9. Bonus: what about transformers like BERT? (notebook 07)</w:t>
             </w:r>
             <w:r>
               <w:rPr>
@@ -3129,7 +3129,7 @@
               <w:rPr>
                 <w:noProof/>
               </w:rPr>
-              <w:instrText xml:space="preserve"> PAGEREF _Toc243405040 \h </w:instrText>
+              <w:instrText xml:space="preserve"> PAGEREF _Toc243410336 \h </w:instrText>
             </w:r>
             <w:r>
               <w:rPr>
@@ -3166,13 +3166,13 @@
               <w:noProof/>
             </w:rPr>
           </w:pPr>
-          <w:hyperlink w:anchor="_Toc243405041" w:history="1">
+          <w:hyperlink w:anchor="_Toc243410337" w:history="1">
             <w:r>
               <w:rPr>
                 <w:rStyle w:val="Lienhypertexte"/>
                 <w:noProof/>
               </w:rPr>
-              <w:t>10. Concepts in simple words</w:t>
+              <w:t>10. Key numbers to know by heart</w:t>
             </w:r>
             <w:r>
               <w:rPr>
@@ -3190,7 +3190,7 @@
               <w:rPr>
                 <w:noProof/>
               </w:rPr>
-              <w:instrText xml:space="preserve"> PAGEREF _Toc243405041 \h </w:instrText>
+              <w:instrText xml:space="preserve"> PAGEREF _Toc243410337 \h </w:instrText>
             </w:r>
             <w:r>
               <w:rPr>
@@ -3207,7 +3207,7 @@
               <w:rPr>
                 <w:noProof/>
               </w:rPr>
-              <w:t>21</w:t>
+              <w:t>22</w:t>
             </w:r>
             <w:r>
               <w:rPr>
@@ -3227,13 +3227,13 @@
               <w:noProof/>
             </w:rPr>
           </w:pPr>
-          <w:hyperlink w:anchor="_Toc243405042" w:history="1">
+          <w:hyperlink w:anchor="_Toc243410338" w:history="1">
             <w:r>
               <w:rPr>
                 <w:rStyle w:val="Lienhypertexte"/>
                 <w:noProof/>
               </w:rPr>
-              <w:t>11. Questions you may get, with answers</w:t>
+              <w:t>11. Concepts in simple words</w:t>
             </w:r>
             <w:r>
               <w:rPr>
@@ -3251,7 +3251,7 @@
               <w:rPr>
                 <w:noProof/>
               </w:rPr>
-              <w:instrText xml:space="preserve"> PAGEREF _Toc243405042 \h </w:instrText>
+              <w:instrText xml:space="preserve"> PAGEREF _Toc243410338 \h </w:instrText>
             </w:r>
             <w:r>
               <w:rPr>
@@ -3269,6 +3269,67 @@
                 <w:noProof/>
               </w:rPr>
               <w:t>23</w:t>
+            </w:r>
+            <w:r>
+              <w:rPr>
+                <w:noProof/>
+              </w:rPr>
+              <w:fldChar w:fldCharType="end"/>
+            </w:r>
+          </w:hyperlink>
+        </w:p>
+        <w:p>
+          <w:pPr>
+            <w:pStyle w:val="TM1"/>
+            <w:tabs>
+              <w:tab w:val="right" w:leader="dot" w:pos="9628"/>
+            </w:tabs>
+            <w:rPr>
+              <w:noProof/>
+            </w:rPr>
+          </w:pPr>
+          <w:hyperlink w:anchor="_Toc243410339" w:history="1">
+            <w:r>
+              <w:rPr>
+                <w:rStyle w:val="Lienhypertexte"/>
+                <w:noProof/>
+              </w:rPr>
+              <w:t>12. Questions you may get, with answers</w:t>
+            </w:r>
+            <w:r>
+              <w:rPr>
+                <w:noProof/>
+              </w:rPr>
+              <w:tab/>
+            </w:r>
+            <w:r>
+              <w:rPr>
+                <w:noProof/>
+              </w:rPr>
+              <w:fldChar w:fldCharType="begin"/>
+            </w:r>
+            <w:r>
+              <w:rPr>
+                <w:noProof/>
+              </w:rPr>
+              <w:instrText xml:space="preserve"> PAGEREF _Toc243410339 \h </w:instrText>
+            </w:r>
+            <w:r>
+              <w:rPr>
+                <w:noProof/>
+              </w:rPr>
+            </w:r>
+            <w:r>
+              <w:rPr>
+                <w:noProof/>
+              </w:rPr>
+              <w:fldChar w:fldCharType="separate"/>
+            </w:r>
+            <w:r>
+              <w:rPr>
+                <w:noProof/>
+              </w:rPr>
+              <w:t>25</w:t>
             </w:r>
             <w:r>
               <w:rPr>
@@ -3288,7 +3349,7 @@
               <w:noProof/>
             </w:rPr>
           </w:pPr>
-          <w:hyperlink w:anchor="_Toc243405043" w:history="1">
+          <w:hyperlink w:anchor="_Toc243410340" w:history="1">
             <w:r>
               <w:rPr>
                 <w:rStyle w:val="Lienhypertexte"/>
@@ -3312,7 +3373,7 @@
               <w:rPr>
                 <w:noProof/>
               </w:rPr>
-              <w:instrText xml:space="preserve"> PAGEREF _Toc243405043 \h </w:instrText>
+              <w:instrText xml:space="preserve"> PAGEREF _Toc243410340 \h </w:instrText>
             </w:r>
             <w:r>
               <w:rPr>
@@ -3329,7 +3390,7 @@
               <w:rPr>
                 <w:noProof/>
               </w:rPr>
-              <w:t>23</w:t>
+              <w:t>25</w:t>
             </w:r>
             <w:r>
               <w:rPr>
@@ -3349,7 +3410,7 @@
               <w:noProof/>
             </w:rPr>
           </w:pPr>
-          <w:hyperlink w:anchor="_Toc243405044" w:history="1">
+          <w:hyperlink w:anchor="_Toc243410341" w:history="1">
             <w:r>
               <w:rPr>
                 <w:rStyle w:val="Lienhypertexte"/>
@@ -3373,7 +3434,7 @@
               <w:rPr>
                 <w:noProof/>
               </w:rPr>
-              <w:instrText xml:space="preserve"> PAGEREF _Toc243405044 \h </w:instrText>
+              <w:instrText xml:space="preserve"> PAGEREF _Toc243410341 \h </w:instrText>
             </w:r>
             <w:r>
               <w:rPr>
@@ -3390,7 +3451,7 @@
               <w:rPr>
                 <w:noProof/>
               </w:rPr>
-              <w:t>23</w:t>
+              <w:t>25</w:t>
             </w:r>
             <w:r>
               <w:rPr>
@@ -3410,7 +3471,7 @@
               <w:noProof/>
             </w:rPr>
           </w:pPr>
-          <w:hyperlink w:anchor="_Toc243405045" w:history="1">
+          <w:hyperlink w:anchor="_Toc243410342" w:history="1">
             <w:r>
               <w:rPr>
                 <w:rStyle w:val="Lienhypertexte"/>
@@ -3434,7 +3495,7 @@
               <w:rPr>
                 <w:noProof/>
               </w:rPr>
-              <w:instrText xml:space="preserve"> PAGEREF _Toc243405045 \h </w:instrText>
+              <w:instrText xml:space="preserve"> PAGEREF _Toc243410342 \h </w:instrText>
             </w:r>
             <w:r>
               <w:rPr>
@@ -3451,7 +3512,7 @@
               <w:rPr>
                 <w:noProof/>
               </w:rPr>
-              <w:t>23</w:t>
+              <w:t>25</w:t>
             </w:r>
             <w:r>
               <w:rPr>
@@ -3471,7 +3532,7 @@
               <w:noProof/>
             </w:rPr>
           </w:pPr>
-          <w:hyperlink w:anchor="_Toc243405046" w:history="1">
+          <w:hyperlink w:anchor="_Toc243410343" w:history="1">
             <w:r>
               <w:rPr>
                 <w:rStyle w:val="Lienhypertexte"/>
@@ -3495,7 +3556,7 @@
               <w:rPr>
                 <w:noProof/>
               </w:rPr>
-              <w:instrText xml:space="preserve"> PAGEREF _Toc243405046 \h </w:instrText>
+              <w:instrText xml:space="preserve"> PAGEREF _Toc243410343 \h </w:instrText>
             </w:r>
             <w:r>
               <w:rPr>
@@ -3512,7 +3573,7 @@
               <w:rPr>
                 <w:noProof/>
               </w:rPr>
-              <w:t>24</w:t>
+              <w:t>26</w:t>
             </w:r>
             <w:r>
               <w:rPr>
@@ -3532,7 +3593,7 @@
               <w:noProof/>
             </w:rPr>
           </w:pPr>
-          <w:hyperlink w:anchor="_Toc243405047" w:history="1">
+          <w:hyperlink w:anchor="_Toc243410344" w:history="1">
             <w:r>
               <w:rPr>
                 <w:rStyle w:val="Lienhypertexte"/>
@@ -3556,7 +3617,7 @@
               <w:rPr>
                 <w:noProof/>
               </w:rPr>
-              <w:instrText xml:space="preserve"> PAGEREF _Toc243405047 \h </w:instrText>
+              <w:instrText xml:space="preserve"> PAGEREF _Toc243410344 \h </w:instrText>
             </w:r>
             <w:r>
               <w:rPr>
@@ -3573,7 +3634,7 @@
               <w:rPr>
                 <w:noProof/>
               </w:rPr>
-              <w:t>24</w:t>
+              <w:t>26</w:t>
             </w:r>
             <w:r>
               <w:rPr>
@@ -3593,7 +3654,7 @@
               <w:noProof/>
             </w:rPr>
           </w:pPr>
-          <w:hyperlink w:anchor="_Toc243405048" w:history="1">
+          <w:hyperlink w:anchor="_Toc243410345" w:history="1">
             <w:r>
               <w:rPr>
                 <w:rStyle w:val="Lienhypertexte"/>
@@ -3617,7 +3678,7 @@
               <w:rPr>
                 <w:noProof/>
               </w:rPr>
-              <w:instrText xml:space="preserve"> PAGEREF _Toc243405048 \h </w:instrText>
+              <w:instrText xml:space="preserve"> PAGEREF _Toc243410345 \h </w:instrText>
             </w:r>
             <w:r>
               <w:rPr>
@@ -3634,7 +3695,7 @@
               <w:rPr>
                 <w:noProof/>
               </w:rPr>
-              <w:t>24</w:t>
+              <w:t>27</w:t>
             </w:r>
             <w:r>
               <w:rPr>
@@ -3654,13 +3715,13 @@
               <w:noProof/>
             </w:rPr>
           </w:pPr>
-          <w:hyperlink w:anchor="_Toc243405049" w:history="1">
+          <w:hyperlink w:anchor="_Toc243410346" w:history="1">
             <w:r>
               <w:rPr>
                 <w:rStyle w:val="Lienhypertexte"/>
                 <w:noProof/>
               </w:rPr>
-              <w:t>12. Limits to admit, and next steps</w:t>
+              <w:t>13. Limits to admit, and next steps</w:t>
             </w:r>
             <w:r>
               <w:rPr>
@@ -3678,7 +3739,7 @@
               <w:rPr>
                 <w:noProof/>
               </w:rPr>
-              <w:instrText xml:space="preserve"> PAGEREF _Toc243405049 \h </w:instrText>
+              <w:instrText xml:space="preserve"> PAGEREF _Toc243410346 \h </w:instrText>
             </w:r>
             <w:r>
               <w:rPr>
@@ -3695,7 +3756,7 @@
               <w:rPr>
                 <w:noProof/>
               </w:rPr>
-              <w:t>25</w:t>
+              <w:t>28</w:t>
             </w:r>
             <w:r>
               <w:rPr>
@@ -3715,13 +3776,13 @@
               <w:noProof/>
             </w:rPr>
           </w:pPr>
-          <w:hyperlink w:anchor="_Toc243405050" w:history="1">
+          <w:hyperlink w:anchor="_Toc243410347" w:history="1">
             <w:r>
               <w:rPr>
                 <w:rStyle w:val="Lienhypertexte"/>
                 <w:noProof/>
               </w:rPr>
-              <w:t>13. Git history and how to reproduce</w:t>
+              <w:t>14. Git history and how to reproduce</w:t>
             </w:r>
             <w:r>
               <w:rPr>
@@ -3739,7 +3800,7 @@
               <w:rPr>
                 <w:noProof/>
               </w:rPr>
-              <w:instrText xml:space="preserve"> PAGEREF _Toc243405050 \h </w:instrText>
+              <w:instrText xml:space="preserve"> PAGEREF _Toc243410347 \h </w:instrText>
             </w:r>
             <w:r>
               <w:rPr>
@@ -3756,7 +3817,7 @@
               <w:rPr>
                 <w:noProof/>
               </w:rPr>
-              <w:t>26</w:t>
+              <w:t>29</w:t>
             </w:r>
             <w:r>
               <w:rPr>
@@ -3776,13 +3837,13 @@
               <w:noProof/>
             </w:rPr>
           </w:pPr>
-          <w:hyperlink w:anchor="_Toc243405051" w:history="1">
+          <w:hyperlink w:anchor="_Toc243410348" w:history="1">
             <w:r>
               <w:rPr>
                 <w:rStyle w:val="Lienhypertexte"/>
                 <w:noProof/>
               </w:rPr>
-              <w:t>14. The 10-minute talk, slide by slide</w:t>
+              <w:t>15. The 10-minute talk, slide by slide</w:t>
             </w:r>
             <w:r>
               <w:rPr>
@@ -3800,7 +3861,7 @@
               <w:rPr>
                 <w:noProof/>
               </w:rPr>
-              <w:instrText xml:space="preserve"> PAGEREF _Toc243405051 \h </w:instrText>
+              <w:instrText xml:space="preserve"> PAGEREF _Toc243410348 \h </w:instrText>
             </w:r>
             <w:r>
               <w:rPr>
@@ -3817,7 +3878,7 @@
               <w:rPr>
                 <w:noProof/>
               </w:rPr>
-              <w:t>27</w:t>
+              <w:t>30</w:t>
             </w:r>
             <w:r>
               <w:rPr>
@@ -3839,7 +3900,7 @@
         <w:pStyle w:val="Titre1"/>
         <w:pageBreakBefore/>
       </w:pPr>
-      <w:bookmarkStart w:id="0" w:name="_Toc243404991"/>
+      <w:bookmarkStart w:id="0" w:name="_Toc243410287"/>
       <w:r>
         <w:lastRenderedPageBreak/>
         <w:t>1. The pitch in 60 seconds</w:t>
@@ -4058,7 +4119,7 @@
         <w:pStyle w:val="Titre1"/>
         <w:pageBreakBefore/>
       </w:pPr>
-      <w:bookmarkStart w:id="1" w:name="_Toc243404992"/>
+      <w:bookmarkStart w:id="1" w:name="_Toc243410288"/>
       <w:r>
         <w:lastRenderedPageBreak/>
         <w:t>2. The basic ideas, explained simply</w:t>
@@ -4163,7 +4224,7 @@
       <w:pPr>
         <w:pStyle w:val="Titre2"/>
       </w:pPr>
-      <w:bookmarkStart w:id="2" w:name="_Toc243404993"/>
+      <w:bookmarkStart w:id="2" w:name="_Toc243410289"/>
       <w:r>
         <w:t>A neuron, weights and a network</w:t>
       </w:r>
@@ -4233,7 +4294,7 @@
       <w:pPr>
         <w:pStyle w:val="Titre2"/>
       </w:pPr>
-      <w:bookmarkStart w:id="3" w:name="_Toc243404994"/>
+      <w:bookmarkStart w:id="3" w:name="_Toc243410290"/>
       <w:r>
         <w:t>The loss: how wrong we are</w:t>
       </w:r>
@@ -4293,7 +4354,7 @@
       <w:pPr>
         <w:pStyle w:val="Titre2"/>
       </w:pPr>
-      <w:bookmarkStart w:id="4" w:name="_Toc243404995"/>
+      <w:bookmarkStart w:id="4" w:name="_Toc243410291"/>
       <w:r>
         <w:t>Gradient descent and the learning rate</w:t>
       </w:r>
@@ -4363,7 +4424,7 @@
       <w:pPr>
         <w:pStyle w:val="Titre2"/>
       </w:pPr>
-      <w:bookmarkStart w:id="5" w:name="_Toc243404996"/>
+      <w:bookmarkStart w:id="5" w:name="_Toc243410292"/>
       <w:r>
         <w:t>Backpropagation and the 5 lines of the training loop</w:t>
       </w:r>
@@ -4457,7 +4518,7 @@
       <w:pPr>
         <w:pStyle w:val="Titre2"/>
       </w:pPr>
-      <w:bookmarkStart w:id="6" w:name="_Toc243404997"/>
+      <w:bookmarkStart w:id="6" w:name="_Toc243410293"/>
       <w:r>
         <w:t>Epoch and mini-batch</w:t>
       </w:r>
@@ -4517,7 +4578,7 @@
       <w:pPr>
         <w:pStyle w:val="Titre2"/>
       </w:pPr>
-      <w:bookmarkStart w:id="7" w:name="_Toc243404998"/>
+      <w:bookmarkStart w:id="7" w:name="_Toc243410294"/>
       <w:r>
         <w:lastRenderedPageBreak/>
         <w:t>Train, validation, test</w:t>
@@ -4588,7 +4649,7 @@
       <w:pPr>
         <w:pStyle w:val="Titre2"/>
       </w:pPr>
-      <w:bookmarkStart w:id="8" w:name="_Toc243404999"/>
+      <w:bookmarkStart w:id="8" w:name="_Toc243410295"/>
       <w:r>
         <w:t>Overfitting</w:t>
       </w:r>
@@ -4638,7 +4699,7 @@
       <w:pPr>
         <w:pStyle w:val="Titre2"/>
       </w:pPr>
-      <w:bookmarkStart w:id="9" w:name="_Toc243405000"/>
+      <w:bookmarkStart w:id="9" w:name="_Toc243410296"/>
       <w:r>
         <w:t>ReLU, the activation</w:t>
       </w:r>
@@ -4708,7 +4769,7 @@
       <w:pPr>
         <w:pStyle w:val="Titre2"/>
       </w:pPr>
-      <w:bookmarkStart w:id="10" w:name="_Toc243405001"/>
+      <w:bookmarkStart w:id="10" w:name="_Toc243410297"/>
       <w:r>
         <w:t>Initialisation and the first loss</w:t>
       </w:r>
@@ -4758,7 +4819,7 @@
       <w:pPr>
         <w:pStyle w:val="Titre2"/>
       </w:pPr>
-      <w:bookmarkStart w:id="11" w:name="_Toc243405002"/>
+      <w:bookmarkStart w:id="11" w:name="_Toc243410298"/>
       <w:r>
         <w:t>Standardisation of the pixels</w:t>
       </w:r>
@@ -4818,7 +4879,7 @@
       <w:pPr>
         <w:pStyle w:val="Titre2"/>
       </w:pPr>
-      <w:bookmarkStart w:id="12" w:name="_Toc243405003"/>
+      <w:bookmarkStart w:id="12" w:name="_Toc243410299"/>
       <w:r>
         <w:t>MLP versus CNN: why the MLP cannot see shapes</w:t>
       </w:r>
@@ -4878,7 +4939,7 @@
       <w:pPr>
         <w:pStyle w:val="Titre2"/>
       </w:pPr>
-      <w:bookmarkStart w:id="13" w:name="_Toc243405004"/>
+      <w:bookmarkStart w:id="13" w:name="_Toc243410300"/>
       <w:r>
         <w:t>Convolution, filters and channels (session 7 slide)</w:t>
       </w:r>
@@ -4969,7 +5030,7 @@
       <w:pPr>
         <w:pStyle w:val="Titre2"/>
       </w:pPr>
-      <w:bookmarkStart w:id="14" w:name="_Toc243405005"/>
+      <w:bookmarkStart w:id="14" w:name="_Toc243410301"/>
       <w:r>
         <w:t>A pretrained network and transfer learning</w:t>
       </w:r>
@@ -5029,7 +5090,7 @@
       <w:pPr>
         <w:pStyle w:val="Titre2"/>
       </w:pPr>
-      <w:bookmarkStart w:id="15" w:name="_Toc243405006"/>
+      <w:bookmarkStart w:id="15" w:name="_Toc243410302"/>
       <w:r>
         <w:t>Frozen features (linear probe) versus fine-tuning</w:t>
       </w:r>
@@ -5099,7 +5160,7 @@
       <w:pPr>
         <w:pStyle w:val="Titre2"/>
       </w:pPr>
-      <w:bookmarkStart w:id="16" w:name="_Toc243405007"/>
+      <w:bookmarkStart w:id="16" w:name="_Toc243410303"/>
       <w:r>
         <w:t>The tools against overfitting</w:t>
       </w:r>
@@ -5259,7 +5320,7 @@
       <w:pPr>
         <w:pStyle w:val="Titre2"/>
       </w:pPr>
-      <w:bookmarkStart w:id="17" w:name="_Toc243405008"/>
+      <w:bookmarkStart w:id="17" w:name="_Toc243410304"/>
       <w:r>
         <w:t>Vanishing gradient</w:t>
       </w:r>
@@ -5309,7 +5370,7 @@
       <w:pPr>
         <w:pStyle w:val="Titre2"/>
       </w:pPr>
-      <w:bookmarkStart w:id="18" w:name="_Toc243405009"/>
+      <w:bookmarkStart w:id="18" w:name="_Toc243410305"/>
       <w:r>
         <w:t>Data leakage</w:t>
       </w:r>
@@ -5359,7 +5420,7 @@
       <w:pPr>
         <w:pStyle w:val="Titre2"/>
       </w:pPr>
-      <w:bookmarkStart w:id="19" w:name="_Toc243405010"/>
+      <w:bookmarkStart w:id="19" w:name="_Toc243410306"/>
       <w:r>
         <w:t>Confidence interval and bootstrap</w:t>
       </w:r>
@@ -5419,7 +5480,7 @@
       <w:pPr>
         <w:pStyle w:val="Titre2"/>
       </w:pPr>
-      <w:bookmarkStart w:id="20" w:name="_Toc243405011"/>
+      <w:bookmarkStart w:id="20" w:name="_Toc243410307"/>
       <w:r>
         <w:lastRenderedPageBreak/>
         <w:t>Latency and CPU threads</w:t>
@@ -5491,7 +5552,7 @@
         <w:pStyle w:val="Titre1"/>
         <w:pageBreakBefore/>
       </w:pPr>
-      <w:bookmarkStart w:id="21" w:name="_Toc243405012"/>
+      <w:bookmarkStart w:id="21" w:name="_Toc243410308"/>
       <w:r>
         <w:lastRenderedPageBreak/>
         <w:t>3. Step 1: the data and a fair split (notebook 01)</w:t>
@@ -5604,7 +5665,7 @@
       <w:pPr>
         <w:pStyle w:val="Titre2"/>
       </w:pPr>
-      <w:bookmarkStart w:id="22" w:name="_Toc243405013"/>
+      <w:bookmarkStart w:id="22" w:name="_Toc243410309"/>
       <w:r>
         <w:t>What we downloaded</w:t>
       </w:r>
@@ -5725,7 +5786,7 @@
       <w:pPr>
         <w:pStyle w:val="Titre2"/>
       </w:pPr>
-      <w:bookmarkStart w:id="23" w:name="_Toc243405014"/>
+      <w:bookmarkStart w:id="23" w:name="_Toc243410310"/>
       <w:r>
         <w:t>The split (make_split in data.py)</w:t>
       </w:r>
@@ -5856,7 +5917,7 @@
       <w:pPr>
         <w:pStyle w:val="Titre2"/>
       </w:pPr>
-      <w:bookmarkStart w:id="24" w:name="_Toc243405015"/>
+      <w:bookmarkStart w:id="24" w:name="_Toc243410311"/>
       <w:r>
         <w:t>What we found in the data</w:t>
       </w:r>
@@ -5919,7 +5980,7 @@
         <w:pStyle w:val="Titre1"/>
         <w:pageBreakBefore/>
       </w:pPr>
-      <w:bookmarkStart w:id="25" w:name="_Toc243405016"/>
+      <w:bookmarkStart w:id="25" w:name="_Toc243410312"/>
       <w:r>
         <w:lastRenderedPageBreak/>
         <w:t>4. Step 2: the MLP and its two checks (notebook 02)</w:t>
@@ -6069,7 +6130,7 @@
       <w:pPr>
         <w:pStyle w:val="Titre2"/>
       </w:pPr>
-      <w:bookmarkStart w:id="26" w:name="_Toc243405017"/>
+      <w:bookmarkStart w:id="26" w:name="_Toc243410313"/>
       <w:r>
         <w:t>The model</w:t>
       </w:r>
@@ -6196,7 +6257,7 @@
       <w:pPr>
         <w:pStyle w:val="Titre2"/>
       </w:pPr>
-      <w:bookmarkStart w:id="27" w:name="_Toc243405018"/>
+      <w:bookmarkStart w:id="27" w:name="_Toc243410314"/>
       <w:r>
         <w:t>Check 1: the first loss</w:t>
       </w:r>
@@ -6245,7 +6306,7 @@
       <w:pPr>
         <w:pStyle w:val="Titre2"/>
       </w:pPr>
-      <w:bookmarkStart w:id="28" w:name="_Toc243405019"/>
+      <w:bookmarkStart w:id="28" w:name="_Toc243410315"/>
       <w:r>
         <w:t>Check 2: overfit one batch</w:t>
       </w:r>
@@ -6263,7 +6324,7 @@
       <w:pPr>
         <w:pStyle w:val="Titre2"/>
       </w:pPr>
-      <w:bookmarkStart w:id="29" w:name="_Toc243405020"/>
+      <w:bookmarkStart w:id="29" w:name="_Toc243410316"/>
       <w:r>
         <w:t>Baseline and image size</w:t>
       </w:r>
@@ -6339,7 +6400,7 @@
         </w:rPr>
         <w:lastRenderedPageBreak/>
         <w:drawing>
-          <wp:inline distT="0" distB="0" distL="0" distR="0" wp14:anchorId="74A0DC65" wp14:editId="74A0DC66">
+          <wp:inline distT="0" distB="0" distL="0" distR="0" wp14:anchorId="01918AFB" wp14:editId="01918AFC">
             <wp:extent cx="4762500" cy="1924050"/>
             <wp:effectExtent l="0" t="0" r="0" b="0"/>
             <wp:docPr id="1" name="02_baseline_curves.png" descr="MLP baseline: training loss falls to 0 while validation loss rises (overfitting)." title="MLP baseline: training loss falls to 0 while validation loss rises (overfitting)."/>
@@ -6399,7 +6460,7 @@
         <w:pStyle w:val="Titre1"/>
         <w:pageBreakBefore/>
       </w:pPr>
-      <w:bookmarkStart w:id="30" w:name="_Toc243405021"/>
+      <w:bookmarkStart w:id="30" w:name="_Toc243410317"/>
       <w:r>
         <w:lastRenderedPageBreak/>
         <w:t>5. Step 3: monitoring and regularisation (notebook 03)</w:t>
@@ -6570,7 +6631,7 @@
       <w:pPr>
         <w:pStyle w:val="Titre2"/>
       </w:pPr>
-      <w:bookmarkStart w:id="31" w:name="_Toc243405022"/>
+      <w:bookmarkStart w:id="31" w:name="_Toc243410318"/>
       <w:r>
         <w:t>What we monitored</w:t>
       </w:r>
@@ -6689,7 +6750,7 @@
       <w:pPr>
         <w:pStyle w:val="Titre2"/>
       </w:pPr>
-      <w:bookmarkStart w:id="32" w:name="_Toc243405023"/>
+      <w:bookmarkStart w:id="32" w:name="_Toc243410319"/>
       <w:r>
         <w:t>Learning-rate sweep (Adam, 8 values, 15 epochs each)</w:t>
       </w:r>
@@ -6764,7 +6825,7 @@
           <w:noProof/>
         </w:rPr>
         <w:drawing>
-          <wp:inline distT="0" distB="0" distL="0" distR="0" wp14:anchorId="74A0DC67" wp14:editId="74A0DC68">
+          <wp:inline distT="0" distB="0" distL="0" distR="0" wp14:anchorId="01918AFD" wp14:editId="01918AFE">
             <wp:extent cx="4191000" cy="1619250"/>
             <wp:effectExtent l="0" t="0" r="0" b="0"/>
             <wp:docPr id="2" name="03_lr_sweep.png" descr="Learning-rate sweep: a U-shaped validation loss, best at 0.0001." title="Learning-rate sweep: a U-shaped validation loss, best at 0.0001."/>
@@ -6823,7 +6884,7 @@
       <w:pPr>
         <w:pStyle w:val="Titre2"/>
       </w:pPr>
-      <w:bookmarkStart w:id="33" w:name="_Toc243405024"/>
+      <w:bookmarkStart w:id="33" w:name="_Toc243410320"/>
       <w:r>
         <w:t>The tools against overfitting (lr 0.0001, 3 seeds each)</w:t>
       </w:r>
@@ -7796,7 +7857,7 @@
         <w:pStyle w:val="Titre1"/>
         <w:pageBreakBefore/>
       </w:pPr>
-      <w:bookmarkStart w:id="34" w:name="_Toc243405025"/>
+      <w:bookmarkStart w:id="34" w:name="_Toc243410321"/>
       <w:r>
         <w:lastRenderedPageBreak/>
         <w:t>6. Step 4: the training doctor (notebook 04)</w:t>
@@ -8687,7 +8748,7 @@
         </w:rPr>
         <w:lastRenderedPageBreak/>
         <w:drawing>
-          <wp:inline distT="0" distB="0" distL="0" distR="0" wp14:anchorId="74A0DC69" wp14:editId="74A0DC6A">
+          <wp:inline distT="0" distB="0" distL="0" distR="0" wp14:anchorId="01918AFF" wp14:editId="01918B00">
             <wp:extent cx="4000500" cy="2209800"/>
             <wp:effectExtent l="0" t="0" r="0" b="0"/>
             <wp:docPr id="3" name="04_p4_grad_per_layer.png" descr="Patient 4: the gradient vanishes layer after layer with sigmoids; ReLU + He init fixes it." title="Patient 4: the gradient vanishes layer after layer with sigmoids; ReLU + He init fixes it."/>
@@ -8746,7 +8807,7 @@
       <w:pPr>
         <w:pStyle w:val="Titre2"/>
       </w:pPr>
-      <w:bookmarkStart w:id="35" w:name="_Toc243405026"/>
+      <w:bookmarkStart w:id="35" w:name="_Toc243410322"/>
       <w:r>
         <w:t>Lessons to say at the oral</w:t>
       </w:r>
@@ -8839,7 +8900,7 @@
         <w:pStyle w:val="Titre1"/>
         <w:pageBreakBefore/>
       </w:pPr>
-      <w:bookmarkStart w:id="36" w:name="_Toc243405027"/>
+      <w:bookmarkStart w:id="36" w:name="_Toc243410323"/>
       <w:r>
         <w:lastRenderedPageBreak/>
         <w:t>7. Step 5: pretrained ResNet18 (notebook 05)</w:t>
@@ -9046,7 +9107,7 @@
       <w:pPr>
         <w:pStyle w:val="Titre2"/>
       </w:pPr>
-      <w:bookmarkStart w:id="37" w:name="_Toc243405028"/>
+      <w:bookmarkStart w:id="37" w:name="_Toc243410324"/>
       <w:r>
         <w:t>Why a CNN, and why pretrained</w:t>
       </w:r>
@@ -9131,7 +9192,7 @@
       <w:pPr>
         <w:pStyle w:val="Titre2"/>
       </w:pPr>
-      <w:bookmarkStart w:id="38" w:name="_Toc243405029"/>
+      <w:bookmarkStart w:id="38" w:name="_Toc243410325"/>
       <w:r>
         <w:t>Method A: frozen features + head</w:t>
       </w:r>
@@ -9238,7 +9299,7 @@
       <w:pPr>
         <w:pStyle w:val="Titre2"/>
       </w:pPr>
-      <w:bookmarkStart w:id="39" w:name="_Toc243405030"/>
+      <w:bookmarkStart w:id="39" w:name="_Toc243410326"/>
       <w:r>
         <w:t>Method B: fine-tuning layer4</w:t>
       </w:r>
@@ -9295,7 +9356,7 @@
       <w:pPr>
         <w:pStyle w:val="Titre2"/>
       </w:pPr>
-      <w:bookmarkStart w:id="40" w:name="_Toc243405031"/>
+      <w:bookmarkStart w:id="40" w:name="_Toc243410327"/>
       <w:r>
         <w:t>Two silent bugs, measured</w:t>
       </w:r>
@@ -9362,7 +9423,7 @@
       <w:pPr>
         <w:pStyle w:val="Titre2"/>
       </w:pPr>
-      <w:bookmarkStart w:id="41" w:name="_Toc243405032"/>
+      <w:bookmarkStart w:id="41" w:name="_Toc243410328"/>
       <w:r>
         <w:lastRenderedPageBreak/>
         <w:t>Painter leakage, measured fairly</w:t>
@@ -9704,7 +9765,7 @@
           <w:noProof/>
         </w:rPr>
         <w:drawing>
-          <wp:inline distT="0" distB="0" distL="0" distR="0" wp14:anchorId="74A0DC6B" wp14:editId="74A0DC6C">
+          <wp:inline distT="0" distB="0" distL="0" distR="0" wp14:anchorId="01918B01" wp14:editId="01918B02">
             <wp:extent cx="4762500" cy="2524125"/>
             <wp:effectExtent l="0" t="0" r="0" b="0"/>
             <wp:docPr id="4" name="05_painter_leakage.png" descr="Painter leakage: same images, same model; only the known-painter group changes." title="Painter leakage: same images, same model; only the known-painter group changes."/>
@@ -9779,7 +9840,7 @@
         <w:pStyle w:val="Titre1"/>
         <w:pageBreakBefore/>
       </w:pPr>
-      <w:bookmarkStart w:id="42" w:name="_Toc243405033"/>
+      <w:bookmarkStart w:id="42" w:name="_Toc243410329"/>
       <w:r>
         <w:lastRenderedPageBreak/>
         <w:t>8. Step 6: final test, CPU cost and recommendation (notebook 06)</w:t>
@@ -9925,7 +9986,7 @@
       <w:pPr>
         <w:pStyle w:val="Titre2"/>
       </w:pPr>
-      <w:bookmarkStart w:id="43" w:name="_Toc243405034"/>
+      <w:bookmarkStart w:id="43" w:name="_Toc243410330"/>
       <w:r>
         <w:t>Classical models (settings chosen on validation)</w:t>
       </w:r>
@@ -10038,7 +10099,7 @@
       <w:pPr>
         <w:pStyle w:val="Titre2"/>
       </w:pPr>
-      <w:bookmarkStart w:id="44" w:name="_Toc243405035"/>
+      <w:bookmarkStart w:id="44" w:name="_Toc243410331"/>
       <w:r>
         <w:t>The final test, measured once</w:t>
       </w:r>
@@ -11069,7 +11130,7 @@
         </w:rPr>
         <w:lastRenderedPageBreak/>
         <w:drawing>
-          <wp:inline distT="0" distB="0" distL="0" distR="0" wp14:anchorId="74A0DC6D" wp14:editId="74A0DC6E">
+          <wp:inline distT="0" distB="0" distL="0" distR="0" wp14:anchorId="01918B03" wp14:editId="01918B04">
             <wp:extent cx="4762500" cy="1971675"/>
             <wp:effectExtent l="0" t="0" r="0" b="0"/>
             <wp:docPr id="5" name="06_test_accuracy.png" descr="Final test: 220 paintings never seen before, with 95 % bootstrap intervals." title="Final test: 220 paintings never seen before, with 95 % bootstrap intervals."/>
@@ -11128,7 +11189,7 @@
       <w:pPr>
         <w:pStyle w:val="Titre2"/>
       </w:pPr>
-      <w:bookmarkStart w:id="45" w:name="_Toc243405036"/>
+      <w:bookmarkStart w:id="45" w:name="_Toc243410332"/>
       <w:r>
         <w:t>Are the gaps real? Paired bootstrap (same 220 paintings, 5 000 redraws)</w:t>
       </w:r>
@@ -11187,7 +11248,7 @@
       <w:pPr>
         <w:pStyle w:val="Titre2"/>
       </w:pPr>
-      <w:bookmarkStart w:id="46" w:name="_Toc243405037"/>
+      <w:bookmarkStart w:id="46" w:name="_Toc243410333"/>
       <w:r>
         <w:t>Frozen or fine-tuned? Validation and test disagree</w:t>
       </w:r>
@@ -11215,7 +11276,7 @@
       <w:pPr>
         <w:pStyle w:val="Titre2"/>
       </w:pPr>
-      <w:bookmarkStart w:id="47" w:name="_Toc243405038"/>
+      <w:bookmarkStart w:id="47" w:name="_Toc243410334"/>
       <w:r>
         <w:t>Speed and size</w:t>
       </w:r>
@@ -11233,7 +11294,7 @@
       <w:pPr>
         <w:pStyle w:val="Titre2"/>
       </w:pPr>
-      <w:bookmarkStart w:id="48" w:name="_Toc243405039"/>
+      <w:bookmarkStart w:id="48" w:name="_Toc243410335"/>
       <w:r>
         <w:t>Recommendation to the director</w:t>
       </w:r>
@@ -11330,12 +11391,939 @@
         <w:pStyle w:val="Titre1"/>
         <w:pageBreakBefore/>
       </w:pPr>
-      <w:bookmarkStart w:id="49" w:name="_Toc243405040"/>
+      <w:bookmarkStart w:id="49" w:name="_Toc243410336"/>
       <w:r>
         <w:lastRenderedPageBreak/>
-        <w:t>9. Key numbers to know by heart</w:t>
+        <w:t>9. Bonus: what about transformers like BERT? (notebook 07)</w:t>
       </w:r>
       <w:bookmarkEnd w:id="49"/>
+    </w:p>
+    <w:tbl>
+      <w:tblPr>
+        <w:tblW w:w="9638" w:type="dxa"/>
+        <w:tblBorders>
+          <w:top w:val="single" w:sz="4" w:space="0" w:color="auto"/>
+          <w:left w:val="single" w:sz="4" w:space="0" w:color="auto"/>
+          <w:bottom w:val="single" w:sz="4" w:space="0" w:color="auto"/>
+          <w:right w:val="single" w:sz="4" w:space="0" w:color="auto"/>
+          <w:insideH w:val="single" w:sz="4" w:space="0" w:color="auto"/>
+          <w:insideV w:val="single" w:sz="4" w:space="0" w:color="auto"/>
+        </w:tblBorders>
+        <w:tblLook w:val="04A0" w:firstRow="1" w:lastRow="0" w:firstColumn="1" w:lastColumn="0" w:noHBand="0" w:noVBand="1"/>
+      </w:tblPr>
+      <w:tblGrid>
+        <w:gridCol w:w="9638"/>
+      </w:tblGrid>
+      <w:tr>
+        <w:tc>
+          <w:tcPr>
+            <w:tcW w:w="9638" w:type="dxa"/>
+            <w:tcBorders>
+              <w:top w:val="single" w:sz="6" w:space="0" w:color="BFD6F5"/>
+              <w:left w:val="single" w:sz="6" w:space="0" w:color="BFD6F5"/>
+              <w:bottom w:val="single" w:sz="6" w:space="0" w:color="BFD6F5"/>
+              <w:right w:val="single" w:sz="6" w:space="0" w:color="BFD6F5"/>
+            </w:tcBorders>
+            <w:shd w:val="clear" w:color="auto" w:fill="EEF4FC"/>
+            <w:tcMar>
+              <w:top w:w="140" w:type="dxa"/>
+              <w:left w:w="180" w:type="dxa"/>
+              <w:bottom w:w="80" w:type="dxa"/>
+              <w:right w:w="180" w:type="dxa"/>
+            </w:tcMar>
+          </w:tcPr>
+          <w:p>
+            <w:pPr>
+              <w:spacing w:after="100"/>
+            </w:pPr>
+            <w:r>
+              <w:rPr>
+                <w:b/>
+                <w:bCs/>
+                <w:color w:val="1C5FB0"/>
+              </w:rPr>
+              <w:t>In simple words</w:t>
+            </w:r>
+          </w:p>
+          <w:p>
+            <w:pPr>
+              <w:spacing w:after="120"/>
+            </w:pPr>
+            <w:r>
+              <w:rPr>
+                <w:b/>
+                <w:bCs/>
+              </w:rPr>
+              <w:t>BERT is a reader of words.</w:t>
+            </w:r>
+            <w:r>
+              <w:t xml:space="preserve"> It has read millions of books, but it has never looked at a picture: it cannot tell the style of a painting by itself.</w:t>
+            </w:r>
+          </w:p>
+          <w:p>
+            <w:pPr>
+              <w:spacing w:after="120"/>
+            </w:pPr>
+            <w:r>
+              <w:rPr>
+                <w:b/>
+                <w:bCs/>
+              </w:rPr>
+              <w:t>ViT is the same reader, given a painting cut into 196 small squares</w:t>
+            </w:r>
+            <w:r>
+              <w:t xml:space="preserve"> that it reads like words. Trained on the same ImageNet photos as our ResNet, it ends up just as good (88.1 %), but it is much heavier: 9 times slower.</w:t>
+            </w:r>
+          </w:p>
+          <w:p>
+            <w:pPr>
+              <w:spacing w:after="120"/>
+            </w:pPr>
+            <w:r>
+              <w:rPr>
+                <w:b/>
+                <w:bCs/>
+              </w:rPr>
+              <w:t>CLIP learned from 400 million picture books</w:t>
+            </w:r>
+            <w:r>
+              <w:t xml:space="preserve"> (an image with its caption). So it knows that a certain look goes with the words "Impressionist painting". We can just </w:t>
+            </w:r>
+            <w:r>
+              <w:rPr>
+                <w:b/>
+                <w:bCs/>
+              </w:rPr>
+              <w:t>tell it the names of the styles</w:t>
+            </w:r>
+            <w:r>
+              <w:t xml:space="preserve"> and it chooses the closest one, without any training (zero-shot): 89.0 %. With our small grading sheet on top: </w:t>
+            </w:r>
+            <w:r>
+              <w:rPr>
+                <w:b/>
+                <w:bCs/>
+              </w:rPr>
+              <w:t>94.7 %</w:t>
+            </w:r>
+            <w:r>
+              <w:t>.</w:t>
+            </w:r>
+          </w:p>
+          <w:p>
+            <w:pPr>
+              <w:spacing w:after="120"/>
+            </w:pPr>
+            <w:r>
+              <w:rPr>
+                <w:b/>
+                <w:bCs/>
+              </w:rPr>
+              <w:t>The catch</w:t>
+            </w:r>
+            <w:r>
+              <w:t xml:space="preserve">: CLIP's picture books came from the Internet, where WikiArt paintings and their captions are. It may have </w:t>
+            </w:r>
+            <w:r>
+              <w:rPr>
+                <w:b/>
+                <w:bCs/>
+              </w:rPr>
+              <w:t>already seen our exact paintings</w:t>
+            </w:r>
+            <w:r>
+              <w:t>, like a student who saw the exam questions in a book. So we keep our recommendation and make CLIP the first next step, to be tested on real kiosk photos.</w:t>
+            </w:r>
+          </w:p>
+        </w:tc>
+      </w:tr>
+    </w:tbl>
+    <w:p>
+      <w:pPr>
+        <w:spacing w:after="160"/>
+      </w:pPr>
+    </w:p>
+    <w:p>
+      <w:pPr>
+        <w:spacing w:after="160"/>
+      </w:pPr>
+      <w:r>
+        <w:rPr>
+          <w:color w:val="1C2433"/>
+        </w:rPr>
+        <w:t>On validation, CLIP with a linear head is 6.8 points better than our ResNet18; ViT is not better; CLIP without any training equals our trained ResNet18.</w:t>
+      </w:r>
+    </w:p>
+    <w:tbl>
+      <w:tblPr>
+        <w:tblW w:w="9638" w:type="dxa"/>
+        <w:tblBorders>
+          <w:top w:val="single" w:sz="4" w:space="0" w:color="auto"/>
+          <w:left w:val="single" w:sz="4" w:space="0" w:color="auto"/>
+          <w:bottom w:val="single" w:sz="4" w:space="0" w:color="auto"/>
+          <w:right w:val="single" w:sz="4" w:space="0" w:color="auto"/>
+          <w:insideH w:val="single" w:sz="4" w:space="0" w:color="auto"/>
+          <w:insideV w:val="single" w:sz="4" w:space="0" w:color="auto"/>
+        </w:tblBorders>
+        <w:tblLook w:val="04A0" w:firstRow="1" w:lastRow="0" w:firstColumn="1" w:lastColumn="0" w:noHBand="0" w:noVBand="1"/>
+      </w:tblPr>
+      <w:tblGrid>
+        <w:gridCol w:w="4433"/>
+        <w:gridCol w:w="1735"/>
+        <w:gridCol w:w="1735"/>
+        <w:gridCol w:w="1735"/>
+      </w:tblGrid>
+      <w:tr>
+        <w:trPr>
+          <w:tblHeader/>
+        </w:trPr>
+        <w:tc>
+          <w:tcPr>
+            <w:tcW w:w="4433" w:type="dxa"/>
+            <w:tcBorders>
+              <w:top w:val="single" w:sz="4" w:space="0" w:color="D9DCE2"/>
+              <w:left w:val="single" w:sz="4" w:space="0" w:color="D9DCE2"/>
+              <w:bottom w:val="single" w:sz="4" w:space="0" w:color="D9DCE2"/>
+              <w:right w:val="single" w:sz="4" w:space="0" w:color="D9DCE2"/>
+            </w:tcBorders>
+            <w:shd w:val="clear" w:color="auto" w:fill="1C2433"/>
+            <w:tcMar>
+              <w:top w:w="60" w:type="dxa"/>
+              <w:left w:w="100" w:type="dxa"/>
+              <w:bottom w:w="60" w:type="dxa"/>
+              <w:right w:w="100" w:type="dxa"/>
+            </w:tcMar>
+          </w:tcPr>
+          <w:p>
+            <w:r>
+              <w:rPr>
+                <w:b/>
+                <w:bCs/>
+                <w:color w:val="FFFFFF"/>
+                <w:sz w:val="19"/>
+                <w:szCs w:val="19"/>
+              </w:rPr>
+              <w:t>Frozen network (validation, 219 paintings)</w:t>
+            </w:r>
+          </w:p>
+        </w:tc>
+        <w:tc>
+          <w:tcPr>
+            <w:tcW w:w="1735" w:type="dxa"/>
+            <w:tcBorders>
+              <w:top w:val="single" w:sz="4" w:space="0" w:color="D9DCE2"/>
+              <w:left w:val="single" w:sz="4" w:space="0" w:color="D9DCE2"/>
+              <w:bottom w:val="single" w:sz="4" w:space="0" w:color="D9DCE2"/>
+              <w:right w:val="single" w:sz="4" w:space="0" w:color="D9DCE2"/>
+            </w:tcBorders>
+            <w:shd w:val="clear" w:color="auto" w:fill="1C2433"/>
+            <w:tcMar>
+              <w:top w:w="60" w:type="dxa"/>
+              <w:left w:w="100" w:type="dxa"/>
+              <w:bottom w:w="60" w:type="dxa"/>
+              <w:right w:w="100" w:type="dxa"/>
+            </w:tcMar>
+          </w:tcPr>
+          <w:p>
+            <w:r>
+              <w:rPr>
+                <w:b/>
+                <w:bCs/>
+                <w:color w:val="FFFFFF"/>
+                <w:sz w:val="19"/>
+                <w:szCs w:val="19"/>
+              </w:rPr>
+              <w:t>Validation</w:t>
+            </w:r>
+          </w:p>
+        </w:tc>
+        <w:tc>
+          <w:tcPr>
+            <w:tcW w:w="1735" w:type="dxa"/>
+            <w:tcBorders>
+              <w:top w:val="single" w:sz="4" w:space="0" w:color="D9DCE2"/>
+              <w:left w:val="single" w:sz="4" w:space="0" w:color="D9DCE2"/>
+              <w:bottom w:val="single" w:sz="4" w:space="0" w:color="D9DCE2"/>
+              <w:right w:val="single" w:sz="4" w:space="0" w:color="D9DCE2"/>
+            </w:tcBorders>
+            <w:shd w:val="clear" w:color="auto" w:fill="1C2433"/>
+            <w:tcMar>
+              <w:top w:w="60" w:type="dxa"/>
+              <w:left w:w="100" w:type="dxa"/>
+              <w:bottom w:w="60" w:type="dxa"/>
+              <w:right w:w="100" w:type="dxa"/>
+            </w:tcMar>
+          </w:tcPr>
+          <w:p>
+            <w:r>
+              <w:rPr>
+                <w:b/>
+                <w:bCs/>
+                <w:color w:val="FFFFFF"/>
+                <w:sz w:val="19"/>
+                <w:szCs w:val="19"/>
+              </w:rPr>
+              <w:t>Time vs ResNet18</w:t>
+            </w:r>
+          </w:p>
+        </w:tc>
+        <w:tc>
+          <w:tcPr>
+            <w:tcW w:w="1735" w:type="dxa"/>
+            <w:tcBorders>
+              <w:top w:val="single" w:sz="4" w:space="0" w:color="D9DCE2"/>
+              <w:left w:val="single" w:sz="4" w:space="0" w:color="D9DCE2"/>
+              <w:bottom w:val="single" w:sz="4" w:space="0" w:color="D9DCE2"/>
+              <w:right w:val="single" w:sz="4" w:space="0" w:color="D9DCE2"/>
+            </w:tcBorders>
+            <w:shd w:val="clear" w:color="auto" w:fill="1C2433"/>
+            <w:tcMar>
+              <w:top w:w="60" w:type="dxa"/>
+              <w:left w:w="100" w:type="dxa"/>
+              <w:bottom w:w="60" w:type="dxa"/>
+              <w:right w:w="100" w:type="dxa"/>
+            </w:tcMar>
+          </w:tcPr>
+          <w:p>
+            <w:r>
+              <w:rPr>
+                <w:b/>
+                <w:bCs/>
+                <w:color w:val="FFFFFF"/>
+                <w:sz w:val="19"/>
+                <w:szCs w:val="19"/>
+              </w:rPr>
+              <w:t>Parameters</w:t>
+            </w:r>
+          </w:p>
+        </w:tc>
+      </w:tr>
+      <w:tr>
+        <w:tc>
+          <w:tcPr>
+            <w:tcW w:w="4433" w:type="dxa"/>
+            <w:tcBorders>
+              <w:top w:val="single" w:sz="4" w:space="0" w:color="D9DCE2"/>
+              <w:left w:val="single" w:sz="4" w:space="0" w:color="D9DCE2"/>
+              <w:bottom w:val="single" w:sz="4" w:space="0" w:color="D9DCE2"/>
+              <w:right w:val="single" w:sz="4" w:space="0" w:color="D9DCE2"/>
+            </w:tcBorders>
+            <w:tcMar>
+              <w:top w:w="60" w:type="dxa"/>
+              <w:left w:w="100" w:type="dxa"/>
+              <w:bottom w:w="60" w:type="dxa"/>
+              <w:right w:w="100" w:type="dxa"/>
+            </w:tcMar>
+          </w:tcPr>
+          <w:p>
+            <w:r>
+              <w:rPr>
+                <w:sz w:val="19"/>
+                <w:szCs w:val="19"/>
+              </w:rPr>
+              <w:t>ResNet18 + linear head (our choice)</w:t>
+            </w:r>
+          </w:p>
+        </w:tc>
+        <w:tc>
+          <w:tcPr>
+            <w:tcW w:w="1735" w:type="dxa"/>
+            <w:tcBorders>
+              <w:top w:val="single" w:sz="4" w:space="0" w:color="D9DCE2"/>
+              <w:left w:val="single" w:sz="4" w:space="0" w:color="D9DCE2"/>
+              <w:bottom w:val="single" w:sz="4" w:space="0" w:color="D9DCE2"/>
+              <w:right w:val="single" w:sz="4" w:space="0" w:color="D9DCE2"/>
+            </w:tcBorders>
+            <w:tcMar>
+              <w:top w:w="60" w:type="dxa"/>
+              <w:left w:w="100" w:type="dxa"/>
+              <w:bottom w:w="60" w:type="dxa"/>
+              <w:right w:w="100" w:type="dxa"/>
+            </w:tcMar>
+          </w:tcPr>
+          <w:p>
+            <w:r>
+              <w:rPr>
+                <w:sz w:val="19"/>
+                <w:szCs w:val="19"/>
+              </w:rPr>
+              <w:t>88.1 %</w:t>
+            </w:r>
+          </w:p>
+        </w:tc>
+        <w:tc>
+          <w:tcPr>
+            <w:tcW w:w="1735" w:type="dxa"/>
+            <w:tcBorders>
+              <w:top w:val="single" w:sz="4" w:space="0" w:color="D9DCE2"/>
+              <w:left w:val="single" w:sz="4" w:space="0" w:color="D9DCE2"/>
+              <w:bottom w:val="single" w:sz="4" w:space="0" w:color="D9DCE2"/>
+              <w:right w:val="single" w:sz="4" w:space="0" w:color="D9DCE2"/>
+            </w:tcBorders>
+            <w:tcMar>
+              <w:top w:w="60" w:type="dxa"/>
+              <w:left w:w="100" w:type="dxa"/>
+              <w:bottom w:w="60" w:type="dxa"/>
+              <w:right w:w="100" w:type="dxa"/>
+            </w:tcMar>
+          </w:tcPr>
+          <w:p>
+            <w:r>
+              <w:rPr>
+                <w:sz w:val="19"/>
+                <w:szCs w:val="19"/>
+              </w:rPr>
+              <w:t>x 1</w:t>
+            </w:r>
+          </w:p>
+        </w:tc>
+        <w:tc>
+          <w:tcPr>
+            <w:tcW w:w="1735" w:type="dxa"/>
+            <w:tcBorders>
+              <w:top w:val="single" w:sz="4" w:space="0" w:color="D9DCE2"/>
+              <w:left w:val="single" w:sz="4" w:space="0" w:color="D9DCE2"/>
+              <w:bottom w:val="single" w:sz="4" w:space="0" w:color="D9DCE2"/>
+              <w:right w:val="single" w:sz="4" w:space="0" w:color="D9DCE2"/>
+            </w:tcBorders>
+            <w:tcMar>
+              <w:top w:w="60" w:type="dxa"/>
+              <w:left w:w="100" w:type="dxa"/>
+              <w:bottom w:w="60" w:type="dxa"/>
+              <w:right w:w="100" w:type="dxa"/>
+            </w:tcMar>
+          </w:tcPr>
+          <w:p>
+            <w:r>
+              <w:rPr>
+                <w:sz w:val="19"/>
+                <w:szCs w:val="19"/>
+              </w:rPr>
+              <w:t>11 M</w:t>
+            </w:r>
+          </w:p>
+        </w:tc>
+      </w:tr>
+      <w:tr>
+        <w:tc>
+          <w:tcPr>
+            <w:tcW w:w="4433" w:type="dxa"/>
+            <w:tcBorders>
+              <w:top w:val="single" w:sz="4" w:space="0" w:color="D9DCE2"/>
+              <w:left w:val="single" w:sz="4" w:space="0" w:color="D9DCE2"/>
+              <w:bottom w:val="single" w:sz="4" w:space="0" w:color="D9DCE2"/>
+              <w:right w:val="single" w:sz="4" w:space="0" w:color="D9DCE2"/>
+            </w:tcBorders>
+            <w:shd w:val="clear" w:color="auto" w:fill="F2F3F5"/>
+            <w:tcMar>
+              <w:top w:w="60" w:type="dxa"/>
+              <w:left w:w="100" w:type="dxa"/>
+              <w:bottom w:w="60" w:type="dxa"/>
+              <w:right w:w="100" w:type="dxa"/>
+            </w:tcMar>
+          </w:tcPr>
+          <w:p>
+            <w:r>
+              <w:rPr>
+                <w:sz w:val="19"/>
+                <w:szCs w:val="19"/>
+              </w:rPr>
+              <w:t>ViT-B/16 (BERT architecture on image patches) + linear head</w:t>
+            </w:r>
+          </w:p>
+        </w:tc>
+        <w:tc>
+          <w:tcPr>
+            <w:tcW w:w="1735" w:type="dxa"/>
+            <w:tcBorders>
+              <w:top w:val="single" w:sz="4" w:space="0" w:color="D9DCE2"/>
+              <w:left w:val="single" w:sz="4" w:space="0" w:color="D9DCE2"/>
+              <w:bottom w:val="single" w:sz="4" w:space="0" w:color="D9DCE2"/>
+              <w:right w:val="single" w:sz="4" w:space="0" w:color="D9DCE2"/>
+            </w:tcBorders>
+            <w:shd w:val="clear" w:color="auto" w:fill="F2F3F5"/>
+            <w:tcMar>
+              <w:top w:w="60" w:type="dxa"/>
+              <w:left w:w="100" w:type="dxa"/>
+              <w:bottom w:w="60" w:type="dxa"/>
+              <w:right w:w="100" w:type="dxa"/>
+            </w:tcMar>
+          </w:tcPr>
+          <w:p>
+            <w:r>
+              <w:rPr>
+                <w:sz w:val="19"/>
+                <w:szCs w:val="19"/>
+              </w:rPr>
+              <w:t>88.1 % (std 0.5)</w:t>
+            </w:r>
+          </w:p>
+        </w:tc>
+        <w:tc>
+          <w:tcPr>
+            <w:tcW w:w="1735" w:type="dxa"/>
+            <w:tcBorders>
+              <w:top w:val="single" w:sz="4" w:space="0" w:color="D9DCE2"/>
+              <w:left w:val="single" w:sz="4" w:space="0" w:color="D9DCE2"/>
+              <w:bottom w:val="single" w:sz="4" w:space="0" w:color="D9DCE2"/>
+              <w:right w:val="single" w:sz="4" w:space="0" w:color="D9DCE2"/>
+            </w:tcBorders>
+            <w:shd w:val="clear" w:color="auto" w:fill="F2F3F5"/>
+            <w:tcMar>
+              <w:top w:w="60" w:type="dxa"/>
+              <w:left w:w="100" w:type="dxa"/>
+              <w:bottom w:w="60" w:type="dxa"/>
+              <w:right w:w="100" w:type="dxa"/>
+            </w:tcMar>
+          </w:tcPr>
+          <w:p>
+            <w:r>
+              <w:rPr>
+                <w:sz w:val="19"/>
+                <w:szCs w:val="19"/>
+              </w:rPr>
+              <w:t>x 9</w:t>
+            </w:r>
+          </w:p>
+        </w:tc>
+        <w:tc>
+          <w:tcPr>
+            <w:tcW w:w="1735" w:type="dxa"/>
+            <w:tcBorders>
+              <w:top w:val="single" w:sz="4" w:space="0" w:color="D9DCE2"/>
+              <w:left w:val="single" w:sz="4" w:space="0" w:color="D9DCE2"/>
+              <w:bottom w:val="single" w:sz="4" w:space="0" w:color="D9DCE2"/>
+              <w:right w:val="single" w:sz="4" w:space="0" w:color="D9DCE2"/>
+            </w:tcBorders>
+            <w:shd w:val="clear" w:color="auto" w:fill="F2F3F5"/>
+            <w:tcMar>
+              <w:top w:w="60" w:type="dxa"/>
+              <w:left w:w="100" w:type="dxa"/>
+              <w:bottom w:w="60" w:type="dxa"/>
+              <w:right w:w="100" w:type="dxa"/>
+            </w:tcMar>
+          </w:tcPr>
+          <w:p>
+            <w:r>
+              <w:rPr>
+                <w:sz w:val="19"/>
+                <w:szCs w:val="19"/>
+              </w:rPr>
+              <w:t>86 M</w:t>
+            </w:r>
+          </w:p>
+        </w:tc>
+      </w:tr>
+      <w:tr>
+        <w:tc>
+          <w:tcPr>
+            <w:tcW w:w="4433" w:type="dxa"/>
+            <w:tcBorders>
+              <w:top w:val="single" w:sz="4" w:space="0" w:color="D9DCE2"/>
+              <w:left w:val="single" w:sz="4" w:space="0" w:color="D9DCE2"/>
+              <w:bottom w:val="single" w:sz="4" w:space="0" w:color="D9DCE2"/>
+              <w:right w:val="single" w:sz="4" w:space="0" w:color="D9DCE2"/>
+            </w:tcBorders>
+            <w:tcMar>
+              <w:top w:w="60" w:type="dxa"/>
+              <w:left w:w="100" w:type="dxa"/>
+              <w:bottom w:w="60" w:type="dxa"/>
+              <w:right w:w="100" w:type="dxa"/>
+            </w:tcMar>
+          </w:tcPr>
+          <w:p>
+            <w:r>
+              <w:rPr>
+                <w:sz w:val="19"/>
+                <w:szCs w:val="19"/>
+              </w:rPr>
+              <w:t>CLIP ViT-B/32, zero-shot (one sentence per style, no training)</w:t>
+            </w:r>
+          </w:p>
+        </w:tc>
+        <w:tc>
+          <w:tcPr>
+            <w:tcW w:w="1735" w:type="dxa"/>
+            <w:tcBorders>
+              <w:top w:val="single" w:sz="4" w:space="0" w:color="D9DCE2"/>
+              <w:left w:val="single" w:sz="4" w:space="0" w:color="D9DCE2"/>
+              <w:bottom w:val="single" w:sz="4" w:space="0" w:color="D9DCE2"/>
+              <w:right w:val="single" w:sz="4" w:space="0" w:color="D9DCE2"/>
+            </w:tcBorders>
+            <w:tcMar>
+              <w:top w:w="60" w:type="dxa"/>
+              <w:left w:w="100" w:type="dxa"/>
+              <w:bottom w:w="60" w:type="dxa"/>
+              <w:right w:w="100" w:type="dxa"/>
+            </w:tcMar>
+          </w:tcPr>
+          <w:p>
+            <w:r>
+              <w:rPr>
+                <w:sz w:val="19"/>
+                <w:szCs w:val="19"/>
+              </w:rPr>
+              <w:t>89.0 %</w:t>
+            </w:r>
+          </w:p>
+        </w:tc>
+        <w:tc>
+          <w:tcPr>
+            <w:tcW w:w="1735" w:type="dxa"/>
+            <w:tcBorders>
+              <w:top w:val="single" w:sz="4" w:space="0" w:color="D9DCE2"/>
+              <w:left w:val="single" w:sz="4" w:space="0" w:color="D9DCE2"/>
+              <w:bottom w:val="single" w:sz="4" w:space="0" w:color="D9DCE2"/>
+              <w:right w:val="single" w:sz="4" w:space="0" w:color="D9DCE2"/>
+            </w:tcBorders>
+            <w:tcMar>
+              <w:top w:w="60" w:type="dxa"/>
+              <w:left w:w="100" w:type="dxa"/>
+              <w:bottom w:w="60" w:type="dxa"/>
+              <w:right w:w="100" w:type="dxa"/>
+            </w:tcMar>
+          </w:tcPr>
+          <w:p>
+            <w:r>
+              <w:rPr>
+                <w:sz w:val="19"/>
+                <w:szCs w:val="19"/>
+              </w:rPr>
+              <w:t>x 2.7</w:t>
+            </w:r>
+          </w:p>
+        </w:tc>
+        <w:tc>
+          <w:tcPr>
+            <w:tcW w:w="1735" w:type="dxa"/>
+            <w:tcBorders>
+              <w:top w:val="single" w:sz="4" w:space="0" w:color="D9DCE2"/>
+              <w:left w:val="single" w:sz="4" w:space="0" w:color="D9DCE2"/>
+              <w:bottom w:val="single" w:sz="4" w:space="0" w:color="D9DCE2"/>
+              <w:right w:val="single" w:sz="4" w:space="0" w:color="D9DCE2"/>
+            </w:tcBorders>
+            <w:tcMar>
+              <w:top w:w="60" w:type="dxa"/>
+              <w:left w:w="100" w:type="dxa"/>
+              <w:bottom w:w="60" w:type="dxa"/>
+              <w:right w:w="100" w:type="dxa"/>
+            </w:tcMar>
+          </w:tcPr>
+          <w:p>
+            <w:r>
+              <w:rPr>
+                <w:sz w:val="19"/>
+                <w:szCs w:val="19"/>
+              </w:rPr>
+              <w:t>151 M (88 M for images)</w:t>
+            </w:r>
+          </w:p>
+        </w:tc>
+      </w:tr>
+      <w:tr>
+        <w:tc>
+          <w:tcPr>
+            <w:tcW w:w="4433" w:type="dxa"/>
+            <w:tcBorders>
+              <w:top w:val="single" w:sz="4" w:space="0" w:color="D9DCE2"/>
+              <w:left w:val="single" w:sz="4" w:space="0" w:color="D9DCE2"/>
+              <w:bottom w:val="single" w:sz="4" w:space="0" w:color="D9DCE2"/>
+              <w:right w:val="single" w:sz="4" w:space="0" w:color="D9DCE2"/>
+            </w:tcBorders>
+            <w:shd w:val="clear" w:color="auto" w:fill="F2F3F5"/>
+            <w:tcMar>
+              <w:top w:w="60" w:type="dxa"/>
+              <w:left w:w="100" w:type="dxa"/>
+              <w:bottom w:w="60" w:type="dxa"/>
+              <w:right w:w="100" w:type="dxa"/>
+            </w:tcMar>
+          </w:tcPr>
+          <w:p>
+            <w:r>
+              <w:rPr>
+                <w:b/>
+                <w:bCs/>
+                <w:sz w:val="19"/>
+                <w:szCs w:val="19"/>
+              </w:rPr>
+              <w:t>CLIP ViT-B/32 + linear head</w:t>
+            </w:r>
+          </w:p>
+        </w:tc>
+        <w:tc>
+          <w:tcPr>
+            <w:tcW w:w="1735" w:type="dxa"/>
+            <w:tcBorders>
+              <w:top w:val="single" w:sz="4" w:space="0" w:color="D9DCE2"/>
+              <w:left w:val="single" w:sz="4" w:space="0" w:color="D9DCE2"/>
+              <w:bottom w:val="single" w:sz="4" w:space="0" w:color="D9DCE2"/>
+              <w:right w:val="single" w:sz="4" w:space="0" w:color="D9DCE2"/>
+            </w:tcBorders>
+            <w:shd w:val="clear" w:color="auto" w:fill="F2F3F5"/>
+            <w:tcMar>
+              <w:top w:w="60" w:type="dxa"/>
+              <w:left w:w="100" w:type="dxa"/>
+              <w:bottom w:w="60" w:type="dxa"/>
+              <w:right w:w="100" w:type="dxa"/>
+            </w:tcMar>
+          </w:tcPr>
+          <w:p>
+            <w:r>
+              <w:rPr>
+                <w:b/>
+                <w:bCs/>
+                <w:sz w:val="19"/>
+                <w:szCs w:val="19"/>
+              </w:rPr>
+              <w:t>94.7 %</w:t>
+            </w:r>
+            <w:r>
+              <w:rPr>
+                <w:sz w:val="19"/>
+                <w:szCs w:val="19"/>
+              </w:rPr>
+              <w:t xml:space="preserve"> (std 0.3)</w:t>
+            </w:r>
+          </w:p>
+        </w:tc>
+        <w:tc>
+          <w:tcPr>
+            <w:tcW w:w="1735" w:type="dxa"/>
+            <w:tcBorders>
+              <w:top w:val="single" w:sz="4" w:space="0" w:color="D9DCE2"/>
+              <w:left w:val="single" w:sz="4" w:space="0" w:color="D9DCE2"/>
+              <w:bottom w:val="single" w:sz="4" w:space="0" w:color="D9DCE2"/>
+              <w:right w:val="single" w:sz="4" w:space="0" w:color="D9DCE2"/>
+            </w:tcBorders>
+            <w:shd w:val="clear" w:color="auto" w:fill="F2F3F5"/>
+            <w:tcMar>
+              <w:top w:w="60" w:type="dxa"/>
+              <w:left w:w="100" w:type="dxa"/>
+              <w:bottom w:w="60" w:type="dxa"/>
+              <w:right w:w="100" w:type="dxa"/>
+            </w:tcMar>
+          </w:tcPr>
+          <w:p>
+            <w:r>
+              <w:rPr>
+                <w:sz w:val="19"/>
+                <w:szCs w:val="19"/>
+              </w:rPr>
+              <w:t>x 2.7</w:t>
+            </w:r>
+          </w:p>
+        </w:tc>
+        <w:tc>
+          <w:tcPr>
+            <w:tcW w:w="1735" w:type="dxa"/>
+            <w:tcBorders>
+              <w:top w:val="single" w:sz="4" w:space="0" w:color="D9DCE2"/>
+              <w:left w:val="single" w:sz="4" w:space="0" w:color="D9DCE2"/>
+              <w:bottom w:val="single" w:sz="4" w:space="0" w:color="D9DCE2"/>
+              <w:right w:val="single" w:sz="4" w:space="0" w:color="D9DCE2"/>
+            </w:tcBorders>
+            <w:shd w:val="clear" w:color="auto" w:fill="F2F3F5"/>
+            <w:tcMar>
+              <w:top w:w="60" w:type="dxa"/>
+              <w:left w:w="100" w:type="dxa"/>
+              <w:bottom w:w="60" w:type="dxa"/>
+              <w:right w:w="100" w:type="dxa"/>
+            </w:tcMar>
+          </w:tcPr>
+          <w:p>
+            <w:r>
+              <w:rPr>
+                <w:sz w:val="19"/>
+                <w:szCs w:val="19"/>
+              </w:rPr>
+              <w:t>151 M (88 M for images)</w:t>
+            </w:r>
+          </w:p>
+        </w:tc>
+      </w:tr>
+    </w:tbl>
+    <w:p>
+      <w:pPr>
+        <w:spacing w:after="120"/>
+      </w:pPr>
+    </w:p>
+    <w:p>
+      <w:pPr>
+        <w:pStyle w:val="Paragraphedeliste"/>
+        <w:numPr>
+          <w:ilvl w:val="0"/>
+          <w:numId w:val="3"/>
+        </w:numPr>
+        <w:spacing w:after="80"/>
+      </w:pPr>
+      <w:r>
+        <w:rPr>
+          <w:b/>
+          <w:bCs/>
+        </w:rPr>
+        <w:t>Paired comparison on validation</w:t>
+      </w:r>
+      <w:r>
+        <w:t xml:space="preserve"> (same 219 paintings, 5 000 redraws): CLIP + head vs ResNet18 + head = +6.8 points (interval 2.3 to 11.4); CLIP zero-shot vs ResNet18 = +0.9 (interval -5.0 to +6.8); ViT vs ResNet18 = +0.5 (interval -4.6 to +5.9).</w:t>
+      </w:r>
+    </w:p>
+    <w:p>
+      <w:pPr>
+        <w:pStyle w:val="Paragraphedeliste"/>
+        <w:numPr>
+          <w:ilvl w:val="0"/>
+          <w:numId w:val="3"/>
+        </w:numPr>
+        <w:spacing w:after="80"/>
+      </w:pPr>
+      <w:r>
+        <w:rPr>
+          <w:b/>
+          <w:bCs/>
+        </w:rPr>
+        <w:t>CLIP zero-shot per style</w:t>
+      </w:r>
+      <w:r>
+        <w:t>: Baroque and Ukiyo-e 100 %, Impressionism 94 %, Cubism 93 %, Pop Art 58 % (11 of the 43 Pop Art paintings taken for Cubism, 6 for Ukiyo-e).</w:t>
+      </w:r>
+    </w:p>
+    <w:p>
+      <w:pPr>
+        <w:pStyle w:val="Paragraphedeliste"/>
+        <w:numPr>
+          <w:ilvl w:val="0"/>
+          <w:numId w:val="3"/>
+        </w:numPr>
+        <w:spacing w:after="80"/>
+      </w:pPr>
+      <w:r>
+        <w:rPr>
+          <w:b/>
+          <w:bCs/>
+        </w:rPr>
+        <w:t>The prompts</w:t>
+      </w:r>
+      <w:r>
+        <w:t xml:space="preserve"> (two sentences per style, such as "a Baroque painting") were written once, before looking at any score, and never changed: changing them after seeing the validation score would be tuning on validation.</w:t>
+      </w:r>
+    </w:p>
+    <w:p>
+      <w:pPr>
+        <w:pStyle w:val="Paragraphedeliste"/>
+        <w:numPr>
+          <w:ilvl w:val="0"/>
+          <w:numId w:val="3"/>
+        </w:numPr>
+        <w:spacing w:after="80"/>
+      </w:pPr>
+      <w:r>
+        <w:rPr>
+          <w:b/>
+          <w:bCs/>
+        </w:rPr>
+        <w:t>Speed in that run</w:t>
+      </w:r>
+      <w:r>
+        <w:t xml:space="preserve"> (one photo, one CPU thread): 38 ms for ResNet18, 105 ms for CLIP, 349 ms for ViT-B/16. Absolute times move by about 30 % between runs on a laptop (notebook 06 measured 53 ms for ResNet18); the ratios are what to remember.</w:t>
+      </w:r>
+    </w:p>
+    <w:p>
+      <w:pPr>
+        <w:pStyle w:val="Paragraphedeliste"/>
+        <w:numPr>
+          <w:ilvl w:val="0"/>
+          <w:numId w:val="3"/>
+        </w:numPr>
+        <w:spacing w:after="80"/>
+      </w:pPr>
+      <w:r>
+        <w:rPr>
+          <w:b/>
+          <w:bCs/>
+        </w:rPr>
+        <w:t>Why we keep our recommendation</w:t>
+      </w:r>
+      <w:r>
+        <w:t>: it was chosen before the test; CLIP's numbers are validation only (we did not reopen the test); CLIP has probably seen WikiArt; it is bigger and slower. CLIP is the first next step, and it also links sentences to images, so it could answer visitors' questions (part 2).</w:t>
+      </w:r>
+    </w:p>
+    <w:p>
+      <w:pPr>
+        <w:spacing w:before="120" w:after="60"/>
+        <w:jc w:val="center"/>
+      </w:pPr>
+      <w:r>
+        <w:rPr>
+          <w:noProof/>
+        </w:rPr>
+        <w:lastRenderedPageBreak/>
+        <w:drawing>
+          <wp:inline distT="0" distB="0" distL="0" distR="0" wp14:anchorId="01918B05" wp14:editId="01918B06">
+            <wp:extent cx="4381500" cy="2486025"/>
+            <wp:effectExtent l="0" t="0" r="0" b="0"/>
+            <wp:docPr id="6" name="07_transformers_accuracy_vs_speed.png" descr="Transformers on validation: CLIP is more accurate, but slower." title="Transformers on validation: CLIP is more accurate, but slower."/>
+            <wp:cNvGraphicFramePr>
+              <a:graphicFrameLocks xmlns:a="http://schemas.openxmlformats.org/drawingml/2006/main" noChangeAspect="1"/>
+            </wp:cNvGraphicFramePr>
+            <a:graphic xmlns:a="http://schemas.openxmlformats.org/drawingml/2006/main">
+              <a:graphicData uri="http://schemas.openxmlformats.org/drawingml/2006/picture">
+                <pic:pic xmlns:pic="http://schemas.openxmlformats.org/drawingml/2006/picture">
+                  <pic:nvPicPr>
+                    <pic:cNvPr id="0" name=""/>
+                    <pic:cNvPicPr>
+                      <a:picLocks noChangeAspect="1" noChangeArrowheads="1"/>
+                    </pic:cNvPicPr>
+                  </pic:nvPicPr>
+                  <pic:blipFill>
+                    <a:blip r:embed="rId12"/>
+                    <a:srcRect/>
+                    <a:stretch>
+                      <a:fillRect/>
+                    </a:stretch>
+                  </pic:blipFill>
+                  <pic:spPr bwMode="auto">
+                    <a:xfrm>
+                      <a:off x="0" y="0"/>
+                      <a:ext cx="4381500" cy="2486025"/>
+                    </a:xfrm>
+                    <a:prstGeom prst="rect">
+                      <a:avLst/>
+                    </a:prstGeom>
+                  </pic:spPr>
+                </pic:pic>
+              </a:graphicData>
+            </a:graphic>
+          </wp:inline>
+        </w:drawing>
+      </w:r>
+    </w:p>
+    <w:p>
+      <w:pPr>
+        <w:spacing w:after="200"/>
+        <w:jc w:val="center"/>
+      </w:pPr>
+      <w:r>
+        <w:rPr>
+          <w:i/>
+          <w:iCs/>
+          <w:color w:val="5F6473"/>
+          <w:sz w:val="18"/>
+          <w:szCs w:val="18"/>
+        </w:rPr>
+        <w:t>Transformers on validation: CLIP is more accurate, but slower.</w:t>
+      </w:r>
+    </w:p>
+    <w:p>
+      <w:pPr>
+        <w:pStyle w:val="Titre1"/>
+        <w:pageBreakBefore/>
+      </w:pPr>
+      <w:bookmarkStart w:id="50" w:name="_Toc243410337"/>
+      <w:r>
+        <w:lastRenderedPageBreak/>
+        <w:t>10. Key numbers to know by heart</w:t>
+      </w:r>
+      <w:bookmarkEnd w:id="50"/>
     </w:p>
     <w:tbl>
       <w:tblPr>
@@ -12523,6 +13511,60 @@
           </w:p>
         </w:tc>
       </w:tr>
+      <w:tr>
+        <w:tc>
+          <w:tcPr>
+            <w:tcW w:w="5301" w:type="dxa"/>
+            <w:tcBorders>
+              <w:top w:val="single" w:sz="4" w:space="0" w:color="D9DCE2"/>
+              <w:left w:val="single" w:sz="4" w:space="0" w:color="D9DCE2"/>
+              <w:bottom w:val="single" w:sz="4" w:space="0" w:color="D9DCE2"/>
+              <w:right w:val="single" w:sz="4" w:space="0" w:color="D9DCE2"/>
+            </w:tcBorders>
+            <w:tcMar>
+              <w:top w:w="60" w:type="dxa"/>
+              <w:left w:w="100" w:type="dxa"/>
+              <w:bottom w:w="60" w:type="dxa"/>
+              <w:right w:w="100" w:type="dxa"/>
+            </w:tcMar>
+          </w:tcPr>
+          <w:p>
+            <w:r>
+              <w:rPr>
+                <w:sz w:val="19"/>
+                <w:szCs w:val="19"/>
+              </w:rPr>
+              <w:t>Bonus, validation only: CLIP + head / CLIP zero-shot / ViT + head</w:t>
+            </w:r>
+          </w:p>
+        </w:tc>
+        <w:tc>
+          <w:tcPr>
+            <w:tcW w:w="4337" w:type="dxa"/>
+            <w:tcBorders>
+              <w:top w:val="single" w:sz="4" w:space="0" w:color="D9DCE2"/>
+              <w:left w:val="single" w:sz="4" w:space="0" w:color="D9DCE2"/>
+              <w:bottom w:val="single" w:sz="4" w:space="0" w:color="D9DCE2"/>
+              <w:right w:val="single" w:sz="4" w:space="0" w:color="D9DCE2"/>
+            </w:tcBorders>
+            <w:tcMar>
+              <w:top w:w="60" w:type="dxa"/>
+              <w:left w:w="100" w:type="dxa"/>
+              <w:bottom w:w="60" w:type="dxa"/>
+              <w:right w:w="100" w:type="dxa"/>
+            </w:tcMar>
+          </w:tcPr>
+          <w:p>
+            <w:r>
+              <w:rPr>
+                <w:sz w:val="19"/>
+                <w:szCs w:val="19"/>
+              </w:rPr>
+              <w:t>94.7 % / 89.0 % / 88.1 % (ResNet18: 88.1 %)</w:t>
+            </w:r>
+          </w:p>
+        </w:tc>
+      </w:tr>
     </w:tbl>
     <w:p>
       <w:pPr>
@@ -12534,12 +13576,12 @@
         <w:pStyle w:val="Titre1"/>
         <w:pageBreakBefore/>
       </w:pPr>
-      <w:bookmarkStart w:id="50" w:name="_Toc243405041"/>
+      <w:bookmarkStart w:id="51" w:name="_Toc243410338"/>
       <w:r>
         <w:lastRenderedPageBreak/>
-        <w:t>10. Concepts in simple words</w:t>
-      </w:r>
-      <w:bookmarkEnd w:id="50"/>
+        <w:t>11. Concepts in simple words</w:t>
+      </w:r>
+      <w:bookmarkEnd w:id="51"/>
     </w:p>
     <w:tbl>
       <w:tblPr>
@@ -14384,6 +15426,336 @@
           </w:p>
         </w:tc>
       </w:tr>
+      <w:tr>
+        <w:tc>
+          <w:tcPr>
+            <w:tcW w:w="2891" w:type="dxa"/>
+            <w:tcBorders>
+              <w:top w:val="single" w:sz="4" w:space="0" w:color="D9DCE2"/>
+              <w:left w:val="single" w:sz="4" w:space="0" w:color="D9DCE2"/>
+              <w:bottom w:val="single" w:sz="4" w:space="0" w:color="D9DCE2"/>
+              <w:right w:val="single" w:sz="4" w:space="0" w:color="D9DCE2"/>
+            </w:tcBorders>
+            <w:tcMar>
+              <w:top w:w="60" w:type="dxa"/>
+              <w:left w:w="100" w:type="dxa"/>
+              <w:bottom w:w="60" w:type="dxa"/>
+              <w:right w:w="100" w:type="dxa"/>
+            </w:tcMar>
+          </w:tcPr>
+          <w:p>
+            <w:r>
+              <w:rPr>
+                <w:sz w:val="19"/>
+                <w:szCs w:val="19"/>
+              </w:rPr>
+              <w:t>Transformer, attention</w:t>
+            </w:r>
+          </w:p>
+        </w:tc>
+        <w:tc>
+          <w:tcPr>
+            <w:tcW w:w="6747" w:type="dxa"/>
+            <w:tcBorders>
+              <w:top w:val="single" w:sz="4" w:space="0" w:color="D9DCE2"/>
+              <w:left w:val="single" w:sz="4" w:space="0" w:color="D9DCE2"/>
+              <w:bottom w:val="single" w:sz="4" w:space="0" w:color="D9DCE2"/>
+              <w:right w:val="single" w:sz="4" w:space="0" w:color="D9DCE2"/>
+            </w:tcBorders>
+            <w:tcMar>
+              <w:top w:w="60" w:type="dxa"/>
+              <w:left w:w="100" w:type="dxa"/>
+              <w:bottom w:w="60" w:type="dxa"/>
+              <w:right w:w="100" w:type="dxa"/>
+            </w:tcMar>
+          </w:tcPr>
+          <w:p>
+            <w:r>
+              <w:rPr>
+                <w:sz w:val="19"/>
+                <w:szCs w:val="19"/>
+              </w:rPr>
+              <w:t>A network where every piece of the input looks at every other piece and decides which ones matter (attention).</w:t>
+            </w:r>
+          </w:p>
+        </w:tc>
+      </w:tr>
+      <w:tr>
+        <w:tc>
+          <w:tcPr>
+            <w:tcW w:w="2891" w:type="dxa"/>
+            <w:tcBorders>
+              <w:top w:val="single" w:sz="4" w:space="0" w:color="D9DCE2"/>
+              <w:left w:val="single" w:sz="4" w:space="0" w:color="D9DCE2"/>
+              <w:bottom w:val="single" w:sz="4" w:space="0" w:color="D9DCE2"/>
+              <w:right w:val="single" w:sz="4" w:space="0" w:color="D9DCE2"/>
+            </w:tcBorders>
+            <w:shd w:val="clear" w:color="auto" w:fill="F2F3F5"/>
+            <w:tcMar>
+              <w:top w:w="60" w:type="dxa"/>
+              <w:left w:w="100" w:type="dxa"/>
+              <w:bottom w:w="60" w:type="dxa"/>
+              <w:right w:w="100" w:type="dxa"/>
+            </w:tcMar>
+          </w:tcPr>
+          <w:p>
+            <w:r>
+              <w:rPr>
+                <w:sz w:val="19"/>
+                <w:szCs w:val="19"/>
+              </w:rPr>
+              <w:t>BERT</w:t>
+            </w:r>
+          </w:p>
+        </w:tc>
+        <w:tc>
+          <w:tcPr>
+            <w:tcW w:w="6747" w:type="dxa"/>
+            <w:tcBorders>
+              <w:top w:val="single" w:sz="4" w:space="0" w:color="D9DCE2"/>
+              <w:left w:val="single" w:sz="4" w:space="0" w:color="D9DCE2"/>
+              <w:bottom w:val="single" w:sz="4" w:space="0" w:color="D9DCE2"/>
+              <w:right w:val="single" w:sz="4" w:space="0" w:color="D9DCE2"/>
+            </w:tcBorders>
+            <w:shd w:val="clear" w:color="auto" w:fill="F2F3F5"/>
+            <w:tcMar>
+              <w:top w:w="60" w:type="dxa"/>
+              <w:left w:w="100" w:type="dxa"/>
+              <w:bottom w:w="60" w:type="dxa"/>
+              <w:right w:w="100" w:type="dxa"/>
+            </w:tcMar>
+          </w:tcPr>
+          <w:p>
+            <w:r>
+              <w:rPr>
+                <w:sz w:val="19"/>
+                <w:szCs w:val="19"/>
+              </w:rPr>
+              <w:t>A transformer trained on huge amounts of text: it turns sentences into numbers; it does not see images.</w:t>
+            </w:r>
+          </w:p>
+        </w:tc>
+      </w:tr>
+      <w:tr>
+        <w:tc>
+          <w:tcPr>
+            <w:tcW w:w="2891" w:type="dxa"/>
+            <w:tcBorders>
+              <w:top w:val="single" w:sz="4" w:space="0" w:color="D9DCE2"/>
+              <w:left w:val="single" w:sz="4" w:space="0" w:color="D9DCE2"/>
+              <w:bottom w:val="single" w:sz="4" w:space="0" w:color="D9DCE2"/>
+              <w:right w:val="single" w:sz="4" w:space="0" w:color="D9DCE2"/>
+            </w:tcBorders>
+            <w:tcMar>
+              <w:top w:w="60" w:type="dxa"/>
+              <w:left w:w="100" w:type="dxa"/>
+              <w:bottom w:w="60" w:type="dxa"/>
+              <w:right w:w="100" w:type="dxa"/>
+            </w:tcMar>
+          </w:tcPr>
+          <w:p>
+            <w:r>
+              <w:rPr>
+                <w:sz w:val="19"/>
+                <w:szCs w:val="19"/>
+              </w:rPr>
+              <w:t>ViT (Vision Transformer)</w:t>
+            </w:r>
+          </w:p>
+        </w:tc>
+        <w:tc>
+          <w:tcPr>
+            <w:tcW w:w="6747" w:type="dxa"/>
+            <w:tcBorders>
+              <w:top w:val="single" w:sz="4" w:space="0" w:color="D9DCE2"/>
+              <w:left w:val="single" w:sz="4" w:space="0" w:color="D9DCE2"/>
+              <w:bottom w:val="single" w:sz="4" w:space="0" w:color="D9DCE2"/>
+              <w:right w:val="single" w:sz="4" w:space="0" w:color="D9DCE2"/>
+            </w:tcBorders>
+            <w:tcMar>
+              <w:top w:w="60" w:type="dxa"/>
+              <w:left w:w="100" w:type="dxa"/>
+              <w:bottom w:w="60" w:type="dxa"/>
+              <w:right w:w="100" w:type="dxa"/>
+            </w:tcMar>
+          </w:tcPr>
+          <w:p>
+            <w:r>
+              <w:rPr>
+                <w:sz w:val="19"/>
+                <w:szCs w:val="19"/>
+              </w:rPr>
+              <w:t>BERT's architecture applied to an image cut into 16 x 16 pixel squares, read like words.</w:t>
+            </w:r>
+          </w:p>
+        </w:tc>
+      </w:tr>
+      <w:tr>
+        <w:tc>
+          <w:tcPr>
+            <w:tcW w:w="2891" w:type="dxa"/>
+            <w:tcBorders>
+              <w:top w:val="single" w:sz="4" w:space="0" w:color="D9DCE2"/>
+              <w:left w:val="single" w:sz="4" w:space="0" w:color="D9DCE2"/>
+              <w:bottom w:val="single" w:sz="4" w:space="0" w:color="D9DCE2"/>
+              <w:right w:val="single" w:sz="4" w:space="0" w:color="D9DCE2"/>
+            </w:tcBorders>
+            <w:shd w:val="clear" w:color="auto" w:fill="F2F3F5"/>
+            <w:tcMar>
+              <w:top w:w="60" w:type="dxa"/>
+              <w:left w:w="100" w:type="dxa"/>
+              <w:bottom w:w="60" w:type="dxa"/>
+              <w:right w:w="100" w:type="dxa"/>
+            </w:tcMar>
+          </w:tcPr>
+          <w:p>
+            <w:r>
+              <w:rPr>
+                <w:sz w:val="19"/>
+                <w:szCs w:val="19"/>
+              </w:rPr>
+              <w:t>CLIP</w:t>
+            </w:r>
+          </w:p>
+        </w:tc>
+        <w:tc>
+          <w:tcPr>
+            <w:tcW w:w="6747" w:type="dxa"/>
+            <w:tcBorders>
+              <w:top w:val="single" w:sz="4" w:space="0" w:color="D9DCE2"/>
+              <w:left w:val="single" w:sz="4" w:space="0" w:color="D9DCE2"/>
+              <w:bottom w:val="single" w:sz="4" w:space="0" w:color="D9DCE2"/>
+              <w:right w:val="single" w:sz="4" w:space="0" w:color="D9DCE2"/>
+            </w:tcBorders>
+            <w:shd w:val="clear" w:color="auto" w:fill="F2F3F5"/>
+            <w:tcMar>
+              <w:top w:w="60" w:type="dxa"/>
+              <w:left w:w="100" w:type="dxa"/>
+              <w:bottom w:w="60" w:type="dxa"/>
+              <w:right w:w="100" w:type="dxa"/>
+            </w:tcMar>
+          </w:tcPr>
+          <w:p>
+            <w:r>
+              <w:rPr>
+                <w:sz w:val="19"/>
+                <w:szCs w:val="19"/>
+              </w:rPr>
+              <w:t>An image encoder and a text encoder trained together on 400 million image-caption pairs: images and sentences share one space.</w:t>
+            </w:r>
+          </w:p>
+        </w:tc>
+      </w:tr>
+      <w:tr>
+        <w:tc>
+          <w:tcPr>
+            <w:tcW w:w="2891" w:type="dxa"/>
+            <w:tcBorders>
+              <w:top w:val="single" w:sz="4" w:space="0" w:color="D9DCE2"/>
+              <w:left w:val="single" w:sz="4" w:space="0" w:color="D9DCE2"/>
+              <w:bottom w:val="single" w:sz="4" w:space="0" w:color="D9DCE2"/>
+              <w:right w:val="single" w:sz="4" w:space="0" w:color="D9DCE2"/>
+            </w:tcBorders>
+            <w:tcMar>
+              <w:top w:w="60" w:type="dxa"/>
+              <w:left w:w="100" w:type="dxa"/>
+              <w:bottom w:w="60" w:type="dxa"/>
+              <w:right w:w="100" w:type="dxa"/>
+            </w:tcMar>
+          </w:tcPr>
+          <w:p>
+            <w:r>
+              <w:rPr>
+                <w:sz w:val="19"/>
+                <w:szCs w:val="19"/>
+              </w:rPr>
+              <w:t>Zero-shot</w:t>
+            </w:r>
+          </w:p>
+        </w:tc>
+        <w:tc>
+          <w:tcPr>
+            <w:tcW w:w="6747" w:type="dxa"/>
+            <w:tcBorders>
+              <w:top w:val="single" w:sz="4" w:space="0" w:color="D9DCE2"/>
+              <w:left w:val="single" w:sz="4" w:space="0" w:color="D9DCE2"/>
+              <w:bottom w:val="single" w:sz="4" w:space="0" w:color="D9DCE2"/>
+              <w:right w:val="single" w:sz="4" w:space="0" w:color="D9DCE2"/>
+            </w:tcBorders>
+            <w:tcMar>
+              <w:top w:w="60" w:type="dxa"/>
+              <w:left w:w="100" w:type="dxa"/>
+              <w:bottom w:w="60" w:type="dxa"/>
+              <w:right w:w="100" w:type="dxa"/>
+            </w:tcMar>
+          </w:tcPr>
+          <w:p>
+            <w:r>
+              <w:rPr>
+                <w:sz w:val="19"/>
+                <w:szCs w:val="19"/>
+              </w:rPr>
+              <w:t>Classifying without any training example: CLIP compares the image with one sentence per class.</w:t>
+            </w:r>
+          </w:p>
+        </w:tc>
+      </w:tr>
+      <w:tr>
+        <w:tc>
+          <w:tcPr>
+            <w:tcW w:w="2891" w:type="dxa"/>
+            <w:tcBorders>
+              <w:top w:val="single" w:sz="4" w:space="0" w:color="D9DCE2"/>
+              <w:left w:val="single" w:sz="4" w:space="0" w:color="D9DCE2"/>
+              <w:bottom w:val="single" w:sz="4" w:space="0" w:color="D9DCE2"/>
+              <w:right w:val="single" w:sz="4" w:space="0" w:color="D9DCE2"/>
+            </w:tcBorders>
+            <w:shd w:val="clear" w:color="auto" w:fill="F2F3F5"/>
+            <w:tcMar>
+              <w:top w:w="60" w:type="dxa"/>
+              <w:left w:w="100" w:type="dxa"/>
+              <w:bottom w:w="60" w:type="dxa"/>
+              <w:right w:w="100" w:type="dxa"/>
+            </w:tcMar>
+          </w:tcPr>
+          <w:p>
+            <w:r>
+              <w:rPr>
+                <w:sz w:val="19"/>
+                <w:szCs w:val="19"/>
+              </w:rPr>
+              <w:t>Contamination</w:t>
+            </w:r>
+          </w:p>
+        </w:tc>
+        <w:tc>
+          <w:tcPr>
+            <w:tcW w:w="6747" w:type="dxa"/>
+            <w:tcBorders>
+              <w:top w:val="single" w:sz="4" w:space="0" w:color="D9DCE2"/>
+              <w:left w:val="single" w:sz="4" w:space="0" w:color="D9DCE2"/>
+              <w:bottom w:val="single" w:sz="4" w:space="0" w:color="D9DCE2"/>
+              <w:right w:val="single" w:sz="4" w:space="0" w:color="D9DCE2"/>
+            </w:tcBorders>
+            <w:shd w:val="clear" w:color="auto" w:fill="F2F3F5"/>
+            <w:tcMar>
+              <w:top w:w="60" w:type="dxa"/>
+              <w:left w:w="100" w:type="dxa"/>
+              <w:bottom w:w="60" w:type="dxa"/>
+              <w:right w:w="100" w:type="dxa"/>
+            </w:tcMar>
+          </w:tcPr>
+          <w:p>
+            <w:r>
+              <w:rPr>
+                <w:sz w:val="19"/>
+                <w:szCs w:val="19"/>
+              </w:rPr>
+              <w:t>The pretrained model may have seen the evaluation data (here: WikiArt) during its own training, which inflates its score.</w:t>
+            </w:r>
+          </w:p>
+        </w:tc>
+      </w:tr>
     </w:tbl>
     <w:p>
       <w:pPr>
@@ -14395,12 +15767,12 @@
         <w:pStyle w:val="Titre1"/>
         <w:pageBreakBefore/>
       </w:pPr>
-      <w:bookmarkStart w:id="51" w:name="_Toc243405042"/>
+      <w:bookmarkStart w:id="52" w:name="_Toc243410339"/>
       <w:r>
         <w:lastRenderedPageBreak/>
-        <w:t>11. Questions you may get, with answers</w:t>
-      </w:r>
-      <w:bookmarkEnd w:id="51"/>
+        <w:t>12. Questions you may get, with answers</w:t>
+      </w:r>
+      <w:bookmarkEnd w:id="52"/>
     </w:p>
     <w:p>
       <w:pPr>
@@ -14417,11 +15789,11 @@
       <w:pPr>
         <w:pStyle w:val="Titre2"/>
       </w:pPr>
-      <w:bookmarkStart w:id="52" w:name="_Toc243405043"/>
+      <w:bookmarkStart w:id="53" w:name="_Toc243410340"/>
       <w:r>
         <w:t>About the data</w:t>
       </w:r>
-      <w:bookmarkEnd w:id="52"/>
+      <w:bookmarkEnd w:id="53"/>
     </w:p>
     <w:p>
       <w:pPr>
@@ -14537,11 +15909,11 @@
       <w:pPr>
         <w:pStyle w:val="Titre2"/>
       </w:pPr>
-      <w:bookmarkStart w:id="53" w:name="_Toc243405044"/>
+      <w:bookmarkStart w:id="54" w:name="_Toc243410341"/>
       <w:r>
         <w:t>About the MLP</w:t>
       </w:r>
-      <w:bookmarkEnd w:id="53"/>
+      <w:bookmarkEnd w:id="54"/>
     </w:p>
     <w:p>
       <w:pPr>
@@ -14657,11 +16029,11 @@
       <w:pPr>
         <w:pStyle w:val="Titre2"/>
       </w:pPr>
-      <w:bookmarkStart w:id="54" w:name="_Toc243405045"/>
+      <w:bookmarkStart w:id="55" w:name="_Toc243410342"/>
       <w:r>
         <w:t>About training and diagnosis</w:t>
       </w:r>
-      <w:bookmarkEnd w:id="54"/>
+      <w:bookmarkEnd w:id="55"/>
     </w:p>
     <w:p>
       <w:pPr>
@@ -14755,12 +16127,12 @@
       <w:pPr>
         <w:pStyle w:val="Titre2"/>
       </w:pPr>
-      <w:bookmarkStart w:id="55" w:name="_Toc243405046"/>
+      <w:bookmarkStart w:id="56" w:name="_Toc243410343"/>
       <w:r>
         <w:lastRenderedPageBreak/>
         <w:t>About ResNet</w:t>
       </w:r>
-      <w:bookmarkEnd w:id="55"/>
+      <w:bookmarkEnd w:id="56"/>
     </w:p>
     <w:p>
       <w:pPr>
@@ -14861,7 +16233,7 @@
           <w:bCs/>
           <w:color w:val="1C2433"/>
         </w:rPr>
-        <w:t>What does the 12.8 % bug teach?</w:t>
+        <w:t>The course talked about BERT and transformers. Could they solve the problem?</w:t>
       </w:r>
     </w:p>
     <w:p>
@@ -14869,18 +16241,8 @@
         <w:spacing w:after="120"/>
       </w:pPr>
       <w:r>
-        <w:t>Always call model.eval(): in train mode batch norm uses each batch's statistics, which erased the style because our batches held mostly one style.</w:t>
-      </w:r>
-    </w:p>
-    <w:p>
-      <w:pPr>
-        <w:pStyle w:val="Titre2"/>
-      </w:pPr>
-      <w:bookmarkStart w:id="56" w:name="_Toc243405047"/>
-      <w:r>
-        <w:t>About the results and the recommendation</w:t>
-      </w:r>
-      <w:bookmarkEnd w:id="56"/>
+        <w:t>BERT alone, no: it reads text, not pixels. We tested its image cousins on validation (notebook 07). ViT-B/16 gives the same 88.1 % as ResNet18 and is 9 times slower. CLIP, trained on images with captions, reaches 89.0 % with no training at all and 94.7 % with our linear head, 6.8 points above ResNet18 (paired interval 2.3 to 11.4), for 2.7 times the time. But it has probably seen WikiArt during its training and we did not reopen the test, so it is our first next step, not our recommendation.</w:t>
+      </w:r>
     </w:p>
     <w:p>
       <w:pPr>
@@ -14893,7 +16255,7 @@
           <w:bCs/>
           <w:color w:val="1C2433"/>
         </w:rPr>
-        <w:t>Validation says frozen is better, test says fine-tuned is better. Which is right?</w:t>
+        <w:t>What does the 12.8 % bug teach?</w:t>
       </w:r>
     </w:p>
     <w:p>
@@ -14901,8 +16263,18 @@
         <w:spacing w:after="120"/>
       </w:pPr>
       <w:r>
-        <w:t>Neither can be proven: with about 220 images a score moves about 5 points by chance. We chose on validation before the test, which keeps the test honest. Fine-tuning is the first thing to retry with more data.</w:t>
-      </w:r>
+        <w:t>Always call model.eval(): in train mode batch norm uses each batch's statistics, which erased the style because our batches held mostly one style.</w:t>
+      </w:r>
+    </w:p>
+    <w:p>
+      <w:pPr>
+        <w:pStyle w:val="Titre2"/>
+      </w:pPr>
+      <w:bookmarkStart w:id="57" w:name="_Toc243410344"/>
+      <w:r>
+        <w:t>About the results and the recommendation</w:t>
+      </w:r>
+      <w:bookmarkEnd w:id="57"/>
     </w:p>
     <w:p>
       <w:pPr>
@@ -14915,7 +16287,7 @@
           <w:bCs/>
           <w:color w:val="1C2433"/>
         </w:rPr>
-        <w:t>Why not pick the fine-tuned model, since it won the test?</w:t>
+        <w:t>Validation says frozen is better, test says fine-tuned is better. Which is right?</w:t>
       </w:r>
     </w:p>
     <w:p>
@@ -14923,7 +16295,7 @@
         <w:spacing w:after="120"/>
       </w:pPr>
       <w:r>
-        <w:t>Choosing by test score turns the test into a second validation set and makes the reported score too optimistic.</w:t>
+        <w:t>Neither can be proven: with about 220 images a score moves about 5 points by chance. We chose on validation before the test, which keeps the test honest. Fine-tuning is the first thing to retry with more data.</w:t>
       </w:r>
     </w:p>
     <w:p>
@@ -14937,7 +16309,7 @@
           <w:bCs/>
           <w:color w:val="1C2433"/>
         </w:rPr>
-        <w:t>Is 83 % good enough for a museum?</w:t>
+        <w:t>Why not pick the fine-tuned model, since it won the test?</w:t>
       </w:r>
     </w:p>
     <w:p>
@@ -14945,7 +16317,7 @@
         <w:spacing w:after="120"/>
       </w:pPr>
       <w:r>
-        <w:t>One visitor in six gets a wrong style, against one in three for the best classical model. Good for a guide that tells the story of a movement; it must be confirmed on real kiosk photos.</w:t>
+        <w:t>Choosing by test score turns the test into a second validation set and makes the reported score too optimistic.</w:t>
       </w:r>
     </w:p>
     <w:p>
@@ -14959,7 +16331,7 @@
           <w:bCs/>
           <w:color w:val="1C2433"/>
         </w:rPr>
-        <w:t>Is 53 ms realistic on a kiosk?</w:t>
+        <w:t>Is 83 % good enough for a museum?</w:t>
       </w:r>
     </w:p>
     <w:p>
@@ -14967,7 +16339,7 @@
         <w:spacing w:after="120"/>
       </w:pPr>
       <w:r>
-        <w:t>Measured on one thread of a laptop, one photo at a time. A kiosk 4 times slower would still answer in about 0.2 s.</w:t>
+        <w:t>One visitor in six gets a wrong style, against one in three for the best classical model. Good for a guide that tells the story of a movement; it must be confirmed on real kiosk photos.</w:t>
       </w:r>
     </w:p>
     <w:p>
@@ -14981,7 +16353,7 @@
           <w:bCs/>
           <w:color w:val="1C2433"/>
         </w:rPr>
-        <w:t>So is a neural network worth it?</w:t>
+        <w:t>Is 53 ms realistic on a kiosk?</w:t>
       </w:r>
     </w:p>
     <w:p>
@@ -14989,7 +16361,7 @@
         <w:spacing w:after="120"/>
       </w:pPr>
       <w:r>
-        <w:t>Yes, a pretrained one: +16.4 points over the best classical model (interval 9.1 to 24.1), a cost a kiosk can afford, no GPU, retrained in seconds.</w:t>
+        <w:t>Measured on one thread of a laptop, one photo at a time. A kiosk 4 times slower would still answer in about 0.2 s.</w:t>
       </w:r>
     </w:p>
     <w:p>
@@ -15003,7 +16375,7 @@
           <w:bCs/>
           <w:color w:val="1C2433"/>
         </w:rPr>
-        <w:t>What about part 2 (questions in natural language)?</w:t>
+        <w:t>So is a neural network worth it?</w:t>
       </w:r>
     </w:p>
     <w:p>
@@ -15011,18 +16383,8 @@
         <w:spacing w:after="120"/>
       </w:pPr>
       <w:r>
-        <w:t>The written brief lists three deliverables and part 2 is not one of them, so we put our time on those and on the recommendation. Session 8 shows the next step (milestone m4): encode the visitors' questions and descriptions of the artworks with sentence embeddings (all-MiniLM-L6-v2), retrieve the closest artwork by cosine similarity, and compare with a classical TF-IDF search. Our WikiArt images have no text descriptions, so we would first have to write them.</w:t>
-      </w:r>
-    </w:p>
-    <w:p>
-      <w:pPr>
-        <w:pStyle w:val="Titre2"/>
-      </w:pPr>
-      <w:bookmarkStart w:id="57" w:name="_Toc243405048"/>
-      <w:r>
-        <w:t>About the project</w:t>
-      </w:r>
-      <w:bookmarkEnd w:id="57"/>
+        <w:t>Yes, a pretrained one: +16.4 points over the best classical model (interval 9.1 to 24.1), a cost a kiosk can afford, no GPU, retrained in seconds.</w:t>
+      </w:r>
     </w:p>
     <w:p>
       <w:pPr>
@@ -15035,7 +16397,7 @@
           <w:bCs/>
           <w:color w:val="1C2433"/>
         </w:rPr>
-        <w:t>How can someone reproduce your results?</w:t>
+        <w:t>What about part 2 (questions in natural language)?</w:t>
       </w:r>
     </w:p>
     <w:p>
@@ -15043,8 +16405,19 @@
         <w:spacing w:after="120"/>
       </w:pPr>
       <w:r>
-        <w:t>pip install -r requirements.txt, bash scripts/get_data.sh, python -m pytest, python scripts/run_notebooks.py. Fixed seeds and a pinned dataset revision; notebook 06 re-trains the models and gets exactly the same validation scores.</w:t>
-      </w:r>
+        <w:t>The written brief lists three deliverables and part 2 is not one of them, so we put our time on those and on the recommendation. Session 8 shows the next step (milestone m4): encode the visitors' questions and descriptions of the artworks with sentence embeddings (all-MiniLM-L6-v2), retrieve the closest artwork by cosine similarity, and compare with a classical TF-IDF search. Our WikiArt images have no text descriptions, so we would first have to write them.</w:t>
+      </w:r>
+    </w:p>
+    <w:p>
+      <w:pPr>
+        <w:pStyle w:val="Titre2"/>
+      </w:pPr>
+      <w:bookmarkStart w:id="58" w:name="_Toc243410345"/>
+      <w:r>
+        <w:lastRenderedPageBreak/>
+        <w:t>About the project</w:t>
+      </w:r>
+      <w:bookmarkEnd w:id="58"/>
     </w:p>
     <w:p>
       <w:pPr>
@@ -15057,6 +16430,28 @@
           <w:bCs/>
           <w:color w:val="1C2433"/>
         </w:rPr>
+        <w:t>How can someone reproduce your results?</w:t>
+      </w:r>
+    </w:p>
+    <w:p>
+      <w:pPr>
+        <w:spacing w:after="120"/>
+      </w:pPr>
+      <w:r>
+        <w:t>pip install -r requirements.txt, bash scripts/get_data.sh, python -m pytest, python scripts/run_notebooks.py. Fixed seeds and a pinned dataset revision; notebook 06 re-trains the models and gets exactly the same validation scores.</w:t>
+      </w:r>
+    </w:p>
+    <w:p>
+      <w:pPr>
+        <w:keepNext/>
+        <w:spacing w:before="120" w:after="40"/>
+      </w:pPr>
+      <w:r>
+        <w:rPr>
+          <w:b/>
+          <w:bCs/>
+          <w:color w:val="1C2433"/>
+        </w:rPr>
         <w:t>How is the work organised?</w:t>
       </w:r>
     </w:p>
@@ -15065,7 +16460,7 @@
         <w:spacing w:after="120"/>
       </w:pPr>
       <w:r>
-        <w:t>A Python package (src/museum_guide), 6 notebooks paired with .py sources (clean Git diffs), 31 automatic tests, and every number saved in reports/results/*.json.</w:t>
+        <w:t>A Python package (src/museum_guide), 7 notebooks paired with .py sources (clean Git diffs; the 7th is the transformers bonus), 33 automatic tests, and every number saved in reports/results/*.json.</w:t>
       </w:r>
     </w:p>
     <w:p>
@@ -15073,12 +16468,12 @@
         <w:pStyle w:val="Titre1"/>
         <w:pageBreakBefore/>
       </w:pPr>
-      <w:bookmarkStart w:id="58" w:name="_Toc243405049"/>
+      <w:bookmarkStart w:id="59" w:name="_Toc243410346"/>
       <w:r>
         <w:lastRenderedPageBreak/>
-        <w:t>12. Limits to admit, and next steps</w:t>
-      </w:r>
-      <w:bookmarkEnd w:id="58"/>
+        <w:t>13. Limits to admit, and next steps</w:t>
+      </w:r>
+      <w:bookmarkEnd w:id="59"/>
     </w:p>
     <w:p>
       <w:pPr>
@@ -15867,12 +17262,12 @@
         <w:pStyle w:val="Titre1"/>
         <w:pageBreakBefore/>
       </w:pPr>
-      <w:bookmarkStart w:id="59" w:name="_Toc243405050"/>
+      <w:bookmarkStart w:id="60" w:name="_Toc243410347"/>
       <w:r>
         <w:lastRenderedPageBreak/>
-        <w:t>13. Git history and how to reproduce</w:t>
-      </w:r>
-      <w:bookmarkEnd w:id="59"/>
+        <w:t>14. Git history and how to reproduce</w:t>
+      </w:r>
+      <w:bookmarkEnd w:id="60"/>
     </w:p>
     <w:p>
       <w:pPr>
@@ -16413,6 +17808,78 @@
                 <w:sz w:val="19"/>
                 <w:szCs w:val="19"/>
               </w:rPr>
+              <w:t>Bonus</w:t>
+            </w:r>
+          </w:p>
+        </w:tc>
+        <w:tc>
+          <w:tcPr>
+            <w:tcW w:w="5590" w:type="dxa"/>
+            <w:tcBorders>
+              <w:top w:val="single" w:sz="4" w:space="0" w:color="D9DCE2"/>
+              <w:left w:val="single" w:sz="4" w:space="0" w:color="D9DCE2"/>
+              <w:bottom w:val="single" w:sz="4" w:space="0" w:color="D9DCE2"/>
+              <w:right w:val="single" w:sz="4" w:space="0" w:color="D9DCE2"/>
+            </w:tcBorders>
+            <w:tcMar>
+              <w:top w:w="60" w:type="dxa"/>
+              <w:left w:w="100" w:type="dxa"/>
+              <w:bottom w:w="60" w:type="dxa"/>
+              <w:right w:w="100" w:type="dxa"/>
+            </w:tcMar>
+          </w:tcPr>
+          <w:p>
+            <w:r>
+              <w:rPr>
+                <w:sz w:val="19"/>
+                <w:szCs w:val="19"/>
+              </w:rPr>
+              <w:t>transformers module (+ tests); notebook 07 (ViT, CLIP on validation); README, backup slide and guide</w:t>
+            </w:r>
+          </w:p>
+        </w:tc>
+        <w:tc>
+          <w:tcPr>
+            <w:tcW w:w="1928" w:type="dxa"/>
+            <w:tcBorders>
+              <w:top w:val="single" w:sz="4" w:space="0" w:color="D9DCE2"/>
+              <w:left w:val="single" w:sz="4" w:space="0" w:color="D9DCE2"/>
+              <w:bottom w:val="single" w:sz="4" w:space="0" w:color="D9DCE2"/>
+              <w:right w:val="single" w:sz="4" w:space="0" w:color="D9DCE2"/>
+            </w:tcBorders>
+            <w:tcMar>
+              <w:top w:w="60" w:type="dxa"/>
+              <w:left w:w="100" w:type="dxa"/>
+              <w:bottom w:w="60" w:type="dxa"/>
+              <w:right w:w="100" w:type="dxa"/>
+            </w:tcMar>
+          </w:tcPr>
+          <w:p/>
+        </w:tc>
+      </w:tr>
+      <w:tr>
+        <w:tc>
+          <w:tcPr>
+            <w:tcW w:w="2120" w:type="dxa"/>
+            <w:tcBorders>
+              <w:top w:val="single" w:sz="4" w:space="0" w:color="D9DCE2"/>
+              <w:left w:val="single" w:sz="4" w:space="0" w:color="D9DCE2"/>
+              <w:bottom w:val="single" w:sz="4" w:space="0" w:color="D9DCE2"/>
+              <w:right w:val="single" w:sz="4" w:space="0" w:color="D9DCE2"/>
+            </w:tcBorders>
+            <w:tcMar>
+              <w:top w:w="60" w:type="dxa"/>
+              <w:left w:w="100" w:type="dxa"/>
+              <w:bottom w:w="60" w:type="dxa"/>
+              <w:right w:w="100" w:type="dxa"/>
+            </w:tcMar>
+          </w:tcPr>
+          <w:p>
+            <w:r>
+              <w:rPr>
+                <w:sz w:val="19"/>
+                <w:szCs w:val="19"/>
+              </w:rPr>
               <w:t>6. Defence material</w:t>
             </w:r>
           </w:p>
@@ -16590,7 +18057,7 @@
         <w:t>evaluation.py</w:t>
       </w:r>
       <w:r>
-        <w:t xml:space="preserve"> (confusion matrix, bootstrap). </w:t>
+        <w:t xml:space="preserve"> (confusion matrix, bootstrap), </w:t>
       </w:r>
       <w:r>
         <w:rPr>
@@ -16598,10 +18065,10 @@
           <w:sz w:val="19"/>
           <w:szCs w:val="19"/>
         </w:rPr>
-        <w:t>notebooks/</w:t>
-      </w:r>
-      <w:r>
-        <w:t xml:space="preserve"> 01 to 06 (.py source + .ipynb with outputs). </w:t>
+        <w:t>foundation.py</w:t>
+      </w:r>
+      <w:r>
+        <w:t xml:space="preserve"> (ViT and CLIP, bonus). </w:t>
       </w:r>
       <w:r>
         <w:rPr>
@@ -16609,10 +18076,21 @@
           <w:sz w:val="19"/>
           <w:szCs w:val="19"/>
         </w:rPr>
+        <w:t>notebooks/</w:t>
+      </w:r>
+      <w:r>
+        <w:t xml:space="preserve"> 01 to 07 (.py source + .ipynb with outputs; 07 is the bonus). </w:t>
+      </w:r>
+      <w:r>
+        <w:rPr>
+          <w:rFonts w:ascii="Consolas" w:eastAsia="Consolas" w:hAnsi="Consolas" w:cs="Consolas"/>
+          <w:sz w:val="19"/>
+          <w:szCs w:val="19"/>
+        </w:rPr>
         <w:t>tests/</w:t>
       </w:r>
       <w:r>
-        <w:t xml:space="preserve">: 31 tests. </w:t>
+        <w:t xml:space="preserve">: 33 tests. </w:t>
       </w:r>
       <w:r>
         <w:rPr>
@@ -16740,12 +18218,12 @@
         <w:pStyle w:val="Titre1"/>
         <w:pageBreakBefore/>
       </w:pPr>
-      <w:bookmarkStart w:id="60" w:name="_Toc243405051"/>
+      <w:bookmarkStart w:id="61" w:name="_Toc243410348"/>
       <w:r>
         <w:lastRenderedPageBreak/>
-        <w:t>14. The 10-minute talk, slide by slide</w:t>
-      </w:r>
-      <w:bookmarkEnd w:id="60"/>
+        <w:t>15. The 10-minute talk, slide by slide</w:t>
+      </w:r>
+      <w:bookmarkEnd w:id="61"/>
     </w:p>
     <w:p>
       <w:pPr>
@@ -18099,11 +19577,11 @@
         <w:spacing w:after="120"/>
       </w:pPr>
       <w:r>
-        <w:t>Slides 12 to 15 are backups for the questions: validation vs test, why you can trust the numbers, the training recipes, and where the chosen model fails.</w:t>
+        <w:t>Slides 12 to 16 are backups for the questions: validation vs test, why you can trust the numbers, the training recipes, where the chosen model fails, and what about transformers (BERT, ViT, CLIP). The word-for-word script is in oral_script.pdf.</w:t>
       </w:r>
     </w:p>
     <w:sectPr>
-      <w:footerReference w:type="default" r:id="rId12"/>
+      <w:footerReference w:type="default" r:id="rId13"/>
       <w:pgSz w:w="11906" w:h="16838"/>
       <w:pgMar w:top="1134" w:right="1134" w:bottom="1134" w:left="1134" w:header="708" w:footer="708" w:gutter="0"/>
       <w:cols w:space="720"/>
@@ -18213,64 +19691,64 @@
 <file path=word/numbering.xml><?xml version="1.0" encoding="utf-8"?>
 <w:numbering xmlns:wpc="http://schemas.microsoft.com/office/word/2010/wordprocessingCanvas" xmlns:cx="http://schemas.microsoft.com/office/drawing/2014/chartex" xmlns:cx1="http://schemas.microsoft.com/office/drawing/2015/9/8/chartex" xmlns:cx2="http://schemas.microsoft.com/office/drawing/2015/10/21/chartex" xmlns:cx3="http://schemas.microsoft.com/office/drawing/2016/5/9/chartex" xmlns:cx4="http://schemas.microsoft.com/office/drawing/2016/5/10/chartex" xmlns:cx5="http://schemas.microsoft.com/office/drawing/2016/5/11/chartex" xmlns:cx6="http://schemas.microsoft.com/office/drawing/2016/5/12/chartex" xmlns:cx7="http://schemas.microsoft.com/office/drawing/2016/5/13/chartex" xmlns:cx8="http://schemas.microsoft.com/office/drawing/2016/5/14/chartex" xmlns:mc="http://schemas.openxmlformats.org/markup-compatibility/2006" xmlns:aink="http://schemas.microsoft.com/office/drawing/2016/ink" xmlns:am3d="http://schemas.microsoft.com/office/drawing/2017/model3d" xmlns:o="urn:schemas-microsoft-com:office:office" xmlns:oel="http://schemas.microsoft.com/office/2019/extlst" xmlns:r="http://schemas.openxmlformats.org/officeDocument/2006/relationships" xmlns:m="http://schemas.openxmlformats.org/officeDocument/2006/math" xmlns:v="urn:schemas-microsoft-com:vml" xmlns:wp14="http://schemas.microsoft.com/office/word/2010/wordprocessingDrawing" xmlns:wp="http://schemas.openxmlformats.org/drawingml/2006/wordprocessingDrawing" xmlns:w10="urn:schemas-microsoft-com:office:word" xmlns:w="http://schemas.openxmlformats.org/wordprocessingml/2006/main" xmlns:w14="http://schemas.microsoft.com/office/word/2010/wordml" xmlns:w15="http://schemas.microsoft.com/office/word/2012/wordml" xmlns:w16cex="http://schemas.microsoft.com/office/word/2018/wordml/cex" xmlns:w16cid="http://schemas.microsoft.com/office/word/2016/wordml/cid" xmlns:w16="http://schemas.microsoft.com/office/word/2018/wordml" xmlns:w16du="http://schemas.microsoft.com/office/word/2023/wordml/word16du" xmlns:w16sdtdh="http://schemas.microsoft.com/office/word/2020/wordml/sdtdatahash" xmlns:w16sdtfl="http://schemas.microsoft.com/office/word/2024/wordml/sdtformatlock" xmlns:w16se="http://schemas.microsoft.com/office/word/2015/wordml/symex" xmlns:wpg="http://schemas.microsoft.com/office/word/2010/wordprocessingGroup" xmlns:wpi="http://schemas.microsoft.com/office/word/2010/wordprocessingInk" xmlns:wne="http://schemas.microsoft.com/office/word/2006/wordml" xmlns:wps="http://schemas.microsoft.com/office/word/2010/wordprocessingShape" mc:Ignorable="w14 w15 w16se w16cid w16 w16cex w16sdtdh w16sdtfl w16du wp14">
   <w:abstractNum w:abstractNumId="0" w15:restartNumberingAfterBreak="0">
-    <w:nsid w:val="12347EF6"/>
+    <w:nsid w:val="396B73FD"/>
     <w:multiLevelType w:val="hybridMultilevel"/>
-    <w:tmpl w:val="DBFCE084"/>
-    <w:lvl w:ilvl="0" w:tplc="A9F6E2CE">
+    <w:tmpl w:val="E72E7B70"/>
+    <w:lvl w:ilvl="0" w:tplc="FA16A582">
       <w:start w:val="1"/>
-      <w:numFmt w:val="bullet"/>
-      <w:lvlText w:val="•"/>
+      <w:numFmt w:val="decimal"/>
+      <w:lvlText w:val="%1."/>
       <w:lvlJc w:val="left"/>
       <w:pPr>
-        <w:ind w:left="400" w:hanging="260"/>
+        <w:ind w:left="400" w:hanging="300"/>
       </w:pPr>
     </w:lvl>
-    <w:lvl w:ilvl="1" w:tplc="B164C4EC">
+    <w:lvl w:ilvl="1" w:tplc="EC0E69B4">
       <w:numFmt w:val="decimal"/>
       <w:lvlText w:val=""/>
       <w:lvlJc w:val="left"/>
     </w:lvl>
-    <w:lvl w:ilvl="2" w:tplc="4E740992">
+    <w:lvl w:ilvl="2" w:tplc="B5D40592">
       <w:numFmt w:val="decimal"/>
       <w:lvlText w:val=""/>
       <w:lvlJc w:val="left"/>
     </w:lvl>
-    <w:lvl w:ilvl="3" w:tplc="82522AD6">
+    <w:lvl w:ilvl="3" w:tplc="FDFC5100">
       <w:numFmt w:val="decimal"/>
       <w:lvlText w:val=""/>
       <w:lvlJc w:val="left"/>
     </w:lvl>
-    <w:lvl w:ilvl="4" w:tplc="D72AF548">
+    <w:lvl w:ilvl="4" w:tplc="C944BB40">
       <w:numFmt w:val="decimal"/>
       <w:lvlText w:val=""/>
       <w:lvlJc w:val="left"/>
     </w:lvl>
-    <w:lvl w:ilvl="5" w:tplc="52B6A644">
+    <w:lvl w:ilvl="5" w:tplc="FCAC06BE">
       <w:numFmt w:val="decimal"/>
       <w:lvlText w:val=""/>
       <w:lvlJc w:val="left"/>
     </w:lvl>
-    <w:lvl w:ilvl="6" w:tplc="25FC8BAA">
+    <w:lvl w:ilvl="6" w:tplc="22963502">
       <w:numFmt w:val="decimal"/>
       <w:lvlText w:val=""/>
       <w:lvlJc w:val="left"/>
     </w:lvl>
-    <w:lvl w:ilvl="7" w:tplc="6878340C">
+    <w:lvl w:ilvl="7" w:tplc="03D67B2E">
       <w:numFmt w:val="decimal"/>
       <w:lvlText w:val=""/>
       <w:lvlJc w:val="left"/>
     </w:lvl>
-    <w:lvl w:ilvl="8" w:tplc="2E3E7328">
+    <w:lvl w:ilvl="8" w:tplc="FB58169C">
       <w:numFmt w:val="decimal"/>
       <w:lvlText w:val=""/>
       <w:lvlJc w:val="left"/>
     </w:lvl>
   </w:abstractNum>
   <w:abstractNum w:abstractNumId="1" w15:restartNumberingAfterBreak="0">
-    <w:nsid w:val="203C5A68"/>
+    <w:nsid w:val="3D3C6208"/>
     <w:multiLevelType w:val="hybridMultilevel"/>
-    <w:tmpl w:val="2AD47B5A"/>
-    <w:lvl w:ilvl="0" w:tplc="CF127204">
+    <w:tmpl w:val="43B4D5B6"/>
+    <w:lvl w:ilvl="0" w:tplc="2856CDE0">
       <w:start w:val="1"/>
       <w:numFmt w:val="decimal"/>
       <w:lvlText w:val="%1."/>
@@ -18279,106 +19757,192 @@
         <w:ind w:left="400" w:hanging="300"/>
       </w:pPr>
     </w:lvl>
-    <w:lvl w:ilvl="1" w:tplc="89F88138">
+    <w:lvl w:ilvl="1" w:tplc="9058E762">
       <w:numFmt w:val="decimal"/>
       <w:lvlText w:val=""/>
       <w:lvlJc w:val="left"/>
     </w:lvl>
-    <w:lvl w:ilvl="2" w:tplc="EA5A16EC">
+    <w:lvl w:ilvl="2" w:tplc="32C63FC2">
       <w:numFmt w:val="decimal"/>
       <w:lvlText w:val=""/>
       <w:lvlJc w:val="left"/>
     </w:lvl>
-    <w:lvl w:ilvl="3" w:tplc="D2603BF8">
+    <w:lvl w:ilvl="3" w:tplc="4AA6265A">
       <w:numFmt w:val="decimal"/>
       <w:lvlText w:val=""/>
       <w:lvlJc w:val="left"/>
     </w:lvl>
-    <w:lvl w:ilvl="4" w:tplc="28768CF6">
+    <w:lvl w:ilvl="4" w:tplc="A11429E6">
       <w:numFmt w:val="decimal"/>
       <w:lvlText w:val=""/>
       <w:lvlJc w:val="left"/>
     </w:lvl>
-    <w:lvl w:ilvl="5" w:tplc="5C743126">
+    <w:lvl w:ilvl="5" w:tplc="DE5033E2">
       <w:numFmt w:val="decimal"/>
       <w:lvlText w:val=""/>
       <w:lvlJc w:val="left"/>
     </w:lvl>
-    <w:lvl w:ilvl="6" w:tplc="D8CED2AE">
+    <w:lvl w:ilvl="6" w:tplc="CDB63F94">
       <w:numFmt w:val="decimal"/>
       <w:lvlText w:val=""/>
       <w:lvlJc w:val="left"/>
     </w:lvl>
-    <w:lvl w:ilvl="7" w:tplc="FA867948">
+    <w:lvl w:ilvl="7" w:tplc="77383F0E">
       <w:numFmt w:val="decimal"/>
       <w:lvlText w:val=""/>
       <w:lvlJc w:val="left"/>
     </w:lvl>
-    <w:lvl w:ilvl="8" w:tplc="6142A5A8">
+    <w:lvl w:ilvl="8" w:tplc="82E407B0">
       <w:numFmt w:val="decimal"/>
       <w:lvlText w:val=""/>
       <w:lvlJc w:val="left"/>
     </w:lvl>
   </w:abstractNum>
   <w:abstractNum w:abstractNumId="2" w15:restartNumberingAfterBreak="0">
-    <w:nsid w:val="2370322F"/>
+    <w:nsid w:val="3D593FCE"/>
     <w:multiLevelType w:val="hybridMultilevel"/>
-    <w:tmpl w:val="E856BCCE"/>
-    <w:lvl w:ilvl="0" w:tplc="D794D29E">
+    <w:tmpl w:val="FC167494"/>
+    <w:lvl w:ilvl="0" w:tplc="CF86E8C2">
       <w:start w:val="1"/>
-      <w:numFmt w:val="decimal"/>
-      <w:lvlText w:val="%1."/>
+      <w:numFmt w:val="bullet"/>
+      <w:lvlText w:val="•"/>
       <w:lvlJc w:val="left"/>
       <w:pPr>
-        <w:ind w:left="400" w:hanging="300"/>
+        <w:ind w:left="400" w:hanging="260"/>
       </w:pPr>
     </w:lvl>
-    <w:lvl w:ilvl="1" w:tplc="8E76BF0C">
+    <w:lvl w:ilvl="1" w:tplc="2098BF66">
       <w:numFmt w:val="decimal"/>
       <w:lvlText w:val=""/>
       <w:lvlJc w:val="left"/>
     </w:lvl>
-    <w:lvl w:ilvl="2" w:tplc="9F4258EE">
+    <w:lvl w:ilvl="2" w:tplc="36746A04">
       <w:numFmt w:val="decimal"/>
       <w:lvlText w:val=""/>
       <w:lvlJc w:val="left"/>
     </w:lvl>
-    <w:lvl w:ilvl="3" w:tplc="0B74C848">
+    <w:lvl w:ilvl="3" w:tplc="B7DC26DE">
       <w:numFmt w:val="decimal"/>
       <w:lvlText w:val=""/>
       <w:lvlJc w:val="left"/>
     </w:lvl>
-    <w:lvl w:ilvl="4" w:tplc="EB78E92A">
+    <w:lvl w:ilvl="4" w:tplc="95542B92">
       <w:numFmt w:val="decimal"/>
       <w:lvlText w:val=""/>
       <w:lvlJc w:val="left"/>
     </w:lvl>
-    <w:lvl w:ilvl="5" w:tplc="7D6C368A">
+    <w:lvl w:ilvl="5" w:tplc="FA4280B8">
       <w:numFmt w:val="decimal"/>
       <w:lvlText w:val=""/>
       <w:lvlJc w:val="left"/>
     </w:lvl>
-    <w:lvl w:ilvl="6" w:tplc="BDDAF93C">
+    <w:lvl w:ilvl="6" w:tplc="9120F7CA">
       <w:numFmt w:val="decimal"/>
       <w:lvlText w:val=""/>
       <w:lvlJc w:val="left"/>
     </w:lvl>
-    <w:lvl w:ilvl="7" w:tplc="02CE052A">
+    <w:lvl w:ilvl="7" w:tplc="BC9E7950">
       <w:numFmt w:val="decimal"/>
       <w:lvlText w:val=""/>
       <w:lvlJc w:val="left"/>
     </w:lvl>
-    <w:lvl w:ilvl="8" w:tplc="79C85136">
+    <w:lvl w:ilvl="8" w:tplc="8EE424D2">
       <w:numFmt w:val="decimal"/>
       <w:lvlText w:val=""/>
       <w:lvlJc w:val="left"/>
     </w:lvl>
   </w:abstractNum>
   <w:abstractNum w:abstractNumId="3" w15:restartNumberingAfterBreak="0">
-    <w:nsid w:val="3BC66BA2"/>
+    <w:nsid w:val="470C68CB"/>
     <w:multiLevelType w:val="hybridMultilevel"/>
-    <w:tmpl w:val="FFE82BB8"/>
-    <w:lvl w:ilvl="0" w:tplc="AABEE07E">
+    <w:tmpl w:val="76C26030"/>
+    <w:lvl w:ilvl="0" w:tplc="840C3A86" w:tentative="1">
+      <w:start w:val="1"/>
+      <w:numFmt w:val="bullet"/>
+      <w:lvlText w:val="●"/>
+      <w:lvlJc w:val="left"/>
+      <w:pPr>
+        <w:ind w:left="720" w:hanging="360"/>
+      </w:pPr>
+    </w:lvl>
+    <w:lvl w:ilvl="1" w:tplc="82FC6DBC" w:tentative="1">
+      <w:start w:val="1"/>
+      <w:numFmt w:val="bullet"/>
+      <w:lvlText w:val="○"/>
+      <w:lvlJc w:val="left"/>
+      <w:pPr>
+        <w:ind w:left="1440" w:hanging="360"/>
+      </w:pPr>
+    </w:lvl>
+    <w:lvl w:ilvl="2" w:tplc="569E4100" w:tentative="1">
+      <w:start w:val="1"/>
+      <w:numFmt w:val="bullet"/>
+      <w:lvlText w:val="■"/>
+      <w:lvlJc w:val="left"/>
+      <w:pPr>
+        <w:ind w:left="2160" w:hanging="360"/>
+      </w:pPr>
+    </w:lvl>
+    <w:lvl w:ilvl="3" w:tplc="1AAC7B38" w:tentative="1">
+      <w:start w:val="1"/>
+      <w:numFmt w:val="bullet"/>
+      <w:lvlText w:val="●"/>
+      <w:lvlJc w:val="left"/>
+      <w:pPr>
+        <w:ind w:left="2880" w:hanging="360"/>
+      </w:pPr>
+    </w:lvl>
+    <w:lvl w:ilvl="4" w:tplc="950C780E" w:tentative="1">
+      <w:start w:val="1"/>
+      <w:numFmt w:val="bullet"/>
+      <w:lvlText w:val="○"/>
+      <w:lvlJc w:val="left"/>
+      <w:pPr>
+        <w:ind w:left="3600" w:hanging="360"/>
+      </w:pPr>
+    </w:lvl>
+    <w:lvl w:ilvl="5" w:tplc="0DCA5E14" w:tentative="1">
+      <w:start w:val="1"/>
+      <w:numFmt w:val="bullet"/>
+      <w:lvlText w:val="■"/>
+      <w:lvlJc w:val="left"/>
+      <w:pPr>
+        <w:ind w:left="4320" w:hanging="360"/>
+      </w:pPr>
+    </w:lvl>
+    <w:lvl w:ilvl="6" w:tplc="845AFC76" w:tentative="1">
+      <w:start w:val="1"/>
+      <w:numFmt w:val="bullet"/>
+      <w:lvlText w:val="●"/>
+      <w:lvlJc w:val="left"/>
+      <w:pPr>
+        <w:ind w:left="5040" w:hanging="360"/>
+      </w:pPr>
+    </w:lvl>
+    <w:lvl w:ilvl="7" w:tplc="FFFCFB26" w:tentative="1">
+      <w:start w:val="1"/>
+      <w:numFmt w:val="bullet"/>
+      <w:lvlText w:val="●"/>
+      <w:lvlJc w:val="left"/>
+      <w:pPr>
+        <w:ind w:left="5760" w:hanging="360"/>
+      </w:pPr>
+    </w:lvl>
+    <w:lvl w:ilvl="8" w:tplc="A9F8F83E" w:tentative="1">
+      <w:start w:val="1"/>
+      <w:numFmt w:val="bullet"/>
+      <w:lvlText w:val="●"/>
+      <w:lvlJc w:val="left"/>
+      <w:pPr>
+        <w:ind w:left="6480" w:hanging="360"/>
+      </w:pPr>
+    </w:lvl>
+  </w:abstractNum>
+  <w:abstractNum w:abstractNumId="4" w15:restartNumberingAfterBreak="0">
+    <w:nsid w:val="73427400"/>
+    <w:multiLevelType w:val="hybridMultilevel"/>
+    <w:tmpl w:val="FDBEEEAA"/>
+    <w:lvl w:ilvl="0" w:tplc="B426C3BE">
       <w:start w:val="1"/>
       <w:numFmt w:val="decimal"/>
       <w:lvlText w:val="%1."/>
@@ -18387,159 +19951,73 @@
         <w:ind w:left="400" w:hanging="300"/>
       </w:pPr>
     </w:lvl>
-    <w:lvl w:ilvl="1" w:tplc="F26EF5A2">
+    <w:lvl w:ilvl="1" w:tplc="C87492FC">
       <w:numFmt w:val="decimal"/>
       <w:lvlText w:val=""/>
       <w:lvlJc w:val="left"/>
     </w:lvl>
-    <w:lvl w:ilvl="2" w:tplc="EA16023C">
+    <w:lvl w:ilvl="2" w:tplc="3786A042">
       <w:numFmt w:val="decimal"/>
       <w:lvlText w:val=""/>
       <w:lvlJc w:val="left"/>
     </w:lvl>
-    <w:lvl w:ilvl="3" w:tplc="294EE6C6">
+    <w:lvl w:ilvl="3" w:tplc="A126B4E0">
       <w:numFmt w:val="decimal"/>
       <w:lvlText w:val=""/>
       <w:lvlJc w:val="left"/>
     </w:lvl>
-    <w:lvl w:ilvl="4" w:tplc="BF021F40">
+    <w:lvl w:ilvl="4" w:tplc="6F300B36">
       <w:numFmt w:val="decimal"/>
       <w:lvlText w:val=""/>
       <w:lvlJc w:val="left"/>
     </w:lvl>
-    <w:lvl w:ilvl="5" w:tplc="4D866416">
+    <w:lvl w:ilvl="5" w:tplc="70E6B782">
       <w:numFmt w:val="decimal"/>
       <w:lvlText w:val=""/>
       <w:lvlJc w:val="left"/>
     </w:lvl>
-    <w:lvl w:ilvl="6" w:tplc="3384ACFE">
+    <w:lvl w:ilvl="6" w:tplc="8330370E">
       <w:numFmt w:val="decimal"/>
       <w:lvlText w:val=""/>
       <w:lvlJc w:val="left"/>
     </w:lvl>
-    <w:lvl w:ilvl="7" w:tplc="0674EFEA">
+    <w:lvl w:ilvl="7" w:tplc="9E9C6560">
       <w:numFmt w:val="decimal"/>
       <w:lvlText w:val=""/>
       <w:lvlJc w:val="left"/>
     </w:lvl>
-    <w:lvl w:ilvl="8" w:tplc="9E9C306A">
+    <w:lvl w:ilvl="8" w:tplc="AC1E9504">
       <w:numFmt w:val="decimal"/>
       <w:lvlText w:val=""/>
       <w:lvlJc w:val="left"/>
     </w:lvl>
   </w:abstractNum>
-  <w:abstractNum w:abstractNumId="4" w15:restartNumberingAfterBreak="0">
-    <w:nsid w:val="59BD7B63"/>
-    <w:multiLevelType w:val="hybridMultilevel"/>
-    <w:tmpl w:val="97505584"/>
-    <w:lvl w:ilvl="0" w:tplc="0C3A6FC6" w:tentative="1">
-      <w:start w:val="1"/>
-      <w:numFmt w:val="bullet"/>
-      <w:lvlText w:val="●"/>
-      <w:lvlJc w:val="left"/>
-      <w:pPr>
-        <w:ind w:left="720" w:hanging="360"/>
-      </w:pPr>
-    </w:lvl>
-    <w:lvl w:ilvl="1" w:tplc="8402E09C" w:tentative="1">
-      <w:start w:val="1"/>
-      <w:numFmt w:val="bullet"/>
-      <w:lvlText w:val="○"/>
-      <w:lvlJc w:val="left"/>
-      <w:pPr>
-        <w:ind w:left="1440" w:hanging="360"/>
-      </w:pPr>
-    </w:lvl>
-    <w:lvl w:ilvl="2" w:tplc="4524EF2C" w:tentative="1">
-      <w:start w:val="1"/>
-      <w:numFmt w:val="bullet"/>
-      <w:lvlText w:val="■"/>
-      <w:lvlJc w:val="left"/>
-      <w:pPr>
-        <w:ind w:left="2160" w:hanging="360"/>
-      </w:pPr>
-    </w:lvl>
-    <w:lvl w:ilvl="3" w:tplc="02B2C3AC" w:tentative="1">
-      <w:start w:val="1"/>
-      <w:numFmt w:val="bullet"/>
-      <w:lvlText w:val="●"/>
-      <w:lvlJc w:val="left"/>
-      <w:pPr>
-        <w:ind w:left="2880" w:hanging="360"/>
-      </w:pPr>
-    </w:lvl>
-    <w:lvl w:ilvl="4" w:tplc="359AD404" w:tentative="1">
-      <w:start w:val="1"/>
-      <w:numFmt w:val="bullet"/>
-      <w:lvlText w:val="○"/>
-      <w:lvlJc w:val="left"/>
-      <w:pPr>
-        <w:ind w:left="3600" w:hanging="360"/>
-      </w:pPr>
-    </w:lvl>
-    <w:lvl w:ilvl="5" w:tplc="3794BA44" w:tentative="1">
-      <w:start w:val="1"/>
-      <w:numFmt w:val="bullet"/>
-      <w:lvlText w:val="■"/>
-      <w:lvlJc w:val="left"/>
-      <w:pPr>
-        <w:ind w:left="4320" w:hanging="360"/>
-      </w:pPr>
-    </w:lvl>
-    <w:lvl w:ilvl="6" w:tplc="63566A44" w:tentative="1">
-      <w:start w:val="1"/>
-      <w:numFmt w:val="bullet"/>
-      <w:lvlText w:val="●"/>
-      <w:lvlJc w:val="left"/>
-      <w:pPr>
-        <w:ind w:left="5040" w:hanging="360"/>
-      </w:pPr>
-    </w:lvl>
-    <w:lvl w:ilvl="7" w:tplc="08DC5436" w:tentative="1">
-      <w:start w:val="1"/>
-      <w:numFmt w:val="bullet"/>
-      <w:lvlText w:val="●"/>
-      <w:lvlJc w:val="left"/>
-      <w:pPr>
-        <w:ind w:left="5760" w:hanging="360"/>
-      </w:pPr>
-    </w:lvl>
-    <w:lvl w:ilvl="8" w:tplc="07D00762" w:tentative="1">
-      <w:start w:val="1"/>
-      <w:numFmt w:val="bullet"/>
-      <w:lvlText w:val="●"/>
-      <w:lvlJc w:val="left"/>
-      <w:pPr>
-        <w:ind w:left="6480" w:hanging="360"/>
-      </w:pPr>
-    </w:lvl>
-  </w:abstractNum>
-  <w:num w:numId="1" w16cid:durableId="1959144455">
+  <w:num w:numId="1" w16cid:durableId="1553077170">
+    <w:abstractNumId w:val="3"/>
+    <w:lvlOverride w:ilvl="0">
+      <w:startOverride w:val="1"/>
+    </w:lvlOverride>
+  </w:num>
+  <w:num w:numId="2" w16cid:durableId="427434149">
+    <w:abstractNumId w:val="0"/>
+    <w:lvlOverride w:ilvl="0">
+      <w:startOverride w:val="1"/>
+    </w:lvlOverride>
+  </w:num>
+  <w:num w:numId="3" w16cid:durableId="1900364802">
+    <w:abstractNumId w:val="2"/>
+    <w:lvlOverride w:ilvl="0">
+      <w:startOverride w:val="1"/>
+    </w:lvlOverride>
+  </w:num>
+  <w:num w:numId="4" w16cid:durableId="1690567475">
     <w:abstractNumId w:val="4"/>
     <w:lvlOverride w:ilvl="0">
       <w:startOverride w:val="1"/>
     </w:lvlOverride>
   </w:num>
-  <w:num w:numId="2" w16cid:durableId="1514807490">
+  <w:num w:numId="5" w16cid:durableId="468784870">
     <w:abstractNumId w:val="1"/>
-    <w:lvlOverride w:ilvl="0">
-      <w:startOverride w:val="1"/>
-    </w:lvlOverride>
-  </w:num>
-  <w:num w:numId="3" w16cid:durableId="916209782">
-    <w:abstractNumId w:val="0"/>
-    <w:lvlOverride w:ilvl="0">
-      <w:startOverride w:val="1"/>
-    </w:lvlOverride>
-  </w:num>
-  <w:num w:numId="4" w16cid:durableId="711462583">
-    <w:abstractNumId w:val="2"/>
-    <w:lvlOverride w:ilvl="0">
-      <w:startOverride w:val="1"/>
-    </w:lvlOverride>
-  </w:num>
-  <w:num w:numId="5" w16cid:durableId="2044863430">
-    <w:abstractNumId w:val="3"/>
     <w:lvlOverride w:ilvl="0">
       <w:startOverride w:val="1"/>
     </w:lvlOverride>
@@ -19179,7 +20657,7 @@
     <w:autoRedefine/>
     <w:uiPriority w:val="39"/>
     <w:unhideWhenUsed/>
-    <w:rsid w:val="00765EC1"/>
+    <w:rsid w:val="008035C8"/>
     <w:pPr>
       <w:spacing w:after="100"/>
     </w:pPr>
@@ -19191,7 +20669,7 @@
     <w:autoRedefine/>
     <w:uiPriority w:val="39"/>
     <w:unhideWhenUsed/>
-    <w:rsid w:val="00765EC1"/>
+    <w:rsid w:val="008035C8"/>
     <w:pPr>
       <w:spacing w:after="100"/>
       <w:ind w:left="210"/>

</xml_diff>

<commit_message>
changes in the oral script to make it more fluid and comprehensive
</commit_message>
<xml_diff>
--- a/docs/oral_study_guide.docx
+++ b/docs/oral_study_guide.docx
@@ -86,14 +86,13 @@
           <w:sz w:val="34"/>
           <w:szCs w:val="34"/>
         </w:rPr>
-        <w:lastRenderedPageBreak/>
         <w:t>Contents</w:t>
       </w:r>
     </w:p>
     <w:sdt>
       <w:sdtPr>
         <w:alias w:val="Contents"/>
-        <w:id w:val="1062133137"/>
+        <w:id w:val="470033892"/>
       </w:sdtPr>
       <w:sdtEndPr/>
       <w:sdtContent>
@@ -116,7 +115,7 @@
           <w:r>
             <w:fldChar w:fldCharType="separate"/>
           </w:r>
-          <w:hyperlink w:anchor="_Toc243410287" w:history="1">
+          <w:hyperlink w:anchor="_Toc243470727" w:history="1">
             <w:r>
               <w:rPr>
                 <w:rStyle w:val="Lienhypertexte"/>
@@ -140,7 +139,7 @@
               <w:rPr>
                 <w:noProof/>
               </w:rPr>
-              <w:instrText xml:space="preserve"> PAGEREF _Toc243410287 \h </w:instrText>
+              <w:instrText xml:space="preserve"> PAGEREF _Toc243470727 \h </w:instrText>
             </w:r>
             <w:r>
               <w:rPr>
@@ -177,7 +176,7 @@
               <w:noProof/>
             </w:rPr>
           </w:pPr>
-          <w:hyperlink w:anchor="_Toc243410288" w:history="1">
+          <w:hyperlink w:anchor="_Toc243470728" w:history="1">
             <w:r>
               <w:rPr>
                 <w:rStyle w:val="Lienhypertexte"/>
@@ -201,7 +200,7 @@
               <w:rPr>
                 <w:noProof/>
               </w:rPr>
-              <w:instrText xml:space="preserve"> PAGEREF _Toc243410288 \h </w:instrText>
+              <w:instrText xml:space="preserve"> PAGEREF _Toc243470728 \h </w:instrText>
             </w:r>
             <w:r>
               <w:rPr>
@@ -238,7 +237,7 @@
               <w:noProof/>
             </w:rPr>
           </w:pPr>
-          <w:hyperlink w:anchor="_Toc243410289" w:history="1">
+          <w:hyperlink w:anchor="_Toc243470729" w:history="1">
             <w:r>
               <w:rPr>
                 <w:rStyle w:val="Lienhypertexte"/>
@@ -262,7 +261,7 @@
               <w:rPr>
                 <w:noProof/>
               </w:rPr>
-              <w:instrText xml:space="preserve"> PAGEREF _Toc243410289 \h </w:instrText>
+              <w:instrText xml:space="preserve"> PAGEREF _Toc243470729 \h </w:instrText>
             </w:r>
             <w:r>
               <w:rPr>
@@ -299,7 +298,7 @@
               <w:noProof/>
             </w:rPr>
           </w:pPr>
-          <w:hyperlink w:anchor="_Toc243410290" w:history="1">
+          <w:hyperlink w:anchor="_Toc243470730" w:history="1">
             <w:r>
               <w:rPr>
                 <w:rStyle w:val="Lienhypertexte"/>
@@ -323,7 +322,7 @@
               <w:rPr>
                 <w:noProof/>
               </w:rPr>
-              <w:instrText xml:space="preserve"> PAGEREF _Toc243410290 \h </w:instrText>
+              <w:instrText xml:space="preserve"> PAGEREF _Toc243470730 \h </w:instrText>
             </w:r>
             <w:r>
               <w:rPr>
@@ -360,7 +359,7 @@
               <w:noProof/>
             </w:rPr>
           </w:pPr>
-          <w:hyperlink w:anchor="_Toc243410291" w:history="1">
+          <w:hyperlink w:anchor="_Toc243470731" w:history="1">
             <w:r>
               <w:rPr>
                 <w:rStyle w:val="Lienhypertexte"/>
@@ -384,7 +383,7 @@
               <w:rPr>
                 <w:noProof/>
               </w:rPr>
-              <w:instrText xml:space="preserve"> PAGEREF _Toc243410291 \h </w:instrText>
+              <w:instrText xml:space="preserve"> PAGEREF _Toc243470731 \h </w:instrText>
             </w:r>
             <w:r>
               <w:rPr>
@@ -421,7 +420,7 @@
               <w:noProof/>
             </w:rPr>
           </w:pPr>
-          <w:hyperlink w:anchor="_Toc243410292" w:history="1">
+          <w:hyperlink w:anchor="_Toc243470732" w:history="1">
             <w:r>
               <w:rPr>
                 <w:rStyle w:val="Lienhypertexte"/>
@@ -445,7 +444,7 @@
               <w:rPr>
                 <w:noProof/>
               </w:rPr>
-              <w:instrText xml:space="preserve"> PAGEREF _Toc243410292 \h </w:instrText>
+              <w:instrText xml:space="preserve"> PAGEREF _Toc243470732 \h </w:instrText>
             </w:r>
             <w:r>
               <w:rPr>
@@ -482,7 +481,7 @@
               <w:noProof/>
             </w:rPr>
           </w:pPr>
-          <w:hyperlink w:anchor="_Toc243410293" w:history="1">
+          <w:hyperlink w:anchor="_Toc243470733" w:history="1">
             <w:r>
               <w:rPr>
                 <w:rStyle w:val="Lienhypertexte"/>
@@ -506,7 +505,7 @@
               <w:rPr>
                 <w:noProof/>
               </w:rPr>
-              <w:instrText xml:space="preserve"> PAGEREF _Toc243410293 \h </w:instrText>
+              <w:instrText xml:space="preserve"> PAGEREF _Toc243470733 \h </w:instrText>
             </w:r>
             <w:r>
               <w:rPr>
@@ -543,7 +542,7 @@
               <w:noProof/>
             </w:rPr>
           </w:pPr>
-          <w:hyperlink w:anchor="_Toc243410294" w:history="1">
+          <w:hyperlink w:anchor="_Toc243470734" w:history="1">
             <w:r>
               <w:rPr>
                 <w:rStyle w:val="Lienhypertexte"/>
@@ -567,7 +566,7 @@
               <w:rPr>
                 <w:noProof/>
               </w:rPr>
-              <w:instrText xml:space="preserve"> PAGEREF _Toc243410294 \h </w:instrText>
+              <w:instrText xml:space="preserve"> PAGEREF _Toc243470734 \h </w:instrText>
             </w:r>
             <w:r>
               <w:rPr>
@@ -604,7 +603,7 @@
               <w:noProof/>
             </w:rPr>
           </w:pPr>
-          <w:hyperlink w:anchor="_Toc243410295" w:history="1">
+          <w:hyperlink w:anchor="_Toc243470735" w:history="1">
             <w:r>
               <w:rPr>
                 <w:rStyle w:val="Lienhypertexte"/>
@@ -628,7 +627,7 @@
               <w:rPr>
                 <w:noProof/>
               </w:rPr>
-              <w:instrText xml:space="preserve"> PAGEREF _Toc243410295 \h </w:instrText>
+              <w:instrText xml:space="preserve"> PAGEREF _Toc243470735 \h </w:instrText>
             </w:r>
             <w:r>
               <w:rPr>
@@ -665,7 +664,7 @@
               <w:noProof/>
             </w:rPr>
           </w:pPr>
-          <w:hyperlink w:anchor="_Toc243410296" w:history="1">
+          <w:hyperlink w:anchor="_Toc243470736" w:history="1">
             <w:r>
               <w:rPr>
                 <w:rStyle w:val="Lienhypertexte"/>
@@ -689,7 +688,7 @@
               <w:rPr>
                 <w:noProof/>
               </w:rPr>
-              <w:instrText xml:space="preserve"> PAGEREF _Toc243410296 \h </w:instrText>
+              <w:instrText xml:space="preserve"> PAGEREF _Toc243470736 \h </w:instrText>
             </w:r>
             <w:r>
               <w:rPr>
@@ -726,7 +725,7 @@
               <w:noProof/>
             </w:rPr>
           </w:pPr>
-          <w:hyperlink w:anchor="_Toc243410297" w:history="1">
+          <w:hyperlink w:anchor="_Toc243470737" w:history="1">
             <w:r>
               <w:rPr>
                 <w:rStyle w:val="Lienhypertexte"/>
@@ -750,7 +749,7 @@
               <w:rPr>
                 <w:noProof/>
               </w:rPr>
-              <w:instrText xml:space="preserve"> PAGEREF _Toc243410297 \h </w:instrText>
+              <w:instrText xml:space="preserve"> PAGEREF _Toc243470737 \h </w:instrText>
             </w:r>
             <w:r>
               <w:rPr>
@@ -787,7 +786,7 @@
               <w:noProof/>
             </w:rPr>
           </w:pPr>
-          <w:hyperlink w:anchor="_Toc243410298" w:history="1">
+          <w:hyperlink w:anchor="_Toc243470738" w:history="1">
             <w:r>
               <w:rPr>
                 <w:rStyle w:val="Lienhypertexte"/>
@@ -811,7 +810,7 @@
               <w:rPr>
                 <w:noProof/>
               </w:rPr>
-              <w:instrText xml:space="preserve"> PAGEREF _Toc243410298 \h </w:instrText>
+              <w:instrText xml:space="preserve"> PAGEREF _Toc243470738 \h </w:instrText>
             </w:r>
             <w:r>
               <w:rPr>
@@ -848,7 +847,7 @@
               <w:noProof/>
             </w:rPr>
           </w:pPr>
-          <w:hyperlink w:anchor="_Toc243410299" w:history="1">
+          <w:hyperlink w:anchor="_Toc243470739" w:history="1">
             <w:r>
               <w:rPr>
                 <w:rStyle w:val="Lienhypertexte"/>
@@ -872,7 +871,7 @@
               <w:rPr>
                 <w:noProof/>
               </w:rPr>
-              <w:instrText xml:space="preserve"> PAGEREF _Toc243410299 \h </w:instrText>
+              <w:instrText xml:space="preserve"> PAGEREF _Toc243470739 \h </w:instrText>
             </w:r>
             <w:r>
               <w:rPr>
@@ -909,7 +908,7 @@
               <w:noProof/>
             </w:rPr>
           </w:pPr>
-          <w:hyperlink w:anchor="_Toc243410300" w:history="1">
+          <w:hyperlink w:anchor="_Toc243470740" w:history="1">
             <w:r>
               <w:rPr>
                 <w:rStyle w:val="Lienhypertexte"/>
@@ -933,7 +932,7 @@
               <w:rPr>
                 <w:noProof/>
               </w:rPr>
-              <w:instrText xml:space="preserve"> PAGEREF _Toc243410300 \h </w:instrText>
+              <w:instrText xml:space="preserve"> PAGEREF _Toc243470740 \h </w:instrText>
             </w:r>
             <w:r>
               <w:rPr>
@@ -970,7 +969,7 @@
               <w:noProof/>
             </w:rPr>
           </w:pPr>
-          <w:hyperlink w:anchor="_Toc243410301" w:history="1">
+          <w:hyperlink w:anchor="_Toc243470741" w:history="1">
             <w:r>
               <w:rPr>
                 <w:rStyle w:val="Lienhypertexte"/>
@@ -994,7 +993,7 @@
               <w:rPr>
                 <w:noProof/>
               </w:rPr>
-              <w:instrText xml:space="preserve"> PAGEREF _Toc243410301 \h </w:instrText>
+              <w:instrText xml:space="preserve"> PAGEREF _Toc243470741 \h </w:instrText>
             </w:r>
             <w:r>
               <w:rPr>
@@ -1031,7 +1030,7 @@
               <w:noProof/>
             </w:rPr>
           </w:pPr>
-          <w:hyperlink w:anchor="_Toc243410302" w:history="1">
+          <w:hyperlink w:anchor="_Toc243470742" w:history="1">
             <w:r>
               <w:rPr>
                 <w:rStyle w:val="Lienhypertexte"/>
@@ -1055,7 +1054,7 @@
               <w:rPr>
                 <w:noProof/>
               </w:rPr>
-              <w:instrText xml:space="preserve"> PAGEREF _Toc243410302 \h </w:instrText>
+              <w:instrText xml:space="preserve"> PAGEREF _Toc243470742 \h </w:instrText>
             </w:r>
             <w:r>
               <w:rPr>
@@ -1092,7 +1091,7 @@
               <w:noProof/>
             </w:rPr>
           </w:pPr>
-          <w:hyperlink w:anchor="_Toc243410303" w:history="1">
+          <w:hyperlink w:anchor="_Toc243470743" w:history="1">
             <w:r>
               <w:rPr>
                 <w:rStyle w:val="Lienhypertexte"/>
@@ -1116,7 +1115,7 @@
               <w:rPr>
                 <w:noProof/>
               </w:rPr>
-              <w:instrText xml:space="preserve"> PAGEREF _Toc243410303 \h </w:instrText>
+              <w:instrText xml:space="preserve"> PAGEREF _Toc243470743 \h </w:instrText>
             </w:r>
             <w:r>
               <w:rPr>
@@ -1153,7 +1152,7 @@
               <w:noProof/>
             </w:rPr>
           </w:pPr>
-          <w:hyperlink w:anchor="_Toc243410304" w:history="1">
+          <w:hyperlink w:anchor="_Toc243470744" w:history="1">
             <w:r>
               <w:rPr>
                 <w:rStyle w:val="Lienhypertexte"/>
@@ -1177,7 +1176,7 @@
               <w:rPr>
                 <w:noProof/>
               </w:rPr>
-              <w:instrText xml:space="preserve"> PAGEREF _Toc243410304 \h </w:instrText>
+              <w:instrText xml:space="preserve"> PAGEREF _Toc243470744 \h </w:instrText>
             </w:r>
             <w:r>
               <w:rPr>
@@ -1214,7 +1213,7 @@
               <w:noProof/>
             </w:rPr>
           </w:pPr>
-          <w:hyperlink w:anchor="_Toc243410305" w:history="1">
+          <w:hyperlink w:anchor="_Toc243470745" w:history="1">
             <w:r>
               <w:rPr>
                 <w:rStyle w:val="Lienhypertexte"/>
@@ -1238,7 +1237,7 @@
               <w:rPr>
                 <w:noProof/>
               </w:rPr>
-              <w:instrText xml:space="preserve"> PAGEREF _Toc243410305 \h </w:instrText>
+              <w:instrText xml:space="preserve"> PAGEREF _Toc243470745 \h </w:instrText>
             </w:r>
             <w:r>
               <w:rPr>
@@ -1275,7 +1274,7 @@
               <w:noProof/>
             </w:rPr>
           </w:pPr>
-          <w:hyperlink w:anchor="_Toc243410306" w:history="1">
+          <w:hyperlink w:anchor="_Toc243470746" w:history="1">
             <w:r>
               <w:rPr>
                 <w:rStyle w:val="Lienhypertexte"/>
@@ -1299,7 +1298,7 @@
               <w:rPr>
                 <w:noProof/>
               </w:rPr>
-              <w:instrText xml:space="preserve"> PAGEREF _Toc243410306 \h </w:instrText>
+              <w:instrText xml:space="preserve"> PAGEREF _Toc243470746 \h </w:instrText>
             </w:r>
             <w:r>
               <w:rPr>
@@ -1336,7 +1335,7 @@
               <w:noProof/>
             </w:rPr>
           </w:pPr>
-          <w:hyperlink w:anchor="_Toc243410307" w:history="1">
+          <w:hyperlink w:anchor="_Toc243470747" w:history="1">
             <w:r>
               <w:rPr>
                 <w:rStyle w:val="Lienhypertexte"/>
@@ -1360,7 +1359,7 @@
               <w:rPr>
                 <w:noProof/>
               </w:rPr>
-              <w:instrText xml:space="preserve"> PAGEREF _Toc243410307 \h </w:instrText>
+              <w:instrText xml:space="preserve"> PAGEREF _Toc243470747 \h </w:instrText>
             </w:r>
             <w:r>
               <w:rPr>
@@ -1397,7 +1396,7 @@
               <w:noProof/>
             </w:rPr>
           </w:pPr>
-          <w:hyperlink w:anchor="_Toc243410308" w:history="1">
+          <w:hyperlink w:anchor="_Toc243470748" w:history="1">
             <w:r>
               <w:rPr>
                 <w:rStyle w:val="Lienhypertexte"/>
@@ -1421,7 +1420,7 @@
               <w:rPr>
                 <w:noProof/>
               </w:rPr>
-              <w:instrText xml:space="preserve"> PAGEREF _Toc243410308 \h </w:instrText>
+              <w:instrText xml:space="preserve"> PAGEREF _Toc243470748 \h </w:instrText>
             </w:r>
             <w:r>
               <w:rPr>
@@ -1458,7 +1457,7 @@
               <w:noProof/>
             </w:rPr>
           </w:pPr>
-          <w:hyperlink w:anchor="_Toc243410309" w:history="1">
+          <w:hyperlink w:anchor="_Toc243470749" w:history="1">
             <w:r>
               <w:rPr>
                 <w:rStyle w:val="Lienhypertexte"/>
@@ -1482,7 +1481,7 @@
               <w:rPr>
                 <w:noProof/>
               </w:rPr>
-              <w:instrText xml:space="preserve"> PAGEREF _Toc243410309 \h </w:instrText>
+              <w:instrText xml:space="preserve"> PAGEREF _Toc243470749 \h </w:instrText>
             </w:r>
             <w:r>
               <w:rPr>
@@ -1519,7 +1518,7 @@
               <w:noProof/>
             </w:rPr>
           </w:pPr>
-          <w:hyperlink w:anchor="_Toc243410310" w:history="1">
+          <w:hyperlink w:anchor="_Toc243470750" w:history="1">
             <w:r>
               <w:rPr>
                 <w:rStyle w:val="Lienhypertexte"/>
@@ -1543,7 +1542,7 @@
               <w:rPr>
                 <w:noProof/>
               </w:rPr>
-              <w:instrText xml:space="preserve"> PAGEREF _Toc243410310 \h </w:instrText>
+              <w:instrText xml:space="preserve"> PAGEREF _Toc243470750 \h </w:instrText>
             </w:r>
             <w:r>
               <w:rPr>
@@ -1580,7 +1579,7 @@
               <w:noProof/>
             </w:rPr>
           </w:pPr>
-          <w:hyperlink w:anchor="_Toc243410311" w:history="1">
+          <w:hyperlink w:anchor="_Toc243470751" w:history="1">
             <w:r>
               <w:rPr>
                 <w:rStyle w:val="Lienhypertexte"/>
@@ -1604,7 +1603,7 @@
               <w:rPr>
                 <w:noProof/>
               </w:rPr>
-              <w:instrText xml:space="preserve"> PAGEREF _Toc243410311 \h </w:instrText>
+              <w:instrText xml:space="preserve"> PAGEREF _Toc243470751 \h </w:instrText>
             </w:r>
             <w:r>
               <w:rPr>
@@ -1641,7 +1640,7 @@
               <w:noProof/>
             </w:rPr>
           </w:pPr>
-          <w:hyperlink w:anchor="_Toc243410312" w:history="1">
+          <w:hyperlink w:anchor="_Toc243470752" w:history="1">
             <w:r>
               <w:rPr>
                 <w:rStyle w:val="Lienhypertexte"/>
@@ -1665,7 +1664,7 @@
               <w:rPr>
                 <w:noProof/>
               </w:rPr>
-              <w:instrText xml:space="preserve"> PAGEREF _Toc243410312 \h </w:instrText>
+              <w:instrText xml:space="preserve"> PAGEREF _Toc243470752 \h </w:instrText>
             </w:r>
             <w:r>
               <w:rPr>
@@ -1702,7 +1701,7 @@
               <w:noProof/>
             </w:rPr>
           </w:pPr>
-          <w:hyperlink w:anchor="_Toc243410313" w:history="1">
+          <w:hyperlink w:anchor="_Toc243470753" w:history="1">
             <w:r>
               <w:rPr>
                 <w:rStyle w:val="Lienhypertexte"/>
@@ -1726,7 +1725,7 @@
               <w:rPr>
                 <w:noProof/>
               </w:rPr>
-              <w:instrText xml:space="preserve"> PAGEREF _Toc243410313 \h </w:instrText>
+              <w:instrText xml:space="preserve"> PAGEREF _Toc243470753 \h </w:instrText>
             </w:r>
             <w:r>
               <w:rPr>
@@ -1763,7 +1762,7 @@
               <w:noProof/>
             </w:rPr>
           </w:pPr>
-          <w:hyperlink w:anchor="_Toc243410314" w:history="1">
+          <w:hyperlink w:anchor="_Toc243470754" w:history="1">
             <w:r>
               <w:rPr>
                 <w:rStyle w:val="Lienhypertexte"/>
@@ -1787,7 +1786,7 @@
               <w:rPr>
                 <w:noProof/>
               </w:rPr>
-              <w:instrText xml:space="preserve"> PAGEREF _Toc243410314 \h </w:instrText>
+              <w:instrText xml:space="preserve"> PAGEREF _Toc243470754 \h </w:instrText>
             </w:r>
             <w:r>
               <w:rPr>
@@ -1824,7 +1823,7 @@
               <w:noProof/>
             </w:rPr>
           </w:pPr>
-          <w:hyperlink w:anchor="_Toc243410315" w:history="1">
+          <w:hyperlink w:anchor="_Toc243470755" w:history="1">
             <w:r>
               <w:rPr>
                 <w:rStyle w:val="Lienhypertexte"/>
@@ -1848,7 +1847,7 @@
               <w:rPr>
                 <w:noProof/>
               </w:rPr>
-              <w:instrText xml:space="preserve"> PAGEREF _Toc243410315 \h </w:instrText>
+              <w:instrText xml:space="preserve"> PAGEREF _Toc243470755 \h </w:instrText>
             </w:r>
             <w:r>
               <w:rPr>
@@ -1885,7 +1884,7 @@
               <w:noProof/>
             </w:rPr>
           </w:pPr>
-          <w:hyperlink w:anchor="_Toc243410316" w:history="1">
+          <w:hyperlink w:anchor="_Toc243470756" w:history="1">
             <w:r>
               <w:rPr>
                 <w:rStyle w:val="Lienhypertexte"/>
@@ -1909,7 +1908,7 @@
               <w:rPr>
                 <w:noProof/>
               </w:rPr>
-              <w:instrText xml:space="preserve"> PAGEREF _Toc243410316 \h </w:instrText>
+              <w:instrText xml:space="preserve"> PAGEREF _Toc243470756 \h </w:instrText>
             </w:r>
             <w:r>
               <w:rPr>
@@ -1946,7 +1945,7 @@
               <w:noProof/>
             </w:rPr>
           </w:pPr>
-          <w:hyperlink w:anchor="_Toc243410317" w:history="1">
+          <w:hyperlink w:anchor="_Toc243470757" w:history="1">
             <w:r>
               <w:rPr>
                 <w:rStyle w:val="Lienhypertexte"/>
@@ -1970,7 +1969,7 @@
               <w:rPr>
                 <w:noProof/>
               </w:rPr>
-              <w:instrText xml:space="preserve"> PAGEREF _Toc243410317 \h </w:instrText>
+              <w:instrText xml:space="preserve"> PAGEREF _Toc243470757 \h </w:instrText>
             </w:r>
             <w:r>
               <w:rPr>
@@ -2007,7 +2006,7 @@
               <w:noProof/>
             </w:rPr>
           </w:pPr>
-          <w:hyperlink w:anchor="_Toc243410318" w:history="1">
+          <w:hyperlink w:anchor="_Toc243470758" w:history="1">
             <w:r>
               <w:rPr>
                 <w:rStyle w:val="Lienhypertexte"/>
@@ -2031,7 +2030,7 @@
               <w:rPr>
                 <w:noProof/>
               </w:rPr>
-              <w:instrText xml:space="preserve"> PAGEREF _Toc243410318 \h </w:instrText>
+              <w:instrText xml:space="preserve"> PAGEREF _Toc243470758 \h </w:instrText>
             </w:r>
             <w:r>
               <w:rPr>
@@ -2068,7 +2067,7 @@
               <w:noProof/>
             </w:rPr>
           </w:pPr>
-          <w:hyperlink w:anchor="_Toc243410319" w:history="1">
+          <w:hyperlink w:anchor="_Toc243470759" w:history="1">
             <w:r>
               <w:rPr>
                 <w:rStyle w:val="Lienhypertexte"/>
@@ -2092,7 +2091,7 @@
               <w:rPr>
                 <w:noProof/>
               </w:rPr>
-              <w:instrText xml:space="preserve"> PAGEREF _Toc243410319 \h </w:instrText>
+              <w:instrText xml:space="preserve"> PAGEREF _Toc243470759 \h </w:instrText>
             </w:r>
             <w:r>
               <w:rPr>
@@ -2129,7 +2128,7 @@
               <w:noProof/>
             </w:rPr>
           </w:pPr>
-          <w:hyperlink w:anchor="_Toc243410320" w:history="1">
+          <w:hyperlink w:anchor="_Toc243470760" w:history="1">
             <w:r>
               <w:rPr>
                 <w:rStyle w:val="Lienhypertexte"/>
@@ -2153,7 +2152,7 @@
               <w:rPr>
                 <w:noProof/>
               </w:rPr>
-              <w:instrText xml:space="preserve"> PAGEREF _Toc243410320 \h </w:instrText>
+              <w:instrText xml:space="preserve"> PAGEREF _Toc243470760 \h </w:instrText>
             </w:r>
             <w:r>
               <w:rPr>
@@ -2190,7 +2189,7 @@
               <w:noProof/>
             </w:rPr>
           </w:pPr>
-          <w:hyperlink w:anchor="_Toc243410321" w:history="1">
+          <w:hyperlink w:anchor="_Toc243470761" w:history="1">
             <w:r>
               <w:rPr>
                 <w:rStyle w:val="Lienhypertexte"/>
@@ -2214,7 +2213,7 @@
               <w:rPr>
                 <w:noProof/>
               </w:rPr>
-              <w:instrText xml:space="preserve"> PAGEREF _Toc243410321 \h </w:instrText>
+              <w:instrText xml:space="preserve"> PAGEREF _Toc243470761 \h </w:instrText>
             </w:r>
             <w:r>
               <w:rPr>
@@ -2251,7 +2250,7 @@
               <w:noProof/>
             </w:rPr>
           </w:pPr>
-          <w:hyperlink w:anchor="_Toc243410322" w:history="1">
+          <w:hyperlink w:anchor="_Toc243470762" w:history="1">
             <w:r>
               <w:rPr>
                 <w:rStyle w:val="Lienhypertexte"/>
@@ -2275,7 +2274,7 @@
               <w:rPr>
                 <w:noProof/>
               </w:rPr>
-              <w:instrText xml:space="preserve"> PAGEREF _Toc243410322 \h </w:instrText>
+              <w:instrText xml:space="preserve"> PAGEREF _Toc243470762 \h </w:instrText>
             </w:r>
             <w:r>
               <w:rPr>
@@ -2312,7 +2311,7 @@
               <w:noProof/>
             </w:rPr>
           </w:pPr>
-          <w:hyperlink w:anchor="_Toc243410323" w:history="1">
+          <w:hyperlink w:anchor="_Toc243470763" w:history="1">
             <w:r>
               <w:rPr>
                 <w:rStyle w:val="Lienhypertexte"/>
@@ -2336,7 +2335,7 @@
               <w:rPr>
                 <w:noProof/>
               </w:rPr>
-              <w:instrText xml:space="preserve"> PAGEREF _Toc243410323 \h </w:instrText>
+              <w:instrText xml:space="preserve"> PAGEREF _Toc243470763 \h </w:instrText>
             </w:r>
             <w:r>
               <w:rPr>
@@ -2373,7 +2372,7 @@
               <w:noProof/>
             </w:rPr>
           </w:pPr>
-          <w:hyperlink w:anchor="_Toc243410324" w:history="1">
+          <w:hyperlink w:anchor="_Toc243470764" w:history="1">
             <w:r>
               <w:rPr>
                 <w:rStyle w:val="Lienhypertexte"/>
@@ -2397,7 +2396,7 @@
               <w:rPr>
                 <w:noProof/>
               </w:rPr>
-              <w:instrText xml:space="preserve"> PAGEREF _Toc243410324 \h </w:instrText>
+              <w:instrText xml:space="preserve"> PAGEREF _Toc243470764 \h </w:instrText>
             </w:r>
             <w:r>
               <w:rPr>
@@ -2434,7 +2433,7 @@
               <w:noProof/>
             </w:rPr>
           </w:pPr>
-          <w:hyperlink w:anchor="_Toc243410325" w:history="1">
+          <w:hyperlink w:anchor="_Toc243470765" w:history="1">
             <w:r>
               <w:rPr>
                 <w:rStyle w:val="Lienhypertexte"/>
@@ -2458,7 +2457,7 @@
               <w:rPr>
                 <w:noProof/>
               </w:rPr>
-              <w:instrText xml:space="preserve"> PAGEREF _Toc243410325 \h </w:instrText>
+              <w:instrText xml:space="preserve"> PAGEREF _Toc243470765 \h </w:instrText>
             </w:r>
             <w:r>
               <w:rPr>
@@ -2495,7 +2494,7 @@
               <w:noProof/>
             </w:rPr>
           </w:pPr>
-          <w:hyperlink w:anchor="_Toc243410326" w:history="1">
+          <w:hyperlink w:anchor="_Toc243470766" w:history="1">
             <w:r>
               <w:rPr>
                 <w:rStyle w:val="Lienhypertexte"/>
@@ -2519,7 +2518,7 @@
               <w:rPr>
                 <w:noProof/>
               </w:rPr>
-              <w:instrText xml:space="preserve"> PAGEREF _Toc243410326 \h </w:instrText>
+              <w:instrText xml:space="preserve"> PAGEREF _Toc243470766 \h </w:instrText>
             </w:r>
             <w:r>
               <w:rPr>
@@ -2556,7 +2555,7 @@
               <w:noProof/>
             </w:rPr>
           </w:pPr>
-          <w:hyperlink w:anchor="_Toc243410327" w:history="1">
+          <w:hyperlink w:anchor="_Toc243470767" w:history="1">
             <w:r>
               <w:rPr>
                 <w:rStyle w:val="Lienhypertexte"/>
@@ -2580,7 +2579,7 @@
               <w:rPr>
                 <w:noProof/>
               </w:rPr>
-              <w:instrText xml:space="preserve"> PAGEREF _Toc243410327 \h </w:instrText>
+              <w:instrText xml:space="preserve"> PAGEREF _Toc243470767 \h </w:instrText>
             </w:r>
             <w:r>
               <w:rPr>
@@ -2617,7 +2616,7 @@
               <w:noProof/>
             </w:rPr>
           </w:pPr>
-          <w:hyperlink w:anchor="_Toc243410328" w:history="1">
+          <w:hyperlink w:anchor="_Toc243470768" w:history="1">
             <w:r>
               <w:rPr>
                 <w:rStyle w:val="Lienhypertexte"/>
@@ -2641,7 +2640,7 @@
               <w:rPr>
                 <w:noProof/>
               </w:rPr>
-              <w:instrText xml:space="preserve"> PAGEREF _Toc243410328 \h </w:instrText>
+              <w:instrText xml:space="preserve"> PAGEREF _Toc243470768 \h </w:instrText>
             </w:r>
             <w:r>
               <w:rPr>
@@ -2678,7 +2677,7 @@
               <w:noProof/>
             </w:rPr>
           </w:pPr>
-          <w:hyperlink w:anchor="_Toc243410329" w:history="1">
+          <w:hyperlink w:anchor="_Toc243470769" w:history="1">
             <w:r>
               <w:rPr>
                 <w:rStyle w:val="Lienhypertexte"/>
@@ -2702,7 +2701,7 @@
               <w:rPr>
                 <w:noProof/>
               </w:rPr>
-              <w:instrText xml:space="preserve"> PAGEREF _Toc243410329 \h </w:instrText>
+              <w:instrText xml:space="preserve"> PAGEREF _Toc243470769 \h </w:instrText>
             </w:r>
             <w:r>
               <w:rPr>
@@ -2739,7 +2738,7 @@
               <w:noProof/>
             </w:rPr>
           </w:pPr>
-          <w:hyperlink w:anchor="_Toc243410330" w:history="1">
+          <w:hyperlink w:anchor="_Toc243470770" w:history="1">
             <w:r>
               <w:rPr>
                 <w:rStyle w:val="Lienhypertexte"/>
@@ -2763,7 +2762,7 @@
               <w:rPr>
                 <w:noProof/>
               </w:rPr>
-              <w:instrText xml:space="preserve"> PAGEREF _Toc243410330 \h </w:instrText>
+              <w:instrText xml:space="preserve"> PAGEREF _Toc243470770 \h </w:instrText>
             </w:r>
             <w:r>
               <w:rPr>
@@ -2800,7 +2799,7 @@
               <w:noProof/>
             </w:rPr>
           </w:pPr>
-          <w:hyperlink w:anchor="_Toc243410331" w:history="1">
+          <w:hyperlink w:anchor="_Toc243470771" w:history="1">
             <w:r>
               <w:rPr>
                 <w:rStyle w:val="Lienhypertexte"/>
@@ -2824,7 +2823,7 @@
               <w:rPr>
                 <w:noProof/>
               </w:rPr>
-              <w:instrText xml:space="preserve"> PAGEREF _Toc243410331 \h </w:instrText>
+              <w:instrText xml:space="preserve"> PAGEREF _Toc243470771 \h </w:instrText>
             </w:r>
             <w:r>
               <w:rPr>
@@ -2861,7 +2860,7 @@
               <w:noProof/>
             </w:rPr>
           </w:pPr>
-          <w:hyperlink w:anchor="_Toc243410332" w:history="1">
+          <w:hyperlink w:anchor="_Toc243470772" w:history="1">
             <w:r>
               <w:rPr>
                 <w:rStyle w:val="Lienhypertexte"/>
@@ -2885,7 +2884,7 @@
               <w:rPr>
                 <w:noProof/>
               </w:rPr>
-              <w:instrText xml:space="preserve"> PAGEREF _Toc243410332 \h </w:instrText>
+              <w:instrText xml:space="preserve"> PAGEREF _Toc243470772 \h </w:instrText>
             </w:r>
             <w:r>
               <w:rPr>
@@ -2922,7 +2921,7 @@
               <w:noProof/>
             </w:rPr>
           </w:pPr>
-          <w:hyperlink w:anchor="_Toc243410333" w:history="1">
+          <w:hyperlink w:anchor="_Toc243470773" w:history="1">
             <w:r>
               <w:rPr>
                 <w:rStyle w:val="Lienhypertexte"/>
@@ -2946,7 +2945,7 @@
               <w:rPr>
                 <w:noProof/>
               </w:rPr>
-              <w:instrText xml:space="preserve"> PAGEREF _Toc243410333 \h </w:instrText>
+              <w:instrText xml:space="preserve"> PAGEREF _Toc243470773 \h </w:instrText>
             </w:r>
             <w:r>
               <w:rPr>
@@ -2983,7 +2982,7 @@
               <w:noProof/>
             </w:rPr>
           </w:pPr>
-          <w:hyperlink w:anchor="_Toc243410334" w:history="1">
+          <w:hyperlink w:anchor="_Toc243470774" w:history="1">
             <w:r>
               <w:rPr>
                 <w:rStyle w:val="Lienhypertexte"/>
@@ -3007,7 +3006,7 @@
               <w:rPr>
                 <w:noProof/>
               </w:rPr>
-              <w:instrText xml:space="preserve"> PAGEREF _Toc243410334 \h </w:instrText>
+              <w:instrText xml:space="preserve"> PAGEREF _Toc243470774 \h </w:instrText>
             </w:r>
             <w:r>
               <w:rPr>
@@ -3044,7 +3043,7 @@
               <w:noProof/>
             </w:rPr>
           </w:pPr>
-          <w:hyperlink w:anchor="_Toc243410335" w:history="1">
+          <w:hyperlink w:anchor="_Toc243470775" w:history="1">
             <w:r>
               <w:rPr>
                 <w:rStyle w:val="Lienhypertexte"/>
@@ -3068,7 +3067,7 @@
               <w:rPr>
                 <w:noProof/>
               </w:rPr>
-              <w:instrText xml:space="preserve"> PAGEREF _Toc243410335 \h </w:instrText>
+              <w:instrText xml:space="preserve"> PAGEREF _Toc243470775 \h </w:instrText>
             </w:r>
             <w:r>
               <w:rPr>
@@ -3105,7 +3104,7 @@
               <w:noProof/>
             </w:rPr>
           </w:pPr>
-          <w:hyperlink w:anchor="_Toc243410336" w:history="1">
+          <w:hyperlink w:anchor="_Toc243470776" w:history="1">
             <w:r>
               <w:rPr>
                 <w:rStyle w:val="Lienhypertexte"/>
@@ -3129,7 +3128,7 @@
               <w:rPr>
                 <w:noProof/>
               </w:rPr>
-              <w:instrText xml:space="preserve"> PAGEREF _Toc243410336 \h </w:instrText>
+              <w:instrText xml:space="preserve"> PAGEREF _Toc243470776 \h </w:instrText>
             </w:r>
             <w:r>
               <w:rPr>
@@ -3166,7 +3165,7 @@
               <w:noProof/>
             </w:rPr>
           </w:pPr>
-          <w:hyperlink w:anchor="_Toc243410337" w:history="1">
+          <w:hyperlink w:anchor="_Toc243470777" w:history="1">
             <w:r>
               <w:rPr>
                 <w:rStyle w:val="Lienhypertexte"/>
@@ -3190,7 +3189,7 @@
               <w:rPr>
                 <w:noProof/>
               </w:rPr>
-              <w:instrText xml:space="preserve"> PAGEREF _Toc243410337 \h </w:instrText>
+              <w:instrText xml:space="preserve"> PAGEREF _Toc243470777 \h </w:instrText>
             </w:r>
             <w:r>
               <w:rPr>
@@ -3227,7 +3226,7 @@
               <w:noProof/>
             </w:rPr>
           </w:pPr>
-          <w:hyperlink w:anchor="_Toc243410338" w:history="1">
+          <w:hyperlink w:anchor="_Toc243470778" w:history="1">
             <w:r>
               <w:rPr>
                 <w:rStyle w:val="Lienhypertexte"/>
@@ -3251,7 +3250,7 @@
               <w:rPr>
                 <w:noProof/>
               </w:rPr>
-              <w:instrText xml:space="preserve"> PAGEREF _Toc243410338 \h </w:instrText>
+              <w:instrText xml:space="preserve"> PAGEREF _Toc243470778 \h </w:instrText>
             </w:r>
             <w:r>
               <w:rPr>
@@ -3288,7 +3287,7 @@
               <w:noProof/>
             </w:rPr>
           </w:pPr>
-          <w:hyperlink w:anchor="_Toc243410339" w:history="1">
+          <w:hyperlink w:anchor="_Toc243470779" w:history="1">
             <w:r>
               <w:rPr>
                 <w:rStyle w:val="Lienhypertexte"/>
@@ -3312,7 +3311,7 @@
               <w:rPr>
                 <w:noProof/>
               </w:rPr>
-              <w:instrText xml:space="preserve"> PAGEREF _Toc243410339 \h </w:instrText>
+              <w:instrText xml:space="preserve"> PAGEREF _Toc243470779 \h </w:instrText>
             </w:r>
             <w:r>
               <w:rPr>
@@ -3349,7 +3348,7 @@
               <w:noProof/>
             </w:rPr>
           </w:pPr>
-          <w:hyperlink w:anchor="_Toc243410340" w:history="1">
+          <w:hyperlink w:anchor="_Toc243470780" w:history="1">
             <w:r>
               <w:rPr>
                 <w:rStyle w:val="Lienhypertexte"/>
@@ -3373,7 +3372,7 @@
               <w:rPr>
                 <w:noProof/>
               </w:rPr>
-              <w:instrText xml:space="preserve"> PAGEREF _Toc243410340 \h </w:instrText>
+              <w:instrText xml:space="preserve"> PAGEREF _Toc243470780 \h </w:instrText>
             </w:r>
             <w:r>
               <w:rPr>
@@ -3410,7 +3409,7 @@
               <w:noProof/>
             </w:rPr>
           </w:pPr>
-          <w:hyperlink w:anchor="_Toc243410341" w:history="1">
+          <w:hyperlink w:anchor="_Toc243470781" w:history="1">
             <w:r>
               <w:rPr>
                 <w:rStyle w:val="Lienhypertexte"/>
@@ -3434,7 +3433,7 @@
               <w:rPr>
                 <w:noProof/>
               </w:rPr>
-              <w:instrText xml:space="preserve"> PAGEREF _Toc243410341 \h </w:instrText>
+              <w:instrText xml:space="preserve"> PAGEREF _Toc243470781 \h </w:instrText>
             </w:r>
             <w:r>
               <w:rPr>
@@ -3471,7 +3470,7 @@
               <w:noProof/>
             </w:rPr>
           </w:pPr>
-          <w:hyperlink w:anchor="_Toc243410342" w:history="1">
+          <w:hyperlink w:anchor="_Toc243470782" w:history="1">
             <w:r>
               <w:rPr>
                 <w:rStyle w:val="Lienhypertexte"/>
@@ -3495,7 +3494,7 @@
               <w:rPr>
                 <w:noProof/>
               </w:rPr>
-              <w:instrText xml:space="preserve"> PAGEREF _Toc243410342 \h </w:instrText>
+              <w:instrText xml:space="preserve"> PAGEREF _Toc243470782 \h </w:instrText>
             </w:r>
             <w:r>
               <w:rPr>
@@ -3532,7 +3531,7 @@
               <w:noProof/>
             </w:rPr>
           </w:pPr>
-          <w:hyperlink w:anchor="_Toc243410343" w:history="1">
+          <w:hyperlink w:anchor="_Toc243470783" w:history="1">
             <w:r>
               <w:rPr>
                 <w:rStyle w:val="Lienhypertexte"/>
@@ -3556,7 +3555,7 @@
               <w:rPr>
                 <w:noProof/>
               </w:rPr>
-              <w:instrText xml:space="preserve"> PAGEREF _Toc243410343 \h </w:instrText>
+              <w:instrText xml:space="preserve"> PAGEREF _Toc243470783 \h </w:instrText>
             </w:r>
             <w:r>
               <w:rPr>
@@ -3593,7 +3592,7 @@
               <w:noProof/>
             </w:rPr>
           </w:pPr>
-          <w:hyperlink w:anchor="_Toc243410344" w:history="1">
+          <w:hyperlink w:anchor="_Toc243470784" w:history="1">
             <w:r>
               <w:rPr>
                 <w:rStyle w:val="Lienhypertexte"/>
@@ -3617,7 +3616,7 @@
               <w:rPr>
                 <w:noProof/>
               </w:rPr>
-              <w:instrText xml:space="preserve"> PAGEREF _Toc243410344 \h </w:instrText>
+              <w:instrText xml:space="preserve"> PAGEREF _Toc243470784 \h </w:instrText>
             </w:r>
             <w:r>
               <w:rPr>
@@ -3654,7 +3653,7 @@
               <w:noProof/>
             </w:rPr>
           </w:pPr>
-          <w:hyperlink w:anchor="_Toc243410345" w:history="1">
+          <w:hyperlink w:anchor="_Toc243470785" w:history="1">
             <w:r>
               <w:rPr>
                 <w:rStyle w:val="Lienhypertexte"/>
@@ -3678,7 +3677,7 @@
               <w:rPr>
                 <w:noProof/>
               </w:rPr>
-              <w:instrText xml:space="preserve"> PAGEREF _Toc243410345 \h </w:instrText>
+              <w:instrText xml:space="preserve"> PAGEREF _Toc243470785 \h </w:instrText>
             </w:r>
             <w:r>
               <w:rPr>
@@ -3715,7 +3714,7 @@
               <w:noProof/>
             </w:rPr>
           </w:pPr>
-          <w:hyperlink w:anchor="_Toc243410346" w:history="1">
+          <w:hyperlink w:anchor="_Toc243470786" w:history="1">
             <w:r>
               <w:rPr>
                 <w:rStyle w:val="Lienhypertexte"/>
@@ -3739,7 +3738,7 @@
               <w:rPr>
                 <w:noProof/>
               </w:rPr>
-              <w:instrText xml:space="preserve"> PAGEREF _Toc243410346 \h </w:instrText>
+              <w:instrText xml:space="preserve"> PAGEREF _Toc243470786 \h </w:instrText>
             </w:r>
             <w:r>
               <w:rPr>
@@ -3776,7 +3775,7 @@
               <w:noProof/>
             </w:rPr>
           </w:pPr>
-          <w:hyperlink w:anchor="_Toc243410347" w:history="1">
+          <w:hyperlink w:anchor="_Toc243470787" w:history="1">
             <w:r>
               <w:rPr>
                 <w:rStyle w:val="Lienhypertexte"/>
@@ -3800,7 +3799,7 @@
               <w:rPr>
                 <w:noProof/>
               </w:rPr>
-              <w:instrText xml:space="preserve"> PAGEREF _Toc243410347 \h </w:instrText>
+              <w:instrText xml:space="preserve"> PAGEREF _Toc243470787 \h </w:instrText>
             </w:r>
             <w:r>
               <w:rPr>
@@ -3837,7 +3836,7 @@
               <w:noProof/>
             </w:rPr>
           </w:pPr>
-          <w:hyperlink w:anchor="_Toc243410348" w:history="1">
+          <w:hyperlink w:anchor="_Toc243470788" w:history="1">
             <w:r>
               <w:rPr>
                 <w:rStyle w:val="Lienhypertexte"/>
@@ -3861,7 +3860,7 @@
               <w:rPr>
                 <w:noProof/>
               </w:rPr>
-              <w:instrText xml:space="preserve"> PAGEREF _Toc243410348 \h </w:instrText>
+              <w:instrText xml:space="preserve"> PAGEREF _Toc243470788 \h </w:instrText>
             </w:r>
             <w:r>
               <w:rPr>
@@ -3900,9 +3899,8 @@
         <w:pStyle w:val="Titre1"/>
         <w:pageBreakBefore/>
       </w:pPr>
-      <w:bookmarkStart w:id="0" w:name="_Toc243410287"/>
-      <w:r>
-        <w:lastRenderedPageBreak/>
+      <w:bookmarkStart w:id="0" w:name="_Toc243470727"/>
+      <w:r>
         <w:t>1. The pitch in 60 seconds</w:t>
       </w:r>
       <w:bookmarkEnd w:id="0"/>
@@ -3915,7 +3913,7 @@
         <w:rPr>
           <w:color w:val="1C2433"/>
         </w:rPr>
-        <w:t>Say this first, in this order: it answers the director's question in one breath.</w:t>
+        <w:t>The whole project in one minute: use it when someone asks "summarise your project". The talk itself tells the same story step by step and gives the answer only at the end (chapter on the 10-minute talk).</w:t>
       </w:r>
     </w:p>
     <w:p>
@@ -4119,9 +4117,8 @@
         <w:pStyle w:val="Titre1"/>
         <w:pageBreakBefore/>
       </w:pPr>
-      <w:bookmarkStart w:id="1" w:name="_Toc243410288"/>
-      <w:r>
-        <w:lastRenderedPageBreak/>
+      <w:bookmarkStart w:id="1" w:name="_Toc243470728"/>
+      <w:r>
         <w:t>2. The basic ideas, explained simply</w:t>
       </w:r>
       <w:bookmarkEnd w:id="1"/>
@@ -4224,7 +4221,7 @@
       <w:pPr>
         <w:pStyle w:val="Titre2"/>
       </w:pPr>
-      <w:bookmarkStart w:id="2" w:name="_Toc243410289"/>
+      <w:bookmarkStart w:id="2" w:name="_Toc243470729"/>
       <w:r>
         <w:t>A neuron, weights and a network</w:t>
       </w:r>
@@ -4294,7 +4291,7 @@
       <w:pPr>
         <w:pStyle w:val="Titre2"/>
       </w:pPr>
-      <w:bookmarkStart w:id="3" w:name="_Toc243410290"/>
+      <w:bookmarkStart w:id="3" w:name="_Toc243470730"/>
       <w:r>
         <w:t>The loss: how wrong we are</w:t>
       </w:r>
@@ -4354,7 +4351,7 @@
       <w:pPr>
         <w:pStyle w:val="Titre2"/>
       </w:pPr>
-      <w:bookmarkStart w:id="4" w:name="_Toc243410291"/>
+      <w:bookmarkStart w:id="4" w:name="_Toc243470731"/>
       <w:r>
         <w:t>Gradient descent and the learning rate</w:t>
       </w:r>
@@ -4424,7 +4421,7 @@
       <w:pPr>
         <w:pStyle w:val="Titre2"/>
       </w:pPr>
-      <w:bookmarkStart w:id="5" w:name="_Toc243410292"/>
+      <w:bookmarkStart w:id="5" w:name="_Toc243470732"/>
       <w:r>
         <w:t>Backpropagation and the 5 lines of the training loop</w:t>
       </w:r>
@@ -4518,7 +4515,7 @@
       <w:pPr>
         <w:pStyle w:val="Titre2"/>
       </w:pPr>
-      <w:bookmarkStart w:id="6" w:name="_Toc243410293"/>
+      <w:bookmarkStart w:id="6" w:name="_Toc243470733"/>
       <w:r>
         <w:t>Epoch and mini-batch</w:t>
       </w:r>
@@ -4578,9 +4575,8 @@
       <w:pPr>
         <w:pStyle w:val="Titre2"/>
       </w:pPr>
-      <w:bookmarkStart w:id="7" w:name="_Toc243410294"/>
-      <w:r>
-        <w:lastRenderedPageBreak/>
+      <w:bookmarkStart w:id="7" w:name="_Toc243470734"/>
+      <w:r>
         <w:t>Train, validation, test</w:t>
       </w:r>
       <w:bookmarkEnd w:id="7"/>
@@ -4649,7 +4645,7 @@
       <w:pPr>
         <w:pStyle w:val="Titre2"/>
       </w:pPr>
-      <w:bookmarkStart w:id="8" w:name="_Toc243410295"/>
+      <w:bookmarkStart w:id="8" w:name="_Toc243470735"/>
       <w:r>
         <w:t>Overfitting</w:t>
       </w:r>
@@ -4699,7 +4695,7 @@
       <w:pPr>
         <w:pStyle w:val="Titre2"/>
       </w:pPr>
-      <w:bookmarkStart w:id="9" w:name="_Toc243410296"/>
+      <w:bookmarkStart w:id="9" w:name="_Toc243470736"/>
       <w:r>
         <w:t>ReLU, the activation</w:t>
       </w:r>
@@ -4769,7 +4765,7 @@
       <w:pPr>
         <w:pStyle w:val="Titre2"/>
       </w:pPr>
-      <w:bookmarkStart w:id="10" w:name="_Toc243410297"/>
+      <w:bookmarkStart w:id="10" w:name="_Toc243470737"/>
       <w:r>
         <w:t>Initialisation and the first loss</w:t>
       </w:r>
@@ -4819,7 +4815,7 @@
       <w:pPr>
         <w:pStyle w:val="Titre2"/>
       </w:pPr>
-      <w:bookmarkStart w:id="11" w:name="_Toc243410298"/>
+      <w:bookmarkStart w:id="11" w:name="_Toc243470738"/>
       <w:r>
         <w:t>Standardisation of the pixels</w:t>
       </w:r>
@@ -4879,7 +4875,7 @@
       <w:pPr>
         <w:pStyle w:val="Titre2"/>
       </w:pPr>
-      <w:bookmarkStart w:id="12" w:name="_Toc243410299"/>
+      <w:bookmarkStart w:id="12" w:name="_Toc243470739"/>
       <w:r>
         <w:t>MLP versus CNN: why the MLP cannot see shapes</w:t>
       </w:r>
@@ -4939,7 +4935,7 @@
       <w:pPr>
         <w:pStyle w:val="Titre2"/>
       </w:pPr>
-      <w:bookmarkStart w:id="13" w:name="_Toc243410300"/>
+      <w:bookmarkStart w:id="13" w:name="_Toc243470740"/>
       <w:r>
         <w:t>Convolution, filters and channels (session 7 slide)</w:t>
       </w:r>
@@ -5009,7 +5005,6 @@
           <w:b/>
           <w:bCs/>
         </w:rPr>
-        <w:lastRenderedPageBreak/>
         <w:t>In our project.</w:t>
       </w:r>
       <w:r>
@@ -5030,7 +5025,7 @@
       <w:pPr>
         <w:pStyle w:val="Titre2"/>
       </w:pPr>
-      <w:bookmarkStart w:id="14" w:name="_Toc243410301"/>
+      <w:bookmarkStart w:id="14" w:name="_Toc243470741"/>
       <w:r>
         <w:t>A pretrained network and transfer learning</w:t>
       </w:r>
@@ -5090,7 +5085,7 @@
       <w:pPr>
         <w:pStyle w:val="Titre2"/>
       </w:pPr>
-      <w:bookmarkStart w:id="15" w:name="_Toc243410302"/>
+      <w:bookmarkStart w:id="15" w:name="_Toc243470742"/>
       <w:r>
         <w:t>Frozen features (linear probe) versus fine-tuning</w:t>
       </w:r>
@@ -5160,7 +5155,7 @@
       <w:pPr>
         <w:pStyle w:val="Titre2"/>
       </w:pPr>
-      <w:bookmarkStart w:id="16" w:name="_Toc243410303"/>
+      <w:bookmarkStart w:id="16" w:name="_Toc243470743"/>
       <w:r>
         <w:t>The tools against overfitting</w:t>
       </w:r>
@@ -5320,7 +5315,7 @@
       <w:pPr>
         <w:pStyle w:val="Titre2"/>
       </w:pPr>
-      <w:bookmarkStart w:id="17" w:name="_Toc243410304"/>
+      <w:bookmarkStart w:id="17" w:name="_Toc243470744"/>
       <w:r>
         <w:t>Vanishing gradient</w:t>
       </w:r>
@@ -5370,7 +5365,7 @@
       <w:pPr>
         <w:pStyle w:val="Titre2"/>
       </w:pPr>
-      <w:bookmarkStart w:id="18" w:name="_Toc243410305"/>
+      <w:bookmarkStart w:id="18" w:name="_Toc243470745"/>
       <w:r>
         <w:t>Data leakage</w:t>
       </w:r>
@@ -5420,7 +5415,7 @@
       <w:pPr>
         <w:pStyle w:val="Titre2"/>
       </w:pPr>
-      <w:bookmarkStart w:id="19" w:name="_Toc243410306"/>
+      <w:bookmarkStart w:id="19" w:name="_Toc243470746"/>
       <w:r>
         <w:t>Confidence interval and bootstrap</w:t>
       </w:r>
@@ -5480,9 +5475,8 @@
       <w:pPr>
         <w:pStyle w:val="Titre2"/>
       </w:pPr>
-      <w:bookmarkStart w:id="20" w:name="_Toc243410307"/>
-      <w:r>
-        <w:lastRenderedPageBreak/>
+      <w:bookmarkStart w:id="20" w:name="_Toc243470747"/>
+      <w:r>
         <w:t>Latency and CPU threads</w:t>
       </w:r>
       <w:bookmarkEnd w:id="20"/>
@@ -5552,9 +5546,8 @@
         <w:pStyle w:val="Titre1"/>
         <w:pageBreakBefore/>
       </w:pPr>
-      <w:bookmarkStart w:id="21" w:name="_Toc243410308"/>
-      <w:r>
-        <w:lastRenderedPageBreak/>
+      <w:bookmarkStart w:id="21" w:name="_Toc243470748"/>
+      <w:r>
         <w:t>3. Step 1: the data and a fair split (notebook 01)</w:t>
       </w:r>
       <w:bookmarkEnd w:id="21"/>
@@ -5665,7 +5658,7 @@
       <w:pPr>
         <w:pStyle w:val="Titre2"/>
       </w:pPr>
-      <w:bookmarkStart w:id="22" w:name="_Toc243410309"/>
+      <w:bookmarkStart w:id="22" w:name="_Toc243470749"/>
       <w:r>
         <w:t>What we downloaded</w:t>
       </w:r>
@@ -5786,7 +5779,7 @@
       <w:pPr>
         <w:pStyle w:val="Titre2"/>
       </w:pPr>
-      <w:bookmarkStart w:id="23" w:name="_Toc243410310"/>
+      <w:bookmarkStart w:id="23" w:name="_Toc243470750"/>
       <w:r>
         <w:t>The split (make_split in data.py)</w:t>
       </w:r>
@@ -5917,7 +5910,7 @@
       <w:pPr>
         <w:pStyle w:val="Titre2"/>
       </w:pPr>
-      <w:bookmarkStart w:id="24" w:name="_Toc243410311"/>
+      <w:bookmarkStart w:id="24" w:name="_Toc243470751"/>
       <w:r>
         <w:t>What we found in the data</w:t>
       </w:r>
@@ -5980,9 +5973,8 @@
         <w:pStyle w:val="Titre1"/>
         <w:pageBreakBefore/>
       </w:pPr>
-      <w:bookmarkStart w:id="25" w:name="_Toc243410312"/>
-      <w:r>
-        <w:lastRenderedPageBreak/>
+      <w:bookmarkStart w:id="25" w:name="_Toc243470752"/>
+      <w:r>
         <w:t>4. Step 2: the MLP and its two checks (notebook 02)</w:t>
       </w:r>
       <w:bookmarkEnd w:id="25"/>
@@ -6130,7 +6122,7 @@
       <w:pPr>
         <w:pStyle w:val="Titre2"/>
       </w:pPr>
-      <w:bookmarkStart w:id="26" w:name="_Toc243410313"/>
+      <w:bookmarkStart w:id="26" w:name="_Toc243470753"/>
       <w:r>
         <w:t>The model</w:t>
       </w:r>
@@ -6257,7 +6249,7 @@
       <w:pPr>
         <w:pStyle w:val="Titre2"/>
       </w:pPr>
-      <w:bookmarkStart w:id="27" w:name="_Toc243410314"/>
+      <w:bookmarkStart w:id="27" w:name="_Toc243470754"/>
       <w:r>
         <w:t>Check 1: the first loss</w:t>
       </w:r>
@@ -6306,7 +6298,7 @@
       <w:pPr>
         <w:pStyle w:val="Titre2"/>
       </w:pPr>
-      <w:bookmarkStart w:id="28" w:name="_Toc243410315"/>
+      <w:bookmarkStart w:id="28" w:name="_Toc243470755"/>
       <w:r>
         <w:t>Check 2: overfit one batch</w:t>
       </w:r>
@@ -6324,7 +6316,7 @@
       <w:pPr>
         <w:pStyle w:val="Titre2"/>
       </w:pPr>
-      <w:bookmarkStart w:id="29" w:name="_Toc243410316"/>
+      <w:bookmarkStart w:id="29" w:name="_Toc243470756"/>
       <w:r>
         <w:t>Baseline and image size</w:t>
       </w:r>
@@ -6398,9 +6390,8 @@
         <w:rPr>
           <w:noProof/>
         </w:rPr>
-        <w:lastRenderedPageBreak/>
         <w:drawing>
-          <wp:inline distT="0" distB="0" distL="0" distR="0" wp14:anchorId="01918AFB" wp14:editId="01918AFC">
+          <wp:inline distT="0" distB="0" distL="0" distR="0" wp14:anchorId="7BB8C871" wp14:editId="7BB8C872">
             <wp:extent cx="4762500" cy="1924050"/>
             <wp:effectExtent l="0" t="0" r="0" b="0"/>
             <wp:docPr id="1" name="02_baseline_curves.png" descr="MLP baseline: training loss falls to 0 while validation loss rises (overfitting)." title="MLP baseline: training loss falls to 0 while validation loss rises (overfitting)."/>
@@ -6460,9 +6451,8 @@
         <w:pStyle w:val="Titre1"/>
         <w:pageBreakBefore/>
       </w:pPr>
-      <w:bookmarkStart w:id="30" w:name="_Toc243410317"/>
-      <w:r>
-        <w:lastRenderedPageBreak/>
+      <w:bookmarkStart w:id="30" w:name="_Toc243470757"/>
+      <w:r>
         <w:t>5. Step 3: monitoring and regularisation (notebook 03)</w:t>
       </w:r>
       <w:bookmarkEnd w:id="30"/>
@@ -6631,7 +6621,7 @@
       <w:pPr>
         <w:pStyle w:val="Titre2"/>
       </w:pPr>
-      <w:bookmarkStart w:id="31" w:name="_Toc243410318"/>
+      <w:bookmarkStart w:id="31" w:name="_Toc243470758"/>
       <w:r>
         <w:t>What we monitored</w:t>
       </w:r>
@@ -6750,7 +6740,7 @@
       <w:pPr>
         <w:pStyle w:val="Titre2"/>
       </w:pPr>
-      <w:bookmarkStart w:id="32" w:name="_Toc243410319"/>
+      <w:bookmarkStart w:id="32" w:name="_Toc243470759"/>
       <w:r>
         <w:t>Learning-rate sweep (Adam, 8 values, 15 epochs each)</w:t>
       </w:r>
@@ -6825,7 +6815,7 @@
           <w:noProof/>
         </w:rPr>
         <w:drawing>
-          <wp:inline distT="0" distB="0" distL="0" distR="0" wp14:anchorId="01918AFD" wp14:editId="01918AFE">
+          <wp:inline distT="0" distB="0" distL="0" distR="0" wp14:anchorId="7BB8C873" wp14:editId="7BB8C874">
             <wp:extent cx="4191000" cy="1619250"/>
             <wp:effectExtent l="0" t="0" r="0" b="0"/>
             <wp:docPr id="2" name="03_lr_sweep.png" descr="Learning-rate sweep: a U-shaped validation loss, best at 0.0001." title="Learning-rate sweep: a U-shaped validation loss, best at 0.0001."/>
@@ -6884,7 +6874,7 @@
       <w:pPr>
         <w:pStyle w:val="Titre2"/>
       </w:pPr>
-      <w:bookmarkStart w:id="33" w:name="_Toc243410320"/>
+      <w:bookmarkStart w:id="33" w:name="_Toc243470760"/>
       <w:r>
         <w:t>The tools against overfitting (lr 0.0001, 3 seeds each)</w:t>
       </w:r>
@@ -7265,7 +7255,6 @@
                 <w:sz w:val="19"/>
                 <w:szCs w:val="19"/>
               </w:rPr>
-              <w:lastRenderedPageBreak/>
               <w:t>Dropout (0.5 hidden, 0.2 input)</w:t>
             </w:r>
           </w:p>
@@ -7857,9 +7846,8 @@
         <w:pStyle w:val="Titre1"/>
         <w:pageBreakBefore/>
       </w:pPr>
-      <w:bookmarkStart w:id="34" w:name="_Toc243410321"/>
-      <w:r>
-        <w:lastRenderedPageBreak/>
+      <w:bookmarkStart w:id="34" w:name="_Toc243470761"/>
+      <w:r>
         <w:t>6. Step 4: the training doctor (notebook 04)</w:t>
       </w:r>
       <w:bookmarkEnd w:id="34"/>
@@ -8746,9 +8734,8 @@
         <w:rPr>
           <w:noProof/>
         </w:rPr>
-        <w:lastRenderedPageBreak/>
         <w:drawing>
-          <wp:inline distT="0" distB="0" distL="0" distR="0" wp14:anchorId="01918AFF" wp14:editId="01918B00">
+          <wp:inline distT="0" distB="0" distL="0" distR="0" wp14:anchorId="7BB8C875" wp14:editId="7BB8C876">
             <wp:extent cx="4000500" cy="2209800"/>
             <wp:effectExtent l="0" t="0" r="0" b="0"/>
             <wp:docPr id="3" name="04_p4_grad_per_layer.png" descr="Patient 4: the gradient vanishes layer after layer with sigmoids; ReLU + He init fixes it." title="Patient 4: the gradient vanishes layer after layer with sigmoids; ReLU + He init fixes it."/>
@@ -8807,7 +8794,7 @@
       <w:pPr>
         <w:pStyle w:val="Titre2"/>
       </w:pPr>
-      <w:bookmarkStart w:id="35" w:name="_Toc243410322"/>
+      <w:bookmarkStart w:id="35" w:name="_Toc243470762"/>
       <w:r>
         <w:t>Lessons to say at the oral</w:t>
       </w:r>
@@ -8900,9 +8887,8 @@
         <w:pStyle w:val="Titre1"/>
         <w:pageBreakBefore/>
       </w:pPr>
-      <w:bookmarkStart w:id="36" w:name="_Toc243410323"/>
-      <w:r>
-        <w:lastRenderedPageBreak/>
+      <w:bookmarkStart w:id="36" w:name="_Toc243470763"/>
+      <w:r>
         <w:t>7. Step 5: pretrained ResNet18 (notebook 05)</w:t>
       </w:r>
       <w:bookmarkEnd w:id="36"/>
@@ -9107,7 +9093,7 @@
       <w:pPr>
         <w:pStyle w:val="Titre2"/>
       </w:pPr>
-      <w:bookmarkStart w:id="37" w:name="_Toc243410324"/>
+      <w:bookmarkStart w:id="37" w:name="_Toc243470764"/>
       <w:r>
         <w:t>Why a CNN, and why pretrained</w:t>
       </w:r>
@@ -9192,7 +9178,7 @@
       <w:pPr>
         <w:pStyle w:val="Titre2"/>
       </w:pPr>
-      <w:bookmarkStart w:id="38" w:name="_Toc243410325"/>
+      <w:bookmarkStart w:id="38" w:name="_Toc243470765"/>
       <w:r>
         <w:t>Method A: frozen features + head</w:t>
       </w:r>
@@ -9299,7 +9285,7 @@
       <w:pPr>
         <w:pStyle w:val="Titre2"/>
       </w:pPr>
-      <w:bookmarkStart w:id="39" w:name="_Toc243410326"/>
+      <w:bookmarkStart w:id="39" w:name="_Toc243470766"/>
       <w:r>
         <w:t>Method B: fine-tuning layer4</w:t>
       </w:r>
@@ -9356,7 +9342,7 @@
       <w:pPr>
         <w:pStyle w:val="Titre2"/>
       </w:pPr>
-      <w:bookmarkStart w:id="40" w:name="_Toc243410327"/>
+      <w:bookmarkStart w:id="40" w:name="_Toc243470767"/>
       <w:r>
         <w:t>Two silent bugs, measured</w:t>
       </w:r>
@@ -9423,9 +9409,8 @@
       <w:pPr>
         <w:pStyle w:val="Titre2"/>
       </w:pPr>
-      <w:bookmarkStart w:id="41" w:name="_Toc243410328"/>
-      <w:r>
-        <w:lastRenderedPageBreak/>
+      <w:bookmarkStart w:id="41" w:name="_Toc243470768"/>
+      <w:r>
         <w:t>Painter leakage, measured fairly</w:t>
       </w:r>
       <w:bookmarkEnd w:id="41"/>
@@ -9765,7 +9750,7 @@
           <w:noProof/>
         </w:rPr>
         <w:drawing>
-          <wp:inline distT="0" distB="0" distL="0" distR="0" wp14:anchorId="01918B01" wp14:editId="01918B02">
+          <wp:inline distT="0" distB="0" distL="0" distR="0" wp14:anchorId="7BB8C877" wp14:editId="7BB8C878">
             <wp:extent cx="4762500" cy="2524125"/>
             <wp:effectExtent l="0" t="0" r="0" b="0"/>
             <wp:docPr id="4" name="05_painter_leakage.png" descr="Painter leakage: same images, same model; only the known-painter group changes." title="Painter leakage: same images, same model; only the known-painter group changes."/>
@@ -9840,9 +9825,8 @@
         <w:pStyle w:val="Titre1"/>
         <w:pageBreakBefore/>
       </w:pPr>
-      <w:bookmarkStart w:id="42" w:name="_Toc243410329"/>
-      <w:r>
-        <w:lastRenderedPageBreak/>
+      <w:bookmarkStart w:id="42" w:name="_Toc243470769"/>
+      <w:r>
         <w:t>8. Step 6: final test, CPU cost and recommendation (notebook 06)</w:t>
       </w:r>
       <w:bookmarkEnd w:id="42"/>
@@ -9986,7 +9970,7 @@
       <w:pPr>
         <w:pStyle w:val="Titre2"/>
       </w:pPr>
-      <w:bookmarkStart w:id="43" w:name="_Toc243410330"/>
+      <w:bookmarkStart w:id="43" w:name="_Toc243470770"/>
       <w:r>
         <w:t>Classical models (settings chosen on validation)</w:t>
       </w:r>
@@ -10099,7 +10083,7 @@
       <w:pPr>
         <w:pStyle w:val="Titre2"/>
       </w:pPr>
-      <w:bookmarkStart w:id="44" w:name="_Toc243410331"/>
+      <w:bookmarkStart w:id="44" w:name="_Toc243470771"/>
       <w:r>
         <w:t>The final test, measured once</w:t>
       </w:r>
@@ -11128,9 +11112,8 @@
         <w:rPr>
           <w:noProof/>
         </w:rPr>
-        <w:lastRenderedPageBreak/>
         <w:drawing>
-          <wp:inline distT="0" distB="0" distL="0" distR="0" wp14:anchorId="01918B03" wp14:editId="01918B04">
+          <wp:inline distT="0" distB="0" distL="0" distR="0" wp14:anchorId="7BB8C879" wp14:editId="7BB8C87A">
             <wp:extent cx="4762500" cy="1971675"/>
             <wp:effectExtent l="0" t="0" r="0" b="0"/>
             <wp:docPr id="5" name="06_test_accuracy.png" descr="Final test: 220 paintings never seen before, with 95 % bootstrap intervals." title="Final test: 220 paintings never seen before, with 95 % bootstrap intervals."/>
@@ -11189,7 +11172,7 @@
       <w:pPr>
         <w:pStyle w:val="Titre2"/>
       </w:pPr>
-      <w:bookmarkStart w:id="45" w:name="_Toc243410332"/>
+      <w:bookmarkStart w:id="45" w:name="_Toc243470772"/>
       <w:r>
         <w:t>Are the gaps real? Paired bootstrap (same 220 paintings, 5 000 redraws)</w:t>
       </w:r>
@@ -11248,7 +11231,7 @@
       <w:pPr>
         <w:pStyle w:val="Titre2"/>
       </w:pPr>
-      <w:bookmarkStart w:id="46" w:name="_Toc243410333"/>
+      <w:bookmarkStart w:id="46" w:name="_Toc243470773"/>
       <w:r>
         <w:t>Frozen or fine-tuned? Validation and test disagree</w:t>
       </w:r>
@@ -11276,7 +11259,7 @@
       <w:pPr>
         <w:pStyle w:val="Titre2"/>
       </w:pPr>
-      <w:bookmarkStart w:id="47" w:name="_Toc243410334"/>
+      <w:bookmarkStart w:id="47" w:name="_Toc243470774"/>
       <w:r>
         <w:t>Speed and size</w:t>
       </w:r>
@@ -11294,7 +11277,7 @@
       <w:pPr>
         <w:pStyle w:val="Titre2"/>
       </w:pPr>
-      <w:bookmarkStart w:id="48" w:name="_Toc243410335"/>
+      <w:bookmarkStart w:id="48" w:name="_Toc243470775"/>
       <w:r>
         <w:t>Recommendation to the director</w:t>
       </w:r>
@@ -11391,9 +11374,8 @@
         <w:pStyle w:val="Titre1"/>
         <w:pageBreakBefore/>
       </w:pPr>
-      <w:bookmarkStart w:id="49" w:name="_Toc243410336"/>
-      <w:r>
-        <w:lastRenderedPageBreak/>
+      <w:bookmarkStart w:id="49" w:name="_Toc243470776"/>
+      <w:r>
         <w:t>9. Bonus: what about transformers like BERT? (notebook 07)</w:t>
       </w:r>
       <w:bookmarkEnd w:id="49"/>
@@ -12256,9 +12238,8 @@
         <w:rPr>
           <w:noProof/>
         </w:rPr>
-        <w:lastRenderedPageBreak/>
         <w:drawing>
-          <wp:inline distT="0" distB="0" distL="0" distR="0" wp14:anchorId="01918B05" wp14:editId="01918B06">
+          <wp:inline distT="0" distB="0" distL="0" distR="0" wp14:anchorId="7BB8C87B" wp14:editId="7BB8C87C">
             <wp:extent cx="4381500" cy="2486025"/>
             <wp:effectExtent l="0" t="0" r="0" b="0"/>
             <wp:docPr id="6" name="07_transformers_accuracy_vs_speed.png" descr="Transformers on validation: CLIP is more accurate, but slower." title="Transformers on validation: CLIP is more accurate, but slower."/>
@@ -12318,9 +12299,8 @@
         <w:pStyle w:val="Titre1"/>
         <w:pageBreakBefore/>
       </w:pPr>
-      <w:bookmarkStart w:id="50" w:name="_Toc243410337"/>
-      <w:r>
-        <w:lastRenderedPageBreak/>
+      <w:bookmarkStart w:id="50" w:name="_Toc243470777"/>
+      <w:r>
         <w:t>10. Key numbers to know by heart</w:t>
       </w:r>
       <w:bookmarkEnd w:id="50"/>
@@ -13576,9 +13556,8 @@
         <w:pStyle w:val="Titre1"/>
         <w:pageBreakBefore/>
       </w:pPr>
-      <w:bookmarkStart w:id="51" w:name="_Toc243410338"/>
-      <w:r>
-        <w:lastRenderedPageBreak/>
+      <w:bookmarkStart w:id="51" w:name="_Toc243470778"/>
+      <w:r>
         <w:t>11. Concepts in simple words</w:t>
       </w:r>
       <w:bookmarkEnd w:id="51"/>
@@ -15283,7 +15262,6 @@
                 <w:sz w:val="19"/>
                 <w:szCs w:val="19"/>
               </w:rPr>
-              <w:lastRenderedPageBreak/>
               <w:t>Confusion matrix</w:t>
             </w:r>
           </w:p>
@@ -15767,9 +15745,8 @@
         <w:pStyle w:val="Titre1"/>
         <w:pageBreakBefore/>
       </w:pPr>
-      <w:bookmarkStart w:id="52" w:name="_Toc243410339"/>
-      <w:r>
-        <w:lastRenderedPageBreak/>
+      <w:bookmarkStart w:id="52" w:name="_Toc243470779"/>
+      <w:r>
         <w:t>12. Questions you may get, with answers</w:t>
       </w:r>
       <w:bookmarkEnd w:id="52"/>
@@ -15789,7 +15766,7 @@
       <w:pPr>
         <w:pStyle w:val="Titre2"/>
       </w:pPr>
-      <w:bookmarkStart w:id="53" w:name="_Toc243410340"/>
+      <w:bookmarkStart w:id="53" w:name="_Toc243470780"/>
       <w:r>
         <w:t>About the data</w:t>
       </w:r>
@@ -15909,7 +15886,7 @@
       <w:pPr>
         <w:pStyle w:val="Titre2"/>
       </w:pPr>
-      <w:bookmarkStart w:id="54" w:name="_Toc243410341"/>
+      <w:bookmarkStart w:id="54" w:name="_Toc243470781"/>
       <w:r>
         <w:t>About the MLP</w:t>
       </w:r>
@@ -16029,7 +16006,7 @@
       <w:pPr>
         <w:pStyle w:val="Titre2"/>
       </w:pPr>
-      <w:bookmarkStart w:id="55" w:name="_Toc243410342"/>
+      <w:bookmarkStart w:id="55" w:name="_Toc243470782"/>
       <w:r>
         <w:t>About training and diagnosis</w:t>
       </w:r>
@@ -16127,9 +16104,8 @@
       <w:pPr>
         <w:pStyle w:val="Titre2"/>
       </w:pPr>
-      <w:bookmarkStart w:id="56" w:name="_Toc243410343"/>
-      <w:r>
-        <w:lastRenderedPageBreak/>
+      <w:bookmarkStart w:id="56" w:name="_Toc243470783"/>
+      <w:r>
         <w:t>About ResNet</w:t>
       </w:r>
       <w:bookmarkEnd w:id="56"/>
@@ -16270,7 +16246,7 @@
       <w:pPr>
         <w:pStyle w:val="Titre2"/>
       </w:pPr>
-      <w:bookmarkStart w:id="57" w:name="_Toc243410344"/>
+      <w:bookmarkStart w:id="57" w:name="_Toc243470784"/>
       <w:r>
         <w:t>About the results and the recommendation</w:t>
       </w:r>
@@ -16412,9 +16388,8 @@
       <w:pPr>
         <w:pStyle w:val="Titre2"/>
       </w:pPr>
-      <w:bookmarkStart w:id="58" w:name="_Toc243410345"/>
-      <w:r>
-        <w:lastRenderedPageBreak/>
+      <w:bookmarkStart w:id="58" w:name="_Toc243470785"/>
+      <w:r>
         <w:t>About the project</w:t>
       </w:r>
       <w:bookmarkEnd w:id="58"/>
@@ -16468,9 +16443,8 @@
         <w:pStyle w:val="Titre1"/>
         <w:pageBreakBefore/>
       </w:pPr>
-      <w:bookmarkStart w:id="59" w:name="_Toc243410346"/>
-      <w:r>
-        <w:lastRenderedPageBreak/>
+      <w:bookmarkStart w:id="59" w:name="_Toc243470786"/>
+      <w:r>
         <w:t>13. Limits to admit, and next steps</w:t>
       </w:r>
       <w:bookmarkEnd w:id="59"/>
@@ -17262,9 +17236,8 @@
         <w:pStyle w:val="Titre1"/>
         <w:pageBreakBefore/>
       </w:pPr>
-      <w:bookmarkStart w:id="60" w:name="_Toc243410347"/>
-      <w:r>
-        <w:lastRenderedPageBreak/>
+      <w:bookmarkStart w:id="60" w:name="_Toc243470787"/>
+      <w:r>
         <w:t>14. Git history and how to reproduce</w:t>
       </w:r>
       <w:bookmarkEnd w:id="60"/>
@@ -18218,9 +18191,8 @@
         <w:pStyle w:val="Titre1"/>
         <w:pageBreakBefore/>
       </w:pPr>
-      <w:bookmarkStart w:id="61" w:name="_Toc243410348"/>
-      <w:r>
-        <w:lastRenderedPageBreak/>
+      <w:bookmarkStart w:id="61" w:name="_Toc243470788"/>
+      <w:r>
         <w:t>15. The 10-minute talk, slide by slide</w:t>
       </w:r>
       <w:bookmarkEnd w:id="61"/>
@@ -18233,7 +18205,7 @@
         <w:rPr>
           <w:color w:val="1C2433"/>
         </w:rPr>
-        <w:t>About 55 seconds per slide; the speaker notes in the .pptx hold the full text in simple English.</w:t>
+        <w:t>The talk follows the project step by step and gives the answer only at the end. About 55 seconds per slide; the speaker notes in the .pptx and oral_script.pdf hold the full text in simple English.</w:t>
       </w:r>
     </w:p>
     <w:tbl>
@@ -18537,7 +18509,7 @@
                 <w:sz w:val="19"/>
                 <w:szCs w:val="19"/>
               </w:rPr>
-              <w:t>Our answer: yes, a pretrained network</w:t>
+              <w:t>Six steps to answer the director</w:t>
             </w:r>
           </w:p>
         </w:tc>
@@ -18564,7 +18536,7 @@
                 <w:sz w:val="19"/>
                 <w:szCs w:val="19"/>
               </w:rPr>
-              <w:t>1:00</w:t>
+              <w:t>0:50</w:t>
             </w:r>
           </w:p>
         </w:tc>
@@ -18591,7 +18563,7 @@
                 <w:sz w:val="19"/>
                 <w:szCs w:val="19"/>
               </w:rPr>
-              <w:t>83.0 % vs 67.3 % vs 41.4 %, at 53 ms per photo.</w:t>
+              <w:t>The question, then the six steps; the answer comes at the end.</w:t>
             </w:r>
           </w:p>
         </w:tc>
@@ -18645,7 +18617,7 @@
                 <w:sz w:val="19"/>
                 <w:szCs w:val="19"/>
               </w:rPr>
-              <w:t>A fair test: one painter, one part</w:t>
+              <w:t>Step 1: A fair test: one painter, one part</w:t>
             </w:r>
           </w:p>
         </w:tc>
@@ -18671,7 +18643,7 @@
                 <w:sz w:val="19"/>
                 <w:szCs w:val="19"/>
               </w:rPr>
-              <w:t>0:50</w:t>
+              <w:t>0:55</w:t>
             </w:r>
           </w:p>
         </w:tc>
@@ -18753,7 +18725,7 @@
                 <w:sz w:val="19"/>
                 <w:szCs w:val="19"/>
               </w:rPr>
-              <w:t>Our MLP learns the paintings by heart</w:t>
+              <w:t>Step 2: Our MLP learns the paintings by heart</w:t>
             </w:r>
           </w:p>
         </w:tc>
@@ -18861,7 +18833,7 @@
                 <w:sz w:val="19"/>
                 <w:szCs w:val="19"/>
               </w:rPr>
-              <w:t>Healthy training, but the MLP overfits</w:t>
+              <w:t>Step 3: Healthy training, but the MLP overfits</w:t>
             </w:r>
           </w:p>
         </w:tc>
@@ -18887,7 +18859,7 @@
                 <w:sz w:val="19"/>
                 <w:szCs w:val="19"/>
               </w:rPr>
-              <w:t>1:00</w:t>
+              <w:t>0:55</w:t>
             </w:r>
           </w:p>
         </w:tc>
@@ -18969,7 +18941,7 @@
                 <w:sz w:val="19"/>
                 <w:szCs w:val="19"/>
               </w:rPr>
-              <w:t>Four broken runs, four signatures</w:t>
+              <w:t>Step 3: Four broken runs, four signatures</w:t>
             </w:r>
           </w:p>
         </w:tc>
@@ -18996,7 +18968,7 @@
                 <w:sz w:val="19"/>
                 <w:szCs w:val="19"/>
               </w:rPr>
-              <w:t>1:00</w:t>
+              <w:t>0:55</w:t>
             </w:r>
           </w:p>
         </w:tc>
@@ -19077,7 +19049,7 @@
                 <w:sz w:val="19"/>
                 <w:szCs w:val="19"/>
               </w:rPr>
-              <w:t>A pretrained ResNet18 sees shapes</w:t>
+              <w:t>Step 4: A pretrained ResNet18 sees shapes</w:t>
             </w:r>
           </w:p>
         </w:tc>
@@ -19185,7 +19157,7 @@
                 <w:sz w:val="19"/>
                 <w:szCs w:val="19"/>
               </w:rPr>
-              <w:t>Seeing the painter inflates the score</w:t>
+              <w:t>Step 4: Seeing the painter inflates the score</w:t>
             </w:r>
           </w:p>
         </w:tc>
@@ -19293,7 +19265,7 @@
                 <w:sz w:val="19"/>
                 <w:szCs w:val="19"/>
               </w:rPr>
-              <w:t>Final test: the pretrained network wins</w:t>
+              <w:t>Step 5: Final test: the pretrained network wins</w:t>
             </w:r>
           </w:p>
         </w:tc>
@@ -19401,7 +19373,7 @@
                 <w:sz w:val="19"/>
                 <w:szCs w:val="19"/>
               </w:rPr>
-              <w:t>Fast and cheap enough for a kiosk</w:t>
+              <w:t>Step 6: Fast and cheap enough for a kiosk</w:t>
             </w:r>
           </w:p>
         </w:tc>
@@ -19428,7 +19400,7 @@
                 <w:sz w:val="19"/>
                 <w:szCs w:val="19"/>
               </w:rPr>
-              <w:t>0:40</w:t>
+              <w:t>0:45</w:t>
             </w:r>
           </w:p>
         </w:tc>
@@ -19509,7 +19481,7 @@
                 <w:sz w:val="19"/>
                 <w:szCs w:val="19"/>
               </w:rPr>
-              <w:t>Deploy a frozen ResNet18 + linear head</w:t>
+              <w:t>Our choice: frozen ResNet18 + linear head</w:t>
             </w:r>
           </w:p>
         </w:tc>
@@ -19535,7 +19507,7 @@
                 <w:sz w:val="19"/>
                 <w:szCs w:val="19"/>
               </w:rPr>
-              <w:t>1:00</w:t>
+              <w:t>1:10</w:t>
             </w:r>
           </w:p>
         </w:tc>
@@ -19561,7 +19533,7 @@
                 <w:sz w:val="19"/>
                 <w:szCs w:val="19"/>
               </w:rPr>
-              <w:t>Why, not now, before launch; then thank you.</w:t>
+              <w:t>41 % then 67 % then 83 %: the answer, why, before launch; thank you.</w:t>
             </w:r>
           </w:p>
         </w:tc>
@@ -19691,64 +19663,64 @@
 <file path=word/numbering.xml><?xml version="1.0" encoding="utf-8"?>
 <w:numbering xmlns:wpc="http://schemas.microsoft.com/office/word/2010/wordprocessingCanvas" xmlns:cx="http://schemas.microsoft.com/office/drawing/2014/chartex" xmlns:cx1="http://schemas.microsoft.com/office/drawing/2015/9/8/chartex" xmlns:cx2="http://schemas.microsoft.com/office/drawing/2015/10/21/chartex" xmlns:cx3="http://schemas.microsoft.com/office/drawing/2016/5/9/chartex" xmlns:cx4="http://schemas.microsoft.com/office/drawing/2016/5/10/chartex" xmlns:cx5="http://schemas.microsoft.com/office/drawing/2016/5/11/chartex" xmlns:cx6="http://schemas.microsoft.com/office/drawing/2016/5/12/chartex" xmlns:cx7="http://schemas.microsoft.com/office/drawing/2016/5/13/chartex" xmlns:cx8="http://schemas.microsoft.com/office/drawing/2016/5/14/chartex" xmlns:mc="http://schemas.openxmlformats.org/markup-compatibility/2006" xmlns:aink="http://schemas.microsoft.com/office/drawing/2016/ink" xmlns:am3d="http://schemas.microsoft.com/office/drawing/2017/model3d" xmlns:o="urn:schemas-microsoft-com:office:office" xmlns:oel="http://schemas.microsoft.com/office/2019/extlst" xmlns:r="http://schemas.openxmlformats.org/officeDocument/2006/relationships" xmlns:m="http://schemas.openxmlformats.org/officeDocument/2006/math" xmlns:v="urn:schemas-microsoft-com:vml" xmlns:wp14="http://schemas.microsoft.com/office/word/2010/wordprocessingDrawing" xmlns:wp="http://schemas.openxmlformats.org/drawingml/2006/wordprocessingDrawing" xmlns:w10="urn:schemas-microsoft-com:office:word" xmlns:w="http://schemas.openxmlformats.org/wordprocessingml/2006/main" xmlns:w14="http://schemas.microsoft.com/office/word/2010/wordml" xmlns:w15="http://schemas.microsoft.com/office/word/2012/wordml" xmlns:w16cex="http://schemas.microsoft.com/office/word/2018/wordml/cex" xmlns:w16cid="http://schemas.microsoft.com/office/word/2016/wordml/cid" xmlns:w16="http://schemas.microsoft.com/office/word/2018/wordml" xmlns:w16du="http://schemas.microsoft.com/office/word/2023/wordml/word16du" xmlns:w16sdtdh="http://schemas.microsoft.com/office/word/2020/wordml/sdtdatahash" xmlns:w16sdtfl="http://schemas.microsoft.com/office/word/2024/wordml/sdtformatlock" xmlns:w16se="http://schemas.microsoft.com/office/word/2015/wordml/symex" xmlns:wpg="http://schemas.microsoft.com/office/word/2010/wordprocessingGroup" xmlns:wpi="http://schemas.microsoft.com/office/word/2010/wordprocessingInk" xmlns:wne="http://schemas.microsoft.com/office/word/2006/wordml" xmlns:wps="http://schemas.microsoft.com/office/word/2010/wordprocessingShape" mc:Ignorable="w14 w15 w16se w16cid w16 w16cex w16sdtdh w16sdtfl w16du wp14">
   <w:abstractNum w:abstractNumId="0" w15:restartNumberingAfterBreak="0">
-    <w:nsid w:val="396B73FD"/>
+    <w:nsid w:val="347E022F"/>
     <w:multiLevelType w:val="hybridMultilevel"/>
-    <w:tmpl w:val="E72E7B70"/>
-    <w:lvl w:ilvl="0" w:tplc="FA16A582">
+    <w:tmpl w:val="D0D4F3D0"/>
+    <w:lvl w:ilvl="0" w:tplc="3DEAC8DE">
       <w:start w:val="1"/>
-      <w:numFmt w:val="decimal"/>
-      <w:lvlText w:val="%1."/>
+      <w:numFmt w:val="bullet"/>
+      <w:lvlText w:val="•"/>
       <w:lvlJc w:val="left"/>
       <w:pPr>
-        <w:ind w:left="400" w:hanging="300"/>
+        <w:ind w:left="400" w:hanging="260"/>
       </w:pPr>
     </w:lvl>
-    <w:lvl w:ilvl="1" w:tplc="EC0E69B4">
+    <w:lvl w:ilvl="1" w:tplc="623619C6">
       <w:numFmt w:val="decimal"/>
       <w:lvlText w:val=""/>
       <w:lvlJc w:val="left"/>
     </w:lvl>
-    <w:lvl w:ilvl="2" w:tplc="B5D40592">
+    <w:lvl w:ilvl="2" w:tplc="1206E3EC">
       <w:numFmt w:val="decimal"/>
       <w:lvlText w:val=""/>
       <w:lvlJc w:val="left"/>
     </w:lvl>
-    <w:lvl w:ilvl="3" w:tplc="FDFC5100">
+    <w:lvl w:ilvl="3" w:tplc="93F24E5E">
       <w:numFmt w:val="decimal"/>
       <w:lvlText w:val=""/>
       <w:lvlJc w:val="left"/>
     </w:lvl>
-    <w:lvl w:ilvl="4" w:tplc="C944BB40">
+    <w:lvl w:ilvl="4" w:tplc="CD42FD9E">
       <w:numFmt w:val="decimal"/>
       <w:lvlText w:val=""/>
       <w:lvlJc w:val="left"/>
     </w:lvl>
-    <w:lvl w:ilvl="5" w:tplc="FCAC06BE">
+    <w:lvl w:ilvl="5" w:tplc="51C08CB0">
       <w:numFmt w:val="decimal"/>
       <w:lvlText w:val=""/>
       <w:lvlJc w:val="left"/>
     </w:lvl>
-    <w:lvl w:ilvl="6" w:tplc="22963502">
+    <w:lvl w:ilvl="6" w:tplc="C6D8FA96">
       <w:numFmt w:val="decimal"/>
       <w:lvlText w:val=""/>
       <w:lvlJc w:val="left"/>
     </w:lvl>
-    <w:lvl w:ilvl="7" w:tplc="03D67B2E">
+    <w:lvl w:ilvl="7" w:tplc="11320118">
       <w:numFmt w:val="decimal"/>
       <w:lvlText w:val=""/>
       <w:lvlJc w:val="left"/>
     </w:lvl>
-    <w:lvl w:ilvl="8" w:tplc="FB58169C">
+    <w:lvl w:ilvl="8" w:tplc="5FEEC25A">
       <w:numFmt w:val="decimal"/>
       <w:lvlText w:val=""/>
       <w:lvlJc w:val="left"/>
     </w:lvl>
   </w:abstractNum>
   <w:abstractNum w:abstractNumId="1" w15:restartNumberingAfterBreak="0">
-    <w:nsid w:val="3D3C6208"/>
+    <w:nsid w:val="4EDE4EDC"/>
     <w:multiLevelType w:val="hybridMultilevel"/>
-    <w:tmpl w:val="43B4D5B6"/>
-    <w:lvl w:ilvl="0" w:tplc="2856CDE0">
+    <w:tmpl w:val="2B3AAA1E"/>
+    <w:lvl w:ilvl="0" w:tplc="B0E6D7A4">
       <w:start w:val="1"/>
       <w:numFmt w:val="decimal"/>
       <w:lvlText w:val="%1."/>
@@ -19757,192 +19729,106 @@
         <w:ind w:left="400" w:hanging="300"/>
       </w:pPr>
     </w:lvl>
-    <w:lvl w:ilvl="1" w:tplc="9058E762">
+    <w:lvl w:ilvl="1" w:tplc="4AE0CE0A">
       <w:numFmt w:val="decimal"/>
       <w:lvlText w:val=""/>
       <w:lvlJc w:val="left"/>
     </w:lvl>
-    <w:lvl w:ilvl="2" w:tplc="32C63FC2">
+    <w:lvl w:ilvl="2" w:tplc="E594DC7C">
       <w:numFmt w:val="decimal"/>
       <w:lvlText w:val=""/>
       <w:lvlJc w:val="left"/>
     </w:lvl>
-    <w:lvl w:ilvl="3" w:tplc="4AA6265A">
+    <w:lvl w:ilvl="3" w:tplc="3814A198">
       <w:numFmt w:val="decimal"/>
       <w:lvlText w:val=""/>
       <w:lvlJc w:val="left"/>
     </w:lvl>
-    <w:lvl w:ilvl="4" w:tplc="A11429E6">
+    <w:lvl w:ilvl="4" w:tplc="DE9CB038">
       <w:numFmt w:val="decimal"/>
       <w:lvlText w:val=""/>
       <w:lvlJc w:val="left"/>
     </w:lvl>
-    <w:lvl w:ilvl="5" w:tplc="DE5033E2">
+    <w:lvl w:ilvl="5" w:tplc="C6F68556">
       <w:numFmt w:val="decimal"/>
       <w:lvlText w:val=""/>
       <w:lvlJc w:val="left"/>
     </w:lvl>
-    <w:lvl w:ilvl="6" w:tplc="CDB63F94">
+    <w:lvl w:ilvl="6" w:tplc="BDB43B46">
       <w:numFmt w:val="decimal"/>
       <w:lvlText w:val=""/>
       <w:lvlJc w:val="left"/>
     </w:lvl>
-    <w:lvl w:ilvl="7" w:tplc="77383F0E">
+    <w:lvl w:ilvl="7" w:tplc="5DA63968">
       <w:numFmt w:val="decimal"/>
       <w:lvlText w:val=""/>
       <w:lvlJc w:val="left"/>
     </w:lvl>
-    <w:lvl w:ilvl="8" w:tplc="82E407B0">
+    <w:lvl w:ilvl="8" w:tplc="A5D45AA2">
       <w:numFmt w:val="decimal"/>
       <w:lvlText w:val=""/>
       <w:lvlJc w:val="left"/>
     </w:lvl>
   </w:abstractNum>
   <w:abstractNum w:abstractNumId="2" w15:restartNumberingAfterBreak="0">
-    <w:nsid w:val="3D593FCE"/>
+    <w:nsid w:val="6212103D"/>
     <w:multiLevelType w:val="hybridMultilevel"/>
-    <w:tmpl w:val="FC167494"/>
-    <w:lvl w:ilvl="0" w:tplc="CF86E8C2">
+    <w:tmpl w:val="41D84D16"/>
+    <w:lvl w:ilvl="0" w:tplc="D79C2AB0">
       <w:start w:val="1"/>
-      <w:numFmt w:val="bullet"/>
-      <w:lvlText w:val="•"/>
+      <w:numFmt w:val="decimal"/>
+      <w:lvlText w:val="%1."/>
       <w:lvlJc w:val="left"/>
       <w:pPr>
-        <w:ind w:left="400" w:hanging="260"/>
+        <w:ind w:left="400" w:hanging="300"/>
       </w:pPr>
     </w:lvl>
-    <w:lvl w:ilvl="1" w:tplc="2098BF66">
+    <w:lvl w:ilvl="1" w:tplc="ED9C2E3A">
       <w:numFmt w:val="decimal"/>
       <w:lvlText w:val=""/>
       <w:lvlJc w:val="left"/>
     </w:lvl>
-    <w:lvl w:ilvl="2" w:tplc="36746A04">
+    <w:lvl w:ilvl="2" w:tplc="C6FC6164">
       <w:numFmt w:val="decimal"/>
       <w:lvlText w:val=""/>
       <w:lvlJc w:val="left"/>
     </w:lvl>
-    <w:lvl w:ilvl="3" w:tplc="B7DC26DE">
+    <w:lvl w:ilvl="3" w:tplc="D6C62498">
       <w:numFmt w:val="decimal"/>
       <w:lvlText w:val=""/>
       <w:lvlJc w:val="left"/>
     </w:lvl>
-    <w:lvl w:ilvl="4" w:tplc="95542B92">
+    <w:lvl w:ilvl="4" w:tplc="577EEA2A">
       <w:numFmt w:val="decimal"/>
       <w:lvlText w:val=""/>
       <w:lvlJc w:val="left"/>
     </w:lvl>
-    <w:lvl w:ilvl="5" w:tplc="FA4280B8">
+    <w:lvl w:ilvl="5" w:tplc="CE78622A">
       <w:numFmt w:val="decimal"/>
       <w:lvlText w:val=""/>
       <w:lvlJc w:val="left"/>
     </w:lvl>
-    <w:lvl w:ilvl="6" w:tplc="9120F7CA">
+    <w:lvl w:ilvl="6" w:tplc="706ECF40">
       <w:numFmt w:val="decimal"/>
       <w:lvlText w:val=""/>
       <w:lvlJc w:val="left"/>
     </w:lvl>
-    <w:lvl w:ilvl="7" w:tplc="BC9E7950">
+    <w:lvl w:ilvl="7" w:tplc="5A001506">
       <w:numFmt w:val="decimal"/>
       <w:lvlText w:val=""/>
       <w:lvlJc w:val="left"/>
     </w:lvl>
-    <w:lvl w:ilvl="8" w:tplc="8EE424D2">
+    <w:lvl w:ilvl="8" w:tplc="04B4DF90">
       <w:numFmt w:val="decimal"/>
       <w:lvlText w:val=""/>
       <w:lvlJc w:val="left"/>
     </w:lvl>
   </w:abstractNum>
   <w:abstractNum w:abstractNumId="3" w15:restartNumberingAfterBreak="0">
-    <w:nsid w:val="470C68CB"/>
+    <w:nsid w:val="697C157A"/>
     <w:multiLevelType w:val="hybridMultilevel"/>
-    <w:tmpl w:val="76C26030"/>
-    <w:lvl w:ilvl="0" w:tplc="840C3A86" w:tentative="1">
-      <w:start w:val="1"/>
-      <w:numFmt w:val="bullet"/>
-      <w:lvlText w:val="●"/>
-      <w:lvlJc w:val="left"/>
-      <w:pPr>
-        <w:ind w:left="720" w:hanging="360"/>
-      </w:pPr>
-    </w:lvl>
-    <w:lvl w:ilvl="1" w:tplc="82FC6DBC" w:tentative="1">
-      <w:start w:val="1"/>
-      <w:numFmt w:val="bullet"/>
-      <w:lvlText w:val="○"/>
-      <w:lvlJc w:val="left"/>
-      <w:pPr>
-        <w:ind w:left="1440" w:hanging="360"/>
-      </w:pPr>
-    </w:lvl>
-    <w:lvl w:ilvl="2" w:tplc="569E4100" w:tentative="1">
-      <w:start w:val="1"/>
-      <w:numFmt w:val="bullet"/>
-      <w:lvlText w:val="■"/>
-      <w:lvlJc w:val="left"/>
-      <w:pPr>
-        <w:ind w:left="2160" w:hanging="360"/>
-      </w:pPr>
-    </w:lvl>
-    <w:lvl w:ilvl="3" w:tplc="1AAC7B38" w:tentative="1">
-      <w:start w:val="1"/>
-      <w:numFmt w:val="bullet"/>
-      <w:lvlText w:val="●"/>
-      <w:lvlJc w:val="left"/>
-      <w:pPr>
-        <w:ind w:left="2880" w:hanging="360"/>
-      </w:pPr>
-    </w:lvl>
-    <w:lvl w:ilvl="4" w:tplc="950C780E" w:tentative="1">
-      <w:start w:val="1"/>
-      <w:numFmt w:val="bullet"/>
-      <w:lvlText w:val="○"/>
-      <w:lvlJc w:val="left"/>
-      <w:pPr>
-        <w:ind w:left="3600" w:hanging="360"/>
-      </w:pPr>
-    </w:lvl>
-    <w:lvl w:ilvl="5" w:tplc="0DCA5E14" w:tentative="1">
-      <w:start w:val="1"/>
-      <w:numFmt w:val="bullet"/>
-      <w:lvlText w:val="■"/>
-      <w:lvlJc w:val="left"/>
-      <w:pPr>
-        <w:ind w:left="4320" w:hanging="360"/>
-      </w:pPr>
-    </w:lvl>
-    <w:lvl w:ilvl="6" w:tplc="845AFC76" w:tentative="1">
-      <w:start w:val="1"/>
-      <w:numFmt w:val="bullet"/>
-      <w:lvlText w:val="●"/>
-      <w:lvlJc w:val="left"/>
-      <w:pPr>
-        <w:ind w:left="5040" w:hanging="360"/>
-      </w:pPr>
-    </w:lvl>
-    <w:lvl w:ilvl="7" w:tplc="FFFCFB26" w:tentative="1">
-      <w:start w:val="1"/>
-      <w:numFmt w:val="bullet"/>
-      <w:lvlText w:val="●"/>
-      <w:lvlJc w:val="left"/>
-      <w:pPr>
-        <w:ind w:left="5760" w:hanging="360"/>
-      </w:pPr>
-    </w:lvl>
-    <w:lvl w:ilvl="8" w:tplc="A9F8F83E" w:tentative="1">
-      <w:start w:val="1"/>
-      <w:numFmt w:val="bullet"/>
-      <w:lvlText w:val="●"/>
-      <w:lvlJc w:val="left"/>
-      <w:pPr>
-        <w:ind w:left="6480" w:hanging="360"/>
-      </w:pPr>
-    </w:lvl>
-  </w:abstractNum>
-  <w:abstractNum w:abstractNumId="4" w15:restartNumberingAfterBreak="0">
-    <w:nsid w:val="73427400"/>
-    <w:multiLevelType w:val="hybridMultilevel"/>
-    <w:tmpl w:val="FDBEEEAA"/>
-    <w:lvl w:ilvl="0" w:tplc="B426C3BE">
+    <w:tmpl w:val="40486F06"/>
+    <w:lvl w:ilvl="0" w:tplc="B8EE1A3A">
       <w:start w:val="1"/>
       <w:numFmt w:val="decimal"/>
       <w:lvlText w:val="%1."/>
@@ -19951,72 +19837,158 @@
         <w:ind w:left="400" w:hanging="300"/>
       </w:pPr>
     </w:lvl>
-    <w:lvl w:ilvl="1" w:tplc="C87492FC">
+    <w:lvl w:ilvl="1" w:tplc="8F7CEC10">
       <w:numFmt w:val="decimal"/>
       <w:lvlText w:val=""/>
       <w:lvlJc w:val="left"/>
     </w:lvl>
-    <w:lvl w:ilvl="2" w:tplc="3786A042">
+    <w:lvl w:ilvl="2" w:tplc="C7F461C0">
       <w:numFmt w:val="decimal"/>
       <w:lvlText w:val=""/>
       <w:lvlJc w:val="left"/>
     </w:lvl>
-    <w:lvl w:ilvl="3" w:tplc="A126B4E0">
+    <w:lvl w:ilvl="3" w:tplc="8A822852">
       <w:numFmt w:val="decimal"/>
       <w:lvlText w:val=""/>
       <w:lvlJc w:val="left"/>
     </w:lvl>
-    <w:lvl w:ilvl="4" w:tplc="6F300B36">
+    <w:lvl w:ilvl="4" w:tplc="2C2AB294">
       <w:numFmt w:val="decimal"/>
       <w:lvlText w:val=""/>
       <w:lvlJc w:val="left"/>
     </w:lvl>
-    <w:lvl w:ilvl="5" w:tplc="70E6B782">
+    <w:lvl w:ilvl="5" w:tplc="6D549E06">
       <w:numFmt w:val="decimal"/>
       <w:lvlText w:val=""/>
       <w:lvlJc w:val="left"/>
     </w:lvl>
-    <w:lvl w:ilvl="6" w:tplc="8330370E">
+    <w:lvl w:ilvl="6" w:tplc="BE4858DE">
       <w:numFmt w:val="decimal"/>
       <w:lvlText w:val=""/>
       <w:lvlJc w:val="left"/>
     </w:lvl>
-    <w:lvl w:ilvl="7" w:tplc="9E9C6560">
+    <w:lvl w:ilvl="7" w:tplc="D18688D2">
       <w:numFmt w:val="decimal"/>
       <w:lvlText w:val=""/>
       <w:lvlJc w:val="left"/>
     </w:lvl>
-    <w:lvl w:ilvl="8" w:tplc="AC1E9504">
+    <w:lvl w:ilvl="8" w:tplc="459E31F4">
       <w:numFmt w:val="decimal"/>
       <w:lvlText w:val=""/>
       <w:lvlJc w:val="left"/>
     </w:lvl>
   </w:abstractNum>
-  <w:num w:numId="1" w16cid:durableId="1553077170">
+  <w:abstractNum w:abstractNumId="4" w15:restartNumberingAfterBreak="0">
+    <w:nsid w:val="7A6D7CFC"/>
+    <w:multiLevelType w:val="hybridMultilevel"/>
+    <w:tmpl w:val="B6EE4D72"/>
+    <w:lvl w:ilvl="0" w:tplc="61FED5D6" w:tentative="1">
+      <w:start w:val="1"/>
+      <w:numFmt w:val="bullet"/>
+      <w:lvlText w:val="●"/>
+      <w:lvlJc w:val="left"/>
+      <w:pPr>
+        <w:ind w:left="720" w:hanging="360"/>
+      </w:pPr>
+    </w:lvl>
+    <w:lvl w:ilvl="1" w:tplc="2B723AA0" w:tentative="1">
+      <w:start w:val="1"/>
+      <w:numFmt w:val="bullet"/>
+      <w:lvlText w:val="○"/>
+      <w:lvlJc w:val="left"/>
+      <w:pPr>
+        <w:ind w:left="1440" w:hanging="360"/>
+      </w:pPr>
+    </w:lvl>
+    <w:lvl w:ilvl="2" w:tplc="9FF87B44" w:tentative="1">
+      <w:start w:val="1"/>
+      <w:numFmt w:val="bullet"/>
+      <w:lvlText w:val="■"/>
+      <w:lvlJc w:val="left"/>
+      <w:pPr>
+        <w:ind w:left="2160" w:hanging="360"/>
+      </w:pPr>
+    </w:lvl>
+    <w:lvl w:ilvl="3" w:tplc="65803632" w:tentative="1">
+      <w:start w:val="1"/>
+      <w:numFmt w:val="bullet"/>
+      <w:lvlText w:val="●"/>
+      <w:lvlJc w:val="left"/>
+      <w:pPr>
+        <w:ind w:left="2880" w:hanging="360"/>
+      </w:pPr>
+    </w:lvl>
+    <w:lvl w:ilvl="4" w:tplc="6F241D0A" w:tentative="1">
+      <w:start w:val="1"/>
+      <w:numFmt w:val="bullet"/>
+      <w:lvlText w:val="○"/>
+      <w:lvlJc w:val="left"/>
+      <w:pPr>
+        <w:ind w:left="3600" w:hanging="360"/>
+      </w:pPr>
+    </w:lvl>
+    <w:lvl w:ilvl="5" w:tplc="5DCE0F58" w:tentative="1">
+      <w:start w:val="1"/>
+      <w:numFmt w:val="bullet"/>
+      <w:lvlText w:val="■"/>
+      <w:lvlJc w:val="left"/>
+      <w:pPr>
+        <w:ind w:left="4320" w:hanging="360"/>
+      </w:pPr>
+    </w:lvl>
+    <w:lvl w:ilvl="6" w:tplc="E034C17E" w:tentative="1">
+      <w:start w:val="1"/>
+      <w:numFmt w:val="bullet"/>
+      <w:lvlText w:val="●"/>
+      <w:lvlJc w:val="left"/>
+      <w:pPr>
+        <w:ind w:left="5040" w:hanging="360"/>
+      </w:pPr>
+    </w:lvl>
+    <w:lvl w:ilvl="7" w:tplc="937C6AF8" w:tentative="1">
+      <w:start w:val="1"/>
+      <w:numFmt w:val="bullet"/>
+      <w:lvlText w:val="●"/>
+      <w:lvlJc w:val="left"/>
+      <w:pPr>
+        <w:ind w:left="5760" w:hanging="360"/>
+      </w:pPr>
+    </w:lvl>
+    <w:lvl w:ilvl="8" w:tplc="1E227F4A" w:tentative="1">
+      <w:start w:val="1"/>
+      <w:numFmt w:val="bullet"/>
+      <w:lvlText w:val="●"/>
+      <w:lvlJc w:val="left"/>
+      <w:pPr>
+        <w:ind w:left="6480" w:hanging="360"/>
+      </w:pPr>
+    </w:lvl>
+  </w:abstractNum>
+  <w:num w:numId="1" w16cid:durableId="548339992">
+    <w:abstractNumId w:val="4"/>
+    <w:lvlOverride w:ilvl="0">
+      <w:startOverride w:val="1"/>
+    </w:lvlOverride>
+  </w:num>
+  <w:num w:numId="2" w16cid:durableId="2099061094">
     <w:abstractNumId w:val="3"/>
     <w:lvlOverride w:ilvl="0">
       <w:startOverride w:val="1"/>
     </w:lvlOverride>
   </w:num>
-  <w:num w:numId="2" w16cid:durableId="427434149">
+  <w:num w:numId="3" w16cid:durableId="797603245">
     <w:abstractNumId w:val="0"/>
     <w:lvlOverride w:ilvl="0">
       <w:startOverride w:val="1"/>
     </w:lvlOverride>
   </w:num>
-  <w:num w:numId="3" w16cid:durableId="1900364802">
+  <w:num w:numId="4" w16cid:durableId="1055355430">
     <w:abstractNumId w:val="2"/>
     <w:lvlOverride w:ilvl="0">
       <w:startOverride w:val="1"/>
     </w:lvlOverride>
   </w:num>
-  <w:num w:numId="4" w16cid:durableId="1690567475">
-    <w:abstractNumId w:val="4"/>
-    <w:lvlOverride w:ilvl="0">
-      <w:startOverride w:val="1"/>
-    </w:lvlOverride>
-  </w:num>
-  <w:num w:numId="5" w16cid:durableId="468784870">
+  <w:num w:numId="5" w16cid:durableId="695935193">
     <w:abstractNumId w:val="1"/>
     <w:lvlOverride w:ilvl="0">
       <w:startOverride w:val="1"/>
@@ -20657,7 +20629,7 @@
     <w:autoRedefine/>
     <w:uiPriority w:val="39"/>
     <w:unhideWhenUsed/>
-    <w:rsid w:val="008035C8"/>
+    <w:rsid w:val="004649E9"/>
     <w:pPr>
       <w:spacing w:after="100"/>
     </w:pPr>
@@ -20669,7 +20641,7 @@
     <w:autoRedefine/>
     <w:uiPriority w:val="39"/>
     <w:unhideWhenUsed/>
-    <w:rsid w:val="008035C8"/>
+    <w:rsid w:val="004649E9"/>
     <w:pPr>
       <w:spacing w:after="100"/>
       <w:ind w:left="210"/>

</xml_diff>

<commit_message>
Update talk timings and add the slide-to-slide thread to the study guide
</commit_message>
<xml_diff>
--- a/docs/oral_study_guide.docx
+++ b/docs/oral_study_guide.docx
@@ -86,19 +86,19 @@
           <w:sz w:val="34"/>
           <w:szCs w:val="34"/>
         </w:rPr>
+        <w:lastRenderedPageBreak/>
         <w:t>Contents</w:t>
       </w:r>
     </w:p>
     <w:sdt>
       <w:sdtPr>
         <w:alias w:val="Contents"/>
-        <w:id w:val="470033892"/>
+        <w:id w:val="-129861409"/>
       </w:sdtPr>
       <w:sdtEndPr/>
       <w:sdtContent>
         <w:p>
           <w:pPr>
-            <w:pStyle w:val="TM1"/>
             <w:tabs>
               <w:tab w:val="right" w:leader="dot" w:pos="9628"/>
             </w:tabs>
@@ -115,7 +115,7 @@
           <w:r>
             <w:fldChar w:fldCharType="separate"/>
           </w:r>
-          <w:hyperlink w:anchor="_Toc243470727" w:history="1">
+          <w:hyperlink w:anchor="_Toc243477388" w:history="1">
             <w:r>
               <w:rPr>
                 <w:rStyle w:val="Lienhypertexte"/>
@@ -139,7 +139,7 @@
               <w:rPr>
                 <w:noProof/>
               </w:rPr>
-              <w:instrText xml:space="preserve"> PAGEREF _Toc243470727 \h </w:instrText>
+              <w:instrText xml:space="preserve"> PAGEREF _Toc243477388 \h </w:instrText>
             </w:r>
             <w:r>
               <w:rPr>
@@ -168,7 +168,6 @@
         </w:p>
         <w:p>
           <w:pPr>
-            <w:pStyle w:val="TM1"/>
             <w:tabs>
               <w:tab w:val="right" w:leader="dot" w:pos="9628"/>
             </w:tabs>
@@ -176,7 +175,7 @@
               <w:noProof/>
             </w:rPr>
           </w:pPr>
-          <w:hyperlink w:anchor="_Toc243470728" w:history="1">
+          <w:hyperlink w:anchor="_Toc243477389" w:history="1">
             <w:r>
               <w:rPr>
                 <w:rStyle w:val="Lienhypertexte"/>
@@ -200,7 +199,7 @@
               <w:rPr>
                 <w:noProof/>
               </w:rPr>
-              <w:instrText xml:space="preserve"> PAGEREF _Toc243470728 \h </w:instrText>
+              <w:instrText xml:space="preserve"> PAGEREF _Toc243477389 \h </w:instrText>
             </w:r>
             <w:r>
               <w:rPr>
@@ -229,7 +228,6 @@
         </w:p>
         <w:p>
           <w:pPr>
-            <w:pStyle w:val="TM2"/>
             <w:tabs>
               <w:tab w:val="right" w:leader="dot" w:pos="9628"/>
             </w:tabs>
@@ -237,7 +235,7 @@
               <w:noProof/>
             </w:rPr>
           </w:pPr>
-          <w:hyperlink w:anchor="_Toc243470729" w:history="1">
+          <w:hyperlink w:anchor="_Toc243477390" w:history="1">
             <w:r>
               <w:rPr>
                 <w:rStyle w:val="Lienhypertexte"/>
@@ -261,7 +259,7 @@
               <w:rPr>
                 <w:noProof/>
               </w:rPr>
-              <w:instrText xml:space="preserve"> PAGEREF _Toc243470729 \h </w:instrText>
+              <w:instrText xml:space="preserve"> PAGEREF _Toc243477390 \h </w:instrText>
             </w:r>
             <w:r>
               <w:rPr>
@@ -290,7 +288,6 @@
         </w:p>
         <w:p>
           <w:pPr>
-            <w:pStyle w:val="TM2"/>
             <w:tabs>
               <w:tab w:val="right" w:leader="dot" w:pos="9628"/>
             </w:tabs>
@@ -298,7 +295,7 @@
               <w:noProof/>
             </w:rPr>
           </w:pPr>
-          <w:hyperlink w:anchor="_Toc243470730" w:history="1">
+          <w:hyperlink w:anchor="_Toc243477391" w:history="1">
             <w:r>
               <w:rPr>
                 <w:rStyle w:val="Lienhypertexte"/>
@@ -322,7 +319,7 @@
               <w:rPr>
                 <w:noProof/>
               </w:rPr>
-              <w:instrText xml:space="preserve"> PAGEREF _Toc243470730 \h </w:instrText>
+              <w:instrText xml:space="preserve"> PAGEREF _Toc243477391 \h </w:instrText>
             </w:r>
             <w:r>
               <w:rPr>
@@ -351,7 +348,6 @@
         </w:p>
         <w:p>
           <w:pPr>
-            <w:pStyle w:val="TM2"/>
             <w:tabs>
               <w:tab w:val="right" w:leader="dot" w:pos="9628"/>
             </w:tabs>
@@ -359,7 +355,7 @@
               <w:noProof/>
             </w:rPr>
           </w:pPr>
-          <w:hyperlink w:anchor="_Toc243470731" w:history="1">
+          <w:hyperlink w:anchor="_Toc243477392" w:history="1">
             <w:r>
               <w:rPr>
                 <w:rStyle w:val="Lienhypertexte"/>
@@ -383,7 +379,7 @@
               <w:rPr>
                 <w:noProof/>
               </w:rPr>
-              <w:instrText xml:space="preserve"> PAGEREF _Toc243470731 \h </w:instrText>
+              <w:instrText xml:space="preserve"> PAGEREF _Toc243477392 \h </w:instrText>
             </w:r>
             <w:r>
               <w:rPr>
@@ -412,7 +408,6 @@
         </w:p>
         <w:p>
           <w:pPr>
-            <w:pStyle w:val="TM2"/>
             <w:tabs>
               <w:tab w:val="right" w:leader="dot" w:pos="9628"/>
             </w:tabs>
@@ -420,7 +415,7 @@
               <w:noProof/>
             </w:rPr>
           </w:pPr>
-          <w:hyperlink w:anchor="_Toc243470732" w:history="1">
+          <w:hyperlink w:anchor="_Toc243477393" w:history="1">
             <w:r>
               <w:rPr>
                 <w:rStyle w:val="Lienhypertexte"/>
@@ -444,7 +439,7 @@
               <w:rPr>
                 <w:noProof/>
               </w:rPr>
-              <w:instrText xml:space="preserve"> PAGEREF _Toc243470732 \h </w:instrText>
+              <w:instrText xml:space="preserve"> PAGEREF _Toc243477393 \h </w:instrText>
             </w:r>
             <w:r>
               <w:rPr>
@@ -473,7 +468,6 @@
         </w:p>
         <w:p>
           <w:pPr>
-            <w:pStyle w:val="TM2"/>
             <w:tabs>
               <w:tab w:val="right" w:leader="dot" w:pos="9628"/>
             </w:tabs>
@@ -481,7 +475,7 @@
               <w:noProof/>
             </w:rPr>
           </w:pPr>
-          <w:hyperlink w:anchor="_Toc243470733" w:history="1">
+          <w:hyperlink w:anchor="_Toc243477394" w:history="1">
             <w:r>
               <w:rPr>
                 <w:rStyle w:val="Lienhypertexte"/>
@@ -505,7 +499,7 @@
               <w:rPr>
                 <w:noProof/>
               </w:rPr>
-              <w:instrText xml:space="preserve"> PAGEREF _Toc243470733 \h </w:instrText>
+              <w:instrText xml:space="preserve"> PAGEREF _Toc243477394 \h </w:instrText>
             </w:r>
             <w:r>
               <w:rPr>
@@ -534,7 +528,6 @@
         </w:p>
         <w:p>
           <w:pPr>
-            <w:pStyle w:val="TM2"/>
             <w:tabs>
               <w:tab w:val="right" w:leader="dot" w:pos="9628"/>
             </w:tabs>
@@ -542,7 +535,7 @@
               <w:noProof/>
             </w:rPr>
           </w:pPr>
-          <w:hyperlink w:anchor="_Toc243470734" w:history="1">
+          <w:hyperlink w:anchor="_Toc243477395" w:history="1">
             <w:r>
               <w:rPr>
                 <w:rStyle w:val="Lienhypertexte"/>
@@ -566,7 +559,7 @@
               <w:rPr>
                 <w:noProof/>
               </w:rPr>
-              <w:instrText xml:space="preserve"> PAGEREF _Toc243470734 \h </w:instrText>
+              <w:instrText xml:space="preserve"> PAGEREF _Toc243477395 \h </w:instrText>
             </w:r>
             <w:r>
               <w:rPr>
@@ -595,7 +588,6 @@
         </w:p>
         <w:p>
           <w:pPr>
-            <w:pStyle w:val="TM2"/>
             <w:tabs>
               <w:tab w:val="right" w:leader="dot" w:pos="9628"/>
             </w:tabs>
@@ -603,7 +595,7 @@
               <w:noProof/>
             </w:rPr>
           </w:pPr>
-          <w:hyperlink w:anchor="_Toc243470735" w:history="1">
+          <w:hyperlink w:anchor="_Toc243477396" w:history="1">
             <w:r>
               <w:rPr>
                 <w:rStyle w:val="Lienhypertexte"/>
@@ -627,7 +619,7 @@
               <w:rPr>
                 <w:noProof/>
               </w:rPr>
-              <w:instrText xml:space="preserve"> PAGEREF _Toc243470735 \h </w:instrText>
+              <w:instrText xml:space="preserve"> PAGEREF _Toc243477396 \h </w:instrText>
             </w:r>
             <w:r>
               <w:rPr>
@@ -656,7 +648,6 @@
         </w:p>
         <w:p>
           <w:pPr>
-            <w:pStyle w:val="TM2"/>
             <w:tabs>
               <w:tab w:val="right" w:leader="dot" w:pos="9628"/>
             </w:tabs>
@@ -664,7 +655,7 @@
               <w:noProof/>
             </w:rPr>
           </w:pPr>
-          <w:hyperlink w:anchor="_Toc243470736" w:history="1">
+          <w:hyperlink w:anchor="_Toc243477397" w:history="1">
             <w:r>
               <w:rPr>
                 <w:rStyle w:val="Lienhypertexte"/>
@@ -688,7 +679,7 @@
               <w:rPr>
                 <w:noProof/>
               </w:rPr>
-              <w:instrText xml:space="preserve"> PAGEREF _Toc243470736 \h </w:instrText>
+              <w:instrText xml:space="preserve"> PAGEREF _Toc243477397 \h </w:instrText>
             </w:r>
             <w:r>
               <w:rPr>
@@ -717,7 +708,6 @@
         </w:p>
         <w:p>
           <w:pPr>
-            <w:pStyle w:val="TM2"/>
             <w:tabs>
               <w:tab w:val="right" w:leader="dot" w:pos="9628"/>
             </w:tabs>
@@ -725,7 +715,7 @@
               <w:noProof/>
             </w:rPr>
           </w:pPr>
-          <w:hyperlink w:anchor="_Toc243470737" w:history="1">
+          <w:hyperlink w:anchor="_Toc243477398" w:history="1">
             <w:r>
               <w:rPr>
                 <w:rStyle w:val="Lienhypertexte"/>
@@ -749,7 +739,7 @@
               <w:rPr>
                 <w:noProof/>
               </w:rPr>
-              <w:instrText xml:space="preserve"> PAGEREF _Toc243470737 \h </w:instrText>
+              <w:instrText xml:space="preserve"> PAGEREF _Toc243477398 \h </w:instrText>
             </w:r>
             <w:r>
               <w:rPr>
@@ -778,7 +768,6 @@
         </w:p>
         <w:p>
           <w:pPr>
-            <w:pStyle w:val="TM2"/>
             <w:tabs>
               <w:tab w:val="right" w:leader="dot" w:pos="9628"/>
             </w:tabs>
@@ -786,7 +775,7 @@
               <w:noProof/>
             </w:rPr>
           </w:pPr>
-          <w:hyperlink w:anchor="_Toc243470738" w:history="1">
+          <w:hyperlink w:anchor="_Toc243477399" w:history="1">
             <w:r>
               <w:rPr>
                 <w:rStyle w:val="Lienhypertexte"/>
@@ -810,7 +799,7 @@
               <w:rPr>
                 <w:noProof/>
               </w:rPr>
-              <w:instrText xml:space="preserve"> PAGEREF _Toc243470738 \h </w:instrText>
+              <w:instrText xml:space="preserve"> PAGEREF _Toc243477399 \h </w:instrText>
             </w:r>
             <w:r>
               <w:rPr>
@@ -839,7 +828,6 @@
         </w:p>
         <w:p>
           <w:pPr>
-            <w:pStyle w:val="TM2"/>
             <w:tabs>
               <w:tab w:val="right" w:leader="dot" w:pos="9628"/>
             </w:tabs>
@@ -847,7 +835,7 @@
               <w:noProof/>
             </w:rPr>
           </w:pPr>
-          <w:hyperlink w:anchor="_Toc243470739" w:history="1">
+          <w:hyperlink w:anchor="_Toc243477400" w:history="1">
             <w:r>
               <w:rPr>
                 <w:rStyle w:val="Lienhypertexte"/>
@@ -871,7 +859,7 @@
               <w:rPr>
                 <w:noProof/>
               </w:rPr>
-              <w:instrText xml:space="preserve"> PAGEREF _Toc243470739 \h </w:instrText>
+              <w:instrText xml:space="preserve"> PAGEREF _Toc243477400 \h </w:instrText>
             </w:r>
             <w:r>
               <w:rPr>
@@ -900,7 +888,6 @@
         </w:p>
         <w:p>
           <w:pPr>
-            <w:pStyle w:val="TM2"/>
             <w:tabs>
               <w:tab w:val="right" w:leader="dot" w:pos="9628"/>
             </w:tabs>
@@ -908,7 +895,7 @@
               <w:noProof/>
             </w:rPr>
           </w:pPr>
-          <w:hyperlink w:anchor="_Toc243470740" w:history="1">
+          <w:hyperlink w:anchor="_Toc243477401" w:history="1">
             <w:r>
               <w:rPr>
                 <w:rStyle w:val="Lienhypertexte"/>
@@ -932,7 +919,7 @@
               <w:rPr>
                 <w:noProof/>
               </w:rPr>
-              <w:instrText xml:space="preserve"> PAGEREF _Toc243470740 \h </w:instrText>
+              <w:instrText xml:space="preserve"> PAGEREF _Toc243477401 \h </w:instrText>
             </w:r>
             <w:r>
               <w:rPr>
@@ -961,7 +948,6 @@
         </w:p>
         <w:p>
           <w:pPr>
-            <w:pStyle w:val="TM2"/>
             <w:tabs>
               <w:tab w:val="right" w:leader="dot" w:pos="9628"/>
             </w:tabs>
@@ -969,7 +955,7 @@
               <w:noProof/>
             </w:rPr>
           </w:pPr>
-          <w:hyperlink w:anchor="_Toc243470741" w:history="1">
+          <w:hyperlink w:anchor="_Toc243477402" w:history="1">
             <w:r>
               <w:rPr>
                 <w:rStyle w:val="Lienhypertexte"/>
@@ -993,7 +979,7 @@
               <w:rPr>
                 <w:noProof/>
               </w:rPr>
-              <w:instrText xml:space="preserve"> PAGEREF _Toc243470741 \h </w:instrText>
+              <w:instrText xml:space="preserve"> PAGEREF _Toc243477402 \h </w:instrText>
             </w:r>
             <w:r>
               <w:rPr>
@@ -1022,7 +1008,6 @@
         </w:p>
         <w:p>
           <w:pPr>
-            <w:pStyle w:val="TM2"/>
             <w:tabs>
               <w:tab w:val="right" w:leader="dot" w:pos="9628"/>
             </w:tabs>
@@ -1030,7 +1015,7 @@
               <w:noProof/>
             </w:rPr>
           </w:pPr>
-          <w:hyperlink w:anchor="_Toc243470742" w:history="1">
+          <w:hyperlink w:anchor="_Toc243477403" w:history="1">
             <w:r>
               <w:rPr>
                 <w:rStyle w:val="Lienhypertexte"/>
@@ -1054,7 +1039,7 @@
               <w:rPr>
                 <w:noProof/>
               </w:rPr>
-              <w:instrText xml:space="preserve"> PAGEREF _Toc243470742 \h </w:instrText>
+              <w:instrText xml:space="preserve"> PAGEREF _Toc243477403 \h </w:instrText>
             </w:r>
             <w:r>
               <w:rPr>
@@ -1083,7 +1068,6 @@
         </w:p>
         <w:p>
           <w:pPr>
-            <w:pStyle w:val="TM2"/>
             <w:tabs>
               <w:tab w:val="right" w:leader="dot" w:pos="9628"/>
             </w:tabs>
@@ -1091,7 +1075,7 @@
               <w:noProof/>
             </w:rPr>
           </w:pPr>
-          <w:hyperlink w:anchor="_Toc243470743" w:history="1">
+          <w:hyperlink w:anchor="_Toc243477404" w:history="1">
             <w:r>
               <w:rPr>
                 <w:rStyle w:val="Lienhypertexte"/>
@@ -1115,7 +1099,7 @@
               <w:rPr>
                 <w:noProof/>
               </w:rPr>
-              <w:instrText xml:space="preserve"> PAGEREF _Toc243470743 \h </w:instrText>
+              <w:instrText xml:space="preserve"> PAGEREF _Toc243477404 \h </w:instrText>
             </w:r>
             <w:r>
               <w:rPr>
@@ -1144,7 +1128,6 @@
         </w:p>
         <w:p>
           <w:pPr>
-            <w:pStyle w:val="TM2"/>
             <w:tabs>
               <w:tab w:val="right" w:leader="dot" w:pos="9628"/>
             </w:tabs>
@@ -1152,7 +1135,7 @@
               <w:noProof/>
             </w:rPr>
           </w:pPr>
-          <w:hyperlink w:anchor="_Toc243470744" w:history="1">
+          <w:hyperlink w:anchor="_Toc243477405" w:history="1">
             <w:r>
               <w:rPr>
                 <w:rStyle w:val="Lienhypertexte"/>
@@ -1176,7 +1159,7 @@
               <w:rPr>
                 <w:noProof/>
               </w:rPr>
-              <w:instrText xml:space="preserve"> PAGEREF _Toc243470744 \h </w:instrText>
+              <w:instrText xml:space="preserve"> PAGEREF _Toc243477405 \h </w:instrText>
             </w:r>
             <w:r>
               <w:rPr>
@@ -1205,7 +1188,6 @@
         </w:p>
         <w:p>
           <w:pPr>
-            <w:pStyle w:val="TM2"/>
             <w:tabs>
               <w:tab w:val="right" w:leader="dot" w:pos="9628"/>
             </w:tabs>
@@ -1213,7 +1195,7 @@
               <w:noProof/>
             </w:rPr>
           </w:pPr>
-          <w:hyperlink w:anchor="_Toc243470745" w:history="1">
+          <w:hyperlink w:anchor="_Toc243477406" w:history="1">
             <w:r>
               <w:rPr>
                 <w:rStyle w:val="Lienhypertexte"/>
@@ -1237,7 +1219,7 @@
               <w:rPr>
                 <w:noProof/>
               </w:rPr>
-              <w:instrText xml:space="preserve"> PAGEREF _Toc243470745 \h </w:instrText>
+              <w:instrText xml:space="preserve"> PAGEREF _Toc243477406 \h </w:instrText>
             </w:r>
             <w:r>
               <w:rPr>
@@ -1266,7 +1248,6 @@
         </w:p>
         <w:p>
           <w:pPr>
-            <w:pStyle w:val="TM2"/>
             <w:tabs>
               <w:tab w:val="right" w:leader="dot" w:pos="9628"/>
             </w:tabs>
@@ -1274,7 +1255,7 @@
               <w:noProof/>
             </w:rPr>
           </w:pPr>
-          <w:hyperlink w:anchor="_Toc243470746" w:history="1">
+          <w:hyperlink w:anchor="_Toc243477407" w:history="1">
             <w:r>
               <w:rPr>
                 <w:rStyle w:val="Lienhypertexte"/>
@@ -1298,7 +1279,7 @@
               <w:rPr>
                 <w:noProof/>
               </w:rPr>
-              <w:instrText xml:space="preserve"> PAGEREF _Toc243470746 \h </w:instrText>
+              <w:instrText xml:space="preserve"> PAGEREF _Toc243477407 \h </w:instrText>
             </w:r>
             <w:r>
               <w:rPr>
@@ -1327,7 +1308,6 @@
         </w:p>
         <w:p>
           <w:pPr>
-            <w:pStyle w:val="TM2"/>
             <w:tabs>
               <w:tab w:val="right" w:leader="dot" w:pos="9628"/>
             </w:tabs>
@@ -1335,7 +1315,7 @@
               <w:noProof/>
             </w:rPr>
           </w:pPr>
-          <w:hyperlink w:anchor="_Toc243470747" w:history="1">
+          <w:hyperlink w:anchor="_Toc243477408" w:history="1">
             <w:r>
               <w:rPr>
                 <w:rStyle w:val="Lienhypertexte"/>
@@ -1359,7 +1339,7 @@
               <w:rPr>
                 <w:noProof/>
               </w:rPr>
-              <w:instrText xml:space="preserve"> PAGEREF _Toc243470747 \h </w:instrText>
+              <w:instrText xml:space="preserve"> PAGEREF _Toc243477408 \h </w:instrText>
             </w:r>
             <w:r>
               <w:rPr>
@@ -1388,7 +1368,6 @@
         </w:p>
         <w:p>
           <w:pPr>
-            <w:pStyle w:val="TM1"/>
             <w:tabs>
               <w:tab w:val="right" w:leader="dot" w:pos="9628"/>
             </w:tabs>
@@ -1396,7 +1375,7 @@
               <w:noProof/>
             </w:rPr>
           </w:pPr>
-          <w:hyperlink w:anchor="_Toc243470748" w:history="1">
+          <w:hyperlink w:anchor="_Toc243477409" w:history="1">
             <w:r>
               <w:rPr>
                 <w:rStyle w:val="Lienhypertexte"/>
@@ -1420,7 +1399,7 @@
               <w:rPr>
                 <w:noProof/>
               </w:rPr>
-              <w:instrText xml:space="preserve"> PAGEREF _Toc243470748 \h </w:instrText>
+              <w:instrText xml:space="preserve"> PAGEREF _Toc243477409 \h </w:instrText>
             </w:r>
             <w:r>
               <w:rPr>
@@ -1449,7 +1428,6 @@
         </w:p>
         <w:p>
           <w:pPr>
-            <w:pStyle w:val="TM2"/>
             <w:tabs>
               <w:tab w:val="right" w:leader="dot" w:pos="9628"/>
             </w:tabs>
@@ -1457,7 +1435,7 @@
               <w:noProof/>
             </w:rPr>
           </w:pPr>
-          <w:hyperlink w:anchor="_Toc243470749" w:history="1">
+          <w:hyperlink w:anchor="_Toc243477410" w:history="1">
             <w:r>
               <w:rPr>
                 <w:rStyle w:val="Lienhypertexte"/>
@@ -1481,7 +1459,7 @@
               <w:rPr>
                 <w:noProof/>
               </w:rPr>
-              <w:instrText xml:space="preserve"> PAGEREF _Toc243470749 \h </w:instrText>
+              <w:instrText xml:space="preserve"> PAGEREF _Toc243477410 \h </w:instrText>
             </w:r>
             <w:r>
               <w:rPr>
@@ -1510,7 +1488,6 @@
         </w:p>
         <w:p>
           <w:pPr>
-            <w:pStyle w:val="TM2"/>
             <w:tabs>
               <w:tab w:val="right" w:leader="dot" w:pos="9628"/>
             </w:tabs>
@@ -1518,7 +1495,7 @@
               <w:noProof/>
             </w:rPr>
           </w:pPr>
-          <w:hyperlink w:anchor="_Toc243470750" w:history="1">
+          <w:hyperlink w:anchor="_Toc243477411" w:history="1">
             <w:r>
               <w:rPr>
                 <w:rStyle w:val="Lienhypertexte"/>
@@ -1542,7 +1519,7 @@
               <w:rPr>
                 <w:noProof/>
               </w:rPr>
-              <w:instrText xml:space="preserve"> PAGEREF _Toc243470750 \h </w:instrText>
+              <w:instrText xml:space="preserve"> PAGEREF _Toc243477411 \h </w:instrText>
             </w:r>
             <w:r>
               <w:rPr>
@@ -1571,7 +1548,6 @@
         </w:p>
         <w:p>
           <w:pPr>
-            <w:pStyle w:val="TM2"/>
             <w:tabs>
               <w:tab w:val="right" w:leader="dot" w:pos="9628"/>
             </w:tabs>
@@ -1579,7 +1555,7 @@
               <w:noProof/>
             </w:rPr>
           </w:pPr>
-          <w:hyperlink w:anchor="_Toc243470751" w:history="1">
+          <w:hyperlink w:anchor="_Toc243477412" w:history="1">
             <w:r>
               <w:rPr>
                 <w:rStyle w:val="Lienhypertexte"/>
@@ -1603,7 +1579,7 @@
               <w:rPr>
                 <w:noProof/>
               </w:rPr>
-              <w:instrText xml:space="preserve"> PAGEREF _Toc243470751 \h </w:instrText>
+              <w:instrText xml:space="preserve"> PAGEREF _Toc243477412 \h </w:instrText>
             </w:r>
             <w:r>
               <w:rPr>
@@ -1632,7 +1608,6 @@
         </w:p>
         <w:p>
           <w:pPr>
-            <w:pStyle w:val="TM1"/>
             <w:tabs>
               <w:tab w:val="right" w:leader="dot" w:pos="9628"/>
             </w:tabs>
@@ -1640,7 +1615,7 @@
               <w:noProof/>
             </w:rPr>
           </w:pPr>
-          <w:hyperlink w:anchor="_Toc243470752" w:history="1">
+          <w:hyperlink w:anchor="_Toc243477413" w:history="1">
             <w:r>
               <w:rPr>
                 <w:rStyle w:val="Lienhypertexte"/>
@@ -1664,7 +1639,7 @@
               <w:rPr>
                 <w:noProof/>
               </w:rPr>
-              <w:instrText xml:space="preserve"> PAGEREF _Toc243470752 \h </w:instrText>
+              <w:instrText xml:space="preserve"> PAGEREF _Toc243477413 \h </w:instrText>
             </w:r>
             <w:r>
               <w:rPr>
@@ -1693,7 +1668,6 @@
         </w:p>
         <w:p>
           <w:pPr>
-            <w:pStyle w:val="TM2"/>
             <w:tabs>
               <w:tab w:val="right" w:leader="dot" w:pos="9628"/>
             </w:tabs>
@@ -1701,7 +1675,7 @@
               <w:noProof/>
             </w:rPr>
           </w:pPr>
-          <w:hyperlink w:anchor="_Toc243470753" w:history="1">
+          <w:hyperlink w:anchor="_Toc243477414" w:history="1">
             <w:r>
               <w:rPr>
                 <w:rStyle w:val="Lienhypertexte"/>
@@ -1725,7 +1699,7 @@
               <w:rPr>
                 <w:noProof/>
               </w:rPr>
-              <w:instrText xml:space="preserve"> PAGEREF _Toc243470753 \h </w:instrText>
+              <w:instrText xml:space="preserve"> PAGEREF _Toc243477414 \h </w:instrText>
             </w:r>
             <w:r>
               <w:rPr>
@@ -1754,7 +1728,6 @@
         </w:p>
         <w:p>
           <w:pPr>
-            <w:pStyle w:val="TM2"/>
             <w:tabs>
               <w:tab w:val="right" w:leader="dot" w:pos="9628"/>
             </w:tabs>
@@ -1762,7 +1735,7 @@
               <w:noProof/>
             </w:rPr>
           </w:pPr>
-          <w:hyperlink w:anchor="_Toc243470754" w:history="1">
+          <w:hyperlink w:anchor="_Toc243477415" w:history="1">
             <w:r>
               <w:rPr>
                 <w:rStyle w:val="Lienhypertexte"/>
@@ -1786,7 +1759,7 @@
               <w:rPr>
                 <w:noProof/>
               </w:rPr>
-              <w:instrText xml:space="preserve"> PAGEREF _Toc243470754 \h </w:instrText>
+              <w:instrText xml:space="preserve"> PAGEREF _Toc243477415 \h </w:instrText>
             </w:r>
             <w:r>
               <w:rPr>
@@ -1815,7 +1788,6 @@
         </w:p>
         <w:p>
           <w:pPr>
-            <w:pStyle w:val="TM2"/>
             <w:tabs>
               <w:tab w:val="right" w:leader="dot" w:pos="9628"/>
             </w:tabs>
@@ -1823,7 +1795,7 @@
               <w:noProof/>
             </w:rPr>
           </w:pPr>
-          <w:hyperlink w:anchor="_Toc243470755" w:history="1">
+          <w:hyperlink w:anchor="_Toc243477416" w:history="1">
             <w:r>
               <w:rPr>
                 <w:rStyle w:val="Lienhypertexte"/>
@@ -1847,7 +1819,7 @@
               <w:rPr>
                 <w:noProof/>
               </w:rPr>
-              <w:instrText xml:space="preserve"> PAGEREF _Toc243470755 \h </w:instrText>
+              <w:instrText xml:space="preserve"> PAGEREF _Toc243477416 \h </w:instrText>
             </w:r>
             <w:r>
               <w:rPr>
@@ -1876,7 +1848,6 @@
         </w:p>
         <w:p>
           <w:pPr>
-            <w:pStyle w:val="TM2"/>
             <w:tabs>
               <w:tab w:val="right" w:leader="dot" w:pos="9628"/>
             </w:tabs>
@@ -1884,7 +1855,7 @@
               <w:noProof/>
             </w:rPr>
           </w:pPr>
-          <w:hyperlink w:anchor="_Toc243470756" w:history="1">
+          <w:hyperlink w:anchor="_Toc243477417" w:history="1">
             <w:r>
               <w:rPr>
                 <w:rStyle w:val="Lienhypertexte"/>
@@ -1908,7 +1879,7 @@
               <w:rPr>
                 <w:noProof/>
               </w:rPr>
-              <w:instrText xml:space="preserve"> PAGEREF _Toc243470756 \h </w:instrText>
+              <w:instrText xml:space="preserve"> PAGEREF _Toc243477417 \h </w:instrText>
             </w:r>
             <w:r>
               <w:rPr>
@@ -1937,7 +1908,6 @@
         </w:p>
         <w:p>
           <w:pPr>
-            <w:pStyle w:val="TM1"/>
             <w:tabs>
               <w:tab w:val="right" w:leader="dot" w:pos="9628"/>
             </w:tabs>
@@ -1945,7 +1915,7 @@
               <w:noProof/>
             </w:rPr>
           </w:pPr>
-          <w:hyperlink w:anchor="_Toc243470757" w:history="1">
+          <w:hyperlink w:anchor="_Toc243477418" w:history="1">
             <w:r>
               <w:rPr>
                 <w:rStyle w:val="Lienhypertexte"/>
@@ -1969,7 +1939,7 @@
               <w:rPr>
                 <w:noProof/>
               </w:rPr>
-              <w:instrText xml:space="preserve"> PAGEREF _Toc243470757 \h </w:instrText>
+              <w:instrText xml:space="preserve"> PAGEREF _Toc243477418 \h </w:instrText>
             </w:r>
             <w:r>
               <w:rPr>
@@ -1998,7 +1968,6 @@
         </w:p>
         <w:p>
           <w:pPr>
-            <w:pStyle w:val="TM2"/>
             <w:tabs>
               <w:tab w:val="right" w:leader="dot" w:pos="9628"/>
             </w:tabs>
@@ -2006,7 +1975,7 @@
               <w:noProof/>
             </w:rPr>
           </w:pPr>
-          <w:hyperlink w:anchor="_Toc243470758" w:history="1">
+          <w:hyperlink w:anchor="_Toc243477419" w:history="1">
             <w:r>
               <w:rPr>
                 <w:rStyle w:val="Lienhypertexte"/>
@@ -2030,7 +1999,7 @@
               <w:rPr>
                 <w:noProof/>
               </w:rPr>
-              <w:instrText xml:space="preserve"> PAGEREF _Toc243470758 \h </w:instrText>
+              <w:instrText xml:space="preserve"> PAGEREF _Toc243477419 \h </w:instrText>
             </w:r>
             <w:r>
               <w:rPr>
@@ -2059,7 +2028,6 @@
         </w:p>
         <w:p>
           <w:pPr>
-            <w:pStyle w:val="TM2"/>
             <w:tabs>
               <w:tab w:val="right" w:leader="dot" w:pos="9628"/>
             </w:tabs>
@@ -2067,7 +2035,7 @@
               <w:noProof/>
             </w:rPr>
           </w:pPr>
-          <w:hyperlink w:anchor="_Toc243470759" w:history="1">
+          <w:hyperlink w:anchor="_Toc243477420" w:history="1">
             <w:r>
               <w:rPr>
                 <w:rStyle w:val="Lienhypertexte"/>
@@ -2091,7 +2059,7 @@
               <w:rPr>
                 <w:noProof/>
               </w:rPr>
-              <w:instrText xml:space="preserve"> PAGEREF _Toc243470759 \h </w:instrText>
+              <w:instrText xml:space="preserve"> PAGEREF _Toc243477420 \h </w:instrText>
             </w:r>
             <w:r>
               <w:rPr>
@@ -2120,7 +2088,6 @@
         </w:p>
         <w:p>
           <w:pPr>
-            <w:pStyle w:val="TM2"/>
             <w:tabs>
               <w:tab w:val="right" w:leader="dot" w:pos="9628"/>
             </w:tabs>
@@ -2128,7 +2095,7 @@
               <w:noProof/>
             </w:rPr>
           </w:pPr>
-          <w:hyperlink w:anchor="_Toc243470760" w:history="1">
+          <w:hyperlink w:anchor="_Toc243477421" w:history="1">
             <w:r>
               <w:rPr>
                 <w:rStyle w:val="Lienhypertexte"/>
@@ -2152,7 +2119,7 @@
               <w:rPr>
                 <w:noProof/>
               </w:rPr>
-              <w:instrText xml:space="preserve"> PAGEREF _Toc243470760 \h </w:instrText>
+              <w:instrText xml:space="preserve"> PAGEREF _Toc243477421 \h </w:instrText>
             </w:r>
             <w:r>
               <w:rPr>
@@ -2181,7 +2148,6 @@
         </w:p>
         <w:p>
           <w:pPr>
-            <w:pStyle w:val="TM1"/>
             <w:tabs>
               <w:tab w:val="right" w:leader="dot" w:pos="9628"/>
             </w:tabs>
@@ -2189,7 +2155,7 @@
               <w:noProof/>
             </w:rPr>
           </w:pPr>
-          <w:hyperlink w:anchor="_Toc243470761" w:history="1">
+          <w:hyperlink w:anchor="_Toc243477422" w:history="1">
             <w:r>
               <w:rPr>
                 <w:rStyle w:val="Lienhypertexte"/>
@@ -2213,7 +2179,7 @@
               <w:rPr>
                 <w:noProof/>
               </w:rPr>
-              <w:instrText xml:space="preserve"> PAGEREF _Toc243470761 \h </w:instrText>
+              <w:instrText xml:space="preserve"> PAGEREF _Toc243477422 \h </w:instrText>
             </w:r>
             <w:r>
               <w:rPr>
@@ -2242,7 +2208,6 @@
         </w:p>
         <w:p>
           <w:pPr>
-            <w:pStyle w:val="TM2"/>
             <w:tabs>
               <w:tab w:val="right" w:leader="dot" w:pos="9628"/>
             </w:tabs>
@@ -2250,7 +2215,7 @@
               <w:noProof/>
             </w:rPr>
           </w:pPr>
-          <w:hyperlink w:anchor="_Toc243470762" w:history="1">
+          <w:hyperlink w:anchor="_Toc243477423" w:history="1">
             <w:r>
               <w:rPr>
                 <w:rStyle w:val="Lienhypertexte"/>
@@ -2274,7 +2239,7 @@
               <w:rPr>
                 <w:noProof/>
               </w:rPr>
-              <w:instrText xml:space="preserve"> PAGEREF _Toc243470762 \h </w:instrText>
+              <w:instrText xml:space="preserve"> PAGEREF _Toc243477423 \h </w:instrText>
             </w:r>
             <w:r>
               <w:rPr>
@@ -2303,7 +2268,6 @@
         </w:p>
         <w:p>
           <w:pPr>
-            <w:pStyle w:val="TM1"/>
             <w:tabs>
               <w:tab w:val="right" w:leader="dot" w:pos="9628"/>
             </w:tabs>
@@ -2311,7 +2275,7 @@
               <w:noProof/>
             </w:rPr>
           </w:pPr>
-          <w:hyperlink w:anchor="_Toc243470763" w:history="1">
+          <w:hyperlink w:anchor="_Toc243477424" w:history="1">
             <w:r>
               <w:rPr>
                 <w:rStyle w:val="Lienhypertexte"/>
@@ -2335,7 +2299,7 @@
               <w:rPr>
                 <w:noProof/>
               </w:rPr>
-              <w:instrText xml:space="preserve"> PAGEREF _Toc243470763 \h </w:instrText>
+              <w:instrText xml:space="preserve"> PAGEREF _Toc243477424 \h </w:instrText>
             </w:r>
             <w:r>
               <w:rPr>
@@ -2364,7 +2328,6 @@
         </w:p>
         <w:p>
           <w:pPr>
-            <w:pStyle w:val="TM2"/>
             <w:tabs>
               <w:tab w:val="right" w:leader="dot" w:pos="9628"/>
             </w:tabs>
@@ -2372,7 +2335,7 @@
               <w:noProof/>
             </w:rPr>
           </w:pPr>
-          <w:hyperlink w:anchor="_Toc243470764" w:history="1">
+          <w:hyperlink w:anchor="_Toc243477425" w:history="1">
             <w:r>
               <w:rPr>
                 <w:rStyle w:val="Lienhypertexte"/>
@@ -2396,7 +2359,7 @@
               <w:rPr>
                 <w:noProof/>
               </w:rPr>
-              <w:instrText xml:space="preserve"> PAGEREF _Toc243470764 \h </w:instrText>
+              <w:instrText xml:space="preserve"> PAGEREF _Toc243477425 \h </w:instrText>
             </w:r>
             <w:r>
               <w:rPr>
@@ -2425,7 +2388,6 @@
         </w:p>
         <w:p>
           <w:pPr>
-            <w:pStyle w:val="TM2"/>
             <w:tabs>
               <w:tab w:val="right" w:leader="dot" w:pos="9628"/>
             </w:tabs>
@@ -2433,7 +2395,7 @@
               <w:noProof/>
             </w:rPr>
           </w:pPr>
-          <w:hyperlink w:anchor="_Toc243470765" w:history="1">
+          <w:hyperlink w:anchor="_Toc243477426" w:history="1">
             <w:r>
               <w:rPr>
                 <w:rStyle w:val="Lienhypertexte"/>
@@ -2457,7 +2419,7 @@
               <w:rPr>
                 <w:noProof/>
               </w:rPr>
-              <w:instrText xml:space="preserve"> PAGEREF _Toc243470765 \h </w:instrText>
+              <w:instrText xml:space="preserve"> PAGEREF _Toc243477426 \h </w:instrText>
             </w:r>
             <w:r>
               <w:rPr>
@@ -2486,7 +2448,6 @@
         </w:p>
         <w:p>
           <w:pPr>
-            <w:pStyle w:val="TM2"/>
             <w:tabs>
               <w:tab w:val="right" w:leader="dot" w:pos="9628"/>
             </w:tabs>
@@ -2494,7 +2455,7 @@
               <w:noProof/>
             </w:rPr>
           </w:pPr>
-          <w:hyperlink w:anchor="_Toc243470766" w:history="1">
+          <w:hyperlink w:anchor="_Toc243477427" w:history="1">
             <w:r>
               <w:rPr>
                 <w:rStyle w:val="Lienhypertexte"/>
@@ -2518,7 +2479,7 @@
               <w:rPr>
                 <w:noProof/>
               </w:rPr>
-              <w:instrText xml:space="preserve"> PAGEREF _Toc243470766 \h </w:instrText>
+              <w:instrText xml:space="preserve"> PAGEREF _Toc243477427 \h </w:instrText>
             </w:r>
             <w:r>
               <w:rPr>
@@ -2547,7 +2508,6 @@
         </w:p>
         <w:p>
           <w:pPr>
-            <w:pStyle w:val="TM2"/>
             <w:tabs>
               <w:tab w:val="right" w:leader="dot" w:pos="9628"/>
             </w:tabs>
@@ -2555,7 +2515,7 @@
               <w:noProof/>
             </w:rPr>
           </w:pPr>
-          <w:hyperlink w:anchor="_Toc243470767" w:history="1">
+          <w:hyperlink w:anchor="_Toc243477428" w:history="1">
             <w:r>
               <w:rPr>
                 <w:rStyle w:val="Lienhypertexte"/>
@@ -2579,7 +2539,7 @@
               <w:rPr>
                 <w:noProof/>
               </w:rPr>
-              <w:instrText xml:space="preserve"> PAGEREF _Toc243470767 \h </w:instrText>
+              <w:instrText xml:space="preserve"> PAGEREF _Toc243477428 \h </w:instrText>
             </w:r>
             <w:r>
               <w:rPr>
@@ -2608,7 +2568,6 @@
         </w:p>
         <w:p>
           <w:pPr>
-            <w:pStyle w:val="TM2"/>
             <w:tabs>
               <w:tab w:val="right" w:leader="dot" w:pos="9628"/>
             </w:tabs>
@@ -2616,7 +2575,7 @@
               <w:noProof/>
             </w:rPr>
           </w:pPr>
-          <w:hyperlink w:anchor="_Toc243470768" w:history="1">
+          <w:hyperlink w:anchor="_Toc243477429" w:history="1">
             <w:r>
               <w:rPr>
                 <w:rStyle w:val="Lienhypertexte"/>
@@ -2640,7 +2599,7 @@
               <w:rPr>
                 <w:noProof/>
               </w:rPr>
-              <w:instrText xml:space="preserve"> PAGEREF _Toc243470768 \h </w:instrText>
+              <w:instrText xml:space="preserve"> PAGEREF _Toc243477429 \h </w:instrText>
             </w:r>
             <w:r>
               <w:rPr>
@@ -2669,7 +2628,6 @@
         </w:p>
         <w:p>
           <w:pPr>
-            <w:pStyle w:val="TM1"/>
             <w:tabs>
               <w:tab w:val="right" w:leader="dot" w:pos="9628"/>
             </w:tabs>
@@ -2677,7 +2635,7 @@
               <w:noProof/>
             </w:rPr>
           </w:pPr>
-          <w:hyperlink w:anchor="_Toc243470769" w:history="1">
+          <w:hyperlink w:anchor="_Toc243477430" w:history="1">
             <w:r>
               <w:rPr>
                 <w:rStyle w:val="Lienhypertexte"/>
@@ -2701,7 +2659,7 @@
               <w:rPr>
                 <w:noProof/>
               </w:rPr>
-              <w:instrText xml:space="preserve"> PAGEREF _Toc243470769 \h </w:instrText>
+              <w:instrText xml:space="preserve"> PAGEREF _Toc243477430 \h </w:instrText>
             </w:r>
             <w:r>
               <w:rPr>
@@ -2730,7 +2688,6 @@
         </w:p>
         <w:p>
           <w:pPr>
-            <w:pStyle w:val="TM2"/>
             <w:tabs>
               <w:tab w:val="right" w:leader="dot" w:pos="9628"/>
             </w:tabs>
@@ -2738,7 +2695,7 @@
               <w:noProof/>
             </w:rPr>
           </w:pPr>
-          <w:hyperlink w:anchor="_Toc243470770" w:history="1">
+          <w:hyperlink w:anchor="_Toc243477431" w:history="1">
             <w:r>
               <w:rPr>
                 <w:rStyle w:val="Lienhypertexte"/>
@@ -2762,7 +2719,7 @@
               <w:rPr>
                 <w:noProof/>
               </w:rPr>
-              <w:instrText xml:space="preserve"> PAGEREF _Toc243470770 \h </w:instrText>
+              <w:instrText xml:space="preserve"> PAGEREF _Toc243477431 \h </w:instrText>
             </w:r>
             <w:r>
               <w:rPr>
@@ -2791,7 +2748,6 @@
         </w:p>
         <w:p>
           <w:pPr>
-            <w:pStyle w:val="TM2"/>
             <w:tabs>
               <w:tab w:val="right" w:leader="dot" w:pos="9628"/>
             </w:tabs>
@@ -2799,7 +2755,7 @@
               <w:noProof/>
             </w:rPr>
           </w:pPr>
-          <w:hyperlink w:anchor="_Toc243470771" w:history="1">
+          <w:hyperlink w:anchor="_Toc243477432" w:history="1">
             <w:r>
               <w:rPr>
                 <w:rStyle w:val="Lienhypertexte"/>
@@ -2823,7 +2779,7 @@
               <w:rPr>
                 <w:noProof/>
               </w:rPr>
-              <w:instrText xml:space="preserve"> PAGEREF _Toc243470771 \h </w:instrText>
+              <w:instrText xml:space="preserve"> PAGEREF _Toc243477432 \h </w:instrText>
             </w:r>
             <w:r>
               <w:rPr>
@@ -2852,7 +2808,6 @@
         </w:p>
         <w:p>
           <w:pPr>
-            <w:pStyle w:val="TM2"/>
             <w:tabs>
               <w:tab w:val="right" w:leader="dot" w:pos="9628"/>
             </w:tabs>
@@ -2860,7 +2815,7 @@
               <w:noProof/>
             </w:rPr>
           </w:pPr>
-          <w:hyperlink w:anchor="_Toc243470772" w:history="1">
+          <w:hyperlink w:anchor="_Toc243477433" w:history="1">
             <w:r>
               <w:rPr>
                 <w:rStyle w:val="Lienhypertexte"/>
@@ -2884,7 +2839,7 @@
               <w:rPr>
                 <w:noProof/>
               </w:rPr>
-              <w:instrText xml:space="preserve"> PAGEREF _Toc243470772 \h </w:instrText>
+              <w:instrText xml:space="preserve"> PAGEREF _Toc243477433 \h </w:instrText>
             </w:r>
             <w:r>
               <w:rPr>
@@ -2913,7 +2868,6 @@
         </w:p>
         <w:p>
           <w:pPr>
-            <w:pStyle w:val="TM2"/>
             <w:tabs>
               <w:tab w:val="right" w:leader="dot" w:pos="9628"/>
             </w:tabs>
@@ -2921,7 +2875,7 @@
               <w:noProof/>
             </w:rPr>
           </w:pPr>
-          <w:hyperlink w:anchor="_Toc243470773" w:history="1">
+          <w:hyperlink w:anchor="_Toc243477434" w:history="1">
             <w:r>
               <w:rPr>
                 <w:rStyle w:val="Lienhypertexte"/>
@@ -2945,7 +2899,7 @@
               <w:rPr>
                 <w:noProof/>
               </w:rPr>
-              <w:instrText xml:space="preserve"> PAGEREF _Toc243470773 \h </w:instrText>
+              <w:instrText xml:space="preserve"> PAGEREF _Toc243477434 \h </w:instrText>
             </w:r>
             <w:r>
               <w:rPr>
@@ -2974,7 +2928,6 @@
         </w:p>
         <w:p>
           <w:pPr>
-            <w:pStyle w:val="TM2"/>
             <w:tabs>
               <w:tab w:val="right" w:leader="dot" w:pos="9628"/>
             </w:tabs>
@@ -2982,7 +2935,7 @@
               <w:noProof/>
             </w:rPr>
           </w:pPr>
-          <w:hyperlink w:anchor="_Toc243470774" w:history="1">
+          <w:hyperlink w:anchor="_Toc243477435" w:history="1">
             <w:r>
               <w:rPr>
                 <w:rStyle w:val="Lienhypertexte"/>
@@ -3006,7 +2959,7 @@
               <w:rPr>
                 <w:noProof/>
               </w:rPr>
-              <w:instrText xml:space="preserve"> PAGEREF _Toc243470774 \h </w:instrText>
+              <w:instrText xml:space="preserve"> PAGEREF _Toc243477435 \h </w:instrText>
             </w:r>
             <w:r>
               <w:rPr>
@@ -3035,7 +2988,6 @@
         </w:p>
         <w:p>
           <w:pPr>
-            <w:pStyle w:val="TM2"/>
             <w:tabs>
               <w:tab w:val="right" w:leader="dot" w:pos="9628"/>
             </w:tabs>
@@ -3043,7 +2995,7 @@
               <w:noProof/>
             </w:rPr>
           </w:pPr>
-          <w:hyperlink w:anchor="_Toc243470775" w:history="1">
+          <w:hyperlink w:anchor="_Toc243477436" w:history="1">
             <w:r>
               <w:rPr>
                 <w:rStyle w:val="Lienhypertexte"/>
@@ -3067,7 +3019,7 @@
               <w:rPr>
                 <w:noProof/>
               </w:rPr>
-              <w:instrText xml:space="preserve"> PAGEREF _Toc243470775 \h </w:instrText>
+              <w:instrText xml:space="preserve"> PAGEREF _Toc243477436 \h </w:instrText>
             </w:r>
             <w:r>
               <w:rPr>
@@ -3096,7 +3048,6 @@
         </w:p>
         <w:p>
           <w:pPr>
-            <w:pStyle w:val="TM1"/>
             <w:tabs>
               <w:tab w:val="right" w:leader="dot" w:pos="9628"/>
             </w:tabs>
@@ -3104,7 +3055,7 @@
               <w:noProof/>
             </w:rPr>
           </w:pPr>
-          <w:hyperlink w:anchor="_Toc243470776" w:history="1">
+          <w:hyperlink w:anchor="_Toc243477437" w:history="1">
             <w:r>
               <w:rPr>
                 <w:rStyle w:val="Lienhypertexte"/>
@@ -3128,7 +3079,7 @@
               <w:rPr>
                 <w:noProof/>
               </w:rPr>
-              <w:instrText xml:space="preserve"> PAGEREF _Toc243470776 \h </w:instrText>
+              <w:instrText xml:space="preserve"> PAGEREF _Toc243477437 \h </w:instrText>
             </w:r>
             <w:r>
               <w:rPr>
@@ -3157,7 +3108,6 @@
         </w:p>
         <w:p>
           <w:pPr>
-            <w:pStyle w:val="TM1"/>
             <w:tabs>
               <w:tab w:val="right" w:leader="dot" w:pos="9628"/>
             </w:tabs>
@@ -3165,7 +3115,7 @@
               <w:noProof/>
             </w:rPr>
           </w:pPr>
-          <w:hyperlink w:anchor="_Toc243470777" w:history="1">
+          <w:hyperlink w:anchor="_Toc243477438" w:history="1">
             <w:r>
               <w:rPr>
                 <w:rStyle w:val="Lienhypertexte"/>
@@ -3189,7 +3139,7 @@
               <w:rPr>
                 <w:noProof/>
               </w:rPr>
-              <w:instrText xml:space="preserve"> PAGEREF _Toc243470777 \h </w:instrText>
+              <w:instrText xml:space="preserve"> PAGEREF _Toc243477438 \h </w:instrText>
             </w:r>
             <w:r>
               <w:rPr>
@@ -3218,7 +3168,6 @@
         </w:p>
         <w:p>
           <w:pPr>
-            <w:pStyle w:val="TM1"/>
             <w:tabs>
               <w:tab w:val="right" w:leader="dot" w:pos="9628"/>
             </w:tabs>
@@ -3226,7 +3175,7 @@
               <w:noProof/>
             </w:rPr>
           </w:pPr>
-          <w:hyperlink w:anchor="_Toc243470778" w:history="1">
+          <w:hyperlink w:anchor="_Toc243477439" w:history="1">
             <w:r>
               <w:rPr>
                 <w:rStyle w:val="Lienhypertexte"/>
@@ -3250,7 +3199,7 @@
               <w:rPr>
                 <w:noProof/>
               </w:rPr>
-              <w:instrText xml:space="preserve"> PAGEREF _Toc243470778 \h </w:instrText>
+              <w:instrText xml:space="preserve"> PAGEREF _Toc243477439 \h </w:instrText>
             </w:r>
             <w:r>
               <w:rPr>
@@ -3279,7 +3228,6 @@
         </w:p>
         <w:p>
           <w:pPr>
-            <w:pStyle w:val="TM1"/>
             <w:tabs>
               <w:tab w:val="right" w:leader="dot" w:pos="9628"/>
             </w:tabs>
@@ -3287,7 +3235,7 @@
               <w:noProof/>
             </w:rPr>
           </w:pPr>
-          <w:hyperlink w:anchor="_Toc243470779" w:history="1">
+          <w:hyperlink w:anchor="_Toc243477440" w:history="1">
             <w:r>
               <w:rPr>
                 <w:rStyle w:val="Lienhypertexte"/>
@@ -3311,7 +3259,7 @@
               <w:rPr>
                 <w:noProof/>
               </w:rPr>
-              <w:instrText xml:space="preserve"> PAGEREF _Toc243470779 \h </w:instrText>
+              <w:instrText xml:space="preserve"> PAGEREF _Toc243477440 \h </w:instrText>
             </w:r>
             <w:r>
               <w:rPr>
@@ -3340,7 +3288,6 @@
         </w:p>
         <w:p>
           <w:pPr>
-            <w:pStyle w:val="TM2"/>
             <w:tabs>
               <w:tab w:val="right" w:leader="dot" w:pos="9628"/>
             </w:tabs>
@@ -3348,7 +3295,7 @@
               <w:noProof/>
             </w:rPr>
           </w:pPr>
-          <w:hyperlink w:anchor="_Toc243470780" w:history="1">
+          <w:hyperlink w:anchor="_Toc243477441" w:history="1">
             <w:r>
               <w:rPr>
                 <w:rStyle w:val="Lienhypertexte"/>
@@ -3372,7 +3319,7 @@
               <w:rPr>
                 <w:noProof/>
               </w:rPr>
-              <w:instrText xml:space="preserve"> PAGEREF _Toc243470780 \h </w:instrText>
+              <w:instrText xml:space="preserve"> PAGEREF _Toc243477441 \h </w:instrText>
             </w:r>
             <w:r>
               <w:rPr>
@@ -3401,7 +3348,6 @@
         </w:p>
         <w:p>
           <w:pPr>
-            <w:pStyle w:val="TM2"/>
             <w:tabs>
               <w:tab w:val="right" w:leader="dot" w:pos="9628"/>
             </w:tabs>
@@ -3409,7 +3355,7 @@
               <w:noProof/>
             </w:rPr>
           </w:pPr>
-          <w:hyperlink w:anchor="_Toc243470781" w:history="1">
+          <w:hyperlink w:anchor="_Toc243477442" w:history="1">
             <w:r>
               <w:rPr>
                 <w:rStyle w:val="Lienhypertexte"/>
@@ -3433,7 +3379,7 @@
               <w:rPr>
                 <w:noProof/>
               </w:rPr>
-              <w:instrText xml:space="preserve"> PAGEREF _Toc243470781 \h </w:instrText>
+              <w:instrText xml:space="preserve"> PAGEREF _Toc243477442 \h </w:instrText>
             </w:r>
             <w:r>
               <w:rPr>
@@ -3462,7 +3408,6 @@
         </w:p>
         <w:p>
           <w:pPr>
-            <w:pStyle w:val="TM2"/>
             <w:tabs>
               <w:tab w:val="right" w:leader="dot" w:pos="9628"/>
             </w:tabs>
@@ -3470,7 +3415,7 @@
               <w:noProof/>
             </w:rPr>
           </w:pPr>
-          <w:hyperlink w:anchor="_Toc243470782" w:history="1">
+          <w:hyperlink w:anchor="_Toc243477443" w:history="1">
             <w:r>
               <w:rPr>
                 <w:rStyle w:val="Lienhypertexte"/>
@@ -3494,7 +3439,7 @@
               <w:rPr>
                 <w:noProof/>
               </w:rPr>
-              <w:instrText xml:space="preserve"> PAGEREF _Toc243470782 \h </w:instrText>
+              <w:instrText xml:space="preserve"> PAGEREF _Toc243477443 \h </w:instrText>
             </w:r>
             <w:r>
               <w:rPr>
@@ -3523,7 +3468,6 @@
         </w:p>
         <w:p>
           <w:pPr>
-            <w:pStyle w:val="TM2"/>
             <w:tabs>
               <w:tab w:val="right" w:leader="dot" w:pos="9628"/>
             </w:tabs>
@@ -3531,7 +3475,7 @@
               <w:noProof/>
             </w:rPr>
           </w:pPr>
-          <w:hyperlink w:anchor="_Toc243470783" w:history="1">
+          <w:hyperlink w:anchor="_Toc243477444" w:history="1">
             <w:r>
               <w:rPr>
                 <w:rStyle w:val="Lienhypertexte"/>
@@ -3555,7 +3499,7 @@
               <w:rPr>
                 <w:noProof/>
               </w:rPr>
-              <w:instrText xml:space="preserve"> PAGEREF _Toc243470783 \h </w:instrText>
+              <w:instrText xml:space="preserve"> PAGEREF _Toc243477444 \h </w:instrText>
             </w:r>
             <w:r>
               <w:rPr>
@@ -3584,7 +3528,6 @@
         </w:p>
         <w:p>
           <w:pPr>
-            <w:pStyle w:val="TM2"/>
             <w:tabs>
               <w:tab w:val="right" w:leader="dot" w:pos="9628"/>
             </w:tabs>
@@ -3592,7 +3535,7 @@
               <w:noProof/>
             </w:rPr>
           </w:pPr>
-          <w:hyperlink w:anchor="_Toc243470784" w:history="1">
+          <w:hyperlink w:anchor="_Toc243477445" w:history="1">
             <w:r>
               <w:rPr>
                 <w:rStyle w:val="Lienhypertexte"/>
@@ -3616,7 +3559,7 @@
               <w:rPr>
                 <w:noProof/>
               </w:rPr>
-              <w:instrText xml:space="preserve"> PAGEREF _Toc243470784 \h </w:instrText>
+              <w:instrText xml:space="preserve"> PAGEREF _Toc243477445 \h </w:instrText>
             </w:r>
             <w:r>
               <w:rPr>
@@ -3645,7 +3588,6 @@
         </w:p>
         <w:p>
           <w:pPr>
-            <w:pStyle w:val="TM2"/>
             <w:tabs>
               <w:tab w:val="right" w:leader="dot" w:pos="9628"/>
             </w:tabs>
@@ -3653,7 +3595,7 @@
               <w:noProof/>
             </w:rPr>
           </w:pPr>
-          <w:hyperlink w:anchor="_Toc243470785" w:history="1">
+          <w:hyperlink w:anchor="_Toc243477446" w:history="1">
             <w:r>
               <w:rPr>
                 <w:rStyle w:val="Lienhypertexte"/>
@@ -3677,7 +3619,7 @@
               <w:rPr>
                 <w:noProof/>
               </w:rPr>
-              <w:instrText xml:space="preserve"> PAGEREF _Toc243470785 \h </w:instrText>
+              <w:instrText xml:space="preserve"> PAGEREF _Toc243477446 \h </w:instrText>
             </w:r>
             <w:r>
               <w:rPr>
@@ -3706,7 +3648,6 @@
         </w:p>
         <w:p>
           <w:pPr>
-            <w:pStyle w:val="TM1"/>
             <w:tabs>
               <w:tab w:val="right" w:leader="dot" w:pos="9628"/>
             </w:tabs>
@@ -3714,7 +3655,7 @@
               <w:noProof/>
             </w:rPr>
           </w:pPr>
-          <w:hyperlink w:anchor="_Toc243470786" w:history="1">
+          <w:hyperlink w:anchor="_Toc243477447" w:history="1">
             <w:r>
               <w:rPr>
                 <w:rStyle w:val="Lienhypertexte"/>
@@ -3738,7 +3679,7 @@
               <w:rPr>
                 <w:noProof/>
               </w:rPr>
-              <w:instrText xml:space="preserve"> PAGEREF _Toc243470786 \h </w:instrText>
+              <w:instrText xml:space="preserve"> PAGEREF _Toc243477447 \h </w:instrText>
             </w:r>
             <w:r>
               <w:rPr>
@@ -3767,7 +3708,6 @@
         </w:p>
         <w:p>
           <w:pPr>
-            <w:pStyle w:val="TM1"/>
             <w:tabs>
               <w:tab w:val="right" w:leader="dot" w:pos="9628"/>
             </w:tabs>
@@ -3775,7 +3715,7 @@
               <w:noProof/>
             </w:rPr>
           </w:pPr>
-          <w:hyperlink w:anchor="_Toc243470787" w:history="1">
+          <w:hyperlink w:anchor="_Toc243477448" w:history="1">
             <w:r>
               <w:rPr>
                 <w:rStyle w:val="Lienhypertexte"/>
@@ -3799,7 +3739,7 @@
               <w:rPr>
                 <w:noProof/>
               </w:rPr>
-              <w:instrText xml:space="preserve"> PAGEREF _Toc243470787 \h </w:instrText>
+              <w:instrText xml:space="preserve"> PAGEREF _Toc243477448 \h </w:instrText>
             </w:r>
             <w:r>
               <w:rPr>
@@ -3828,7 +3768,6 @@
         </w:p>
         <w:p>
           <w:pPr>
-            <w:pStyle w:val="TM1"/>
             <w:tabs>
               <w:tab w:val="right" w:leader="dot" w:pos="9628"/>
             </w:tabs>
@@ -3836,7 +3775,7 @@
               <w:noProof/>
             </w:rPr>
           </w:pPr>
-          <w:hyperlink w:anchor="_Toc243470788" w:history="1">
+          <w:hyperlink w:anchor="_Toc243477449" w:history="1">
             <w:r>
               <w:rPr>
                 <w:rStyle w:val="Lienhypertexte"/>
@@ -3860,7 +3799,67 @@
               <w:rPr>
                 <w:noProof/>
               </w:rPr>
-              <w:instrText xml:space="preserve"> PAGEREF _Toc243470788 \h </w:instrText>
+              <w:instrText xml:space="preserve"> PAGEREF _Toc243477449 \h </w:instrText>
+            </w:r>
+            <w:r>
+              <w:rPr>
+                <w:noProof/>
+              </w:rPr>
+            </w:r>
+            <w:r>
+              <w:rPr>
+                <w:noProof/>
+              </w:rPr>
+              <w:fldChar w:fldCharType="separate"/>
+            </w:r>
+            <w:r>
+              <w:rPr>
+                <w:noProof/>
+              </w:rPr>
+              <w:t>30</w:t>
+            </w:r>
+            <w:r>
+              <w:rPr>
+                <w:noProof/>
+              </w:rPr>
+              <w:fldChar w:fldCharType="end"/>
+            </w:r>
+          </w:hyperlink>
+        </w:p>
+        <w:p>
+          <w:pPr>
+            <w:tabs>
+              <w:tab w:val="right" w:leader="dot" w:pos="9628"/>
+            </w:tabs>
+            <w:rPr>
+              <w:noProof/>
+            </w:rPr>
+          </w:pPr>
+          <w:hyperlink w:anchor="_Toc243477450" w:history="1">
+            <w:r>
+              <w:rPr>
+                <w:rStyle w:val="Lienhypertexte"/>
+                <w:noProof/>
+              </w:rPr>
+              <w:t>The thread: each result opens the next step</w:t>
+            </w:r>
+            <w:r>
+              <w:rPr>
+                <w:noProof/>
+              </w:rPr>
+              <w:tab/>
+            </w:r>
+            <w:r>
+              <w:rPr>
+                <w:noProof/>
+              </w:rPr>
+              <w:fldChar w:fldCharType="begin"/>
+            </w:r>
+            <w:r>
+              <w:rPr>
+                <w:noProof/>
+              </w:rPr>
+              <w:instrText xml:space="preserve"> PAGEREF _Toc243477450 \h </w:instrText>
             </w:r>
             <w:r>
               <w:rPr>
@@ -3899,11 +3898,14 @@
         <w:pStyle w:val="Titre1"/>
         <w:pageBreakBefore/>
       </w:pPr>
-      <w:bookmarkStart w:id="0" w:name="_Toc243470727"/>
-      <w:r>
+      <w:bookmarkStart w:id="0" w:name="_Toc243477388"/>
+      <w:bookmarkStart w:id="1" w:name="_Toc1"/>
+      <w:r>
+        <w:lastRenderedPageBreak/>
         <w:t>1. The pitch in 60 seconds</w:t>
       </w:r>
       <w:bookmarkEnd w:id="0"/>
+      <w:bookmarkEnd w:id="1"/>
     </w:p>
     <w:p>
       <w:pPr>
@@ -3921,7 +3923,7 @@
         <w:pStyle w:val="Paragraphedeliste"/>
         <w:numPr>
           <w:ilvl w:val="0"/>
-          <w:numId w:val="2"/>
+          <w:numId w:val="7"/>
         </w:numPr>
         <w:spacing w:after="80"/>
       </w:pPr>
@@ -3941,7 +3943,7 @@
         <w:pStyle w:val="Paragraphedeliste"/>
         <w:numPr>
           <w:ilvl w:val="0"/>
-          <w:numId w:val="2"/>
+          <w:numId w:val="7"/>
         </w:numPr>
         <w:spacing w:after="80"/>
       </w:pPr>
@@ -3971,7 +3973,7 @@
         <w:pStyle w:val="Paragraphedeliste"/>
         <w:numPr>
           <w:ilvl w:val="0"/>
-          <w:numId w:val="2"/>
+          <w:numId w:val="7"/>
         </w:numPr>
         <w:spacing w:after="80"/>
       </w:pPr>
@@ -4002,7 +4004,7 @@
         <w:pStyle w:val="Paragraphedeliste"/>
         <w:numPr>
           <w:ilvl w:val="0"/>
-          <w:numId w:val="2"/>
+          <w:numId w:val="7"/>
         </w:numPr>
         <w:spacing w:after="80"/>
       </w:pPr>
@@ -4042,7 +4044,7 @@
         <w:pStyle w:val="Paragraphedeliste"/>
         <w:numPr>
           <w:ilvl w:val="0"/>
-          <w:numId w:val="2"/>
+          <w:numId w:val="7"/>
         </w:numPr>
         <w:spacing w:after="80"/>
       </w:pPr>
@@ -4072,7 +4074,7 @@
         <w:pStyle w:val="Paragraphedeliste"/>
         <w:numPr>
           <w:ilvl w:val="0"/>
-          <w:numId w:val="2"/>
+          <w:numId w:val="7"/>
         </w:numPr>
         <w:spacing w:after="80"/>
       </w:pPr>
@@ -4117,11 +4119,14 @@
         <w:pStyle w:val="Titre1"/>
         <w:pageBreakBefore/>
       </w:pPr>
-      <w:bookmarkStart w:id="1" w:name="_Toc243470728"/>
-      <w:r>
+      <w:bookmarkStart w:id="2" w:name="_Toc243477389"/>
+      <w:bookmarkStart w:id="3" w:name="_Toc2"/>
+      <w:r>
+        <w:lastRenderedPageBreak/>
         <w:t>2. The basic ideas, explained simply</w:t>
       </w:r>
-      <w:bookmarkEnd w:id="1"/>
+      <w:bookmarkEnd w:id="2"/>
+      <w:bookmarkEnd w:id="3"/>
     </w:p>
     <w:p>
       <w:pPr>
@@ -4221,11 +4226,13 @@
       <w:pPr>
         <w:pStyle w:val="Titre2"/>
       </w:pPr>
-      <w:bookmarkStart w:id="2" w:name="_Toc243470729"/>
+      <w:bookmarkStart w:id="4" w:name="_Toc243477390"/>
+      <w:bookmarkStart w:id="5" w:name="_Toc3"/>
       <w:r>
         <w:t>A neuron, weights and a network</w:t>
       </w:r>
-      <w:bookmarkEnd w:id="2"/>
+      <w:bookmarkEnd w:id="4"/>
+      <w:bookmarkEnd w:id="5"/>
     </w:p>
     <w:p>
       <w:pPr>
@@ -4291,11 +4298,13 @@
       <w:pPr>
         <w:pStyle w:val="Titre2"/>
       </w:pPr>
-      <w:bookmarkStart w:id="3" w:name="_Toc243470730"/>
+      <w:bookmarkStart w:id="6" w:name="_Toc243477391"/>
+      <w:bookmarkStart w:id="7" w:name="_Toc4"/>
       <w:r>
         <w:t>The loss: how wrong we are</w:t>
       </w:r>
-      <w:bookmarkEnd w:id="3"/>
+      <w:bookmarkEnd w:id="6"/>
+      <w:bookmarkEnd w:id="7"/>
     </w:p>
     <w:p>
       <w:pPr>
@@ -4351,11 +4360,13 @@
       <w:pPr>
         <w:pStyle w:val="Titre2"/>
       </w:pPr>
-      <w:bookmarkStart w:id="4" w:name="_Toc243470731"/>
+      <w:bookmarkStart w:id="8" w:name="_Toc243477392"/>
+      <w:bookmarkStart w:id="9" w:name="_Toc5"/>
       <w:r>
         <w:t>Gradient descent and the learning rate</w:t>
       </w:r>
-      <w:bookmarkEnd w:id="4"/>
+      <w:bookmarkEnd w:id="8"/>
+      <w:bookmarkEnd w:id="9"/>
     </w:p>
     <w:p>
       <w:pPr>
@@ -4421,11 +4432,13 @@
       <w:pPr>
         <w:pStyle w:val="Titre2"/>
       </w:pPr>
-      <w:bookmarkStart w:id="5" w:name="_Toc243470732"/>
+      <w:bookmarkStart w:id="10" w:name="_Toc243477393"/>
+      <w:bookmarkStart w:id="11" w:name="_Toc6"/>
       <w:r>
         <w:t>Backpropagation and the 5 lines of the training loop</w:t>
       </w:r>
-      <w:bookmarkEnd w:id="5"/>
+      <w:bookmarkEnd w:id="10"/>
+      <w:bookmarkEnd w:id="11"/>
     </w:p>
     <w:p>
       <w:pPr>
@@ -4515,11 +4528,13 @@
       <w:pPr>
         <w:pStyle w:val="Titre2"/>
       </w:pPr>
-      <w:bookmarkStart w:id="6" w:name="_Toc243470733"/>
+      <w:bookmarkStart w:id="12" w:name="_Toc243477394"/>
+      <w:bookmarkStart w:id="13" w:name="_Toc7"/>
       <w:r>
         <w:t>Epoch and mini-batch</w:t>
       </w:r>
-      <w:bookmarkEnd w:id="6"/>
+      <w:bookmarkEnd w:id="12"/>
+      <w:bookmarkEnd w:id="13"/>
     </w:p>
     <w:p>
       <w:pPr>
@@ -4575,11 +4590,14 @@
       <w:pPr>
         <w:pStyle w:val="Titre2"/>
       </w:pPr>
-      <w:bookmarkStart w:id="7" w:name="_Toc243470734"/>
-      <w:r>
+      <w:bookmarkStart w:id="14" w:name="_Toc243477395"/>
+      <w:bookmarkStart w:id="15" w:name="_Toc8"/>
+      <w:r>
+        <w:lastRenderedPageBreak/>
         <w:t>Train, validation, test</w:t>
       </w:r>
-      <w:bookmarkEnd w:id="7"/>
+      <w:bookmarkEnd w:id="14"/>
+      <w:bookmarkEnd w:id="15"/>
     </w:p>
     <w:p>
       <w:pPr>
@@ -4645,11 +4663,13 @@
       <w:pPr>
         <w:pStyle w:val="Titre2"/>
       </w:pPr>
-      <w:bookmarkStart w:id="8" w:name="_Toc243470735"/>
+      <w:bookmarkStart w:id="16" w:name="_Toc243477396"/>
+      <w:bookmarkStart w:id="17" w:name="_Toc9"/>
       <w:r>
         <w:t>Overfitting</w:t>
       </w:r>
-      <w:bookmarkEnd w:id="8"/>
+      <w:bookmarkEnd w:id="16"/>
+      <w:bookmarkEnd w:id="17"/>
     </w:p>
     <w:p>
       <w:pPr>
@@ -4695,11 +4715,13 @@
       <w:pPr>
         <w:pStyle w:val="Titre2"/>
       </w:pPr>
-      <w:bookmarkStart w:id="9" w:name="_Toc243470736"/>
+      <w:bookmarkStart w:id="18" w:name="_Toc243477397"/>
+      <w:bookmarkStart w:id="19" w:name="_Toc10"/>
       <w:r>
         <w:t>ReLU, the activation</w:t>
       </w:r>
-      <w:bookmarkEnd w:id="9"/>
+      <w:bookmarkEnd w:id="18"/>
+      <w:bookmarkEnd w:id="19"/>
     </w:p>
     <w:p>
       <w:pPr>
@@ -4765,11 +4787,13 @@
       <w:pPr>
         <w:pStyle w:val="Titre2"/>
       </w:pPr>
-      <w:bookmarkStart w:id="10" w:name="_Toc243470737"/>
+      <w:bookmarkStart w:id="20" w:name="_Toc243477398"/>
+      <w:bookmarkStart w:id="21" w:name="_Toc11"/>
       <w:r>
         <w:t>Initialisation and the first loss</w:t>
       </w:r>
-      <w:bookmarkEnd w:id="10"/>
+      <w:bookmarkEnd w:id="20"/>
+      <w:bookmarkEnd w:id="21"/>
     </w:p>
     <w:p>
       <w:pPr>
@@ -4815,11 +4839,13 @@
       <w:pPr>
         <w:pStyle w:val="Titre2"/>
       </w:pPr>
-      <w:bookmarkStart w:id="11" w:name="_Toc243470738"/>
+      <w:bookmarkStart w:id="22" w:name="_Toc243477399"/>
+      <w:bookmarkStart w:id="23" w:name="_Toc12"/>
       <w:r>
         <w:t>Standardisation of the pixels</w:t>
       </w:r>
-      <w:bookmarkEnd w:id="11"/>
+      <w:bookmarkEnd w:id="22"/>
+      <w:bookmarkEnd w:id="23"/>
     </w:p>
     <w:p>
       <w:pPr>
@@ -4875,11 +4901,13 @@
       <w:pPr>
         <w:pStyle w:val="Titre2"/>
       </w:pPr>
-      <w:bookmarkStart w:id="12" w:name="_Toc243470739"/>
+      <w:bookmarkStart w:id="24" w:name="_Toc243477400"/>
+      <w:bookmarkStart w:id="25" w:name="_Toc13"/>
       <w:r>
         <w:t>MLP versus CNN: why the MLP cannot see shapes</w:t>
       </w:r>
-      <w:bookmarkEnd w:id="12"/>
+      <w:bookmarkEnd w:id="24"/>
+      <w:bookmarkEnd w:id="25"/>
     </w:p>
     <w:p>
       <w:pPr>
@@ -4935,11 +4963,13 @@
       <w:pPr>
         <w:pStyle w:val="Titre2"/>
       </w:pPr>
-      <w:bookmarkStart w:id="13" w:name="_Toc243470740"/>
+      <w:bookmarkStart w:id="26" w:name="_Toc243477401"/>
+      <w:bookmarkStart w:id="27" w:name="_Toc14"/>
       <w:r>
         <w:t>Convolution, filters and channels (session 7 slide)</w:t>
       </w:r>
-      <w:bookmarkEnd w:id="13"/>
+      <w:bookmarkEnd w:id="26"/>
+      <w:bookmarkEnd w:id="27"/>
     </w:p>
     <w:p>
       <w:pPr>
@@ -5005,6 +5035,7 @@
           <w:b/>
           <w:bCs/>
         </w:rPr>
+        <w:lastRenderedPageBreak/>
         <w:t>In our project.</w:t>
       </w:r>
       <w:r>
@@ -5025,11 +5056,13 @@
       <w:pPr>
         <w:pStyle w:val="Titre2"/>
       </w:pPr>
-      <w:bookmarkStart w:id="14" w:name="_Toc243470741"/>
+      <w:bookmarkStart w:id="28" w:name="_Toc243477402"/>
+      <w:bookmarkStart w:id="29" w:name="_Toc15"/>
       <w:r>
         <w:t>A pretrained network and transfer learning</w:t>
       </w:r>
-      <w:bookmarkEnd w:id="14"/>
+      <w:bookmarkEnd w:id="28"/>
+      <w:bookmarkEnd w:id="29"/>
     </w:p>
     <w:p>
       <w:pPr>
@@ -5085,11 +5118,13 @@
       <w:pPr>
         <w:pStyle w:val="Titre2"/>
       </w:pPr>
-      <w:bookmarkStart w:id="15" w:name="_Toc243470742"/>
+      <w:bookmarkStart w:id="30" w:name="_Toc243477403"/>
+      <w:bookmarkStart w:id="31" w:name="_Toc16"/>
       <w:r>
         <w:t>Frozen features (linear probe) versus fine-tuning</w:t>
       </w:r>
-      <w:bookmarkEnd w:id="15"/>
+      <w:bookmarkEnd w:id="30"/>
+      <w:bookmarkEnd w:id="31"/>
     </w:p>
     <w:p>
       <w:pPr>
@@ -5155,11 +5190,13 @@
       <w:pPr>
         <w:pStyle w:val="Titre2"/>
       </w:pPr>
-      <w:bookmarkStart w:id="16" w:name="_Toc243470743"/>
+      <w:bookmarkStart w:id="32" w:name="_Toc243477404"/>
+      <w:bookmarkStart w:id="33" w:name="_Toc17"/>
       <w:r>
         <w:t>The tools against overfitting</w:t>
       </w:r>
-      <w:bookmarkEnd w:id="16"/>
+      <w:bookmarkEnd w:id="32"/>
+      <w:bookmarkEnd w:id="33"/>
     </w:p>
     <w:p>
       <w:pPr>
@@ -5315,11 +5352,13 @@
       <w:pPr>
         <w:pStyle w:val="Titre2"/>
       </w:pPr>
-      <w:bookmarkStart w:id="17" w:name="_Toc243470744"/>
+      <w:bookmarkStart w:id="34" w:name="_Toc243477405"/>
+      <w:bookmarkStart w:id="35" w:name="_Toc18"/>
       <w:r>
         <w:t>Vanishing gradient</w:t>
       </w:r>
-      <w:bookmarkEnd w:id="17"/>
+      <w:bookmarkEnd w:id="34"/>
+      <w:bookmarkEnd w:id="35"/>
     </w:p>
     <w:p>
       <w:pPr>
@@ -5365,11 +5404,13 @@
       <w:pPr>
         <w:pStyle w:val="Titre2"/>
       </w:pPr>
-      <w:bookmarkStart w:id="18" w:name="_Toc243470745"/>
+      <w:bookmarkStart w:id="36" w:name="_Toc243477406"/>
+      <w:bookmarkStart w:id="37" w:name="_Toc19"/>
       <w:r>
         <w:t>Data leakage</w:t>
       </w:r>
-      <w:bookmarkEnd w:id="18"/>
+      <w:bookmarkEnd w:id="36"/>
+      <w:bookmarkEnd w:id="37"/>
     </w:p>
     <w:p>
       <w:pPr>
@@ -5415,11 +5456,13 @@
       <w:pPr>
         <w:pStyle w:val="Titre2"/>
       </w:pPr>
-      <w:bookmarkStart w:id="19" w:name="_Toc243470746"/>
+      <w:bookmarkStart w:id="38" w:name="_Toc243477407"/>
+      <w:bookmarkStart w:id="39" w:name="_Toc20"/>
       <w:r>
         <w:t>Confidence interval and bootstrap</w:t>
       </w:r>
-      <w:bookmarkEnd w:id="19"/>
+      <w:bookmarkEnd w:id="38"/>
+      <w:bookmarkEnd w:id="39"/>
     </w:p>
     <w:p>
       <w:pPr>
@@ -5475,11 +5518,14 @@
       <w:pPr>
         <w:pStyle w:val="Titre2"/>
       </w:pPr>
-      <w:bookmarkStart w:id="20" w:name="_Toc243470747"/>
-      <w:r>
+      <w:bookmarkStart w:id="40" w:name="_Toc243477408"/>
+      <w:bookmarkStart w:id="41" w:name="_Toc21"/>
+      <w:r>
+        <w:lastRenderedPageBreak/>
         <w:t>Latency and CPU threads</w:t>
       </w:r>
-      <w:bookmarkEnd w:id="20"/>
+      <w:bookmarkEnd w:id="40"/>
+      <w:bookmarkEnd w:id="41"/>
     </w:p>
     <w:p>
       <w:pPr>
@@ -5546,11 +5592,14 @@
         <w:pStyle w:val="Titre1"/>
         <w:pageBreakBefore/>
       </w:pPr>
-      <w:bookmarkStart w:id="21" w:name="_Toc243470748"/>
-      <w:r>
+      <w:bookmarkStart w:id="42" w:name="_Toc243477409"/>
+      <w:bookmarkStart w:id="43" w:name="_Toc22"/>
+      <w:r>
+        <w:lastRenderedPageBreak/>
         <w:t>3. Step 1: the data and a fair split (notebook 01)</w:t>
       </w:r>
-      <w:bookmarkEnd w:id="21"/>
+      <w:bookmarkEnd w:id="42"/>
+      <w:bookmarkEnd w:id="43"/>
     </w:p>
     <w:tbl>
       <w:tblPr>
@@ -5658,11 +5707,13 @@
       <w:pPr>
         <w:pStyle w:val="Titre2"/>
       </w:pPr>
-      <w:bookmarkStart w:id="22" w:name="_Toc243470749"/>
+      <w:bookmarkStart w:id="44" w:name="_Toc243477410"/>
+      <w:bookmarkStart w:id="45" w:name="_Toc23"/>
       <w:r>
         <w:t>What we downloaded</w:t>
       </w:r>
-      <w:bookmarkEnd w:id="22"/>
+      <w:bookmarkEnd w:id="44"/>
+      <w:bookmarkEnd w:id="45"/>
     </w:p>
     <w:p>
       <w:pPr>
@@ -5699,7 +5750,7 @@
         <w:pStyle w:val="Paragraphedeliste"/>
         <w:numPr>
           <w:ilvl w:val="0"/>
-          <w:numId w:val="3"/>
+          <w:numId w:val="8"/>
         </w:numPr>
         <w:spacing w:after="80"/>
       </w:pPr>
@@ -5729,7 +5780,7 @@
         <w:pStyle w:val="Paragraphedeliste"/>
         <w:numPr>
           <w:ilvl w:val="0"/>
-          <w:numId w:val="3"/>
+          <w:numId w:val="8"/>
         </w:numPr>
         <w:spacing w:after="80"/>
       </w:pPr>
@@ -5749,7 +5800,7 @@
         <w:pStyle w:val="Paragraphedeliste"/>
         <w:numPr>
           <w:ilvl w:val="0"/>
-          <w:numId w:val="3"/>
+          <w:numId w:val="8"/>
         </w:numPr>
         <w:spacing w:after="80"/>
       </w:pPr>
@@ -5779,18 +5830,20 @@
       <w:pPr>
         <w:pStyle w:val="Titre2"/>
       </w:pPr>
-      <w:bookmarkStart w:id="23" w:name="_Toc243470750"/>
+      <w:bookmarkStart w:id="46" w:name="_Toc243477411"/>
+      <w:bookmarkStart w:id="47" w:name="_Toc24"/>
       <w:r>
         <w:t>The split (make_split in data.py)</w:t>
       </w:r>
-      <w:bookmarkEnd w:id="23"/>
+      <w:bookmarkEnd w:id="46"/>
+      <w:bookmarkEnd w:id="47"/>
     </w:p>
     <w:p>
       <w:pPr>
         <w:pStyle w:val="Paragraphedeliste"/>
         <w:numPr>
           <w:ilvl w:val="0"/>
-          <w:numId w:val="3"/>
+          <w:numId w:val="8"/>
         </w:numPr>
         <w:spacing w:after="80"/>
       </w:pPr>
@@ -5803,7 +5856,7 @@
         <w:pStyle w:val="Paragraphedeliste"/>
         <w:numPr>
           <w:ilvl w:val="0"/>
-          <w:numId w:val="3"/>
+          <w:numId w:val="8"/>
         </w:numPr>
         <w:spacing w:after="80"/>
       </w:pPr>
@@ -5823,7 +5876,7 @@
         <w:pStyle w:val="Paragraphedeliste"/>
         <w:numPr>
           <w:ilvl w:val="0"/>
-          <w:numId w:val="3"/>
+          <w:numId w:val="8"/>
         </w:numPr>
         <w:spacing w:after="80"/>
       </w:pPr>
@@ -5874,7 +5927,7 @@
         <w:pStyle w:val="Paragraphedeliste"/>
         <w:numPr>
           <w:ilvl w:val="0"/>
-          <w:numId w:val="3"/>
+          <w:numId w:val="8"/>
         </w:numPr>
         <w:spacing w:after="80"/>
       </w:pPr>
@@ -5887,7 +5940,7 @@
         <w:pStyle w:val="Paragraphedeliste"/>
         <w:numPr>
           <w:ilvl w:val="0"/>
-          <w:numId w:val="3"/>
+          <w:numId w:val="8"/>
         </w:numPr>
         <w:spacing w:after="80"/>
       </w:pPr>
@@ -5910,18 +5963,20 @@
       <w:pPr>
         <w:pStyle w:val="Titre2"/>
       </w:pPr>
-      <w:bookmarkStart w:id="24" w:name="_Toc243470751"/>
+      <w:bookmarkStart w:id="48" w:name="_Toc243477412"/>
+      <w:bookmarkStart w:id="49" w:name="_Toc25"/>
       <w:r>
         <w:t>What we found in the data</w:t>
       </w:r>
-      <w:bookmarkEnd w:id="24"/>
+      <w:bookmarkEnd w:id="48"/>
+      <w:bookmarkEnd w:id="49"/>
     </w:p>
     <w:p>
       <w:pPr>
         <w:pStyle w:val="Paragraphedeliste"/>
         <w:numPr>
           <w:ilvl w:val="0"/>
-          <w:numId w:val="3"/>
+          <w:numId w:val="8"/>
         </w:numPr>
         <w:spacing w:after="80"/>
       </w:pPr>
@@ -5934,7 +5989,7 @@
         <w:pStyle w:val="Paragraphedeliste"/>
         <w:numPr>
           <w:ilvl w:val="0"/>
-          <w:numId w:val="3"/>
+          <w:numId w:val="8"/>
         </w:numPr>
         <w:spacing w:after="80"/>
       </w:pPr>
@@ -5947,7 +6002,7 @@
         <w:pStyle w:val="Paragraphedeliste"/>
         <w:numPr>
           <w:ilvl w:val="0"/>
-          <w:numId w:val="3"/>
+          <w:numId w:val="8"/>
         </w:numPr>
         <w:spacing w:after="80"/>
       </w:pPr>
@@ -5960,7 +6015,7 @@
         <w:pStyle w:val="Paragraphedeliste"/>
         <w:numPr>
           <w:ilvl w:val="0"/>
-          <w:numId w:val="3"/>
+          <w:numId w:val="8"/>
         </w:numPr>
         <w:spacing w:after="80"/>
       </w:pPr>
@@ -5973,11 +6028,14 @@
         <w:pStyle w:val="Titre1"/>
         <w:pageBreakBefore/>
       </w:pPr>
-      <w:bookmarkStart w:id="25" w:name="_Toc243470752"/>
-      <w:r>
+      <w:bookmarkStart w:id="50" w:name="_Toc243477413"/>
+      <w:bookmarkStart w:id="51" w:name="_Toc26"/>
+      <w:r>
+        <w:lastRenderedPageBreak/>
         <w:t>4. Step 2: the MLP and its two checks (notebook 02)</w:t>
       </w:r>
-      <w:bookmarkEnd w:id="25"/>
+      <w:bookmarkEnd w:id="50"/>
+      <w:bookmarkEnd w:id="51"/>
     </w:p>
     <w:tbl>
       <w:tblPr>
@@ -6122,11 +6180,13 @@
       <w:pPr>
         <w:pStyle w:val="Titre2"/>
       </w:pPr>
-      <w:bookmarkStart w:id="26" w:name="_Toc243470753"/>
+      <w:bookmarkStart w:id="52" w:name="_Toc243477414"/>
+      <w:bookmarkStart w:id="53" w:name="_Toc27"/>
       <w:r>
         <w:t>The model</w:t>
       </w:r>
-      <w:bookmarkEnd w:id="26"/>
+      <w:bookmarkEnd w:id="52"/>
+      <w:bookmarkEnd w:id="53"/>
     </w:p>
     <w:p>
       <w:pPr>
@@ -6249,11 +6309,13 @@
       <w:pPr>
         <w:pStyle w:val="Titre2"/>
       </w:pPr>
-      <w:bookmarkStart w:id="27" w:name="_Toc243470754"/>
+      <w:bookmarkStart w:id="54" w:name="_Toc243477415"/>
+      <w:bookmarkStart w:id="55" w:name="_Toc28"/>
       <w:r>
         <w:t>Check 1: the first loss</w:t>
       </w:r>
-      <w:bookmarkEnd w:id="27"/>
+      <w:bookmarkEnd w:id="54"/>
+      <w:bookmarkEnd w:id="55"/>
     </w:p>
     <w:p>
       <w:pPr>
@@ -6298,11 +6360,13 @@
       <w:pPr>
         <w:pStyle w:val="Titre2"/>
       </w:pPr>
-      <w:bookmarkStart w:id="28" w:name="_Toc243470755"/>
+      <w:bookmarkStart w:id="56" w:name="_Toc243477416"/>
+      <w:bookmarkStart w:id="57" w:name="_Toc29"/>
       <w:r>
         <w:t>Check 2: overfit one batch</w:t>
       </w:r>
-      <w:bookmarkEnd w:id="28"/>
+      <w:bookmarkEnd w:id="56"/>
+      <w:bookmarkEnd w:id="57"/>
     </w:p>
     <w:p>
       <w:pPr>
@@ -6316,18 +6380,20 @@
       <w:pPr>
         <w:pStyle w:val="Titre2"/>
       </w:pPr>
-      <w:bookmarkStart w:id="29" w:name="_Toc243470756"/>
+      <w:bookmarkStart w:id="58" w:name="_Toc243477417"/>
+      <w:bookmarkStart w:id="59" w:name="_Toc30"/>
       <w:r>
         <w:t>Baseline and image size</w:t>
       </w:r>
-      <w:bookmarkEnd w:id="29"/>
+      <w:bookmarkEnd w:id="58"/>
+      <w:bookmarkEnd w:id="59"/>
     </w:p>
     <w:p>
       <w:pPr>
         <w:pStyle w:val="Paragraphedeliste"/>
         <w:numPr>
           <w:ilvl w:val="0"/>
-          <w:numId w:val="3"/>
+          <w:numId w:val="8"/>
         </w:numPr>
         <w:spacing w:after="80"/>
       </w:pPr>
@@ -6340,7 +6406,7 @@
         <w:pStyle w:val="Paragraphedeliste"/>
         <w:numPr>
           <w:ilvl w:val="0"/>
-          <w:numId w:val="3"/>
+          <w:numId w:val="8"/>
         </w:numPr>
         <w:spacing w:after="80"/>
       </w:pPr>
@@ -6373,7 +6439,7 @@
         <w:pStyle w:val="Paragraphedeliste"/>
         <w:numPr>
           <w:ilvl w:val="0"/>
-          <w:numId w:val="3"/>
+          <w:numId w:val="8"/>
         </w:numPr>
         <w:spacing w:after="80"/>
       </w:pPr>
@@ -6390,8 +6456,9 @@
         <w:rPr>
           <w:noProof/>
         </w:rPr>
+        <w:lastRenderedPageBreak/>
         <w:drawing>
-          <wp:inline distT="0" distB="0" distL="0" distR="0" wp14:anchorId="7BB8C871" wp14:editId="7BB8C872">
+          <wp:inline distT="0" distB="0" distL="0" distR="0" wp14:anchorId="44C38F4A" wp14:editId="44C38F4B">
             <wp:extent cx="4762500" cy="1924050"/>
             <wp:effectExtent l="0" t="0" r="0" b="0"/>
             <wp:docPr id="1" name="02_baseline_curves.png" descr="MLP baseline: training loss falls to 0 while validation loss rises (overfitting)." title="MLP baseline: training loss falls to 0 while validation loss rises (overfitting)."/>
@@ -6451,11 +6518,14 @@
         <w:pStyle w:val="Titre1"/>
         <w:pageBreakBefore/>
       </w:pPr>
-      <w:bookmarkStart w:id="30" w:name="_Toc243470757"/>
-      <w:r>
+      <w:bookmarkStart w:id="60" w:name="_Toc243477418"/>
+      <w:bookmarkStart w:id="61" w:name="_Toc31"/>
+      <w:r>
+        <w:lastRenderedPageBreak/>
         <w:t>5. Step 3: monitoring and regularisation (notebook 03)</w:t>
       </w:r>
-      <w:bookmarkEnd w:id="30"/>
+      <w:bookmarkEnd w:id="60"/>
+      <w:bookmarkEnd w:id="61"/>
     </w:p>
     <w:tbl>
       <w:tblPr>
@@ -6621,11 +6691,13 @@
       <w:pPr>
         <w:pStyle w:val="Titre2"/>
       </w:pPr>
-      <w:bookmarkStart w:id="31" w:name="_Toc243470758"/>
+      <w:bookmarkStart w:id="62" w:name="_Toc243477419"/>
+      <w:bookmarkStart w:id="63" w:name="_Toc32"/>
       <w:r>
         <w:t>What we monitored</w:t>
       </w:r>
-      <w:bookmarkEnd w:id="31"/>
+      <w:bookmarkEnd w:id="62"/>
+      <w:bookmarkEnd w:id="63"/>
     </w:p>
     <w:p>
       <w:pPr>
@@ -6673,7 +6745,7 @@
         <w:pStyle w:val="Paragraphedeliste"/>
         <w:numPr>
           <w:ilvl w:val="0"/>
-          <w:numId w:val="3"/>
+          <w:numId w:val="8"/>
         </w:numPr>
         <w:spacing w:after="80"/>
       </w:pPr>
@@ -6693,7 +6765,7 @@
         <w:pStyle w:val="Paragraphedeliste"/>
         <w:numPr>
           <w:ilvl w:val="0"/>
-          <w:numId w:val="3"/>
+          <w:numId w:val="8"/>
         </w:numPr>
         <w:spacing w:after="80"/>
       </w:pPr>
@@ -6713,7 +6785,7 @@
         <w:pStyle w:val="Paragraphedeliste"/>
         <w:numPr>
           <w:ilvl w:val="0"/>
-          <w:numId w:val="3"/>
+          <w:numId w:val="8"/>
         </w:numPr>
         <w:spacing w:after="80"/>
       </w:pPr>
@@ -6740,18 +6812,20 @@
       <w:pPr>
         <w:pStyle w:val="Titre2"/>
       </w:pPr>
-      <w:bookmarkStart w:id="32" w:name="_Toc243470759"/>
+      <w:bookmarkStart w:id="64" w:name="_Toc243477420"/>
+      <w:bookmarkStart w:id="65" w:name="_Toc33"/>
       <w:r>
         <w:t>Learning-rate sweep (Adam, 8 values, 15 epochs each)</w:t>
       </w:r>
-      <w:bookmarkEnd w:id="32"/>
+      <w:bookmarkEnd w:id="64"/>
+      <w:bookmarkEnd w:id="65"/>
     </w:p>
     <w:p>
       <w:pPr>
         <w:pStyle w:val="Paragraphedeliste"/>
         <w:numPr>
           <w:ilvl w:val="0"/>
-          <w:numId w:val="3"/>
+          <w:numId w:val="8"/>
         </w:numPr>
         <w:spacing w:after="80"/>
       </w:pPr>
@@ -6764,7 +6838,7 @@
         <w:pStyle w:val="Paragraphedeliste"/>
         <w:numPr>
           <w:ilvl w:val="0"/>
-          <w:numId w:val="3"/>
+          <w:numId w:val="8"/>
         </w:numPr>
         <w:spacing w:after="80"/>
       </w:pPr>
@@ -6784,7 +6858,7 @@
         <w:pStyle w:val="Paragraphedeliste"/>
         <w:numPr>
           <w:ilvl w:val="0"/>
-          <w:numId w:val="3"/>
+          <w:numId w:val="8"/>
         </w:numPr>
         <w:spacing w:after="80"/>
       </w:pPr>
@@ -6797,7 +6871,7 @@
         <w:pStyle w:val="Paragraphedeliste"/>
         <w:numPr>
           <w:ilvl w:val="0"/>
-          <w:numId w:val="3"/>
+          <w:numId w:val="8"/>
         </w:numPr>
         <w:spacing w:after="80"/>
       </w:pPr>
@@ -6815,7 +6889,7 @@
           <w:noProof/>
         </w:rPr>
         <w:drawing>
-          <wp:inline distT="0" distB="0" distL="0" distR="0" wp14:anchorId="7BB8C873" wp14:editId="7BB8C874">
+          <wp:inline distT="0" distB="0" distL="0" distR="0" wp14:anchorId="44C38F4C" wp14:editId="44C38F4D">
             <wp:extent cx="4191000" cy="1619250"/>
             <wp:effectExtent l="0" t="0" r="0" b="0"/>
             <wp:docPr id="2" name="03_lr_sweep.png" descr="Learning-rate sweep: a U-shaped validation loss, best at 0.0001." title="Learning-rate sweep: a U-shaped validation loss, best at 0.0001."/>
@@ -6874,11 +6948,13 @@
       <w:pPr>
         <w:pStyle w:val="Titre2"/>
       </w:pPr>
-      <w:bookmarkStart w:id="33" w:name="_Toc243470760"/>
+      <w:bookmarkStart w:id="66" w:name="_Toc243477421"/>
+      <w:bookmarkStart w:id="67" w:name="_Toc34"/>
       <w:r>
         <w:t>The tools against overfitting (lr 0.0001, 3 seeds each)</w:t>
       </w:r>
-      <w:bookmarkEnd w:id="33"/>
+      <w:bookmarkEnd w:id="66"/>
+      <w:bookmarkEnd w:id="67"/>
     </w:p>
     <w:tbl>
       <w:tblPr>
@@ -7255,6 +7331,7 @@
                 <w:sz w:val="19"/>
                 <w:szCs w:val="19"/>
               </w:rPr>
+              <w:lastRenderedPageBreak/>
               <w:t>Dropout (0.5 hidden, 0.2 input)</w:t>
             </w:r>
           </w:p>
@@ -7846,11 +7923,14 @@
         <w:pStyle w:val="Titre1"/>
         <w:pageBreakBefore/>
       </w:pPr>
-      <w:bookmarkStart w:id="34" w:name="_Toc243470761"/>
-      <w:r>
+      <w:bookmarkStart w:id="68" w:name="_Toc243477422"/>
+      <w:bookmarkStart w:id="69" w:name="_Toc35"/>
+      <w:r>
+        <w:lastRenderedPageBreak/>
         <w:t>6. Step 4: the training doctor (notebook 04)</w:t>
       </w:r>
-      <w:bookmarkEnd w:id="34"/>
+      <w:bookmarkEnd w:id="68"/>
+      <w:bookmarkEnd w:id="69"/>
     </w:p>
     <w:tbl>
       <w:tblPr>
@@ -8734,8 +8814,9 @@
         <w:rPr>
           <w:noProof/>
         </w:rPr>
+        <w:lastRenderedPageBreak/>
         <w:drawing>
-          <wp:inline distT="0" distB="0" distL="0" distR="0" wp14:anchorId="7BB8C875" wp14:editId="7BB8C876">
+          <wp:inline distT="0" distB="0" distL="0" distR="0" wp14:anchorId="44C38F4E" wp14:editId="44C38F4F">
             <wp:extent cx="4000500" cy="2209800"/>
             <wp:effectExtent l="0" t="0" r="0" b="0"/>
             <wp:docPr id="3" name="04_p4_grad_per_layer.png" descr="Patient 4: the gradient vanishes layer after layer with sigmoids; ReLU + He init fixes it." title="Patient 4: the gradient vanishes layer after layer with sigmoids; ReLU + He init fixes it."/>
@@ -8794,18 +8875,20 @@
       <w:pPr>
         <w:pStyle w:val="Titre2"/>
       </w:pPr>
-      <w:bookmarkStart w:id="35" w:name="_Toc243470762"/>
+      <w:bookmarkStart w:id="70" w:name="_Toc243477423"/>
+      <w:bookmarkStart w:id="71" w:name="_Toc36"/>
       <w:r>
         <w:t>Lessons to say at the oral</w:t>
       </w:r>
-      <w:bookmarkEnd w:id="35"/>
+      <w:bookmarkEnd w:id="70"/>
+      <w:bookmarkEnd w:id="71"/>
     </w:p>
     <w:p>
       <w:pPr>
         <w:pStyle w:val="Paragraphedeliste"/>
         <w:numPr>
           <w:ilvl w:val="0"/>
-          <w:numId w:val="3"/>
+          <w:numId w:val="8"/>
         </w:numPr>
         <w:spacing w:after="80"/>
       </w:pPr>
@@ -8838,7 +8921,7 @@
         <w:pStyle w:val="Paragraphedeliste"/>
         <w:numPr>
           <w:ilvl w:val="0"/>
-          <w:numId w:val="3"/>
+          <w:numId w:val="8"/>
         </w:numPr>
         <w:spacing w:after="80"/>
       </w:pPr>
@@ -8861,7 +8944,7 @@
         <w:pStyle w:val="Paragraphedeliste"/>
         <w:numPr>
           <w:ilvl w:val="0"/>
-          <w:numId w:val="3"/>
+          <w:numId w:val="8"/>
         </w:numPr>
         <w:spacing w:after="80"/>
       </w:pPr>
@@ -8874,7 +8957,7 @@
         <w:pStyle w:val="Paragraphedeliste"/>
         <w:numPr>
           <w:ilvl w:val="0"/>
-          <w:numId w:val="3"/>
+          <w:numId w:val="8"/>
         </w:numPr>
         <w:spacing w:after="80"/>
       </w:pPr>
@@ -8887,11 +8970,14 @@
         <w:pStyle w:val="Titre1"/>
         <w:pageBreakBefore/>
       </w:pPr>
-      <w:bookmarkStart w:id="36" w:name="_Toc243470763"/>
-      <w:r>
+      <w:bookmarkStart w:id="72" w:name="_Toc243477424"/>
+      <w:bookmarkStart w:id="73" w:name="_Toc37"/>
+      <w:r>
+        <w:lastRenderedPageBreak/>
         <w:t>7. Step 5: pretrained ResNet18 (notebook 05)</w:t>
       </w:r>
-      <w:bookmarkEnd w:id="36"/>
+      <w:bookmarkEnd w:id="72"/>
+      <w:bookmarkEnd w:id="73"/>
     </w:p>
     <w:tbl>
       <w:tblPr>
@@ -9093,11 +9179,13 @@
       <w:pPr>
         <w:pStyle w:val="Titre2"/>
       </w:pPr>
-      <w:bookmarkStart w:id="37" w:name="_Toc243470764"/>
+      <w:bookmarkStart w:id="74" w:name="_Toc243477425"/>
+      <w:bookmarkStart w:id="75" w:name="_Toc38"/>
       <w:r>
         <w:t>Why a CNN, and why pretrained</w:t>
       </w:r>
-      <w:bookmarkEnd w:id="37"/>
+      <w:bookmarkEnd w:id="74"/>
+      <w:bookmarkEnd w:id="75"/>
     </w:p>
     <w:p>
       <w:pPr>
@@ -9178,18 +9266,20 @@
       <w:pPr>
         <w:pStyle w:val="Titre2"/>
       </w:pPr>
-      <w:bookmarkStart w:id="38" w:name="_Toc243470765"/>
+      <w:bookmarkStart w:id="76" w:name="_Toc243477426"/>
+      <w:bookmarkStart w:id="77" w:name="_Toc39"/>
       <w:r>
         <w:t>Method A: frozen features + head</w:t>
       </w:r>
-      <w:bookmarkEnd w:id="38"/>
+      <w:bookmarkEnd w:id="76"/>
+      <w:bookmarkEnd w:id="77"/>
     </w:p>
     <w:p>
       <w:pPr>
         <w:pStyle w:val="Paragraphedeliste"/>
         <w:numPr>
           <w:ilvl w:val="0"/>
-          <w:numId w:val="3"/>
+          <w:numId w:val="8"/>
         </w:numPr>
         <w:spacing w:after="80"/>
       </w:pPr>
@@ -9212,7 +9302,7 @@
         <w:pStyle w:val="Paragraphedeliste"/>
         <w:numPr>
           <w:ilvl w:val="0"/>
-          <w:numId w:val="3"/>
+          <w:numId w:val="8"/>
         </w:numPr>
         <w:spacing w:after="80"/>
       </w:pPr>
@@ -9263,7 +9353,7 @@
         <w:pStyle w:val="Paragraphedeliste"/>
         <w:numPr>
           <w:ilvl w:val="0"/>
-          <w:numId w:val="3"/>
+          <w:numId w:val="8"/>
         </w:numPr>
         <w:spacing w:after="80"/>
       </w:pPr>
@@ -9285,11 +9375,13 @@
       <w:pPr>
         <w:pStyle w:val="Titre2"/>
       </w:pPr>
-      <w:bookmarkStart w:id="39" w:name="_Toc243470766"/>
+      <w:bookmarkStart w:id="78" w:name="_Toc243477427"/>
+      <w:bookmarkStart w:id="79" w:name="_Toc40"/>
       <w:r>
         <w:t>Method B: fine-tuning layer4</w:t>
       </w:r>
-      <w:bookmarkEnd w:id="39"/>
+      <w:bookmarkEnd w:id="78"/>
+      <w:bookmarkEnd w:id="79"/>
     </w:p>
     <w:p>
       <w:pPr>
@@ -9342,18 +9434,20 @@
       <w:pPr>
         <w:pStyle w:val="Titre2"/>
       </w:pPr>
-      <w:bookmarkStart w:id="40" w:name="_Toc243470767"/>
+      <w:bookmarkStart w:id="80" w:name="_Toc243477428"/>
+      <w:bookmarkStart w:id="81" w:name="_Toc41"/>
       <w:r>
         <w:t>Two silent bugs, measured</w:t>
       </w:r>
-      <w:bookmarkEnd w:id="40"/>
+      <w:bookmarkEnd w:id="80"/>
+      <w:bookmarkEnd w:id="81"/>
     </w:p>
     <w:p>
       <w:pPr>
         <w:pStyle w:val="Paragraphedeliste"/>
         <w:numPr>
           <w:ilvl w:val="0"/>
-          <w:numId w:val="3"/>
+          <w:numId w:val="8"/>
         </w:numPr>
         <w:spacing w:after="80"/>
       </w:pPr>
@@ -9387,7 +9481,7 @@
         <w:pStyle w:val="Paragraphedeliste"/>
         <w:numPr>
           <w:ilvl w:val="0"/>
-          <w:numId w:val="3"/>
+          <w:numId w:val="8"/>
         </w:numPr>
         <w:spacing w:after="80"/>
       </w:pPr>
@@ -9409,11 +9503,14 @@
       <w:pPr>
         <w:pStyle w:val="Titre2"/>
       </w:pPr>
-      <w:bookmarkStart w:id="41" w:name="_Toc243470768"/>
-      <w:r>
+      <w:bookmarkStart w:id="82" w:name="_Toc243477429"/>
+      <w:bookmarkStart w:id="83" w:name="_Toc42"/>
+      <w:r>
+        <w:lastRenderedPageBreak/>
         <w:t>Painter leakage, measured fairly</w:t>
       </w:r>
-      <w:bookmarkEnd w:id="41"/>
+      <w:bookmarkEnd w:id="82"/>
+      <w:bookmarkEnd w:id="83"/>
     </w:p>
     <w:p>
       <w:pPr>
@@ -9750,7 +9847,7 @@
           <w:noProof/>
         </w:rPr>
         <w:drawing>
-          <wp:inline distT="0" distB="0" distL="0" distR="0" wp14:anchorId="7BB8C877" wp14:editId="7BB8C878">
+          <wp:inline distT="0" distB="0" distL="0" distR="0" wp14:anchorId="44C38F50" wp14:editId="44C38F51">
             <wp:extent cx="4762500" cy="2524125"/>
             <wp:effectExtent l="0" t="0" r="0" b="0"/>
             <wp:docPr id="4" name="05_painter_leakage.png" descr="Painter leakage: same images, same model; only the known-painter group changes." title="Painter leakage: same images, same model; only the known-painter group changes."/>
@@ -9825,11 +9922,14 @@
         <w:pStyle w:val="Titre1"/>
         <w:pageBreakBefore/>
       </w:pPr>
-      <w:bookmarkStart w:id="42" w:name="_Toc243470769"/>
-      <w:r>
+      <w:bookmarkStart w:id="84" w:name="_Toc243477430"/>
+      <w:bookmarkStart w:id="85" w:name="_Toc43"/>
+      <w:r>
+        <w:lastRenderedPageBreak/>
         <w:t>8. Step 6: final test, CPU cost and recommendation (notebook 06)</w:t>
       </w:r>
-      <w:bookmarkEnd w:id="42"/>
+      <w:bookmarkEnd w:id="84"/>
+      <w:bookmarkEnd w:id="85"/>
     </w:p>
     <w:tbl>
       <w:tblPr>
@@ -9970,18 +10070,20 @@
       <w:pPr>
         <w:pStyle w:val="Titre2"/>
       </w:pPr>
-      <w:bookmarkStart w:id="43" w:name="_Toc243470770"/>
+      <w:bookmarkStart w:id="86" w:name="_Toc243477431"/>
+      <w:bookmarkStart w:id="87" w:name="_Toc44"/>
       <w:r>
         <w:t>Classical models (settings chosen on validation)</w:t>
       </w:r>
-      <w:bookmarkEnd w:id="43"/>
+      <w:bookmarkEnd w:id="86"/>
+      <w:bookmarkEnd w:id="87"/>
     </w:p>
     <w:p>
       <w:pPr>
         <w:pStyle w:val="Paragraphedeliste"/>
         <w:numPr>
           <w:ilvl w:val="0"/>
-          <w:numId w:val="3"/>
+          <w:numId w:val="8"/>
         </w:numPr>
         <w:spacing w:after="80"/>
       </w:pPr>
@@ -9994,7 +10096,7 @@
         <w:pStyle w:val="Paragraphedeliste"/>
         <w:numPr>
           <w:ilvl w:val="0"/>
-          <w:numId w:val="3"/>
+          <w:numId w:val="8"/>
         </w:numPr>
         <w:spacing w:after="80"/>
       </w:pPr>
@@ -10035,7 +10137,7 @@
         <w:pStyle w:val="Paragraphedeliste"/>
         <w:numPr>
           <w:ilvl w:val="0"/>
-          <w:numId w:val="3"/>
+          <w:numId w:val="8"/>
         </w:numPr>
         <w:spacing w:after="80"/>
       </w:pPr>
@@ -10083,11 +10185,13 @@
       <w:pPr>
         <w:pStyle w:val="Titre2"/>
       </w:pPr>
-      <w:bookmarkStart w:id="44" w:name="_Toc243470771"/>
+      <w:bookmarkStart w:id="88" w:name="_Toc243477432"/>
+      <w:bookmarkStart w:id="89" w:name="_Toc45"/>
       <w:r>
         <w:t>The final test, measured once</w:t>
       </w:r>
-      <w:bookmarkEnd w:id="44"/>
+      <w:bookmarkEnd w:id="88"/>
+      <w:bookmarkEnd w:id="89"/>
     </w:p>
     <w:p>
       <w:pPr>
@@ -11112,8 +11216,9 @@
         <w:rPr>
           <w:noProof/>
         </w:rPr>
+        <w:lastRenderedPageBreak/>
         <w:drawing>
-          <wp:inline distT="0" distB="0" distL="0" distR="0" wp14:anchorId="7BB8C879" wp14:editId="7BB8C87A">
+          <wp:inline distT="0" distB="0" distL="0" distR="0" wp14:anchorId="44C38F52" wp14:editId="44C38F53">
             <wp:extent cx="4762500" cy="1971675"/>
             <wp:effectExtent l="0" t="0" r="0" b="0"/>
             <wp:docPr id="5" name="06_test_accuracy.png" descr="Final test: 220 paintings never seen before, with 95 % bootstrap intervals." title="Final test: 220 paintings never seen before, with 95 % bootstrap intervals."/>
@@ -11172,18 +11277,20 @@
       <w:pPr>
         <w:pStyle w:val="Titre2"/>
       </w:pPr>
-      <w:bookmarkStart w:id="45" w:name="_Toc243470772"/>
+      <w:bookmarkStart w:id="90" w:name="_Toc243477433"/>
+      <w:bookmarkStart w:id="91" w:name="_Toc46"/>
       <w:r>
         <w:t>Are the gaps real? Paired bootstrap (same 220 paintings, 5 000 redraws)</w:t>
       </w:r>
-      <w:bookmarkEnd w:id="45"/>
+      <w:bookmarkEnd w:id="90"/>
+      <w:bookmarkEnd w:id="91"/>
     </w:p>
     <w:p>
       <w:pPr>
         <w:pStyle w:val="Paragraphedeliste"/>
         <w:numPr>
           <w:ilvl w:val="0"/>
-          <w:numId w:val="3"/>
+          <w:numId w:val="8"/>
         </w:numPr>
         <w:spacing w:after="80"/>
       </w:pPr>
@@ -11206,7 +11313,7 @@
         <w:pStyle w:val="Paragraphedeliste"/>
         <w:numPr>
           <w:ilvl w:val="0"/>
-          <w:numId w:val="3"/>
+          <w:numId w:val="8"/>
         </w:numPr>
         <w:spacing w:after="80"/>
       </w:pPr>
@@ -11219,7 +11326,7 @@
         <w:pStyle w:val="Paragraphedeliste"/>
         <w:numPr>
           <w:ilvl w:val="0"/>
-          <w:numId w:val="3"/>
+          <w:numId w:val="8"/>
         </w:numPr>
         <w:spacing w:after="80"/>
       </w:pPr>
@@ -11231,11 +11338,13 @@
       <w:pPr>
         <w:pStyle w:val="Titre2"/>
       </w:pPr>
-      <w:bookmarkStart w:id="46" w:name="_Toc243470773"/>
+      <w:bookmarkStart w:id="92" w:name="_Toc243477434"/>
+      <w:bookmarkStart w:id="93" w:name="_Toc47"/>
       <w:r>
         <w:t>Frozen or fine-tuned? Validation and test disagree</w:t>
       </w:r>
-      <w:bookmarkEnd w:id="46"/>
+      <w:bookmarkEnd w:id="92"/>
+      <w:bookmarkEnd w:id="93"/>
     </w:p>
     <w:p>
       <w:pPr>
@@ -11259,11 +11368,13 @@
       <w:pPr>
         <w:pStyle w:val="Titre2"/>
       </w:pPr>
-      <w:bookmarkStart w:id="47" w:name="_Toc243470774"/>
+      <w:bookmarkStart w:id="94" w:name="_Toc243477435"/>
+      <w:bookmarkStart w:id="95" w:name="_Toc48"/>
       <w:r>
         <w:t>Speed and size</w:t>
       </w:r>
-      <w:bookmarkEnd w:id="47"/>
+      <w:bookmarkEnd w:id="94"/>
+      <w:bookmarkEnd w:id="95"/>
     </w:p>
     <w:p>
       <w:pPr>
@@ -11277,11 +11388,13 @@
       <w:pPr>
         <w:pStyle w:val="Titre2"/>
       </w:pPr>
-      <w:bookmarkStart w:id="48" w:name="_Toc243470775"/>
+      <w:bookmarkStart w:id="96" w:name="_Toc243477436"/>
+      <w:bookmarkStart w:id="97" w:name="_Toc49"/>
       <w:r>
         <w:t>Recommendation to the director</w:t>
       </w:r>
-      <w:bookmarkEnd w:id="48"/>
+      <w:bookmarkEnd w:id="96"/>
+      <w:bookmarkEnd w:id="97"/>
     </w:p>
     <w:p>
       <w:pPr>
@@ -11306,7 +11419,7 @@
         <w:pStyle w:val="Paragraphedeliste"/>
         <w:numPr>
           <w:ilvl w:val="0"/>
-          <w:numId w:val="4"/>
+          <w:numId w:val="9"/>
         </w:numPr>
         <w:spacing w:after="80"/>
       </w:pPr>
@@ -11326,7 +11439,7 @@
         <w:pStyle w:val="Paragraphedeliste"/>
         <w:numPr>
           <w:ilvl w:val="0"/>
-          <w:numId w:val="4"/>
+          <w:numId w:val="9"/>
         </w:numPr>
         <w:spacing w:after="80"/>
       </w:pPr>
@@ -11346,7 +11459,7 @@
         <w:pStyle w:val="Paragraphedeliste"/>
         <w:numPr>
           <w:ilvl w:val="0"/>
-          <w:numId w:val="4"/>
+          <w:numId w:val="9"/>
         </w:numPr>
         <w:spacing w:after="80"/>
       </w:pPr>
@@ -11374,11 +11487,14 @@
         <w:pStyle w:val="Titre1"/>
         <w:pageBreakBefore/>
       </w:pPr>
-      <w:bookmarkStart w:id="49" w:name="_Toc243470776"/>
-      <w:r>
+      <w:bookmarkStart w:id="98" w:name="_Toc243477437"/>
+      <w:bookmarkStart w:id="99" w:name="_Toc50"/>
+      <w:r>
+        <w:lastRenderedPageBreak/>
         <w:t>9. Bonus: what about transformers like BERT? (notebook 07)</w:t>
       </w:r>
-      <w:bookmarkEnd w:id="49"/>
+      <w:bookmarkEnd w:id="98"/>
+      <w:bookmarkEnd w:id="99"/>
     </w:p>
     <w:tbl>
       <w:tblPr>
@@ -12134,7 +12250,7 @@
         <w:pStyle w:val="Paragraphedeliste"/>
         <w:numPr>
           <w:ilvl w:val="0"/>
-          <w:numId w:val="3"/>
+          <w:numId w:val="8"/>
         </w:numPr>
         <w:spacing w:after="80"/>
       </w:pPr>
@@ -12154,7 +12270,7 @@
         <w:pStyle w:val="Paragraphedeliste"/>
         <w:numPr>
           <w:ilvl w:val="0"/>
-          <w:numId w:val="3"/>
+          <w:numId w:val="8"/>
         </w:numPr>
         <w:spacing w:after="80"/>
       </w:pPr>
@@ -12174,7 +12290,7 @@
         <w:pStyle w:val="Paragraphedeliste"/>
         <w:numPr>
           <w:ilvl w:val="0"/>
-          <w:numId w:val="3"/>
+          <w:numId w:val="8"/>
         </w:numPr>
         <w:spacing w:after="80"/>
       </w:pPr>
@@ -12194,7 +12310,7 @@
         <w:pStyle w:val="Paragraphedeliste"/>
         <w:numPr>
           <w:ilvl w:val="0"/>
-          <w:numId w:val="3"/>
+          <w:numId w:val="8"/>
         </w:numPr>
         <w:spacing w:after="80"/>
       </w:pPr>
@@ -12214,7 +12330,7 @@
         <w:pStyle w:val="Paragraphedeliste"/>
         <w:numPr>
           <w:ilvl w:val="0"/>
-          <w:numId w:val="3"/>
+          <w:numId w:val="8"/>
         </w:numPr>
         <w:spacing w:after="80"/>
       </w:pPr>
@@ -12238,8 +12354,9 @@
         <w:rPr>
           <w:noProof/>
         </w:rPr>
+        <w:lastRenderedPageBreak/>
         <w:drawing>
-          <wp:inline distT="0" distB="0" distL="0" distR="0" wp14:anchorId="7BB8C87B" wp14:editId="7BB8C87C">
+          <wp:inline distT="0" distB="0" distL="0" distR="0" wp14:anchorId="44C38F54" wp14:editId="44C38F55">
             <wp:extent cx="4381500" cy="2486025"/>
             <wp:effectExtent l="0" t="0" r="0" b="0"/>
             <wp:docPr id="6" name="07_transformers_accuracy_vs_speed.png" descr="Transformers on validation: CLIP is more accurate, but slower." title="Transformers on validation: CLIP is more accurate, but slower."/>
@@ -12299,11 +12416,14 @@
         <w:pStyle w:val="Titre1"/>
         <w:pageBreakBefore/>
       </w:pPr>
-      <w:bookmarkStart w:id="50" w:name="_Toc243470777"/>
-      <w:r>
+      <w:bookmarkStart w:id="100" w:name="_Toc243477438"/>
+      <w:bookmarkStart w:id="101" w:name="_Toc51"/>
+      <w:r>
+        <w:lastRenderedPageBreak/>
         <w:t>10. Key numbers to know by heart</w:t>
       </w:r>
-      <w:bookmarkEnd w:id="50"/>
+      <w:bookmarkEnd w:id="100"/>
+      <w:bookmarkEnd w:id="101"/>
     </w:p>
     <w:tbl>
       <w:tblPr>
@@ -13556,11 +13676,14 @@
         <w:pStyle w:val="Titre1"/>
         <w:pageBreakBefore/>
       </w:pPr>
-      <w:bookmarkStart w:id="51" w:name="_Toc243470778"/>
-      <w:r>
+      <w:bookmarkStart w:id="102" w:name="_Toc243477439"/>
+      <w:bookmarkStart w:id="103" w:name="_Toc52"/>
+      <w:r>
+        <w:lastRenderedPageBreak/>
         <w:t>11. Concepts in simple words</w:t>
       </w:r>
-      <w:bookmarkEnd w:id="51"/>
+      <w:bookmarkEnd w:id="102"/>
+      <w:bookmarkEnd w:id="103"/>
     </w:p>
     <w:tbl>
       <w:tblPr>
@@ -15262,6 +15385,7 @@
                 <w:sz w:val="19"/>
                 <w:szCs w:val="19"/>
               </w:rPr>
+              <w:lastRenderedPageBreak/>
               <w:t>Confusion matrix</w:t>
             </w:r>
           </w:p>
@@ -15745,11 +15869,14 @@
         <w:pStyle w:val="Titre1"/>
         <w:pageBreakBefore/>
       </w:pPr>
-      <w:bookmarkStart w:id="52" w:name="_Toc243470779"/>
-      <w:r>
+      <w:bookmarkStart w:id="104" w:name="_Toc243477440"/>
+      <w:bookmarkStart w:id="105" w:name="_Toc53"/>
+      <w:r>
+        <w:lastRenderedPageBreak/>
         <w:t>12. Questions you may get, with answers</w:t>
       </w:r>
-      <w:bookmarkEnd w:id="52"/>
+      <w:bookmarkEnd w:id="104"/>
+      <w:bookmarkEnd w:id="105"/>
     </w:p>
     <w:p>
       <w:pPr>
@@ -15766,11 +15893,13 @@
       <w:pPr>
         <w:pStyle w:val="Titre2"/>
       </w:pPr>
-      <w:bookmarkStart w:id="53" w:name="_Toc243470780"/>
+      <w:bookmarkStart w:id="106" w:name="_Toc243477441"/>
+      <w:bookmarkStart w:id="107" w:name="_Toc54"/>
       <w:r>
         <w:t>About the data</w:t>
       </w:r>
-      <w:bookmarkEnd w:id="53"/>
+      <w:bookmarkEnd w:id="106"/>
+      <w:bookmarkEnd w:id="107"/>
     </w:p>
     <w:p>
       <w:pPr>
@@ -15886,11 +16015,13 @@
       <w:pPr>
         <w:pStyle w:val="Titre2"/>
       </w:pPr>
-      <w:bookmarkStart w:id="54" w:name="_Toc243470781"/>
+      <w:bookmarkStart w:id="108" w:name="_Toc243477442"/>
+      <w:bookmarkStart w:id="109" w:name="_Toc55"/>
       <w:r>
         <w:t>About the MLP</w:t>
       </w:r>
-      <w:bookmarkEnd w:id="54"/>
+      <w:bookmarkEnd w:id="108"/>
+      <w:bookmarkEnd w:id="109"/>
     </w:p>
     <w:p>
       <w:pPr>
@@ -16006,11 +16137,13 @@
       <w:pPr>
         <w:pStyle w:val="Titre2"/>
       </w:pPr>
-      <w:bookmarkStart w:id="55" w:name="_Toc243470782"/>
+      <w:bookmarkStart w:id="110" w:name="_Toc243477443"/>
+      <w:bookmarkStart w:id="111" w:name="_Toc56"/>
       <w:r>
         <w:t>About training and diagnosis</w:t>
       </w:r>
-      <w:bookmarkEnd w:id="55"/>
+      <w:bookmarkEnd w:id="110"/>
+      <w:bookmarkEnd w:id="111"/>
     </w:p>
     <w:p>
       <w:pPr>
@@ -16104,11 +16237,14 @@
       <w:pPr>
         <w:pStyle w:val="Titre2"/>
       </w:pPr>
-      <w:bookmarkStart w:id="56" w:name="_Toc243470783"/>
-      <w:r>
+      <w:bookmarkStart w:id="112" w:name="_Toc243477444"/>
+      <w:bookmarkStart w:id="113" w:name="_Toc57"/>
+      <w:r>
+        <w:lastRenderedPageBreak/>
         <w:t>About ResNet</w:t>
       </w:r>
-      <w:bookmarkEnd w:id="56"/>
+      <w:bookmarkEnd w:id="112"/>
+      <w:bookmarkEnd w:id="113"/>
     </w:p>
     <w:p>
       <w:pPr>
@@ -16246,11 +16382,13 @@
       <w:pPr>
         <w:pStyle w:val="Titre2"/>
       </w:pPr>
-      <w:bookmarkStart w:id="57" w:name="_Toc243470784"/>
+      <w:bookmarkStart w:id="114" w:name="_Toc243477445"/>
+      <w:bookmarkStart w:id="115" w:name="_Toc58"/>
       <w:r>
         <w:t>About the results and the recommendation</w:t>
       </w:r>
-      <w:bookmarkEnd w:id="57"/>
+      <w:bookmarkEnd w:id="114"/>
+      <w:bookmarkEnd w:id="115"/>
     </w:p>
     <w:p>
       <w:pPr>
@@ -16388,11 +16526,14 @@
       <w:pPr>
         <w:pStyle w:val="Titre2"/>
       </w:pPr>
-      <w:bookmarkStart w:id="58" w:name="_Toc243470785"/>
-      <w:r>
+      <w:bookmarkStart w:id="116" w:name="_Toc243477446"/>
+      <w:bookmarkStart w:id="117" w:name="_Toc59"/>
+      <w:r>
+        <w:lastRenderedPageBreak/>
         <w:t>About the project</w:t>
       </w:r>
-      <w:bookmarkEnd w:id="58"/>
+      <w:bookmarkEnd w:id="116"/>
+      <w:bookmarkEnd w:id="117"/>
     </w:p>
     <w:p>
       <w:pPr>
@@ -16443,11 +16584,14 @@
         <w:pStyle w:val="Titre1"/>
         <w:pageBreakBefore/>
       </w:pPr>
-      <w:bookmarkStart w:id="59" w:name="_Toc243470786"/>
-      <w:r>
+      <w:bookmarkStart w:id="118" w:name="_Toc243477447"/>
+      <w:bookmarkStart w:id="119" w:name="_Toc60"/>
+      <w:r>
+        <w:lastRenderedPageBreak/>
         <w:t>13. Limits to admit, and next steps</w:t>
       </w:r>
-      <w:bookmarkEnd w:id="59"/>
+      <w:bookmarkEnd w:id="118"/>
+      <w:bookmarkEnd w:id="119"/>
     </w:p>
     <w:p>
       <w:pPr>
@@ -17236,11 +17380,14 @@
         <w:pStyle w:val="Titre1"/>
         <w:pageBreakBefore/>
       </w:pPr>
-      <w:bookmarkStart w:id="60" w:name="_Toc243470787"/>
-      <w:r>
+      <w:bookmarkStart w:id="120" w:name="_Toc243477448"/>
+      <w:bookmarkStart w:id="121" w:name="_Toc61"/>
+      <w:r>
+        <w:lastRenderedPageBreak/>
         <w:t>14. Git history and how to reproduce</w:t>
       </w:r>
-      <w:bookmarkEnd w:id="60"/>
+      <w:bookmarkEnd w:id="120"/>
+      <w:bookmarkEnd w:id="121"/>
     </w:p>
     <w:p>
       <w:pPr>
@@ -18094,7 +18241,7 @@
         <w:pStyle w:val="Paragraphedeliste"/>
         <w:numPr>
           <w:ilvl w:val="0"/>
-          <w:numId w:val="5"/>
+          <w:numId w:val="10"/>
         </w:numPr>
         <w:spacing w:after="80"/>
       </w:pPr>
@@ -18112,7 +18259,7 @@
         <w:pStyle w:val="Paragraphedeliste"/>
         <w:numPr>
           <w:ilvl w:val="0"/>
-          <w:numId w:val="5"/>
+          <w:numId w:val="10"/>
         </w:numPr>
         <w:spacing w:after="80"/>
       </w:pPr>
@@ -18133,7 +18280,7 @@
         <w:pStyle w:val="Paragraphedeliste"/>
         <w:numPr>
           <w:ilvl w:val="0"/>
-          <w:numId w:val="5"/>
+          <w:numId w:val="10"/>
         </w:numPr>
         <w:spacing w:after="80"/>
       </w:pPr>
@@ -18151,7 +18298,7 @@
         <w:pStyle w:val="Paragraphedeliste"/>
         <w:numPr>
           <w:ilvl w:val="0"/>
-          <w:numId w:val="5"/>
+          <w:numId w:val="10"/>
         </w:numPr>
         <w:spacing w:after="80"/>
       </w:pPr>
@@ -18191,11 +18338,14 @@
         <w:pStyle w:val="Titre1"/>
         <w:pageBreakBefore/>
       </w:pPr>
-      <w:bookmarkStart w:id="61" w:name="_Toc243470788"/>
-      <w:r>
+      <w:bookmarkStart w:id="122" w:name="_Toc243477449"/>
+      <w:bookmarkStart w:id="123" w:name="_Toc62"/>
+      <w:r>
+        <w:lastRenderedPageBreak/>
         <w:t>15. The 10-minute talk, slide by slide</w:t>
       </w:r>
-      <w:bookmarkEnd w:id="61"/>
+      <w:bookmarkEnd w:id="122"/>
+      <w:bookmarkEnd w:id="123"/>
     </w:p>
     <w:p>
       <w:pPr>
@@ -18427,7 +18577,7 @@
                 <w:sz w:val="19"/>
                 <w:szCs w:val="19"/>
               </w:rPr>
-              <w:t>0:30</w:t>
+              <w:t>0:40</w:t>
             </w:r>
           </w:p>
         </w:tc>
@@ -18536,7 +18686,7 @@
                 <w:sz w:val="19"/>
                 <w:szCs w:val="19"/>
               </w:rPr>
-              <w:t>0:50</w:t>
+              <w:t>0:45</w:t>
             </w:r>
           </w:p>
         </w:tc>
@@ -18859,7 +19009,7 @@
                 <w:sz w:val="19"/>
                 <w:szCs w:val="19"/>
               </w:rPr>
-              <w:t>0:55</w:t>
+              <w:t>1:05</w:t>
             </w:r>
           </w:p>
         </w:tc>
@@ -19184,7 +19334,7 @@
                 <w:sz w:val="19"/>
                 <w:szCs w:val="19"/>
               </w:rPr>
-              <w:t>0:50</w:t>
+              <w:t>0:55</w:t>
             </w:r>
           </w:p>
         </w:tc>
@@ -19400,7 +19550,7 @@
                 <w:sz w:val="19"/>
                 <w:szCs w:val="19"/>
               </w:rPr>
-              <w:t>0:45</w:t>
+              <w:t>0:40</w:t>
             </w:r>
           </w:p>
         </w:tc>
@@ -19507,7 +19657,7 @@
                 <w:sz w:val="19"/>
                 <w:szCs w:val="19"/>
               </w:rPr>
-              <w:t>1:10</w:t>
+              <w:t>1:05</w:t>
             </w:r>
           </w:p>
         </w:tc>
@@ -19543,6 +19693,186 @@
       <w:pPr>
         <w:spacing w:after="120"/>
       </w:pPr>
+    </w:p>
+    <w:p>
+      <w:pPr>
+        <w:pStyle w:val="Titre2"/>
+      </w:pPr>
+      <w:bookmarkStart w:id="124" w:name="_Toc243477450"/>
+      <w:bookmarkStart w:id="125" w:name="_Toc63"/>
+      <w:r>
+        <w:t>The thread: each result opens the next step</w:t>
+      </w:r>
+      <w:bookmarkEnd w:id="124"/>
+      <w:bookmarkEnd w:id="125"/>
+    </w:p>
+    <w:p>
+      <w:pPr>
+        <w:spacing w:after="120"/>
+      </w:pPr>
+      <w:r>
+        <w:t>A jury follows a story better than a list. Each slide ends with the problem that the next slide tries to solve:</w:t>
+      </w:r>
+    </w:p>
+    <w:p>
+      <w:pPr>
+        <w:pStyle w:val="Paragraphedeliste"/>
+        <w:numPr>
+          <w:ilvl w:val="0"/>
+          <w:numId w:val="3"/>
+        </w:numPr>
+        <w:spacing w:after="80"/>
+      </w:pPr>
+      <w:r>
+        <w:rPr>
+          <w:b/>
+          <w:bCs/>
+        </w:rPr>
+        <w:t>Slide 3 to 4</w:t>
+      </w:r>
+      <w:r>
+        <w:t>: the data is fair, so we can build our first model.</w:t>
+      </w:r>
+    </w:p>
+    <w:p>
+      <w:pPr>
+        <w:pStyle w:val="Paragraphedeliste"/>
+        <w:numPr>
+          <w:ilvl w:val="0"/>
+          <w:numId w:val="3"/>
+        </w:numPr>
+        <w:spacing w:after="80"/>
+      </w:pPr>
+      <w:r>
+        <w:rPr>
+          <w:b/>
+          <w:bCs/>
+        </w:rPr>
+        <w:t>Slide 4 to 5</w:t>
+      </w:r>
+      <w:r>
+        <w:t>: the MLP overfits, so we try to fix it; but first we check that the training itself is healthy.</w:t>
+      </w:r>
+    </w:p>
+    <w:p>
+      <w:pPr>
+        <w:pStyle w:val="Paragraphedeliste"/>
+        <w:numPr>
+          <w:ilvl w:val="0"/>
+          <w:numId w:val="3"/>
+        </w:numPr>
+        <w:spacing w:after="80"/>
+      </w:pPr>
+      <w:r>
+        <w:rPr>
+          <w:b/>
+          <w:bCs/>
+        </w:rPr>
+        <w:t>Slide 5 to 6</w:t>
+      </w:r>
+      <w:r>
+        <w:t>: overfitting is under control, but it is not the only way a training can fail, so we break it four times on purpose.</w:t>
+      </w:r>
+    </w:p>
+    <w:p>
+      <w:pPr>
+        <w:pStyle w:val="Paragraphedeliste"/>
+        <w:numPr>
+          <w:ilvl w:val="0"/>
+          <w:numId w:val="3"/>
+        </w:numPr>
+        <w:spacing w:after="80"/>
+      </w:pPr>
+      <w:r>
+        <w:rPr>
+          <w:b/>
+          <w:bCs/>
+        </w:rPr>
+        <w:t>Slide 5 and 6 to 7</w:t>
+      </w:r>
+      <w:r>
+        <w:t>: the MLP sees colours, not shapes (Cubism 7 %), so we need a network that sees shapes: a pretrained CNN.</w:t>
+      </w:r>
+    </w:p>
+    <w:p>
+      <w:pPr>
+        <w:pStyle w:val="Paragraphedeliste"/>
+        <w:numPr>
+          <w:ilvl w:val="0"/>
+          <w:numId w:val="3"/>
+        </w:numPr>
+        <w:spacing w:after="80"/>
+      </w:pPr>
+      <w:r>
+        <w:rPr>
+          <w:b/>
+          <w:bCs/>
+        </w:rPr>
+        <w:t>Slide 7 to 8</w:t>
+      </w:r>
+      <w:r>
+        <w:t>: a model this strong can cheat by recognising the painter, so we test the painter rule.</w:t>
+      </w:r>
+    </w:p>
+    <w:p>
+      <w:pPr>
+        <w:pStyle w:val="Paragraphedeliste"/>
+        <w:numPr>
+          <w:ilvl w:val="0"/>
+          <w:numId w:val="3"/>
+        </w:numPr>
+        <w:spacing w:after="80"/>
+      </w:pPr>
+      <w:r>
+        <w:rPr>
+          <w:b/>
+          <w:bCs/>
+        </w:rPr>
+        <w:t>Slide 8 to 9</w:t>
+      </w:r>
+      <w:r>
+        <w:t>: the split protects us, so we can trust the final test.</w:t>
+      </w:r>
+    </w:p>
+    <w:p>
+      <w:pPr>
+        <w:pStyle w:val="Paragraphedeliste"/>
+        <w:numPr>
+          <w:ilvl w:val="0"/>
+          <w:numId w:val="3"/>
+        </w:numPr>
+        <w:spacing w:after="80"/>
+      </w:pPr>
+      <w:r>
+        <w:rPr>
+          <w:b/>
+          <w:bCs/>
+        </w:rPr>
+        <w:t>Slide 9 to 10</w:t>
+      </w:r>
+      <w:r>
+        <w:t>: accuracy is half of the director's question; the other half is the cost on a kiosk.</w:t>
+      </w:r>
+    </w:p>
+    <w:p>
+      <w:pPr>
+        <w:pStyle w:val="Paragraphedeliste"/>
+        <w:numPr>
+          <w:ilvl w:val="0"/>
+          <w:numId w:val="3"/>
+        </w:numPr>
+        <w:spacing w:after="80"/>
+      </w:pPr>
+      <w:r>
+        <w:rPr>
+          <w:b/>
+          <w:bCs/>
+        </w:rPr>
+        <w:t>Slide 10 to 11</w:t>
+      </w:r>
+      <w:r>
+        <w:t>: we have both halves, so we can answer the director.</w:t>
+      </w:r>
     </w:p>
     <w:p>
       <w:pPr>
@@ -19627,7 +19957,7 @@
         <w:sz w:val="16"/>
         <w:szCs w:val="16"/>
       </w:rPr>
-      <w:t>1</w:t>
+      <w:t>30</w:t>
     </w:r>
     <w:r>
       <w:rPr>
@@ -19663,64 +19993,150 @@
 <file path=word/numbering.xml><?xml version="1.0" encoding="utf-8"?>
 <w:numbering xmlns:wpc="http://schemas.microsoft.com/office/word/2010/wordprocessingCanvas" xmlns:cx="http://schemas.microsoft.com/office/drawing/2014/chartex" xmlns:cx1="http://schemas.microsoft.com/office/drawing/2015/9/8/chartex" xmlns:cx2="http://schemas.microsoft.com/office/drawing/2015/10/21/chartex" xmlns:cx3="http://schemas.microsoft.com/office/drawing/2016/5/9/chartex" xmlns:cx4="http://schemas.microsoft.com/office/drawing/2016/5/10/chartex" xmlns:cx5="http://schemas.microsoft.com/office/drawing/2016/5/11/chartex" xmlns:cx6="http://schemas.microsoft.com/office/drawing/2016/5/12/chartex" xmlns:cx7="http://schemas.microsoft.com/office/drawing/2016/5/13/chartex" xmlns:cx8="http://schemas.microsoft.com/office/drawing/2016/5/14/chartex" xmlns:mc="http://schemas.openxmlformats.org/markup-compatibility/2006" xmlns:aink="http://schemas.microsoft.com/office/drawing/2016/ink" xmlns:am3d="http://schemas.microsoft.com/office/drawing/2017/model3d" xmlns:o="urn:schemas-microsoft-com:office:office" xmlns:oel="http://schemas.microsoft.com/office/2019/extlst" xmlns:r="http://schemas.openxmlformats.org/officeDocument/2006/relationships" xmlns:m="http://schemas.openxmlformats.org/officeDocument/2006/math" xmlns:v="urn:schemas-microsoft-com:vml" xmlns:wp14="http://schemas.microsoft.com/office/word/2010/wordprocessingDrawing" xmlns:wp="http://schemas.openxmlformats.org/drawingml/2006/wordprocessingDrawing" xmlns:w10="urn:schemas-microsoft-com:office:word" xmlns:w="http://schemas.openxmlformats.org/wordprocessingml/2006/main" xmlns:w14="http://schemas.microsoft.com/office/word/2010/wordml" xmlns:w15="http://schemas.microsoft.com/office/word/2012/wordml" xmlns:w16cex="http://schemas.microsoft.com/office/word/2018/wordml/cex" xmlns:w16cid="http://schemas.microsoft.com/office/word/2016/wordml/cid" xmlns:w16="http://schemas.microsoft.com/office/word/2018/wordml" xmlns:w16du="http://schemas.microsoft.com/office/word/2023/wordml/word16du" xmlns:w16sdtdh="http://schemas.microsoft.com/office/word/2020/wordml/sdtdatahash" xmlns:w16sdtfl="http://schemas.microsoft.com/office/word/2024/wordml/sdtformatlock" xmlns:w16se="http://schemas.microsoft.com/office/word/2015/wordml/symex" xmlns:wpg="http://schemas.microsoft.com/office/word/2010/wordprocessingGroup" xmlns:wpi="http://schemas.microsoft.com/office/word/2010/wordprocessingInk" xmlns:wne="http://schemas.microsoft.com/office/word/2006/wordml" xmlns:wps="http://schemas.microsoft.com/office/word/2010/wordprocessingShape" mc:Ignorable="w14 w15 w16se w16cid w16 w16cex w16sdtdh w16sdtfl w16du wp14">
   <w:abstractNum w:abstractNumId="0" w15:restartNumberingAfterBreak="0">
-    <w:nsid w:val="347E022F"/>
+    <w:nsid w:val="0CD745DF"/>
     <w:multiLevelType w:val="hybridMultilevel"/>
-    <w:tmpl w:val="D0D4F3D0"/>
-    <w:lvl w:ilvl="0" w:tplc="3DEAC8DE">
+    <w:tmpl w:val="85A0C2F2"/>
+    <w:lvl w:ilvl="0" w:tplc="3FBA1C1E">
       <w:start w:val="1"/>
-      <w:numFmt w:val="bullet"/>
-      <w:lvlText w:val="•"/>
+      <w:numFmt w:val="decimal"/>
+      <w:lvlText w:val="%1."/>
       <w:lvlJc w:val="left"/>
       <w:pPr>
-        <w:ind w:left="400" w:hanging="260"/>
+        <w:ind w:left="400" w:hanging="300"/>
       </w:pPr>
     </w:lvl>
-    <w:lvl w:ilvl="1" w:tplc="623619C6">
+    <w:lvl w:ilvl="1" w:tplc="297CD7C4">
       <w:numFmt w:val="decimal"/>
       <w:lvlText w:val=""/>
       <w:lvlJc w:val="left"/>
     </w:lvl>
-    <w:lvl w:ilvl="2" w:tplc="1206E3EC">
+    <w:lvl w:ilvl="2" w:tplc="1E8C4F64">
       <w:numFmt w:val="decimal"/>
       <w:lvlText w:val=""/>
       <w:lvlJc w:val="left"/>
     </w:lvl>
-    <w:lvl w:ilvl="3" w:tplc="93F24E5E">
+    <w:lvl w:ilvl="3" w:tplc="37CE4176">
       <w:numFmt w:val="decimal"/>
       <w:lvlText w:val=""/>
       <w:lvlJc w:val="left"/>
     </w:lvl>
-    <w:lvl w:ilvl="4" w:tplc="CD42FD9E">
+    <w:lvl w:ilvl="4" w:tplc="CD141514">
       <w:numFmt w:val="decimal"/>
       <w:lvlText w:val=""/>
       <w:lvlJc w:val="left"/>
     </w:lvl>
-    <w:lvl w:ilvl="5" w:tplc="51C08CB0">
+    <w:lvl w:ilvl="5" w:tplc="0CB4D6AC">
       <w:numFmt w:val="decimal"/>
       <w:lvlText w:val=""/>
       <w:lvlJc w:val="left"/>
     </w:lvl>
-    <w:lvl w:ilvl="6" w:tplc="C6D8FA96">
+    <w:lvl w:ilvl="6" w:tplc="2D989198">
       <w:numFmt w:val="decimal"/>
       <w:lvlText w:val=""/>
       <w:lvlJc w:val="left"/>
     </w:lvl>
-    <w:lvl w:ilvl="7" w:tplc="11320118">
+    <w:lvl w:ilvl="7" w:tplc="1F8A420C">
       <w:numFmt w:val="decimal"/>
       <w:lvlText w:val=""/>
       <w:lvlJc w:val="left"/>
     </w:lvl>
-    <w:lvl w:ilvl="8" w:tplc="5FEEC25A">
+    <w:lvl w:ilvl="8" w:tplc="138C4FC6">
       <w:numFmt w:val="decimal"/>
       <w:lvlText w:val=""/>
       <w:lvlJc w:val="left"/>
     </w:lvl>
   </w:abstractNum>
   <w:abstractNum w:abstractNumId="1" w15:restartNumberingAfterBreak="0">
-    <w:nsid w:val="4EDE4EDC"/>
+    <w:nsid w:val="0EDF2EE6"/>
     <w:multiLevelType w:val="hybridMultilevel"/>
-    <w:tmpl w:val="2B3AAA1E"/>
-    <w:lvl w:ilvl="0" w:tplc="B0E6D7A4">
+    <w:tmpl w:val="0980C432"/>
+    <w:lvl w:ilvl="0" w:tplc="2F18FD28" w:tentative="1">
+      <w:start w:val="1"/>
+      <w:numFmt w:val="bullet"/>
+      <w:lvlText w:val="●"/>
+      <w:lvlJc w:val="left"/>
+      <w:pPr>
+        <w:ind w:left="720" w:hanging="360"/>
+      </w:pPr>
+    </w:lvl>
+    <w:lvl w:ilvl="1" w:tplc="AD6A645A" w:tentative="1">
+      <w:start w:val="1"/>
+      <w:numFmt w:val="bullet"/>
+      <w:lvlText w:val="○"/>
+      <w:lvlJc w:val="left"/>
+      <w:pPr>
+        <w:ind w:left="1440" w:hanging="360"/>
+      </w:pPr>
+    </w:lvl>
+    <w:lvl w:ilvl="2" w:tplc="6B9CA7C6" w:tentative="1">
+      <w:start w:val="1"/>
+      <w:numFmt w:val="bullet"/>
+      <w:lvlText w:val="■"/>
+      <w:lvlJc w:val="left"/>
+      <w:pPr>
+        <w:ind w:left="2160" w:hanging="360"/>
+      </w:pPr>
+    </w:lvl>
+    <w:lvl w:ilvl="3" w:tplc="CFBABB28" w:tentative="1">
+      <w:start w:val="1"/>
+      <w:numFmt w:val="bullet"/>
+      <w:lvlText w:val="●"/>
+      <w:lvlJc w:val="left"/>
+      <w:pPr>
+        <w:ind w:left="2880" w:hanging="360"/>
+      </w:pPr>
+    </w:lvl>
+    <w:lvl w:ilvl="4" w:tplc="9DA4033A" w:tentative="1">
+      <w:start w:val="1"/>
+      <w:numFmt w:val="bullet"/>
+      <w:lvlText w:val="○"/>
+      <w:lvlJc w:val="left"/>
+      <w:pPr>
+        <w:ind w:left="3600" w:hanging="360"/>
+      </w:pPr>
+    </w:lvl>
+    <w:lvl w:ilvl="5" w:tplc="39C4A562" w:tentative="1">
+      <w:start w:val="1"/>
+      <w:numFmt w:val="bullet"/>
+      <w:lvlText w:val="■"/>
+      <w:lvlJc w:val="left"/>
+      <w:pPr>
+        <w:ind w:left="4320" w:hanging="360"/>
+      </w:pPr>
+    </w:lvl>
+    <w:lvl w:ilvl="6" w:tplc="4D5C123C" w:tentative="1">
+      <w:start w:val="1"/>
+      <w:numFmt w:val="bullet"/>
+      <w:lvlText w:val="●"/>
+      <w:lvlJc w:val="left"/>
+      <w:pPr>
+        <w:ind w:left="5040" w:hanging="360"/>
+      </w:pPr>
+    </w:lvl>
+    <w:lvl w:ilvl="7" w:tplc="E876B580" w:tentative="1">
+      <w:start w:val="1"/>
+      <w:numFmt w:val="bullet"/>
+      <w:lvlText w:val="●"/>
+      <w:lvlJc w:val="left"/>
+      <w:pPr>
+        <w:ind w:left="5760" w:hanging="360"/>
+      </w:pPr>
+    </w:lvl>
+    <w:lvl w:ilvl="8" w:tplc="646E45CE" w:tentative="1">
+      <w:start w:val="1"/>
+      <w:numFmt w:val="bullet"/>
+      <w:lvlText w:val="●"/>
+      <w:lvlJc w:val="left"/>
+      <w:pPr>
+        <w:ind w:left="6480" w:hanging="360"/>
+      </w:pPr>
+    </w:lvl>
+  </w:abstractNum>
+  <w:abstractNum w:abstractNumId="2" w15:restartNumberingAfterBreak="0">
+    <w:nsid w:val="12632571"/>
+    <w:multiLevelType w:val="hybridMultilevel"/>
+    <w:tmpl w:val="47A2812C"/>
+    <w:lvl w:ilvl="0" w:tplc="F03CDFFC">
       <w:start w:val="1"/>
       <w:numFmt w:val="decimal"/>
       <w:lvlText w:val="%1."/>
@@ -19729,106 +20145,138 @@
         <w:ind w:left="400" w:hanging="300"/>
       </w:pPr>
     </w:lvl>
-    <w:lvl w:ilvl="1" w:tplc="4AE0CE0A">
+    <w:lvl w:ilvl="1" w:tplc="68F610A2">
       <w:numFmt w:val="decimal"/>
       <w:lvlText w:val=""/>
       <w:lvlJc w:val="left"/>
     </w:lvl>
-    <w:lvl w:ilvl="2" w:tplc="E594DC7C">
+    <w:lvl w:ilvl="2" w:tplc="5DAE78FC">
       <w:numFmt w:val="decimal"/>
       <w:lvlText w:val=""/>
       <w:lvlJc w:val="left"/>
     </w:lvl>
-    <w:lvl w:ilvl="3" w:tplc="3814A198">
+    <w:lvl w:ilvl="3" w:tplc="E3E67000">
       <w:numFmt w:val="decimal"/>
       <w:lvlText w:val=""/>
       <w:lvlJc w:val="left"/>
     </w:lvl>
-    <w:lvl w:ilvl="4" w:tplc="DE9CB038">
+    <w:lvl w:ilvl="4" w:tplc="0D8E4816">
       <w:numFmt w:val="decimal"/>
       <w:lvlText w:val=""/>
       <w:lvlJc w:val="left"/>
     </w:lvl>
-    <w:lvl w:ilvl="5" w:tplc="C6F68556">
+    <w:lvl w:ilvl="5" w:tplc="CC3CAA48">
       <w:numFmt w:val="decimal"/>
       <w:lvlText w:val=""/>
       <w:lvlJc w:val="left"/>
     </w:lvl>
-    <w:lvl w:ilvl="6" w:tplc="BDB43B46">
+    <w:lvl w:ilvl="6" w:tplc="20A0E92A">
       <w:numFmt w:val="decimal"/>
       <w:lvlText w:val=""/>
       <w:lvlJc w:val="left"/>
     </w:lvl>
-    <w:lvl w:ilvl="7" w:tplc="5DA63968">
+    <w:lvl w:ilvl="7" w:tplc="ACF235EE">
       <w:numFmt w:val="decimal"/>
       <w:lvlText w:val=""/>
       <w:lvlJc w:val="left"/>
     </w:lvl>
-    <w:lvl w:ilvl="8" w:tplc="A5D45AA2">
-      <w:numFmt w:val="decimal"/>
-      <w:lvlText w:val=""/>
-      <w:lvlJc w:val="left"/>
-    </w:lvl>
-  </w:abstractNum>
-  <w:abstractNum w:abstractNumId="2" w15:restartNumberingAfterBreak="0">
-    <w:nsid w:val="6212103D"/>
-    <w:multiLevelType w:val="hybridMultilevel"/>
-    <w:tmpl w:val="41D84D16"/>
-    <w:lvl w:ilvl="0" w:tplc="D79C2AB0">
-      <w:start w:val="1"/>
-      <w:numFmt w:val="decimal"/>
-      <w:lvlText w:val="%1."/>
-      <w:lvlJc w:val="left"/>
-      <w:pPr>
-        <w:ind w:left="400" w:hanging="300"/>
-      </w:pPr>
-    </w:lvl>
-    <w:lvl w:ilvl="1" w:tplc="ED9C2E3A">
-      <w:numFmt w:val="decimal"/>
-      <w:lvlText w:val=""/>
-      <w:lvlJc w:val="left"/>
-    </w:lvl>
-    <w:lvl w:ilvl="2" w:tplc="C6FC6164">
-      <w:numFmt w:val="decimal"/>
-      <w:lvlText w:val=""/>
-      <w:lvlJc w:val="left"/>
-    </w:lvl>
-    <w:lvl w:ilvl="3" w:tplc="D6C62498">
-      <w:numFmt w:val="decimal"/>
-      <w:lvlText w:val=""/>
-      <w:lvlJc w:val="left"/>
-    </w:lvl>
-    <w:lvl w:ilvl="4" w:tplc="577EEA2A">
-      <w:numFmt w:val="decimal"/>
-      <w:lvlText w:val=""/>
-      <w:lvlJc w:val="left"/>
-    </w:lvl>
-    <w:lvl w:ilvl="5" w:tplc="CE78622A">
-      <w:numFmt w:val="decimal"/>
-      <w:lvlText w:val=""/>
-      <w:lvlJc w:val="left"/>
-    </w:lvl>
-    <w:lvl w:ilvl="6" w:tplc="706ECF40">
-      <w:numFmt w:val="decimal"/>
-      <w:lvlText w:val=""/>
-      <w:lvlJc w:val="left"/>
-    </w:lvl>
-    <w:lvl w:ilvl="7" w:tplc="5A001506">
-      <w:numFmt w:val="decimal"/>
-      <w:lvlText w:val=""/>
-      <w:lvlJc w:val="left"/>
-    </w:lvl>
-    <w:lvl w:ilvl="8" w:tplc="04B4DF90">
+    <w:lvl w:ilvl="8" w:tplc="7DEC6992">
       <w:numFmt w:val="decimal"/>
       <w:lvlText w:val=""/>
       <w:lvlJc w:val="left"/>
     </w:lvl>
   </w:abstractNum>
   <w:abstractNum w:abstractNumId="3" w15:restartNumberingAfterBreak="0">
-    <w:nsid w:val="697C157A"/>
+    <w:nsid w:val="1CDA20CF"/>
     <w:multiLevelType w:val="hybridMultilevel"/>
-    <w:tmpl w:val="40486F06"/>
-    <w:lvl w:ilvl="0" w:tplc="B8EE1A3A">
+    <w:tmpl w:val="D31EE368"/>
+    <w:lvl w:ilvl="0" w:tplc="9C5AC08E" w:tentative="1">
+      <w:start w:val="1"/>
+      <w:numFmt w:val="bullet"/>
+      <w:lvlText w:val="●"/>
+      <w:lvlJc w:val="left"/>
+      <w:pPr>
+        <w:ind w:left="720" w:hanging="360"/>
+      </w:pPr>
+    </w:lvl>
+    <w:lvl w:ilvl="1" w:tplc="8F70233A" w:tentative="1">
+      <w:start w:val="1"/>
+      <w:numFmt w:val="bullet"/>
+      <w:lvlText w:val="○"/>
+      <w:lvlJc w:val="left"/>
+      <w:pPr>
+        <w:ind w:left="1440" w:hanging="360"/>
+      </w:pPr>
+    </w:lvl>
+    <w:lvl w:ilvl="2" w:tplc="C92E967C" w:tentative="1">
+      <w:start w:val="1"/>
+      <w:numFmt w:val="bullet"/>
+      <w:lvlText w:val="■"/>
+      <w:lvlJc w:val="left"/>
+      <w:pPr>
+        <w:ind w:left="2160" w:hanging="360"/>
+      </w:pPr>
+    </w:lvl>
+    <w:lvl w:ilvl="3" w:tplc="931AC23E" w:tentative="1">
+      <w:start w:val="1"/>
+      <w:numFmt w:val="bullet"/>
+      <w:lvlText w:val="●"/>
+      <w:lvlJc w:val="left"/>
+      <w:pPr>
+        <w:ind w:left="2880" w:hanging="360"/>
+      </w:pPr>
+    </w:lvl>
+    <w:lvl w:ilvl="4" w:tplc="5D12F37E" w:tentative="1">
+      <w:start w:val="1"/>
+      <w:numFmt w:val="bullet"/>
+      <w:lvlText w:val="○"/>
+      <w:lvlJc w:val="left"/>
+      <w:pPr>
+        <w:ind w:left="3600" w:hanging="360"/>
+      </w:pPr>
+    </w:lvl>
+    <w:lvl w:ilvl="5" w:tplc="AAC82996" w:tentative="1">
+      <w:start w:val="1"/>
+      <w:numFmt w:val="bullet"/>
+      <w:lvlText w:val="■"/>
+      <w:lvlJc w:val="left"/>
+      <w:pPr>
+        <w:ind w:left="4320" w:hanging="360"/>
+      </w:pPr>
+    </w:lvl>
+    <w:lvl w:ilvl="6" w:tplc="B7442BDE" w:tentative="1">
+      <w:start w:val="1"/>
+      <w:numFmt w:val="bullet"/>
+      <w:lvlText w:val="●"/>
+      <w:lvlJc w:val="left"/>
+      <w:pPr>
+        <w:ind w:left="5040" w:hanging="360"/>
+      </w:pPr>
+    </w:lvl>
+    <w:lvl w:ilvl="7" w:tplc="428EC51C" w:tentative="1">
+      <w:start w:val="1"/>
+      <w:numFmt w:val="bullet"/>
+      <w:lvlText w:val="●"/>
+      <w:lvlJc w:val="left"/>
+      <w:pPr>
+        <w:ind w:left="5760" w:hanging="360"/>
+      </w:pPr>
+    </w:lvl>
+    <w:lvl w:ilvl="8" w:tplc="629207DE" w:tentative="1">
+      <w:start w:val="1"/>
+      <w:numFmt w:val="bullet"/>
+      <w:lvlText w:val="●"/>
+      <w:lvlJc w:val="left"/>
+      <w:pPr>
+        <w:ind w:left="6480" w:hanging="360"/>
+      </w:pPr>
+    </w:lvl>
+  </w:abstractNum>
+  <w:abstractNum w:abstractNumId="4" w15:restartNumberingAfterBreak="0">
+    <w:nsid w:val="26390707"/>
+    <w:multiLevelType w:val="hybridMultilevel"/>
+    <w:tmpl w:val="B3380312"/>
+    <w:lvl w:ilvl="0" w:tplc="29DEB616">
       <w:start w:val="1"/>
       <w:numFmt w:val="decimal"/>
       <w:lvlText w:val="%1."/>
@@ -19837,159 +20285,373 @@
         <w:ind w:left="400" w:hanging="300"/>
       </w:pPr>
     </w:lvl>
-    <w:lvl w:ilvl="1" w:tplc="8F7CEC10">
+    <w:lvl w:ilvl="1" w:tplc="DCC4F9A4">
       <w:numFmt w:val="decimal"/>
       <w:lvlText w:val=""/>
       <w:lvlJc w:val="left"/>
     </w:lvl>
-    <w:lvl w:ilvl="2" w:tplc="C7F461C0">
+    <w:lvl w:ilvl="2" w:tplc="8C6ED982">
       <w:numFmt w:val="decimal"/>
       <w:lvlText w:val=""/>
       <w:lvlJc w:val="left"/>
     </w:lvl>
-    <w:lvl w:ilvl="3" w:tplc="8A822852">
+    <w:lvl w:ilvl="3" w:tplc="EADC9C8A">
       <w:numFmt w:val="decimal"/>
       <w:lvlText w:val=""/>
       <w:lvlJc w:val="left"/>
     </w:lvl>
-    <w:lvl w:ilvl="4" w:tplc="2C2AB294">
+    <w:lvl w:ilvl="4" w:tplc="C5222086">
       <w:numFmt w:val="decimal"/>
       <w:lvlText w:val=""/>
       <w:lvlJc w:val="left"/>
     </w:lvl>
-    <w:lvl w:ilvl="5" w:tplc="6D549E06">
+    <w:lvl w:ilvl="5" w:tplc="0C22DE0C">
       <w:numFmt w:val="decimal"/>
       <w:lvlText w:val=""/>
       <w:lvlJc w:val="left"/>
     </w:lvl>
-    <w:lvl w:ilvl="6" w:tplc="BE4858DE">
+    <w:lvl w:ilvl="6" w:tplc="EFA8C8E6">
       <w:numFmt w:val="decimal"/>
       <w:lvlText w:val=""/>
       <w:lvlJc w:val="left"/>
     </w:lvl>
-    <w:lvl w:ilvl="7" w:tplc="D18688D2">
+    <w:lvl w:ilvl="7" w:tplc="9446A9E4">
       <w:numFmt w:val="decimal"/>
       <w:lvlText w:val=""/>
       <w:lvlJc w:val="left"/>
     </w:lvl>
-    <w:lvl w:ilvl="8" w:tplc="459E31F4">
+    <w:lvl w:ilvl="8" w:tplc="1C6CE010">
       <w:numFmt w:val="decimal"/>
       <w:lvlText w:val=""/>
       <w:lvlJc w:val="left"/>
     </w:lvl>
   </w:abstractNum>
-  <w:abstractNum w:abstractNumId="4" w15:restartNumberingAfterBreak="0">
-    <w:nsid w:val="7A6D7CFC"/>
+  <w:abstractNum w:abstractNumId="5" w15:restartNumberingAfterBreak="0">
+    <w:nsid w:val="31222CA5"/>
     <w:multiLevelType w:val="hybridMultilevel"/>
-    <w:tmpl w:val="B6EE4D72"/>
-    <w:lvl w:ilvl="0" w:tplc="61FED5D6" w:tentative="1">
+    <w:tmpl w:val="DD20D39E"/>
+    <w:lvl w:ilvl="0" w:tplc="D7205FCA">
       <w:start w:val="1"/>
       <w:numFmt w:val="bullet"/>
-      <w:lvlText w:val="●"/>
+      <w:lvlText w:val="•"/>
       <w:lvlJc w:val="left"/>
       <w:pPr>
-        <w:ind w:left="720" w:hanging="360"/>
+        <w:ind w:left="400" w:hanging="260"/>
       </w:pPr>
     </w:lvl>
-    <w:lvl w:ilvl="1" w:tplc="2B723AA0" w:tentative="1">
+    <w:lvl w:ilvl="1" w:tplc="2814D8E6">
+      <w:numFmt w:val="decimal"/>
+      <w:lvlText w:val=""/>
+      <w:lvlJc w:val="left"/>
+    </w:lvl>
+    <w:lvl w:ilvl="2" w:tplc="88F482DE">
+      <w:numFmt w:val="decimal"/>
+      <w:lvlText w:val=""/>
+      <w:lvlJc w:val="left"/>
+    </w:lvl>
+    <w:lvl w:ilvl="3" w:tplc="E07CB9F0">
+      <w:numFmt w:val="decimal"/>
+      <w:lvlText w:val=""/>
+      <w:lvlJc w:val="left"/>
+    </w:lvl>
+    <w:lvl w:ilvl="4" w:tplc="E12A9DAE">
+      <w:numFmt w:val="decimal"/>
+      <w:lvlText w:val=""/>
+      <w:lvlJc w:val="left"/>
+    </w:lvl>
+    <w:lvl w:ilvl="5" w:tplc="B664A636">
+      <w:numFmt w:val="decimal"/>
+      <w:lvlText w:val=""/>
+      <w:lvlJc w:val="left"/>
+    </w:lvl>
+    <w:lvl w:ilvl="6" w:tplc="F67A3DAA">
+      <w:numFmt w:val="decimal"/>
+      <w:lvlText w:val=""/>
+      <w:lvlJc w:val="left"/>
+    </w:lvl>
+    <w:lvl w:ilvl="7" w:tplc="154A20FA">
+      <w:numFmt w:val="decimal"/>
+      <w:lvlText w:val=""/>
+      <w:lvlJc w:val="left"/>
+    </w:lvl>
+    <w:lvl w:ilvl="8" w:tplc="9158698A">
+      <w:numFmt w:val="decimal"/>
+      <w:lvlText w:val=""/>
+      <w:lvlJc w:val="left"/>
+    </w:lvl>
+  </w:abstractNum>
+  <w:abstractNum w:abstractNumId="6" w15:restartNumberingAfterBreak="0">
+    <w:nsid w:val="364B15AD"/>
+    <w:multiLevelType w:val="hybridMultilevel"/>
+    <w:tmpl w:val="7F6028B0"/>
+    <w:lvl w:ilvl="0" w:tplc="7152DAB8">
       <w:start w:val="1"/>
       <w:numFmt w:val="bullet"/>
-      <w:lvlText w:val="○"/>
+      <w:lvlText w:val="•"/>
       <w:lvlJc w:val="left"/>
       <w:pPr>
-        <w:ind w:left="1440" w:hanging="360"/>
+        <w:ind w:left="400" w:hanging="260"/>
       </w:pPr>
     </w:lvl>
-    <w:lvl w:ilvl="2" w:tplc="9FF87B44" w:tentative="1">
-      <w:start w:val="1"/>
-      <w:numFmt w:val="bullet"/>
-      <w:lvlText w:val="■"/>
+    <w:lvl w:ilvl="1" w:tplc="3E386BF0">
+      <w:numFmt w:val="decimal"/>
+      <w:lvlText w:val=""/>
       <w:lvlJc w:val="left"/>
-      <w:pPr>
-        <w:ind w:left="2160" w:hanging="360"/>
-      </w:pPr>
     </w:lvl>
-    <w:lvl w:ilvl="3" w:tplc="65803632" w:tentative="1">
-      <w:start w:val="1"/>
-      <w:numFmt w:val="bullet"/>
-      <w:lvlText w:val="●"/>
+    <w:lvl w:ilvl="2" w:tplc="6BB6B53E">
+      <w:numFmt w:val="decimal"/>
+      <w:lvlText w:val=""/>
       <w:lvlJc w:val="left"/>
-      <w:pPr>
-        <w:ind w:left="2880" w:hanging="360"/>
-      </w:pPr>
     </w:lvl>
-    <w:lvl w:ilvl="4" w:tplc="6F241D0A" w:tentative="1">
-      <w:start w:val="1"/>
-      <w:numFmt w:val="bullet"/>
-      <w:lvlText w:val="○"/>
+    <w:lvl w:ilvl="3" w:tplc="871E18A6">
+      <w:numFmt w:val="decimal"/>
+      <w:lvlText w:val=""/>
       <w:lvlJc w:val="left"/>
-      <w:pPr>
-        <w:ind w:left="3600" w:hanging="360"/>
-      </w:pPr>
     </w:lvl>
-    <w:lvl w:ilvl="5" w:tplc="5DCE0F58" w:tentative="1">
-      <w:start w:val="1"/>
-      <w:numFmt w:val="bullet"/>
-      <w:lvlText w:val="■"/>
+    <w:lvl w:ilvl="4" w:tplc="E2C09EE2">
+      <w:numFmt w:val="decimal"/>
+      <w:lvlText w:val=""/>
       <w:lvlJc w:val="left"/>
-      <w:pPr>
-        <w:ind w:left="4320" w:hanging="360"/>
-      </w:pPr>
     </w:lvl>
-    <w:lvl w:ilvl="6" w:tplc="E034C17E" w:tentative="1">
-      <w:start w:val="1"/>
-      <w:numFmt w:val="bullet"/>
-      <w:lvlText w:val="●"/>
+    <w:lvl w:ilvl="5" w:tplc="D3748418">
+      <w:numFmt w:val="decimal"/>
+      <w:lvlText w:val=""/>
       <w:lvlJc w:val="left"/>
-      <w:pPr>
-        <w:ind w:left="5040" w:hanging="360"/>
-      </w:pPr>
     </w:lvl>
-    <w:lvl w:ilvl="7" w:tplc="937C6AF8" w:tentative="1">
-      <w:start w:val="1"/>
-      <w:numFmt w:val="bullet"/>
-      <w:lvlText w:val="●"/>
+    <w:lvl w:ilvl="6" w:tplc="12DE50BA">
+      <w:numFmt w:val="decimal"/>
+      <w:lvlText w:val=""/>
       <w:lvlJc w:val="left"/>
-      <w:pPr>
-        <w:ind w:left="5760" w:hanging="360"/>
-      </w:pPr>
     </w:lvl>
-    <w:lvl w:ilvl="8" w:tplc="1E227F4A" w:tentative="1">
-      <w:start w:val="1"/>
-      <w:numFmt w:val="bullet"/>
-      <w:lvlText w:val="●"/>
+    <w:lvl w:ilvl="7" w:tplc="6750E78E">
+      <w:numFmt w:val="decimal"/>
+      <w:lvlText w:val=""/>
       <w:lvlJc w:val="left"/>
-      <w:pPr>
-        <w:ind w:left="6480" w:hanging="360"/>
-      </w:pPr>
+    </w:lvl>
+    <w:lvl w:ilvl="8" w:tplc="D406729C">
+      <w:numFmt w:val="decimal"/>
+      <w:lvlText w:val=""/>
+      <w:lvlJc w:val="left"/>
     </w:lvl>
   </w:abstractNum>
-  <w:num w:numId="1" w16cid:durableId="548339992">
+  <w:abstractNum w:abstractNumId="7" w15:restartNumberingAfterBreak="0">
+    <w:nsid w:val="370D35A7"/>
+    <w:multiLevelType w:val="hybridMultilevel"/>
+    <w:tmpl w:val="F35C9C68"/>
+    <w:lvl w:ilvl="0" w:tplc="E3B08598">
+      <w:start w:val="1"/>
+      <w:numFmt w:val="decimal"/>
+      <w:lvlText w:val="%1."/>
+      <w:lvlJc w:val="left"/>
+      <w:pPr>
+        <w:ind w:left="400" w:hanging="300"/>
+      </w:pPr>
+    </w:lvl>
+    <w:lvl w:ilvl="1" w:tplc="7F880AD6">
+      <w:numFmt w:val="decimal"/>
+      <w:lvlText w:val=""/>
+      <w:lvlJc w:val="left"/>
+    </w:lvl>
+    <w:lvl w:ilvl="2" w:tplc="FDE27830">
+      <w:numFmt w:val="decimal"/>
+      <w:lvlText w:val=""/>
+      <w:lvlJc w:val="left"/>
+    </w:lvl>
+    <w:lvl w:ilvl="3" w:tplc="45FC2080">
+      <w:numFmt w:val="decimal"/>
+      <w:lvlText w:val=""/>
+      <w:lvlJc w:val="left"/>
+    </w:lvl>
+    <w:lvl w:ilvl="4" w:tplc="439E976C">
+      <w:numFmt w:val="decimal"/>
+      <w:lvlText w:val=""/>
+      <w:lvlJc w:val="left"/>
+    </w:lvl>
+    <w:lvl w:ilvl="5" w:tplc="AB4AE63A">
+      <w:numFmt w:val="decimal"/>
+      <w:lvlText w:val=""/>
+      <w:lvlJc w:val="left"/>
+    </w:lvl>
+    <w:lvl w:ilvl="6" w:tplc="E73EE076">
+      <w:numFmt w:val="decimal"/>
+      <w:lvlText w:val=""/>
+      <w:lvlJc w:val="left"/>
+    </w:lvl>
+    <w:lvl w:ilvl="7" w:tplc="8FEE4042">
+      <w:numFmt w:val="decimal"/>
+      <w:lvlText w:val=""/>
+      <w:lvlJc w:val="left"/>
+    </w:lvl>
+    <w:lvl w:ilvl="8" w:tplc="7FE4BCA6">
+      <w:numFmt w:val="decimal"/>
+      <w:lvlText w:val=""/>
+      <w:lvlJc w:val="left"/>
+    </w:lvl>
+  </w:abstractNum>
+  <w:abstractNum w:abstractNumId="8" w15:restartNumberingAfterBreak="0">
+    <w:nsid w:val="6D99609A"/>
+    <w:multiLevelType w:val="hybridMultilevel"/>
+    <w:tmpl w:val="6FCC6644"/>
+    <w:lvl w:ilvl="0" w:tplc="B07288EE">
+      <w:start w:val="1"/>
+      <w:numFmt w:val="decimal"/>
+      <w:lvlText w:val="%1."/>
+      <w:lvlJc w:val="left"/>
+      <w:pPr>
+        <w:ind w:left="400" w:hanging="300"/>
+      </w:pPr>
+    </w:lvl>
+    <w:lvl w:ilvl="1" w:tplc="9EB874EA">
+      <w:numFmt w:val="decimal"/>
+      <w:lvlText w:val=""/>
+      <w:lvlJc w:val="left"/>
+    </w:lvl>
+    <w:lvl w:ilvl="2" w:tplc="B8C83E7E">
+      <w:numFmt w:val="decimal"/>
+      <w:lvlText w:val=""/>
+      <w:lvlJc w:val="left"/>
+    </w:lvl>
+    <w:lvl w:ilvl="3" w:tplc="C54698FC">
+      <w:numFmt w:val="decimal"/>
+      <w:lvlText w:val=""/>
+      <w:lvlJc w:val="left"/>
+    </w:lvl>
+    <w:lvl w:ilvl="4" w:tplc="92F8A6BC">
+      <w:numFmt w:val="decimal"/>
+      <w:lvlText w:val=""/>
+      <w:lvlJc w:val="left"/>
+    </w:lvl>
+    <w:lvl w:ilvl="5" w:tplc="FF340226">
+      <w:numFmt w:val="decimal"/>
+      <w:lvlText w:val=""/>
+      <w:lvlJc w:val="left"/>
+    </w:lvl>
+    <w:lvl w:ilvl="6" w:tplc="D23AB3FC">
+      <w:numFmt w:val="decimal"/>
+      <w:lvlText w:val=""/>
+      <w:lvlJc w:val="left"/>
+    </w:lvl>
+    <w:lvl w:ilvl="7" w:tplc="6B366B9C">
+      <w:numFmt w:val="decimal"/>
+      <w:lvlText w:val=""/>
+      <w:lvlJc w:val="left"/>
+    </w:lvl>
+    <w:lvl w:ilvl="8" w:tplc="D56E5BD6">
+      <w:numFmt w:val="decimal"/>
+      <w:lvlText w:val=""/>
+      <w:lvlJc w:val="left"/>
+    </w:lvl>
+  </w:abstractNum>
+  <w:abstractNum w:abstractNumId="9" w15:restartNumberingAfterBreak="0">
+    <w:nsid w:val="79D106D3"/>
+    <w:multiLevelType w:val="hybridMultilevel"/>
+    <w:tmpl w:val="FA3C6C60"/>
+    <w:lvl w:ilvl="0" w:tplc="1A1E3E34">
+      <w:start w:val="1"/>
+      <w:numFmt w:val="decimal"/>
+      <w:lvlText w:val="%1."/>
+      <w:lvlJc w:val="left"/>
+      <w:pPr>
+        <w:ind w:left="400" w:hanging="300"/>
+      </w:pPr>
+    </w:lvl>
+    <w:lvl w:ilvl="1" w:tplc="D62E38BC">
+      <w:numFmt w:val="decimal"/>
+      <w:lvlText w:val=""/>
+      <w:lvlJc w:val="left"/>
+    </w:lvl>
+    <w:lvl w:ilvl="2" w:tplc="E2044F48">
+      <w:numFmt w:val="decimal"/>
+      <w:lvlText w:val=""/>
+      <w:lvlJc w:val="left"/>
+    </w:lvl>
+    <w:lvl w:ilvl="3" w:tplc="1728A71E">
+      <w:numFmt w:val="decimal"/>
+      <w:lvlText w:val=""/>
+      <w:lvlJc w:val="left"/>
+    </w:lvl>
+    <w:lvl w:ilvl="4" w:tplc="9C04F222">
+      <w:numFmt w:val="decimal"/>
+      <w:lvlText w:val=""/>
+      <w:lvlJc w:val="left"/>
+    </w:lvl>
+    <w:lvl w:ilvl="5" w:tplc="B324F456">
+      <w:numFmt w:val="decimal"/>
+      <w:lvlText w:val=""/>
+      <w:lvlJc w:val="left"/>
+    </w:lvl>
+    <w:lvl w:ilvl="6" w:tplc="1C0C74B4">
+      <w:numFmt w:val="decimal"/>
+      <w:lvlText w:val=""/>
+      <w:lvlJc w:val="left"/>
+    </w:lvl>
+    <w:lvl w:ilvl="7" w:tplc="AB2E70C4">
+      <w:numFmt w:val="decimal"/>
+      <w:lvlText w:val=""/>
+      <w:lvlJc w:val="left"/>
+    </w:lvl>
+    <w:lvl w:ilvl="8" w:tplc="8CAABA62">
+      <w:numFmt w:val="decimal"/>
+      <w:lvlText w:val=""/>
+      <w:lvlJc w:val="left"/>
+    </w:lvl>
+  </w:abstractNum>
+  <w:num w:numId="1" w16cid:durableId="1779333182">
+    <w:abstractNumId w:val="1"/>
+    <w:lvlOverride w:ilvl="0">
+      <w:startOverride w:val="1"/>
+    </w:lvlOverride>
+  </w:num>
+  <w:num w:numId="2" w16cid:durableId="2056923297">
+    <w:abstractNumId w:val="0"/>
+    <w:lvlOverride w:ilvl="0">
+      <w:startOverride w:val="1"/>
+    </w:lvlOverride>
+  </w:num>
+  <w:num w:numId="3" w16cid:durableId="1263219051">
+    <w:abstractNumId w:val="5"/>
+    <w:lvlOverride w:ilvl="0">
+      <w:startOverride w:val="1"/>
+    </w:lvlOverride>
+  </w:num>
+  <w:num w:numId="4" w16cid:durableId="1002397754">
     <w:abstractNumId w:val="4"/>
     <w:lvlOverride w:ilvl="0">
       <w:startOverride w:val="1"/>
     </w:lvlOverride>
   </w:num>
-  <w:num w:numId="2" w16cid:durableId="2099061094">
+  <w:num w:numId="5" w16cid:durableId="799879050">
+    <w:abstractNumId w:val="8"/>
+    <w:lvlOverride w:ilvl="0">
+      <w:startOverride w:val="1"/>
+    </w:lvlOverride>
+  </w:num>
+  <w:num w:numId="6" w16cid:durableId="1218249638">
     <w:abstractNumId w:val="3"/>
     <w:lvlOverride w:ilvl="0">
       <w:startOverride w:val="1"/>
     </w:lvlOverride>
   </w:num>
-  <w:num w:numId="3" w16cid:durableId="797603245">
-    <w:abstractNumId w:val="0"/>
+  <w:num w:numId="7" w16cid:durableId="407769568">
+    <w:abstractNumId w:val="9"/>
     <w:lvlOverride w:ilvl="0">
       <w:startOverride w:val="1"/>
     </w:lvlOverride>
   </w:num>
-  <w:num w:numId="4" w16cid:durableId="1055355430">
-    <w:abstractNumId w:val="2"/>
+  <w:num w:numId="8" w16cid:durableId="1593203644">
+    <w:abstractNumId w:val="6"/>
     <w:lvlOverride w:ilvl="0">
       <w:startOverride w:val="1"/>
     </w:lvlOverride>
   </w:num>
-  <w:num w:numId="5" w16cid:durableId="695935193">
-    <w:abstractNumId w:val="1"/>
+  <w:num w:numId="9" w16cid:durableId="2027366974">
+    <w:abstractNumId w:val="7"/>
+    <w:lvlOverride w:ilvl="0">
+      <w:startOverride w:val="1"/>
+    </w:lvlOverride>
+  </w:num>
+  <w:num w:numId="10" w16cid:durableId="169372883">
+    <w:abstractNumId w:val="2"/>
     <w:lvlOverride w:ilvl="0">
       <w:startOverride w:val="1"/>
     </w:lvlOverride>
@@ -20622,30 +21284,51 @@
       <w:szCs w:val="20"/>
     </w:rPr>
   </w:style>
-  <w:style w:type="paragraph" w:styleId="TM1">
-    <w:name w:val="toc 1"/>
+  <w:style w:type="paragraph" w:styleId="En-tte">
+    <w:name w:val="header"/>
     <w:basedOn w:val="Normal"/>
-    <w:next w:val="Normal"/>
-    <w:autoRedefine/>
-    <w:uiPriority w:val="39"/>
+    <w:link w:val="En-tteCar"/>
+    <w:uiPriority w:val="99"/>
+    <w:semiHidden/>
     <w:unhideWhenUsed/>
-    <w:rsid w:val="004649E9"/>
+    <w:rsid w:val="00385A1D"/>
     <w:pPr>
-      <w:spacing w:after="100"/>
+      <w:tabs>
+        <w:tab w:val="center" w:pos="4536"/>
+        <w:tab w:val="right" w:pos="9072"/>
+      </w:tabs>
     </w:pPr>
   </w:style>
-  <w:style w:type="paragraph" w:styleId="TM2">
-    <w:name w:val="toc 2"/>
+  <w:style w:type="character" w:customStyle="1" w:styleId="En-tteCar">
+    <w:name w:val="En-tête Car"/>
+    <w:basedOn w:val="Policepardfaut"/>
+    <w:link w:val="En-tte"/>
+    <w:uiPriority w:val="99"/>
+    <w:semiHidden/>
+    <w:rsid w:val="00385A1D"/>
+  </w:style>
+  <w:style w:type="paragraph" w:styleId="Pieddepage">
+    <w:name w:val="footer"/>
     <w:basedOn w:val="Normal"/>
-    <w:next w:val="Normal"/>
-    <w:autoRedefine/>
-    <w:uiPriority w:val="39"/>
+    <w:link w:val="PieddepageCar"/>
+    <w:uiPriority w:val="99"/>
+    <w:semiHidden/>
     <w:unhideWhenUsed/>
-    <w:rsid w:val="004649E9"/>
+    <w:rsid w:val="00385A1D"/>
     <w:pPr>
-      <w:spacing w:after="100"/>
-      <w:ind w:left="210"/>
+      <w:tabs>
+        <w:tab w:val="center" w:pos="4536"/>
+        <w:tab w:val="right" w:pos="9072"/>
+      </w:tabs>
     </w:pPr>
+  </w:style>
+  <w:style w:type="character" w:customStyle="1" w:styleId="PieddepageCar">
+    <w:name w:val="Pied de page Car"/>
+    <w:basedOn w:val="Policepardfaut"/>
+    <w:link w:val="Pieddepage"/>
+    <w:uiPriority w:val="99"/>
+    <w:semiHidden/>
+    <w:rsid w:val="00385A1D"/>
   </w:style>
 </w:styles>
 </file>

</xml_diff>

<commit_message>
Update the study guide for the 10-slide talk
</commit_message>
<xml_diff>
--- a/docs/oral_study_guide.docx
+++ b/docs/oral_study_guide.docx
@@ -93,12 +93,13 @@
     <w:sdt>
       <w:sdtPr>
         <w:alias w:val="Contents"/>
-        <w:id w:val="-129861409"/>
+        <w:id w:val="1243600410"/>
       </w:sdtPr>
       <w:sdtEndPr/>
       <w:sdtContent>
         <w:p>
           <w:pPr>
+            <w:pStyle w:val="TM1"/>
             <w:tabs>
               <w:tab w:val="right" w:leader="dot" w:pos="9628"/>
             </w:tabs>
@@ -115,7 +116,7 @@
           <w:r>
             <w:fldChar w:fldCharType="separate"/>
           </w:r>
-          <w:hyperlink w:anchor="_Toc243477388" w:history="1">
+          <w:hyperlink w:anchor="_Toc243481292" w:history="1">
             <w:r>
               <w:rPr>
                 <w:rStyle w:val="Lienhypertexte"/>
@@ -139,7 +140,7 @@
               <w:rPr>
                 <w:noProof/>
               </w:rPr>
-              <w:instrText xml:space="preserve"> PAGEREF _Toc243477388 \h </w:instrText>
+              <w:instrText xml:space="preserve"> PAGEREF _Toc243481292 \h </w:instrText>
             </w:r>
             <w:r>
               <w:rPr>
@@ -168,6 +169,7 @@
         </w:p>
         <w:p>
           <w:pPr>
+            <w:pStyle w:val="TM1"/>
             <w:tabs>
               <w:tab w:val="right" w:leader="dot" w:pos="9628"/>
             </w:tabs>
@@ -175,7 +177,7 @@
               <w:noProof/>
             </w:rPr>
           </w:pPr>
-          <w:hyperlink w:anchor="_Toc243477389" w:history="1">
+          <w:hyperlink w:anchor="_Toc243481293" w:history="1">
             <w:r>
               <w:rPr>
                 <w:rStyle w:val="Lienhypertexte"/>
@@ -199,7 +201,7 @@
               <w:rPr>
                 <w:noProof/>
               </w:rPr>
-              <w:instrText xml:space="preserve"> PAGEREF _Toc243477389 \h </w:instrText>
+              <w:instrText xml:space="preserve"> PAGEREF _Toc243481293 \h </w:instrText>
             </w:r>
             <w:r>
               <w:rPr>
@@ -228,6 +230,7 @@
         </w:p>
         <w:p>
           <w:pPr>
+            <w:pStyle w:val="TM2"/>
             <w:tabs>
               <w:tab w:val="right" w:leader="dot" w:pos="9628"/>
             </w:tabs>
@@ -235,7 +238,7 @@
               <w:noProof/>
             </w:rPr>
           </w:pPr>
-          <w:hyperlink w:anchor="_Toc243477390" w:history="1">
+          <w:hyperlink w:anchor="_Toc243481294" w:history="1">
             <w:r>
               <w:rPr>
                 <w:rStyle w:val="Lienhypertexte"/>
@@ -259,7 +262,7 @@
               <w:rPr>
                 <w:noProof/>
               </w:rPr>
-              <w:instrText xml:space="preserve"> PAGEREF _Toc243477390 \h </w:instrText>
+              <w:instrText xml:space="preserve"> PAGEREF _Toc243481294 \h </w:instrText>
             </w:r>
             <w:r>
               <w:rPr>
@@ -288,6 +291,7 @@
         </w:p>
         <w:p>
           <w:pPr>
+            <w:pStyle w:val="TM2"/>
             <w:tabs>
               <w:tab w:val="right" w:leader="dot" w:pos="9628"/>
             </w:tabs>
@@ -295,7 +299,7 @@
               <w:noProof/>
             </w:rPr>
           </w:pPr>
-          <w:hyperlink w:anchor="_Toc243477391" w:history="1">
+          <w:hyperlink w:anchor="_Toc243481295" w:history="1">
             <w:r>
               <w:rPr>
                 <w:rStyle w:val="Lienhypertexte"/>
@@ -319,7 +323,7 @@
               <w:rPr>
                 <w:noProof/>
               </w:rPr>
-              <w:instrText xml:space="preserve"> PAGEREF _Toc243477391 \h </w:instrText>
+              <w:instrText xml:space="preserve"> PAGEREF _Toc243481295 \h </w:instrText>
             </w:r>
             <w:r>
               <w:rPr>
@@ -348,6 +352,7 @@
         </w:p>
         <w:p>
           <w:pPr>
+            <w:pStyle w:val="TM2"/>
             <w:tabs>
               <w:tab w:val="right" w:leader="dot" w:pos="9628"/>
             </w:tabs>
@@ -355,7 +360,7 @@
               <w:noProof/>
             </w:rPr>
           </w:pPr>
-          <w:hyperlink w:anchor="_Toc243477392" w:history="1">
+          <w:hyperlink w:anchor="_Toc243481296" w:history="1">
             <w:r>
               <w:rPr>
                 <w:rStyle w:val="Lienhypertexte"/>
@@ -379,7 +384,7 @@
               <w:rPr>
                 <w:noProof/>
               </w:rPr>
-              <w:instrText xml:space="preserve"> PAGEREF _Toc243477392 \h </w:instrText>
+              <w:instrText xml:space="preserve"> PAGEREF _Toc243481296 \h </w:instrText>
             </w:r>
             <w:r>
               <w:rPr>
@@ -408,6 +413,7 @@
         </w:p>
         <w:p>
           <w:pPr>
+            <w:pStyle w:val="TM2"/>
             <w:tabs>
               <w:tab w:val="right" w:leader="dot" w:pos="9628"/>
             </w:tabs>
@@ -415,7 +421,7 @@
               <w:noProof/>
             </w:rPr>
           </w:pPr>
-          <w:hyperlink w:anchor="_Toc243477393" w:history="1">
+          <w:hyperlink w:anchor="_Toc243481297" w:history="1">
             <w:r>
               <w:rPr>
                 <w:rStyle w:val="Lienhypertexte"/>
@@ -439,7 +445,7 @@
               <w:rPr>
                 <w:noProof/>
               </w:rPr>
-              <w:instrText xml:space="preserve"> PAGEREF _Toc243477393 \h </w:instrText>
+              <w:instrText xml:space="preserve"> PAGEREF _Toc243481297 \h </w:instrText>
             </w:r>
             <w:r>
               <w:rPr>
@@ -468,6 +474,7 @@
         </w:p>
         <w:p>
           <w:pPr>
+            <w:pStyle w:val="TM2"/>
             <w:tabs>
               <w:tab w:val="right" w:leader="dot" w:pos="9628"/>
             </w:tabs>
@@ -475,7 +482,7 @@
               <w:noProof/>
             </w:rPr>
           </w:pPr>
-          <w:hyperlink w:anchor="_Toc243477394" w:history="1">
+          <w:hyperlink w:anchor="_Toc243481298" w:history="1">
             <w:r>
               <w:rPr>
                 <w:rStyle w:val="Lienhypertexte"/>
@@ -499,7 +506,7 @@
               <w:rPr>
                 <w:noProof/>
               </w:rPr>
-              <w:instrText xml:space="preserve"> PAGEREF _Toc243477394 \h </w:instrText>
+              <w:instrText xml:space="preserve"> PAGEREF _Toc243481298 \h </w:instrText>
             </w:r>
             <w:r>
               <w:rPr>
@@ -528,6 +535,7 @@
         </w:p>
         <w:p>
           <w:pPr>
+            <w:pStyle w:val="TM2"/>
             <w:tabs>
               <w:tab w:val="right" w:leader="dot" w:pos="9628"/>
             </w:tabs>
@@ -535,7 +543,7 @@
               <w:noProof/>
             </w:rPr>
           </w:pPr>
-          <w:hyperlink w:anchor="_Toc243477395" w:history="1">
+          <w:hyperlink w:anchor="_Toc243481299" w:history="1">
             <w:r>
               <w:rPr>
                 <w:rStyle w:val="Lienhypertexte"/>
@@ -559,7 +567,7 @@
               <w:rPr>
                 <w:noProof/>
               </w:rPr>
-              <w:instrText xml:space="preserve"> PAGEREF _Toc243477395 \h </w:instrText>
+              <w:instrText xml:space="preserve"> PAGEREF _Toc243481299 \h </w:instrText>
             </w:r>
             <w:r>
               <w:rPr>
@@ -588,6 +596,7 @@
         </w:p>
         <w:p>
           <w:pPr>
+            <w:pStyle w:val="TM2"/>
             <w:tabs>
               <w:tab w:val="right" w:leader="dot" w:pos="9628"/>
             </w:tabs>
@@ -595,7 +604,7 @@
               <w:noProof/>
             </w:rPr>
           </w:pPr>
-          <w:hyperlink w:anchor="_Toc243477396" w:history="1">
+          <w:hyperlink w:anchor="_Toc243481300" w:history="1">
             <w:r>
               <w:rPr>
                 <w:rStyle w:val="Lienhypertexte"/>
@@ -619,7 +628,7 @@
               <w:rPr>
                 <w:noProof/>
               </w:rPr>
-              <w:instrText xml:space="preserve"> PAGEREF _Toc243477396 \h </w:instrText>
+              <w:instrText xml:space="preserve"> PAGEREF _Toc243481300 \h </w:instrText>
             </w:r>
             <w:r>
               <w:rPr>
@@ -648,6 +657,7 @@
         </w:p>
         <w:p>
           <w:pPr>
+            <w:pStyle w:val="TM2"/>
             <w:tabs>
               <w:tab w:val="right" w:leader="dot" w:pos="9628"/>
             </w:tabs>
@@ -655,7 +665,7 @@
               <w:noProof/>
             </w:rPr>
           </w:pPr>
-          <w:hyperlink w:anchor="_Toc243477397" w:history="1">
+          <w:hyperlink w:anchor="_Toc243481301" w:history="1">
             <w:r>
               <w:rPr>
                 <w:rStyle w:val="Lienhypertexte"/>
@@ -679,7 +689,7 @@
               <w:rPr>
                 <w:noProof/>
               </w:rPr>
-              <w:instrText xml:space="preserve"> PAGEREF _Toc243477397 \h </w:instrText>
+              <w:instrText xml:space="preserve"> PAGEREF _Toc243481301 \h </w:instrText>
             </w:r>
             <w:r>
               <w:rPr>
@@ -708,6 +718,7 @@
         </w:p>
         <w:p>
           <w:pPr>
+            <w:pStyle w:val="TM2"/>
             <w:tabs>
               <w:tab w:val="right" w:leader="dot" w:pos="9628"/>
             </w:tabs>
@@ -715,7 +726,7 @@
               <w:noProof/>
             </w:rPr>
           </w:pPr>
-          <w:hyperlink w:anchor="_Toc243477398" w:history="1">
+          <w:hyperlink w:anchor="_Toc243481302" w:history="1">
             <w:r>
               <w:rPr>
                 <w:rStyle w:val="Lienhypertexte"/>
@@ -739,7 +750,7 @@
               <w:rPr>
                 <w:noProof/>
               </w:rPr>
-              <w:instrText xml:space="preserve"> PAGEREF _Toc243477398 \h </w:instrText>
+              <w:instrText xml:space="preserve"> PAGEREF _Toc243481302 \h </w:instrText>
             </w:r>
             <w:r>
               <w:rPr>
@@ -768,6 +779,7 @@
         </w:p>
         <w:p>
           <w:pPr>
+            <w:pStyle w:val="TM2"/>
             <w:tabs>
               <w:tab w:val="right" w:leader="dot" w:pos="9628"/>
             </w:tabs>
@@ -775,7 +787,7 @@
               <w:noProof/>
             </w:rPr>
           </w:pPr>
-          <w:hyperlink w:anchor="_Toc243477399" w:history="1">
+          <w:hyperlink w:anchor="_Toc243481303" w:history="1">
             <w:r>
               <w:rPr>
                 <w:rStyle w:val="Lienhypertexte"/>
@@ -799,7 +811,7 @@
               <w:rPr>
                 <w:noProof/>
               </w:rPr>
-              <w:instrText xml:space="preserve"> PAGEREF _Toc243477399 \h </w:instrText>
+              <w:instrText xml:space="preserve"> PAGEREF _Toc243481303 \h </w:instrText>
             </w:r>
             <w:r>
               <w:rPr>
@@ -828,6 +840,7 @@
         </w:p>
         <w:p>
           <w:pPr>
+            <w:pStyle w:val="TM2"/>
             <w:tabs>
               <w:tab w:val="right" w:leader="dot" w:pos="9628"/>
             </w:tabs>
@@ -835,7 +848,7 @@
               <w:noProof/>
             </w:rPr>
           </w:pPr>
-          <w:hyperlink w:anchor="_Toc243477400" w:history="1">
+          <w:hyperlink w:anchor="_Toc243481304" w:history="1">
             <w:r>
               <w:rPr>
                 <w:rStyle w:val="Lienhypertexte"/>
@@ -859,7 +872,7 @@
               <w:rPr>
                 <w:noProof/>
               </w:rPr>
-              <w:instrText xml:space="preserve"> PAGEREF _Toc243477400 \h </w:instrText>
+              <w:instrText xml:space="preserve"> PAGEREF _Toc243481304 \h </w:instrText>
             </w:r>
             <w:r>
               <w:rPr>
@@ -888,6 +901,7 @@
         </w:p>
         <w:p>
           <w:pPr>
+            <w:pStyle w:val="TM2"/>
             <w:tabs>
               <w:tab w:val="right" w:leader="dot" w:pos="9628"/>
             </w:tabs>
@@ -895,7 +909,7 @@
               <w:noProof/>
             </w:rPr>
           </w:pPr>
-          <w:hyperlink w:anchor="_Toc243477401" w:history="1">
+          <w:hyperlink w:anchor="_Toc243481305" w:history="1">
             <w:r>
               <w:rPr>
                 <w:rStyle w:val="Lienhypertexte"/>
@@ -919,7 +933,7 @@
               <w:rPr>
                 <w:noProof/>
               </w:rPr>
-              <w:instrText xml:space="preserve"> PAGEREF _Toc243477401 \h </w:instrText>
+              <w:instrText xml:space="preserve"> PAGEREF _Toc243481305 \h </w:instrText>
             </w:r>
             <w:r>
               <w:rPr>
@@ -948,6 +962,7 @@
         </w:p>
         <w:p>
           <w:pPr>
+            <w:pStyle w:val="TM2"/>
             <w:tabs>
               <w:tab w:val="right" w:leader="dot" w:pos="9628"/>
             </w:tabs>
@@ -955,7 +970,7 @@
               <w:noProof/>
             </w:rPr>
           </w:pPr>
-          <w:hyperlink w:anchor="_Toc243477402" w:history="1">
+          <w:hyperlink w:anchor="_Toc243481306" w:history="1">
             <w:r>
               <w:rPr>
                 <w:rStyle w:val="Lienhypertexte"/>
@@ -979,7 +994,7 @@
               <w:rPr>
                 <w:noProof/>
               </w:rPr>
-              <w:instrText xml:space="preserve"> PAGEREF _Toc243477402 \h </w:instrText>
+              <w:instrText xml:space="preserve"> PAGEREF _Toc243481306 \h </w:instrText>
             </w:r>
             <w:r>
               <w:rPr>
@@ -1008,6 +1023,7 @@
         </w:p>
         <w:p>
           <w:pPr>
+            <w:pStyle w:val="TM2"/>
             <w:tabs>
               <w:tab w:val="right" w:leader="dot" w:pos="9628"/>
             </w:tabs>
@@ -1015,7 +1031,7 @@
               <w:noProof/>
             </w:rPr>
           </w:pPr>
-          <w:hyperlink w:anchor="_Toc243477403" w:history="1">
+          <w:hyperlink w:anchor="_Toc243481307" w:history="1">
             <w:r>
               <w:rPr>
                 <w:rStyle w:val="Lienhypertexte"/>
@@ -1039,7 +1055,7 @@
               <w:rPr>
                 <w:noProof/>
               </w:rPr>
-              <w:instrText xml:space="preserve"> PAGEREF _Toc243477403 \h </w:instrText>
+              <w:instrText xml:space="preserve"> PAGEREF _Toc243481307 \h </w:instrText>
             </w:r>
             <w:r>
               <w:rPr>
@@ -1068,6 +1084,7 @@
         </w:p>
         <w:p>
           <w:pPr>
+            <w:pStyle w:val="TM2"/>
             <w:tabs>
               <w:tab w:val="right" w:leader="dot" w:pos="9628"/>
             </w:tabs>
@@ -1075,7 +1092,7 @@
               <w:noProof/>
             </w:rPr>
           </w:pPr>
-          <w:hyperlink w:anchor="_Toc243477404" w:history="1">
+          <w:hyperlink w:anchor="_Toc243481308" w:history="1">
             <w:r>
               <w:rPr>
                 <w:rStyle w:val="Lienhypertexte"/>
@@ -1099,7 +1116,7 @@
               <w:rPr>
                 <w:noProof/>
               </w:rPr>
-              <w:instrText xml:space="preserve"> PAGEREF _Toc243477404 \h </w:instrText>
+              <w:instrText xml:space="preserve"> PAGEREF _Toc243481308 \h </w:instrText>
             </w:r>
             <w:r>
               <w:rPr>
@@ -1128,6 +1145,7 @@
         </w:p>
         <w:p>
           <w:pPr>
+            <w:pStyle w:val="TM2"/>
             <w:tabs>
               <w:tab w:val="right" w:leader="dot" w:pos="9628"/>
             </w:tabs>
@@ -1135,7 +1153,7 @@
               <w:noProof/>
             </w:rPr>
           </w:pPr>
-          <w:hyperlink w:anchor="_Toc243477405" w:history="1">
+          <w:hyperlink w:anchor="_Toc243481309" w:history="1">
             <w:r>
               <w:rPr>
                 <w:rStyle w:val="Lienhypertexte"/>
@@ -1159,7 +1177,7 @@
               <w:rPr>
                 <w:noProof/>
               </w:rPr>
-              <w:instrText xml:space="preserve"> PAGEREF _Toc243477405 \h </w:instrText>
+              <w:instrText xml:space="preserve"> PAGEREF _Toc243481309 \h </w:instrText>
             </w:r>
             <w:r>
               <w:rPr>
@@ -1188,6 +1206,7 @@
         </w:p>
         <w:p>
           <w:pPr>
+            <w:pStyle w:val="TM2"/>
             <w:tabs>
               <w:tab w:val="right" w:leader="dot" w:pos="9628"/>
             </w:tabs>
@@ -1195,7 +1214,7 @@
               <w:noProof/>
             </w:rPr>
           </w:pPr>
-          <w:hyperlink w:anchor="_Toc243477406" w:history="1">
+          <w:hyperlink w:anchor="_Toc243481310" w:history="1">
             <w:r>
               <w:rPr>
                 <w:rStyle w:val="Lienhypertexte"/>
@@ -1219,7 +1238,7 @@
               <w:rPr>
                 <w:noProof/>
               </w:rPr>
-              <w:instrText xml:space="preserve"> PAGEREF _Toc243477406 \h </w:instrText>
+              <w:instrText xml:space="preserve"> PAGEREF _Toc243481310 \h </w:instrText>
             </w:r>
             <w:r>
               <w:rPr>
@@ -1248,6 +1267,7 @@
         </w:p>
         <w:p>
           <w:pPr>
+            <w:pStyle w:val="TM2"/>
             <w:tabs>
               <w:tab w:val="right" w:leader="dot" w:pos="9628"/>
             </w:tabs>
@@ -1255,7 +1275,7 @@
               <w:noProof/>
             </w:rPr>
           </w:pPr>
-          <w:hyperlink w:anchor="_Toc243477407" w:history="1">
+          <w:hyperlink w:anchor="_Toc243481311" w:history="1">
             <w:r>
               <w:rPr>
                 <w:rStyle w:val="Lienhypertexte"/>
@@ -1279,7 +1299,7 @@
               <w:rPr>
                 <w:noProof/>
               </w:rPr>
-              <w:instrText xml:space="preserve"> PAGEREF _Toc243477407 \h </w:instrText>
+              <w:instrText xml:space="preserve"> PAGEREF _Toc243481311 \h </w:instrText>
             </w:r>
             <w:r>
               <w:rPr>
@@ -1308,6 +1328,7 @@
         </w:p>
         <w:p>
           <w:pPr>
+            <w:pStyle w:val="TM2"/>
             <w:tabs>
               <w:tab w:val="right" w:leader="dot" w:pos="9628"/>
             </w:tabs>
@@ -1315,7 +1336,7 @@
               <w:noProof/>
             </w:rPr>
           </w:pPr>
-          <w:hyperlink w:anchor="_Toc243477408" w:history="1">
+          <w:hyperlink w:anchor="_Toc243481312" w:history="1">
             <w:r>
               <w:rPr>
                 <w:rStyle w:val="Lienhypertexte"/>
@@ -1339,7 +1360,7 @@
               <w:rPr>
                 <w:noProof/>
               </w:rPr>
-              <w:instrText xml:space="preserve"> PAGEREF _Toc243477408 \h </w:instrText>
+              <w:instrText xml:space="preserve"> PAGEREF _Toc243481312 \h </w:instrText>
             </w:r>
             <w:r>
               <w:rPr>
@@ -1368,6 +1389,7 @@
         </w:p>
         <w:p>
           <w:pPr>
+            <w:pStyle w:val="TM1"/>
             <w:tabs>
               <w:tab w:val="right" w:leader="dot" w:pos="9628"/>
             </w:tabs>
@@ -1375,7 +1397,7 @@
               <w:noProof/>
             </w:rPr>
           </w:pPr>
-          <w:hyperlink w:anchor="_Toc243477409" w:history="1">
+          <w:hyperlink w:anchor="_Toc243481313" w:history="1">
             <w:r>
               <w:rPr>
                 <w:rStyle w:val="Lienhypertexte"/>
@@ -1399,7 +1421,7 @@
               <w:rPr>
                 <w:noProof/>
               </w:rPr>
-              <w:instrText xml:space="preserve"> PAGEREF _Toc243477409 \h </w:instrText>
+              <w:instrText xml:space="preserve"> PAGEREF _Toc243481313 \h </w:instrText>
             </w:r>
             <w:r>
               <w:rPr>
@@ -1428,6 +1450,7 @@
         </w:p>
         <w:p>
           <w:pPr>
+            <w:pStyle w:val="TM2"/>
             <w:tabs>
               <w:tab w:val="right" w:leader="dot" w:pos="9628"/>
             </w:tabs>
@@ -1435,7 +1458,7 @@
               <w:noProof/>
             </w:rPr>
           </w:pPr>
-          <w:hyperlink w:anchor="_Toc243477410" w:history="1">
+          <w:hyperlink w:anchor="_Toc243481314" w:history="1">
             <w:r>
               <w:rPr>
                 <w:rStyle w:val="Lienhypertexte"/>
@@ -1459,7 +1482,7 @@
               <w:rPr>
                 <w:noProof/>
               </w:rPr>
-              <w:instrText xml:space="preserve"> PAGEREF _Toc243477410 \h </w:instrText>
+              <w:instrText xml:space="preserve"> PAGEREF _Toc243481314 \h </w:instrText>
             </w:r>
             <w:r>
               <w:rPr>
@@ -1488,6 +1511,7 @@
         </w:p>
         <w:p>
           <w:pPr>
+            <w:pStyle w:val="TM2"/>
             <w:tabs>
               <w:tab w:val="right" w:leader="dot" w:pos="9628"/>
             </w:tabs>
@@ -1495,7 +1519,7 @@
               <w:noProof/>
             </w:rPr>
           </w:pPr>
-          <w:hyperlink w:anchor="_Toc243477411" w:history="1">
+          <w:hyperlink w:anchor="_Toc243481315" w:history="1">
             <w:r>
               <w:rPr>
                 <w:rStyle w:val="Lienhypertexte"/>
@@ -1519,7 +1543,7 @@
               <w:rPr>
                 <w:noProof/>
               </w:rPr>
-              <w:instrText xml:space="preserve"> PAGEREF _Toc243477411 \h </w:instrText>
+              <w:instrText xml:space="preserve"> PAGEREF _Toc243481315 \h </w:instrText>
             </w:r>
             <w:r>
               <w:rPr>
@@ -1548,6 +1572,7 @@
         </w:p>
         <w:p>
           <w:pPr>
+            <w:pStyle w:val="TM2"/>
             <w:tabs>
               <w:tab w:val="right" w:leader="dot" w:pos="9628"/>
             </w:tabs>
@@ -1555,7 +1580,7 @@
               <w:noProof/>
             </w:rPr>
           </w:pPr>
-          <w:hyperlink w:anchor="_Toc243477412" w:history="1">
+          <w:hyperlink w:anchor="_Toc243481316" w:history="1">
             <w:r>
               <w:rPr>
                 <w:rStyle w:val="Lienhypertexte"/>
@@ -1579,7 +1604,7 @@
               <w:rPr>
                 <w:noProof/>
               </w:rPr>
-              <w:instrText xml:space="preserve"> PAGEREF _Toc243477412 \h </w:instrText>
+              <w:instrText xml:space="preserve"> PAGEREF _Toc243481316 \h </w:instrText>
             </w:r>
             <w:r>
               <w:rPr>
@@ -1608,6 +1633,7 @@
         </w:p>
         <w:p>
           <w:pPr>
+            <w:pStyle w:val="TM1"/>
             <w:tabs>
               <w:tab w:val="right" w:leader="dot" w:pos="9628"/>
             </w:tabs>
@@ -1615,7 +1641,7 @@
               <w:noProof/>
             </w:rPr>
           </w:pPr>
-          <w:hyperlink w:anchor="_Toc243477413" w:history="1">
+          <w:hyperlink w:anchor="_Toc243481317" w:history="1">
             <w:r>
               <w:rPr>
                 <w:rStyle w:val="Lienhypertexte"/>
@@ -1639,7 +1665,7 @@
               <w:rPr>
                 <w:noProof/>
               </w:rPr>
-              <w:instrText xml:space="preserve"> PAGEREF _Toc243477413 \h </w:instrText>
+              <w:instrText xml:space="preserve"> PAGEREF _Toc243481317 \h </w:instrText>
             </w:r>
             <w:r>
               <w:rPr>
@@ -1668,6 +1694,7 @@
         </w:p>
         <w:p>
           <w:pPr>
+            <w:pStyle w:val="TM2"/>
             <w:tabs>
               <w:tab w:val="right" w:leader="dot" w:pos="9628"/>
             </w:tabs>
@@ -1675,7 +1702,7 @@
               <w:noProof/>
             </w:rPr>
           </w:pPr>
-          <w:hyperlink w:anchor="_Toc243477414" w:history="1">
+          <w:hyperlink w:anchor="_Toc243481318" w:history="1">
             <w:r>
               <w:rPr>
                 <w:rStyle w:val="Lienhypertexte"/>
@@ -1699,7 +1726,7 @@
               <w:rPr>
                 <w:noProof/>
               </w:rPr>
-              <w:instrText xml:space="preserve"> PAGEREF _Toc243477414 \h </w:instrText>
+              <w:instrText xml:space="preserve"> PAGEREF _Toc243481318 \h </w:instrText>
             </w:r>
             <w:r>
               <w:rPr>
@@ -1728,6 +1755,7 @@
         </w:p>
         <w:p>
           <w:pPr>
+            <w:pStyle w:val="TM2"/>
             <w:tabs>
               <w:tab w:val="right" w:leader="dot" w:pos="9628"/>
             </w:tabs>
@@ -1735,7 +1763,7 @@
               <w:noProof/>
             </w:rPr>
           </w:pPr>
-          <w:hyperlink w:anchor="_Toc243477415" w:history="1">
+          <w:hyperlink w:anchor="_Toc243481319" w:history="1">
             <w:r>
               <w:rPr>
                 <w:rStyle w:val="Lienhypertexte"/>
@@ -1759,7 +1787,7 @@
               <w:rPr>
                 <w:noProof/>
               </w:rPr>
-              <w:instrText xml:space="preserve"> PAGEREF _Toc243477415 \h </w:instrText>
+              <w:instrText xml:space="preserve"> PAGEREF _Toc243481319 \h </w:instrText>
             </w:r>
             <w:r>
               <w:rPr>
@@ -1788,6 +1816,7 @@
         </w:p>
         <w:p>
           <w:pPr>
+            <w:pStyle w:val="TM2"/>
             <w:tabs>
               <w:tab w:val="right" w:leader="dot" w:pos="9628"/>
             </w:tabs>
@@ -1795,7 +1824,7 @@
               <w:noProof/>
             </w:rPr>
           </w:pPr>
-          <w:hyperlink w:anchor="_Toc243477416" w:history="1">
+          <w:hyperlink w:anchor="_Toc243481320" w:history="1">
             <w:r>
               <w:rPr>
                 <w:rStyle w:val="Lienhypertexte"/>
@@ -1819,7 +1848,7 @@
               <w:rPr>
                 <w:noProof/>
               </w:rPr>
-              <w:instrText xml:space="preserve"> PAGEREF _Toc243477416 \h </w:instrText>
+              <w:instrText xml:space="preserve"> PAGEREF _Toc243481320 \h </w:instrText>
             </w:r>
             <w:r>
               <w:rPr>
@@ -1848,6 +1877,7 @@
         </w:p>
         <w:p>
           <w:pPr>
+            <w:pStyle w:val="TM2"/>
             <w:tabs>
               <w:tab w:val="right" w:leader="dot" w:pos="9628"/>
             </w:tabs>
@@ -1855,7 +1885,7 @@
               <w:noProof/>
             </w:rPr>
           </w:pPr>
-          <w:hyperlink w:anchor="_Toc243477417" w:history="1">
+          <w:hyperlink w:anchor="_Toc243481321" w:history="1">
             <w:r>
               <w:rPr>
                 <w:rStyle w:val="Lienhypertexte"/>
@@ -1879,7 +1909,7 @@
               <w:rPr>
                 <w:noProof/>
               </w:rPr>
-              <w:instrText xml:space="preserve"> PAGEREF _Toc243477417 \h </w:instrText>
+              <w:instrText xml:space="preserve"> PAGEREF _Toc243481321 \h </w:instrText>
             </w:r>
             <w:r>
               <w:rPr>
@@ -1908,6 +1938,7 @@
         </w:p>
         <w:p>
           <w:pPr>
+            <w:pStyle w:val="TM1"/>
             <w:tabs>
               <w:tab w:val="right" w:leader="dot" w:pos="9628"/>
             </w:tabs>
@@ -1915,7 +1946,7 @@
               <w:noProof/>
             </w:rPr>
           </w:pPr>
-          <w:hyperlink w:anchor="_Toc243477418" w:history="1">
+          <w:hyperlink w:anchor="_Toc243481322" w:history="1">
             <w:r>
               <w:rPr>
                 <w:rStyle w:val="Lienhypertexte"/>
@@ -1939,7 +1970,7 @@
               <w:rPr>
                 <w:noProof/>
               </w:rPr>
-              <w:instrText xml:space="preserve"> PAGEREF _Toc243477418 \h </w:instrText>
+              <w:instrText xml:space="preserve"> PAGEREF _Toc243481322 \h </w:instrText>
             </w:r>
             <w:r>
               <w:rPr>
@@ -1968,6 +1999,7 @@
         </w:p>
         <w:p>
           <w:pPr>
+            <w:pStyle w:val="TM2"/>
             <w:tabs>
               <w:tab w:val="right" w:leader="dot" w:pos="9628"/>
             </w:tabs>
@@ -1975,7 +2007,7 @@
               <w:noProof/>
             </w:rPr>
           </w:pPr>
-          <w:hyperlink w:anchor="_Toc243477419" w:history="1">
+          <w:hyperlink w:anchor="_Toc243481323" w:history="1">
             <w:r>
               <w:rPr>
                 <w:rStyle w:val="Lienhypertexte"/>
@@ -1999,7 +2031,7 @@
               <w:rPr>
                 <w:noProof/>
               </w:rPr>
-              <w:instrText xml:space="preserve"> PAGEREF _Toc243477419 \h </w:instrText>
+              <w:instrText xml:space="preserve"> PAGEREF _Toc243481323 \h </w:instrText>
             </w:r>
             <w:r>
               <w:rPr>
@@ -2028,6 +2060,7 @@
         </w:p>
         <w:p>
           <w:pPr>
+            <w:pStyle w:val="TM2"/>
             <w:tabs>
               <w:tab w:val="right" w:leader="dot" w:pos="9628"/>
             </w:tabs>
@@ -2035,7 +2068,7 @@
               <w:noProof/>
             </w:rPr>
           </w:pPr>
-          <w:hyperlink w:anchor="_Toc243477420" w:history="1">
+          <w:hyperlink w:anchor="_Toc243481324" w:history="1">
             <w:r>
               <w:rPr>
                 <w:rStyle w:val="Lienhypertexte"/>
@@ -2059,7 +2092,7 @@
               <w:rPr>
                 <w:noProof/>
               </w:rPr>
-              <w:instrText xml:space="preserve"> PAGEREF _Toc243477420 \h </w:instrText>
+              <w:instrText xml:space="preserve"> PAGEREF _Toc243481324 \h </w:instrText>
             </w:r>
             <w:r>
               <w:rPr>
@@ -2088,6 +2121,7 @@
         </w:p>
         <w:p>
           <w:pPr>
+            <w:pStyle w:val="TM2"/>
             <w:tabs>
               <w:tab w:val="right" w:leader="dot" w:pos="9628"/>
             </w:tabs>
@@ -2095,7 +2129,7 @@
               <w:noProof/>
             </w:rPr>
           </w:pPr>
-          <w:hyperlink w:anchor="_Toc243477421" w:history="1">
+          <w:hyperlink w:anchor="_Toc243481325" w:history="1">
             <w:r>
               <w:rPr>
                 <w:rStyle w:val="Lienhypertexte"/>
@@ -2119,7 +2153,7 @@
               <w:rPr>
                 <w:noProof/>
               </w:rPr>
-              <w:instrText xml:space="preserve"> PAGEREF _Toc243477421 \h </w:instrText>
+              <w:instrText xml:space="preserve"> PAGEREF _Toc243481325 \h </w:instrText>
             </w:r>
             <w:r>
               <w:rPr>
@@ -2148,6 +2182,7 @@
         </w:p>
         <w:p>
           <w:pPr>
+            <w:pStyle w:val="TM1"/>
             <w:tabs>
               <w:tab w:val="right" w:leader="dot" w:pos="9628"/>
             </w:tabs>
@@ -2155,7 +2190,7 @@
               <w:noProof/>
             </w:rPr>
           </w:pPr>
-          <w:hyperlink w:anchor="_Toc243477422" w:history="1">
+          <w:hyperlink w:anchor="_Toc243481326" w:history="1">
             <w:r>
               <w:rPr>
                 <w:rStyle w:val="Lienhypertexte"/>
@@ -2179,7 +2214,7 @@
               <w:rPr>
                 <w:noProof/>
               </w:rPr>
-              <w:instrText xml:space="preserve"> PAGEREF _Toc243477422 \h </w:instrText>
+              <w:instrText xml:space="preserve"> PAGEREF _Toc243481326 \h </w:instrText>
             </w:r>
             <w:r>
               <w:rPr>
@@ -2208,6 +2243,7 @@
         </w:p>
         <w:p>
           <w:pPr>
+            <w:pStyle w:val="TM2"/>
             <w:tabs>
               <w:tab w:val="right" w:leader="dot" w:pos="9628"/>
             </w:tabs>
@@ -2215,7 +2251,7 @@
               <w:noProof/>
             </w:rPr>
           </w:pPr>
-          <w:hyperlink w:anchor="_Toc243477423" w:history="1">
+          <w:hyperlink w:anchor="_Toc243481327" w:history="1">
             <w:r>
               <w:rPr>
                 <w:rStyle w:val="Lienhypertexte"/>
@@ -2239,7 +2275,7 @@
               <w:rPr>
                 <w:noProof/>
               </w:rPr>
-              <w:instrText xml:space="preserve"> PAGEREF _Toc243477423 \h </w:instrText>
+              <w:instrText xml:space="preserve"> PAGEREF _Toc243481327 \h </w:instrText>
             </w:r>
             <w:r>
               <w:rPr>
@@ -2268,6 +2304,7 @@
         </w:p>
         <w:p>
           <w:pPr>
+            <w:pStyle w:val="TM1"/>
             <w:tabs>
               <w:tab w:val="right" w:leader="dot" w:pos="9628"/>
             </w:tabs>
@@ -2275,7 +2312,7 @@
               <w:noProof/>
             </w:rPr>
           </w:pPr>
-          <w:hyperlink w:anchor="_Toc243477424" w:history="1">
+          <w:hyperlink w:anchor="_Toc243481328" w:history="1">
             <w:r>
               <w:rPr>
                 <w:rStyle w:val="Lienhypertexte"/>
@@ -2299,7 +2336,7 @@
               <w:rPr>
                 <w:noProof/>
               </w:rPr>
-              <w:instrText xml:space="preserve"> PAGEREF _Toc243477424 \h </w:instrText>
+              <w:instrText xml:space="preserve"> PAGEREF _Toc243481328 \h </w:instrText>
             </w:r>
             <w:r>
               <w:rPr>
@@ -2328,6 +2365,7 @@
         </w:p>
         <w:p>
           <w:pPr>
+            <w:pStyle w:val="TM2"/>
             <w:tabs>
               <w:tab w:val="right" w:leader="dot" w:pos="9628"/>
             </w:tabs>
@@ -2335,7 +2373,7 @@
               <w:noProof/>
             </w:rPr>
           </w:pPr>
-          <w:hyperlink w:anchor="_Toc243477425" w:history="1">
+          <w:hyperlink w:anchor="_Toc243481329" w:history="1">
             <w:r>
               <w:rPr>
                 <w:rStyle w:val="Lienhypertexte"/>
@@ -2359,7 +2397,7 @@
               <w:rPr>
                 <w:noProof/>
               </w:rPr>
-              <w:instrText xml:space="preserve"> PAGEREF _Toc243477425 \h </w:instrText>
+              <w:instrText xml:space="preserve"> PAGEREF _Toc243481329 \h </w:instrText>
             </w:r>
             <w:r>
               <w:rPr>
@@ -2388,6 +2426,7 @@
         </w:p>
         <w:p>
           <w:pPr>
+            <w:pStyle w:val="TM2"/>
             <w:tabs>
               <w:tab w:val="right" w:leader="dot" w:pos="9628"/>
             </w:tabs>
@@ -2395,7 +2434,7 @@
               <w:noProof/>
             </w:rPr>
           </w:pPr>
-          <w:hyperlink w:anchor="_Toc243477426" w:history="1">
+          <w:hyperlink w:anchor="_Toc243481330" w:history="1">
             <w:r>
               <w:rPr>
                 <w:rStyle w:val="Lienhypertexte"/>
@@ -2419,7 +2458,7 @@
               <w:rPr>
                 <w:noProof/>
               </w:rPr>
-              <w:instrText xml:space="preserve"> PAGEREF _Toc243477426 \h </w:instrText>
+              <w:instrText xml:space="preserve"> PAGEREF _Toc243481330 \h </w:instrText>
             </w:r>
             <w:r>
               <w:rPr>
@@ -2448,6 +2487,7 @@
         </w:p>
         <w:p>
           <w:pPr>
+            <w:pStyle w:val="TM2"/>
             <w:tabs>
               <w:tab w:val="right" w:leader="dot" w:pos="9628"/>
             </w:tabs>
@@ -2455,7 +2495,7 @@
               <w:noProof/>
             </w:rPr>
           </w:pPr>
-          <w:hyperlink w:anchor="_Toc243477427" w:history="1">
+          <w:hyperlink w:anchor="_Toc243481331" w:history="1">
             <w:r>
               <w:rPr>
                 <w:rStyle w:val="Lienhypertexte"/>
@@ -2479,7 +2519,7 @@
               <w:rPr>
                 <w:noProof/>
               </w:rPr>
-              <w:instrText xml:space="preserve"> PAGEREF _Toc243477427 \h </w:instrText>
+              <w:instrText xml:space="preserve"> PAGEREF _Toc243481331 \h </w:instrText>
             </w:r>
             <w:r>
               <w:rPr>
@@ -2508,6 +2548,7 @@
         </w:p>
         <w:p>
           <w:pPr>
+            <w:pStyle w:val="TM2"/>
             <w:tabs>
               <w:tab w:val="right" w:leader="dot" w:pos="9628"/>
             </w:tabs>
@@ -2515,7 +2556,7 @@
               <w:noProof/>
             </w:rPr>
           </w:pPr>
-          <w:hyperlink w:anchor="_Toc243477428" w:history="1">
+          <w:hyperlink w:anchor="_Toc243481332" w:history="1">
             <w:r>
               <w:rPr>
                 <w:rStyle w:val="Lienhypertexte"/>
@@ -2539,7 +2580,7 @@
               <w:rPr>
                 <w:noProof/>
               </w:rPr>
-              <w:instrText xml:space="preserve"> PAGEREF _Toc243477428 \h </w:instrText>
+              <w:instrText xml:space="preserve"> PAGEREF _Toc243481332 \h </w:instrText>
             </w:r>
             <w:r>
               <w:rPr>
@@ -2568,6 +2609,7 @@
         </w:p>
         <w:p>
           <w:pPr>
+            <w:pStyle w:val="TM2"/>
             <w:tabs>
               <w:tab w:val="right" w:leader="dot" w:pos="9628"/>
             </w:tabs>
@@ -2575,7 +2617,7 @@
               <w:noProof/>
             </w:rPr>
           </w:pPr>
-          <w:hyperlink w:anchor="_Toc243477429" w:history="1">
+          <w:hyperlink w:anchor="_Toc243481333" w:history="1">
             <w:r>
               <w:rPr>
                 <w:rStyle w:val="Lienhypertexte"/>
@@ -2599,7 +2641,7 @@
               <w:rPr>
                 <w:noProof/>
               </w:rPr>
-              <w:instrText xml:space="preserve"> PAGEREF _Toc243477429 \h </w:instrText>
+              <w:instrText xml:space="preserve"> PAGEREF _Toc243481333 \h </w:instrText>
             </w:r>
             <w:r>
               <w:rPr>
@@ -2628,6 +2670,7 @@
         </w:p>
         <w:p>
           <w:pPr>
+            <w:pStyle w:val="TM1"/>
             <w:tabs>
               <w:tab w:val="right" w:leader="dot" w:pos="9628"/>
             </w:tabs>
@@ -2635,7 +2678,7 @@
               <w:noProof/>
             </w:rPr>
           </w:pPr>
-          <w:hyperlink w:anchor="_Toc243477430" w:history="1">
+          <w:hyperlink w:anchor="_Toc243481334" w:history="1">
             <w:r>
               <w:rPr>
                 <w:rStyle w:val="Lienhypertexte"/>
@@ -2659,7 +2702,7 @@
               <w:rPr>
                 <w:noProof/>
               </w:rPr>
-              <w:instrText xml:space="preserve"> PAGEREF _Toc243477430 \h </w:instrText>
+              <w:instrText xml:space="preserve"> PAGEREF _Toc243481334 \h </w:instrText>
             </w:r>
             <w:r>
               <w:rPr>
@@ -2688,6 +2731,7 @@
         </w:p>
         <w:p>
           <w:pPr>
+            <w:pStyle w:val="TM2"/>
             <w:tabs>
               <w:tab w:val="right" w:leader="dot" w:pos="9628"/>
             </w:tabs>
@@ -2695,7 +2739,7 @@
               <w:noProof/>
             </w:rPr>
           </w:pPr>
-          <w:hyperlink w:anchor="_Toc243477431" w:history="1">
+          <w:hyperlink w:anchor="_Toc243481335" w:history="1">
             <w:r>
               <w:rPr>
                 <w:rStyle w:val="Lienhypertexte"/>
@@ -2719,7 +2763,7 @@
               <w:rPr>
                 <w:noProof/>
               </w:rPr>
-              <w:instrText xml:space="preserve"> PAGEREF _Toc243477431 \h </w:instrText>
+              <w:instrText xml:space="preserve"> PAGEREF _Toc243481335 \h </w:instrText>
             </w:r>
             <w:r>
               <w:rPr>
@@ -2748,6 +2792,7 @@
         </w:p>
         <w:p>
           <w:pPr>
+            <w:pStyle w:val="TM2"/>
             <w:tabs>
               <w:tab w:val="right" w:leader="dot" w:pos="9628"/>
             </w:tabs>
@@ -2755,7 +2800,7 @@
               <w:noProof/>
             </w:rPr>
           </w:pPr>
-          <w:hyperlink w:anchor="_Toc243477432" w:history="1">
+          <w:hyperlink w:anchor="_Toc243481336" w:history="1">
             <w:r>
               <w:rPr>
                 <w:rStyle w:val="Lienhypertexte"/>
@@ -2779,7 +2824,7 @@
               <w:rPr>
                 <w:noProof/>
               </w:rPr>
-              <w:instrText xml:space="preserve"> PAGEREF _Toc243477432 \h </w:instrText>
+              <w:instrText xml:space="preserve"> PAGEREF _Toc243481336 \h </w:instrText>
             </w:r>
             <w:r>
               <w:rPr>
@@ -2808,6 +2853,7 @@
         </w:p>
         <w:p>
           <w:pPr>
+            <w:pStyle w:val="TM2"/>
             <w:tabs>
               <w:tab w:val="right" w:leader="dot" w:pos="9628"/>
             </w:tabs>
@@ -2815,7 +2861,7 @@
               <w:noProof/>
             </w:rPr>
           </w:pPr>
-          <w:hyperlink w:anchor="_Toc243477433" w:history="1">
+          <w:hyperlink w:anchor="_Toc243481337" w:history="1">
             <w:r>
               <w:rPr>
                 <w:rStyle w:val="Lienhypertexte"/>
@@ -2839,7 +2885,7 @@
               <w:rPr>
                 <w:noProof/>
               </w:rPr>
-              <w:instrText xml:space="preserve"> PAGEREF _Toc243477433 \h </w:instrText>
+              <w:instrText xml:space="preserve"> PAGEREF _Toc243481337 \h </w:instrText>
             </w:r>
             <w:r>
               <w:rPr>
@@ -2868,6 +2914,7 @@
         </w:p>
         <w:p>
           <w:pPr>
+            <w:pStyle w:val="TM2"/>
             <w:tabs>
               <w:tab w:val="right" w:leader="dot" w:pos="9628"/>
             </w:tabs>
@@ -2875,7 +2922,7 @@
               <w:noProof/>
             </w:rPr>
           </w:pPr>
-          <w:hyperlink w:anchor="_Toc243477434" w:history="1">
+          <w:hyperlink w:anchor="_Toc243481338" w:history="1">
             <w:r>
               <w:rPr>
                 <w:rStyle w:val="Lienhypertexte"/>
@@ -2899,7 +2946,7 @@
               <w:rPr>
                 <w:noProof/>
               </w:rPr>
-              <w:instrText xml:space="preserve"> PAGEREF _Toc243477434 \h </w:instrText>
+              <w:instrText xml:space="preserve"> PAGEREF _Toc243481338 \h </w:instrText>
             </w:r>
             <w:r>
               <w:rPr>
@@ -2928,6 +2975,7 @@
         </w:p>
         <w:p>
           <w:pPr>
+            <w:pStyle w:val="TM2"/>
             <w:tabs>
               <w:tab w:val="right" w:leader="dot" w:pos="9628"/>
             </w:tabs>
@@ -2935,7 +2983,7 @@
               <w:noProof/>
             </w:rPr>
           </w:pPr>
-          <w:hyperlink w:anchor="_Toc243477435" w:history="1">
+          <w:hyperlink w:anchor="_Toc243481339" w:history="1">
             <w:r>
               <w:rPr>
                 <w:rStyle w:val="Lienhypertexte"/>
@@ -2959,7 +3007,7 @@
               <w:rPr>
                 <w:noProof/>
               </w:rPr>
-              <w:instrText xml:space="preserve"> PAGEREF _Toc243477435 \h </w:instrText>
+              <w:instrText xml:space="preserve"> PAGEREF _Toc243481339 \h </w:instrText>
             </w:r>
             <w:r>
               <w:rPr>
@@ -2988,6 +3036,7 @@
         </w:p>
         <w:p>
           <w:pPr>
+            <w:pStyle w:val="TM2"/>
             <w:tabs>
               <w:tab w:val="right" w:leader="dot" w:pos="9628"/>
             </w:tabs>
@@ -2995,7 +3044,7 @@
               <w:noProof/>
             </w:rPr>
           </w:pPr>
-          <w:hyperlink w:anchor="_Toc243477436" w:history="1">
+          <w:hyperlink w:anchor="_Toc243481340" w:history="1">
             <w:r>
               <w:rPr>
                 <w:rStyle w:val="Lienhypertexte"/>
@@ -3019,7 +3068,7 @@
               <w:rPr>
                 <w:noProof/>
               </w:rPr>
-              <w:instrText xml:space="preserve"> PAGEREF _Toc243477436 \h </w:instrText>
+              <w:instrText xml:space="preserve"> PAGEREF _Toc243481340 \h </w:instrText>
             </w:r>
             <w:r>
               <w:rPr>
@@ -3048,6 +3097,7 @@
         </w:p>
         <w:p>
           <w:pPr>
+            <w:pStyle w:val="TM1"/>
             <w:tabs>
               <w:tab w:val="right" w:leader="dot" w:pos="9628"/>
             </w:tabs>
@@ -3055,7 +3105,7 @@
               <w:noProof/>
             </w:rPr>
           </w:pPr>
-          <w:hyperlink w:anchor="_Toc243477437" w:history="1">
+          <w:hyperlink w:anchor="_Toc243481341" w:history="1">
             <w:r>
               <w:rPr>
                 <w:rStyle w:val="Lienhypertexte"/>
@@ -3079,7 +3129,7 @@
               <w:rPr>
                 <w:noProof/>
               </w:rPr>
-              <w:instrText xml:space="preserve"> PAGEREF _Toc243477437 \h </w:instrText>
+              <w:instrText xml:space="preserve"> PAGEREF _Toc243481341 \h </w:instrText>
             </w:r>
             <w:r>
               <w:rPr>
@@ -3108,6 +3158,7 @@
         </w:p>
         <w:p>
           <w:pPr>
+            <w:pStyle w:val="TM1"/>
             <w:tabs>
               <w:tab w:val="right" w:leader="dot" w:pos="9628"/>
             </w:tabs>
@@ -3115,7 +3166,7 @@
               <w:noProof/>
             </w:rPr>
           </w:pPr>
-          <w:hyperlink w:anchor="_Toc243477438" w:history="1">
+          <w:hyperlink w:anchor="_Toc243481342" w:history="1">
             <w:r>
               <w:rPr>
                 <w:rStyle w:val="Lienhypertexte"/>
@@ -3139,7 +3190,7 @@
               <w:rPr>
                 <w:noProof/>
               </w:rPr>
-              <w:instrText xml:space="preserve"> PAGEREF _Toc243477438 \h </w:instrText>
+              <w:instrText xml:space="preserve"> PAGEREF _Toc243481342 \h </w:instrText>
             </w:r>
             <w:r>
               <w:rPr>
@@ -3168,6 +3219,7 @@
         </w:p>
         <w:p>
           <w:pPr>
+            <w:pStyle w:val="TM1"/>
             <w:tabs>
               <w:tab w:val="right" w:leader="dot" w:pos="9628"/>
             </w:tabs>
@@ -3175,7 +3227,7 @@
               <w:noProof/>
             </w:rPr>
           </w:pPr>
-          <w:hyperlink w:anchor="_Toc243477439" w:history="1">
+          <w:hyperlink w:anchor="_Toc243481343" w:history="1">
             <w:r>
               <w:rPr>
                 <w:rStyle w:val="Lienhypertexte"/>
@@ -3199,7 +3251,7 @@
               <w:rPr>
                 <w:noProof/>
               </w:rPr>
-              <w:instrText xml:space="preserve"> PAGEREF _Toc243477439 \h </w:instrText>
+              <w:instrText xml:space="preserve"> PAGEREF _Toc243481343 \h </w:instrText>
             </w:r>
             <w:r>
               <w:rPr>
@@ -3228,6 +3280,7 @@
         </w:p>
         <w:p>
           <w:pPr>
+            <w:pStyle w:val="TM1"/>
             <w:tabs>
               <w:tab w:val="right" w:leader="dot" w:pos="9628"/>
             </w:tabs>
@@ -3235,7 +3288,7 @@
               <w:noProof/>
             </w:rPr>
           </w:pPr>
-          <w:hyperlink w:anchor="_Toc243477440" w:history="1">
+          <w:hyperlink w:anchor="_Toc243481344" w:history="1">
             <w:r>
               <w:rPr>
                 <w:rStyle w:val="Lienhypertexte"/>
@@ -3259,7 +3312,7 @@
               <w:rPr>
                 <w:noProof/>
               </w:rPr>
-              <w:instrText xml:space="preserve"> PAGEREF _Toc243477440 \h </w:instrText>
+              <w:instrText xml:space="preserve"> PAGEREF _Toc243481344 \h </w:instrText>
             </w:r>
             <w:r>
               <w:rPr>
@@ -3288,6 +3341,7 @@
         </w:p>
         <w:p>
           <w:pPr>
+            <w:pStyle w:val="TM2"/>
             <w:tabs>
               <w:tab w:val="right" w:leader="dot" w:pos="9628"/>
             </w:tabs>
@@ -3295,7 +3349,7 @@
               <w:noProof/>
             </w:rPr>
           </w:pPr>
-          <w:hyperlink w:anchor="_Toc243477441" w:history="1">
+          <w:hyperlink w:anchor="_Toc243481345" w:history="1">
             <w:r>
               <w:rPr>
                 <w:rStyle w:val="Lienhypertexte"/>
@@ -3319,7 +3373,7 @@
               <w:rPr>
                 <w:noProof/>
               </w:rPr>
-              <w:instrText xml:space="preserve"> PAGEREF _Toc243477441 \h </w:instrText>
+              <w:instrText xml:space="preserve"> PAGEREF _Toc243481345 \h </w:instrText>
             </w:r>
             <w:r>
               <w:rPr>
@@ -3348,6 +3402,7 @@
         </w:p>
         <w:p>
           <w:pPr>
+            <w:pStyle w:val="TM2"/>
             <w:tabs>
               <w:tab w:val="right" w:leader="dot" w:pos="9628"/>
             </w:tabs>
@@ -3355,7 +3410,7 @@
               <w:noProof/>
             </w:rPr>
           </w:pPr>
-          <w:hyperlink w:anchor="_Toc243477442" w:history="1">
+          <w:hyperlink w:anchor="_Toc243481346" w:history="1">
             <w:r>
               <w:rPr>
                 <w:rStyle w:val="Lienhypertexte"/>
@@ -3379,7 +3434,7 @@
               <w:rPr>
                 <w:noProof/>
               </w:rPr>
-              <w:instrText xml:space="preserve"> PAGEREF _Toc243477442 \h </w:instrText>
+              <w:instrText xml:space="preserve"> PAGEREF _Toc243481346 \h </w:instrText>
             </w:r>
             <w:r>
               <w:rPr>
@@ -3408,6 +3463,7 @@
         </w:p>
         <w:p>
           <w:pPr>
+            <w:pStyle w:val="TM2"/>
             <w:tabs>
               <w:tab w:val="right" w:leader="dot" w:pos="9628"/>
             </w:tabs>
@@ -3415,7 +3471,7 @@
               <w:noProof/>
             </w:rPr>
           </w:pPr>
-          <w:hyperlink w:anchor="_Toc243477443" w:history="1">
+          <w:hyperlink w:anchor="_Toc243481347" w:history="1">
             <w:r>
               <w:rPr>
                 <w:rStyle w:val="Lienhypertexte"/>
@@ -3439,7 +3495,7 @@
               <w:rPr>
                 <w:noProof/>
               </w:rPr>
-              <w:instrText xml:space="preserve"> PAGEREF _Toc243477443 \h </w:instrText>
+              <w:instrText xml:space="preserve"> PAGEREF _Toc243481347 \h </w:instrText>
             </w:r>
             <w:r>
               <w:rPr>
@@ -3468,6 +3524,7 @@
         </w:p>
         <w:p>
           <w:pPr>
+            <w:pStyle w:val="TM2"/>
             <w:tabs>
               <w:tab w:val="right" w:leader="dot" w:pos="9628"/>
             </w:tabs>
@@ -3475,7 +3532,7 @@
               <w:noProof/>
             </w:rPr>
           </w:pPr>
-          <w:hyperlink w:anchor="_Toc243477444" w:history="1">
+          <w:hyperlink w:anchor="_Toc243481348" w:history="1">
             <w:r>
               <w:rPr>
                 <w:rStyle w:val="Lienhypertexte"/>
@@ -3499,7 +3556,7 @@
               <w:rPr>
                 <w:noProof/>
               </w:rPr>
-              <w:instrText xml:space="preserve"> PAGEREF _Toc243477444 \h </w:instrText>
+              <w:instrText xml:space="preserve"> PAGEREF _Toc243481348 \h </w:instrText>
             </w:r>
             <w:r>
               <w:rPr>
@@ -3528,6 +3585,7 @@
         </w:p>
         <w:p>
           <w:pPr>
+            <w:pStyle w:val="TM2"/>
             <w:tabs>
               <w:tab w:val="right" w:leader="dot" w:pos="9628"/>
             </w:tabs>
@@ -3535,7 +3593,7 @@
               <w:noProof/>
             </w:rPr>
           </w:pPr>
-          <w:hyperlink w:anchor="_Toc243477445" w:history="1">
+          <w:hyperlink w:anchor="_Toc243481349" w:history="1">
             <w:r>
               <w:rPr>
                 <w:rStyle w:val="Lienhypertexte"/>
@@ -3559,7 +3617,7 @@
               <w:rPr>
                 <w:noProof/>
               </w:rPr>
-              <w:instrText xml:space="preserve"> PAGEREF _Toc243477445 \h </w:instrText>
+              <w:instrText xml:space="preserve"> PAGEREF _Toc243481349 \h </w:instrText>
             </w:r>
             <w:r>
               <w:rPr>
@@ -3588,6 +3646,7 @@
         </w:p>
         <w:p>
           <w:pPr>
+            <w:pStyle w:val="TM2"/>
             <w:tabs>
               <w:tab w:val="right" w:leader="dot" w:pos="9628"/>
             </w:tabs>
@@ -3595,7 +3654,7 @@
               <w:noProof/>
             </w:rPr>
           </w:pPr>
-          <w:hyperlink w:anchor="_Toc243477446" w:history="1">
+          <w:hyperlink w:anchor="_Toc243481350" w:history="1">
             <w:r>
               <w:rPr>
                 <w:rStyle w:val="Lienhypertexte"/>
@@ -3619,7 +3678,7 @@
               <w:rPr>
                 <w:noProof/>
               </w:rPr>
-              <w:instrText xml:space="preserve"> PAGEREF _Toc243477446 \h </w:instrText>
+              <w:instrText xml:space="preserve"> PAGEREF _Toc243481350 \h </w:instrText>
             </w:r>
             <w:r>
               <w:rPr>
@@ -3648,6 +3707,7 @@
         </w:p>
         <w:p>
           <w:pPr>
+            <w:pStyle w:val="TM1"/>
             <w:tabs>
               <w:tab w:val="right" w:leader="dot" w:pos="9628"/>
             </w:tabs>
@@ -3655,7 +3715,7 @@
               <w:noProof/>
             </w:rPr>
           </w:pPr>
-          <w:hyperlink w:anchor="_Toc243477447" w:history="1">
+          <w:hyperlink w:anchor="_Toc243481351" w:history="1">
             <w:r>
               <w:rPr>
                 <w:rStyle w:val="Lienhypertexte"/>
@@ -3679,7 +3739,7 @@
               <w:rPr>
                 <w:noProof/>
               </w:rPr>
-              <w:instrText xml:space="preserve"> PAGEREF _Toc243477447 \h </w:instrText>
+              <w:instrText xml:space="preserve"> PAGEREF _Toc243481351 \h </w:instrText>
             </w:r>
             <w:r>
               <w:rPr>
@@ -3708,6 +3768,7 @@
         </w:p>
         <w:p>
           <w:pPr>
+            <w:pStyle w:val="TM1"/>
             <w:tabs>
               <w:tab w:val="right" w:leader="dot" w:pos="9628"/>
             </w:tabs>
@@ -3715,7 +3776,7 @@
               <w:noProof/>
             </w:rPr>
           </w:pPr>
-          <w:hyperlink w:anchor="_Toc243477448" w:history="1">
+          <w:hyperlink w:anchor="_Toc243481352" w:history="1">
             <w:r>
               <w:rPr>
                 <w:rStyle w:val="Lienhypertexte"/>
@@ -3739,7 +3800,7 @@
               <w:rPr>
                 <w:noProof/>
               </w:rPr>
-              <w:instrText xml:space="preserve"> PAGEREF _Toc243477448 \h </w:instrText>
+              <w:instrText xml:space="preserve"> PAGEREF _Toc243481352 \h </w:instrText>
             </w:r>
             <w:r>
               <w:rPr>
@@ -3768,6 +3829,7 @@
         </w:p>
         <w:p>
           <w:pPr>
+            <w:pStyle w:val="TM1"/>
             <w:tabs>
               <w:tab w:val="right" w:leader="dot" w:pos="9628"/>
             </w:tabs>
@@ -3775,7 +3837,7 @@
               <w:noProof/>
             </w:rPr>
           </w:pPr>
-          <w:hyperlink w:anchor="_Toc243477449" w:history="1">
+          <w:hyperlink w:anchor="_Toc243481353" w:history="1">
             <w:r>
               <w:rPr>
                 <w:rStyle w:val="Lienhypertexte"/>
@@ -3799,7 +3861,7 @@
               <w:rPr>
                 <w:noProof/>
               </w:rPr>
-              <w:instrText xml:space="preserve"> PAGEREF _Toc243477449 \h </w:instrText>
+              <w:instrText xml:space="preserve"> PAGEREF _Toc243481353 \h </w:instrText>
             </w:r>
             <w:r>
               <w:rPr>
@@ -3828,6 +3890,7 @@
         </w:p>
         <w:p>
           <w:pPr>
+            <w:pStyle w:val="TM2"/>
             <w:tabs>
               <w:tab w:val="right" w:leader="dot" w:pos="9628"/>
             </w:tabs>
@@ -3835,7 +3898,7 @@
               <w:noProof/>
             </w:rPr>
           </w:pPr>
-          <w:hyperlink w:anchor="_Toc243477450" w:history="1">
+          <w:hyperlink w:anchor="_Toc243481354" w:history="1">
             <w:r>
               <w:rPr>
                 <w:rStyle w:val="Lienhypertexte"/>
@@ -3859,7 +3922,7 @@
               <w:rPr>
                 <w:noProof/>
               </w:rPr>
-              <w:instrText xml:space="preserve"> PAGEREF _Toc243477450 \h </w:instrText>
+              <w:instrText xml:space="preserve"> PAGEREF _Toc243481354 \h </w:instrText>
             </w:r>
             <w:r>
               <w:rPr>
@@ -3898,14 +3961,12 @@
         <w:pStyle w:val="Titre1"/>
         <w:pageBreakBefore/>
       </w:pPr>
-      <w:bookmarkStart w:id="0" w:name="_Toc243477388"/>
-      <w:bookmarkStart w:id="1" w:name="_Toc1"/>
+      <w:bookmarkStart w:id="0" w:name="_Toc243481292"/>
       <w:r>
         <w:lastRenderedPageBreak/>
         <w:t>1. The pitch in 60 seconds</w:t>
       </w:r>
       <w:bookmarkEnd w:id="0"/>
-      <w:bookmarkEnd w:id="1"/>
     </w:p>
     <w:p>
       <w:pPr>
@@ -3923,7 +3984,7 @@
         <w:pStyle w:val="Paragraphedeliste"/>
         <w:numPr>
           <w:ilvl w:val="0"/>
-          <w:numId w:val="7"/>
+          <w:numId w:val="2"/>
         </w:numPr>
         <w:spacing w:after="80"/>
       </w:pPr>
@@ -3943,7 +4004,7 @@
         <w:pStyle w:val="Paragraphedeliste"/>
         <w:numPr>
           <w:ilvl w:val="0"/>
-          <w:numId w:val="7"/>
+          <w:numId w:val="2"/>
         </w:numPr>
         <w:spacing w:after="80"/>
       </w:pPr>
@@ -3973,7 +4034,7 @@
         <w:pStyle w:val="Paragraphedeliste"/>
         <w:numPr>
           <w:ilvl w:val="0"/>
-          <w:numId w:val="7"/>
+          <w:numId w:val="2"/>
         </w:numPr>
         <w:spacing w:after="80"/>
       </w:pPr>
@@ -3996,7 +4057,7 @@
         <w:t>nn.Linear</w:t>
       </w:r>
       <w:r>
-        <w:t xml:space="preserve"> layers, learns the training images by heart: 99.7 % on train, about 40 % on new images. We monitored it, fixed it with regularisation (45.5 % on validation) and diagnosed four broken runs.</w:t>
+        <w:t xml:space="preserve"> layers, learns the training images by heart: 99.7 % on train, about 40 % on new images. We monitored it from the inside, diagnosed overfitting and fixed it with regularisation (45.5 % on validation).</w:t>
       </w:r>
     </w:p>
     <w:p>
@@ -4004,7 +4065,7 @@
         <w:pStyle w:val="Paragraphedeliste"/>
         <w:numPr>
           <w:ilvl w:val="0"/>
-          <w:numId w:val="7"/>
+          <w:numId w:val="2"/>
         </w:numPr>
         <w:spacing w:after="80"/>
       </w:pPr>
@@ -4044,7 +4105,7 @@
         <w:pStyle w:val="Paragraphedeliste"/>
         <w:numPr>
           <w:ilvl w:val="0"/>
-          <w:numId w:val="7"/>
+          <w:numId w:val="2"/>
         </w:numPr>
         <w:spacing w:after="80"/>
       </w:pPr>
@@ -4074,7 +4135,7 @@
         <w:pStyle w:val="Paragraphedeliste"/>
         <w:numPr>
           <w:ilvl w:val="0"/>
-          <w:numId w:val="7"/>
+          <w:numId w:val="2"/>
         </w:numPr>
         <w:spacing w:after="80"/>
       </w:pPr>
@@ -4119,14 +4180,12 @@
         <w:pStyle w:val="Titre1"/>
         <w:pageBreakBefore/>
       </w:pPr>
-      <w:bookmarkStart w:id="2" w:name="_Toc243477389"/>
-      <w:bookmarkStart w:id="3" w:name="_Toc2"/>
+      <w:bookmarkStart w:id="1" w:name="_Toc243481293"/>
       <w:r>
         <w:lastRenderedPageBreak/>
         <w:t>2. The basic ideas, explained simply</w:t>
       </w:r>
-      <w:bookmarkEnd w:id="2"/>
-      <w:bookmarkEnd w:id="3"/>
+      <w:bookmarkEnd w:id="1"/>
     </w:p>
     <w:p>
       <w:pPr>
@@ -4226,13 +4285,11 @@
       <w:pPr>
         <w:pStyle w:val="Titre2"/>
       </w:pPr>
-      <w:bookmarkStart w:id="4" w:name="_Toc243477390"/>
-      <w:bookmarkStart w:id="5" w:name="_Toc3"/>
+      <w:bookmarkStart w:id="2" w:name="_Toc243481294"/>
       <w:r>
         <w:t>A neuron, weights and a network</w:t>
       </w:r>
-      <w:bookmarkEnd w:id="4"/>
-      <w:bookmarkEnd w:id="5"/>
+      <w:bookmarkEnd w:id="2"/>
     </w:p>
     <w:p>
       <w:pPr>
@@ -4298,13 +4355,11 @@
       <w:pPr>
         <w:pStyle w:val="Titre2"/>
       </w:pPr>
-      <w:bookmarkStart w:id="6" w:name="_Toc243477391"/>
-      <w:bookmarkStart w:id="7" w:name="_Toc4"/>
+      <w:bookmarkStart w:id="3" w:name="_Toc243481295"/>
       <w:r>
         <w:t>The loss: how wrong we are</w:t>
       </w:r>
-      <w:bookmarkEnd w:id="6"/>
-      <w:bookmarkEnd w:id="7"/>
+      <w:bookmarkEnd w:id="3"/>
     </w:p>
     <w:p>
       <w:pPr>
@@ -4360,13 +4415,11 @@
       <w:pPr>
         <w:pStyle w:val="Titre2"/>
       </w:pPr>
-      <w:bookmarkStart w:id="8" w:name="_Toc243477392"/>
-      <w:bookmarkStart w:id="9" w:name="_Toc5"/>
+      <w:bookmarkStart w:id="4" w:name="_Toc243481296"/>
       <w:r>
         <w:t>Gradient descent and the learning rate</w:t>
       </w:r>
-      <w:bookmarkEnd w:id="8"/>
-      <w:bookmarkEnd w:id="9"/>
+      <w:bookmarkEnd w:id="4"/>
     </w:p>
     <w:p>
       <w:pPr>
@@ -4432,13 +4485,11 @@
       <w:pPr>
         <w:pStyle w:val="Titre2"/>
       </w:pPr>
-      <w:bookmarkStart w:id="10" w:name="_Toc243477393"/>
-      <w:bookmarkStart w:id="11" w:name="_Toc6"/>
+      <w:bookmarkStart w:id="5" w:name="_Toc243481297"/>
       <w:r>
         <w:t>Backpropagation and the 5 lines of the training loop</w:t>
       </w:r>
-      <w:bookmarkEnd w:id="10"/>
-      <w:bookmarkEnd w:id="11"/>
+      <w:bookmarkEnd w:id="5"/>
     </w:p>
     <w:p>
       <w:pPr>
@@ -4528,13 +4579,11 @@
       <w:pPr>
         <w:pStyle w:val="Titre2"/>
       </w:pPr>
-      <w:bookmarkStart w:id="12" w:name="_Toc243477394"/>
-      <w:bookmarkStart w:id="13" w:name="_Toc7"/>
+      <w:bookmarkStart w:id="6" w:name="_Toc243481298"/>
       <w:r>
         <w:t>Epoch and mini-batch</w:t>
       </w:r>
-      <w:bookmarkEnd w:id="12"/>
-      <w:bookmarkEnd w:id="13"/>
+      <w:bookmarkEnd w:id="6"/>
     </w:p>
     <w:p>
       <w:pPr>
@@ -4590,14 +4639,12 @@
       <w:pPr>
         <w:pStyle w:val="Titre2"/>
       </w:pPr>
-      <w:bookmarkStart w:id="14" w:name="_Toc243477395"/>
-      <w:bookmarkStart w:id="15" w:name="_Toc8"/>
+      <w:bookmarkStart w:id="7" w:name="_Toc243481299"/>
       <w:r>
         <w:lastRenderedPageBreak/>
         <w:t>Train, validation, test</w:t>
       </w:r>
-      <w:bookmarkEnd w:id="14"/>
-      <w:bookmarkEnd w:id="15"/>
+      <w:bookmarkEnd w:id="7"/>
     </w:p>
     <w:p>
       <w:pPr>
@@ -4663,13 +4710,11 @@
       <w:pPr>
         <w:pStyle w:val="Titre2"/>
       </w:pPr>
-      <w:bookmarkStart w:id="16" w:name="_Toc243477396"/>
-      <w:bookmarkStart w:id="17" w:name="_Toc9"/>
+      <w:bookmarkStart w:id="8" w:name="_Toc243481300"/>
       <w:r>
         <w:t>Overfitting</w:t>
       </w:r>
-      <w:bookmarkEnd w:id="16"/>
-      <w:bookmarkEnd w:id="17"/>
+      <w:bookmarkEnd w:id="8"/>
     </w:p>
     <w:p>
       <w:pPr>
@@ -4715,13 +4760,11 @@
       <w:pPr>
         <w:pStyle w:val="Titre2"/>
       </w:pPr>
-      <w:bookmarkStart w:id="18" w:name="_Toc243477397"/>
-      <w:bookmarkStart w:id="19" w:name="_Toc10"/>
+      <w:bookmarkStart w:id="9" w:name="_Toc243481301"/>
       <w:r>
         <w:t>ReLU, the activation</w:t>
       </w:r>
-      <w:bookmarkEnd w:id="18"/>
-      <w:bookmarkEnd w:id="19"/>
+      <w:bookmarkEnd w:id="9"/>
     </w:p>
     <w:p>
       <w:pPr>
@@ -4787,13 +4830,11 @@
       <w:pPr>
         <w:pStyle w:val="Titre2"/>
       </w:pPr>
-      <w:bookmarkStart w:id="20" w:name="_Toc243477398"/>
-      <w:bookmarkStart w:id="21" w:name="_Toc11"/>
+      <w:bookmarkStart w:id="10" w:name="_Toc243481302"/>
       <w:r>
         <w:t>Initialisation and the first loss</w:t>
       </w:r>
-      <w:bookmarkEnd w:id="20"/>
-      <w:bookmarkEnd w:id="21"/>
+      <w:bookmarkEnd w:id="10"/>
     </w:p>
     <w:p>
       <w:pPr>
@@ -4839,13 +4880,11 @@
       <w:pPr>
         <w:pStyle w:val="Titre2"/>
       </w:pPr>
-      <w:bookmarkStart w:id="22" w:name="_Toc243477399"/>
-      <w:bookmarkStart w:id="23" w:name="_Toc12"/>
+      <w:bookmarkStart w:id="11" w:name="_Toc243481303"/>
       <w:r>
         <w:t>Standardisation of the pixels</w:t>
       </w:r>
-      <w:bookmarkEnd w:id="22"/>
-      <w:bookmarkEnd w:id="23"/>
+      <w:bookmarkEnd w:id="11"/>
     </w:p>
     <w:p>
       <w:pPr>
@@ -4901,13 +4940,11 @@
       <w:pPr>
         <w:pStyle w:val="Titre2"/>
       </w:pPr>
-      <w:bookmarkStart w:id="24" w:name="_Toc243477400"/>
-      <w:bookmarkStart w:id="25" w:name="_Toc13"/>
+      <w:bookmarkStart w:id="12" w:name="_Toc243481304"/>
       <w:r>
         <w:t>MLP versus CNN: why the MLP cannot see shapes</w:t>
       </w:r>
-      <w:bookmarkEnd w:id="24"/>
-      <w:bookmarkEnd w:id="25"/>
+      <w:bookmarkEnd w:id="12"/>
     </w:p>
     <w:p>
       <w:pPr>
@@ -4963,13 +5000,11 @@
       <w:pPr>
         <w:pStyle w:val="Titre2"/>
       </w:pPr>
-      <w:bookmarkStart w:id="26" w:name="_Toc243477401"/>
-      <w:bookmarkStart w:id="27" w:name="_Toc14"/>
+      <w:bookmarkStart w:id="13" w:name="_Toc243481305"/>
       <w:r>
         <w:t>Convolution, filters and channels (session 7 slide)</w:t>
       </w:r>
-      <w:bookmarkEnd w:id="26"/>
-      <w:bookmarkEnd w:id="27"/>
+      <w:bookmarkEnd w:id="13"/>
     </w:p>
     <w:p>
       <w:pPr>
@@ -5056,13 +5091,11 @@
       <w:pPr>
         <w:pStyle w:val="Titre2"/>
       </w:pPr>
-      <w:bookmarkStart w:id="28" w:name="_Toc243477402"/>
-      <w:bookmarkStart w:id="29" w:name="_Toc15"/>
+      <w:bookmarkStart w:id="14" w:name="_Toc243481306"/>
       <w:r>
         <w:t>A pretrained network and transfer learning</w:t>
       </w:r>
-      <w:bookmarkEnd w:id="28"/>
-      <w:bookmarkEnd w:id="29"/>
+      <w:bookmarkEnd w:id="14"/>
     </w:p>
     <w:p>
       <w:pPr>
@@ -5118,13 +5151,11 @@
       <w:pPr>
         <w:pStyle w:val="Titre2"/>
       </w:pPr>
-      <w:bookmarkStart w:id="30" w:name="_Toc243477403"/>
-      <w:bookmarkStart w:id="31" w:name="_Toc16"/>
+      <w:bookmarkStart w:id="15" w:name="_Toc243481307"/>
       <w:r>
         <w:t>Frozen features (linear probe) versus fine-tuning</w:t>
       </w:r>
-      <w:bookmarkEnd w:id="30"/>
-      <w:bookmarkEnd w:id="31"/>
+      <w:bookmarkEnd w:id="15"/>
     </w:p>
     <w:p>
       <w:pPr>
@@ -5190,13 +5221,11 @@
       <w:pPr>
         <w:pStyle w:val="Titre2"/>
       </w:pPr>
-      <w:bookmarkStart w:id="32" w:name="_Toc243477404"/>
-      <w:bookmarkStart w:id="33" w:name="_Toc17"/>
+      <w:bookmarkStart w:id="16" w:name="_Toc243481308"/>
       <w:r>
         <w:t>The tools against overfitting</w:t>
       </w:r>
-      <w:bookmarkEnd w:id="32"/>
-      <w:bookmarkEnd w:id="33"/>
+      <w:bookmarkEnd w:id="16"/>
     </w:p>
     <w:p>
       <w:pPr>
@@ -5352,13 +5381,11 @@
       <w:pPr>
         <w:pStyle w:val="Titre2"/>
       </w:pPr>
-      <w:bookmarkStart w:id="34" w:name="_Toc243477405"/>
-      <w:bookmarkStart w:id="35" w:name="_Toc18"/>
+      <w:bookmarkStart w:id="17" w:name="_Toc243481309"/>
       <w:r>
         <w:t>Vanishing gradient</w:t>
       </w:r>
-      <w:bookmarkEnd w:id="34"/>
-      <w:bookmarkEnd w:id="35"/>
+      <w:bookmarkEnd w:id="17"/>
     </w:p>
     <w:p>
       <w:pPr>
@@ -5404,13 +5431,11 @@
       <w:pPr>
         <w:pStyle w:val="Titre2"/>
       </w:pPr>
-      <w:bookmarkStart w:id="36" w:name="_Toc243477406"/>
-      <w:bookmarkStart w:id="37" w:name="_Toc19"/>
+      <w:bookmarkStart w:id="18" w:name="_Toc243481310"/>
       <w:r>
         <w:t>Data leakage</w:t>
       </w:r>
-      <w:bookmarkEnd w:id="36"/>
-      <w:bookmarkEnd w:id="37"/>
+      <w:bookmarkEnd w:id="18"/>
     </w:p>
     <w:p>
       <w:pPr>
@@ -5456,13 +5481,11 @@
       <w:pPr>
         <w:pStyle w:val="Titre2"/>
       </w:pPr>
-      <w:bookmarkStart w:id="38" w:name="_Toc243477407"/>
-      <w:bookmarkStart w:id="39" w:name="_Toc20"/>
+      <w:bookmarkStart w:id="19" w:name="_Toc243481311"/>
       <w:r>
         <w:t>Confidence interval and bootstrap</w:t>
       </w:r>
-      <w:bookmarkEnd w:id="38"/>
-      <w:bookmarkEnd w:id="39"/>
+      <w:bookmarkEnd w:id="19"/>
     </w:p>
     <w:p>
       <w:pPr>
@@ -5518,14 +5541,12 @@
       <w:pPr>
         <w:pStyle w:val="Titre2"/>
       </w:pPr>
-      <w:bookmarkStart w:id="40" w:name="_Toc243477408"/>
-      <w:bookmarkStart w:id="41" w:name="_Toc21"/>
+      <w:bookmarkStart w:id="20" w:name="_Toc243481312"/>
       <w:r>
         <w:lastRenderedPageBreak/>
         <w:t>Latency and CPU threads</w:t>
       </w:r>
-      <w:bookmarkEnd w:id="40"/>
-      <w:bookmarkEnd w:id="41"/>
+      <w:bookmarkEnd w:id="20"/>
     </w:p>
     <w:p>
       <w:pPr>
@@ -5592,14 +5613,12 @@
         <w:pStyle w:val="Titre1"/>
         <w:pageBreakBefore/>
       </w:pPr>
-      <w:bookmarkStart w:id="42" w:name="_Toc243477409"/>
-      <w:bookmarkStart w:id="43" w:name="_Toc22"/>
+      <w:bookmarkStart w:id="21" w:name="_Toc243481313"/>
       <w:r>
         <w:lastRenderedPageBreak/>
         <w:t>3. Step 1: the data and a fair split (notebook 01)</w:t>
       </w:r>
-      <w:bookmarkEnd w:id="42"/>
-      <w:bookmarkEnd w:id="43"/>
+      <w:bookmarkEnd w:id="21"/>
     </w:p>
     <w:tbl>
       <w:tblPr>
@@ -5707,13 +5726,11 @@
       <w:pPr>
         <w:pStyle w:val="Titre2"/>
       </w:pPr>
-      <w:bookmarkStart w:id="44" w:name="_Toc243477410"/>
-      <w:bookmarkStart w:id="45" w:name="_Toc23"/>
+      <w:bookmarkStart w:id="22" w:name="_Toc243481314"/>
       <w:r>
         <w:t>What we downloaded</w:t>
       </w:r>
-      <w:bookmarkEnd w:id="44"/>
-      <w:bookmarkEnd w:id="45"/>
+      <w:bookmarkEnd w:id="22"/>
     </w:p>
     <w:p>
       <w:pPr>
@@ -5750,7 +5767,7 @@
         <w:pStyle w:val="Paragraphedeliste"/>
         <w:numPr>
           <w:ilvl w:val="0"/>
-          <w:numId w:val="8"/>
+          <w:numId w:val="3"/>
         </w:numPr>
         <w:spacing w:after="80"/>
       </w:pPr>
@@ -5780,7 +5797,7 @@
         <w:pStyle w:val="Paragraphedeliste"/>
         <w:numPr>
           <w:ilvl w:val="0"/>
-          <w:numId w:val="8"/>
+          <w:numId w:val="3"/>
         </w:numPr>
         <w:spacing w:after="80"/>
       </w:pPr>
@@ -5800,7 +5817,7 @@
         <w:pStyle w:val="Paragraphedeliste"/>
         <w:numPr>
           <w:ilvl w:val="0"/>
-          <w:numId w:val="8"/>
+          <w:numId w:val="3"/>
         </w:numPr>
         <w:spacing w:after="80"/>
       </w:pPr>
@@ -5830,20 +5847,18 @@
       <w:pPr>
         <w:pStyle w:val="Titre2"/>
       </w:pPr>
-      <w:bookmarkStart w:id="46" w:name="_Toc243477411"/>
-      <w:bookmarkStart w:id="47" w:name="_Toc24"/>
+      <w:bookmarkStart w:id="23" w:name="_Toc243481315"/>
       <w:r>
         <w:t>The split (make_split in data.py)</w:t>
       </w:r>
-      <w:bookmarkEnd w:id="46"/>
-      <w:bookmarkEnd w:id="47"/>
+      <w:bookmarkEnd w:id="23"/>
     </w:p>
     <w:p>
       <w:pPr>
         <w:pStyle w:val="Paragraphedeliste"/>
         <w:numPr>
           <w:ilvl w:val="0"/>
-          <w:numId w:val="8"/>
+          <w:numId w:val="3"/>
         </w:numPr>
         <w:spacing w:after="80"/>
       </w:pPr>
@@ -5856,7 +5871,7 @@
         <w:pStyle w:val="Paragraphedeliste"/>
         <w:numPr>
           <w:ilvl w:val="0"/>
-          <w:numId w:val="8"/>
+          <w:numId w:val="3"/>
         </w:numPr>
         <w:spacing w:after="80"/>
       </w:pPr>
@@ -5876,7 +5891,7 @@
         <w:pStyle w:val="Paragraphedeliste"/>
         <w:numPr>
           <w:ilvl w:val="0"/>
-          <w:numId w:val="8"/>
+          <w:numId w:val="3"/>
         </w:numPr>
         <w:spacing w:after="80"/>
       </w:pPr>
@@ -5927,7 +5942,7 @@
         <w:pStyle w:val="Paragraphedeliste"/>
         <w:numPr>
           <w:ilvl w:val="0"/>
-          <w:numId w:val="8"/>
+          <w:numId w:val="3"/>
         </w:numPr>
         <w:spacing w:after="80"/>
       </w:pPr>
@@ -5940,7 +5955,7 @@
         <w:pStyle w:val="Paragraphedeliste"/>
         <w:numPr>
           <w:ilvl w:val="0"/>
-          <w:numId w:val="8"/>
+          <w:numId w:val="3"/>
         </w:numPr>
         <w:spacing w:after="80"/>
       </w:pPr>
@@ -5963,20 +5978,18 @@
       <w:pPr>
         <w:pStyle w:val="Titre2"/>
       </w:pPr>
-      <w:bookmarkStart w:id="48" w:name="_Toc243477412"/>
-      <w:bookmarkStart w:id="49" w:name="_Toc25"/>
+      <w:bookmarkStart w:id="24" w:name="_Toc243481316"/>
       <w:r>
         <w:t>What we found in the data</w:t>
       </w:r>
-      <w:bookmarkEnd w:id="48"/>
-      <w:bookmarkEnd w:id="49"/>
+      <w:bookmarkEnd w:id="24"/>
     </w:p>
     <w:p>
       <w:pPr>
         <w:pStyle w:val="Paragraphedeliste"/>
         <w:numPr>
           <w:ilvl w:val="0"/>
-          <w:numId w:val="8"/>
+          <w:numId w:val="3"/>
         </w:numPr>
         <w:spacing w:after="80"/>
       </w:pPr>
@@ -5989,7 +6002,7 @@
         <w:pStyle w:val="Paragraphedeliste"/>
         <w:numPr>
           <w:ilvl w:val="0"/>
-          <w:numId w:val="8"/>
+          <w:numId w:val="3"/>
         </w:numPr>
         <w:spacing w:after="80"/>
       </w:pPr>
@@ -6002,7 +6015,7 @@
         <w:pStyle w:val="Paragraphedeliste"/>
         <w:numPr>
           <w:ilvl w:val="0"/>
-          <w:numId w:val="8"/>
+          <w:numId w:val="3"/>
         </w:numPr>
         <w:spacing w:after="80"/>
       </w:pPr>
@@ -6015,7 +6028,7 @@
         <w:pStyle w:val="Paragraphedeliste"/>
         <w:numPr>
           <w:ilvl w:val="0"/>
-          <w:numId w:val="8"/>
+          <w:numId w:val="3"/>
         </w:numPr>
         <w:spacing w:after="80"/>
       </w:pPr>
@@ -6028,14 +6041,12 @@
         <w:pStyle w:val="Titre1"/>
         <w:pageBreakBefore/>
       </w:pPr>
-      <w:bookmarkStart w:id="50" w:name="_Toc243477413"/>
-      <w:bookmarkStart w:id="51" w:name="_Toc26"/>
+      <w:bookmarkStart w:id="25" w:name="_Toc243481317"/>
       <w:r>
         <w:lastRenderedPageBreak/>
         <w:t>4. Step 2: the MLP and its two checks (notebook 02)</w:t>
       </w:r>
-      <w:bookmarkEnd w:id="50"/>
-      <w:bookmarkEnd w:id="51"/>
+      <w:bookmarkEnd w:id="25"/>
     </w:p>
     <w:tbl>
       <w:tblPr>
@@ -6180,13 +6191,11 @@
       <w:pPr>
         <w:pStyle w:val="Titre2"/>
       </w:pPr>
-      <w:bookmarkStart w:id="52" w:name="_Toc243477414"/>
-      <w:bookmarkStart w:id="53" w:name="_Toc27"/>
+      <w:bookmarkStart w:id="26" w:name="_Toc243481318"/>
       <w:r>
         <w:t>The model</w:t>
       </w:r>
-      <w:bookmarkEnd w:id="52"/>
-      <w:bookmarkEnd w:id="53"/>
+      <w:bookmarkEnd w:id="26"/>
     </w:p>
     <w:p>
       <w:pPr>
@@ -6309,13 +6318,11 @@
       <w:pPr>
         <w:pStyle w:val="Titre2"/>
       </w:pPr>
-      <w:bookmarkStart w:id="54" w:name="_Toc243477415"/>
-      <w:bookmarkStart w:id="55" w:name="_Toc28"/>
+      <w:bookmarkStart w:id="27" w:name="_Toc243481319"/>
       <w:r>
         <w:t>Check 1: the first loss</w:t>
       </w:r>
-      <w:bookmarkEnd w:id="54"/>
-      <w:bookmarkEnd w:id="55"/>
+      <w:bookmarkEnd w:id="27"/>
     </w:p>
     <w:p>
       <w:pPr>
@@ -6360,13 +6367,11 @@
       <w:pPr>
         <w:pStyle w:val="Titre2"/>
       </w:pPr>
-      <w:bookmarkStart w:id="56" w:name="_Toc243477416"/>
-      <w:bookmarkStart w:id="57" w:name="_Toc29"/>
+      <w:bookmarkStart w:id="28" w:name="_Toc243481320"/>
       <w:r>
         <w:t>Check 2: overfit one batch</w:t>
       </w:r>
-      <w:bookmarkEnd w:id="56"/>
-      <w:bookmarkEnd w:id="57"/>
+      <w:bookmarkEnd w:id="28"/>
     </w:p>
     <w:p>
       <w:pPr>
@@ -6380,20 +6385,18 @@
       <w:pPr>
         <w:pStyle w:val="Titre2"/>
       </w:pPr>
-      <w:bookmarkStart w:id="58" w:name="_Toc243477417"/>
-      <w:bookmarkStart w:id="59" w:name="_Toc30"/>
+      <w:bookmarkStart w:id="29" w:name="_Toc243481321"/>
       <w:r>
         <w:t>Baseline and image size</w:t>
       </w:r>
-      <w:bookmarkEnd w:id="58"/>
-      <w:bookmarkEnd w:id="59"/>
+      <w:bookmarkEnd w:id="29"/>
     </w:p>
     <w:p>
       <w:pPr>
         <w:pStyle w:val="Paragraphedeliste"/>
         <w:numPr>
           <w:ilvl w:val="0"/>
-          <w:numId w:val="8"/>
+          <w:numId w:val="3"/>
         </w:numPr>
         <w:spacing w:after="80"/>
       </w:pPr>
@@ -6406,7 +6409,7 @@
         <w:pStyle w:val="Paragraphedeliste"/>
         <w:numPr>
           <w:ilvl w:val="0"/>
-          <w:numId w:val="8"/>
+          <w:numId w:val="3"/>
         </w:numPr>
         <w:spacing w:after="80"/>
       </w:pPr>
@@ -6439,7 +6442,7 @@
         <w:pStyle w:val="Paragraphedeliste"/>
         <w:numPr>
           <w:ilvl w:val="0"/>
-          <w:numId w:val="8"/>
+          <w:numId w:val="3"/>
         </w:numPr>
         <w:spacing w:after="80"/>
       </w:pPr>
@@ -6458,7 +6461,7 @@
         </w:rPr>
         <w:lastRenderedPageBreak/>
         <w:drawing>
-          <wp:inline distT="0" distB="0" distL="0" distR="0" wp14:anchorId="44C38F4A" wp14:editId="44C38F4B">
+          <wp:inline distT="0" distB="0" distL="0" distR="0" wp14:anchorId="6B2EA66A" wp14:editId="6B2EA66B">
             <wp:extent cx="4762500" cy="1924050"/>
             <wp:effectExtent l="0" t="0" r="0" b="0"/>
             <wp:docPr id="1" name="02_baseline_curves.png" descr="MLP baseline: training loss falls to 0 while validation loss rises (overfitting)." title="MLP baseline: training loss falls to 0 while validation loss rises (overfitting)."/>
@@ -6518,14 +6521,12 @@
         <w:pStyle w:val="Titre1"/>
         <w:pageBreakBefore/>
       </w:pPr>
-      <w:bookmarkStart w:id="60" w:name="_Toc243477418"/>
-      <w:bookmarkStart w:id="61" w:name="_Toc31"/>
+      <w:bookmarkStart w:id="30" w:name="_Toc243481322"/>
       <w:r>
         <w:lastRenderedPageBreak/>
         <w:t>5. Step 3: monitoring and regularisation (notebook 03)</w:t>
       </w:r>
-      <w:bookmarkEnd w:id="60"/>
-      <w:bookmarkEnd w:id="61"/>
+      <w:bookmarkEnd w:id="30"/>
     </w:p>
     <w:tbl>
       <w:tblPr>
@@ -6691,13 +6692,11 @@
       <w:pPr>
         <w:pStyle w:val="Titre2"/>
       </w:pPr>
-      <w:bookmarkStart w:id="62" w:name="_Toc243477419"/>
-      <w:bookmarkStart w:id="63" w:name="_Toc32"/>
+      <w:bookmarkStart w:id="31" w:name="_Toc243481323"/>
       <w:r>
         <w:t>What we monitored</w:t>
       </w:r>
-      <w:bookmarkEnd w:id="62"/>
-      <w:bookmarkEnd w:id="63"/>
+      <w:bookmarkEnd w:id="31"/>
     </w:p>
     <w:p>
       <w:pPr>
@@ -6745,7 +6744,7 @@
         <w:pStyle w:val="Paragraphedeliste"/>
         <w:numPr>
           <w:ilvl w:val="0"/>
-          <w:numId w:val="8"/>
+          <w:numId w:val="3"/>
         </w:numPr>
         <w:spacing w:after="80"/>
       </w:pPr>
@@ -6765,7 +6764,7 @@
         <w:pStyle w:val="Paragraphedeliste"/>
         <w:numPr>
           <w:ilvl w:val="0"/>
-          <w:numId w:val="8"/>
+          <w:numId w:val="3"/>
         </w:numPr>
         <w:spacing w:after="80"/>
       </w:pPr>
@@ -6785,7 +6784,7 @@
         <w:pStyle w:val="Paragraphedeliste"/>
         <w:numPr>
           <w:ilvl w:val="0"/>
-          <w:numId w:val="8"/>
+          <w:numId w:val="3"/>
         </w:numPr>
         <w:spacing w:after="80"/>
       </w:pPr>
@@ -6812,20 +6811,18 @@
       <w:pPr>
         <w:pStyle w:val="Titre2"/>
       </w:pPr>
-      <w:bookmarkStart w:id="64" w:name="_Toc243477420"/>
-      <w:bookmarkStart w:id="65" w:name="_Toc33"/>
+      <w:bookmarkStart w:id="32" w:name="_Toc243481324"/>
       <w:r>
         <w:t>Learning-rate sweep (Adam, 8 values, 15 epochs each)</w:t>
       </w:r>
-      <w:bookmarkEnd w:id="64"/>
-      <w:bookmarkEnd w:id="65"/>
+      <w:bookmarkEnd w:id="32"/>
     </w:p>
     <w:p>
       <w:pPr>
         <w:pStyle w:val="Paragraphedeliste"/>
         <w:numPr>
           <w:ilvl w:val="0"/>
-          <w:numId w:val="8"/>
+          <w:numId w:val="3"/>
         </w:numPr>
         <w:spacing w:after="80"/>
       </w:pPr>
@@ -6838,7 +6835,7 @@
         <w:pStyle w:val="Paragraphedeliste"/>
         <w:numPr>
           <w:ilvl w:val="0"/>
-          <w:numId w:val="8"/>
+          <w:numId w:val="3"/>
         </w:numPr>
         <w:spacing w:after="80"/>
       </w:pPr>
@@ -6858,7 +6855,7 @@
         <w:pStyle w:val="Paragraphedeliste"/>
         <w:numPr>
           <w:ilvl w:val="0"/>
-          <w:numId w:val="8"/>
+          <w:numId w:val="3"/>
         </w:numPr>
         <w:spacing w:after="80"/>
       </w:pPr>
@@ -6871,7 +6868,7 @@
         <w:pStyle w:val="Paragraphedeliste"/>
         <w:numPr>
           <w:ilvl w:val="0"/>
-          <w:numId w:val="8"/>
+          <w:numId w:val="3"/>
         </w:numPr>
         <w:spacing w:after="80"/>
       </w:pPr>
@@ -6889,7 +6886,7 @@
           <w:noProof/>
         </w:rPr>
         <w:drawing>
-          <wp:inline distT="0" distB="0" distL="0" distR="0" wp14:anchorId="44C38F4C" wp14:editId="44C38F4D">
+          <wp:inline distT="0" distB="0" distL="0" distR="0" wp14:anchorId="6B2EA66C" wp14:editId="6B2EA66D">
             <wp:extent cx="4191000" cy="1619250"/>
             <wp:effectExtent l="0" t="0" r="0" b="0"/>
             <wp:docPr id="2" name="03_lr_sweep.png" descr="Learning-rate sweep: a U-shaped validation loss, best at 0.0001." title="Learning-rate sweep: a U-shaped validation loss, best at 0.0001."/>
@@ -6948,13 +6945,11 @@
       <w:pPr>
         <w:pStyle w:val="Titre2"/>
       </w:pPr>
-      <w:bookmarkStart w:id="66" w:name="_Toc243477421"/>
-      <w:bookmarkStart w:id="67" w:name="_Toc34"/>
+      <w:bookmarkStart w:id="33" w:name="_Toc243481325"/>
       <w:r>
         <w:t>The tools against overfitting (lr 0.0001, 3 seeds each)</w:t>
       </w:r>
-      <w:bookmarkEnd w:id="66"/>
-      <w:bookmarkEnd w:id="67"/>
+      <w:bookmarkEnd w:id="33"/>
     </w:p>
     <w:tbl>
       <w:tblPr>
@@ -7923,14 +7918,27 @@
         <w:pStyle w:val="Titre1"/>
         <w:pageBreakBefore/>
       </w:pPr>
-      <w:bookmarkStart w:id="68" w:name="_Toc243477422"/>
-      <w:bookmarkStart w:id="69" w:name="_Toc35"/>
+      <w:bookmarkStart w:id="34" w:name="_Toc243481326"/>
       <w:r>
         <w:lastRenderedPageBreak/>
         <w:t>6. Step 4: the training doctor (notebook 04)</w:t>
       </w:r>
-      <w:bookmarkEnd w:id="68"/>
-      <w:bookmarkEnd w:id="69"/>
+      <w:bookmarkEnd w:id="34"/>
+    </w:p>
+    <w:p>
+      <w:pPr>
+        <w:spacing w:after="120"/>
+      </w:pPr>
+      <w:r>
+        <w:rPr>
+          <w:b/>
+          <w:bCs/>
+        </w:rPr>
+        <w:t>In the talk: backup slide 14 only.</w:t>
+      </w:r>
+      <w:r>
+        <w:t xml:space="preserve"> The brief asks for monitoring and failure diagnosis of our own trainings: the talk shows them on slide 5 (inside the MLP, overfitting diagnosed and fixed) and slide 6 (ResNet curves, fine-tuning overfits). This chapter is for the questions: it proves that our monitoring tools really catch a broken training.</w:t>
+      </w:r>
     </w:p>
     <w:tbl>
       <w:tblPr>
@@ -8816,7 +8824,7 @@
         </w:rPr>
         <w:lastRenderedPageBreak/>
         <w:drawing>
-          <wp:inline distT="0" distB="0" distL="0" distR="0" wp14:anchorId="44C38F4E" wp14:editId="44C38F4F">
+          <wp:inline distT="0" distB="0" distL="0" distR="0" wp14:anchorId="6B2EA66E" wp14:editId="6B2EA66F">
             <wp:extent cx="4000500" cy="2209800"/>
             <wp:effectExtent l="0" t="0" r="0" b="0"/>
             <wp:docPr id="3" name="04_p4_grad_per_layer.png" descr="Patient 4: the gradient vanishes layer after layer with sigmoids; ReLU + He init fixes it." title="Patient 4: the gradient vanishes layer after layer with sigmoids; ReLU + He init fixes it."/>
@@ -8875,20 +8883,18 @@
       <w:pPr>
         <w:pStyle w:val="Titre2"/>
       </w:pPr>
-      <w:bookmarkStart w:id="70" w:name="_Toc243477423"/>
-      <w:bookmarkStart w:id="71" w:name="_Toc36"/>
+      <w:bookmarkStart w:id="35" w:name="_Toc243481327"/>
       <w:r>
         <w:t>Lessons to say at the oral</w:t>
       </w:r>
-      <w:bookmarkEnd w:id="70"/>
-      <w:bookmarkEnd w:id="71"/>
+      <w:bookmarkEnd w:id="35"/>
     </w:p>
     <w:p>
       <w:pPr>
         <w:pStyle w:val="Paragraphedeliste"/>
         <w:numPr>
           <w:ilvl w:val="0"/>
-          <w:numId w:val="8"/>
+          <w:numId w:val="3"/>
         </w:numPr>
         <w:spacing w:after="80"/>
       </w:pPr>
@@ -8921,7 +8927,7 @@
         <w:pStyle w:val="Paragraphedeliste"/>
         <w:numPr>
           <w:ilvl w:val="0"/>
-          <w:numId w:val="8"/>
+          <w:numId w:val="3"/>
         </w:numPr>
         <w:spacing w:after="80"/>
       </w:pPr>
@@ -8944,7 +8950,7 @@
         <w:pStyle w:val="Paragraphedeliste"/>
         <w:numPr>
           <w:ilvl w:val="0"/>
-          <w:numId w:val="8"/>
+          <w:numId w:val="3"/>
         </w:numPr>
         <w:spacing w:after="80"/>
       </w:pPr>
@@ -8957,7 +8963,7 @@
         <w:pStyle w:val="Paragraphedeliste"/>
         <w:numPr>
           <w:ilvl w:val="0"/>
-          <w:numId w:val="8"/>
+          <w:numId w:val="3"/>
         </w:numPr>
         <w:spacing w:after="80"/>
       </w:pPr>
@@ -8970,14 +8976,12 @@
         <w:pStyle w:val="Titre1"/>
         <w:pageBreakBefore/>
       </w:pPr>
-      <w:bookmarkStart w:id="72" w:name="_Toc243477424"/>
-      <w:bookmarkStart w:id="73" w:name="_Toc37"/>
+      <w:bookmarkStart w:id="36" w:name="_Toc243481328"/>
       <w:r>
         <w:lastRenderedPageBreak/>
         <w:t>7. Step 5: pretrained ResNet18 (notebook 05)</w:t>
       </w:r>
-      <w:bookmarkEnd w:id="72"/>
-      <w:bookmarkEnd w:id="73"/>
+      <w:bookmarkEnd w:id="36"/>
     </w:p>
     <w:tbl>
       <w:tblPr>
@@ -9179,13 +9183,11 @@
       <w:pPr>
         <w:pStyle w:val="Titre2"/>
       </w:pPr>
-      <w:bookmarkStart w:id="74" w:name="_Toc243477425"/>
-      <w:bookmarkStart w:id="75" w:name="_Toc38"/>
+      <w:bookmarkStart w:id="37" w:name="_Toc243481329"/>
       <w:r>
         <w:t>Why a CNN, and why pretrained</w:t>
       </w:r>
-      <w:bookmarkEnd w:id="74"/>
-      <w:bookmarkEnd w:id="75"/>
+      <w:bookmarkEnd w:id="37"/>
     </w:p>
     <w:p>
       <w:pPr>
@@ -9266,20 +9268,18 @@
       <w:pPr>
         <w:pStyle w:val="Titre2"/>
       </w:pPr>
-      <w:bookmarkStart w:id="76" w:name="_Toc243477426"/>
-      <w:bookmarkStart w:id="77" w:name="_Toc39"/>
+      <w:bookmarkStart w:id="38" w:name="_Toc243481330"/>
       <w:r>
         <w:t>Method A: frozen features + head</w:t>
       </w:r>
-      <w:bookmarkEnd w:id="76"/>
-      <w:bookmarkEnd w:id="77"/>
+      <w:bookmarkEnd w:id="38"/>
     </w:p>
     <w:p>
       <w:pPr>
         <w:pStyle w:val="Paragraphedeliste"/>
         <w:numPr>
           <w:ilvl w:val="0"/>
-          <w:numId w:val="8"/>
+          <w:numId w:val="3"/>
         </w:numPr>
         <w:spacing w:after="80"/>
       </w:pPr>
@@ -9302,7 +9302,7 @@
         <w:pStyle w:val="Paragraphedeliste"/>
         <w:numPr>
           <w:ilvl w:val="0"/>
-          <w:numId w:val="8"/>
+          <w:numId w:val="3"/>
         </w:numPr>
         <w:spacing w:after="80"/>
       </w:pPr>
@@ -9353,7 +9353,7 @@
         <w:pStyle w:val="Paragraphedeliste"/>
         <w:numPr>
           <w:ilvl w:val="0"/>
-          <w:numId w:val="8"/>
+          <w:numId w:val="3"/>
         </w:numPr>
         <w:spacing w:after="80"/>
       </w:pPr>
@@ -9375,13 +9375,11 @@
       <w:pPr>
         <w:pStyle w:val="Titre2"/>
       </w:pPr>
-      <w:bookmarkStart w:id="78" w:name="_Toc243477427"/>
-      <w:bookmarkStart w:id="79" w:name="_Toc40"/>
+      <w:bookmarkStart w:id="39" w:name="_Toc243481331"/>
       <w:r>
         <w:t>Method B: fine-tuning layer4</w:t>
       </w:r>
-      <w:bookmarkEnd w:id="78"/>
-      <w:bookmarkEnd w:id="79"/>
+      <w:bookmarkEnd w:id="39"/>
     </w:p>
     <w:p>
       <w:pPr>
@@ -9434,20 +9432,18 @@
       <w:pPr>
         <w:pStyle w:val="Titre2"/>
       </w:pPr>
-      <w:bookmarkStart w:id="80" w:name="_Toc243477428"/>
-      <w:bookmarkStart w:id="81" w:name="_Toc41"/>
+      <w:bookmarkStart w:id="40" w:name="_Toc243481332"/>
       <w:r>
         <w:t>Two silent bugs, measured</w:t>
       </w:r>
-      <w:bookmarkEnd w:id="80"/>
-      <w:bookmarkEnd w:id="81"/>
+      <w:bookmarkEnd w:id="40"/>
     </w:p>
     <w:p>
       <w:pPr>
         <w:pStyle w:val="Paragraphedeliste"/>
         <w:numPr>
           <w:ilvl w:val="0"/>
-          <w:numId w:val="8"/>
+          <w:numId w:val="3"/>
         </w:numPr>
         <w:spacing w:after="80"/>
       </w:pPr>
@@ -9481,7 +9477,7 @@
         <w:pStyle w:val="Paragraphedeliste"/>
         <w:numPr>
           <w:ilvl w:val="0"/>
-          <w:numId w:val="8"/>
+          <w:numId w:val="3"/>
         </w:numPr>
         <w:spacing w:after="80"/>
       </w:pPr>
@@ -9503,14 +9499,12 @@
       <w:pPr>
         <w:pStyle w:val="Titre2"/>
       </w:pPr>
-      <w:bookmarkStart w:id="82" w:name="_Toc243477429"/>
-      <w:bookmarkStart w:id="83" w:name="_Toc42"/>
+      <w:bookmarkStart w:id="41" w:name="_Toc243481333"/>
       <w:r>
         <w:lastRenderedPageBreak/>
         <w:t>Painter leakage, measured fairly</w:t>
       </w:r>
-      <w:bookmarkEnd w:id="82"/>
-      <w:bookmarkEnd w:id="83"/>
+      <w:bookmarkEnd w:id="41"/>
     </w:p>
     <w:p>
       <w:pPr>
@@ -9847,7 +9841,7 @@
           <w:noProof/>
         </w:rPr>
         <w:drawing>
-          <wp:inline distT="0" distB="0" distL="0" distR="0" wp14:anchorId="44C38F50" wp14:editId="44C38F51">
+          <wp:inline distT="0" distB="0" distL="0" distR="0" wp14:anchorId="6B2EA670" wp14:editId="6B2EA671">
             <wp:extent cx="4762500" cy="2524125"/>
             <wp:effectExtent l="0" t="0" r="0" b="0"/>
             <wp:docPr id="4" name="05_painter_leakage.png" descr="Painter leakage: same images, same model; only the known-painter group changes." title="Painter leakage: same images, same model; only the known-painter group changes."/>
@@ -9922,14 +9916,12 @@
         <w:pStyle w:val="Titre1"/>
         <w:pageBreakBefore/>
       </w:pPr>
-      <w:bookmarkStart w:id="84" w:name="_Toc243477430"/>
-      <w:bookmarkStart w:id="85" w:name="_Toc43"/>
+      <w:bookmarkStart w:id="42" w:name="_Toc243481334"/>
       <w:r>
         <w:lastRenderedPageBreak/>
         <w:t>8. Step 6: final test, CPU cost and recommendation (notebook 06)</w:t>
       </w:r>
-      <w:bookmarkEnd w:id="84"/>
-      <w:bookmarkEnd w:id="85"/>
+      <w:bookmarkEnd w:id="42"/>
     </w:p>
     <w:tbl>
       <w:tblPr>
@@ -10070,20 +10062,18 @@
       <w:pPr>
         <w:pStyle w:val="Titre2"/>
       </w:pPr>
-      <w:bookmarkStart w:id="86" w:name="_Toc243477431"/>
-      <w:bookmarkStart w:id="87" w:name="_Toc44"/>
+      <w:bookmarkStart w:id="43" w:name="_Toc243481335"/>
       <w:r>
         <w:t>Classical models (settings chosen on validation)</w:t>
       </w:r>
-      <w:bookmarkEnd w:id="86"/>
-      <w:bookmarkEnd w:id="87"/>
+      <w:bookmarkEnd w:id="43"/>
     </w:p>
     <w:p>
       <w:pPr>
         <w:pStyle w:val="Paragraphedeliste"/>
         <w:numPr>
           <w:ilvl w:val="0"/>
-          <w:numId w:val="8"/>
+          <w:numId w:val="3"/>
         </w:numPr>
         <w:spacing w:after="80"/>
       </w:pPr>
@@ -10096,7 +10086,7 @@
         <w:pStyle w:val="Paragraphedeliste"/>
         <w:numPr>
           <w:ilvl w:val="0"/>
-          <w:numId w:val="8"/>
+          <w:numId w:val="3"/>
         </w:numPr>
         <w:spacing w:after="80"/>
       </w:pPr>
@@ -10137,7 +10127,7 @@
         <w:pStyle w:val="Paragraphedeliste"/>
         <w:numPr>
           <w:ilvl w:val="0"/>
-          <w:numId w:val="8"/>
+          <w:numId w:val="3"/>
         </w:numPr>
         <w:spacing w:after="80"/>
       </w:pPr>
@@ -10185,13 +10175,11 @@
       <w:pPr>
         <w:pStyle w:val="Titre2"/>
       </w:pPr>
-      <w:bookmarkStart w:id="88" w:name="_Toc243477432"/>
-      <w:bookmarkStart w:id="89" w:name="_Toc45"/>
+      <w:bookmarkStart w:id="44" w:name="_Toc243481336"/>
       <w:r>
         <w:t>The final test, measured once</w:t>
       </w:r>
-      <w:bookmarkEnd w:id="88"/>
-      <w:bookmarkEnd w:id="89"/>
+      <w:bookmarkEnd w:id="44"/>
     </w:p>
     <w:p>
       <w:pPr>
@@ -11218,7 +11206,7 @@
         </w:rPr>
         <w:lastRenderedPageBreak/>
         <w:drawing>
-          <wp:inline distT="0" distB="0" distL="0" distR="0" wp14:anchorId="44C38F52" wp14:editId="44C38F53">
+          <wp:inline distT="0" distB="0" distL="0" distR="0" wp14:anchorId="6B2EA672" wp14:editId="6B2EA673">
             <wp:extent cx="4762500" cy="1971675"/>
             <wp:effectExtent l="0" t="0" r="0" b="0"/>
             <wp:docPr id="5" name="06_test_accuracy.png" descr="Final test: 220 paintings never seen before, with 95 % bootstrap intervals." title="Final test: 220 paintings never seen before, with 95 % bootstrap intervals."/>
@@ -11277,20 +11265,18 @@
       <w:pPr>
         <w:pStyle w:val="Titre2"/>
       </w:pPr>
-      <w:bookmarkStart w:id="90" w:name="_Toc243477433"/>
-      <w:bookmarkStart w:id="91" w:name="_Toc46"/>
+      <w:bookmarkStart w:id="45" w:name="_Toc243481337"/>
       <w:r>
         <w:t>Are the gaps real? Paired bootstrap (same 220 paintings, 5 000 redraws)</w:t>
       </w:r>
-      <w:bookmarkEnd w:id="90"/>
-      <w:bookmarkEnd w:id="91"/>
+      <w:bookmarkEnd w:id="45"/>
     </w:p>
     <w:p>
       <w:pPr>
         <w:pStyle w:val="Paragraphedeliste"/>
         <w:numPr>
           <w:ilvl w:val="0"/>
-          <w:numId w:val="8"/>
+          <w:numId w:val="3"/>
         </w:numPr>
         <w:spacing w:after="80"/>
       </w:pPr>
@@ -11313,7 +11299,7 @@
         <w:pStyle w:val="Paragraphedeliste"/>
         <w:numPr>
           <w:ilvl w:val="0"/>
-          <w:numId w:val="8"/>
+          <w:numId w:val="3"/>
         </w:numPr>
         <w:spacing w:after="80"/>
       </w:pPr>
@@ -11326,7 +11312,7 @@
         <w:pStyle w:val="Paragraphedeliste"/>
         <w:numPr>
           <w:ilvl w:val="0"/>
-          <w:numId w:val="8"/>
+          <w:numId w:val="3"/>
         </w:numPr>
         <w:spacing w:after="80"/>
       </w:pPr>
@@ -11338,13 +11324,11 @@
       <w:pPr>
         <w:pStyle w:val="Titre2"/>
       </w:pPr>
-      <w:bookmarkStart w:id="92" w:name="_Toc243477434"/>
-      <w:bookmarkStart w:id="93" w:name="_Toc47"/>
+      <w:bookmarkStart w:id="46" w:name="_Toc243481338"/>
       <w:r>
         <w:t>Frozen or fine-tuned? Validation and test disagree</w:t>
       </w:r>
-      <w:bookmarkEnd w:id="92"/>
-      <w:bookmarkEnd w:id="93"/>
+      <w:bookmarkEnd w:id="46"/>
     </w:p>
     <w:p>
       <w:pPr>
@@ -11368,13 +11352,11 @@
       <w:pPr>
         <w:pStyle w:val="Titre2"/>
       </w:pPr>
-      <w:bookmarkStart w:id="94" w:name="_Toc243477435"/>
-      <w:bookmarkStart w:id="95" w:name="_Toc48"/>
+      <w:bookmarkStart w:id="47" w:name="_Toc243481339"/>
       <w:r>
         <w:t>Speed and size</w:t>
       </w:r>
-      <w:bookmarkEnd w:id="94"/>
-      <w:bookmarkEnd w:id="95"/>
+      <w:bookmarkEnd w:id="47"/>
     </w:p>
     <w:p>
       <w:pPr>
@@ -11388,13 +11370,11 @@
       <w:pPr>
         <w:pStyle w:val="Titre2"/>
       </w:pPr>
-      <w:bookmarkStart w:id="96" w:name="_Toc243477436"/>
-      <w:bookmarkStart w:id="97" w:name="_Toc49"/>
+      <w:bookmarkStart w:id="48" w:name="_Toc243481340"/>
       <w:r>
         <w:t>Recommendation to the director</w:t>
       </w:r>
-      <w:bookmarkEnd w:id="96"/>
-      <w:bookmarkEnd w:id="97"/>
+      <w:bookmarkEnd w:id="48"/>
     </w:p>
     <w:p>
       <w:pPr>
@@ -11419,7 +11399,7 @@
         <w:pStyle w:val="Paragraphedeliste"/>
         <w:numPr>
           <w:ilvl w:val="0"/>
-          <w:numId w:val="9"/>
+          <w:numId w:val="4"/>
         </w:numPr>
         <w:spacing w:after="80"/>
       </w:pPr>
@@ -11439,7 +11419,7 @@
         <w:pStyle w:val="Paragraphedeliste"/>
         <w:numPr>
           <w:ilvl w:val="0"/>
-          <w:numId w:val="9"/>
+          <w:numId w:val="4"/>
         </w:numPr>
         <w:spacing w:after="80"/>
       </w:pPr>
@@ -11459,7 +11439,7 @@
         <w:pStyle w:val="Paragraphedeliste"/>
         <w:numPr>
           <w:ilvl w:val="0"/>
-          <w:numId w:val="9"/>
+          <w:numId w:val="4"/>
         </w:numPr>
         <w:spacing w:after="80"/>
       </w:pPr>
@@ -11487,14 +11467,12 @@
         <w:pStyle w:val="Titre1"/>
         <w:pageBreakBefore/>
       </w:pPr>
-      <w:bookmarkStart w:id="98" w:name="_Toc243477437"/>
-      <w:bookmarkStart w:id="99" w:name="_Toc50"/>
+      <w:bookmarkStart w:id="49" w:name="_Toc243481341"/>
       <w:r>
         <w:lastRenderedPageBreak/>
         <w:t>9. Bonus: what about transformers like BERT? (notebook 07)</w:t>
       </w:r>
-      <w:bookmarkEnd w:id="98"/>
-      <w:bookmarkEnd w:id="99"/>
+      <w:bookmarkEnd w:id="49"/>
     </w:p>
     <w:tbl>
       <w:tblPr>
@@ -12250,7 +12228,7 @@
         <w:pStyle w:val="Paragraphedeliste"/>
         <w:numPr>
           <w:ilvl w:val="0"/>
-          <w:numId w:val="8"/>
+          <w:numId w:val="3"/>
         </w:numPr>
         <w:spacing w:after="80"/>
       </w:pPr>
@@ -12270,7 +12248,7 @@
         <w:pStyle w:val="Paragraphedeliste"/>
         <w:numPr>
           <w:ilvl w:val="0"/>
-          <w:numId w:val="8"/>
+          <w:numId w:val="3"/>
         </w:numPr>
         <w:spacing w:after="80"/>
       </w:pPr>
@@ -12290,7 +12268,7 @@
         <w:pStyle w:val="Paragraphedeliste"/>
         <w:numPr>
           <w:ilvl w:val="0"/>
-          <w:numId w:val="8"/>
+          <w:numId w:val="3"/>
         </w:numPr>
         <w:spacing w:after="80"/>
       </w:pPr>
@@ -12310,7 +12288,7 @@
         <w:pStyle w:val="Paragraphedeliste"/>
         <w:numPr>
           <w:ilvl w:val="0"/>
-          <w:numId w:val="8"/>
+          <w:numId w:val="3"/>
         </w:numPr>
         <w:spacing w:after="80"/>
       </w:pPr>
@@ -12330,7 +12308,7 @@
         <w:pStyle w:val="Paragraphedeliste"/>
         <w:numPr>
           <w:ilvl w:val="0"/>
-          <w:numId w:val="8"/>
+          <w:numId w:val="3"/>
         </w:numPr>
         <w:spacing w:after="80"/>
       </w:pPr>
@@ -12356,7 +12334,7 @@
         </w:rPr>
         <w:lastRenderedPageBreak/>
         <w:drawing>
-          <wp:inline distT="0" distB="0" distL="0" distR="0" wp14:anchorId="44C38F54" wp14:editId="44C38F55">
+          <wp:inline distT="0" distB="0" distL="0" distR="0" wp14:anchorId="6B2EA674" wp14:editId="6B2EA675">
             <wp:extent cx="4381500" cy="2486025"/>
             <wp:effectExtent l="0" t="0" r="0" b="0"/>
             <wp:docPr id="6" name="07_transformers_accuracy_vs_speed.png" descr="Transformers on validation: CLIP is more accurate, but slower." title="Transformers on validation: CLIP is more accurate, but slower."/>
@@ -12416,14 +12394,12 @@
         <w:pStyle w:val="Titre1"/>
         <w:pageBreakBefore/>
       </w:pPr>
-      <w:bookmarkStart w:id="100" w:name="_Toc243477438"/>
-      <w:bookmarkStart w:id="101" w:name="_Toc51"/>
+      <w:bookmarkStart w:id="50" w:name="_Toc243481342"/>
       <w:r>
         <w:lastRenderedPageBreak/>
         <w:t>10. Key numbers to know by heart</w:t>
       </w:r>
-      <w:bookmarkEnd w:id="100"/>
-      <w:bookmarkEnd w:id="101"/>
+      <w:bookmarkEnd w:id="50"/>
     </w:p>
     <w:tbl>
       <w:tblPr>
@@ -13676,14 +13652,12 @@
         <w:pStyle w:val="Titre1"/>
         <w:pageBreakBefore/>
       </w:pPr>
-      <w:bookmarkStart w:id="102" w:name="_Toc243477439"/>
-      <w:bookmarkStart w:id="103" w:name="_Toc52"/>
+      <w:bookmarkStart w:id="51" w:name="_Toc243481343"/>
       <w:r>
         <w:lastRenderedPageBreak/>
         <w:t>11. Concepts in simple words</w:t>
       </w:r>
-      <w:bookmarkEnd w:id="102"/>
-      <w:bookmarkEnd w:id="103"/>
+      <w:bookmarkEnd w:id="51"/>
     </w:p>
     <w:tbl>
       <w:tblPr>
@@ -15869,14 +15843,12 @@
         <w:pStyle w:val="Titre1"/>
         <w:pageBreakBefore/>
       </w:pPr>
-      <w:bookmarkStart w:id="104" w:name="_Toc243477440"/>
-      <w:bookmarkStart w:id="105" w:name="_Toc53"/>
+      <w:bookmarkStart w:id="52" w:name="_Toc243481344"/>
       <w:r>
         <w:lastRenderedPageBreak/>
         <w:t>12. Questions you may get, with answers</w:t>
       </w:r>
-      <w:bookmarkEnd w:id="104"/>
-      <w:bookmarkEnd w:id="105"/>
+      <w:bookmarkEnd w:id="52"/>
     </w:p>
     <w:p>
       <w:pPr>
@@ -15893,13 +15865,11 @@
       <w:pPr>
         <w:pStyle w:val="Titre2"/>
       </w:pPr>
-      <w:bookmarkStart w:id="106" w:name="_Toc243477441"/>
-      <w:bookmarkStart w:id="107" w:name="_Toc54"/>
+      <w:bookmarkStart w:id="53" w:name="_Toc243481345"/>
       <w:r>
         <w:t>About the data</w:t>
       </w:r>
-      <w:bookmarkEnd w:id="106"/>
-      <w:bookmarkEnd w:id="107"/>
+      <w:bookmarkEnd w:id="53"/>
     </w:p>
     <w:p>
       <w:pPr>
@@ -16015,13 +15985,11 @@
       <w:pPr>
         <w:pStyle w:val="Titre2"/>
       </w:pPr>
-      <w:bookmarkStart w:id="108" w:name="_Toc243477442"/>
-      <w:bookmarkStart w:id="109" w:name="_Toc55"/>
+      <w:bookmarkStart w:id="54" w:name="_Toc243481346"/>
       <w:r>
         <w:t>About the MLP</w:t>
       </w:r>
-      <w:bookmarkEnd w:id="108"/>
-      <w:bookmarkEnd w:id="109"/>
+      <w:bookmarkEnd w:id="54"/>
     </w:p>
     <w:p>
       <w:pPr>
@@ -16137,13 +16105,11 @@
       <w:pPr>
         <w:pStyle w:val="Titre2"/>
       </w:pPr>
-      <w:bookmarkStart w:id="110" w:name="_Toc243477443"/>
-      <w:bookmarkStart w:id="111" w:name="_Toc56"/>
+      <w:bookmarkStart w:id="55" w:name="_Toc243481347"/>
       <w:r>
         <w:t>About training and diagnosis</w:t>
       </w:r>
-      <w:bookmarkEnd w:id="110"/>
-      <w:bookmarkEnd w:id="111"/>
+      <w:bookmarkEnd w:id="55"/>
     </w:p>
     <w:p>
       <w:pPr>
@@ -16237,14 +16203,12 @@
       <w:pPr>
         <w:pStyle w:val="Titre2"/>
       </w:pPr>
-      <w:bookmarkStart w:id="112" w:name="_Toc243477444"/>
-      <w:bookmarkStart w:id="113" w:name="_Toc57"/>
+      <w:bookmarkStart w:id="56" w:name="_Toc243481348"/>
       <w:r>
         <w:lastRenderedPageBreak/>
         <w:t>About ResNet</w:t>
       </w:r>
-      <w:bookmarkEnd w:id="112"/>
-      <w:bookmarkEnd w:id="113"/>
+      <w:bookmarkEnd w:id="56"/>
     </w:p>
     <w:p>
       <w:pPr>
@@ -16382,13 +16346,11 @@
       <w:pPr>
         <w:pStyle w:val="Titre2"/>
       </w:pPr>
-      <w:bookmarkStart w:id="114" w:name="_Toc243477445"/>
-      <w:bookmarkStart w:id="115" w:name="_Toc58"/>
+      <w:bookmarkStart w:id="57" w:name="_Toc243481349"/>
       <w:r>
         <w:t>About the results and the recommendation</w:t>
       </w:r>
-      <w:bookmarkEnd w:id="114"/>
-      <w:bookmarkEnd w:id="115"/>
+      <w:bookmarkEnd w:id="57"/>
     </w:p>
     <w:p>
       <w:pPr>
@@ -16526,14 +16488,12 @@
       <w:pPr>
         <w:pStyle w:val="Titre2"/>
       </w:pPr>
-      <w:bookmarkStart w:id="116" w:name="_Toc243477446"/>
-      <w:bookmarkStart w:id="117" w:name="_Toc59"/>
+      <w:bookmarkStart w:id="58" w:name="_Toc243481350"/>
       <w:r>
         <w:lastRenderedPageBreak/>
         <w:t>About the project</w:t>
       </w:r>
-      <w:bookmarkEnd w:id="116"/>
-      <w:bookmarkEnd w:id="117"/>
+      <w:bookmarkEnd w:id="58"/>
     </w:p>
     <w:p>
       <w:pPr>
@@ -16584,14 +16544,12 @@
         <w:pStyle w:val="Titre1"/>
         <w:pageBreakBefore/>
       </w:pPr>
-      <w:bookmarkStart w:id="118" w:name="_Toc243477447"/>
-      <w:bookmarkStart w:id="119" w:name="_Toc60"/>
+      <w:bookmarkStart w:id="59" w:name="_Toc243481351"/>
       <w:r>
         <w:lastRenderedPageBreak/>
         <w:t>13. Limits to admit, and next steps</w:t>
       </w:r>
-      <w:bookmarkEnd w:id="118"/>
-      <w:bookmarkEnd w:id="119"/>
+      <w:bookmarkEnd w:id="59"/>
     </w:p>
     <w:p>
       <w:pPr>
@@ -17380,14 +17338,12 @@
         <w:pStyle w:val="Titre1"/>
         <w:pageBreakBefore/>
       </w:pPr>
-      <w:bookmarkStart w:id="120" w:name="_Toc243477448"/>
-      <w:bookmarkStart w:id="121" w:name="_Toc61"/>
+      <w:bookmarkStart w:id="60" w:name="_Toc243481352"/>
       <w:r>
         <w:lastRenderedPageBreak/>
         <w:t>14. Git history and how to reproduce</w:t>
       </w:r>
-      <w:bookmarkEnd w:id="120"/>
-      <w:bookmarkEnd w:id="121"/>
+      <w:bookmarkEnd w:id="60"/>
     </w:p>
     <w:p>
       <w:pPr>
@@ -18241,7 +18197,7 @@
         <w:pStyle w:val="Paragraphedeliste"/>
         <w:numPr>
           <w:ilvl w:val="0"/>
-          <w:numId w:val="10"/>
+          <w:numId w:val="5"/>
         </w:numPr>
         <w:spacing w:after="80"/>
       </w:pPr>
@@ -18259,7 +18215,7 @@
         <w:pStyle w:val="Paragraphedeliste"/>
         <w:numPr>
           <w:ilvl w:val="0"/>
-          <w:numId w:val="10"/>
+          <w:numId w:val="5"/>
         </w:numPr>
         <w:spacing w:after="80"/>
       </w:pPr>
@@ -18280,7 +18236,7 @@
         <w:pStyle w:val="Paragraphedeliste"/>
         <w:numPr>
           <w:ilvl w:val="0"/>
-          <w:numId w:val="10"/>
+          <w:numId w:val="5"/>
         </w:numPr>
         <w:spacing w:after="80"/>
       </w:pPr>
@@ -18298,7 +18254,7 @@
         <w:pStyle w:val="Paragraphedeliste"/>
         <w:numPr>
           <w:ilvl w:val="0"/>
-          <w:numId w:val="10"/>
+          <w:numId w:val="5"/>
         </w:numPr>
         <w:spacing w:after="80"/>
       </w:pPr>
@@ -18338,14 +18294,12 @@
         <w:pStyle w:val="Titre1"/>
         <w:pageBreakBefore/>
       </w:pPr>
-      <w:bookmarkStart w:id="122" w:name="_Toc243477449"/>
-      <w:bookmarkStart w:id="123" w:name="_Toc62"/>
+      <w:bookmarkStart w:id="61" w:name="_Toc243481353"/>
       <w:r>
         <w:lastRenderedPageBreak/>
         <w:t>15. The 10-minute talk, slide by slide</w:t>
       </w:r>
-      <w:bookmarkEnd w:id="122"/>
-      <w:bookmarkEnd w:id="123"/>
+      <w:bookmarkEnd w:id="61"/>
     </w:p>
     <w:p>
       <w:pPr>
@@ -18355,7 +18309,7 @@
         <w:rPr>
           <w:color w:val="1C2433"/>
         </w:rPr>
-        <w:t>The talk follows the project step by step and gives the answer only at the end. About 55 seconds per slide; the speaker notes in the .pptx and oral_script.pdf hold the full text in simple English.</w:t>
+        <w:t>The talk follows the project step by step and gives the answer only at the end. 10 slides, about 55 seconds each: about 9:05 in total, the rest of the 10 minutes is a margin. The speaker notes in the .pptx and oral_script.pdf hold the full text in simple English.</w:t>
       </w:r>
     </w:p>
     <w:tbl>
@@ -18577,7 +18531,7 @@
                 <w:sz w:val="19"/>
                 <w:szCs w:val="19"/>
               </w:rPr>
-              <w:t>0:40</w:t>
+              <w:t>0:45</w:t>
             </w:r>
           </w:p>
         </w:tc>
@@ -18686,7 +18640,7 @@
                 <w:sz w:val="19"/>
                 <w:szCs w:val="19"/>
               </w:rPr>
-              <w:t>0:45</w:t>
+              <w:t>0:40</w:t>
             </w:r>
           </w:p>
         </w:tc>
@@ -18902,7 +18856,7 @@
                 <w:sz w:val="19"/>
                 <w:szCs w:val="19"/>
               </w:rPr>
-              <w:t>1:00</w:t>
+              <w:t>1:05</w:t>
             </w:r>
           </w:p>
         </w:tc>
@@ -19009,7 +18963,7 @@
                 <w:sz w:val="19"/>
                 <w:szCs w:val="19"/>
               </w:rPr>
-              <w:t>1:05</w:t>
+              <w:t>1:00</w:t>
             </w:r>
           </w:p>
         </w:tc>
@@ -19035,7 +18989,7 @@
                 <w:sz w:val="19"/>
                 <w:szCs w:val="19"/>
               </w:rPr>
-              <w:t>All tools together: 45.5 %; but Cubism 7 %: colours, not shapes.</w:t>
+              <w:t>Healthy inside (gradients, 4 % dead neurons); all tools together: 45.5 %; but Cubism 7 %.</w:t>
             </w:r>
           </w:p>
         </w:tc>
@@ -19091,7 +19045,7 @@
                 <w:sz w:val="19"/>
                 <w:szCs w:val="19"/>
               </w:rPr>
-              <w:t>Step 3: Four broken runs, four signatures</w:t>
+              <w:t>Step 4: A pretrained ResNet18 sees shapes</w:t>
             </w:r>
           </w:p>
         </w:tc>
@@ -19118,7 +19072,7 @@
                 <w:sz w:val="19"/>
                 <w:szCs w:val="19"/>
               </w:rPr>
-              <w:t>0:55</w:t>
+              <w:t>1:05</w:t>
             </w:r>
           </w:p>
         </w:tc>
@@ -19145,7 +19099,7 @@
                 <w:sz w:val="19"/>
                 <w:szCs w:val="19"/>
               </w:rPr>
-              <w:t>Same symptom, two causes: the monitor tells them apart.</w:t>
+              <w:t>88.1 % with 2 565 trained weights, small train-validation gap (0.09); fine-tuning overfits.</w:t>
             </w:r>
           </w:p>
         </w:tc>
@@ -19199,7 +19153,7 @@
                 <w:sz w:val="19"/>
                 <w:szCs w:val="19"/>
               </w:rPr>
-              <w:t>Step 4: A pretrained ResNet18 sees shapes</w:t>
+              <w:t>Step 4: Seeing the painter inflates the score</w:t>
             </w:r>
           </w:p>
         </w:tc>
@@ -19225,7 +19179,7 @@
                 <w:sz w:val="19"/>
                 <w:szCs w:val="19"/>
               </w:rPr>
-              <w:t>1:00</w:t>
+              <w:t>0:50</w:t>
             </w:r>
           </w:p>
         </w:tc>
@@ -19251,7 +19205,7 @@
                 <w:sz w:val="19"/>
                 <w:szCs w:val="19"/>
               </w:rPr>
-              <w:t>88.1 % with 2 565 trained weights; fine-tuning overfits.</w:t>
+              <w:t>+11.4 points on known painters, no change on the control group.</w:t>
             </w:r>
           </w:p>
         </w:tc>
@@ -19307,7 +19261,7 @@
                 <w:sz w:val="19"/>
                 <w:szCs w:val="19"/>
               </w:rPr>
-              <w:t>Step 4: Seeing the painter inflates the score</w:t>
+              <w:t>Step 5: Final test: the pretrained network wins</w:t>
             </w:r>
           </w:p>
         </w:tc>
@@ -19334,7 +19288,7 @@
                 <w:sz w:val="19"/>
                 <w:szCs w:val="19"/>
               </w:rPr>
-              <w:t>0:55</w:t>
+              <w:t>1:05</w:t>
             </w:r>
           </w:p>
         </w:tc>
@@ -19361,7 +19315,7 @@
                 <w:sz w:val="19"/>
                 <w:szCs w:val="19"/>
               </w:rPr>
-              <w:t>+11.4 points on known painters, no change on the control group.</w:t>
+              <w:t>+16.4 points over the random forest, interval 9.1 to 24.1.</w:t>
             </w:r>
           </w:p>
         </w:tc>
@@ -19415,7 +19369,7 @@
                 <w:sz w:val="19"/>
                 <w:szCs w:val="19"/>
               </w:rPr>
-              <w:t>Step 5: Final test: the pretrained network wins</w:t>
+              <w:t>Step 6: Fast and cheap enough for a kiosk</w:t>
             </w:r>
           </w:p>
         </w:tc>
@@ -19441,7 +19395,7 @@
                 <w:sz w:val="19"/>
                 <w:szCs w:val="19"/>
               </w:rPr>
-              <w:t>1:00</w:t>
+              <w:t>0:40</w:t>
             </w:r>
           </w:p>
         </w:tc>
@@ -19467,7 +19421,7 @@
                 <w:sz w:val="19"/>
                 <w:szCs w:val="19"/>
               </w:rPr>
-              <w:t>+16.4 points over the random forest, interval 9.1 to 24.1.</w:t>
+              <w:t>53 ms, 45 MB, 17 s of training, no GPU.</w:t>
             </w:r>
           </w:p>
         </w:tc>
@@ -19523,7 +19477,7 @@
                 <w:sz w:val="19"/>
                 <w:szCs w:val="19"/>
               </w:rPr>
-              <w:t>Step 6: Fast and cheap enough for a kiosk</w:t>
+              <w:t>Our choice: frozen ResNet18 + linear head</w:t>
             </w:r>
           </w:p>
         </w:tc>
@@ -19550,7 +19504,7 @@
                 <w:sz w:val="19"/>
                 <w:szCs w:val="19"/>
               </w:rPr>
-              <w:t>0:40</w:t>
+              <w:t>1:00</w:t>
             </w:r>
           </w:p>
         </w:tc>
@@ -19564,112 +19518,6 @@
               <w:right w:val="single" w:sz="4" w:space="0" w:color="D9DCE2"/>
             </w:tcBorders>
             <w:shd w:val="clear" w:color="auto" w:fill="F2F3F5"/>
-            <w:tcMar>
-              <w:top w:w="60" w:type="dxa"/>
-              <w:left w:w="100" w:type="dxa"/>
-              <w:bottom w:w="60" w:type="dxa"/>
-              <w:right w:w="100" w:type="dxa"/>
-            </w:tcMar>
-          </w:tcPr>
-          <w:p>
-            <w:r>
-              <w:rPr>
-                <w:sz w:val="19"/>
-                <w:szCs w:val="19"/>
-              </w:rPr>
-              <w:t>53 ms, 45 MB, 17 s of training, no GPU.</w:t>
-            </w:r>
-          </w:p>
-        </w:tc>
-      </w:tr>
-      <w:tr>
-        <w:tc>
-          <w:tcPr>
-            <w:tcW w:w="675" w:type="dxa"/>
-            <w:tcBorders>
-              <w:top w:val="single" w:sz="4" w:space="0" w:color="D9DCE2"/>
-              <w:left w:val="single" w:sz="4" w:space="0" w:color="D9DCE2"/>
-              <w:bottom w:val="single" w:sz="4" w:space="0" w:color="D9DCE2"/>
-              <w:right w:val="single" w:sz="4" w:space="0" w:color="D9DCE2"/>
-            </w:tcBorders>
-            <w:tcMar>
-              <w:top w:w="60" w:type="dxa"/>
-              <w:left w:w="100" w:type="dxa"/>
-              <w:bottom w:w="60" w:type="dxa"/>
-              <w:right w:w="100" w:type="dxa"/>
-            </w:tcMar>
-          </w:tcPr>
-          <w:p>
-            <w:r>
-              <w:rPr>
-                <w:sz w:val="19"/>
-                <w:szCs w:val="19"/>
-              </w:rPr>
-              <w:t>11</w:t>
-            </w:r>
-          </w:p>
-        </w:tc>
-        <w:tc>
-          <w:tcPr>
-            <w:tcW w:w="3181" w:type="dxa"/>
-            <w:tcBorders>
-              <w:top w:val="single" w:sz="4" w:space="0" w:color="D9DCE2"/>
-              <w:left w:val="single" w:sz="4" w:space="0" w:color="D9DCE2"/>
-              <w:bottom w:val="single" w:sz="4" w:space="0" w:color="D9DCE2"/>
-              <w:right w:val="single" w:sz="4" w:space="0" w:color="D9DCE2"/>
-            </w:tcBorders>
-            <w:tcMar>
-              <w:top w:w="60" w:type="dxa"/>
-              <w:left w:w="100" w:type="dxa"/>
-              <w:bottom w:w="60" w:type="dxa"/>
-              <w:right w:w="100" w:type="dxa"/>
-            </w:tcMar>
-          </w:tcPr>
-          <w:p>
-            <w:r>
-              <w:rPr>
-                <w:sz w:val="19"/>
-                <w:szCs w:val="19"/>
-              </w:rPr>
-              <w:t>Our choice: frozen ResNet18 + linear head</w:t>
-            </w:r>
-          </w:p>
-        </w:tc>
-        <w:tc>
-          <w:tcPr>
-            <w:tcW w:w="1157" w:type="dxa"/>
-            <w:tcBorders>
-              <w:top w:val="single" w:sz="4" w:space="0" w:color="D9DCE2"/>
-              <w:left w:val="single" w:sz="4" w:space="0" w:color="D9DCE2"/>
-              <w:bottom w:val="single" w:sz="4" w:space="0" w:color="D9DCE2"/>
-              <w:right w:val="single" w:sz="4" w:space="0" w:color="D9DCE2"/>
-            </w:tcBorders>
-            <w:tcMar>
-              <w:top w:w="60" w:type="dxa"/>
-              <w:left w:w="100" w:type="dxa"/>
-              <w:bottom w:w="60" w:type="dxa"/>
-              <w:right w:w="100" w:type="dxa"/>
-            </w:tcMar>
-          </w:tcPr>
-          <w:p>
-            <w:r>
-              <w:rPr>
-                <w:sz w:val="19"/>
-                <w:szCs w:val="19"/>
-              </w:rPr>
-              <w:t>1:05</w:t>
-            </w:r>
-          </w:p>
-        </w:tc>
-        <w:tc>
-          <w:tcPr>
-            <w:tcW w:w="4625" w:type="dxa"/>
-            <w:tcBorders>
-              <w:top w:val="single" w:sz="4" w:space="0" w:color="D9DCE2"/>
-              <w:left w:val="single" w:sz="4" w:space="0" w:color="D9DCE2"/>
-              <w:bottom w:val="single" w:sz="4" w:space="0" w:color="D9DCE2"/>
-              <w:right w:val="single" w:sz="4" w:space="0" w:color="D9DCE2"/>
-            </w:tcBorders>
             <w:tcMar>
               <w:top w:w="60" w:type="dxa"/>
               <w:left w:w="100" w:type="dxa"/>
@@ -19698,20 +19546,18 @@
       <w:pPr>
         <w:pStyle w:val="Titre2"/>
       </w:pPr>
-      <w:bookmarkStart w:id="124" w:name="_Toc243477450"/>
-      <w:bookmarkStart w:id="125" w:name="_Toc63"/>
+      <w:bookmarkStart w:id="62" w:name="_Toc243481354"/>
       <w:r>
         <w:t>The thread: each result opens the next step</w:t>
       </w:r>
-      <w:bookmarkEnd w:id="124"/>
-      <w:bookmarkEnd w:id="125"/>
+      <w:bookmarkEnd w:id="62"/>
     </w:p>
     <w:p>
       <w:pPr>
         <w:spacing w:after="120"/>
       </w:pPr>
       <w:r>
-        <w:t>A jury follows a story better than a list. Each slide ends with the problem that the next slide tries to solve:</w:t>
+        <w:t>A jury follows a story better than a list. Every slide ends with the same kind of sentence: what we saw, then what we do next. These are the exact words of the script:</w:t>
       </w:r>
     </w:p>
     <w:p>
@@ -19728,10 +19574,10 @@
           <w:b/>
           <w:bCs/>
         </w:rPr>
-        <w:t>Slide 3 to 4</w:t>
-      </w:r>
-      <w:r>
-        <w:t>: the data is fair, so we can build our first model.</w:t>
+        <w:t>Slide 1 to 2</w:t>
+      </w:r>
+      <w:r>
+        <w:t>: To answer it, we did not jump straight to a model. So now, here is our path: six steps.</w:t>
       </w:r>
     </w:p>
     <w:p>
@@ -19748,10 +19594,10 @@
           <w:b/>
           <w:bCs/>
         </w:rPr>
-        <w:t>Slide 4 to 5</w:t>
-      </w:r>
-      <w:r>
-        <w:t>: the MLP overfits, so we try to fix it; but first we check that the training itself is healthy.</w:t>
+        <w:t>Slide 2 to 3</w:t>
+      </w:r>
+      <w:r>
+        <w:t>: So now, let's start with step one: the data, and how we made the test fair.</w:t>
       </w:r>
     </w:p>
     <w:p>
@@ -19768,10 +19614,10 @@
           <w:b/>
           <w:bCs/>
         </w:rPr>
-        <w:t>Slide 5 to 6</w:t>
-      </w:r>
-      <w:r>
-        <w:t>: overfitting is under control, but it is not the only way a training can fail, so we break it four times on purpose.</w:t>
+        <w:t>Slide 3 to 4</w:t>
+      </w:r>
+      <w:r>
+        <w:t>: We saw that our data is ready and our test is fair. So now, step two: we can build our first model.</w:t>
       </w:r>
     </w:p>
     <w:p>
@@ -19788,10 +19634,10 @@
           <w:b/>
           <w:bCs/>
         </w:rPr>
-        <w:t>Slide 5 and 6 to 7</w:t>
-      </w:r>
-      <w:r>
-        <w:t>: the MLP sees colours, not shapes (Cubism 7 %), so we need a network that sees shapes: a pretrained CNN.</w:t>
+        <w:t>Slide 4 to 5</w:t>
+      </w:r>
+      <w:r>
+        <w:t>: We saw that our MLP is overfitting. So now, step three: we try to fix this overfitting.</w:t>
       </w:r>
     </w:p>
     <w:p>
@@ -19808,10 +19654,10 @@
           <w:b/>
           <w:bCs/>
         </w:rPr>
-        <w:t>Slide 7 to 8</w:t>
-      </w:r>
-      <w:r>
-        <w:t>: a model this strong can cheat by recognising the painter, so we test the painter rule.</w:t>
+        <w:t>Slide 5 to 6</w:t>
+      </w:r>
+      <w:r>
+        <w:t>: We saw that the overfitting is under control. But our MLP still sees colours, not shapes. So now, step four: we need a network that sees shapes.</w:t>
       </w:r>
     </w:p>
     <w:p>
@@ -19828,10 +19674,10 @@
           <w:b/>
           <w:bCs/>
         </w:rPr>
-        <w:t>Slide 8 to 9</w:t>
-      </w:r>
-      <w:r>
-        <w:t>: the split protects us, so we can trust the final test.</w:t>
+        <w:t>Slide 6 to 7</w:t>
+      </w:r>
+      <w:r>
+        <w:t>: We saw that ResNet18 reaches 88 percent. But a model this strong could cheat, by recognising the painter instead of the style. So now, we check if it cheats.</w:t>
       </w:r>
     </w:p>
     <w:p>
@@ -19848,10 +19694,10 @@
           <w:b/>
           <w:bCs/>
         </w:rPr>
-        <w:t>Slide 9 to 10</w:t>
-      </w:r>
-      <w:r>
-        <w:t>: accuracy is half of the director's question; the other half is the cost on a kiosk.</w:t>
+        <w:t>Slide 7 to 8</w:t>
+      </w:r>
+      <w:r>
+        <w:t>: We saw that our split stops this cheating: we can trust our test. So now, step five: the final test of every model.</w:t>
       </w:r>
     </w:p>
     <w:p>
@@ -19868,10 +19714,30 @@
           <w:b/>
           <w:bCs/>
         </w:rPr>
-        <w:t>Slide 10 to 11</w:t>
-      </w:r>
-      <w:r>
-        <w:t>: we have both halves, so we can answer the director.</w:t>
+        <w:t>Slide 8 to 9</w:t>
+      </w:r>
+      <w:r>
+        <w:t>: We saw that the pretrained network is the most accurate. But accuracy is only half of the director's question. So now, step six: what does it cost on a kiosk?</w:t>
+      </w:r>
+    </w:p>
+    <w:p>
+      <w:pPr>
+        <w:pStyle w:val="Paragraphedeliste"/>
+        <w:numPr>
+          <w:ilvl w:val="0"/>
+          <w:numId w:val="3"/>
+        </w:numPr>
+        <w:spacing w:after="80"/>
+      </w:pPr>
+      <w:r>
+        <w:rPr>
+          <w:b/>
+          <w:bCs/>
+        </w:rPr>
+        <w:t>Slide 9 to 10</w:t>
+      </w:r>
+      <w:r>
+        <w:t>: We saw that it is accurate, fast and cheap. So now, we have everything we need to answer the director.</w:t>
       </w:r>
     </w:p>
     <w:p>
@@ -19879,7 +19745,8 @@
         <w:spacing w:after="120"/>
       </w:pPr>
       <w:r>
-        <w:t>Slides 12 to 16 are backups for the questions: validation vs test, why you can trust the numbers, the training recipes, where the chosen model fails, and what about transformers (BERT, ViT, CLIP). The word-for-word script is in oral_script.pdf.</w:t>
+        <w:lastRenderedPageBreak/>
+        <w:t>Slides 11 to 16 are backups for the questions: validation vs test, why you can trust the numbers, the training recipes, the four broken runs of notebook 04, where the chosen model fails, and what about transformers (BERT, ViT, CLIP). The word-for-word script is in oral_script.pdf.</w:t>
       </w:r>
     </w:p>
     <w:sectPr>
@@ -19957,7 +19824,7 @@
         <w:sz w:val="16"/>
         <w:szCs w:val="16"/>
       </w:rPr>
-      <w:t>30</w:t>
+      <w:t>1</w:t>
     </w:r>
     <w:r>
       <w:rPr>
@@ -19993,10 +19860,10 @@
 <file path=word/numbering.xml><?xml version="1.0" encoding="utf-8"?>
 <w:numbering xmlns:wpc="http://schemas.microsoft.com/office/word/2010/wordprocessingCanvas" xmlns:cx="http://schemas.microsoft.com/office/drawing/2014/chartex" xmlns:cx1="http://schemas.microsoft.com/office/drawing/2015/9/8/chartex" xmlns:cx2="http://schemas.microsoft.com/office/drawing/2015/10/21/chartex" xmlns:cx3="http://schemas.microsoft.com/office/drawing/2016/5/9/chartex" xmlns:cx4="http://schemas.microsoft.com/office/drawing/2016/5/10/chartex" xmlns:cx5="http://schemas.microsoft.com/office/drawing/2016/5/11/chartex" xmlns:cx6="http://schemas.microsoft.com/office/drawing/2016/5/12/chartex" xmlns:cx7="http://schemas.microsoft.com/office/drawing/2016/5/13/chartex" xmlns:cx8="http://schemas.microsoft.com/office/drawing/2016/5/14/chartex" xmlns:mc="http://schemas.openxmlformats.org/markup-compatibility/2006" xmlns:aink="http://schemas.microsoft.com/office/drawing/2016/ink" xmlns:am3d="http://schemas.microsoft.com/office/drawing/2017/model3d" xmlns:o="urn:schemas-microsoft-com:office:office" xmlns:oel="http://schemas.microsoft.com/office/2019/extlst" xmlns:r="http://schemas.openxmlformats.org/officeDocument/2006/relationships" xmlns:m="http://schemas.openxmlformats.org/officeDocument/2006/math" xmlns:v="urn:schemas-microsoft-com:vml" xmlns:wp14="http://schemas.microsoft.com/office/word/2010/wordprocessingDrawing" xmlns:wp="http://schemas.openxmlformats.org/drawingml/2006/wordprocessingDrawing" xmlns:w10="urn:schemas-microsoft-com:office:word" xmlns:w="http://schemas.openxmlformats.org/wordprocessingml/2006/main" xmlns:w14="http://schemas.microsoft.com/office/word/2010/wordml" xmlns:w15="http://schemas.microsoft.com/office/word/2012/wordml" xmlns:w16cex="http://schemas.microsoft.com/office/word/2018/wordml/cex" xmlns:w16cid="http://schemas.microsoft.com/office/word/2016/wordml/cid" xmlns:w16="http://schemas.microsoft.com/office/word/2018/wordml" xmlns:w16du="http://schemas.microsoft.com/office/word/2023/wordml/word16du" xmlns:w16sdtdh="http://schemas.microsoft.com/office/word/2020/wordml/sdtdatahash" xmlns:w16sdtfl="http://schemas.microsoft.com/office/word/2024/wordml/sdtformatlock" xmlns:w16se="http://schemas.microsoft.com/office/word/2015/wordml/symex" xmlns:wpg="http://schemas.microsoft.com/office/word/2010/wordprocessingGroup" xmlns:wpi="http://schemas.microsoft.com/office/word/2010/wordprocessingInk" xmlns:wne="http://schemas.microsoft.com/office/word/2006/wordml" xmlns:wps="http://schemas.microsoft.com/office/word/2010/wordprocessingShape" mc:Ignorable="w14 w15 w16se w16cid w16 w16cex w16sdtdh w16sdtfl w16du wp14">
   <w:abstractNum w:abstractNumId="0" w15:restartNumberingAfterBreak="0">
-    <w:nsid w:val="0CD745DF"/>
+    <w:nsid w:val="0E2026D7"/>
     <w:multiLevelType w:val="hybridMultilevel"/>
-    <w:tmpl w:val="85A0C2F2"/>
-    <w:lvl w:ilvl="0" w:tplc="3FBA1C1E">
+    <w:tmpl w:val="5B6213CE"/>
+    <w:lvl w:ilvl="0" w:tplc="279ABD66">
       <w:start w:val="1"/>
       <w:numFmt w:val="decimal"/>
       <w:lvlText w:val="%1."/>
@@ -20005,138 +19872,106 @@
         <w:ind w:left="400" w:hanging="300"/>
       </w:pPr>
     </w:lvl>
-    <w:lvl w:ilvl="1" w:tplc="297CD7C4">
+    <w:lvl w:ilvl="1" w:tplc="9CF262D8">
       <w:numFmt w:val="decimal"/>
       <w:lvlText w:val=""/>
       <w:lvlJc w:val="left"/>
     </w:lvl>
-    <w:lvl w:ilvl="2" w:tplc="1E8C4F64">
+    <w:lvl w:ilvl="2" w:tplc="8BD026EA">
       <w:numFmt w:val="decimal"/>
       <w:lvlText w:val=""/>
       <w:lvlJc w:val="left"/>
     </w:lvl>
-    <w:lvl w:ilvl="3" w:tplc="37CE4176">
+    <w:lvl w:ilvl="3" w:tplc="5A6AFCC4">
       <w:numFmt w:val="decimal"/>
       <w:lvlText w:val=""/>
       <w:lvlJc w:val="left"/>
     </w:lvl>
-    <w:lvl w:ilvl="4" w:tplc="CD141514">
+    <w:lvl w:ilvl="4" w:tplc="9898AB6A">
       <w:numFmt w:val="decimal"/>
       <w:lvlText w:val=""/>
       <w:lvlJc w:val="left"/>
     </w:lvl>
-    <w:lvl w:ilvl="5" w:tplc="0CB4D6AC">
+    <w:lvl w:ilvl="5" w:tplc="7988D80A">
       <w:numFmt w:val="decimal"/>
       <w:lvlText w:val=""/>
       <w:lvlJc w:val="left"/>
     </w:lvl>
-    <w:lvl w:ilvl="6" w:tplc="2D989198">
+    <w:lvl w:ilvl="6" w:tplc="A7BAF60C">
       <w:numFmt w:val="decimal"/>
       <w:lvlText w:val=""/>
       <w:lvlJc w:val="left"/>
     </w:lvl>
-    <w:lvl w:ilvl="7" w:tplc="1F8A420C">
+    <w:lvl w:ilvl="7" w:tplc="C992A242">
       <w:numFmt w:val="decimal"/>
       <w:lvlText w:val=""/>
       <w:lvlJc w:val="left"/>
     </w:lvl>
-    <w:lvl w:ilvl="8" w:tplc="138C4FC6">
+    <w:lvl w:ilvl="8" w:tplc="4EA2F2B8">
       <w:numFmt w:val="decimal"/>
       <w:lvlText w:val=""/>
       <w:lvlJc w:val="left"/>
     </w:lvl>
   </w:abstractNum>
   <w:abstractNum w:abstractNumId="1" w15:restartNumberingAfterBreak="0">
-    <w:nsid w:val="0EDF2EE6"/>
+    <w:nsid w:val="0F9B59E6"/>
     <w:multiLevelType w:val="hybridMultilevel"/>
-    <w:tmpl w:val="0980C432"/>
-    <w:lvl w:ilvl="0" w:tplc="2F18FD28" w:tentative="1">
+    <w:tmpl w:val="3B78FD66"/>
+    <w:lvl w:ilvl="0" w:tplc="F11C5E7E">
       <w:start w:val="1"/>
       <w:numFmt w:val="bullet"/>
-      <w:lvlText w:val="●"/>
+      <w:lvlText w:val="•"/>
       <w:lvlJc w:val="left"/>
       <w:pPr>
-        <w:ind w:left="720" w:hanging="360"/>
+        <w:ind w:left="400" w:hanging="260"/>
       </w:pPr>
     </w:lvl>
-    <w:lvl w:ilvl="1" w:tplc="AD6A645A" w:tentative="1">
-      <w:start w:val="1"/>
-      <w:numFmt w:val="bullet"/>
-      <w:lvlText w:val="○"/>
+    <w:lvl w:ilvl="1" w:tplc="718C772C">
+      <w:numFmt w:val="decimal"/>
+      <w:lvlText w:val=""/>
       <w:lvlJc w:val="left"/>
-      <w:pPr>
-        <w:ind w:left="1440" w:hanging="360"/>
-      </w:pPr>
     </w:lvl>
-    <w:lvl w:ilvl="2" w:tplc="6B9CA7C6" w:tentative="1">
-      <w:start w:val="1"/>
-      <w:numFmt w:val="bullet"/>
-      <w:lvlText w:val="■"/>
+    <w:lvl w:ilvl="2" w:tplc="5CEC1D9E">
+      <w:numFmt w:val="decimal"/>
+      <w:lvlText w:val=""/>
       <w:lvlJc w:val="left"/>
-      <w:pPr>
-        <w:ind w:left="2160" w:hanging="360"/>
-      </w:pPr>
     </w:lvl>
-    <w:lvl w:ilvl="3" w:tplc="CFBABB28" w:tentative="1">
-      <w:start w:val="1"/>
-      <w:numFmt w:val="bullet"/>
-      <w:lvlText w:val="●"/>
+    <w:lvl w:ilvl="3" w:tplc="95B4A254">
+      <w:numFmt w:val="decimal"/>
+      <w:lvlText w:val=""/>
       <w:lvlJc w:val="left"/>
-      <w:pPr>
-        <w:ind w:left="2880" w:hanging="360"/>
-      </w:pPr>
     </w:lvl>
-    <w:lvl w:ilvl="4" w:tplc="9DA4033A" w:tentative="1">
-      <w:start w:val="1"/>
-      <w:numFmt w:val="bullet"/>
-      <w:lvlText w:val="○"/>
+    <w:lvl w:ilvl="4" w:tplc="E98E6A1E">
+      <w:numFmt w:val="decimal"/>
+      <w:lvlText w:val=""/>
       <w:lvlJc w:val="left"/>
-      <w:pPr>
-        <w:ind w:left="3600" w:hanging="360"/>
-      </w:pPr>
     </w:lvl>
-    <w:lvl w:ilvl="5" w:tplc="39C4A562" w:tentative="1">
-      <w:start w:val="1"/>
-      <w:numFmt w:val="bullet"/>
-      <w:lvlText w:val="■"/>
+    <w:lvl w:ilvl="5" w:tplc="57D853EA">
+      <w:numFmt w:val="decimal"/>
+      <w:lvlText w:val=""/>
       <w:lvlJc w:val="left"/>
-      <w:pPr>
-        <w:ind w:left="4320" w:hanging="360"/>
-      </w:pPr>
     </w:lvl>
-    <w:lvl w:ilvl="6" w:tplc="4D5C123C" w:tentative="1">
-      <w:start w:val="1"/>
-      <w:numFmt w:val="bullet"/>
-      <w:lvlText w:val="●"/>
+    <w:lvl w:ilvl="6" w:tplc="CB005A36">
+      <w:numFmt w:val="decimal"/>
+      <w:lvlText w:val=""/>
       <w:lvlJc w:val="left"/>
-      <w:pPr>
-        <w:ind w:left="5040" w:hanging="360"/>
-      </w:pPr>
     </w:lvl>
-    <w:lvl w:ilvl="7" w:tplc="E876B580" w:tentative="1">
-      <w:start w:val="1"/>
-      <w:numFmt w:val="bullet"/>
-      <w:lvlText w:val="●"/>
+    <w:lvl w:ilvl="7" w:tplc="2662F00C">
+      <w:numFmt w:val="decimal"/>
+      <w:lvlText w:val=""/>
       <w:lvlJc w:val="left"/>
-      <w:pPr>
-        <w:ind w:left="5760" w:hanging="360"/>
-      </w:pPr>
     </w:lvl>
-    <w:lvl w:ilvl="8" w:tplc="646E45CE" w:tentative="1">
-      <w:start w:val="1"/>
-      <w:numFmt w:val="bullet"/>
-      <w:lvlText w:val="●"/>
+    <w:lvl w:ilvl="8" w:tplc="968880D2">
+      <w:numFmt w:val="decimal"/>
+      <w:lvlText w:val=""/>
       <w:lvlJc w:val="left"/>
-      <w:pPr>
-        <w:ind w:left="6480" w:hanging="360"/>
-      </w:pPr>
     </w:lvl>
   </w:abstractNum>
   <w:abstractNum w:abstractNumId="2" w15:restartNumberingAfterBreak="0">
-    <w:nsid w:val="12632571"/>
+    <w:nsid w:val="55BC4BCA"/>
     <w:multiLevelType w:val="hybridMultilevel"/>
-    <w:tmpl w:val="47A2812C"/>
-    <w:lvl w:ilvl="0" w:tplc="F03CDFFC">
+    <w:tmpl w:val="71F89426"/>
+    <w:lvl w:ilvl="0" w:tplc="DBF02D08">
       <w:start w:val="1"/>
       <w:numFmt w:val="decimal"/>
       <w:lvlText w:val="%1."/>
@@ -20145,138 +19980,52 @@
         <w:ind w:left="400" w:hanging="300"/>
       </w:pPr>
     </w:lvl>
-    <w:lvl w:ilvl="1" w:tplc="68F610A2">
+    <w:lvl w:ilvl="1" w:tplc="1136A088">
       <w:numFmt w:val="decimal"/>
       <w:lvlText w:val=""/>
       <w:lvlJc w:val="left"/>
     </w:lvl>
-    <w:lvl w:ilvl="2" w:tplc="5DAE78FC">
+    <w:lvl w:ilvl="2" w:tplc="33EAFDD0">
       <w:numFmt w:val="decimal"/>
       <w:lvlText w:val=""/>
       <w:lvlJc w:val="left"/>
     </w:lvl>
-    <w:lvl w:ilvl="3" w:tplc="E3E67000">
+    <w:lvl w:ilvl="3" w:tplc="C0D2D9F8">
       <w:numFmt w:val="decimal"/>
       <w:lvlText w:val=""/>
       <w:lvlJc w:val="left"/>
     </w:lvl>
-    <w:lvl w:ilvl="4" w:tplc="0D8E4816">
+    <w:lvl w:ilvl="4" w:tplc="BAAAC0CE">
       <w:numFmt w:val="decimal"/>
       <w:lvlText w:val=""/>
       <w:lvlJc w:val="left"/>
     </w:lvl>
-    <w:lvl w:ilvl="5" w:tplc="CC3CAA48">
+    <w:lvl w:ilvl="5" w:tplc="46604930">
       <w:numFmt w:val="decimal"/>
       <w:lvlText w:val=""/>
       <w:lvlJc w:val="left"/>
     </w:lvl>
-    <w:lvl w:ilvl="6" w:tplc="20A0E92A">
+    <w:lvl w:ilvl="6" w:tplc="29A295FA">
       <w:numFmt w:val="decimal"/>
       <w:lvlText w:val=""/>
       <w:lvlJc w:val="left"/>
     </w:lvl>
-    <w:lvl w:ilvl="7" w:tplc="ACF235EE">
+    <w:lvl w:ilvl="7" w:tplc="1D42C3B4">
       <w:numFmt w:val="decimal"/>
       <w:lvlText w:val=""/>
       <w:lvlJc w:val="left"/>
     </w:lvl>
-    <w:lvl w:ilvl="8" w:tplc="7DEC6992">
+    <w:lvl w:ilvl="8" w:tplc="54DAA604">
       <w:numFmt w:val="decimal"/>
       <w:lvlText w:val=""/>
       <w:lvlJc w:val="left"/>
     </w:lvl>
   </w:abstractNum>
   <w:abstractNum w:abstractNumId="3" w15:restartNumberingAfterBreak="0">
-    <w:nsid w:val="1CDA20CF"/>
+    <w:nsid w:val="5ED8623F"/>
     <w:multiLevelType w:val="hybridMultilevel"/>
-    <w:tmpl w:val="D31EE368"/>
-    <w:lvl w:ilvl="0" w:tplc="9C5AC08E" w:tentative="1">
-      <w:start w:val="1"/>
-      <w:numFmt w:val="bullet"/>
-      <w:lvlText w:val="●"/>
-      <w:lvlJc w:val="left"/>
-      <w:pPr>
-        <w:ind w:left="720" w:hanging="360"/>
-      </w:pPr>
-    </w:lvl>
-    <w:lvl w:ilvl="1" w:tplc="8F70233A" w:tentative="1">
-      <w:start w:val="1"/>
-      <w:numFmt w:val="bullet"/>
-      <w:lvlText w:val="○"/>
-      <w:lvlJc w:val="left"/>
-      <w:pPr>
-        <w:ind w:left="1440" w:hanging="360"/>
-      </w:pPr>
-    </w:lvl>
-    <w:lvl w:ilvl="2" w:tplc="C92E967C" w:tentative="1">
-      <w:start w:val="1"/>
-      <w:numFmt w:val="bullet"/>
-      <w:lvlText w:val="■"/>
-      <w:lvlJc w:val="left"/>
-      <w:pPr>
-        <w:ind w:left="2160" w:hanging="360"/>
-      </w:pPr>
-    </w:lvl>
-    <w:lvl w:ilvl="3" w:tplc="931AC23E" w:tentative="1">
-      <w:start w:val="1"/>
-      <w:numFmt w:val="bullet"/>
-      <w:lvlText w:val="●"/>
-      <w:lvlJc w:val="left"/>
-      <w:pPr>
-        <w:ind w:left="2880" w:hanging="360"/>
-      </w:pPr>
-    </w:lvl>
-    <w:lvl w:ilvl="4" w:tplc="5D12F37E" w:tentative="1">
-      <w:start w:val="1"/>
-      <w:numFmt w:val="bullet"/>
-      <w:lvlText w:val="○"/>
-      <w:lvlJc w:val="left"/>
-      <w:pPr>
-        <w:ind w:left="3600" w:hanging="360"/>
-      </w:pPr>
-    </w:lvl>
-    <w:lvl w:ilvl="5" w:tplc="AAC82996" w:tentative="1">
-      <w:start w:val="1"/>
-      <w:numFmt w:val="bullet"/>
-      <w:lvlText w:val="■"/>
-      <w:lvlJc w:val="left"/>
-      <w:pPr>
-        <w:ind w:left="4320" w:hanging="360"/>
-      </w:pPr>
-    </w:lvl>
-    <w:lvl w:ilvl="6" w:tplc="B7442BDE" w:tentative="1">
-      <w:start w:val="1"/>
-      <w:numFmt w:val="bullet"/>
-      <w:lvlText w:val="●"/>
-      <w:lvlJc w:val="left"/>
-      <w:pPr>
-        <w:ind w:left="5040" w:hanging="360"/>
-      </w:pPr>
-    </w:lvl>
-    <w:lvl w:ilvl="7" w:tplc="428EC51C" w:tentative="1">
-      <w:start w:val="1"/>
-      <w:numFmt w:val="bullet"/>
-      <w:lvlText w:val="●"/>
-      <w:lvlJc w:val="left"/>
-      <w:pPr>
-        <w:ind w:left="5760" w:hanging="360"/>
-      </w:pPr>
-    </w:lvl>
-    <w:lvl w:ilvl="8" w:tplc="629207DE" w:tentative="1">
-      <w:start w:val="1"/>
-      <w:numFmt w:val="bullet"/>
-      <w:lvlText w:val="●"/>
-      <w:lvlJc w:val="left"/>
-      <w:pPr>
-        <w:ind w:left="6480" w:hanging="360"/>
-      </w:pPr>
-    </w:lvl>
-  </w:abstractNum>
-  <w:abstractNum w:abstractNumId="4" w15:restartNumberingAfterBreak="0">
-    <w:nsid w:val="26390707"/>
-    <w:multiLevelType w:val="hybridMultilevel"/>
-    <w:tmpl w:val="B3380312"/>
-    <w:lvl w:ilvl="0" w:tplc="29DEB616">
+    <w:tmpl w:val="8702E0B8"/>
+    <w:lvl w:ilvl="0" w:tplc="A0F8D4C6">
       <w:start w:val="1"/>
       <w:numFmt w:val="decimal"/>
       <w:lvlText w:val="%1."/>
@@ -20285,372 +20034,158 @@
         <w:ind w:left="400" w:hanging="300"/>
       </w:pPr>
     </w:lvl>
-    <w:lvl w:ilvl="1" w:tplc="DCC4F9A4">
+    <w:lvl w:ilvl="1" w:tplc="28C0CF8A">
       <w:numFmt w:val="decimal"/>
       <w:lvlText w:val=""/>
       <w:lvlJc w:val="left"/>
     </w:lvl>
-    <w:lvl w:ilvl="2" w:tplc="8C6ED982">
+    <w:lvl w:ilvl="2" w:tplc="66A65506">
       <w:numFmt w:val="decimal"/>
       <w:lvlText w:val=""/>
       <w:lvlJc w:val="left"/>
     </w:lvl>
-    <w:lvl w:ilvl="3" w:tplc="EADC9C8A">
+    <w:lvl w:ilvl="3" w:tplc="2F4842C2">
       <w:numFmt w:val="decimal"/>
       <w:lvlText w:val=""/>
       <w:lvlJc w:val="left"/>
     </w:lvl>
-    <w:lvl w:ilvl="4" w:tplc="C5222086">
+    <w:lvl w:ilvl="4" w:tplc="7FE4CB6C">
       <w:numFmt w:val="decimal"/>
       <w:lvlText w:val=""/>
       <w:lvlJc w:val="left"/>
     </w:lvl>
-    <w:lvl w:ilvl="5" w:tplc="0C22DE0C">
+    <w:lvl w:ilvl="5" w:tplc="ABFC8A0C">
       <w:numFmt w:val="decimal"/>
       <w:lvlText w:val=""/>
       <w:lvlJc w:val="left"/>
     </w:lvl>
-    <w:lvl w:ilvl="6" w:tplc="EFA8C8E6">
+    <w:lvl w:ilvl="6" w:tplc="5C7A2650">
       <w:numFmt w:val="decimal"/>
       <w:lvlText w:val=""/>
       <w:lvlJc w:val="left"/>
     </w:lvl>
-    <w:lvl w:ilvl="7" w:tplc="9446A9E4">
+    <w:lvl w:ilvl="7" w:tplc="3B047E54">
       <w:numFmt w:val="decimal"/>
       <w:lvlText w:val=""/>
       <w:lvlJc w:val="left"/>
     </w:lvl>
-    <w:lvl w:ilvl="8" w:tplc="1C6CE010">
+    <w:lvl w:ilvl="8" w:tplc="D096C0A0">
       <w:numFmt w:val="decimal"/>
       <w:lvlText w:val=""/>
       <w:lvlJc w:val="left"/>
     </w:lvl>
   </w:abstractNum>
-  <w:abstractNum w:abstractNumId="5" w15:restartNumberingAfterBreak="0">
-    <w:nsid w:val="31222CA5"/>
+  <w:abstractNum w:abstractNumId="4" w15:restartNumberingAfterBreak="0">
+    <w:nsid w:val="77315512"/>
     <w:multiLevelType w:val="hybridMultilevel"/>
-    <w:tmpl w:val="DD20D39E"/>
-    <w:lvl w:ilvl="0" w:tplc="D7205FCA">
+    <w:tmpl w:val="08C862A0"/>
+    <w:lvl w:ilvl="0" w:tplc="0456A398" w:tentative="1">
       <w:start w:val="1"/>
       <w:numFmt w:val="bullet"/>
-      <w:lvlText w:val="•"/>
+      <w:lvlText w:val="●"/>
       <w:lvlJc w:val="left"/>
       <w:pPr>
-        <w:ind w:left="400" w:hanging="260"/>
+        <w:ind w:left="720" w:hanging="360"/>
       </w:pPr>
     </w:lvl>
-    <w:lvl w:ilvl="1" w:tplc="2814D8E6">
-      <w:numFmt w:val="decimal"/>
-      <w:lvlText w:val=""/>
+    <w:lvl w:ilvl="1" w:tplc="A06AA5A8" w:tentative="1">
+      <w:start w:val="1"/>
+      <w:numFmt w:val="bullet"/>
+      <w:lvlText w:val="○"/>
       <w:lvlJc w:val="left"/>
+      <w:pPr>
+        <w:ind w:left="1440" w:hanging="360"/>
+      </w:pPr>
     </w:lvl>
-    <w:lvl w:ilvl="2" w:tplc="88F482DE">
-      <w:numFmt w:val="decimal"/>
-      <w:lvlText w:val=""/>
+    <w:lvl w:ilvl="2" w:tplc="BDE0C05E" w:tentative="1">
+      <w:start w:val="1"/>
+      <w:numFmt w:val="bullet"/>
+      <w:lvlText w:val="■"/>
       <w:lvlJc w:val="left"/>
+      <w:pPr>
+        <w:ind w:left="2160" w:hanging="360"/>
+      </w:pPr>
     </w:lvl>
-    <w:lvl w:ilvl="3" w:tplc="E07CB9F0">
-      <w:numFmt w:val="decimal"/>
-      <w:lvlText w:val=""/>
+    <w:lvl w:ilvl="3" w:tplc="735ADADE" w:tentative="1">
+      <w:start w:val="1"/>
+      <w:numFmt w:val="bullet"/>
+      <w:lvlText w:val="●"/>
       <w:lvlJc w:val="left"/>
+      <w:pPr>
+        <w:ind w:left="2880" w:hanging="360"/>
+      </w:pPr>
     </w:lvl>
-    <w:lvl w:ilvl="4" w:tplc="E12A9DAE">
-      <w:numFmt w:val="decimal"/>
-      <w:lvlText w:val=""/>
+    <w:lvl w:ilvl="4" w:tplc="00AC4802" w:tentative="1">
+      <w:start w:val="1"/>
+      <w:numFmt w:val="bullet"/>
+      <w:lvlText w:val="○"/>
       <w:lvlJc w:val="left"/>
+      <w:pPr>
+        <w:ind w:left="3600" w:hanging="360"/>
+      </w:pPr>
     </w:lvl>
-    <w:lvl w:ilvl="5" w:tplc="B664A636">
-      <w:numFmt w:val="decimal"/>
-      <w:lvlText w:val=""/>
+    <w:lvl w:ilvl="5" w:tplc="DCA66104" w:tentative="1">
+      <w:start w:val="1"/>
+      <w:numFmt w:val="bullet"/>
+      <w:lvlText w:val="■"/>
       <w:lvlJc w:val="left"/>
+      <w:pPr>
+        <w:ind w:left="4320" w:hanging="360"/>
+      </w:pPr>
     </w:lvl>
-    <w:lvl w:ilvl="6" w:tplc="F67A3DAA">
-      <w:numFmt w:val="decimal"/>
-      <w:lvlText w:val=""/>
+    <w:lvl w:ilvl="6" w:tplc="58C6413A" w:tentative="1">
+      <w:start w:val="1"/>
+      <w:numFmt w:val="bullet"/>
+      <w:lvlText w:val="●"/>
       <w:lvlJc w:val="left"/>
+      <w:pPr>
+        <w:ind w:left="5040" w:hanging="360"/>
+      </w:pPr>
     </w:lvl>
-    <w:lvl w:ilvl="7" w:tplc="154A20FA">
-      <w:numFmt w:val="decimal"/>
-      <w:lvlText w:val=""/>
+    <w:lvl w:ilvl="7" w:tplc="E29C0C2A" w:tentative="1">
+      <w:start w:val="1"/>
+      <w:numFmt w:val="bullet"/>
+      <w:lvlText w:val="●"/>
       <w:lvlJc w:val="left"/>
+      <w:pPr>
+        <w:ind w:left="5760" w:hanging="360"/>
+      </w:pPr>
     </w:lvl>
-    <w:lvl w:ilvl="8" w:tplc="9158698A">
-      <w:numFmt w:val="decimal"/>
-      <w:lvlText w:val=""/>
+    <w:lvl w:ilvl="8" w:tplc="EEA8582E" w:tentative="1">
+      <w:start w:val="1"/>
+      <w:numFmt w:val="bullet"/>
+      <w:lvlText w:val="●"/>
       <w:lvlJc w:val="left"/>
+      <w:pPr>
+        <w:ind w:left="6480" w:hanging="360"/>
+      </w:pPr>
     </w:lvl>
   </w:abstractNum>
-  <w:abstractNum w:abstractNumId="6" w15:restartNumberingAfterBreak="0">
-    <w:nsid w:val="364B15AD"/>
-    <w:multiLevelType w:val="hybridMultilevel"/>
-    <w:tmpl w:val="7F6028B0"/>
-    <w:lvl w:ilvl="0" w:tplc="7152DAB8">
-      <w:start w:val="1"/>
-      <w:numFmt w:val="bullet"/>
-      <w:lvlText w:val="•"/>
-      <w:lvlJc w:val="left"/>
-      <w:pPr>
-        <w:ind w:left="400" w:hanging="260"/>
-      </w:pPr>
-    </w:lvl>
-    <w:lvl w:ilvl="1" w:tplc="3E386BF0">
-      <w:numFmt w:val="decimal"/>
-      <w:lvlText w:val=""/>
-      <w:lvlJc w:val="left"/>
-    </w:lvl>
-    <w:lvl w:ilvl="2" w:tplc="6BB6B53E">
-      <w:numFmt w:val="decimal"/>
-      <w:lvlText w:val=""/>
-      <w:lvlJc w:val="left"/>
-    </w:lvl>
-    <w:lvl w:ilvl="3" w:tplc="871E18A6">
-      <w:numFmt w:val="decimal"/>
-      <w:lvlText w:val=""/>
-      <w:lvlJc w:val="left"/>
-    </w:lvl>
-    <w:lvl w:ilvl="4" w:tplc="E2C09EE2">
-      <w:numFmt w:val="decimal"/>
-      <w:lvlText w:val=""/>
-      <w:lvlJc w:val="left"/>
-    </w:lvl>
-    <w:lvl w:ilvl="5" w:tplc="D3748418">
-      <w:numFmt w:val="decimal"/>
-      <w:lvlText w:val=""/>
-      <w:lvlJc w:val="left"/>
-    </w:lvl>
-    <w:lvl w:ilvl="6" w:tplc="12DE50BA">
-      <w:numFmt w:val="decimal"/>
-      <w:lvlText w:val=""/>
-      <w:lvlJc w:val="left"/>
-    </w:lvl>
-    <w:lvl w:ilvl="7" w:tplc="6750E78E">
-      <w:numFmt w:val="decimal"/>
-      <w:lvlText w:val=""/>
-      <w:lvlJc w:val="left"/>
-    </w:lvl>
-    <w:lvl w:ilvl="8" w:tplc="D406729C">
-      <w:numFmt w:val="decimal"/>
-      <w:lvlText w:val=""/>
-      <w:lvlJc w:val="left"/>
-    </w:lvl>
-  </w:abstractNum>
-  <w:abstractNum w:abstractNumId="7" w15:restartNumberingAfterBreak="0">
-    <w:nsid w:val="370D35A7"/>
-    <w:multiLevelType w:val="hybridMultilevel"/>
-    <w:tmpl w:val="F35C9C68"/>
-    <w:lvl w:ilvl="0" w:tplc="E3B08598">
-      <w:start w:val="1"/>
-      <w:numFmt w:val="decimal"/>
-      <w:lvlText w:val="%1."/>
-      <w:lvlJc w:val="left"/>
-      <w:pPr>
-        <w:ind w:left="400" w:hanging="300"/>
-      </w:pPr>
-    </w:lvl>
-    <w:lvl w:ilvl="1" w:tplc="7F880AD6">
-      <w:numFmt w:val="decimal"/>
-      <w:lvlText w:val=""/>
-      <w:lvlJc w:val="left"/>
-    </w:lvl>
-    <w:lvl w:ilvl="2" w:tplc="FDE27830">
-      <w:numFmt w:val="decimal"/>
-      <w:lvlText w:val=""/>
-      <w:lvlJc w:val="left"/>
-    </w:lvl>
-    <w:lvl w:ilvl="3" w:tplc="45FC2080">
-      <w:numFmt w:val="decimal"/>
-      <w:lvlText w:val=""/>
-      <w:lvlJc w:val="left"/>
-    </w:lvl>
-    <w:lvl w:ilvl="4" w:tplc="439E976C">
-      <w:numFmt w:val="decimal"/>
-      <w:lvlText w:val=""/>
-      <w:lvlJc w:val="left"/>
-    </w:lvl>
-    <w:lvl w:ilvl="5" w:tplc="AB4AE63A">
-      <w:numFmt w:val="decimal"/>
-      <w:lvlText w:val=""/>
-      <w:lvlJc w:val="left"/>
-    </w:lvl>
-    <w:lvl w:ilvl="6" w:tplc="E73EE076">
-      <w:numFmt w:val="decimal"/>
-      <w:lvlText w:val=""/>
-      <w:lvlJc w:val="left"/>
-    </w:lvl>
-    <w:lvl w:ilvl="7" w:tplc="8FEE4042">
-      <w:numFmt w:val="decimal"/>
-      <w:lvlText w:val=""/>
-      <w:lvlJc w:val="left"/>
-    </w:lvl>
-    <w:lvl w:ilvl="8" w:tplc="7FE4BCA6">
-      <w:numFmt w:val="decimal"/>
-      <w:lvlText w:val=""/>
-      <w:lvlJc w:val="left"/>
-    </w:lvl>
-  </w:abstractNum>
-  <w:abstractNum w:abstractNumId="8" w15:restartNumberingAfterBreak="0">
-    <w:nsid w:val="6D99609A"/>
-    <w:multiLevelType w:val="hybridMultilevel"/>
-    <w:tmpl w:val="6FCC6644"/>
-    <w:lvl w:ilvl="0" w:tplc="B07288EE">
-      <w:start w:val="1"/>
-      <w:numFmt w:val="decimal"/>
-      <w:lvlText w:val="%1."/>
-      <w:lvlJc w:val="left"/>
-      <w:pPr>
-        <w:ind w:left="400" w:hanging="300"/>
-      </w:pPr>
-    </w:lvl>
-    <w:lvl w:ilvl="1" w:tplc="9EB874EA">
-      <w:numFmt w:val="decimal"/>
-      <w:lvlText w:val=""/>
-      <w:lvlJc w:val="left"/>
-    </w:lvl>
-    <w:lvl w:ilvl="2" w:tplc="B8C83E7E">
-      <w:numFmt w:val="decimal"/>
-      <w:lvlText w:val=""/>
-      <w:lvlJc w:val="left"/>
-    </w:lvl>
-    <w:lvl w:ilvl="3" w:tplc="C54698FC">
-      <w:numFmt w:val="decimal"/>
-      <w:lvlText w:val=""/>
-      <w:lvlJc w:val="left"/>
-    </w:lvl>
-    <w:lvl w:ilvl="4" w:tplc="92F8A6BC">
-      <w:numFmt w:val="decimal"/>
-      <w:lvlText w:val=""/>
-      <w:lvlJc w:val="left"/>
-    </w:lvl>
-    <w:lvl w:ilvl="5" w:tplc="FF340226">
-      <w:numFmt w:val="decimal"/>
-      <w:lvlText w:val=""/>
-      <w:lvlJc w:val="left"/>
-    </w:lvl>
-    <w:lvl w:ilvl="6" w:tplc="D23AB3FC">
-      <w:numFmt w:val="decimal"/>
-      <w:lvlText w:val=""/>
-      <w:lvlJc w:val="left"/>
-    </w:lvl>
-    <w:lvl w:ilvl="7" w:tplc="6B366B9C">
-      <w:numFmt w:val="decimal"/>
-      <w:lvlText w:val=""/>
-      <w:lvlJc w:val="left"/>
-    </w:lvl>
-    <w:lvl w:ilvl="8" w:tplc="D56E5BD6">
-      <w:numFmt w:val="decimal"/>
-      <w:lvlText w:val=""/>
-      <w:lvlJc w:val="left"/>
-    </w:lvl>
-  </w:abstractNum>
-  <w:abstractNum w:abstractNumId="9" w15:restartNumberingAfterBreak="0">
-    <w:nsid w:val="79D106D3"/>
-    <w:multiLevelType w:val="hybridMultilevel"/>
-    <w:tmpl w:val="FA3C6C60"/>
-    <w:lvl w:ilvl="0" w:tplc="1A1E3E34">
-      <w:start w:val="1"/>
-      <w:numFmt w:val="decimal"/>
-      <w:lvlText w:val="%1."/>
-      <w:lvlJc w:val="left"/>
-      <w:pPr>
-        <w:ind w:left="400" w:hanging="300"/>
-      </w:pPr>
-    </w:lvl>
-    <w:lvl w:ilvl="1" w:tplc="D62E38BC">
-      <w:numFmt w:val="decimal"/>
-      <w:lvlText w:val=""/>
-      <w:lvlJc w:val="left"/>
-    </w:lvl>
-    <w:lvl w:ilvl="2" w:tplc="E2044F48">
-      <w:numFmt w:val="decimal"/>
-      <w:lvlText w:val=""/>
-      <w:lvlJc w:val="left"/>
-    </w:lvl>
-    <w:lvl w:ilvl="3" w:tplc="1728A71E">
-      <w:numFmt w:val="decimal"/>
-      <w:lvlText w:val=""/>
-      <w:lvlJc w:val="left"/>
-    </w:lvl>
-    <w:lvl w:ilvl="4" w:tplc="9C04F222">
-      <w:numFmt w:val="decimal"/>
-      <w:lvlText w:val=""/>
-      <w:lvlJc w:val="left"/>
-    </w:lvl>
-    <w:lvl w:ilvl="5" w:tplc="B324F456">
-      <w:numFmt w:val="decimal"/>
-      <w:lvlText w:val=""/>
-      <w:lvlJc w:val="left"/>
-    </w:lvl>
-    <w:lvl w:ilvl="6" w:tplc="1C0C74B4">
-      <w:numFmt w:val="decimal"/>
-      <w:lvlText w:val=""/>
-      <w:lvlJc w:val="left"/>
-    </w:lvl>
-    <w:lvl w:ilvl="7" w:tplc="AB2E70C4">
-      <w:numFmt w:val="decimal"/>
-      <w:lvlText w:val=""/>
-      <w:lvlJc w:val="left"/>
-    </w:lvl>
-    <w:lvl w:ilvl="8" w:tplc="8CAABA62">
-      <w:numFmt w:val="decimal"/>
-      <w:lvlText w:val=""/>
-      <w:lvlJc w:val="left"/>
-    </w:lvl>
-  </w:abstractNum>
-  <w:num w:numId="1" w16cid:durableId="1779333182">
+  <w:num w:numId="1" w16cid:durableId="1820027284">
+    <w:abstractNumId w:val="4"/>
+    <w:lvlOverride w:ilvl="0">
+      <w:startOverride w:val="1"/>
+    </w:lvlOverride>
+  </w:num>
+  <w:num w:numId="2" w16cid:durableId="1160268626">
+    <w:abstractNumId w:val="0"/>
+    <w:lvlOverride w:ilvl="0">
+      <w:startOverride w:val="1"/>
+    </w:lvlOverride>
+  </w:num>
+  <w:num w:numId="3" w16cid:durableId="986514005">
     <w:abstractNumId w:val="1"/>
     <w:lvlOverride w:ilvl="0">
       <w:startOverride w:val="1"/>
     </w:lvlOverride>
   </w:num>
-  <w:num w:numId="2" w16cid:durableId="2056923297">
-    <w:abstractNumId w:val="0"/>
-    <w:lvlOverride w:ilvl="0">
-      <w:startOverride w:val="1"/>
-    </w:lvlOverride>
-  </w:num>
-  <w:num w:numId="3" w16cid:durableId="1263219051">
-    <w:abstractNumId w:val="5"/>
-    <w:lvlOverride w:ilvl="0">
-      <w:startOverride w:val="1"/>
-    </w:lvlOverride>
-  </w:num>
-  <w:num w:numId="4" w16cid:durableId="1002397754">
-    <w:abstractNumId w:val="4"/>
-    <w:lvlOverride w:ilvl="0">
-      <w:startOverride w:val="1"/>
-    </w:lvlOverride>
-  </w:num>
-  <w:num w:numId="5" w16cid:durableId="799879050">
-    <w:abstractNumId w:val="8"/>
-    <w:lvlOverride w:ilvl="0">
-      <w:startOverride w:val="1"/>
-    </w:lvlOverride>
-  </w:num>
-  <w:num w:numId="6" w16cid:durableId="1218249638">
+  <w:num w:numId="4" w16cid:durableId="156655267">
     <w:abstractNumId w:val="3"/>
     <w:lvlOverride w:ilvl="0">
       <w:startOverride w:val="1"/>
     </w:lvlOverride>
   </w:num>
-  <w:num w:numId="7" w16cid:durableId="407769568">
-    <w:abstractNumId w:val="9"/>
-    <w:lvlOverride w:ilvl="0">
-      <w:startOverride w:val="1"/>
-    </w:lvlOverride>
-  </w:num>
-  <w:num w:numId="8" w16cid:durableId="1593203644">
-    <w:abstractNumId w:val="6"/>
-    <w:lvlOverride w:ilvl="0">
-      <w:startOverride w:val="1"/>
-    </w:lvlOverride>
-  </w:num>
-  <w:num w:numId="9" w16cid:durableId="2027366974">
-    <w:abstractNumId w:val="7"/>
-    <w:lvlOverride w:ilvl="0">
-      <w:startOverride w:val="1"/>
-    </w:lvlOverride>
-  </w:num>
-  <w:num w:numId="10" w16cid:durableId="169372883">
+  <w:num w:numId="5" w16cid:durableId="300159213">
     <w:abstractNumId w:val="2"/>
     <w:lvlOverride w:ilvl="0">
       <w:startOverride w:val="1"/>
@@ -21284,51 +20819,30 @@
       <w:szCs w:val="20"/>
     </w:rPr>
   </w:style>
-  <w:style w:type="paragraph" w:styleId="En-tte">
-    <w:name w:val="header"/>
+  <w:style w:type="paragraph" w:styleId="TM1">
+    <w:name w:val="toc 1"/>
     <w:basedOn w:val="Normal"/>
-    <w:link w:val="En-tteCar"/>
-    <w:uiPriority w:val="99"/>
-    <w:semiHidden/>
+    <w:next w:val="Normal"/>
+    <w:autoRedefine/>
+    <w:uiPriority w:val="39"/>
     <w:unhideWhenUsed/>
-    <w:rsid w:val="00385A1D"/>
+    <w:rsid w:val="00E341FE"/>
     <w:pPr>
-      <w:tabs>
-        <w:tab w:val="center" w:pos="4536"/>
-        <w:tab w:val="right" w:pos="9072"/>
-      </w:tabs>
+      <w:spacing w:after="100"/>
     </w:pPr>
   </w:style>
-  <w:style w:type="character" w:customStyle="1" w:styleId="En-tteCar">
-    <w:name w:val="En-tête Car"/>
-    <w:basedOn w:val="Policepardfaut"/>
-    <w:link w:val="En-tte"/>
-    <w:uiPriority w:val="99"/>
-    <w:semiHidden/>
-    <w:rsid w:val="00385A1D"/>
-  </w:style>
-  <w:style w:type="paragraph" w:styleId="Pieddepage">
-    <w:name w:val="footer"/>
+  <w:style w:type="paragraph" w:styleId="TM2">
+    <w:name w:val="toc 2"/>
     <w:basedOn w:val="Normal"/>
-    <w:link w:val="PieddepageCar"/>
-    <w:uiPriority w:val="99"/>
-    <w:semiHidden/>
+    <w:next w:val="Normal"/>
+    <w:autoRedefine/>
+    <w:uiPriority w:val="39"/>
     <w:unhideWhenUsed/>
-    <w:rsid w:val="00385A1D"/>
+    <w:rsid w:val="00E341FE"/>
     <w:pPr>
-      <w:tabs>
-        <w:tab w:val="center" w:pos="4536"/>
-        <w:tab w:val="right" w:pos="9072"/>
-      </w:tabs>
+      <w:spacing w:after="100"/>
+      <w:ind w:left="210"/>
     </w:pPr>
-  </w:style>
-  <w:style w:type="character" w:customStyle="1" w:styleId="PieddepageCar">
-    <w:name w:val="Pied de page Car"/>
-    <w:basedOn w:val="Policepardfaut"/>
-    <w:link w:val="Pieddepage"/>
-    <w:uiPriority w:val="99"/>
-    <w:semiHidden/>
-    <w:rsid w:val="00385A1D"/>
   </w:style>
 </w:styles>
 </file>

</xml_diff>

<commit_message>
Add a random forest chapter to the study guide and update the talk plan
</commit_message>
<xml_diff>
--- a/docs/oral_study_guide.docx
+++ b/docs/oral_study_guide.docx
@@ -93,7 +93,7 @@
     <w:sdt>
       <w:sdtPr>
         <w:alias w:val="Contents"/>
-        <w:id w:val="1243600410"/>
+        <w:id w:val="-1808232435"/>
       </w:sdtPr>
       <w:sdtEndPr/>
       <w:sdtContent>
@@ -116,7 +116,7 @@
           <w:r>
             <w:fldChar w:fldCharType="separate"/>
           </w:r>
-          <w:hyperlink w:anchor="_Toc243481292" w:history="1">
+          <w:hyperlink w:anchor="_Toc243482151" w:history="1">
             <w:r>
               <w:rPr>
                 <w:rStyle w:val="Lienhypertexte"/>
@@ -140,7 +140,7 @@
               <w:rPr>
                 <w:noProof/>
               </w:rPr>
-              <w:instrText xml:space="preserve"> PAGEREF _Toc243481292 \h </w:instrText>
+              <w:instrText xml:space="preserve"> PAGEREF _Toc243482151 \h </w:instrText>
             </w:r>
             <w:r>
               <w:rPr>
@@ -177,7 +177,7 @@
               <w:noProof/>
             </w:rPr>
           </w:pPr>
-          <w:hyperlink w:anchor="_Toc243481293" w:history="1">
+          <w:hyperlink w:anchor="_Toc243482152" w:history="1">
             <w:r>
               <w:rPr>
                 <w:rStyle w:val="Lienhypertexte"/>
@@ -201,7 +201,7 @@
               <w:rPr>
                 <w:noProof/>
               </w:rPr>
-              <w:instrText xml:space="preserve"> PAGEREF _Toc243481293 \h </w:instrText>
+              <w:instrText xml:space="preserve"> PAGEREF _Toc243482152 \h </w:instrText>
             </w:r>
             <w:r>
               <w:rPr>
@@ -238,7 +238,7 @@
               <w:noProof/>
             </w:rPr>
           </w:pPr>
-          <w:hyperlink w:anchor="_Toc243481294" w:history="1">
+          <w:hyperlink w:anchor="_Toc243482153" w:history="1">
             <w:r>
               <w:rPr>
                 <w:rStyle w:val="Lienhypertexte"/>
@@ -262,7 +262,7 @@
               <w:rPr>
                 <w:noProof/>
               </w:rPr>
-              <w:instrText xml:space="preserve"> PAGEREF _Toc243481294 \h </w:instrText>
+              <w:instrText xml:space="preserve"> PAGEREF _Toc243482153 \h </w:instrText>
             </w:r>
             <w:r>
               <w:rPr>
@@ -299,7 +299,7 @@
               <w:noProof/>
             </w:rPr>
           </w:pPr>
-          <w:hyperlink w:anchor="_Toc243481295" w:history="1">
+          <w:hyperlink w:anchor="_Toc243482154" w:history="1">
             <w:r>
               <w:rPr>
                 <w:rStyle w:val="Lienhypertexte"/>
@@ -323,7 +323,7 @@
               <w:rPr>
                 <w:noProof/>
               </w:rPr>
-              <w:instrText xml:space="preserve"> PAGEREF _Toc243481295 \h </w:instrText>
+              <w:instrText xml:space="preserve"> PAGEREF _Toc243482154 \h </w:instrText>
             </w:r>
             <w:r>
               <w:rPr>
@@ -360,7 +360,7 @@
               <w:noProof/>
             </w:rPr>
           </w:pPr>
-          <w:hyperlink w:anchor="_Toc243481296" w:history="1">
+          <w:hyperlink w:anchor="_Toc243482155" w:history="1">
             <w:r>
               <w:rPr>
                 <w:rStyle w:val="Lienhypertexte"/>
@@ -384,7 +384,7 @@
               <w:rPr>
                 <w:noProof/>
               </w:rPr>
-              <w:instrText xml:space="preserve"> PAGEREF _Toc243481296 \h </w:instrText>
+              <w:instrText xml:space="preserve"> PAGEREF _Toc243482155 \h </w:instrText>
             </w:r>
             <w:r>
               <w:rPr>
@@ -421,7 +421,7 @@
               <w:noProof/>
             </w:rPr>
           </w:pPr>
-          <w:hyperlink w:anchor="_Toc243481297" w:history="1">
+          <w:hyperlink w:anchor="_Toc243482156" w:history="1">
             <w:r>
               <w:rPr>
                 <w:rStyle w:val="Lienhypertexte"/>
@@ -445,7 +445,7 @@
               <w:rPr>
                 <w:noProof/>
               </w:rPr>
-              <w:instrText xml:space="preserve"> PAGEREF _Toc243481297 \h </w:instrText>
+              <w:instrText xml:space="preserve"> PAGEREF _Toc243482156 \h </w:instrText>
             </w:r>
             <w:r>
               <w:rPr>
@@ -482,7 +482,7 @@
               <w:noProof/>
             </w:rPr>
           </w:pPr>
-          <w:hyperlink w:anchor="_Toc243481298" w:history="1">
+          <w:hyperlink w:anchor="_Toc243482157" w:history="1">
             <w:r>
               <w:rPr>
                 <w:rStyle w:val="Lienhypertexte"/>
@@ -506,7 +506,7 @@
               <w:rPr>
                 <w:noProof/>
               </w:rPr>
-              <w:instrText xml:space="preserve"> PAGEREF _Toc243481298 \h </w:instrText>
+              <w:instrText xml:space="preserve"> PAGEREF _Toc243482157 \h </w:instrText>
             </w:r>
             <w:r>
               <w:rPr>
@@ -543,7 +543,7 @@
               <w:noProof/>
             </w:rPr>
           </w:pPr>
-          <w:hyperlink w:anchor="_Toc243481299" w:history="1">
+          <w:hyperlink w:anchor="_Toc243482158" w:history="1">
             <w:r>
               <w:rPr>
                 <w:rStyle w:val="Lienhypertexte"/>
@@ -567,7 +567,7 @@
               <w:rPr>
                 <w:noProof/>
               </w:rPr>
-              <w:instrText xml:space="preserve"> PAGEREF _Toc243481299 \h </w:instrText>
+              <w:instrText xml:space="preserve"> PAGEREF _Toc243482158 \h </w:instrText>
             </w:r>
             <w:r>
               <w:rPr>
@@ -604,7 +604,7 @@
               <w:noProof/>
             </w:rPr>
           </w:pPr>
-          <w:hyperlink w:anchor="_Toc243481300" w:history="1">
+          <w:hyperlink w:anchor="_Toc243482159" w:history="1">
             <w:r>
               <w:rPr>
                 <w:rStyle w:val="Lienhypertexte"/>
@@ -628,7 +628,7 @@
               <w:rPr>
                 <w:noProof/>
               </w:rPr>
-              <w:instrText xml:space="preserve"> PAGEREF _Toc243481300 \h </w:instrText>
+              <w:instrText xml:space="preserve"> PAGEREF _Toc243482159 \h </w:instrText>
             </w:r>
             <w:r>
               <w:rPr>
@@ -665,7 +665,7 @@
               <w:noProof/>
             </w:rPr>
           </w:pPr>
-          <w:hyperlink w:anchor="_Toc243481301" w:history="1">
+          <w:hyperlink w:anchor="_Toc243482160" w:history="1">
             <w:r>
               <w:rPr>
                 <w:rStyle w:val="Lienhypertexte"/>
@@ -689,7 +689,7 @@
               <w:rPr>
                 <w:noProof/>
               </w:rPr>
-              <w:instrText xml:space="preserve"> PAGEREF _Toc243481301 \h </w:instrText>
+              <w:instrText xml:space="preserve"> PAGEREF _Toc243482160 \h </w:instrText>
             </w:r>
             <w:r>
               <w:rPr>
@@ -726,7 +726,7 @@
               <w:noProof/>
             </w:rPr>
           </w:pPr>
-          <w:hyperlink w:anchor="_Toc243481302" w:history="1">
+          <w:hyperlink w:anchor="_Toc243482161" w:history="1">
             <w:r>
               <w:rPr>
                 <w:rStyle w:val="Lienhypertexte"/>
@@ -750,7 +750,7 @@
               <w:rPr>
                 <w:noProof/>
               </w:rPr>
-              <w:instrText xml:space="preserve"> PAGEREF _Toc243481302 \h </w:instrText>
+              <w:instrText xml:space="preserve"> PAGEREF _Toc243482161 \h </w:instrText>
             </w:r>
             <w:r>
               <w:rPr>
@@ -787,7 +787,7 @@
               <w:noProof/>
             </w:rPr>
           </w:pPr>
-          <w:hyperlink w:anchor="_Toc243481303" w:history="1">
+          <w:hyperlink w:anchor="_Toc243482162" w:history="1">
             <w:r>
               <w:rPr>
                 <w:rStyle w:val="Lienhypertexte"/>
@@ -811,7 +811,7 @@
               <w:rPr>
                 <w:noProof/>
               </w:rPr>
-              <w:instrText xml:space="preserve"> PAGEREF _Toc243481303 \h </w:instrText>
+              <w:instrText xml:space="preserve"> PAGEREF _Toc243482162 \h </w:instrText>
             </w:r>
             <w:r>
               <w:rPr>
@@ -848,7 +848,7 @@
               <w:noProof/>
             </w:rPr>
           </w:pPr>
-          <w:hyperlink w:anchor="_Toc243481304" w:history="1">
+          <w:hyperlink w:anchor="_Toc243482163" w:history="1">
             <w:r>
               <w:rPr>
                 <w:rStyle w:val="Lienhypertexte"/>
@@ -872,7 +872,7 @@
               <w:rPr>
                 <w:noProof/>
               </w:rPr>
-              <w:instrText xml:space="preserve"> PAGEREF _Toc243481304 \h </w:instrText>
+              <w:instrText xml:space="preserve"> PAGEREF _Toc243482163 \h </w:instrText>
             </w:r>
             <w:r>
               <w:rPr>
@@ -909,7 +909,7 @@
               <w:noProof/>
             </w:rPr>
           </w:pPr>
-          <w:hyperlink w:anchor="_Toc243481305" w:history="1">
+          <w:hyperlink w:anchor="_Toc243482164" w:history="1">
             <w:r>
               <w:rPr>
                 <w:rStyle w:val="Lienhypertexte"/>
@@ -933,7 +933,7 @@
               <w:rPr>
                 <w:noProof/>
               </w:rPr>
-              <w:instrText xml:space="preserve"> PAGEREF _Toc243481305 \h </w:instrText>
+              <w:instrText xml:space="preserve"> PAGEREF _Toc243482164 \h </w:instrText>
             </w:r>
             <w:r>
               <w:rPr>
@@ -970,7 +970,7 @@
               <w:noProof/>
             </w:rPr>
           </w:pPr>
-          <w:hyperlink w:anchor="_Toc243481306" w:history="1">
+          <w:hyperlink w:anchor="_Toc243482165" w:history="1">
             <w:r>
               <w:rPr>
                 <w:rStyle w:val="Lienhypertexte"/>
@@ -994,7 +994,7 @@
               <w:rPr>
                 <w:noProof/>
               </w:rPr>
-              <w:instrText xml:space="preserve"> PAGEREF _Toc243481306 \h </w:instrText>
+              <w:instrText xml:space="preserve"> PAGEREF _Toc243482165 \h </w:instrText>
             </w:r>
             <w:r>
               <w:rPr>
@@ -1031,7 +1031,7 @@
               <w:noProof/>
             </w:rPr>
           </w:pPr>
-          <w:hyperlink w:anchor="_Toc243481307" w:history="1">
+          <w:hyperlink w:anchor="_Toc243482166" w:history="1">
             <w:r>
               <w:rPr>
                 <w:rStyle w:val="Lienhypertexte"/>
@@ -1055,7 +1055,7 @@
               <w:rPr>
                 <w:noProof/>
               </w:rPr>
-              <w:instrText xml:space="preserve"> PAGEREF _Toc243481307 \h </w:instrText>
+              <w:instrText xml:space="preserve"> PAGEREF _Toc243482166 \h </w:instrText>
             </w:r>
             <w:r>
               <w:rPr>
@@ -1092,7 +1092,7 @@
               <w:noProof/>
             </w:rPr>
           </w:pPr>
-          <w:hyperlink w:anchor="_Toc243481308" w:history="1">
+          <w:hyperlink w:anchor="_Toc243482167" w:history="1">
             <w:r>
               <w:rPr>
                 <w:rStyle w:val="Lienhypertexte"/>
@@ -1116,7 +1116,7 @@
               <w:rPr>
                 <w:noProof/>
               </w:rPr>
-              <w:instrText xml:space="preserve"> PAGEREF _Toc243481308 \h </w:instrText>
+              <w:instrText xml:space="preserve"> PAGEREF _Toc243482167 \h </w:instrText>
             </w:r>
             <w:r>
               <w:rPr>
@@ -1153,7 +1153,7 @@
               <w:noProof/>
             </w:rPr>
           </w:pPr>
-          <w:hyperlink w:anchor="_Toc243481309" w:history="1">
+          <w:hyperlink w:anchor="_Toc243482168" w:history="1">
             <w:r>
               <w:rPr>
                 <w:rStyle w:val="Lienhypertexte"/>
@@ -1177,7 +1177,7 @@
               <w:rPr>
                 <w:noProof/>
               </w:rPr>
-              <w:instrText xml:space="preserve"> PAGEREF _Toc243481309 \h </w:instrText>
+              <w:instrText xml:space="preserve"> PAGEREF _Toc243482168 \h </w:instrText>
             </w:r>
             <w:r>
               <w:rPr>
@@ -1214,7 +1214,7 @@
               <w:noProof/>
             </w:rPr>
           </w:pPr>
-          <w:hyperlink w:anchor="_Toc243481310" w:history="1">
+          <w:hyperlink w:anchor="_Toc243482169" w:history="1">
             <w:r>
               <w:rPr>
                 <w:rStyle w:val="Lienhypertexte"/>
@@ -1238,7 +1238,7 @@
               <w:rPr>
                 <w:noProof/>
               </w:rPr>
-              <w:instrText xml:space="preserve"> PAGEREF _Toc243481310 \h </w:instrText>
+              <w:instrText xml:space="preserve"> PAGEREF _Toc243482169 \h </w:instrText>
             </w:r>
             <w:r>
               <w:rPr>
@@ -1275,7 +1275,7 @@
               <w:noProof/>
             </w:rPr>
           </w:pPr>
-          <w:hyperlink w:anchor="_Toc243481311" w:history="1">
+          <w:hyperlink w:anchor="_Toc243482170" w:history="1">
             <w:r>
               <w:rPr>
                 <w:rStyle w:val="Lienhypertexte"/>
@@ -1299,7 +1299,7 @@
               <w:rPr>
                 <w:noProof/>
               </w:rPr>
-              <w:instrText xml:space="preserve"> PAGEREF _Toc243481311 \h </w:instrText>
+              <w:instrText xml:space="preserve"> PAGEREF _Toc243482170 \h </w:instrText>
             </w:r>
             <w:r>
               <w:rPr>
@@ -1336,7 +1336,7 @@
               <w:noProof/>
             </w:rPr>
           </w:pPr>
-          <w:hyperlink w:anchor="_Toc243481312" w:history="1">
+          <w:hyperlink w:anchor="_Toc243482171" w:history="1">
             <w:r>
               <w:rPr>
                 <w:rStyle w:val="Lienhypertexte"/>
@@ -1360,7 +1360,7 @@
               <w:rPr>
                 <w:noProof/>
               </w:rPr>
-              <w:instrText xml:space="preserve"> PAGEREF _Toc243481312 \h </w:instrText>
+              <w:instrText xml:space="preserve"> PAGEREF _Toc243482171 \h </w:instrText>
             </w:r>
             <w:r>
               <w:rPr>
@@ -1397,7 +1397,7 @@
               <w:noProof/>
             </w:rPr>
           </w:pPr>
-          <w:hyperlink w:anchor="_Toc243481313" w:history="1">
+          <w:hyperlink w:anchor="_Toc243482172" w:history="1">
             <w:r>
               <w:rPr>
                 <w:rStyle w:val="Lienhypertexte"/>
@@ -1421,7 +1421,7 @@
               <w:rPr>
                 <w:noProof/>
               </w:rPr>
-              <w:instrText xml:space="preserve"> PAGEREF _Toc243481313 \h </w:instrText>
+              <w:instrText xml:space="preserve"> PAGEREF _Toc243482172 \h </w:instrText>
             </w:r>
             <w:r>
               <w:rPr>
@@ -1458,7 +1458,7 @@
               <w:noProof/>
             </w:rPr>
           </w:pPr>
-          <w:hyperlink w:anchor="_Toc243481314" w:history="1">
+          <w:hyperlink w:anchor="_Toc243482173" w:history="1">
             <w:r>
               <w:rPr>
                 <w:rStyle w:val="Lienhypertexte"/>
@@ -1482,7 +1482,7 @@
               <w:rPr>
                 <w:noProof/>
               </w:rPr>
-              <w:instrText xml:space="preserve"> PAGEREF _Toc243481314 \h </w:instrText>
+              <w:instrText xml:space="preserve"> PAGEREF _Toc243482173 \h </w:instrText>
             </w:r>
             <w:r>
               <w:rPr>
@@ -1519,7 +1519,7 @@
               <w:noProof/>
             </w:rPr>
           </w:pPr>
-          <w:hyperlink w:anchor="_Toc243481315" w:history="1">
+          <w:hyperlink w:anchor="_Toc243482174" w:history="1">
             <w:r>
               <w:rPr>
                 <w:rStyle w:val="Lienhypertexte"/>
@@ -1543,7 +1543,7 @@
               <w:rPr>
                 <w:noProof/>
               </w:rPr>
-              <w:instrText xml:space="preserve"> PAGEREF _Toc243481315 \h </w:instrText>
+              <w:instrText xml:space="preserve"> PAGEREF _Toc243482174 \h </w:instrText>
             </w:r>
             <w:r>
               <w:rPr>
@@ -1580,7 +1580,7 @@
               <w:noProof/>
             </w:rPr>
           </w:pPr>
-          <w:hyperlink w:anchor="_Toc243481316" w:history="1">
+          <w:hyperlink w:anchor="_Toc243482175" w:history="1">
             <w:r>
               <w:rPr>
                 <w:rStyle w:val="Lienhypertexte"/>
@@ -1604,7 +1604,7 @@
               <w:rPr>
                 <w:noProof/>
               </w:rPr>
-              <w:instrText xml:space="preserve"> PAGEREF _Toc243481316 \h </w:instrText>
+              <w:instrText xml:space="preserve"> PAGEREF _Toc243482175 \h </w:instrText>
             </w:r>
             <w:r>
               <w:rPr>
@@ -1641,7 +1641,7 @@
               <w:noProof/>
             </w:rPr>
           </w:pPr>
-          <w:hyperlink w:anchor="_Toc243481317" w:history="1">
+          <w:hyperlink w:anchor="_Toc243482176" w:history="1">
             <w:r>
               <w:rPr>
                 <w:rStyle w:val="Lienhypertexte"/>
@@ -1665,7 +1665,7 @@
               <w:rPr>
                 <w:noProof/>
               </w:rPr>
-              <w:instrText xml:space="preserve"> PAGEREF _Toc243481317 \h </w:instrText>
+              <w:instrText xml:space="preserve"> PAGEREF _Toc243482176 \h </w:instrText>
             </w:r>
             <w:r>
               <w:rPr>
@@ -1702,7 +1702,7 @@
               <w:noProof/>
             </w:rPr>
           </w:pPr>
-          <w:hyperlink w:anchor="_Toc243481318" w:history="1">
+          <w:hyperlink w:anchor="_Toc243482177" w:history="1">
             <w:r>
               <w:rPr>
                 <w:rStyle w:val="Lienhypertexte"/>
@@ -1726,7 +1726,7 @@
               <w:rPr>
                 <w:noProof/>
               </w:rPr>
-              <w:instrText xml:space="preserve"> PAGEREF _Toc243481318 \h </w:instrText>
+              <w:instrText xml:space="preserve"> PAGEREF _Toc243482177 \h </w:instrText>
             </w:r>
             <w:r>
               <w:rPr>
@@ -1763,7 +1763,7 @@
               <w:noProof/>
             </w:rPr>
           </w:pPr>
-          <w:hyperlink w:anchor="_Toc243481319" w:history="1">
+          <w:hyperlink w:anchor="_Toc243482178" w:history="1">
             <w:r>
               <w:rPr>
                 <w:rStyle w:val="Lienhypertexte"/>
@@ -1787,7 +1787,7 @@
               <w:rPr>
                 <w:noProof/>
               </w:rPr>
-              <w:instrText xml:space="preserve"> PAGEREF _Toc243481319 \h </w:instrText>
+              <w:instrText xml:space="preserve"> PAGEREF _Toc243482178 \h </w:instrText>
             </w:r>
             <w:r>
               <w:rPr>
@@ -1824,7 +1824,7 @@
               <w:noProof/>
             </w:rPr>
           </w:pPr>
-          <w:hyperlink w:anchor="_Toc243481320" w:history="1">
+          <w:hyperlink w:anchor="_Toc243482179" w:history="1">
             <w:r>
               <w:rPr>
                 <w:rStyle w:val="Lienhypertexte"/>
@@ -1848,7 +1848,7 @@
               <w:rPr>
                 <w:noProof/>
               </w:rPr>
-              <w:instrText xml:space="preserve"> PAGEREF _Toc243481320 \h </w:instrText>
+              <w:instrText xml:space="preserve"> PAGEREF _Toc243482179 \h </w:instrText>
             </w:r>
             <w:r>
               <w:rPr>
@@ -1885,7 +1885,7 @@
               <w:noProof/>
             </w:rPr>
           </w:pPr>
-          <w:hyperlink w:anchor="_Toc243481321" w:history="1">
+          <w:hyperlink w:anchor="_Toc243482180" w:history="1">
             <w:r>
               <w:rPr>
                 <w:rStyle w:val="Lienhypertexte"/>
@@ -1909,7 +1909,7 @@
               <w:rPr>
                 <w:noProof/>
               </w:rPr>
-              <w:instrText xml:space="preserve"> PAGEREF _Toc243481321 \h </w:instrText>
+              <w:instrText xml:space="preserve"> PAGEREF _Toc243482180 \h </w:instrText>
             </w:r>
             <w:r>
               <w:rPr>
@@ -1946,7 +1946,7 @@
               <w:noProof/>
             </w:rPr>
           </w:pPr>
-          <w:hyperlink w:anchor="_Toc243481322" w:history="1">
+          <w:hyperlink w:anchor="_Toc243482181" w:history="1">
             <w:r>
               <w:rPr>
                 <w:rStyle w:val="Lienhypertexte"/>
@@ -1970,7 +1970,7 @@
               <w:rPr>
                 <w:noProof/>
               </w:rPr>
-              <w:instrText xml:space="preserve"> PAGEREF _Toc243481322 \h </w:instrText>
+              <w:instrText xml:space="preserve"> PAGEREF _Toc243482181 \h </w:instrText>
             </w:r>
             <w:r>
               <w:rPr>
@@ -2007,7 +2007,7 @@
               <w:noProof/>
             </w:rPr>
           </w:pPr>
-          <w:hyperlink w:anchor="_Toc243481323" w:history="1">
+          <w:hyperlink w:anchor="_Toc243482182" w:history="1">
             <w:r>
               <w:rPr>
                 <w:rStyle w:val="Lienhypertexte"/>
@@ -2031,7 +2031,7 @@
               <w:rPr>
                 <w:noProof/>
               </w:rPr>
-              <w:instrText xml:space="preserve"> PAGEREF _Toc243481323 \h </w:instrText>
+              <w:instrText xml:space="preserve"> PAGEREF _Toc243482182 \h </w:instrText>
             </w:r>
             <w:r>
               <w:rPr>
@@ -2068,7 +2068,7 @@
               <w:noProof/>
             </w:rPr>
           </w:pPr>
-          <w:hyperlink w:anchor="_Toc243481324" w:history="1">
+          <w:hyperlink w:anchor="_Toc243482183" w:history="1">
             <w:r>
               <w:rPr>
                 <w:rStyle w:val="Lienhypertexte"/>
@@ -2092,7 +2092,7 @@
               <w:rPr>
                 <w:noProof/>
               </w:rPr>
-              <w:instrText xml:space="preserve"> PAGEREF _Toc243481324 \h </w:instrText>
+              <w:instrText xml:space="preserve"> PAGEREF _Toc243482183 \h </w:instrText>
             </w:r>
             <w:r>
               <w:rPr>
@@ -2129,7 +2129,7 @@
               <w:noProof/>
             </w:rPr>
           </w:pPr>
-          <w:hyperlink w:anchor="_Toc243481325" w:history="1">
+          <w:hyperlink w:anchor="_Toc243482184" w:history="1">
             <w:r>
               <w:rPr>
                 <w:rStyle w:val="Lienhypertexte"/>
@@ -2153,7 +2153,7 @@
               <w:rPr>
                 <w:noProof/>
               </w:rPr>
-              <w:instrText xml:space="preserve"> PAGEREF _Toc243481325 \h </w:instrText>
+              <w:instrText xml:space="preserve"> PAGEREF _Toc243482184 \h </w:instrText>
             </w:r>
             <w:r>
               <w:rPr>
@@ -2190,7 +2190,7 @@
               <w:noProof/>
             </w:rPr>
           </w:pPr>
-          <w:hyperlink w:anchor="_Toc243481326" w:history="1">
+          <w:hyperlink w:anchor="_Toc243482185" w:history="1">
             <w:r>
               <w:rPr>
                 <w:rStyle w:val="Lienhypertexte"/>
@@ -2214,7 +2214,7 @@
               <w:rPr>
                 <w:noProof/>
               </w:rPr>
-              <w:instrText xml:space="preserve"> PAGEREF _Toc243481326 \h </w:instrText>
+              <w:instrText xml:space="preserve"> PAGEREF _Toc243482185 \h </w:instrText>
             </w:r>
             <w:r>
               <w:rPr>
@@ -2251,7 +2251,7 @@
               <w:noProof/>
             </w:rPr>
           </w:pPr>
-          <w:hyperlink w:anchor="_Toc243481327" w:history="1">
+          <w:hyperlink w:anchor="_Toc243482186" w:history="1">
             <w:r>
               <w:rPr>
                 <w:rStyle w:val="Lienhypertexte"/>
@@ -2275,7 +2275,7 @@
               <w:rPr>
                 <w:noProof/>
               </w:rPr>
-              <w:instrText xml:space="preserve"> PAGEREF _Toc243481327 \h </w:instrText>
+              <w:instrText xml:space="preserve"> PAGEREF _Toc243482186 \h </w:instrText>
             </w:r>
             <w:r>
               <w:rPr>
@@ -2312,7 +2312,7 @@
               <w:noProof/>
             </w:rPr>
           </w:pPr>
-          <w:hyperlink w:anchor="_Toc243481328" w:history="1">
+          <w:hyperlink w:anchor="_Toc243482187" w:history="1">
             <w:r>
               <w:rPr>
                 <w:rStyle w:val="Lienhypertexte"/>
@@ -2336,7 +2336,7 @@
               <w:rPr>
                 <w:noProof/>
               </w:rPr>
-              <w:instrText xml:space="preserve"> PAGEREF _Toc243481328 \h </w:instrText>
+              <w:instrText xml:space="preserve"> PAGEREF _Toc243482187 \h </w:instrText>
             </w:r>
             <w:r>
               <w:rPr>
@@ -2373,7 +2373,7 @@
               <w:noProof/>
             </w:rPr>
           </w:pPr>
-          <w:hyperlink w:anchor="_Toc243481329" w:history="1">
+          <w:hyperlink w:anchor="_Toc243482188" w:history="1">
             <w:r>
               <w:rPr>
                 <w:rStyle w:val="Lienhypertexte"/>
@@ -2397,7 +2397,7 @@
               <w:rPr>
                 <w:noProof/>
               </w:rPr>
-              <w:instrText xml:space="preserve"> PAGEREF _Toc243481329 \h </w:instrText>
+              <w:instrText xml:space="preserve"> PAGEREF _Toc243482188 \h </w:instrText>
             </w:r>
             <w:r>
               <w:rPr>
@@ -2434,7 +2434,7 @@
               <w:noProof/>
             </w:rPr>
           </w:pPr>
-          <w:hyperlink w:anchor="_Toc243481330" w:history="1">
+          <w:hyperlink w:anchor="_Toc243482189" w:history="1">
             <w:r>
               <w:rPr>
                 <w:rStyle w:val="Lienhypertexte"/>
@@ -2458,7 +2458,7 @@
               <w:rPr>
                 <w:noProof/>
               </w:rPr>
-              <w:instrText xml:space="preserve"> PAGEREF _Toc243481330 \h </w:instrText>
+              <w:instrText xml:space="preserve"> PAGEREF _Toc243482189 \h </w:instrText>
             </w:r>
             <w:r>
               <w:rPr>
@@ -2495,7 +2495,7 @@
               <w:noProof/>
             </w:rPr>
           </w:pPr>
-          <w:hyperlink w:anchor="_Toc243481331" w:history="1">
+          <w:hyperlink w:anchor="_Toc243482190" w:history="1">
             <w:r>
               <w:rPr>
                 <w:rStyle w:val="Lienhypertexte"/>
@@ -2519,7 +2519,7 @@
               <w:rPr>
                 <w:noProof/>
               </w:rPr>
-              <w:instrText xml:space="preserve"> PAGEREF _Toc243481331 \h </w:instrText>
+              <w:instrText xml:space="preserve"> PAGEREF _Toc243482190 \h </w:instrText>
             </w:r>
             <w:r>
               <w:rPr>
@@ -2556,7 +2556,7 @@
               <w:noProof/>
             </w:rPr>
           </w:pPr>
-          <w:hyperlink w:anchor="_Toc243481332" w:history="1">
+          <w:hyperlink w:anchor="_Toc243482191" w:history="1">
             <w:r>
               <w:rPr>
                 <w:rStyle w:val="Lienhypertexte"/>
@@ -2580,7 +2580,7 @@
               <w:rPr>
                 <w:noProof/>
               </w:rPr>
-              <w:instrText xml:space="preserve"> PAGEREF _Toc243481332 \h </w:instrText>
+              <w:instrText xml:space="preserve"> PAGEREF _Toc243482191 \h </w:instrText>
             </w:r>
             <w:r>
               <w:rPr>
@@ -2617,7 +2617,7 @@
               <w:noProof/>
             </w:rPr>
           </w:pPr>
-          <w:hyperlink w:anchor="_Toc243481333" w:history="1">
+          <w:hyperlink w:anchor="_Toc243482192" w:history="1">
             <w:r>
               <w:rPr>
                 <w:rStyle w:val="Lienhypertexte"/>
@@ -2641,7 +2641,7 @@
               <w:rPr>
                 <w:noProof/>
               </w:rPr>
-              <w:instrText xml:space="preserve"> PAGEREF _Toc243481333 \h </w:instrText>
+              <w:instrText xml:space="preserve"> PAGEREF _Toc243482192 \h </w:instrText>
             </w:r>
             <w:r>
               <w:rPr>
@@ -2678,7 +2678,7 @@
               <w:noProof/>
             </w:rPr>
           </w:pPr>
-          <w:hyperlink w:anchor="_Toc243481334" w:history="1">
+          <w:hyperlink w:anchor="_Toc243482193" w:history="1">
             <w:r>
               <w:rPr>
                 <w:rStyle w:val="Lienhypertexte"/>
@@ -2702,7 +2702,7 @@
               <w:rPr>
                 <w:noProof/>
               </w:rPr>
-              <w:instrText xml:space="preserve"> PAGEREF _Toc243481334 \h </w:instrText>
+              <w:instrText xml:space="preserve"> PAGEREF _Toc243482193 \h </w:instrText>
             </w:r>
             <w:r>
               <w:rPr>
@@ -2739,7 +2739,7 @@
               <w:noProof/>
             </w:rPr>
           </w:pPr>
-          <w:hyperlink w:anchor="_Toc243481335" w:history="1">
+          <w:hyperlink w:anchor="_Toc243482194" w:history="1">
             <w:r>
               <w:rPr>
                 <w:rStyle w:val="Lienhypertexte"/>
@@ -2763,7 +2763,7 @@
               <w:rPr>
                 <w:noProof/>
               </w:rPr>
-              <w:instrText xml:space="preserve"> PAGEREF _Toc243481335 \h </w:instrText>
+              <w:instrText xml:space="preserve"> PAGEREF _Toc243482194 \h </w:instrText>
             </w:r>
             <w:r>
               <w:rPr>
@@ -2800,7 +2800,7 @@
               <w:noProof/>
             </w:rPr>
           </w:pPr>
-          <w:hyperlink w:anchor="_Toc243481336" w:history="1">
+          <w:hyperlink w:anchor="_Toc243482195" w:history="1">
             <w:r>
               <w:rPr>
                 <w:rStyle w:val="Lienhypertexte"/>
@@ -2824,7 +2824,7 @@
               <w:rPr>
                 <w:noProof/>
               </w:rPr>
-              <w:instrText xml:space="preserve"> PAGEREF _Toc243481336 \h </w:instrText>
+              <w:instrText xml:space="preserve"> PAGEREF _Toc243482195 \h </w:instrText>
             </w:r>
             <w:r>
               <w:rPr>
@@ -2861,7 +2861,7 @@
               <w:noProof/>
             </w:rPr>
           </w:pPr>
-          <w:hyperlink w:anchor="_Toc243481337" w:history="1">
+          <w:hyperlink w:anchor="_Toc243482196" w:history="1">
             <w:r>
               <w:rPr>
                 <w:rStyle w:val="Lienhypertexte"/>
@@ -2885,7 +2885,7 @@
               <w:rPr>
                 <w:noProof/>
               </w:rPr>
-              <w:instrText xml:space="preserve"> PAGEREF _Toc243481337 \h </w:instrText>
+              <w:instrText xml:space="preserve"> PAGEREF _Toc243482196 \h </w:instrText>
             </w:r>
             <w:r>
               <w:rPr>
@@ -2922,7 +2922,7 @@
               <w:noProof/>
             </w:rPr>
           </w:pPr>
-          <w:hyperlink w:anchor="_Toc243481338" w:history="1">
+          <w:hyperlink w:anchor="_Toc243482197" w:history="1">
             <w:r>
               <w:rPr>
                 <w:rStyle w:val="Lienhypertexte"/>
@@ -2946,7 +2946,7 @@
               <w:rPr>
                 <w:noProof/>
               </w:rPr>
-              <w:instrText xml:space="preserve"> PAGEREF _Toc243481338 \h </w:instrText>
+              <w:instrText xml:space="preserve"> PAGEREF _Toc243482197 \h </w:instrText>
             </w:r>
             <w:r>
               <w:rPr>
@@ -2983,7 +2983,7 @@
               <w:noProof/>
             </w:rPr>
           </w:pPr>
-          <w:hyperlink w:anchor="_Toc243481339" w:history="1">
+          <w:hyperlink w:anchor="_Toc243482198" w:history="1">
             <w:r>
               <w:rPr>
                 <w:rStyle w:val="Lienhypertexte"/>
@@ -3007,7 +3007,7 @@
               <w:rPr>
                 <w:noProof/>
               </w:rPr>
-              <w:instrText xml:space="preserve"> PAGEREF _Toc243481339 \h </w:instrText>
+              <w:instrText xml:space="preserve"> PAGEREF _Toc243482198 \h </w:instrText>
             </w:r>
             <w:r>
               <w:rPr>
@@ -3044,7 +3044,7 @@
               <w:noProof/>
             </w:rPr>
           </w:pPr>
-          <w:hyperlink w:anchor="_Toc243481340" w:history="1">
+          <w:hyperlink w:anchor="_Toc243482199" w:history="1">
             <w:r>
               <w:rPr>
                 <w:rStyle w:val="Lienhypertexte"/>
@@ -3068,7 +3068,7 @@
               <w:rPr>
                 <w:noProof/>
               </w:rPr>
-              <w:instrText xml:space="preserve"> PAGEREF _Toc243481340 \h </w:instrText>
+              <w:instrText xml:space="preserve"> PAGEREF _Toc243482199 \h </w:instrText>
             </w:r>
             <w:r>
               <w:rPr>
@@ -3105,13 +3105,13 @@
               <w:noProof/>
             </w:rPr>
           </w:pPr>
-          <w:hyperlink w:anchor="_Toc243481341" w:history="1">
+          <w:hyperlink w:anchor="_Toc243482200" w:history="1">
             <w:r>
               <w:rPr>
                 <w:rStyle w:val="Lienhypertexte"/>
                 <w:noProof/>
               </w:rPr>
-              <w:t>9. Bonus: what about transformers like BERT? (notebook 07)</w:t>
+              <w:t>9. The random forest, our classical challenger (notebook 06)</w:t>
             </w:r>
             <w:r>
               <w:rPr>
@@ -3129,7 +3129,190 @@
               <w:rPr>
                 <w:noProof/>
               </w:rPr>
-              <w:instrText xml:space="preserve"> PAGEREF _Toc243481341 \h </w:instrText>
+              <w:instrText xml:space="preserve"> PAGEREF _Toc243482200 \h </w:instrText>
+            </w:r>
+            <w:r>
+              <w:rPr>
+                <w:noProof/>
+              </w:rPr>
+            </w:r>
+            <w:r>
+              <w:rPr>
+                <w:noProof/>
+              </w:rPr>
+              <w:fldChar w:fldCharType="separate"/>
+            </w:r>
+            <w:r>
+              <w:rPr>
+                <w:noProof/>
+              </w:rPr>
+              <w:t>20</w:t>
+            </w:r>
+            <w:r>
+              <w:rPr>
+                <w:noProof/>
+              </w:rPr>
+              <w:fldChar w:fldCharType="end"/>
+            </w:r>
+          </w:hyperlink>
+        </w:p>
+        <w:p>
+          <w:pPr>
+            <w:pStyle w:val="TM2"/>
+            <w:tabs>
+              <w:tab w:val="right" w:leader="dot" w:pos="9628"/>
+            </w:tabs>
+            <w:rPr>
+              <w:noProof/>
+            </w:rPr>
+          </w:pPr>
+          <w:hyperlink w:anchor="_Toc243482201" w:history="1">
+            <w:r>
+              <w:rPr>
+                <w:rStyle w:val="Lienhypertexte"/>
+                <w:noProof/>
+              </w:rPr>
+              <w:t>The 102 hand-made numbers (baselines.py)</w:t>
+            </w:r>
+            <w:r>
+              <w:rPr>
+                <w:noProof/>
+              </w:rPr>
+              <w:tab/>
+            </w:r>
+            <w:r>
+              <w:rPr>
+                <w:noProof/>
+              </w:rPr>
+              <w:fldChar w:fldCharType="begin"/>
+            </w:r>
+            <w:r>
+              <w:rPr>
+                <w:noProof/>
+              </w:rPr>
+              <w:instrText xml:space="preserve"> PAGEREF _Toc243482201 \h </w:instrText>
+            </w:r>
+            <w:r>
+              <w:rPr>
+                <w:noProof/>
+              </w:rPr>
+            </w:r>
+            <w:r>
+              <w:rPr>
+                <w:noProof/>
+              </w:rPr>
+              <w:fldChar w:fldCharType="separate"/>
+            </w:r>
+            <w:r>
+              <w:rPr>
+                <w:noProof/>
+              </w:rPr>
+              <w:t>20</w:t>
+            </w:r>
+            <w:r>
+              <w:rPr>
+                <w:noProof/>
+              </w:rPr>
+              <w:fldChar w:fldCharType="end"/>
+            </w:r>
+          </w:hyperlink>
+        </w:p>
+        <w:p>
+          <w:pPr>
+            <w:pStyle w:val="TM2"/>
+            <w:tabs>
+              <w:tab w:val="right" w:leader="dot" w:pos="9628"/>
+            </w:tabs>
+            <w:rPr>
+              <w:noProof/>
+            </w:rPr>
+          </w:pPr>
+          <w:hyperlink w:anchor="_Toc243482202" w:history="1">
+            <w:r>
+              <w:rPr>
+                <w:rStyle w:val="Lienhypertexte"/>
+                <w:noProof/>
+              </w:rPr>
+              <w:t>Our settings, chosen on validation</w:t>
+            </w:r>
+            <w:r>
+              <w:rPr>
+                <w:noProof/>
+              </w:rPr>
+              <w:tab/>
+            </w:r>
+            <w:r>
+              <w:rPr>
+                <w:noProof/>
+              </w:rPr>
+              <w:fldChar w:fldCharType="begin"/>
+            </w:r>
+            <w:r>
+              <w:rPr>
+                <w:noProof/>
+              </w:rPr>
+              <w:instrText xml:space="preserve"> PAGEREF _Toc243482202 \h </w:instrText>
+            </w:r>
+            <w:r>
+              <w:rPr>
+                <w:noProof/>
+              </w:rPr>
+            </w:r>
+            <w:r>
+              <w:rPr>
+                <w:noProof/>
+              </w:rPr>
+              <w:fldChar w:fldCharType="separate"/>
+            </w:r>
+            <w:r>
+              <w:rPr>
+                <w:noProof/>
+              </w:rPr>
+              <w:t>20</w:t>
+            </w:r>
+            <w:r>
+              <w:rPr>
+                <w:noProof/>
+              </w:rPr>
+              <w:fldChar w:fldCharType="end"/>
+            </w:r>
+          </w:hyperlink>
+        </w:p>
+        <w:p>
+          <w:pPr>
+            <w:pStyle w:val="TM2"/>
+            <w:tabs>
+              <w:tab w:val="right" w:leader="dot" w:pos="9628"/>
+            </w:tabs>
+            <w:rPr>
+              <w:noProof/>
+            </w:rPr>
+          </w:pPr>
+          <w:hyperlink w:anchor="_Toc243482203" w:history="1">
+            <w:r>
+              <w:rPr>
+                <w:rStyle w:val="Lienhypertexte"/>
+                <w:noProof/>
+              </w:rPr>
+              <w:t>Questions on the random forest, with answers</w:t>
+            </w:r>
+            <w:r>
+              <w:rPr>
+                <w:noProof/>
+              </w:rPr>
+              <w:tab/>
+            </w:r>
+            <w:r>
+              <w:rPr>
+                <w:noProof/>
+              </w:rPr>
+              <w:fldChar w:fldCharType="begin"/>
+            </w:r>
+            <w:r>
+              <w:rPr>
+                <w:noProof/>
+              </w:rPr>
+              <w:instrText xml:space="preserve"> PAGEREF _Toc243482203 \h </w:instrText>
             </w:r>
             <w:r>
               <w:rPr>
@@ -3166,13 +3349,13 @@
               <w:noProof/>
             </w:rPr>
           </w:pPr>
-          <w:hyperlink w:anchor="_Toc243481342" w:history="1">
+          <w:hyperlink w:anchor="_Toc243482204" w:history="1">
             <w:r>
               <w:rPr>
                 <w:rStyle w:val="Lienhypertexte"/>
                 <w:noProof/>
               </w:rPr>
-              <w:t>10. Key numbers to know by heart</w:t>
+              <w:t>10. Bonus: what about transformers like BERT? (notebook 07)</w:t>
             </w:r>
             <w:r>
               <w:rPr>
@@ -3190,7 +3373,7 @@
               <w:rPr>
                 <w:noProof/>
               </w:rPr>
-              <w:instrText xml:space="preserve"> PAGEREF _Toc243481342 \h </w:instrText>
+              <w:instrText xml:space="preserve"> PAGEREF _Toc243482204 \h </w:instrText>
             </w:r>
             <w:r>
               <w:rPr>
@@ -3227,13 +3410,13 @@
               <w:noProof/>
             </w:rPr>
           </w:pPr>
-          <w:hyperlink w:anchor="_Toc243481343" w:history="1">
+          <w:hyperlink w:anchor="_Toc243482205" w:history="1">
             <w:r>
               <w:rPr>
                 <w:rStyle w:val="Lienhypertexte"/>
                 <w:noProof/>
               </w:rPr>
-              <w:t>11. Concepts in simple words</w:t>
+              <w:t>11. Key numbers to know by heart</w:t>
             </w:r>
             <w:r>
               <w:rPr>
@@ -3251,7 +3434,7 @@
               <w:rPr>
                 <w:noProof/>
               </w:rPr>
-              <w:instrText xml:space="preserve"> PAGEREF _Toc243481343 \h </w:instrText>
+              <w:instrText xml:space="preserve"> PAGEREF _Toc243482205 \h </w:instrText>
             </w:r>
             <w:r>
               <w:rPr>
@@ -3268,7 +3451,7 @@
               <w:rPr>
                 <w:noProof/>
               </w:rPr>
-              <w:t>23</w:t>
+              <w:t>24</w:t>
             </w:r>
             <w:r>
               <w:rPr>
@@ -3288,13 +3471,13 @@
               <w:noProof/>
             </w:rPr>
           </w:pPr>
-          <w:hyperlink w:anchor="_Toc243481344" w:history="1">
+          <w:hyperlink w:anchor="_Toc243482206" w:history="1">
             <w:r>
               <w:rPr>
                 <w:rStyle w:val="Lienhypertexte"/>
                 <w:noProof/>
               </w:rPr>
-              <w:t>12. Questions you may get, with answers</w:t>
+              <w:t>12. Concepts in simple words</w:t>
             </w:r>
             <w:r>
               <w:rPr>
@@ -3312,7 +3495,7 @@
               <w:rPr>
                 <w:noProof/>
               </w:rPr>
-              <w:instrText xml:space="preserve"> PAGEREF _Toc243481344 \h </w:instrText>
+              <w:instrText xml:space="preserve"> PAGEREF _Toc243482206 \h </w:instrText>
             </w:r>
             <w:r>
               <w:rPr>
@@ -3330,6 +3513,67 @@
                 <w:noProof/>
               </w:rPr>
               <w:t>25</w:t>
+            </w:r>
+            <w:r>
+              <w:rPr>
+                <w:noProof/>
+              </w:rPr>
+              <w:fldChar w:fldCharType="end"/>
+            </w:r>
+          </w:hyperlink>
+        </w:p>
+        <w:p>
+          <w:pPr>
+            <w:pStyle w:val="TM1"/>
+            <w:tabs>
+              <w:tab w:val="right" w:leader="dot" w:pos="9628"/>
+            </w:tabs>
+            <w:rPr>
+              <w:noProof/>
+            </w:rPr>
+          </w:pPr>
+          <w:hyperlink w:anchor="_Toc243482207" w:history="1">
+            <w:r>
+              <w:rPr>
+                <w:rStyle w:val="Lienhypertexte"/>
+                <w:noProof/>
+              </w:rPr>
+              <w:t>13. Questions you may get, with answers</w:t>
+            </w:r>
+            <w:r>
+              <w:rPr>
+                <w:noProof/>
+              </w:rPr>
+              <w:tab/>
+            </w:r>
+            <w:r>
+              <w:rPr>
+                <w:noProof/>
+              </w:rPr>
+              <w:fldChar w:fldCharType="begin"/>
+            </w:r>
+            <w:r>
+              <w:rPr>
+                <w:noProof/>
+              </w:rPr>
+              <w:instrText xml:space="preserve"> PAGEREF _Toc243482207 \h </w:instrText>
+            </w:r>
+            <w:r>
+              <w:rPr>
+                <w:noProof/>
+              </w:rPr>
+            </w:r>
+            <w:r>
+              <w:rPr>
+                <w:noProof/>
+              </w:rPr>
+              <w:fldChar w:fldCharType="separate"/>
+            </w:r>
+            <w:r>
+              <w:rPr>
+                <w:noProof/>
+              </w:rPr>
+              <w:t>27</w:t>
             </w:r>
             <w:r>
               <w:rPr>
@@ -3349,7 +3593,7 @@
               <w:noProof/>
             </w:rPr>
           </w:pPr>
-          <w:hyperlink w:anchor="_Toc243481345" w:history="1">
+          <w:hyperlink w:anchor="_Toc243482208" w:history="1">
             <w:r>
               <w:rPr>
                 <w:rStyle w:val="Lienhypertexte"/>
@@ -3373,7 +3617,7 @@
               <w:rPr>
                 <w:noProof/>
               </w:rPr>
-              <w:instrText xml:space="preserve"> PAGEREF _Toc243481345 \h </w:instrText>
+              <w:instrText xml:space="preserve"> PAGEREF _Toc243482208 \h </w:instrText>
             </w:r>
             <w:r>
               <w:rPr>
@@ -3390,7 +3634,7 @@
               <w:rPr>
                 <w:noProof/>
               </w:rPr>
-              <w:t>25</w:t>
+              <w:t>27</w:t>
             </w:r>
             <w:r>
               <w:rPr>
@@ -3410,7 +3654,7 @@
               <w:noProof/>
             </w:rPr>
           </w:pPr>
-          <w:hyperlink w:anchor="_Toc243481346" w:history="1">
+          <w:hyperlink w:anchor="_Toc243482209" w:history="1">
             <w:r>
               <w:rPr>
                 <w:rStyle w:val="Lienhypertexte"/>
@@ -3434,7 +3678,7 @@
               <w:rPr>
                 <w:noProof/>
               </w:rPr>
-              <w:instrText xml:space="preserve"> PAGEREF _Toc243481346 \h </w:instrText>
+              <w:instrText xml:space="preserve"> PAGEREF _Toc243482209 \h </w:instrText>
             </w:r>
             <w:r>
               <w:rPr>
@@ -3451,7 +3695,7 @@
               <w:rPr>
                 <w:noProof/>
               </w:rPr>
-              <w:t>25</w:t>
+              <w:t>27</w:t>
             </w:r>
             <w:r>
               <w:rPr>
@@ -3471,7 +3715,7 @@
               <w:noProof/>
             </w:rPr>
           </w:pPr>
-          <w:hyperlink w:anchor="_Toc243481347" w:history="1">
+          <w:hyperlink w:anchor="_Toc243482210" w:history="1">
             <w:r>
               <w:rPr>
                 <w:rStyle w:val="Lienhypertexte"/>
@@ -3495,7 +3739,7 @@
               <w:rPr>
                 <w:noProof/>
               </w:rPr>
-              <w:instrText xml:space="preserve"> PAGEREF _Toc243481347 \h </w:instrText>
+              <w:instrText xml:space="preserve"> PAGEREF _Toc243482210 \h </w:instrText>
             </w:r>
             <w:r>
               <w:rPr>
@@ -3512,7 +3756,7 @@
               <w:rPr>
                 <w:noProof/>
               </w:rPr>
-              <w:t>25</w:t>
+              <w:t>27</w:t>
             </w:r>
             <w:r>
               <w:rPr>
@@ -3532,7 +3776,7 @@
               <w:noProof/>
             </w:rPr>
           </w:pPr>
-          <w:hyperlink w:anchor="_Toc243481348" w:history="1">
+          <w:hyperlink w:anchor="_Toc243482211" w:history="1">
             <w:r>
               <w:rPr>
                 <w:rStyle w:val="Lienhypertexte"/>
@@ -3556,7 +3800,7 @@
               <w:rPr>
                 <w:noProof/>
               </w:rPr>
-              <w:instrText xml:space="preserve"> PAGEREF _Toc243481348 \h </w:instrText>
+              <w:instrText xml:space="preserve"> PAGEREF _Toc243482211 \h </w:instrText>
             </w:r>
             <w:r>
               <w:rPr>
@@ -3573,7 +3817,7 @@
               <w:rPr>
                 <w:noProof/>
               </w:rPr>
-              <w:t>26</w:t>
+              <w:t>28</w:t>
             </w:r>
             <w:r>
               <w:rPr>
@@ -3593,7 +3837,7 @@
               <w:noProof/>
             </w:rPr>
           </w:pPr>
-          <w:hyperlink w:anchor="_Toc243481349" w:history="1">
+          <w:hyperlink w:anchor="_Toc243482212" w:history="1">
             <w:r>
               <w:rPr>
                 <w:rStyle w:val="Lienhypertexte"/>
@@ -3617,7 +3861,7 @@
               <w:rPr>
                 <w:noProof/>
               </w:rPr>
-              <w:instrText xml:space="preserve"> PAGEREF _Toc243481349 \h </w:instrText>
+              <w:instrText xml:space="preserve"> PAGEREF _Toc243482212 \h </w:instrText>
             </w:r>
             <w:r>
               <w:rPr>
@@ -3634,7 +3878,7 @@
               <w:rPr>
                 <w:noProof/>
               </w:rPr>
-              <w:t>26</w:t>
+              <w:t>28</w:t>
             </w:r>
             <w:r>
               <w:rPr>
@@ -3654,7 +3898,7 @@
               <w:noProof/>
             </w:rPr>
           </w:pPr>
-          <w:hyperlink w:anchor="_Toc243481350" w:history="1">
+          <w:hyperlink w:anchor="_Toc243482213" w:history="1">
             <w:r>
               <w:rPr>
                 <w:rStyle w:val="Lienhypertexte"/>
@@ -3678,7 +3922,7 @@
               <w:rPr>
                 <w:noProof/>
               </w:rPr>
-              <w:instrText xml:space="preserve"> PAGEREF _Toc243481350 \h </w:instrText>
+              <w:instrText xml:space="preserve"> PAGEREF _Toc243482213 \h </w:instrText>
             </w:r>
             <w:r>
               <w:rPr>
@@ -3695,7 +3939,7 @@
               <w:rPr>
                 <w:noProof/>
               </w:rPr>
-              <w:t>27</w:t>
+              <w:t>29</w:t>
             </w:r>
             <w:r>
               <w:rPr>
@@ -3715,13 +3959,13 @@
               <w:noProof/>
             </w:rPr>
           </w:pPr>
-          <w:hyperlink w:anchor="_Toc243481351" w:history="1">
+          <w:hyperlink w:anchor="_Toc243482214" w:history="1">
             <w:r>
               <w:rPr>
                 <w:rStyle w:val="Lienhypertexte"/>
                 <w:noProof/>
               </w:rPr>
-              <w:t>13. Limits to admit, and next steps</w:t>
+              <w:t>14. Limits to admit, and next steps</w:t>
             </w:r>
             <w:r>
               <w:rPr>
@@ -3739,7 +3983,7 @@
               <w:rPr>
                 <w:noProof/>
               </w:rPr>
-              <w:instrText xml:space="preserve"> PAGEREF _Toc243481351 \h </w:instrText>
+              <w:instrText xml:space="preserve"> PAGEREF _Toc243482214 \h </w:instrText>
             </w:r>
             <w:r>
               <w:rPr>
@@ -3756,7 +4000,7 @@
               <w:rPr>
                 <w:noProof/>
               </w:rPr>
-              <w:t>28</w:t>
+              <w:t>30</w:t>
             </w:r>
             <w:r>
               <w:rPr>
@@ -3776,13 +4020,13 @@
               <w:noProof/>
             </w:rPr>
           </w:pPr>
-          <w:hyperlink w:anchor="_Toc243481352" w:history="1">
+          <w:hyperlink w:anchor="_Toc243482215" w:history="1">
             <w:r>
               <w:rPr>
                 <w:rStyle w:val="Lienhypertexte"/>
                 <w:noProof/>
               </w:rPr>
-              <w:t>14. Git history and how to reproduce</w:t>
+              <w:t>15. Git history and how to reproduce</w:t>
             </w:r>
             <w:r>
               <w:rPr>
@@ -3800,7 +4044,7 @@
               <w:rPr>
                 <w:noProof/>
               </w:rPr>
-              <w:instrText xml:space="preserve"> PAGEREF _Toc243481352 \h </w:instrText>
+              <w:instrText xml:space="preserve"> PAGEREF _Toc243482215 \h </w:instrText>
             </w:r>
             <w:r>
               <w:rPr>
@@ -3817,7 +4061,7 @@
               <w:rPr>
                 <w:noProof/>
               </w:rPr>
-              <w:t>29</w:t>
+              <w:t>31</w:t>
             </w:r>
             <w:r>
               <w:rPr>
@@ -3837,13 +4081,13 @@
               <w:noProof/>
             </w:rPr>
           </w:pPr>
-          <w:hyperlink w:anchor="_Toc243481353" w:history="1">
+          <w:hyperlink w:anchor="_Toc243482216" w:history="1">
             <w:r>
               <w:rPr>
                 <w:rStyle w:val="Lienhypertexte"/>
                 <w:noProof/>
               </w:rPr>
-              <w:t>15. The 10-minute talk, slide by slide</w:t>
+              <w:t>16. The 10-minute talk, slide by slide</w:t>
             </w:r>
             <w:r>
               <w:rPr>
@@ -3861,7 +4105,7 @@
               <w:rPr>
                 <w:noProof/>
               </w:rPr>
-              <w:instrText xml:space="preserve"> PAGEREF _Toc243481353 \h </w:instrText>
+              <w:instrText xml:space="preserve"> PAGEREF _Toc243482216 \h </w:instrText>
             </w:r>
             <w:r>
               <w:rPr>
@@ -3878,7 +4122,7 @@
               <w:rPr>
                 <w:noProof/>
               </w:rPr>
-              <w:t>30</w:t>
+              <w:t>32</w:t>
             </w:r>
             <w:r>
               <w:rPr>
@@ -3898,7 +4142,7 @@
               <w:noProof/>
             </w:rPr>
           </w:pPr>
-          <w:hyperlink w:anchor="_Toc243481354" w:history="1">
+          <w:hyperlink w:anchor="_Toc243482217" w:history="1">
             <w:r>
               <w:rPr>
                 <w:rStyle w:val="Lienhypertexte"/>
@@ -3922,7 +4166,7 @@
               <w:rPr>
                 <w:noProof/>
               </w:rPr>
-              <w:instrText xml:space="preserve"> PAGEREF _Toc243481354 \h </w:instrText>
+              <w:instrText xml:space="preserve"> PAGEREF _Toc243482217 \h </w:instrText>
             </w:r>
             <w:r>
               <w:rPr>
@@ -3939,7 +4183,7 @@
               <w:rPr>
                 <w:noProof/>
               </w:rPr>
-              <w:t>30</w:t>
+              <w:t>32</w:t>
             </w:r>
             <w:r>
               <w:rPr>
@@ -3961,7 +4205,7 @@
         <w:pStyle w:val="Titre1"/>
         <w:pageBreakBefore/>
       </w:pPr>
-      <w:bookmarkStart w:id="0" w:name="_Toc243481292"/>
+      <w:bookmarkStart w:id="0" w:name="_Toc243482151"/>
       <w:r>
         <w:lastRenderedPageBreak/>
         <w:t>1. The pitch in 60 seconds</w:t>
@@ -4180,7 +4424,7 @@
         <w:pStyle w:val="Titre1"/>
         <w:pageBreakBefore/>
       </w:pPr>
-      <w:bookmarkStart w:id="1" w:name="_Toc243481293"/>
+      <w:bookmarkStart w:id="1" w:name="_Toc243482152"/>
       <w:r>
         <w:lastRenderedPageBreak/>
         <w:t>2. The basic ideas, explained simply</w:t>
@@ -4285,7 +4529,7 @@
       <w:pPr>
         <w:pStyle w:val="Titre2"/>
       </w:pPr>
-      <w:bookmarkStart w:id="2" w:name="_Toc243481294"/>
+      <w:bookmarkStart w:id="2" w:name="_Toc243482153"/>
       <w:r>
         <w:t>A neuron, weights and a network</w:t>
       </w:r>
@@ -4355,7 +4599,7 @@
       <w:pPr>
         <w:pStyle w:val="Titre2"/>
       </w:pPr>
-      <w:bookmarkStart w:id="3" w:name="_Toc243481295"/>
+      <w:bookmarkStart w:id="3" w:name="_Toc243482154"/>
       <w:r>
         <w:t>The loss: how wrong we are</w:t>
       </w:r>
@@ -4415,7 +4659,7 @@
       <w:pPr>
         <w:pStyle w:val="Titre2"/>
       </w:pPr>
-      <w:bookmarkStart w:id="4" w:name="_Toc243481296"/>
+      <w:bookmarkStart w:id="4" w:name="_Toc243482155"/>
       <w:r>
         <w:t>Gradient descent and the learning rate</w:t>
       </w:r>
@@ -4485,7 +4729,7 @@
       <w:pPr>
         <w:pStyle w:val="Titre2"/>
       </w:pPr>
-      <w:bookmarkStart w:id="5" w:name="_Toc243481297"/>
+      <w:bookmarkStart w:id="5" w:name="_Toc243482156"/>
       <w:r>
         <w:t>Backpropagation and the 5 lines of the training loop</w:t>
       </w:r>
@@ -4579,7 +4823,7 @@
       <w:pPr>
         <w:pStyle w:val="Titre2"/>
       </w:pPr>
-      <w:bookmarkStart w:id="6" w:name="_Toc243481298"/>
+      <w:bookmarkStart w:id="6" w:name="_Toc243482157"/>
       <w:r>
         <w:t>Epoch and mini-batch</w:t>
       </w:r>
@@ -4639,7 +4883,7 @@
       <w:pPr>
         <w:pStyle w:val="Titre2"/>
       </w:pPr>
-      <w:bookmarkStart w:id="7" w:name="_Toc243481299"/>
+      <w:bookmarkStart w:id="7" w:name="_Toc243482158"/>
       <w:r>
         <w:lastRenderedPageBreak/>
         <w:t>Train, validation, test</w:t>
@@ -4710,7 +4954,7 @@
       <w:pPr>
         <w:pStyle w:val="Titre2"/>
       </w:pPr>
-      <w:bookmarkStart w:id="8" w:name="_Toc243481300"/>
+      <w:bookmarkStart w:id="8" w:name="_Toc243482159"/>
       <w:r>
         <w:t>Overfitting</w:t>
       </w:r>
@@ -4760,7 +5004,7 @@
       <w:pPr>
         <w:pStyle w:val="Titre2"/>
       </w:pPr>
-      <w:bookmarkStart w:id="9" w:name="_Toc243481301"/>
+      <w:bookmarkStart w:id="9" w:name="_Toc243482160"/>
       <w:r>
         <w:t>ReLU, the activation</w:t>
       </w:r>
@@ -4830,7 +5074,7 @@
       <w:pPr>
         <w:pStyle w:val="Titre2"/>
       </w:pPr>
-      <w:bookmarkStart w:id="10" w:name="_Toc243481302"/>
+      <w:bookmarkStart w:id="10" w:name="_Toc243482161"/>
       <w:r>
         <w:t>Initialisation and the first loss</w:t>
       </w:r>
@@ -4880,7 +5124,7 @@
       <w:pPr>
         <w:pStyle w:val="Titre2"/>
       </w:pPr>
-      <w:bookmarkStart w:id="11" w:name="_Toc243481303"/>
+      <w:bookmarkStart w:id="11" w:name="_Toc243482162"/>
       <w:r>
         <w:t>Standardisation of the pixels</w:t>
       </w:r>
@@ -4940,7 +5184,7 @@
       <w:pPr>
         <w:pStyle w:val="Titre2"/>
       </w:pPr>
-      <w:bookmarkStart w:id="12" w:name="_Toc243481304"/>
+      <w:bookmarkStart w:id="12" w:name="_Toc243482163"/>
       <w:r>
         <w:t>MLP versus CNN: why the MLP cannot see shapes</w:t>
       </w:r>
@@ -5000,7 +5244,7 @@
       <w:pPr>
         <w:pStyle w:val="Titre2"/>
       </w:pPr>
-      <w:bookmarkStart w:id="13" w:name="_Toc243481305"/>
+      <w:bookmarkStart w:id="13" w:name="_Toc243482164"/>
       <w:r>
         <w:t>Convolution, filters and channels (session 7 slide)</w:t>
       </w:r>
@@ -5091,7 +5335,7 @@
       <w:pPr>
         <w:pStyle w:val="Titre2"/>
       </w:pPr>
-      <w:bookmarkStart w:id="14" w:name="_Toc243481306"/>
+      <w:bookmarkStart w:id="14" w:name="_Toc243482165"/>
       <w:r>
         <w:t>A pretrained network and transfer learning</w:t>
       </w:r>
@@ -5151,7 +5395,7 @@
       <w:pPr>
         <w:pStyle w:val="Titre2"/>
       </w:pPr>
-      <w:bookmarkStart w:id="15" w:name="_Toc243481307"/>
+      <w:bookmarkStart w:id="15" w:name="_Toc243482166"/>
       <w:r>
         <w:t>Frozen features (linear probe) versus fine-tuning</w:t>
       </w:r>
@@ -5221,7 +5465,7 @@
       <w:pPr>
         <w:pStyle w:val="Titre2"/>
       </w:pPr>
-      <w:bookmarkStart w:id="16" w:name="_Toc243481308"/>
+      <w:bookmarkStart w:id="16" w:name="_Toc243482167"/>
       <w:r>
         <w:t>The tools against overfitting</w:t>
       </w:r>
@@ -5381,7 +5625,7 @@
       <w:pPr>
         <w:pStyle w:val="Titre2"/>
       </w:pPr>
-      <w:bookmarkStart w:id="17" w:name="_Toc243481309"/>
+      <w:bookmarkStart w:id="17" w:name="_Toc243482168"/>
       <w:r>
         <w:t>Vanishing gradient</w:t>
       </w:r>
@@ -5431,7 +5675,7 @@
       <w:pPr>
         <w:pStyle w:val="Titre2"/>
       </w:pPr>
-      <w:bookmarkStart w:id="18" w:name="_Toc243481310"/>
+      <w:bookmarkStart w:id="18" w:name="_Toc243482169"/>
       <w:r>
         <w:t>Data leakage</w:t>
       </w:r>
@@ -5481,7 +5725,7 @@
       <w:pPr>
         <w:pStyle w:val="Titre2"/>
       </w:pPr>
-      <w:bookmarkStart w:id="19" w:name="_Toc243481311"/>
+      <w:bookmarkStart w:id="19" w:name="_Toc243482170"/>
       <w:r>
         <w:t>Confidence interval and bootstrap</w:t>
       </w:r>
@@ -5541,7 +5785,7 @@
       <w:pPr>
         <w:pStyle w:val="Titre2"/>
       </w:pPr>
-      <w:bookmarkStart w:id="20" w:name="_Toc243481312"/>
+      <w:bookmarkStart w:id="20" w:name="_Toc243482171"/>
       <w:r>
         <w:lastRenderedPageBreak/>
         <w:t>Latency and CPU threads</w:t>
@@ -5613,7 +5857,7 @@
         <w:pStyle w:val="Titre1"/>
         <w:pageBreakBefore/>
       </w:pPr>
-      <w:bookmarkStart w:id="21" w:name="_Toc243481313"/>
+      <w:bookmarkStart w:id="21" w:name="_Toc243482172"/>
       <w:r>
         <w:lastRenderedPageBreak/>
         <w:t>3. Step 1: the data and a fair split (notebook 01)</w:t>
@@ -5726,7 +5970,7 @@
       <w:pPr>
         <w:pStyle w:val="Titre2"/>
       </w:pPr>
-      <w:bookmarkStart w:id="22" w:name="_Toc243481314"/>
+      <w:bookmarkStart w:id="22" w:name="_Toc243482173"/>
       <w:r>
         <w:t>What we downloaded</w:t>
       </w:r>
@@ -5847,7 +6091,7 @@
       <w:pPr>
         <w:pStyle w:val="Titre2"/>
       </w:pPr>
-      <w:bookmarkStart w:id="23" w:name="_Toc243481315"/>
+      <w:bookmarkStart w:id="23" w:name="_Toc243482174"/>
       <w:r>
         <w:t>The split (make_split in data.py)</w:t>
       </w:r>
@@ -5978,7 +6222,7 @@
       <w:pPr>
         <w:pStyle w:val="Titre2"/>
       </w:pPr>
-      <w:bookmarkStart w:id="24" w:name="_Toc243481316"/>
+      <w:bookmarkStart w:id="24" w:name="_Toc243482175"/>
       <w:r>
         <w:t>What we found in the data</w:t>
       </w:r>
@@ -6041,7 +6285,7 @@
         <w:pStyle w:val="Titre1"/>
         <w:pageBreakBefore/>
       </w:pPr>
-      <w:bookmarkStart w:id="25" w:name="_Toc243481317"/>
+      <w:bookmarkStart w:id="25" w:name="_Toc243482176"/>
       <w:r>
         <w:lastRenderedPageBreak/>
         <w:t>4. Step 2: the MLP and its two checks (notebook 02)</w:t>
@@ -6191,7 +6435,7 @@
       <w:pPr>
         <w:pStyle w:val="Titre2"/>
       </w:pPr>
-      <w:bookmarkStart w:id="26" w:name="_Toc243481318"/>
+      <w:bookmarkStart w:id="26" w:name="_Toc243482177"/>
       <w:r>
         <w:t>The model</w:t>
       </w:r>
@@ -6318,7 +6562,7 @@
       <w:pPr>
         <w:pStyle w:val="Titre2"/>
       </w:pPr>
-      <w:bookmarkStart w:id="27" w:name="_Toc243481319"/>
+      <w:bookmarkStart w:id="27" w:name="_Toc243482178"/>
       <w:r>
         <w:t>Check 1: the first loss</w:t>
       </w:r>
@@ -6367,7 +6611,7 @@
       <w:pPr>
         <w:pStyle w:val="Titre2"/>
       </w:pPr>
-      <w:bookmarkStart w:id="28" w:name="_Toc243481320"/>
+      <w:bookmarkStart w:id="28" w:name="_Toc243482179"/>
       <w:r>
         <w:t>Check 2: overfit one batch</w:t>
       </w:r>
@@ -6385,7 +6629,7 @@
       <w:pPr>
         <w:pStyle w:val="Titre2"/>
       </w:pPr>
-      <w:bookmarkStart w:id="29" w:name="_Toc243481321"/>
+      <w:bookmarkStart w:id="29" w:name="_Toc243482180"/>
       <w:r>
         <w:t>Baseline and image size</w:t>
       </w:r>
@@ -6461,7 +6705,7 @@
         </w:rPr>
         <w:lastRenderedPageBreak/>
         <w:drawing>
-          <wp:inline distT="0" distB="0" distL="0" distR="0" wp14:anchorId="6B2EA66A" wp14:editId="6B2EA66B">
+          <wp:inline distT="0" distB="0" distL="0" distR="0" wp14:anchorId="7263814F" wp14:editId="72638150">
             <wp:extent cx="4762500" cy="1924050"/>
             <wp:effectExtent l="0" t="0" r="0" b="0"/>
             <wp:docPr id="1" name="02_baseline_curves.png" descr="MLP baseline: training loss falls to 0 while validation loss rises (overfitting)." title="MLP baseline: training loss falls to 0 while validation loss rises (overfitting)."/>
@@ -6521,7 +6765,7 @@
         <w:pStyle w:val="Titre1"/>
         <w:pageBreakBefore/>
       </w:pPr>
-      <w:bookmarkStart w:id="30" w:name="_Toc243481322"/>
+      <w:bookmarkStart w:id="30" w:name="_Toc243482181"/>
       <w:r>
         <w:lastRenderedPageBreak/>
         <w:t>5. Step 3: monitoring and regularisation (notebook 03)</w:t>
@@ -6692,7 +6936,7 @@
       <w:pPr>
         <w:pStyle w:val="Titre2"/>
       </w:pPr>
-      <w:bookmarkStart w:id="31" w:name="_Toc243481323"/>
+      <w:bookmarkStart w:id="31" w:name="_Toc243482182"/>
       <w:r>
         <w:t>What we monitored</w:t>
       </w:r>
@@ -6811,7 +7055,7 @@
       <w:pPr>
         <w:pStyle w:val="Titre2"/>
       </w:pPr>
-      <w:bookmarkStart w:id="32" w:name="_Toc243481324"/>
+      <w:bookmarkStart w:id="32" w:name="_Toc243482183"/>
       <w:r>
         <w:t>Learning-rate sweep (Adam, 8 values, 15 epochs each)</w:t>
       </w:r>
@@ -6886,7 +7130,7 @@
           <w:noProof/>
         </w:rPr>
         <w:drawing>
-          <wp:inline distT="0" distB="0" distL="0" distR="0" wp14:anchorId="6B2EA66C" wp14:editId="6B2EA66D">
+          <wp:inline distT="0" distB="0" distL="0" distR="0" wp14:anchorId="72638151" wp14:editId="72638152">
             <wp:extent cx="4191000" cy="1619250"/>
             <wp:effectExtent l="0" t="0" r="0" b="0"/>
             <wp:docPr id="2" name="03_lr_sweep.png" descr="Learning-rate sweep: a U-shaped validation loss, best at 0.0001." title="Learning-rate sweep: a U-shaped validation loss, best at 0.0001."/>
@@ -6945,7 +7189,7 @@
       <w:pPr>
         <w:pStyle w:val="Titre2"/>
       </w:pPr>
-      <w:bookmarkStart w:id="33" w:name="_Toc243481325"/>
+      <w:bookmarkStart w:id="33" w:name="_Toc243482184"/>
       <w:r>
         <w:t>The tools against overfitting (lr 0.0001, 3 seeds each)</w:t>
       </w:r>
@@ -7918,7 +8162,7 @@
         <w:pStyle w:val="Titre1"/>
         <w:pageBreakBefore/>
       </w:pPr>
-      <w:bookmarkStart w:id="34" w:name="_Toc243481326"/>
+      <w:bookmarkStart w:id="34" w:name="_Toc243482185"/>
       <w:r>
         <w:lastRenderedPageBreak/>
         <w:t>6. Step 4: the training doctor (notebook 04)</w:t>
@@ -7934,7 +8178,7 @@
           <w:b/>
           <w:bCs/>
         </w:rPr>
-        <w:t>In the talk: backup slide 14 only.</w:t>
+        <w:t>In the talk: backup slide 15 only.</w:t>
       </w:r>
       <w:r>
         <w:t xml:space="preserve"> The brief asks for monitoring and failure diagnosis of our own trainings: the talk shows them on slide 5 (inside the MLP, overfitting diagnosed and fixed) and slide 6 (ResNet curves, fine-tuning overfits). This chapter is for the questions: it proves that our monitoring tools really catch a broken training.</w:t>
@@ -8824,7 +9068,7 @@
         </w:rPr>
         <w:lastRenderedPageBreak/>
         <w:drawing>
-          <wp:inline distT="0" distB="0" distL="0" distR="0" wp14:anchorId="6B2EA66E" wp14:editId="6B2EA66F">
+          <wp:inline distT="0" distB="0" distL="0" distR="0" wp14:anchorId="72638153" wp14:editId="72638154">
             <wp:extent cx="4000500" cy="2209800"/>
             <wp:effectExtent l="0" t="0" r="0" b="0"/>
             <wp:docPr id="3" name="04_p4_grad_per_layer.png" descr="Patient 4: the gradient vanishes layer after layer with sigmoids; ReLU + He init fixes it." title="Patient 4: the gradient vanishes layer after layer with sigmoids; ReLU + He init fixes it."/>
@@ -8883,7 +9127,7 @@
       <w:pPr>
         <w:pStyle w:val="Titre2"/>
       </w:pPr>
-      <w:bookmarkStart w:id="35" w:name="_Toc243481327"/>
+      <w:bookmarkStart w:id="35" w:name="_Toc243482186"/>
       <w:r>
         <w:t>Lessons to say at the oral</w:t>
       </w:r>
@@ -8976,7 +9220,7 @@
         <w:pStyle w:val="Titre1"/>
         <w:pageBreakBefore/>
       </w:pPr>
-      <w:bookmarkStart w:id="36" w:name="_Toc243481328"/>
+      <w:bookmarkStart w:id="36" w:name="_Toc243482187"/>
       <w:r>
         <w:lastRenderedPageBreak/>
         <w:t>7. Step 5: pretrained ResNet18 (notebook 05)</w:t>
@@ -9183,7 +9427,7 @@
       <w:pPr>
         <w:pStyle w:val="Titre2"/>
       </w:pPr>
-      <w:bookmarkStart w:id="37" w:name="_Toc243481329"/>
+      <w:bookmarkStart w:id="37" w:name="_Toc243482188"/>
       <w:r>
         <w:t>Why a CNN, and why pretrained</w:t>
       </w:r>
@@ -9268,7 +9512,7 @@
       <w:pPr>
         <w:pStyle w:val="Titre2"/>
       </w:pPr>
-      <w:bookmarkStart w:id="38" w:name="_Toc243481330"/>
+      <w:bookmarkStart w:id="38" w:name="_Toc243482189"/>
       <w:r>
         <w:t>Method A: frozen features + head</w:t>
       </w:r>
@@ -9375,7 +9619,7 @@
       <w:pPr>
         <w:pStyle w:val="Titre2"/>
       </w:pPr>
-      <w:bookmarkStart w:id="39" w:name="_Toc243481331"/>
+      <w:bookmarkStart w:id="39" w:name="_Toc243482190"/>
       <w:r>
         <w:t>Method B: fine-tuning layer4</w:t>
       </w:r>
@@ -9432,7 +9676,7 @@
       <w:pPr>
         <w:pStyle w:val="Titre2"/>
       </w:pPr>
-      <w:bookmarkStart w:id="40" w:name="_Toc243481332"/>
+      <w:bookmarkStart w:id="40" w:name="_Toc243482191"/>
       <w:r>
         <w:t>Two silent bugs, measured</w:t>
       </w:r>
@@ -9499,7 +9743,7 @@
       <w:pPr>
         <w:pStyle w:val="Titre2"/>
       </w:pPr>
-      <w:bookmarkStart w:id="41" w:name="_Toc243481333"/>
+      <w:bookmarkStart w:id="41" w:name="_Toc243482192"/>
       <w:r>
         <w:lastRenderedPageBreak/>
         <w:t>Painter leakage, measured fairly</w:t>
@@ -9841,7 +10085,7 @@
           <w:noProof/>
         </w:rPr>
         <w:drawing>
-          <wp:inline distT="0" distB="0" distL="0" distR="0" wp14:anchorId="6B2EA670" wp14:editId="6B2EA671">
+          <wp:inline distT="0" distB="0" distL="0" distR="0" wp14:anchorId="72638155" wp14:editId="72638156">
             <wp:extent cx="4762500" cy="2524125"/>
             <wp:effectExtent l="0" t="0" r="0" b="0"/>
             <wp:docPr id="4" name="05_painter_leakage.png" descr="Painter leakage: same images, same model; only the known-painter group changes." title="Painter leakage: same images, same model; only the known-painter group changes."/>
@@ -9916,7 +10160,7 @@
         <w:pStyle w:val="Titre1"/>
         <w:pageBreakBefore/>
       </w:pPr>
-      <w:bookmarkStart w:id="42" w:name="_Toc243481334"/>
+      <w:bookmarkStart w:id="42" w:name="_Toc243482193"/>
       <w:r>
         <w:lastRenderedPageBreak/>
         <w:t>8. Step 6: final test, CPU cost and recommendation (notebook 06)</w:t>
@@ -10062,7 +10306,7 @@
       <w:pPr>
         <w:pStyle w:val="Titre2"/>
       </w:pPr>
-      <w:bookmarkStart w:id="43" w:name="_Toc243481335"/>
+      <w:bookmarkStart w:id="43" w:name="_Toc243482194"/>
       <w:r>
         <w:t>Classical models (settings chosen on validation)</w:t>
       </w:r>
@@ -10175,7 +10419,7 @@
       <w:pPr>
         <w:pStyle w:val="Titre2"/>
       </w:pPr>
-      <w:bookmarkStart w:id="44" w:name="_Toc243481336"/>
+      <w:bookmarkStart w:id="44" w:name="_Toc243482195"/>
       <w:r>
         <w:t>The final test, measured once</w:t>
       </w:r>
@@ -11206,7 +11450,7 @@
         </w:rPr>
         <w:lastRenderedPageBreak/>
         <w:drawing>
-          <wp:inline distT="0" distB="0" distL="0" distR="0" wp14:anchorId="6B2EA672" wp14:editId="6B2EA673">
+          <wp:inline distT="0" distB="0" distL="0" distR="0" wp14:anchorId="72638157" wp14:editId="72638158">
             <wp:extent cx="4762500" cy="1971675"/>
             <wp:effectExtent l="0" t="0" r="0" b="0"/>
             <wp:docPr id="5" name="06_test_accuracy.png" descr="Final test: 220 paintings never seen before, with 95 % bootstrap intervals." title="Final test: 220 paintings never seen before, with 95 % bootstrap intervals."/>
@@ -11265,7 +11509,7 @@
       <w:pPr>
         <w:pStyle w:val="Titre2"/>
       </w:pPr>
-      <w:bookmarkStart w:id="45" w:name="_Toc243481337"/>
+      <w:bookmarkStart w:id="45" w:name="_Toc243482196"/>
       <w:r>
         <w:t>Are the gaps real? Paired bootstrap (same 220 paintings, 5 000 redraws)</w:t>
       </w:r>
@@ -11324,7 +11568,7 @@
       <w:pPr>
         <w:pStyle w:val="Titre2"/>
       </w:pPr>
-      <w:bookmarkStart w:id="46" w:name="_Toc243481338"/>
+      <w:bookmarkStart w:id="46" w:name="_Toc243482197"/>
       <w:r>
         <w:t>Frozen or fine-tuned? Validation and test disagree</w:t>
       </w:r>
@@ -11352,7 +11596,7 @@
       <w:pPr>
         <w:pStyle w:val="Titre2"/>
       </w:pPr>
-      <w:bookmarkStart w:id="47" w:name="_Toc243481339"/>
+      <w:bookmarkStart w:id="47" w:name="_Toc243482198"/>
       <w:r>
         <w:t>Speed and size</w:t>
       </w:r>
@@ -11370,7 +11614,7 @@
       <w:pPr>
         <w:pStyle w:val="Titre2"/>
       </w:pPr>
-      <w:bookmarkStart w:id="48" w:name="_Toc243481340"/>
+      <w:bookmarkStart w:id="48" w:name="_Toc243482199"/>
       <w:r>
         <w:t>Recommendation to the director</w:t>
       </w:r>
@@ -11467,12 +11711,1022 @@
         <w:pStyle w:val="Titre1"/>
         <w:pageBreakBefore/>
       </w:pPr>
-      <w:bookmarkStart w:id="49" w:name="_Toc243481341"/>
+      <w:bookmarkStart w:id="49" w:name="_Toc243482200"/>
       <w:r>
         <w:lastRenderedPageBreak/>
-        <w:t>9. Bonus: what about transformers like BERT? (notebook 07)</w:t>
+        <w:t>9. The random forest, our classical challenger (notebook 06)</w:t>
       </w:r>
       <w:bookmarkEnd w:id="49"/>
+    </w:p>
+    <w:tbl>
+      <w:tblPr>
+        <w:tblW w:w="9638" w:type="dxa"/>
+        <w:tblBorders>
+          <w:top w:val="single" w:sz="4" w:space="0" w:color="auto"/>
+          <w:left w:val="single" w:sz="4" w:space="0" w:color="auto"/>
+          <w:bottom w:val="single" w:sz="4" w:space="0" w:color="auto"/>
+          <w:right w:val="single" w:sz="4" w:space="0" w:color="auto"/>
+          <w:insideH w:val="single" w:sz="4" w:space="0" w:color="auto"/>
+          <w:insideV w:val="single" w:sz="4" w:space="0" w:color="auto"/>
+        </w:tblBorders>
+        <w:tblLook w:val="04A0" w:firstRow="1" w:lastRow="0" w:firstColumn="1" w:lastColumn="0" w:noHBand="0" w:noVBand="1"/>
+      </w:tblPr>
+      <w:tblGrid>
+        <w:gridCol w:w="9638"/>
+      </w:tblGrid>
+      <w:tr>
+        <w:tc>
+          <w:tcPr>
+            <w:tcW w:w="9638" w:type="dxa"/>
+            <w:tcBorders>
+              <w:top w:val="single" w:sz="6" w:space="0" w:color="BFD6F5"/>
+              <w:left w:val="single" w:sz="6" w:space="0" w:color="BFD6F5"/>
+              <w:bottom w:val="single" w:sz="6" w:space="0" w:color="BFD6F5"/>
+              <w:right w:val="single" w:sz="6" w:space="0" w:color="BFD6F5"/>
+            </w:tcBorders>
+            <w:shd w:val="clear" w:color="auto" w:fill="EEF4FC"/>
+            <w:tcMar>
+              <w:top w:w="140" w:type="dxa"/>
+              <w:left w:w="180" w:type="dxa"/>
+              <w:bottom w:w="80" w:type="dxa"/>
+              <w:right w:w="180" w:type="dxa"/>
+            </w:tcMar>
+          </w:tcPr>
+          <w:p>
+            <w:pPr>
+              <w:spacing w:after="100"/>
+            </w:pPr>
+            <w:r>
+              <w:rPr>
+                <w:b/>
+                <w:bCs/>
+                <w:color w:val="1C5FB0"/>
+              </w:rPr>
+              <w:t>In simple words</w:t>
+            </w:r>
+          </w:p>
+          <w:p>
+            <w:pPr>
+              <w:spacing w:after="120"/>
+            </w:pPr>
+            <w:r>
+              <w:rPr>
+                <w:b/>
+                <w:bCs/>
+              </w:rPr>
+              <w:t>Why it is here.</w:t>
+            </w:r>
+            <w:r>
+              <w:t xml:space="preserve"> The director asks: is a neural network worth it, or would a simpler classical model do the job? To answer, we need a real challenger </w:t>
+            </w:r>
+            <w:r>
+              <w:rPr>
+                <w:b/>
+                <w:bCs/>
+              </w:rPr>
+              <w:t>without any neural network</w:t>
+            </w:r>
+            <w:r>
+              <w:t>. The random forest is that challenger.</w:t>
+            </w:r>
+          </w:p>
+          <w:p>
+            <w:pPr>
+              <w:spacing w:after="120"/>
+            </w:pPr>
+            <w:r>
+              <w:rPr>
+                <w:b/>
+                <w:bCs/>
+              </w:rPr>
+              <w:t>The checklist.</w:t>
+            </w:r>
+            <w:r>
+              <w:t xml:space="preserve"> A classical model cannot read 12 288 raw pixels well (logistic regression on pixels: 32.7 % on the test). So we give it a </w:t>
+            </w:r>
+            <w:r>
+              <w:rPr>
+                <w:b/>
+                <w:bCs/>
+              </w:rPr>
+              <w:t>checklist written by a human</w:t>
+            </w:r>
+            <w:r>
+              <w:t>: 102 numbers per painting that describe its colours and its brush strokes, wherever they are in the painting.</w:t>
+            </w:r>
+          </w:p>
+          <w:p>
+            <w:pPr>
+              <w:spacing w:after="120"/>
+            </w:pPr>
+            <w:r>
+              <w:rPr>
+                <w:b/>
+                <w:bCs/>
+              </w:rPr>
+              <w:t>One tree</w:t>
+            </w:r>
+            <w:r>
+              <w:t xml:space="preserve"> is a game of 20 questions: "a lot of dark colours?", then "edges mostly straight?", and so on, until it names a style. One tree learns its examples by heart and makes silly mistakes.</w:t>
+            </w:r>
+          </w:p>
+          <w:p>
+            <w:pPr>
+              <w:spacing w:after="120"/>
+            </w:pPr>
+            <w:r>
+              <w:rPr>
+                <w:b/>
+                <w:bCs/>
+              </w:rPr>
+              <w:t>The forest</w:t>
+            </w:r>
+            <w:r>
+              <w:t xml:space="preserve"> is 500 different trees that </w:t>
+            </w:r>
+            <w:r>
+              <w:rPr>
+                <w:b/>
+                <w:bCs/>
+              </w:rPr>
+              <w:t>vote</w:t>
+            </w:r>
+            <w:r>
+              <w:t xml:space="preserve">, like asking 500 museum visitors instead of one: their mistakes are different, so they cancel out. The trees are different because each one learns from a </w:t>
+            </w:r>
+            <w:r>
+              <w:rPr>
+                <w:b/>
+                <w:bCs/>
+              </w:rPr>
+              <w:t>random draw</w:t>
+            </w:r>
+            <w:r>
+              <w:t xml:space="preserve"> of the training paintings (some twice, some not at all) and, at each question, may only look at </w:t>
+            </w:r>
+            <w:r>
+              <w:rPr>
+                <w:b/>
+                <w:bCs/>
+              </w:rPr>
+              <w:t>10 of the 102 numbers</w:t>
+            </w:r>
+            <w:r>
+              <w:t>, chosen at random. That is the "random" in random forest.</w:t>
+            </w:r>
+          </w:p>
+        </w:tc>
+      </w:tr>
+    </w:tbl>
+    <w:p>
+      <w:pPr>
+        <w:spacing w:after="160"/>
+      </w:pPr>
+    </w:p>
+    <w:p>
+      <w:pPr>
+        <w:spacing w:after="160"/>
+      </w:pPr>
+      <w:r>
+        <w:rPr>
+          <w:color w:val="1C2433"/>
+        </w:rPr>
+        <w:t>The random forest on 102 hand-made numbers is our best model without a neural network: 63.5 % on validation, 67.3 % on the test, 16.4 points below the frozen ResNet18 (interval 9.1 to 24.1). Backup slide 11 shows it.</w:t>
+      </w:r>
+    </w:p>
+    <w:p>
+      <w:pPr>
+        <w:pStyle w:val="Titre2"/>
+      </w:pPr>
+      <w:bookmarkStart w:id="50" w:name="_Toc243482201"/>
+      <w:r>
+        <w:t>The 102 hand-made numbers (baselines.py)</w:t>
+      </w:r>
+      <w:bookmarkEnd w:id="50"/>
+    </w:p>
+    <w:tbl>
+      <w:tblPr>
+        <w:tblW w:w="9638" w:type="dxa"/>
+        <w:tblBorders>
+          <w:top w:val="single" w:sz="4" w:space="0" w:color="auto"/>
+          <w:left w:val="single" w:sz="4" w:space="0" w:color="auto"/>
+          <w:bottom w:val="single" w:sz="4" w:space="0" w:color="auto"/>
+          <w:right w:val="single" w:sz="4" w:space="0" w:color="auto"/>
+          <w:insideH w:val="single" w:sz="4" w:space="0" w:color="auto"/>
+          <w:insideV w:val="single" w:sz="4" w:space="0" w:color="auto"/>
+        </w:tblBorders>
+        <w:tblLook w:val="04A0" w:firstRow="1" w:lastRow="0" w:firstColumn="1" w:lastColumn="0" w:noHBand="0" w:noVBand="1"/>
+      </w:tblPr>
+      <w:tblGrid>
+        <w:gridCol w:w="2891"/>
+        <w:gridCol w:w="1157"/>
+        <w:gridCol w:w="5590"/>
+      </w:tblGrid>
+      <w:tr>
+        <w:trPr>
+          <w:tblHeader/>
+        </w:trPr>
+        <w:tc>
+          <w:tcPr>
+            <w:tcW w:w="2891" w:type="dxa"/>
+            <w:tcBorders>
+              <w:top w:val="single" w:sz="4" w:space="0" w:color="D9DCE2"/>
+              <w:left w:val="single" w:sz="4" w:space="0" w:color="D9DCE2"/>
+              <w:bottom w:val="single" w:sz="4" w:space="0" w:color="D9DCE2"/>
+              <w:right w:val="single" w:sz="4" w:space="0" w:color="D9DCE2"/>
+            </w:tcBorders>
+            <w:shd w:val="clear" w:color="auto" w:fill="1C2433"/>
+            <w:tcMar>
+              <w:top w:w="60" w:type="dxa"/>
+              <w:left w:w="100" w:type="dxa"/>
+              <w:bottom w:w="60" w:type="dxa"/>
+              <w:right w:w="100" w:type="dxa"/>
+            </w:tcMar>
+          </w:tcPr>
+          <w:p>
+            <w:r>
+              <w:rPr>
+                <w:b/>
+                <w:bCs/>
+                <w:color w:val="FFFFFF"/>
+                <w:sz w:val="19"/>
+                <w:szCs w:val="19"/>
+              </w:rPr>
+              <w:t>Group</w:t>
+            </w:r>
+          </w:p>
+        </w:tc>
+        <w:tc>
+          <w:tcPr>
+            <w:tcW w:w="1157" w:type="dxa"/>
+            <w:tcBorders>
+              <w:top w:val="single" w:sz="4" w:space="0" w:color="D9DCE2"/>
+              <w:left w:val="single" w:sz="4" w:space="0" w:color="D9DCE2"/>
+              <w:bottom w:val="single" w:sz="4" w:space="0" w:color="D9DCE2"/>
+              <w:right w:val="single" w:sz="4" w:space="0" w:color="D9DCE2"/>
+            </w:tcBorders>
+            <w:shd w:val="clear" w:color="auto" w:fill="1C2433"/>
+            <w:tcMar>
+              <w:top w:w="60" w:type="dxa"/>
+              <w:left w:w="100" w:type="dxa"/>
+              <w:bottom w:w="60" w:type="dxa"/>
+              <w:right w:w="100" w:type="dxa"/>
+            </w:tcMar>
+          </w:tcPr>
+          <w:p>
+            <w:r>
+              <w:rPr>
+                <w:b/>
+                <w:bCs/>
+                <w:color w:val="FFFFFF"/>
+                <w:sz w:val="19"/>
+                <w:szCs w:val="19"/>
+              </w:rPr>
+              <w:t>Numbers</w:t>
+            </w:r>
+          </w:p>
+        </w:tc>
+        <w:tc>
+          <w:tcPr>
+            <w:tcW w:w="5590" w:type="dxa"/>
+            <w:tcBorders>
+              <w:top w:val="single" w:sz="4" w:space="0" w:color="D9DCE2"/>
+              <w:left w:val="single" w:sz="4" w:space="0" w:color="D9DCE2"/>
+              <w:bottom w:val="single" w:sz="4" w:space="0" w:color="D9DCE2"/>
+              <w:right w:val="single" w:sz="4" w:space="0" w:color="D9DCE2"/>
+            </w:tcBorders>
+            <w:shd w:val="clear" w:color="auto" w:fill="1C2433"/>
+            <w:tcMar>
+              <w:top w:w="60" w:type="dxa"/>
+              <w:left w:w="100" w:type="dxa"/>
+              <w:bottom w:w="60" w:type="dxa"/>
+              <w:right w:w="100" w:type="dxa"/>
+            </w:tcMar>
+          </w:tcPr>
+          <w:p>
+            <w:r>
+              <w:rPr>
+                <w:b/>
+                <w:bCs/>
+                <w:color w:val="FFFFFF"/>
+                <w:sz w:val="19"/>
+                <w:szCs w:val="19"/>
+              </w:rPr>
+              <w:t>What it describes</w:t>
+            </w:r>
+          </w:p>
+        </w:tc>
+      </w:tr>
+      <w:tr>
+        <w:tc>
+          <w:tcPr>
+            <w:tcW w:w="2891" w:type="dxa"/>
+            <w:tcBorders>
+              <w:top w:val="single" w:sz="4" w:space="0" w:color="D9DCE2"/>
+              <w:left w:val="single" w:sz="4" w:space="0" w:color="D9DCE2"/>
+              <w:bottom w:val="single" w:sz="4" w:space="0" w:color="D9DCE2"/>
+              <w:right w:val="single" w:sz="4" w:space="0" w:color="D9DCE2"/>
+            </w:tcBorders>
+            <w:tcMar>
+              <w:top w:w="60" w:type="dxa"/>
+              <w:left w:w="100" w:type="dxa"/>
+              <w:bottom w:w="60" w:type="dxa"/>
+              <w:right w:w="100" w:type="dxa"/>
+            </w:tcMar>
+          </w:tcPr>
+          <w:p>
+            <w:r>
+              <w:rPr>
+                <w:sz w:val="19"/>
+                <w:szCs w:val="19"/>
+              </w:rPr>
+              <w:t>Colour histogram in HSV: 8 hues x 3 saturations x 3 brightness levels</w:t>
+            </w:r>
+          </w:p>
+        </w:tc>
+        <w:tc>
+          <w:tcPr>
+            <w:tcW w:w="1157" w:type="dxa"/>
+            <w:tcBorders>
+              <w:top w:val="single" w:sz="4" w:space="0" w:color="D9DCE2"/>
+              <w:left w:val="single" w:sz="4" w:space="0" w:color="D9DCE2"/>
+              <w:bottom w:val="single" w:sz="4" w:space="0" w:color="D9DCE2"/>
+              <w:right w:val="single" w:sz="4" w:space="0" w:color="D9DCE2"/>
+            </w:tcBorders>
+            <w:tcMar>
+              <w:top w:w="60" w:type="dxa"/>
+              <w:left w:w="100" w:type="dxa"/>
+              <w:bottom w:w="60" w:type="dxa"/>
+              <w:right w:w="100" w:type="dxa"/>
+            </w:tcMar>
+          </w:tcPr>
+          <w:p>
+            <w:r>
+              <w:rPr>
+                <w:sz w:val="19"/>
+                <w:szCs w:val="19"/>
+              </w:rPr>
+              <w:t>72</w:t>
+            </w:r>
+          </w:p>
+        </w:tc>
+        <w:tc>
+          <w:tcPr>
+            <w:tcW w:w="5590" w:type="dxa"/>
+            <w:tcBorders>
+              <w:top w:val="single" w:sz="4" w:space="0" w:color="D9DCE2"/>
+              <w:left w:val="single" w:sz="4" w:space="0" w:color="D9DCE2"/>
+              <w:bottom w:val="single" w:sz="4" w:space="0" w:color="D9DCE2"/>
+              <w:right w:val="single" w:sz="4" w:space="0" w:color="D9DCE2"/>
+            </w:tcBorders>
+            <w:tcMar>
+              <w:top w:w="60" w:type="dxa"/>
+              <w:left w:w="100" w:type="dxa"/>
+              <w:bottom w:w="60" w:type="dxa"/>
+              <w:right w:w="100" w:type="dxa"/>
+            </w:tcMar>
+          </w:tcPr>
+          <w:p>
+            <w:r>
+              <w:rPr>
+                <w:sz w:val="19"/>
+                <w:szCs w:val="19"/>
+              </w:rPr>
+              <w:t>Which colours, how vivid, how bright: the share of the painting in each of the 72 colour boxes.</w:t>
+            </w:r>
+          </w:p>
+        </w:tc>
+      </w:tr>
+      <w:tr>
+        <w:tc>
+          <w:tcPr>
+            <w:tcW w:w="2891" w:type="dxa"/>
+            <w:tcBorders>
+              <w:top w:val="single" w:sz="4" w:space="0" w:color="D9DCE2"/>
+              <w:left w:val="single" w:sz="4" w:space="0" w:color="D9DCE2"/>
+              <w:bottom w:val="single" w:sz="4" w:space="0" w:color="D9DCE2"/>
+              <w:right w:val="single" w:sz="4" w:space="0" w:color="D9DCE2"/>
+            </w:tcBorders>
+            <w:shd w:val="clear" w:color="auto" w:fill="F2F3F5"/>
+            <w:tcMar>
+              <w:top w:w="60" w:type="dxa"/>
+              <w:left w:w="100" w:type="dxa"/>
+              <w:bottom w:w="60" w:type="dxa"/>
+              <w:right w:w="100" w:type="dxa"/>
+            </w:tcMar>
+          </w:tcPr>
+          <w:p>
+            <w:r>
+              <w:rPr>
+                <w:sz w:val="19"/>
+                <w:szCs w:val="19"/>
+              </w:rPr>
+              <w:t>Colour statistics</w:t>
+            </w:r>
+          </w:p>
+        </w:tc>
+        <w:tc>
+          <w:tcPr>
+            <w:tcW w:w="1157" w:type="dxa"/>
+            <w:tcBorders>
+              <w:top w:val="single" w:sz="4" w:space="0" w:color="D9DCE2"/>
+              <w:left w:val="single" w:sz="4" w:space="0" w:color="D9DCE2"/>
+              <w:bottom w:val="single" w:sz="4" w:space="0" w:color="D9DCE2"/>
+              <w:right w:val="single" w:sz="4" w:space="0" w:color="D9DCE2"/>
+            </w:tcBorders>
+            <w:shd w:val="clear" w:color="auto" w:fill="F2F3F5"/>
+            <w:tcMar>
+              <w:top w:w="60" w:type="dxa"/>
+              <w:left w:w="100" w:type="dxa"/>
+              <w:bottom w:w="60" w:type="dxa"/>
+              <w:right w:w="100" w:type="dxa"/>
+            </w:tcMar>
+          </w:tcPr>
+          <w:p>
+            <w:r>
+              <w:rPr>
+                <w:sz w:val="19"/>
+                <w:szCs w:val="19"/>
+              </w:rPr>
+              <w:t>10</w:t>
+            </w:r>
+          </w:p>
+        </w:tc>
+        <w:tc>
+          <w:tcPr>
+            <w:tcW w:w="5590" w:type="dxa"/>
+            <w:tcBorders>
+              <w:top w:val="single" w:sz="4" w:space="0" w:color="D9DCE2"/>
+              <w:left w:val="single" w:sz="4" w:space="0" w:color="D9DCE2"/>
+              <w:bottom w:val="single" w:sz="4" w:space="0" w:color="D9DCE2"/>
+              <w:right w:val="single" w:sz="4" w:space="0" w:color="D9DCE2"/>
+            </w:tcBorders>
+            <w:shd w:val="clear" w:color="auto" w:fill="F2F3F5"/>
+            <w:tcMar>
+              <w:top w:w="60" w:type="dxa"/>
+              <w:left w:w="100" w:type="dxa"/>
+              <w:bottom w:w="60" w:type="dxa"/>
+              <w:right w:w="100" w:type="dxa"/>
+            </w:tcMar>
+          </w:tcPr>
+          <w:p>
+            <w:r>
+              <w:rPr>
+                <w:sz w:val="19"/>
+                <w:szCs w:val="19"/>
+              </w:rPr>
+              <w:t>Mean and spread of red, green, blue, brightness and saturation: dark or light, strong or soft contrast.</w:t>
+            </w:r>
+          </w:p>
+        </w:tc>
+      </w:tr>
+      <w:tr>
+        <w:tc>
+          <w:tcPr>
+            <w:tcW w:w="2891" w:type="dxa"/>
+            <w:tcBorders>
+              <w:top w:val="single" w:sz="4" w:space="0" w:color="D9DCE2"/>
+              <w:left w:val="single" w:sz="4" w:space="0" w:color="D9DCE2"/>
+              <w:bottom w:val="single" w:sz="4" w:space="0" w:color="D9DCE2"/>
+              <w:right w:val="single" w:sz="4" w:space="0" w:color="D9DCE2"/>
+            </w:tcBorders>
+            <w:tcMar>
+              <w:top w:w="60" w:type="dxa"/>
+              <w:left w:w="100" w:type="dxa"/>
+              <w:bottom w:w="60" w:type="dxa"/>
+              <w:right w:w="100" w:type="dxa"/>
+            </w:tcMar>
+          </w:tcPr>
+          <w:p>
+            <w:r>
+              <w:rPr>
+                <w:sz w:val="19"/>
+                <w:szCs w:val="19"/>
+              </w:rPr>
+              <w:t>Edge directions and strength, at full and at half size</w:t>
+            </w:r>
+          </w:p>
+        </w:tc>
+        <w:tc>
+          <w:tcPr>
+            <w:tcW w:w="1157" w:type="dxa"/>
+            <w:tcBorders>
+              <w:top w:val="single" w:sz="4" w:space="0" w:color="D9DCE2"/>
+              <w:left w:val="single" w:sz="4" w:space="0" w:color="D9DCE2"/>
+              <w:bottom w:val="single" w:sz="4" w:space="0" w:color="D9DCE2"/>
+              <w:right w:val="single" w:sz="4" w:space="0" w:color="D9DCE2"/>
+            </w:tcBorders>
+            <w:tcMar>
+              <w:top w:w="60" w:type="dxa"/>
+              <w:left w:w="100" w:type="dxa"/>
+              <w:bottom w:w="60" w:type="dxa"/>
+              <w:right w:w="100" w:type="dxa"/>
+            </w:tcMar>
+          </w:tcPr>
+          <w:p>
+            <w:r>
+              <w:rPr>
+                <w:sz w:val="19"/>
+                <w:szCs w:val="19"/>
+              </w:rPr>
+              <w:t>20</w:t>
+            </w:r>
+          </w:p>
+        </w:tc>
+        <w:tc>
+          <w:tcPr>
+            <w:tcW w:w="5590" w:type="dxa"/>
+            <w:tcBorders>
+              <w:top w:val="single" w:sz="4" w:space="0" w:color="D9DCE2"/>
+              <w:left w:val="single" w:sz="4" w:space="0" w:color="D9DCE2"/>
+              <w:bottom w:val="single" w:sz="4" w:space="0" w:color="D9DCE2"/>
+              <w:right w:val="single" w:sz="4" w:space="0" w:color="D9DCE2"/>
+            </w:tcBorders>
+            <w:tcMar>
+              <w:top w:w="60" w:type="dxa"/>
+              <w:left w:w="100" w:type="dxa"/>
+              <w:bottom w:w="60" w:type="dxa"/>
+              <w:right w:w="100" w:type="dxa"/>
+            </w:tcMar>
+          </w:tcPr>
+          <w:p>
+            <w:r>
+              <w:rPr>
+                <w:sz w:val="19"/>
+                <w:szCs w:val="19"/>
+              </w:rPr>
+              <w:t>For each size: how much of the edges go in each of 8 directions, the mean edge strength and the share of strong edges. It describes brush strokes and shapes: many straight edges, or small strokes in all directions.</w:t>
+            </w:r>
+          </w:p>
+        </w:tc>
+      </w:tr>
+    </w:tbl>
+    <w:p>
+      <w:pPr>
+        <w:spacing w:after="120"/>
+      </w:pPr>
+    </w:p>
+    <w:p>
+      <w:pPr>
+        <w:spacing w:after="120"/>
+      </w:pPr>
+      <w:r>
+        <w:t xml:space="preserve">These numbers do not depend on </w:t>
+      </w:r>
+      <w:r>
+        <w:rPr>
+          <w:b/>
+          <w:bCs/>
+        </w:rPr>
+        <w:t>where</w:t>
+      </w:r>
+      <w:r>
+        <w:t xml:space="preserve"> things are in the painting. That is why a classical model can use them, and not the raw pixels.</w:t>
+      </w:r>
+    </w:p>
+    <w:p>
+      <w:pPr>
+        <w:pStyle w:val="Titre2"/>
+      </w:pPr>
+      <w:bookmarkStart w:id="51" w:name="_Toc243482202"/>
+      <w:r>
+        <w:t>Our settings, chosen on validation</w:t>
+      </w:r>
+      <w:bookmarkEnd w:id="51"/>
+    </w:p>
+    <w:p>
+      <w:pPr>
+        <w:pStyle w:val="Paragraphedeliste"/>
+        <w:numPr>
+          <w:ilvl w:val="0"/>
+          <w:numId w:val="3"/>
+        </w:numPr>
+        <w:spacing w:after="80"/>
+      </w:pPr>
+      <w:r>
+        <w:rPr>
+          <w:b/>
+          <w:bCs/>
+        </w:rPr>
+        <w:t>500 trees</w:t>
+      </w:r>
+      <w:r>
+        <w:t xml:space="preserve"> (</w:t>
+      </w:r>
+      <w:r>
+        <w:rPr>
+          <w:rFonts w:ascii="Consolas" w:eastAsia="Consolas" w:hAnsi="Consolas" w:cs="Consolas"/>
+          <w:sz w:val="19"/>
+          <w:szCs w:val="19"/>
+        </w:rPr>
+        <w:t>n_estimators=500</w:t>
+      </w:r>
+      <w:r>
+        <w:t>): more trees never hurt the accuracy, they only make the model slower.</w:t>
+      </w:r>
+    </w:p>
+    <w:p>
+      <w:pPr>
+        <w:pStyle w:val="Paragraphedeliste"/>
+        <w:numPr>
+          <w:ilvl w:val="0"/>
+          <w:numId w:val="3"/>
+        </w:numPr>
+        <w:spacing w:after="80"/>
+      </w:pPr>
+      <w:r>
+        <w:t xml:space="preserve">We tried </w:t>
+      </w:r>
+      <w:r>
+        <w:rPr>
+          <w:b/>
+          <w:bCs/>
+        </w:rPr>
+        <w:t>4 settings</w:t>
+      </w:r>
+      <w:r>
+        <w:t xml:space="preserve"> on validation: leaves of at least 1 or 3 paintings (</w:t>
+      </w:r>
+      <w:r>
+        <w:rPr>
+          <w:rFonts w:ascii="Consolas" w:eastAsia="Consolas" w:hAnsi="Consolas" w:cs="Consolas"/>
+          <w:sz w:val="19"/>
+          <w:szCs w:val="19"/>
+        </w:rPr>
+        <w:t>min_samples_leaf</w:t>
+      </w:r>
+      <w:r>
+        <w:t>), and 10 of the 102 numbers (</w:t>
+      </w:r>
+      <w:r>
+        <w:rPr>
+          <w:rFonts w:ascii="Consolas" w:eastAsia="Consolas" w:hAnsi="Consolas" w:cs="Consolas"/>
+          <w:sz w:val="19"/>
+          <w:szCs w:val="19"/>
+        </w:rPr>
+        <w:t>sqrt</w:t>
+      </w:r>
+      <w:r>
+        <w:t>) or 30 % of them at each question (</w:t>
+      </w:r>
+      <w:r>
+        <w:rPr>
+          <w:rFonts w:ascii="Consolas" w:eastAsia="Consolas" w:hAnsi="Consolas" w:cs="Consolas"/>
+          <w:sz w:val="19"/>
+          <w:szCs w:val="19"/>
+        </w:rPr>
+        <w:t>max_features</w:t>
+      </w:r>
+      <w:r>
+        <w:t xml:space="preserve">). Best: 1 painting and </w:t>
+      </w:r>
+      <w:r>
+        <w:rPr>
+          <w:rFonts w:ascii="Consolas" w:eastAsia="Consolas" w:hAnsi="Consolas" w:cs="Consolas"/>
+          <w:sz w:val="19"/>
+          <w:szCs w:val="19"/>
+        </w:rPr>
+        <w:t>sqrt</w:t>
+      </w:r>
+      <w:r>
+        <w:t xml:space="preserve">, </w:t>
+      </w:r>
+      <w:r>
+        <w:rPr>
+          <w:b/>
+          <w:bCs/>
+        </w:rPr>
+        <w:t>63.5 %</w:t>
+      </w:r>
+      <w:r>
+        <w:t>; the 3 others scored 60.7 to 61.2 %.</w:t>
+      </w:r>
+    </w:p>
+    <w:p>
+      <w:pPr>
+        <w:pStyle w:val="Paragraphedeliste"/>
+        <w:numPr>
+          <w:ilvl w:val="0"/>
+          <w:numId w:val="3"/>
+        </w:numPr>
+        <w:spacing w:after="80"/>
+      </w:pPr>
+      <w:r>
+        <w:rPr>
+          <w:b/>
+          <w:bCs/>
+        </w:rPr>
+        <w:t>Same rules as every model</w:t>
+      </w:r>
+      <w:r>
+        <w:t>: trained on the 1 061 training paintings, settings chosen on the 219 validation paintings, tested once on the 220 test paintings.</w:t>
+      </w:r>
+    </w:p>
+    <w:p>
+      <w:pPr>
+        <w:pStyle w:val="Paragraphedeliste"/>
+        <w:numPr>
+          <w:ilvl w:val="0"/>
+          <w:numId w:val="3"/>
+        </w:numPr>
+        <w:spacing w:after="80"/>
+      </w:pPr>
+      <w:r>
+        <w:rPr>
+          <w:b/>
+          <w:bCs/>
+        </w:rPr>
+        <w:t>Cost</w:t>
+      </w:r>
+      <w:r>
+        <w:t xml:space="preserve">: 1 s of training, </w:t>
+      </w:r>
+      <w:r>
+        <w:rPr>
+          <w:b/>
+          <w:bCs/>
+        </w:rPr>
+        <w:t>24 ms per photo</w:t>
+      </w:r>
+      <w:r>
+        <w:t xml:space="preserve"> on one CPU thread (computing the 102 numbers included), a 26 MB file.</w:t>
+      </w:r>
+    </w:p>
+    <w:p>
+      <w:pPr>
+        <w:pStyle w:val="Titre2"/>
+      </w:pPr>
+      <w:bookmarkStart w:id="52" w:name="_Toc243482203"/>
+      <w:r>
+        <w:t>Questions on the random forest, with answers</w:t>
+      </w:r>
+      <w:bookmarkEnd w:id="52"/>
+    </w:p>
+    <w:p>
+      <w:pPr>
+        <w:keepNext/>
+        <w:spacing w:before="120" w:after="40"/>
+      </w:pPr>
+      <w:r>
+        <w:rPr>
+          <w:b/>
+          <w:bCs/>
+          <w:color w:val="1C2433"/>
+        </w:rPr>
+        <w:t>What is a random forest?</w:t>
+      </w:r>
+    </w:p>
+    <w:p>
+      <w:pPr>
+        <w:spacing w:after="120"/>
+      </w:pPr>
+      <w:r>
+        <w:t>Many decision trees, 500 here. Each one is trained on a random draw of the training paintings and, at each question, looks at a random subset of the numbers. To predict, the trees vote (scikit-learn averages their probabilities).</w:t>
+      </w:r>
+    </w:p>
+    <w:p>
+      <w:pPr>
+        <w:keepNext/>
+        <w:spacing w:before="120" w:after="40"/>
+      </w:pPr>
+      <w:r>
+        <w:rPr>
+          <w:b/>
+          <w:bCs/>
+          <w:color w:val="1C2433"/>
+        </w:rPr>
+        <w:lastRenderedPageBreak/>
+        <w:t>What is a decision tree?</w:t>
+      </w:r>
+    </w:p>
+    <w:p>
+      <w:pPr>
+        <w:spacing w:after="120"/>
+      </w:pPr>
+      <w:r>
+        <w:t>A chain of yes/no questions on the numbers, such as "is the share of strong edges above 0.3?". Each answer sends the painting left or right, until a leaf that names a style. Training picks the questions that best separate the styles of the training paintings.</w:t>
+      </w:r>
+    </w:p>
+    <w:p>
+      <w:pPr>
+        <w:keepNext/>
+        <w:spacing w:before="120" w:after="40"/>
+      </w:pPr>
+      <w:r>
+        <w:rPr>
+          <w:b/>
+          <w:bCs/>
+          <w:color w:val="1C2433"/>
+        </w:rPr>
+        <w:t>Why 500 trees and not one?</w:t>
+      </w:r>
+    </w:p>
+    <w:p>
+      <w:pPr>
+        <w:spacing w:after="120"/>
+      </w:pPr>
+      <w:r>
+        <w:t>One deep tree learns the training paintings by heart and changes a lot when the data changes a little. Trees trained on different draws make different mistakes, and the vote averages them out: much less overfitting.</w:t>
+      </w:r>
+    </w:p>
+    <w:p>
+      <w:pPr>
+        <w:keepNext/>
+        <w:spacing w:before="120" w:after="40"/>
+      </w:pPr>
+      <w:r>
+        <w:rPr>
+          <w:b/>
+          <w:bCs/>
+          <w:color w:val="1C2433"/>
+        </w:rPr>
+        <w:t>With leaves of 1 painting, does it not overfit?</w:t>
+      </w:r>
+    </w:p>
+    <w:p>
+      <w:pPr>
+        <w:spacing w:after="120"/>
+      </w:pPr>
+      <w:r>
+        <w:t>Each tree does, but the randomness and the vote of 500 trees fix it. And validation chose this setting: leaves of 3 paintings scored lower (60.7 %).</w:t>
+      </w:r>
+    </w:p>
+    <w:p>
+      <w:pPr>
+        <w:keepNext/>
+        <w:spacing w:before="120" w:after="40"/>
+      </w:pPr>
+      <w:r>
+        <w:rPr>
+          <w:b/>
+          <w:bCs/>
+          <w:color w:val="1C2433"/>
+        </w:rPr>
+        <w:t>Why hand-made numbers and not the pixels?</w:t>
+      </w:r>
+    </w:p>
+    <w:p>
+      <w:pPr>
+        <w:spacing w:after="120"/>
+      </w:pPr>
+      <w:r>
+        <w:t>A question on one pixel means nothing: move the painting by a few pixels and the answer changes. Our 102 numbers describe colours and brush strokes wherever they are. The same logistic regression gets 32.7 % on pixels and 61.4 % on our numbers (test).</w:t>
+      </w:r>
+    </w:p>
+    <w:p>
+      <w:pPr>
+        <w:keepNext/>
+        <w:spacing w:before="120" w:after="40"/>
+      </w:pPr>
+      <w:r>
+        <w:rPr>
+          <w:b/>
+          <w:bCs/>
+          <w:color w:val="1C2433"/>
+        </w:rPr>
+        <w:t>Why is the random forest better than your MLP (67 % against 41 %)?</w:t>
+      </w:r>
+    </w:p>
+    <w:p>
+      <w:pPr>
+        <w:spacing w:after="120"/>
+      </w:pPr>
+      <w:r>
+        <w:t>Because a human already did part of the work: the checklist summarises colour and texture, so the model only combines 102 good numbers. Our MLP had to discover everything from 12 288 pixels with only 1 061 paintings. Paired gap: +26.4 points (interval 19.5 to 33.2).</w:t>
+      </w:r>
+    </w:p>
+    <w:p>
+      <w:pPr>
+        <w:keepNext/>
+        <w:spacing w:before="120" w:after="40"/>
+      </w:pPr>
+      <w:r>
+        <w:rPr>
+          <w:b/>
+          <w:bCs/>
+          <w:color w:val="1C2433"/>
+        </w:rPr>
+        <w:t>Why is it better than the logistic regression?</w:t>
+      </w:r>
+    </w:p>
+    <w:p>
+      <w:pPr>
+        <w:spacing w:after="120"/>
+      </w:pPr>
+      <w:r>
+        <w:t>A logistic regression adds up the numbers: each one pushes towards or away from a style. Trees can combine them, like "dark AND few strong edges". Validation: 63.5 % against 61.2 %; test: 67.3 % against 61.4 %.</w:t>
+      </w:r>
+    </w:p>
+    <w:p>
+      <w:pPr>
+        <w:keepNext/>
+        <w:spacing w:before="120" w:after="40"/>
+      </w:pPr>
+      <w:r>
+        <w:rPr>
+          <w:b/>
+          <w:bCs/>
+          <w:color w:val="1C2433"/>
+        </w:rPr>
+        <w:t>Why not a stronger classical model, like gradient boosting or an SVM?</w:t>
+      </w:r>
+    </w:p>
+    <w:p>
+      <w:pPr>
+        <w:spacing w:after="120"/>
+      </w:pPr>
+      <w:r>
+        <w:t>We kept the most standard one, which needs little tuning, and we admit we did not test the others. But our results show that the numbers matter more than the model on top: the same logistic regression goes from 61.4 % on our hand-made numbers to 84.5 % on the ResNet features. A better classical model on the same checklist would still lack what the ResNet sees.</w:t>
+      </w:r>
+    </w:p>
+    <w:p>
+      <w:pPr>
+        <w:keepNext/>
+        <w:spacing w:before="120" w:after="40"/>
+      </w:pPr>
+      <w:r>
+        <w:rPr>
+          <w:b/>
+          <w:bCs/>
+          <w:color w:val="1C2433"/>
+        </w:rPr>
+        <w:t>Is the comparison fair to the random forest?</w:t>
+      </w:r>
+    </w:p>
+    <w:p>
+      <w:pPr>
+        <w:spacing w:after="120"/>
+      </w:pPr>
+      <w:r>
+        <w:t>Yes: same paintings, same split by painter, settings chosen on validation like every model, test used once, and the paired bootstrap compares the two models on exactly the same 220 paintings.</w:t>
+      </w:r>
+    </w:p>
+    <w:p>
+      <w:pPr>
+        <w:keepNext/>
+        <w:spacing w:before="120" w:after="40"/>
+      </w:pPr>
+      <w:r>
+        <w:rPr>
+          <w:b/>
+          <w:bCs/>
+          <w:color w:val="1C2433"/>
+        </w:rPr>
+        <w:t>The random forest is faster (24 ms against 53 ms). Why not use it on the kiosk?</w:t>
+      </w:r>
+    </w:p>
+    <w:p>
+      <w:pPr>
+        <w:spacing w:after="120"/>
+      </w:pPr>
+      <w:r>
+        <w:t>Both are fast enough for a kiosk. But the random forest gets the style wrong for one visitor in three, the ResNet for one in six. For a similar cost, the ResNet is much more accurate.</w:t>
+      </w:r>
+    </w:p>
+    <w:p>
+      <w:pPr>
+        <w:keepNext/>
+        <w:spacing w:before="120" w:after="40"/>
+      </w:pPr>
+      <w:r>
+        <w:rPr>
+          <w:b/>
+          <w:bCs/>
+          <w:color w:val="1C2433"/>
+        </w:rPr>
+        <w:t>Which of the 102 numbers matter most?</w:t>
+      </w:r>
+    </w:p>
+    <w:p>
+      <w:pPr>
+        <w:spacing w:after="120"/>
+      </w:pPr>
+      <w:r>
+        <w:t>We did not measure it. Scikit-learn gives an importance per number (</w:t>
+      </w:r>
+      <w:r>
+        <w:rPr>
+          <w:rFonts w:ascii="Consolas" w:eastAsia="Consolas" w:hAnsi="Consolas" w:cs="Consolas"/>
+          <w:sz w:val="19"/>
+          <w:szCs w:val="19"/>
+        </w:rPr>
+        <w:t>feature_importances_</w:t>
+      </w:r>
+      <w:r>
+        <w:t>): it is an easy next step.</w:t>
+      </w:r>
+    </w:p>
+    <w:p>
+      <w:pPr>
+        <w:pStyle w:val="Titre1"/>
+        <w:pageBreakBefore/>
+      </w:pPr>
+      <w:bookmarkStart w:id="53" w:name="_Toc243482204"/>
+      <w:r>
+        <w:lastRenderedPageBreak/>
+        <w:t>10. Bonus: what about transformers like BERT? (notebook 07)</w:t>
+      </w:r>
+      <w:bookmarkEnd w:id="53"/>
     </w:p>
     <w:tbl>
       <w:tblPr>
@@ -12334,7 +13588,7 @@
         </w:rPr>
         <w:lastRenderedPageBreak/>
         <w:drawing>
-          <wp:inline distT="0" distB="0" distL="0" distR="0" wp14:anchorId="6B2EA674" wp14:editId="6B2EA675">
+          <wp:inline distT="0" distB="0" distL="0" distR="0" wp14:anchorId="72638159" wp14:editId="7263815A">
             <wp:extent cx="4381500" cy="2486025"/>
             <wp:effectExtent l="0" t="0" r="0" b="0"/>
             <wp:docPr id="6" name="07_transformers_accuracy_vs_speed.png" descr="Transformers on validation: CLIP is more accurate, but slower." title="Transformers on validation: CLIP is more accurate, but slower."/>
@@ -12394,12 +13648,12 @@
         <w:pStyle w:val="Titre1"/>
         <w:pageBreakBefore/>
       </w:pPr>
-      <w:bookmarkStart w:id="50" w:name="_Toc243481342"/>
+      <w:bookmarkStart w:id="54" w:name="_Toc243482205"/>
       <w:r>
         <w:lastRenderedPageBreak/>
-        <w:t>10. Key numbers to know by heart</w:t>
-      </w:r>
-      <w:bookmarkEnd w:id="50"/>
+        <w:t>11. Key numbers to know by heart</w:t>
+      </w:r>
+      <w:bookmarkEnd w:id="54"/>
     </w:p>
     <w:tbl>
       <w:tblPr>
@@ -13652,12 +14906,12 @@
         <w:pStyle w:val="Titre1"/>
         <w:pageBreakBefore/>
       </w:pPr>
-      <w:bookmarkStart w:id="51" w:name="_Toc243481343"/>
+      <w:bookmarkStart w:id="55" w:name="_Toc243482206"/>
       <w:r>
         <w:lastRenderedPageBreak/>
-        <w:t>11. Concepts in simple words</w:t>
-      </w:r>
-      <w:bookmarkEnd w:id="51"/>
+        <w:t>12. Concepts in simple words</w:t>
+      </w:r>
+      <w:bookmarkEnd w:id="55"/>
     </w:p>
     <w:tbl>
       <w:tblPr>
@@ -15843,12 +17097,12 @@
         <w:pStyle w:val="Titre1"/>
         <w:pageBreakBefore/>
       </w:pPr>
-      <w:bookmarkStart w:id="52" w:name="_Toc243481344"/>
+      <w:bookmarkStart w:id="56" w:name="_Toc243482207"/>
       <w:r>
         <w:lastRenderedPageBreak/>
-        <w:t>12. Questions you may get, with answers</w:t>
-      </w:r>
-      <w:bookmarkEnd w:id="52"/>
+        <w:t>13. Questions you may get, with answers</w:t>
+      </w:r>
+      <w:bookmarkEnd w:id="56"/>
     </w:p>
     <w:p>
       <w:pPr>
@@ -15865,11 +17119,11 @@
       <w:pPr>
         <w:pStyle w:val="Titre2"/>
       </w:pPr>
-      <w:bookmarkStart w:id="53" w:name="_Toc243481345"/>
+      <w:bookmarkStart w:id="57" w:name="_Toc243482208"/>
       <w:r>
         <w:t>About the data</w:t>
       </w:r>
-      <w:bookmarkEnd w:id="53"/>
+      <w:bookmarkEnd w:id="57"/>
     </w:p>
     <w:p>
       <w:pPr>
@@ -15985,11 +17239,11 @@
       <w:pPr>
         <w:pStyle w:val="Titre2"/>
       </w:pPr>
-      <w:bookmarkStart w:id="54" w:name="_Toc243481346"/>
+      <w:bookmarkStart w:id="58" w:name="_Toc243482209"/>
       <w:r>
         <w:t>About the MLP</w:t>
       </w:r>
-      <w:bookmarkEnd w:id="54"/>
+      <w:bookmarkEnd w:id="58"/>
     </w:p>
     <w:p>
       <w:pPr>
@@ -16105,11 +17359,11 @@
       <w:pPr>
         <w:pStyle w:val="Titre2"/>
       </w:pPr>
-      <w:bookmarkStart w:id="55" w:name="_Toc243481347"/>
+      <w:bookmarkStart w:id="59" w:name="_Toc243482210"/>
       <w:r>
         <w:t>About training and diagnosis</w:t>
       </w:r>
-      <w:bookmarkEnd w:id="55"/>
+      <w:bookmarkEnd w:id="59"/>
     </w:p>
     <w:p>
       <w:pPr>
@@ -16203,12 +17457,12 @@
       <w:pPr>
         <w:pStyle w:val="Titre2"/>
       </w:pPr>
-      <w:bookmarkStart w:id="56" w:name="_Toc243481348"/>
+      <w:bookmarkStart w:id="60" w:name="_Toc243482211"/>
       <w:r>
         <w:lastRenderedPageBreak/>
         <w:t>About ResNet</w:t>
       </w:r>
-      <w:bookmarkEnd w:id="56"/>
+      <w:bookmarkEnd w:id="60"/>
     </w:p>
     <w:p>
       <w:pPr>
@@ -16346,11 +17600,11 @@
       <w:pPr>
         <w:pStyle w:val="Titre2"/>
       </w:pPr>
-      <w:bookmarkStart w:id="57" w:name="_Toc243481349"/>
+      <w:bookmarkStart w:id="61" w:name="_Toc243482212"/>
       <w:r>
         <w:t>About the results and the recommendation</w:t>
       </w:r>
-      <w:bookmarkEnd w:id="57"/>
+      <w:bookmarkEnd w:id="61"/>
     </w:p>
     <w:p>
       <w:pPr>
@@ -16488,12 +17742,12 @@
       <w:pPr>
         <w:pStyle w:val="Titre2"/>
       </w:pPr>
-      <w:bookmarkStart w:id="58" w:name="_Toc243481350"/>
+      <w:bookmarkStart w:id="62" w:name="_Toc243482213"/>
       <w:r>
         <w:lastRenderedPageBreak/>
         <w:t>About the project</w:t>
       </w:r>
-      <w:bookmarkEnd w:id="58"/>
+      <w:bookmarkEnd w:id="62"/>
     </w:p>
     <w:p>
       <w:pPr>
@@ -16544,12 +17798,12 @@
         <w:pStyle w:val="Titre1"/>
         <w:pageBreakBefore/>
       </w:pPr>
-      <w:bookmarkStart w:id="59" w:name="_Toc243481351"/>
+      <w:bookmarkStart w:id="63" w:name="_Toc243482214"/>
       <w:r>
         <w:lastRenderedPageBreak/>
-        <w:t>13. Limits to admit, and next steps</w:t>
-      </w:r>
-      <w:bookmarkEnd w:id="59"/>
+        <w:t>14. Limits to admit, and next steps</w:t>
+      </w:r>
+      <w:bookmarkEnd w:id="63"/>
     </w:p>
     <w:p>
       <w:pPr>
@@ -17338,12 +18592,12 @@
         <w:pStyle w:val="Titre1"/>
         <w:pageBreakBefore/>
       </w:pPr>
-      <w:bookmarkStart w:id="60" w:name="_Toc243481352"/>
+      <w:bookmarkStart w:id="64" w:name="_Toc243482215"/>
       <w:r>
         <w:lastRenderedPageBreak/>
-        <w:t>14. Git history and how to reproduce</w:t>
-      </w:r>
-      <w:bookmarkEnd w:id="60"/>
+        <w:t>15. Git history and how to reproduce</w:t>
+      </w:r>
+      <w:bookmarkEnd w:id="64"/>
     </w:p>
     <w:p>
       <w:pPr>
@@ -18294,12 +19548,12 @@
         <w:pStyle w:val="Titre1"/>
         <w:pageBreakBefore/>
       </w:pPr>
-      <w:bookmarkStart w:id="61" w:name="_Toc243481353"/>
+      <w:bookmarkStart w:id="65" w:name="_Toc243482216"/>
       <w:r>
         <w:lastRenderedPageBreak/>
-        <w:t>15. The 10-minute talk, slide by slide</w:t>
-      </w:r>
-      <w:bookmarkEnd w:id="61"/>
+        <w:t>16. The 10-minute talk, slide by slide</w:t>
+      </w:r>
+      <w:bookmarkEnd w:id="65"/>
     </w:p>
     <w:p>
       <w:pPr>
@@ -18309,7 +19563,7 @@
         <w:rPr>
           <w:color w:val="1C2433"/>
         </w:rPr>
-        <w:t>The talk follows the project step by step and gives the answer only at the end. 10 slides, about 55 seconds each: about 9:05 in total, the rest of the 10 minutes is a margin. The speaker notes in the .pptx and oral_script.pdf hold the full text in simple English.</w:t>
+        <w:t>The talk follows the project step by step and gives the answer only at the end. 10 slides, about 55 seconds each: about 9:30 in total, the rest of the 10 minutes is a margin. The speaker notes in the .pptx and oral_script.pdf hold the full text in simple English.</w:t>
       </w:r>
     </w:p>
     <w:tbl>
@@ -19179,7 +20433,7 @@
                 <w:sz w:val="19"/>
                 <w:szCs w:val="19"/>
               </w:rPr>
-              <w:t>0:50</w:t>
+              <w:t>0:55</w:t>
             </w:r>
           </w:p>
         </w:tc>
@@ -19288,7 +20542,7 @@
                 <w:sz w:val="19"/>
                 <w:szCs w:val="19"/>
               </w:rPr>
-              <w:t>1:05</w:t>
+              <w:t>1:25</w:t>
             </w:r>
           </w:p>
         </w:tc>
@@ -19315,7 +20569,7 @@
                 <w:sz w:val="19"/>
                 <w:szCs w:val="19"/>
               </w:rPr>
-              <w:t>+16.4 points over the random forest, interval 9.1 to 24.1.</w:t>
+              <w:t>The classical challenger: 102 hand-made numbers + random forest, 67 %. ResNet +16.4 points (9.1 to 24.1).</w:t>
             </w:r>
           </w:p>
         </w:tc>
@@ -19546,11 +20800,11 @@
       <w:pPr>
         <w:pStyle w:val="Titre2"/>
       </w:pPr>
-      <w:bookmarkStart w:id="62" w:name="_Toc243481354"/>
+      <w:bookmarkStart w:id="66" w:name="_Toc243482217"/>
       <w:r>
         <w:t>The thread: each result opens the next step</w:t>
       </w:r>
-      <w:bookmarkEnd w:id="62"/>
+      <w:bookmarkEnd w:id="66"/>
     </w:p>
     <w:p>
       <w:pPr>
@@ -19697,7 +20951,7 @@
         <w:t>Slide 7 to 8</w:t>
       </w:r>
       <w:r>
-        <w:t>: We saw that our split stops this cheating: we can trust our test. So now, step five: the final test of every model.</w:t>
+        <w:t>: We saw that our split stops this cheating: we can trust our test. But to answer the director, we also need a challenger without any neural network. So now, step five: the final test of every model.</w:t>
       </w:r>
     </w:p>
     <w:p>
@@ -19746,7 +21000,7 @@
       </w:pPr>
       <w:r>
         <w:lastRenderedPageBreak/>
-        <w:t>Slides 11 to 16 are backups for the questions: validation vs test, why you can trust the numbers, the training recipes, the four broken runs of notebook 04, where the chosen model fails, and what about transformers (BERT, ViT, CLIP). The word-for-word script is in oral_script.pdf.</w:t>
+        <w:t>Slides 11 to 17 are backups for the questions: the random forest, validation vs test, why you can trust the numbers, the training recipes, the four broken runs of notebook 04, where the chosen model fails, and what about transformers (BERT, ViT, CLIP). The word-for-word script is in oral_script.pdf.</w:t>
       </w:r>
     </w:p>
     <w:sectPr>
@@ -19860,10 +21114,10 @@
 <file path=word/numbering.xml><?xml version="1.0" encoding="utf-8"?>
 <w:numbering xmlns:wpc="http://schemas.microsoft.com/office/word/2010/wordprocessingCanvas" xmlns:cx="http://schemas.microsoft.com/office/drawing/2014/chartex" xmlns:cx1="http://schemas.microsoft.com/office/drawing/2015/9/8/chartex" xmlns:cx2="http://schemas.microsoft.com/office/drawing/2015/10/21/chartex" xmlns:cx3="http://schemas.microsoft.com/office/drawing/2016/5/9/chartex" xmlns:cx4="http://schemas.microsoft.com/office/drawing/2016/5/10/chartex" xmlns:cx5="http://schemas.microsoft.com/office/drawing/2016/5/11/chartex" xmlns:cx6="http://schemas.microsoft.com/office/drawing/2016/5/12/chartex" xmlns:cx7="http://schemas.microsoft.com/office/drawing/2016/5/13/chartex" xmlns:cx8="http://schemas.microsoft.com/office/drawing/2016/5/14/chartex" xmlns:mc="http://schemas.openxmlformats.org/markup-compatibility/2006" xmlns:aink="http://schemas.microsoft.com/office/drawing/2016/ink" xmlns:am3d="http://schemas.microsoft.com/office/drawing/2017/model3d" xmlns:o="urn:schemas-microsoft-com:office:office" xmlns:oel="http://schemas.microsoft.com/office/2019/extlst" xmlns:r="http://schemas.openxmlformats.org/officeDocument/2006/relationships" xmlns:m="http://schemas.openxmlformats.org/officeDocument/2006/math" xmlns:v="urn:schemas-microsoft-com:vml" xmlns:wp14="http://schemas.microsoft.com/office/word/2010/wordprocessingDrawing" xmlns:wp="http://schemas.openxmlformats.org/drawingml/2006/wordprocessingDrawing" xmlns:w10="urn:schemas-microsoft-com:office:word" xmlns:w="http://schemas.openxmlformats.org/wordprocessingml/2006/main" xmlns:w14="http://schemas.microsoft.com/office/word/2010/wordml" xmlns:w15="http://schemas.microsoft.com/office/word/2012/wordml" xmlns:w16cex="http://schemas.microsoft.com/office/word/2018/wordml/cex" xmlns:w16cid="http://schemas.microsoft.com/office/word/2016/wordml/cid" xmlns:w16="http://schemas.microsoft.com/office/word/2018/wordml" xmlns:w16du="http://schemas.microsoft.com/office/word/2023/wordml/word16du" xmlns:w16sdtdh="http://schemas.microsoft.com/office/word/2020/wordml/sdtdatahash" xmlns:w16sdtfl="http://schemas.microsoft.com/office/word/2024/wordml/sdtformatlock" xmlns:w16se="http://schemas.microsoft.com/office/word/2015/wordml/symex" xmlns:wpg="http://schemas.microsoft.com/office/word/2010/wordprocessingGroup" xmlns:wpi="http://schemas.microsoft.com/office/word/2010/wordprocessingInk" xmlns:wne="http://schemas.microsoft.com/office/word/2006/wordml" xmlns:wps="http://schemas.microsoft.com/office/word/2010/wordprocessingShape" mc:Ignorable="w14 w15 w16se w16cid w16 w16cex w16sdtdh w16sdtfl w16du wp14">
   <w:abstractNum w:abstractNumId="0" w15:restartNumberingAfterBreak="0">
-    <w:nsid w:val="0E2026D7"/>
+    <w:nsid w:val="16BC4F0B"/>
     <w:multiLevelType w:val="hybridMultilevel"/>
-    <w:tmpl w:val="5B6213CE"/>
-    <w:lvl w:ilvl="0" w:tplc="279ABD66">
+    <w:tmpl w:val="52086782"/>
+    <w:lvl w:ilvl="0" w:tplc="3DBA5588">
       <w:start w:val="1"/>
       <w:numFmt w:val="decimal"/>
       <w:lvlText w:val="%1."/>
@@ -19872,52 +21126,52 @@
         <w:ind w:left="400" w:hanging="300"/>
       </w:pPr>
     </w:lvl>
-    <w:lvl w:ilvl="1" w:tplc="9CF262D8">
+    <w:lvl w:ilvl="1" w:tplc="AFA25B8C">
       <w:numFmt w:val="decimal"/>
       <w:lvlText w:val=""/>
       <w:lvlJc w:val="left"/>
     </w:lvl>
-    <w:lvl w:ilvl="2" w:tplc="8BD026EA">
+    <w:lvl w:ilvl="2" w:tplc="A2DEB71C">
       <w:numFmt w:val="decimal"/>
       <w:lvlText w:val=""/>
       <w:lvlJc w:val="left"/>
     </w:lvl>
-    <w:lvl w:ilvl="3" w:tplc="5A6AFCC4">
+    <w:lvl w:ilvl="3" w:tplc="33C8FA78">
       <w:numFmt w:val="decimal"/>
       <w:lvlText w:val=""/>
       <w:lvlJc w:val="left"/>
     </w:lvl>
-    <w:lvl w:ilvl="4" w:tplc="9898AB6A">
+    <w:lvl w:ilvl="4" w:tplc="5EA2CE2A">
       <w:numFmt w:val="decimal"/>
       <w:lvlText w:val=""/>
       <w:lvlJc w:val="left"/>
     </w:lvl>
-    <w:lvl w:ilvl="5" w:tplc="7988D80A">
+    <w:lvl w:ilvl="5" w:tplc="BB821D5C">
       <w:numFmt w:val="decimal"/>
       <w:lvlText w:val=""/>
       <w:lvlJc w:val="left"/>
     </w:lvl>
-    <w:lvl w:ilvl="6" w:tplc="A7BAF60C">
+    <w:lvl w:ilvl="6" w:tplc="B9B60B88">
       <w:numFmt w:val="decimal"/>
       <w:lvlText w:val=""/>
       <w:lvlJc w:val="left"/>
     </w:lvl>
-    <w:lvl w:ilvl="7" w:tplc="C992A242">
+    <w:lvl w:ilvl="7" w:tplc="D6EC977C">
       <w:numFmt w:val="decimal"/>
       <w:lvlText w:val=""/>
       <w:lvlJc w:val="left"/>
     </w:lvl>
-    <w:lvl w:ilvl="8" w:tplc="4EA2F2B8">
+    <w:lvl w:ilvl="8" w:tplc="F9BC4948">
       <w:numFmt w:val="decimal"/>
       <w:lvlText w:val=""/>
       <w:lvlJc w:val="left"/>
     </w:lvl>
   </w:abstractNum>
   <w:abstractNum w:abstractNumId="1" w15:restartNumberingAfterBreak="0">
-    <w:nsid w:val="0F9B59E6"/>
+    <w:nsid w:val="31112937"/>
     <w:multiLevelType w:val="hybridMultilevel"/>
-    <w:tmpl w:val="3B78FD66"/>
-    <w:lvl w:ilvl="0" w:tplc="F11C5E7E">
+    <w:tmpl w:val="AF2494C4"/>
+    <w:lvl w:ilvl="0" w:tplc="C29C599C">
       <w:start w:val="1"/>
       <w:numFmt w:val="bullet"/>
       <w:lvlText w:val="•"/>
@@ -19926,52 +21180,52 @@
         <w:ind w:left="400" w:hanging="260"/>
       </w:pPr>
     </w:lvl>
-    <w:lvl w:ilvl="1" w:tplc="718C772C">
+    <w:lvl w:ilvl="1" w:tplc="1E4A5B0A">
       <w:numFmt w:val="decimal"/>
       <w:lvlText w:val=""/>
       <w:lvlJc w:val="left"/>
     </w:lvl>
-    <w:lvl w:ilvl="2" w:tplc="5CEC1D9E">
+    <w:lvl w:ilvl="2" w:tplc="EF008E20">
       <w:numFmt w:val="decimal"/>
       <w:lvlText w:val=""/>
       <w:lvlJc w:val="left"/>
     </w:lvl>
-    <w:lvl w:ilvl="3" w:tplc="95B4A254">
+    <w:lvl w:ilvl="3" w:tplc="D9C04C06">
       <w:numFmt w:val="decimal"/>
       <w:lvlText w:val=""/>
       <w:lvlJc w:val="left"/>
     </w:lvl>
-    <w:lvl w:ilvl="4" w:tplc="E98E6A1E">
+    <w:lvl w:ilvl="4" w:tplc="01985DEE">
       <w:numFmt w:val="decimal"/>
       <w:lvlText w:val=""/>
       <w:lvlJc w:val="left"/>
     </w:lvl>
-    <w:lvl w:ilvl="5" w:tplc="57D853EA">
+    <w:lvl w:ilvl="5" w:tplc="E648FE6A">
       <w:numFmt w:val="decimal"/>
       <w:lvlText w:val=""/>
       <w:lvlJc w:val="left"/>
     </w:lvl>
-    <w:lvl w:ilvl="6" w:tplc="CB005A36">
+    <w:lvl w:ilvl="6" w:tplc="CDC6C746">
       <w:numFmt w:val="decimal"/>
       <w:lvlText w:val=""/>
       <w:lvlJc w:val="left"/>
     </w:lvl>
-    <w:lvl w:ilvl="7" w:tplc="2662F00C">
+    <w:lvl w:ilvl="7" w:tplc="4A8AFED6">
       <w:numFmt w:val="decimal"/>
       <w:lvlText w:val=""/>
       <w:lvlJc w:val="left"/>
     </w:lvl>
-    <w:lvl w:ilvl="8" w:tplc="968880D2">
+    <w:lvl w:ilvl="8" w:tplc="EE32B8E4">
       <w:numFmt w:val="decimal"/>
       <w:lvlText w:val=""/>
       <w:lvlJc w:val="left"/>
     </w:lvl>
   </w:abstractNum>
   <w:abstractNum w:abstractNumId="2" w15:restartNumberingAfterBreak="0">
-    <w:nsid w:val="55BC4BCA"/>
+    <w:nsid w:val="514D2F0C"/>
     <w:multiLevelType w:val="hybridMultilevel"/>
-    <w:tmpl w:val="71F89426"/>
-    <w:lvl w:ilvl="0" w:tplc="DBF02D08">
+    <w:tmpl w:val="41D869F2"/>
+    <w:lvl w:ilvl="0" w:tplc="09067050">
       <w:start w:val="1"/>
       <w:numFmt w:val="decimal"/>
       <w:lvlText w:val="%1."/>
@@ -19980,52 +21234,52 @@
         <w:ind w:left="400" w:hanging="300"/>
       </w:pPr>
     </w:lvl>
-    <w:lvl w:ilvl="1" w:tplc="1136A088">
+    <w:lvl w:ilvl="1" w:tplc="12AC9828">
       <w:numFmt w:val="decimal"/>
       <w:lvlText w:val=""/>
       <w:lvlJc w:val="left"/>
     </w:lvl>
-    <w:lvl w:ilvl="2" w:tplc="33EAFDD0">
+    <w:lvl w:ilvl="2" w:tplc="E4B0D554">
       <w:numFmt w:val="decimal"/>
       <w:lvlText w:val=""/>
       <w:lvlJc w:val="left"/>
     </w:lvl>
-    <w:lvl w:ilvl="3" w:tplc="C0D2D9F8">
+    <w:lvl w:ilvl="3" w:tplc="B05A1BE4">
       <w:numFmt w:val="decimal"/>
       <w:lvlText w:val=""/>
       <w:lvlJc w:val="left"/>
     </w:lvl>
-    <w:lvl w:ilvl="4" w:tplc="BAAAC0CE">
+    <w:lvl w:ilvl="4" w:tplc="5CAA598C">
       <w:numFmt w:val="decimal"/>
       <w:lvlText w:val=""/>
       <w:lvlJc w:val="left"/>
     </w:lvl>
-    <w:lvl w:ilvl="5" w:tplc="46604930">
+    <w:lvl w:ilvl="5" w:tplc="A6A22E36">
       <w:numFmt w:val="decimal"/>
       <w:lvlText w:val=""/>
       <w:lvlJc w:val="left"/>
     </w:lvl>
-    <w:lvl w:ilvl="6" w:tplc="29A295FA">
+    <w:lvl w:ilvl="6" w:tplc="183E85C4">
       <w:numFmt w:val="decimal"/>
       <w:lvlText w:val=""/>
       <w:lvlJc w:val="left"/>
     </w:lvl>
-    <w:lvl w:ilvl="7" w:tplc="1D42C3B4">
+    <w:lvl w:ilvl="7" w:tplc="549A1CFA">
       <w:numFmt w:val="decimal"/>
       <w:lvlText w:val=""/>
       <w:lvlJc w:val="left"/>
     </w:lvl>
-    <w:lvl w:ilvl="8" w:tplc="54DAA604">
+    <w:lvl w:ilvl="8" w:tplc="11567EF6">
       <w:numFmt w:val="decimal"/>
       <w:lvlText w:val=""/>
       <w:lvlJc w:val="left"/>
     </w:lvl>
   </w:abstractNum>
   <w:abstractNum w:abstractNumId="3" w15:restartNumberingAfterBreak="0">
-    <w:nsid w:val="5ED8623F"/>
+    <w:nsid w:val="6CAE30B5"/>
     <w:multiLevelType w:val="hybridMultilevel"/>
-    <w:tmpl w:val="8702E0B8"/>
-    <w:lvl w:ilvl="0" w:tplc="A0F8D4C6">
+    <w:tmpl w:val="7EF8661C"/>
+    <w:lvl w:ilvl="0" w:tplc="C36EF344">
       <w:start w:val="1"/>
       <w:numFmt w:val="decimal"/>
       <w:lvlText w:val="%1."/>
@@ -20034,52 +21288,52 @@
         <w:ind w:left="400" w:hanging="300"/>
       </w:pPr>
     </w:lvl>
-    <w:lvl w:ilvl="1" w:tplc="28C0CF8A">
+    <w:lvl w:ilvl="1" w:tplc="111254E4">
       <w:numFmt w:val="decimal"/>
       <w:lvlText w:val=""/>
       <w:lvlJc w:val="left"/>
     </w:lvl>
-    <w:lvl w:ilvl="2" w:tplc="66A65506">
+    <w:lvl w:ilvl="2" w:tplc="06FAFC94">
       <w:numFmt w:val="decimal"/>
       <w:lvlText w:val=""/>
       <w:lvlJc w:val="left"/>
     </w:lvl>
-    <w:lvl w:ilvl="3" w:tplc="2F4842C2">
+    <w:lvl w:ilvl="3" w:tplc="7D42C3D8">
       <w:numFmt w:val="decimal"/>
       <w:lvlText w:val=""/>
       <w:lvlJc w:val="left"/>
     </w:lvl>
-    <w:lvl w:ilvl="4" w:tplc="7FE4CB6C">
+    <w:lvl w:ilvl="4" w:tplc="EF60EA4A">
       <w:numFmt w:val="decimal"/>
       <w:lvlText w:val=""/>
       <w:lvlJc w:val="left"/>
     </w:lvl>
-    <w:lvl w:ilvl="5" w:tplc="ABFC8A0C">
+    <w:lvl w:ilvl="5" w:tplc="CBFAC4D6">
       <w:numFmt w:val="decimal"/>
       <w:lvlText w:val=""/>
       <w:lvlJc w:val="left"/>
     </w:lvl>
-    <w:lvl w:ilvl="6" w:tplc="5C7A2650">
+    <w:lvl w:ilvl="6" w:tplc="D520C694">
       <w:numFmt w:val="decimal"/>
       <w:lvlText w:val=""/>
       <w:lvlJc w:val="left"/>
     </w:lvl>
-    <w:lvl w:ilvl="7" w:tplc="3B047E54">
+    <w:lvl w:ilvl="7" w:tplc="CA162DEA">
       <w:numFmt w:val="decimal"/>
       <w:lvlText w:val=""/>
       <w:lvlJc w:val="left"/>
     </w:lvl>
-    <w:lvl w:ilvl="8" w:tplc="D096C0A0">
+    <w:lvl w:ilvl="8" w:tplc="E9D8C1B0">
       <w:numFmt w:val="decimal"/>
       <w:lvlText w:val=""/>
       <w:lvlJc w:val="left"/>
     </w:lvl>
   </w:abstractNum>
   <w:abstractNum w:abstractNumId="4" w15:restartNumberingAfterBreak="0">
-    <w:nsid w:val="77315512"/>
+    <w:nsid w:val="6DD97387"/>
     <w:multiLevelType w:val="hybridMultilevel"/>
-    <w:tmpl w:val="08C862A0"/>
-    <w:lvl w:ilvl="0" w:tplc="0456A398" w:tentative="1">
+    <w:tmpl w:val="B57E4310"/>
+    <w:lvl w:ilvl="0" w:tplc="14648082" w:tentative="1">
       <w:start w:val="1"/>
       <w:numFmt w:val="bullet"/>
       <w:lvlText w:val="●"/>
@@ -20088,7 +21342,7 @@
         <w:ind w:left="720" w:hanging="360"/>
       </w:pPr>
     </w:lvl>
-    <w:lvl w:ilvl="1" w:tplc="A06AA5A8" w:tentative="1">
+    <w:lvl w:ilvl="1" w:tplc="875668EE" w:tentative="1">
       <w:start w:val="1"/>
       <w:numFmt w:val="bullet"/>
       <w:lvlText w:val="○"/>
@@ -20097,7 +21351,7 @@
         <w:ind w:left="1440" w:hanging="360"/>
       </w:pPr>
     </w:lvl>
-    <w:lvl w:ilvl="2" w:tplc="BDE0C05E" w:tentative="1">
+    <w:lvl w:ilvl="2" w:tplc="F264B130" w:tentative="1">
       <w:start w:val="1"/>
       <w:numFmt w:val="bullet"/>
       <w:lvlText w:val="■"/>
@@ -20106,7 +21360,7 @@
         <w:ind w:left="2160" w:hanging="360"/>
       </w:pPr>
     </w:lvl>
-    <w:lvl w:ilvl="3" w:tplc="735ADADE" w:tentative="1">
+    <w:lvl w:ilvl="3" w:tplc="ECF8AF3E" w:tentative="1">
       <w:start w:val="1"/>
       <w:numFmt w:val="bullet"/>
       <w:lvlText w:val="●"/>
@@ -20115,7 +21369,7 @@
         <w:ind w:left="2880" w:hanging="360"/>
       </w:pPr>
     </w:lvl>
-    <w:lvl w:ilvl="4" w:tplc="00AC4802" w:tentative="1">
+    <w:lvl w:ilvl="4" w:tplc="6EF8B604" w:tentative="1">
       <w:start w:val="1"/>
       <w:numFmt w:val="bullet"/>
       <w:lvlText w:val="○"/>
@@ -20124,7 +21378,7 @@
         <w:ind w:left="3600" w:hanging="360"/>
       </w:pPr>
     </w:lvl>
-    <w:lvl w:ilvl="5" w:tplc="DCA66104" w:tentative="1">
+    <w:lvl w:ilvl="5" w:tplc="69D69B9A" w:tentative="1">
       <w:start w:val="1"/>
       <w:numFmt w:val="bullet"/>
       <w:lvlText w:val="■"/>
@@ -20133,7 +21387,7 @@
         <w:ind w:left="4320" w:hanging="360"/>
       </w:pPr>
     </w:lvl>
-    <w:lvl w:ilvl="6" w:tplc="58C6413A" w:tentative="1">
+    <w:lvl w:ilvl="6" w:tplc="CD04A76E" w:tentative="1">
       <w:start w:val="1"/>
       <w:numFmt w:val="bullet"/>
       <w:lvlText w:val="●"/>
@@ -20142,7 +21396,7 @@
         <w:ind w:left="5040" w:hanging="360"/>
       </w:pPr>
     </w:lvl>
-    <w:lvl w:ilvl="7" w:tplc="E29C0C2A" w:tentative="1">
+    <w:lvl w:ilvl="7" w:tplc="B5E0C23A" w:tentative="1">
       <w:start w:val="1"/>
       <w:numFmt w:val="bullet"/>
       <w:lvlText w:val="●"/>
@@ -20151,7 +21405,7 @@
         <w:ind w:left="5760" w:hanging="360"/>
       </w:pPr>
     </w:lvl>
-    <w:lvl w:ilvl="8" w:tplc="EEA8582E" w:tentative="1">
+    <w:lvl w:ilvl="8" w:tplc="A9F80204" w:tentative="1">
       <w:start w:val="1"/>
       <w:numFmt w:val="bullet"/>
       <w:lvlText w:val="●"/>
@@ -20161,32 +21415,32 @@
       </w:pPr>
     </w:lvl>
   </w:abstractNum>
-  <w:num w:numId="1" w16cid:durableId="1820027284">
+  <w:num w:numId="1" w16cid:durableId="1478524509">
     <w:abstractNumId w:val="4"/>
     <w:lvlOverride w:ilvl="0">
       <w:startOverride w:val="1"/>
     </w:lvlOverride>
   </w:num>
-  <w:num w:numId="2" w16cid:durableId="1160268626">
-    <w:abstractNumId w:val="0"/>
+  <w:num w:numId="2" w16cid:durableId="826484160">
+    <w:abstractNumId w:val="3"/>
     <w:lvlOverride w:ilvl="0">
       <w:startOverride w:val="1"/>
     </w:lvlOverride>
   </w:num>
-  <w:num w:numId="3" w16cid:durableId="986514005">
+  <w:num w:numId="3" w16cid:durableId="1126580568">
     <w:abstractNumId w:val="1"/>
     <w:lvlOverride w:ilvl="0">
       <w:startOverride w:val="1"/>
     </w:lvlOverride>
   </w:num>
-  <w:num w:numId="4" w16cid:durableId="156655267">
-    <w:abstractNumId w:val="3"/>
+  <w:num w:numId="4" w16cid:durableId="935599884">
+    <w:abstractNumId w:val="2"/>
     <w:lvlOverride w:ilvl="0">
       <w:startOverride w:val="1"/>
     </w:lvlOverride>
   </w:num>
-  <w:num w:numId="5" w16cid:durableId="300159213">
-    <w:abstractNumId w:val="2"/>
+  <w:num w:numId="5" w16cid:durableId="1778021736">
+    <w:abstractNumId w:val="0"/>
     <w:lvlOverride w:ilvl="0">
       <w:startOverride w:val="1"/>
     </w:lvlOverride>
@@ -20826,7 +22080,7 @@
     <w:autoRedefine/>
     <w:uiPriority w:val="39"/>
     <w:unhideWhenUsed/>
-    <w:rsid w:val="00E341FE"/>
+    <w:rsid w:val="00D53842"/>
     <w:pPr>
       <w:spacing w:after="100"/>
     </w:pPr>
@@ -20838,7 +22092,7 @@
     <w:autoRedefine/>
     <w:uiPriority w:val="39"/>
     <w:unhideWhenUsed/>
-    <w:rsid w:val="00E341FE"/>
+    <w:rsid w:val="00D53842"/>
     <w:pPr>
       <w:spacing w:after="100"/>
       <w:ind w:left="210"/>

</xml_diff>

<commit_message>
Update the study guide for the 9-slide talk
</commit_message>
<xml_diff>
--- a/docs/oral_study_guide.docx
+++ b/docs/oral_study_guide.docx
@@ -93,7 +93,7 @@
     <w:sdt>
       <w:sdtPr>
         <w:alias w:val="Contents"/>
-        <w:id w:val="-1808232435"/>
+        <w:id w:val="25530565"/>
       </w:sdtPr>
       <w:sdtEndPr/>
       <w:sdtContent>
@@ -116,7 +116,7 @@
           <w:r>
             <w:fldChar w:fldCharType="separate"/>
           </w:r>
-          <w:hyperlink w:anchor="_Toc243482151" w:history="1">
+          <w:hyperlink w:anchor="_Toc243483836" w:history="1">
             <w:r>
               <w:rPr>
                 <w:rStyle w:val="Lienhypertexte"/>
@@ -140,7 +140,7 @@
               <w:rPr>
                 <w:noProof/>
               </w:rPr>
-              <w:instrText xml:space="preserve"> PAGEREF _Toc243482151 \h </w:instrText>
+              <w:instrText xml:space="preserve"> PAGEREF _Toc243483836 \h </w:instrText>
             </w:r>
             <w:r>
               <w:rPr>
@@ -177,7 +177,7 @@
               <w:noProof/>
             </w:rPr>
           </w:pPr>
-          <w:hyperlink w:anchor="_Toc243482152" w:history="1">
+          <w:hyperlink w:anchor="_Toc243483837" w:history="1">
             <w:r>
               <w:rPr>
                 <w:rStyle w:val="Lienhypertexte"/>
@@ -201,7 +201,7 @@
               <w:rPr>
                 <w:noProof/>
               </w:rPr>
-              <w:instrText xml:space="preserve"> PAGEREF _Toc243482152 \h </w:instrText>
+              <w:instrText xml:space="preserve"> PAGEREF _Toc243483837 \h </w:instrText>
             </w:r>
             <w:r>
               <w:rPr>
@@ -238,7 +238,7 @@
               <w:noProof/>
             </w:rPr>
           </w:pPr>
-          <w:hyperlink w:anchor="_Toc243482153" w:history="1">
+          <w:hyperlink w:anchor="_Toc243483838" w:history="1">
             <w:r>
               <w:rPr>
                 <w:rStyle w:val="Lienhypertexte"/>
@@ -262,7 +262,7 @@
               <w:rPr>
                 <w:noProof/>
               </w:rPr>
-              <w:instrText xml:space="preserve"> PAGEREF _Toc243482153 \h </w:instrText>
+              <w:instrText xml:space="preserve"> PAGEREF _Toc243483838 \h </w:instrText>
             </w:r>
             <w:r>
               <w:rPr>
@@ -299,7 +299,7 @@
               <w:noProof/>
             </w:rPr>
           </w:pPr>
-          <w:hyperlink w:anchor="_Toc243482154" w:history="1">
+          <w:hyperlink w:anchor="_Toc243483839" w:history="1">
             <w:r>
               <w:rPr>
                 <w:rStyle w:val="Lienhypertexte"/>
@@ -323,7 +323,7 @@
               <w:rPr>
                 <w:noProof/>
               </w:rPr>
-              <w:instrText xml:space="preserve"> PAGEREF _Toc243482154 \h </w:instrText>
+              <w:instrText xml:space="preserve"> PAGEREF _Toc243483839 \h </w:instrText>
             </w:r>
             <w:r>
               <w:rPr>
@@ -360,7 +360,7 @@
               <w:noProof/>
             </w:rPr>
           </w:pPr>
-          <w:hyperlink w:anchor="_Toc243482155" w:history="1">
+          <w:hyperlink w:anchor="_Toc243483840" w:history="1">
             <w:r>
               <w:rPr>
                 <w:rStyle w:val="Lienhypertexte"/>
@@ -384,7 +384,7 @@
               <w:rPr>
                 <w:noProof/>
               </w:rPr>
-              <w:instrText xml:space="preserve"> PAGEREF _Toc243482155 \h </w:instrText>
+              <w:instrText xml:space="preserve"> PAGEREF _Toc243483840 \h </w:instrText>
             </w:r>
             <w:r>
               <w:rPr>
@@ -421,7 +421,7 @@
               <w:noProof/>
             </w:rPr>
           </w:pPr>
-          <w:hyperlink w:anchor="_Toc243482156" w:history="1">
+          <w:hyperlink w:anchor="_Toc243483841" w:history="1">
             <w:r>
               <w:rPr>
                 <w:rStyle w:val="Lienhypertexte"/>
@@ -445,7 +445,7 @@
               <w:rPr>
                 <w:noProof/>
               </w:rPr>
-              <w:instrText xml:space="preserve"> PAGEREF _Toc243482156 \h </w:instrText>
+              <w:instrText xml:space="preserve"> PAGEREF _Toc243483841 \h </w:instrText>
             </w:r>
             <w:r>
               <w:rPr>
@@ -482,7 +482,7 @@
               <w:noProof/>
             </w:rPr>
           </w:pPr>
-          <w:hyperlink w:anchor="_Toc243482157" w:history="1">
+          <w:hyperlink w:anchor="_Toc243483842" w:history="1">
             <w:r>
               <w:rPr>
                 <w:rStyle w:val="Lienhypertexte"/>
@@ -506,7 +506,7 @@
               <w:rPr>
                 <w:noProof/>
               </w:rPr>
-              <w:instrText xml:space="preserve"> PAGEREF _Toc243482157 \h </w:instrText>
+              <w:instrText xml:space="preserve"> PAGEREF _Toc243483842 \h </w:instrText>
             </w:r>
             <w:r>
               <w:rPr>
@@ -543,7 +543,7 @@
               <w:noProof/>
             </w:rPr>
           </w:pPr>
-          <w:hyperlink w:anchor="_Toc243482158" w:history="1">
+          <w:hyperlink w:anchor="_Toc243483843" w:history="1">
             <w:r>
               <w:rPr>
                 <w:rStyle w:val="Lienhypertexte"/>
@@ -567,7 +567,7 @@
               <w:rPr>
                 <w:noProof/>
               </w:rPr>
-              <w:instrText xml:space="preserve"> PAGEREF _Toc243482158 \h </w:instrText>
+              <w:instrText xml:space="preserve"> PAGEREF _Toc243483843 \h </w:instrText>
             </w:r>
             <w:r>
               <w:rPr>
@@ -604,7 +604,7 @@
               <w:noProof/>
             </w:rPr>
           </w:pPr>
-          <w:hyperlink w:anchor="_Toc243482159" w:history="1">
+          <w:hyperlink w:anchor="_Toc243483844" w:history="1">
             <w:r>
               <w:rPr>
                 <w:rStyle w:val="Lienhypertexte"/>
@@ -628,7 +628,7 @@
               <w:rPr>
                 <w:noProof/>
               </w:rPr>
-              <w:instrText xml:space="preserve"> PAGEREF _Toc243482159 \h </w:instrText>
+              <w:instrText xml:space="preserve"> PAGEREF _Toc243483844 \h </w:instrText>
             </w:r>
             <w:r>
               <w:rPr>
@@ -665,7 +665,7 @@
               <w:noProof/>
             </w:rPr>
           </w:pPr>
-          <w:hyperlink w:anchor="_Toc243482160" w:history="1">
+          <w:hyperlink w:anchor="_Toc243483845" w:history="1">
             <w:r>
               <w:rPr>
                 <w:rStyle w:val="Lienhypertexte"/>
@@ -689,7 +689,7 @@
               <w:rPr>
                 <w:noProof/>
               </w:rPr>
-              <w:instrText xml:space="preserve"> PAGEREF _Toc243482160 \h </w:instrText>
+              <w:instrText xml:space="preserve"> PAGEREF _Toc243483845 \h </w:instrText>
             </w:r>
             <w:r>
               <w:rPr>
@@ -726,7 +726,7 @@
               <w:noProof/>
             </w:rPr>
           </w:pPr>
-          <w:hyperlink w:anchor="_Toc243482161" w:history="1">
+          <w:hyperlink w:anchor="_Toc243483846" w:history="1">
             <w:r>
               <w:rPr>
                 <w:rStyle w:val="Lienhypertexte"/>
@@ -750,7 +750,7 @@
               <w:rPr>
                 <w:noProof/>
               </w:rPr>
-              <w:instrText xml:space="preserve"> PAGEREF _Toc243482161 \h </w:instrText>
+              <w:instrText xml:space="preserve"> PAGEREF _Toc243483846 \h </w:instrText>
             </w:r>
             <w:r>
               <w:rPr>
@@ -787,7 +787,7 @@
               <w:noProof/>
             </w:rPr>
           </w:pPr>
-          <w:hyperlink w:anchor="_Toc243482162" w:history="1">
+          <w:hyperlink w:anchor="_Toc243483847" w:history="1">
             <w:r>
               <w:rPr>
                 <w:rStyle w:val="Lienhypertexte"/>
@@ -811,7 +811,7 @@
               <w:rPr>
                 <w:noProof/>
               </w:rPr>
-              <w:instrText xml:space="preserve"> PAGEREF _Toc243482162 \h </w:instrText>
+              <w:instrText xml:space="preserve"> PAGEREF _Toc243483847 \h </w:instrText>
             </w:r>
             <w:r>
               <w:rPr>
@@ -848,7 +848,7 @@
               <w:noProof/>
             </w:rPr>
           </w:pPr>
-          <w:hyperlink w:anchor="_Toc243482163" w:history="1">
+          <w:hyperlink w:anchor="_Toc243483848" w:history="1">
             <w:r>
               <w:rPr>
                 <w:rStyle w:val="Lienhypertexte"/>
@@ -872,7 +872,7 @@
               <w:rPr>
                 <w:noProof/>
               </w:rPr>
-              <w:instrText xml:space="preserve"> PAGEREF _Toc243482163 \h </w:instrText>
+              <w:instrText xml:space="preserve"> PAGEREF _Toc243483848 \h </w:instrText>
             </w:r>
             <w:r>
               <w:rPr>
@@ -909,7 +909,7 @@
               <w:noProof/>
             </w:rPr>
           </w:pPr>
-          <w:hyperlink w:anchor="_Toc243482164" w:history="1">
+          <w:hyperlink w:anchor="_Toc243483849" w:history="1">
             <w:r>
               <w:rPr>
                 <w:rStyle w:val="Lienhypertexte"/>
@@ -933,7 +933,7 @@
               <w:rPr>
                 <w:noProof/>
               </w:rPr>
-              <w:instrText xml:space="preserve"> PAGEREF _Toc243482164 \h </w:instrText>
+              <w:instrText xml:space="preserve"> PAGEREF _Toc243483849 \h </w:instrText>
             </w:r>
             <w:r>
               <w:rPr>
@@ -970,7 +970,7 @@
               <w:noProof/>
             </w:rPr>
           </w:pPr>
-          <w:hyperlink w:anchor="_Toc243482165" w:history="1">
+          <w:hyperlink w:anchor="_Toc243483850" w:history="1">
             <w:r>
               <w:rPr>
                 <w:rStyle w:val="Lienhypertexte"/>
@@ -994,7 +994,7 @@
               <w:rPr>
                 <w:noProof/>
               </w:rPr>
-              <w:instrText xml:space="preserve"> PAGEREF _Toc243482165 \h </w:instrText>
+              <w:instrText xml:space="preserve"> PAGEREF _Toc243483850 \h </w:instrText>
             </w:r>
             <w:r>
               <w:rPr>
@@ -1031,7 +1031,7 @@
               <w:noProof/>
             </w:rPr>
           </w:pPr>
-          <w:hyperlink w:anchor="_Toc243482166" w:history="1">
+          <w:hyperlink w:anchor="_Toc243483851" w:history="1">
             <w:r>
               <w:rPr>
                 <w:rStyle w:val="Lienhypertexte"/>
@@ -1055,7 +1055,7 @@
               <w:rPr>
                 <w:noProof/>
               </w:rPr>
-              <w:instrText xml:space="preserve"> PAGEREF _Toc243482166 \h </w:instrText>
+              <w:instrText xml:space="preserve"> PAGEREF _Toc243483851 \h </w:instrText>
             </w:r>
             <w:r>
               <w:rPr>
@@ -1092,7 +1092,7 @@
               <w:noProof/>
             </w:rPr>
           </w:pPr>
-          <w:hyperlink w:anchor="_Toc243482167" w:history="1">
+          <w:hyperlink w:anchor="_Toc243483852" w:history="1">
             <w:r>
               <w:rPr>
                 <w:rStyle w:val="Lienhypertexte"/>
@@ -1116,7 +1116,7 @@
               <w:rPr>
                 <w:noProof/>
               </w:rPr>
-              <w:instrText xml:space="preserve"> PAGEREF _Toc243482167 \h </w:instrText>
+              <w:instrText xml:space="preserve"> PAGEREF _Toc243483852 \h </w:instrText>
             </w:r>
             <w:r>
               <w:rPr>
@@ -1153,7 +1153,7 @@
               <w:noProof/>
             </w:rPr>
           </w:pPr>
-          <w:hyperlink w:anchor="_Toc243482168" w:history="1">
+          <w:hyperlink w:anchor="_Toc243483853" w:history="1">
             <w:r>
               <w:rPr>
                 <w:rStyle w:val="Lienhypertexte"/>
@@ -1177,7 +1177,7 @@
               <w:rPr>
                 <w:noProof/>
               </w:rPr>
-              <w:instrText xml:space="preserve"> PAGEREF _Toc243482168 \h </w:instrText>
+              <w:instrText xml:space="preserve"> PAGEREF _Toc243483853 \h </w:instrText>
             </w:r>
             <w:r>
               <w:rPr>
@@ -1214,7 +1214,7 @@
               <w:noProof/>
             </w:rPr>
           </w:pPr>
-          <w:hyperlink w:anchor="_Toc243482169" w:history="1">
+          <w:hyperlink w:anchor="_Toc243483854" w:history="1">
             <w:r>
               <w:rPr>
                 <w:rStyle w:val="Lienhypertexte"/>
@@ -1238,7 +1238,7 @@
               <w:rPr>
                 <w:noProof/>
               </w:rPr>
-              <w:instrText xml:space="preserve"> PAGEREF _Toc243482169 \h </w:instrText>
+              <w:instrText xml:space="preserve"> PAGEREF _Toc243483854 \h </w:instrText>
             </w:r>
             <w:r>
               <w:rPr>
@@ -1275,7 +1275,7 @@
               <w:noProof/>
             </w:rPr>
           </w:pPr>
-          <w:hyperlink w:anchor="_Toc243482170" w:history="1">
+          <w:hyperlink w:anchor="_Toc243483855" w:history="1">
             <w:r>
               <w:rPr>
                 <w:rStyle w:val="Lienhypertexte"/>
@@ -1299,7 +1299,7 @@
               <w:rPr>
                 <w:noProof/>
               </w:rPr>
-              <w:instrText xml:space="preserve"> PAGEREF _Toc243482170 \h </w:instrText>
+              <w:instrText xml:space="preserve"> PAGEREF _Toc243483855 \h </w:instrText>
             </w:r>
             <w:r>
               <w:rPr>
@@ -1336,7 +1336,7 @@
               <w:noProof/>
             </w:rPr>
           </w:pPr>
-          <w:hyperlink w:anchor="_Toc243482171" w:history="1">
+          <w:hyperlink w:anchor="_Toc243483856" w:history="1">
             <w:r>
               <w:rPr>
                 <w:rStyle w:val="Lienhypertexte"/>
@@ -1360,7 +1360,7 @@
               <w:rPr>
                 <w:noProof/>
               </w:rPr>
-              <w:instrText xml:space="preserve"> PAGEREF _Toc243482171 \h </w:instrText>
+              <w:instrText xml:space="preserve"> PAGEREF _Toc243483856 \h </w:instrText>
             </w:r>
             <w:r>
               <w:rPr>
@@ -1397,7 +1397,7 @@
               <w:noProof/>
             </w:rPr>
           </w:pPr>
-          <w:hyperlink w:anchor="_Toc243482172" w:history="1">
+          <w:hyperlink w:anchor="_Toc243483857" w:history="1">
             <w:r>
               <w:rPr>
                 <w:rStyle w:val="Lienhypertexte"/>
@@ -1421,7 +1421,7 @@
               <w:rPr>
                 <w:noProof/>
               </w:rPr>
-              <w:instrText xml:space="preserve"> PAGEREF _Toc243482172 \h </w:instrText>
+              <w:instrText xml:space="preserve"> PAGEREF _Toc243483857 \h </w:instrText>
             </w:r>
             <w:r>
               <w:rPr>
@@ -1458,7 +1458,7 @@
               <w:noProof/>
             </w:rPr>
           </w:pPr>
-          <w:hyperlink w:anchor="_Toc243482173" w:history="1">
+          <w:hyperlink w:anchor="_Toc243483858" w:history="1">
             <w:r>
               <w:rPr>
                 <w:rStyle w:val="Lienhypertexte"/>
@@ -1482,7 +1482,7 @@
               <w:rPr>
                 <w:noProof/>
               </w:rPr>
-              <w:instrText xml:space="preserve"> PAGEREF _Toc243482173 \h </w:instrText>
+              <w:instrText xml:space="preserve"> PAGEREF _Toc243483858 \h </w:instrText>
             </w:r>
             <w:r>
               <w:rPr>
@@ -1519,7 +1519,7 @@
               <w:noProof/>
             </w:rPr>
           </w:pPr>
-          <w:hyperlink w:anchor="_Toc243482174" w:history="1">
+          <w:hyperlink w:anchor="_Toc243483859" w:history="1">
             <w:r>
               <w:rPr>
                 <w:rStyle w:val="Lienhypertexte"/>
@@ -1543,7 +1543,7 @@
               <w:rPr>
                 <w:noProof/>
               </w:rPr>
-              <w:instrText xml:space="preserve"> PAGEREF _Toc243482174 \h </w:instrText>
+              <w:instrText xml:space="preserve"> PAGEREF _Toc243483859 \h </w:instrText>
             </w:r>
             <w:r>
               <w:rPr>
@@ -1580,7 +1580,7 @@
               <w:noProof/>
             </w:rPr>
           </w:pPr>
-          <w:hyperlink w:anchor="_Toc243482175" w:history="1">
+          <w:hyperlink w:anchor="_Toc243483860" w:history="1">
             <w:r>
               <w:rPr>
                 <w:rStyle w:val="Lienhypertexte"/>
@@ -1604,7 +1604,7 @@
               <w:rPr>
                 <w:noProof/>
               </w:rPr>
-              <w:instrText xml:space="preserve"> PAGEREF _Toc243482175 \h </w:instrText>
+              <w:instrText xml:space="preserve"> PAGEREF _Toc243483860 \h </w:instrText>
             </w:r>
             <w:r>
               <w:rPr>
@@ -1641,7 +1641,7 @@
               <w:noProof/>
             </w:rPr>
           </w:pPr>
-          <w:hyperlink w:anchor="_Toc243482176" w:history="1">
+          <w:hyperlink w:anchor="_Toc243483861" w:history="1">
             <w:r>
               <w:rPr>
                 <w:rStyle w:val="Lienhypertexte"/>
@@ -1665,7 +1665,7 @@
               <w:rPr>
                 <w:noProof/>
               </w:rPr>
-              <w:instrText xml:space="preserve"> PAGEREF _Toc243482176 \h </w:instrText>
+              <w:instrText xml:space="preserve"> PAGEREF _Toc243483861 \h </w:instrText>
             </w:r>
             <w:r>
               <w:rPr>
@@ -1702,7 +1702,7 @@
               <w:noProof/>
             </w:rPr>
           </w:pPr>
-          <w:hyperlink w:anchor="_Toc243482177" w:history="1">
+          <w:hyperlink w:anchor="_Toc243483862" w:history="1">
             <w:r>
               <w:rPr>
                 <w:rStyle w:val="Lienhypertexte"/>
@@ -1726,7 +1726,7 @@
               <w:rPr>
                 <w:noProof/>
               </w:rPr>
-              <w:instrText xml:space="preserve"> PAGEREF _Toc243482177 \h </w:instrText>
+              <w:instrText xml:space="preserve"> PAGEREF _Toc243483862 \h </w:instrText>
             </w:r>
             <w:r>
               <w:rPr>
@@ -1763,7 +1763,7 @@
               <w:noProof/>
             </w:rPr>
           </w:pPr>
-          <w:hyperlink w:anchor="_Toc243482178" w:history="1">
+          <w:hyperlink w:anchor="_Toc243483863" w:history="1">
             <w:r>
               <w:rPr>
                 <w:rStyle w:val="Lienhypertexte"/>
@@ -1787,7 +1787,7 @@
               <w:rPr>
                 <w:noProof/>
               </w:rPr>
-              <w:instrText xml:space="preserve"> PAGEREF _Toc243482178 \h </w:instrText>
+              <w:instrText xml:space="preserve"> PAGEREF _Toc243483863 \h </w:instrText>
             </w:r>
             <w:r>
               <w:rPr>
@@ -1824,7 +1824,7 @@
               <w:noProof/>
             </w:rPr>
           </w:pPr>
-          <w:hyperlink w:anchor="_Toc243482179" w:history="1">
+          <w:hyperlink w:anchor="_Toc243483864" w:history="1">
             <w:r>
               <w:rPr>
                 <w:rStyle w:val="Lienhypertexte"/>
@@ -1848,7 +1848,7 @@
               <w:rPr>
                 <w:noProof/>
               </w:rPr>
-              <w:instrText xml:space="preserve"> PAGEREF _Toc243482179 \h </w:instrText>
+              <w:instrText xml:space="preserve"> PAGEREF _Toc243483864 \h </w:instrText>
             </w:r>
             <w:r>
               <w:rPr>
@@ -1885,7 +1885,7 @@
               <w:noProof/>
             </w:rPr>
           </w:pPr>
-          <w:hyperlink w:anchor="_Toc243482180" w:history="1">
+          <w:hyperlink w:anchor="_Toc243483865" w:history="1">
             <w:r>
               <w:rPr>
                 <w:rStyle w:val="Lienhypertexte"/>
@@ -1909,7 +1909,7 @@
               <w:rPr>
                 <w:noProof/>
               </w:rPr>
-              <w:instrText xml:space="preserve"> PAGEREF _Toc243482180 \h </w:instrText>
+              <w:instrText xml:space="preserve"> PAGEREF _Toc243483865 \h </w:instrText>
             </w:r>
             <w:r>
               <w:rPr>
@@ -1946,7 +1946,7 @@
               <w:noProof/>
             </w:rPr>
           </w:pPr>
-          <w:hyperlink w:anchor="_Toc243482181" w:history="1">
+          <w:hyperlink w:anchor="_Toc243483866" w:history="1">
             <w:r>
               <w:rPr>
                 <w:rStyle w:val="Lienhypertexte"/>
@@ -1970,7 +1970,7 @@
               <w:rPr>
                 <w:noProof/>
               </w:rPr>
-              <w:instrText xml:space="preserve"> PAGEREF _Toc243482181 \h </w:instrText>
+              <w:instrText xml:space="preserve"> PAGEREF _Toc243483866 \h </w:instrText>
             </w:r>
             <w:r>
               <w:rPr>
@@ -2007,7 +2007,7 @@
               <w:noProof/>
             </w:rPr>
           </w:pPr>
-          <w:hyperlink w:anchor="_Toc243482182" w:history="1">
+          <w:hyperlink w:anchor="_Toc243483867" w:history="1">
             <w:r>
               <w:rPr>
                 <w:rStyle w:val="Lienhypertexte"/>
@@ -2031,7 +2031,7 @@
               <w:rPr>
                 <w:noProof/>
               </w:rPr>
-              <w:instrText xml:space="preserve"> PAGEREF _Toc243482182 \h </w:instrText>
+              <w:instrText xml:space="preserve"> PAGEREF _Toc243483867 \h </w:instrText>
             </w:r>
             <w:r>
               <w:rPr>
@@ -2068,7 +2068,7 @@
               <w:noProof/>
             </w:rPr>
           </w:pPr>
-          <w:hyperlink w:anchor="_Toc243482183" w:history="1">
+          <w:hyperlink w:anchor="_Toc243483868" w:history="1">
             <w:r>
               <w:rPr>
                 <w:rStyle w:val="Lienhypertexte"/>
@@ -2092,7 +2092,7 @@
               <w:rPr>
                 <w:noProof/>
               </w:rPr>
-              <w:instrText xml:space="preserve"> PAGEREF _Toc243482183 \h </w:instrText>
+              <w:instrText xml:space="preserve"> PAGEREF _Toc243483868 \h </w:instrText>
             </w:r>
             <w:r>
               <w:rPr>
@@ -2129,7 +2129,7 @@
               <w:noProof/>
             </w:rPr>
           </w:pPr>
-          <w:hyperlink w:anchor="_Toc243482184" w:history="1">
+          <w:hyperlink w:anchor="_Toc243483869" w:history="1">
             <w:r>
               <w:rPr>
                 <w:rStyle w:val="Lienhypertexte"/>
@@ -2153,7 +2153,7 @@
               <w:rPr>
                 <w:noProof/>
               </w:rPr>
-              <w:instrText xml:space="preserve"> PAGEREF _Toc243482184 \h </w:instrText>
+              <w:instrText xml:space="preserve"> PAGEREF _Toc243483869 \h </w:instrText>
             </w:r>
             <w:r>
               <w:rPr>
@@ -2190,7 +2190,7 @@
               <w:noProof/>
             </w:rPr>
           </w:pPr>
-          <w:hyperlink w:anchor="_Toc243482185" w:history="1">
+          <w:hyperlink w:anchor="_Toc243483870" w:history="1">
             <w:r>
               <w:rPr>
                 <w:rStyle w:val="Lienhypertexte"/>
@@ -2214,7 +2214,7 @@
               <w:rPr>
                 <w:noProof/>
               </w:rPr>
-              <w:instrText xml:space="preserve"> PAGEREF _Toc243482185 \h </w:instrText>
+              <w:instrText xml:space="preserve"> PAGEREF _Toc243483870 \h </w:instrText>
             </w:r>
             <w:r>
               <w:rPr>
@@ -2251,7 +2251,7 @@
               <w:noProof/>
             </w:rPr>
           </w:pPr>
-          <w:hyperlink w:anchor="_Toc243482186" w:history="1">
+          <w:hyperlink w:anchor="_Toc243483871" w:history="1">
             <w:r>
               <w:rPr>
                 <w:rStyle w:val="Lienhypertexte"/>
@@ -2275,7 +2275,7 @@
               <w:rPr>
                 <w:noProof/>
               </w:rPr>
-              <w:instrText xml:space="preserve"> PAGEREF _Toc243482186 \h </w:instrText>
+              <w:instrText xml:space="preserve"> PAGEREF _Toc243483871 \h </w:instrText>
             </w:r>
             <w:r>
               <w:rPr>
@@ -2312,7 +2312,7 @@
               <w:noProof/>
             </w:rPr>
           </w:pPr>
-          <w:hyperlink w:anchor="_Toc243482187" w:history="1">
+          <w:hyperlink w:anchor="_Toc243483872" w:history="1">
             <w:r>
               <w:rPr>
                 <w:rStyle w:val="Lienhypertexte"/>
@@ -2336,7 +2336,7 @@
               <w:rPr>
                 <w:noProof/>
               </w:rPr>
-              <w:instrText xml:space="preserve"> PAGEREF _Toc243482187 \h </w:instrText>
+              <w:instrText xml:space="preserve"> PAGEREF _Toc243483872 \h </w:instrText>
             </w:r>
             <w:r>
               <w:rPr>
@@ -2373,7 +2373,7 @@
               <w:noProof/>
             </w:rPr>
           </w:pPr>
-          <w:hyperlink w:anchor="_Toc243482188" w:history="1">
+          <w:hyperlink w:anchor="_Toc243483873" w:history="1">
             <w:r>
               <w:rPr>
                 <w:rStyle w:val="Lienhypertexte"/>
@@ -2397,7 +2397,7 @@
               <w:rPr>
                 <w:noProof/>
               </w:rPr>
-              <w:instrText xml:space="preserve"> PAGEREF _Toc243482188 \h </w:instrText>
+              <w:instrText xml:space="preserve"> PAGEREF _Toc243483873 \h </w:instrText>
             </w:r>
             <w:r>
               <w:rPr>
@@ -2434,7 +2434,7 @@
               <w:noProof/>
             </w:rPr>
           </w:pPr>
-          <w:hyperlink w:anchor="_Toc243482189" w:history="1">
+          <w:hyperlink w:anchor="_Toc243483874" w:history="1">
             <w:r>
               <w:rPr>
                 <w:rStyle w:val="Lienhypertexte"/>
@@ -2458,7 +2458,7 @@
               <w:rPr>
                 <w:noProof/>
               </w:rPr>
-              <w:instrText xml:space="preserve"> PAGEREF _Toc243482189 \h </w:instrText>
+              <w:instrText xml:space="preserve"> PAGEREF _Toc243483874 \h </w:instrText>
             </w:r>
             <w:r>
               <w:rPr>
@@ -2495,7 +2495,7 @@
               <w:noProof/>
             </w:rPr>
           </w:pPr>
-          <w:hyperlink w:anchor="_Toc243482190" w:history="1">
+          <w:hyperlink w:anchor="_Toc243483875" w:history="1">
             <w:r>
               <w:rPr>
                 <w:rStyle w:val="Lienhypertexte"/>
@@ -2519,7 +2519,7 @@
               <w:rPr>
                 <w:noProof/>
               </w:rPr>
-              <w:instrText xml:space="preserve"> PAGEREF _Toc243482190 \h </w:instrText>
+              <w:instrText xml:space="preserve"> PAGEREF _Toc243483875 \h </w:instrText>
             </w:r>
             <w:r>
               <w:rPr>
@@ -2556,7 +2556,7 @@
               <w:noProof/>
             </w:rPr>
           </w:pPr>
-          <w:hyperlink w:anchor="_Toc243482191" w:history="1">
+          <w:hyperlink w:anchor="_Toc243483876" w:history="1">
             <w:r>
               <w:rPr>
                 <w:rStyle w:val="Lienhypertexte"/>
@@ -2580,7 +2580,7 @@
               <w:rPr>
                 <w:noProof/>
               </w:rPr>
-              <w:instrText xml:space="preserve"> PAGEREF _Toc243482191 \h </w:instrText>
+              <w:instrText xml:space="preserve"> PAGEREF _Toc243483876 \h </w:instrText>
             </w:r>
             <w:r>
               <w:rPr>
@@ -2617,7 +2617,7 @@
               <w:noProof/>
             </w:rPr>
           </w:pPr>
-          <w:hyperlink w:anchor="_Toc243482192" w:history="1">
+          <w:hyperlink w:anchor="_Toc243483877" w:history="1">
             <w:r>
               <w:rPr>
                 <w:rStyle w:val="Lienhypertexte"/>
@@ -2641,7 +2641,7 @@
               <w:rPr>
                 <w:noProof/>
               </w:rPr>
-              <w:instrText xml:space="preserve"> PAGEREF _Toc243482192 \h </w:instrText>
+              <w:instrText xml:space="preserve"> PAGEREF _Toc243483877 \h </w:instrText>
             </w:r>
             <w:r>
               <w:rPr>
@@ -2678,7 +2678,7 @@
               <w:noProof/>
             </w:rPr>
           </w:pPr>
-          <w:hyperlink w:anchor="_Toc243482193" w:history="1">
+          <w:hyperlink w:anchor="_Toc243483878" w:history="1">
             <w:r>
               <w:rPr>
                 <w:rStyle w:val="Lienhypertexte"/>
@@ -2702,7 +2702,7 @@
               <w:rPr>
                 <w:noProof/>
               </w:rPr>
-              <w:instrText xml:space="preserve"> PAGEREF _Toc243482193 \h </w:instrText>
+              <w:instrText xml:space="preserve"> PAGEREF _Toc243483878 \h </w:instrText>
             </w:r>
             <w:r>
               <w:rPr>
@@ -2739,7 +2739,7 @@
               <w:noProof/>
             </w:rPr>
           </w:pPr>
-          <w:hyperlink w:anchor="_Toc243482194" w:history="1">
+          <w:hyperlink w:anchor="_Toc243483879" w:history="1">
             <w:r>
               <w:rPr>
                 <w:rStyle w:val="Lienhypertexte"/>
@@ -2763,7 +2763,7 @@
               <w:rPr>
                 <w:noProof/>
               </w:rPr>
-              <w:instrText xml:space="preserve"> PAGEREF _Toc243482194 \h </w:instrText>
+              <w:instrText xml:space="preserve"> PAGEREF _Toc243483879 \h </w:instrText>
             </w:r>
             <w:r>
               <w:rPr>
@@ -2800,7 +2800,7 @@
               <w:noProof/>
             </w:rPr>
           </w:pPr>
-          <w:hyperlink w:anchor="_Toc243482195" w:history="1">
+          <w:hyperlink w:anchor="_Toc243483880" w:history="1">
             <w:r>
               <w:rPr>
                 <w:rStyle w:val="Lienhypertexte"/>
@@ -2824,7 +2824,7 @@
               <w:rPr>
                 <w:noProof/>
               </w:rPr>
-              <w:instrText xml:space="preserve"> PAGEREF _Toc243482195 \h </w:instrText>
+              <w:instrText xml:space="preserve"> PAGEREF _Toc243483880 \h </w:instrText>
             </w:r>
             <w:r>
               <w:rPr>
@@ -2861,7 +2861,7 @@
               <w:noProof/>
             </w:rPr>
           </w:pPr>
-          <w:hyperlink w:anchor="_Toc243482196" w:history="1">
+          <w:hyperlink w:anchor="_Toc243483881" w:history="1">
             <w:r>
               <w:rPr>
                 <w:rStyle w:val="Lienhypertexte"/>
@@ -2885,7 +2885,7 @@
               <w:rPr>
                 <w:noProof/>
               </w:rPr>
-              <w:instrText xml:space="preserve"> PAGEREF _Toc243482196 \h </w:instrText>
+              <w:instrText xml:space="preserve"> PAGEREF _Toc243483881 \h </w:instrText>
             </w:r>
             <w:r>
               <w:rPr>
@@ -2922,7 +2922,7 @@
               <w:noProof/>
             </w:rPr>
           </w:pPr>
-          <w:hyperlink w:anchor="_Toc243482197" w:history="1">
+          <w:hyperlink w:anchor="_Toc243483882" w:history="1">
             <w:r>
               <w:rPr>
                 <w:rStyle w:val="Lienhypertexte"/>
@@ -2946,7 +2946,7 @@
               <w:rPr>
                 <w:noProof/>
               </w:rPr>
-              <w:instrText xml:space="preserve"> PAGEREF _Toc243482197 \h </w:instrText>
+              <w:instrText xml:space="preserve"> PAGEREF _Toc243483882 \h </w:instrText>
             </w:r>
             <w:r>
               <w:rPr>
@@ -2983,7 +2983,7 @@
               <w:noProof/>
             </w:rPr>
           </w:pPr>
-          <w:hyperlink w:anchor="_Toc243482198" w:history="1">
+          <w:hyperlink w:anchor="_Toc243483883" w:history="1">
             <w:r>
               <w:rPr>
                 <w:rStyle w:val="Lienhypertexte"/>
@@ -3007,7 +3007,7 @@
               <w:rPr>
                 <w:noProof/>
               </w:rPr>
-              <w:instrText xml:space="preserve"> PAGEREF _Toc243482198 \h </w:instrText>
+              <w:instrText xml:space="preserve"> PAGEREF _Toc243483883 \h </w:instrText>
             </w:r>
             <w:r>
               <w:rPr>
@@ -3044,7 +3044,7 @@
               <w:noProof/>
             </w:rPr>
           </w:pPr>
-          <w:hyperlink w:anchor="_Toc243482199" w:history="1">
+          <w:hyperlink w:anchor="_Toc243483884" w:history="1">
             <w:r>
               <w:rPr>
                 <w:rStyle w:val="Lienhypertexte"/>
@@ -3068,7 +3068,7 @@
               <w:rPr>
                 <w:noProof/>
               </w:rPr>
-              <w:instrText xml:space="preserve"> PAGEREF _Toc243482199 \h </w:instrText>
+              <w:instrText xml:space="preserve"> PAGEREF _Toc243483884 \h </w:instrText>
             </w:r>
             <w:r>
               <w:rPr>
@@ -3105,7 +3105,7 @@
               <w:noProof/>
             </w:rPr>
           </w:pPr>
-          <w:hyperlink w:anchor="_Toc243482200" w:history="1">
+          <w:hyperlink w:anchor="_Toc243483885" w:history="1">
             <w:r>
               <w:rPr>
                 <w:rStyle w:val="Lienhypertexte"/>
@@ -3129,7 +3129,7 @@
               <w:rPr>
                 <w:noProof/>
               </w:rPr>
-              <w:instrText xml:space="preserve"> PAGEREF _Toc243482200 \h </w:instrText>
+              <w:instrText xml:space="preserve"> PAGEREF _Toc243483885 \h </w:instrText>
             </w:r>
             <w:r>
               <w:rPr>
@@ -3166,7 +3166,7 @@
               <w:noProof/>
             </w:rPr>
           </w:pPr>
-          <w:hyperlink w:anchor="_Toc243482201" w:history="1">
+          <w:hyperlink w:anchor="_Toc243483886" w:history="1">
             <w:r>
               <w:rPr>
                 <w:rStyle w:val="Lienhypertexte"/>
@@ -3190,7 +3190,7 @@
               <w:rPr>
                 <w:noProof/>
               </w:rPr>
-              <w:instrText xml:space="preserve"> PAGEREF _Toc243482201 \h </w:instrText>
+              <w:instrText xml:space="preserve"> PAGEREF _Toc243483886 \h </w:instrText>
             </w:r>
             <w:r>
               <w:rPr>
@@ -3227,7 +3227,7 @@
               <w:noProof/>
             </w:rPr>
           </w:pPr>
-          <w:hyperlink w:anchor="_Toc243482202" w:history="1">
+          <w:hyperlink w:anchor="_Toc243483887" w:history="1">
             <w:r>
               <w:rPr>
                 <w:rStyle w:val="Lienhypertexte"/>
@@ -3251,7 +3251,7 @@
               <w:rPr>
                 <w:noProof/>
               </w:rPr>
-              <w:instrText xml:space="preserve"> PAGEREF _Toc243482202 \h </w:instrText>
+              <w:instrText xml:space="preserve"> PAGEREF _Toc243483887 \h </w:instrText>
             </w:r>
             <w:r>
               <w:rPr>
@@ -3288,7 +3288,7 @@
               <w:noProof/>
             </w:rPr>
           </w:pPr>
-          <w:hyperlink w:anchor="_Toc243482203" w:history="1">
+          <w:hyperlink w:anchor="_Toc243483888" w:history="1">
             <w:r>
               <w:rPr>
                 <w:rStyle w:val="Lienhypertexte"/>
@@ -3312,7 +3312,7 @@
               <w:rPr>
                 <w:noProof/>
               </w:rPr>
-              <w:instrText xml:space="preserve"> PAGEREF _Toc243482203 \h </w:instrText>
+              <w:instrText xml:space="preserve"> PAGEREF _Toc243483888 \h </w:instrText>
             </w:r>
             <w:r>
               <w:rPr>
@@ -3349,7 +3349,7 @@
               <w:noProof/>
             </w:rPr>
           </w:pPr>
-          <w:hyperlink w:anchor="_Toc243482204" w:history="1">
+          <w:hyperlink w:anchor="_Toc243483889" w:history="1">
             <w:r>
               <w:rPr>
                 <w:rStyle w:val="Lienhypertexte"/>
@@ -3373,7 +3373,7 @@
               <w:rPr>
                 <w:noProof/>
               </w:rPr>
-              <w:instrText xml:space="preserve"> PAGEREF _Toc243482204 \h </w:instrText>
+              <w:instrText xml:space="preserve"> PAGEREF _Toc243483889 \h </w:instrText>
             </w:r>
             <w:r>
               <w:rPr>
@@ -3410,7 +3410,7 @@
               <w:noProof/>
             </w:rPr>
           </w:pPr>
-          <w:hyperlink w:anchor="_Toc243482205" w:history="1">
+          <w:hyperlink w:anchor="_Toc243483890" w:history="1">
             <w:r>
               <w:rPr>
                 <w:rStyle w:val="Lienhypertexte"/>
@@ -3434,7 +3434,7 @@
               <w:rPr>
                 <w:noProof/>
               </w:rPr>
-              <w:instrText xml:space="preserve"> PAGEREF _Toc243482205 \h </w:instrText>
+              <w:instrText xml:space="preserve"> PAGEREF _Toc243483890 \h </w:instrText>
             </w:r>
             <w:r>
               <w:rPr>
@@ -3471,7 +3471,7 @@
               <w:noProof/>
             </w:rPr>
           </w:pPr>
-          <w:hyperlink w:anchor="_Toc243482206" w:history="1">
+          <w:hyperlink w:anchor="_Toc243483891" w:history="1">
             <w:r>
               <w:rPr>
                 <w:rStyle w:val="Lienhypertexte"/>
@@ -3495,7 +3495,7 @@
               <w:rPr>
                 <w:noProof/>
               </w:rPr>
-              <w:instrText xml:space="preserve"> PAGEREF _Toc243482206 \h </w:instrText>
+              <w:instrText xml:space="preserve"> PAGEREF _Toc243483891 \h </w:instrText>
             </w:r>
             <w:r>
               <w:rPr>
@@ -3532,7 +3532,7 @@
               <w:noProof/>
             </w:rPr>
           </w:pPr>
-          <w:hyperlink w:anchor="_Toc243482207" w:history="1">
+          <w:hyperlink w:anchor="_Toc243483892" w:history="1">
             <w:r>
               <w:rPr>
                 <w:rStyle w:val="Lienhypertexte"/>
@@ -3556,7 +3556,7 @@
               <w:rPr>
                 <w:noProof/>
               </w:rPr>
-              <w:instrText xml:space="preserve"> PAGEREF _Toc243482207 \h </w:instrText>
+              <w:instrText xml:space="preserve"> PAGEREF _Toc243483892 \h </w:instrText>
             </w:r>
             <w:r>
               <w:rPr>
@@ -3593,7 +3593,7 @@
               <w:noProof/>
             </w:rPr>
           </w:pPr>
-          <w:hyperlink w:anchor="_Toc243482208" w:history="1">
+          <w:hyperlink w:anchor="_Toc243483893" w:history="1">
             <w:r>
               <w:rPr>
                 <w:rStyle w:val="Lienhypertexte"/>
@@ -3617,7 +3617,7 @@
               <w:rPr>
                 <w:noProof/>
               </w:rPr>
-              <w:instrText xml:space="preserve"> PAGEREF _Toc243482208 \h </w:instrText>
+              <w:instrText xml:space="preserve"> PAGEREF _Toc243483893 \h </w:instrText>
             </w:r>
             <w:r>
               <w:rPr>
@@ -3654,7 +3654,7 @@
               <w:noProof/>
             </w:rPr>
           </w:pPr>
-          <w:hyperlink w:anchor="_Toc243482209" w:history="1">
+          <w:hyperlink w:anchor="_Toc243483894" w:history="1">
             <w:r>
               <w:rPr>
                 <w:rStyle w:val="Lienhypertexte"/>
@@ -3678,7 +3678,7 @@
               <w:rPr>
                 <w:noProof/>
               </w:rPr>
-              <w:instrText xml:space="preserve"> PAGEREF _Toc243482209 \h </w:instrText>
+              <w:instrText xml:space="preserve"> PAGEREF _Toc243483894 \h </w:instrText>
             </w:r>
             <w:r>
               <w:rPr>
@@ -3715,7 +3715,7 @@
               <w:noProof/>
             </w:rPr>
           </w:pPr>
-          <w:hyperlink w:anchor="_Toc243482210" w:history="1">
+          <w:hyperlink w:anchor="_Toc243483895" w:history="1">
             <w:r>
               <w:rPr>
                 <w:rStyle w:val="Lienhypertexte"/>
@@ -3739,7 +3739,7 @@
               <w:rPr>
                 <w:noProof/>
               </w:rPr>
-              <w:instrText xml:space="preserve"> PAGEREF _Toc243482210 \h </w:instrText>
+              <w:instrText xml:space="preserve"> PAGEREF _Toc243483895 \h </w:instrText>
             </w:r>
             <w:r>
               <w:rPr>
@@ -3776,7 +3776,7 @@
               <w:noProof/>
             </w:rPr>
           </w:pPr>
-          <w:hyperlink w:anchor="_Toc243482211" w:history="1">
+          <w:hyperlink w:anchor="_Toc243483896" w:history="1">
             <w:r>
               <w:rPr>
                 <w:rStyle w:val="Lienhypertexte"/>
@@ -3800,7 +3800,7 @@
               <w:rPr>
                 <w:noProof/>
               </w:rPr>
-              <w:instrText xml:space="preserve"> PAGEREF _Toc243482211 \h </w:instrText>
+              <w:instrText xml:space="preserve"> PAGEREF _Toc243483896 \h </w:instrText>
             </w:r>
             <w:r>
               <w:rPr>
@@ -3837,7 +3837,7 @@
               <w:noProof/>
             </w:rPr>
           </w:pPr>
-          <w:hyperlink w:anchor="_Toc243482212" w:history="1">
+          <w:hyperlink w:anchor="_Toc243483897" w:history="1">
             <w:r>
               <w:rPr>
                 <w:rStyle w:val="Lienhypertexte"/>
@@ -3861,7 +3861,7 @@
               <w:rPr>
                 <w:noProof/>
               </w:rPr>
-              <w:instrText xml:space="preserve"> PAGEREF _Toc243482212 \h </w:instrText>
+              <w:instrText xml:space="preserve"> PAGEREF _Toc243483897 \h </w:instrText>
             </w:r>
             <w:r>
               <w:rPr>
@@ -3898,7 +3898,7 @@
               <w:noProof/>
             </w:rPr>
           </w:pPr>
-          <w:hyperlink w:anchor="_Toc243482213" w:history="1">
+          <w:hyperlink w:anchor="_Toc243483898" w:history="1">
             <w:r>
               <w:rPr>
                 <w:rStyle w:val="Lienhypertexte"/>
@@ -3922,7 +3922,7 @@
               <w:rPr>
                 <w:noProof/>
               </w:rPr>
-              <w:instrText xml:space="preserve"> PAGEREF _Toc243482213 \h </w:instrText>
+              <w:instrText xml:space="preserve"> PAGEREF _Toc243483898 \h </w:instrText>
             </w:r>
             <w:r>
               <w:rPr>
@@ -3959,7 +3959,7 @@
               <w:noProof/>
             </w:rPr>
           </w:pPr>
-          <w:hyperlink w:anchor="_Toc243482214" w:history="1">
+          <w:hyperlink w:anchor="_Toc243483899" w:history="1">
             <w:r>
               <w:rPr>
                 <w:rStyle w:val="Lienhypertexte"/>
@@ -3983,7 +3983,7 @@
               <w:rPr>
                 <w:noProof/>
               </w:rPr>
-              <w:instrText xml:space="preserve"> PAGEREF _Toc243482214 \h </w:instrText>
+              <w:instrText xml:space="preserve"> PAGEREF _Toc243483899 \h </w:instrText>
             </w:r>
             <w:r>
               <w:rPr>
@@ -4020,7 +4020,7 @@
               <w:noProof/>
             </w:rPr>
           </w:pPr>
-          <w:hyperlink w:anchor="_Toc243482215" w:history="1">
+          <w:hyperlink w:anchor="_Toc243483900" w:history="1">
             <w:r>
               <w:rPr>
                 <w:rStyle w:val="Lienhypertexte"/>
@@ -4044,7 +4044,7 @@
               <w:rPr>
                 <w:noProof/>
               </w:rPr>
-              <w:instrText xml:space="preserve"> PAGEREF _Toc243482215 \h </w:instrText>
+              <w:instrText xml:space="preserve"> PAGEREF _Toc243483900 \h </w:instrText>
             </w:r>
             <w:r>
               <w:rPr>
@@ -4081,7 +4081,7 @@
               <w:noProof/>
             </w:rPr>
           </w:pPr>
-          <w:hyperlink w:anchor="_Toc243482216" w:history="1">
+          <w:hyperlink w:anchor="_Toc243483901" w:history="1">
             <w:r>
               <w:rPr>
                 <w:rStyle w:val="Lienhypertexte"/>
@@ -4105,7 +4105,7 @@
               <w:rPr>
                 <w:noProof/>
               </w:rPr>
-              <w:instrText xml:space="preserve"> PAGEREF _Toc243482216 \h </w:instrText>
+              <w:instrText xml:space="preserve"> PAGEREF _Toc243483901 \h </w:instrText>
             </w:r>
             <w:r>
               <w:rPr>
@@ -4142,7 +4142,7 @@
               <w:noProof/>
             </w:rPr>
           </w:pPr>
-          <w:hyperlink w:anchor="_Toc243482217" w:history="1">
+          <w:hyperlink w:anchor="_Toc243483902" w:history="1">
             <w:r>
               <w:rPr>
                 <w:rStyle w:val="Lienhypertexte"/>
@@ -4166,7 +4166,7 @@
               <w:rPr>
                 <w:noProof/>
               </w:rPr>
-              <w:instrText xml:space="preserve"> PAGEREF _Toc243482217 \h </w:instrText>
+              <w:instrText xml:space="preserve"> PAGEREF _Toc243483902 \h </w:instrText>
             </w:r>
             <w:r>
               <w:rPr>
@@ -4205,7 +4205,7 @@
         <w:pStyle w:val="Titre1"/>
         <w:pageBreakBefore/>
       </w:pPr>
-      <w:bookmarkStart w:id="0" w:name="_Toc243482151"/>
+      <w:bookmarkStart w:id="0" w:name="_Toc243483836"/>
       <w:r>
         <w:lastRenderedPageBreak/>
         <w:t>1. The pitch in 60 seconds</w:t>
@@ -4424,7 +4424,7 @@
         <w:pStyle w:val="Titre1"/>
         <w:pageBreakBefore/>
       </w:pPr>
-      <w:bookmarkStart w:id="1" w:name="_Toc243482152"/>
+      <w:bookmarkStart w:id="1" w:name="_Toc243483837"/>
       <w:r>
         <w:lastRenderedPageBreak/>
         <w:t>2. The basic ideas, explained simply</w:t>
@@ -4529,7 +4529,7 @@
       <w:pPr>
         <w:pStyle w:val="Titre2"/>
       </w:pPr>
-      <w:bookmarkStart w:id="2" w:name="_Toc243482153"/>
+      <w:bookmarkStart w:id="2" w:name="_Toc243483838"/>
       <w:r>
         <w:t>A neuron, weights and a network</w:t>
       </w:r>
@@ -4599,7 +4599,7 @@
       <w:pPr>
         <w:pStyle w:val="Titre2"/>
       </w:pPr>
-      <w:bookmarkStart w:id="3" w:name="_Toc243482154"/>
+      <w:bookmarkStart w:id="3" w:name="_Toc243483839"/>
       <w:r>
         <w:t>The loss: how wrong we are</w:t>
       </w:r>
@@ -4659,7 +4659,7 @@
       <w:pPr>
         <w:pStyle w:val="Titre2"/>
       </w:pPr>
-      <w:bookmarkStart w:id="4" w:name="_Toc243482155"/>
+      <w:bookmarkStart w:id="4" w:name="_Toc243483840"/>
       <w:r>
         <w:t>Gradient descent and the learning rate</w:t>
       </w:r>
@@ -4729,7 +4729,7 @@
       <w:pPr>
         <w:pStyle w:val="Titre2"/>
       </w:pPr>
-      <w:bookmarkStart w:id="5" w:name="_Toc243482156"/>
+      <w:bookmarkStart w:id="5" w:name="_Toc243483841"/>
       <w:r>
         <w:t>Backpropagation and the 5 lines of the training loop</w:t>
       </w:r>
@@ -4823,7 +4823,7 @@
       <w:pPr>
         <w:pStyle w:val="Titre2"/>
       </w:pPr>
-      <w:bookmarkStart w:id="6" w:name="_Toc243482157"/>
+      <w:bookmarkStart w:id="6" w:name="_Toc243483842"/>
       <w:r>
         <w:t>Epoch and mini-batch</w:t>
       </w:r>
@@ -4883,7 +4883,7 @@
       <w:pPr>
         <w:pStyle w:val="Titre2"/>
       </w:pPr>
-      <w:bookmarkStart w:id="7" w:name="_Toc243482158"/>
+      <w:bookmarkStart w:id="7" w:name="_Toc243483843"/>
       <w:r>
         <w:lastRenderedPageBreak/>
         <w:t>Train, validation, test</w:t>
@@ -4954,7 +4954,7 @@
       <w:pPr>
         <w:pStyle w:val="Titre2"/>
       </w:pPr>
-      <w:bookmarkStart w:id="8" w:name="_Toc243482159"/>
+      <w:bookmarkStart w:id="8" w:name="_Toc243483844"/>
       <w:r>
         <w:t>Overfitting</w:t>
       </w:r>
@@ -5004,7 +5004,7 @@
       <w:pPr>
         <w:pStyle w:val="Titre2"/>
       </w:pPr>
-      <w:bookmarkStart w:id="9" w:name="_Toc243482160"/>
+      <w:bookmarkStart w:id="9" w:name="_Toc243483845"/>
       <w:r>
         <w:t>ReLU, the activation</w:t>
       </w:r>
@@ -5074,7 +5074,7 @@
       <w:pPr>
         <w:pStyle w:val="Titre2"/>
       </w:pPr>
-      <w:bookmarkStart w:id="10" w:name="_Toc243482161"/>
+      <w:bookmarkStart w:id="10" w:name="_Toc243483846"/>
       <w:r>
         <w:t>Initialisation and the first loss</w:t>
       </w:r>
@@ -5124,7 +5124,7 @@
       <w:pPr>
         <w:pStyle w:val="Titre2"/>
       </w:pPr>
-      <w:bookmarkStart w:id="11" w:name="_Toc243482162"/>
+      <w:bookmarkStart w:id="11" w:name="_Toc243483847"/>
       <w:r>
         <w:t>Standardisation of the pixels</w:t>
       </w:r>
@@ -5184,7 +5184,7 @@
       <w:pPr>
         <w:pStyle w:val="Titre2"/>
       </w:pPr>
-      <w:bookmarkStart w:id="12" w:name="_Toc243482163"/>
+      <w:bookmarkStart w:id="12" w:name="_Toc243483848"/>
       <w:r>
         <w:t>MLP versus CNN: why the MLP cannot see shapes</w:t>
       </w:r>
@@ -5244,7 +5244,7 @@
       <w:pPr>
         <w:pStyle w:val="Titre2"/>
       </w:pPr>
-      <w:bookmarkStart w:id="13" w:name="_Toc243482164"/>
+      <w:bookmarkStart w:id="13" w:name="_Toc243483849"/>
       <w:r>
         <w:t>Convolution, filters and channels (session 7 slide)</w:t>
       </w:r>
@@ -5335,7 +5335,7 @@
       <w:pPr>
         <w:pStyle w:val="Titre2"/>
       </w:pPr>
-      <w:bookmarkStart w:id="14" w:name="_Toc243482165"/>
+      <w:bookmarkStart w:id="14" w:name="_Toc243483850"/>
       <w:r>
         <w:t>A pretrained network and transfer learning</w:t>
       </w:r>
@@ -5395,7 +5395,7 @@
       <w:pPr>
         <w:pStyle w:val="Titre2"/>
       </w:pPr>
-      <w:bookmarkStart w:id="15" w:name="_Toc243482166"/>
+      <w:bookmarkStart w:id="15" w:name="_Toc243483851"/>
       <w:r>
         <w:t>Frozen features (linear probe) versus fine-tuning</w:t>
       </w:r>
@@ -5465,7 +5465,7 @@
       <w:pPr>
         <w:pStyle w:val="Titre2"/>
       </w:pPr>
-      <w:bookmarkStart w:id="16" w:name="_Toc243482167"/>
+      <w:bookmarkStart w:id="16" w:name="_Toc243483852"/>
       <w:r>
         <w:t>The tools against overfitting</w:t>
       </w:r>
@@ -5625,7 +5625,7 @@
       <w:pPr>
         <w:pStyle w:val="Titre2"/>
       </w:pPr>
-      <w:bookmarkStart w:id="17" w:name="_Toc243482168"/>
+      <w:bookmarkStart w:id="17" w:name="_Toc243483853"/>
       <w:r>
         <w:t>Vanishing gradient</w:t>
       </w:r>
@@ -5675,7 +5675,7 @@
       <w:pPr>
         <w:pStyle w:val="Titre2"/>
       </w:pPr>
-      <w:bookmarkStart w:id="18" w:name="_Toc243482169"/>
+      <w:bookmarkStart w:id="18" w:name="_Toc243483854"/>
       <w:r>
         <w:t>Data leakage</w:t>
       </w:r>
@@ -5725,7 +5725,7 @@
       <w:pPr>
         <w:pStyle w:val="Titre2"/>
       </w:pPr>
-      <w:bookmarkStart w:id="19" w:name="_Toc243482170"/>
+      <w:bookmarkStart w:id="19" w:name="_Toc243483855"/>
       <w:r>
         <w:t>Confidence interval and bootstrap</w:t>
       </w:r>
@@ -5785,7 +5785,7 @@
       <w:pPr>
         <w:pStyle w:val="Titre2"/>
       </w:pPr>
-      <w:bookmarkStart w:id="20" w:name="_Toc243482171"/>
+      <w:bookmarkStart w:id="20" w:name="_Toc243483856"/>
       <w:r>
         <w:lastRenderedPageBreak/>
         <w:t>Latency and CPU threads</w:t>
@@ -5857,7 +5857,7 @@
         <w:pStyle w:val="Titre1"/>
         <w:pageBreakBefore/>
       </w:pPr>
-      <w:bookmarkStart w:id="21" w:name="_Toc243482172"/>
+      <w:bookmarkStart w:id="21" w:name="_Toc243483857"/>
       <w:r>
         <w:lastRenderedPageBreak/>
         <w:t>3. Step 1: the data and a fair split (notebook 01)</w:t>
@@ -5970,7 +5970,7 @@
       <w:pPr>
         <w:pStyle w:val="Titre2"/>
       </w:pPr>
-      <w:bookmarkStart w:id="22" w:name="_Toc243482173"/>
+      <w:bookmarkStart w:id="22" w:name="_Toc243483858"/>
       <w:r>
         <w:t>What we downloaded</w:t>
       </w:r>
@@ -6091,7 +6091,7 @@
       <w:pPr>
         <w:pStyle w:val="Titre2"/>
       </w:pPr>
-      <w:bookmarkStart w:id="23" w:name="_Toc243482174"/>
+      <w:bookmarkStart w:id="23" w:name="_Toc243483859"/>
       <w:r>
         <w:t>The split (make_split in data.py)</w:t>
       </w:r>
@@ -6222,7 +6222,7 @@
       <w:pPr>
         <w:pStyle w:val="Titre2"/>
       </w:pPr>
-      <w:bookmarkStart w:id="24" w:name="_Toc243482175"/>
+      <w:bookmarkStart w:id="24" w:name="_Toc243483860"/>
       <w:r>
         <w:t>What we found in the data</w:t>
       </w:r>
@@ -6285,7 +6285,7 @@
         <w:pStyle w:val="Titre1"/>
         <w:pageBreakBefore/>
       </w:pPr>
-      <w:bookmarkStart w:id="25" w:name="_Toc243482176"/>
+      <w:bookmarkStart w:id="25" w:name="_Toc243483861"/>
       <w:r>
         <w:lastRenderedPageBreak/>
         <w:t>4. Step 2: the MLP and its two checks (notebook 02)</w:t>
@@ -6435,7 +6435,7 @@
       <w:pPr>
         <w:pStyle w:val="Titre2"/>
       </w:pPr>
-      <w:bookmarkStart w:id="26" w:name="_Toc243482177"/>
+      <w:bookmarkStart w:id="26" w:name="_Toc243483862"/>
       <w:r>
         <w:t>The model</w:t>
       </w:r>
@@ -6562,7 +6562,7 @@
       <w:pPr>
         <w:pStyle w:val="Titre2"/>
       </w:pPr>
-      <w:bookmarkStart w:id="27" w:name="_Toc243482178"/>
+      <w:bookmarkStart w:id="27" w:name="_Toc243483863"/>
       <w:r>
         <w:t>Check 1: the first loss</w:t>
       </w:r>
@@ -6611,7 +6611,7 @@
       <w:pPr>
         <w:pStyle w:val="Titre2"/>
       </w:pPr>
-      <w:bookmarkStart w:id="28" w:name="_Toc243482179"/>
+      <w:bookmarkStart w:id="28" w:name="_Toc243483864"/>
       <w:r>
         <w:t>Check 2: overfit one batch</w:t>
       </w:r>
@@ -6629,7 +6629,7 @@
       <w:pPr>
         <w:pStyle w:val="Titre2"/>
       </w:pPr>
-      <w:bookmarkStart w:id="29" w:name="_Toc243482180"/>
+      <w:bookmarkStart w:id="29" w:name="_Toc243483865"/>
       <w:r>
         <w:t>Baseline and image size</w:t>
       </w:r>
@@ -6705,7 +6705,7 @@
         </w:rPr>
         <w:lastRenderedPageBreak/>
         <w:drawing>
-          <wp:inline distT="0" distB="0" distL="0" distR="0" wp14:anchorId="7263814F" wp14:editId="72638150">
+          <wp:inline distT="0" distB="0" distL="0" distR="0" wp14:anchorId="01CDD641" wp14:editId="01CDD642">
             <wp:extent cx="4762500" cy="1924050"/>
             <wp:effectExtent l="0" t="0" r="0" b="0"/>
             <wp:docPr id="1" name="02_baseline_curves.png" descr="MLP baseline: training loss falls to 0 while validation loss rises (overfitting)." title="MLP baseline: training loss falls to 0 while validation loss rises (overfitting)."/>
@@ -6765,7 +6765,7 @@
         <w:pStyle w:val="Titre1"/>
         <w:pageBreakBefore/>
       </w:pPr>
-      <w:bookmarkStart w:id="30" w:name="_Toc243482181"/>
+      <w:bookmarkStart w:id="30" w:name="_Toc243483866"/>
       <w:r>
         <w:lastRenderedPageBreak/>
         <w:t>5. Step 3: monitoring and regularisation (notebook 03)</w:t>
@@ -6936,7 +6936,7 @@
       <w:pPr>
         <w:pStyle w:val="Titre2"/>
       </w:pPr>
-      <w:bookmarkStart w:id="31" w:name="_Toc243482182"/>
+      <w:bookmarkStart w:id="31" w:name="_Toc243483867"/>
       <w:r>
         <w:t>What we monitored</w:t>
       </w:r>
@@ -7055,7 +7055,7 @@
       <w:pPr>
         <w:pStyle w:val="Titre2"/>
       </w:pPr>
-      <w:bookmarkStart w:id="32" w:name="_Toc243482183"/>
+      <w:bookmarkStart w:id="32" w:name="_Toc243483868"/>
       <w:r>
         <w:t>Learning-rate sweep (Adam, 8 values, 15 epochs each)</w:t>
       </w:r>
@@ -7130,7 +7130,7 @@
           <w:noProof/>
         </w:rPr>
         <w:drawing>
-          <wp:inline distT="0" distB="0" distL="0" distR="0" wp14:anchorId="72638151" wp14:editId="72638152">
+          <wp:inline distT="0" distB="0" distL="0" distR="0" wp14:anchorId="01CDD643" wp14:editId="01CDD644">
             <wp:extent cx="4191000" cy="1619250"/>
             <wp:effectExtent l="0" t="0" r="0" b="0"/>
             <wp:docPr id="2" name="03_lr_sweep.png" descr="Learning-rate sweep: a U-shaped validation loss, best at 0.0001." title="Learning-rate sweep: a U-shaped validation loss, best at 0.0001."/>
@@ -7189,7 +7189,7 @@
       <w:pPr>
         <w:pStyle w:val="Titre2"/>
       </w:pPr>
-      <w:bookmarkStart w:id="33" w:name="_Toc243482184"/>
+      <w:bookmarkStart w:id="33" w:name="_Toc243483869"/>
       <w:r>
         <w:t>The tools against overfitting (lr 0.0001, 3 seeds each)</w:t>
       </w:r>
@@ -8162,7 +8162,7 @@
         <w:pStyle w:val="Titre1"/>
         <w:pageBreakBefore/>
       </w:pPr>
-      <w:bookmarkStart w:id="34" w:name="_Toc243482185"/>
+      <w:bookmarkStart w:id="34" w:name="_Toc243483870"/>
       <w:r>
         <w:lastRenderedPageBreak/>
         <w:t>6. Step 4: the training doctor (notebook 04)</w:t>
@@ -9068,7 +9068,7 @@
         </w:rPr>
         <w:lastRenderedPageBreak/>
         <w:drawing>
-          <wp:inline distT="0" distB="0" distL="0" distR="0" wp14:anchorId="72638153" wp14:editId="72638154">
+          <wp:inline distT="0" distB="0" distL="0" distR="0" wp14:anchorId="01CDD645" wp14:editId="01CDD646">
             <wp:extent cx="4000500" cy="2209800"/>
             <wp:effectExtent l="0" t="0" r="0" b="0"/>
             <wp:docPr id="3" name="04_p4_grad_per_layer.png" descr="Patient 4: the gradient vanishes layer after layer with sigmoids; ReLU + He init fixes it." title="Patient 4: the gradient vanishes layer after layer with sigmoids; ReLU + He init fixes it."/>
@@ -9127,7 +9127,7 @@
       <w:pPr>
         <w:pStyle w:val="Titre2"/>
       </w:pPr>
-      <w:bookmarkStart w:id="35" w:name="_Toc243482186"/>
+      <w:bookmarkStart w:id="35" w:name="_Toc243483871"/>
       <w:r>
         <w:t>Lessons to say at the oral</w:t>
       </w:r>
@@ -9220,7 +9220,7 @@
         <w:pStyle w:val="Titre1"/>
         <w:pageBreakBefore/>
       </w:pPr>
-      <w:bookmarkStart w:id="36" w:name="_Toc243482187"/>
+      <w:bookmarkStart w:id="36" w:name="_Toc243483872"/>
       <w:r>
         <w:lastRenderedPageBreak/>
         <w:t>7. Step 5: pretrained ResNet18 (notebook 05)</w:t>
@@ -9427,7 +9427,7 @@
       <w:pPr>
         <w:pStyle w:val="Titre2"/>
       </w:pPr>
-      <w:bookmarkStart w:id="37" w:name="_Toc243482188"/>
+      <w:bookmarkStart w:id="37" w:name="_Toc243483873"/>
       <w:r>
         <w:t>Why a CNN, and why pretrained</w:t>
       </w:r>
@@ -9512,7 +9512,7 @@
       <w:pPr>
         <w:pStyle w:val="Titre2"/>
       </w:pPr>
-      <w:bookmarkStart w:id="38" w:name="_Toc243482189"/>
+      <w:bookmarkStart w:id="38" w:name="_Toc243483874"/>
       <w:r>
         <w:t>Method A: frozen features + head</w:t>
       </w:r>
@@ -9619,7 +9619,7 @@
       <w:pPr>
         <w:pStyle w:val="Titre2"/>
       </w:pPr>
-      <w:bookmarkStart w:id="39" w:name="_Toc243482190"/>
+      <w:bookmarkStart w:id="39" w:name="_Toc243483875"/>
       <w:r>
         <w:t>Method B: fine-tuning layer4</w:t>
       </w:r>
@@ -9676,7 +9676,7 @@
       <w:pPr>
         <w:pStyle w:val="Titre2"/>
       </w:pPr>
-      <w:bookmarkStart w:id="40" w:name="_Toc243482191"/>
+      <w:bookmarkStart w:id="40" w:name="_Toc243483876"/>
       <w:r>
         <w:t>Two silent bugs, measured</w:t>
       </w:r>
@@ -9743,7 +9743,7 @@
       <w:pPr>
         <w:pStyle w:val="Titre2"/>
       </w:pPr>
-      <w:bookmarkStart w:id="41" w:name="_Toc243482192"/>
+      <w:bookmarkStart w:id="41" w:name="_Toc243483877"/>
       <w:r>
         <w:lastRenderedPageBreak/>
         <w:t>Painter leakage, measured fairly</w:t>
@@ -10085,7 +10085,7 @@
           <w:noProof/>
         </w:rPr>
         <w:drawing>
-          <wp:inline distT="0" distB="0" distL="0" distR="0" wp14:anchorId="72638155" wp14:editId="72638156">
+          <wp:inline distT="0" distB="0" distL="0" distR="0" wp14:anchorId="01CDD647" wp14:editId="01CDD648">
             <wp:extent cx="4762500" cy="2524125"/>
             <wp:effectExtent l="0" t="0" r="0" b="0"/>
             <wp:docPr id="4" name="05_painter_leakage.png" descr="Painter leakage: same images, same model; only the known-painter group changes." title="Painter leakage: same images, same model; only the known-painter group changes."/>
@@ -10160,7 +10160,7 @@
         <w:pStyle w:val="Titre1"/>
         <w:pageBreakBefore/>
       </w:pPr>
-      <w:bookmarkStart w:id="42" w:name="_Toc243482193"/>
+      <w:bookmarkStart w:id="42" w:name="_Toc243483878"/>
       <w:r>
         <w:lastRenderedPageBreak/>
         <w:t>8. Step 6: final test, CPU cost and recommendation (notebook 06)</w:t>
@@ -10306,7 +10306,7 @@
       <w:pPr>
         <w:pStyle w:val="Titre2"/>
       </w:pPr>
-      <w:bookmarkStart w:id="43" w:name="_Toc243482194"/>
+      <w:bookmarkStart w:id="43" w:name="_Toc243483879"/>
       <w:r>
         <w:t>Classical models (settings chosen on validation)</w:t>
       </w:r>
@@ -10419,7 +10419,7 @@
       <w:pPr>
         <w:pStyle w:val="Titre2"/>
       </w:pPr>
-      <w:bookmarkStart w:id="44" w:name="_Toc243482195"/>
+      <w:bookmarkStart w:id="44" w:name="_Toc243483880"/>
       <w:r>
         <w:t>The final test, measured once</w:t>
       </w:r>
@@ -11450,7 +11450,7 @@
         </w:rPr>
         <w:lastRenderedPageBreak/>
         <w:drawing>
-          <wp:inline distT="0" distB="0" distL="0" distR="0" wp14:anchorId="72638157" wp14:editId="72638158">
+          <wp:inline distT="0" distB="0" distL="0" distR="0" wp14:anchorId="01CDD649" wp14:editId="01CDD64A">
             <wp:extent cx="4762500" cy="1971675"/>
             <wp:effectExtent l="0" t="0" r="0" b="0"/>
             <wp:docPr id="5" name="06_test_accuracy.png" descr="Final test: 220 paintings never seen before, with 95 % bootstrap intervals." title="Final test: 220 paintings never seen before, with 95 % bootstrap intervals."/>
@@ -11509,7 +11509,7 @@
       <w:pPr>
         <w:pStyle w:val="Titre2"/>
       </w:pPr>
-      <w:bookmarkStart w:id="45" w:name="_Toc243482196"/>
+      <w:bookmarkStart w:id="45" w:name="_Toc243483881"/>
       <w:r>
         <w:t>Are the gaps real? Paired bootstrap (same 220 paintings, 5 000 redraws)</w:t>
       </w:r>
@@ -11568,7 +11568,7 @@
       <w:pPr>
         <w:pStyle w:val="Titre2"/>
       </w:pPr>
-      <w:bookmarkStart w:id="46" w:name="_Toc243482197"/>
+      <w:bookmarkStart w:id="46" w:name="_Toc243483882"/>
       <w:r>
         <w:t>Frozen or fine-tuned? Validation and test disagree</w:t>
       </w:r>
@@ -11596,7 +11596,7 @@
       <w:pPr>
         <w:pStyle w:val="Titre2"/>
       </w:pPr>
-      <w:bookmarkStart w:id="47" w:name="_Toc243482198"/>
+      <w:bookmarkStart w:id="47" w:name="_Toc243483883"/>
       <w:r>
         <w:t>Speed and size</w:t>
       </w:r>
@@ -11614,7 +11614,7 @@
       <w:pPr>
         <w:pStyle w:val="Titre2"/>
       </w:pPr>
-      <w:bookmarkStart w:id="48" w:name="_Toc243482199"/>
+      <w:bookmarkStart w:id="48" w:name="_Toc243483884"/>
       <w:r>
         <w:t>Recommendation to the director</w:t>
       </w:r>
@@ -11711,7 +11711,7 @@
         <w:pStyle w:val="Titre1"/>
         <w:pageBreakBefore/>
       </w:pPr>
-      <w:bookmarkStart w:id="49" w:name="_Toc243482200"/>
+      <w:bookmarkStart w:id="49" w:name="_Toc243483885"/>
       <w:r>
         <w:lastRenderedPageBreak/>
         <w:t>9. The random forest, our classical challenger (notebook 06)</w:t>
@@ -11891,14 +11891,14 @@
         <w:rPr>
           <w:color w:val="1C2433"/>
         </w:rPr>
-        <w:t>The random forest on 102 hand-made numbers is our best model without a neural network: 63.5 % on validation, 67.3 % on the test, 16.4 points below the frozen ResNet18 (interval 9.1 to 24.1). Backup slide 11 shows it.</w:t>
+        <w:t>The random forest on 102 hand-made numbers is our best model without a neural network: 63.5 % on validation, 67.3 % on the test, 16.4 points below the frozen ResNet18 (interval 9.1 to 24.1). Backup slide 10 shows it.</w:t>
       </w:r>
     </w:p>
     <w:p>
       <w:pPr>
         <w:pStyle w:val="Titre2"/>
       </w:pPr>
-      <w:bookmarkStart w:id="50" w:name="_Toc243482201"/>
+      <w:bookmarkStart w:id="50" w:name="_Toc243483886"/>
       <w:r>
         <w:t>The 102 hand-made numbers (baselines.py)</w:t>
       </w:r>
@@ -12288,7 +12288,7 @@
       <w:pPr>
         <w:pStyle w:val="Titre2"/>
       </w:pPr>
-      <w:bookmarkStart w:id="51" w:name="_Toc243482202"/>
+      <w:bookmarkStart w:id="51" w:name="_Toc243483887"/>
       <w:r>
         <w:t>Our settings, chosen on validation</w:t>
       </w:r>
@@ -12456,7 +12456,7 @@
       <w:pPr>
         <w:pStyle w:val="Titre2"/>
       </w:pPr>
-      <w:bookmarkStart w:id="52" w:name="_Toc243482203"/>
+      <w:bookmarkStart w:id="52" w:name="_Toc243483888"/>
       <w:r>
         <w:t>Questions on the random forest, with answers</w:t>
       </w:r>
@@ -12721,7 +12721,7 @@
         <w:pStyle w:val="Titre1"/>
         <w:pageBreakBefore/>
       </w:pPr>
-      <w:bookmarkStart w:id="53" w:name="_Toc243482204"/>
+      <w:bookmarkStart w:id="53" w:name="_Toc243483889"/>
       <w:r>
         <w:lastRenderedPageBreak/>
         <w:t>10. Bonus: what about transformers like BERT? (notebook 07)</w:t>
@@ -13588,7 +13588,7 @@
         </w:rPr>
         <w:lastRenderedPageBreak/>
         <w:drawing>
-          <wp:inline distT="0" distB="0" distL="0" distR="0" wp14:anchorId="72638159" wp14:editId="7263815A">
+          <wp:inline distT="0" distB="0" distL="0" distR="0" wp14:anchorId="01CDD64B" wp14:editId="01CDD64C">
             <wp:extent cx="4381500" cy="2486025"/>
             <wp:effectExtent l="0" t="0" r="0" b="0"/>
             <wp:docPr id="6" name="07_transformers_accuracy_vs_speed.png" descr="Transformers on validation: CLIP is more accurate, but slower." title="Transformers on validation: CLIP is more accurate, but slower."/>
@@ -13648,7 +13648,7 @@
         <w:pStyle w:val="Titre1"/>
         <w:pageBreakBefore/>
       </w:pPr>
-      <w:bookmarkStart w:id="54" w:name="_Toc243482205"/>
+      <w:bookmarkStart w:id="54" w:name="_Toc243483890"/>
       <w:r>
         <w:lastRenderedPageBreak/>
         <w:t>11. Key numbers to know by heart</w:t>
@@ -14906,7 +14906,7 @@
         <w:pStyle w:val="Titre1"/>
         <w:pageBreakBefore/>
       </w:pPr>
-      <w:bookmarkStart w:id="55" w:name="_Toc243482206"/>
+      <w:bookmarkStart w:id="55" w:name="_Toc243483891"/>
       <w:r>
         <w:lastRenderedPageBreak/>
         <w:t>12. Concepts in simple words</w:t>
@@ -17097,7 +17097,7 @@
         <w:pStyle w:val="Titre1"/>
         <w:pageBreakBefore/>
       </w:pPr>
-      <w:bookmarkStart w:id="56" w:name="_Toc243482207"/>
+      <w:bookmarkStart w:id="56" w:name="_Toc243483892"/>
       <w:r>
         <w:lastRenderedPageBreak/>
         <w:t>13. Questions you may get, with answers</w:t>
@@ -17119,7 +17119,7 @@
       <w:pPr>
         <w:pStyle w:val="Titre2"/>
       </w:pPr>
-      <w:bookmarkStart w:id="57" w:name="_Toc243482208"/>
+      <w:bookmarkStart w:id="57" w:name="_Toc243483893"/>
       <w:r>
         <w:t>About the data</w:t>
       </w:r>
@@ -17239,7 +17239,7 @@
       <w:pPr>
         <w:pStyle w:val="Titre2"/>
       </w:pPr>
-      <w:bookmarkStart w:id="58" w:name="_Toc243482209"/>
+      <w:bookmarkStart w:id="58" w:name="_Toc243483894"/>
       <w:r>
         <w:t>About the MLP</w:t>
       </w:r>
@@ -17359,7 +17359,7 @@
       <w:pPr>
         <w:pStyle w:val="Titre2"/>
       </w:pPr>
-      <w:bookmarkStart w:id="59" w:name="_Toc243482210"/>
+      <w:bookmarkStart w:id="59" w:name="_Toc243483895"/>
       <w:r>
         <w:t>About training and diagnosis</w:t>
       </w:r>
@@ -17457,7 +17457,7 @@
       <w:pPr>
         <w:pStyle w:val="Titre2"/>
       </w:pPr>
-      <w:bookmarkStart w:id="60" w:name="_Toc243482211"/>
+      <w:bookmarkStart w:id="60" w:name="_Toc243483896"/>
       <w:r>
         <w:lastRenderedPageBreak/>
         <w:t>About ResNet</w:t>
@@ -17600,7 +17600,7 @@
       <w:pPr>
         <w:pStyle w:val="Titre2"/>
       </w:pPr>
-      <w:bookmarkStart w:id="61" w:name="_Toc243482212"/>
+      <w:bookmarkStart w:id="61" w:name="_Toc243483897"/>
       <w:r>
         <w:t>About the results and the recommendation</w:t>
       </w:r>
@@ -17742,7 +17742,7 @@
       <w:pPr>
         <w:pStyle w:val="Titre2"/>
       </w:pPr>
-      <w:bookmarkStart w:id="62" w:name="_Toc243482213"/>
+      <w:bookmarkStart w:id="62" w:name="_Toc243483898"/>
       <w:r>
         <w:lastRenderedPageBreak/>
         <w:t>About the project</w:t>
@@ -17798,7 +17798,7 @@
         <w:pStyle w:val="Titre1"/>
         <w:pageBreakBefore/>
       </w:pPr>
-      <w:bookmarkStart w:id="63" w:name="_Toc243482214"/>
+      <w:bookmarkStart w:id="63" w:name="_Toc243483899"/>
       <w:r>
         <w:lastRenderedPageBreak/>
         <w:t>14. Limits to admit, and next steps</w:t>
@@ -18592,7 +18592,7 @@
         <w:pStyle w:val="Titre1"/>
         <w:pageBreakBefore/>
       </w:pPr>
-      <w:bookmarkStart w:id="64" w:name="_Toc243482215"/>
+      <w:bookmarkStart w:id="64" w:name="_Toc243483900"/>
       <w:r>
         <w:lastRenderedPageBreak/>
         <w:t>15. Git history and how to reproduce</w:t>
@@ -19548,7 +19548,7 @@
         <w:pStyle w:val="Titre1"/>
         <w:pageBreakBefore/>
       </w:pPr>
-      <w:bookmarkStart w:id="65" w:name="_Toc243482216"/>
+      <w:bookmarkStart w:id="65" w:name="_Toc243483901"/>
       <w:r>
         <w:lastRenderedPageBreak/>
         <w:t>16. The 10-minute talk, slide by slide</w:t>
@@ -19563,7 +19563,7 @@
         <w:rPr>
           <w:color w:val="1C2433"/>
         </w:rPr>
-        <w:t>The talk follows the project step by step and gives the answer only at the end. 10 slides, about 55 seconds each: about 9:30 in total, the rest of the 10 minutes is a margin. The speaker notes in the .pptx and oral_script.pdf hold the full text in simple English.</w:t>
+        <w:t>The talk follows the project step by step and gives the answer only at the end. 9 slides, about one minute each: about 8:40 in total, the rest of the 10 minutes is a margin. The speaker notes in the .pptx and oral_script.pdf hold the full text in simple English.</w:t>
       </w:r>
     </w:p>
     <w:tbl>
@@ -20001,7 +20001,7 @@
                 <w:sz w:val="19"/>
                 <w:szCs w:val="19"/>
               </w:rPr>
-              <w:t>0:55</w:t>
+              <w:t>1:05</w:t>
             </w:r>
           </w:p>
         </w:tc>
@@ -20027,7 +20027,7 @@
                 <w:sz w:val="19"/>
                 <w:szCs w:val="19"/>
               </w:rPr>
-              <w:t>0 known painters in two parts; the test is used once.</w:t>
+              <w:t>0 known painters in two parts (otherwise +11 points of flattery); the test is used once.</w:t>
             </w:r>
           </w:p>
         </w:tc>
@@ -20407,7 +20407,7 @@
                 <w:sz w:val="19"/>
                 <w:szCs w:val="19"/>
               </w:rPr>
-              <w:t>Step 4: Seeing the painter inflates the score</w:t>
+              <w:t>Step 5: Final test: the pretrained network wins</w:t>
             </w:r>
           </w:p>
         </w:tc>
@@ -20433,7 +20433,7 @@
                 <w:sz w:val="19"/>
                 <w:szCs w:val="19"/>
               </w:rPr>
-              <w:t>0:55</w:t>
+              <w:t>1:20</w:t>
             </w:r>
           </w:p>
         </w:tc>
@@ -20459,7 +20459,7 @@
                 <w:sz w:val="19"/>
                 <w:szCs w:val="19"/>
               </w:rPr>
-              <w:t>+11.4 points on known painters, no change on the control group.</w:t>
+              <w:t>The classical challenger: 102 hand-made numbers + random forest, 67 %. ResNet +16.4 points (9.1 to 24.1).</w:t>
             </w:r>
           </w:p>
         </w:tc>
@@ -20515,7 +20515,7 @@
                 <w:sz w:val="19"/>
                 <w:szCs w:val="19"/>
               </w:rPr>
-              <w:t>Step 5: Final test: the pretrained network wins</w:t>
+              <w:t>Step 6: Fast and cheap enough for a kiosk</w:t>
             </w:r>
           </w:p>
         </w:tc>
@@ -20542,7 +20542,7 @@
                 <w:sz w:val="19"/>
                 <w:szCs w:val="19"/>
               </w:rPr>
-              <w:t>1:25</w:t>
+              <w:t>0:40</w:t>
             </w:r>
           </w:p>
         </w:tc>
@@ -20569,7 +20569,7 @@
                 <w:sz w:val="19"/>
                 <w:szCs w:val="19"/>
               </w:rPr>
-              <w:t>The classical challenger: 102 hand-made numbers + random forest, 67 %. ResNet +16.4 points (9.1 to 24.1).</w:t>
+              <w:t>53 ms, 45 MB, 17 s of training, no GPU.</w:t>
             </w:r>
           </w:p>
         </w:tc>
@@ -20623,7 +20623,7 @@
                 <w:sz w:val="19"/>
                 <w:szCs w:val="19"/>
               </w:rPr>
-              <w:t>Step 6: Fast and cheap enough for a kiosk</w:t>
+              <w:t>Our choice: frozen ResNet18 + linear head</w:t>
             </w:r>
           </w:p>
         </w:tc>
@@ -20649,7 +20649,7 @@
                 <w:sz w:val="19"/>
                 <w:szCs w:val="19"/>
               </w:rPr>
-              <w:t>0:40</w:t>
+              <w:t>1:00</w:t>
             </w:r>
           </w:p>
         </w:tc>
@@ -20662,116 +20662,6 @@
               <w:bottom w:val="single" w:sz="4" w:space="0" w:color="D9DCE2"/>
               <w:right w:val="single" w:sz="4" w:space="0" w:color="D9DCE2"/>
             </w:tcBorders>
-            <w:tcMar>
-              <w:top w:w="60" w:type="dxa"/>
-              <w:left w:w="100" w:type="dxa"/>
-              <w:bottom w:w="60" w:type="dxa"/>
-              <w:right w:w="100" w:type="dxa"/>
-            </w:tcMar>
-          </w:tcPr>
-          <w:p>
-            <w:r>
-              <w:rPr>
-                <w:sz w:val="19"/>
-                <w:szCs w:val="19"/>
-              </w:rPr>
-              <w:t>53 ms, 45 MB, 17 s of training, no GPU.</w:t>
-            </w:r>
-          </w:p>
-        </w:tc>
-      </w:tr>
-      <w:tr>
-        <w:tc>
-          <w:tcPr>
-            <w:tcW w:w="675" w:type="dxa"/>
-            <w:tcBorders>
-              <w:top w:val="single" w:sz="4" w:space="0" w:color="D9DCE2"/>
-              <w:left w:val="single" w:sz="4" w:space="0" w:color="D9DCE2"/>
-              <w:bottom w:val="single" w:sz="4" w:space="0" w:color="D9DCE2"/>
-              <w:right w:val="single" w:sz="4" w:space="0" w:color="D9DCE2"/>
-            </w:tcBorders>
-            <w:shd w:val="clear" w:color="auto" w:fill="F2F3F5"/>
-            <w:tcMar>
-              <w:top w:w="60" w:type="dxa"/>
-              <w:left w:w="100" w:type="dxa"/>
-              <w:bottom w:w="60" w:type="dxa"/>
-              <w:right w:w="100" w:type="dxa"/>
-            </w:tcMar>
-          </w:tcPr>
-          <w:p>
-            <w:r>
-              <w:rPr>
-                <w:sz w:val="19"/>
-                <w:szCs w:val="19"/>
-              </w:rPr>
-              <w:t>10</w:t>
-            </w:r>
-          </w:p>
-        </w:tc>
-        <w:tc>
-          <w:tcPr>
-            <w:tcW w:w="3181" w:type="dxa"/>
-            <w:tcBorders>
-              <w:top w:val="single" w:sz="4" w:space="0" w:color="D9DCE2"/>
-              <w:left w:val="single" w:sz="4" w:space="0" w:color="D9DCE2"/>
-              <w:bottom w:val="single" w:sz="4" w:space="0" w:color="D9DCE2"/>
-              <w:right w:val="single" w:sz="4" w:space="0" w:color="D9DCE2"/>
-            </w:tcBorders>
-            <w:shd w:val="clear" w:color="auto" w:fill="F2F3F5"/>
-            <w:tcMar>
-              <w:top w:w="60" w:type="dxa"/>
-              <w:left w:w="100" w:type="dxa"/>
-              <w:bottom w:w="60" w:type="dxa"/>
-              <w:right w:w="100" w:type="dxa"/>
-            </w:tcMar>
-          </w:tcPr>
-          <w:p>
-            <w:r>
-              <w:rPr>
-                <w:sz w:val="19"/>
-                <w:szCs w:val="19"/>
-              </w:rPr>
-              <w:t>Our choice: frozen ResNet18 + linear head</w:t>
-            </w:r>
-          </w:p>
-        </w:tc>
-        <w:tc>
-          <w:tcPr>
-            <w:tcW w:w="1157" w:type="dxa"/>
-            <w:tcBorders>
-              <w:top w:val="single" w:sz="4" w:space="0" w:color="D9DCE2"/>
-              <w:left w:val="single" w:sz="4" w:space="0" w:color="D9DCE2"/>
-              <w:bottom w:val="single" w:sz="4" w:space="0" w:color="D9DCE2"/>
-              <w:right w:val="single" w:sz="4" w:space="0" w:color="D9DCE2"/>
-            </w:tcBorders>
-            <w:shd w:val="clear" w:color="auto" w:fill="F2F3F5"/>
-            <w:tcMar>
-              <w:top w:w="60" w:type="dxa"/>
-              <w:left w:w="100" w:type="dxa"/>
-              <w:bottom w:w="60" w:type="dxa"/>
-              <w:right w:w="100" w:type="dxa"/>
-            </w:tcMar>
-          </w:tcPr>
-          <w:p>
-            <w:r>
-              <w:rPr>
-                <w:sz w:val="19"/>
-                <w:szCs w:val="19"/>
-              </w:rPr>
-              <w:t>1:00</w:t>
-            </w:r>
-          </w:p>
-        </w:tc>
-        <w:tc>
-          <w:tcPr>
-            <w:tcW w:w="4625" w:type="dxa"/>
-            <w:tcBorders>
-              <w:top w:val="single" w:sz="4" w:space="0" w:color="D9DCE2"/>
-              <w:left w:val="single" w:sz="4" w:space="0" w:color="D9DCE2"/>
-              <w:bottom w:val="single" w:sz="4" w:space="0" w:color="D9DCE2"/>
-              <w:right w:val="single" w:sz="4" w:space="0" w:color="D9DCE2"/>
-            </w:tcBorders>
-            <w:shd w:val="clear" w:color="auto" w:fill="F2F3F5"/>
             <w:tcMar>
               <w:top w:w="60" w:type="dxa"/>
               <w:left w:w="100" w:type="dxa"/>
@@ -20800,7 +20690,7 @@
       <w:pPr>
         <w:pStyle w:val="Titre2"/>
       </w:pPr>
-      <w:bookmarkStart w:id="66" w:name="_Toc243482217"/>
+      <w:bookmarkStart w:id="66" w:name="_Toc243483902"/>
       <w:r>
         <w:t>The thread: each result opens the next step</w:t>
       </w:r>
@@ -20931,7 +20821,7 @@
         <w:t>Slide 6 to 7</w:t>
       </w:r>
       <w:r>
-        <w:t>: We saw that ResNet18 reaches 88 percent. But a model this strong could cheat, by recognising the painter instead of the style. So now, we check if it cheats.</w:t>
+        <w:t>: We saw that ResNet18 reaches 88 percent on validation. But to answer the director, we also need a challenger without any neural network. So now, step five: the final test of every model.</w:t>
       </w:r>
     </w:p>
     <w:p>
@@ -20951,7 +20841,7 @@
         <w:t>Slide 7 to 8</w:t>
       </w:r>
       <w:r>
-        <w:t>: We saw that our split stops this cheating: we can trust our test. But to answer the director, we also need a challenger without any neural network. So now, step five: the final test of every model.</w:t>
+        <w:t>: We saw that the pretrained network is the most accurate. But accuracy is only half of the director's question. So now, step six: what does it cost on a kiosk?</w:t>
       </w:r>
     </w:p>
     <w:p>
@@ -20971,26 +20861,6 @@
         <w:t>Slide 8 to 9</w:t>
       </w:r>
       <w:r>
-        <w:t>: We saw that the pretrained network is the most accurate. But accuracy is only half of the director's question. So now, step six: what does it cost on a kiosk?</w:t>
-      </w:r>
-    </w:p>
-    <w:p>
-      <w:pPr>
-        <w:pStyle w:val="Paragraphedeliste"/>
-        <w:numPr>
-          <w:ilvl w:val="0"/>
-          <w:numId w:val="3"/>
-        </w:numPr>
-        <w:spacing w:after="80"/>
-      </w:pPr>
-      <w:r>
-        <w:rPr>
-          <w:b/>
-          <w:bCs/>
-        </w:rPr>
-        <w:t>Slide 9 to 10</w:t>
-      </w:r>
-      <w:r>
         <w:t>: We saw that it is accurate, fast and cheap. So now, we have everything we need to answer the director.</w:t>
       </w:r>
     </w:p>
@@ -20999,8 +20869,7 @@
         <w:spacing w:after="120"/>
       </w:pPr>
       <w:r>
-        <w:lastRenderedPageBreak/>
-        <w:t>Slides 11 to 17 are backups for the questions: the random forest, validation vs test, why you can trust the numbers, the training recipes, the four broken runs of notebook 04, where the chosen model fails, and what about transformers (BERT, ViT, CLIP). The word-for-word script is in oral_script.pdf.</w:t>
+        <w:t>Slides 10 to 17 are backups for the questions: the random forest, seeing the painter inflates the score, validation vs test, why you can trust the numbers, the training recipes, the four broken runs of notebook 04, where the chosen model fails, and what about transformers (BERT, ViT, CLIP). The word-for-word script is in oral_script.pdf.</w:t>
       </w:r>
     </w:p>
     <w:sectPr>
@@ -21114,10 +20983,10 @@
 <file path=word/numbering.xml><?xml version="1.0" encoding="utf-8"?>
 <w:numbering xmlns:wpc="http://schemas.microsoft.com/office/word/2010/wordprocessingCanvas" xmlns:cx="http://schemas.microsoft.com/office/drawing/2014/chartex" xmlns:cx1="http://schemas.microsoft.com/office/drawing/2015/9/8/chartex" xmlns:cx2="http://schemas.microsoft.com/office/drawing/2015/10/21/chartex" xmlns:cx3="http://schemas.microsoft.com/office/drawing/2016/5/9/chartex" xmlns:cx4="http://schemas.microsoft.com/office/drawing/2016/5/10/chartex" xmlns:cx5="http://schemas.microsoft.com/office/drawing/2016/5/11/chartex" xmlns:cx6="http://schemas.microsoft.com/office/drawing/2016/5/12/chartex" xmlns:cx7="http://schemas.microsoft.com/office/drawing/2016/5/13/chartex" xmlns:cx8="http://schemas.microsoft.com/office/drawing/2016/5/14/chartex" xmlns:mc="http://schemas.openxmlformats.org/markup-compatibility/2006" xmlns:aink="http://schemas.microsoft.com/office/drawing/2016/ink" xmlns:am3d="http://schemas.microsoft.com/office/drawing/2017/model3d" xmlns:o="urn:schemas-microsoft-com:office:office" xmlns:oel="http://schemas.microsoft.com/office/2019/extlst" xmlns:r="http://schemas.openxmlformats.org/officeDocument/2006/relationships" xmlns:m="http://schemas.openxmlformats.org/officeDocument/2006/math" xmlns:v="urn:schemas-microsoft-com:vml" xmlns:wp14="http://schemas.microsoft.com/office/word/2010/wordprocessingDrawing" xmlns:wp="http://schemas.openxmlformats.org/drawingml/2006/wordprocessingDrawing" xmlns:w10="urn:schemas-microsoft-com:office:word" xmlns:w="http://schemas.openxmlformats.org/wordprocessingml/2006/main" xmlns:w14="http://schemas.microsoft.com/office/word/2010/wordml" xmlns:w15="http://schemas.microsoft.com/office/word/2012/wordml" xmlns:w16cex="http://schemas.microsoft.com/office/word/2018/wordml/cex" xmlns:w16cid="http://schemas.microsoft.com/office/word/2016/wordml/cid" xmlns:w16="http://schemas.microsoft.com/office/word/2018/wordml" xmlns:w16du="http://schemas.microsoft.com/office/word/2023/wordml/word16du" xmlns:w16sdtdh="http://schemas.microsoft.com/office/word/2020/wordml/sdtdatahash" xmlns:w16sdtfl="http://schemas.microsoft.com/office/word/2024/wordml/sdtformatlock" xmlns:w16se="http://schemas.microsoft.com/office/word/2015/wordml/symex" xmlns:wpg="http://schemas.microsoft.com/office/word/2010/wordprocessingGroup" xmlns:wpi="http://schemas.microsoft.com/office/word/2010/wordprocessingInk" xmlns:wne="http://schemas.microsoft.com/office/word/2006/wordml" xmlns:wps="http://schemas.microsoft.com/office/word/2010/wordprocessingShape" mc:Ignorable="w14 w15 w16se w16cid w16 w16cex w16sdtdh w16sdtfl w16du wp14">
   <w:abstractNum w:abstractNumId="0" w15:restartNumberingAfterBreak="0">
-    <w:nsid w:val="16BC4F0B"/>
+    <w:nsid w:val="08A2559D"/>
     <w:multiLevelType w:val="hybridMultilevel"/>
-    <w:tmpl w:val="52086782"/>
-    <w:lvl w:ilvl="0" w:tplc="3DBA5588">
+    <w:tmpl w:val="5850467A"/>
+    <w:lvl w:ilvl="0" w:tplc="4364AC16">
       <w:start w:val="1"/>
       <w:numFmt w:val="decimal"/>
       <w:lvlText w:val="%1."/>
@@ -21126,160 +20995,246 @@
         <w:ind w:left="400" w:hanging="300"/>
       </w:pPr>
     </w:lvl>
-    <w:lvl w:ilvl="1" w:tplc="AFA25B8C">
+    <w:lvl w:ilvl="1" w:tplc="4EE64912">
       <w:numFmt w:val="decimal"/>
       <w:lvlText w:val=""/>
       <w:lvlJc w:val="left"/>
     </w:lvl>
-    <w:lvl w:ilvl="2" w:tplc="A2DEB71C">
+    <w:lvl w:ilvl="2" w:tplc="AD7277AE">
       <w:numFmt w:val="decimal"/>
       <w:lvlText w:val=""/>
       <w:lvlJc w:val="left"/>
     </w:lvl>
-    <w:lvl w:ilvl="3" w:tplc="33C8FA78">
+    <w:lvl w:ilvl="3" w:tplc="D3F4F228">
       <w:numFmt w:val="decimal"/>
       <w:lvlText w:val=""/>
       <w:lvlJc w:val="left"/>
     </w:lvl>
-    <w:lvl w:ilvl="4" w:tplc="5EA2CE2A">
+    <w:lvl w:ilvl="4" w:tplc="72162304">
       <w:numFmt w:val="decimal"/>
       <w:lvlText w:val=""/>
       <w:lvlJc w:val="left"/>
     </w:lvl>
-    <w:lvl w:ilvl="5" w:tplc="BB821D5C">
+    <w:lvl w:ilvl="5" w:tplc="9D3C7E88">
       <w:numFmt w:val="decimal"/>
       <w:lvlText w:val=""/>
       <w:lvlJc w:val="left"/>
     </w:lvl>
-    <w:lvl w:ilvl="6" w:tplc="B9B60B88">
+    <w:lvl w:ilvl="6" w:tplc="92F8E2E6">
       <w:numFmt w:val="decimal"/>
       <w:lvlText w:val=""/>
       <w:lvlJc w:val="left"/>
     </w:lvl>
-    <w:lvl w:ilvl="7" w:tplc="D6EC977C">
+    <w:lvl w:ilvl="7" w:tplc="50B6D16A">
       <w:numFmt w:val="decimal"/>
       <w:lvlText w:val=""/>
       <w:lvlJc w:val="left"/>
     </w:lvl>
-    <w:lvl w:ilvl="8" w:tplc="F9BC4948">
+    <w:lvl w:ilvl="8" w:tplc="7C347110">
       <w:numFmt w:val="decimal"/>
       <w:lvlText w:val=""/>
       <w:lvlJc w:val="left"/>
     </w:lvl>
   </w:abstractNum>
   <w:abstractNum w:abstractNumId="1" w15:restartNumberingAfterBreak="0">
-    <w:nsid w:val="31112937"/>
+    <w:nsid w:val="1E1C50B0"/>
     <w:multiLevelType w:val="hybridMultilevel"/>
-    <w:tmpl w:val="AF2494C4"/>
-    <w:lvl w:ilvl="0" w:tplc="C29C599C">
+    <w:tmpl w:val="6D50F974"/>
+    <w:lvl w:ilvl="0" w:tplc="A23ED0D8">
       <w:start w:val="1"/>
-      <w:numFmt w:val="bullet"/>
-      <w:lvlText w:val="•"/>
+      <w:numFmt w:val="decimal"/>
+      <w:lvlText w:val="%1."/>
       <w:lvlJc w:val="left"/>
       <w:pPr>
-        <w:ind w:left="400" w:hanging="260"/>
+        <w:ind w:left="400" w:hanging="300"/>
       </w:pPr>
     </w:lvl>
-    <w:lvl w:ilvl="1" w:tplc="1E4A5B0A">
+    <w:lvl w:ilvl="1" w:tplc="AC6E9170">
       <w:numFmt w:val="decimal"/>
       <w:lvlText w:val=""/>
       <w:lvlJc w:val="left"/>
     </w:lvl>
-    <w:lvl w:ilvl="2" w:tplc="EF008E20">
+    <w:lvl w:ilvl="2" w:tplc="1A8CD97C">
       <w:numFmt w:val="decimal"/>
       <w:lvlText w:val=""/>
       <w:lvlJc w:val="left"/>
     </w:lvl>
-    <w:lvl w:ilvl="3" w:tplc="D9C04C06">
+    <w:lvl w:ilvl="3" w:tplc="2C3435D4">
       <w:numFmt w:val="decimal"/>
       <w:lvlText w:val=""/>
       <w:lvlJc w:val="left"/>
     </w:lvl>
-    <w:lvl w:ilvl="4" w:tplc="01985DEE">
+    <w:lvl w:ilvl="4" w:tplc="8C0AC75A">
       <w:numFmt w:val="decimal"/>
       <w:lvlText w:val=""/>
       <w:lvlJc w:val="left"/>
     </w:lvl>
-    <w:lvl w:ilvl="5" w:tplc="E648FE6A">
+    <w:lvl w:ilvl="5" w:tplc="78827716">
       <w:numFmt w:val="decimal"/>
       <w:lvlText w:val=""/>
       <w:lvlJc w:val="left"/>
     </w:lvl>
-    <w:lvl w:ilvl="6" w:tplc="CDC6C746">
+    <w:lvl w:ilvl="6" w:tplc="1CFE8976">
       <w:numFmt w:val="decimal"/>
       <w:lvlText w:val=""/>
       <w:lvlJc w:val="left"/>
     </w:lvl>
-    <w:lvl w:ilvl="7" w:tplc="4A8AFED6">
+    <w:lvl w:ilvl="7" w:tplc="005ABABA">
       <w:numFmt w:val="decimal"/>
       <w:lvlText w:val=""/>
       <w:lvlJc w:val="left"/>
     </w:lvl>
-    <w:lvl w:ilvl="8" w:tplc="EE32B8E4">
+    <w:lvl w:ilvl="8" w:tplc="192630AE">
       <w:numFmt w:val="decimal"/>
       <w:lvlText w:val=""/>
       <w:lvlJc w:val="left"/>
     </w:lvl>
   </w:abstractNum>
   <w:abstractNum w:abstractNumId="2" w15:restartNumberingAfterBreak="0">
-    <w:nsid w:val="514D2F0C"/>
+    <w:nsid w:val="378F1933"/>
     <w:multiLevelType w:val="hybridMultilevel"/>
-    <w:tmpl w:val="41D869F2"/>
-    <w:lvl w:ilvl="0" w:tplc="09067050">
+    <w:tmpl w:val="D322474E"/>
+    <w:lvl w:ilvl="0" w:tplc="D7B02DA8">
       <w:start w:val="1"/>
-      <w:numFmt w:val="decimal"/>
-      <w:lvlText w:val="%1."/>
+      <w:numFmt w:val="bullet"/>
+      <w:lvlText w:val="•"/>
       <w:lvlJc w:val="left"/>
       <w:pPr>
-        <w:ind w:left="400" w:hanging="300"/>
+        <w:ind w:left="400" w:hanging="260"/>
       </w:pPr>
     </w:lvl>
-    <w:lvl w:ilvl="1" w:tplc="12AC9828">
+    <w:lvl w:ilvl="1" w:tplc="E91EB044">
       <w:numFmt w:val="decimal"/>
       <w:lvlText w:val=""/>
       <w:lvlJc w:val="left"/>
     </w:lvl>
-    <w:lvl w:ilvl="2" w:tplc="E4B0D554">
+    <w:lvl w:ilvl="2" w:tplc="C186D2FA">
       <w:numFmt w:val="decimal"/>
       <w:lvlText w:val=""/>
       <w:lvlJc w:val="left"/>
     </w:lvl>
-    <w:lvl w:ilvl="3" w:tplc="B05A1BE4">
+    <w:lvl w:ilvl="3" w:tplc="7214CC4A">
       <w:numFmt w:val="decimal"/>
       <w:lvlText w:val=""/>
       <w:lvlJc w:val="left"/>
     </w:lvl>
-    <w:lvl w:ilvl="4" w:tplc="5CAA598C">
+    <w:lvl w:ilvl="4" w:tplc="C9CE5A20">
       <w:numFmt w:val="decimal"/>
       <w:lvlText w:val=""/>
       <w:lvlJc w:val="left"/>
     </w:lvl>
-    <w:lvl w:ilvl="5" w:tplc="A6A22E36">
+    <w:lvl w:ilvl="5" w:tplc="F97251A6">
       <w:numFmt w:val="decimal"/>
       <w:lvlText w:val=""/>
       <w:lvlJc w:val="left"/>
     </w:lvl>
-    <w:lvl w:ilvl="6" w:tplc="183E85C4">
+    <w:lvl w:ilvl="6" w:tplc="E856F346">
       <w:numFmt w:val="decimal"/>
       <w:lvlText w:val=""/>
       <w:lvlJc w:val="left"/>
     </w:lvl>
-    <w:lvl w:ilvl="7" w:tplc="549A1CFA">
+    <w:lvl w:ilvl="7" w:tplc="7CAE9DBE">
       <w:numFmt w:val="decimal"/>
       <w:lvlText w:val=""/>
       <w:lvlJc w:val="left"/>
     </w:lvl>
-    <w:lvl w:ilvl="8" w:tplc="11567EF6">
+    <w:lvl w:ilvl="8" w:tplc="E848AE0C">
       <w:numFmt w:val="decimal"/>
       <w:lvlText w:val=""/>
       <w:lvlJc w:val="left"/>
     </w:lvl>
   </w:abstractNum>
   <w:abstractNum w:abstractNumId="3" w15:restartNumberingAfterBreak="0">
-    <w:nsid w:val="6CAE30B5"/>
+    <w:nsid w:val="50173E7F"/>
     <w:multiLevelType w:val="hybridMultilevel"/>
-    <w:tmpl w:val="7EF8661C"/>
-    <w:lvl w:ilvl="0" w:tplc="C36EF344">
+    <w:tmpl w:val="6BEC9AA8"/>
+    <w:lvl w:ilvl="0" w:tplc="CAFE0D22" w:tentative="1">
+      <w:start w:val="1"/>
+      <w:numFmt w:val="bullet"/>
+      <w:lvlText w:val="●"/>
+      <w:lvlJc w:val="left"/>
+      <w:pPr>
+        <w:ind w:left="720" w:hanging="360"/>
+      </w:pPr>
+    </w:lvl>
+    <w:lvl w:ilvl="1" w:tplc="22C2BC6E" w:tentative="1">
+      <w:start w:val="1"/>
+      <w:numFmt w:val="bullet"/>
+      <w:lvlText w:val="○"/>
+      <w:lvlJc w:val="left"/>
+      <w:pPr>
+        <w:ind w:left="1440" w:hanging="360"/>
+      </w:pPr>
+    </w:lvl>
+    <w:lvl w:ilvl="2" w:tplc="3BA244E2" w:tentative="1">
+      <w:start w:val="1"/>
+      <w:numFmt w:val="bullet"/>
+      <w:lvlText w:val="■"/>
+      <w:lvlJc w:val="left"/>
+      <w:pPr>
+        <w:ind w:left="2160" w:hanging="360"/>
+      </w:pPr>
+    </w:lvl>
+    <w:lvl w:ilvl="3" w:tplc="0EA42E34" w:tentative="1">
+      <w:start w:val="1"/>
+      <w:numFmt w:val="bullet"/>
+      <w:lvlText w:val="●"/>
+      <w:lvlJc w:val="left"/>
+      <w:pPr>
+        <w:ind w:left="2880" w:hanging="360"/>
+      </w:pPr>
+    </w:lvl>
+    <w:lvl w:ilvl="4" w:tplc="FBD85058" w:tentative="1">
+      <w:start w:val="1"/>
+      <w:numFmt w:val="bullet"/>
+      <w:lvlText w:val="○"/>
+      <w:lvlJc w:val="left"/>
+      <w:pPr>
+        <w:ind w:left="3600" w:hanging="360"/>
+      </w:pPr>
+    </w:lvl>
+    <w:lvl w:ilvl="5" w:tplc="A5F66A34" w:tentative="1">
+      <w:start w:val="1"/>
+      <w:numFmt w:val="bullet"/>
+      <w:lvlText w:val="■"/>
+      <w:lvlJc w:val="left"/>
+      <w:pPr>
+        <w:ind w:left="4320" w:hanging="360"/>
+      </w:pPr>
+    </w:lvl>
+    <w:lvl w:ilvl="6" w:tplc="CDA027A4" w:tentative="1">
+      <w:start w:val="1"/>
+      <w:numFmt w:val="bullet"/>
+      <w:lvlText w:val="●"/>
+      <w:lvlJc w:val="left"/>
+      <w:pPr>
+        <w:ind w:left="5040" w:hanging="360"/>
+      </w:pPr>
+    </w:lvl>
+    <w:lvl w:ilvl="7" w:tplc="47FAB40C" w:tentative="1">
+      <w:start w:val="1"/>
+      <w:numFmt w:val="bullet"/>
+      <w:lvlText w:val="●"/>
+      <w:lvlJc w:val="left"/>
+      <w:pPr>
+        <w:ind w:left="5760" w:hanging="360"/>
+      </w:pPr>
+    </w:lvl>
+    <w:lvl w:ilvl="8" w:tplc="C2607F28" w:tentative="1">
+      <w:start w:val="1"/>
+      <w:numFmt w:val="bullet"/>
+      <w:lvlText w:val="●"/>
+      <w:lvlJc w:val="left"/>
+      <w:pPr>
+        <w:ind w:left="6480" w:hanging="360"/>
+      </w:pPr>
+    </w:lvl>
+  </w:abstractNum>
+  <w:abstractNum w:abstractNumId="4" w15:restartNumberingAfterBreak="0">
+    <w:nsid w:val="50300502"/>
+    <w:multiLevelType w:val="hybridMultilevel"/>
+    <w:tmpl w:val="7ED4EC70"/>
+    <w:lvl w:ilvl="0" w:tplc="44AA9334">
       <w:start w:val="1"/>
       <w:numFmt w:val="decimal"/>
       <w:lvlText w:val="%1."/>
@@ -21288,159 +21243,73 @@
         <w:ind w:left="400" w:hanging="300"/>
       </w:pPr>
     </w:lvl>
-    <w:lvl w:ilvl="1" w:tplc="111254E4">
+    <w:lvl w:ilvl="1" w:tplc="DF78793E">
       <w:numFmt w:val="decimal"/>
       <w:lvlText w:val=""/>
       <w:lvlJc w:val="left"/>
     </w:lvl>
-    <w:lvl w:ilvl="2" w:tplc="06FAFC94">
+    <w:lvl w:ilvl="2" w:tplc="9FC6F432">
       <w:numFmt w:val="decimal"/>
       <w:lvlText w:val=""/>
       <w:lvlJc w:val="left"/>
     </w:lvl>
-    <w:lvl w:ilvl="3" w:tplc="7D42C3D8">
+    <w:lvl w:ilvl="3" w:tplc="E534963E">
       <w:numFmt w:val="decimal"/>
       <w:lvlText w:val=""/>
       <w:lvlJc w:val="left"/>
     </w:lvl>
-    <w:lvl w:ilvl="4" w:tplc="EF60EA4A">
+    <w:lvl w:ilvl="4" w:tplc="43DA8B72">
       <w:numFmt w:val="decimal"/>
       <w:lvlText w:val=""/>
       <w:lvlJc w:val="left"/>
     </w:lvl>
-    <w:lvl w:ilvl="5" w:tplc="CBFAC4D6">
+    <w:lvl w:ilvl="5" w:tplc="2668DF1E">
       <w:numFmt w:val="decimal"/>
       <w:lvlText w:val=""/>
       <w:lvlJc w:val="left"/>
     </w:lvl>
-    <w:lvl w:ilvl="6" w:tplc="D520C694">
+    <w:lvl w:ilvl="6" w:tplc="101A23F8">
       <w:numFmt w:val="decimal"/>
       <w:lvlText w:val=""/>
       <w:lvlJc w:val="left"/>
     </w:lvl>
-    <w:lvl w:ilvl="7" w:tplc="CA162DEA">
+    <w:lvl w:ilvl="7" w:tplc="2DCE91B0">
       <w:numFmt w:val="decimal"/>
       <w:lvlText w:val=""/>
       <w:lvlJc w:val="left"/>
     </w:lvl>
-    <w:lvl w:ilvl="8" w:tplc="E9D8C1B0">
+    <w:lvl w:ilvl="8" w:tplc="88524018">
       <w:numFmt w:val="decimal"/>
       <w:lvlText w:val=""/>
       <w:lvlJc w:val="left"/>
     </w:lvl>
   </w:abstractNum>
-  <w:abstractNum w:abstractNumId="4" w15:restartNumberingAfterBreak="0">
-    <w:nsid w:val="6DD97387"/>
-    <w:multiLevelType w:val="hybridMultilevel"/>
-    <w:tmpl w:val="B57E4310"/>
-    <w:lvl w:ilvl="0" w:tplc="14648082" w:tentative="1">
-      <w:start w:val="1"/>
-      <w:numFmt w:val="bullet"/>
-      <w:lvlText w:val="●"/>
-      <w:lvlJc w:val="left"/>
-      <w:pPr>
-        <w:ind w:left="720" w:hanging="360"/>
-      </w:pPr>
-    </w:lvl>
-    <w:lvl w:ilvl="1" w:tplc="875668EE" w:tentative="1">
-      <w:start w:val="1"/>
-      <w:numFmt w:val="bullet"/>
-      <w:lvlText w:val="○"/>
-      <w:lvlJc w:val="left"/>
-      <w:pPr>
-        <w:ind w:left="1440" w:hanging="360"/>
-      </w:pPr>
-    </w:lvl>
-    <w:lvl w:ilvl="2" w:tplc="F264B130" w:tentative="1">
-      <w:start w:val="1"/>
-      <w:numFmt w:val="bullet"/>
-      <w:lvlText w:val="■"/>
-      <w:lvlJc w:val="left"/>
-      <w:pPr>
-        <w:ind w:left="2160" w:hanging="360"/>
-      </w:pPr>
-    </w:lvl>
-    <w:lvl w:ilvl="3" w:tplc="ECF8AF3E" w:tentative="1">
-      <w:start w:val="1"/>
-      <w:numFmt w:val="bullet"/>
-      <w:lvlText w:val="●"/>
-      <w:lvlJc w:val="left"/>
-      <w:pPr>
-        <w:ind w:left="2880" w:hanging="360"/>
-      </w:pPr>
-    </w:lvl>
-    <w:lvl w:ilvl="4" w:tplc="6EF8B604" w:tentative="1">
-      <w:start w:val="1"/>
-      <w:numFmt w:val="bullet"/>
-      <w:lvlText w:val="○"/>
-      <w:lvlJc w:val="left"/>
-      <w:pPr>
-        <w:ind w:left="3600" w:hanging="360"/>
-      </w:pPr>
-    </w:lvl>
-    <w:lvl w:ilvl="5" w:tplc="69D69B9A" w:tentative="1">
-      <w:start w:val="1"/>
-      <w:numFmt w:val="bullet"/>
-      <w:lvlText w:val="■"/>
-      <w:lvlJc w:val="left"/>
-      <w:pPr>
-        <w:ind w:left="4320" w:hanging="360"/>
-      </w:pPr>
-    </w:lvl>
-    <w:lvl w:ilvl="6" w:tplc="CD04A76E" w:tentative="1">
-      <w:start w:val="1"/>
-      <w:numFmt w:val="bullet"/>
-      <w:lvlText w:val="●"/>
-      <w:lvlJc w:val="left"/>
-      <w:pPr>
-        <w:ind w:left="5040" w:hanging="360"/>
-      </w:pPr>
-    </w:lvl>
-    <w:lvl w:ilvl="7" w:tplc="B5E0C23A" w:tentative="1">
-      <w:start w:val="1"/>
-      <w:numFmt w:val="bullet"/>
-      <w:lvlText w:val="●"/>
-      <w:lvlJc w:val="left"/>
-      <w:pPr>
-        <w:ind w:left="5760" w:hanging="360"/>
-      </w:pPr>
-    </w:lvl>
-    <w:lvl w:ilvl="8" w:tplc="A9F80204" w:tentative="1">
-      <w:start w:val="1"/>
-      <w:numFmt w:val="bullet"/>
-      <w:lvlText w:val="●"/>
-      <w:lvlJc w:val="left"/>
-      <w:pPr>
-        <w:ind w:left="6480" w:hanging="360"/>
-      </w:pPr>
-    </w:lvl>
-  </w:abstractNum>
-  <w:num w:numId="1" w16cid:durableId="1478524509">
-    <w:abstractNumId w:val="4"/>
-    <w:lvlOverride w:ilvl="0">
-      <w:startOverride w:val="1"/>
-    </w:lvlOverride>
-  </w:num>
-  <w:num w:numId="2" w16cid:durableId="826484160">
+  <w:num w:numId="1" w16cid:durableId="1439136863">
     <w:abstractNumId w:val="3"/>
     <w:lvlOverride w:ilvl="0">
       <w:startOverride w:val="1"/>
     </w:lvlOverride>
   </w:num>
-  <w:num w:numId="3" w16cid:durableId="1126580568">
+  <w:num w:numId="2" w16cid:durableId="1820925962">
     <w:abstractNumId w:val="1"/>
     <w:lvlOverride w:ilvl="0">
       <w:startOverride w:val="1"/>
     </w:lvlOverride>
   </w:num>
-  <w:num w:numId="4" w16cid:durableId="935599884">
+  <w:num w:numId="3" w16cid:durableId="597176488">
     <w:abstractNumId w:val="2"/>
     <w:lvlOverride w:ilvl="0">
       <w:startOverride w:val="1"/>
     </w:lvlOverride>
   </w:num>
-  <w:num w:numId="5" w16cid:durableId="1778021736">
+  <w:num w:numId="4" w16cid:durableId="744955621">
     <w:abstractNumId w:val="0"/>
+    <w:lvlOverride w:ilvl="0">
+      <w:startOverride w:val="1"/>
+    </w:lvlOverride>
+  </w:num>
+  <w:num w:numId="5" w16cid:durableId="1715421409">
+    <w:abstractNumId w:val="4"/>
     <w:lvlOverride w:ilvl="0">
       <w:startOverride w:val="1"/>
     </w:lvlOverride>
@@ -22080,7 +21949,7 @@
     <w:autoRedefine/>
     <w:uiPriority w:val="39"/>
     <w:unhideWhenUsed/>
-    <w:rsid w:val="00D53842"/>
+    <w:rsid w:val="00137B00"/>
     <w:pPr>
       <w:spacing w:after="100"/>
     </w:pPr>
@@ -22092,7 +21961,7 @@
     <w:autoRedefine/>
     <w:uiPriority w:val="39"/>
     <w:unhideWhenUsed/>
-    <w:rsid w:val="00D53842"/>
+    <w:rsid w:val="00137B00"/>
     <w:pPr>
       <w:spacing w:after="100"/>
       <w:ind w:left="210"/>

</xml_diff>

<commit_message>
Update the study guide for the 11-slide talk and add ResNet questions
</commit_message>
<xml_diff>
--- a/docs/oral_study_guide.docx
+++ b/docs/oral_study_guide.docx
@@ -93,7 +93,7 @@
     <w:sdt>
       <w:sdtPr>
         <w:alias w:val="Contents"/>
-        <w:id w:val="25530565"/>
+        <w:id w:val="1014962769"/>
       </w:sdtPr>
       <w:sdtEndPr/>
       <w:sdtContent>
@@ -116,7 +116,7 @@
           <w:r>
             <w:fldChar w:fldCharType="separate"/>
           </w:r>
-          <w:hyperlink w:anchor="_Toc243483836" w:history="1">
+          <w:hyperlink w:anchor="_Toc243484915" w:history="1">
             <w:r>
               <w:rPr>
                 <w:rStyle w:val="Lienhypertexte"/>
@@ -140,7 +140,7 @@
               <w:rPr>
                 <w:noProof/>
               </w:rPr>
-              <w:instrText xml:space="preserve"> PAGEREF _Toc243483836 \h </w:instrText>
+              <w:instrText xml:space="preserve"> PAGEREF _Toc243484915 \h </w:instrText>
             </w:r>
             <w:r>
               <w:rPr>
@@ -177,7 +177,7 @@
               <w:noProof/>
             </w:rPr>
           </w:pPr>
-          <w:hyperlink w:anchor="_Toc243483837" w:history="1">
+          <w:hyperlink w:anchor="_Toc243484916" w:history="1">
             <w:r>
               <w:rPr>
                 <w:rStyle w:val="Lienhypertexte"/>
@@ -201,7 +201,7 @@
               <w:rPr>
                 <w:noProof/>
               </w:rPr>
-              <w:instrText xml:space="preserve"> PAGEREF _Toc243483837 \h </w:instrText>
+              <w:instrText xml:space="preserve"> PAGEREF _Toc243484916 \h </w:instrText>
             </w:r>
             <w:r>
               <w:rPr>
@@ -238,7 +238,7 @@
               <w:noProof/>
             </w:rPr>
           </w:pPr>
-          <w:hyperlink w:anchor="_Toc243483838" w:history="1">
+          <w:hyperlink w:anchor="_Toc243484917" w:history="1">
             <w:r>
               <w:rPr>
                 <w:rStyle w:val="Lienhypertexte"/>
@@ -262,7 +262,7 @@
               <w:rPr>
                 <w:noProof/>
               </w:rPr>
-              <w:instrText xml:space="preserve"> PAGEREF _Toc243483838 \h </w:instrText>
+              <w:instrText xml:space="preserve"> PAGEREF _Toc243484917 \h </w:instrText>
             </w:r>
             <w:r>
               <w:rPr>
@@ -299,7 +299,7 @@
               <w:noProof/>
             </w:rPr>
           </w:pPr>
-          <w:hyperlink w:anchor="_Toc243483839" w:history="1">
+          <w:hyperlink w:anchor="_Toc243484918" w:history="1">
             <w:r>
               <w:rPr>
                 <w:rStyle w:val="Lienhypertexte"/>
@@ -323,7 +323,7 @@
               <w:rPr>
                 <w:noProof/>
               </w:rPr>
-              <w:instrText xml:space="preserve"> PAGEREF _Toc243483839 \h </w:instrText>
+              <w:instrText xml:space="preserve"> PAGEREF _Toc243484918 \h </w:instrText>
             </w:r>
             <w:r>
               <w:rPr>
@@ -360,7 +360,7 @@
               <w:noProof/>
             </w:rPr>
           </w:pPr>
-          <w:hyperlink w:anchor="_Toc243483840" w:history="1">
+          <w:hyperlink w:anchor="_Toc243484919" w:history="1">
             <w:r>
               <w:rPr>
                 <w:rStyle w:val="Lienhypertexte"/>
@@ -384,7 +384,7 @@
               <w:rPr>
                 <w:noProof/>
               </w:rPr>
-              <w:instrText xml:space="preserve"> PAGEREF _Toc243483840 \h </w:instrText>
+              <w:instrText xml:space="preserve"> PAGEREF _Toc243484919 \h </w:instrText>
             </w:r>
             <w:r>
               <w:rPr>
@@ -421,7 +421,7 @@
               <w:noProof/>
             </w:rPr>
           </w:pPr>
-          <w:hyperlink w:anchor="_Toc243483841" w:history="1">
+          <w:hyperlink w:anchor="_Toc243484920" w:history="1">
             <w:r>
               <w:rPr>
                 <w:rStyle w:val="Lienhypertexte"/>
@@ -445,7 +445,7 @@
               <w:rPr>
                 <w:noProof/>
               </w:rPr>
-              <w:instrText xml:space="preserve"> PAGEREF _Toc243483841 \h </w:instrText>
+              <w:instrText xml:space="preserve"> PAGEREF _Toc243484920 \h </w:instrText>
             </w:r>
             <w:r>
               <w:rPr>
@@ -482,7 +482,7 @@
               <w:noProof/>
             </w:rPr>
           </w:pPr>
-          <w:hyperlink w:anchor="_Toc243483842" w:history="1">
+          <w:hyperlink w:anchor="_Toc243484921" w:history="1">
             <w:r>
               <w:rPr>
                 <w:rStyle w:val="Lienhypertexte"/>
@@ -506,7 +506,7 @@
               <w:rPr>
                 <w:noProof/>
               </w:rPr>
-              <w:instrText xml:space="preserve"> PAGEREF _Toc243483842 \h </w:instrText>
+              <w:instrText xml:space="preserve"> PAGEREF _Toc243484921 \h </w:instrText>
             </w:r>
             <w:r>
               <w:rPr>
@@ -543,7 +543,7 @@
               <w:noProof/>
             </w:rPr>
           </w:pPr>
-          <w:hyperlink w:anchor="_Toc243483843" w:history="1">
+          <w:hyperlink w:anchor="_Toc243484922" w:history="1">
             <w:r>
               <w:rPr>
                 <w:rStyle w:val="Lienhypertexte"/>
@@ -567,7 +567,7 @@
               <w:rPr>
                 <w:noProof/>
               </w:rPr>
-              <w:instrText xml:space="preserve"> PAGEREF _Toc243483843 \h </w:instrText>
+              <w:instrText xml:space="preserve"> PAGEREF _Toc243484922 \h </w:instrText>
             </w:r>
             <w:r>
               <w:rPr>
@@ -604,7 +604,7 @@
               <w:noProof/>
             </w:rPr>
           </w:pPr>
-          <w:hyperlink w:anchor="_Toc243483844" w:history="1">
+          <w:hyperlink w:anchor="_Toc243484923" w:history="1">
             <w:r>
               <w:rPr>
                 <w:rStyle w:val="Lienhypertexte"/>
@@ -628,7 +628,7 @@
               <w:rPr>
                 <w:noProof/>
               </w:rPr>
-              <w:instrText xml:space="preserve"> PAGEREF _Toc243483844 \h </w:instrText>
+              <w:instrText xml:space="preserve"> PAGEREF _Toc243484923 \h </w:instrText>
             </w:r>
             <w:r>
               <w:rPr>
@@ -665,7 +665,7 @@
               <w:noProof/>
             </w:rPr>
           </w:pPr>
-          <w:hyperlink w:anchor="_Toc243483845" w:history="1">
+          <w:hyperlink w:anchor="_Toc243484924" w:history="1">
             <w:r>
               <w:rPr>
                 <w:rStyle w:val="Lienhypertexte"/>
@@ -689,7 +689,7 @@
               <w:rPr>
                 <w:noProof/>
               </w:rPr>
-              <w:instrText xml:space="preserve"> PAGEREF _Toc243483845 \h </w:instrText>
+              <w:instrText xml:space="preserve"> PAGEREF _Toc243484924 \h </w:instrText>
             </w:r>
             <w:r>
               <w:rPr>
@@ -726,7 +726,7 @@
               <w:noProof/>
             </w:rPr>
           </w:pPr>
-          <w:hyperlink w:anchor="_Toc243483846" w:history="1">
+          <w:hyperlink w:anchor="_Toc243484925" w:history="1">
             <w:r>
               <w:rPr>
                 <w:rStyle w:val="Lienhypertexte"/>
@@ -750,7 +750,7 @@
               <w:rPr>
                 <w:noProof/>
               </w:rPr>
-              <w:instrText xml:space="preserve"> PAGEREF _Toc243483846 \h </w:instrText>
+              <w:instrText xml:space="preserve"> PAGEREF _Toc243484925 \h </w:instrText>
             </w:r>
             <w:r>
               <w:rPr>
@@ -787,7 +787,7 @@
               <w:noProof/>
             </w:rPr>
           </w:pPr>
-          <w:hyperlink w:anchor="_Toc243483847" w:history="1">
+          <w:hyperlink w:anchor="_Toc243484926" w:history="1">
             <w:r>
               <w:rPr>
                 <w:rStyle w:val="Lienhypertexte"/>
@@ -811,7 +811,7 @@
               <w:rPr>
                 <w:noProof/>
               </w:rPr>
-              <w:instrText xml:space="preserve"> PAGEREF _Toc243483847 \h </w:instrText>
+              <w:instrText xml:space="preserve"> PAGEREF _Toc243484926 \h </w:instrText>
             </w:r>
             <w:r>
               <w:rPr>
@@ -848,7 +848,7 @@
               <w:noProof/>
             </w:rPr>
           </w:pPr>
-          <w:hyperlink w:anchor="_Toc243483848" w:history="1">
+          <w:hyperlink w:anchor="_Toc243484927" w:history="1">
             <w:r>
               <w:rPr>
                 <w:rStyle w:val="Lienhypertexte"/>
@@ -872,7 +872,7 @@
               <w:rPr>
                 <w:noProof/>
               </w:rPr>
-              <w:instrText xml:space="preserve"> PAGEREF _Toc243483848 \h </w:instrText>
+              <w:instrText xml:space="preserve"> PAGEREF _Toc243484927 \h </w:instrText>
             </w:r>
             <w:r>
               <w:rPr>
@@ -909,7 +909,7 @@
               <w:noProof/>
             </w:rPr>
           </w:pPr>
-          <w:hyperlink w:anchor="_Toc243483849" w:history="1">
+          <w:hyperlink w:anchor="_Toc243484928" w:history="1">
             <w:r>
               <w:rPr>
                 <w:rStyle w:val="Lienhypertexte"/>
@@ -933,7 +933,7 @@
               <w:rPr>
                 <w:noProof/>
               </w:rPr>
-              <w:instrText xml:space="preserve"> PAGEREF _Toc243483849 \h </w:instrText>
+              <w:instrText xml:space="preserve"> PAGEREF _Toc243484928 \h </w:instrText>
             </w:r>
             <w:r>
               <w:rPr>
@@ -970,7 +970,7 @@
               <w:noProof/>
             </w:rPr>
           </w:pPr>
-          <w:hyperlink w:anchor="_Toc243483850" w:history="1">
+          <w:hyperlink w:anchor="_Toc243484929" w:history="1">
             <w:r>
               <w:rPr>
                 <w:rStyle w:val="Lienhypertexte"/>
@@ -994,7 +994,7 @@
               <w:rPr>
                 <w:noProof/>
               </w:rPr>
-              <w:instrText xml:space="preserve"> PAGEREF _Toc243483850 \h </w:instrText>
+              <w:instrText xml:space="preserve"> PAGEREF _Toc243484929 \h </w:instrText>
             </w:r>
             <w:r>
               <w:rPr>
@@ -1031,7 +1031,7 @@
               <w:noProof/>
             </w:rPr>
           </w:pPr>
-          <w:hyperlink w:anchor="_Toc243483851" w:history="1">
+          <w:hyperlink w:anchor="_Toc243484930" w:history="1">
             <w:r>
               <w:rPr>
                 <w:rStyle w:val="Lienhypertexte"/>
@@ -1055,7 +1055,7 @@
               <w:rPr>
                 <w:noProof/>
               </w:rPr>
-              <w:instrText xml:space="preserve"> PAGEREF _Toc243483851 \h </w:instrText>
+              <w:instrText xml:space="preserve"> PAGEREF _Toc243484930 \h </w:instrText>
             </w:r>
             <w:r>
               <w:rPr>
@@ -1092,7 +1092,7 @@
               <w:noProof/>
             </w:rPr>
           </w:pPr>
-          <w:hyperlink w:anchor="_Toc243483852" w:history="1">
+          <w:hyperlink w:anchor="_Toc243484931" w:history="1">
             <w:r>
               <w:rPr>
                 <w:rStyle w:val="Lienhypertexte"/>
@@ -1116,7 +1116,7 @@
               <w:rPr>
                 <w:noProof/>
               </w:rPr>
-              <w:instrText xml:space="preserve"> PAGEREF _Toc243483852 \h </w:instrText>
+              <w:instrText xml:space="preserve"> PAGEREF _Toc243484931 \h </w:instrText>
             </w:r>
             <w:r>
               <w:rPr>
@@ -1153,7 +1153,7 @@
               <w:noProof/>
             </w:rPr>
           </w:pPr>
-          <w:hyperlink w:anchor="_Toc243483853" w:history="1">
+          <w:hyperlink w:anchor="_Toc243484932" w:history="1">
             <w:r>
               <w:rPr>
                 <w:rStyle w:val="Lienhypertexte"/>
@@ -1177,7 +1177,7 @@
               <w:rPr>
                 <w:noProof/>
               </w:rPr>
-              <w:instrText xml:space="preserve"> PAGEREF _Toc243483853 \h </w:instrText>
+              <w:instrText xml:space="preserve"> PAGEREF _Toc243484932 \h </w:instrText>
             </w:r>
             <w:r>
               <w:rPr>
@@ -1214,7 +1214,7 @@
               <w:noProof/>
             </w:rPr>
           </w:pPr>
-          <w:hyperlink w:anchor="_Toc243483854" w:history="1">
+          <w:hyperlink w:anchor="_Toc243484933" w:history="1">
             <w:r>
               <w:rPr>
                 <w:rStyle w:val="Lienhypertexte"/>
@@ -1238,7 +1238,7 @@
               <w:rPr>
                 <w:noProof/>
               </w:rPr>
-              <w:instrText xml:space="preserve"> PAGEREF _Toc243483854 \h </w:instrText>
+              <w:instrText xml:space="preserve"> PAGEREF _Toc243484933 \h </w:instrText>
             </w:r>
             <w:r>
               <w:rPr>
@@ -1275,7 +1275,7 @@
               <w:noProof/>
             </w:rPr>
           </w:pPr>
-          <w:hyperlink w:anchor="_Toc243483855" w:history="1">
+          <w:hyperlink w:anchor="_Toc243484934" w:history="1">
             <w:r>
               <w:rPr>
                 <w:rStyle w:val="Lienhypertexte"/>
@@ -1299,7 +1299,7 @@
               <w:rPr>
                 <w:noProof/>
               </w:rPr>
-              <w:instrText xml:space="preserve"> PAGEREF _Toc243483855 \h </w:instrText>
+              <w:instrText xml:space="preserve"> PAGEREF _Toc243484934 \h </w:instrText>
             </w:r>
             <w:r>
               <w:rPr>
@@ -1336,7 +1336,7 @@
               <w:noProof/>
             </w:rPr>
           </w:pPr>
-          <w:hyperlink w:anchor="_Toc243483856" w:history="1">
+          <w:hyperlink w:anchor="_Toc243484935" w:history="1">
             <w:r>
               <w:rPr>
                 <w:rStyle w:val="Lienhypertexte"/>
@@ -1360,7 +1360,7 @@
               <w:rPr>
                 <w:noProof/>
               </w:rPr>
-              <w:instrText xml:space="preserve"> PAGEREF _Toc243483856 \h </w:instrText>
+              <w:instrText xml:space="preserve"> PAGEREF _Toc243484935 \h </w:instrText>
             </w:r>
             <w:r>
               <w:rPr>
@@ -1397,7 +1397,7 @@
               <w:noProof/>
             </w:rPr>
           </w:pPr>
-          <w:hyperlink w:anchor="_Toc243483857" w:history="1">
+          <w:hyperlink w:anchor="_Toc243484936" w:history="1">
             <w:r>
               <w:rPr>
                 <w:rStyle w:val="Lienhypertexte"/>
@@ -1421,7 +1421,7 @@
               <w:rPr>
                 <w:noProof/>
               </w:rPr>
-              <w:instrText xml:space="preserve"> PAGEREF _Toc243483857 \h </w:instrText>
+              <w:instrText xml:space="preserve"> PAGEREF _Toc243484936 \h </w:instrText>
             </w:r>
             <w:r>
               <w:rPr>
@@ -1458,7 +1458,7 @@
               <w:noProof/>
             </w:rPr>
           </w:pPr>
-          <w:hyperlink w:anchor="_Toc243483858" w:history="1">
+          <w:hyperlink w:anchor="_Toc243484937" w:history="1">
             <w:r>
               <w:rPr>
                 <w:rStyle w:val="Lienhypertexte"/>
@@ -1482,7 +1482,7 @@
               <w:rPr>
                 <w:noProof/>
               </w:rPr>
-              <w:instrText xml:space="preserve"> PAGEREF _Toc243483858 \h </w:instrText>
+              <w:instrText xml:space="preserve"> PAGEREF _Toc243484937 \h </w:instrText>
             </w:r>
             <w:r>
               <w:rPr>
@@ -1519,7 +1519,7 @@
               <w:noProof/>
             </w:rPr>
           </w:pPr>
-          <w:hyperlink w:anchor="_Toc243483859" w:history="1">
+          <w:hyperlink w:anchor="_Toc243484938" w:history="1">
             <w:r>
               <w:rPr>
                 <w:rStyle w:val="Lienhypertexte"/>
@@ -1543,7 +1543,7 @@
               <w:rPr>
                 <w:noProof/>
               </w:rPr>
-              <w:instrText xml:space="preserve"> PAGEREF _Toc243483859 \h </w:instrText>
+              <w:instrText xml:space="preserve"> PAGEREF _Toc243484938 \h </w:instrText>
             </w:r>
             <w:r>
               <w:rPr>
@@ -1580,7 +1580,7 @@
               <w:noProof/>
             </w:rPr>
           </w:pPr>
-          <w:hyperlink w:anchor="_Toc243483860" w:history="1">
+          <w:hyperlink w:anchor="_Toc243484939" w:history="1">
             <w:r>
               <w:rPr>
                 <w:rStyle w:val="Lienhypertexte"/>
@@ -1604,7 +1604,7 @@
               <w:rPr>
                 <w:noProof/>
               </w:rPr>
-              <w:instrText xml:space="preserve"> PAGEREF _Toc243483860 \h </w:instrText>
+              <w:instrText xml:space="preserve"> PAGEREF _Toc243484939 \h </w:instrText>
             </w:r>
             <w:r>
               <w:rPr>
@@ -1641,7 +1641,7 @@
               <w:noProof/>
             </w:rPr>
           </w:pPr>
-          <w:hyperlink w:anchor="_Toc243483861" w:history="1">
+          <w:hyperlink w:anchor="_Toc243484940" w:history="1">
             <w:r>
               <w:rPr>
                 <w:rStyle w:val="Lienhypertexte"/>
@@ -1665,7 +1665,7 @@
               <w:rPr>
                 <w:noProof/>
               </w:rPr>
-              <w:instrText xml:space="preserve"> PAGEREF _Toc243483861 \h </w:instrText>
+              <w:instrText xml:space="preserve"> PAGEREF _Toc243484940 \h </w:instrText>
             </w:r>
             <w:r>
               <w:rPr>
@@ -1702,7 +1702,7 @@
               <w:noProof/>
             </w:rPr>
           </w:pPr>
-          <w:hyperlink w:anchor="_Toc243483862" w:history="1">
+          <w:hyperlink w:anchor="_Toc243484941" w:history="1">
             <w:r>
               <w:rPr>
                 <w:rStyle w:val="Lienhypertexte"/>
@@ -1726,7 +1726,7 @@
               <w:rPr>
                 <w:noProof/>
               </w:rPr>
-              <w:instrText xml:space="preserve"> PAGEREF _Toc243483862 \h </w:instrText>
+              <w:instrText xml:space="preserve"> PAGEREF _Toc243484941 \h </w:instrText>
             </w:r>
             <w:r>
               <w:rPr>
@@ -1763,7 +1763,7 @@
               <w:noProof/>
             </w:rPr>
           </w:pPr>
-          <w:hyperlink w:anchor="_Toc243483863" w:history="1">
+          <w:hyperlink w:anchor="_Toc243484942" w:history="1">
             <w:r>
               <w:rPr>
                 <w:rStyle w:val="Lienhypertexte"/>
@@ -1787,7 +1787,7 @@
               <w:rPr>
                 <w:noProof/>
               </w:rPr>
-              <w:instrText xml:space="preserve"> PAGEREF _Toc243483863 \h </w:instrText>
+              <w:instrText xml:space="preserve"> PAGEREF _Toc243484942 \h </w:instrText>
             </w:r>
             <w:r>
               <w:rPr>
@@ -1824,7 +1824,7 @@
               <w:noProof/>
             </w:rPr>
           </w:pPr>
-          <w:hyperlink w:anchor="_Toc243483864" w:history="1">
+          <w:hyperlink w:anchor="_Toc243484943" w:history="1">
             <w:r>
               <w:rPr>
                 <w:rStyle w:val="Lienhypertexte"/>
@@ -1848,7 +1848,7 @@
               <w:rPr>
                 <w:noProof/>
               </w:rPr>
-              <w:instrText xml:space="preserve"> PAGEREF _Toc243483864 \h </w:instrText>
+              <w:instrText xml:space="preserve"> PAGEREF _Toc243484943 \h </w:instrText>
             </w:r>
             <w:r>
               <w:rPr>
@@ -1885,7 +1885,7 @@
               <w:noProof/>
             </w:rPr>
           </w:pPr>
-          <w:hyperlink w:anchor="_Toc243483865" w:history="1">
+          <w:hyperlink w:anchor="_Toc243484944" w:history="1">
             <w:r>
               <w:rPr>
                 <w:rStyle w:val="Lienhypertexte"/>
@@ -1909,7 +1909,7 @@
               <w:rPr>
                 <w:noProof/>
               </w:rPr>
-              <w:instrText xml:space="preserve"> PAGEREF _Toc243483865 \h </w:instrText>
+              <w:instrText xml:space="preserve"> PAGEREF _Toc243484944 \h </w:instrText>
             </w:r>
             <w:r>
               <w:rPr>
@@ -1946,7 +1946,7 @@
               <w:noProof/>
             </w:rPr>
           </w:pPr>
-          <w:hyperlink w:anchor="_Toc243483866" w:history="1">
+          <w:hyperlink w:anchor="_Toc243484945" w:history="1">
             <w:r>
               <w:rPr>
                 <w:rStyle w:val="Lienhypertexte"/>
@@ -1970,7 +1970,7 @@
               <w:rPr>
                 <w:noProof/>
               </w:rPr>
-              <w:instrText xml:space="preserve"> PAGEREF _Toc243483866 \h </w:instrText>
+              <w:instrText xml:space="preserve"> PAGEREF _Toc243484945 \h </w:instrText>
             </w:r>
             <w:r>
               <w:rPr>
@@ -2007,7 +2007,7 @@
               <w:noProof/>
             </w:rPr>
           </w:pPr>
-          <w:hyperlink w:anchor="_Toc243483867" w:history="1">
+          <w:hyperlink w:anchor="_Toc243484946" w:history="1">
             <w:r>
               <w:rPr>
                 <w:rStyle w:val="Lienhypertexte"/>
@@ -2031,7 +2031,7 @@
               <w:rPr>
                 <w:noProof/>
               </w:rPr>
-              <w:instrText xml:space="preserve"> PAGEREF _Toc243483867 \h </w:instrText>
+              <w:instrText xml:space="preserve"> PAGEREF _Toc243484946 \h </w:instrText>
             </w:r>
             <w:r>
               <w:rPr>
@@ -2068,7 +2068,7 @@
               <w:noProof/>
             </w:rPr>
           </w:pPr>
-          <w:hyperlink w:anchor="_Toc243483868" w:history="1">
+          <w:hyperlink w:anchor="_Toc243484947" w:history="1">
             <w:r>
               <w:rPr>
                 <w:rStyle w:val="Lienhypertexte"/>
@@ -2092,7 +2092,7 @@
               <w:rPr>
                 <w:noProof/>
               </w:rPr>
-              <w:instrText xml:space="preserve"> PAGEREF _Toc243483868 \h </w:instrText>
+              <w:instrText xml:space="preserve"> PAGEREF _Toc243484947 \h </w:instrText>
             </w:r>
             <w:r>
               <w:rPr>
@@ -2129,7 +2129,7 @@
               <w:noProof/>
             </w:rPr>
           </w:pPr>
-          <w:hyperlink w:anchor="_Toc243483869" w:history="1">
+          <w:hyperlink w:anchor="_Toc243484948" w:history="1">
             <w:r>
               <w:rPr>
                 <w:rStyle w:val="Lienhypertexte"/>
@@ -2153,7 +2153,7 @@
               <w:rPr>
                 <w:noProof/>
               </w:rPr>
-              <w:instrText xml:space="preserve"> PAGEREF _Toc243483869 \h </w:instrText>
+              <w:instrText xml:space="preserve"> PAGEREF _Toc243484948 \h </w:instrText>
             </w:r>
             <w:r>
               <w:rPr>
@@ -2190,7 +2190,7 @@
               <w:noProof/>
             </w:rPr>
           </w:pPr>
-          <w:hyperlink w:anchor="_Toc243483870" w:history="1">
+          <w:hyperlink w:anchor="_Toc243484949" w:history="1">
             <w:r>
               <w:rPr>
                 <w:rStyle w:val="Lienhypertexte"/>
@@ -2214,7 +2214,7 @@
               <w:rPr>
                 <w:noProof/>
               </w:rPr>
-              <w:instrText xml:space="preserve"> PAGEREF _Toc243483870 \h </w:instrText>
+              <w:instrText xml:space="preserve"> PAGEREF _Toc243484949 \h </w:instrText>
             </w:r>
             <w:r>
               <w:rPr>
@@ -2251,7 +2251,7 @@
               <w:noProof/>
             </w:rPr>
           </w:pPr>
-          <w:hyperlink w:anchor="_Toc243483871" w:history="1">
+          <w:hyperlink w:anchor="_Toc243484950" w:history="1">
             <w:r>
               <w:rPr>
                 <w:rStyle w:val="Lienhypertexte"/>
@@ -2275,7 +2275,7 @@
               <w:rPr>
                 <w:noProof/>
               </w:rPr>
-              <w:instrText xml:space="preserve"> PAGEREF _Toc243483871 \h </w:instrText>
+              <w:instrText xml:space="preserve"> PAGEREF _Toc243484950 \h </w:instrText>
             </w:r>
             <w:r>
               <w:rPr>
@@ -2312,7 +2312,7 @@
               <w:noProof/>
             </w:rPr>
           </w:pPr>
-          <w:hyperlink w:anchor="_Toc243483872" w:history="1">
+          <w:hyperlink w:anchor="_Toc243484951" w:history="1">
             <w:r>
               <w:rPr>
                 <w:rStyle w:val="Lienhypertexte"/>
@@ -2336,7 +2336,7 @@
               <w:rPr>
                 <w:noProof/>
               </w:rPr>
-              <w:instrText xml:space="preserve"> PAGEREF _Toc243483872 \h </w:instrText>
+              <w:instrText xml:space="preserve"> PAGEREF _Toc243484951 \h </w:instrText>
             </w:r>
             <w:r>
               <w:rPr>
@@ -2373,7 +2373,7 @@
               <w:noProof/>
             </w:rPr>
           </w:pPr>
-          <w:hyperlink w:anchor="_Toc243483873" w:history="1">
+          <w:hyperlink w:anchor="_Toc243484952" w:history="1">
             <w:r>
               <w:rPr>
                 <w:rStyle w:val="Lienhypertexte"/>
@@ -2397,7 +2397,7 @@
               <w:rPr>
                 <w:noProof/>
               </w:rPr>
-              <w:instrText xml:space="preserve"> PAGEREF _Toc243483873 \h </w:instrText>
+              <w:instrText xml:space="preserve"> PAGEREF _Toc243484952 \h </w:instrText>
             </w:r>
             <w:r>
               <w:rPr>
@@ -2434,7 +2434,7 @@
               <w:noProof/>
             </w:rPr>
           </w:pPr>
-          <w:hyperlink w:anchor="_Toc243483874" w:history="1">
+          <w:hyperlink w:anchor="_Toc243484953" w:history="1">
             <w:r>
               <w:rPr>
                 <w:rStyle w:val="Lienhypertexte"/>
@@ -2458,7 +2458,7 @@
               <w:rPr>
                 <w:noProof/>
               </w:rPr>
-              <w:instrText xml:space="preserve"> PAGEREF _Toc243483874 \h </w:instrText>
+              <w:instrText xml:space="preserve"> PAGEREF _Toc243484953 \h </w:instrText>
             </w:r>
             <w:r>
               <w:rPr>
@@ -2495,7 +2495,7 @@
               <w:noProof/>
             </w:rPr>
           </w:pPr>
-          <w:hyperlink w:anchor="_Toc243483875" w:history="1">
+          <w:hyperlink w:anchor="_Toc243484954" w:history="1">
             <w:r>
               <w:rPr>
                 <w:rStyle w:val="Lienhypertexte"/>
@@ -2519,7 +2519,7 @@
               <w:rPr>
                 <w:noProof/>
               </w:rPr>
-              <w:instrText xml:space="preserve"> PAGEREF _Toc243483875 \h </w:instrText>
+              <w:instrText xml:space="preserve"> PAGEREF _Toc243484954 \h </w:instrText>
             </w:r>
             <w:r>
               <w:rPr>
@@ -2556,7 +2556,7 @@
               <w:noProof/>
             </w:rPr>
           </w:pPr>
-          <w:hyperlink w:anchor="_Toc243483876" w:history="1">
+          <w:hyperlink w:anchor="_Toc243484955" w:history="1">
             <w:r>
               <w:rPr>
                 <w:rStyle w:val="Lienhypertexte"/>
@@ -2580,7 +2580,7 @@
               <w:rPr>
                 <w:noProof/>
               </w:rPr>
-              <w:instrText xml:space="preserve"> PAGEREF _Toc243483876 \h </w:instrText>
+              <w:instrText xml:space="preserve"> PAGEREF _Toc243484955 \h </w:instrText>
             </w:r>
             <w:r>
               <w:rPr>
@@ -2617,7 +2617,7 @@
               <w:noProof/>
             </w:rPr>
           </w:pPr>
-          <w:hyperlink w:anchor="_Toc243483877" w:history="1">
+          <w:hyperlink w:anchor="_Toc243484956" w:history="1">
             <w:r>
               <w:rPr>
                 <w:rStyle w:val="Lienhypertexte"/>
@@ -2641,7 +2641,7 @@
               <w:rPr>
                 <w:noProof/>
               </w:rPr>
-              <w:instrText xml:space="preserve"> PAGEREF _Toc243483877 \h </w:instrText>
+              <w:instrText xml:space="preserve"> PAGEREF _Toc243484956 \h </w:instrText>
             </w:r>
             <w:r>
               <w:rPr>
@@ -2678,7 +2678,7 @@
               <w:noProof/>
             </w:rPr>
           </w:pPr>
-          <w:hyperlink w:anchor="_Toc243483878" w:history="1">
+          <w:hyperlink w:anchor="_Toc243484957" w:history="1">
             <w:r>
               <w:rPr>
                 <w:rStyle w:val="Lienhypertexte"/>
@@ -2702,7 +2702,7 @@
               <w:rPr>
                 <w:noProof/>
               </w:rPr>
-              <w:instrText xml:space="preserve"> PAGEREF _Toc243483878 \h </w:instrText>
+              <w:instrText xml:space="preserve"> PAGEREF _Toc243484957 \h </w:instrText>
             </w:r>
             <w:r>
               <w:rPr>
@@ -2739,7 +2739,7 @@
               <w:noProof/>
             </w:rPr>
           </w:pPr>
-          <w:hyperlink w:anchor="_Toc243483879" w:history="1">
+          <w:hyperlink w:anchor="_Toc243484958" w:history="1">
             <w:r>
               <w:rPr>
                 <w:rStyle w:val="Lienhypertexte"/>
@@ -2763,7 +2763,7 @@
               <w:rPr>
                 <w:noProof/>
               </w:rPr>
-              <w:instrText xml:space="preserve"> PAGEREF _Toc243483879 \h </w:instrText>
+              <w:instrText xml:space="preserve"> PAGEREF _Toc243484958 \h </w:instrText>
             </w:r>
             <w:r>
               <w:rPr>
@@ -2800,7 +2800,7 @@
               <w:noProof/>
             </w:rPr>
           </w:pPr>
-          <w:hyperlink w:anchor="_Toc243483880" w:history="1">
+          <w:hyperlink w:anchor="_Toc243484959" w:history="1">
             <w:r>
               <w:rPr>
                 <w:rStyle w:val="Lienhypertexte"/>
@@ -2824,7 +2824,7 @@
               <w:rPr>
                 <w:noProof/>
               </w:rPr>
-              <w:instrText xml:space="preserve"> PAGEREF _Toc243483880 \h </w:instrText>
+              <w:instrText xml:space="preserve"> PAGEREF _Toc243484959 \h </w:instrText>
             </w:r>
             <w:r>
               <w:rPr>
@@ -2861,7 +2861,7 @@
               <w:noProof/>
             </w:rPr>
           </w:pPr>
-          <w:hyperlink w:anchor="_Toc243483881" w:history="1">
+          <w:hyperlink w:anchor="_Toc243484960" w:history="1">
             <w:r>
               <w:rPr>
                 <w:rStyle w:val="Lienhypertexte"/>
@@ -2885,7 +2885,7 @@
               <w:rPr>
                 <w:noProof/>
               </w:rPr>
-              <w:instrText xml:space="preserve"> PAGEREF _Toc243483881 \h </w:instrText>
+              <w:instrText xml:space="preserve"> PAGEREF _Toc243484960 \h </w:instrText>
             </w:r>
             <w:r>
               <w:rPr>
@@ -2922,7 +2922,7 @@
               <w:noProof/>
             </w:rPr>
           </w:pPr>
-          <w:hyperlink w:anchor="_Toc243483882" w:history="1">
+          <w:hyperlink w:anchor="_Toc243484961" w:history="1">
             <w:r>
               <w:rPr>
                 <w:rStyle w:val="Lienhypertexte"/>
@@ -2946,7 +2946,7 @@
               <w:rPr>
                 <w:noProof/>
               </w:rPr>
-              <w:instrText xml:space="preserve"> PAGEREF _Toc243483882 \h </w:instrText>
+              <w:instrText xml:space="preserve"> PAGEREF _Toc243484961 \h </w:instrText>
             </w:r>
             <w:r>
               <w:rPr>
@@ -2983,7 +2983,7 @@
               <w:noProof/>
             </w:rPr>
           </w:pPr>
-          <w:hyperlink w:anchor="_Toc243483883" w:history="1">
+          <w:hyperlink w:anchor="_Toc243484962" w:history="1">
             <w:r>
               <w:rPr>
                 <w:rStyle w:val="Lienhypertexte"/>
@@ -3007,7 +3007,7 @@
               <w:rPr>
                 <w:noProof/>
               </w:rPr>
-              <w:instrText xml:space="preserve"> PAGEREF _Toc243483883 \h </w:instrText>
+              <w:instrText xml:space="preserve"> PAGEREF _Toc243484962 \h </w:instrText>
             </w:r>
             <w:r>
               <w:rPr>
@@ -3044,7 +3044,7 @@
               <w:noProof/>
             </w:rPr>
           </w:pPr>
-          <w:hyperlink w:anchor="_Toc243483884" w:history="1">
+          <w:hyperlink w:anchor="_Toc243484963" w:history="1">
             <w:r>
               <w:rPr>
                 <w:rStyle w:val="Lienhypertexte"/>
@@ -3068,7 +3068,7 @@
               <w:rPr>
                 <w:noProof/>
               </w:rPr>
-              <w:instrText xml:space="preserve"> PAGEREF _Toc243483884 \h </w:instrText>
+              <w:instrText xml:space="preserve"> PAGEREF _Toc243484963 \h </w:instrText>
             </w:r>
             <w:r>
               <w:rPr>
@@ -3105,7 +3105,7 @@
               <w:noProof/>
             </w:rPr>
           </w:pPr>
-          <w:hyperlink w:anchor="_Toc243483885" w:history="1">
+          <w:hyperlink w:anchor="_Toc243484964" w:history="1">
             <w:r>
               <w:rPr>
                 <w:rStyle w:val="Lienhypertexte"/>
@@ -3129,7 +3129,7 @@
               <w:rPr>
                 <w:noProof/>
               </w:rPr>
-              <w:instrText xml:space="preserve"> PAGEREF _Toc243483885 \h </w:instrText>
+              <w:instrText xml:space="preserve"> PAGEREF _Toc243484964 \h </w:instrText>
             </w:r>
             <w:r>
               <w:rPr>
@@ -3166,7 +3166,7 @@
               <w:noProof/>
             </w:rPr>
           </w:pPr>
-          <w:hyperlink w:anchor="_Toc243483886" w:history="1">
+          <w:hyperlink w:anchor="_Toc243484965" w:history="1">
             <w:r>
               <w:rPr>
                 <w:rStyle w:val="Lienhypertexte"/>
@@ -3190,7 +3190,7 @@
               <w:rPr>
                 <w:noProof/>
               </w:rPr>
-              <w:instrText xml:space="preserve"> PAGEREF _Toc243483886 \h </w:instrText>
+              <w:instrText xml:space="preserve"> PAGEREF _Toc243484965 \h </w:instrText>
             </w:r>
             <w:r>
               <w:rPr>
@@ -3227,7 +3227,7 @@
               <w:noProof/>
             </w:rPr>
           </w:pPr>
-          <w:hyperlink w:anchor="_Toc243483887" w:history="1">
+          <w:hyperlink w:anchor="_Toc243484966" w:history="1">
             <w:r>
               <w:rPr>
                 <w:rStyle w:val="Lienhypertexte"/>
@@ -3251,7 +3251,7 @@
               <w:rPr>
                 <w:noProof/>
               </w:rPr>
-              <w:instrText xml:space="preserve"> PAGEREF _Toc243483887 \h </w:instrText>
+              <w:instrText xml:space="preserve"> PAGEREF _Toc243484966 \h </w:instrText>
             </w:r>
             <w:r>
               <w:rPr>
@@ -3288,7 +3288,7 @@
               <w:noProof/>
             </w:rPr>
           </w:pPr>
-          <w:hyperlink w:anchor="_Toc243483888" w:history="1">
+          <w:hyperlink w:anchor="_Toc243484967" w:history="1">
             <w:r>
               <w:rPr>
                 <w:rStyle w:val="Lienhypertexte"/>
@@ -3312,7 +3312,7 @@
               <w:rPr>
                 <w:noProof/>
               </w:rPr>
-              <w:instrText xml:space="preserve"> PAGEREF _Toc243483888 \h </w:instrText>
+              <w:instrText xml:space="preserve"> PAGEREF _Toc243484967 \h </w:instrText>
             </w:r>
             <w:r>
               <w:rPr>
@@ -3349,7 +3349,7 @@
               <w:noProof/>
             </w:rPr>
           </w:pPr>
-          <w:hyperlink w:anchor="_Toc243483889" w:history="1">
+          <w:hyperlink w:anchor="_Toc243484968" w:history="1">
             <w:r>
               <w:rPr>
                 <w:rStyle w:val="Lienhypertexte"/>
@@ -3373,7 +3373,7 @@
               <w:rPr>
                 <w:noProof/>
               </w:rPr>
-              <w:instrText xml:space="preserve"> PAGEREF _Toc243483889 \h </w:instrText>
+              <w:instrText xml:space="preserve"> PAGEREF _Toc243484968 \h </w:instrText>
             </w:r>
             <w:r>
               <w:rPr>
@@ -3410,7 +3410,7 @@
               <w:noProof/>
             </w:rPr>
           </w:pPr>
-          <w:hyperlink w:anchor="_Toc243483890" w:history="1">
+          <w:hyperlink w:anchor="_Toc243484969" w:history="1">
             <w:r>
               <w:rPr>
                 <w:rStyle w:val="Lienhypertexte"/>
@@ -3434,7 +3434,7 @@
               <w:rPr>
                 <w:noProof/>
               </w:rPr>
-              <w:instrText xml:space="preserve"> PAGEREF _Toc243483890 \h </w:instrText>
+              <w:instrText xml:space="preserve"> PAGEREF _Toc243484969 \h </w:instrText>
             </w:r>
             <w:r>
               <w:rPr>
@@ -3471,7 +3471,7 @@
               <w:noProof/>
             </w:rPr>
           </w:pPr>
-          <w:hyperlink w:anchor="_Toc243483891" w:history="1">
+          <w:hyperlink w:anchor="_Toc243484970" w:history="1">
             <w:r>
               <w:rPr>
                 <w:rStyle w:val="Lienhypertexte"/>
@@ -3495,7 +3495,7 @@
               <w:rPr>
                 <w:noProof/>
               </w:rPr>
-              <w:instrText xml:space="preserve"> PAGEREF _Toc243483891 \h </w:instrText>
+              <w:instrText xml:space="preserve"> PAGEREF _Toc243484970 \h </w:instrText>
             </w:r>
             <w:r>
               <w:rPr>
@@ -3532,7 +3532,7 @@
               <w:noProof/>
             </w:rPr>
           </w:pPr>
-          <w:hyperlink w:anchor="_Toc243483892" w:history="1">
+          <w:hyperlink w:anchor="_Toc243484971" w:history="1">
             <w:r>
               <w:rPr>
                 <w:rStyle w:val="Lienhypertexte"/>
@@ -3556,7 +3556,7 @@
               <w:rPr>
                 <w:noProof/>
               </w:rPr>
-              <w:instrText xml:space="preserve"> PAGEREF _Toc243483892 \h </w:instrText>
+              <w:instrText xml:space="preserve"> PAGEREF _Toc243484971 \h </w:instrText>
             </w:r>
             <w:r>
               <w:rPr>
@@ -3593,7 +3593,7 @@
               <w:noProof/>
             </w:rPr>
           </w:pPr>
-          <w:hyperlink w:anchor="_Toc243483893" w:history="1">
+          <w:hyperlink w:anchor="_Toc243484972" w:history="1">
             <w:r>
               <w:rPr>
                 <w:rStyle w:val="Lienhypertexte"/>
@@ -3617,7 +3617,7 @@
               <w:rPr>
                 <w:noProof/>
               </w:rPr>
-              <w:instrText xml:space="preserve"> PAGEREF _Toc243483893 \h </w:instrText>
+              <w:instrText xml:space="preserve"> PAGEREF _Toc243484972 \h </w:instrText>
             </w:r>
             <w:r>
               <w:rPr>
@@ -3654,7 +3654,7 @@
               <w:noProof/>
             </w:rPr>
           </w:pPr>
-          <w:hyperlink w:anchor="_Toc243483894" w:history="1">
+          <w:hyperlink w:anchor="_Toc243484973" w:history="1">
             <w:r>
               <w:rPr>
                 <w:rStyle w:val="Lienhypertexte"/>
@@ -3678,7 +3678,7 @@
               <w:rPr>
                 <w:noProof/>
               </w:rPr>
-              <w:instrText xml:space="preserve"> PAGEREF _Toc243483894 \h </w:instrText>
+              <w:instrText xml:space="preserve"> PAGEREF _Toc243484973 \h </w:instrText>
             </w:r>
             <w:r>
               <w:rPr>
@@ -3715,7 +3715,7 @@
               <w:noProof/>
             </w:rPr>
           </w:pPr>
-          <w:hyperlink w:anchor="_Toc243483895" w:history="1">
+          <w:hyperlink w:anchor="_Toc243484974" w:history="1">
             <w:r>
               <w:rPr>
                 <w:rStyle w:val="Lienhypertexte"/>
@@ -3739,7 +3739,7 @@
               <w:rPr>
                 <w:noProof/>
               </w:rPr>
-              <w:instrText xml:space="preserve"> PAGEREF _Toc243483895 \h </w:instrText>
+              <w:instrText xml:space="preserve"> PAGEREF _Toc243484974 \h </w:instrText>
             </w:r>
             <w:r>
               <w:rPr>
@@ -3776,7 +3776,7 @@
               <w:noProof/>
             </w:rPr>
           </w:pPr>
-          <w:hyperlink w:anchor="_Toc243483896" w:history="1">
+          <w:hyperlink w:anchor="_Toc243484975" w:history="1">
             <w:r>
               <w:rPr>
                 <w:rStyle w:val="Lienhypertexte"/>
@@ -3800,7 +3800,7 @@
               <w:rPr>
                 <w:noProof/>
               </w:rPr>
-              <w:instrText xml:space="preserve"> PAGEREF _Toc243483896 \h </w:instrText>
+              <w:instrText xml:space="preserve"> PAGEREF _Toc243484975 \h </w:instrText>
             </w:r>
             <w:r>
               <w:rPr>
@@ -3837,7 +3837,7 @@
               <w:noProof/>
             </w:rPr>
           </w:pPr>
-          <w:hyperlink w:anchor="_Toc243483897" w:history="1">
+          <w:hyperlink w:anchor="_Toc243484976" w:history="1">
             <w:r>
               <w:rPr>
                 <w:rStyle w:val="Lienhypertexte"/>
@@ -3861,7 +3861,7 @@
               <w:rPr>
                 <w:noProof/>
               </w:rPr>
-              <w:instrText xml:space="preserve"> PAGEREF _Toc243483897 \h </w:instrText>
+              <w:instrText xml:space="preserve"> PAGEREF _Toc243484976 \h </w:instrText>
             </w:r>
             <w:r>
               <w:rPr>
@@ -3898,7 +3898,7 @@
               <w:noProof/>
             </w:rPr>
           </w:pPr>
-          <w:hyperlink w:anchor="_Toc243483898" w:history="1">
+          <w:hyperlink w:anchor="_Toc243484977" w:history="1">
             <w:r>
               <w:rPr>
                 <w:rStyle w:val="Lienhypertexte"/>
@@ -3922,7 +3922,7 @@
               <w:rPr>
                 <w:noProof/>
               </w:rPr>
-              <w:instrText xml:space="preserve"> PAGEREF _Toc243483898 \h </w:instrText>
+              <w:instrText xml:space="preserve"> PAGEREF _Toc243484977 \h </w:instrText>
             </w:r>
             <w:r>
               <w:rPr>
@@ -3959,7 +3959,7 @@
               <w:noProof/>
             </w:rPr>
           </w:pPr>
-          <w:hyperlink w:anchor="_Toc243483899" w:history="1">
+          <w:hyperlink w:anchor="_Toc243484978" w:history="1">
             <w:r>
               <w:rPr>
                 <w:rStyle w:val="Lienhypertexte"/>
@@ -3983,7 +3983,7 @@
               <w:rPr>
                 <w:noProof/>
               </w:rPr>
-              <w:instrText xml:space="preserve"> PAGEREF _Toc243483899 \h </w:instrText>
+              <w:instrText xml:space="preserve"> PAGEREF _Toc243484978 \h </w:instrText>
             </w:r>
             <w:r>
               <w:rPr>
@@ -4020,7 +4020,7 @@
               <w:noProof/>
             </w:rPr>
           </w:pPr>
-          <w:hyperlink w:anchor="_Toc243483900" w:history="1">
+          <w:hyperlink w:anchor="_Toc243484979" w:history="1">
             <w:r>
               <w:rPr>
                 <w:rStyle w:val="Lienhypertexte"/>
@@ -4044,7 +4044,7 @@
               <w:rPr>
                 <w:noProof/>
               </w:rPr>
-              <w:instrText xml:space="preserve"> PAGEREF _Toc243483900 \h </w:instrText>
+              <w:instrText xml:space="preserve"> PAGEREF _Toc243484979 \h </w:instrText>
             </w:r>
             <w:r>
               <w:rPr>
@@ -4081,7 +4081,7 @@
               <w:noProof/>
             </w:rPr>
           </w:pPr>
-          <w:hyperlink w:anchor="_Toc243483901" w:history="1">
+          <w:hyperlink w:anchor="_Toc243484980" w:history="1">
             <w:r>
               <w:rPr>
                 <w:rStyle w:val="Lienhypertexte"/>
@@ -4105,7 +4105,7 @@
               <w:rPr>
                 <w:noProof/>
               </w:rPr>
-              <w:instrText xml:space="preserve"> PAGEREF _Toc243483901 \h </w:instrText>
+              <w:instrText xml:space="preserve"> PAGEREF _Toc243484980 \h </w:instrText>
             </w:r>
             <w:r>
               <w:rPr>
@@ -4142,7 +4142,7 @@
               <w:noProof/>
             </w:rPr>
           </w:pPr>
-          <w:hyperlink w:anchor="_Toc243483902" w:history="1">
+          <w:hyperlink w:anchor="_Toc243484981" w:history="1">
             <w:r>
               <w:rPr>
                 <w:rStyle w:val="Lienhypertexte"/>
@@ -4166,7 +4166,7 @@
               <w:rPr>
                 <w:noProof/>
               </w:rPr>
-              <w:instrText xml:space="preserve"> PAGEREF _Toc243483902 \h </w:instrText>
+              <w:instrText xml:space="preserve"> PAGEREF _Toc243484981 \h </w:instrText>
             </w:r>
             <w:r>
               <w:rPr>
@@ -4205,7 +4205,7 @@
         <w:pStyle w:val="Titre1"/>
         <w:pageBreakBefore/>
       </w:pPr>
-      <w:bookmarkStart w:id="0" w:name="_Toc243483836"/>
+      <w:bookmarkStart w:id="0" w:name="_Toc243484915"/>
       <w:r>
         <w:lastRenderedPageBreak/>
         <w:t>1. The pitch in 60 seconds</w:t>
@@ -4424,7 +4424,7 @@
         <w:pStyle w:val="Titre1"/>
         <w:pageBreakBefore/>
       </w:pPr>
-      <w:bookmarkStart w:id="1" w:name="_Toc243483837"/>
+      <w:bookmarkStart w:id="1" w:name="_Toc243484916"/>
       <w:r>
         <w:lastRenderedPageBreak/>
         <w:t>2. The basic ideas, explained simply</w:t>
@@ -4529,7 +4529,7 @@
       <w:pPr>
         <w:pStyle w:val="Titre2"/>
       </w:pPr>
-      <w:bookmarkStart w:id="2" w:name="_Toc243483838"/>
+      <w:bookmarkStart w:id="2" w:name="_Toc243484917"/>
       <w:r>
         <w:t>A neuron, weights and a network</w:t>
       </w:r>
@@ -4599,7 +4599,7 @@
       <w:pPr>
         <w:pStyle w:val="Titre2"/>
       </w:pPr>
-      <w:bookmarkStart w:id="3" w:name="_Toc243483839"/>
+      <w:bookmarkStart w:id="3" w:name="_Toc243484918"/>
       <w:r>
         <w:t>The loss: how wrong we are</w:t>
       </w:r>
@@ -4659,7 +4659,7 @@
       <w:pPr>
         <w:pStyle w:val="Titre2"/>
       </w:pPr>
-      <w:bookmarkStart w:id="4" w:name="_Toc243483840"/>
+      <w:bookmarkStart w:id="4" w:name="_Toc243484919"/>
       <w:r>
         <w:t>Gradient descent and the learning rate</w:t>
       </w:r>
@@ -4729,7 +4729,7 @@
       <w:pPr>
         <w:pStyle w:val="Titre2"/>
       </w:pPr>
-      <w:bookmarkStart w:id="5" w:name="_Toc243483841"/>
+      <w:bookmarkStart w:id="5" w:name="_Toc243484920"/>
       <w:r>
         <w:t>Backpropagation and the 5 lines of the training loop</w:t>
       </w:r>
@@ -4823,7 +4823,7 @@
       <w:pPr>
         <w:pStyle w:val="Titre2"/>
       </w:pPr>
-      <w:bookmarkStart w:id="6" w:name="_Toc243483842"/>
+      <w:bookmarkStart w:id="6" w:name="_Toc243484921"/>
       <w:r>
         <w:t>Epoch and mini-batch</w:t>
       </w:r>
@@ -4883,7 +4883,7 @@
       <w:pPr>
         <w:pStyle w:val="Titre2"/>
       </w:pPr>
-      <w:bookmarkStart w:id="7" w:name="_Toc243483843"/>
+      <w:bookmarkStart w:id="7" w:name="_Toc243484922"/>
       <w:r>
         <w:lastRenderedPageBreak/>
         <w:t>Train, validation, test</w:t>
@@ -4954,7 +4954,7 @@
       <w:pPr>
         <w:pStyle w:val="Titre2"/>
       </w:pPr>
-      <w:bookmarkStart w:id="8" w:name="_Toc243483844"/>
+      <w:bookmarkStart w:id="8" w:name="_Toc243484923"/>
       <w:r>
         <w:t>Overfitting</w:t>
       </w:r>
@@ -5004,7 +5004,7 @@
       <w:pPr>
         <w:pStyle w:val="Titre2"/>
       </w:pPr>
-      <w:bookmarkStart w:id="9" w:name="_Toc243483845"/>
+      <w:bookmarkStart w:id="9" w:name="_Toc243484924"/>
       <w:r>
         <w:t>ReLU, the activation</w:t>
       </w:r>
@@ -5074,7 +5074,7 @@
       <w:pPr>
         <w:pStyle w:val="Titre2"/>
       </w:pPr>
-      <w:bookmarkStart w:id="10" w:name="_Toc243483846"/>
+      <w:bookmarkStart w:id="10" w:name="_Toc243484925"/>
       <w:r>
         <w:t>Initialisation and the first loss</w:t>
       </w:r>
@@ -5124,7 +5124,7 @@
       <w:pPr>
         <w:pStyle w:val="Titre2"/>
       </w:pPr>
-      <w:bookmarkStart w:id="11" w:name="_Toc243483847"/>
+      <w:bookmarkStart w:id="11" w:name="_Toc243484926"/>
       <w:r>
         <w:t>Standardisation of the pixels</w:t>
       </w:r>
@@ -5184,7 +5184,7 @@
       <w:pPr>
         <w:pStyle w:val="Titre2"/>
       </w:pPr>
-      <w:bookmarkStart w:id="12" w:name="_Toc243483848"/>
+      <w:bookmarkStart w:id="12" w:name="_Toc243484927"/>
       <w:r>
         <w:t>MLP versus CNN: why the MLP cannot see shapes</w:t>
       </w:r>
@@ -5244,7 +5244,7 @@
       <w:pPr>
         <w:pStyle w:val="Titre2"/>
       </w:pPr>
-      <w:bookmarkStart w:id="13" w:name="_Toc243483849"/>
+      <w:bookmarkStart w:id="13" w:name="_Toc243484928"/>
       <w:r>
         <w:t>Convolution, filters and channels (session 7 slide)</w:t>
       </w:r>
@@ -5335,7 +5335,7 @@
       <w:pPr>
         <w:pStyle w:val="Titre2"/>
       </w:pPr>
-      <w:bookmarkStart w:id="14" w:name="_Toc243483850"/>
+      <w:bookmarkStart w:id="14" w:name="_Toc243484929"/>
       <w:r>
         <w:t>A pretrained network and transfer learning</w:t>
       </w:r>
@@ -5395,7 +5395,7 @@
       <w:pPr>
         <w:pStyle w:val="Titre2"/>
       </w:pPr>
-      <w:bookmarkStart w:id="15" w:name="_Toc243483851"/>
+      <w:bookmarkStart w:id="15" w:name="_Toc243484930"/>
       <w:r>
         <w:t>Frozen features (linear probe) versus fine-tuning</w:t>
       </w:r>
@@ -5465,7 +5465,7 @@
       <w:pPr>
         <w:pStyle w:val="Titre2"/>
       </w:pPr>
-      <w:bookmarkStart w:id="16" w:name="_Toc243483852"/>
+      <w:bookmarkStart w:id="16" w:name="_Toc243484931"/>
       <w:r>
         <w:t>The tools against overfitting</w:t>
       </w:r>
@@ -5625,7 +5625,7 @@
       <w:pPr>
         <w:pStyle w:val="Titre2"/>
       </w:pPr>
-      <w:bookmarkStart w:id="17" w:name="_Toc243483853"/>
+      <w:bookmarkStart w:id="17" w:name="_Toc243484932"/>
       <w:r>
         <w:t>Vanishing gradient</w:t>
       </w:r>
@@ -5675,7 +5675,7 @@
       <w:pPr>
         <w:pStyle w:val="Titre2"/>
       </w:pPr>
-      <w:bookmarkStart w:id="18" w:name="_Toc243483854"/>
+      <w:bookmarkStart w:id="18" w:name="_Toc243484933"/>
       <w:r>
         <w:t>Data leakage</w:t>
       </w:r>
@@ -5725,7 +5725,7 @@
       <w:pPr>
         <w:pStyle w:val="Titre2"/>
       </w:pPr>
-      <w:bookmarkStart w:id="19" w:name="_Toc243483855"/>
+      <w:bookmarkStart w:id="19" w:name="_Toc243484934"/>
       <w:r>
         <w:t>Confidence interval and bootstrap</w:t>
       </w:r>
@@ -5785,7 +5785,7 @@
       <w:pPr>
         <w:pStyle w:val="Titre2"/>
       </w:pPr>
-      <w:bookmarkStart w:id="20" w:name="_Toc243483856"/>
+      <w:bookmarkStart w:id="20" w:name="_Toc243484935"/>
       <w:r>
         <w:lastRenderedPageBreak/>
         <w:t>Latency and CPU threads</w:t>
@@ -5857,7 +5857,7 @@
         <w:pStyle w:val="Titre1"/>
         <w:pageBreakBefore/>
       </w:pPr>
-      <w:bookmarkStart w:id="21" w:name="_Toc243483857"/>
+      <w:bookmarkStart w:id="21" w:name="_Toc243484936"/>
       <w:r>
         <w:lastRenderedPageBreak/>
         <w:t>3. Step 1: the data and a fair split (notebook 01)</w:t>
@@ -5970,7 +5970,7 @@
       <w:pPr>
         <w:pStyle w:val="Titre2"/>
       </w:pPr>
-      <w:bookmarkStart w:id="22" w:name="_Toc243483858"/>
+      <w:bookmarkStart w:id="22" w:name="_Toc243484937"/>
       <w:r>
         <w:t>What we downloaded</w:t>
       </w:r>
@@ -6091,7 +6091,7 @@
       <w:pPr>
         <w:pStyle w:val="Titre2"/>
       </w:pPr>
-      <w:bookmarkStart w:id="23" w:name="_Toc243483859"/>
+      <w:bookmarkStart w:id="23" w:name="_Toc243484938"/>
       <w:r>
         <w:t>The split (make_split in data.py)</w:t>
       </w:r>
@@ -6222,7 +6222,7 @@
       <w:pPr>
         <w:pStyle w:val="Titre2"/>
       </w:pPr>
-      <w:bookmarkStart w:id="24" w:name="_Toc243483860"/>
+      <w:bookmarkStart w:id="24" w:name="_Toc243484939"/>
       <w:r>
         <w:t>What we found in the data</w:t>
       </w:r>
@@ -6285,7 +6285,7 @@
         <w:pStyle w:val="Titre1"/>
         <w:pageBreakBefore/>
       </w:pPr>
-      <w:bookmarkStart w:id="25" w:name="_Toc243483861"/>
+      <w:bookmarkStart w:id="25" w:name="_Toc243484940"/>
       <w:r>
         <w:lastRenderedPageBreak/>
         <w:t>4. Step 2: the MLP and its two checks (notebook 02)</w:t>
@@ -6435,7 +6435,7 @@
       <w:pPr>
         <w:pStyle w:val="Titre2"/>
       </w:pPr>
-      <w:bookmarkStart w:id="26" w:name="_Toc243483862"/>
+      <w:bookmarkStart w:id="26" w:name="_Toc243484941"/>
       <w:r>
         <w:t>The model</w:t>
       </w:r>
@@ -6562,7 +6562,7 @@
       <w:pPr>
         <w:pStyle w:val="Titre2"/>
       </w:pPr>
-      <w:bookmarkStart w:id="27" w:name="_Toc243483863"/>
+      <w:bookmarkStart w:id="27" w:name="_Toc243484942"/>
       <w:r>
         <w:t>Check 1: the first loss</w:t>
       </w:r>
@@ -6611,7 +6611,7 @@
       <w:pPr>
         <w:pStyle w:val="Titre2"/>
       </w:pPr>
-      <w:bookmarkStart w:id="28" w:name="_Toc243483864"/>
+      <w:bookmarkStart w:id="28" w:name="_Toc243484943"/>
       <w:r>
         <w:t>Check 2: overfit one batch</w:t>
       </w:r>
@@ -6629,7 +6629,7 @@
       <w:pPr>
         <w:pStyle w:val="Titre2"/>
       </w:pPr>
-      <w:bookmarkStart w:id="29" w:name="_Toc243483865"/>
+      <w:bookmarkStart w:id="29" w:name="_Toc243484944"/>
       <w:r>
         <w:t>Baseline and image size</w:t>
       </w:r>
@@ -6705,7 +6705,7 @@
         </w:rPr>
         <w:lastRenderedPageBreak/>
         <w:drawing>
-          <wp:inline distT="0" distB="0" distL="0" distR="0" wp14:anchorId="01CDD641" wp14:editId="01CDD642">
+          <wp:inline distT="0" distB="0" distL="0" distR="0" wp14:anchorId="6220CBAB" wp14:editId="6220CBAC">
             <wp:extent cx="4762500" cy="1924050"/>
             <wp:effectExtent l="0" t="0" r="0" b="0"/>
             <wp:docPr id="1" name="02_baseline_curves.png" descr="MLP baseline: training loss falls to 0 while validation loss rises (overfitting)." title="MLP baseline: training loss falls to 0 while validation loss rises (overfitting)."/>
@@ -6765,7 +6765,7 @@
         <w:pStyle w:val="Titre1"/>
         <w:pageBreakBefore/>
       </w:pPr>
-      <w:bookmarkStart w:id="30" w:name="_Toc243483866"/>
+      <w:bookmarkStart w:id="30" w:name="_Toc243484945"/>
       <w:r>
         <w:lastRenderedPageBreak/>
         <w:t>5. Step 3: monitoring and regularisation (notebook 03)</w:t>
@@ -6936,7 +6936,7 @@
       <w:pPr>
         <w:pStyle w:val="Titre2"/>
       </w:pPr>
-      <w:bookmarkStart w:id="31" w:name="_Toc243483867"/>
+      <w:bookmarkStart w:id="31" w:name="_Toc243484946"/>
       <w:r>
         <w:t>What we monitored</w:t>
       </w:r>
@@ -7055,7 +7055,7 @@
       <w:pPr>
         <w:pStyle w:val="Titre2"/>
       </w:pPr>
-      <w:bookmarkStart w:id="32" w:name="_Toc243483868"/>
+      <w:bookmarkStart w:id="32" w:name="_Toc243484947"/>
       <w:r>
         <w:t>Learning-rate sweep (Adam, 8 values, 15 epochs each)</w:t>
       </w:r>
@@ -7130,7 +7130,7 @@
           <w:noProof/>
         </w:rPr>
         <w:drawing>
-          <wp:inline distT="0" distB="0" distL="0" distR="0" wp14:anchorId="01CDD643" wp14:editId="01CDD644">
+          <wp:inline distT="0" distB="0" distL="0" distR="0" wp14:anchorId="6220CBAD" wp14:editId="6220CBAE">
             <wp:extent cx="4191000" cy="1619250"/>
             <wp:effectExtent l="0" t="0" r="0" b="0"/>
             <wp:docPr id="2" name="03_lr_sweep.png" descr="Learning-rate sweep: a U-shaped validation loss, best at 0.0001." title="Learning-rate sweep: a U-shaped validation loss, best at 0.0001."/>
@@ -7189,7 +7189,7 @@
       <w:pPr>
         <w:pStyle w:val="Titre2"/>
       </w:pPr>
-      <w:bookmarkStart w:id="33" w:name="_Toc243483869"/>
+      <w:bookmarkStart w:id="33" w:name="_Toc243484948"/>
       <w:r>
         <w:t>The tools against overfitting (lr 0.0001, 3 seeds each)</w:t>
       </w:r>
@@ -8162,7 +8162,7 @@
         <w:pStyle w:val="Titre1"/>
         <w:pageBreakBefore/>
       </w:pPr>
-      <w:bookmarkStart w:id="34" w:name="_Toc243483870"/>
+      <w:bookmarkStart w:id="34" w:name="_Toc243484949"/>
       <w:r>
         <w:lastRenderedPageBreak/>
         <w:t>6. Step 4: the training doctor (notebook 04)</w:t>
@@ -8178,10 +8178,10 @@
           <w:b/>
           <w:bCs/>
         </w:rPr>
-        <w:t>In the talk: backup slide 15 only.</w:t>
-      </w:r>
-      <w:r>
-        <w:t xml:space="preserve"> The brief asks for monitoring and failure diagnosis of our own trainings: the talk shows them on slide 5 (inside the MLP, overfitting diagnosed and fixed) and slide 6 (ResNet curves, fine-tuning overfits). This chapter is for the questions: it proves that our monitoring tools really catch a broken training.</w:t>
+        <w:t>In the talk: backup slide 17 only.</w:t>
+      </w:r>
+      <w:r>
+        <w:t xml:space="preserve"> The brief asks for monitoring and failure diagnosis of our own trainings: the talk shows them on slide 5 (inside the MLP, overfitting diagnosed and fixed) and slide 7 (ResNet curves, fine-tuning overfits). This chapter is for the questions: it proves that our monitoring tools really catch a broken training.</w:t>
       </w:r>
     </w:p>
     <w:tbl>
@@ -9068,7 +9068,7 @@
         </w:rPr>
         <w:lastRenderedPageBreak/>
         <w:drawing>
-          <wp:inline distT="0" distB="0" distL="0" distR="0" wp14:anchorId="01CDD645" wp14:editId="01CDD646">
+          <wp:inline distT="0" distB="0" distL="0" distR="0" wp14:anchorId="6220CBAF" wp14:editId="6220CBB0">
             <wp:extent cx="4000500" cy="2209800"/>
             <wp:effectExtent l="0" t="0" r="0" b="0"/>
             <wp:docPr id="3" name="04_p4_grad_per_layer.png" descr="Patient 4: the gradient vanishes layer after layer with sigmoids; ReLU + He init fixes it." title="Patient 4: the gradient vanishes layer after layer with sigmoids; ReLU + He init fixes it."/>
@@ -9127,7 +9127,7 @@
       <w:pPr>
         <w:pStyle w:val="Titre2"/>
       </w:pPr>
-      <w:bookmarkStart w:id="35" w:name="_Toc243483871"/>
+      <w:bookmarkStart w:id="35" w:name="_Toc243484950"/>
       <w:r>
         <w:t>Lessons to say at the oral</w:t>
       </w:r>
@@ -9220,7 +9220,7 @@
         <w:pStyle w:val="Titre1"/>
         <w:pageBreakBefore/>
       </w:pPr>
-      <w:bookmarkStart w:id="36" w:name="_Toc243483872"/>
+      <w:bookmarkStart w:id="36" w:name="_Toc243484951"/>
       <w:r>
         <w:lastRenderedPageBreak/>
         <w:t>7. Step 5: pretrained ResNet18 (notebook 05)</w:t>
@@ -9427,7 +9427,7 @@
       <w:pPr>
         <w:pStyle w:val="Titre2"/>
       </w:pPr>
-      <w:bookmarkStart w:id="37" w:name="_Toc243483873"/>
+      <w:bookmarkStart w:id="37" w:name="_Toc243484952"/>
       <w:r>
         <w:t>Why a CNN, and why pretrained</w:t>
       </w:r>
@@ -9512,7 +9512,7 @@
       <w:pPr>
         <w:pStyle w:val="Titre2"/>
       </w:pPr>
-      <w:bookmarkStart w:id="38" w:name="_Toc243483874"/>
+      <w:bookmarkStart w:id="38" w:name="_Toc243484953"/>
       <w:r>
         <w:t>Method A: frozen features + head</w:t>
       </w:r>
@@ -9619,7 +9619,7 @@
       <w:pPr>
         <w:pStyle w:val="Titre2"/>
       </w:pPr>
-      <w:bookmarkStart w:id="39" w:name="_Toc243483875"/>
+      <w:bookmarkStart w:id="39" w:name="_Toc243484954"/>
       <w:r>
         <w:t>Method B: fine-tuning layer4</w:t>
       </w:r>
@@ -9676,7 +9676,7 @@
       <w:pPr>
         <w:pStyle w:val="Titre2"/>
       </w:pPr>
-      <w:bookmarkStart w:id="40" w:name="_Toc243483876"/>
+      <w:bookmarkStart w:id="40" w:name="_Toc243484955"/>
       <w:r>
         <w:t>Two silent bugs, measured</w:t>
       </w:r>
@@ -9743,7 +9743,7 @@
       <w:pPr>
         <w:pStyle w:val="Titre2"/>
       </w:pPr>
-      <w:bookmarkStart w:id="41" w:name="_Toc243483877"/>
+      <w:bookmarkStart w:id="41" w:name="_Toc243484956"/>
       <w:r>
         <w:lastRenderedPageBreak/>
         <w:t>Painter leakage, measured fairly</w:t>
@@ -10085,7 +10085,7 @@
           <w:noProof/>
         </w:rPr>
         <w:drawing>
-          <wp:inline distT="0" distB="0" distL="0" distR="0" wp14:anchorId="01CDD647" wp14:editId="01CDD648">
+          <wp:inline distT="0" distB="0" distL="0" distR="0" wp14:anchorId="6220CBB1" wp14:editId="6220CBB2">
             <wp:extent cx="4762500" cy="2524125"/>
             <wp:effectExtent l="0" t="0" r="0" b="0"/>
             <wp:docPr id="4" name="05_painter_leakage.png" descr="Painter leakage: same images, same model; only the known-painter group changes." title="Painter leakage: same images, same model; only the known-painter group changes."/>
@@ -10160,7 +10160,7 @@
         <w:pStyle w:val="Titre1"/>
         <w:pageBreakBefore/>
       </w:pPr>
-      <w:bookmarkStart w:id="42" w:name="_Toc243483878"/>
+      <w:bookmarkStart w:id="42" w:name="_Toc243484957"/>
       <w:r>
         <w:lastRenderedPageBreak/>
         <w:t>8. Step 6: final test, CPU cost and recommendation (notebook 06)</w:t>
@@ -10306,7 +10306,7 @@
       <w:pPr>
         <w:pStyle w:val="Titre2"/>
       </w:pPr>
-      <w:bookmarkStart w:id="43" w:name="_Toc243483879"/>
+      <w:bookmarkStart w:id="43" w:name="_Toc243484958"/>
       <w:r>
         <w:t>Classical models (settings chosen on validation)</w:t>
       </w:r>
@@ -10419,7 +10419,7 @@
       <w:pPr>
         <w:pStyle w:val="Titre2"/>
       </w:pPr>
-      <w:bookmarkStart w:id="44" w:name="_Toc243483880"/>
+      <w:bookmarkStart w:id="44" w:name="_Toc243484959"/>
       <w:r>
         <w:t>The final test, measured once</w:t>
       </w:r>
@@ -11450,7 +11450,7 @@
         </w:rPr>
         <w:lastRenderedPageBreak/>
         <w:drawing>
-          <wp:inline distT="0" distB="0" distL="0" distR="0" wp14:anchorId="01CDD649" wp14:editId="01CDD64A">
+          <wp:inline distT="0" distB="0" distL="0" distR="0" wp14:anchorId="6220CBB3" wp14:editId="6220CBB4">
             <wp:extent cx="4762500" cy="1971675"/>
             <wp:effectExtent l="0" t="0" r="0" b="0"/>
             <wp:docPr id="5" name="06_test_accuracy.png" descr="Final test: 220 paintings never seen before, with 95 % bootstrap intervals." title="Final test: 220 paintings never seen before, with 95 % bootstrap intervals."/>
@@ -11509,7 +11509,7 @@
       <w:pPr>
         <w:pStyle w:val="Titre2"/>
       </w:pPr>
-      <w:bookmarkStart w:id="45" w:name="_Toc243483881"/>
+      <w:bookmarkStart w:id="45" w:name="_Toc243484960"/>
       <w:r>
         <w:t>Are the gaps real? Paired bootstrap (same 220 paintings, 5 000 redraws)</w:t>
       </w:r>
@@ -11568,7 +11568,7 @@
       <w:pPr>
         <w:pStyle w:val="Titre2"/>
       </w:pPr>
-      <w:bookmarkStart w:id="46" w:name="_Toc243483882"/>
+      <w:bookmarkStart w:id="46" w:name="_Toc243484961"/>
       <w:r>
         <w:t>Frozen or fine-tuned? Validation and test disagree</w:t>
       </w:r>
@@ -11596,7 +11596,7 @@
       <w:pPr>
         <w:pStyle w:val="Titre2"/>
       </w:pPr>
-      <w:bookmarkStart w:id="47" w:name="_Toc243483883"/>
+      <w:bookmarkStart w:id="47" w:name="_Toc243484962"/>
       <w:r>
         <w:t>Speed and size</w:t>
       </w:r>
@@ -11614,7 +11614,7 @@
       <w:pPr>
         <w:pStyle w:val="Titre2"/>
       </w:pPr>
-      <w:bookmarkStart w:id="48" w:name="_Toc243483884"/>
+      <w:bookmarkStart w:id="48" w:name="_Toc243484963"/>
       <w:r>
         <w:t>Recommendation to the director</w:t>
       </w:r>
@@ -11711,7 +11711,7 @@
         <w:pStyle w:val="Titre1"/>
         <w:pageBreakBefore/>
       </w:pPr>
-      <w:bookmarkStart w:id="49" w:name="_Toc243483885"/>
+      <w:bookmarkStart w:id="49" w:name="_Toc243484964"/>
       <w:r>
         <w:lastRenderedPageBreak/>
         <w:t>9. The random forest, our classical challenger (notebook 06)</w:t>
@@ -11891,14 +11891,14 @@
         <w:rPr>
           <w:color w:val="1C2433"/>
         </w:rPr>
-        <w:t>The random forest on 102 hand-made numbers is our best model without a neural network: 63.5 % on validation, 67.3 % on the test, 16.4 points below the frozen ResNet18 (interval 9.1 to 24.1). Backup slide 10 shows it.</w:t>
+        <w:t>The random forest on 102 hand-made numbers is our best model without a neural network: 63.5 % on validation, 67.3 % on the test, 16.4 points below the frozen ResNet18 (interval 9.1 to 24.1). Slide 8 of the talk explains it; backup slide 12 gives all the classical scores.</w:t>
       </w:r>
     </w:p>
     <w:p>
       <w:pPr>
         <w:pStyle w:val="Titre2"/>
       </w:pPr>
-      <w:bookmarkStart w:id="50" w:name="_Toc243483886"/>
+      <w:bookmarkStart w:id="50" w:name="_Toc243484965"/>
       <w:r>
         <w:t>The 102 hand-made numbers (baselines.py)</w:t>
       </w:r>
@@ -12288,7 +12288,7 @@
       <w:pPr>
         <w:pStyle w:val="Titre2"/>
       </w:pPr>
-      <w:bookmarkStart w:id="51" w:name="_Toc243483887"/>
+      <w:bookmarkStart w:id="51" w:name="_Toc243484966"/>
       <w:r>
         <w:t>Our settings, chosen on validation</w:t>
       </w:r>
@@ -12456,7 +12456,7 @@
       <w:pPr>
         <w:pStyle w:val="Titre2"/>
       </w:pPr>
-      <w:bookmarkStart w:id="52" w:name="_Toc243483888"/>
+      <w:bookmarkStart w:id="52" w:name="_Toc243484967"/>
       <w:r>
         <w:t>Questions on the random forest, with answers</w:t>
       </w:r>
@@ -12721,7 +12721,7 @@
         <w:pStyle w:val="Titre1"/>
         <w:pageBreakBefore/>
       </w:pPr>
-      <w:bookmarkStart w:id="53" w:name="_Toc243483889"/>
+      <w:bookmarkStart w:id="53" w:name="_Toc243484968"/>
       <w:r>
         <w:lastRenderedPageBreak/>
         <w:t>10. Bonus: what about transformers like BERT? (notebook 07)</w:t>
@@ -13588,7 +13588,7 @@
         </w:rPr>
         <w:lastRenderedPageBreak/>
         <w:drawing>
-          <wp:inline distT="0" distB="0" distL="0" distR="0" wp14:anchorId="01CDD64B" wp14:editId="01CDD64C">
+          <wp:inline distT="0" distB="0" distL="0" distR="0" wp14:anchorId="6220CBB5" wp14:editId="6220CBB6">
             <wp:extent cx="4381500" cy="2486025"/>
             <wp:effectExtent l="0" t="0" r="0" b="0"/>
             <wp:docPr id="6" name="07_transformers_accuracy_vs_speed.png" descr="Transformers on validation: CLIP is more accurate, but slower." title="Transformers on validation: CLIP is more accurate, but slower."/>
@@ -13648,7 +13648,7 @@
         <w:pStyle w:val="Titre1"/>
         <w:pageBreakBefore/>
       </w:pPr>
-      <w:bookmarkStart w:id="54" w:name="_Toc243483890"/>
+      <w:bookmarkStart w:id="54" w:name="_Toc243484969"/>
       <w:r>
         <w:lastRenderedPageBreak/>
         <w:t>11. Key numbers to know by heart</w:t>
@@ -14906,7 +14906,7 @@
         <w:pStyle w:val="Titre1"/>
         <w:pageBreakBefore/>
       </w:pPr>
-      <w:bookmarkStart w:id="55" w:name="_Toc243483891"/>
+      <w:bookmarkStart w:id="55" w:name="_Toc243484970"/>
       <w:r>
         <w:lastRenderedPageBreak/>
         <w:t>12. Concepts in simple words</w:t>
@@ -17097,7 +17097,7 @@
         <w:pStyle w:val="Titre1"/>
         <w:pageBreakBefore/>
       </w:pPr>
-      <w:bookmarkStart w:id="56" w:name="_Toc243483892"/>
+      <w:bookmarkStart w:id="56" w:name="_Toc243484971"/>
       <w:r>
         <w:lastRenderedPageBreak/>
         <w:t>13. Questions you may get, with answers</w:t>
@@ -17119,7 +17119,7 @@
       <w:pPr>
         <w:pStyle w:val="Titre2"/>
       </w:pPr>
-      <w:bookmarkStart w:id="57" w:name="_Toc243483893"/>
+      <w:bookmarkStart w:id="57" w:name="_Toc243484972"/>
       <w:r>
         <w:t>About the data</w:t>
       </w:r>
@@ -17239,7 +17239,7 @@
       <w:pPr>
         <w:pStyle w:val="Titre2"/>
       </w:pPr>
-      <w:bookmarkStart w:id="58" w:name="_Toc243483894"/>
+      <w:bookmarkStart w:id="58" w:name="_Toc243484973"/>
       <w:r>
         <w:t>About the MLP</w:t>
       </w:r>
@@ -17359,7 +17359,7 @@
       <w:pPr>
         <w:pStyle w:val="Titre2"/>
       </w:pPr>
-      <w:bookmarkStart w:id="59" w:name="_Toc243483895"/>
+      <w:bookmarkStart w:id="59" w:name="_Toc243484974"/>
       <w:r>
         <w:t>About training and diagnosis</w:t>
       </w:r>
@@ -17457,7 +17457,7 @@
       <w:pPr>
         <w:pStyle w:val="Titre2"/>
       </w:pPr>
-      <w:bookmarkStart w:id="60" w:name="_Toc243483896"/>
+      <w:bookmarkStart w:id="60" w:name="_Toc243484975"/>
       <w:r>
         <w:lastRenderedPageBreak/>
         <w:t>About ResNet</w:t>
@@ -17519,7 +17519,7 @@
           <w:bCs/>
           <w:color w:val="1C2433"/>
         </w:rPr>
-        <w:t>Why did fine-tuning not win on validation?</w:t>
+        <w:t>What are the 512 numbers?</w:t>
       </w:r>
     </w:p>
     <w:p>
@@ -17527,7 +17527,7 @@
         <w:spacing w:after="120"/>
       </w:pPr>
       <w:r>
-        <w:t>8.4 M weights for 1 061 images: it overfits (99.9 % on train) even with augmentation. Frozen features plus 2 565 trained weights generalise better here.</w:t>
+        <w:t>What ResNet18 gives just before its own last layer: after the convolution layers, each of its 512 feature maps is averaged over the whole picture. Each number says how much of one learned pattern is in the painting. We removed its last layer (1 000 ImageNet classes) and put ours instead (5 styles).</w:t>
       </w:r>
     </w:p>
     <w:p>
@@ -17541,7 +17541,7 @@
           <w:bCs/>
           <w:color w:val="1C2433"/>
         </w:rPr>
-        <w:t>Why does the linear probe give the same 88.1 % for 3 seeds?</w:t>
+        <w:t>What does "Res" mean in ResNet?</w:t>
       </w:r>
     </w:p>
     <w:p>
@@ -17549,7 +17549,7 @@
         <w:spacing w:after="120"/>
       </w:pPr>
       <w:r>
-        <w:t>The features are fixed and the problem is nearly convex, so every seed finds the same solution.</w:t>
+        <w:t>Residual: each block adds its input to its output, a shortcut. The gradient flows back through these shortcuts, so an 18-layer network does not suffer from the vanishing gradient that blocked our 8 sigmoid layers.</w:t>
       </w:r>
     </w:p>
     <w:p>
@@ -17563,7 +17563,7 @@
           <w:bCs/>
           <w:color w:val="1C2433"/>
         </w:rPr>
-        <w:t>The course talked about BERT and transformers. Could they solve the problem?</w:t>
+        <w:t>How do you freeze it in code?</w:t>
       </w:r>
     </w:p>
     <w:p>
@@ -17571,7 +17571,51 @@
         <w:spacing w:after="120"/>
       </w:pPr>
       <w:r>
-        <w:t>BERT alone, no: it reads text, not pixels. We tested its image cousins on validation (notebook 07). ViT-B/16 gives the same 88.1 % as ResNet18 and is 9 times slower. CLIP, trained on images with captions, reaches 89.0 % with no training at all and 94.7 % with our linear head, 6.8 points above ResNet18 (paired interval 2.3 to 11.4), for 2.7 times the time. But it has probably seen WikiArt during its training and we did not reopen the test, so it is our first next step, not our recommendation.</w:t>
+        <w:t xml:space="preserve">In </w:t>
+      </w:r>
+      <w:r>
+        <w:rPr>
+          <w:rFonts w:ascii="Consolas" w:eastAsia="Consolas" w:hAnsi="Consolas" w:cs="Consolas"/>
+          <w:sz w:val="19"/>
+          <w:szCs w:val="19"/>
+        </w:rPr>
+        <w:t>ResNetClassifier</w:t>
+      </w:r>
+      <w:r>
+        <w:t xml:space="preserve"> (</w:t>
+      </w:r>
+      <w:r>
+        <w:rPr>
+          <w:rFonts w:ascii="Consolas" w:eastAsia="Consolas" w:hAnsi="Consolas" w:cs="Consolas"/>
+          <w:sz w:val="19"/>
+          <w:szCs w:val="19"/>
+        </w:rPr>
+        <w:t>models.py</w:t>
+      </w:r>
+      <w:r>
+        <w:t xml:space="preserve">): </w:t>
+      </w:r>
+      <w:r>
+        <w:rPr>
+          <w:rFonts w:ascii="Consolas" w:eastAsia="Consolas" w:hAnsi="Consolas" w:cs="Consolas"/>
+          <w:sz w:val="19"/>
+          <w:szCs w:val="19"/>
+        </w:rPr>
+        <w:t>requires_grad_(False)</w:t>
+      </w:r>
+      <w:r>
+        <w:t xml:space="preserve"> on every weight of the body, and its batch norm layers stay in eval mode. Only the head, </w:t>
+      </w:r>
+      <w:r>
+        <w:rPr>
+          <w:rFonts w:ascii="Consolas" w:eastAsia="Consolas" w:hAnsi="Consolas" w:cs="Consolas"/>
+          <w:sz w:val="19"/>
+          <w:szCs w:val="19"/>
+        </w:rPr>
+        <w:t>nn.Linear(512, 5)</w:t>
+      </w:r>
+      <w:r>
+        <w:t>, learns: 2 565 weights. As the body never changes, we compute the 512 numbers once and cache them.</w:t>
       </w:r>
     </w:p>
     <w:p>
@@ -17585,7 +17629,7 @@
           <w:bCs/>
           <w:color w:val="1C2433"/>
         </w:rPr>
-        <w:t>What does the 12.8 % bug teach?</w:t>
+        <w:t>Why did fine-tuning not win on validation?</w:t>
       </w:r>
     </w:p>
     <w:p>
@@ -17593,18 +17637,8 @@
         <w:spacing w:after="120"/>
       </w:pPr>
       <w:r>
-        <w:t>Always call model.eval(): in train mode batch norm uses each batch's statistics, which erased the style because our batches held mostly one style.</w:t>
-      </w:r>
-    </w:p>
-    <w:p>
-      <w:pPr>
-        <w:pStyle w:val="Titre2"/>
-      </w:pPr>
-      <w:bookmarkStart w:id="61" w:name="_Toc243483897"/>
-      <w:r>
-        <w:t>About the results and the recommendation</w:t>
-      </w:r>
-      <w:bookmarkEnd w:id="61"/>
+        <w:t>8.4 M weights for 1 061 images: it overfits (99.9 % on train) even with augmentation. Frozen features plus 2 565 trained weights generalise better here.</w:t>
+      </w:r>
     </w:p>
     <w:p>
       <w:pPr>
@@ -17617,7 +17651,7 @@
           <w:bCs/>
           <w:color w:val="1C2433"/>
         </w:rPr>
-        <w:t>Validation says frozen is better, test says fine-tuned is better. Which is right?</w:t>
+        <w:t>Why does the linear probe give the same 88.1 % for 3 seeds?</w:t>
       </w:r>
     </w:p>
     <w:p>
@@ -17625,7 +17659,7 @@
         <w:spacing w:after="120"/>
       </w:pPr>
       <w:r>
-        <w:t>Neither can be proven: with about 220 images a score moves about 5 points by chance. We chose on validation before the test, which keeps the test honest. Fine-tuning is the first thing to retry with more data.</w:t>
+        <w:t>The features are fixed and the problem is nearly convex, so every seed finds the same solution.</w:t>
       </w:r>
     </w:p>
     <w:p>
@@ -17639,7 +17673,7 @@
           <w:bCs/>
           <w:color w:val="1C2433"/>
         </w:rPr>
-        <w:t>Why not pick the fine-tuned model, since it won the test?</w:t>
+        <w:t>The course talked about BERT and transformers. Could they solve the problem?</w:t>
       </w:r>
     </w:p>
     <w:p>
@@ -17647,7 +17681,7 @@
         <w:spacing w:after="120"/>
       </w:pPr>
       <w:r>
-        <w:t>Choosing by test score turns the test into a second validation set and makes the reported score too optimistic.</w:t>
+        <w:t>BERT alone, no: it reads text, not pixels. We tested its image cousins on validation (notebook 07). ViT-B/16 gives the same 88.1 % as ResNet18 and is 9 times slower. CLIP, trained on images with captions, reaches 89.0 % with no training at all and 94.7 % with our linear head, 6.8 points above ResNet18 (paired interval 2.3 to 11.4), for 2.7 times the time. But it has probably seen WikiArt during its training and we did not reopen the test, so it is our first next step, not our recommendation.</w:t>
       </w:r>
     </w:p>
     <w:p>
@@ -17661,7 +17695,7 @@
           <w:bCs/>
           <w:color w:val="1C2433"/>
         </w:rPr>
-        <w:t>Is 83 % good enough for a museum?</w:t>
+        <w:t>What does the 12.8 % bug teach?</w:t>
       </w:r>
     </w:p>
     <w:p>
@@ -17669,8 +17703,18 @@
         <w:spacing w:after="120"/>
       </w:pPr>
       <w:r>
-        <w:t>One visitor in six gets a wrong style, against one in three for the best classical model. Good for a guide that tells the story of a movement; it must be confirmed on real kiosk photos.</w:t>
-      </w:r>
+        <w:t>Always call model.eval(): in train mode batch norm uses each batch's statistics, which erased the style because our batches held mostly one style.</w:t>
+      </w:r>
+    </w:p>
+    <w:p>
+      <w:pPr>
+        <w:pStyle w:val="Titre2"/>
+      </w:pPr>
+      <w:bookmarkStart w:id="61" w:name="_Toc243484976"/>
+      <w:r>
+        <w:t>About the results and the recommendation</w:t>
+      </w:r>
+      <w:bookmarkEnd w:id="61"/>
     </w:p>
     <w:p>
       <w:pPr>
@@ -17683,7 +17727,7 @@
           <w:bCs/>
           <w:color w:val="1C2433"/>
         </w:rPr>
-        <w:t>Is 53 ms realistic on a kiosk?</w:t>
+        <w:t>Validation says frozen is better, test says fine-tuned is better. Which is right?</w:t>
       </w:r>
     </w:p>
     <w:p>
@@ -17691,7 +17735,7 @@
         <w:spacing w:after="120"/>
       </w:pPr>
       <w:r>
-        <w:t>Measured on one thread of a laptop, one photo at a time. A kiosk 4 times slower would still answer in about 0.2 s.</w:t>
+        <w:t>Neither can be proven: with about 220 images a score moves about 5 points by chance. We chose on validation before the test, which keeps the test honest. Fine-tuning is the first thing to retry with more data.</w:t>
       </w:r>
     </w:p>
     <w:p>
@@ -17705,7 +17749,7 @@
           <w:bCs/>
           <w:color w:val="1C2433"/>
         </w:rPr>
-        <w:t>So is a neural network worth it?</w:t>
+        <w:t>Why not pick the fine-tuned model, since it won the test?</w:t>
       </w:r>
     </w:p>
     <w:p>
@@ -17713,7 +17757,7 @@
         <w:spacing w:after="120"/>
       </w:pPr>
       <w:r>
-        <w:t>Yes, a pretrained one: +16.4 points over the best classical model (interval 9.1 to 24.1), a cost a kiosk can afford, no GPU, retrained in seconds.</w:t>
+        <w:t>Choosing by test score turns the test into a second validation set and makes the reported score too optimistic.</w:t>
       </w:r>
     </w:p>
     <w:p>
@@ -17727,7 +17771,7 @@
           <w:bCs/>
           <w:color w:val="1C2433"/>
         </w:rPr>
-        <w:t>What about part 2 (questions in natural language)?</w:t>
+        <w:t>Is 83 % good enough for a museum?</w:t>
       </w:r>
     </w:p>
     <w:p>
@@ -17735,19 +17779,8 @@
         <w:spacing w:after="120"/>
       </w:pPr>
       <w:r>
-        <w:t>The written brief lists three deliverables and part 2 is not one of them, so we put our time on those and on the recommendation. Session 8 shows the next step (milestone m4): encode the visitors' questions and descriptions of the artworks with sentence embeddings (all-MiniLM-L6-v2), retrieve the closest artwork by cosine similarity, and compare with a classical TF-IDF search. Our WikiArt images have no text descriptions, so we would first have to write them.</w:t>
-      </w:r>
-    </w:p>
-    <w:p>
-      <w:pPr>
-        <w:pStyle w:val="Titre2"/>
-      </w:pPr>
-      <w:bookmarkStart w:id="62" w:name="_Toc243483898"/>
-      <w:r>
-        <w:lastRenderedPageBreak/>
-        <w:t>About the project</w:t>
-      </w:r>
-      <w:bookmarkEnd w:id="62"/>
+        <w:t>One visitor in six gets a wrong style, against one in three for the best classical model. Good for a guide that tells the story of a movement; it must be confirmed on real kiosk photos.</w:t>
+      </w:r>
     </w:p>
     <w:p>
       <w:pPr>
@@ -17760,7 +17793,7 @@
           <w:bCs/>
           <w:color w:val="1C2433"/>
         </w:rPr>
-        <w:t>How can someone reproduce your results?</w:t>
+        <w:t>Is 53 ms realistic on a kiosk?</w:t>
       </w:r>
     </w:p>
     <w:p>
@@ -17768,7 +17801,7 @@
         <w:spacing w:after="120"/>
       </w:pPr>
       <w:r>
-        <w:t>pip install -r requirements.txt, bash scripts/get_data.sh, python -m pytest, python scripts/run_notebooks.py. Fixed seeds and a pinned dataset revision; notebook 06 re-trains the models and gets exactly the same validation scores.</w:t>
+        <w:t>Measured on one thread of a laptop, one photo at a time. A kiosk 4 times slower would still answer in about 0.2 s.</w:t>
       </w:r>
     </w:p>
     <w:p>
@@ -17782,6 +17815,83 @@
           <w:bCs/>
           <w:color w:val="1C2433"/>
         </w:rPr>
+        <w:lastRenderedPageBreak/>
+        <w:t>So is a neural network worth it?</w:t>
+      </w:r>
+    </w:p>
+    <w:p>
+      <w:pPr>
+        <w:spacing w:after="120"/>
+      </w:pPr>
+      <w:r>
+        <w:t>Yes, a pretrained one: +16.4 points over the best classical model (interval 9.1 to 24.1), a cost a kiosk can afford, no GPU, retrained in seconds.</w:t>
+      </w:r>
+    </w:p>
+    <w:p>
+      <w:pPr>
+        <w:keepNext/>
+        <w:spacing w:before="120" w:after="40"/>
+      </w:pPr>
+      <w:r>
+        <w:rPr>
+          <w:b/>
+          <w:bCs/>
+          <w:color w:val="1C2433"/>
+        </w:rPr>
+        <w:t>What about part 2 (questions in natural language)?</w:t>
+      </w:r>
+    </w:p>
+    <w:p>
+      <w:pPr>
+        <w:spacing w:after="120"/>
+      </w:pPr>
+      <w:r>
+        <w:t>The written brief lists three deliverables and part 2 is not one of them, so we put our time on those and on the recommendation. Session 8 shows the next step (milestone m4): encode the visitors' questions and descriptions of the artworks with sentence embeddings (all-MiniLM-L6-v2), retrieve the closest artwork by cosine similarity, and compare with a classical TF-IDF search. Our WikiArt images have no text descriptions, so we would first have to write them.</w:t>
+      </w:r>
+    </w:p>
+    <w:p>
+      <w:pPr>
+        <w:pStyle w:val="Titre2"/>
+      </w:pPr>
+      <w:bookmarkStart w:id="62" w:name="_Toc243484977"/>
+      <w:r>
+        <w:t>About the project</w:t>
+      </w:r>
+      <w:bookmarkEnd w:id="62"/>
+    </w:p>
+    <w:p>
+      <w:pPr>
+        <w:keepNext/>
+        <w:spacing w:before="120" w:after="40"/>
+      </w:pPr>
+      <w:r>
+        <w:rPr>
+          <w:b/>
+          <w:bCs/>
+          <w:color w:val="1C2433"/>
+        </w:rPr>
+        <w:t>How can someone reproduce your results?</w:t>
+      </w:r>
+    </w:p>
+    <w:p>
+      <w:pPr>
+        <w:spacing w:after="120"/>
+      </w:pPr>
+      <w:r>
+        <w:t>pip install -r requirements.txt, bash scripts/get_data.sh, python -m pytest, python scripts/run_notebooks.py. Fixed seeds and a pinned dataset revision; notebook 06 re-trains the models and gets exactly the same validation scores.</w:t>
+      </w:r>
+    </w:p>
+    <w:p>
+      <w:pPr>
+        <w:keepNext/>
+        <w:spacing w:before="120" w:after="40"/>
+      </w:pPr>
+      <w:r>
+        <w:rPr>
+          <w:b/>
+          <w:bCs/>
+          <w:color w:val="1C2433"/>
+        </w:rPr>
         <w:t>How is the work organised?</w:t>
       </w:r>
     </w:p>
@@ -17798,7 +17908,7 @@
         <w:pStyle w:val="Titre1"/>
         <w:pageBreakBefore/>
       </w:pPr>
-      <w:bookmarkStart w:id="63" w:name="_Toc243483899"/>
+      <w:bookmarkStart w:id="63" w:name="_Toc243484978"/>
       <w:r>
         <w:lastRenderedPageBreak/>
         <w:t>14. Limits to admit, and next steps</w:t>
@@ -18592,7 +18702,7 @@
         <w:pStyle w:val="Titre1"/>
         <w:pageBreakBefore/>
       </w:pPr>
-      <w:bookmarkStart w:id="64" w:name="_Toc243483900"/>
+      <w:bookmarkStart w:id="64" w:name="_Toc243484979"/>
       <w:r>
         <w:lastRenderedPageBreak/>
         <w:t>15. Git history and how to reproduce</w:t>
@@ -19548,7 +19658,7 @@
         <w:pStyle w:val="Titre1"/>
         <w:pageBreakBefore/>
       </w:pPr>
-      <w:bookmarkStart w:id="65" w:name="_Toc243483901"/>
+      <w:bookmarkStart w:id="65" w:name="_Toc243484980"/>
       <w:r>
         <w:lastRenderedPageBreak/>
         <w:t>16. The 10-minute talk, slide by slide</w:t>
@@ -19563,7 +19673,7 @@
         <w:rPr>
           <w:color w:val="1C2433"/>
         </w:rPr>
-        <w:t>The talk follows the project step by step and gives the answer only at the end. 9 slides, about one minute each: about 8:40 in total, the rest of the 10 minutes is a margin. The speaker notes in the .pptx and oral_script.pdf hold the full text in simple English.</w:t>
+        <w:t>The talk follows the project step by step and gives the answer only at the end. 11 slides, about 50 seconds each: about 9:35 in total, the rest of the 10 minutes is a margin. The speaker notes in the .pptx and oral_script.pdf hold the full text in simple English.</w:t>
       </w:r>
     </w:p>
     <w:tbl>
@@ -19894,7 +20004,7 @@
                 <w:sz w:val="19"/>
                 <w:szCs w:val="19"/>
               </w:rPr>
-              <w:t>0:40</w:t>
+              <w:t>0:35</w:t>
             </w:r>
           </w:p>
         </w:tc>
@@ -20001,7 +20111,7 @@
                 <w:sz w:val="19"/>
                 <w:szCs w:val="19"/>
               </w:rPr>
-              <w:t>1:05</w:t>
+              <w:t>0:55</w:t>
             </w:r>
           </w:p>
         </w:tc>
@@ -20299,7 +20409,7 @@
                 <w:sz w:val="19"/>
                 <w:szCs w:val="19"/>
               </w:rPr>
-              <w:t>Step 4: A pretrained ResNet18 sees shapes</w:t>
+              <w:t>Step 4: ResNet18: a network made for images</w:t>
             </w:r>
           </w:p>
         </w:tc>
@@ -20326,7 +20436,7 @@
                 <w:sz w:val="19"/>
                 <w:szCs w:val="19"/>
               </w:rPr>
-              <w:t>1:05</w:t>
+              <w:t>1:00</w:t>
             </w:r>
           </w:p>
         </w:tc>
@@ -20353,7 +20463,7 @@
                 <w:sz w:val="19"/>
                 <w:szCs w:val="19"/>
               </w:rPr>
-              <w:t>88.1 % with 2 565 trained weights, small train-validation gap (0.09); fine-tuning overfits.</w:t>
+              <w:t>A CNN made for images (edges, textures, shapes), pretrained on 1.2 million photos and frozen: we train only 2 565 weights.</w:t>
             </w:r>
           </w:p>
         </w:tc>
@@ -20407,7 +20517,7 @@
                 <w:sz w:val="19"/>
                 <w:szCs w:val="19"/>
               </w:rPr>
-              <w:t>Step 5: Final test: the pretrained network wins</w:t>
+              <w:t>Step 4: A pretrained ResNet18 sees shapes</w:t>
             </w:r>
           </w:p>
         </w:tc>
@@ -20433,7 +20543,7 @@
                 <w:sz w:val="19"/>
                 <w:szCs w:val="19"/>
               </w:rPr>
-              <w:t>1:20</w:t>
+              <w:t>0:55</w:t>
             </w:r>
           </w:p>
         </w:tc>
@@ -20459,7 +20569,7 @@
                 <w:sz w:val="19"/>
                 <w:szCs w:val="19"/>
               </w:rPr>
-              <w:t>The classical challenger: 102 hand-made numbers + random forest, 67 %. ResNet +16.4 points (9.1 to 24.1).</w:t>
+              <w:t>88.1 % on validation; Cubism 7 % → 71 %; small gap (0.09); fine-tuning overfits.</w:t>
             </w:r>
           </w:p>
         </w:tc>
@@ -20515,7 +20625,7 @@
                 <w:sz w:val="19"/>
                 <w:szCs w:val="19"/>
               </w:rPr>
-              <w:t>Step 6: Fast and cheap enough for a kiosk</w:t>
+              <w:t>Step 5: Our classical challenger: a random forest</w:t>
             </w:r>
           </w:p>
         </w:tc>
@@ -20542,7 +20652,7 @@
                 <w:sz w:val="19"/>
                 <w:szCs w:val="19"/>
               </w:rPr>
-              <w:t>0:40</w:t>
+              <w:t>0:50</w:t>
             </w:r>
           </w:p>
         </w:tc>
@@ -20569,7 +20679,7 @@
                 <w:sz w:val="19"/>
                 <w:szCs w:val="19"/>
               </w:rPr>
-              <w:t>53 ms, 45 MB, 17 s of training, no GPU.</w:t>
+              <w:t>102 hand-made numbers, 500 trees that vote, settings chosen on validation (63.5 %).</w:t>
             </w:r>
           </w:p>
         </w:tc>
@@ -20623,6 +20733,222 @@
                 <w:sz w:val="19"/>
                 <w:szCs w:val="19"/>
               </w:rPr>
+              <w:t>Step 5: Final test: the pretrained network wins</w:t>
+            </w:r>
+          </w:p>
+        </w:tc>
+        <w:tc>
+          <w:tcPr>
+            <w:tcW w:w="1157" w:type="dxa"/>
+            <w:tcBorders>
+              <w:top w:val="single" w:sz="4" w:space="0" w:color="D9DCE2"/>
+              <w:left w:val="single" w:sz="4" w:space="0" w:color="D9DCE2"/>
+              <w:bottom w:val="single" w:sz="4" w:space="0" w:color="D9DCE2"/>
+              <w:right w:val="single" w:sz="4" w:space="0" w:color="D9DCE2"/>
+            </w:tcBorders>
+            <w:tcMar>
+              <w:top w:w="60" w:type="dxa"/>
+              <w:left w:w="100" w:type="dxa"/>
+              <w:bottom w:w="60" w:type="dxa"/>
+              <w:right w:w="100" w:type="dxa"/>
+            </w:tcMar>
+          </w:tcPr>
+          <w:p>
+            <w:r>
+              <w:rPr>
+                <w:sz w:val="19"/>
+                <w:szCs w:val="19"/>
+              </w:rPr>
+              <w:t>0:55</w:t>
+            </w:r>
+          </w:p>
+        </w:tc>
+        <w:tc>
+          <w:tcPr>
+            <w:tcW w:w="4625" w:type="dxa"/>
+            <w:tcBorders>
+              <w:top w:val="single" w:sz="4" w:space="0" w:color="D9DCE2"/>
+              <w:left w:val="single" w:sz="4" w:space="0" w:color="D9DCE2"/>
+              <w:bottom w:val="single" w:sz="4" w:space="0" w:color="D9DCE2"/>
+              <w:right w:val="single" w:sz="4" w:space="0" w:color="D9DCE2"/>
+            </w:tcBorders>
+            <w:tcMar>
+              <w:top w:w="60" w:type="dxa"/>
+              <w:left w:w="100" w:type="dxa"/>
+              <w:bottom w:w="60" w:type="dxa"/>
+              <w:right w:w="100" w:type="dxa"/>
+            </w:tcMar>
+          </w:tcPr>
+          <w:p>
+            <w:r>
+              <w:rPr>
+                <w:sz w:val="19"/>
+                <w:szCs w:val="19"/>
+              </w:rPr>
+              <w:t>ResNet 83 %, random forest 67 %, MLP 41 %: +16.4 points (9.1 to 24.1).</w:t>
+            </w:r>
+          </w:p>
+        </w:tc>
+      </w:tr>
+      <w:tr>
+        <w:tc>
+          <w:tcPr>
+            <w:tcW w:w="675" w:type="dxa"/>
+            <w:tcBorders>
+              <w:top w:val="single" w:sz="4" w:space="0" w:color="D9DCE2"/>
+              <w:left w:val="single" w:sz="4" w:space="0" w:color="D9DCE2"/>
+              <w:bottom w:val="single" w:sz="4" w:space="0" w:color="D9DCE2"/>
+              <w:right w:val="single" w:sz="4" w:space="0" w:color="D9DCE2"/>
+            </w:tcBorders>
+            <w:shd w:val="clear" w:color="auto" w:fill="F2F3F5"/>
+            <w:tcMar>
+              <w:top w:w="60" w:type="dxa"/>
+              <w:left w:w="100" w:type="dxa"/>
+              <w:bottom w:w="60" w:type="dxa"/>
+              <w:right w:w="100" w:type="dxa"/>
+            </w:tcMar>
+          </w:tcPr>
+          <w:p>
+            <w:r>
+              <w:rPr>
+                <w:sz w:val="19"/>
+                <w:szCs w:val="19"/>
+              </w:rPr>
+              <w:t>10</w:t>
+            </w:r>
+          </w:p>
+        </w:tc>
+        <w:tc>
+          <w:tcPr>
+            <w:tcW w:w="3181" w:type="dxa"/>
+            <w:tcBorders>
+              <w:top w:val="single" w:sz="4" w:space="0" w:color="D9DCE2"/>
+              <w:left w:val="single" w:sz="4" w:space="0" w:color="D9DCE2"/>
+              <w:bottom w:val="single" w:sz="4" w:space="0" w:color="D9DCE2"/>
+              <w:right w:val="single" w:sz="4" w:space="0" w:color="D9DCE2"/>
+            </w:tcBorders>
+            <w:shd w:val="clear" w:color="auto" w:fill="F2F3F5"/>
+            <w:tcMar>
+              <w:top w:w="60" w:type="dxa"/>
+              <w:left w:w="100" w:type="dxa"/>
+              <w:bottom w:w="60" w:type="dxa"/>
+              <w:right w:w="100" w:type="dxa"/>
+            </w:tcMar>
+          </w:tcPr>
+          <w:p>
+            <w:r>
+              <w:rPr>
+                <w:sz w:val="19"/>
+                <w:szCs w:val="19"/>
+              </w:rPr>
+              <w:t>Step 6: Fast and cheap enough for a kiosk</w:t>
+            </w:r>
+          </w:p>
+        </w:tc>
+        <w:tc>
+          <w:tcPr>
+            <w:tcW w:w="1157" w:type="dxa"/>
+            <w:tcBorders>
+              <w:top w:val="single" w:sz="4" w:space="0" w:color="D9DCE2"/>
+              <w:left w:val="single" w:sz="4" w:space="0" w:color="D9DCE2"/>
+              <w:bottom w:val="single" w:sz="4" w:space="0" w:color="D9DCE2"/>
+              <w:right w:val="single" w:sz="4" w:space="0" w:color="D9DCE2"/>
+            </w:tcBorders>
+            <w:shd w:val="clear" w:color="auto" w:fill="F2F3F5"/>
+            <w:tcMar>
+              <w:top w:w="60" w:type="dxa"/>
+              <w:left w:w="100" w:type="dxa"/>
+              <w:bottom w:w="60" w:type="dxa"/>
+              <w:right w:w="100" w:type="dxa"/>
+            </w:tcMar>
+          </w:tcPr>
+          <w:p>
+            <w:r>
+              <w:rPr>
+                <w:sz w:val="19"/>
+                <w:szCs w:val="19"/>
+              </w:rPr>
+              <w:t>0:35</w:t>
+            </w:r>
+          </w:p>
+        </w:tc>
+        <w:tc>
+          <w:tcPr>
+            <w:tcW w:w="4625" w:type="dxa"/>
+            <w:tcBorders>
+              <w:top w:val="single" w:sz="4" w:space="0" w:color="D9DCE2"/>
+              <w:left w:val="single" w:sz="4" w:space="0" w:color="D9DCE2"/>
+              <w:bottom w:val="single" w:sz="4" w:space="0" w:color="D9DCE2"/>
+              <w:right w:val="single" w:sz="4" w:space="0" w:color="D9DCE2"/>
+            </w:tcBorders>
+            <w:shd w:val="clear" w:color="auto" w:fill="F2F3F5"/>
+            <w:tcMar>
+              <w:top w:w="60" w:type="dxa"/>
+              <w:left w:w="100" w:type="dxa"/>
+              <w:bottom w:w="60" w:type="dxa"/>
+              <w:right w:w="100" w:type="dxa"/>
+            </w:tcMar>
+          </w:tcPr>
+          <w:p>
+            <w:r>
+              <w:rPr>
+                <w:sz w:val="19"/>
+                <w:szCs w:val="19"/>
+              </w:rPr>
+              <w:t>53 ms, 45 MB, 17 s of training, no GPU.</w:t>
+            </w:r>
+          </w:p>
+        </w:tc>
+      </w:tr>
+      <w:tr>
+        <w:tc>
+          <w:tcPr>
+            <w:tcW w:w="675" w:type="dxa"/>
+            <w:tcBorders>
+              <w:top w:val="single" w:sz="4" w:space="0" w:color="D9DCE2"/>
+              <w:left w:val="single" w:sz="4" w:space="0" w:color="D9DCE2"/>
+              <w:bottom w:val="single" w:sz="4" w:space="0" w:color="D9DCE2"/>
+              <w:right w:val="single" w:sz="4" w:space="0" w:color="D9DCE2"/>
+            </w:tcBorders>
+            <w:tcMar>
+              <w:top w:w="60" w:type="dxa"/>
+              <w:left w:w="100" w:type="dxa"/>
+              <w:bottom w:w="60" w:type="dxa"/>
+              <w:right w:w="100" w:type="dxa"/>
+            </w:tcMar>
+          </w:tcPr>
+          <w:p>
+            <w:r>
+              <w:rPr>
+                <w:sz w:val="19"/>
+                <w:szCs w:val="19"/>
+              </w:rPr>
+              <w:t>11</w:t>
+            </w:r>
+          </w:p>
+        </w:tc>
+        <w:tc>
+          <w:tcPr>
+            <w:tcW w:w="3181" w:type="dxa"/>
+            <w:tcBorders>
+              <w:top w:val="single" w:sz="4" w:space="0" w:color="D9DCE2"/>
+              <w:left w:val="single" w:sz="4" w:space="0" w:color="D9DCE2"/>
+              <w:bottom w:val="single" w:sz="4" w:space="0" w:color="D9DCE2"/>
+              <w:right w:val="single" w:sz="4" w:space="0" w:color="D9DCE2"/>
+            </w:tcBorders>
+            <w:tcMar>
+              <w:top w:w="60" w:type="dxa"/>
+              <w:left w:w="100" w:type="dxa"/>
+              <w:bottom w:w="60" w:type="dxa"/>
+              <w:right w:w="100" w:type="dxa"/>
+            </w:tcMar>
+          </w:tcPr>
+          <w:p>
+            <w:r>
+              <w:rPr>
+                <w:sz w:val="19"/>
+                <w:szCs w:val="19"/>
+              </w:rPr>
               <w:t>Our choice: frozen ResNet18 + linear head</w:t>
             </w:r>
           </w:p>
@@ -20690,7 +21016,7 @@
       <w:pPr>
         <w:pStyle w:val="Titre2"/>
       </w:pPr>
-      <w:bookmarkStart w:id="66" w:name="_Toc243483902"/>
+      <w:bookmarkStart w:id="66" w:name="_Toc243484981"/>
       <w:r>
         <w:t>The thread: each result opens the next step</w:t>
       </w:r>
@@ -20821,7 +21147,7 @@
         <w:t>Slide 6 to 7</w:t>
       </w:r>
       <w:r>
-        <w:t>: We saw that ResNet18 reaches 88 percent on validation. But to answer the director, we also need a challenger without any neural network. So now, step five: the final test of every model.</w:t>
+        <w:t>: We saw how ResNet18 works. So now, let's see what it gives on our paintings.</w:t>
       </w:r>
     </w:p>
     <w:p>
@@ -20841,7 +21167,7 @@
         <w:t>Slide 7 to 8</w:t>
       </w:r>
       <w:r>
-        <w:t>: We saw that the pretrained network is the most accurate. But accuracy is only half of the director's question. So now, step six: what does it cost on a kiosk?</w:t>
+        <w:t>: We saw that ResNet18 reaches 88 percent. But to answer the director, we also need a challenger without any neural network. So now, step five: we build this classical challenger, then we test every model.</w:t>
       </w:r>
     </w:p>
     <w:p>
@@ -20861,6 +21187,47 @@
         <w:t>Slide 8 to 9</w:t>
       </w:r>
       <w:r>
+        <w:t>: We saw how our challenger works. So now, the final test: every model, on 220 paintings never seen before.</w:t>
+      </w:r>
+    </w:p>
+    <w:p>
+      <w:pPr>
+        <w:pStyle w:val="Paragraphedeliste"/>
+        <w:numPr>
+          <w:ilvl w:val="0"/>
+          <w:numId w:val="3"/>
+        </w:numPr>
+        <w:spacing w:after="80"/>
+      </w:pPr>
+      <w:r>
+        <w:rPr>
+          <w:b/>
+          <w:bCs/>
+        </w:rPr>
+        <w:lastRenderedPageBreak/>
+        <w:t>Slide 9 to 10</w:t>
+      </w:r>
+      <w:r>
+        <w:t>: We saw that the pretrained network is the most accurate. But accuracy is only half of the director's question. So now, step six: what does it cost on a kiosk?</w:t>
+      </w:r>
+    </w:p>
+    <w:p>
+      <w:pPr>
+        <w:pStyle w:val="Paragraphedeliste"/>
+        <w:numPr>
+          <w:ilvl w:val="0"/>
+          <w:numId w:val="3"/>
+        </w:numPr>
+        <w:spacing w:after="80"/>
+      </w:pPr>
+      <w:r>
+        <w:rPr>
+          <w:b/>
+          <w:bCs/>
+        </w:rPr>
+        <w:t>Slide 10 to 11</w:t>
+      </w:r>
+      <w:r>
         <w:t>: We saw that it is accurate, fast and cheap. So now, we have everything we need to answer the director.</w:t>
       </w:r>
     </w:p>
@@ -20869,7 +21236,7 @@
         <w:spacing w:after="120"/>
       </w:pPr>
       <w:r>
-        <w:t>Slides 10 to 17 are backups for the questions: the random forest, seeing the painter inflates the score, validation vs test, why you can trust the numbers, the training recipes, the four broken runs of notebook 04, where the chosen model fails, and what about transformers (BERT, ViT, CLIP). The word-for-word script is in oral_script.pdf.</w:t>
+        <w:t>Slides 12 to 19 are backups for the questions: classical models (all the scores), seeing the painter inflates the score, validation vs test, why you can trust the numbers, the training recipes, the four broken runs of notebook 04, where the chosen model fails, and what about transformers (BERT, ViT, CLIP). The word-for-word script is in oral_script.pdf.</w:t>
       </w:r>
     </w:p>
     <w:sectPr>
@@ -20983,10 +21350,10 @@
 <file path=word/numbering.xml><?xml version="1.0" encoding="utf-8"?>
 <w:numbering xmlns:wpc="http://schemas.microsoft.com/office/word/2010/wordprocessingCanvas" xmlns:cx="http://schemas.microsoft.com/office/drawing/2014/chartex" xmlns:cx1="http://schemas.microsoft.com/office/drawing/2015/9/8/chartex" xmlns:cx2="http://schemas.microsoft.com/office/drawing/2015/10/21/chartex" xmlns:cx3="http://schemas.microsoft.com/office/drawing/2016/5/9/chartex" xmlns:cx4="http://schemas.microsoft.com/office/drawing/2016/5/10/chartex" xmlns:cx5="http://schemas.microsoft.com/office/drawing/2016/5/11/chartex" xmlns:cx6="http://schemas.microsoft.com/office/drawing/2016/5/12/chartex" xmlns:cx7="http://schemas.microsoft.com/office/drawing/2016/5/13/chartex" xmlns:cx8="http://schemas.microsoft.com/office/drawing/2016/5/14/chartex" xmlns:mc="http://schemas.openxmlformats.org/markup-compatibility/2006" xmlns:aink="http://schemas.microsoft.com/office/drawing/2016/ink" xmlns:am3d="http://schemas.microsoft.com/office/drawing/2017/model3d" xmlns:o="urn:schemas-microsoft-com:office:office" xmlns:oel="http://schemas.microsoft.com/office/2019/extlst" xmlns:r="http://schemas.openxmlformats.org/officeDocument/2006/relationships" xmlns:m="http://schemas.openxmlformats.org/officeDocument/2006/math" xmlns:v="urn:schemas-microsoft-com:vml" xmlns:wp14="http://schemas.microsoft.com/office/word/2010/wordprocessingDrawing" xmlns:wp="http://schemas.openxmlformats.org/drawingml/2006/wordprocessingDrawing" xmlns:w10="urn:schemas-microsoft-com:office:word" xmlns:w="http://schemas.openxmlformats.org/wordprocessingml/2006/main" xmlns:w14="http://schemas.microsoft.com/office/word/2010/wordml" xmlns:w15="http://schemas.microsoft.com/office/word/2012/wordml" xmlns:w16cex="http://schemas.microsoft.com/office/word/2018/wordml/cex" xmlns:w16cid="http://schemas.microsoft.com/office/word/2016/wordml/cid" xmlns:w16="http://schemas.microsoft.com/office/word/2018/wordml" xmlns:w16du="http://schemas.microsoft.com/office/word/2023/wordml/word16du" xmlns:w16sdtdh="http://schemas.microsoft.com/office/word/2020/wordml/sdtdatahash" xmlns:w16sdtfl="http://schemas.microsoft.com/office/word/2024/wordml/sdtformatlock" xmlns:w16se="http://schemas.microsoft.com/office/word/2015/wordml/symex" xmlns:wpg="http://schemas.microsoft.com/office/word/2010/wordprocessingGroup" xmlns:wpi="http://schemas.microsoft.com/office/word/2010/wordprocessingInk" xmlns:wne="http://schemas.microsoft.com/office/word/2006/wordml" xmlns:wps="http://schemas.microsoft.com/office/word/2010/wordprocessingShape" mc:Ignorable="w14 w15 w16se w16cid w16 w16cex w16sdtdh w16sdtfl w16du wp14">
   <w:abstractNum w:abstractNumId="0" w15:restartNumberingAfterBreak="0">
-    <w:nsid w:val="08A2559D"/>
+    <w:nsid w:val="18EE08A1"/>
     <w:multiLevelType w:val="hybridMultilevel"/>
-    <w:tmpl w:val="5850467A"/>
-    <w:lvl w:ilvl="0" w:tplc="4364AC16">
+    <w:tmpl w:val="871E1F18"/>
+    <w:lvl w:ilvl="0" w:tplc="2DD260FC">
       <w:start w:val="1"/>
       <w:numFmt w:val="decimal"/>
       <w:lvlText w:val="%1."/>
@@ -20995,246 +21362,192 @@
         <w:ind w:left="400" w:hanging="300"/>
       </w:pPr>
     </w:lvl>
-    <w:lvl w:ilvl="1" w:tplc="4EE64912">
+    <w:lvl w:ilvl="1" w:tplc="39F0074E">
       <w:numFmt w:val="decimal"/>
       <w:lvlText w:val=""/>
       <w:lvlJc w:val="left"/>
     </w:lvl>
-    <w:lvl w:ilvl="2" w:tplc="AD7277AE">
+    <w:lvl w:ilvl="2" w:tplc="859ADF94">
       <w:numFmt w:val="decimal"/>
       <w:lvlText w:val=""/>
       <w:lvlJc w:val="left"/>
     </w:lvl>
-    <w:lvl w:ilvl="3" w:tplc="D3F4F228">
+    <w:lvl w:ilvl="3" w:tplc="D270966C">
       <w:numFmt w:val="decimal"/>
       <w:lvlText w:val=""/>
       <w:lvlJc w:val="left"/>
     </w:lvl>
-    <w:lvl w:ilvl="4" w:tplc="72162304">
+    <w:lvl w:ilvl="4" w:tplc="5752575C">
       <w:numFmt w:val="decimal"/>
       <w:lvlText w:val=""/>
       <w:lvlJc w:val="left"/>
     </w:lvl>
-    <w:lvl w:ilvl="5" w:tplc="9D3C7E88">
+    <w:lvl w:ilvl="5" w:tplc="D424E160">
       <w:numFmt w:val="decimal"/>
       <w:lvlText w:val=""/>
       <w:lvlJc w:val="left"/>
     </w:lvl>
-    <w:lvl w:ilvl="6" w:tplc="92F8E2E6">
+    <w:lvl w:ilvl="6" w:tplc="B86A66C2">
       <w:numFmt w:val="decimal"/>
       <w:lvlText w:val=""/>
       <w:lvlJc w:val="left"/>
     </w:lvl>
-    <w:lvl w:ilvl="7" w:tplc="50B6D16A">
+    <w:lvl w:ilvl="7" w:tplc="7FF8F2C6">
       <w:numFmt w:val="decimal"/>
       <w:lvlText w:val=""/>
       <w:lvlJc w:val="left"/>
     </w:lvl>
-    <w:lvl w:ilvl="8" w:tplc="7C347110">
+    <w:lvl w:ilvl="8" w:tplc="37CA8B7A">
       <w:numFmt w:val="decimal"/>
       <w:lvlText w:val=""/>
       <w:lvlJc w:val="left"/>
     </w:lvl>
   </w:abstractNum>
   <w:abstractNum w:abstractNumId="1" w15:restartNumberingAfterBreak="0">
-    <w:nsid w:val="1E1C50B0"/>
+    <w:nsid w:val="1EA6701B"/>
     <w:multiLevelType w:val="hybridMultilevel"/>
-    <w:tmpl w:val="6D50F974"/>
-    <w:lvl w:ilvl="0" w:tplc="A23ED0D8">
+    <w:tmpl w:val="A9046FAA"/>
+    <w:lvl w:ilvl="0" w:tplc="4ABA26E6" w:tentative="1">
       <w:start w:val="1"/>
-      <w:numFmt w:val="decimal"/>
-      <w:lvlText w:val="%1."/>
+      <w:numFmt w:val="bullet"/>
+      <w:lvlText w:val="●"/>
       <w:lvlJc w:val="left"/>
       <w:pPr>
-        <w:ind w:left="400" w:hanging="300"/>
+        <w:ind w:left="720" w:hanging="360"/>
       </w:pPr>
     </w:lvl>
-    <w:lvl w:ilvl="1" w:tplc="AC6E9170">
+    <w:lvl w:ilvl="1" w:tplc="8E6AEBEA" w:tentative="1">
+      <w:start w:val="1"/>
+      <w:numFmt w:val="bullet"/>
+      <w:lvlText w:val="○"/>
+      <w:lvlJc w:val="left"/>
+      <w:pPr>
+        <w:ind w:left="1440" w:hanging="360"/>
+      </w:pPr>
+    </w:lvl>
+    <w:lvl w:ilvl="2" w:tplc="F25C372E" w:tentative="1">
+      <w:start w:val="1"/>
+      <w:numFmt w:val="bullet"/>
+      <w:lvlText w:val="■"/>
+      <w:lvlJc w:val="left"/>
+      <w:pPr>
+        <w:ind w:left="2160" w:hanging="360"/>
+      </w:pPr>
+    </w:lvl>
+    <w:lvl w:ilvl="3" w:tplc="517088D0" w:tentative="1">
+      <w:start w:val="1"/>
+      <w:numFmt w:val="bullet"/>
+      <w:lvlText w:val="●"/>
+      <w:lvlJc w:val="left"/>
+      <w:pPr>
+        <w:ind w:left="2880" w:hanging="360"/>
+      </w:pPr>
+    </w:lvl>
+    <w:lvl w:ilvl="4" w:tplc="22F09354" w:tentative="1">
+      <w:start w:val="1"/>
+      <w:numFmt w:val="bullet"/>
+      <w:lvlText w:val="○"/>
+      <w:lvlJc w:val="left"/>
+      <w:pPr>
+        <w:ind w:left="3600" w:hanging="360"/>
+      </w:pPr>
+    </w:lvl>
+    <w:lvl w:ilvl="5" w:tplc="8B56F8AC" w:tentative="1">
+      <w:start w:val="1"/>
+      <w:numFmt w:val="bullet"/>
+      <w:lvlText w:val="■"/>
+      <w:lvlJc w:val="left"/>
+      <w:pPr>
+        <w:ind w:left="4320" w:hanging="360"/>
+      </w:pPr>
+    </w:lvl>
+    <w:lvl w:ilvl="6" w:tplc="8564B770" w:tentative="1">
+      <w:start w:val="1"/>
+      <w:numFmt w:val="bullet"/>
+      <w:lvlText w:val="●"/>
+      <w:lvlJc w:val="left"/>
+      <w:pPr>
+        <w:ind w:left="5040" w:hanging="360"/>
+      </w:pPr>
+    </w:lvl>
+    <w:lvl w:ilvl="7" w:tplc="CA165F46" w:tentative="1">
+      <w:start w:val="1"/>
+      <w:numFmt w:val="bullet"/>
+      <w:lvlText w:val="●"/>
+      <w:lvlJc w:val="left"/>
+      <w:pPr>
+        <w:ind w:left="5760" w:hanging="360"/>
+      </w:pPr>
+    </w:lvl>
+    <w:lvl w:ilvl="8" w:tplc="580E747E" w:tentative="1">
+      <w:start w:val="1"/>
+      <w:numFmt w:val="bullet"/>
+      <w:lvlText w:val="●"/>
+      <w:lvlJc w:val="left"/>
+      <w:pPr>
+        <w:ind w:left="6480" w:hanging="360"/>
+      </w:pPr>
+    </w:lvl>
+  </w:abstractNum>
+  <w:abstractNum w:abstractNumId="2" w15:restartNumberingAfterBreak="0">
+    <w:nsid w:val="3D37387A"/>
+    <w:multiLevelType w:val="hybridMultilevel"/>
+    <w:tmpl w:val="D8F003BC"/>
+    <w:lvl w:ilvl="0" w:tplc="B8ECC244">
+      <w:start w:val="1"/>
+      <w:numFmt w:val="bullet"/>
+      <w:lvlText w:val="•"/>
+      <w:lvlJc w:val="left"/>
+      <w:pPr>
+        <w:ind w:left="400" w:hanging="260"/>
+      </w:pPr>
+    </w:lvl>
+    <w:lvl w:ilvl="1" w:tplc="5B984FC6">
       <w:numFmt w:val="decimal"/>
       <w:lvlText w:val=""/>
       <w:lvlJc w:val="left"/>
     </w:lvl>
-    <w:lvl w:ilvl="2" w:tplc="1A8CD97C">
+    <w:lvl w:ilvl="2" w:tplc="E1E6C21C">
       <w:numFmt w:val="decimal"/>
       <w:lvlText w:val=""/>
       <w:lvlJc w:val="left"/>
     </w:lvl>
-    <w:lvl w:ilvl="3" w:tplc="2C3435D4">
+    <w:lvl w:ilvl="3" w:tplc="64E2BF26">
       <w:numFmt w:val="decimal"/>
       <w:lvlText w:val=""/>
       <w:lvlJc w:val="left"/>
     </w:lvl>
-    <w:lvl w:ilvl="4" w:tplc="8C0AC75A">
+    <w:lvl w:ilvl="4" w:tplc="A8486ADE">
       <w:numFmt w:val="decimal"/>
       <w:lvlText w:val=""/>
       <w:lvlJc w:val="left"/>
     </w:lvl>
-    <w:lvl w:ilvl="5" w:tplc="78827716">
+    <w:lvl w:ilvl="5" w:tplc="3A02D5CC">
       <w:numFmt w:val="decimal"/>
       <w:lvlText w:val=""/>
       <w:lvlJc w:val="left"/>
     </w:lvl>
-    <w:lvl w:ilvl="6" w:tplc="1CFE8976">
+    <w:lvl w:ilvl="6" w:tplc="6C1CD2C0">
       <w:numFmt w:val="decimal"/>
       <w:lvlText w:val=""/>
       <w:lvlJc w:val="left"/>
     </w:lvl>
-    <w:lvl w:ilvl="7" w:tplc="005ABABA">
+    <w:lvl w:ilvl="7" w:tplc="8892B236">
       <w:numFmt w:val="decimal"/>
       <w:lvlText w:val=""/>
       <w:lvlJc w:val="left"/>
     </w:lvl>
-    <w:lvl w:ilvl="8" w:tplc="192630AE">
-      <w:numFmt w:val="decimal"/>
-      <w:lvlText w:val=""/>
-      <w:lvlJc w:val="left"/>
-    </w:lvl>
-  </w:abstractNum>
-  <w:abstractNum w:abstractNumId="2" w15:restartNumberingAfterBreak="0">
-    <w:nsid w:val="378F1933"/>
-    <w:multiLevelType w:val="hybridMultilevel"/>
-    <w:tmpl w:val="D322474E"/>
-    <w:lvl w:ilvl="0" w:tplc="D7B02DA8">
-      <w:start w:val="1"/>
-      <w:numFmt w:val="bullet"/>
-      <w:lvlText w:val="•"/>
-      <w:lvlJc w:val="left"/>
-      <w:pPr>
-        <w:ind w:left="400" w:hanging="260"/>
-      </w:pPr>
-    </w:lvl>
-    <w:lvl w:ilvl="1" w:tplc="E91EB044">
-      <w:numFmt w:val="decimal"/>
-      <w:lvlText w:val=""/>
-      <w:lvlJc w:val="left"/>
-    </w:lvl>
-    <w:lvl w:ilvl="2" w:tplc="C186D2FA">
-      <w:numFmt w:val="decimal"/>
-      <w:lvlText w:val=""/>
-      <w:lvlJc w:val="left"/>
-    </w:lvl>
-    <w:lvl w:ilvl="3" w:tplc="7214CC4A">
-      <w:numFmt w:val="decimal"/>
-      <w:lvlText w:val=""/>
-      <w:lvlJc w:val="left"/>
-    </w:lvl>
-    <w:lvl w:ilvl="4" w:tplc="C9CE5A20">
-      <w:numFmt w:val="decimal"/>
-      <w:lvlText w:val=""/>
-      <w:lvlJc w:val="left"/>
-    </w:lvl>
-    <w:lvl w:ilvl="5" w:tplc="F97251A6">
-      <w:numFmt w:val="decimal"/>
-      <w:lvlText w:val=""/>
-      <w:lvlJc w:val="left"/>
-    </w:lvl>
-    <w:lvl w:ilvl="6" w:tplc="E856F346">
-      <w:numFmt w:val="decimal"/>
-      <w:lvlText w:val=""/>
-      <w:lvlJc w:val="left"/>
-    </w:lvl>
-    <w:lvl w:ilvl="7" w:tplc="7CAE9DBE">
-      <w:numFmt w:val="decimal"/>
-      <w:lvlText w:val=""/>
-      <w:lvlJc w:val="left"/>
-    </w:lvl>
-    <w:lvl w:ilvl="8" w:tplc="E848AE0C">
+    <w:lvl w:ilvl="8" w:tplc="719C06B2">
       <w:numFmt w:val="decimal"/>
       <w:lvlText w:val=""/>
       <w:lvlJc w:val="left"/>
     </w:lvl>
   </w:abstractNum>
   <w:abstractNum w:abstractNumId="3" w15:restartNumberingAfterBreak="0">
-    <w:nsid w:val="50173E7F"/>
+    <w:nsid w:val="4CDC5FB7"/>
     <w:multiLevelType w:val="hybridMultilevel"/>
-    <w:tmpl w:val="6BEC9AA8"/>
-    <w:lvl w:ilvl="0" w:tplc="CAFE0D22" w:tentative="1">
-      <w:start w:val="1"/>
-      <w:numFmt w:val="bullet"/>
-      <w:lvlText w:val="●"/>
-      <w:lvlJc w:val="left"/>
-      <w:pPr>
-        <w:ind w:left="720" w:hanging="360"/>
-      </w:pPr>
-    </w:lvl>
-    <w:lvl w:ilvl="1" w:tplc="22C2BC6E" w:tentative="1">
-      <w:start w:val="1"/>
-      <w:numFmt w:val="bullet"/>
-      <w:lvlText w:val="○"/>
-      <w:lvlJc w:val="left"/>
-      <w:pPr>
-        <w:ind w:left="1440" w:hanging="360"/>
-      </w:pPr>
-    </w:lvl>
-    <w:lvl w:ilvl="2" w:tplc="3BA244E2" w:tentative="1">
-      <w:start w:val="1"/>
-      <w:numFmt w:val="bullet"/>
-      <w:lvlText w:val="■"/>
-      <w:lvlJc w:val="left"/>
-      <w:pPr>
-        <w:ind w:left="2160" w:hanging="360"/>
-      </w:pPr>
-    </w:lvl>
-    <w:lvl w:ilvl="3" w:tplc="0EA42E34" w:tentative="1">
-      <w:start w:val="1"/>
-      <w:numFmt w:val="bullet"/>
-      <w:lvlText w:val="●"/>
-      <w:lvlJc w:val="left"/>
-      <w:pPr>
-        <w:ind w:left="2880" w:hanging="360"/>
-      </w:pPr>
-    </w:lvl>
-    <w:lvl w:ilvl="4" w:tplc="FBD85058" w:tentative="1">
-      <w:start w:val="1"/>
-      <w:numFmt w:val="bullet"/>
-      <w:lvlText w:val="○"/>
-      <w:lvlJc w:val="left"/>
-      <w:pPr>
-        <w:ind w:left="3600" w:hanging="360"/>
-      </w:pPr>
-    </w:lvl>
-    <w:lvl w:ilvl="5" w:tplc="A5F66A34" w:tentative="1">
-      <w:start w:val="1"/>
-      <w:numFmt w:val="bullet"/>
-      <w:lvlText w:val="■"/>
-      <w:lvlJc w:val="left"/>
-      <w:pPr>
-        <w:ind w:left="4320" w:hanging="360"/>
-      </w:pPr>
-    </w:lvl>
-    <w:lvl w:ilvl="6" w:tplc="CDA027A4" w:tentative="1">
-      <w:start w:val="1"/>
-      <w:numFmt w:val="bullet"/>
-      <w:lvlText w:val="●"/>
-      <w:lvlJc w:val="left"/>
-      <w:pPr>
-        <w:ind w:left="5040" w:hanging="360"/>
-      </w:pPr>
-    </w:lvl>
-    <w:lvl w:ilvl="7" w:tplc="47FAB40C" w:tentative="1">
-      <w:start w:val="1"/>
-      <w:numFmt w:val="bullet"/>
-      <w:lvlText w:val="●"/>
-      <w:lvlJc w:val="left"/>
-      <w:pPr>
-        <w:ind w:left="5760" w:hanging="360"/>
-      </w:pPr>
-    </w:lvl>
-    <w:lvl w:ilvl="8" w:tplc="C2607F28" w:tentative="1">
-      <w:start w:val="1"/>
-      <w:numFmt w:val="bullet"/>
-      <w:lvlText w:val="●"/>
-      <w:lvlJc w:val="left"/>
-      <w:pPr>
-        <w:ind w:left="6480" w:hanging="360"/>
-      </w:pPr>
-    </w:lvl>
-  </w:abstractNum>
-  <w:abstractNum w:abstractNumId="4" w15:restartNumberingAfterBreak="0">
-    <w:nsid w:val="50300502"/>
-    <w:multiLevelType w:val="hybridMultilevel"/>
-    <w:tmpl w:val="7ED4EC70"/>
-    <w:lvl w:ilvl="0" w:tplc="44AA9334">
+    <w:tmpl w:val="83A0F98E"/>
+    <w:lvl w:ilvl="0" w:tplc="57F24C7E">
       <w:start w:val="1"/>
       <w:numFmt w:val="decimal"/>
       <w:lvlText w:val="%1."/>
@@ -21243,73 +21556,127 @@
         <w:ind w:left="400" w:hanging="300"/>
       </w:pPr>
     </w:lvl>
-    <w:lvl w:ilvl="1" w:tplc="DF78793E">
+    <w:lvl w:ilvl="1" w:tplc="E304A72E">
       <w:numFmt w:val="decimal"/>
       <w:lvlText w:val=""/>
       <w:lvlJc w:val="left"/>
     </w:lvl>
-    <w:lvl w:ilvl="2" w:tplc="9FC6F432">
+    <w:lvl w:ilvl="2" w:tplc="31DC3A1E">
       <w:numFmt w:val="decimal"/>
       <w:lvlText w:val=""/>
       <w:lvlJc w:val="left"/>
     </w:lvl>
-    <w:lvl w:ilvl="3" w:tplc="E534963E">
+    <w:lvl w:ilvl="3" w:tplc="0E369D14">
       <w:numFmt w:val="decimal"/>
       <w:lvlText w:val=""/>
       <w:lvlJc w:val="left"/>
     </w:lvl>
-    <w:lvl w:ilvl="4" w:tplc="43DA8B72">
+    <w:lvl w:ilvl="4" w:tplc="8180B25E">
       <w:numFmt w:val="decimal"/>
       <w:lvlText w:val=""/>
       <w:lvlJc w:val="left"/>
     </w:lvl>
-    <w:lvl w:ilvl="5" w:tplc="2668DF1E">
+    <w:lvl w:ilvl="5" w:tplc="5DB0907C">
       <w:numFmt w:val="decimal"/>
       <w:lvlText w:val=""/>
       <w:lvlJc w:val="left"/>
     </w:lvl>
-    <w:lvl w:ilvl="6" w:tplc="101A23F8">
+    <w:lvl w:ilvl="6" w:tplc="5A40A53E">
       <w:numFmt w:val="decimal"/>
       <w:lvlText w:val=""/>
       <w:lvlJc w:val="left"/>
     </w:lvl>
-    <w:lvl w:ilvl="7" w:tplc="2DCE91B0">
+    <w:lvl w:ilvl="7" w:tplc="C98EF094">
       <w:numFmt w:val="decimal"/>
       <w:lvlText w:val=""/>
       <w:lvlJc w:val="left"/>
     </w:lvl>
-    <w:lvl w:ilvl="8" w:tplc="88524018">
+    <w:lvl w:ilvl="8" w:tplc="E572F39C">
       <w:numFmt w:val="decimal"/>
       <w:lvlText w:val=""/>
       <w:lvlJc w:val="left"/>
     </w:lvl>
   </w:abstractNum>
-  <w:num w:numId="1" w16cid:durableId="1439136863">
+  <w:abstractNum w:abstractNumId="4" w15:restartNumberingAfterBreak="0">
+    <w:nsid w:val="53B87772"/>
+    <w:multiLevelType w:val="hybridMultilevel"/>
+    <w:tmpl w:val="1FCAE84E"/>
+    <w:lvl w:ilvl="0" w:tplc="AE30E92E">
+      <w:start w:val="1"/>
+      <w:numFmt w:val="decimal"/>
+      <w:lvlText w:val="%1."/>
+      <w:lvlJc w:val="left"/>
+      <w:pPr>
+        <w:ind w:left="400" w:hanging="300"/>
+      </w:pPr>
+    </w:lvl>
+    <w:lvl w:ilvl="1" w:tplc="3798381E">
+      <w:numFmt w:val="decimal"/>
+      <w:lvlText w:val=""/>
+      <w:lvlJc w:val="left"/>
+    </w:lvl>
+    <w:lvl w:ilvl="2" w:tplc="4DAC5020">
+      <w:numFmt w:val="decimal"/>
+      <w:lvlText w:val=""/>
+      <w:lvlJc w:val="left"/>
+    </w:lvl>
+    <w:lvl w:ilvl="3" w:tplc="57AE1C46">
+      <w:numFmt w:val="decimal"/>
+      <w:lvlText w:val=""/>
+      <w:lvlJc w:val="left"/>
+    </w:lvl>
+    <w:lvl w:ilvl="4" w:tplc="12B278D6">
+      <w:numFmt w:val="decimal"/>
+      <w:lvlText w:val=""/>
+      <w:lvlJc w:val="left"/>
+    </w:lvl>
+    <w:lvl w:ilvl="5" w:tplc="4D008E92">
+      <w:numFmt w:val="decimal"/>
+      <w:lvlText w:val=""/>
+      <w:lvlJc w:val="left"/>
+    </w:lvl>
+    <w:lvl w:ilvl="6" w:tplc="0BC84664">
+      <w:numFmt w:val="decimal"/>
+      <w:lvlText w:val=""/>
+      <w:lvlJc w:val="left"/>
+    </w:lvl>
+    <w:lvl w:ilvl="7" w:tplc="C4FA2BE8">
+      <w:numFmt w:val="decimal"/>
+      <w:lvlText w:val=""/>
+      <w:lvlJc w:val="left"/>
+    </w:lvl>
+    <w:lvl w:ilvl="8" w:tplc="C7048C56">
+      <w:numFmt w:val="decimal"/>
+      <w:lvlText w:val=""/>
+      <w:lvlJc w:val="left"/>
+    </w:lvl>
+  </w:abstractNum>
+  <w:num w:numId="1" w16cid:durableId="1852068860">
+    <w:abstractNumId w:val="1"/>
+    <w:lvlOverride w:ilvl="0">
+      <w:startOverride w:val="1"/>
+    </w:lvlOverride>
+  </w:num>
+  <w:num w:numId="2" w16cid:durableId="1045443608">
     <w:abstractNumId w:val="3"/>
     <w:lvlOverride w:ilvl="0">
       <w:startOverride w:val="1"/>
     </w:lvlOverride>
   </w:num>
-  <w:num w:numId="2" w16cid:durableId="1820925962">
-    <w:abstractNumId w:val="1"/>
-    <w:lvlOverride w:ilvl="0">
-      <w:startOverride w:val="1"/>
-    </w:lvlOverride>
-  </w:num>
-  <w:num w:numId="3" w16cid:durableId="597176488">
+  <w:num w:numId="3" w16cid:durableId="1604875717">
     <w:abstractNumId w:val="2"/>
     <w:lvlOverride w:ilvl="0">
       <w:startOverride w:val="1"/>
     </w:lvlOverride>
   </w:num>
-  <w:num w:numId="4" w16cid:durableId="744955621">
-    <w:abstractNumId w:val="0"/>
+  <w:num w:numId="4" w16cid:durableId="1994137476">
+    <w:abstractNumId w:val="4"/>
     <w:lvlOverride w:ilvl="0">
       <w:startOverride w:val="1"/>
     </w:lvlOverride>
   </w:num>
-  <w:num w:numId="5" w16cid:durableId="1715421409">
-    <w:abstractNumId w:val="4"/>
+  <w:num w:numId="5" w16cid:durableId="1662002037">
+    <w:abstractNumId w:val="0"/>
     <w:lvlOverride w:ilvl="0">
       <w:startOverride w:val="1"/>
     </w:lvlOverride>
@@ -21949,7 +22316,7 @@
     <w:autoRedefine/>
     <w:uiPriority w:val="39"/>
     <w:unhideWhenUsed/>
-    <w:rsid w:val="00137B00"/>
+    <w:rsid w:val="00F06F1D"/>
     <w:pPr>
       <w:spacing w:after="100"/>
     </w:pPr>
@@ -21961,7 +22328,7 @@
     <w:autoRedefine/>
     <w:uiPriority w:val="39"/>
     <w:unhideWhenUsed/>
-    <w:rsid w:val="00137B00"/>
+    <w:rsid w:val="00F06F1D"/>
     <w:pPr>
       <w:spacing w:after="100"/>
       <w:ind w:left="210"/>

</xml_diff>

<commit_message>
Add the frozen versus fine-tuning question to the study guide
</commit_message>
<xml_diff>
--- a/docs/oral_study_guide.docx
+++ b/docs/oral_study_guide.docx
@@ -93,7 +93,7 @@
     <w:sdt>
       <w:sdtPr>
         <w:alias w:val="Contents"/>
-        <w:id w:val="1014962769"/>
+        <w:id w:val="686094849"/>
       </w:sdtPr>
       <w:sdtEndPr/>
       <w:sdtContent>
@@ -116,7 +116,7 @@
           <w:r>
             <w:fldChar w:fldCharType="separate"/>
           </w:r>
-          <w:hyperlink w:anchor="_Toc243484915" w:history="1">
+          <w:hyperlink w:anchor="_Toc243485455" w:history="1">
             <w:r>
               <w:rPr>
                 <w:rStyle w:val="Lienhypertexte"/>
@@ -140,7 +140,7 @@
               <w:rPr>
                 <w:noProof/>
               </w:rPr>
-              <w:instrText xml:space="preserve"> PAGEREF _Toc243484915 \h </w:instrText>
+              <w:instrText xml:space="preserve"> PAGEREF _Toc243485455 \h </w:instrText>
             </w:r>
             <w:r>
               <w:rPr>
@@ -177,7 +177,7 @@
               <w:noProof/>
             </w:rPr>
           </w:pPr>
-          <w:hyperlink w:anchor="_Toc243484916" w:history="1">
+          <w:hyperlink w:anchor="_Toc243485456" w:history="1">
             <w:r>
               <w:rPr>
                 <w:rStyle w:val="Lienhypertexte"/>
@@ -201,7 +201,7 @@
               <w:rPr>
                 <w:noProof/>
               </w:rPr>
-              <w:instrText xml:space="preserve"> PAGEREF _Toc243484916 \h </w:instrText>
+              <w:instrText xml:space="preserve"> PAGEREF _Toc243485456 \h </w:instrText>
             </w:r>
             <w:r>
               <w:rPr>
@@ -238,7 +238,7 @@
               <w:noProof/>
             </w:rPr>
           </w:pPr>
-          <w:hyperlink w:anchor="_Toc243484917" w:history="1">
+          <w:hyperlink w:anchor="_Toc243485457" w:history="1">
             <w:r>
               <w:rPr>
                 <w:rStyle w:val="Lienhypertexte"/>
@@ -262,7 +262,7 @@
               <w:rPr>
                 <w:noProof/>
               </w:rPr>
-              <w:instrText xml:space="preserve"> PAGEREF _Toc243484917 \h </w:instrText>
+              <w:instrText xml:space="preserve"> PAGEREF _Toc243485457 \h </w:instrText>
             </w:r>
             <w:r>
               <w:rPr>
@@ -299,7 +299,7 @@
               <w:noProof/>
             </w:rPr>
           </w:pPr>
-          <w:hyperlink w:anchor="_Toc243484918" w:history="1">
+          <w:hyperlink w:anchor="_Toc243485458" w:history="1">
             <w:r>
               <w:rPr>
                 <w:rStyle w:val="Lienhypertexte"/>
@@ -323,7 +323,7 @@
               <w:rPr>
                 <w:noProof/>
               </w:rPr>
-              <w:instrText xml:space="preserve"> PAGEREF _Toc243484918 \h </w:instrText>
+              <w:instrText xml:space="preserve"> PAGEREF _Toc243485458 \h </w:instrText>
             </w:r>
             <w:r>
               <w:rPr>
@@ -360,7 +360,7 @@
               <w:noProof/>
             </w:rPr>
           </w:pPr>
-          <w:hyperlink w:anchor="_Toc243484919" w:history="1">
+          <w:hyperlink w:anchor="_Toc243485459" w:history="1">
             <w:r>
               <w:rPr>
                 <w:rStyle w:val="Lienhypertexte"/>
@@ -384,7 +384,7 @@
               <w:rPr>
                 <w:noProof/>
               </w:rPr>
-              <w:instrText xml:space="preserve"> PAGEREF _Toc243484919 \h </w:instrText>
+              <w:instrText xml:space="preserve"> PAGEREF _Toc243485459 \h </w:instrText>
             </w:r>
             <w:r>
               <w:rPr>
@@ -421,7 +421,7 @@
               <w:noProof/>
             </w:rPr>
           </w:pPr>
-          <w:hyperlink w:anchor="_Toc243484920" w:history="1">
+          <w:hyperlink w:anchor="_Toc243485460" w:history="1">
             <w:r>
               <w:rPr>
                 <w:rStyle w:val="Lienhypertexte"/>
@@ -445,7 +445,7 @@
               <w:rPr>
                 <w:noProof/>
               </w:rPr>
-              <w:instrText xml:space="preserve"> PAGEREF _Toc243484920 \h </w:instrText>
+              <w:instrText xml:space="preserve"> PAGEREF _Toc243485460 \h </w:instrText>
             </w:r>
             <w:r>
               <w:rPr>
@@ -482,7 +482,7 @@
               <w:noProof/>
             </w:rPr>
           </w:pPr>
-          <w:hyperlink w:anchor="_Toc243484921" w:history="1">
+          <w:hyperlink w:anchor="_Toc243485461" w:history="1">
             <w:r>
               <w:rPr>
                 <w:rStyle w:val="Lienhypertexte"/>
@@ -506,7 +506,7 @@
               <w:rPr>
                 <w:noProof/>
               </w:rPr>
-              <w:instrText xml:space="preserve"> PAGEREF _Toc243484921 \h </w:instrText>
+              <w:instrText xml:space="preserve"> PAGEREF _Toc243485461 \h </w:instrText>
             </w:r>
             <w:r>
               <w:rPr>
@@ -543,7 +543,7 @@
               <w:noProof/>
             </w:rPr>
           </w:pPr>
-          <w:hyperlink w:anchor="_Toc243484922" w:history="1">
+          <w:hyperlink w:anchor="_Toc243485462" w:history="1">
             <w:r>
               <w:rPr>
                 <w:rStyle w:val="Lienhypertexte"/>
@@ -567,7 +567,7 @@
               <w:rPr>
                 <w:noProof/>
               </w:rPr>
-              <w:instrText xml:space="preserve"> PAGEREF _Toc243484922 \h </w:instrText>
+              <w:instrText xml:space="preserve"> PAGEREF _Toc243485462 \h </w:instrText>
             </w:r>
             <w:r>
               <w:rPr>
@@ -604,7 +604,7 @@
               <w:noProof/>
             </w:rPr>
           </w:pPr>
-          <w:hyperlink w:anchor="_Toc243484923" w:history="1">
+          <w:hyperlink w:anchor="_Toc243485463" w:history="1">
             <w:r>
               <w:rPr>
                 <w:rStyle w:val="Lienhypertexte"/>
@@ -628,7 +628,7 @@
               <w:rPr>
                 <w:noProof/>
               </w:rPr>
-              <w:instrText xml:space="preserve"> PAGEREF _Toc243484923 \h </w:instrText>
+              <w:instrText xml:space="preserve"> PAGEREF _Toc243485463 \h </w:instrText>
             </w:r>
             <w:r>
               <w:rPr>
@@ -665,7 +665,7 @@
               <w:noProof/>
             </w:rPr>
           </w:pPr>
-          <w:hyperlink w:anchor="_Toc243484924" w:history="1">
+          <w:hyperlink w:anchor="_Toc243485464" w:history="1">
             <w:r>
               <w:rPr>
                 <w:rStyle w:val="Lienhypertexte"/>
@@ -689,7 +689,7 @@
               <w:rPr>
                 <w:noProof/>
               </w:rPr>
-              <w:instrText xml:space="preserve"> PAGEREF _Toc243484924 \h </w:instrText>
+              <w:instrText xml:space="preserve"> PAGEREF _Toc243485464 \h </w:instrText>
             </w:r>
             <w:r>
               <w:rPr>
@@ -726,7 +726,7 @@
               <w:noProof/>
             </w:rPr>
           </w:pPr>
-          <w:hyperlink w:anchor="_Toc243484925" w:history="1">
+          <w:hyperlink w:anchor="_Toc243485465" w:history="1">
             <w:r>
               <w:rPr>
                 <w:rStyle w:val="Lienhypertexte"/>
@@ -750,7 +750,7 @@
               <w:rPr>
                 <w:noProof/>
               </w:rPr>
-              <w:instrText xml:space="preserve"> PAGEREF _Toc243484925 \h </w:instrText>
+              <w:instrText xml:space="preserve"> PAGEREF _Toc243485465 \h </w:instrText>
             </w:r>
             <w:r>
               <w:rPr>
@@ -787,7 +787,7 @@
               <w:noProof/>
             </w:rPr>
           </w:pPr>
-          <w:hyperlink w:anchor="_Toc243484926" w:history="1">
+          <w:hyperlink w:anchor="_Toc243485466" w:history="1">
             <w:r>
               <w:rPr>
                 <w:rStyle w:val="Lienhypertexte"/>
@@ -811,7 +811,7 @@
               <w:rPr>
                 <w:noProof/>
               </w:rPr>
-              <w:instrText xml:space="preserve"> PAGEREF _Toc243484926 \h </w:instrText>
+              <w:instrText xml:space="preserve"> PAGEREF _Toc243485466 \h </w:instrText>
             </w:r>
             <w:r>
               <w:rPr>
@@ -848,7 +848,7 @@
               <w:noProof/>
             </w:rPr>
           </w:pPr>
-          <w:hyperlink w:anchor="_Toc243484927" w:history="1">
+          <w:hyperlink w:anchor="_Toc243485467" w:history="1">
             <w:r>
               <w:rPr>
                 <w:rStyle w:val="Lienhypertexte"/>
@@ -872,7 +872,7 @@
               <w:rPr>
                 <w:noProof/>
               </w:rPr>
-              <w:instrText xml:space="preserve"> PAGEREF _Toc243484927 \h </w:instrText>
+              <w:instrText xml:space="preserve"> PAGEREF _Toc243485467 \h </w:instrText>
             </w:r>
             <w:r>
               <w:rPr>
@@ -909,7 +909,7 @@
               <w:noProof/>
             </w:rPr>
           </w:pPr>
-          <w:hyperlink w:anchor="_Toc243484928" w:history="1">
+          <w:hyperlink w:anchor="_Toc243485468" w:history="1">
             <w:r>
               <w:rPr>
                 <w:rStyle w:val="Lienhypertexte"/>
@@ -933,7 +933,7 @@
               <w:rPr>
                 <w:noProof/>
               </w:rPr>
-              <w:instrText xml:space="preserve"> PAGEREF _Toc243484928 \h </w:instrText>
+              <w:instrText xml:space="preserve"> PAGEREF _Toc243485468 \h </w:instrText>
             </w:r>
             <w:r>
               <w:rPr>
@@ -970,7 +970,7 @@
               <w:noProof/>
             </w:rPr>
           </w:pPr>
-          <w:hyperlink w:anchor="_Toc243484929" w:history="1">
+          <w:hyperlink w:anchor="_Toc243485469" w:history="1">
             <w:r>
               <w:rPr>
                 <w:rStyle w:val="Lienhypertexte"/>
@@ -994,7 +994,7 @@
               <w:rPr>
                 <w:noProof/>
               </w:rPr>
-              <w:instrText xml:space="preserve"> PAGEREF _Toc243484929 \h </w:instrText>
+              <w:instrText xml:space="preserve"> PAGEREF _Toc243485469 \h </w:instrText>
             </w:r>
             <w:r>
               <w:rPr>
@@ -1031,7 +1031,7 @@
               <w:noProof/>
             </w:rPr>
           </w:pPr>
-          <w:hyperlink w:anchor="_Toc243484930" w:history="1">
+          <w:hyperlink w:anchor="_Toc243485470" w:history="1">
             <w:r>
               <w:rPr>
                 <w:rStyle w:val="Lienhypertexte"/>
@@ -1055,7 +1055,7 @@
               <w:rPr>
                 <w:noProof/>
               </w:rPr>
-              <w:instrText xml:space="preserve"> PAGEREF _Toc243484930 \h </w:instrText>
+              <w:instrText xml:space="preserve"> PAGEREF _Toc243485470 \h </w:instrText>
             </w:r>
             <w:r>
               <w:rPr>
@@ -1092,7 +1092,7 @@
               <w:noProof/>
             </w:rPr>
           </w:pPr>
-          <w:hyperlink w:anchor="_Toc243484931" w:history="1">
+          <w:hyperlink w:anchor="_Toc243485471" w:history="1">
             <w:r>
               <w:rPr>
                 <w:rStyle w:val="Lienhypertexte"/>
@@ -1116,7 +1116,7 @@
               <w:rPr>
                 <w:noProof/>
               </w:rPr>
-              <w:instrText xml:space="preserve"> PAGEREF _Toc243484931 \h </w:instrText>
+              <w:instrText xml:space="preserve"> PAGEREF _Toc243485471 \h </w:instrText>
             </w:r>
             <w:r>
               <w:rPr>
@@ -1153,7 +1153,7 @@
               <w:noProof/>
             </w:rPr>
           </w:pPr>
-          <w:hyperlink w:anchor="_Toc243484932" w:history="1">
+          <w:hyperlink w:anchor="_Toc243485472" w:history="1">
             <w:r>
               <w:rPr>
                 <w:rStyle w:val="Lienhypertexte"/>
@@ -1177,7 +1177,7 @@
               <w:rPr>
                 <w:noProof/>
               </w:rPr>
-              <w:instrText xml:space="preserve"> PAGEREF _Toc243484932 \h </w:instrText>
+              <w:instrText xml:space="preserve"> PAGEREF _Toc243485472 \h </w:instrText>
             </w:r>
             <w:r>
               <w:rPr>
@@ -1214,7 +1214,7 @@
               <w:noProof/>
             </w:rPr>
           </w:pPr>
-          <w:hyperlink w:anchor="_Toc243484933" w:history="1">
+          <w:hyperlink w:anchor="_Toc243485473" w:history="1">
             <w:r>
               <w:rPr>
                 <w:rStyle w:val="Lienhypertexte"/>
@@ -1238,7 +1238,7 @@
               <w:rPr>
                 <w:noProof/>
               </w:rPr>
-              <w:instrText xml:space="preserve"> PAGEREF _Toc243484933 \h </w:instrText>
+              <w:instrText xml:space="preserve"> PAGEREF _Toc243485473 \h </w:instrText>
             </w:r>
             <w:r>
               <w:rPr>
@@ -1275,7 +1275,7 @@
               <w:noProof/>
             </w:rPr>
           </w:pPr>
-          <w:hyperlink w:anchor="_Toc243484934" w:history="1">
+          <w:hyperlink w:anchor="_Toc243485474" w:history="1">
             <w:r>
               <w:rPr>
                 <w:rStyle w:val="Lienhypertexte"/>
@@ -1299,7 +1299,7 @@
               <w:rPr>
                 <w:noProof/>
               </w:rPr>
-              <w:instrText xml:space="preserve"> PAGEREF _Toc243484934 \h </w:instrText>
+              <w:instrText xml:space="preserve"> PAGEREF _Toc243485474 \h </w:instrText>
             </w:r>
             <w:r>
               <w:rPr>
@@ -1336,7 +1336,7 @@
               <w:noProof/>
             </w:rPr>
           </w:pPr>
-          <w:hyperlink w:anchor="_Toc243484935" w:history="1">
+          <w:hyperlink w:anchor="_Toc243485475" w:history="1">
             <w:r>
               <w:rPr>
                 <w:rStyle w:val="Lienhypertexte"/>
@@ -1360,7 +1360,7 @@
               <w:rPr>
                 <w:noProof/>
               </w:rPr>
-              <w:instrText xml:space="preserve"> PAGEREF _Toc243484935 \h </w:instrText>
+              <w:instrText xml:space="preserve"> PAGEREF _Toc243485475 \h </w:instrText>
             </w:r>
             <w:r>
               <w:rPr>
@@ -1397,7 +1397,7 @@
               <w:noProof/>
             </w:rPr>
           </w:pPr>
-          <w:hyperlink w:anchor="_Toc243484936" w:history="1">
+          <w:hyperlink w:anchor="_Toc243485476" w:history="1">
             <w:r>
               <w:rPr>
                 <w:rStyle w:val="Lienhypertexte"/>
@@ -1421,7 +1421,7 @@
               <w:rPr>
                 <w:noProof/>
               </w:rPr>
-              <w:instrText xml:space="preserve"> PAGEREF _Toc243484936 \h </w:instrText>
+              <w:instrText xml:space="preserve"> PAGEREF _Toc243485476 \h </w:instrText>
             </w:r>
             <w:r>
               <w:rPr>
@@ -1458,7 +1458,7 @@
               <w:noProof/>
             </w:rPr>
           </w:pPr>
-          <w:hyperlink w:anchor="_Toc243484937" w:history="1">
+          <w:hyperlink w:anchor="_Toc243485477" w:history="1">
             <w:r>
               <w:rPr>
                 <w:rStyle w:val="Lienhypertexte"/>
@@ -1482,7 +1482,7 @@
               <w:rPr>
                 <w:noProof/>
               </w:rPr>
-              <w:instrText xml:space="preserve"> PAGEREF _Toc243484937 \h </w:instrText>
+              <w:instrText xml:space="preserve"> PAGEREF _Toc243485477 \h </w:instrText>
             </w:r>
             <w:r>
               <w:rPr>
@@ -1519,7 +1519,7 @@
               <w:noProof/>
             </w:rPr>
           </w:pPr>
-          <w:hyperlink w:anchor="_Toc243484938" w:history="1">
+          <w:hyperlink w:anchor="_Toc243485478" w:history="1">
             <w:r>
               <w:rPr>
                 <w:rStyle w:val="Lienhypertexte"/>
@@ -1543,7 +1543,7 @@
               <w:rPr>
                 <w:noProof/>
               </w:rPr>
-              <w:instrText xml:space="preserve"> PAGEREF _Toc243484938 \h </w:instrText>
+              <w:instrText xml:space="preserve"> PAGEREF _Toc243485478 \h </w:instrText>
             </w:r>
             <w:r>
               <w:rPr>
@@ -1580,7 +1580,7 @@
               <w:noProof/>
             </w:rPr>
           </w:pPr>
-          <w:hyperlink w:anchor="_Toc243484939" w:history="1">
+          <w:hyperlink w:anchor="_Toc243485479" w:history="1">
             <w:r>
               <w:rPr>
                 <w:rStyle w:val="Lienhypertexte"/>
@@ -1604,7 +1604,7 @@
               <w:rPr>
                 <w:noProof/>
               </w:rPr>
-              <w:instrText xml:space="preserve"> PAGEREF _Toc243484939 \h </w:instrText>
+              <w:instrText xml:space="preserve"> PAGEREF _Toc243485479 \h </w:instrText>
             </w:r>
             <w:r>
               <w:rPr>
@@ -1641,7 +1641,7 @@
               <w:noProof/>
             </w:rPr>
           </w:pPr>
-          <w:hyperlink w:anchor="_Toc243484940" w:history="1">
+          <w:hyperlink w:anchor="_Toc243485480" w:history="1">
             <w:r>
               <w:rPr>
                 <w:rStyle w:val="Lienhypertexte"/>
@@ -1665,7 +1665,7 @@
               <w:rPr>
                 <w:noProof/>
               </w:rPr>
-              <w:instrText xml:space="preserve"> PAGEREF _Toc243484940 \h </w:instrText>
+              <w:instrText xml:space="preserve"> PAGEREF _Toc243485480 \h </w:instrText>
             </w:r>
             <w:r>
               <w:rPr>
@@ -1702,7 +1702,7 @@
               <w:noProof/>
             </w:rPr>
           </w:pPr>
-          <w:hyperlink w:anchor="_Toc243484941" w:history="1">
+          <w:hyperlink w:anchor="_Toc243485481" w:history="1">
             <w:r>
               <w:rPr>
                 <w:rStyle w:val="Lienhypertexte"/>
@@ -1726,7 +1726,7 @@
               <w:rPr>
                 <w:noProof/>
               </w:rPr>
-              <w:instrText xml:space="preserve"> PAGEREF _Toc243484941 \h </w:instrText>
+              <w:instrText xml:space="preserve"> PAGEREF _Toc243485481 \h </w:instrText>
             </w:r>
             <w:r>
               <w:rPr>
@@ -1763,7 +1763,7 @@
               <w:noProof/>
             </w:rPr>
           </w:pPr>
-          <w:hyperlink w:anchor="_Toc243484942" w:history="1">
+          <w:hyperlink w:anchor="_Toc243485482" w:history="1">
             <w:r>
               <w:rPr>
                 <w:rStyle w:val="Lienhypertexte"/>
@@ -1787,7 +1787,7 @@
               <w:rPr>
                 <w:noProof/>
               </w:rPr>
-              <w:instrText xml:space="preserve"> PAGEREF _Toc243484942 \h </w:instrText>
+              <w:instrText xml:space="preserve"> PAGEREF _Toc243485482 \h </w:instrText>
             </w:r>
             <w:r>
               <w:rPr>
@@ -1824,7 +1824,7 @@
               <w:noProof/>
             </w:rPr>
           </w:pPr>
-          <w:hyperlink w:anchor="_Toc243484943" w:history="1">
+          <w:hyperlink w:anchor="_Toc243485483" w:history="1">
             <w:r>
               <w:rPr>
                 <w:rStyle w:val="Lienhypertexte"/>
@@ -1848,7 +1848,7 @@
               <w:rPr>
                 <w:noProof/>
               </w:rPr>
-              <w:instrText xml:space="preserve"> PAGEREF _Toc243484943 \h </w:instrText>
+              <w:instrText xml:space="preserve"> PAGEREF _Toc243485483 \h </w:instrText>
             </w:r>
             <w:r>
               <w:rPr>
@@ -1885,7 +1885,7 @@
               <w:noProof/>
             </w:rPr>
           </w:pPr>
-          <w:hyperlink w:anchor="_Toc243484944" w:history="1">
+          <w:hyperlink w:anchor="_Toc243485484" w:history="1">
             <w:r>
               <w:rPr>
                 <w:rStyle w:val="Lienhypertexte"/>
@@ -1909,7 +1909,7 @@
               <w:rPr>
                 <w:noProof/>
               </w:rPr>
-              <w:instrText xml:space="preserve"> PAGEREF _Toc243484944 \h </w:instrText>
+              <w:instrText xml:space="preserve"> PAGEREF _Toc243485484 \h </w:instrText>
             </w:r>
             <w:r>
               <w:rPr>
@@ -1946,7 +1946,7 @@
               <w:noProof/>
             </w:rPr>
           </w:pPr>
-          <w:hyperlink w:anchor="_Toc243484945" w:history="1">
+          <w:hyperlink w:anchor="_Toc243485485" w:history="1">
             <w:r>
               <w:rPr>
                 <w:rStyle w:val="Lienhypertexte"/>
@@ -1970,7 +1970,7 @@
               <w:rPr>
                 <w:noProof/>
               </w:rPr>
-              <w:instrText xml:space="preserve"> PAGEREF _Toc243484945 \h </w:instrText>
+              <w:instrText xml:space="preserve"> PAGEREF _Toc243485485 \h </w:instrText>
             </w:r>
             <w:r>
               <w:rPr>
@@ -2007,7 +2007,7 @@
               <w:noProof/>
             </w:rPr>
           </w:pPr>
-          <w:hyperlink w:anchor="_Toc243484946" w:history="1">
+          <w:hyperlink w:anchor="_Toc243485486" w:history="1">
             <w:r>
               <w:rPr>
                 <w:rStyle w:val="Lienhypertexte"/>
@@ -2031,7 +2031,7 @@
               <w:rPr>
                 <w:noProof/>
               </w:rPr>
-              <w:instrText xml:space="preserve"> PAGEREF _Toc243484946 \h </w:instrText>
+              <w:instrText xml:space="preserve"> PAGEREF _Toc243485486 \h </w:instrText>
             </w:r>
             <w:r>
               <w:rPr>
@@ -2068,7 +2068,7 @@
               <w:noProof/>
             </w:rPr>
           </w:pPr>
-          <w:hyperlink w:anchor="_Toc243484947" w:history="1">
+          <w:hyperlink w:anchor="_Toc243485487" w:history="1">
             <w:r>
               <w:rPr>
                 <w:rStyle w:val="Lienhypertexte"/>
@@ -2092,7 +2092,7 @@
               <w:rPr>
                 <w:noProof/>
               </w:rPr>
-              <w:instrText xml:space="preserve"> PAGEREF _Toc243484947 \h </w:instrText>
+              <w:instrText xml:space="preserve"> PAGEREF _Toc243485487 \h </w:instrText>
             </w:r>
             <w:r>
               <w:rPr>
@@ -2129,7 +2129,7 @@
               <w:noProof/>
             </w:rPr>
           </w:pPr>
-          <w:hyperlink w:anchor="_Toc243484948" w:history="1">
+          <w:hyperlink w:anchor="_Toc243485488" w:history="1">
             <w:r>
               <w:rPr>
                 <w:rStyle w:val="Lienhypertexte"/>
@@ -2153,7 +2153,7 @@
               <w:rPr>
                 <w:noProof/>
               </w:rPr>
-              <w:instrText xml:space="preserve"> PAGEREF _Toc243484948 \h </w:instrText>
+              <w:instrText xml:space="preserve"> PAGEREF _Toc243485488 \h </w:instrText>
             </w:r>
             <w:r>
               <w:rPr>
@@ -2190,7 +2190,7 @@
               <w:noProof/>
             </w:rPr>
           </w:pPr>
-          <w:hyperlink w:anchor="_Toc243484949" w:history="1">
+          <w:hyperlink w:anchor="_Toc243485489" w:history="1">
             <w:r>
               <w:rPr>
                 <w:rStyle w:val="Lienhypertexte"/>
@@ -2214,7 +2214,7 @@
               <w:rPr>
                 <w:noProof/>
               </w:rPr>
-              <w:instrText xml:space="preserve"> PAGEREF _Toc243484949 \h </w:instrText>
+              <w:instrText xml:space="preserve"> PAGEREF _Toc243485489 \h </w:instrText>
             </w:r>
             <w:r>
               <w:rPr>
@@ -2251,7 +2251,7 @@
               <w:noProof/>
             </w:rPr>
           </w:pPr>
-          <w:hyperlink w:anchor="_Toc243484950" w:history="1">
+          <w:hyperlink w:anchor="_Toc243485490" w:history="1">
             <w:r>
               <w:rPr>
                 <w:rStyle w:val="Lienhypertexte"/>
@@ -2275,7 +2275,7 @@
               <w:rPr>
                 <w:noProof/>
               </w:rPr>
-              <w:instrText xml:space="preserve"> PAGEREF _Toc243484950 \h </w:instrText>
+              <w:instrText xml:space="preserve"> PAGEREF _Toc243485490 \h </w:instrText>
             </w:r>
             <w:r>
               <w:rPr>
@@ -2312,7 +2312,7 @@
               <w:noProof/>
             </w:rPr>
           </w:pPr>
-          <w:hyperlink w:anchor="_Toc243484951" w:history="1">
+          <w:hyperlink w:anchor="_Toc243485491" w:history="1">
             <w:r>
               <w:rPr>
                 <w:rStyle w:val="Lienhypertexte"/>
@@ -2336,7 +2336,7 @@
               <w:rPr>
                 <w:noProof/>
               </w:rPr>
-              <w:instrText xml:space="preserve"> PAGEREF _Toc243484951 \h </w:instrText>
+              <w:instrText xml:space="preserve"> PAGEREF _Toc243485491 \h </w:instrText>
             </w:r>
             <w:r>
               <w:rPr>
@@ -2373,7 +2373,7 @@
               <w:noProof/>
             </w:rPr>
           </w:pPr>
-          <w:hyperlink w:anchor="_Toc243484952" w:history="1">
+          <w:hyperlink w:anchor="_Toc243485492" w:history="1">
             <w:r>
               <w:rPr>
                 <w:rStyle w:val="Lienhypertexte"/>
@@ -2397,7 +2397,7 @@
               <w:rPr>
                 <w:noProof/>
               </w:rPr>
-              <w:instrText xml:space="preserve"> PAGEREF _Toc243484952 \h </w:instrText>
+              <w:instrText xml:space="preserve"> PAGEREF _Toc243485492 \h </w:instrText>
             </w:r>
             <w:r>
               <w:rPr>
@@ -2434,7 +2434,7 @@
               <w:noProof/>
             </w:rPr>
           </w:pPr>
-          <w:hyperlink w:anchor="_Toc243484953" w:history="1">
+          <w:hyperlink w:anchor="_Toc243485493" w:history="1">
             <w:r>
               <w:rPr>
                 <w:rStyle w:val="Lienhypertexte"/>
@@ -2458,7 +2458,7 @@
               <w:rPr>
                 <w:noProof/>
               </w:rPr>
-              <w:instrText xml:space="preserve"> PAGEREF _Toc243484953 \h </w:instrText>
+              <w:instrText xml:space="preserve"> PAGEREF _Toc243485493 \h </w:instrText>
             </w:r>
             <w:r>
               <w:rPr>
@@ -2495,7 +2495,7 @@
               <w:noProof/>
             </w:rPr>
           </w:pPr>
-          <w:hyperlink w:anchor="_Toc243484954" w:history="1">
+          <w:hyperlink w:anchor="_Toc243485494" w:history="1">
             <w:r>
               <w:rPr>
                 <w:rStyle w:val="Lienhypertexte"/>
@@ -2519,7 +2519,7 @@
               <w:rPr>
                 <w:noProof/>
               </w:rPr>
-              <w:instrText xml:space="preserve"> PAGEREF _Toc243484954 \h </w:instrText>
+              <w:instrText xml:space="preserve"> PAGEREF _Toc243485494 \h </w:instrText>
             </w:r>
             <w:r>
               <w:rPr>
@@ -2556,7 +2556,7 @@
               <w:noProof/>
             </w:rPr>
           </w:pPr>
-          <w:hyperlink w:anchor="_Toc243484955" w:history="1">
+          <w:hyperlink w:anchor="_Toc243485495" w:history="1">
             <w:r>
               <w:rPr>
                 <w:rStyle w:val="Lienhypertexte"/>
@@ -2580,7 +2580,7 @@
               <w:rPr>
                 <w:noProof/>
               </w:rPr>
-              <w:instrText xml:space="preserve"> PAGEREF _Toc243484955 \h </w:instrText>
+              <w:instrText xml:space="preserve"> PAGEREF _Toc243485495 \h </w:instrText>
             </w:r>
             <w:r>
               <w:rPr>
@@ -2617,7 +2617,7 @@
               <w:noProof/>
             </w:rPr>
           </w:pPr>
-          <w:hyperlink w:anchor="_Toc243484956" w:history="1">
+          <w:hyperlink w:anchor="_Toc243485496" w:history="1">
             <w:r>
               <w:rPr>
                 <w:rStyle w:val="Lienhypertexte"/>
@@ -2641,7 +2641,7 @@
               <w:rPr>
                 <w:noProof/>
               </w:rPr>
-              <w:instrText xml:space="preserve"> PAGEREF _Toc243484956 \h </w:instrText>
+              <w:instrText xml:space="preserve"> PAGEREF _Toc243485496 \h </w:instrText>
             </w:r>
             <w:r>
               <w:rPr>
@@ -2678,7 +2678,7 @@
               <w:noProof/>
             </w:rPr>
           </w:pPr>
-          <w:hyperlink w:anchor="_Toc243484957" w:history="1">
+          <w:hyperlink w:anchor="_Toc243485497" w:history="1">
             <w:r>
               <w:rPr>
                 <w:rStyle w:val="Lienhypertexte"/>
@@ -2702,7 +2702,7 @@
               <w:rPr>
                 <w:noProof/>
               </w:rPr>
-              <w:instrText xml:space="preserve"> PAGEREF _Toc243484957 \h </w:instrText>
+              <w:instrText xml:space="preserve"> PAGEREF _Toc243485497 \h </w:instrText>
             </w:r>
             <w:r>
               <w:rPr>
@@ -2739,7 +2739,7 @@
               <w:noProof/>
             </w:rPr>
           </w:pPr>
-          <w:hyperlink w:anchor="_Toc243484958" w:history="1">
+          <w:hyperlink w:anchor="_Toc243485498" w:history="1">
             <w:r>
               <w:rPr>
                 <w:rStyle w:val="Lienhypertexte"/>
@@ -2763,7 +2763,7 @@
               <w:rPr>
                 <w:noProof/>
               </w:rPr>
-              <w:instrText xml:space="preserve"> PAGEREF _Toc243484958 \h </w:instrText>
+              <w:instrText xml:space="preserve"> PAGEREF _Toc243485498 \h </w:instrText>
             </w:r>
             <w:r>
               <w:rPr>
@@ -2800,7 +2800,7 @@
               <w:noProof/>
             </w:rPr>
           </w:pPr>
-          <w:hyperlink w:anchor="_Toc243484959" w:history="1">
+          <w:hyperlink w:anchor="_Toc243485499" w:history="1">
             <w:r>
               <w:rPr>
                 <w:rStyle w:val="Lienhypertexte"/>
@@ -2824,7 +2824,7 @@
               <w:rPr>
                 <w:noProof/>
               </w:rPr>
-              <w:instrText xml:space="preserve"> PAGEREF _Toc243484959 \h </w:instrText>
+              <w:instrText xml:space="preserve"> PAGEREF _Toc243485499 \h </w:instrText>
             </w:r>
             <w:r>
               <w:rPr>
@@ -2861,7 +2861,7 @@
               <w:noProof/>
             </w:rPr>
           </w:pPr>
-          <w:hyperlink w:anchor="_Toc243484960" w:history="1">
+          <w:hyperlink w:anchor="_Toc243485500" w:history="1">
             <w:r>
               <w:rPr>
                 <w:rStyle w:val="Lienhypertexte"/>
@@ -2885,7 +2885,7 @@
               <w:rPr>
                 <w:noProof/>
               </w:rPr>
-              <w:instrText xml:space="preserve"> PAGEREF _Toc243484960 \h </w:instrText>
+              <w:instrText xml:space="preserve"> PAGEREF _Toc243485500 \h </w:instrText>
             </w:r>
             <w:r>
               <w:rPr>
@@ -2922,7 +2922,7 @@
               <w:noProof/>
             </w:rPr>
           </w:pPr>
-          <w:hyperlink w:anchor="_Toc243484961" w:history="1">
+          <w:hyperlink w:anchor="_Toc243485501" w:history="1">
             <w:r>
               <w:rPr>
                 <w:rStyle w:val="Lienhypertexte"/>
@@ -2946,7 +2946,7 @@
               <w:rPr>
                 <w:noProof/>
               </w:rPr>
-              <w:instrText xml:space="preserve"> PAGEREF _Toc243484961 \h </w:instrText>
+              <w:instrText xml:space="preserve"> PAGEREF _Toc243485501 \h </w:instrText>
             </w:r>
             <w:r>
               <w:rPr>
@@ -2983,7 +2983,7 @@
               <w:noProof/>
             </w:rPr>
           </w:pPr>
-          <w:hyperlink w:anchor="_Toc243484962" w:history="1">
+          <w:hyperlink w:anchor="_Toc243485502" w:history="1">
             <w:r>
               <w:rPr>
                 <w:rStyle w:val="Lienhypertexte"/>
@@ -3007,7 +3007,7 @@
               <w:rPr>
                 <w:noProof/>
               </w:rPr>
-              <w:instrText xml:space="preserve"> PAGEREF _Toc243484962 \h </w:instrText>
+              <w:instrText xml:space="preserve"> PAGEREF _Toc243485502 \h </w:instrText>
             </w:r>
             <w:r>
               <w:rPr>
@@ -3044,7 +3044,7 @@
               <w:noProof/>
             </w:rPr>
           </w:pPr>
-          <w:hyperlink w:anchor="_Toc243484963" w:history="1">
+          <w:hyperlink w:anchor="_Toc243485503" w:history="1">
             <w:r>
               <w:rPr>
                 <w:rStyle w:val="Lienhypertexte"/>
@@ -3068,7 +3068,7 @@
               <w:rPr>
                 <w:noProof/>
               </w:rPr>
-              <w:instrText xml:space="preserve"> PAGEREF _Toc243484963 \h </w:instrText>
+              <w:instrText xml:space="preserve"> PAGEREF _Toc243485503 \h </w:instrText>
             </w:r>
             <w:r>
               <w:rPr>
@@ -3105,7 +3105,7 @@
               <w:noProof/>
             </w:rPr>
           </w:pPr>
-          <w:hyperlink w:anchor="_Toc243484964" w:history="1">
+          <w:hyperlink w:anchor="_Toc243485504" w:history="1">
             <w:r>
               <w:rPr>
                 <w:rStyle w:val="Lienhypertexte"/>
@@ -3129,7 +3129,7 @@
               <w:rPr>
                 <w:noProof/>
               </w:rPr>
-              <w:instrText xml:space="preserve"> PAGEREF _Toc243484964 \h </w:instrText>
+              <w:instrText xml:space="preserve"> PAGEREF _Toc243485504 \h </w:instrText>
             </w:r>
             <w:r>
               <w:rPr>
@@ -3166,7 +3166,7 @@
               <w:noProof/>
             </w:rPr>
           </w:pPr>
-          <w:hyperlink w:anchor="_Toc243484965" w:history="1">
+          <w:hyperlink w:anchor="_Toc243485505" w:history="1">
             <w:r>
               <w:rPr>
                 <w:rStyle w:val="Lienhypertexte"/>
@@ -3190,7 +3190,7 @@
               <w:rPr>
                 <w:noProof/>
               </w:rPr>
-              <w:instrText xml:space="preserve"> PAGEREF _Toc243484965 \h </w:instrText>
+              <w:instrText xml:space="preserve"> PAGEREF _Toc243485505 \h </w:instrText>
             </w:r>
             <w:r>
               <w:rPr>
@@ -3227,7 +3227,7 @@
               <w:noProof/>
             </w:rPr>
           </w:pPr>
-          <w:hyperlink w:anchor="_Toc243484966" w:history="1">
+          <w:hyperlink w:anchor="_Toc243485506" w:history="1">
             <w:r>
               <w:rPr>
                 <w:rStyle w:val="Lienhypertexte"/>
@@ -3251,7 +3251,7 @@
               <w:rPr>
                 <w:noProof/>
               </w:rPr>
-              <w:instrText xml:space="preserve"> PAGEREF _Toc243484966 \h </w:instrText>
+              <w:instrText xml:space="preserve"> PAGEREF _Toc243485506 \h </w:instrText>
             </w:r>
             <w:r>
               <w:rPr>
@@ -3288,7 +3288,7 @@
               <w:noProof/>
             </w:rPr>
           </w:pPr>
-          <w:hyperlink w:anchor="_Toc243484967" w:history="1">
+          <w:hyperlink w:anchor="_Toc243485507" w:history="1">
             <w:r>
               <w:rPr>
                 <w:rStyle w:val="Lienhypertexte"/>
@@ -3312,7 +3312,7 @@
               <w:rPr>
                 <w:noProof/>
               </w:rPr>
-              <w:instrText xml:space="preserve"> PAGEREF _Toc243484967 \h </w:instrText>
+              <w:instrText xml:space="preserve"> PAGEREF _Toc243485507 \h </w:instrText>
             </w:r>
             <w:r>
               <w:rPr>
@@ -3349,7 +3349,7 @@
               <w:noProof/>
             </w:rPr>
           </w:pPr>
-          <w:hyperlink w:anchor="_Toc243484968" w:history="1">
+          <w:hyperlink w:anchor="_Toc243485508" w:history="1">
             <w:r>
               <w:rPr>
                 <w:rStyle w:val="Lienhypertexte"/>
@@ -3373,7 +3373,7 @@
               <w:rPr>
                 <w:noProof/>
               </w:rPr>
-              <w:instrText xml:space="preserve"> PAGEREF _Toc243484968 \h </w:instrText>
+              <w:instrText xml:space="preserve"> PAGEREF _Toc243485508 \h </w:instrText>
             </w:r>
             <w:r>
               <w:rPr>
@@ -3410,7 +3410,7 @@
               <w:noProof/>
             </w:rPr>
           </w:pPr>
-          <w:hyperlink w:anchor="_Toc243484969" w:history="1">
+          <w:hyperlink w:anchor="_Toc243485509" w:history="1">
             <w:r>
               <w:rPr>
                 <w:rStyle w:val="Lienhypertexte"/>
@@ -3434,7 +3434,7 @@
               <w:rPr>
                 <w:noProof/>
               </w:rPr>
-              <w:instrText xml:space="preserve"> PAGEREF _Toc243484969 \h </w:instrText>
+              <w:instrText xml:space="preserve"> PAGEREF _Toc243485509 \h </w:instrText>
             </w:r>
             <w:r>
               <w:rPr>
@@ -3471,7 +3471,7 @@
               <w:noProof/>
             </w:rPr>
           </w:pPr>
-          <w:hyperlink w:anchor="_Toc243484970" w:history="1">
+          <w:hyperlink w:anchor="_Toc243485510" w:history="1">
             <w:r>
               <w:rPr>
                 <w:rStyle w:val="Lienhypertexte"/>
@@ -3495,7 +3495,7 @@
               <w:rPr>
                 <w:noProof/>
               </w:rPr>
-              <w:instrText xml:space="preserve"> PAGEREF _Toc243484970 \h </w:instrText>
+              <w:instrText xml:space="preserve"> PAGEREF _Toc243485510 \h </w:instrText>
             </w:r>
             <w:r>
               <w:rPr>
@@ -3532,7 +3532,7 @@
               <w:noProof/>
             </w:rPr>
           </w:pPr>
-          <w:hyperlink w:anchor="_Toc243484971" w:history="1">
+          <w:hyperlink w:anchor="_Toc243485511" w:history="1">
             <w:r>
               <w:rPr>
                 <w:rStyle w:val="Lienhypertexte"/>
@@ -3556,7 +3556,7 @@
               <w:rPr>
                 <w:noProof/>
               </w:rPr>
-              <w:instrText xml:space="preserve"> PAGEREF _Toc243484971 \h </w:instrText>
+              <w:instrText xml:space="preserve"> PAGEREF _Toc243485511 \h </w:instrText>
             </w:r>
             <w:r>
               <w:rPr>
@@ -3593,7 +3593,7 @@
               <w:noProof/>
             </w:rPr>
           </w:pPr>
-          <w:hyperlink w:anchor="_Toc243484972" w:history="1">
+          <w:hyperlink w:anchor="_Toc243485512" w:history="1">
             <w:r>
               <w:rPr>
                 <w:rStyle w:val="Lienhypertexte"/>
@@ -3617,7 +3617,7 @@
               <w:rPr>
                 <w:noProof/>
               </w:rPr>
-              <w:instrText xml:space="preserve"> PAGEREF _Toc243484972 \h </w:instrText>
+              <w:instrText xml:space="preserve"> PAGEREF _Toc243485512 \h </w:instrText>
             </w:r>
             <w:r>
               <w:rPr>
@@ -3654,7 +3654,7 @@
               <w:noProof/>
             </w:rPr>
           </w:pPr>
-          <w:hyperlink w:anchor="_Toc243484973" w:history="1">
+          <w:hyperlink w:anchor="_Toc243485513" w:history="1">
             <w:r>
               <w:rPr>
                 <w:rStyle w:val="Lienhypertexte"/>
@@ -3678,7 +3678,7 @@
               <w:rPr>
                 <w:noProof/>
               </w:rPr>
-              <w:instrText xml:space="preserve"> PAGEREF _Toc243484973 \h </w:instrText>
+              <w:instrText xml:space="preserve"> PAGEREF _Toc243485513 \h </w:instrText>
             </w:r>
             <w:r>
               <w:rPr>
@@ -3715,7 +3715,7 @@
               <w:noProof/>
             </w:rPr>
           </w:pPr>
-          <w:hyperlink w:anchor="_Toc243484974" w:history="1">
+          <w:hyperlink w:anchor="_Toc243485514" w:history="1">
             <w:r>
               <w:rPr>
                 <w:rStyle w:val="Lienhypertexte"/>
@@ -3739,7 +3739,7 @@
               <w:rPr>
                 <w:noProof/>
               </w:rPr>
-              <w:instrText xml:space="preserve"> PAGEREF _Toc243484974 \h </w:instrText>
+              <w:instrText xml:space="preserve"> PAGEREF _Toc243485514 \h </w:instrText>
             </w:r>
             <w:r>
               <w:rPr>
@@ -3776,7 +3776,7 @@
               <w:noProof/>
             </w:rPr>
           </w:pPr>
-          <w:hyperlink w:anchor="_Toc243484975" w:history="1">
+          <w:hyperlink w:anchor="_Toc243485515" w:history="1">
             <w:r>
               <w:rPr>
                 <w:rStyle w:val="Lienhypertexte"/>
@@ -3800,7 +3800,7 @@
               <w:rPr>
                 <w:noProof/>
               </w:rPr>
-              <w:instrText xml:space="preserve"> PAGEREF _Toc243484975 \h </w:instrText>
+              <w:instrText xml:space="preserve"> PAGEREF _Toc243485515 \h </w:instrText>
             </w:r>
             <w:r>
               <w:rPr>
@@ -3837,7 +3837,7 @@
               <w:noProof/>
             </w:rPr>
           </w:pPr>
-          <w:hyperlink w:anchor="_Toc243484976" w:history="1">
+          <w:hyperlink w:anchor="_Toc243485516" w:history="1">
             <w:r>
               <w:rPr>
                 <w:rStyle w:val="Lienhypertexte"/>
@@ -3861,7 +3861,7 @@
               <w:rPr>
                 <w:noProof/>
               </w:rPr>
-              <w:instrText xml:space="preserve"> PAGEREF _Toc243484976 \h </w:instrText>
+              <w:instrText xml:space="preserve"> PAGEREF _Toc243485516 \h </w:instrText>
             </w:r>
             <w:r>
               <w:rPr>
@@ -3898,7 +3898,7 @@
               <w:noProof/>
             </w:rPr>
           </w:pPr>
-          <w:hyperlink w:anchor="_Toc243484977" w:history="1">
+          <w:hyperlink w:anchor="_Toc243485517" w:history="1">
             <w:r>
               <w:rPr>
                 <w:rStyle w:val="Lienhypertexte"/>
@@ -3922,7 +3922,7 @@
               <w:rPr>
                 <w:noProof/>
               </w:rPr>
-              <w:instrText xml:space="preserve"> PAGEREF _Toc243484977 \h </w:instrText>
+              <w:instrText xml:space="preserve"> PAGEREF _Toc243485517 \h </w:instrText>
             </w:r>
             <w:r>
               <w:rPr>
@@ -3959,7 +3959,7 @@
               <w:noProof/>
             </w:rPr>
           </w:pPr>
-          <w:hyperlink w:anchor="_Toc243484978" w:history="1">
+          <w:hyperlink w:anchor="_Toc243485518" w:history="1">
             <w:r>
               <w:rPr>
                 <w:rStyle w:val="Lienhypertexte"/>
@@ -3983,7 +3983,7 @@
               <w:rPr>
                 <w:noProof/>
               </w:rPr>
-              <w:instrText xml:space="preserve"> PAGEREF _Toc243484978 \h </w:instrText>
+              <w:instrText xml:space="preserve"> PAGEREF _Toc243485518 \h </w:instrText>
             </w:r>
             <w:r>
               <w:rPr>
@@ -4020,7 +4020,7 @@
               <w:noProof/>
             </w:rPr>
           </w:pPr>
-          <w:hyperlink w:anchor="_Toc243484979" w:history="1">
+          <w:hyperlink w:anchor="_Toc243485519" w:history="1">
             <w:r>
               <w:rPr>
                 <w:rStyle w:val="Lienhypertexte"/>
@@ -4044,7 +4044,7 @@
               <w:rPr>
                 <w:noProof/>
               </w:rPr>
-              <w:instrText xml:space="preserve"> PAGEREF _Toc243484979 \h </w:instrText>
+              <w:instrText xml:space="preserve"> PAGEREF _Toc243485519 \h </w:instrText>
             </w:r>
             <w:r>
               <w:rPr>
@@ -4081,7 +4081,7 @@
               <w:noProof/>
             </w:rPr>
           </w:pPr>
-          <w:hyperlink w:anchor="_Toc243484980" w:history="1">
+          <w:hyperlink w:anchor="_Toc243485520" w:history="1">
             <w:r>
               <w:rPr>
                 <w:rStyle w:val="Lienhypertexte"/>
@@ -4105,7 +4105,7 @@
               <w:rPr>
                 <w:noProof/>
               </w:rPr>
-              <w:instrText xml:space="preserve"> PAGEREF _Toc243484980 \h </w:instrText>
+              <w:instrText xml:space="preserve"> PAGEREF _Toc243485520 \h </w:instrText>
             </w:r>
             <w:r>
               <w:rPr>
@@ -4142,7 +4142,7 @@
               <w:noProof/>
             </w:rPr>
           </w:pPr>
-          <w:hyperlink w:anchor="_Toc243484981" w:history="1">
+          <w:hyperlink w:anchor="_Toc243485521" w:history="1">
             <w:r>
               <w:rPr>
                 <w:rStyle w:val="Lienhypertexte"/>
@@ -4166,7 +4166,7 @@
               <w:rPr>
                 <w:noProof/>
               </w:rPr>
-              <w:instrText xml:space="preserve"> PAGEREF _Toc243484981 \h </w:instrText>
+              <w:instrText xml:space="preserve"> PAGEREF _Toc243485521 \h </w:instrText>
             </w:r>
             <w:r>
               <w:rPr>
@@ -4205,7 +4205,7 @@
         <w:pStyle w:val="Titre1"/>
         <w:pageBreakBefore/>
       </w:pPr>
-      <w:bookmarkStart w:id="0" w:name="_Toc243484915"/>
+      <w:bookmarkStart w:id="0" w:name="_Toc243485455"/>
       <w:r>
         <w:lastRenderedPageBreak/>
         <w:t>1. The pitch in 60 seconds</w:t>
@@ -4424,7 +4424,7 @@
         <w:pStyle w:val="Titre1"/>
         <w:pageBreakBefore/>
       </w:pPr>
-      <w:bookmarkStart w:id="1" w:name="_Toc243484916"/>
+      <w:bookmarkStart w:id="1" w:name="_Toc243485456"/>
       <w:r>
         <w:lastRenderedPageBreak/>
         <w:t>2. The basic ideas, explained simply</w:t>
@@ -4529,7 +4529,7 @@
       <w:pPr>
         <w:pStyle w:val="Titre2"/>
       </w:pPr>
-      <w:bookmarkStart w:id="2" w:name="_Toc243484917"/>
+      <w:bookmarkStart w:id="2" w:name="_Toc243485457"/>
       <w:r>
         <w:t>A neuron, weights and a network</w:t>
       </w:r>
@@ -4599,7 +4599,7 @@
       <w:pPr>
         <w:pStyle w:val="Titre2"/>
       </w:pPr>
-      <w:bookmarkStart w:id="3" w:name="_Toc243484918"/>
+      <w:bookmarkStart w:id="3" w:name="_Toc243485458"/>
       <w:r>
         <w:t>The loss: how wrong we are</w:t>
       </w:r>
@@ -4659,7 +4659,7 @@
       <w:pPr>
         <w:pStyle w:val="Titre2"/>
       </w:pPr>
-      <w:bookmarkStart w:id="4" w:name="_Toc243484919"/>
+      <w:bookmarkStart w:id="4" w:name="_Toc243485459"/>
       <w:r>
         <w:t>Gradient descent and the learning rate</w:t>
       </w:r>
@@ -4729,7 +4729,7 @@
       <w:pPr>
         <w:pStyle w:val="Titre2"/>
       </w:pPr>
-      <w:bookmarkStart w:id="5" w:name="_Toc243484920"/>
+      <w:bookmarkStart w:id="5" w:name="_Toc243485460"/>
       <w:r>
         <w:t>Backpropagation and the 5 lines of the training loop</w:t>
       </w:r>
@@ -4823,7 +4823,7 @@
       <w:pPr>
         <w:pStyle w:val="Titre2"/>
       </w:pPr>
-      <w:bookmarkStart w:id="6" w:name="_Toc243484921"/>
+      <w:bookmarkStart w:id="6" w:name="_Toc243485461"/>
       <w:r>
         <w:t>Epoch and mini-batch</w:t>
       </w:r>
@@ -4883,7 +4883,7 @@
       <w:pPr>
         <w:pStyle w:val="Titre2"/>
       </w:pPr>
-      <w:bookmarkStart w:id="7" w:name="_Toc243484922"/>
+      <w:bookmarkStart w:id="7" w:name="_Toc243485462"/>
       <w:r>
         <w:lastRenderedPageBreak/>
         <w:t>Train, validation, test</w:t>
@@ -4954,7 +4954,7 @@
       <w:pPr>
         <w:pStyle w:val="Titre2"/>
       </w:pPr>
-      <w:bookmarkStart w:id="8" w:name="_Toc243484923"/>
+      <w:bookmarkStart w:id="8" w:name="_Toc243485463"/>
       <w:r>
         <w:t>Overfitting</w:t>
       </w:r>
@@ -5004,7 +5004,7 @@
       <w:pPr>
         <w:pStyle w:val="Titre2"/>
       </w:pPr>
-      <w:bookmarkStart w:id="9" w:name="_Toc243484924"/>
+      <w:bookmarkStart w:id="9" w:name="_Toc243485464"/>
       <w:r>
         <w:t>ReLU, the activation</w:t>
       </w:r>
@@ -5074,7 +5074,7 @@
       <w:pPr>
         <w:pStyle w:val="Titre2"/>
       </w:pPr>
-      <w:bookmarkStart w:id="10" w:name="_Toc243484925"/>
+      <w:bookmarkStart w:id="10" w:name="_Toc243485465"/>
       <w:r>
         <w:t>Initialisation and the first loss</w:t>
       </w:r>
@@ -5124,7 +5124,7 @@
       <w:pPr>
         <w:pStyle w:val="Titre2"/>
       </w:pPr>
-      <w:bookmarkStart w:id="11" w:name="_Toc243484926"/>
+      <w:bookmarkStart w:id="11" w:name="_Toc243485466"/>
       <w:r>
         <w:t>Standardisation of the pixels</w:t>
       </w:r>
@@ -5184,7 +5184,7 @@
       <w:pPr>
         <w:pStyle w:val="Titre2"/>
       </w:pPr>
-      <w:bookmarkStart w:id="12" w:name="_Toc243484927"/>
+      <w:bookmarkStart w:id="12" w:name="_Toc243485467"/>
       <w:r>
         <w:t>MLP versus CNN: why the MLP cannot see shapes</w:t>
       </w:r>
@@ -5244,7 +5244,7 @@
       <w:pPr>
         <w:pStyle w:val="Titre2"/>
       </w:pPr>
-      <w:bookmarkStart w:id="13" w:name="_Toc243484928"/>
+      <w:bookmarkStart w:id="13" w:name="_Toc243485468"/>
       <w:r>
         <w:t>Convolution, filters and channels (session 7 slide)</w:t>
       </w:r>
@@ -5335,7 +5335,7 @@
       <w:pPr>
         <w:pStyle w:val="Titre2"/>
       </w:pPr>
-      <w:bookmarkStart w:id="14" w:name="_Toc243484929"/>
+      <w:bookmarkStart w:id="14" w:name="_Toc243485469"/>
       <w:r>
         <w:t>A pretrained network and transfer learning</w:t>
       </w:r>
@@ -5395,7 +5395,7 @@
       <w:pPr>
         <w:pStyle w:val="Titre2"/>
       </w:pPr>
-      <w:bookmarkStart w:id="15" w:name="_Toc243484930"/>
+      <w:bookmarkStart w:id="15" w:name="_Toc243485470"/>
       <w:r>
         <w:t>Frozen features (linear probe) versus fine-tuning</w:t>
       </w:r>
@@ -5465,7 +5465,7 @@
       <w:pPr>
         <w:pStyle w:val="Titre2"/>
       </w:pPr>
-      <w:bookmarkStart w:id="16" w:name="_Toc243484931"/>
+      <w:bookmarkStart w:id="16" w:name="_Toc243485471"/>
       <w:r>
         <w:t>The tools against overfitting</w:t>
       </w:r>
@@ -5625,7 +5625,7 @@
       <w:pPr>
         <w:pStyle w:val="Titre2"/>
       </w:pPr>
-      <w:bookmarkStart w:id="17" w:name="_Toc243484932"/>
+      <w:bookmarkStart w:id="17" w:name="_Toc243485472"/>
       <w:r>
         <w:t>Vanishing gradient</w:t>
       </w:r>
@@ -5675,7 +5675,7 @@
       <w:pPr>
         <w:pStyle w:val="Titre2"/>
       </w:pPr>
-      <w:bookmarkStart w:id="18" w:name="_Toc243484933"/>
+      <w:bookmarkStart w:id="18" w:name="_Toc243485473"/>
       <w:r>
         <w:t>Data leakage</w:t>
       </w:r>
@@ -5725,7 +5725,7 @@
       <w:pPr>
         <w:pStyle w:val="Titre2"/>
       </w:pPr>
-      <w:bookmarkStart w:id="19" w:name="_Toc243484934"/>
+      <w:bookmarkStart w:id="19" w:name="_Toc243485474"/>
       <w:r>
         <w:t>Confidence interval and bootstrap</w:t>
       </w:r>
@@ -5785,7 +5785,7 @@
       <w:pPr>
         <w:pStyle w:val="Titre2"/>
       </w:pPr>
-      <w:bookmarkStart w:id="20" w:name="_Toc243484935"/>
+      <w:bookmarkStart w:id="20" w:name="_Toc243485475"/>
       <w:r>
         <w:lastRenderedPageBreak/>
         <w:t>Latency and CPU threads</w:t>
@@ -5857,7 +5857,7 @@
         <w:pStyle w:val="Titre1"/>
         <w:pageBreakBefore/>
       </w:pPr>
-      <w:bookmarkStart w:id="21" w:name="_Toc243484936"/>
+      <w:bookmarkStart w:id="21" w:name="_Toc243485476"/>
       <w:r>
         <w:lastRenderedPageBreak/>
         <w:t>3. Step 1: the data and a fair split (notebook 01)</w:t>
@@ -5970,7 +5970,7 @@
       <w:pPr>
         <w:pStyle w:val="Titre2"/>
       </w:pPr>
-      <w:bookmarkStart w:id="22" w:name="_Toc243484937"/>
+      <w:bookmarkStart w:id="22" w:name="_Toc243485477"/>
       <w:r>
         <w:t>What we downloaded</w:t>
       </w:r>
@@ -6091,7 +6091,7 @@
       <w:pPr>
         <w:pStyle w:val="Titre2"/>
       </w:pPr>
-      <w:bookmarkStart w:id="23" w:name="_Toc243484938"/>
+      <w:bookmarkStart w:id="23" w:name="_Toc243485478"/>
       <w:r>
         <w:t>The split (make_split in data.py)</w:t>
       </w:r>
@@ -6222,7 +6222,7 @@
       <w:pPr>
         <w:pStyle w:val="Titre2"/>
       </w:pPr>
-      <w:bookmarkStart w:id="24" w:name="_Toc243484939"/>
+      <w:bookmarkStart w:id="24" w:name="_Toc243485479"/>
       <w:r>
         <w:t>What we found in the data</w:t>
       </w:r>
@@ -6285,7 +6285,7 @@
         <w:pStyle w:val="Titre1"/>
         <w:pageBreakBefore/>
       </w:pPr>
-      <w:bookmarkStart w:id="25" w:name="_Toc243484940"/>
+      <w:bookmarkStart w:id="25" w:name="_Toc243485480"/>
       <w:r>
         <w:lastRenderedPageBreak/>
         <w:t>4. Step 2: the MLP and its two checks (notebook 02)</w:t>
@@ -6435,7 +6435,7 @@
       <w:pPr>
         <w:pStyle w:val="Titre2"/>
       </w:pPr>
-      <w:bookmarkStart w:id="26" w:name="_Toc243484941"/>
+      <w:bookmarkStart w:id="26" w:name="_Toc243485481"/>
       <w:r>
         <w:t>The model</w:t>
       </w:r>
@@ -6562,7 +6562,7 @@
       <w:pPr>
         <w:pStyle w:val="Titre2"/>
       </w:pPr>
-      <w:bookmarkStart w:id="27" w:name="_Toc243484942"/>
+      <w:bookmarkStart w:id="27" w:name="_Toc243485482"/>
       <w:r>
         <w:t>Check 1: the first loss</w:t>
       </w:r>
@@ -6611,7 +6611,7 @@
       <w:pPr>
         <w:pStyle w:val="Titre2"/>
       </w:pPr>
-      <w:bookmarkStart w:id="28" w:name="_Toc243484943"/>
+      <w:bookmarkStart w:id="28" w:name="_Toc243485483"/>
       <w:r>
         <w:t>Check 2: overfit one batch</w:t>
       </w:r>
@@ -6629,7 +6629,7 @@
       <w:pPr>
         <w:pStyle w:val="Titre2"/>
       </w:pPr>
-      <w:bookmarkStart w:id="29" w:name="_Toc243484944"/>
+      <w:bookmarkStart w:id="29" w:name="_Toc243485484"/>
       <w:r>
         <w:t>Baseline and image size</w:t>
       </w:r>
@@ -6705,7 +6705,7 @@
         </w:rPr>
         <w:lastRenderedPageBreak/>
         <w:drawing>
-          <wp:inline distT="0" distB="0" distL="0" distR="0" wp14:anchorId="6220CBAB" wp14:editId="6220CBAC">
+          <wp:inline distT="0" distB="0" distL="0" distR="0" wp14:anchorId="733CE1EE" wp14:editId="733CE1EF">
             <wp:extent cx="4762500" cy="1924050"/>
             <wp:effectExtent l="0" t="0" r="0" b="0"/>
             <wp:docPr id="1" name="02_baseline_curves.png" descr="MLP baseline: training loss falls to 0 while validation loss rises (overfitting)." title="MLP baseline: training loss falls to 0 while validation loss rises (overfitting)."/>
@@ -6765,7 +6765,7 @@
         <w:pStyle w:val="Titre1"/>
         <w:pageBreakBefore/>
       </w:pPr>
-      <w:bookmarkStart w:id="30" w:name="_Toc243484945"/>
+      <w:bookmarkStart w:id="30" w:name="_Toc243485485"/>
       <w:r>
         <w:lastRenderedPageBreak/>
         <w:t>5. Step 3: monitoring and regularisation (notebook 03)</w:t>
@@ -6936,7 +6936,7 @@
       <w:pPr>
         <w:pStyle w:val="Titre2"/>
       </w:pPr>
-      <w:bookmarkStart w:id="31" w:name="_Toc243484946"/>
+      <w:bookmarkStart w:id="31" w:name="_Toc243485486"/>
       <w:r>
         <w:t>What we monitored</w:t>
       </w:r>
@@ -7055,7 +7055,7 @@
       <w:pPr>
         <w:pStyle w:val="Titre2"/>
       </w:pPr>
-      <w:bookmarkStart w:id="32" w:name="_Toc243484947"/>
+      <w:bookmarkStart w:id="32" w:name="_Toc243485487"/>
       <w:r>
         <w:t>Learning-rate sweep (Adam, 8 values, 15 epochs each)</w:t>
       </w:r>
@@ -7130,7 +7130,7 @@
           <w:noProof/>
         </w:rPr>
         <w:drawing>
-          <wp:inline distT="0" distB="0" distL="0" distR="0" wp14:anchorId="6220CBAD" wp14:editId="6220CBAE">
+          <wp:inline distT="0" distB="0" distL="0" distR="0" wp14:anchorId="733CE1F0" wp14:editId="733CE1F1">
             <wp:extent cx="4191000" cy="1619250"/>
             <wp:effectExtent l="0" t="0" r="0" b="0"/>
             <wp:docPr id="2" name="03_lr_sweep.png" descr="Learning-rate sweep: a U-shaped validation loss, best at 0.0001." title="Learning-rate sweep: a U-shaped validation loss, best at 0.0001."/>
@@ -7189,7 +7189,7 @@
       <w:pPr>
         <w:pStyle w:val="Titre2"/>
       </w:pPr>
-      <w:bookmarkStart w:id="33" w:name="_Toc243484948"/>
+      <w:bookmarkStart w:id="33" w:name="_Toc243485488"/>
       <w:r>
         <w:t>The tools against overfitting (lr 0.0001, 3 seeds each)</w:t>
       </w:r>
@@ -8162,7 +8162,7 @@
         <w:pStyle w:val="Titre1"/>
         <w:pageBreakBefore/>
       </w:pPr>
-      <w:bookmarkStart w:id="34" w:name="_Toc243484949"/>
+      <w:bookmarkStart w:id="34" w:name="_Toc243485489"/>
       <w:r>
         <w:lastRenderedPageBreak/>
         <w:t>6. Step 4: the training doctor (notebook 04)</w:t>
@@ -9068,7 +9068,7 @@
         </w:rPr>
         <w:lastRenderedPageBreak/>
         <w:drawing>
-          <wp:inline distT="0" distB="0" distL="0" distR="0" wp14:anchorId="6220CBAF" wp14:editId="6220CBB0">
+          <wp:inline distT="0" distB="0" distL="0" distR="0" wp14:anchorId="733CE1F2" wp14:editId="733CE1F3">
             <wp:extent cx="4000500" cy="2209800"/>
             <wp:effectExtent l="0" t="0" r="0" b="0"/>
             <wp:docPr id="3" name="04_p4_grad_per_layer.png" descr="Patient 4: the gradient vanishes layer after layer with sigmoids; ReLU + He init fixes it." title="Patient 4: the gradient vanishes layer after layer with sigmoids; ReLU + He init fixes it."/>
@@ -9127,7 +9127,7 @@
       <w:pPr>
         <w:pStyle w:val="Titre2"/>
       </w:pPr>
-      <w:bookmarkStart w:id="35" w:name="_Toc243484950"/>
+      <w:bookmarkStart w:id="35" w:name="_Toc243485490"/>
       <w:r>
         <w:t>Lessons to say at the oral</w:t>
       </w:r>
@@ -9220,7 +9220,7 @@
         <w:pStyle w:val="Titre1"/>
         <w:pageBreakBefore/>
       </w:pPr>
-      <w:bookmarkStart w:id="36" w:name="_Toc243484951"/>
+      <w:bookmarkStart w:id="36" w:name="_Toc243485491"/>
       <w:r>
         <w:lastRenderedPageBreak/>
         <w:t>7. Step 5: pretrained ResNet18 (notebook 05)</w:t>
@@ -9427,7 +9427,7 @@
       <w:pPr>
         <w:pStyle w:val="Titre2"/>
       </w:pPr>
-      <w:bookmarkStart w:id="37" w:name="_Toc243484952"/>
+      <w:bookmarkStart w:id="37" w:name="_Toc243485492"/>
       <w:r>
         <w:t>Why a CNN, and why pretrained</w:t>
       </w:r>
@@ -9512,7 +9512,7 @@
       <w:pPr>
         <w:pStyle w:val="Titre2"/>
       </w:pPr>
-      <w:bookmarkStart w:id="38" w:name="_Toc243484953"/>
+      <w:bookmarkStart w:id="38" w:name="_Toc243485493"/>
       <w:r>
         <w:t>Method A: frozen features + head</w:t>
       </w:r>
@@ -9619,7 +9619,7 @@
       <w:pPr>
         <w:pStyle w:val="Titre2"/>
       </w:pPr>
-      <w:bookmarkStart w:id="39" w:name="_Toc243484954"/>
+      <w:bookmarkStart w:id="39" w:name="_Toc243485494"/>
       <w:r>
         <w:t>Method B: fine-tuning layer4</w:t>
       </w:r>
@@ -9676,7 +9676,7 @@
       <w:pPr>
         <w:pStyle w:val="Titre2"/>
       </w:pPr>
-      <w:bookmarkStart w:id="40" w:name="_Toc243484955"/>
+      <w:bookmarkStart w:id="40" w:name="_Toc243485495"/>
       <w:r>
         <w:t>Two silent bugs, measured</w:t>
       </w:r>
@@ -9743,7 +9743,7 @@
       <w:pPr>
         <w:pStyle w:val="Titre2"/>
       </w:pPr>
-      <w:bookmarkStart w:id="41" w:name="_Toc243484956"/>
+      <w:bookmarkStart w:id="41" w:name="_Toc243485496"/>
       <w:r>
         <w:lastRenderedPageBreak/>
         <w:t>Painter leakage, measured fairly</w:t>
@@ -10085,7 +10085,7 @@
           <w:noProof/>
         </w:rPr>
         <w:drawing>
-          <wp:inline distT="0" distB="0" distL="0" distR="0" wp14:anchorId="6220CBB1" wp14:editId="6220CBB2">
+          <wp:inline distT="0" distB="0" distL="0" distR="0" wp14:anchorId="733CE1F4" wp14:editId="733CE1F5">
             <wp:extent cx="4762500" cy="2524125"/>
             <wp:effectExtent l="0" t="0" r="0" b="0"/>
             <wp:docPr id="4" name="05_painter_leakage.png" descr="Painter leakage: same images, same model; only the known-painter group changes." title="Painter leakage: same images, same model; only the known-painter group changes."/>
@@ -10160,7 +10160,7 @@
         <w:pStyle w:val="Titre1"/>
         <w:pageBreakBefore/>
       </w:pPr>
-      <w:bookmarkStart w:id="42" w:name="_Toc243484957"/>
+      <w:bookmarkStart w:id="42" w:name="_Toc243485497"/>
       <w:r>
         <w:lastRenderedPageBreak/>
         <w:t>8. Step 6: final test, CPU cost and recommendation (notebook 06)</w:t>
@@ -10306,7 +10306,7 @@
       <w:pPr>
         <w:pStyle w:val="Titre2"/>
       </w:pPr>
-      <w:bookmarkStart w:id="43" w:name="_Toc243484958"/>
+      <w:bookmarkStart w:id="43" w:name="_Toc243485498"/>
       <w:r>
         <w:t>Classical models (settings chosen on validation)</w:t>
       </w:r>
@@ -10419,7 +10419,7 @@
       <w:pPr>
         <w:pStyle w:val="Titre2"/>
       </w:pPr>
-      <w:bookmarkStart w:id="44" w:name="_Toc243484959"/>
+      <w:bookmarkStart w:id="44" w:name="_Toc243485499"/>
       <w:r>
         <w:t>The final test, measured once</w:t>
       </w:r>
@@ -11450,7 +11450,7 @@
         </w:rPr>
         <w:lastRenderedPageBreak/>
         <w:drawing>
-          <wp:inline distT="0" distB="0" distL="0" distR="0" wp14:anchorId="6220CBB3" wp14:editId="6220CBB4">
+          <wp:inline distT="0" distB="0" distL="0" distR="0" wp14:anchorId="733CE1F6" wp14:editId="733CE1F7">
             <wp:extent cx="4762500" cy="1971675"/>
             <wp:effectExtent l="0" t="0" r="0" b="0"/>
             <wp:docPr id="5" name="06_test_accuracy.png" descr="Final test: 220 paintings never seen before, with 95 % bootstrap intervals." title="Final test: 220 paintings never seen before, with 95 % bootstrap intervals."/>
@@ -11509,7 +11509,7 @@
       <w:pPr>
         <w:pStyle w:val="Titre2"/>
       </w:pPr>
-      <w:bookmarkStart w:id="45" w:name="_Toc243484960"/>
+      <w:bookmarkStart w:id="45" w:name="_Toc243485500"/>
       <w:r>
         <w:t>Are the gaps real? Paired bootstrap (same 220 paintings, 5 000 redraws)</w:t>
       </w:r>
@@ -11568,7 +11568,7 @@
       <w:pPr>
         <w:pStyle w:val="Titre2"/>
       </w:pPr>
-      <w:bookmarkStart w:id="46" w:name="_Toc243484961"/>
+      <w:bookmarkStart w:id="46" w:name="_Toc243485501"/>
       <w:r>
         <w:t>Frozen or fine-tuned? Validation and test disagree</w:t>
       </w:r>
@@ -11596,7 +11596,7 @@
       <w:pPr>
         <w:pStyle w:val="Titre2"/>
       </w:pPr>
-      <w:bookmarkStart w:id="47" w:name="_Toc243484962"/>
+      <w:bookmarkStart w:id="47" w:name="_Toc243485502"/>
       <w:r>
         <w:t>Speed and size</w:t>
       </w:r>
@@ -11614,7 +11614,7 @@
       <w:pPr>
         <w:pStyle w:val="Titre2"/>
       </w:pPr>
-      <w:bookmarkStart w:id="48" w:name="_Toc243484963"/>
+      <w:bookmarkStart w:id="48" w:name="_Toc243485503"/>
       <w:r>
         <w:t>Recommendation to the director</w:t>
       </w:r>
@@ -11711,7 +11711,7 @@
         <w:pStyle w:val="Titre1"/>
         <w:pageBreakBefore/>
       </w:pPr>
-      <w:bookmarkStart w:id="49" w:name="_Toc243484964"/>
+      <w:bookmarkStart w:id="49" w:name="_Toc243485504"/>
       <w:r>
         <w:lastRenderedPageBreak/>
         <w:t>9. The random forest, our classical challenger (notebook 06)</w:t>
@@ -11898,7 +11898,7 @@
       <w:pPr>
         <w:pStyle w:val="Titre2"/>
       </w:pPr>
-      <w:bookmarkStart w:id="50" w:name="_Toc243484965"/>
+      <w:bookmarkStart w:id="50" w:name="_Toc243485505"/>
       <w:r>
         <w:t>The 102 hand-made numbers (baselines.py)</w:t>
       </w:r>
@@ -12288,7 +12288,7 @@
       <w:pPr>
         <w:pStyle w:val="Titre2"/>
       </w:pPr>
-      <w:bookmarkStart w:id="51" w:name="_Toc243484966"/>
+      <w:bookmarkStart w:id="51" w:name="_Toc243485506"/>
       <w:r>
         <w:t>Our settings, chosen on validation</w:t>
       </w:r>
@@ -12456,7 +12456,7 @@
       <w:pPr>
         <w:pStyle w:val="Titre2"/>
       </w:pPr>
-      <w:bookmarkStart w:id="52" w:name="_Toc243484967"/>
+      <w:bookmarkStart w:id="52" w:name="_Toc243485507"/>
       <w:r>
         <w:t>Questions on the random forest, with answers</w:t>
       </w:r>
@@ -12721,7 +12721,7 @@
         <w:pStyle w:val="Titre1"/>
         <w:pageBreakBefore/>
       </w:pPr>
-      <w:bookmarkStart w:id="53" w:name="_Toc243484968"/>
+      <w:bookmarkStart w:id="53" w:name="_Toc243485508"/>
       <w:r>
         <w:lastRenderedPageBreak/>
         <w:t>10. Bonus: what about transformers like BERT? (notebook 07)</w:t>
@@ -13588,7 +13588,7 @@
         </w:rPr>
         <w:lastRenderedPageBreak/>
         <w:drawing>
-          <wp:inline distT="0" distB="0" distL="0" distR="0" wp14:anchorId="6220CBB5" wp14:editId="6220CBB6">
+          <wp:inline distT="0" distB="0" distL="0" distR="0" wp14:anchorId="733CE1F8" wp14:editId="733CE1F9">
             <wp:extent cx="4381500" cy="2486025"/>
             <wp:effectExtent l="0" t="0" r="0" b="0"/>
             <wp:docPr id="6" name="07_transformers_accuracy_vs_speed.png" descr="Transformers on validation: CLIP is more accurate, but slower." title="Transformers on validation: CLIP is more accurate, but slower."/>
@@ -13648,7 +13648,7 @@
         <w:pStyle w:val="Titre1"/>
         <w:pageBreakBefore/>
       </w:pPr>
-      <w:bookmarkStart w:id="54" w:name="_Toc243484969"/>
+      <w:bookmarkStart w:id="54" w:name="_Toc243485509"/>
       <w:r>
         <w:lastRenderedPageBreak/>
         <w:t>11. Key numbers to know by heart</w:t>
@@ -14906,7 +14906,7 @@
         <w:pStyle w:val="Titre1"/>
         <w:pageBreakBefore/>
       </w:pPr>
-      <w:bookmarkStart w:id="55" w:name="_Toc243484970"/>
+      <w:bookmarkStart w:id="55" w:name="_Toc243485510"/>
       <w:r>
         <w:lastRenderedPageBreak/>
         <w:t>12. Concepts in simple words</w:t>
@@ -17097,7 +17097,7 @@
         <w:pStyle w:val="Titre1"/>
         <w:pageBreakBefore/>
       </w:pPr>
-      <w:bookmarkStart w:id="56" w:name="_Toc243484971"/>
+      <w:bookmarkStart w:id="56" w:name="_Toc243485511"/>
       <w:r>
         <w:lastRenderedPageBreak/>
         <w:t>13. Questions you may get, with answers</w:t>
@@ -17119,7 +17119,7 @@
       <w:pPr>
         <w:pStyle w:val="Titre2"/>
       </w:pPr>
-      <w:bookmarkStart w:id="57" w:name="_Toc243484972"/>
+      <w:bookmarkStart w:id="57" w:name="_Toc243485512"/>
       <w:r>
         <w:t>About the data</w:t>
       </w:r>
@@ -17239,7 +17239,7 @@
       <w:pPr>
         <w:pStyle w:val="Titre2"/>
       </w:pPr>
-      <w:bookmarkStart w:id="58" w:name="_Toc243484973"/>
+      <w:bookmarkStart w:id="58" w:name="_Toc243485513"/>
       <w:r>
         <w:t>About the MLP</w:t>
       </w:r>
@@ -17359,7 +17359,7 @@
       <w:pPr>
         <w:pStyle w:val="Titre2"/>
       </w:pPr>
-      <w:bookmarkStart w:id="59" w:name="_Toc243484974"/>
+      <w:bookmarkStart w:id="59" w:name="_Toc243485514"/>
       <w:r>
         <w:t>About training and diagnosis</w:t>
       </w:r>
@@ -17457,7 +17457,7 @@
       <w:pPr>
         <w:pStyle w:val="Titre2"/>
       </w:pPr>
-      <w:bookmarkStart w:id="60" w:name="_Toc243484975"/>
+      <w:bookmarkStart w:id="60" w:name="_Toc243485515"/>
       <w:r>
         <w:lastRenderedPageBreak/>
         <w:t>About ResNet</w:t>
@@ -17629,7 +17629,7 @@
           <w:bCs/>
           <w:color w:val="1C2433"/>
         </w:rPr>
-        <w:t>Why did fine-tuning not win on validation?</w:t>
+        <w:t>Frozen: did you unfreeze the last layer of ResNet18?</w:t>
       </w:r>
     </w:p>
     <w:p>
@@ -17637,7 +17637,7 @@
         <w:spacing w:after="120"/>
       </w:pPr>
       <w:r>
-        <w:t>8.4 M weights for 1 061 images: it overfits (99.9 % on train) even with augmentation. Frozen features plus 2 565 trained weights generalise better here.</w:t>
+        <w:t>No. Frozen means that none of the 11 million weights of ResNet18 change. We removed its last layer, made for the 1 000 ImageNet classes, and added a new one of our own (512 numbers to 5 styles): only this new layer learns, 2 565 weights. Fine-tuning goes one step further: we also unfreeze the last block of ResNet18 (layer4, 8.4 million weights) and let it learn from our paintings with a small learning rate. It was less convincing: 85.4 % against 88.1 % on validation.</w:t>
       </w:r>
     </w:p>
     <w:p>
@@ -17651,7 +17651,7 @@
           <w:bCs/>
           <w:color w:val="1C2433"/>
         </w:rPr>
-        <w:t>Why does the linear probe give the same 88.1 % for 3 seeds?</w:t>
+        <w:t>Why did fine-tuning not win on validation?</w:t>
       </w:r>
     </w:p>
     <w:p>
@@ -17659,7 +17659,7 @@
         <w:spacing w:after="120"/>
       </w:pPr>
       <w:r>
-        <w:t>The features are fixed and the problem is nearly convex, so every seed finds the same solution.</w:t>
+        <w:t>8.4 M weights for 1 061 images: it overfits (99.9 % on train) even with augmentation. Frozen features plus 2 565 trained weights generalise better here.</w:t>
       </w:r>
     </w:p>
     <w:p>
@@ -17673,7 +17673,7 @@
           <w:bCs/>
           <w:color w:val="1C2433"/>
         </w:rPr>
-        <w:t>The course talked about BERT and transformers. Could they solve the problem?</w:t>
+        <w:t>Why does the linear probe give the same 88.1 % for 3 seeds?</w:t>
       </w:r>
     </w:p>
     <w:p>
@@ -17681,7 +17681,7 @@
         <w:spacing w:after="120"/>
       </w:pPr>
       <w:r>
-        <w:t>BERT alone, no: it reads text, not pixels. We tested its image cousins on validation (notebook 07). ViT-B/16 gives the same 88.1 % as ResNet18 and is 9 times slower. CLIP, trained on images with captions, reaches 89.0 % with no training at all and 94.7 % with our linear head, 6.8 points above ResNet18 (paired interval 2.3 to 11.4), for 2.7 times the time. But it has probably seen WikiArt during its training and we did not reopen the test, so it is our first next step, not our recommendation.</w:t>
+        <w:t>The features are fixed and the problem is nearly convex, so every seed finds the same solution.</w:t>
       </w:r>
     </w:p>
     <w:p>
@@ -17695,7 +17695,7 @@
           <w:bCs/>
           <w:color w:val="1C2433"/>
         </w:rPr>
-        <w:t>What does the 12.8 % bug teach?</w:t>
+        <w:t>The course talked about BERT and transformers. Could they solve the problem?</w:t>
       </w:r>
     </w:p>
     <w:p>
@@ -17703,18 +17703,8 @@
         <w:spacing w:after="120"/>
       </w:pPr>
       <w:r>
-        <w:t>Always call model.eval(): in train mode batch norm uses each batch's statistics, which erased the style because our batches held mostly one style.</w:t>
-      </w:r>
-    </w:p>
-    <w:p>
-      <w:pPr>
-        <w:pStyle w:val="Titre2"/>
-      </w:pPr>
-      <w:bookmarkStart w:id="61" w:name="_Toc243484976"/>
-      <w:r>
-        <w:t>About the results and the recommendation</w:t>
-      </w:r>
-      <w:bookmarkEnd w:id="61"/>
+        <w:t>BERT alone, no: it reads text, not pixels. We tested its image cousins on validation (notebook 07). ViT-B/16 gives the same 88.1 % as ResNet18 and is 9 times slower. CLIP, trained on images with captions, reaches 89.0 % with no training at all and 94.7 % with our linear head, 6.8 points above ResNet18 (paired interval 2.3 to 11.4), for 2.7 times the time. But it has probably seen WikiArt during its training and we did not reopen the test, so it is our first next step, not our recommendation.</w:t>
+      </w:r>
     </w:p>
     <w:p>
       <w:pPr>
@@ -17727,7 +17717,7 @@
           <w:bCs/>
           <w:color w:val="1C2433"/>
         </w:rPr>
-        <w:t>Validation says frozen is better, test says fine-tuned is better. Which is right?</w:t>
+        <w:t>What does the 12.8 % bug teach?</w:t>
       </w:r>
     </w:p>
     <w:p>
@@ -17735,8 +17725,18 @@
         <w:spacing w:after="120"/>
       </w:pPr>
       <w:r>
-        <w:t>Neither can be proven: with about 220 images a score moves about 5 points by chance. We chose on validation before the test, which keeps the test honest. Fine-tuning is the first thing to retry with more data.</w:t>
-      </w:r>
+        <w:t>Always call model.eval(): in train mode batch norm uses each batch's statistics, which erased the style because our batches held mostly one style.</w:t>
+      </w:r>
+    </w:p>
+    <w:p>
+      <w:pPr>
+        <w:pStyle w:val="Titre2"/>
+      </w:pPr>
+      <w:bookmarkStart w:id="61" w:name="_Toc243485516"/>
+      <w:r>
+        <w:t>About the results and the recommendation</w:t>
+      </w:r>
+      <w:bookmarkEnd w:id="61"/>
     </w:p>
     <w:p>
       <w:pPr>
@@ -17749,7 +17749,7 @@
           <w:bCs/>
           <w:color w:val="1C2433"/>
         </w:rPr>
-        <w:t>Why not pick the fine-tuned model, since it won the test?</w:t>
+        <w:t>Validation says frozen is better, test says fine-tuned is better. Which is right?</w:t>
       </w:r>
     </w:p>
     <w:p>
@@ -17757,7 +17757,7 @@
         <w:spacing w:after="120"/>
       </w:pPr>
       <w:r>
-        <w:t>Choosing by test score turns the test into a second validation set and makes the reported score too optimistic.</w:t>
+        <w:t>Neither can be proven: with about 220 images a score moves about 5 points by chance. We chose on validation before the test, which keeps the test honest. Fine-tuning is the first thing to retry with more data.</w:t>
       </w:r>
     </w:p>
     <w:p>
@@ -17771,7 +17771,7 @@
           <w:bCs/>
           <w:color w:val="1C2433"/>
         </w:rPr>
-        <w:t>Is 83 % good enough for a museum?</w:t>
+        <w:t>Why not pick the fine-tuned model, since it won the test?</w:t>
       </w:r>
     </w:p>
     <w:p>
@@ -17779,7 +17779,7 @@
         <w:spacing w:after="120"/>
       </w:pPr>
       <w:r>
-        <w:t>One visitor in six gets a wrong style, against one in three for the best classical model. Good for a guide that tells the story of a movement; it must be confirmed on real kiosk photos.</w:t>
+        <w:t>Choosing by test score turns the test into a second validation set and makes the reported score too optimistic.</w:t>
       </w:r>
     </w:p>
     <w:p>
@@ -17793,7 +17793,7 @@
           <w:bCs/>
           <w:color w:val="1C2433"/>
         </w:rPr>
-        <w:t>Is 53 ms realistic on a kiosk?</w:t>
+        <w:t>Is 83 % good enough for a museum?</w:t>
       </w:r>
     </w:p>
     <w:p>
@@ -17801,7 +17801,7 @@
         <w:spacing w:after="120"/>
       </w:pPr>
       <w:r>
-        <w:t>Measured on one thread of a laptop, one photo at a time. A kiosk 4 times slower would still answer in about 0.2 s.</w:t>
+        <w:t>One visitor in six gets a wrong style, against one in three for the best classical model. Good for a guide that tells the story of a movement; it must be confirmed on real kiosk photos.</w:t>
       </w:r>
     </w:p>
     <w:p>
@@ -17816,7 +17816,7 @@
           <w:color w:val="1C2433"/>
         </w:rPr>
         <w:lastRenderedPageBreak/>
-        <w:t>So is a neural network worth it?</w:t>
+        <w:t>Is 53 ms realistic on a kiosk?</w:t>
       </w:r>
     </w:p>
     <w:p>
@@ -17824,7 +17824,7 @@
         <w:spacing w:after="120"/>
       </w:pPr>
       <w:r>
-        <w:t>Yes, a pretrained one: +16.4 points over the best classical model (interval 9.1 to 24.1), a cost a kiosk can afford, no GPU, retrained in seconds.</w:t>
+        <w:t>Measured on one thread of a laptop, one photo at a time. A kiosk 4 times slower would still answer in about 0.2 s.</w:t>
       </w:r>
     </w:p>
     <w:p>
@@ -17838,7 +17838,7 @@
           <w:bCs/>
           <w:color w:val="1C2433"/>
         </w:rPr>
-        <w:t>What about part 2 (questions in natural language)?</w:t>
+        <w:t>So is a neural network worth it?</w:t>
       </w:r>
     </w:p>
     <w:p>
@@ -17846,18 +17846,8 @@
         <w:spacing w:after="120"/>
       </w:pPr>
       <w:r>
-        <w:t>The written brief lists three deliverables and part 2 is not one of them, so we put our time on those and on the recommendation. Session 8 shows the next step (milestone m4): encode the visitors' questions and descriptions of the artworks with sentence embeddings (all-MiniLM-L6-v2), retrieve the closest artwork by cosine similarity, and compare with a classical TF-IDF search. Our WikiArt images have no text descriptions, so we would first have to write them.</w:t>
-      </w:r>
-    </w:p>
-    <w:p>
-      <w:pPr>
-        <w:pStyle w:val="Titre2"/>
-      </w:pPr>
-      <w:bookmarkStart w:id="62" w:name="_Toc243484977"/>
-      <w:r>
-        <w:t>About the project</w:t>
-      </w:r>
-      <w:bookmarkEnd w:id="62"/>
+        <w:t>Yes, a pretrained one: +16.4 points over the best classical model (interval 9.1 to 24.1), a cost a kiosk can afford, no GPU, retrained in seconds.</w:t>
+      </w:r>
     </w:p>
     <w:p>
       <w:pPr>
@@ -17870,7 +17860,7 @@
           <w:bCs/>
           <w:color w:val="1C2433"/>
         </w:rPr>
-        <w:t>How can someone reproduce your results?</w:t>
+        <w:t>What about part 2 (questions in natural language)?</w:t>
       </w:r>
     </w:p>
     <w:p>
@@ -17878,8 +17868,18 @@
         <w:spacing w:after="120"/>
       </w:pPr>
       <w:r>
-        <w:t>pip install -r requirements.txt, bash scripts/get_data.sh, python -m pytest, python scripts/run_notebooks.py. Fixed seeds and a pinned dataset revision; notebook 06 re-trains the models and gets exactly the same validation scores.</w:t>
-      </w:r>
+        <w:t>The written brief lists three deliverables and part 2 is not one of them, so we put our time on those and on the recommendation. Session 8 shows the next step (milestone m4): encode the visitors' questions and descriptions of the artworks with sentence embeddings (all-MiniLM-L6-v2), retrieve the closest artwork by cosine similarity, and compare with a classical TF-IDF search. Our WikiArt images have no text descriptions, so we would first have to write them.</w:t>
+      </w:r>
+    </w:p>
+    <w:p>
+      <w:pPr>
+        <w:pStyle w:val="Titre2"/>
+      </w:pPr>
+      <w:bookmarkStart w:id="62" w:name="_Toc243485517"/>
+      <w:r>
+        <w:t>About the project</w:t>
+      </w:r>
+      <w:bookmarkEnd w:id="62"/>
     </w:p>
     <w:p>
       <w:pPr>
@@ -17892,6 +17892,28 @@
           <w:bCs/>
           <w:color w:val="1C2433"/>
         </w:rPr>
+        <w:t>How can someone reproduce your results?</w:t>
+      </w:r>
+    </w:p>
+    <w:p>
+      <w:pPr>
+        <w:spacing w:after="120"/>
+      </w:pPr>
+      <w:r>
+        <w:t>pip install -r requirements.txt, bash scripts/get_data.sh, python -m pytest, python scripts/run_notebooks.py. Fixed seeds and a pinned dataset revision; notebook 06 re-trains the models and gets exactly the same validation scores.</w:t>
+      </w:r>
+    </w:p>
+    <w:p>
+      <w:pPr>
+        <w:keepNext/>
+        <w:spacing w:before="120" w:after="40"/>
+      </w:pPr>
+      <w:r>
+        <w:rPr>
+          <w:b/>
+          <w:bCs/>
+          <w:color w:val="1C2433"/>
+        </w:rPr>
         <w:t>How is the work organised?</w:t>
       </w:r>
     </w:p>
@@ -17908,7 +17930,7 @@
         <w:pStyle w:val="Titre1"/>
         <w:pageBreakBefore/>
       </w:pPr>
-      <w:bookmarkStart w:id="63" w:name="_Toc243484978"/>
+      <w:bookmarkStart w:id="63" w:name="_Toc243485518"/>
       <w:r>
         <w:lastRenderedPageBreak/>
         <w:t>14. Limits to admit, and next steps</w:t>
@@ -18702,7 +18724,7 @@
         <w:pStyle w:val="Titre1"/>
         <w:pageBreakBefore/>
       </w:pPr>
-      <w:bookmarkStart w:id="64" w:name="_Toc243484979"/>
+      <w:bookmarkStart w:id="64" w:name="_Toc243485519"/>
       <w:r>
         <w:lastRenderedPageBreak/>
         <w:t>15. Git history and how to reproduce</w:t>
@@ -19658,7 +19680,7 @@
         <w:pStyle w:val="Titre1"/>
         <w:pageBreakBefore/>
       </w:pPr>
-      <w:bookmarkStart w:id="65" w:name="_Toc243484980"/>
+      <w:bookmarkStart w:id="65" w:name="_Toc243485520"/>
       <w:r>
         <w:lastRenderedPageBreak/>
         <w:t>16. The 10-minute talk, slide by slide</w:t>
@@ -19673,7 +19695,7 @@
         <w:rPr>
           <w:color w:val="1C2433"/>
         </w:rPr>
-        <w:t>The talk follows the project step by step and gives the answer only at the end. 11 slides, about 50 seconds each: about 9:35 in total, the rest of the 10 minutes is a margin. The speaker notes in the .pptx and oral_script.pdf hold the full text in simple English.</w:t>
+        <w:t>The talk follows the project step by step and gives the answer only at the end. 11 slides, about 50 seconds each: about 9:40 in total, the rest of the 10 minutes is a margin. The speaker notes in the .pptx and oral_script.pdf hold the full text in simple English.</w:t>
       </w:r>
     </w:p>
     <w:tbl>
@@ -20436,7 +20458,7 @@
                 <w:sz w:val="19"/>
                 <w:szCs w:val="19"/>
               </w:rPr>
-              <w:t>1:00</w:t>
+              <w:t>1:05</w:t>
             </w:r>
           </w:p>
         </w:tc>
@@ -20543,7 +20565,7 @@
                 <w:sz w:val="19"/>
                 <w:szCs w:val="19"/>
               </w:rPr>
-              <w:t>0:55</w:t>
+              <w:t>1:05</w:t>
             </w:r>
           </w:p>
         </w:tc>
@@ -20569,7 +20591,7 @@
                 <w:sz w:val="19"/>
                 <w:szCs w:val="19"/>
               </w:rPr>
-              <w:t>88.1 % on validation; Cubism 7 % → 71 %; small gap (0.09); fine-tuning overfits.</w:t>
+              <w:t>88.1 % on validation; Cubism 7 % → 71 %; small gap (0.09); fine-tuning less convincing (85.4 %).</w:t>
             </w:r>
           </w:p>
         </w:tc>
@@ -20975,7 +20997,7 @@
                 <w:sz w:val="19"/>
                 <w:szCs w:val="19"/>
               </w:rPr>
-              <w:t>1:00</w:t>
+              <w:t>0:50</w:t>
             </w:r>
           </w:p>
         </w:tc>
@@ -21016,7 +21038,7 @@
       <w:pPr>
         <w:pStyle w:val="Titre2"/>
       </w:pPr>
-      <w:bookmarkStart w:id="66" w:name="_Toc243484981"/>
+      <w:bookmarkStart w:id="66" w:name="_Toc243485521"/>
       <w:r>
         <w:t>The thread: each result opens the next step</w:t>
       </w:r>
@@ -21350,10 +21372,96 @@
 <file path=word/numbering.xml><?xml version="1.0" encoding="utf-8"?>
 <w:numbering xmlns:wpc="http://schemas.microsoft.com/office/word/2010/wordprocessingCanvas" xmlns:cx="http://schemas.microsoft.com/office/drawing/2014/chartex" xmlns:cx1="http://schemas.microsoft.com/office/drawing/2015/9/8/chartex" xmlns:cx2="http://schemas.microsoft.com/office/drawing/2015/10/21/chartex" xmlns:cx3="http://schemas.microsoft.com/office/drawing/2016/5/9/chartex" xmlns:cx4="http://schemas.microsoft.com/office/drawing/2016/5/10/chartex" xmlns:cx5="http://schemas.microsoft.com/office/drawing/2016/5/11/chartex" xmlns:cx6="http://schemas.microsoft.com/office/drawing/2016/5/12/chartex" xmlns:cx7="http://schemas.microsoft.com/office/drawing/2016/5/13/chartex" xmlns:cx8="http://schemas.microsoft.com/office/drawing/2016/5/14/chartex" xmlns:mc="http://schemas.openxmlformats.org/markup-compatibility/2006" xmlns:aink="http://schemas.microsoft.com/office/drawing/2016/ink" xmlns:am3d="http://schemas.microsoft.com/office/drawing/2017/model3d" xmlns:o="urn:schemas-microsoft-com:office:office" xmlns:oel="http://schemas.microsoft.com/office/2019/extlst" xmlns:r="http://schemas.openxmlformats.org/officeDocument/2006/relationships" xmlns:m="http://schemas.openxmlformats.org/officeDocument/2006/math" xmlns:v="urn:schemas-microsoft-com:vml" xmlns:wp14="http://schemas.microsoft.com/office/word/2010/wordprocessingDrawing" xmlns:wp="http://schemas.openxmlformats.org/drawingml/2006/wordprocessingDrawing" xmlns:w10="urn:schemas-microsoft-com:office:word" xmlns:w="http://schemas.openxmlformats.org/wordprocessingml/2006/main" xmlns:w14="http://schemas.microsoft.com/office/word/2010/wordml" xmlns:w15="http://schemas.microsoft.com/office/word/2012/wordml" xmlns:w16cex="http://schemas.microsoft.com/office/word/2018/wordml/cex" xmlns:w16cid="http://schemas.microsoft.com/office/word/2016/wordml/cid" xmlns:w16="http://schemas.microsoft.com/office/word/2018/wordml" xmlns:w16du="http://schemas.microsoft.com/office/word/2023/wordml/word16du" xmlns:w16sdtdh="http://schemas.microsoft.com/office/word/2020/wordml/sdtdatahash" xmlns:w16sdtfl="http://schemas.microsoft.com/office/word/2024/wordml/sdtformatlock" xmlns:w16se="http://schemas.microsoft.com/office/word/2015/wordml/symex" xmlns:wpg="http://schemas.microsoft.com/office/word/2010/wordprocessingGroup" xmlns:wpi="http://schemas.microsoft.com/office/word/2010/wordprocessingInk" xmlns:wne="http://schemas.microsoft.com/office/word/2006/wordml" xmlns:wps="http://schemas.microsoft.com/office/word/2010/wordprocessingShape" mc:Ignorable="w14 w15 w16se w16cid w16 w16cex w16sdtdh w16sdtfl w16du wp14">
   <w:abstractNum w:abstractNumId="0" w15:restartNumberingAfterBreak="0">
-    <w:nsid w:val="18EE08A1"/>
+    <w:nsid w:val="01287CBF"/>
     <w:multiLevelType w:val="hybridMultilevel"/>
-    <w:tmpl w:val="871E1F18"/>
-    <w:lvl w:ilvl="0" w:tplc="2DD260FC">
+    <w:tmpl w:val="B5C4C3A0"/>
+    <w:lvl w:ilvl="0" w:tplc="4AB8C252" w:tentative="1">
+      <w:start w:val="1"/>
+      <w:numFmt w:val="bullet"/>
+      <w:lvlText w:val="●"/>
+      <w:lvlJc w:val="left"/>
+      <w:pPr>
+        <w:ind w:left="720" w:hanging="360"/>
+      </w:pPr>
+    </w:lvl>
+    <w:lvl w:ilvl="1" w:tplc="4D64561E" w:tentative="1">
+      <w:start w:val="1"/>
+      <w:numFmt w:val="bullet"/>
+      <w:lvlText w:val="○"/>
+      <w:lvlJc w:val="left"/>
+      <w:pPr>
+        <w:ind w:left="1440" w:hanging="360"/>
+      </w:pPr>
+    </w:lvl>
+    <w:lvl w:ilvl="2" w:tplc="3368A564" w:tentative="1">
+      <w:start w:val="1"/>
+      <w:numFmt w:val="bullet"/>
+      <w:lvlText w:val="■"/>
+      <w:lvlJc w:val="left"/>
+      <w:pPr>
+        <w:ind w:left="2160" w:hanging="360"/>
+      </w:pPr>
+    </w:lvl>
+    <w:lvl w:ilvl="3" w:tplc="722A4022" w:tentative="1">
+      <w:start w:val="1"/>
+      <w:numFmt w:val="bullet"/>
+      <w:lvlText w:val="●"/>
+      <w:lvlJc w:val="left"/>
+      <w:pPr>
+        <w:ind w:left="2880" w:hanging="360"/>
+      </w:pPr>
+    </w:lvl>
+    <w:lvl w:ilvl="4" w:tplc="EE562374" w:tentative="1">
+      <w:start w:val="1"/>
+      <w:numFmt w:val="bullet"/>
+      <w:lvlText w:val="○"/>
+      <w:lvlJc w:val="left"/>
+      <w:pPr>
+        <w:ind w:left="3600" w:hanging="360"/>
+      </w:pPr>
+    </w:lvl>
+    <w:lvl w:ilvl="5" w:tplc="9D2412C4" w:tentative="1">
+      <w:start w:val="1"/>
+      <w:numFmt w:val="bullet"/>
+      <w:lvlText w:val="■"/>
+      <w:lvlJc w:val="left"/>
+      <w:pPr>
+        <w:ind w:left="4320" w:hanging="360"/>
+      </w:pPr>
+    </w:lvl>
+    <w:lvl w:ilvl="6" w:tplc="56FC8604" w:tentative="1">
+      <w:start w:val="1"/>
+      <w:numFmt w:val="bullet"/>
+      <w:lvlText w:val="●"/>
+      <w:lvlJc w:val="left"/>
+      <w:pPr>
+        <w:ind w:left="5040" w:hanging="360"/>
+      </w:pPr>
+    </w:lvl>
+    <w:lvl w:ilvl="7" w:tplc="C4FEE770" w:tentative="1">
+      <w:start w:val="1"/>
+      <w:numFmt w:val="bullet"/>
+      <w:lvlText w:val="●"/>
+      <w:lvlJc w:val="left"/>
+      <w:pPr>
+        <w:ind w:left="5760" w:hanging="360"/>
+      </w:pPr>
+    </w:lvl>
+    <w:lvl w:ilvl="8" w:tplc="6900800A" w:tentative="1">
+      <w:start w:val="1"/>
+      <w:numFmt w:val="bullet"/>
+      <w:lvlText w:val="●"/>
+      <w:lvlJc w:val="left"/>
+      <w:pPr>
+        <w:ind w:left="6480" w:hanging="360"/>
+      </w:pPr>
+    </w:lvl>
+  </w:abstractNum>
+  <w:abstractNum w:abstractNumId="1" w15:restartNumberingAfterBreak="0">
+    <w:nsid w:val="0DBF100C"/>
+    <w:multiLevelType w:val="hybridMultilevel"/>
+    <w:tmpl w:val="897CE27A"/>
+    <w:lvl w:ilvl="0" w:tplc="2390C9D6">
       <w:start w:val="1"/>
       <w:numFmt w:val="decimal"/>
       <w:lvlText w:val="%1."/>
@@ -21362,246 +21470,160 @@
         <w:ind w:left="400" w:hanging="300"/>
       </w:pPr>
     </w:lvl>
-    <w:lvl w:ilvl="1" w:tplc="39F0074E">
+    <w:lvl w:ilvl="1" w:tplc="CA164944">
       <w:numFmt w:val="decimal"/>
       <w:lvlText w:val=""/>
       <w:lvlJc w:val="left"/>
     </w:lvl>
-    <w:lvl w:ilvl="2" w:tplc="859ADF94">
+    <w:lvl w:ilvl="2" w:tplc="3AE6E1BA">
       <w:numFmt w:val="decimal"/>
       <w:lvlText w:val=""/>
       <w:lvlJc w:val="left"/>
     </w:lvl>
-    <w:lvl w:ilvl="3" w:tplc="D270966C">
+    <w:lvl w:ilvl="3" w:tplc="58866BEA">
       <w:numFmt w:val="decimal"/>
       <w:lvlText w:val=""/>
       <w:lvlJc w:val="left"/>
     </w:lvl>
-    <w:lvl w:ilvl="4" w:tplc="5752575C">
+    <w:lvl w:ilvl="4" w:tplc="6630D9BA">
       <w:numFmt w:val="decimal"/>
       <w:lvlText w:val=""/>
       <w:lvlJc w:val="left"/>
     </w:lvl>
-    <w:lvl w:ilvl="5" w:tplc="D424E160">
+    <w:lvl w:ilvl="5" w:tplc="2D740054">
       <w:numFmt w:val="decimal"/>
       <w:lvlText w:val=""/>
       <w:lvlJc w:val="left"/>
     </w:lvl>
-    <w:lvl w:ilvl="6" w:tplc="B86A66C2">
+    <w:lvl w:ilvl="6" w:tplc="E6BC46F6">
       <w:numFmt w:val="decimal"/>
       <w:lvlText w:val=""/>
       <w:lvlJc w:val="left"/>
     </w:lvl>
-    <w:lvl w:ilvl="7" w:tplc="7FF8F2C6">
+    <w:lvl w:ilvl="7" w:tplc="97948370">
       <w:numFmt w:val="decimal"/>
       <w:lvlText w:val=""/>
       <w:lvlJc w:val="left"/>
     </w:lvl>
-    <w:lvl w:ilvl="8" w:tplc="37CA8B7A">
+    <w:lvl w:ilvl="8" w:tplc="CF9886BE">
       <w:numFmt w:val="decimal"/>
       <w:lvlText w:val=""/>
       <w:lvlJc w:val="left"/>
     </w:lvl>
   </w:abstractNum>
-  <w:abstractNum w:abstractNumId="1" w15:restartNumberingAfterBreak="0">
-    <w:nsid w:val="1EA6701B"/>
+  <w:abstractNum w:abstractNumId="2" w15:restartNumberingAfterBreak="0">
+    <w:nsid w:val="2FDC510C"/>
     <w:multiLevelType w:val="hybridMultilevel"/>
-    <w:tmpl w:val="A9046FAA"/>
-    <w:lvl w:ilvl="0" w:tplc="4ABA26E6" w:tentative="1">
+    <w:tmpl w:val="07A0BF6E"/>
+    <w:lvl w:ilvl="0" w:tplc="53984A58">
       <w:start w:val="1"/>
-      <w:numFmt w:val="bullet"/>
-      <w:lvlText w:val="●"/>
+      <w:numFmt w:val="decimal"/>
+      <w:lvlText w:val="%1."/>
       <w:lvlJc w:val="left"/>
       <w:pPr>
-        <w:ind w:left="720" w:hanging="360"/>
+        <w:ind w:left="400" w:hanging="300"/>
       </w:pPr>
     </w:lvl>
-    <w:lvl w:ilvl="1" w:tplc="8E6AEBEA" w:tentative="1">
-      <w:start w:val="1"/>
-      <w:numFmt w:val="bullet"/>
-      <w:lvlText w:val="○"/>
-      <w:lvlJc w:val="left"/>
-      <w:pPr>
-        <w:ind w:left="1440" w:hanging="360"/>
-      </w:pPr>
-    </w:lvl>
-    <w:lvl w:ilvl="2" w:tplc="F25C372E" w:tentative="1">
-      <w:start w:val="1"/>
-      <w:numFmt w:val="bullet"/>
-      <w:lvlText w:val="■"/>
-      <w:lvlJc w:val="left"/>
-      <w:pPr>
-        <w:ind w:left="2160" w:hanging="360"/>
-      </w:pPr>
-    </w:lvl>
-    <w:lvl w:ilvl="3" w:tplc="517088D0" w:tentative="1">
-      <w:start w:val="1"/>
-      <w:numFmt w:val="bullet"/>
-      <w:lvlText w:val="●"/>
-      <w:lvlJc w:val="left"/>
-      <w:pPr>
-        <w:ind w:left="2880" w:hanging="360"/>
-      </w:pPr>
-    </w:lvl>
-    <w:lvl w:ilvl="4" w:tplc="22F09354" w:tentative="1">
-      <w:start w:val="1"/>
-      <w:numFmt w:val="bullet"/>
-      <w:lvlText w:val="○"/>
-      <w:lvlJc w:val="left"/>
-      <w:pPr>
-        <w:ind w:left="3600" w:hanging="360"/>
-      </w:pPr>
-    </w:lvl>
-    <w:lvl w:ilvl="5" w:tplc="8B56F8AC" w:tentative="1">
-      <w:start w:val="1"/>
-      <w:numFmt w:val="bullet"/>
-      <w:lvlText w:val="■"/>
-      <w:lvlJc w:val="left"/>
-      <w:pPr>
-        <w:ind w:left="4320" w:hanging="360"/>
-      </w:pPr>
-    </w:lvl>
-    <w:lvl w:ilvl="6" w:tplc="8564B770" w:tentative="1">
-      <w:start w:val="1"/>
-      <w:numFmt w:val="bullet"/>
-      <w:lvlText w:val="●"/>
-      <w:lvlJc w:val="left"/>
-      <w:pPr>
-        <w:ind w:left="5040" w:hanging="360"/>
-      </w:pPr>
-    </w:lvl>
-    <w:lvl w:ilvl="7" w:tplc="CA165F46" w:tentative="1">
-      <w:start w:val="1"/>
-      <w:numFmt w:val="bullet"/>
-      <w:lvlText w:val="●"/>
-      <w:lvlJc w:val="left"/>
-      <w:pPr>
-        <w:ind w:left="5760" w:hanging="360"/>
-      </w:pPr>
-    </w:lvl>
-    <w:lvl w:ilvl="8" w:tplc="580E747E" w:tentative="1">
-      <w:start w:val="1"/>
-      <w:numFmt w:val="bullet"/>
-      <w:lvlText w:val="●"/>
-      <w:lvlJc w:val="left"/>
-      <w:pPr>
-        <w:ind w:left="6480" w:hanging="360"/>
-      </w:pPr>
-    </w:lvl>
-  </w:abstractNum>
-  <w:abstractNum w:abstractNumId="2" w15:restartNumberingAfterBreak="0">
-    <w:nsid w:val="3D37387A"/>
-    <w:multiLevelType w:val="hybridMultilevel"/>
-    <w:tmpl w:val="D8F003BC"/>
-    <w:lvl w:ilvl="0" w:tplc="B8ECC244">
-      <w:start w:val="1"/>
-      <w:numFmt w:val="bullet"/>
-      <w:lvlText w:val="•"/>
-      <w:lvlJc w:val="left"/>
-      <w:pPr>
-        <w:ind w:left="400" w:hanging="260"/>
-      </w:pPr>
-    </w:lvl>
-    <w:lvl w:ilvl="1" w:tplc="5B984FC6">
+    <w:lvl w:ilvl="1" w:tplc="8C6A56E4">
       <w:numFmt w:val="decimal"/>
       <w:lvlText w:val=""/>
       <w:lvlJc w:val="left"/>
     </w:lvl>
-    <w:lvl w:ilvl="2" w:tplc="E1E6C21C">
+    <w:lvl w:ilvl="2" w:tplc="F6C2F298">
       <w:numFmt w:val="decimal"/>
       <w:lvlText w:val=""/>
       <w:lvlJc w:val="left"/>
     </w:lvl>
-    <w:lvl w:ilvl="3" w:tplc="64E2BF26">
+    <w:lvl w:ilvl="3" w:tplc="6E9A7A68">
       <w:numFmt w:val="decimal"/>
       <w:lvlText w:val=""/>
       <w:lvlJc w:val="left"/>
     </w:lvl>
-    <w:lvl w:ilvl="4" w:tplc="A8486ADE">
+    <w:lvl w:ilvl="4" w:tplc="67F0F916">
       <w:numFmt w:val="decimal"/>
       <w:lvlText w:val=""/>
       <w:lvlJc w:val="left"/>
     </w:lvl>
-    <w:lvl w:ilvl="5" w:tplc="3A02D5CC">
+    <w:lvl w:ilvl="5" w:tplc="851266AC">
       <w:numFmt w:val="decimal"/>
       <w:lvlText w:val=""/>
       <w:lvlJc w:val="left"/>
     </w:lvl>
-    <w:lvl w:ilvl="6" w:tplc="6C1CD2C0">
+    <w:lvl w:ilvl="6" w:tplc="546081EC">
       <w:numFmt w:val="decimal"/>
       <w:lvlText w:val=""/>
       <w:lvlJc w:val="left"/>
     </w:lvl>
-    <w:lvl w:ilvl="7" w:tplc="8892B236">
+    <w:lvl w:ilvl="7" w:tplc="B90A4332">
       <w:numFmt w:val="decimal"/>
       <w:lvlText w:val=""/>
       <w:lvlJc w:val="left"/>
     </w:lvl>
-    <w:lvl w:ilvl="8" w:tplc="719C06B2">
+    <w:lvl w:ilvl="8" w:tplc="260C2232">
       <w:numFmt w:val="decimal"/>
       <w:lvlText w:val=""/>
       <w:lvlJc w:val="left"/>
     </w:lvl>
   </w:abstractNum>
   <w:abstractNum w:abstractNumId="3" w15:restartNumberingAfterBreak="0">
-    <w:nsid w:val="4CDC5FB7"/>
+    <w:nsid w:val="3C3E570E"/>
     <w:multiLevelType w:val="hybridMultilevel"/>
-    <w:tmpl w:val="83A0F98E"/>
-    <w:lvl w:ilvl="0" w:tplc="57F24C7E">
+    <w:tmpl w:val="E6669868"/>
+    <w:lvl w:ilvl="0" w:tplc="74627850">
       <w:start w:val="1"/>
-      <w:numFmt w:val="decimal"/>
-      <w:lvlText w:val="%1."/>
+      <w:numFmt w:val="bullet"/>
+      <w:lvlText w:val="•"/>
       <w:lvlJc w:val="left"/>
       <w:pPr>
-        <w:ind w:left="400" w:hanging="300"/>
+        <w:ind w:left="400" w:hanging="260"/>
       </w:pPr>
     </w:lvl>
-    <w:lvl w:ilvl="1" w:tplc="E304A72E">
+    <w:lvl w:ilvl="1" w:tplc="07EE7D24">
       <w:numFmt w:val="decimal"/>
       <w:lvlText w:val=""/>
       <w:lvlJc w:val="left"/>
     </w:lvl>
-    <w:lvl w:ilvl="2" w:tplc="31DC3A1E">
+    <w:lvl w:ilvl="2" w:tplc="5E622FB2">
       <w:numFmt w:val="decimal"/>
       <w:lvlText w:val=""/>
       <w:lvlJc w:val="left"/>
     </w:lvl>
-    <w:lvl w:ilvl="3" w:tplc="0E369D14">
+    <w:lvl w:ilvl="3" w:tplc="3F82B46E">
       <w:numFmt w:val="decimal"/>
       <w:lvlText w:val=""/>
       <w:lvlJc w:val="left"/>
     </w:lvl>
-    <w:lvl w:ilvl="4" w:tplc="8180B25E">
+    <w:lvl w:ilvl="4" w:tplc="86E69BB2">
       <w:numFmt w:val="decimal"/>
       <w:lvlText w:val=""/>
       <w:lvlJc w:val="left"/>
     </w:lvl>
-    <w:lvl w:ilvl="5" w:tplc="5DB0907C">
+    <w:lvl w:ilvl="5" w:tplc="6178C94C">
       <w:numFmt w:val="decimal"/>
       <w:lvlText w:val=""/>
       <w:lvlJc w:val="left"/>
     </w:lvl>
-    <w:lvl w:ilvl="6" w:tplc="5A40A53E">
+    <w:lvl w:ilvl="6" w:tplc="09E84F66">
       <w:numFmt w:val="decimal"/>
       <w:lvlText w:val=""/>
       <w:lvlJc w:val="left"/>
     </w:lvl>
-    <w:lvl w:ilvl="7" w:tplc="C98EF094">
+    <w:lvl w:ilvl="7" w:tplc="4E9ADDFE">
       <w:numFmt w:val="decimal"/>
       <w:lvlText w:val=""/>
       <w:lvlJc w:val="left"/>
     </w:lvl>
-    <w:lvl w:ilvl="8" w:tplc="E572F39C">
+    <w:lvl w:ilvl="8" w:tplc="E5520828">
       <w:numFmt w:val="decimal"/>
       <w:lvlText w:val=""/>
       <w:lvlJc w:val="left"/>
     </w:lvl>
   </w:abstractNum>
   <w:abstractNum w:abstractNumId="4" w15:restartNumberingAfterBreak="0">
-    <w:nsid w:val="53B87772"/>
+    <w:nsid w:val="65861685"/>
     <w:multiLevelType w:val="hybridMultilevel"/>
-    <w:tmpl w:val="1FCAE84E"/>
-    <w:lvl w:ilvl="0" w:tplc="AE30E92E">
+    <w:tmpl w:val="355453BE"/>
+    <w:lvl w:ilvl="0" w:tplc="18C0D6C2">
       <w:start w:val="1"/>
       <w:numFmt w:val="decimal"/>
       <w:lvlText w:val="%1."/>
@@ -21610,73 +21632,73 @@
         <w:ind w:left="400" w:hanging="300"/>
       </w:pPr>
     </w:lvl>
-    <w:lvl w:ilvl="1" w:tplc="3798381E">
+    <w:lvl w:ilvl="1" w:tplc="7CAE954A">
       <w:numFmt w:val="decimal"/>
       <w:lvlText w:val=""/>
       <w:lvlJc w:val="left"/>
     </w:lvl>
-    <w:lvl w:ilvl="2" w:tplc="4DAC5020">
+    <w:lvl w:ilvl="2" w:tplc="BEBEF7E6">
       <w:numFmt w:val="decimal"/>
       <w:lvlText w:val=""/>
       <w:lvlJc w:val="left"/>
     </w:lvl>
-    <w:lvl w:ilvl="3" w:tplc="57AE1C46">
+    <w:lvl w:ilvl="3" w:tplc="D1EA8D54">
       <w:numFmt w:val="decimal"/>
       <w:lvlText w:val=""/>
       <w:lvlJc w:val="left"/>
     </w:lvl>
-    <w:lvl w:ilvl="4" w:tplc="12B278D6">
+    <w:lvl w:ilvl="4" w:tplc="4A644A12">
       <w:numFmt w:val="decimal"/>
       <w:lvlText w:val=""/>
       <w:lvlJc w:val="left"/>
     </w:lvl>
-    <w:lvl w:ilvl="5" w:tplc="4D008E92">
+    <w:lvl w:ilvl="5" w:tplc="F83CA45E">
       <w:numFmt w:val="decimal"/>
       <w:lvlText w:val=""/>
       <w:lvlJc w:val="left"/>
     </w:lvl>
-    <w:lvl w:ilvl="6" w:tplc="0BC84664">
+    <w:lvl w:ilvl="6" w:tplc="5A26CF9A">
       <w:numFmt w:val="decimal"/>
       <w:lvlText w:val=""/>
       <w:lvlJc w:val="left"/>
     </w:lvl>
-    <w:lvl w:ilvl="7" w:tplc="C4FA2BE8">
+    <w:lvl w:ilvl="7" w:tplc="D91A35AE">
       <w:numFmt w:val="decimal"/>
       <w:lvlText w:val=""/>
       <w:lvlJc w:val="left"/>
     </w:lvl>
-    <w:lvl w:ilvl="8" w:tplc="C7048C56">
+    <w:lvl w:ilvl="8" w:tplc="CFB87638">
       <w:numFmt w:val="decimal"/>
       <w:lvlText w:val=""/>
       <w:lvlJc w:val="left"/>
     </w:lvl>
   </w:abstractNum>
-  <w:num w:numId="1" w16cid:durableId="1852068860">
+  <w:num w:numId="1" w16cid:durableId="1789078505">
+    <w:abstractNumId w:val="0"/>
+    <w:lvlOverride w:ilvl="0">
+      <w:startOverride w:val="1"/>
+    </w:lvlOverride>
+  </w:num>
+  <w:num w:numId="2" w16cid:durableId="282269251">
     <w:abstractNumId w:val="1"/>
     <w:lvlOverride w:ilvl="0">
       <w:startOverride w:val="1"/>
     </w:lvlOverride>
   </w:num>
-  <w:num w:numId="2" w16cid:durableId="1045443608">
+  <w:num w:numId="3" w16cid:durableId="73548876">
     <w:abstractNumId w:val="3"/>
     <w:lvlOverride w:ilvl="0">
       <w:startOverride w:val="1"/>
     </w:lvlOverride>
   </w:num>
-  <w:num w:numId="3" w16cid:durableId="1604875717">
-    <w:abstractNumId w:val="2"/>
-    <w:lvlOverride w:ilvl="0">
-      <w:startOverride w:val="1"/>
-    </w:lvlOverride>
-  </w:num>
-  <w:num w:numId="4" w16cid:durableId="1994137476">
+  <w:num w:numId="4" w16cid:durableId="1435980633">
     <w:abstractNumId w:val="4"/>
     <w:lvlOverride w:ilvl="0">
       <w:startOverride w:val="1"/>
     </w:lvlOverride>
   </w:num>
-  <w:num w:numId="5" w16cid:durableId="1662002037">
-    <w:abstractNumId w:val="0"/>
+  <w:num w:numId="5" w16cid:durableId="809712489">
+    <w:abstractNumId w:val="2"/>
     <w:lvlOverride w:ilvl="0">
       <w:startOverride w:val="1"/>
     </w:lvlOverride>
@@ -22316,7 +22338,7 @@
     <w:autoRedefine/>
     <w:uiPriority w:val="39"/>
     <w:unhideWhenUsed/>
-    <w:rsid w:val="00F06F1D"/>
+    <w:rsid w:val="00767DE4"/>
     <w:pPr>
       <w:spacing w:after="100"/>
     </w:pPr>
@@ -22328,7 +22350,7 @@
     <w:autoRedefine/>
     <w:uiPriority w:val="39"/>
     <w:unhideWhenUsed/>
-    <w:rsid w:val="00F06F1D"/>
+    <w:rsid w:val="00767DE4"/>
     <w:pPr>
       <w:spacing w:after="100"/>
       <w:ind w:left="210"/>

</xml_diff>

<commit_message>
Add the ResNet18 diagram and the linear head explanation to the study guide
</commit_message>
<xml_diff>
--- a/docs/oral_study_guide.docx
+++ b/docs/oral_study_guide.docx
@@ -93,7 +93,7 @@
     <w:sdt>
       <w:sdtPr>
         <w:alias w:val="Contents"/>
-        <w:id w:val="686094849"/>
+        <w:id w:val="-2012597017"/>
       </w:sdtPr>
       <w:sdtEndPr/>
       <w:sdtContent>
@@ -116,7 +116,7 @@
           <w:r>
             <w:fldChar w:fldCharType="separate"/>
           </w:r>
-          <w:hyperlink w:anchor="_Toc243485455" w:history="1">
+          <w:hyperlink w:anchor="_Toc243488380" w:history="1">
             <w:r>
               <w:rPr>
                 <w:rStyle w:val="Lienhypertexte"/>
@@ -140,7 +140,7 @@
               <w:rPr>
                 <w:noProof/>
               </w:rPr>
-              <w:instrText xml:space="preserve"> PAGEREF _Toc243485455 \h </w:instrText>
+              <w:instrText xml:space="preserve"> PAGEREF _Toc243488380 \h </w:instrText>
             </w:r>
             <w:r>
               <w:rPr>
@@ -177,7 +177,7 @@
               <w:noProof/>
             </w:rPr>
           </w:pPr>
-          <w:hyperlink w:anchor="_Toc243485456" w:history="1">
+          <w:hyperlink w:anchor="_Toc243488381" w:history="1">
             <w:r>
               <w:rPr>
                 <w:rStyle w:val="Lienhypertexte"/>
@@ -201,7 +201,7 @@
               <w:rPr>
                 <w:noProof/>
               </w:rPr>
-              <w:instrText xml:space="preserve"> PAGEREF _Toc243485456 \h </w:instrText>
+              <w:instrText xml:space="preserve"> PAGEREF _Toc243488381 \h </w:instrText>
             </w:r>
             <w:r>
               <w:rPr>
@@ -238,7 +238,7 @@
               <w:noProof/>
             </w:rPr>
           </w:pPr>
-          <w:hyperlink w:anchor="_Toc243485457" w:history="1">
+          <w:hyperlink w:anchor="_Toc243488382" w:history="1">
             <w:r>
               <w:rPr>
                 <w:rStyle w:val="Lienhypertexte"/>
@@ -262,7 +262,7 @@
               <w:rPr>
                 <w:noProof/>
               </w:rPr>
-              <w:instrText xml:space="preserve"> PAGEREF _Toc243485457 \h </w:instrText>
+              <w:instrText xml:space="preserve"> PAGEREF _Toc243488382 \h </w:instrText>
             </w:r>
             <w:r>
               <w:rPr>
@@ -299,7 +299,7 @@
               <w:noProof/>
             </w:rPr>
           </w:pPr>
-          <w:hyperlink w:anchor="_Toc243485458" w:history="1">
+          <w:hyperlink w:anchor="_Toc243488383" w:history="1">
             <w:r>
               <w:rPr>
                 <w:rStyle w:val="Lienhypertexte"/>
@@ -323,7 +323,7 @@
               <w:rPr>
                 <w:noProof/>
               </w:rPr>
-              <w:instrText xml:space="preserve"> PAGEREF _Toc243485458 \h </w:instrText>
+              <w:instrText xml:space="preserve"> PAGEREF _Toc243488383 \h </w:instrText>
             </w:r>
             <w:r>
               <w:rPr>
@@ -360,7 +360,7 @@
               <w:noProof/>
             </w:rPr>
           </w:pPr>
-          <w:hyperlink w:anchor="_Toc243485459" w:history="1">
+          <w:hyperlink w:anchor="_Toc243488384" w:history="1">
             <w:r>
               <w:rPr>
                 <w:rStyle w:val="Lienhypertexte"/>
@@ -384,7 +384,7 @@
               <w:rPr>
                 <w:noProof/>
               </w:rPr>
-              <w:instrText xml:space="preserve"> PAGEREF _Toc243485459 \h </w:instrText>
+              <w:instrText xml:space="preserve"> PAGEREF _Toc243488384 \h </w:instrText>
             </w:r>
             <w:r>
               <w:rPr>
@@ -421,7 +421,7 @@
               <w:noProof/>
             </w:rPr>
           </w:pPr>
-          <w:hyperlink w:anchor="_Toc243485460" w:history="1">
+          <w:hyperlink w:anchor="_Toc243488385" w:history="1">
             <w:r>
               <w:rPr>
                 <w:rStyle w:val="Lienhypertexte"/>
@@ -445,7 +445,7 @@
               <w:rPr>
                 <w:noProof/>
               </w:rPr>
-              <w:instrText xml:space="preserve"> PAGEREF _Toc243485460 \h </w:instrText>
+              <w:instrText xml:space="preserve"> PAGEREF _Toc243488385 \h </w:instrText>
             </w:r>
             <w:r>
               <w:rPr>
@@ -482,7 +482,7 @@
               <w:noProof/>
             </w:rPr>
           </w:pPr>
-          <w:hyperlink w:anchor="_Toc243485461" w:history="1">
+          <w:hyperlink w:anchor="_Toc243488386" w:history="1">
             <w:r>
               <w:rPr>
                 <w:rStyle w:val="Lienhypertexte"/>
@@ -506,7 +506,7 @@
               <w:rPr>
                 <w:noProof/>
               </w:rPr>
-              <w:instrText xml:space="preserve"> PAGEREF _Toc243485461 \h </w:instrText>
+              <w:instrText xml:space="preserve"> PAGEREF _Toc243488386 \h </w:instrText>
             </w:r>
             <w:r>
               <w:rPr>
@@ -543,7 +543,7 @@
               <w:noProof/>
             </w:rPr>
           </w:pPr>
-          <w:hyperlink w:anchor="_Toc243485462" w:history="1">
+          <w:hyperlink w:anchor="_Toc243488387" w:history="1">
             <w:r>
               <w:rPr>
                 <w:rStyle w:val="Lienhypertexte"/>
@@ -567,7 +567,7 @@
               <w:rPr>
                 <w:noProof/>
               </w:rPr>
-              <w:instrText xml:space="preserve"> PAGEREF _Toc243485462 \h </w:instrText>
+              <w:instrText xml:space="preserve"> PAGEREF _Toc243488387 \h </w:instrText>
             </w:r>
             <w:r>
               <w:rPr>
@@ -604,7 +604,7 @@
               <w:noProof/>
             </w:rPr>
           </w:pPr>
-          <w:hyperlink w:anchor="_Toc243485463" w:history="1">
+          <w:hyperlink w:anchor="_Toc243488388" w:history="1">
             <w:r>
               <w:rPr>
                 <w:rStyle w:val="Lienhypertexte"/>
@@ -628,7 +628,7 @@
               <w:rPr>
                 <w:noProof/>
               </w:rPr>
-              <w:instrText xml:space="preserve"> PAGEREF _Toc243485463 \h </w:instrText>
+              <w:instrText xml:space="preserve"> PAGEREF _Toc243488388 \h </w:instrText>
             </w:r>
             <w:r>
               <w:rPr>
@@ -665,7 +665,7 @@
               <w:noProof/>
             </w:rPr>
           </w:pPr>
-          <w:hyperlink w:anchor="_Toc243485464" w:history="1">
+          <w:hyperlink w:anchor="_Toc243488389" w:history="1">
             <w:r>
               <w:rPr>
                 <w:rStyle w:val="Lienhypertexte"/>
@@ -689,7 +689,7 @@
               <w:rPr>
                 <w:noProof/>
               </w:rPr>
-              <w:instrText xml:space="preserve"> PAGEREF _Toc243485464 \h </w:instrText>
+              <w:instrText xml:space="preserve"> PAGEREF _Toc243488389 \h </w:instrText>
             </w:r>
             <w:r>
               <w:rPr>
@@ -726,7 +726,7 @@
               <w:noProof/>
             </w:rPr>
           </w:pPr>
-          <w:hyperlink w:anchor="_Toc243485465" w:history="1">
+          <w:hyperlink w:anchor="_Toc243488390" w:history="1">
             <w:r>
               <w:rPr>
                 <w:rStyle w:val="Lienhypertexte"/>
@@ -750,7 +750,7 @@
               <w:rPr>
                 <w:noProof/>
               </w:rPr>
-              <w:instrText xml:space="preserve"> PAGEREF _Toc243485465 \h </w:instrText>
+              <w:instrText xml:space="preserve"> PAGEREF _Toc243488390 \h </w:instrText>
             </w:r>
             <w:r>
               <w:rPr>
@@ -787,7 +787,7 @@
               <w:noProof/>
             </w:rPr>
           </w:pPr>
-          <w:hyperlink w:anchor="_Toc243485466" w:history="1">
+          <w:hyperlink w:anchor="_Toc243488391" w:history="1">
             <w:r>
               <w:rPr>
                 <w:rStyle w:val="Lienhypertexte"/>
@@ -811,7 +811,7 @@
               <w:rPr>
                 <w:noProof/>
               </w:rPr>
-              <w:instrText xml:space="preserve"> PAGEREF _Toc243485466 \h </w:instrText>
+              <w:instrText xml:space="preserve"> PAGEREF _Toc243488391 \h </w:instrText>
             </w:r>
             <w:r>
               <w:rPr>
@@ -848,7 +848,7 @@
               <w:noProof/>
             </w:rPr>
           </w:pPr>
-          <w:hyperlink w:anchor="_Toc243485467" w:history="1">
+          <w:hyperlink w:anchor="_Toc243488392" w:history="1">
             <w:r>
               <w:rPr>
                 <w:rStyle w:val="Lienhypertexte"/>
@@ -872,7 +872,7 @@
               <w:rPr>
                 <w:noProof/>
               </w:rPr>
-              <w:instrText xml:space="preserve"> PAGEREF _Toc243485467 \h </w:instrText>
+              <w:instrText xml:space="preserve"> PAGEREF _Toc243488392 \h </w:instrText>
             </w:r>
             <w:r>
               <w:rPr>
@@ -909,7 +909,7 @@
               <w:noProof/>
             </w:rPr>
           </w:pPr>
-          <w:hyperlink w:anchor="_Toc243485468" w:history="1">
+          <w:hyperlink w:anchor="_Toc243488393" w:history="1">
             <w:r>
               <w:rPr>
                 <w:rStyle w:val="Lienhypertexte"/>
@@ -933,7 +933,7 @@
               <w:rPr>
                 <w:noProof/>
               </w:rPr>
-              <w:instrText xml:space="preserve"> PAGEREF _Toc243485468 \h </w:instrText>
+              <w:instrText xml:space="preserve"> PAGEREF _Toc243488393 \h </w:instrText>
             </w:r>
             <w:r>
               <w:rPr>
@@ -970,7 +970,7 @@
               <w:noProof/>
             </w:rPr>
           </w:pPr>
-          <w:hyperlink w:anchor="_Toc243485469" w:history="1">
+          <w:hyperlink w:anchor="_Toc243488394" w:history="1">
             <w:r>
               <w:rPr>
                 <w:rStyle w:val="Lienhypertexte"/>
@@ -994,7 +994,7 @@
               <w:rPr>
                 <w:noProof/>
               </w:rPr>
-              <w:instrText xml:space="preserve"> PAGEREF _Toc243485469 \h </w:instrText>
+              <w:instrText xml:space="preserve"> PAGEREF _Toc243488394 \h </w:instrText>
             </w:r>
             <w:r>
               <w:rPr>
@@ -1031,7 +1031,7 @@
               <w:noProof/>
             </w:rPr>
           </w:pPr>
-          <w:hyperlink w:anchor="_Toc243485470" w:history="1">
+          <w:hyperlink w:anchor="_Toc243488395" w:history="1">
             <w:r>
               <w:rPr>
                 <w:rStyle w:val="Lienhypertexte"/>
@@ -1055,7 +1055,7 @@
               <w:rPr>
                 <w:noProof/>
               </w:rPr>
-              <w:instrText xml:space="preserve"> PAGEREF _Toc243485470 \h </w:instrText>
+              <w:instrText xml:space="preserve"> PAGEREF _Toc243488395 \h </w:instrText>
             </w:r>
             <w:r>
               <w:rPr>
@@ -1092,7 +1092,7 @@
               <w:noProof/>
             </w:rPr>
           </w:pPr>
-          <w:hyperlink w:anchor="_Toc243485471" w:history="1">
+          <w:hyperlink w:anchor="_Toc243488396" w:history="1">
             <w:r>
               <w:rPr>
                 <w:rStyle w:val="Lienhypertexte"/>
@@ -1116,7 +1116,7 @@
               <w:rPr>
                 <w:noProof/>
               </w:rPr>
-              <w:instrText xml:space="preserve"> PAGEREF _Toc243485471 \h </w:instrText>
+              <w:instrText xml:space="preserve"> PAGEREF _Toc243488396 \h </w:instrText>
             </w:r>
             <w:r>
               <w:rPr>
@@ -1153,7 +1153,7 @@
               <w:noProof/>
             </w:rPr>
           </w:pPr>
-          <w:hyperlink w:anchor="_Toc243485472" w:history="1">
+          <w:hyperlink w:anchor="_Toc243488397" w:history="1">
             <w:r>
               <w:rPr>
                 <w:rStyle w:val="Lienhypertexte"/>
@@ -1177,7 +1177,7 @@
               <w:rPr>
                 <w:noProof/>
               </w:rPr>
-              <w:instrText xml:space="preserve"> PAGEREF _Toc243485472 \h </w:instrText>
+              <w:instrText xml:space="preserve"> PAGEREF _Toc243488397 \h </w:instrText>
             </w:r>
             <w:r>
               <w:rPr>
@@ -1214,7 +1214,7 @@
               <w:noProof/>
             </w:rPr>
           </w:pPr>
-          <w:hyperlink w:anchor="_Toc243485473" w:history="1">
+          <w:hyperlink w:anchor="_Toc243488398" w:history="1">
             <w:r>
               <w:rPr>
                 <w:rStyle w:val="Lienhypertexte"/>
@@ -1238,7 +1238,7 @@
               <w:rPr>
                 <w:noProof/>
               </w:rPr>
-              <w:instrText xml:space="preserve"> PAGEREF _Toc243485473 \h </w:instrText>
+              <w:instrText xml:space="preserve"> PAGEREF _Toc243488398 \h </w:instrText>
             </w:r>
             <w:r>
               <w:rPr>
@@ -1275,7 +1275,7 @@
               <w:noProof/>
             </w:rPr>
           </w:pPr>
-          <w:hyperlink w:anchor="_Toc243485474" w:history="1">
+          <w:hyperlink w:anchor="_Toc243488399" w:history="1">
             <w:r>
               <w:rPr>
                 <w:rStyle w:val="Lienhypertexte"/>
@@ -1299,7 +1299,7 @@
               <w:rPr>
                 <w:noProof/>
               </w:rPr>
-              <w:instrText xml:space="preserve"> PAGEREF _Toc243485474 \h </w:instrText>
+              <w:instrText xml:space="preserve"> PAGEREF _Toc243488399 \h </w:instrText>
             </w:r>
             <w:r>
               <w:rPr>
@@ -1336,7 +1336,7 @@
               <w:noProof/>
             </w:rPr>
           </w:pPr>
-          <w:hyperlink w:anchor="_Toc243485475" w:history="1">
+          <w:hyperlink w:anchor="_Toc243488400" w:history="1">
             <w:r>
               <w:rPr>
                 <w:rStyle w:val="Lienhypertexte"/>
@@ -1360,7 +1360,7 @@
               <w:rPr>
                 <w:noProof/>
               </w:rPr>
-              <w:instrText xml:space="preserve"> PAGEREF _Toc243485475 \h </w:instrText>
+              <w:instrText xml:space="preserve"> PAGEREF _Toc243488400 \h </w:instrText>
             </w:r>
             <w:r>
               <w:rPr>
@@ -1397,7 +1397,7 @@
               <w:noProof/>
             </w:rPr>
           </w:pPr>
-          <w:hyperlink w:anchor="_Toc243485476" w:history="1">
+          <w:hyperlink w:anchor="_Toc243488401" w:history="1">
             <w:r>
               <w:rPr>
                 <w:rStyle w:val="Lienhypertexte"/>
@@ -1421,7 +1421,7 @@
               <w:rPr>
                 <w:noProof/>
               </w:rPr>
-              <w:instrText xml:space="preserve"> PAGEREF _Toc243485476 \h </w:instrText>
+              <w:instrText xml:space="preserve"> PAGEREF _Toc243488401 \h </w:instrText>
             </w:r>
             <w:r>
               <w:rPr>
@@ -1458,7 +1458,7 @@
               <w:noProof/>
             </w:rPr>
           </w:pPr>
-          <w:hyperlink w:anchor="_Toc243485477" w:history="1">
+          <w:hyperlink w:anchor="_Toc243488402" w:history="1">
             <w:r>
               <w:rPr>
                 <w:rStyle w:val="Lienhypertexte"/>
@@ -1482,7 +1482,7 @@
               <w:rPr>
                 <w:noProof/>
               </w:rPr>
-              <w:instrText xml:space="preserve"> PAGEREF _Toc243485477 \h </w:instrText>
+              <w:instrText xml:space="preserve"> PAGEREF _Toc243488402 \h </w:instrText>
             </w:r>
             <w:r>
               <w:rPr>
@@ -1519,7 +1519,7 @@
               <w:noProof/>
             </w:rPr>
           </w:pPr>
-          <w:hyperlink w:anchor="_Toc243485478" w:history="1">
+          <w:hyperlink w:anchor="_Toc243488403" w:history="1">
             <w:r>
               <w:rPr>
                 <w:rStyle w:val="Lienhypertexte"/>
@@ -1543,7 +1543,7 @@
               <w:rPr>
                 <w:noProof/>
               </w:rPr>
-              <w:instrText xml:space="preserve"> PAGEREF _Toc243485478 \h </w:instrText>
+              <w:instrText xml:space="preserve"> PAGEREF _Toc243488403 \h </w:instrText>
             </w:r>
             <w:r>
               <w:rPr>
@@ -1580,7 +1580,7 @@
               <w:noProof/>
             </w:rPr>
           </w:pPr>
-          <w:hyperlink w:anchor="_Toc243485479" w:history="1">
+          <w:hyperlink w:anchor="_Toc243488404" w:history="1">
             <w:r>
               <w:rPr>
                 <w:rStyle w:val="Lienhypertexte"/>
@@ -1604,7 +1604,7 @@
               <w:rPr>
                 <w:noProof/>
               </w:rPr>
-              <w:instrText xml:space="preserve"> PAGEREF _Toc243485479 \h </w:instrText>
+              <w:instrText xml:space="preserve"> PAGEREF _Toc243488404 \h </w:instrText>
             </w:r>
             <w:r>
               <w:rPr>
@@ -1641,7 +1641,7 @@
               <w:noProof/>
             </w:rPr>
           </w:pPr>
-          <w:hyperlink w:anchor="_Toc243485480" w:history="1">
+          <w:hyperlink w:anchor="_Toc243488405" w:history="1">
             <w:r>
               <w:rPr>
                 <w:rStyle w:val="Lienhypertexte"/>
@@ -1665,7 +1665,7 @@
               <w:rPr>
                 <w:noProof/>
               </w:rPr>
-              <w:instrText xml:space="preserve"> PAGEREF _Toc243485480 \h </w:instrText>
+              <w:instrText xml:space="preserve"> PAGEREF _Toc243488405 \h </w:instrText>
             </w:r>
             <w:r>
               <w:rPr>
@@ -1702,7 +1702,7 @@
               <w:noProof/>
             </w:rPr>
           </w:pPr>
-          <w:hyperlink w:anchor="_Toc243485481" w:history="1">
+          <w:hyperlink w:anchor="_Toc243488406" w:history="1">
             <w:r>
               <w:rPr>
                 <w:rStyle w:val="Lienhypertexte"/>
@@ -1726,7 +1726,7 @@
               <w:rPr>
                 <w:noProof/>
               </w:rPr>
-              <w:instrText xml:space="preserve"> PAGEREF _Toc243485481 \h </w:instrText>
+              <w:instrText xml:space="preserve"> PAGEREF _Toc243488406 \h </w:instrText>
             </w:r>
             <w:r>
               <w:rPr>
@@ -1763,7 +1763,7 @@
               <w:noProof/>
             </w:rPr>
           </w:pPr>
-          <w:hyperlink w:anchor="_Toc243485482" w:history="1">
+          <w:hyperlink w:anchor="_Toc243488407" w:history="1">
             <w:r>
               <w:rPr>
                 <w:rStyle w:val="Lienhypertexte"/>
@@ -1787,7 +1787,7 @@
               <w:rPr>
                 <w:noProof/>
               </w:rPr>
-              <w:instrText xml:space="preserve"> PAGEREF _Toc243485482 \h </w:instrText>
+              <w:instrText xml:space="preserve"> PAGEREF _Toc243488407 \h </w:instrText>
             </w:r>
             <w:r>
               <w:rPr>
@@ -1824,7 +1824,7 @@
               <w:noProof/>
             </w:rPr>
           </w:pPr>
-          <w:hyperlink w:anchor="_Toc243485483" w:history="1">
+          <w:hyperlink w:anchor="_Toc243488408" w:history="1">
             <w:r>
               <w:rPr>
                 <w:rStyle w:val="Lienhypertexte"/>
@@ -1848,7 +1848,7 @@
               <w:rPr>
                 <w:noProof/>
               </w:rPr>
-              <w:instrText xml:space="preserve"> PAGEREF _Toc243485483 \h </w:instrText>
+              <w:instrText xml:space="preserve"> PAGEREF _Toc243488408 \h </w:instrText>
             </w:r>
             <w:r>
               <w:rPr>
@@ -1885,7 +1885,7 @@
               <w:noProof/>
             </w:rPr>
           </w:pPr>
-          <w:hyperlink w:anchor="_Toc243485484" w:history="1">
+          <w:hyperlink w:anchor="_Toc243488409" w:history="1">
             <w:r>
               <w:rPr>
                 <w:rStyle w:val="Lienhypertexte"/>
@@ -1909,7 +1909,7 @@
               <w:rPr>
                 <w:noProof/>
               </w:rPr>
-              <w:instrText xml:space="preserve"> PAGEREF _Toc243485484 \h </w:instrText>
+              <w:instrText xml:space="preserve"> PAGEREF _Toc243488409 \h </w:instrText>
             </w:r>
             <w:r>
               <w:rPr>
@@ -1946,7 +1946,7 @@
               <w:noProof/>
             </w:rPr>
           </w:pPr>
-          <w:hyperlink w:anchor="_Toc243485485" w:history="1">
+          <w:hyperlink w:anchor="_Toc243488410" w:history="1">
             <w:r>
               <w:rPr>
                 <w:rStyle w:val="Lienhypertexte"/>
@@ -1970,7 +1970,7 @@
               <w:rPr>
                 <w:noProof/>
               </w:rPr>
-              <w:instrText xml:space="preserve"> PAGEREF _Toc243485485 \h </w:instrText>
+              <w:instrText xml:space="preserve"> PAGEREF _Toc243488410 \h </w:instrText>
             </w:r>
             <w:r>
               <w:rPr>
@@ -2007,7 +2007,7 @@
               <w:noProof/>
             </w:rPr>
           </w:pPr>
-          <w:hyperlink w:anchor="_Toc243485486" w:history="1">
+          <w:hyperlink w:anchor="_Toc243488411" w:history="1">
             <w:r>
               <w:rPr>
                 <w:rStyle w:val="Lienhypertexte"/>
@@ -2031,7 +2031,7 @@
               <w:rPr>
                 <w:noProof/>
               </w:rPr>
-              <w:instrText xml:space="preserve"> PAGEREF _Toc243485486 \h </w:instrText>
+              <w:instrText xml:space="preserve"> PAGEREF _Toc243488411 \h </w:instrText>
             </w:r>
             <w:r>
               <w:rPr>
@@ -2068,7 +2068,7 @@
               <w:noProof/>
             </w:rPr>
           </w:pPr>
-          <w:hyperlink w:anchor="_Toc243485487" w:history="1">
+          <w:hyperlink w:anchor="_Toc243488412" w:history="1">
             <w:r>
               <w:rPr>
                 <w:rStyle w:val="Lienhypertexte"/>
@@ -2092,7 +2092,7 @@
               <w:rPr>
                 <w:noProof/>
               </w:rPr>
-              <w:instrText xml:space="preserve"> PAGEREF _Toc243485487 \h </w:instrText>
+              <w:instrText xml:space="preserve"> PAGEREF _Toc243488412 \h </w:instrText>
             </w:r>
             <w:r>
               <w:rPr>
@@ -2129,7 +2129,7 @@
               <w:noProof/>
             </w:rPr>
           </w:pPr>
-          <w:hyperlink w:anchor="_Toc243485488" w:history="1">
+          <w:hyperlink w:anchor="_Toc243488413" w:history="1">
             <w:r>
               <w:rPr>
                 <w:rStyle w:val="Lienhypertexte"/>
@@ -2153,7 +2153,7 @@
               <w:rPr>
                 <w:noProof/>
               </w:rPr>
-              <w:instrText xml:space="preserve"> PAGEREF _Toc243485488 \h </w:instrText>
+              <w:instrText xml:space="preserve"> PAGEREF _Toc243488413 \h </w:instrText>
             </w:r>
             <w:r>
               <w:rPr>
@@ -2190,7 +2190,7 @@
               <w:noProof/>
             </w:rPr>
           </w:pPr>
-          <w:hyperlink w:anchor="_Toc243485489" w:history="1">
+          <w:hyperlink w:anchor="_Toc243488414" w:history="1">
             <w:r>
               <w:rPr>
                 <w:rStyle w:val="Lienhypertexte"/>
@@ -2214,7 +2214,7 @@
               <w:rPr>
                 <w:noProof/>
               </w:rPr>
-              <w:instrText xml:space="preserve"> PAGEREF _Toc243485489 \h </w:instrText>
+              <w:instrText xml:space="preserve"> PAGEREF _Toc243488414 \h </w:instrText>
             </w:r>
             <w:r>
               <w:rPr>
@@ -2251,7 +2251,7 @@
               <w:noProof/>
             </w:rPr>
           </w:pPr>
-          <w:hyperlink w:anchor="_Toc243485490" w:history="1">
+          <w:hyperlink w:anchor="_Toc243488415" w:history="1">
             <w:r>
               <w:rPr>
                 <w:rStyle w:val="Lienhypertexte"/>
@@ -2275,7 +2275,7 @@
               <w:rPr>
                 <w:noProof/>
               </w:rPr>
-              <w:instrText xml:space="preserve"> PAGEREF _Toc243485490 \h </w:instrText>
+              <w:instrText xml:space="preserve"> PAGEREF _Toc243488415 \h </w:instrText>
             </w:r>
             <w:r>
               <w:rPr>
@@ -2312,7 +2312,7 @@
               <w:noProof/>
             </w:rPr>
           </w:pPr>
-          <w:hyperlink w:anchor="_Toc243485491" w:history="1">
+          <w:hyperlink w:anchor="_Toc243488416" w:history="1">
             <w:r>
               <w:rPr>
                 <w:rStyle w:val="Lienhypertexte"/>
@@ -2336,7 +2336,7 @@
               <w:rPr>
                 <w:noProof/>
               </w:rPr>
-              <w:instrText xml:space="preserve"> PAGEREF _Toc243485491 \h </w:instrText>
+              <w:instrText xml:space="preserve"> PAGEREF _Toc243488416 \h </w:instrText>
             </w:r>
             <w:r>
               <w:rPr>
@@ -2373,7 +2373,7 @@
               <w:noProof/>
             </w:rPr>
           </w:pPr>
-          <w:hyperlink w:anchor="_Toc243485492" w:history="1">
+          <w:hyperlink w:anchor="_Toc243488417" w:history="1">
             <w:r>
               <w:rPr>
                 <w:rStyle w:val="Lienhypertexte"/>
@@ -2397,7 +2397,7 @@
               <w:rPr>
                 <w:noProof/>
               </w:rPr>
-              <w:instrText xml:space="preserve"> PAGEREF _Toc243485492 \h </w:instrText>
+              <w:instrText xml:space="preserve"> PAGEREF _Toc243488417 \h </w:instrText>
             </w:r>
             <w:r>
               <w:rPr>
@@ -2434,7 +2434,7 @@
               <w:noProof/>
             </w:rPr>
           </w:pPr>
-          <w:hyperlink w:anchor="_Toc243485493" w:history="1">
+          <w:hyperlink w:anchor="_Toc243488418" w:history="1">
             <w:r>
               <w:rPr>
                 <w:rStyle w:val="Lienhypertexte"/>
@@ -2458,7 +2458,7 @@
               <w:rPr>
                 <w:noProof/>
               </w:rPr>
-              <w:instrText xml:space="preserve"> PAGEREF _Toc243485493 \h </w:instrText>
+              <w:instrText xml:space="preserve"> PAGEREF _Toc243488418 \h </w:instrText>
             </w:r>
             <w:r>
               <w:rPr>
@@ -2475,7 +2475,7 @@
               <w:rPr>
                 <w:noProof/>
               </w:rPr>
-              <w:t>16</w:t>
+              <w:t>17</w:t>
             </w:r>
             <w:r>
               <w:rPr>
@@ -2495,7 +2495,7 @@
               <w:noProof/>
             </w:rPr>
           </w:pPr>
-          <w:hyperlink w:anchor="_Toc243485494" w:history="1">
+          <w:hyperlink w:anchor="_Toc243488419" w:history="1">
             <w:r>
               <w:rPr>
                 <w:rStyle w:val="Lienhypertexte"/>
@@ -2519,7 +2519,7 @@
               <w:rPr>
                 <w:noProof/>
               </w:rPr>
-              <w:instrText xml:space="preserve"> PAGEREF _Toc243485494 \h </w:instrText>
+              <w:instrText xml:space="preserve"> PAGEREF _Toc243488419 \h </w:instrText>
             </w:r>
             <w:r>
               <w:rPr>
@@ -2536,7 +2536,7 @@
               <w:rPr>
                 <w:noProof/>
               </w:rPr>
-              <w:t>16</w:t>
+              <w:t>17</w:t>
             </w:r>
             <w:r>
               <w:rPr>
@@ -2556,7 +2556,7 @@
               <w:noProof/>
             </w:rPr>
           </w:pPr>
-          <w:hyperlink w:anchor="_Toc243485495" w:history="1">
+          <w:hyperlink w:anchor="_Toc243488420" w:history="1">
             <w:r>
               <w:rPr>
                 <w:rStyle w:val="Lienhypertexte"/>
@@ -2580,7 +2580,7 @@
               <w:rPr>
                 <w:noProof/>
               </w:rPr>
-              <w:instrText xml:space="preserve"> PAGEREF _Toc243485495 \h </w:instrText>
+              <w:instrText xml:space="preserve"> PAGEREF _Toc243488420 \h </w:instrText>
             </w:r>
             <w:r>
               <w:rPr>
@@ -2597,7 +2597,7 @@
               <w:rPr>
                 <w:noProof/>
               </w:rPr>
-              <w:t>16</w:t>
+              <w:t>17</w:t>
             </w:r>
             <w:r>
               <w:rPr>
@@ -2617,7 +2617,7 @@
               <w:noProof/>
             </w:rPr>
           </w:pPr>
-          <w:hyperlink w:anchor="_Toc243485496" w:history="1">
+          <w:hyperlink w:anchor="_Toc243488421" w:history="1">
             <w:r>
               <w:rPr>
                 <w:rStyle w:val="Lienhypertexte"/>
@@ -2641,7 +2641,7 @@
               <w:rPr>
                 <w:noProof/>
               </w:rPr>
-              <w:instrText xml:space="preserve"> PAGEREF _Toc243485496 \h </w:instrText>
+              <w:instrText xml:space="preserve"> PAGEREF _Toc243488421 \h </w:instrText>
             </w:r>
             <w:r>
               <w:rPr>
@@ -2678,7 +2678,7 @@
               <w:noProof/>
             </w:rPr>
           </w:pPr>
-          <w:hyperlink w:anchor="_Toc243485497" w:history="1">
+          <w:hyperlink w:anchor="_Toc243488422" w:history="1">
             <w:r>
               <w:rPr>
                 <w:rStyle w:val="Lienhypertexte"/>
@@ -2702,7 +2702,7 @@
               <w:rPr>
                 <w:noProof/>
               </w:rPr>
-              <w:instrText xml:space="preserve"> PAGEREF _Toc243485497 \h </w:instrText>
+              <w:instrText xml:space="preserve"> PAGEREF _Toc243488422 \h </w:instrText>
             </w:r>
             <w:r>
               <w:rPr>
@@ -2719,7 +2719,7 @@
               <w:rPr>
                 <w:noProof/>
               </w:rPr>
-              <w:t>18</w:t>
+              <w:t>19</w:t>
             </w:r>
             <w:r>
               <w:rPr>
@@ -2739,7 +2739,7 @@
               <w:noProof/>
             </w:rPr>
           </w:pPr>
-          <w:hyperlink w:anchor="_Toc243485498" w:history="1">
+          <w:hyperlink w:anchor="_Toc243488423" w:history="1">
             <w:r>
               <w:rPr>
                 <w:rStyle w:val="Lienhypertexte"/>
@@ -2763,7 +2763,7 @@
               <w:rPr>
                 <w:noProof/>
               </w:rPr>
-              <w:instrText xml:space="preserve"> PAGEREF _Toc243485498 \h </w:instrText>
+              <w:instrText xml:space="preserve"> PAGEREF _Toc243488423 \h </w:instrText>
             </w:r>
             <w:r>
               <w:rPr>
@@ -2780,7 +2780,7 @@
               <w:rPr>
                 <w:noProof/>
               </w:rPr>
-              <w:t>18</w:t>
+              <w:t>19</w:t>
             </w:r>
             <w:r>
               <w:rPr>
@@ -2800,7 +2800,7 @@
               <w:noProof/>
             </w:rPr>
           </w:pPr>
-          <w:hyperlink w:anchor="_Toc243485499" w:history="1">
+          <w:hyperlink w:anchor="_Toc243488424" w:history="1">
             <w:r>
               <w:rPr>
                 <w:rStyle w:val="Lienhypertexte"/>
@@ -2824,7 +2824,7 @@
               <w:rPr>
                 <w:noProof/>
               </w:rPr>
-              <w:instrText xml:space="preserve"> PAGEREF _Toc243485499 \h </w:instrText>
+              <w:instrText xml:space="preserve"> PAGEREF _Toc243488424 \h </w:instrText>
             </w:r>
             <w:r>
               <w:rPr>
@@ -2841,7 +2841,7 @@
               <w:rPr>
                 <w:noProof/>
               </w:rPr>
-              <w:t>18</w:t>
+              <w:t>19</w:t>
             </w:r>
             <w:r>
               <w:rPr>
@@ -2861,7 +2861,7 @@
               <w:noProof/>
             </w:rPr>
           </w:pPr>
-          <w:hyperlink w:anchor="_Toc243485500" w:history="1">
+          <w:hyperlink w:anchor="_Toc243488425" w:history="1">
             <w:r>
               <w:rPr>
                 <w:rStyle w:val="Lienhypertexte"/>
@@ -2885,7 +2885,7 @@
               <w:rPr>
                 <w:noProof/>
               </w:rPr>
-              <w:instrText xml:space="preserve"> PAGEREF _Toc243485500 \h </w:instrText>
+              <w:instrText xml:space="preserve"> PAGEREF _Toc243488425 \h </w:instrText>
             </w:r>
             <w:r>
               <w:rPr>
@@ -2902,7 +2902,7 @@
               <w:rPr>
                 <w:noProof/>
               </w:rPr>
-              <w:t>19</w:t>
+              <w:t>20</w:t>
             </w:r>
             <w:r>
               <w:rPr>
@@ -2922,7 +2922,7 @@
               <w:noProof/>
             </w:rPr>
           </w:pPr>
-          <w:hyperlink w:anchor="_Toc243485501" w:history="1">
+          <w:hyperlink w:anchor="_Toc243488426" w:history="1">
             <w:r>
               <w:rPr>
                 <w:rStyle w:val="Lienhypertexte"/>
@@ -2946,7 +2946,7 @@
               <w:rPr>
                 <w:noProof/>
               </w:rPr>
-              <w:instrText xml:space="preserve"> PAGEREF _Toc243485501 \h </w:instrText>
+              <w:instrText xml:space="preserve"> PAGEREF _Toc243488426 \h </w:instrText>
             </w:r>
             <w:r>
               <w:rPr>
@@ -2963,7 +2963,7 @@
               <w:rPr>
                 <w:noProof/>
               </w:rPr>
-              <w:t>19</w:t>
+              <w:t>20</w:t>
             </w:r>
             <w:r>
               <w:rPr>
@@ -2983,7 +2983,7 @@
               <w:noProof/>
             </w:rPr>
           </w:pPr>
-          <w:hyperlink w:anchor="_Toc243485502" w:history="1">
+          <w:hyperlink w:anchor="_Toc243488427" w:history="1">
             <w:r>
               <w:rPr>
                 <w:rStyle w:val="Lienhypertexte"/>
@@ -3007,7 +3007,7 @@
               <w:rPr>
                 <w:noProof/>
               </w:rPr>
-              <w:instrText xml:space="preserve"> PAGEREF _Toc243485502 \h </w:instrText>
+              <w:instrText xml:space="preserve"> PAGEREF _Toc243488427 \h </w:instrText>
             </w:r>
             <w:r>
               <w:rPr>
@@ -3024,7 +3024,7 @@
               <w:rPr>
                 <w:noProof/>
               </w:rPr>
-              <w:t>19</w:t>
+              <w:t>20</w:t>
             </w:r>
             <w:r>
               <w:rPr>
@@ -3044,7 +3044,7 @@
               <w:noProof/>
             </w:rPr>
           </w:pPr>
-          <w:hyperlink w:anchor="_Toc243485503" w:history="1">
+          <w:hyperlink w:anchor="_Toc243488428" w:history="1">
             <w:r>
               <w:rPr>
                 <w:rStyle w:val="Lienhypertexte"/>
@@ -3068,7 +3068,7 @@
               <w:rPr>
                 <w:noProof/>
               </w:rPr>
-              <w:instrText xml:space="preserve"> PAGEREF _Toc243485503 \h </w:instrText>
+              <w:instrText xml:space="preserve"> PAGEREF _Toc243488428 \h </w:instrText>
             </w:r>
             <w:r>
               <w:rPr>
@@ -3085,7 +3085,7 @@
               <w:rPr>
                 <w:noProof/>
               </w:rPr>
-              <w:t>19</w:t>
+              <w:t>20</w:t>
             </w:r>
             <w:r>
               <w:rPr>
@@ -3105,7 +3105,7 @@
               <w:noProof/>
             </w:rPr>
           </w:pPr>
-          <w:hyperlink w:anchor="_Toc243485504" w:history="1">
+          <w:hyperlink w:anchor="_Toc243488429" w:history="1">
             <w:r>
               <w:rPr>
                 <w:rStyle w:val="Lienhypertexte"/>
@@ -3129,7 +3129,7 @@
               <w:rPr>
                 <w:noProof/>
               </w:rPr>
-              <w:instrText xml:space="preserve"> PAGEREF _Toc243485504 \h </w:instrText>
+              <w:instrText xml:space="preserve"> PAGEREF _Toc243488429 \h </w:instrText>
             </w:r>
             <w:r>
               <w:rPr>
@@ -3146,7 +3146,7 @@
               <w:rPr>
                 <w:noProof/>
               </w:rPr>
-              <w:t>20</w:t>
+              <w:t>21</w:t>
             </w:r>
             <w:r>
               <w:rPr>
@@ -3166,7 +3166,7 @@
               <w:noProof/>
             </w:rPr>
           </w:pPr>
-          <w:hyperlink w:anchor="_Toc243485505" w:history="1">
+          <w:hyperlink w:anchor="_Toc243488430" w:history="1">
             <w:r>
               <w:rPr>
                 <w:rStyle w:val="Lienhypertexte"/>
@@ -3190,7 +3190,7 @@
               <w:rPr>
                 <w:noProof/>
               </w:rPr>
-              <w:instrText xml:space="preserve"> PAGEREF _Toc243485505 \h </w:instrText>
+              <w:instrText xml:space="preserve"> PAGEREF _Toc243488430 \h </w:instrText>
             </w:r>
             <w:r>
               <w:rPr>
@@ -3207,7 +3207,7 @@
               <w:rPr>
                 <w:noProof/>
               </w:rPr>
-              <w:t>20</w:t>
+              <w:t>21</w:t>
             </w:r>
             <w:r>
               <w:rPr>
@@ -3227,7 +3227,7 @@
               <w:noProof/>
             </w:rPr>
           </w:pPr>
-          <w:hyperlink w:anchor="_Toc243485506" w:history="1">
+          <w:hyperlink w:anchor="_Toc243488431" w:history="1">
             <w:r>
               <w:rPr>
                 <w:rStyle w:val="Lienhypertexte"/>
@@ -3251,7 +3251,7 @@
               <w:rPr>
                 <w:noProof/>
               </w:rPr>
-              <w:instrText xml:space="preserve"> PAGEREF _Toc243485506 \h </w:instrText>
+              <w:instrText xml:space="preserve"> PAGEREF _Toc243488431 \h </w:instrText>
             </w:r>
             <w:r>
               <w:rPr>
@@ -3268,7 +3268,7 @@
               <w:rPr>
                 <w:noProof/>
               </w:rPr>
-              <w:t>20</w:t>
+              <w:t>21</w:t>
             </w:r>
             <w:r>
               <w:rPr>
@@ -3288,7 +3288,7 @@
               <w:noProof/>
             </w:rPr>
           </w:pPr>
-          <w:hyperlink w:anchor="_Toc243485507" w:history="1">
+          <w:hyperlink w:anchor="_Toc243488432" w:history="1">
             <w:r>
               <w:rPr>
                 <w:rStyle w:val="Lienhypertexte"/>
@@ -3312,7 +3312,7 @@
               <w:rPr>
                 <w:noProof/>
               </w:rPr>
-              <w:instrText xml:space="preserve"> PAGEREF _Toc243485507 \h </w:instrText>
+              <w:instrText xml:space="preserve"> PAGEREF _Toc243488432 \h </w:instrText>
             </w:r>
             <w:r>
               <w:rPr>
@@ -3329,7 +3329,7 @@
               <w:rPr>
                 <w:noProof/>
               </w:rPr>
-              <w:t>20</w:t>
+              <w:t>21</w:t>
             </w:r>
             <w:r>
               <w:rPr>
@@ -3349,7 +3349,7 @@
               <w:noProof/>
             </w:rPr>
           </w:pPr>
-          <w:hyperlink w:anchor="_Toc243485508" w:history="1">
+          <w:hyperlink w:anchor="_Toc243488433" w:history="1">
             <w:r>
               <w:rPr>
                 <w:rStyle w:val="Lienhypertexte"/>
@@ -3373,7 +3373,7 @@
               <w:rPr>
                 <w:noProof/>
               </w:rPr>
-              <w:instrText xml:space="preserve"> PAGEREF _Toc243485508 \h </w:instrText>
+              <w:instrText xml:space="preserve"> PAGEREF _Toc243488433 \h </w:instrText>
             </w:r>
             <w:r>
               <w:rPr>
@@ -3390,7 +3390,7 @@
               <w:rPr>
                 <w:noProof/>
               </w:rPr>
-              <w:t>22</w:t>
+              <w:t>23</w:t>
             </w:r>
             <w:r>
               <w:rPr>
@@ -3410,7 +3410,7 @@
               <w:noProof/>
             </w:rPr>
           </w:pPr>
-          <w:hyperlink w:anchor="_Toc243485509" w:history="1">
+          <w:hyperlink w:anchor="_Toc243488434" w:history="1">
             <w:r>
               <w:rPr>
                 <w:rStyle w:val="Lienhypertexte"/>
@@ -3434,7 +3434,7 @@
               <w:rPr>
                 <w:noProof/>
               </w:rPr>
-              <w:instrText xml:space="preserve"> PAGEREF _Toc243485509 \h </w:instrText>
+              <w:instrText xml:space="preserve"> PAGEREF _Toc243488434 \h </w:instrText>
             </w:r>
             <w:r>
               <w:rPr>
@@ -3451,7 +3451,7 @@
               <w:rPr>
                 <w:noProof/>
               </w:rPr>
-              <w:t>24</w:t>
+              <w:t>25</w:t>
             </w:r>
             <w:r>
               <w:rPr>
@@ -3471,7 +3471,7 @@
               <w:noProof/>
             </w:rPr>
           </w:pPr>
-          <w:hyperlink w:anchor="_Toc243485510" w:history="1">
+          <w:hyperlink w:anchor="_Toc243488435" w:history="1">
             <w:r>
               <w:rPr>
                 <w:rStyle w:val="Lienhypertexte"/>
@@ -3495,7 +3495,7 @@
               <w:rPr>
                 <w:noProof/>
               </w:rPr>
-              <w:instrText xml:space="preserve"> PAGEREF _Toc243485510 \h </w:instrText>
+              <w:instrText xml:space="preserve"> PAGEREF _Toc243488435 \h </w:instrText>
             </w:r>
             <w:r>
               <w:rPr>
@@ -3512,7 +3512,7 @@
               <w:rPr>
                 <w:noProof/>
               </w:rPr>
-              <w:t>25</w:t>
+              <w:t>26</w:t>
             </w:r>
             <w:r>
               <w:rPr>
@@ -3532,7 +3532,7 @@
               <w:noProof/>
             </w:rPr>
           </w:pPr>
-          <w:hyperlink w:anchor="_Toc243485511" w:history="1">
+          <w:hyperlink w:anchor="_Toc243488436" w:history="1">
             <w:r>
               <w:rPr>
                 <w:rStyle w:val="Lienhypertexte"/>
@@ -3556,7 +3556,7 @@
               <w:rPr>
                 <w:noProof/>
               </w:rPr>
-              <w:instrText xml:space="preserve"> PAGEREF _Toc243485511 \h </w:instrText>
+              <w:instrText xml:space="preserve"> PAGEREF _Toc243488436 \h </w:instrText>
             </w:r>
             <w:r>
               <w:rPr>
@@ -3573,7 +3573,7 @@
               <w:rPr>
                 <w:noProof/>
               </w:rPr>
-              <w:t>27</w:t>
+              <w:t>28</w:t>
             </w:r>
             <w:r>
               <w:rPr>
@@ -3593,7 +3593,7 @@
               <w:noProof/>
             </w:rPr>
           </w:pPr>
-          <w:hyperlink w:anchor="_Toc243485512" w:history="1">
+          <w:hyperlink w:anchor="_Toc243488437" w:history="1">
             <w:r>
               <w:rPr>
                 <w:rStyle w:val="Lienhypertexte"/>
@@ -3617,7 +3617,7 @@
               <w:rPr>
                 <w:noProof/>
               </w:rPr>
-              <w:instrText xml:space="preserve"> PAGEREF _Toc243485512 \h </w:instrText>
+              <w:instrText xml:space="preserve"> PAGEREF _Toc243488437 \h </w:instrText>
             </w:r>
             <w:r>
               <w:rPr>
@@ -3634,7 +3634,7 @@
               <w:rPr>
                 <w:noProof/>
               </w:rPr>
-              <w:t>27</w:t>
+              <w:t>28</w:t>
             </w:r>
             <w:r>
               <w:rPr>
@@ -3654,7 +3654,7 @@
               <w:noProof/>
             </w:rPr>
           </w:pPr>
-          <w:hyperlink w:anchor="_Toc243485513" w:history="1">
+          <w:hyperlink w:anchor="_Toc243488438" w:history="1">
             <w:r>
               <w:rPr>
                 <w:rStyle w:val="Lienhypertexte"/>
@@ -3678,7 +3678,7 @@
               <w:rPr>
                 <w:noProof/>
               </w:rPr>
-              <w:instrText xml:space="preserve"> PAGEREF _Toc243485513 \h </w:instrText>
+              <w:instrText xml:space="preserve"> PAGEREF _Toc243488438 \h </w:instrText>
             </w:r>
             <w:r>
               <w:rPr>
@@ -3695,7 +3695,7 @@
               <w:rPr>
                 <w:noProof/>
               </w:rPr>
-              <w:t>27</w:t>
+              <w:t>28</w:t>
             </w:r>
             <w:r>
               <w:rPr>
@@ -3715,7 +3715,7 @@
               <w:noProof/>
             </w:rPr>
           </w:pPr>
-          <w:hyperlink w:anchor="_Toc243485514" w:history="1">
+          <w:hyperlink w:anchor="_Toc243488439" w:history="1">
             <w:r>
               <w:rPr>
                 <w:rStyle w:val="Lienhypertexte"/>
@@ -3739,7 +3739,7 @@
               <w:rPr>
                 <w:noProof/>
               </w:rPr>
-              <w:instrText xml:space="preserve"> PAGEREF _Toc243485514 \h </w:instrText>
+              <w:instrText xml:space="preserve"> PAGEREF _Toc243488439 \h </w:instrText>
             </w:r>
             <w:r>
               <w:rPr>
@@ -3756,7 +3756,7 @@
               <w:rPr>
                 <w:noProof/>
               </w:rPr>
-              <w:t>27</w:t>
+              <w:t>28</w:t>
             </w:r>
             <w:r>
               <w:rPr>
@@ -3776,7 +3776,7 @@
               <w:noProof/>
             </w:rPr>
           </w:pPr>
-          <w:hyperlink w:anchor="_Toc243485515" w:history="1">
+          <w:hyperlink w:anchor="_Toc243488440" w:history="1">
             <w:r>
               <w:rPr>
                 <w:rStyle w:val="Lienhypertexte"/>
@@ -3800,7 +3800,7 @@
               <w:rPr>
                 <w:noProof/>
               </w:rPr>
-              <w:instrText xml:space="preserve"> PAGEREF _Toc243485515 \h </w:instrText>
+              <w:instrText xml:space="preserve"> PAGEREF _Toc243488440 \h </w:instrText>
             </w:r>
             <w:r>
               <w:rPr>
@@ -3817,7 +3817,7 @@
               <w:rPr>
                 <w:noProof/>
               </w:rPr>
-              <w:t>28</w:t>
+              <w:t>29</w:t>
             </w:r>
             <w:r>
               <w:rPr>
@@ -3837,7 +3837,7 @@
               <w:noProof/>
             </w:rPr>
           </w:pPr>
-          <w:hyperlink w:anchor="_Toc243485516" w:history="1">
+          <w:hyperlink w:anchor="_Toc243488441" w:history="1">
             <w:r>
               <w:rPr>
                 <w:rStyle w:val="Lienhypertexte"/>
@@ -3861,7 +3861,7 @@
               <w:rPr>
                 <w:noProof/>
               </w:rPr>
-              <w:instrText xml:space="preserve"> PAGEREF _Toc243485516 \h </w:instrText>
+              <w:instrText xml:space="preserve"> PAGEREF _Toc243488441 \h </w:instrText>
             </w:r>
             <w:r>
               <w:rPr>
@@ -3878,7 +3878,7 @@
               <w:rPr>
                 <w:noProof/>
               </w:rPr>
-              <w:t>28</w:t>
+              <w:t>29</w:t>
             </w:r>
             <w:r>
               <w:rPr>
@@ -3898,7 +3898,7 @@
               <w:noProof/>
             </w:rPr>
           </w:pPr>
-          <w:hyperlink w:anchor="_Toc243485517" w:history="1">
+          <w:hyperlink w:anchor="_Toc243488442" w:history="1">
             <w:r>
               <w:rPr>
                 <w:rStyle w:val="Lienhypertexte"/>
@@ -3922,7 +3922,7 @@
               <w:rPr>
                 <w:noProof/>
               </w:rPr>
-              <w:instrText xml:space="preserve"> PAGEREF _Toc243485517 \h </w:instrText>
+              <w:instrText xml:space="preserve"> PAGEREF _Toc243488442 \h </w:instrText>
             </w:r>
             <w:r>
               <w:rPr>
@@ -3939,7 +3939,7 @@
               <w:rPr>
                 <w:noProof/>
               </w:rPr>
-              <w:t>29</w:t>
+              <w:t>30</w:t>
             </w:r>
             <w:r>
               <w:rPr>
@@ -3959,7 +3959,7 @@
               <w:noProof/>
             </w:rPr>
           </w:pPr>
-          <w:hyperlink w:anchor="_Toc243485518" w:history="1">
+          <w:hyperlink w:anchor="_Toc243488443" w:history="1">
             <w:r>
               <w:rPr>
                 <w:rStyle w:val="Lienhypertexte"/>
@@ -3983,7 +3983,7 @@
               <w:rPr>
                 <w:noProof/>
               </w:rPr>
-              <w:instrText xml:space="preserve"> PAGEREF _Toc243485518 \h </w:instrText>
+              <w:instrText xml:space="preserve"> PAGEREF _Toc243488443 \h </w:instrText>
             </w:r>
             <w:r>
               <w:rPr>
@@ -4000,7 +4000,7 @@
               <w:rPr>
                 <w:noProof/>
               </w:rPr>
-              <w:t>30</w:t>
+              <w:t>31</w:t>
             </w:r>
             <w:r>
               <w:rPr>
@@ -4020,7 +4020,7 @@
               <w:noProof/>
             </w:rPr>
           </w:pPr>
-          <w:hyperlink w:anchor="_Toc243485519" w:history="1">
+          <w:hyperlink w:anchor="_Toc243488444" w:history="1">
             <w:r>
               <w:rPr>
                 <w:rStyle w:val="Lienhypertexte"/>
@@ -4044,7 +4044,7 @@
               <w:rPr>
                 <w:noProof/>
               </w:rPr>
-              <w:instrText xml:space="preserve"> PAGEREF _Toc243485519 \h </w:instrText>
+              <w:instrText xml:space="preserve"> PAGEREF _Toc243488444 \h </w:instrText>
             </w:r>
             <w:r>
               <w:rPr>
@@ -4061,7 +4061,7 @@
               <w:rPr>
                 <w:noProof/>
               </w:rPr>
-              <w:t>31</w:t>
+              <w:t>32</w:t>
             </w:r>
             <w:r>
               <w:rPr>
@@ -4081,7 +4081,7 @@
               <w:noProof/>
             </w:rPr>
           </w:pPr>
-          <w:hyperlink w:anchor="_Toc243485520" w:history="1">
+          <w:hyperlink w:anchor="_Toc243488445" w:history="1">
             <w:r>
               <w:rPr>
                 <w:rStyle w:val="Lienhypertexte"/>
@@ -4105,7 +4105,7 @@
               <w:rPr>
                 <w:noProof/>
               </w:rPr>
-              <w:instrText xml:space="preserve"> PAGEREF _Toc243485520 \h </w:instrText>
+              <w:instrText xml:space="preserve"> PAGEREF _Toc243488445 \h </w:instrText>
             </w:r>
             <w:r>
               <w:rPr>
@@ -4122,7 +4122,7 @@
               <w:rPr>
                 <w:noProof/>
               </w:rPr>
-              <w:t>32</w:t>
+              <w:t>33</w:t>
             </w:r>
             <w:r>
               <w:rPr>
@@ -4142,7 +4142,7 @@
               <w:noProof/>
             </w:rPr>
           </w:pPr>
-          <w:hyperlink w:anchor="_Toc243485521" w:history="1">
+          <w:hyperlink w:anchor="_Toc243488446" w:history="1">
             <w:r>
               <w:rPr>
                 <w:rStyle w:val="Lienhypertexte"/>
@@ -4166,7 +4166,7 @@
               <w:rPr>
                 <w:noProof/>
               </w:rPr>
-              <w:instrText xml:space="preserve"> PAGEREF _Toc243485521 \h </w:instrText>
+              <w:instrText xml:space="preserve"> PAGEREF _Toc243488446 \h </w:instrText>
             </w:r>
             <w:r>
               <w:rPr>
@@ -4183,7 +4183,7 @@
               <w:rPr>
                 <w:noProof/>
               </w:rPr>
-              <w:t>32</w:t>
+              <w:t>33</w:t>
             </w:r>
             <w:r>
               <w:rPr>
@@ -4205,7 +4205,7 @@
         <w:pStyle w:val="Titre1"/>
         <w:pageBreakBefore/>
       </w:pPr>
-      <w:bookmarkStart w:id="0" w:name="_Toc243485455"/>
+      <w:bookmarkStart w:id="0" w:name="_Toc243488380"/>
       <w:r>
         <w:lastRenderedPageBreak/>
         <w:t>1. The pitch in 60 seconds</w:t>
@@ -4424,7 +4424,7 @@
         <w:pStyle w:val="Titre1"/>
         <w:pageBreakBefore/>
       </w:pPr>
-      <w:bookmarkStart w:id="1" w:name="_Toc243485456"/>
+      <w:bookmarkStart w:id="1" w:name="_Toc243488381"/>
       <w:r>
         <w:lastRenderedPageBreak/>
         <w:t>2. The basic ideas, explained simply</w:t>
@@ -4529,7 +4529,7 @@
       <w:pPr>
         <w:pStyle w:val="Titre2"/>
       </w:pPr>
-      <w:bookmarkStart w:id="2" w:name="_Toc243485457"/>
+      <w:bookmarkStart w:id="2" w:name="_Toc243488382"/>
       <w:r>
         <w:t>A neuron, weights and a network</w:t>
       </w:r>
@@ -4599,7 +4599,7 @@
       <w:pPr>
         <w:pStyle w:val="Titre2"/>
       </w:pPr>
-      <w:bookmarkStart w:id="3" w:name="_Toc243485458"/>
+      <w:bookmarkStart w:id="3" w:name="_Toc243488383"/>
       <w:r>
         <w:t>The loss: how wrong we are</w:t>
       </w:r>
@@ -4659,7 +4659,7 @@
       <w:pPr>
         <w:pStyle w:val="Titre2"/>
       </w:pPr>
-      <w:bookmarkStart w:id="4" w:name="_Toc243485459"/>
+      <w:bookmarkStart w:id="4" w:name="_Toc243488384"/>
       <w:r>
         <w:t>Gradient descent and the learning rate</w:t>
       </w:r>
@@ -4729,7 +4729,7 @@
       <w:pPr>
         <w:pStyle w:val="Titre2"/>
       </w:pPr>
-      <w:bookmarkStart w:id="5" w:name="_Toc243485460"/>
+      <w:bookmarkStart w:id="5" w:name="_Toc243488385"/>
       <w:r>
         <w:t>Backpropagation and the 5 lines of the training loop</w:t>
       </w:r>
@@ -4823,7 +4823,7 @@
       <w:pPr>
         <w:pStyle w:val="Titre2"/>
       </w:pPr>
-      <w:bookmarkStart w:id="6" w:name="_Toc243485461"/>
+      <w:bookmarkStart w:id="6" w:name="_Toc243488386"/>
       <w:r>
         <w:t>Epoch and mini-batch</w:t>
       </w:r>
@@ -4883,7 +4883,7 @@
       <w:pPr>
         <w:pStyle w:val="Titre2"/>
       </w:pPr>
-      <w:bookmarkStart w:id="7" w:name="_Toc243485462"/>
+      <w:bookmarkStart w:id="7" w:name="_Toc243488387"/>
       <w:r>
         <w:lastRenderedPageBreak/>
         <w:t>Train, validation, test</w:t>
@@ -4954,7 +4954,7 @@
       <w:pPr>
         <w:pStyle w:val="Titre2"/>
       </w:pPr>
-      <w:bookmarkStart w:id="8" w:name="_Toc243485463"/>
+      <w:bookmarkStart w:id="8" w:name="_Toc243488388"/>
       <w:r>
         <w:t>Overfitting</w:t>
       </w:r>
@@ -5004,7 +5004,7 @@
       <w:pPr>
         <w:pStyle w:val="Titre2"/>
       </w:pPr>
-      <w:bookmarkStart w:id="9" w:name="_Toc243485464"/>
+      <w:bookmarkStart w:id="9" w:name="_Toc243488389"/>
       <w:r>
         <w:t>ReLU, the activation</w:t>
       </w:r>
@@ -5074,7 +5074,7 @@
       <w:pPr>
         <w:pStyle w:val="Titre2"/>
       </w:pPr>
-      <w:bookmarkStart w:id="10" w:name="_Toc243485465"/>
+      <w:bookmarkStart w:id="10" w:name="_Toc243488390"/>
       <w:r>
         <w:t>Initialisation and the first loss</w:t>
       </w:r>
@@ -5124,7 +5124,7 @@
       <w:pPr>
         <w:pStyle w:val="Titre2"/>
       </w:pPr>
-      <w:bookmarkStart w:id="11" w:name="_Toc243485466"/>
+      <w:bookmarkStart w:id="11" w:name="_Toc243488391"/>
       <w:r>
         <w:t>Standardisation of the pixels</w:t>
       </w:r>
@@ -5184,7 +5184,7 @@
       <w:pPr>
         <w:pStyle w:val="Titre2"/>
       </w:pPr>
-      <w:bookmarkStart w:id="12" w:name="_Toc243485467"/>
+      <w:bookmarkStart w:id="12" w:name="_Toc243488392"/>
       <w:r>
         <w:t>MLP versus CNN: why the MLP cannot see shapes</w:t>
       </w:r>
@@ -5244,7 +5244,7 @@
       <w:pPr>
         <w:pStyle w:val="Titre2"/>
       </w:pPr>
-      <w:bookmarkStart w:id="13" w:name="_Toc243485468"/>
+      <w:bookmarkStart w:id="13" w:name="_Toc243488393"/>
       <w:r>
         <w:t>Convolution, filters and channels (session 7 slide)</w:t>
       </w:r>
@@ -5335,7 +5335,7 @@
       <w:pPr>
         <w:pStyle w:val="Titre2"/>
       </w:pPr>
-      <w:bookmarkStart w:id="14" w:name="_Toc243485469"/>
+      <w:bookmarkStart w:id="14" w:name="_Toc243488394"/>
       <w:r>
         <w:t>A pretrained network and transfer learning</w:t>
       </w:r>
@@ -5395,7 +5395,7 @@
       <w:pPr>
         <w:pStyle w:val="Titre2"/>
       </w:pPr>
-      <w:bookmarkStart w:id="15" w:name="_Toc243485470"/>
+      <w:bookmarkStart w:id="15" w:name="_Toc243488395"/>
       <w:r>
         <w:t>Frozen features (linear probe) versus fine-tuning</w:t>
       </w:r>
@@ -5465,7 +5465,7 @@
       <w:pPr>
         <w:pStyle w:val="Titre2"/>
       </w:pPr>
-      <w:bookmarkStart w:id="16" w:name="_Toc243485471"/>
+      <w:bookmarkStart w:id="16" w:name="_Toc243488396"/>
       <w:r>
         <w:t>The tools against overfitting</w:t>
       </w:r>
@@ -5625,7 +5625,7 @@
       <w:pPr>
         <w:pStyle w:val="Titre2"/>
       </w:pPr>
-      <w:bookmarkStart w:id="17" w:name="_Toc243485472"/>
+      <w:bookmarkStart w:id="17" w:name="_Toc243488397"/>
       <w:r>
         <w:t>Vanishing gradient</w:t>
       </w:r>
@@ -5675,7 +5675,7 @@
       <w:pPr>
         <w:pStyle w:val="Titre2"/>
       </w:pPr>
-      <w:bookmarkStart w:id="18" w:name="_Toc243485473"/>
+      <w:bookmarkStart w:id="18" w:name="_Toc243488398"/>
       <w:r>
         <w:t>Data leakage</w:t>
       </w:r>
@@ -5725,7 +5725,7 @@
       <w:pPr>
         <w:pStyle w:val="Titre2"/>
       </w:pPr>
-      <w:bookmarkStart w:id="19" w:name="_Toc243485474"/>
+      <w:bookmarkStart w:id="19" w:name="_Toc243488399"/>
       <w:r>
         <w:t>Confidence interval and bootstrap</w:t>
       </w:r>
@@ -5785,7 +5785,7 @@
       <w:pPr>
         <w:pStyle w:val="Titre2"/>
       </w:pPr>
-      <w:bookmarkStart w:id="20" w:name="_Toc243485475"/>
+      <w:bookmarkStart w:id="20" w:name="_Toc243488400"/>
       <w:r>
         <w:lastRenderedPageBreak/>
         <w:t>Latency and CPU threads</w:t>
@@ -5857,7 +5857,7 @@
         <w:pStyle w:val="Titre1"/>
         <w:pageBreakBefore/>
       </w:pPr>
-      <w:bookmarkStart w:id="21" w:name="_Toc243485476"/>
+      <w:bookmarkStart w:id="21" w:name="_Toc243488401"/>
       <w:r>
         <w:lastRenderedPageBreak/>
         <w:t>3. Step 1: the data and a fair split (notebook 01)</w:t>
@@ -5970,7 +5970,7 @@
       <w:pPr>
         <w:pStyle w:val="Titre2"/>
       </w:pPr>
-      <w:bookmarkStart w:id="22" w:name="_Toc243485477"/>
+      <w:bookmarkStart w:id="22" w:name="_Toc243488402"/>
       <w:r>
         <w:t>What we downloaded</w:t>
       </w:r>
@@ -6091,7 +6091,7 @@
       <w:pPr>
         <w:pStyle w:val="Titre2"/>
       </w:pPr>
-      <w:bookmarkStart w:id="23" w:name="_Toc243485478"/>
+      <w:bookmarkStart w:id="23" w:name="_Toc243488403"/>
       <w:r>
         <w:t>The split (make_split in data.py)</w:t>
       </w:r>
@@ -6222,7 +6222,7 @@
       <w:pPr>
         <w:pStyle w:val="Titre2"/>
       </w:pPr>
-      <w:bookmarkStart w:id="24" w:name="_Toc243485479"/>
+      <w:bookmarkStart w:id="24" w:name="_Toc243488404"/>
       <w:r>
         <w:t>What we found in the data</w:t>
       </w:r>
@@ -6285,7 +6285,7 @@
         <w:pStyle w:val="Titre1"/>
         <w:pageBreakBefore/>
       </w:pPr>
-      <w:bookmarkStart w:id="25" w:name="_Toc243485480"/>
+      <w:bookmarkStart w:id="25" w:name="_Toc243488405"/>
       <w:r>
         <w:lastRenderedPageBreak/>
         <w:t>4. Step 2: the MLP and its two checks (notebook 02)</w:t>
@@ -6435,7 +6435,7 @@
       <w:pPr>
         <w:pStyle w:val="Titre2"/>
       </w:pPr>
-      <w:bookmarkStart w:id="26" w:name="_Toc243485481"/>
+      <w:bookmarkStart w:id="26" w:name="_Toc243488406"/>
       <w:r>
         <w:t>The model</w:t>
       </w:r>
@@ -6562,7 +6562,7 @@
       <w:pPr>
         <w:pStyle w:val="Titre2"/>
       </w:pPr>
-      <w:bookmarkStart w:id="27" w:name="_Toc243485482"/>
+      <w:bookmarkStart w:id="27" w:name="_Toc243488407"/>
       <w:r>
         <w:t>Check 1: the first loss</w:t>
       </w:r>
@@ -6611,7 +6611,7 @@
       <w:pPr>
         <w:pStyle w:val="Titre2"/>
       </w:pPr>
-      <w:bookmarkStart w:id="28" w:name="_Toc243485483"/>
+      <w:bookmarkStart w:id="28" w:name="_Toc243488408"/>
       <w:r>
         <w:t>Check 2: overfit one batch</w:t>
       </w:r>
@@ -6629,7 +6629,7 @@
       <w:pPr>
         <w:pStyle w:val="Titre2"/>
       </w:pPr>
-      <w:bookmarkStart w:id="29" w:name="_Toc243485484"/>
+      <w:bookmarkStart w:id="29" w:name="_Toc243488409"/>
       <w:r>
         <w:t>Baseline and image size</w:t>
       </w:r>
@@ -6705,7 +6705,7 @@
         </w:rPr>
         <w:lastRenderedPageBreak/>
         <w:drawing>
-          <wp:inline distT="0" distB="0" distL="0" distR="0" wp14:anchorId="733CE1EE" wp14:editId="733CE1EF">
+          <wp:inline distT="0" distB="0" distL="0" distR="0" wp14:anchorId="3785B001" wp14:editId="3785B002">
             <wp:extent cx="4762500" cy="1924050"/>
             <wp:effectExtent l="0" t="0" r="0" b="0"/>
             <wp:docPr id="1" name="02_baseline_curves.png" descr="MLP baseline: training loss falls to 0 while validation loss rises (overfitting)." title="MLP baseline: training loss falls to 0 while validation loss rises (overfitting)."/>
@@ -6765,7 +6765,7 @@
         <w:pStyle w:val="Titre1"/>
         <w:pageBreakBefore/>
       </w:pPr>
-      <w:bookmarkStart w:id="30" w:name="_Toc243485485"/>
+      <w:bookmarkStart w:id="30" w:name="_Toc243488410"/>
       <w:r>
         <w:lastRenderedPageBreak/>
         <w:t>5. Step 3: monitoring and regularisation (notebook 03)</w:t>
@@ -6936,7 +6936,7 @@
       <w:pPr>
         <w:pStyle w:val="Titre2"/>
       </w:pPr>
-      <w:bookmarkStart w:id="31" w:name="_Toc243485486"/>
+      <w:bookmarkStart w:id="31" w:name="_Toc243488411"/>
       <w:r>
         <w:t>What we monitored</w:t>
       </w:r>
@@ -7055,7 +7055,7 @@
       <w:pPr>
         <w:pStyle w:val="Titre2"/>
       </w:pPr>
-      <w:bookmarkStart w:id="32" w:name="_Toc243485487"/>
+      <w:bookmarkStart w:id="32" w:name="_Toc243488412"/>
       <w:r>
         <w:t>Learning-rate sweep (Adam, 8 values, 15 epochs each)</w:t>
       </w:r>
@@ -7130,7 +7130,7 @@
           <w:noProof/>
         </w:rPr>
         <w:drawing>
-          <wp:inline distT="0" distB="0" distL="0" distR="0" wp14:anchorId="733CE1F0" wp14:editId="733CE1F1">
+          <wp:inline distT="0" distB="0" distL="0" distR="0" wp14:anchorId="3785B003" wp14:editId="3785B004">
             <wp:extent cx="4191000" cy="1619250"/>
             <wp:effectExtent l="0" t="0" r="0" b="0"/>
             <wp:docPr id="2" name="03_lr_sweep.png" descr="Learning-rate sweep: a U-shaped validation loss, best at 0.0001." title="Learning-rate sweep: a U-shaped validation loss, best at 0.0001."/>
@@ -7189,7 +7189,7 @@
       <w:pPr>
         <w:pStyle w:val="Titre2"/>
       </w:pPr>
-      <w:bookmarkStart w:id="33" w:name="_Toc243485488"/>
+      <w:bookmarkStart w:id="33" w:name="_Toc243488413"/>
       <w:r>
         <w:t>The tools against overfitting (lr 0.0001, 3 seeds each)</w:t>
       </w:r>
@@ -8162,7 +8162,7 @@
         <w:pStyle w:val="Titre1"/>
         <w:pageBreakBefore/>
       </w:pPr>
-      <w:bookmarkStart w:id="34" w:name="_Toc243485489"/>
+      <w:bookmarkStart w:id="34" w:name="_Toc243488414"/>
       <w:r>
         <w:lastRenderedPageBreak/>
         <w:t>6. Step 4: the training doctor (notebook 04)</w:t>
@@ -9068,7 +9068,7 @@
         </w:rPr>
         <w:lastRenderedPageBreak/>
         <w:drawing>
-          <wp:inline distT="0" distB="0" distL="0" distR="0" wp14:anchorId="733CE1F2" wp14:editId="733CE1F3">
+          <wp:inline distT="0" distB="0" distL="0" distR="0" wp14:anchorId="3785B005" wp14:editId="3785B006">
             <wp:extent cx="4000500" cy="2209800"/>
             <wp:effectExtent l="0" t="0" r="0" b="0"/>
             <wp:docPr id="3" name="04_p4_grad_per_layer.png" descr="Patient 4: the gradient vanishes layer after layer with sigmoids; ReLU + He init fixes it." title="Patient 4: the gradient vanishes layer after layer with sigmoids; ReLU + He init fixes it."/>
@@ -9127,7 +9127,7 @@
       <w:pPr>
         <w:pStyle w:val="Titre2"/>
       </w:pPr>
-      <w:bookmarkStart w:id="35" w:name="_Toc243485490"/>
+      <w:bookmarkStart w:id="35" w:name="_Toc243488415"/>
       <w:r>
         <w:t>Lessons to say at the oral</w:t>
       </w:r>
@@ -9220,7 +9220,7 @@
         <w:pStyle w:val="Titre1"/>
         <w:pageBreakBefore/>
       </w:pPr>
-      <w:bookmarkStart w:id="36" w:name="_Toc243485491"/>
+      <w:bookmarkStart w:id="36" w:name="_Toc243488416"/>
       <w:r>
         <w:lastRenderedPageBreak/>
         <w:t>7. Step 5: pretrained ResNet18 (notebook 05)</w:t>
@@ -9427,7 +9427,7 @@
       <w:pPr>
         <w:pStyle w:val="Titre2"/>
       </w:pPr>
-      <w:bookmarkStart w:id="37" w:name="_Toc243485492"/>
+      <w:bookmarkStart w:id="37" w:name="_Toc243488417"/>
       <w:r>
         <w:t>Why a CNN, and why pretrained</w:t>
       </w:r>
@@ -9473,6 +9473,71 @@
     </w:p>
     <w:p>
       <w:pPr>
+        <w:spacing w:before="120" w:after="60"/>
+        <w:jc w:val="center"/>
+      </w:pPr>
+      <w:r>
+        <w:rPr>
+          <w:noProof/>
+        </w:rPr>
+        <w:drawing>
+          <wp:inline distT="0" distB="0" distL="0" distR="0" wp14:anchorId="3785B007" wp14:editId="3785B008">
+            <wp:extent cx="5905500" cy="2543175"/>
+            <wp:effectExtent l="0" t="0" r="0" b="0"/>
+            <wp:docPr id="4" name="C:\Users\benca\AppData\Local\Temp\claude\c--Users-benca-OneDrive---Thelio-Documents-Perso-Albert-School\1b4fce00-cdbb-452c-8784-7dae784734de\scratchpad\deck\resnet18_diagram.png" descr="Inside ResNet18 + our linear head (backup slide 20): the frozen body (dark) turns a painting into 512 numbers; our linear head (blue) turns them into 5 scores." title="Inside ResNet18 + our linear head (backup slide 20): the frozen body (dark) turns a painting into 512 numbers; our linear head (blue) turns them into 5 scores."/>
+            <wp:cNvGraphicFramePr>
+              <a:graphicFrameLocks xmlns:a="http://schemas.openxmlformats.org/drawingml/2006/main" noChangeAspect="1"/>
+            </wp:cNvGraphicFramePr>
+            <a:graphic xmlns:a="http://schemas.openxmlformats.org/drawingml/2006/main">
+              <a:graphicData uri="http://schemas.openxmlformats.org/drawingml/2006/picture">
+                <pic:pic xmlns:pic="http://schemas.openxmlformats.org/drawingml/2006/picture">
+                  <pic:nvPicPr>
+                    <pic:cNvPr id="0" name=""/>
+                    <pic:cNvPicPr>
+                      <a:picLocks noChangeAspect="1" noChangeArrowheads="1"/>
+                    </pic:cNvPicPr>
+                  </pic:nvPicPr>
+                  <pic:blipFill>
+                    <a:blip r:embed="rId10"/>
+                    <a:srcRect/>
+                    <a:stretch>
+                      <a:fillRect/>
+                    </a:stretch>
+                  </pic:blipFill>
+                  <pic:spPr bwMode="auto">
+                    <a:xfrm>
+                      <a:off x="0" y="0"/>
+                      <a:ext cx="5905500" cy="2543175"/>
+                    </a:xfrm>
+                    <a:prstGeom prst="rect">
+                      <a:avLst/>
+                    </a:prstGeom>
+                  </pic:spPr>
+                </pic:pic>
+              </a:graphicData>
+            </a:graphic>
+          </wp:inline>
+        </w:drawing>
+      </w:r>
+    </w:p>
+    <w:p>
+      <w:pPr>
+        <w:spacing w:after="200"/>
+        <w:jc w:val="center"/>
+      </w:pPr>
+      <w:r>
+        <w:rPr>
+          <w:i/>
+          <w:iCs/>
+          <w:color w:val="5F6473"/>
+          <w:sz w:val="18"/>
+          <w:szCs w:val="18"/>
+        </w:rPr>
+        <w:t>Inside ResNet18 + our linear head (backup slide 20): the frozen body (dark) turns a painting into 512 numbers; our linear head (blue) turns them into 5 scores.</w:t>
+      </w:r>
+    </w:p>
+    <w:p>
+      <w:pPr>
         <w:spacing w:after="120"/>
       </w:pPr>
       <w:r>
@@ -9480,10 +9545,10 @@
           <w:b/>
           <w:bCs/>
         </w:rPr>
-        <w:t>Ours vs library.</w:t>
-      </w:r>
-      <w:r>
-        <w:t xml:space="preserve"> torchvision gives ResNet18 and its weights. Ours: the head, the freezing (</w:t>
+        <w:t>The linear head in one line.</w:t>
+      </w:r>
+      <w:r>
+        <w:t xml:space="preserve"> The head is the part that decides; "linear" means it is a single </w:t>
       </w:r>
       <w:r>
         <w:rPr>
@@ -9491,10 +9556,45 @@
           <w:sz w:val="19"/>
           <w:szCs w:val="19"/>
         </w:rPr>
-        <w:t>ResNetClassifier</w:t>
-      </w:r>
-      <w:r>
-        <w:t xml:space="preserve"> in </w:t>
+        <w:t>nn.Linear</w:t>
+      </w:r>
+      <w:r>
+        <w:t xml:space="preserve"> layer. For each style it computes a score: weight 1 x number 1 + weight 2 x number 2 + ... + weight 512 x number 512 + a bias. The style with the highest score wins (the softmax inside the loss turns the 5 scores into probabilities). 512 x 5 weights + 5 biases = </w:t>
+      </w:r>
+      <w:r>
+        <w:rPr>
+          <w:b/>
+          <w:bCs/>
+        </w:rPr>
+        <w:t>2 565 weights</w:t>
+      </w:r>
+      <w:r>
+        <w:t xml:space="preserve">. Like a jury's </w:t>
+      </w:r>
+      <w:r>
+        <w:rPr>
+          <w:b/>
+          <w:bCs/>
+        </w:rPr>
+        <w:t>grading sheet</w:t>
+      </w:r>
+      <w:r>
+        <w:t>: the expert fills in 512 criteria, and the sheet says how much each criterion counts for each style. Trained with cross-entropy, it is the same thing as a logistic regression on the 512 numbers, which is why "ResNet18 + logistic regression" scores almost the same.</w:t>
+      </w:r>
+    </w:p>
+    <w:p>
+      <w:pPr>
+        <w:spacing w:after="120"/>
+      </w:pPr>
+      <w:r>
+        <w:rPr>
+          <w:b/>
+          <w:bCs/>
+        </w:rPr>
+        <w:t>Ours vs library.</w:t>
+      </w:r>
+      <w:r>
+        <w:t xml:space="preserve"> torchvision gives ResNet18 and its weights. Ours: the head, the freezing (</w:t>
       </w:r>
       <w:r>
         <w:rPr>
@@ -9502,6 +9602,17 @@
           <w:sz w:val="19"/>
           <w:szCs w:val="19"/>
         </w:rPr>
+        <w:t>ResNetClassifier</w:t>
+      </w:r>
+      <w:r>
+        <w:t xml:space="preserve"> in </w:t>
+      </w:r>
+      <w:r>
+        <w:rPr>
+          <w:rFonts w:ascii="Consolas" w:eastAsia="Consolas" w:hAnsi="Consolas" w:cs="Consolas"/>
+          <w:sz w:val="19"/>
+          <w:szCs w:val="19"/>
+        </w:rPr>
         <w:t>models.py</w:t>
       </w:r>
       <w:r>
@@ -9512,8 +9623,9 @@
       <w:pPr>
         <w:pStyle w:val="Titre2"/>
       </w:pPr>
-      <w:bookmarkStart w:id="38" w:name="_Toc243485493"/>
-      <w:r>
+      <w:bookmarkStart w:id="38" w:name="_Toc243488418"/>
+      <w:r>
+        <w:lastRenderedPageBreak/>
         <w:t>Method A: frozen features + head</w:t>
       </w:r>
       <w:bookmarkEnd w:id="38"/>
@@ -9619,7 +9731,7 @@
       <w:pPr>
         <w:pStyle w:val="Titre2"/>
       </w:pPr>
-      <w:bookmarkStart w:id="39" w:name="_Toc243485494"/>
+      <w:bookmarkStart w:id="39" w:name="_Toc243488419"/>
       <w:r>
         <w:t>Method B: fine-tuning layer4</w:t>
       </w:r>
@@ -9676,7 +9788,7 @@
       <w:pPr>
         <w:pStyle w:val="Titre2"/>
       </w:pPr>
-      <w:bookmarkStart w:id="40" w:name="_Toc243485495"/>
+      <w:bookmarkStart w:id="40" w:name="_Toc243488420"/>
       <w:r>
         <w:t>Two silent bugs, measured</w:t>
       </w:r>
@@ -9743,9 +9855,8 @@
       <w:pPr>
         <w:pStyle w:val="Titre2"/>
       </w:pPr>
-      <w:bookmarkStart w:id="41" w:name="_Toc243485496"/>
-      <w:r>
-        <w:lastRenderedPageBreak/>
+      <w:bookmarkStart w:id="41" w:name="_Toc243488421"/>
+      <w:r>
         <w:t>Painter leakage, measured fairly</w:t>
       </w:r>
       <w:bookmarkEnd w:id="41"/>
@@ -10085,10 +10196,10 @@
           <w:noProof/>
         </w:rPr>
         <w:drawing>
-          <wp:inline distT="0" distB="0" distL="0" distR="0" wp14:anchorId="733CE1F4" wp14:editId="733CE1F5">
+          <wp:inline distT="0" distB="0" distL="0" distR="0" wp14:anchorId="3785B009" wp14:editId="3785B00A">
             <wp:extent cx="4762500" cy="2524125"/>
             <wp:effectExtent l="0" t="0" r="0" b="0"/>
-            <wp:docPr id="4" name="05_painter_leakage.png" descr="Painter leakage: same images, same model; only the known-painter group changes." title="Painter leakage: same images, same model; only the known-painter group changes."/>
+            <wp:docPr id="5" name="05_painter_leakage.png" descr="Painter leakage: same images, same model; only the known-painter group changes." title="Painter leakage: same images, same model; only the known-painter group changes."/>
             <wp:cNvGraphicFramePr>
               <a:graphicFrameLocks xmlns:a="http://schemas.openxmlformats.org/drawingml/2006/main" noChangeAspect="1"/>
             </wp:cNvGraphicFramePr>
@@ -10102,7 +10213,7 @@
                     </pic:cNvPicPr>
                   </pic:nvPicPr>
                   <pic:blipFill>
-                    <a:blip r:embed="rId10"/>
+                    <a:blip r:embed="rId11"/>
                     <a:srcRect/>
                     <a:stretch>
                       <a:fillRect/>
@@ -10149,6 +10260,7 @@
           <w:b/>
           <w:bCs/>
         </w:rPr>
+        <w:lastRenderedPageBreak/>
         <w:t>Errors of the linear probe</w:t>
       </w:r>
       <w:r>
@@ -10160,7 +10272,7 @@
         <w:pStyle w:val="Titre1"/>
         <w:pageBreakBefore/>
       </w:pPr>
-      <w:bookmarkStart w:id="42" w:name="_Toc243485497"/>
+      <w:bookmarkStart w:id="42" w:name="_Toc243488422"/>
       <w:r>
         <w:lastRenderedPageBreak/>
         <w:t>8. Step 6: final test, CPU cost and recommendation (notebook 06)</w:t>
@@ -10306,7 +10418,7 @@
       <w:pPr>
         <w:pStyle w:val="Titre2"/>
       </w:pPr>
-      <w:bookmarkStart w:id="43" w:name="_Toc243485498"/>
+      <w:bookmarkStart w:id="43" w:name="_Toc243488423"/>
       <w:r>
         <w:t>Classical models (settings chosen on validation)</w:t>
       </w:r>
@@ -10419,7 +10531,7 @@
       <w:pPr>
         <w:pStyle w:val="Titre2"/>
       </w:pPr>
-      <w:bookmarkStart w:id="44" w:name="_Toc243485499"/>
+      <w:bookmarkStart w:id="44" w:name="_Toc243488424"/>
       <w:r>
         <w:t>The final test, measured once</w:t>
       </w:r>
@@ -11450,10 +11562,10 @@
         </w:rPr>
         <w:lastRenderedPageBreak/>
         <w:drawing>
-          <wp:inline distT="0" distB="0" distL="0" distR="0" wp14:anchorId="733CE1F6" wp14:editId="733CE1F7">
+          <wp:inline distT="0" distB="0" distL="0" distR="0" wp14:anchorId="3785B00B" wp14:editId="3785B00C">
             <wp:extent cx="4762500" cy="1971675"/>
             <wp:effectExtent l="0" t="0" r="0" b="0"/>
-            <wp:docPr id="5" name="06_test_accuracy.png" descr="Final test: 220 paintings never seen before, with 95 % bootstrap intervals." title="Final test: 220 paintings never seen before, with 95 % bootstrap intervals."/>
+            <wp:docPr id="6" name="06_test_accuracy.png" descr="Final test: 220 paintings never seen before, with 95 % bootstrap intervals." title="Final test: 220 paintings never seen before, with 95 % bootstrap intervals."/>
             <wp:cNvGraphicFramePr>
               <a:graphicFrameLocks xmlns:a="http://schemas.openxmlformats.org/drawingml/2006/main" noChangeAspect="1"/>
             </wp:cNvGraphicFramePr>
@@ -11467,7 +11579,7 @@
                     </pic:cNvPicPr>
                   </pic:nvPicPr>
                   <pic:blipFill>
-                    <a:blip r:embed="rId11"/>
+                    <a:blip r:embed="rId12"/>
                     <a:srcRect/>
                     <a:stretch>
                       <a:fillRect/>
@@ -11509,7 +11621,7 @@
       <w:pPr>
         <w:pStyle w:val="Titre2"/>
       </w:pPr>
-      <w:bookmarkStart w:id="45" w:name="_Toc243485500"/>
+      <w:bookmarkStart w:id="45" w:name="_Toc243488425"/>
       <w:r>
         <w:t>Are the gaps real? Paired bootstrap (same 220 paintings, 5 000 redraws)</w:t>
       </w:r>
@@ -11568,7 +11680,7 @@
       <w:pPr>
         <w:pStyle w:val="Titre2"/>
       </w:pPr>
-      <w:bookmarkStart w:id="46" w:name="_Toc243485501"/>
+      <w:bookmarkStart w:id="46" w:name="_Toc243488426"/>
       <w:r>
         <w:t>Frozen or fine-tuned? Validation and test disagree</w:t>
       </w:r>
@@ -11596,7 +11708,7 @@
       <w:pPr>
         <w:pStyle w:val="Titre2"/>
       </w:pPr>
-      <w:bookmarkStart w:id="47" w:name="_Toc243485502"/>
+      <w:bookmarkStart w:id="47" w:name="_Toc243488427"/>
       <w:r>
         <w:t>Speed and size</w:t>
       </w:r>
@@ -11614,7 +11726,7 @@
       <w:pPr>
         <w:pStyle w:val="Titre2"/>
       </w:pPr>
-      <w:bookmarkStart w:id="48" w:name="_Toc243485503"/>
+      <w:bookmarkStart w:id="48" w:name="_Toc243488428"/>
       <w:r>
         <w:t>Recommendation to the director</w:t>
       </w:r>
@@ -11711,7 +11823,7 @@
         <w:pStyle w:val="Titre1"/>
         <w:pageBreakBefore/>
       </w:pPr>
-      <w:bookmarkStart w:id="49" w:name="_Toc243485504"/>
+      <w:bookmarkStart w:id="49" w:name="_Toc243488429"/>
       <w:r>
         <w:lastRenderedPageBreak/>
         <w:t>9. The random forest, our classical challenger (notebook 06)</w:t>
@@ -11898,7 +12010,7 @@
       <w:pPr>
         <w:pStyle w:val="Titre2"/>
       </w:pPr>
-      <w:bookmarkStart w:id="50" w:name="_Toc243485505"/>
+      <w:bookmarkStart w:id="50" w:name="_Toc243488430"/>
       <w:r>
         <w:t>The 102 hand-made numbers (baselines.py)</w:t>
       </w:r>
@@ -12288,7 +12400,7 @@
       <w:pPr>
         <w:pStyle w:val="Titre2"/>
       </w:pPr>
-      <w:bookmarkStart w:id="51" w:name="_Toc243485506"/>
+      <w:bookmarkStart w:id="51" w:name="_Toc243488431"/>
       <w:r>
         <w:t>Our settings, chosen on validation</w:t>
       </w:r>
@@ -12456,7 +12568,7 @@
       <w:pPr>
         <w:pStyle w:val="Titre2"/>
       </w:pPr>
-      <w:bookmarkStart w:id="52" w:name="_Toc243485507"/>
+      <w:bookmarkStart w:id="52" w:name="_Toc243488432"/>
       <w:r>
         <w:t>Questions on the random forest, with answers</w:t>
       </w:r>
@@ -12721,7 +12833,7 @@
         <w:pStyle w:val="Titre1"/>
         <w:pageBreakBefore/>
       </w:pPr>
-      <w:bookmarkStart w:id="53" w:name="_Toc243485508"/>
+      <w:bookmarkStart w:id="53" w:name="_Toc243488433"/>
       <w:r>
         <w:lastRenderedPageBreak/>
         <w:t>10. Bonus: what about transformers like BERT? (notebook 07)</w:t>
@@ -13588,10 +13700,10 @@
         </w:rPr>
         <w:lastRenderedPageBreak/>
         <w:drawing>
-          <wp:inline distT="0" distB="0" distL="0" distR="0" wp14:anchorId="733CE1F8" wp14:editId="733CE1F9">
+          <wp:inline distT="0" distB="0" distL="0" distR="0" wp14:anchorId="3785B00D" wp14:editId="3785B00E">
             <wp:extent cx="4381500" cy="2486025"/>
             <wp:effectExtent l="0" t="0" r="0" b="0"/>
-            <wp:docPr id="6" name="07_transformers_accuracy_vs_speed.png" descr="Transformers on validation: CLIP is more accurate, but slower." title="Transformers on validation: CLIP is more accurate, but slower."/>
+            <wp:docPr id="7" name="07_transformers_accuracy_vs_speed.png" descr="Transformers on validation: CLIP is more accurate, but slower." title="Transformers on validation: CLIP is more accurate, but slower."/>
             <wp:cNvGraphicFramePr>
               <a:graphicFrameLocks xmlns:a="http://schemas.openxmlformats.org/drawingml/2006/main" noChangeAspect="1"/>
             </wp:cNvGraphicFramePr>
@@ -13605,7 +13717,7 @@
                     </pic:cNvPicPr>
                   </pic:nvPicPr>
                   <pic:blipFill>
-                    <a:blip r:embed="rId12"/>
+                    <a:blip r:embed="rId13"/>
                     <a:srcRect/>
                     <a:stretch>
                       <a:fillRect/>
@@ -13648,7 +13760,7 @@
         <w:pStyle w:val="Titre1"/>
         <w:pageBreakBefore/>
       </w:pPr>
-      <w:bookmarkStart w:id="54" w:name="_Toc243485509"/>
+      <w:bookmarkStart w:id="54" w:name="_Toc243488434"/>
       <w:r>
         <w:lastRenderedPageBreak/>
         <w:t>11. Key numbers to know by heart</w:t>
@@ -14906,7 +15018,7 @@
         <w:pStyle w:val="Titre1"/>
         <w:pageBreakBefore/>
       </w:pPr>
-      <w:bookmarkStart w:id="55" w:name="_Toc243485510"/>
+      <w:bookmarkStart w:id="55" w:name="_Toc243488435"/>
       <w:r>
         <w:lastRenderedPageBreak/>
         <w:t>12. Concepts in simple words</w:t>
@@ -17097,7 +17209,7 @@
         <w:pStyle w:val="Titre1"/>
         <w:pageBreakBefore/>
       </w:pPr>
-      <w:bookmarkStart w:id="56" w:name="_Toc243485511"/>
+      <w:bookmarkStart w:id="56" w:name="_Toc243488436"/>
       <w:r>
         <w:lastRenderedPageBreak/>
         <w:t>13. Questions you may get, with answers</w:t>
@@ -17119,7 +17231,7 @@
       <w:pPr>
         <w:pStyle w:val="Titre2"/>
       </w:pPr>
-      <w:bookmarkStart w:id="57" w:name="_Toc243485512"/>
+      <w:bookmarkStart w:id="57" w:name="_Toc243488437"/>
       <w:r>
         <w:t>About the data</w:t>
       </w:r>
@@ -17239,7 +17351,7 @@
       <w:pPr>
         <w:pStyle w:val="Titre2"/>
       </w:pPr>
-      <w:bookmarkStart w:id="58" w:name="_Toc243485513"/>
+      <w:bookmarkStart w:id="58" w:name="_Toc243488438"/>
       <w:r>
         <w:t>About the MLP</w:t>
       </w:r>
@@ -17359,7 +17471,7 @@
       <w:pPr>
         <w:pStyle w:val="Titre2"/>
       </w:pPr>
-      <w:bookmarkStart w:id="59" w:name="_Toc243485514"/>
+      <w:bookmarkStart w:id="59" w:name="_Toc243488439"/>
       <w:r>
         <w:t>About training and diagnosis</w:t>
       </w:r>
@@ -17457,7 +17569,7 @@
       <w:pPr>
         <w:pStyle w:val="Titre2"/>
       </w:pPr>
-      <w:bookmarkStart w:id="60" w:name="_Toc243485515"/>
+      <w:bookmarkStart w:id="60" w:name="_Toc243488440"/>
       <w:r>
         <w:lastRenderedPageBreak/>
         <w:t>About ResNet</w:t>
@@ -17732,7 +17844,7 @@
       <w:pPr>
         <w:pStyle w:val="Titre2"/>
       </w:pPr>
-      <w:bookmarkStart w:id="61" w:name="_Toc243485516"/>
+      <w:bookmarkStart w:id="61" w:name="_Toc243488441"/>
       <w:r>
         <w:t>About the results and the recommendation</w:t>
       </w:r>
@@ -17875,7 +17987,7 @@
       <w:pPr>
         <w:pStyle w:val="Titre2"/>
       </w:pPr>
-      <w:bookmarkStart w:id="62" w:name="_Toc243485517"/>
+      <w:bookmarkStart w:id="62" w:name="_Toc243488442"/>
       <w:r>
         <w:t>About the project</w:t>
       </w:r>
@@ -17930,7 +18042,7 @@
         <w:pStyle w:val="Titre1"/>
         <w:pageBreakBefore/>
       </w:pPr>
-      <w:bookmarkStart w:id="63" w:name="_Toc243485518"/>
+      <w:bookmarkStart w:id="63" w:name="_Toc243488443"/>
       <w:r>
         <w:lastRenderedPageBreak/>
         <w:t>14. Limits to admit, and next steps</w:t>
@@ -18724,7 +18836,7 @@
         <w:pStyle w:val="Titre1"/>
         <w:pageBreakBefore/>
       </w:pPr>
-      <w:bookmarkStart w:id="64" w:name="_Toc243485519"/>
+      <w:bookmarkStart w:id="64" w:name="_Toc243488444"/>
       <w:r>
         <w:lastRenderedPageBreak/>
         <w:t>15. Git history and how to reproduce</w:t>
@@ -19680,7 +19792,7 @@
         <w:pStyle w:val="Titre1"/>
         <w:pageBreakBefore/>
       </w:pPr>
-      <w:bookmarkStart w:id="65" w:name="_Toc243485520"/>
+      <w:bookmarkStart w:id="65" w:name="_Toc243488445"/>
       <w:r>
         <w:lastRenderedPageBreak/>
         <w:t>16. The 10-minute talk, slide by slide</w:t>
@@ -21038,7 +21150,7 @@
       <w:pPr>
         <w:pStyle w:val="Titre2"/>
       </w:pPr>
-      <w:bookmarkStart w:id="66" w:name="_Toc243485521"/>
+      <w:bookmarkStart w:id="66" w:name="_Toc243488446"/>
       <w:r>
         <w:t>The thread: each result opens the next step</w:t>
       </w:r>
@@ -21258,11 +21370,11 @@
         <w:spacing w:after="120"/>
       </w:pPr>
       <w:r>
-        <w:t>Slides 12 to 19 are backups for the questions: classical models (all the scores), seeing the painter inflates the score, validation vs test, why you can trust the numbers, the training recipes, the four broken runs of notebook 04, where the chosen model fails, and what about transformers (BERT, ViT, CLIP). The word-for-word script is in oral_script.pdf.</w:t>
+        <w:t>Slides 12 to 20 are backups for the questions: classical models (all the scores), seeing the painter inflates the score, validation vs test, why you can trust the numbers, the training recipes, the four broken runs of notebook 04, where the chosen model fails, what about transformers (BERT, ViT, CLIP), and inside ResNet18 + our linear head. The word-for-word script is in oral_script.pdf.</w:t>
       </w:r>
     </w:p>
     <w:sectPr>
-      <w:footerReference w:type="default" r:id="rId13"/>
+      <w:footerReference w:type="default" r:id="rId14"/>
       <w:pgSz w:w="11906" w:h="16838"/>
       <w:pgMar w:top="1134" w:right="1134" w:bottom="1134" w:left="1134" w:header="708" w:footer="708" w:gutter="0"/>
       <w:cols w:space="720"/>
@@ -21372,96 +21484,10 @@
 <file path=word/numbering.xml><?xml version="1.0" encoding="utf-8"?>
 <w:numbering xmlns:wpc="http://schemas.microsoft.com/office/word/2010/wordprocessingCanvas" xmlns:cx="http://schemas.microsoft.com/office/drawing/2014/chartex" xmlns:cx1="http://schemas.microsoft.com/office/drawing/2015/9/8/chartex" xmlns:cx2="http://schemas.microsoft.com/office/drawing/2015/10/21/chartex" xmlns:cx3="http://schemas.microsoft.com/office/drawing/2016/5/9/chartex" xmlns:cx4="http://schemas.microsoft.com/office/drawing/2016/5/10/chartex" xmlns:cx5="http://schemas.microsoft.com/office/drawing/2016/5/11/chartex" xmlns:cx6="http://schemas.microsoft.com/office/drawing/2016/5/12/chartex" xmlns:cx7="http://schemas.microsoft.com/office/drawing/2016/5/13/chartex" xmlns:cx8="http://schemas.microsoft.com/office/drawing/2016/5/14/chartex" xmlns:mc="http://schemas.openxmlformats.org/markup-compatibility/2006" xmlns:aink="http://schemas.microsoft.com/office/drawing/2016/ink" xmlns:am3d="http://schemas.microsoft.com/office/drawing/2017/model3d" xmlns:o="urn:schemas-microsoft-com:office:office" xmlns:oel="http://schemas.microsoft.com/office/2019/extlst" xmlns:r="http://schemas.openxmlformats.org/officeDocument/2006/relationships" xmlns:m="http://schemas.openxmlformats.org/officeDocument/2006/math" xmlns:v="urn:schemas-microsoft-com:vml" xmlns:wp14="http://schemas.microsoft.com/office/word/2010/wordprocessingDrawing" xmlns:wp="http://schemas.openxmlformats.org/drawingml/2006/wordprocessingDrawing" xmlns:w10="urn:schemas-microsoft-com:office:word" xmlns:w="http://schemas.openxmlformats.org/wordprocessingml/2006/main" xmlns:w14="http://schemas.microsoft.com/office/word/2010/wordml" xmlns:w15="http://schemas.microsoft.com/office/word/2012/wordml" xmlns:w16cex="http://schemas.microsoft.com/office/word/2018/wordml/cex" xmlns:w16cid="http://schemas.microsoft.com/office/word/2016/wordml/cid" xmlns:w16="http://schemas.microsoft.com/office/word/2018/wordml" xmlns:w16du="http://schemas.microsoft.com/office/word/2023/wordml/word16du" xmlns:w16sdtdh="http://schemas.microsoft.com/office/word/2020/wordml/sdtdatahash" xmlns:w16sdtfl="http://schemas.microsoft.com/office/word/2024/wordml/sdtformatlock" xmlns:w16se="http://schemas.microsoft.com/office/word/2015/wordml/symex" xmlns:wpg="http://schemas.microsoft.com/office/word/2010/wordprocessingGroup" xmlns:wpi="http://schemas.microsoft.com/office/word/2010/wordprocessingInk" xmlns:wne="http://schemas.microsoft.com/office/word/2006/wordml" xmlns:wps="http://schemas.microsoft.com/office/word/2010/wordprocessingShape" mc:Ignorable="w14 w15 w16se w16cid w16 w16cex w16sdtdh w16sdtfl w16du wp14">
   <w:abstractNum w:abstractNumId="0" w15:restartNumberingAfterBreak="0">
-    <w:nsid w:val="01287CBF"/>
+    <w:nsid w:val="067449DC"/>
     <w:multiLevelType w:val="hybridMultilevel"/>
-    <w:tmpl w:val="B5C4C3A0"/>
-    <w:lvl w:ilvl="0" w:tplc="4AB8C252" w:tentative="1">
-      <w:start w:val="1"/>
-      <w:numFmt w:val="bullet"/>
-      <w:lvlText w:val="●"/>
-      <w:lvlJc w:val="left"/>
-      <w:pPr>
-        <w:ind w:left="720" w:hanging="360"/>
-      </w:pPr>
-    </w:lvl>
-    <w:lvl w:ilvl="1" w:tplc="4D64561E" w:tentative="1">
-      <w:start w:val="1"/>
-      <w:numFmt w:val="bullet"/>
-      <w:lvlText w:val="○"/>
-      <w:lvlJc w:val="left"/>
-      <w:pPr>
-        <w:ind w:left="1440" w:hanging="360"/>
-      </w:pPr>
-    </w:lvl>
-    <w:lvl w:ilvl="2" w:tplc="3368A564" w:tentative="1">
-      <w:start w:val="1"/>
-      <w:numFmt w:val="bullet"/>
-      <w:lvlText w:val="■"/>
-      <w:lvlJc w:val="left"/>
-      <w:pPr>
-        <w:ind w:left="2160" w:hanging="360"/>
-      </w:pPr>
-    </w:lvl>
-    <w:lvl w:ilvl="3" w:tplc="722A4022" w:tentative="1">
-      <w:start w:val="1"/>
-      <w:numFmt w:val="bullet"/>
-      <w:lvlText w:val="●"/>
-      <w:lvlJc w:val="left"/>
-      <w:pPr>
-        <w:ind w:left="2880" w:hanging="360"/>
-      </w:pPr>
-    </w:lvl>
-    <w:lvl w:ilvl="4" w:tplc="EE562374" w:tentative="1">
-      <w:start w:val="1"/>
-      <w:numFmt w:val="bullet"/>
-      <w:lvlText w:val="○"/>
-      <w:lvlJc w:val="left"/>
-      <w:pPr>
-        <w:ind w:left="3600" w:hanging="360"/>
-      </w:pPr>
-    </w:lvl>
-    <w:lvl w:ilvl="5" w:tplc="9D2412C4" w:tentative="1">
-      <w:start w:val="1"/>
-      <w:numFmt w:val="bullet"/>
-      <w:lvlText w:val="■"/>
-      <w:lvlJc w:val="left"/>
-      <w:pPr>
-        <w:ind w:left="4320" w:hanging="360"/>
-      </w:pPr>
-    </w:lvl>
-    <w:lvl w:ilvl="6" w:tplc="56FC8604" w:tentative="1">
-      <w:start w:val="1"/>
-      <w:numFmt w:val="bullet"/>
-      <w:lvlText w:val="●"/>
-      <w:lvlJc w:val="left"/>
-      <w:pPr>
-        <w:ind w:left="5040" w:hanging="360"/>
-      </w:pPr>
-    </w:lvl>
-    <w:lvl w:ilvl="7" w:tplc="C4FEE770" w:tentative="1">
-      <w:start w:val="1"/>
-      <w:numFmt w:val="bullet"/>
-      <w:lvlText w:val="●"/>
-      <w:lvlJc w:val="left"/>
-      <w:pPr>
-        <w:ind w:left="5760" w:hanging="360"/>
-      </w:pPr>
-    </w:lvl>
-    <w:lvl w:ilvl="8" w:tplc="6900800A" w:tentative="1">
-      <w:start w:val="1"/>
-      <w:numFmt w:val="bullet"/>
-      <w:lvlText w:val="●"/>
-      <w:lvlJc w:val="left"/>
-      <w:pPr>
-        <w:ind w:left="6480" w:hanging="360"/>
-      </w:pPr>
-    </w:lvl>
-  </w:abstractNum>
-  <w:abstractNum w:abstractNumId="1" w15:restartNumberingAfterBreak="0">
-    <w:nsid w:val="0DBF100C"/>
-    <w:multiLevelType w:val="hybridMultilevel"/>
-    <w:tmpl w:val="897CE27A"/>
-    <w:lvl w:ilvl="0" w:tplc="2390C9D6">
+    <w:tmpl w:val="69D2FB68"/>
+    <w:lvl w:ilvl="0" w:tplc="5434C2C8">
       <w:start w:val="1"/>
       <w:numFmt w:val="decimal"/>
       <w:lvlText w:val="%1."/>
@@ -21470,52 +21496,192 @@
         <w:ind w:left="400" w:hanging="300"/>
       </w:pPr>
     </w:lvl>
-    <w:lvl w:ilvl="1" w:tplc="CA164944">
+    <w:lvl w:ilvl="1" w:tplc="0BFAF764">
       <w:numFmt w:val="decimal"/>
       <w:lvlText w:val=""/>
       <w:lvlJc w:val="left"/>
     </w:lvl>
-    <w:lvl w:ilvl="2" w:tplc="3AE6E1BA">
+    <w:lvl w:ilvl="2" w:tplc="7F267BAE">
       <w:numFmt w:val="decimal"/>
       <w:lvlText w:val=""/>
       <w:lvlJc w:val="left"/>
     </w:lvl>
-    <w:lvl w:ilvl="3" w:tplc="58866BEA">
+    <w:lvl w:ilvl="3" w:tplc="2CF6441A">
       <w:numFmt w:val="decimal"/>
       <w:lvlText w:val=""/>
       <w:lvlJc w:val="left"/>
     </w:lvl>
-    <w:lvl w:ilvl="4" w:tplc="6630D9BA">
+    <w:lvl w:ilvl="4" w:tplc="FB602F44">
       <w:numFmt w:val="decimal"/>
       <w:lvlText w:val=""/>
       <w:lvlJc w:val="left"/>
     </w:lvl>
-    <w:lvl w:ilvl="5" w:tplc="2D740054">
+    <w:lvl w:ilvl="5" w:tplc="B9849676">
       <w:numFmt w:val="decimal"/>
       <w:lvlText w:val=""/>
       <w:lvlJc w:val="left"/>
     </w:lvl>
-    <w:lvl w:ilvl="6" w:tplc="E6BC46F6">
+    <w:lvl w:ilvl="6" w:tplc="A6D83A86">
       <w:numFmt w:val="decimal"/>
       <w:lvlText w:val=""/>
       <w:lvlJc w:val="left"/>
     </w:lvl>
-    <w:lvl w:ilvl="7" w:tplc="97948370">
+    <w:lvl w:ilvl="7" w:tplc="A4A84CB8">
       <w:numFmt w:val="decimal"/>
       <w:lvlText w:val=""/>
       <w:lvlJc w:val="left"/>
     </w:lvl>
-    <w:lvl w:ilvl="8" w:tplc="CF9886BE">
+    <w:lvl w:ilvl="8" w:tplc="B4001B0A">
+      <w:numFmt w:val="decimal"/>
+      <w:lvlText w:val=""/>
+      <w:lvlJc w:val="left"/>
+    </w:lvl>
+  </w:abstractNum>
+  <w:abstractNum w:abstractNumId="1" w15:restartNumberingAfterBreak="0">
+    <w:nsid w:val="06A50F63"/>
+    <w:multiLevelType w:val="hybridMultilevel"/>
+    <w:tmpl w:val="FB9AC8CA"/>
+    <w:lvl w:ilvl="0" w:tplc="690A385E">
+      <w:start w:val="1"/>
+      <w:numFmt w:val="decimal"/>
+      <w:lvlText w:val="%1."/>
+      <w:lvlJc w:val="left"/>
+      <w:pPr>
+        <w:ind w:left="400" w:hanging="300"/>
+      </w:pPr>
+    </w:lvl>
+    <w:lvl w:ilvl="1" w:tplc="EEACE668">
+      <w:numFmt w:val="decimal"/>
+      <w:lvlText w:val=""/>
+      <w:lvlJc w:val="left"/>
+    </w:lvl>
+    <w:lvl w:ilvl="2" w:tplc="A0EADAE4">
+      <w:numFmt w:val="decimal"/>
+      <w:lvlText w:val=""/>
+      <w:lvlJc w:val="left"/>
+    </w:lvl>
+    <w:lvl w:ilvl="3" w:tplc="19E2423E">
+      <w:numFmt w:val="decimal"/>
+      <w:lvlText w:val=""/>
+      <w:lvlJc w:val="left"/>
+    </w:lvl>
+    <w:lvl w:ilvl="4" w:tplc="BA746C5E">
+      <w:numFmt w:val="decimal"/>
+      <w:lvlText w:val=""/>
+      <w:lvlJc w:val="left"/>
+    </w:lvl>
+    <w:lvl w:ilvl="5" w:tplc="CAE09F96">
+      <w:numFmt w:val="decimal"/>
+      <w:lvlText w:val=""/>
+      <w:lvlJc w:val="left"/>
+    </w:lvl>
+    <w:lvl w:ilvl="6" w:tplc="E9F286D4">
+      <w:numFmt w:val="decimal"/>
+      <w:lvlText w:val=""/>
+      <w:lvlJc w:val="left"/>
+    </w:lvl>
+    <w:lvl w:ilvl="7" w:tplc="E67222FE">
+      <w:numFmt w:val="decimal"/>
+      <w:lvlText w:val=""/>
+      <w:lvlJc w:val="left"/>
+    </w:lvl>
+    <w:lvl w:ilvl="8" w:tplc="ABA0AF06">
       <w:numFmt w:val="decimal"/>
       <w:lvlText w:val=""/>
       <w:lvlJc w:val="left"/>
     </w:lvl>
   </w:abstractNum>
   <w:abstractNum w:abstractNumId="2" w15:restartNumberingAfterBreak="0">
-    <w:nsid w:val="2FDC510C"/>
+    <w:nsid w:val="1E305F6A"/>
     <w:multiLevelType w:val="hybridMultilevel"/>
-    <w:tmpl w:val="07A0BF6E"/>
-    <w:lvl w:ilvl="0" w:tplc="53984A58">
+    <w:tmpl w:val="CF240C80"/>
+    <w:lvl w:ilvl="0" w:tplc="FC749772" w:tentative="1">
+      <w:start w:val="1"/>
+      <w:numFmt w:val="bullet"/>
+      <w:lvlText w:val="●"/>
+      <w:lvlJc w:val="left"/>
+      <w:pPr>
+        <w:ind w:left="720" w:hanging="360"/>
+      </w:pPr>
+    </w:lvl>
+    <w:lvl w:ilvl="1" w:tplc="89F2935C" w:tentative="1">
+      <w:start w:val="1"/>
+      <w:numFmt w:val="bullet"/>
+      <w:lvlText w:val="○"/>
+      <w:lvlJc w:val="left"/>
+      <w:pPr>
+        <w:ind w:left="1440" w:hanging="360"/>
+      </w:pPr>
+    </w:lvl>
+    <w:lvl w:ilvl="2" w:tplc="9DFE9400" w:tentative="1">
+      <w:start w:val="1"/>
+      <w:numFmt w:val="bullet"/>
+      <w:lvlText w:val="■"/>
+      <w:lvlJc w:val="left"/>
+      <w:pPr>
+        <w:ind w:left="2160" w:hanging="360"/>
+      </w:pPr>
+    </w:lvl>
+    <w:lvl w:ilvl="3" w:tplc="46FEF6C0" w:tentative="1">
+      <w:start w:val="1"/>
+      <w:numFmt w:val="bullet"/>
+      <w:lvlText w:val="●"/>
+      <w:lvlJc w:val="left"/>
+      <w:pPr>
+        <w:ind w:left="2880" w:hanging="360"/>
+      </w:pPr>
+    </w:lvl>
+    <w:lvl w:ilvl="4" w:tplc="B00EB1AC" w:tentative="1">
+      <w:start w:val="1"/>
+      <w:numFmt w:val="bullet"/>
+      <w:lvlText w:val="○"/>
+      <w:lvlJc w:val="left"/>
+      <w:pPr>
+        <w:ind w:left="3600" w:hanging="360"/>
+      </w:pPr>
+    </w:lvl>
+    <w:lvl w:ilvl="5" w:tplc="B5668932" w:tentative="1">
+      <w:start w:val="1"/>
+      <w:numFmt w:val="bullet"/>
+      <w:lvlText w:val="■"/>
+      <w:lvlJc w:val="left"/>
+      <w:pPr>
+        <w:ind w:left="4320" w:hanging="360"/>
+      </w:pPr>
+    </w:lvl>
+    <w:lvl w:ilvl="6" w:tplc="E18C4900" w:tentative="1">
+      <w:start w:val="1"/>
+      <w:numFmt w:val="bullet"/>
+      <w:lvlText w:val="●"/>
+      <w:lvlJc w:val="left"/>
+      <w:pPr>
+        <w:ind w:left="5040" w:hanging="360"/>
+      </w:pPr>
+    </w:lvl>
+    <w:lvl w:ilvl="7" w:tplc="FCA4AB3E" w:tentative="1">
+      <w:start w:val="1"/>
+      <w:numFmt w:val="bullet"/>
+      <w:lvlText w:val="●"/>
+      <w:lvlJc w:val="left"/>
+      <w:pPr>
+        <w:ind w:left="5760" w:hanging="360"/>
+      </w:pPr>
+    </w:lvl>
+    <w:lvl w:ilvl="8" w:tplc="DE04D43A" w:tentative="1">
+      <w:start w:val="1"/>
+      <w:numFmt w:val="bullet"/>
+      <w:lvlText w:val="●"/>
+      <w:lvlJc w:val="left"/>
+      <w:pPr>
+        <w:ind w:left="6480" w:hanging="360"/>
+      </w:pPr>
+    </w:lvl>
+  </w:abstractNum>
+  <w:abstractNum w:abstractNumId="3" w15:restartNumberingAfterBreak="0">
+    <w:nsid w:val="333E099D"/>
+    <w:multiLevelType w:val="hybridMultilevel"/>
+    <w:tmpl w:val="0C64A498"/>
+    <w:lvl w:ilvl="0" w:tplc="07464CC6">
       <w:start w:val="1"/>
       <w:numFmt w:val="decimal"/>
       <w:lvlText w:val="%1."/>
@@ -21524,181 +21690,127 @@
         <w:ind w:left="400" w:hanging="300"/>
       </w:pPr>
     </w:lvl>
-    <w:lvl w:ilvl="1" w:tplc="8C6A56E4">
+    <w:lvl w:ilvl="1" w:tplc="DB3E8E52">
       <w:numFmt w:val="decimal"/>
       <w:lvlText w:val=""/>
       <w:lvlJc w:val="left"/>
     </w:lvl>
-    <w:lvl w:ilvl="2" w:tplc="F6C2F298">
+    <w:lvl w:ilvl="2" w:tplc="48BA5AB0">
       <w:numFmt w:val="decimal"/>
       <w:lvlText w:val=""/>
       <w:lvlJc w:val="left"/>
     </w:lvl>
-    <w:lvl w:ilvl="3" w:tplc="6E9A7A68">
+    <w:lvl w:ilvl="3" w:tplc="67628556">
       <w:numFmt w:val="decimal"/>
       <w:lvlText w:val=""/>
       <w:lvlJc w:val="left"/>
     </w:lvl>
-    <w:lvl w:ilvl="4" w:tplc="67F0F916">
+    <w:lvl w:ilvl="4" w:tplc="B5F4C1C6">
       <w:numFmt w:val="decimal"/>
       <w:lvlText w:val=""/>
       <w:lvlJc w:val="left"/>
     </w:lvl>
-    <w:lvl w:ilvl="5" w:tplc="851266AC">
+    <w:lvl w:ilvl="5" w:tplc="5550427A">
       <w:numFmt w:val="decimal"/>
       <w:lvlText w:val=""/>
       <w:lvlJc w:val="left"/>
     </w:lvl>
-    <w:lvl w:ilvl="6" w:tplc="546081EC">
+    <w:lvl w:ilvl="6" w:tplc="994EF22C">
       <w:numFmt w:val="decimal"/>
       <w:lvlText w:val=""/>
       <w:lvlJc w:val="left"/>
     </w:lvl>
-    <w:lvl w:ilvl="7" w:tplc="B90A4332">
+    <w:lvl w:ilvl="7" w:tplc="3C9CB59C">
       <w:numFmt w:val="decimal"/>
       <w:lvlText w:val=""/>
       <w:lvlJc w:val="left"/>
     </w:lvl>
-    <w:lvl w:ilvl="8" w:tplc="260C2232">
-      <w:numFmt w:val="decimal"/>
-      <w:lvlText w:val=""/>
-      <w:lvlJc w:val="left"/>
-    </w:lvl>
-  </w:abstractNum>
-  <w:abstractNum w:abstractNumId="3" w15:restartNumberingAfterBreak="0">
-    <w:nsid w:val="3C3E570E"/>
-    <w:multiLevelType w:val="hybridMultilevel"/>
-    <w:tmpl w:val="E6669868"/>
-    <w:lvl w:ilvl="0" w:tplc="74627850">
-      <w:start w:val="1"/>
-      <w:numFmt w:val="bullet"/>
-      <w:lvlText w:val="•"/>
-      <w:lvlJc w:val="left"/>
-      <w:pPr>
-        <w:ind w:left="400" w:hanging="260"/>
-      </w:pPr>
-    </w:lvl>
-    <w:lvl w:ilvl="1" w:tplc="07EE7D24">
-      <w:numFmt w:val="decimal"/>
-      <w:lvlText w:val=""/>
-      <w:lvlJc w:val="left"/>
-    </w:lvl>
-    <w:lvl w:ilvl="2" w:tplc="5E622FB2">
-      <w:numFmt w:val="decimal"/>
-      <w:lvlText w:val=""/>
-      <w:lvlJc w:val="left"/>
-    </w:lvl>
-    <w:lvl w:ilvl="3" w:tplc="3F82B46E">
-      <w:numFmt w:val="decimal"/>
-      <w:lvlText w:val=""/>
-      <w:lvlJc w:val="left"/>
-    </w:lvl>
-    <w:lvl w:ilvl="4" w:tplc="86E69BB2">
-      <w:numFmt w:val="decimal"/>
-      <w:lvlText w:val=""/>
-      <w:lvlJc w:val="left"/>
-    </w:lvl>
-    <w:lvl w:ilvl="5" w:tplc="6178C94C">
-      <w:numFmt w:val="decimal"/>
-      <w:lvlText w:val=""/>
-      <w:lvlJc w:val="left"/>
-    </w:lvl>
-    <w:lvl w:ilvl="6" w:tplc="09E84F66">
-      <w:numFmt w:val="decimal"/>
-      <w:lvlText w:val=""/>
-      <w:lvlJc w:val="left"/>
-    </w:lvl>
-    <w:lvl w:ilvl="7" w:tplc="4E9ADDFE">
-      <w:numFmt w:val="decimal"/>
-      <w:lvlText w:val=""/>
-      <w:lvlJc w:val="left"/>
-    </w:lvl>
-    <w:lvl w:ilvl="8" w:tplc="E5520828">
+    <w:lvl w:ilvl="8" w:tplc="9FF870B4">
       <w:numFmt w:val="decimal"/>
       <w:lvlText w:val=""/>
       <w:lvlJc w:val="left"/>
     </w:lvl>
   </w:abstractNum>
   <w:abstractNum w:abstractNumId="4" w15:restartNumberingAfterBreak="0">
-    <w:nsid w:val="65861685"/>
+    <w:nsid w:val="61E67D17"/>
     <w:multiLevelType w:val="hybridMultilevel"/>
-    <w:tmpl w:val="355453BE"/>
-    <w:lvl w:ilvl="0" w:tplc="18C0D6C2">
+    <w:tmpl w:val="785CCFD8"/>
+    <w:lvl w:ilvl="0" w:tplc="13B698E6">
       <w:start w:val="1"/>
-      <w:numFmt w:val="decimal"/>
-      <w:lvlText w:val="%1."/>
+      <w:numFmt w:val="bullet"/>
+      <w:lvlText w:val="•"/>
       <w:lvlJc w:val="left"/>
       <w:pPr>
-        <w:ind w:left="400" w:hanging="300"/>
+        <w:ind w:left="400" w:hanging="260"/>
       </w:pPr>
     </w:lvl>
-    <w:lvl w:ilvl="1" w:tplc="7CAE954A">
+    <w:lvl w:ilvl="1" w:tplc="30D4ACEE">
       <w:numFmt w:val="decimal"/>
       <w:lvlText w:val=""/>
       <w:lvlJc w:val="left"/>
     </w:lvl>
-    <w:lvl w:ilvl="2" w:tplc="BEBEF7E6">
+    <w:lvl w:ilvl="2" w:tplc="CE20396E">
       <w:numFmt w:val="decimal"/>
       <w:lvlText w:val=""/>
       <w:lvlJc w:val="left"/>
     </w:lvl>
-    <w:lvl w:ilvl="3" w:tplc="D1EA8D54">
+    <w:lvl w:ilvl="3" w:tplc="B1A0E7B4">
       <w:numFmt w:val="decimal"/>
       <w:lvlText w:val=""/>
       <w:lvlJc w:val="left"/>
     </w:lvl>
-    <w:lvl w:ilvl="4" w:tplc="4A644A12">
+    <w:lvl w:ilvl="4" w:tplc="9C620C80">
       <w:numFmt w:val="decimal"/>
       <w:lvlText w:val=""/>
       <w:lvlJc w:val="left"/>
     </w:lvl>
-    <w:lvl w:ilvl="5" w:tplc="F83CA45E">
+    <w:lvl w:ilvl="5" w:tplc="ECEE0998">
       <w:numFmt w:val="decimal"/>
       <w:lvlText w:val=""/>
       <w:lvlJc w:val="left"/>
     </w:lvl>
-    <w:lvl w:ilvl="6" w:tplc="5A26CF9A">
+    <w:lvl w:ilvl="6" w:tplc="67BCF61E">
       <w:numFmt w:val="decimal"/>
       <w:lvlText w:val=""/>
       <w:lvlJc w:val="left"/>
     </w:lvl>
-    <w:lvl w:ilvl="7" w:tplc="D91A35AE">
+    <w:lvl w:ilvl="7" w:tplc="6BA03DC2">
       <w:numFmt w:val="decimal"/>
       <w:lvlText w:val=""/>
       <w:lvlJc w:val="left"/>
     </w:lvl>
-    <w:lvl w:ilvl="8" w:tplc="CFB87638">
+    <w:lvl w:ilvl="8" w:tplc="B4BC3F26">
       <w:numFmt w:val="decimal"/>
       <w:lvlText w:val=""/>
       <w:lvlJc w:val="left"/>
     </w:lvl>
   </w:abstractNum>
-  <w:num w:numId="1" w16cid:durableId="1789078505">
-    <w:abstractNumId w:val="0"/>
+  <w:num w:numId="1" w16cid:durableId="1931621079">
+    <w:abstractNumId w:val="2"/>
     <w:lvlOverride w:ilvl="0">
       <w:startOverride w:val="1"/>
     </w:lvlOverride>
   </w:num>
-  <w:num w:numId="2" w16cid:durableId="282269251">
+  <w:num w:numId="2" w16cid:durableId="1746419459">
     <w:abstractNumId w:val="1"/>
     <w:lvlOverride w:ilvl="0">
       <w:startOverride w:val="1"/>
     </w:lvlOverride>
   </w:num>
-  <w:num w:numId="3" w16cid:durableId="73548876">
+  <w:num w:numId="3" w16cid:durableId="560797426">
+    <w:abstractNumId w:val="4"/>
+    <w:lvlOverride w:ilvl="0">
+      <w:startOverride w:val="1"/>
+    </w:lvlOverride>
+  </w:num>
+  <w:num w:numId="4" w16cid:durableId="1869678412">
     <w:abstractNumId w:val="3"/>
     <w:lvlOverride w:ilvl="0">
       <w:startOverride w:val="1"/>
     </w:lvlOverride>
   </w:num>
-  <w:num w:numId="4" w16cid:durableId="1435980633">
-    <w:abstractNumId w:val="4"/>
-    <w:lvlOverride w:ilvl="0">
-      <w:startOverride w:val="1"/>
-    </w:lvlOverride>
-  </w:num>
-  <w:num w:numId="5" w16cid:durableId="809712489">
-    <w:abstractNumId w:val="2"/>
+  <w:num w:numId="5" w16cid:durableId="1032653813">
+    <w:abstractNumId w:val="0"/>
     <w:lvlOverride w:ilvl="0">
       <w:startOverride w:val="1"/>
     </w:lvlOverride>
@@ -22338,7 +22450,7 @@
     <w:autoRedefine/>
     <w:uiPriority w:val="39"/>
     <w:unhideWhenUsed/>
-    <w:rsid w:val="00767DE4"/>
+    <w:rsid w:val="00611F61"/>
     <w:pPr>
       <w:spacing w:after="100"/>
     </w:pPr>
@@ -22350,7 +22462,7 @@
     <w:autoRedefine/>
     <w:uiPriority w:val="39"/>
     <w:unhideWhenUsed/>
-    <w:rsid w:val="00767DE4"/>
+    <w:rsid w:val="00611F61"/>
     <w:pPr>
       <w:spacing w:after="100"/>
       <w:ind w:left="210"/>

</xml_diff>

<commit_message>
Add the from-zero result to a backup slide, the guide and the README
</commit_message>
<xml_diff>
--- a/docs/oral_study_guide.docx
+++ b/docs/oral_study_guide.docx
@@ -93,7 +93,7 @@
     <w:sdt>
       <w:sdtPr>
         <w:alias w:val="Contents"/>
-        <w:id w:val="-2012597017"/>
+        <w:id w:val="1854600755"/>
       </w:sdtPr>
       <w:sdtEndPr/>
       <w:sdtContent>
@@ -116,7 +116,7 @@
           <w:r>
             <w:fldChar w:fldCharType="separate"/>
           </w:r>
-          <w:hyperlink w:anchor="_Toc243488380" w:history="1">
+          <w:hyperlink w:anchor="_Toc243489863" w:history="1">
             <w:r>
               <w:rPr>
                 <w:rStyle w:val="Lienhypertexte"/>
@@ -140,7 +140,7 @@
               <w:rPr>
                 <w:noProof/>
               </w:rPr>
-              <w:instrText xml:space="preserve"> PAGEREF _Toc243488380 \h </w:instrText>
+              <w:instrText xml:space="preserve"> PAGEREF _Toc243489863 \h </w:instrText>
             </w:r>
             <w:r>
               <w:rPr>
@@ -177,7 +177,7 @@
               <w:noProof/>
             </w:rPr>
           </w:pPr>
-          <w:hyperlink w:anchor="_Toc243488381" w:history="1">
+          <w:hyperlink w:anchor="_Toc243489864" w:history="1">
             <w:r>
               <w:rPr>
                 <w:rStyle w:val="Lienhypertexte"/>
@@ -201,7 +201,7 @@
               <w:rPr>
                 <w:noProof/>
               </w:rPr>
-              <w:instrText xml:space="preserve"> PAGEREF _Toc243488381 \h </w:instrText>
+              <w:instrText xml:space="preserve"> PAGEREF _Toc243489864 \h </w:instrText>
             </w:r>
             <w:r>
               <w:rPr>
@@ -238,7 +238,7 @@
               <w:noProof/>
             </w:rPr>
           </w:pPr>
-          <w:hyperlink w:anchor="_Toc243488382" w:history="1">
+          <w:hyperlink w:anchor="_Toc243489865" w:history="1">
             <w:r>
               <w:rPr>
                 <w:rStyle w:val="Lienhypertexte"/>
@@ -262,7 +262,7 @@
               <w:rPr>
                 <w:noProof/>
               </w:rPr>
-              <w:instrText xml:space="preserve"> PAGEREF _Toc243488382 \h </w:instrText>
+              <w:instrText xml:space="preserve"> PAGEREF _Toc243489865 \h </w:instrText>
             </w:r>
             <w:r>
               <w:rPr>
@@ -299,7 +299,7 @@
               <w:noProof/>
             </w:rPr>
           </w:pPr>
-          <w:hyperlink w:anchor="_Toc243488383" w:history="1">
+          <w:hyperlink w:anchor="_Toc243489866" w:history="1">
             <w:r>
               <w:rPr>
                 <w:rStyle w:val="Lienhypertexte"/>
@@ -323,7 +323,7 @@
               <w:rPr>
                 <w:noProof/>
               </w:rPr>
-              <w:instrText xml:space="preserve"> PAGEREF _Toc243488383 \h </w:instrText>
+              <w:instrText xml:space="preserve"> PAGEREF _Toc243489866 \h </w:instrText>
             </w:r>
             <w:r>
               <w:rPr>
@@ -360,7 +360,7 @@
               <w:noProof/>
             </w:rPr>
           </w:pPr>
-          <w:hyperlink w:anchor="_Toc243488384" w:history="1">
+          <w:hyperlink w:anchor="_Toc243489867" w:history="1">
             <w:r>
               <w:rPr>
                 <w:rStyle w:val="Lienhypertexte"/>
@@ -384,7 +384,7 @@
               <w:rPr>
                 <w:noProof/>
               </w:rPr>
-              <w:instrText xml:space="preserve"> PAGEREF _Toc243488384 \h </w:instrText>
+              <w:instrText xml:space="preserve"> PAGEREF _Toc243489867 \h </w:instrText>
             </w:r>
             <w:r>
               <w:rPr>
@@ -421,7 +421,7 @@
               <w:noProof/>
             </w:rPr>
           </w:pPr>
-          <w:hyperlink w:anchor="_Toc243488385" w:history="1">
+          <w:hyperlink w:anchor="_Toc243489868" w:history="1">
             <w:r>
               <w:rPr>
                 <w:rStyle w:val="Lienhypertexte"/>
@@ -445,7 +445,7 @@
               <w:rPr>
                 <w:noProof/>
               </w:rPr>
-              <w:instrText xml:space="preserve"> PAGEREF _Toc243488385 \h </w:instrText>
+              <w:instrText xml:space="preserve"> PAGEREF _Toc243489868 \h </w:instrText>
             </w:r>
             <w:r>
               <w:rPr>
@@ -482,7 +482,7 @@
               <w:noProof/>
             </w:rPr>
           </w:pPr>
-          <w:hyperlink w:anchor="_Toc243488386" w:history="1">
+          <w:hyperlink w:anchor="_Toc243489869" w:history="1">
             <w:r>
               <w:rPr>
                 <w:rStyle w:val="Lienhypertexte"/>
@@ -506,7 +506,7 @@
               <w:rPr>
                 <w:noProof/>
               </w:rPr>
-              <w:instrText xml:space="preserve"> PAGEREF _Toc243488386 \h </w:instrText>
+              <w:instrText xml:space="preserve"> PAGEREF _Toc243489869 \h </w:instrText>
             </w:r>
             <w:r>
               <w:rPr>
@@ -543,7 +543,7 @@
               <w:noProof/>
             </w:rPr>
           </w:pPr>
-          <w:hyperlink w:anchor="_Toc243488387" w:history="1">
+          <w:hyperlink w:anchor="_Toc243489870" w:history="1">
             <w:r>
               <w:rPr>
                 <w:rStyle w:val="Lienhypertexte"/>
@@ -567,7 +567,7 @@
               <w:rPr>
                 <w:noProof/>
               </w:rPr>
-              <w:instrText xml:space="preserve"> PAGEREF _Toc243488387 \h </w:instrText>
+              <w:instrText xml:space="preserve"> PAGEREF _Toc243489870 \h </w:instrText>
             </w:r>
             <w:r>
               <w:rPr>
@@ -604,7 +604,7 @@
               <w:noProof/>
             </w:rPr>
           </w:pPr>
-          <w:hyperlink w:anchor="_Toc243488388" w:history="1">
+          <w:hyperlink w:anchor="_Toc243489871" w:history="1">
             <w:r>
               <w:rPr>
                 <w:rStyle w:val="Lienhypertexte"/>
@@ -628,7 +628,7 @@
               <w:rPr>
                 <w:noProof/>
               </w:rPr>
-              <w:instrText xml:space="preserve"> PAGEREF _Toc243488388 \h </w:instrText>
+              <w:instrText xml:space="preserve"> PAGEREF _Toc243489871 \h </w:instrText>
             </w:r>
             <w:r>
               <w:rPr>
@@ -665,7 +665,7 @@
               <w:noProof/>
             </w:rPr>
           </w:pPr>
-          <w:hyperlink w:anchor="_Toc243488389" w:history="1">
+          <w:hyperlink w:anchor="_Toc243489872" w:history="1">
             <w:r>
               <w:rPr>
                 <w:rStyle w:val="Lienhypertexte"/>
@@ -689,7 +689,7 @@
               <w:rPr>
                 <w:noProof/>
               </w:rPr>
-              <w:instrText xml:space="preserve"> PAGEREF _Toc243488389 \h </w:instrText>
+              <w:instrText xml:space="preserve"> PAGEREF _Toc243489872 \h </w:instrText>
             </w:r>
             <w:r>
               <w:rPr>
@@ -726,7 +726,7 @@
               <w:noProof/>
             </w:rPr>
           </w:pPr>
-          <w:hyperlink w:anchor="_Toc243488390" w:history="1">
+          <w:hyperlink w:anchor="_Toc243489873" w:history="1">
             <w:r>
               <w:rPr>
                 <w:rStyle w:val="Lienhypertexte"/>
@@ -750,7 +750,7 @@
               <w:rPr>
                 <w:noProof/>
               </w:rPr>
-              <w:instrText xml:space="preserve"> PAGEREF _Toc243488390 \h </w:instrText>
+              <w:instrText xml:space="preserve"> PAGEREF _Toc243489873 \h </w:instrText>
             </w:r>
             <w:r>
               <w:rPr>
@@ -787,7 +787,7 @@
               <w:noProof/>
             </w:rPr>
           </w:pPr>
-          <w:hyperlink w:anchor="_Toc243488391" w:history="1">
+          <w:hyperlink w:anchor="_Toc243489874" w:history="1">
             <w:r>
               <w:rPr>
                 <w:rStyle w:val="Lienhypertexte"/>
@@ -811,7 +811,7 @@
               <w:rPr>
                 <w:noProof/>
               </w:rPr>
-              <w:instrText xml:space="preserve"> PAGEREF _Toc243488391 \h </w:instrText>
+              <w:instrText xml:space="preserve"> PAGEREF _Toc243489874 \h </w:instrText>
             </w:r>
             <w:r>
               <w:rPr>
@@ -848,7 +848,7 @@
               <w:noProof/>
             </w:rPr>
           </w:pPr>
-          <w:hyperlink w:anchor="_Toc243488392" w:history="1">
+          <w:hyperlink w:anchor="_Toc243489875" w:history="1">
             <w:r>
               <w:rPr>
                 <w:rStyle w:val="Lienhypertexte"/>
@@ -872,7 +872,7 @@
               <w:rPr>
                 <w:noProof/>
               </w:rPr>
-              <w:instrText xml:space="preserve"> PAGEREF _Toc243488392 \h </w:instrText>
+              <w:instrText xml:space="preserve"> PAGEREF _Toc243489875 \h </w:instrText>
             </w:r>
             <w:r>
               <w:rPr>
@@ -909,7 +909,7 @@
               <w:noProof/>
             </w:rPr>
           </w:pPr>
-          <w:hyperlink w:anchor="_Toc243488393" w:history="1">
+          <w:hyperlink w:anchor="_Toc243489876" w:history="1">
             <w:r>
               <w:rPr>
                 <w:rStyle w:val="Lienhypertexte"/>
@@ -933,7 +933,7 @@
               <w:rPr>
                 <w:noProof/>
               </w:rPr>
-              <w:instrText xml:space="preserve"> PAGEREF _Toc243488393 \h </w:instrText>
+              <w:instrText xml:space="preserve"> PAGEREF _Toc243489876 \h </w:instrText>
             </w:r>
             <w:r>
               <w:rPr>
@@ -970,7 +970,7 @@
               <w:noProof/>
             </w:rPr>
           </w:pPr>
-          <w:hyperlink w:anchor="_Toc243488394" w:history="1">
+          <w:hyperlink w:anchor="_Toc243489877" w:history="1">
             <w:r>
               <w:rPr>
                 <w:rStyle w:val="Lienhypertexte"/>
@@ -994,7 +994,7 @@
               <w:rPr>
                 <w:noProof/>
               </w:rPr>
-              <w:instrText xml:space="preserve"> PAGEREF _Toc243488394 \h </w:instrText>
+              <w:instrText xml:space="preserve"> PAGEREF _Toc243489877 \h </w:instrText>
             </w:r>
             <w:r>
               <w:rPr>
@@ -1031,7 +1031,7 @@
               <w:noProof/>
             </w:rPr>
           </w:pPr>
-          <w:hyperlink w:anchor="_Toc243488395" w:history="1">
+          <w:hyperlink w:anchor="_Toc243489878" w:history="1">
             <w:r>
               <w:rPr>
                 <w:rStyle w:val="Lienhypertexte"/>
@@ -1055,7 +1055,7 @@
               <w:rPr>
                 <w:noProof/>
               </w:rPr>
-              <w:instrText xml:space="preserve"> PAGEREF _Toc243488395 \h </w:instrText>
+              <w:instrText xml:space="preserve"> PAGEREF _Toc243489878 \h </w:instrText>
             </w:r>
             <w:r>
               <w:rPr>
@@ -1092,7 +1092,7 @@
               <w:noProof/>
             </w:rPr>
           </w:pPr>
-          <w:hyperlink w:anchor="_Toc243488396" w:history="1">
+          <w:hyperlink w:anchor="_Toc243489879" w:history="1">
             <w:r>
               <w:rPr>
                 <w:rStyle w:val="Lienhypertexte"/>
@@ -1116,7 +1116,7 @@
               <w:rPr>
                 <w:noProof/>
               </w:rPr>
-              <w:instrText xml:space="preserve"> PAGEREF _Toc243488396 \h </w:instrText>
+              <w:instrText xml:space="preserve"> PAGEREF _Toc243489879 \h </w:instrText>
             </w:r>
             <w:r>
               <w:rPr>
@@ -1153,7 +1153,7 @@
               <w:noProof/>
             </w:rPr>
           </w:pPr>
-          <w:hyperlink w:anchor="_Toc243488397" w:history="1">
+          <w:hyperlink w:anchor="_Toc243489880" w:history="1">
             <w:r>
               <w:rPr>
                 <w:rStyle w:val="Lienhypertexte"/>
@@ -1177,7 +1177,7 @@
               <w:rPr>
                 <w:noProof/>
               </w:rPr>
-              <w:instrText xml:space="preserve"> PAGEREF _Toc243488397 \h </w:instrText>
+              <w:instrText xml:space="preserve"> PAGEREF _Toc243489880 \h </w:instrText>
             </w:r>
             <w:r>
               <w:rPr>
@@ -1214,7 +1214,7 @@
               <w:noProof/>
             </w:rPr>
           </w:pPr>
-          <w:hyperlink w:anchor="_Toc243488398" w:history="1">
+          <w:hyperlink w:anchor="_Toc243489881" w:history="1">
             <w:r>
               <w:rPr>
                 <w:rStyle w:val="Lienhypertexte"/>
@@ -1238,7 +1238,7 @@
               <w:rPr>
                 <w:noProof/>
               </w:rPr>
-              <w:instrText xml:space="preserve"> PAGEREF _Toc243488398 \h </w:instrText>
+              <w:instrText xml:space="preserve"> PAGEREF _Toc243489881 \h </w:instrText>
             </w:r>
             <w:r>
               <w:rPr>
@@ -1275,7 +1275,7 @@
               <w:noProof/>
             </w:rPr>
           </w:pPr>
-          <w:hyperlink w:anchor="_Toc243488399" w:history="1">
+          <w:hyperlink w:anchor="_Toc243489882" w:history="1">
             <w:r>
               <w:rPr>
                 <w:rStyle w:val="Lienhypertexte"/>
@@ -1299,7 +1299,7 @@
               <w:rPr>
                 <w:noProof/>
               </w:rPr>
-              <w:instrText xml:space="preserve"> PAGEREF _Toc243488399 \h </w:instrText>
+              <w:instrText xml:space="preserve"> PAGEREF _Toc243489882 \h </w:instrText>
             </w:r>
             <w:r>
               <w:rPr>
@@ -1336,7 +1336,7 @@
               <w:noProof/>
             </w:rPr>
           </w:pPr>
-          <w:hyperlink w:anchor="_Toc243488400" w:history="1">
+          <w:hyperlink w:anchor="_Toc243489883" w:history="1">
             <w:r>
               <w:rPr>
                 <w:rStyle w:val="Lienhypertexte"/>
@@ -1360,7 +1360,7 @@
               <w:rPr>
                 <w:noProof/>
               </w:rPr>
-              <w:instrText xml:space="preserve"> PAGEREF _Toc243488400 \h </w:instrText>
+              <w:instrText xml:space="preserve"> PAGEREF _Toc243489883 \h </w:instrText>
             </w:r>
             <w:r>
               <w:rPr>
@@ -1397,7 +1397,7 @@
               <w:noProof/>
             </w:rPr>
           </w:pPr>
-          <w:hyperlink w:anchor="_Toc243488401" w:history="1">
+          <w:hyperlink w:anchor="_Toc243489884" w:history="1">
             <w:r>
               <w:rPr>
                 <w:rStyle w:val="Lienhypertexte"/>
@@ -1421,7 +1421,7 @@
               <w:rPr>
                 <w:noProof/>
               </w:rPr>
-              <w:instrText xml:space="preserve"> PAGEREF _Toc243488401 \h </w:instrText>
+              <w:instrText xml:space="preserve"> PAGEREF _Toc243489884 \h </w:instrText>
             </w:r>
             <w:r>
               <w:rPr>
@@ -1458,7 +1458,7 @@
               <w:noProof/>
             </w:rPr>
           </w:pPr>
-          <w:hyperlink w:anchor="_Toc243488402" w:history="1">
+          <w:hyperlink w:anchor="_Toc243489885" w:history="1">
             <w:r>
               <w:rPr>
                 <w:rStyle w:val="Lienhypertexte"/>
@@ -1482,7 +1482,7 @@
               <w:rPr>
                 <w:noProof/>
               </w:rPr>
-              <w:instrText xml:space="preserve"> PAGEREF _Toc243488402 \h </w:instrText>
+              <w:instrText xml:space="preserve"> PAGEREF _Toc243489885 \h </w:instrText>
             </w:r>
             <w:r>
               <w:rPr>
@@ -1519,7 +1519,7 @@
               <w:noProof/>
             </w:rPr>
           </w:pPr>
-          <w:hyperlink w:anchor="_Toc243488403" w:history="1">
+          <w:hyperlink w:anchor="_Toc243489886" w:history="1">
             <w:r>
               <w:rPr>
                 <w:rStyle w:val="Lienhypertexte"/>
@@ -1543,7 +1543,7 @@
               <w:rPr>
                 <w:noProof/>
               </w:rPr>
-              <w:instrText xml:space="preserve"> PAGEREF _Toc243488403 \h </w:instrText>
+              <w:instrText xml:space="preserve"> PAGEREF _Toc243489886 \h </w:instrText>
             </w:r>
             <w:r>
               <w:rPr>
@@ -1580,7 +1580,7 @@
               <w:noProof/>
             </w:rPr>
           </w:pPr>
-          <w:hyperlink w:anchor="_Toc243488404" w:history="1">
+          <w:hyperlink w:anchor="_Toc243489887" w:history="1">
             <w:r>
               <w:rPr>
                 <w:rStyle w:val="Lienhypertexte"/>
@@ -1604,7 +1604,7 @@
               <w:rPr>
                 <w:noProof/>
               </w:rPr>
-              <w:instrText xml:space="preserve"> PAGEREF _Toc243488404 \h </w:instrText>
+              <w:instrText xml:space="preserve"> PAGEREF _Toc243489887 \h </w:instrText>
             </w:r>
             <w:r>
               <w:rPr>
@@ -1641,7 +1641,7 @@
               <w:noProof/>
             </w:rPr>
           </w:pPr>
-          <w:hyperlink w:anchor="_Toc243488405" w:history="1">
+          <w:hyperlink w:anchor="_Toc243489888" w:history="1">
             <w:r>
               <w:rPr>
                 <w:rStyle w:val="Lienhypertexte"/>
@@ -1665,7 +1665,7 @@
               <w:rPr>
                 <w:noProof/>
               </w:rPr>
-              <w:instrText xml:space="preserve"> PAGEREF _Toc243488405 \h </w:instrText>
+              <w:instrText xml:space="preserve"> PAGEREF _Toc243489888 \h </w:instrText>
             </w:r>
             <w:r>
               <w:rPr>
@@ -1702,7 +1702,7 @@
               <w:noProof/>
             </w:rPr>
           </w:pPr>
-          <w:hyperlink w:anchor="_Toc243488406" w:history="1">
+          <w:hyperlink w:anchor="_Toc243489889" w:history="1">
             <w:r>
               <w:rPr>
                 <w:rStyle w:val="Lienhypertexte"/>
@@ -1726,7 +1726,7 @@
               <w:rPr>
                 <w:noProof/>
               </w:rPr>
-              <w:instrText xml:space="preserve"> PAGEREF _Toc243488406 \h </w:instrText>
+              <w:instrText xml:space="preserve"> PAGEREF _Toc243489889 \h </w:instrText>
             </w:r>
             <w:r>
               <w:rPr>
@@ -1763,7 +1763,7 @@
               <w:noProof/>
             </w:rPr>
           </w:pPr>
-          <w:hyperlink w:anchor="_Toc243488407" w:history="1">
+          <w:hyperlink w:anchor="_Toc243489890" w:history="1">
             <w:r>
               <w:rPr>
                 <w:rStyle w:val="Lienhypertexte"/>
@@ -1787,7 +1787,7 @@
               <w:rPr>
                 <w:noProof/>
               </w:rPr>
-              <w:instrText xml:space="preserve"> PAGEREF _Toc243488407 \h </w:instrText>
+              <w:instrText xml:space="preserve"> PAGEREF _Toc243489890 \h </w:instrText>
             </w:r>
             <w:r>
               <w:rPr>
@@ -1824,7 +1824,7 @@
               <w:noProof/>
             </w:rPr>
           </w:pPr>
-          <w:hyperlink w:anchor="_Toc243488408" w:history="1">
+          <w:hyperlink w:anchor="_Toc243489891" w:history="1">
             <w:r>
               <w:rPr>
                 <w:rStyle w:val="Lienhypertexte"/>
@@ -1848,7 +1848,7 @@
               <w:rPr>
                 <w:noProof/>
               </w:rPr>
-              <w:instrText xml:space="preserve"> PAGEREF _Toc243488408 \h </w:instrText>
+              <w:instrText xml:space="preserve"> PAGEREF _Toc243489891 \h </w:instrText>
             </w:r>
             <w:r>
               <w:rPr>
@@ -1885,7 +1885,7 @@
               <w:noProof/>
             </w:rPr>
           </w:pPr>
-          <w:hyperlink w:anchor="_Toc243488409" w:history="1">
+          <w:hyperlink w:anchor="_Toc243489892" w:history="1">
             <w:r>
               <w:rPr>
                 <w:rStyle w:val="Lienhypertexte"/>
@@ -1909,7 +1909,7 @@
               <w:rPr>
                 <w:noProof/>
               </w:rPr>
-              <w:instrText xml:space="preserve"> PAGEREF _Toc243488409 \h </w:instrText>
+              <w:instrText xml:space="preserve"> PAGEREF _Toc243489892 \h </w:instrText>
             </w:r>
             <w:r>
               <w:rPr>
@@ -1946,7 +1946,7 @@
               <w:noProof/>
             </w:rPr>
           </w:pPr>
-          <w:hyperlink w:anchor="_Toc243488410" w:history="1">
+          <w:hyperlink w:anchor="_Toc243489893" w:history="1">
             <w:r>
               <w:rPr>
                 <w:rStyle w:val="Lienhypertexte"/>
@@ -1970,7 +1970,7 @@
               <w:rPr>
                 <w:noProof/>
               </w:rPr>
-              <w:instrText xml:space="preserve"> PAGEREF _Toc243488410 \h </w:instrText>
+              <w:instrText xml:space="preserve"> PAGEREF _Toc243489893 \h </w:instrText>
             </w:r>
             <w:r>
               <w:rPr>
@@ -2007,7 +2007,7 @@
               <w:noProof/>
             </w:rPr>
           </w:pPr>
-          <w:hyperlink w:anchor="_Toc243488411" w:history="1">
+          <w:hyperlink w:anchor="_Toc243489894" w:history="1">
             <w:r>
               <w:rPr>
                 <w:rStyle w:val="Lienhypertexte"/>
@@ -2031,7 +2031,7 @@
               <w:rPr>
                 <w:noProof/>
               </w:rPr>
-              <w:instrText xml:space="preserve"> PAGEREF _Toc243488411 \h </w:instrText>
+              <w:instrText xml:space="preserve"> PAGEREF _Toc243489894 \h </w:instrText>
             </w:r>
             <w:r>
               <w:rPr>
@@ -2068,7 +2068,7 @@
               <w:noProof/>
             </w:rPr>
           </w:pPr>
-          <w:hyperlink w:anchor="_Toc243488412" w:history="1">
+          <w:hyperlink w:anchor="_Toc243489895" w:history="1">
             <w:r>
               <w:rPr>
                 <w:rStyle w:val="Lienhypertexte"/>
@@ -2092,7 +2092,7 @@
               <w:rPr>
                 <w:noProof/>
               </w:rPr>
-              <w:instrText xml:space="preserve"> PAGEREF _Toc243488412 \h </w:instrText>
+              <w:instrText xml:space="preserve"> PAGEREF _Toc243489895 \h </w:instrText>
             </w:r>
             <w:r>
               <w:rPr>
@@ -2129,7 +2129,7 @@
               <w:noProof/>
             </w:rPr>
           </w:pPr>
-          <w:hyperlink w:anchor="_Toc243488413" w:history="1">
+          <w:hyperlink w:anchor="_Toc243489896" w:history="1">
             <w:r>
               <w:rPr>
                 <w:rStyle w:val="Lienhypertexte"/>
@@ -2153,7 +2153,7 @@
               <w:rPr>
                 <w:noProof/>
               </w:rPr>
-              <w:instrText xml:space="preserve"> PAGEREF _Toc243488413 \h </w:instrText>
+              <w:instrText xml:space="preserve"> PAGEREF _Toc243489896 \h </w:instrText>
             </w:r>
             <w:r>
               <w:rPr>
@@ -2190,7 +2190,7 @@
               <w:noProof/>
             </w:rPr>
           </w:pPr>
-          <w:hyperlink w:anchor="_Toc243488414" w:history="1">
+          <w:hyperlink w:anchor="_Toc243489897" w:history="1">
             <w:r>
               <w:rPr>
                 <w:rStyle w:val="Lienhypertexte"/>
@@ -2214,7 +2214,7 @@
               <w:rPr>
                 <w:noProof/>
               </w:rPr>
-              <w:instrText xml:space="preserve"> PAGEREF _Toc243488414 \h </w:instrText>
+              <w:instrText xml:space="preserve"> PAGEREF _Toc243489897 \h </w:instrText>
             </w:r>
             <w:r>
               <w:rPr>
@@ -2251,7 +2251,7 @@
               <w:noProof/>
             </w:rPr>
           </w:pPr>
-          <w:hyperlink w:anchor="_Toc243488415" w:history="1">
+          <w:hyperlink w:anchor="_Toc243489898" w:history="1">
             <w:r>
               <w:rPr>
                 <w:rStyle w:val="Lienhypertexte"/>
@@ -2275,7 +2275,7 @@
               <w:rPr>
                 <w:noProof/>
               </w:rPr>
-              <w:instrText xml:space="preserve"> PAGEREF _Toc243488415 \h </w:instrText>
+              <w:instrText xml:space="preserve"> PAGEREF _Toc243489898 \h </w:instrText>
             </w:r>
             <w:r>
               <w:rPr>
@@ -2312,7 +2312,7 @@
               <w:noProof/>
             </w:rPr>
           </w:pPr>
-          <w:hyperlink w:anchor="_Toc243488416" w:history="1">
+          <w:hyperlink w:anchor="_Toc243489899" w:history="1">
             <w:r>
               <w:rPr>
                 <w:rStyle w:val="Lienhypertexte"/>
@@ -2336,7 +2336,7 @@
               <w:rPr>
                 <w:noProof/>
               </w:rPr>
-              <w:instrText xml:space="preserve"> PAGEREF _Toc243488416 \h </w:instrText>
+              <w:instrText xml:space="preserve"> PAGEREF _Toc243489899 \h </w:instrText>
             </w:r>
             <w:r>
               <w:rPr>
@@ -2373,7 +2373,7 @@
               <w:noProof/>
             </w:rPr>
           </w:pPr>
-          <w:hyperlink w:anchor="_Toc243488417" w:history="1">
+          <w:hyperlink w:anchor="_Toc243489900" w:history="1">
             <w:r>
               <w:rPr>
                 <w:rStyle w:val="Lienhypertexte"/>
@@ -2397,7 +2397,7 @@
               <w:rPr>
                 <w:noProof/>
               </w:rPr>
-              <w:instrText xml:space="preserve"> PAGEREF _Toc243488417 \h </w:instrText>
+              <w:instrText xml:space="preserve"> PAGEREF _Toc243489900 \h </w:instrText>
             </w:r>
             <w:r>
               <w:rPr>
@@ -2434,7 +2434,7 @@
               <w:noProof/>
             </w:rPr>
           </w:pPr>
-          <w:hyperlink w:anchor="_Toc243488418" w:history="1">
+          <w:hyperlink w:anchor="_Toc243489901" w:history="1">
             <w:r>
               <w:rPr>
                 <w:rStyle w:val="Lienhypertexte"/>
@@ -2458,7 +2458,7 @@
               <w:rPr>
                 <w:noProof/>
               </w:rPr>
-              <w:instrText xml:space="preserve"> PAGEREF _Toc243488418 \h </w:instrText>
+              <w:instrText xml:space="preserve"> PAGEREF _Toc243489901 \h </w:instrText>
             </w:r>
             <w:r>
               <w:rPr>
@@ -2495,7 +2495,7 @@
               <w:noProof/>
             </w:rPr>
           </w:pPr>
-          <w:hyperlink w:anchor="_Toc243488419" w:history="1">
+          <w:hyperlink w:anchor="_Toc243489902" w:history="1">
             <w:r>
               <w:rPr>
                 <w:rStyle w:val="Lienhypertexte"/>
@@ -2519,7 +2519,7 @@
               <w:rPr>
                 <w:noProof/>
               </w:rPr>
-              <w:instrText xml:space="preserve"> PAGEREF _Toc243488419 \h </w:instrText>
+              <w:instrText xml:space="preserve"> PAGEREF _Toc243489902 \h </w:instrText>
             </w:r>
             <w:r>
               <w:rPr>
@@ -2556,7 +2556,7 @@
               <w:noProof/>
             </w:rPr>
           </w:pPr>
-          <w:hyperlink w:anchor="_Toc243488420" w:history="1">
+          <w:hyperlink w:anchor="_Toc243489903" w:history="1">
             <w:r>
               <w:rPr>
                 <w:rStyle w:val="Lienhypertexte"/>
@@ -2580,7 +2580,7 @@
               <w:rPr>
                 <w:noProof/>
               </w:rPr>
-              <w:instrText xml:space="preserve"> PAGEREF _Toc243488420 \h </w:instrText>
+              <w:instrText xml:space="preserve"> PAGEREF _Toc243489903 \h </w:instrText>
             </w:r>
             <w:r>
               <w:rPr>
@@ -2617,7 +2617,7 @@
               <w:noProof/>
             </w:rPr>
           </w:pPr>
-          <w:hyperlink w:anchor="_Toc243488421" w:history="1">
+          <w:hyperlink w:anchor="_Toc243489904" w:history="1">
             <w:r>
               <w:rPr>
                 <w:rStyle w:val="Lienhypertexte"/>
@@ -2641,7 +2641,7 @@
               <w:rPr>
                 <w:noProof/>
               </w:rPr>
-              <w:instrText xml:space="preserve"> PAGEREF _Toc243488421 \h </w:instrText>
+              <w:instrText xml:space="preserve"> PAGEREF _Toc243489904 \h </w:instrText>
             </w:r>
             <w:r>
               <w:rPr>
@@ -2678,7 +2678,7 @@
               <w:noProof/>
             </w:rPr>
           </w:pPr>
-          <w:hyperlink w:anchor="_Toc243488422" w:history="1">
+          <w:hyperlink w:anchor="_Toc243489905" w:history="1">
             <w:r>
               <w:rPr>
                 <w:rStyle w:val="Lienhypertexte"/>
@@ -2702,7 +2702,7 @@
               <w:rPr>
                 <w:noProof/>
               </w:rPr>
-              <w:instrText xml:space="preserve"> PAGEREF _Toc243488422 \h </w:instrText>
+              <w:instrText xml:space="preserve"> PAGEREF _Toc243489905 \h </w:instrText>
             </w:r>
             <w:r>
               <w:rPr>
@@ -2739,7 +2739,7 @@
               <w:noProof/>
             </w:rPr>
           </w:pPr>
-          <w:hyperlink w:anchor="_Toc243488423" w:history="1">
+          <w:hyperlink w:anchor="_Toc243489906" w:history="1">
             <w:r>
               <w:rPr>
                 <w:rStyle w:val="Lienhypertexte"/>
@@ -2763,7 +2763,7 @@
               <w:rPr>
                 <w:noProof/>
               </w:rPr>
-              <w:instrText xml:space="preserve"> PAGEREF _Toc243488423 \h </w:instrText>
+              <w:instrText xml:space="preserve"> PAGEREF _Toc243489906 \h </w:instrText>
             </w:r>
             <w:r>
               <w:rPr>
@@ -2800,7 +2800,7 @@
               <w:noProof/>
             </w:rPr>
           </w:pPr>
-          <w:hyperlink w:anchor="_Toc243488424" w:history="1">
+          <w:hyperlink w:anchor="_Toc243489907" w:history="1">
             <w:r>
               <w:rPr>
                 <w:rStyle w:val="Lienhypertexte"/>
@@ -2824,7 +2824,7 @@
               <w:rPr>
                 <w:noProof/>
               </w:rPr>
-              <w:instrText xml:space="preserve"> PAGEREF _Toc243488424 \h </w:instrText>
+              <w:instrText xml:space="preserve"> PAGEREF _Toc243489907 \h </w:instrText>
             </w:r>
             <w:r>
               <w:rPr>
@@ -2861,7 +2861,7 @@
               <w:noProof/>
             </w:rPr>
           </w:pPr>
-          <w:hyperlink w:anchor="_Toc243488425" w:history="1">
+          <w:hyperlink w:anchor="_Toc243489908" w:history="1">
             <w:r>
               <w:rPr>
                 <w:rStyle w:val="Lienhypertexte"/>
@@ -2885,7 +2885,7 @@
               <w:rPr>
                 <w:noProof/>
               </w:rPr>
-              <w:instrText xml:space="preserve"> PAGEREF _Toc243488425 \h </w:instrText>
+              <w:instrText xml:space="preserve"> PAGEREF _Toc243489908 \h </w:instrText>
             </w:r>
             <w:r>
               <w:rPr>
@@ -2922,7 +2922,7 @@
               <w:noProof/>
             </w:rPr>
           </w:pPr>
-          <w:hyperlink w:anchor="_Toc243488426" w:history="1">
+          <w:hyperlink w:anchor="_Toc243489909" w:history="1">
             <w:r>
               <w:rPr>
                 <w:rStyle w:val="Lienhypertexte"/>
@@ -2946,7 +2946,7 @@
               <w:rPr>
                 <w:noProof/>
               </w:rPr>
-              <w:instrText xml:space="preserve"> PAGEREF _Toc243488426 \h </w:instrText>
+              <w:instrText xml:space="preserve"> PAGEREF _Toc243489909 \h </w:instrText>
             </w:r>
             <w:r>
               <w:rPr>
@@ -2983,7 +2983,7 @@
               <w:noProof/>
             </w:rPr>
           </w:pPr>
-          <w:hyperlink w:anchor="_Toc243488427" w:history="1">
+          <w:hyperlink w:anchor="_Toc243489910" w:history="1">
             <w:r>
               <w:rPr>
                 <w:rStyle w:val="Lienhypertexte"/>
@@ -3007,7 +3007,7 @@
               <w:rPr>
                 <w:noProof/>
               </w:rPr>
-              <w:instrText xml:space="preserve"> PAGEREF _Toc243488427 \h </w:instrText>
+              <w:instrText xml:space="preserve"> PAGEREF _Toc243489910 \h </w:instrText>
             </w:r>
             <w:r>
               <w:rPr>
@@ -3044,7 +3044,7 @@
               <w:noProof/>
             </w:rPr>
           </w:pPr>
-          <w:hyperlink w:anchor="_Toc243488428" w:history="1">
+          <w:hyperlink w:anchor="_Toc243489911" w:history="1">
             <w:r>
               <w:rPr>
                 <w:rStyle w:val="Lienhypertexte"/>
@@ -3068,7 +3068,7 @@
               <w:rPr>
                 <w:noProof/>
               </w:rPr>
-              <w:instrText xml:space="preserve"> PAGEREF _Toc243488428 \h </w:instrText>
+              <w:instrText xml:space="preserve"> PAGEREF _Toc243489911 \h </w:instrText>
             </w:r>
             <w:r>
               <w:rPr>
@@ -3105,7 +3105,7 @@
               <w:noProof/>
             </w:rPr>
           </w:pPr>
-          <w:hyperlink w:anchor="_Toc243488429" w:history="1">
+          <w:hyperlink w:anchor="_Toc243489912" w:history="1">
             <w:r>
               <w:rPr>
                 <w:rStyle w:val="Lienhypertexte"/>
@@ -3129,7 +3129,7 @@
               <w:rPr>
                 <w:noProof/>
               </w:rPr>
-              <w:instrText xml:space="preserve"> PAGEREF _Toc243488429 \h </w:instrText>
+              <w:instrText xml:space="preserve"> PAGEREF _Toc243489912 \h </w:instrText>
             </w:r>
             <w:r>
               <w:rPr>
@@ -3166,7 +3166,7 @@
               <w:noProof/>
             </w:rPr>
           </w:pPr>
-          <w:hyperlink w:anchor="_Toc243488430" w:history="1">
+          <w:hyperlink w:anchor="_Toc243489913" w:history="1">
             <w:r>
               <w:rPr>
                 <w:rStyle w:val="Lienhypertexte"/>
@@ -3190,7 +3190,7 @@
               <w:rPr>
                 <w:noProof/>
               </w:rPr>
-              <w:instrText xml:space="preserve"> PAGEREF _Toc243488430 \h </w:instrText>
+              <w:instrText xml:space="preserve"> PAGEREF _Toc243489913 \h </w:instrText>
             </w:r>
             <w:r>
               <w:rPr>
@@ -3227,7 +3227,7 @@
               <w:noProof/>
             </w:rPr>
           </w:pPr>
-          <w:hyperlink w:anchor="_Toc243488431" w:history="1">
+          <w:hyperlink w:anchor="_Toc243489914" w:history="1">
             <w:r>
               <w:rPr>
                 <w:rStyle w:val="Lienhypertexte"/>
@@ -3251,7 +3251,7 @@
               <w:rPr>
                 <w:noProof/>
               </w:rPr>
-              <w:instrText xml:space="preserve"> PAGEREF _Toc243488431 \h </w:instrText>
+              <w:instrText xml:space="preserve"> PAGEREF _Toc243489914 \h </w:instrText>
             </w:r>
             <w:r>
               <w:rPr>
@@ -3288,7 +3288,7 @@
               <w:noProof/>
             </w:rPr>
           </w:pPr>
-          <w:hyperlink w:anchor="_Toc243488432" w:history="1">
+          <w:hyperlink w:anchor="_Toc243489915" w:history="1">
             <w:r>
               <w:rPr>
                 <w:rStyle w:val="Lienhypertexte"/>
@@ -3312,7 +3312,7 @@
               <w:rPr>
                 <w:noProof/>
               </w:rPr>
-              <w:instrText xml:space="preserve"> PAGEREF _Toc243488432 \h </w:instrText>
+              <w:instrText xml:space="preserve"> PAGEREF _Toc243489915 \h </w:instrText>
             </w:r>
             <w:r>
               <w:rPr>
@@ -3349,7 +3349,7 @@
               <w:noProof/>
             </w:rPr>
           </w:pPr>
-          <w:hyperlink w:anchor="_Toc243488433" w:history="1">
+          <w:hyperlink w:anchor="_Toc243489916" w:history="1">
             <w:r>
               <w:rPr>
                 <w:rStyle w:val="Lienhypertexte"/>
@@ -3373,7 +3373,7 @@
               <w:rPr>
                 <w:noProof/>
               </w:rPr>
-              <w:instrText xml:space="preserve"> PAGEREF _Toc243488433 \h </w:instrText>
+              <w:instrText xml:space="preserve"> PAGEREF _Toc243489916 \h </w:instrText>
             </w:r>
             <w:r>
               <w:rPr>
@@ -3410,7 +3410,7 @@
               <w:noProof/>
             </w:rPr>
           </w:pPr>
-          <w:hyperlink w:anchor="_Toc243488434" w:history="1">
+          <w:hyperlink w:anchor="_Toc243489917" w:history="1">
             <w:r>
               <w:rPr>
                 <w:rStyle w:val="Lienhypertexte"/>
@@ -3434,7 +3434,7 @@
               <w:rPr>
                 <w:noProof/>
               </w:rPr>
-              <w:instrText xml:space="preserve"> PAGEREF _Toc243488434 \h </w:instrText>
+              <w:instrText xml:space="preserve"> PAGEREF _Toc243489917 \h </w:instrText>
             </w:r>
             <w:r>
               <w:rPr>
@@ -3471,7 +3471,7 @@
               <w:noProof/>
             </w:rPr>
           </w:pPr>
-          <w:hyperlink w:anchor="_Toc243488435" w:history="1">
+          <w:hyperlink w:anchor="_Toc243489918" w:history="1">
             <w:r>
               <w:rPr>
                 <w:rStyle w:val="Lienhypertexte"/>
@@ -3495,7 +3495,7 @@
               <w:rPr>
                 <w:noProof/>
               </w:rPr>
-              <w:instrText xml:space="preserve"> PAGEREF _Toc243488435 \h </w:instrText>
+              <w:instrText xml:space="preserve"> PAGEREF _Toc243489918 \h </w:instrText>
             </w:r>
             <w:r>
               <w:rPr>
@@ -3532,7 +3532,7 @@
               <w:noProof/>
             </w:rPr>
           </w:pPr>
-          <w:hyperlink w:anchor="_Toc243488436" w:history="1">
+          <w:hyperlink w:anchor="_Toc243489919" w:history="1">
             <w:r>
               <w:rPr>
                 <w:rStyle w:val="Lienhypertexte"/>
@@ -3556,7 +3556,7 @@
               <w:rPr>
                 <w:noProof/>
               </w:rPr>
-              <w:instrText xml:space="preserve"> PAGEREF _Toc243488436 \h </w:instrText>
+              <w:instrText xml:space="preserve"> PAGEREF _Toc243489919 \h </w:instrText>
             </w:r>
             <w:r>
               <w:rPr>
@@ -3593,7 +3593,7 @@
               <w:noProof/>
             </w:rPr>
           </w:pPr>
-          <w:hyperlink w:anchor="_Toc243488437" w:history="1">
+          <w:hyperlink w:anchor="_Toc243489920" w:history="1">
             <w:r>
               <w:rPr>
                 <w:rStyle w:val="Lienhypertexte"/>
@@ -3617,7 +3617,7 @@
               <w:rPr>
                 <w:noProof/>
               </w:rPr>
-              <w:instrText xml:space="preserve"> PAGEREF _Toc243488437 \h </w:instrText>
+              <w:instrText xml:space="preserve"> PAGEREF _Toc243489920 \h </w:instrText>
             </w:r>
             <w:r>
               <w:rPr>
@@ -3654,7 +3654,7 @@
               <w:noProof/>
             </w:rPr>
           </w:pPr>
-          <w:hyperlink w:anchor="_Toc243488438" w:history="1">
+          <w:hyperlink w:anchor="_Toc243489921" w:history="1">
             <w:r>
               <w:rPr>
                 <w:rStyle w:val="Lienhypertexte"/>
@@ -3678,7 +3678,7 @@
               <w:rPr>
                 <w:noProof/>
               </w:rPr>
-              <w:instrText xml:space="preserve"> PAGEREF _Toc243488438 \h </w:instrText>
+              <w:instrText xml:space="preserve"> PAGEREF _Toc243489921 \h </w:instrText>
             </w:r>
             <w:r>
               <w:rPr>
@@ -3715,7 +3715,7 @@
               <w:noProof/>
             </w:rPr>
           </w:pPr>
-          <w:hyperlink w:anchor="_Toc243488439" w:history="1">
+          <w:hyperlink w:anchor="_Toc243489922" w:history="1">
             <w:r>
               <w:rPr>
                 <w:rStyle w:val="Lienhypertexte"/>
@@ -3739,7 +3739,7 @@
               <w:rPr>
                 <w:noProof/>
               </w:rPr>
-              <w:instrText xml:space="preserve"> PAGEREF _Toc243488439 \h </w:instrText>
+              <w:instrText xml:space="preserve"> PAGEREF _Toc243489922 \h </w:instrText>
             </w:r>
             <w:r>
               <w:rPr>
@@ -3776,7 +3776,7 @@
               <w:noProof/>
             </w:rPr>
           </w:pPr>
-          <w:hyperlink w:anchor="_Toc243488440" w:history="1">
+          <w:hyperlink w:anchor="_Toc243489923" w:history="1">
             <w:r>
               <w:rPr>
                 <w:rStyle w:val="Lienhypertexte"/>
@@ -3800,7 +3800,7 @@
               <w:rPr>
                 <w:noProof/>
               </w:rPr>
-              <w:instrText xml:space="preserve"> PAGEREF _Toc243488440 \h </w:instrText>
+              <w:instrText xml:space="preserve"> PAGEREF _Toc243489923 \h </w:instrText>
             </w:r>
             <w:r>
               <w:rPr>
@@ -3837,7 +3837,7 @@
               <w:noProof/>
             </w:rPr>
           </w:pPr>
-          <w:hyperlink w:anchor="_Toc243488441" w:history="1">
+          <w:hyperlink w:anchor="_Toc243489924" w:history="1">
             <w:r>
               <w:rPr>
                 <w:rStyle w:val="Lienhypertexte"/>
@@ -3861,7 +3861,7 @@
               <w:rPr>
                 <w:noProof/>
               </w:rPr>
-              <w:instrText xml:space="preserve"> PAGEREF _Toc243488441 \h </w:instrText>
+              <w:instrText xml:space="preserve"> PAGEREF _Toc243489924 \h </w:instrText>
             </w:r>
             <w:r>
               <w:rPr>
@@ -3898,7 +3898,7 @@
               <w:noProof/>
             </w:rPr>
           </w:pPr>
-          <w:hyperlink w:anchor="_Toc243488442" w:history="1">
+          <w:hyperlink w:anchor="_Toc243489925" w:history="1">
             <w:r>
               <w:rPr>
                 <w:rStyle w:val="Lienhypertexte"/>
@@ -3922,7 +3922,7 @@
               <w:rPr>
                 <w:noProof/>
               </w:rPr>
-              <w:instrText xml:space="preserve"> PAGEREF _Toc243488442 \h </w:instrText>
+              <w:instrText xml:space="preserve"> PAGEREF _Toc243489925 \h </w:instrText>
             </w:r>
             <w:r>
               <w:rPr>
@@ -3959,7 +3959,7 @@
               <w:noProof/>
             </w:rPr>
           </w:pPr>
-          <w:hyperlink w:anchor="_Toc243488443" w:history="1">
+          <w:hyperlink w:anchor="_Toc243489926" w:history="1">
             <w:r>
               <w:rPr>
                 <w:rStyle w:val="Lienhypertexte"/>
@@ -3983,7 +3983,7 @@
               <w:rPr>
                 <w:noProof/>
               </w:rPr>
-              <w:instrText xml:space="preserve"> PAGEREF _Toc243488443 \h </w:instrText>
+              <w:instrText xml:space="preserve"> PAGEREF _Toc243489926 \h </w:instrText>
             </w:r>
             <w:r>
               <w:rPr>
@@ -4020,7 +4020,7 @@
               <w:noProof/>
             </w:rPr>
           </w:pPr>
-          <w:hyperlink w:anchor="_Toc243488444" w:history="1">
+          <w:hyperlink w:anchor="_Toc243489927" w:history="1">
             <w:r>
               <w:rPr>
                 <w:rStyle w:val="Lienhypertexte"/>
@@ -4044,7 +4044,7 @@
               <w:rPr>
                 <w:noProof/>
               </w:rPr>
-              <w:instrText xml:space="preserve"> PAGEREF _Toc243488444 \h </w:instrText>
+              <w:instrText xml:space="preserve"> PAGEREF _Toc243489927 \h </w:instrText>
             </w:r>
             <w:r>
               <w:rPr>
@@ -4081,7 +4081,7 @@
               <w:noProof/>
             </w:rPr>
           </w:pPr>
-          <w:hyperlink w:anchor="_Toc243488445" w:history="1">
+          <w:hyperlink w:anchor="_Toc243489928" w:history="1">
             <w:r>
               <w:rPr>
                 <w:rStyle w:val="Lienhypertexte"/>
@@ -4105,7 +4105,7 @@
               <w:rPr>
                 <w:noProof/>
               </w:rPr>
-              <w:instrText xml:space="preserve"> PAGEREF _Toc243488445 \h </w:instrText>
+              <w:instrText xml:space="preserve"> PAGEREF _Toc243489928 \h </w:instrText>
             </w:r>
             <w:r>
               <w:rPr>
@@ -4142,7 +4142,7 @@
               <w:noProof/>
             </w:rPr>
           </w:pPr>
-          <w:hyperlink w:anchor="_Toc243488446" w:history="1">
+          <w:hyperlink w:anchor="_Toc243489929" w:history="1">
             <w:r>
               <w:rPr>
                 <w:rStyle w:val="Lienhypertexte"/>
@@ -4166,7 +4166,7 @@
               <w:rPr>
                 <w:noProof/>
               </w:rPr>
-              <w:instrText xml:space="preserve"> PAGEREF _Toc243488446 \h </w:instrText>
+              <w:instrText xml:space="preserve"> PAGEREF _Toc243489929 \h </w:instrText>
             </w:r>
             <w:r>
               <w:rPr>
@@ -4205,7 +4205,7 @@
         <w:pStyle w:val="Titre1"/>
         <w:pageBreakBefore/>
       </w:pPr>
-      <w:bookmarkStart w:id="0" w:name="_Toc243488380"/>
+      <w:bookmarkStart w:id="0" w:name="_Toc243489863"/>
       <w:r>
         <w:lastRenderedPageBreak/>
         <w:t>1. The pitch in 60 seconds</w:t>
@@ -4424,7 +4424,7 @@
         <w:pStyle w:val="Titre1"/>
         <w:pageBreakBefore/>
       </w:pPr>
-      <w:bookmarkStart w:id="1" w:name="_Toc243488381"/>
+      <w:bookmarkStart w:id="1" w:name="_Toc243489864"/>
       <w:r>
         <w:lastRenderedPageBreak/>
         <w:t>2. The basic ideas, explained simply</w:t>
@@ -4529,7 +4529,7 @@
       <w:pPr>
         <w:pStyle w:val="Titre2"/>
       </w:pPr>
-      <w:bookmarkStart w:id="2" w:name="_Toc243488382"/>
+      <w:bookmarkStart w:id="2" w:name="_Toc243489865"/>
       <w:r>
         <w:t>A neuron, weights and a network</w:t>
       </w:r>
@@ -4599,7 +4599,7 @@
       <w:pPr>
         <w:pStyle w:val="Titre2"/>
       </w:pPr>
-      <w:bookmarkStart w:id="3" w:name="_Toc243488383"/>
+      <w:bookmarkStart w:id="3" w:name="_Toc243489866"/>
       <w:r>
         <w:t>The loss: how wrong we are</w:t>
       </w:r>
@@ -4659,7 +4659,7 @@
       <w:pPr>
         <w:pStyle w:val="Titre2"/>
       </w:pPr>
-      <w:bookmarkStart w:id="4" w:name="_Toc243488384"/>
+      <w:bookmarkStart w:id="4" w:name="_Toc243489867"/>
       <w:r>
         <w:t>Gradient descent and the learning rate</w:t>
       </w:r>
@@ -4729,7 +4729,7 @@
       <w:pPr>
         <w:pStyle w:val="Titre2"/>
       </w:pPr>
-      <w:bookmarkStart w:id="5" w:name="_Toc243488385"/>
+      <w:bookmarkStart w:id="5" w:name="_Toc243489868"/>
       <w:r>
         <w:t>Backpropagation and the 5 lines of the training loop</w:t>
       </w:r>
@@ -4823,7 +4823,7 @@
       <w:pPr>
         <w:pStyle w:val="Titre2"/>
       </w:pPr>
-      <w:bookmarkStart w:id="6" w:name="_Toc243488386"/>
+      <w:bookmarkStart w:id="6" w:name="_Toc243489869"/>
       <w:r>
         <w:t>Epoch and mini-batch</w:t>
       </w:r>
@@ -4883,7 +4883,7 @@
       <w:pPr>
         <w:pStyle w:val="Titre2"/>
       </w:pPr>
-      <w:bookmarkStart w:id="7" w:name="_Toc243488387"/>
+      <w:bookmarkStart w:id="7" w:name="_Toc243489870"/>
       <w:r>
         <w:lastRenderedPageBreak/>
         <w:t>Train, validation, test</w:t>
@@ -4954,7 +4954,7 @@
       <w:pPr>
         <w:pStyle w:val="Titre2"/>
       </w:pPr>
-      <w:bookmarkStart w:id="8" w:name="_Toc243488388"/>
+      <w:bookmarkStart w:id="8" w:name="_Toc243489871"/>
       <w:r>
         <w:t>Overfitting</w:t>
       </w:r>
@@ -5004,7 +5004,7 @@
       <w:pPr>
         <w:pStyle w:val="Titre2"/>
       </w:pPr>
-      <w:bookmarkStart w:id="9" w:name="_Toc243488389"/>
+      <w:bookmarkStart w:id="9" w:name="_Toc243489872"/>
       <w:r>
         <w:t>ReLU, the activation</w:t>
       </w:r>
@@ -5074,7 +5074,7 @@
       <w:pPr>
         <w:pStyle w:val="Titre2"/>
       </w:pPr>
-      <w:bookmarkStart w:id="10" w:name="_Toc243488390"/>
+      <w:bookmarkStart w:id="10" w:name="_Toc243489873"/>
       <w:r>
         <w:t>Initialisation and the first loss</w:t>
       </w:r>
@@ -5124,7 +5124,7 @@
       <w:pPr>
         <w:pStyle w:val="Titre2"/>
       </w:pPr>
-      <w:bookmarkStart w:id="11" w:name="_Toc243488391"/>
+      <w:bookmarkStart w:id="11" w:name="_Toc243489874"/>
       <w:r>
         <w:t>Standardisation of the pixels</w:t>
       </w:r>
@@ -5184,7 +5184,7 @@
       <w:pPr>
         <w:pStyle w:val="Titre2"/>
       </w:pPr>
-      <w:bookmarkStart w:id="12" w:name="_Toc243488392"/>
+      <w:bookmarkStart w:id="12" w:name="_Toc243489875"/>
       <w:r>
         <w:t>MLP versus CNN: why the MLP cannot see shapes</w:t>
       </w:r>
@@ -5244,7 +5244,7 @@
       <w:pPr>
         <w:pStyle w:val="Titre2"/>
       </w:pPr>
-      <w:bookmarkStart w:id="13" w:name="_Toc243488393"/>
+      <w:bookmarkStart w:id="13" w:name="_Toc243489876"/>
       <w:r>
         <w:t>Convolution, filters and channels (session 7 slide)</w:t>
       </w:r>
@@ -5335,7 +5335,7 @@
       <w:pPr>
         <w:pStyle w:val="Titre2"/>
       </w:pPr>
-      <w:bookmarkStart w:id="14" w:name="_Toc243488394"/>
+      <w:bookmarkStart w:id="14" w:name="_Toc243489877"/>
       <w:r>
         <w:t>A pretrained network and transfer learning</w:t>
       </w:r>
@@ -5395,7 +5395,7 @@
       <w:pPr>
         <w:pStyle w:val="Titre2"/>
       </w:pPr>
-      <w:bookmarkStart w:id="15" w:name="_Toc243488395"/>
+      <w:bookmarkStart w:id="15" w:name="_Toc243489878"/>
       <w:r>
         <w:t>Frozen features (linear probe) versus fine-tuning</w:t>
       </w:r>
@@ -5465,7 +5465,7 @@
       <w:pPr>
         <w:pStyle w:val="Titre2"/>
       </w:pPr>
-      <w:bookmarkStart w:id="16" w:name="_Toc243488396"/>
+      <w:bookmarkStart w:id="16" w:name="_Toc243489879"/>
       <w:r>
         <w:t>The tools against overfitting</w:t>
       </w:r>
@@ -5625,7 +5625,7 @@
       <w:pPr>
         <w:pStyle w:val="Titre2"/>
       </w:pPr>
-      <w:bookmarkStart w:id="17" w:name="_Toc243488397"/>
+      <w:bookmarkStart w:id="17" w:name="_Toc243489880"/>
       <w:r>
         <w:t>Vanishing gradient</w:t>
       </w:r>
@@ -5675,7 +5675,7 @@
       <w:pPr>
         <w:pStyle w:val="Titre2"/>
       </w:pPr>
-      <w:bookmarkStart w:id="18" w:name="_Toc243488398"/>
+      <w:bookmarkStart w:id="18" w:name="_Toc243489881"/>
       <w:r>
         <w:t>Data leakage</w:t>
       </w:r>
@@ -5725,7 +5725,7 @@
       <w:pPr>
         <w:pStyle w:val="Titre2"/>
       </w:pPr>
-      <w:bookmarkStart w:id="19" w:name="_Toc243488399"/>
+      <w:bookmarkStart w:id="19" w:name="_Toc243489882"/>
       <w:r>
         <w:t>Confidence interval and bootstrap</w:t>
       </w:r>
@@ -5785,7 +5785,7 @@
       <w:pPr>
         <w:pStyle w:val="Titre2"/>
       </w:pPr>
-      <w:bookmarkStart w:id="20" w:name="_Toc243488400"/>
+      <w:bookmarkStart w:id="20" w:name="_Toc243489883"/>
       <w:r>
         <w:lastRenderedPageBreak/>
         <w:t>Latency and CPU threads</w:t>
@@ -5857,7 +5857,7 @@
         <w:pStyle w:val="Titre1"/>
         <w:pageBreakBefore/>
       </w:pPr>
-      <w:bookmarkStart w:id="21" w:name="_Toc243488401"/>
+      <w:bookmarkStart w:id="21" w:name="_Toc243489884"/>
       <w:r>
         <w:lastRenderedPageBreak/>
         <w:t>3. Step 1: the data and a fair split (notebook 01)</w:t>
@@ -5970,7 +5970,7 @@
       <w:pPr>
         <w:pStyle w:val="Titre2"/>
       </w:pPr>
-      <w:bookmarkStart w:id="22" w:name="_Toc243488402"/>
+      <w:bookmarkStart w:id="22" w:name="_Toc243489885"/>
       <w:r>
         <w:t>What we downloaded</w:t>
       </w:r>
@@ -6091,7 +6091,7 @@
       <w:pPr>
         <w:pStyle w:val="Titre2"/>
       </w:pPr>
-      <w:bookmarkStart w:id="23" w:name="_Toc243488403"/>
+      <w:bookmarkStart w:id="23" w:name="_Toc243489886"/>
       <w:r>
         <w:t>The split (make_split in data.py)</w:t>
       </w:r>
@@ -6222,7 +6222,7 @@
       <w:pPr>
         <w:pStyle w:val="Titre2"/>
       </w:pPr>
-      <w:bookmarkStart w:id="24" w:name="_Toc243488404"/>
+      <w:bookmarkStart w:id="24" w:name="_Toc243489887"/>
       <w:r>
         <w:t>What we found in the data</w:t>
       </w:r>
@@ -6285,7 +6285,7 @@
         <w:pStyle w:val="Titre1"/>
         <w:pageBreakBefore/>
       </w:pPr>
-      <w:bookmarkStart w:id="25" w:name="_Toc243488405"/>
+      <w:bookmarkStart w:id="25" w:name="_Toc243489888"/>
       <w:r>
         <w:lastRenderedPageBreak/>
         <w:t>4. Step 2: the MLP and its two checks (notebook 02)</w:t>
@@ -6435,7 +6435,7 @@
       <w:pPr>
         <w:pStyle w:val="Titre2"/>
       </w:pPr>
-      <w:bookmarkStart w:id="26" w:name="_Toc243488406"/>
+      <w:bookmarkStart w:id="26" w:name="_Toc243489889"/>
       <w:r>
         <w:t>The model</w:t>
       </w:r>
@@ -6562,7 +6562,7 @@
       <w:pPr>
         <w:pStyle w:val="Titre2"/>
       </w:pPr>
-      <w:bookmarkStart w:id="27" w:name="_Toc243488407"/>
+      <w:bookmarkStart w:id="27" w:name="_Toc243489890"/>
       <w:r>
         <w:t>Check 1: the first loss</w:t>
       </w:r>
@@ -6611,7 +6611,7 @@
       <w:pPr>
         <w:pStyle w:val="Titre2"/>
       </w:pPr>
-      <w:bookmarkStart w:id="28" w:name="_Toc243488408"/>
+      <w:bookmarkStart w:id="28" w:name="_Toc243489891"/>
       <w:r>
         <w:t>Check 2: overfit one batch</w:t>
       </w:r>
@@ -6629,7 +6629,7 @@
       <w:pPr>
         <w:pStyle w:val="Titre2"/>
       </w:pPr>
-      <w:bookmarkStart w:id="29" w:name="_Toc243488409"/>
+      <w:bookmarkStart w:id="29" w:name="_Toc243489892"/>
       <w:r>
         <w:t>Baseline and image size</w:t>
       </w:r>
@@ -6705,7 +6705,7 @@
         </w:rPr>
         <w:lastRenderedPageBreak/>
         <w:drawing>
-          <wp:inline distT="0" distB="0" distL="0" distR="0" wp14:anchorId="3785B001" wp14:editId="3785B002">
+          <wp:inline distT="0" distB="0" distL="0" distR="0" wp14:anchorId="22171588" wp14:editId="22171589">
             <wp:extent cx="4762500" cy="1924050"/>
             <wp:effectExtent l="0" t="0" r="0" b="0"/>
             <wp:docPr id="1" name="02_baseline_curves.png" descr="MLP baseline: training loss falls to 0 while validation loss rises (overfitting)." title="MLP baseline: training loss falls to 0 while validation loss rises (overfitting)."/>
@@ -6765,7 +6765,7 @@
         <w:pStyle w:val="Titre1"/>
         <w:pageBreakBefore/>
       </w:pPr>
-      <w:bookmarkStart w:id="30" w:name="_Toc243488410"/>
+      <w:bookmarkStart w:id="30" w:name="_Toc243489893"/>
       <w:r>
         <w:lastRenderedPageBreak/>
         <w:t>5. Step 3: monitoring and regularisation (notebook 03)</w:t>
@@ -6936,7 +6936,7 @@
       <w:pPr>
         <w:pStyle w:val="Titre2"/>
       </w:pPr>
-      <w:bookmarkStart w:id="31" w:name="_Toc243488411"/>
+      <w:bookmarkStart w:id="31" w:name="_Toc243489894"/>
       <w:r>
         <w:t>What we monitored</w:t>
       </w:r>
@@ -7055,7 +7055,7 @@
       <w:pPr>
         <w:pStyle w:val="Titre2"/>
       </w:pPr>
-      <w:bookmarkStart w:id="32" w:name="_Toc243488412"/>
+      <w:bookmarkStart w:id="32" w:name="_Toc243489895"/>
       <w:r>
         <w:t>Learning-rate sweep (Adam, 8 values, 15 epochs each)</w:t>
       </w:r>
@@ -7130,7 +7130,7 @@
           <w:noProof/>
         </w:rPr>
         <w:drawing>
-          <wp:inline distT="0" distB="0" distL="0" distR="0" wp14:anchorId="3785B003" wp14:editId="3785B004">
+          <wp:inline distT="0" distB="0" distL="0" distR="0" wp14:anchorId="2217158A" wp14:editId="2217158B">
             <wp:extent cx="4191000" cy="1619250"/>
             <wp:effectExtent l="0" t="0" r="0" b="0"/>
             <wp:docPr id="2" name="03_lr_sweep.png" descr="Learning-rate sweep: a U-shaped validation loss, best at 0.0001." title="Learning-rate sweep: a U-shaped validation loss, best at 0.0001."/>
@@ -7189,7 +7189,7 @@
       <w:pPr>
         <w:pStyle w:val="Titre2"/>
       </w:pPr>
-      <w:bookmarkStart w:id="33" w:name="_Toc243488413"/>
+      <w:bookmarkStart w:id="33" w:name="_Toc243489896"/>
       <w:r>
         <w:t>The tools against overfitting (lr 0.0001, 3 seeds each)</w:t>
       </w:r>
@@ -8162,7 +8162,7 @@
         <w:pStyle w:val="Titre1"/>
         <w:pageBreakBefore/>
       </w:pPr>
-      <w:bookmarkStart w:id="34" w:name="_Toc243488414"/>
+      <w:bookmarkStart w:id="34" w:name="_Toc243489897"/>
       <w:r>
         <w:lastRenderedPageBreak/>
         <w:t>6. Step 4: the training doctor (notebook 04)</w:t>
@@ -9068,7 +9068,7 @@
         </w:rPr>
         <w:lastRenderedPageBreak/>
         <w:drawing>
-          <wp:inline distT="0" distB="0" distL="0" distR="0" wp14:anchorId="3785B005" wp14:editId="3785B006">
+          <wp:inline distT="0" distB="0" distL="0" distR="0" wp14:anchorId="2217158C" wp14:editId="2217158D">
             <wp:extent cx="4000500" cy="2209800"/>
             <wp:effectExtent l="0" t="0" r="0" b="0"/>
             <wp:docPr id="3" name="04_p4_grad_per_layer.png" descr="Patient 4: the gradient vanishes layer after layer with sigmoids; ReLU + He init fixes it." title="Patient 4: the gradient vanishes layer after layer with sigmoids; ReLU + He init fixes it."/>
@@ -9127,7 +9127,7 @@
       <w:pPr>
         <w:pStyle w:val="Titre2"/>
       </w:pPr>
-      <w:bookmarkStart w:id="35" w:name="_Toc243488415"/>
+      <w:bookmarkStart w:id="35" w:name="_Toc243489898"/>
       <w:r>
         <w:t>Lessons to say at the oral</w:t>
       </w:r>
@@ -9220,7 +9220,7 @@
         <w:pStyle w:val="Titre1"/>
         <w:pageBreakBefore/>
       </w:pPr>
-      <w:bookmarkStart w:id="36" w:name="_Toc243488416"/>
+      <w:bookmarkStart w:id="36" w:name="_Toc243489899"/>
       <w:r>
         <w:lastRenderedPageBreak/>
         <w:t>7. Step 5: pretrained ResNet18 (notebook 05)</w:t>
@@ -9427,7 +9427,7 @@
       <w:pPr>
         <w:pStyle w:val="Titre2"/>
       </w:pPr>
-      <w:bookmarkStart w:id="37" w:name="_Toc243488417"/>
+      <w:bookmarkStart w:id="37" w:name="_Toc243489900"/>
       <w:r>
         <w:t>Why a CNN, and why pretrained</w:t>
       </w:r>
@@ -9438,7 +9438,17 @@
         <w:spacing w:after="120"/>
       </w:pPr>
       <w:r>
-        <w:t xml:space="preserve">A CNN slides small filters over the image, so it finds local patterns (edges, textures, brush strokes) anywhere and builds bigger shapes layer after layer. Training one from zero needs far more than 1 061 images, so we reuse </w:t>
+        <w:t xml:space="preserve">A CNN slides small filters over the image, so it finds local patterns (edges, textures, brush strokes) anywhere and builds bigger shapes layer after layer. Training one from zero needs far more than 1 061 images (we checked: from zero, the same ResNet18 reaches only </w:t>
+      </w:r>
+      <w:r>
+        <w:rPr>
+          <w:b/>
+          <w:bCs/>
+        </w:rPr>
+        <w:t>61.6 %</w:t>
+      </w:r>
+      <w:r>
+        <w:t xml:space="preserve"> on validation), so we reuse </w:t>
       </w:r>
       <w:r>
         <w:rPr>
@@ -9481,7 +9491,7 @@
           <w:noProof/>
         </w:rPr>
         <w:drawing>
-          <wp:inline distT="0" distB="0" distL="0" distR="0" wp14:anchorId="3785B007" wp14:editId="3785B008">
+          <wp:inline distT="0" distB="0" distL="0" distR="0" wp14:anchorId="2217158E" wp14:editId="2217158F">
             <wp:extent cx="5905500" cy="2543175"/>
             <wp:effectExtent l="0" t="0" r="0" b="0"/>
             <wp:docPr id="4" name="C:\Users\benca\AppData\Local\Temp\claude\c--Users-benca-OneDrive---Thelio-Documents-Perso-Albert-School\1b4fce00-cdbb-452c-8784-7dae784734de\scratchpad\deck\resnet18_diagram.png" descr="Inside ResNet18 + our linear head (backup slide 20): the frozen body (dark) turns a painting into 512 numbers; our linear head (blue) turns them into 5 scores." title="Inside ResNet18 + our linear head (backup slide 20): the frozen body (dark) turns a painting into 512 numbers; our linear head (blue) turns them into 5 scores."/>
@@ -9591,6 +9601,7 @@
           <w:b/>
           <w:bCs/>
         </w:rPr>
+        <w:lastRenderedPageBreak/>
         <w:t>Ours vs library.</w:t>
       </w:r>
       <w:r>
@@ -9623,9 +9634,8 @@
       <w:pPr>
         <w:pStyle w:val="Titre2"/>
       </w:pPr>
-      <w:bookmarkStart w:id="38" w:name="_Toc243488418"/>
-      <w:r>
-        <w:lastRenderedPageBreak/>
+      <w:bookmarkStart w:id="38" w:name="_Toc243489901"/>
+      <w:r>
         <w:t>Method A: frozen features + head</w:t>
       </w:r>
       <w:bookmarkEnd w:id="38"/>
@@ -9731,7 +9741,7 @@
       <w:pPr>
         <w:pStyle w:val="Titre2"/>
       </w:pPr>
-      <w:bookmarkStart w:id="39" w:name="_Toc243488419"/>
+      <w:bookmarkStart w:id="39" w:name="_Toc243489902"/>
       <w:r>
         <w:t>Method B: fine-tuning layer4</w:t>
       </w:r>
@@ -9788,7 +9798,7 @@
       <w:pPr>
         <w:pStyle w:val="Titre2"/>
       </w:pPr>
-      <w:bookmarkStart w:id="40" w:name="_Toc243488420"/>
+      <w:bookmarkStart w:id="40" w:name="_Toc243489903"/>
       <w:r>
         <w:t>Two silent bugs, measured</w:t>
       </w:r>
@@ -9855,7 +9865,7 @@
       <w:pPr>
         <w:pStyle w:val="Titre2"/>
       </w:pPr>
-      <w:bookmarkStart w:id="41" w:name="_Toc243488421"/>
+      <w:bookmarkStart w:id="41" w:name="_Toc243489904"/>
       <w:r>
         <w:t>Painter leakage, measured fairly</w:t>
       </w:r>
@@ -10196,7 +10206,7 @@
           <w:noProof/>
         </w:rPr>
         <w:drawing>
-          <wp:inline distT="0" distB="0" distL="0" distR="0" wp14:anchorId="3785B009" wp14:editId="3785B00A">
+          <wp:inline distT="0" distB="0" distL="0" distR="0" wp14:anchorId="22171590" wp14:editId="22171591">
             <wp:extent cx="4762500" cy="2524125"/>
             <wp:effectExtent l="0" t="0" r="0" b="0"/>
             <wp:docPr id="5" name="05_painter_leakage.png" descr="Painter leakage: same images, same model; only the known-painter group changes." title="Painter leakage: same images, same model; only the known-painter group changes."/>
@@ -10272,7 +10282,7 @@
         <w:pStyle w:val="Titre1"/>
         <w:pageBreakBefore/>
       </w:pPr>
-      <w:bookmarkStart w:id="42" w:name="_Toc243488422"/>
+      <w:bookmarkStart w:id="42" w:name="_Toc243489905"/>
       <w:r>
         <w:lastRenderedPageBreak/>
         <w:t>8. Step 6: final test, CPU cost and recommendation (notebook 06)</w:t>
@@ -10418,7 +10428,7 @@
       <w:pPr>
         <w:pStyle w:val="Titre2"/>
       </w:pPr>
-      <w:bookmarkStart w:id="43" w:name="_Toc243488423"/>
+      <w:bookmarkStart w:id="43" w:name="_Toc243489906"/>
       <w:r>
         <w:t>Classical models (settings chosen on validation)</w:t>
       </w:r>
@@ -10531,7 +10541,7 @@
       <w:pPr>
         <w:pStyle w:val="Titre2"/>
       </w:pPr>
-      <w:bookmarkStart w:id="44" w:name="_Toc243488424"/>
+      <w:bookmarkStart w:id="44" w:name="_Toc243489907"/>
       <w:r>
         <w:t>The final test, measured once</w:t>
       </w:r>
@@ -11562,7 +11572,7 @@
         </w:rPr>
         <w:lastRenderedPageBreak/>
         <w:drawing>
-          <wp:inline distT="0" distB="0" distL="0" distR="0" wp14:anchorId="3785B00B" wp14:editId="3785B00C">
+          <wp:inline distT="0" distB="0" distL="0" distR="0" wp14:anchorId="22171592" wp14:editId="22171593">
             <wp:extent cx="4762500" cy="1971675"/>
             <wp:effectExtent l="0" t="0" r="0" b="0"/>
             <wp:docPr id="6" name="06_test_accuracy.png" descr="Final test: 220 paintings never seen before, with 95 % bootstrap intervals." title="Final test: 220 paintings never seen before, with 95 % bootstrap intervals."/>
@@ -11621,7 +11631,7 @@
       <w:pPr>
         <w:pStyle w:val="Titre2"/>
       </w:pPr>
-      <w:bookmarkStart w:id="45" w:name="_Toc243488425"/>
+      <w:bookmarkStart w:id="45" w:name="_Toc243489908"/>
       <w:r>
         <w:t>Are the gaps real? Paired bootstrap (same 220 paintings, 5 000 redraws)</w:t>
       </w:r>
@@ -11680,7 +11690,7 @@
       <w:pPr>
         <w:pStyle w:val="Titre2"/>
       </w:pPr>
-      <w:bookmarkStart w:id="46" w:name="_Toc243488426"/>
+      <w:bookmarkStart w:id="46" w:name="_Toc243489909"/>
       <w:r>
         <w:t>Frozen or fine-tuned? Validation and test disagree</w:t>
       </w:r>
@@ -11708,7 +11718,7 @@
       <w:pPr>
         <w:pStyle w:val="Titre2"/>
       </w:pPr>
-      <w:bookmarkStart w:id="47" w:name="_Toc243488427"/>
+      <w:bookmarkStart w:id="47" w:name="_Toc243489910"/>
       <w:r>
         <w:t>Speed and size</w:t>
       </w:r>
@@ -11726,7 +11736,7 @@
       <w:pPr>
         <w:pStyle w:val="Titre2"/>
       </w:pPr>
-      <w:bookmarkStart w:id="48" w:name="_Toc243488428"/>
+      <w:bookmarkStart w:id="48" w:name="_Toc243489911"/>
       <w:r>
         <w:t>Recommendation to the director</w:t>
       </w:r>
@@ -11823,7 +11833,7 @@
         <w:pStyle w:val="Titre1"/>
         <w:pageBreakBefore/>
       </w:pPr>
-      <w:bookmarkStart w:id="49" w:name="_Toc243488429"/>
+      <w:bookmarkStart w:id="49" w:name="_Toc243489912"/>
       <w:r>
         <w:lastRenderedPageBreak/>
         <w:t>9. The random forest, our classical challenger (notebook 06)</w:t>
@@ -12010,7 +12020,7 @@
       <w:pPr>
         <w:pStyle w:val="Titre2"/>
       </w:pPr>
-      <w:bookmarkStart w:id="50" w:name="_Toc243488430"/>
+      <w:bookmarkStart w:id="50" w:name="_Toc243489913"/>
       <w:r>
         <w:t>The 102 hand-made numbers (baselines.py)</w:t>
       </w:r>
@@ -12400,7 +12410,7 @@
       <w:pPr>
         <w:pStyle w:val="Titre2"/>
       </w:pPr>
-      <w:bookmarkStart w:id="51" w:name="_Toc243488431"/>
+      <w:bookmarkStart w:id="51" w:name="_Toc243489914"/>
       <w:r>
         <w:t>Our settings, chosen on validation</w:t>
       </w:r>
@@ -12568,7 +12578,7 @@
       <w:pPr>
         <w:pStyle w:val="Titre2"/>
       </w:pPr>
-      <w:bookmarkStart w:id="52" w:name="_Toc243488432"/>
+      <w:bookmarkStart w:id="52" w:name="_Toc243489915"/>
       <w:r>
         <w:t>Questions on the random forest, with answers</w:t>
       </w:r>
@@ -12833,7 +12843,7 @@
         <w:pStyle w:val="Titre1"/>
         <w:pageBreakBefore/>
       </w:pPr>
-      <w:bookmarkStart w:id="53" w:name="_Toc243488433"/>
+      <w:bookmarkStart w:id="53" w:name="_Toc243489916"/>
       <w:r>
         <w:lastRenderedPageBreak/>
         <w:t>10. Bonus: what about transformers like BERT? (notebook 07)</w:t>
@@ -13700,7 +13710,7 @@
         </w:rPr>
         <w:lastRenderedPageBreak/>
         <w:drawing>
-          <wp:inline distT="0" distB="0" distL="0" distR="0" wp14:anchorId="3785B00D" wp14:editId="3785B00E">
+          <wp:inline distT="0" distB="0" distL="0" distR="0" wp14:anchorId="22171594" wp14:editId="22171595">
             <wp:extent cx="4381500" cy="2486025"/>
             <wp:effectExtent l="0" t="0" r="0" b="0"/>
             <wp:docPr id="7" name="07_transformers_accuracy_vs_speed.png" descr="Transformers on validation: CLIP is more accurate, but slower." title="Transformers on validation: CLIP is more accurate, but slower."/>
@@ -13760,7 +13770,7 @@
         <w:pStyle w:val="Titre1"/>
         <w:pageBreakBefore/>
       </w:pPr>
-      <w:bookmarkStart w:id="54" w:name="_Toc243488434"/>
+      <w:bookmarkStart w:id="54" w:name="_Toc243489917"/>
       <w:r>
         <w:lastRenderedPageBreak/>
         <w:t>11. Key numbers to know by heart</w:t>
@@ -15018,7 +15028,7 @@
         <w:pStyle w:val="Titre1"/>
         <w:pageBreakBefore/>
       </w:pPr>
-      <w:bookmarkStart w:id="55" w:name="_Toc243488435"/>
+      <w:bookmarkStart w:id="55" w:name="_Toc243489918"/>
       <w:r>
         <w:lastRenderedPageBreak/>
         <w:t>12. Concepts in simple words</w:t>
@@ -17209,7 +17219,7 @@
         <w:pStyle w:val="Titre1"/>
         <w:pageBreakBefore/>
       </w:pPr>
-      <w:bookmarkStart w:id="56" w:name="_Toc243488436"/>
+      <w:bookmarkStart w:id="56" w:name="_Toc243489919"/>
       <w:r>
         <w:lastRenderedPageBreak/>
         <w:t>13. Questions you may get, with answers</w:t>
@@ -17231,7 +17241,7 @@
       <w:pPr>
         <w:pStyle w:val="Titre2"/>
       </w:pPr>
-      <w:bookmarkStart w:id="57" w:name="_Toc243488437"/>
+      <w:bookmarkStart w:id="57" w:name="_Toc243489920"/>
       <w:r>
         <w:t>About the data</w:t>
       </w:r>
@@ -17351,7 +17361,7 @@
       <w:pPr>
         <w:pStyle w:val="Titre2"/>
       </w:pPr>
-      <w:bookmarkStart w:id="58" w:name="_Toc243488438"/>
+      <w:bookmarkStart w:id="58" w:name="_Toc243489921"/>
       <w:r>
         <w:t>About the MLP</w:t>
       </w:r>
@@ -17471,7 +17481,7 @@
       <w:pPr>
         <w:pStyle w:val="Titre2"/>
       </w:pPr>
-      <w:bookmarkStart w:id="59" w:name="_Toc243488439"/>
+      <w:bookmarkStart w:id="59" w:name="_Toc243489922"/>
       <w:r>
         <w:t>About training and diagnosis</w:t>
       </w:r>
@@ -17569,7 +17579,7 @@
       <w:pPr>
         <w:pStyle w:val="Titre2"/>
       </w:pPr>
-      <w:bookmarkStart w:id="60" w:name="_Toc243488440"/>
+      <w:bookmarkStart w:id="60" w:name="_Toc243489923"/>
       <w:r>
         <w:lastRenderedPageBreak/>
         <w:t>About ResNet</w:t>
@@ -17595,95 +17605,7 @@
         <w:spacing w:after="120"/>
       </w:pPr>
       <w:r>
-        <w:t>1 061 images are far too few for millions of weights; a pretrained network already knows edges, textures and shapes from 1.2 million photos.</w:t>
-      </w:r>
-    </w:p>
-    <w:p>
-      <w:pPr>
-        <w:keepNext/>
-        <w:spacing w:before="120" w:after="40"/>
-      </w:pPr>
-      <w:r>
-        <w:rPr>
-          <w:b/>
-          <w:bCs/>
-          <w:color w:val="1C2433"/>
-        </w:rPr>
-        <w:t>Why ResNet18 and not a bigger model (ResNet50, ViT, CLIP)?</w:t>
-      </w:r>
-    </w:p>
-    <w:p>
-      <w:pPr>
-        <w:spacing w:after="120"/>
-      </w:pPr>
-      <w:r>
-        <w:t>The brief asks for a ResNet and the kiosk CPU is small: ResNet18 is the smallest standard ResNet (53 ms per photo). We would only try a bigger one if accuracy were not enough.</w:t>
-      </w:r>
-    </w:p>
-    <w:p>
-      <w:pPr>
-        <w:keepNext/>
-        <w:spacing w:before="120" w:after="40"/>
-      </w:pPr>
-      <w:r>
-        <w:rPr>
-          <w:b/>
-          <w:bCs/>
-          <w:color w:val="1C2433"/>
-        </w:rPr>
-        <w:t>What are the 512 numbers?</w:t>
-      </w:r>
-    </w:p>
-    <w:p>
-      <w:pPr>
-        <w:spacing w:after="120"/>
-      </w:pPr>
-      <w:r>
-        <w:t>What ResNet18 gives just before its own last layer: after the convolution layers, each of its 512 feature maps is averaged over the whole picture. Each number says how much of one learned pattern is in the painting. We removed its last layer (1 000 ImageNet classes) and put ours instead (5 styles).</w:t>
-      </w:r>
-    </w:p>
-    <w:p>
-      <w:pPr>
-        <w:keepNext/>
-        <w:spacing w:before="120" w:after="40"/>
-      </w:pPr>
-      <w:r>
-        <w:rPr>
-          <w:b/>
-          <w:bCs/>
-          <w:color w:val="1C2433"/>
-        </w:rPr>
-        <w:t>What does "Res" mean in ResNet?</w:t>
-      </w:r>
-    </w:p>
-    <w:p>
-      <w:pPr>
-        <w:spacing w:after="120"/>
-      </w:pPr>
-      <w:r>
-        <w:t>Residual: each block adds its input to its output, a shortcut. The gradient flows back through these shortcuts, so an 18-layer network does not suffer from the vanishing gradient that blocked our 8 sigmoid layers.</w:t>
-      </w:r>
-    </w:p>
-    <w:p>
-      <w:pPr>
-        <w:keepNext/>
-        <w:spacing w:before="120" w:after="40"/>
-      </w:pPr>
-      <w:r>
-        <w:rPr>
-          <w:b/>
-          <w:bCs/>
-          <w:color w:val="1C2433"/>
-        </w:rPr>
-        <w:t>How do you freeze it in code?</w:t>
-      </w:r>
-    </w:p>
-    <w:p>
-      <w:pPr>
-        <w:spacing w:after="120"/>
-      </w:pPr>
-      <w:r>
-        <w:t xml:space="preserve">In </w:t>
+        <w:t>1 061 images are far too few for millions of weights; a pretrained network already knows edges, textures and shapes from 1.2 million photos. We measured it (</w:t>
       </w:r>
       <w:r>
         <w:rPr>
@@ -17691,10 +17613,98 @@
           <w:sz w:val="19"/>
           <w:szCs w:val="19"/>
         </w:rPr>
-        <w:t>ResNetClassifier</w:t>
-      </w:r>
-      <w:r>
-        <w:t xml:space="preserve"> (</w:t>
+        <w:t>scripts/resnet_from_zero.py</w:t>
+      </w:r>
+      <w:r>
+        <w:t>, backup slide 21): the same ResNet18 with random weights, every layer learning for 30 epochs (24 minutes of CPU), reaches only 61.6 % on validation, against 88.1 % frozen. That is about the random forest (63.5 %), but better than our MLP (45.5 %): convolutions help, the pretraining helps much more.</w:t>
+      </w:r>
+    </w:p>
+    <w:p>
+      <w:pPr>
+        <w:keepNext/>
+        <w:spacing w:before="120" w:after="40"/>
+      </w:pPr>
+      <w:r>
+        <w:rPr>
+          <w:b/>
+          <w:bCs/>
+          <w:color w:val="1C2433"/>
+        </w:rPr>
+        <w:t>Why ResNet18 and not a bigger model (ResNet50, ViT, CLIP)?</w:t>
+      </w:r>
+    </w:p>
+    <w:p>
+      <w:pPr>
+        <w:spacing w:after="120"/>
+      </w:pPr>
+      <w:r>
+        <w:t>The brief asks for a ResNet and the kiosk CPU is small: ResNet18 is the smallest standard ResNet (53 ms per photo). We would only try a bigger one if accuracy were not enough.</w:t>
+      </w:r>
+    </w:p>
+    <w:p>
+      <w:pPr>
+        <w:keepNext/>
+        <w:spacing w:before="120" w:after="40"/>
+      </w:pPr>
+      <w:r>
+        <w:rPr>
+          <w:b/>
+          <w:bCs/>
+          <w:color w:val="1C2433"/>
+        </w:rPr>
+        <w:t>What are the 512 numbers?</w:t>
+      </w:r>
+    </w:p>
+    <w:p>
+      <w:pPr>
+        <w:spacing w:after="120"/>
+      </w:pPr>
+      <w:r>
+        <w:t>What ResNet18 gives just before its own last layer: after the convolution layers, each of its 512 feature maps is averaged over the whole picture. Each number says how much of one learned pattern is in the painting. We removed its last layer (1 000 ImageNet classes) and put ours instead (5 styles).</w:t>
+      </w:r>
+    </w:p>
+    <w:p>
+      <w:pPr>
+        <w:keepNext/>
+        <w:spacing w:before="120" w:after="40"/>
+      </w:pPr>
+      <w:r>
+        <w:rPr>
+          <w:b/>
+          <w:bCs/>
+          <w:color w:val="1C2433"/>
+        </w:rPr>
+        <w:t>What does "Res" mean in ResNet?</w:t>
+      </w:r>
+    </w:p>
+    <w:p>
+      <w:pPr>
+        <w:spacing w:after="120"/>
+      </w:pPr>
+      <w:r>
+        <w:t>Residual: each block adds its input to its output, a shortcut. The gradient flows back through these shortcuts, so an 18-layer network does not suffer from the vanishing gradient that blocked our 8 sigmoid layers.</w:t>
+      </w:r>
+    </w:p>
+    <w:p>
+      <w:pPr>
+        <w:keepNext/>
+        <w:spacing w:before="120" w:after="40"/>
+      </w:pPr>
+      <w:r>
+        <w:rPr>
+          <w:b/>
+          <w:bCs/>
+          <w:color w:val="1C2433"/>
+        </w:rPr>
+        <w:t>How do you freeze it in code?</w:t>
+      </w:r>
+    </w:p>
+    <w:p>
+      <w:pPr>
+        <w:spacing w:after="120"/>
+      </w:pPr>
+      <w:r>
+        <w:t xml:space="preserve">In </w:t>
       </w:r>
       <w:r>
         <w:rPr>
@@ -17702,10 +17712,10 @@
           <w:sz w:val="19"/>
           <w:szCs w:val="19"/>
         </w:rPr>
-        <w:t>models.py</w:t>
-      </w:r>
-      <w:r>
-        <w:t xml:space="preserve">): </w:t>
+        <w:t>ResNetClassifier</w:t>
+      </w:r>
+      <w:r>
+        <w:t xml:space="preserve"> (</w:t>
       </w:r>
       <w:r>
         <w:rPr>
@@ -17713,10 +17723,10 @@
           <w:sz w:val="19"/>
           <w:szCs w:val="19"/>
         </w:rPr>
-        <w:t>requires_grad_(False)</w:t>
-      </w:r>
-      <w:r>
-        <w:t xml:space="preserve"> on every weight of the body, and its batch norm layers stay in eval mode. Only the head, </w:t>
+        <w:t>models.py</w:t>
+      </w:r>
+      <w:r>
+        <w:t xml:space="preserve">): </w:t>
       </w:r>
       <w:r>
         <w:rPr>
@@ -17724,6 +17734,17 @@
           <w:sz w:val="19"/>
           <w:szCs w:val="19"/>
         </w:rPr>
+        <w:t>requires_grad_(False)</w:t>
+      </w:r>
+      <w:r>
+        <w:t xml:space="preserve"> on every weight of the body, and its batch norm layers stay in eval mode. Only the head, </w:t>
+      </w:r>
+      <w:r>
+        <w:rPr>
+          <w:rFonts w:ascii="Consolas" w:eastAsia="Consolas" w:hAnsi="Consolas" w:cs="Consolas"/>
+          <w:sz w:val="19"/>
+          <w:szCs w:val="19"/>
+        </w:rPr>
         <w:t>nn.Linear(512, 5)</w:t>
       </w:r>
       <w:r>
@@ -17844,7 +17865,7 @@
       <w:pPr>
         <w:pStyle w:val="Titre2"/>
       </w:pPr>
-      <w:bookmarkStart w:id="61" w:name="_Toc243488441"/>
+      <w:bookmarkStart w:id="61" w:name="_Toc243489924"/>
       <w:r>
         <w:t>About the results and the recommendation</w:t>
       </w:r>
@@ -17905,6 +17926,7 @@
           <w:bCs/>
           <w:color w:val="1C2433"/>
         </w:rPr>
+        <w:lastRenderedPageBreak/>
         <w:t>Is 83 % good enough for a museum?</w:t>
       </w:r>
     </w:p>
@@ -17927,7 +17949,6 @@
           <w:bCs/>
           <w:color w:val="1C2433"/>
         </w:rPr>
-        <w:lastRenderedPageBreak/>
         <w:t>Is 53 ms realistic on a kiosk?</w:t>
       </w:r>
     </w:p>
@@ -17987,7 +18008,7 @@
       <w:pPr>
         <w:pStyle w:val="Titre2"/>
       </w:pPr>
-      <w:bookmarkStart w:id="62" w:name="_Toc243488442"/>
+      <w:bookmarkStart w:id="62" w:name="_Toc243489925"/>
       <w:r>
         <w:t>About the project</w:t>
       </w:r>
@@ -18042,7 +18063,7 @@
         <w:pStyle w:val="Titre1"/>
         <w:pageBreakBefore/>
       </w:pPr>
-      <w:bookmarkStart w:id="63" w:name="_Toc243488443"/>
+      <w:bookmarkStart w:id="63" w:name="_Toc243489926"/>
       <w:r>
         <w:lastRenderedPageBreak/>
         <w:t>14. Limits to admit, and next steps</w:t>
@@ -18836,7 +18857,7 @@
         <w:pStyle w:val="Titre1"/>
         <w:pageBreakBefore/>
       </w:pPr>
-      <w:bookmarkStart w:id="64" w:name="_Toc243488444"/>
+      <w:bookmarkStart w:id="64" w:name="_Toc243489927"/>
       <w:r>
         <w:lastRenderedPageBreak/>
         <w:t>15. Git history and how to reproduce</w:t>
@@ -19792,7 +19813,7 @@
         <w:pStyle w:val="Titre1"/>
         <w:pageBreakBefore/>
       </w:pPr>
-      <w:bookmarkStart w:id="65" w:name="_Toc243488445"/>
+      <w:bookmarkStart w:id="65" w:name="_Toc243489928"/>
       <w:r>
         <w:lastRenderedPageBreak/>
         <w:t>16. The 10-minute talk, slide by slide</w:t>
@@ -21150,7 +21171,7 @@
       <w:pPr>
         <w:pStyle w:val="Titre2"/>
       </w:pPr>
-      <w:bookmarkStart w:id="66" w:name="_Toc243488446"/>
+      <w:bookmarkStart w:id="66" w:name="_Toc243489929"/>
       <w:r>
         <w:t>The thread: each result opens the next step</w:t>
       </w:r>
@@ -21370,7 +21391,7 @@
         <w:spacing w:after="120"/>
       </w:pPr>
       <w:r>
-        <w:t>Slides 12 to 20 are backups for the questions: classical models (all the scores), seeing the painter inflates the score, validation vs test, why you can trust the numbers, the training recipes, the four broken runs of notebook 04, where the chosen model fails, what about transformers (BERT, ViT, CLIP), and inside ResNet18 + our linear head. The word-for-word script is in oral_script.pdf.</w:t>
+        <w:t>Slides 12 to 21 are backups for the questions: classical models (all the scores), seeing the painter inflates the score, validation vs test, why you can trust the numbers, the training recipes, the four broken runs of notebook 04, where the chosen model fails, what about transformers (BERT, ViT, CLIP), inside ResNet18 + our linear head, and why pretrained (ResNet18 trained from zero). The word-for-word script is in oral_script.pdf.</w:t>
       </w:r>
     </w:p>
     <w:sectPr>
@@ -21484,10 +21505,10 @@
 <file path=word/numbering.xml><?xml version="1.0" encoding="utf-8"?>
 <w:numbering xmlns:wpc="http://schemas.microsoft.com/office/word/2010/wordprocessingCanvas" xmlns:cx="http://schemas.microsoft.com/office/drawing/2014/chartex" xmlns:cx1="http://schemas.microsoft.com/office/drawing/2015/9/8/chartex" xmlns:cx2="http://schemas.microsoft.com/office/drawing/2015/10/21/chartex" xmlns:cx3="http://schemas.microsoft.com/office/drawing/2016/5/9/chartex" xmlns:cx4="http://schemas.microsoft.com/office/drawing/2016/5/10/chartex" xmlns:cx5="http://schemas.microsoft.com/office/drawing/2016/5/11/chartex" xmlns:cx6="http://schemas.microsoft.com/office/drawing/2016/5/12/chartex" xmlns:cx7="http://schemas.microsoft.com/office/drawing/2016/5/13/chartex" xmlns:cx8="http://schemas.microsoft.com/office/drawing/2016/5/14/chartex" xmlns:mc="http://schemas.openxmlformats.org/markup-compatibility/2006" xmlns:aink="http://schemas.microsoft.com/office/drawing/2016/ink" xmlns:am3d="http://schemas.microsoft.com/office/drawing/2017/model3d" xmlns:o="urn:schemas-microsoft-com:office:office" xmlns:oel="http://schemas.microsoft.com/office/2019/extlst" xmlns:r="http://schemas.openxmlformats.org/officeDocument/2006/relationships" xmlns:m="http://schemas.openxmlformats.org/officeDocument/2006/math" xmlns:v="urn:schemas-microsoft-com:vml" xmlns:wp14="http://schemas.microsoft.com/office/word/2010/wordprocessingDrawing" xmlns:wp="http://schemas.openxmlformats.org/drawingml/2006/wordprocessingDrawing" xmlns:w10="urn:schemas-microsoft-com:office:word" xmlns:w="http://schemas.openxmlformats.org/wordprocessingml/2006/main" xmlns:w14="http://schemas.microsoft.com/office/word/2010/wordml" xmlns:w15="http://schemas.microsoft.com/office/word/2012/wordml" xmlns:w16cex="http://schemas.microsoft.com/office/word/2018/wordml/cex" xmlns:w16cid="http://schemas.microsoft.com/office/word/2016/wordml/cid" xmlns:w16="http://schemas.microsoft.com/office/word/2018/wordml" xmlns:w16du="http://schemas.microsoft.com/office/word/2023/wordml/word16du" xmlns:w16sdtdh="http://schemas.microsoft.com/office/word/2020/wordml/sdtdatahash" xmlns:w16sdtfl="http://schemas.microsoft.com/office/word/2024/wordml/sdtformatlock" xmlns:w16se="http://schemas.microsoft.com/office/word/2015/wordml/symex" xmlns:wpg="http://schemas.microsoft.com/office/word/2010/wordprocessingGroup" xmlns:wpi="http://schemas.microsoft.com/office/word/2010/wordprocessingInk" xmlns:wne="http://schemas.microsoft.com/office/word/2006/wordml" xmlns:wps="http://schemas.microsoft.com/office/word/2010/wordprocessingShape" mc:Ignorable="w14 w15 w16se w16cid w16 w16cex w16sdtdh w16sdtfl w16du wp14">
   <w:abstractNum w:abstractNumId="0" w15:restartNumberingAfterBreak="0">
-    <w:nsid w:val="067449DC"/>
+    <w:nsid w:val="07FF7CC8"/>
     <w:multiLevelType w:val="hybridMultilevel"/>
-    <w:tmpl w:val="69D2FB68"/>
-    <w:lvl w:ilvl="0" w:tplc="5434C2C8">
+    <w:tmpl w:val="C9B26C10"/>
+    <w:lvl w:ilvl="0" w:tplc="2FC4FF20">
       <w:start w:val="1"/>
       <w:numFmt w:val="decimal"/>
       <w:lvlText w:val="%1."/>
@@ -21496,192 +21517,106 @@
         <w:ind w:left="400" w:hanging="300"/>
       </w:pPr>
     </w:lvl>
-    <w:lvl w:ilvl="1" w:tplc="0BFAF764">
+    <w:lvl w:ilvl="1" w:tplc="3BA8F714">
       <w:numFmt w:val="decimal"/>
       <w:lvlText w:val=""/>
       <w:lvlJc w:val="left"/>
     </w:lvl>
-    <w:lvl w:ilvl="2" w:tplc="7F267BAE">
+    <w:lvl w:ilvl="2" w:tplc="48D68DD2">
       <w:numFmt w:val="decimal"/>
       <w:lvlText w:val=""/>
       <w:lvlJc w:val="left"/>
     </w:lvl>
-    <w:lvl w:ilvl="3" w:tplc="2CF6441A">
+    <w:lvl w:ilvl="3" w:tplc="524235C2">
       <w:numFmt w:val="decimal"/>
       <w:lvlText w:val=""/>
       <w:lvlJc w:val="left"/>
     </w:lvl>
-    <w:lvl w:ilvl="4" w:tplc="FB602F44">
+    <w:lvl w:ilvl="4" w:tplc="D7162A1C">
       <w:numFmt w:val="decimal"/>
       <w:lvlText w:val=""/>
       <w:lvlJc w:val="left"/>
     </w:lvl>
-    <w:lvl w:ilvl="5" w:tplc="B9849676">
+    <w:lvl w:ilvl="5" w:tplc="E1341722">
       <w:numFmt w:val="decimal"/>
       <w:lvlText w:val=""/>
       <w:lvlJc w:val="left"/>
     </w:lvl>
-    <w:lvl w:ilvl="6" w:tplc="A6D83A86">
+    <w:lvl w:ilvl="6" w:tplc="DA208346">
       <w:numFmt w:val="decimal"/>
       <w:lvlText w:val=""/>
       <w:lvlJc w:val="left"/>
     </w:lvl>
-    <w:lvl w:ilvl="7" w:tplc="A4A84CB8">
+    <w:lvl w:ilvl="7" w:tplc="8D789C6E">
       <w:numFmt w:val="decimal"/>
       <w:lvlText w:val=""/>
       <w:lvlJc w:val="left"/>
     </w:lvl>
-    <w:lvl w:ilvl="8" w:tplc="B4001B0A">
+    <w:lvl w:ilvl="8" w:tplc="912A7390">
       <w:numFmt w:val="decimal"/>
       <w:lvlText w:val=""/>
       <w:lvlJc w:val="left"/>
     </w:lvl>
   </w:abstractNum>
   <w:abstractNum w:abstractNumId="1" w15:restartNumberingAfterBreak="0">
-    <w:nsid w:val="06A50F63"/>
+    <w:nsid w:val="2AE25CFF"/>
     <w:multiLevelType w:val="hybridMultilevel"/>
-    <w:tmpl w:val="FB9AC8CA"/>
-    <w:lvl w:ilvl="0" w:tplc="690A385E">
+    <w:tmpl w:val="CE8E9460"/>
+    <w:lvl w:ilvl="0" w:tplc="9566EB20">
       <w:start w:val="1"/>
-      <w:numFmt w:val="decimal"/>
-      <w:lvlText w:val="%1."/>
+      <w:numFmt w:val="bullet"/>
+      <w:lvlText w:val="•"/>
       <w:lvlJc w:val="left"/>
       <w:pPr>
-        <w:ind w:left="400" w:hanging="300"/>
+        <w:ind w:left="400" w:hanging="260"/>
       </w:pPr>
     </w:lvl>
-    <w:lvl w:ilvl="1" w:tplc="EEACE668">
+    <w:lvl w:ilvl="1" w:tplc="E9E6C5CC">
       <w:numFmt w:val="decimal"/>
       <w:lvlText w:val=""/>
       <w:lvlJc w:val="left"/>
     </w:lvl>
-    <w:lvl w:ilvl="2" w:tplc="A0EADAE4">
+    <w:lvl w:ilvl="2" w:tplc="DF3EDA3C">
       <w:numFmt w:val="decimal"/>
       <w:lvlText w:val=""/>
       <w:lvlJc w:val="left"/>
     </w:lvl>
-    <w:lvl w:ilvl="3" w:tplc="19E2423E">
+    <w:lvl w:ilvl="3" w:tplc="C4EE8506">
       <w:numFmt w:val="decimal"/>
       <w:lvlText w:val=""/>
       <w:lvlJc w:val="left"/>
     </w:lvl>
-    <w:lvl w:ilvl="4" w:tplc="BA746C5E">
+    <w:lvl w:ilvl="4" w:tplc="997CA668">
       <w:numFmt w:val="decimal"/>
       <w:lvlText w:val=""/>
       <w:lvlJc w:val="left"/>
     </w:lvl>
-    <w:lvl w:ilvl="5" w:tplc="CAE09F96">
+    <w:lvl w:ilvl="5" w:tplc="64BE40B8">
       <w:numFmt w:val="decimal"/>
       <w:lvlText w:val=""/>
       <w:lvlJc w:val="left"/>
     </w:lvl>
-    <w:lvl w:ilvl="6" w:tplc="E9F286D4">
+    <w:lvl w:ilvl="6" w:tplc="5E7E5FBA">
       <w:numFmt w:val="decimal"/>
       <w:lvlText w:val=""/>
       <w:lvlJc w:val="left"/>
     </w:lvl>
-    <w:lvl w:ilvl="7" w:tplc="E67222FE">
+    <w:lvl w:ilvl="7" w:tplc="FE82840A">
       <w:numFmt w:val="decimal"/>
       <w:lvlText w:val=""/>
       <w:lvlJc w:val="left"/>
     </w:lvl>
-    <w:lvl w:ilvl="8" w:tplc="ABA0AF06">
+    <w:lvl w:ilvl="8" w:tplc="F46A0BBE">
       <w:numFmt w:val="decimal"/>
       <w:lvlText w:val=""/>
       <w:lvlJc w:val="left"/>
     </w:lvl>
   </w:abstractNum>
   <w:abstractNum w:abstractNumId="2" w15:restartNumberingAfterBreak="0">
-    <w:nsid w:val="1E305F6A"/>
+    <w:nsid w:val="33D10EF9"/>
     <w:multiLevelType w:val="hybridMultilevel"/>
-    <w:tmpl w:val="CF240C80"/>
-    <w:lvl w:ilvl="0" w:tplc="FC749772" w:tentative="1">
-      <w:start w:val="1"/>
-      <w:numFmt w:val="bullet"/>
-      <w:lvlText w:val="●"/>
-      <w:lvlJc w:val="left"/>
-      <w:pPr>
-        <w:ind w:left="720" w:hanging="360"/>
-      </w:pPr>
-    </w:lvl>
-    <w:lvl w:ilvl="1" w:tplc="89F2935C" w:tentative="1">
-      <w:start w:val="1"/>
-      <w:numFmt w:val="bullet"/>
-      <w:lvlText w:val="○"/>
-      <w:lvlJc w:val="left"/>
-      <w:pPr>
-        <w:ind w:left="1440" w:hanging="360"/>
-      </w:pPr>
-    </w:lvl>
-    <w:lvl w:ilvl="2" w:tplc="9DFE9400" w:tentative="1">
-      <w:start w:val="1"/>
-      <w:numFmt w:val="bullet"/>
-      <w:lvlText w:val="■"/>
-      <w:lvlJc w:val="left"/>
-      <w:pPr>
-        <w:ind w:left="2160" w:hanging="360"/>
-      </w:pPr>
-    </w:lvl>
-    <w:lvl w:ilvl="3" w:tplc="46FEF6C0" w:tentative="1">
-      <w:start w:val="1"/>
-      <w:numFmt w:val="bullet"/>
-      <w:lvlText w:val="●"/>
-      <w:lvlJc w:val="left"/>
-      <w:pPr>
-        <w:ind w:left="2880" w:hanging="360"/>
-      </w:pPr>
-    </w:lvl>
-    <w:lvl w:ilvl="4" w:tplc="B00EB1AC" w:tentative="1">
-      <w:start w:val="1"/>
-      <w:numFmt w:val="bullet"/>
-      <w:lvlText w:val="○"/>
-      <w:lvlJc w:val="left"/>
-      <w:pPr>
-        <w:ind w:left="3600" w:hanging="360"/>
-      </w:pPr>
-    </w:lvl>
-    <w:lvl w:ilvl="5" w:tplc="B5668932" w:tentative="1">
-      <w:start w:val="1"/>
-      <w:numFmt w:val="bullet"/>
-      <w:lvlText w:val="■"/>
-      <w:lvlJc w:val="left"/>
-      <w:pPr>
-        <w:ind w:left="4320" w:hanging="360"/>
-      </w:pPr>
-    </w:lvl>
-    <w:lvl w:ilvl="6" w:tplc="E18C4900" w:tentative="1">
-      <w:start w:val="1"/>
-      <w:numFmt w:val="bullet"/>
-      <w:lvlText w:val="●"/>
-      <w:lvlJc w:val="left"/>
-      <w:pPr>
-        <w:ind w:left="5040" w:hanging="360"/>
-      </w:pPr>
-    </w:lvl>
-    <w:lvl w:ilvl="7" w:tplc="FCA4AB3E" w:tentative="1">
-      <w:start w:val="1"/>
-      <w:numFmt w:val="bullet"/>
-      <w:lvlText w:val="●"/>
-      <w:lvlJc w:val="left"/>
-      <w:pPr>
-        <w:ind w:left="5760" w:hanging="360"/>
-      </w:pPr>
-    </w:lvl>
-    <w:lvl w:ilvl="8" w:tplc="DE04D43A" w:tentative="1">
-      <w:start w:val="1"/>
-      <w:numFmt w:val="bullet"/>
-      <w:lvlText w:val="●"/>
-      <w:lvlJc w:val="left"/>
-      <w:pPr>
-        <w:ind w:left="6480" w:hanging="360"/>
-      </w:pPr>
-    </w:lvl>
-  </w:abstractNum>
-  <w:abstractNum w:abstractNumId="3" w15:restartNumberingAfterBreak="0">
-    <w:nsid w:val="333E099D"/>
-    <w:multiLevelType w:val="hybridMultilevel"/>
-    <w:tmpl w:val="0C64A498"/>
-    <w:lvl w:ilvl="0" w:tplc="07464CC6">
+    <w:tmpl w:val="3F9EDB48"/>
+    <w:lvl w:ilvl="0" w:tplc="E39C8FA0">
       <w:start w:val="1"/>
       <w:numFmt w:val="decimal"/>
       <w:lvlText w:val="%1."/>
@@ -21690,127 +21625,213 @@
         <w:ind w:left="400" w:hanging="300"/>
       </w:pPr>
     </w:lvl>
-    <w:lvl w:ilvl="1" w:tplc="DB3E8E52">
+    <w:lvl w:ilvl="1" w:tplc="8C5E8696">
       <w:numFmt w:val="decimal"/>
       <w:lvlText w:val=""/>
       <w:lvlJc w:val="left"/>
     </w:lvl>
-    <w:lvl w:ilvl="2" w:tplc="48BA5AB0">
+    <w:lvl w:ilvl="2" w:tplc="C1FEA538">
       <w:numFmt w:val="decimal"/>
       <w:lvlText w:val=""/>
       <w:lvlJc w:val="left"/>
     </w:lvl>
-    <w:lvl w:ilvl="3" w:tplc="67628556">
+    <w:lvl w:ilvl="3" w:tplc="EEA6F17C">
       <w:numFmt w:val="decimal"/>
       <w:lvlText w:val=""/>
       <w:lvlJc w:val="left"/>
     </w:lvl>
-    <w:lvl w:ilvl="4" w:tplc="B5F4C1C6">
+    <w:lvl w:ilvl="4" w:tplc="C394B8F6">
       <w:numFmt w:val="decimal"/>
       <w:lvlText w:val=""/>
       <w:lvlJc w:val="left"/>
     </w:lvl>
-    <w:lvl w:ilvl="5" w:tplc="5550427A">
+    <w:lvl w:ilvl="5" w:tplc="4100295A">
       <w:numFmt w:val="decimal"/>
       <w:lvlText w:val=""/>
       <w:lvlJc w:val="left"/>
     </w:lvl>
-    <w:lvl w:ilvl="6" w:tplc="994EF22C">
+    <w:lvl w:ilvl="6" w:tplc="EC3EADC4">
       <w:numFmt w:val="decimal"/>
       <w:lvlText w:val=""/>
       <w:lvlJc w:val="left"/>
     </w:lvl>
-    <w:lvl w:ilvl="7" w:tplc="3C9CB59C">
+    <w:lvl w:ilvl="7" w:tplc="C73CDEAA">
       <w:numFmt w:val="decimal"/>
       <w:lvlText w:val=""/>
       <w:lvlJc w:val="left"/>
     </w:lvl>
-    <w:lvl w:ilvl="8" w:tplc="9FF870B4">
+    <w:lvl w:ilvl="8" w:tplc="C562E81E">
       <w:numFmt w:val="decimal"/>
       <w:lvlText w:val=""/>
       <w:lvlJc w:val="left"/>
     </w:lvl>
   </w:abstractNum>
-  <w:abstractNum w:abstractNumId="4" w15:restartNumberingAfterBreak="0">
-    <w:nsid w:val="61E67D17"/>
+  <w:abstractNum w:abstractNumId="3" w15:restartNumberingAfterBreak="0">
+    <w:nsid w:val="6A1444A5"/>
     <w:multiLevelType w:val="hybridMultilevel"/>
-    <w:tmpl w:val="785CCFD8"/>
-    <w:lvl w:ilvl="0" w:tplc="13B698E6">
+    <w:tmpl w:val="4B7AE110"/>
+    <w:lvl w:ilvl="0" w:tplc="A15A68C4" w:tentative="1">
       <w:start w:val="1"/>
       <w:numFmt w:val="bullet"/>
-      <w:lvlText w:val="•"/>
+      <w:lvlText w:val="●"/>
       <w:lvlJc w:val="left"/>
       <w:pPr>
-        <w:ind w:left="400" w:hanging="260"/>
+        <w:ind w:left="720" w:hanging="360"/>
       </w:pPr>
     </w:lvl>
-    <w:lvl w:ilvl="1" w:tplc="30D4ACEE">
+    <w:lvl w:ilvl="1" w:tplc="BF522BC6" w:tentative="1">
+      <w:start w:val="1"/>
+      <w:numFmt w:val="bullet"/>
+      <w:lvlText w:val="○"/>
+      <w:lvlJc w:val="left"/>
+      <w:pPr>
+        <w:ind w:left="1440" w:hanging="360"/>
+      </w:pPr>
+    </w:lvl>
+    <w:lvl w:ilvl="2" w:tplc="BB6A4050" w:tentative="1">
+      <w:start w:val="1"/>
+      <w:numFmt w:val="bullet"/>
+      <w:lvlText w:val="■"/>
+      <w:lvlJc w:val="left"/>
+      <w:pPr>
+        <w:ind w:left="2160" w:hanging="360"/>
+      </w:pPr>
+    </w:lvl>
+    <w:lvl w:ilvl="3" w:tplc="B450DA26" w:tentative="1">
+      <w:start w:val="1"/>
+      <w:numFmt w:val="bullet"/>
+      <w:lvlText w:val="●"/>
+      <w:lvlJc w:val="left"/>
+      <w:pPr>
+        <w:ind w:left="2880" w:hanging="360"/>
+      </w:pPr>
+    </w:lvl>
+    <w:lvl w:ilvl="4" w:tplc="98F2F102" w:tentative="1">
+      <w:start w:val="1"/>
+      <w:numFmt w:val="bullet"/>
+      <w:lvlText w:val="○"/>
+      <w:lvlJc w:val="left"/>
+      <w:pPr>
+        <w:ind w:left="3600" w:hanging="360"/>
+      </w:pPr>
+    </w:lvl>
+    <w:lvl w:ilvl="5" w:tplc="68E24850" w:tentative="1">
+      <w:start w:val="1"/>
+      <w:numFmt w:val="bullet"/>
+      <w:lvlText w:val="■"/>
+      <w:lvlJc w:val="left"/>
+      <w:pPr>
+        <w:ind w:left="4320" w:hanging="360"/>
+      </w:pPr>
+    </w:lvl>
+    <w:lvl w:ilvl="6" w:tplc="8FC629E4" w:tentative="1">
+      <w:start w:val="1"/>
+      <w:numFmt w:val="bullet"/>
+      <w:lvlText w:val="●"/>
+      <w:lvlJc w:val="left"/>
+      <w:pPr>
+        <w:ind w:left="5040" w:hanging="360"/>
+      </w:pPr>
+    </w:lvl>
+    <w:lvl w:ilvl="7" w:tplc="6A7A3C3A" w:tentative="1">
+      <w:start w:val="1"/>
+      <w:numFmt w:val="bullet"/>
+      <w:lvlText w:val="●"/>
+      <w:lvlJc w:val="left"/>
+      <w:pPr>
+        <w:ind w:left="5760" w:hanging="360"/>
+      </w:pPr>
+    </w:lvl>
+    <w:lvl w:ilvl="8" w:tplc="D4A65CCE" w:tentative="1">
+      <w:start w:val="1"/>
+      <w:numFmt w:val="bullet"/>
+      <w:lvlText w:val="●"/>
+      <w:lvlJc w:val="left"/>
+      <w:pPr>
+        <w:ind w:left="6480" w:hanging="360"/>
+      </w:pPr>
+    </w:lvl>
+  </w:abstractNum>
+  <w:abstractNum w:abstractNumId="4" w15:restartNumberingAfterBreak="0">
+    <w:nsid w:val="793777EE"/>
+    <w:multiLevelType w:val="hybridMultilevel"/>
+    <w:tmpl w:val="4F1C47D4"/>
+    <w:lvl w:ilvl="0" w:tplc="EF5C25AA">
+      <w:start w:val="1"/>
+      <w:numFmt w:val="decimal"/>
+      <w:lvlText w:val="%1."/>
+      <w:lvlJc w:val="left"/>
+      <w:pPr>
+        <w:ind w:left="400" w:hanging="300"/>
+      </w:pPr>
+    </w:lvl>
+    <w:lvl w:ilvl="1" w:tplc="4DFC43A6">
       <w:numFmt w:val="decimal"/>
       <w:lvlText w:val=""/>
       <w:lvlJc w:val="left"/>
     </w:lvl>
-    <w:lvl w:ilvl="2" w:tplc="CE20396E">
+    <w:lvl w:ilvl="2" w:tplc="8F4AA804">
       <w:numFmt w:val="decimal"/>
       <w:lvlText w:val=""/>
       <w:lvlJc w:val="left"/>
     </w:lvl>
-    <w:lvl w:ilvl="3" w:tplc="B1A0E7B4">
+    <w:lvl w:ilvl="3" w:tplc="417CC822">
       <w:numFmt w:val="decimal"/>
       <w:lvlText w:val=""/>
       <w:lvlJc w:val="left"/>
     </w:lvl>
-    <w:lvl w:ilvl="4" w:tplc="9C620C80">
+    <w:lvl w:ilvl="4" w:tplc="51361076">
       <w:numFmt w:val="decimal"/>
       <w:lvlText w:val=""/>
       <w:lvlJc w:val="left"/>
     </w:lvl>
-    <w:lvl w:ilvl="5" w:tplc="ECEE0998">
+    <w:lvl w:ilvl="5" w:tplc="053E9564">
       <w:numFmt w:val="decimal"/>
       <w:lvlText w:val=""/>
       <w:lvlJc w:val="left"/>
     </w:lvl>
-    <w:lvl w:ilvl="6" w:tplc="67BCF61E">
+    <w:lvl w:ilvl="6" w:tplc="C576E08A">
       <w:numFmt w:val="decimal"/>
       <w:lvlText w:val=""/>
       <w:lvlJc w:val="left"/>
     </w:lvl>
-    <w:lvl w:ilvl="7" w:tplc="6BA03DC2">
+    <w:lvl w:ilvl="7" w:tplc="B1C2D68C">
       <w:numFmt w:val="decimal"/>
       <w:lvlText w:val=""/>
       <w:lvlJc w:val="left"/>
     </w:lvl>
-    <w:lvl w:ilvl="8" w:tplc="B4BC3F26">
+    <w:lvl w:ilvl="8" w:tplc="3F66A936">
       <w:numFmt w:val="decimal"/>
       <w:lvlText w:val=""/>
       <w:lvlJc w:val="left"/>
     </w:lvl>
   </w:abstractNum>
-  <w:num w:numId="1" w16cid:durableId="1931621079">
+  <w:num w:numId="1" w16cid:durableId="500858169">
+    <w:abstractNumId w:val="3"/>
+    <w:lvlOverride w:ilvl="0">
+      <w:startOverride w:val="1"/>
+    </w:lvlOverride>
+  </w:num>
+  <w:num w:numId="2" w16cid:durableId="1032614387">
+    <w:abstractNumId w:val="0"/>
+    <w:lvlOverride w:ilvl="0">
+      <w:startOverride w:val="1"/>
+    </w:lvlOverride>
+  </w:num>
+  <w:num w:numId="3" w16cid:durableId="1637056292">
+    <w:abstractNumId w:val="1"/>
+    <w:lvlOverride w:ilvl="0">
+      <w:startOverride w:val="1"/>
+    </w:lvlOverride>
+  </w:num>
+  <w:num w:numId="4" w16cid:durableId="229850097">
     <w:abstractNumId w:val="2"/>
     <w:lvlOverride w:ilvl="0">
       <w:startOverride w:val="1"/>
     </w:lvlOverride>
   </w:num>
-  <w:num w:numId="2" w16cid:durableId="1746419459">
-    <w:abstractNumId w:val="1"/>
-    <w:lvlOverride w:ilvl="0">
-      <w:startOverride w:val="1"/>
-    </w:lvlOverride>
-  </w:num>
-  <w:num w:numId="3" w16cid:durableId="560797426">
+  <w:num w:numId="5" w16cid:durableId="1492210310">
     <w:abstractNumId w:val="4"/>
-    <w:lvlOverride w:ilvl="0">
-      <w:startOverride w:val="1"/>
-    </w:lvlOverride>
-  </w:num>
-  <w:num w:numId="4" w16cid:durableId="1869678412">
-    <w:abstractNumId w:val="3"/>
-    <w:lvlOverride w:ilvl="0">
-      <w:startOverride w:val="1"/>
-    </w:lvlOverride>
-  </w:num>
-  <w:num w:numId="5" w16cid:durableId="1032653813">
-    <w:abstractNumId w:val="0"/>
     <w:lvlOverride w:ilvl="0">
       <w:startOverride w:val="1"/>
     </w:lvlOverride>
@@ -22450,7 +22471,7 @@
     <w:autoRedefine/>
     <w:uiPriority w:val="39"/>
     <w:unhideWhenUsed/>
-    <w:rsid w:val="00611F61"/>
+    <w:rsid w:val="00A82A97"/>
     <w:pPr>
       <w:spacing w:after="100"/>
     </w:pPr>
@@ -22462,7 +22483,7 @@
     <w:autoRedefine/>
     <w:uiPriority w:val="39"/>
     <w:unhideWhenUsed/>
-    <w:rsid w:val="00611F61"/>
+    <w:rsid w:val="00A82A97"/>
     <w:pPr>
       <w:spacing w:after="100"/>
       <w:ind w:left="210"/>

</xml_diff>

<commit_message>
Show both final tests on one slide and drop the bootstrap sentence from the talk
</commit_message>
<xml_diff>
--- a/docs/oral_study_guide.docx
+++ b/docs/oral_study_guide.docx
@@ -93,7 +93,7 @@
     <w:sdt>
       <w:sdtPr>
         <w:alias w:val="Contents"/>
-        <w:id w:val="479819400"/>
+        <w:id w:val="1342278016"/>
       </w:sdtPr>
       <w:sdtEndPr/>
       <w:sdtContent>
@@ -116,7 +116,7 @@
           <w:r>
             <w:fldChar w:fldCharType="separate"/>
           </w:r>
-          <w:hyperlink w:anchor="_Toc243492068" w:history="1">
+          <w:hyperlink w:anchor="_Toc243495617" w:history="1">
             <w:r>
               <w:rPr>
                 <w:rStyle w:val="Lienhypertexte"/>
@@ -140,7 +140,7 @@
               <w:rPr>
                 <w:noProof/>
               </w:rPr>
-              <w:instrText xml:space="preserve"> PAGEREF _Toc243492068 \h </w:instrText>
+              <w:instrText xml:space="preserve"> PAGEREF _Toc243495617 \h </w:instrText>
             </w:r>
             <w:r>
               <w:rPr>
@@ -177,7 +177,7 @@
               <w:noProof/>
             </w:rPr>
           </w:pPr>
-          <w:hyperlink w:anchor="_Toc243492069" w:history="1">
+          <w:hyperlink w:anchor="_Toc243495618" w:history="1">
             <w:r>
               <w:rPr>
                 <w:rStyle w:val="Lienhypertexte"/>
@@ -201,7 +201,7 @@
               <w:rPr>
                 <w:noProof/>
               </w:rPr>
-              <w:instrText xml:space="preserve"> PAGEREF _Toc243492069 \h </w:instrText>
+              <w:instrText xml:space="preserve"> PAGEREF _Toc243495618 \h </w:instrText>
             </w:r>
             <w:r>
               <w:rPr>
@@ -238,7 +238,7 @@
               <w:noProof/>
             </w:rPr>
           </w:pPr>
-          <w:hyperlink w:anchor="_Toc243492070" w:history="1">
+          <w:hyperlink w:anchor="_Toc243495619" w:history="1">
             <w:r>
               <w:rPr>
                 <w:rStyle w:val="Lienhypertexte"/>
@@ -262,7 +262,7 @@
               <w:rPr>
                 <w:noProof/>
               </w:rPr>
-              <w:instrText xml:space="preserve"> PAGEREF _Toc243492070 \h </w:instrText>
+              <w:instrText xml:space="preserve"> PAGEREF _Toc243495619 \h </w:instrText>
             </w:r>
             <w:r>
               <w:rPr>
@@ -299,7 +299,7 @@
               <w:noProof/>
             </w:rPr>
           </w:pPr>
-          <w:hyperlink w:anchor="_Toc243492071" w:history="1">
+          <w:hyperlink w:anchor="_Toc243495620" w:history="1">
             <w:r>
               <w:rPr>
                 <w:rStyle w:val="Lienhypertexte"/>
@@ -323,7 +323,7 @@
               <w:rPr>
                 <w:noProof/>
               </w:rPr>
-              <w:instrText xml:space="preserve"> PAGEREF _Toc243492071 \h </w:instrText>
+              <w:instrText xml:space="preserve"> PAGEREF _Toc243495620 \h </w:instrText>
             </w:r>
             <w:r>
               <w:rPr>
@@ -360,7 +360,7 @@
               <w:noProof/>
             </w:rPr>
           </w:pPr>
-          <w:hyperlink w:anchor="_Toc243492072" w:history="1">
+          <w:hyperlink w:anchor="_Toc243495621" w:history="1">
             <w:r>
               <w:rPr>
                 <w:rStyle w:val="Lienhypertexte"/>
@@ -384,7 +384,7 @@
               <w:rPr>
                 <w:noProof/>
               </w:rPr>
-              <w:instrText xml:space="preserve"> PAGEREF _Toc243492072 \h </w:instrText>
+              <w:instrText xml:space="preserve"> PAGEREF _Toc243495621 \h </w:instrText>
             </w:r>
             <w:r>
               <w:rPr>
@@ -421,7 +421,7 @@
               <w:noProof/>
             </w:rPr>
           </w:pPr>
-          <w:hyperlink w:anchor="_Toc243492073" w:history="1">
+          <w:hyperlink w:anchor="_Toc243495622" w:history="1">
             <w:r>
               <w:rPr>
                 <w:rStyle w:val="Lienhypertexte"/>
@@ -445,7 +445,7 @@
               <w:rPr>
                 <w:noProof/>
               </w:rPr>
-              <w:instrText xml:space="preserve"> PAGEREF _Toc243492073 \h </w:instrText>
+              <w:instrText xml:space="preserve"> PAGEREF _Toc243495622 \h </w:instrText>
             </w:r>
             <w:r>
               <w:rPr>
@@ -482,7 +482,7 @@
               <w:noProof/>
             </w:rPr>
           </w:pPr>
-          <w:hyperlink w:anchor="_Toc243492074" w:history="1">
+          <w:hyperlink w:anchor="_Toc243495623" w:history="1">
             <w:r>
               <w:rPr>
                 <w:rStyle w:val="Lienhypertexte"/>
@@ -506,7 +506,7 @@
               <w:rPr>
                 <w:noProof/>
               </w:rPr>
-              <w:instrText xml:space="preserve"> PAGEREF _Toc243492074 \h </w:instrText>
+              <w:instrText xml:space="preserve"> PAGEREF _Toc243495623 \h </w:instrText>
             </w:r>
             <w:r>
               <w:rPr>
@@ -543,7 +543,7 @@
               <w:noProof/>
             </w:rPr>
           </w:pPr>
-          <w:hyperlink w:anchor="_Toc243492075" w:history="1">
+          <w:hyperlink w:anchor="_Toc243495624" w:history="1">
             <w:r>
               <w:rPr>
                 <w:rStyle w:val="Lienhypertexte"/>
@@ -567,7 +567,7 @@
               <w:rPr>
                 <w:noProof/>
               </w:rPr>
-              <w:instrText xml:space="preserve"> PAGEREF _Toc243492075 \h </w:instrText>
+              <w:instrText xml:space="preserve"> PAGEREF _Toc243495624 \h </w:instrText>
             </w:r>
             <w:r>
               <w:rPr>
@@ -604,7 +604,7 @@
               <w:noProof/>
             </w:rPr>
           </w:pPr>
-          <w:hyperlink w:anchor="_Toc243492076" w:history="1">
+          <w:hyperlink w:anchor="_Toc243495625" w:history="1">
             <w:r>
               <w:rPr>
                 <w:rStyle w:val="Lienhypertexte"/>
@@ -628,7 +628,7 @@
               <w:rPr>
                 <w:noProof/>
               </w:rPr>
-              <w:instrText xml:space="preserve"> PAGEREF _Toc243492076 \h </w:instrText>
+              <w:instrText xml:space="preserve"> PAGEREF _Toc243495625 \h </w:instrText>
             </w:r>
             <w:r>
               <w:rPr>
@@ -665,7 +665,7 @@
               <w:noProof/>
             </w:rPr>
           </w:pPr>
-          <w:hyperlink w:anchor="_Toc243492077" w:history="1">
+          <w:hyperlink w:anchor="_Toc243495626" w:history="1">
             <w:r>
               <w:rPr>
                 <w:rStyle w:val="Lienhypertexte"/>
@@ -689,7 +689,7 @@
               <w:rPr>
                 <w:noProof/>
               </w:rPr>
-              <w:instrText xml:space="preserve"> PAGEREF _Toc243492077 \h </w:instrText>
+              <w:instrText xml:space="preserve"> PAGEREF _Toc243495626 \h </w:instrText>
             </w:r>
             <w:r>
               <w:rPr>
@@ -726,7 +726,7 @@
               <w:noProof/>
             </w:rPr>
           </w:pPr>
-          <w:hyperlink w:anchor="_Toc243492078" w:history="1">
+          <w:hyperlink w:anchor="_Toc243495627" w:history="1">
             <w:r>
               <w:rPr>
                 <w:rStyle w:val="Lienhypertexte"/>
@@ -750,7 +750,7 @@
               <w:rPr>
                 <w:noProof/>
               </w:rPr>
-              <w:instrText xml:space="preserve"> PAGEREF _Toc243492078 \h </w:instrText>
+              <w:instrText xml:space="preserve"> PAGEREF _Toc243495627 \h </w:instrText>
             </w:r>
             <w:r>
               <w:rPr>
@@ -787,7 +787,7 @@
               <w:noProof/>
             </w:rPr>
           </w:pPr>
-          <w:hyperlink w:anchor="_Toc243492079" w:history="1">
+          <w:hyperlink w:anchor="_Toc243495628" w:history="1">
             <w:r>
               <w:rPr>
                 <w:rStyle w:val="Lienhypertexte"/>
@@ -811,7 +811,7 @@
               <w:rPr>
                 <w:noProof/>
               </w:rPr>
-              <w:instrText xml:space="preserve"> PAGEREF _Toc243492079 \h </w:instrText>
+              <w:instrText xml:space="preserve"> PAGEREF _Toc243495628 \h </w:instrText>
             </w:r>
             <w:r>
               <w:rPr>
@@ -848,7 +848,7 @@
               <w:noProof/>
             </w:rPr>
           </w:pPr>
-          <w:hyperlink w:anchor="_Toc243492080" w:history="1">
+          <w:hyperlink w:anchor="_Toc243495629" w:history="1">
             <w:r>
               <w:rPr>
                 <w:rStyle w:val="Lienhypertexte"/>
@@ -872,7 +872,7 @@
               <w:rPr>
                 <w:noProof/>
               </w:rPr>
-              <w:instrText xml:space="preserve"> PAGEREF _Toc243492080 \h </w:instrText>
+              <w:instrText xml:space="preserve"> PAGEREF _Toc243495629 \h </w:instrText>
             </w:r>
             <w:r>
               <w:rPr>
@@ -909,7 +909,7 @@
               <w:noProof/>
             </w:rPr>
           </w:pPr>
-          <w:hyperlink w:anchor="_Toc243492081" w:history="1">
+          <w:hyperlink w:anchor="_Toc243495630" w:history="1">
             <w:r>
               <w:rPr>
                 <w:rStyle w:val="Lienhypertexte"/>
@@ -933,7 +933,7 @@
               <w:rPr>
                 <w:noProof/>
               </w:rPr>
-              <w:instrText xml:space="preserve"> PAGEREF _Toc243492081 \h </w:instrText>
+              <w:instrText xml:space="preserve"> PAGEREF _Toc243495630 \h </w:instrText>
             </w:r>
             <w:r>
               <w:rPr>
@@ -970,7 +970,7 @@
               <w:noProof/>
             </w:rPr>
           </w:pPr>
-          <w:hyperlink w:anchor="_Toc243492082" w:history="1">
+          <w:hyperlink w:anchor="_Toc243495631" w:history="1">
             <w:r>
               <w:rPr>
                 <w:rStyle w:val="Lienhypertexte"/>
@@ -994,7 +994,7 @@
               <w:rPr>
                 <w:noProof/>
               </w:rPr>
-              <w:instrText xml:space="preserve"> PAGEREF _Toc243492082 \h </w:instrText>
+              <w:instrText xml:space="preserve"> PAGEREF _Toc243495631 \h </w:instrText>
             </w:r>
             <w:r>
               <w:rPr>
@@ -1031,7 +1031,7 @@
               <w:noProof/>
             </w:rPr>
           </w:pPr>
-          <w:hyperlink w:anchor="_Toc243492083" w:history="1">
+          <w:hyperlink w:anchor="_Toc243495632" w:history="1">
             <w:r>
               <w:rPr>
                 <w:rStyle w:val="Lienhypertexte"/>
@@ -1055,7 +1055,7 @@
               <w:rPr>
                 <w:noProof/>
               </w:rPr>
-              <w:instrText xml:space="preserve"> PAGEREF _Toc243492083 \h </w:instrText>
+              <w:instrText xml:space="preserve"> PAGEREF _Toc243495632 \h </w:instrText>
             </w:r>
             <w:r>
               <w:rPr>
@@ -1092,7 +1092,7 @@
               <w:noProof/>
             </w:rPr>
           </w:pPr>
-          <w:hyperlink w:anchor="_Toc243492084" w:history="1">
+          <w:hyperlink w:anchor="_Toc243495633" w:history="1">
             <w:r>
               <w:rPr>
                 <w:rStyle w:val="Lienhypertexte"/>
@@ -1116,7 +1116,7 @@
               <w:rPr>
                 <w:noProof/>
               </w:rPr>
-              <w:instrText xml:space="preserve"> PAGEREF _Toc243492084 \h </w:instrText>
+              <w:instrText xml:space="preserve"> PAGEREF _Toc243495633 \h </w:instrText>
             </w:r>
             <w:r>
               <w:rPr>
@@ -1153,7 +1153,7 @@
               <w:noProof/>
             </w:rPr>
           </w:pPr>
-          <w:hyperlink w:anchor="_Toc243492085" w:history="1">
+          <w:hyperlink w:anchor="_Toc243495634" w:history="1">
             <w:r>
               <w:rPr>
                 <w:rStyle w:val="Lienhypertexte"/>
@@ -1177,7 +1177,7 @@
               <w:rPr>
                 <w:noProof/>
               </w:rPr>
-              <w:instrText xml:space="preserve"> PAGEREF _Toc243492085 \h </w:instrText>
+              <w:instrText xml:space="preserve"> PAGEREF _Toc243495634 \h </w:instrText>
             </w:r>
             <w:r>
               <w:rPr>
@@ -1214,7 +1214,7 @@
               <w:noProof/>
             </w:rPr>
           </w:pPr>
-          <w:hyperlink w:anchor="_Toc243492086" w:history="1">
+          <w:hyperlink w:anchor="_Toc243495635" w:history="1">
             <w:r>
               <w:rPr>
                 <w:rStyle w:val="Lienhypertexte"/>
@@ -1238,7 +1238,7 @@
               <w:rPr>
                 <w:noProof/>
               </w:rPr>
-              <w:instrText xml:space="preserve"> PAGEREF _Toc243492086 \h </w:instrText>
+              <w:instrText xml:space="preserve"> PAGEREF _Toc243495635 \h </w:instrText>
             </w:r>
             <w:r>
               <w:rPr>
@@ -1275,7 +1275,7 @@
               <w:noProof/>
             </w:rPr>
           </w:pPr>
-          <w:hyperlink w:anchor="_Toc243492087" w:history="1">
+          <w:hyperlink w:anchor="_Toc243495636" w:history="1">
             <w:r>
               <w:rPr>
                 <w:rStyle w:val="Lienhypertexte"/>
@@ -1299,7 +1299,7 @@
               <w:rPr>
                 <w:noProof/>
               </w:rPr>
-              <w:instrText xml:space="preserve"> PAGEREF _Toc243492087 \h </w:instrText>
+              <w:instrText xml:space="preserve"> PAGEREF _Toc243495636 \h </w:instrText>
             </w:r>
             <w:r>
               <w:rPr>
@@ -1336,7 +1336,7 @@
               <w:noProof/>
             </w:rPr>
           </w:pPr>
-          <w:hyperlink w:anchor="_Toc243492088" w:history="1">
+          <w:hyperlink w:anchor="_Toc243495637" w:history="1">
             <w:r>
               <w:rPr>
                 <w:rStyle w:val="Lienhypertexte"/>
@@ -1360,7 +1360,7 @@
               <w:rPr>
                 <w:noProof/>
               </w:rPr>
-              <w:instrText xml:space="preserve"> PAGEREF _Toc243492088 \h </w:instrText>
+              <w:instrText xml:space="preserve"> PAGEREF _Toc243495637 \h </w:instrText>
             </w:r>
             <w:r>
               <w:rPr>
@@ -1397,7 +1397,7 @@
               <w:noProof/>
             </w:rPr>
           </w:pPr>
-          <w:hyperlink w:anchor="_Toc243492089" w:history="1">
+          <w:hyperlink w:anchor="_Toc243495638" w:history="1">
             <w:r>
               <w:rPr>
                 <w:rStyle w:val="Lienhypertexte"/>
@@ -1421,7 +1421,7 @@
               <w:rPr>
                 <w:noProof/>
               </w:rPr>
-              <w:instrText xml:space="preserve"> PAGEREF _Toc243492089 \h </w:instrText>
+              <w:instrText xml:space="preserve"> PAGEREF _Toc243495638 \h </w:instrText>
             </w:r>
             <w:r>
               <w:rPr>
@@ -1458,7 +1458,7 @@
               <w:noProof/>
             </w:rPr>
           </w:pPr>
-          <w:hyperlink w:anchor="_Toc243492090" w:history="1">
+          <w:hyperlink w:anchor="_Toc243495639" w:history="1">
             <w:r>
               <w:rPr>
                 <w:rStyle w:val="Lienhypertexte"/>
@@ -1482,7 +1482,7 @@
               <w:rPr>
                 <w:noProof/>
               </w:rPr>
-              <w:instrText xml:space="preserve"> PAGEREF _Toc243492090 \h </w:instrText>
+              <w:instrText xml:space="preserve"> PAGEREF _Toc243495639 \h </w:instrText>
             </w:r>
             <w:r>
               <w:rPr>
@@ -1519,7 +1519,7 @@
               <w:noProof/>
             </w:rPr>
           </w:pPr>
-          <w:hyperlink w:anchor="_Toc243492091" w:history="1">
+          <w:hyperlink w:anchor="_Toc243495640" w:history="1">
             <w:r>
               <w:rPr>
                 <w:rStyle w:val="Lienhypertexte"/>
@@ -1543,7 +1543,7 @@
               <w:rPr>
                 <w:noProof/>
               </w:rPr>
-              <w:instrText xml:space="preserve"> PAGEREF _Toc243492091 \h </w:instrText>
+              <w:instrText xml:space="preserve"> PAGEREF _Toc243495640 \h </w:instrText>
             </w:r>
             <w:r>
               <w:rPr>
@@ -1580,7 +1580,7 @@
               <w:noProof/>
             </w:rPr>
           </w:pPr>
-          <w:hyperlink w:anchor="_Toc243492092" w:history="1">
+          <w:hyperlink w:anchor="_Toc243495641" w:history="1">
             <w:r>
               <w:rPr>
                 <w:rStyle w:val="Lienhypertexte"/>
@@ -1604,7 +1604,7 @@
               <w:rPr>
                 <w:noProof/>
               </w:rPr>
-              <w:instrText xml:space="preserve"> PAGEREF _Toc243492092 \h </w:instrText>
+              <w:instrText xml:space="preserve"> PAGEREF _Toc243495641 \h </w:instrText>
             </w:r>
             <w:r>
               <w:rPr>
@@ -1641,7 +1641,7 @@
               <w:noProof/>
             </w:rPr>
           </w:pPr>
-          <w:hyperlink w:anchor="_Toc243492093" w:history="1">
+          <w:hyperlink w:anchor="_Toc243495642" w:history="1">
             <w:r>
               <w:rPr>
                 <w:rStyle w:val="Lienhypertexte"/>
@@ -1665,7 +1665,7 @@
               <w:rPr>
                 <w:noProof/>
               </w:rPr>
-              <w:instrText xml:space="preserve"> PAGEREF _Toc243492093 \h </w:instrText>
+              <w:instrText xml:space="preserve"> PAGEREF _Toc243495642 \h </w:instrText>
             </w:r>
             <w:r>
               <w:rPr>
@@ -1702,7 +1702,7 @@
               <w:noProof/>
             </w:rPr>
           </w:pPr>
-          <w:hyperlink w:anchor="_Toc243492094" w:history="1">
+          <w:hyperlink w:anchor="_Toc243495643" w:history="1">
             <w:r>
               <w:rPr>
                 <w:rStyle w:val="Lienhypertexte"/>
@@ -1726,7 +1726,7 @@
               <w:rPr>
                 <w:noProof/>
               </w:rPr>
-              <w:instrText xml:space="preserve"> PAGEREF _Toc243492094 \h </w:instrText>
+              <w:instrText xml:space="preserve"> PAGEREF _Toc243495643 \h </w:instrText>
             </w:r>
             <w:r>
               <w:rPr>
@@ -1763,7 +1763,7 @@
               <w:noProof/>
             </w:rPr>
           </w:pPr>
-          <w:hyperlink w:anchor="_Toc243492095" w:history="1">
+          <w:hyperlink w:anchor="_Toc243495644" w:history="1">
             <w:r>
               <w:rPr>
                 <w:rStyle w:val="Lienhypertexte"/>
@@ -1787,7 +1787,7 @@
               <w:rPr>
                 <w:noProof/>
               </w:rPr>
-              <w:instrText xml:space="preserve"> PAGEREF _Toc243492095 \h </w:instrText>
+              <w:instrText xml:space="preserve"> PAGEREF _Toc243495644 \h </w:instrText>
             </w:r>
             <w:r>
               <w:rPr>
@@ -1824,7 +1824,7 @@
               <w:noProof/>
             </w:rPr>
           </w:pPr>
-          <w:hyperlink w:anchor="_Toc243492096" w:history="1">
+          <w:hyperlink w:anchor="_Toc243495645" w:history="1">
             <w:r>
               <w:rPr>
                 <w:rStyle w:val="Lienhypertexte"/>
@@ -1848,7 +1848,7 @@
               <w:rPr>
                 <w:noProof/>
               </w:rPr>
-              <w:instrText xml:space="preserve"> PAGEREF _Toc243492096 \h </w:instrText>
+              <w:instrText xml:space="preserve"> PAGEREF _Toc243495645 \h </w:instrText>
             </w:r>
             <w:r>
               <w:rPr>
@@ -1885,7 +1885,7 @@
               <w:noProof/>
             </w:rPr>
           </w:pPr>
-          <w:hyperlink w:anchor="_Toc243492097" w:history="1">
+          <w:hyperlink w:anchor="_Toc243495646" w:history="1">
             <w:r>
               <w:rPr>
                 <w:rStyle w:val="Lienhypertexte"/>
@@ -1909,7 +1909,7 @@
               <w:rPr>
                 <w:noProof/>
               </w:rPr>
-              <w:instrText xml:space="preserve"> PAGEREF _Toc243492097 \h </w:instrText>
+              <w:instrText xml:space="preserve"> PAGEREF _Toc243495646 \h </w:instrText>
             </w:r>
             <w:r>
               <w:rPr>
@@ -1946,7 +1946,7 @@
               <w:noProof/>
             </w:rPr>
           </w:pPr>
-          <w:hyperlink w:anchor="_Toc243492098" w:history="1">
+          <w:hyperlink w:anchor="_Toc243495647" w:history="1">
             <w:r>
               <w:rPr>
                 <w:rStyle w:val="Lienhypertexte"/>
@@ -1970,7 +1970,7 @@
               <w:rPr>
                 <w:noProof/>
               </w:rPr>
-              <w:instrText xml:space="preserve"> PAGEREF _Toc243492098 \h </w:instrText>
+              <w:instrText xml:space="preserve"> PAGEREF _Toc243495647 \h </w:instrText>
             </w:r>
             <w:r>
               <w:rPr>
@@ -2007,7 +2007,7 @@
               <w:noProof/>
             </w:rPr>
           </w:pPr>
-          <w:hyperlink w:anchor="_Toc243492099" w:history="1">
+          <w:hyperlink w:anchor="_Toc243495648" w:history="1">
             <w:r>
               <w:rPr>
                 <w:rStyle w:val="Lienhypertexte"/>
@@ -2031,7 +2031,7 @@
               <w:rPr>
                 <w:noProof/>
               </w:rPr>
-              <w:instrText xml:space="preserve"> PAGEREF _Toc243492099 \h </w:instrText>
+              <w:instrText xml:space="preserve"> PAGEREF _Toc243495648 \h </w:instrText>
             </w:r>
             <w:r>
               <w:rPr>
@@ -2068,7 +2068,7 @@
               <w:noProof/>
             </w:rPr>
           </w:pPr>
-          <w:hyperlink w:anchor="_Toc243492100" w:history="1">
+          <w:hyperlink w:anchor="_Toc243495649" w:history="1">
             <w:r>
               <w:rPr>
                 <w:rStyle w:val="Lienhypertexte"/>
@@ -2092,7 +2092,7 @@
               <w:rPr>
                 <w:noProof/>
               </w:rPr>
-              <w:instrText xml:space="preserve"> PAGEREF _Toc243492100 \h </w:instrText>
+              <w:instrText xml:space="preserve"> PAGEREF _Toc243495649 \h </w:instrText>
             </w:r>
             <w:r>
               <w:rPr>
@@ -2129,7 +2129,7 @@
               <w:noProof/>
             </w:rPr>
           </w:pPr>
-          <w:hyperlink w:anchor="_Toc243492101" w:history="1">
+          <w:hyperlink w:anchor="_Toc243495650" w:history="1">
             <w:r>
               <w:rPr>
                 <w:rStyle w:val="Lienhypertexte"/>
@@ -2153,7 +2153,7 @@
               <w:rPr>
                 <w:noProof/>
               </w:rPr>
-              <w:instrText xml:space="preserve"> PAGEREF _Toc243492101 \h </w:instrText>
+              <w:instrText xml:space="preserve"> PAGEREF _Toc243495650 \h </w:instrText>
             </w:r>
             <w:r>
               <w:rPr>
@@ -2190,7 +2190,7 @@
               <w:noProof/>
             </w:rPr>
           </w:pPr>
-          <w:hyperlink w:anchor="_Toc243492102" w:history="1">
+          <w:hyperlink w:anchor="_Toc243495651" w:history="1">
             <w:r>
               <w:rPr>
                 <w:rStyle w:val="Lienhypertexte"/>
@@ -2214,7 +2214,7 @@
               <w:rPr>
                 <w:noProof/>
               </w:rPr>
-              <w:instrText xml:space="preserve"> PAGEREF _Toc243492102 \h </w:instrText>
+              <w:instrText xml:space="preserve"> PAGEREF _Toc243495651 \h </w:instrText>
             </w:r>
             <w:r>
               <w:rPr>
@@ -2251,7 +2251,7 @@
               <w:noProof/>
             </w:rPr>
           </w:pPr>
-          <w:hyperlink w:anchor="_Toc243492103" w:history="1">
+          <w:hyperlink w:anchor="_Toc243495652" w:history="1">
             <w:r>
               <w:rPr>
                 <w:rStyle w:val="Lienhypertexte"/>
@@ -2275,7 +2275,7 @@
               <w:rPr>
                 <w:noProof/>
               </w:rPr>
-              <w:instrText xml:space="preserve"> PAGEREF _Toc243492103 \h </w:instrText>
+              <w:instrText xml:space="preserve"> PAGEREF _Toc243495652 \h </w:instrText>
             </w:r>
             <w:r>
               <w:rPr>
@@ -2312,7 +2312,7 @@
               <w:noProof/>
             </w:rPr>
           </w:pPr>
-          <w:hyperlink w:anchor="_Toc243492104" w:history="1">
+          <w:hyperlink w:anchor="_Toc243495653" w:history="1">
             <w:r>
               <w:rPr>
                 <w:rStyle w:val="Lienhypertexte"/>
@@ -2336,7 +2336,7 @@
               <w:rPr>
                 <w:noProof/>
               </w:rPr>
-              <w:instrText xml:space="preserve"> PAGEREF _Toc243492104 \h </w:instrText>
+              <w:instrText xml:space="preserve"> PAGEREF _Toc243495653 \h </w:instrText>
             </w:r>
             <w:r>
               <w:rPr>
@@ -2373,7 +2373,7 @@
               <w:noProof/>
             </w:rPr>
           </w:pPr>
-          <w:hyperlink w:anchor="_Toc243492105" w:history="1">
+          <w:hyperlink w:anchor="_Toc243495654" w:history="1">
             <w:r>
               <w:rPr>
                 <w:rStyle w:val="Lienhypertexte"/>
@@ -2397,7 +2397,7 @@
               <w:rPr>
                 <w:noProof/>
               </w:rPr>
-              <w:instrText xml:space="preserve"> PAGEREF _Toc243492105 \h </w:instrText>
+              <w:instrText xml:space="preserve"> PAGEREF _Toc243495654 \h </w:instrText>
             </w:r>
             <w:r>
               <w:rPr>
@@ -2434,7 +2434,7 @@
               <w:noProof/>
             </w:rPr>
           </w:pPr>
-          <w:hyperlink w:anchor="_Toc243492106" w:history="1">
+          <w:hyperlink w:anchor="_Toc243495655" w:history="1">
             <w:r>
               <w:rPr>
                 <w:rStyle w:val="Lienhypertexte"/>
@@ -2458,7 +2458,7 @@
               <w:rPr>
                 <w:noProof/>
               </w:rPr>
-              <w:instrText xml:space="preserve"> PAGEREF _Toc243492106 \h </w:instrText>
+              <w:instrText xml:space="preserve"> PAGEREF _Toc243495655 \h </w:instrText>
             </w:r>
             <w:r>
               <w:rPr>
@@ -2495,7 +2495,7 @@
               <w:noProof/>
             </w:rPr>
           </w:pPr>
-          <w:hyperlink w:anchor="_Toc243492107" w:history="1">
+          <w:hyperlink w:anchor="_Toc243495656" w:history="1">
             <w:r>
               <w:rPr>
                 <w:rStyle w:val="Lienhypertexte"/>
@@ -2519,7 +2519,7 @@
               <w:rPr>
                 <w:noProof/>
               </w:rPr>
-              <w:instrText xml:space="preserve"> PAGEREF _Toc243492107 \h </w:instrText>
+              <w:instrText xml:space="preserve"> PAGEREF _Toc243495656 \h </w:instrText>
             </w:r>
             <w:r>
               <w:rPr>
@@ -2556,7 +2556,7 @@
               <w:noProof/>
             </w:rPr>
           </w:pPr>
-          <w:hyperlink w:anchor="_Toc243492108" w:history="1">
+          <w:hyperlink w:anchor="_Toc243495657" w:history="1">
             <w:r>
               <w:rPr>
                 <w:rStyle w:val="Lienhypertexte"/>
@@ -2580,7 +2580,7 @@
               <w:rPr>
                 <w:noProof/>
               </w:rPr>
-              <w:instrText xml:space="preserve"> PAGEREF _Toc243492108 \h </w:instrText>
+              <w:instrText xml:space="preserve"> PAGEREF _Toc243495657 \h </w:instrText>
             </w:r>
             <w:r>
               <w:rPr>
@@ -2617,7 +2617,7 @@
               <w:noProof/>
             </w:rPr>
           </w:pPr>
-          <w:hyperlink w:anchor="_Toc243492109" w:history="1">
+          <w:hyperlink w:anchor="_Toc243495658" w:history="1">
             <w:r>
               <w:rPr>
                 <w:rStyle w:val="Lienhypertexte"/>
@@ -2641,7 +2641,7 @@
               <w:rPr>
                 <w:noProof/>
               </w:rPr>
-              <w:instrText xml:space="preserve"> PAGEREF _Toc243492109 \h </w:instrText>
+              <w:instrText xml:space="preserve"> PAGEREF _Toc243495658 \h </w:instrText>
             </w:r>
             <w:r>
               <w:rPr>
@@ -2678,7 +2678,7 @@
               <w:noProof/>
             </w:rPr>
           </w:pPr>
-          <w:hyperlink w:anchor="_Toc243492110" w:history="1">
+          <w:hyperlink w:anchor="_Toc243495659" w:history="1">
             <w:r>
               <w:rPr>
                 <w:rStyle w:val="Lienhypertexte"/>
@@ -2702,7 +2702,7 @@
               <w:rPr>
                 <w:noProof/>
               </w:rPr>
-              <w:instrText xml:space="preserve"> PAGEREF _Toc243492110 \h </w:instrText>
+              <w:instrText xml:space="preserve"> PAGEREF _Toc243495659 \h </w:instrText>
             </w:r>
             <w:r>
               <w:rPr>
@@ -2739,7 +2739,7 @@
               <w:noProof/>
             </w:rPr>
           </w:pPr>
-          <w:hyperlink w:anchor="_Toc243492111" w:history="1">
+          <w:hyperlink w:anchor="_Toc243495660" w:history="1">
             <w:r>
               <w:rPr>
                 <w:rStyle w:val="Lienhypertexte"/>
@@ -2763,7 +2763,7 @@
               <w:rPr>
                 <w:noProof/>
               </w:rPr>
-              <w:instrText xml:space="preserve"> PAGEREF _Toc243492111 \h </w:instrText>
+              <w:instrText xml:space="preserve"> PAGEREF _Toc243495660 \h </w:instrText>
             </w:r>
             <w:r>
               <w:rPr>
@@ -2800,7 +2800,7 @@
               <w:noProof/>
             </w:rPr>
           </w:pPr>
-          <w:hyperlink w:anchor="_Toc243492112" w:history="1">
+          <w:hyperlink w:anchor="_Toc243495661" w:history="1">
             <w:r>
               <w:rPr>
                 <w:rStyle w:val="Lienhypertexte"/>
@@ -2824,7 +2824,7 @@
               <w:rPr>
                 <w:noProof/>
               </w:rPr>
-              <w:instrText xml:space="preserve"> PAGEREF _Toc243492112 \h </w:instrText>
+              <w:instrText xml:space="preserve"> PAGEREF _Toc243495661 \h </w:instrText>
             </w:r>
             <w:r>
               <w:rPr>
@@ -2861,7 +2861,7 @@
               <w:noProof/>
             </w:rPr>
           </w:pPr>
-          <w:hyperlink w:anchor="_Toc243492113" w:history="1">
+          <w:hyperlink w:anchor="_Toc243495662" w:history="1">
             <w:r>
               <w:rPr>
                 <w:rStyle w:val="Lienhypertexte"/>
@@ -2885,7 +2885,7 @@
               <w:rPr>
                 <w:noProof/>
               </w:rPr>
-              <w:instrText xml:space="preserve"> PAGEREF _Toc243492113 \h </w:instrText>
+              <w:instrText xml:space="preserve"> PAGEREF _Toc243495662 \h </w:instrText>
             </w:r>
             <w:r>
               <w:rPr>
@@ -2922,7 +2922,7 @@
               <w:noProof/>
             </w:rPr>
           </w:pPr>
-          <w:hyperlink w:anchor="_Toc243492114" w:history="1">
+          <w:hyperlink w:anchor="_Toc243495663" w:history="1">
             <w:r>
               <w:rPr>
                 <w:rStyle w:val="Lienhypertexte"/>
@@ -2946,7 +2946,7 @@
               <w:rPr>
                 <w:noProof/>
               </w:rPr>
-              <w:instrText xml:space="preserve"> PAGEREF _Toc243492114 \h </w:instrText>
+              <w:instrText xml:space="preserve"> PAGEREF _Toc243495663 \h </w:instrText>
             </w:r>
             <w:r>
               <w:rPr>
@@ -2983,7 +2983,7 @@
               <w:noProof/>
             </w:rPr>
           </w:pPr>
-          <w:hyperlink w:anchor="_Toc243492115" w:history="1">
+          <w:hyperlink w:anchor="_Toc243495664" w:history="1">
             <w:r>
               <w:rPr>
                 <w:rStyle w:val="Lienhypertexte"/>
@@ -3007,7 +3007,7 @@
               <w:rPr>
                 <w:noProof/>
               </w:rPr>
-              <w:instrText xml:space="preserve"> PAGEREF _Toc243492115 \h </w:instrText>
+              <w:instrText xml:space="preserve"> PAGEREF _Toc243495664 \h </w:instrText>
             </w:r>
             <w:r>
               <w:rPr>
@@ -3044,7 +3044,7 @@
               <w:noProof/>
             </w:rPr>
           </w:pPr>
-          <w:hyperlink w:anchor="_Toc243492116" w:history="1">
+          <w:hyperlink w:anchor="_Toc243495665" w:history="1">
             <w:r>
               <w:rPr>
                 <w:rStyle w:val="Lienhypertexte"/>
@@ -3068,7 +3068,7 @@
               <w:rPr>
                 <w:noProof/>
               </w:rPr>
-              <w:instrText xml:space="preserve"> PAGEREF _Toc243492116 \h </w:instrText>
+              <w:instrText xml:space="preserve"> PAGEREF _Toc243495665 \h </w:instrText>
             </w:r>
             <w:r>
               <w:rPr>
@@ -3105,7 +3105,7 @@
               <w:noProof/>
             </w:rPr>
           </w:pPr>
-          <w:hyperlink w:anchor="_Toc243492117" w:history="1">
+          <w:hyperlink w:anchor="_Toc243495666" w:history="1">
             <w:r>
               <w:rPr>
                 <w:rStyle w:val="Lienhypertexte"/>
@@ -3129,7 +3129,7 @@
               <w:rPr>
                 <w:noProof/>
               </w:rPr>
-              <w:instrText xml:space="preserve"> PAGEREF _Toc243492117 \h </w:instrText>
+              <w:instrText xml:space="preserve"> PAGEREF _Toc243495666 \h </w:instrText>
             </w:r>
             <w:r>
               <w:rPr>
@@ -3166,7 +3166,7 @@
               <w:noProof/>
             </w:rPr>
           </w:pPr>
-          <w:hyperlink w:anchor="_Toc243492118" w:history="1">
+          <w:hyperlink w:anchor="_Toc243495667" w:history="1">
             <w:r>
               <w:rPr>
                 <w:rStyle w:val="Lienhypertexte"/>
@@ -3190,7 +3190,7 @@
               <w:rPr>
                 <w:noProof/>
               </w:rPr>
-              <w:instrText xml:space="preserve"> PAGEREF _Toc243492118 \h </w:instrText>
+              <w:instrText xml:space="preserve"> PAGEREF _Toc243495667 \h </w:instrText>
             </w:r>
             <w:r>
               <w:rPr>
@@ -3227,7 +3227,7 @@
               <w:noProof/>
             </w:rPr>
           </w:pPr>
-          <w:hyperlink w:anchor="_Toc243492119" w:history="1">
+          <w:hyperlink w:anchor="_Toc243495668" w:history="1">
             <w:r>
               <w:rPr>
                 <w:rStyle w:val="Lienhypertexte"/>
@@ -3251,7 +3251,7 @@
               <w:rPr>
                 <w:noProof/>
               </w:rPr>
-              <w:instrText xml:space="preserve"> PAGEREF _Toc243492119 \h </w:instrText>
+              <w:instrText xml:space="preserve"> PAGEREF _Toc243495668 \h </w:instrText>
             </w:r>
             <w:r>
               <w:rPr>
@@ -3288,7 +3288,7 @@
               <w:noProof/>
             </w:rPr>
           </w:pPr>
-          <w:hyperlink w:anchor="_Toc243492120" w:history="1">
+          <w:hyperlink w:anchor="_Toc243495669" w:history="1">
             <w:r>
               <w:rPr>
                 <w:rStyle w:val="Lienhypertexte"/>
@@ -3312,7 +3312,7 @@
               <w:rPr>
                 <w:noProof/>
               </w:rPr>
-              <w:instrText xml:space="preserve"> PAGEREF _Toc243492120 \h </w:instrText>
+              <w:instrText xml:space="preserve"> PAGEREF _Toc243495669 \h </w:instrText>
             </w:r>
             <w:r>
               <w:rPr>
@@ -3349,7 +3349,7 @@
               <w:noProof/>
             </w:rPr>
           </w:pPr>
-          <w:hyperlink w:anchor="_Toc243492121" w:history="1">
+          <w:hyperlink w:anchor="_Toc243495670" w:history="1">
             <w:r>
               <w:rPr>
                 <w:rStyle w:val="Lienhypertexte"/>
@@ -3373,7 +3373,7 @@
               <w:rPr>
                 <w:noProof/>
               </w:rPr>
-              <w:instrText xml:space="preserve"> PAGEREF _Toc243492121 \h </w:instrText>
+              <w:instrText xml:space="preserve"> PAGEREF _Toc243495670 \h </w:instrText>
             </w:r>
             <w:r>
               <w:rPr>
@@ -3410,7 +3410,7 @@
               <w:noProof/>
             </w:rPr>
           </w:pPr>
-          <w:hyperlink w:anchor="_Toc243492122" w:history="1">
+          <w:hyperlink w:anchor="_Toc243495671" w:history="1">
             <w:r>
               <w:rPr>
                 <w:rStyle w:val="Lienhypertexte"/>
@@ -3434,7 +3434,7 @@
               <w:rPr>
                 <w:noProof/>
               </w:rPr>
-              <w:instrText xml:space="preserve"> PAGEREF _Toc243492122 \h </w:instrText>
+              <w:instrText xml:space="preserve"> PAGEREF _Toc243495671 \h </w:instrText>
             </w:r>
             <w:r>
               <w:rPr>
@@ -3471,7 +3471,7 @@
               <w:noProof/>
             </w:rPr>
           </w:pPr>
-          <w:hyperlink w:anchor="_Toc243492123" w:history="1">
+          <w:hyperlink w:anchor="_Toc243495672" w:history="1">
             <w:r>
               <w:rPr>
                 <w:rStyle w:val="Lienhypertexte"/>
@@ -3495,7 +3495,7 @@
               <w:rPr>
                 <w:noProof/>
               </w:rPr>
-              <w:instrText xml:space="preserve"> PAGEREF _Toc243492123 \h </w:instrText>
+              <w:instrText xml:space="preserve"> PAGEREF _Toc243495672 \h </w:instrText>
             </w:r>
             <w:r>
               <w:rPr>
@@ -3532,7 +3532,7 @@
               <w:noProof/>
             </w:rPr>
           </w:pPr>
-          <w:hyperlink w:anchor="_Toc243492124" w:history="1">
+          <w:hyperlink w:anchor="_Toc243495673" w:history="1">
             <w:r>
               <w:rPr>
                 <w:rStyle w:val="Lienhypertexte"/>
@@ -3556,7 +3556,7 @@
               <w:rPr>
                 <w:noProof/>
               </w:rPr>
-              <w:instrText xml:space="preserve"> PAGEREF _Toc243492124 \h </w:instrText>
+              <w:instrText xml:space="preserve"> PAGEREF _Toc243495673 \h </w:instrText>
             </w:r>
             <w:r>
               <w:rPr>
@@ -3593,7 +3593,7 @@
               <w:noProof/>
             </w:rPr>
           </w:pPr>
-          <w:hyperlink w:anchor="_Toc243492125" w:history="1">
+          <w:hyperlink w:anchor="_Toc243495674" w:history="1">
             <w:r>
               <w:rPr>
                 <w:rStyle w:val="Lienhypertexte"/>
@@ -3617,7 +3617,7 @@
               <w:rPr>
                 <w:noProof/>
               </w:rPr>
-              <w:instrText xml:space="preserve"> PAGEREF _Toc243492125 \h </w:instrText>
+              <w:instrText xml:space="preserve"> PAGEREF _Toc243495674 \h </w:instrText>
             </w:r>
             <w:r>
               <w:rPr>
@@ -3654,7 +3654,7 @@
               <w:noProof/>
             </w:rPr>
           </w:pPr>
-          <w:hyperlink w:anchor="_Toc243492126" w:history="1">
+          <w:hyperlink w:anchor="_Toc243495675" w:history="1">
             <w:r>
               <w:rPr>
                 <w:rStyle w:val="Lienhypertexte"/>
@@ -3678,7 +3678,7 @@
               <w:rPr>
                 <w:noProof/>
               </w:rPr>
-              <w:instrText xml:space="preserve"> PAGEREF _Toc243492126 \h </w:instrText>
+              <w:instrText xml:space="preserve"> PAGEREF _Toc243495675 \h </w:instrText>
             </w:r>
             <w:r>
               <w:rPr>
@@ -3715,7 +3715,7 @@
               <w:noProof/>
             </w:rPr>
           </w:pPr>
-          <w:hyperlink w:anchor="_Toc243492127" w:history="1">
+          <w:hyperlink w:anchor="_Toc243495676" w:history="1">
             <w:r>
               <w:rPr>
                 <w:rStyle w:val="Lienhypertexte"/>
@@ -3739,7 +3739,7 @@
               <w:rPr>
                 <w:noProof/>
               </w:rPr>
-              <w:instrText xml:space="preserve"> PAGEREF _Toc243492127 \h </w:instrText>
+              <w:instrText xml:space="preserve"> PAGEREF _Toc243495676 \h </w:instrText>
             </w:r>
             <w:r>
               <w:rPr>
@@ -3776,7 +3776,7 @@
               <w:noProof/>
             </w:rPr>
           </w:pPr>
-          <w:hyperlink w:anchor="_Toc243492128" w:history="1">
+          <w:hyperlink w:anchor="_Toc243495677" w:history="1">
             <w:r>
               <w:rPr>
                 <w:rStyle w:val="Lienhypertexte"/>
@@ -3800,7 +3800,7 @@
               <w:rPr>
                 <w:noProof/>
               </w:rPr>
-              <w:instrText xml:space="preserve"> PAGEREF _Toc243492128 \h </w:instrText>
+              <w:instrText xml:space="preserve"> PAGEREF _Toc243495677 \h </w:instrText>
             </w:r>
             <w:r>
               <w:rPr>
@@ -3837,7 +3837,7 @@
               <w:noProof/>
             </w:rPr>
           </w:pPr>
-          <w:hyperlink w:anchor="_Toc243492129" w:history="1">
+          <w:hyperlink w:anchor="_Toc243495678" w:history="1">
             <w:r>
               <w:rPr>
                 <w:rStyle w:val="Lienhypertexte"/>
@@ -3861,7 +3861,7 @@
               <w:rPr>
                 <w:noProof/>
               </w:rPr>
-              <w:instrText xml:space="preserve"> PAGEREF _Toc243492129 \h </w:instrText>
+              <w:instrText xml:space="preserve"> PAGEREF _Toc243495678 \h </w:instrText>
             </w:r>
             <w:r>
               <w:rPr>
@@ -3898,7 +3898,7 @@
               <w:noProof/>
             </w:rPr>
           </w:pPr>
-          <w:hyperlink w:anchor="_Toc243492130" w:history="1">
+          <w:hyperlink w:anchor="_Toc243495679" w:history="1">
             <w:r>
               <w:rPr>
                 <w:rStyle w:val="Lienhypertexte"/>
@@ -3922,7 +3922,7 @@
               <w:rPr>
                 <w:noProof/>
               </w:rPr>
-              <w:instrText xml:space="preserve"> PAGEREF _Toc243492130 \h </w:instrText>
+              <w:instrText xml:space="preserve"> PAGEREF _Toc243495679 \h </w:instrText>
             </w:r>
             <w:r>
               <w:rPr>
@@ -3959,7 +3959,7 @@
               <w:noProof/>
             </w:rPr>
           </w:pPr>
-          <w:hyperlink w:anchor="_Toc243492131" w:history="1">
+          <w:hyperlink w:anchor="_Toc243495680" w:history="1">
             <w:r>
               <w:rPr>
                 <w:rStyle w:val="Lienhypertexte"/>
@@ -3983,7 +3983,7 @@
               <w:rPr>
                 <w:noProof/>
               </w:rPr>
-              <w:instrText xml:space="preserve"> PAGEREF _Toc243492131 \h </w:instrText>
+              <w:instrText xml:space="preserve"> PAGEREF _Toc243495680 \h </w:instrText>
             </w:r>
             <w:r>
               <w:rPr>
@@ -4020,7 +4020,7 @@
               <w:noProof/>
             </w:rPr>
           </w:pPr>
-          <w:hyperlink w:anchor="_Toc243492132" w:history="1">
+          <w:hyperlink w:anchor="_Toc243495681" w:history="1">
             <w:r>
               <w:rPr>
                 <w:rStyle w:val="Lienhypertexte"/>
@@ -4044,7 +4044,7 @@
               <w:rPr>
                 <w:noProof/>
               </w:rPr>
-              <w:instrText xml:space="preserve"> PAGEREF _Toc243492132 \h </w:instrText>
+              <w:instrText xml:space="preserve"> PAGEREF _Toc243495681 \h </w:instrText>
             </w:r>
             <w:r>
               <w:rPr>
@@ -4081,7 +4081,7 @@
               <w:noProof/>
             </w:rPr>
           </w:pPr>
-          <w:hyperlink w:anchor="_Toc243492133" w:history="1">
+          <w:hyperlink w:anchor="_Toc243495682" w:history="1">
             <w:r>
               <w:rPr>
                 <w:rStyle w:val="Lienhypertexte"/>
@@ -4105,7 +4105,7 @@
               <w:rPr>
                 <w:noProof/>
               </w:rPr>
-              <w:instrText xml:space="preserve"> PAGEREF _Toc243492133 \h </w:instrText>
+              <w:instrText xml:space="preserve"> PAGEREF _Toc243495682 \h </w:instrText>
             </w:r>
             <w:r>
               <w:rPr>
@@ -4142,7 +4142,7 @@
               <w:noProof/>
             </w:rPr>
           </w:pPr>
-          <w:hyperlink w:anchor="_Toc243492134" w:history="1">
+          <w:hyperlink w:anchor="_Toc243495683" w:history="1">
             <w:r>
               <w:rPr>
                 <w:rStyle w:val="Lienhypertexte"/>
@@ -4166,7 +4166,7 @@
               <w:rPr>
                 <w:noProof/>
               </w:rPr>
-              <w:instrText xml:space="preserve"> PAGEREF _Toc243492134 \h </w:instrText>
+              <w:instrText xml:space="preserve"> PAGEREF _Toc243495683 \h </w:instrText>
             </w:r>
             <w:r>
               <w:rPr>
@@ -4203,7 +4203,7 @@
               <w:noProof/>
             </w:rPr>
           </w:pPr>
-          <w:hyperlink w:anchor="_Toc243492135" w:history="1">
+          <w:hyperlink w:anchor="_Toc243495684" w:history="1">
             <w:r>
               <w:rPr>
                 <w:rStyle w:val="Lienhypertexte"/>
@@ -4227,7 +4227,7 @@
               <w:rPr>
                 <w:noProof/>
               </w:rPr>
-              <w:instrText xml:space="preserve"> PAGEREF _Toc243492135 \h </w:instrText>
+              <w:instrText xml:space="preserve"> PAGEREF _Toc243495684 \h </w:instrText>
             </w:r>
             <w:r>
               <w:rPr>
@@ -4264,7 +4264,7 @@
               <w:noProof/>
             </w:rPr>
           </w:pPr>
-          <w:hyperlink w:anchor="_Toc243492136" w:history="1">
+          <w:hyperlink w:anchor="_Toc243495685" w:history="1">
             <w:r>
               <w:rPr>
                 <w:rStyle w:val="Lienhypertexte"/>
@@ -4288,7 +4288,7 @@
               <w:rPr>
                 <w:noProof/>
               </w:rPr>
-              <w:instrText xml:space="preserve"> PAGEREF _Toc243492136 \h </w:instrText>
+              <w:instrText xml:space="preserve"> PAGEREF _Toc243495685 \h </w:instrText>
             </w:r>
             <w:r>
               <w:rPr>
@@ -4325,7 +4325,7 @@
               <w:noProof/>
             </w:rPr>
           </w:pPr>
-          <w:hyperlink w:anchor="_Toc243492137" w:history="1">
+          <w:hyperlink w:anchor="_Toc243495686" w:history="1">
             <w:r>
               <w:rPr>
                 <w:rStyle w:val="Lienhypertexte"/>
@@ -4349,7 +4349,7 @@
               <w:rPr>
                 <w:noProof/>
               </w:rPr>
-              <w:instrText xml:space="preserve"> PAGEREF _Toc243492137 \h </w:instrText>
+              <w:instrText xml:space="preserve"> PAGEREF _Toc243495686 \h </w:instrText>
             </w:r>
             <w:r>
               <w:rPr>
@@ -4386,7 +4386,7 @@
               <w:noProof/>
             </w:rPr>
           </w:pPr>
-          <w:hyperlink w:anchor="_Toc243492138" w:history="1">
+          <w:hyperlink w:anchor="_Toc243495687" w:history="1">
             <w:r>
               <w:rPr>
                 <w:rStyle w:val="Lienhypertexte"/>
@@ -4410,7 +4410,7 @@
               <w:rPr>
                 <w:noProof/>
               </w:rPr>
-              <w:instrText xml:space="preserve"> PAGEREF _Toc243492138 \h </w:instrText>
+              <w:instrText xml:space="preserve"> PAGEREF _Toc243495687 \h </w:instrText>
             </w:r>
             <w:r>
               <w:rPr>
@@ -4449,7 +4449,7 @@
         <w:pStyle w:val="Titre1"/>
         <w:pageBreakBefore/>
       </w:pPr>
-      <w:bookmarkStart w:id="0" w:name="_Toc243492068"/>
+      <w:bookmarkStart w:id="0" w:name="_Toc243495617"/>
       <w:r>
         <w:lastRenderedPageBreak/>
         <w:t>1. The pitch in 60 seconds</w:t>
@@ -4668,7 +4668,7 @@
         <w:pStyle w:val="Titre1"/>
         <w:pageBreakBefore/>
       </w:pPr>
-      <w:bookmarkStart w:id="1" w:name="_Toc243492069"/>
+      <w:bookmarkStart w:id="1" w:name="_Toc243495618"/>
       <w:r>
         <w:lastRenderedPageBreak/>
         <w:t>2. The basic ideas, explained simply</w:t>
@@ -4773,7 +4773,7 @@
       <w:pPr>
         <w:pStyle w:val="Titre2"/>
       </w:pPr>
-      <w:bookmarkStart w:id="2" w:name="_Toc243492070"/>
+      <w:bookmarkStart w:id="2" w:name="_Toc243495619"/>
       <w:r>
         <w:t>A neuron, weights and a network</w:t>
       </w:r>
@@ -4843,7 +4843,7 @@
       <w:pPr>
         <w:pStyle w:val="Titre2"/>
       </w:pPr>
-      <w:bookmarkStart w:id="3" w:name="_Toc243492071"/>
+      <w:bookmarkStart w:id="3" w:name="_Toc243495620"/>
       <w:r>
         <w:t>The loss: how wrong we are</w:t>
       </w:r>
@@ -4903,7 +4903,7 @@
       <w:pPr>
         <w:pStyle w:val="Titre2"/>
       </w:pPr>
-      <w:bookmarkStart w:id="4" w:name="_Toc243492072"/>
+      <w:bookmarkStart w:id="4" w:name="_Toc243495621"/>
       <w:r>
         <w:t>Gradient descent and the learning rate</w:t>
       </w:r>
@@ -4973,7 +4973,7 @@
       <w:pPr>
         <w:pStyle w:val="Titre2"/>
       </w:pPr>
-      <w:bookmarkStart w:id="5" w:name="_Toc243492073"/>
+      <w:bookmarkStart w:id="5" w:name="_Toc243495622"/>
       <w:r>
         <w:t>Backpropagation and the 5 lines of the training loop</w:t>
       </w:r>
@@ -5067,7 +5067,7 @@
       <w:pPr>
         <w:pStyle w:val="Titre2"/>
       </w:pPr>
-      <w:bookmarkStart w:id="6" w:name="_Toc243492074"/>
+      <w:bookmarkStart w:id="6" w:name="_Toc243495623"/>
       <w:r>
         <w:t>Epoch and mini-batch</w:t>
       </w:r>
@@ -5127,7 +5127,7 @@
       <w:pPr>
         <w:pStyle w:val="Titre2"/>
       </w:pPr>
-      <w:bookmarkStart w:id="7" w:name="_Toc243492075"/>
+      <w:bookmarkStart w:id="7" w:name="_Toc243495624"/>
       <w:r>
         <w:lastRenderedPageBreak/>
         <w:t>Train, validation, test</w:t>
@@ -5198,7 +5198,7 @@
       <w:pPr>
         <w:pStyle w:val="Titre2"/>
       </w:pPr>
-      <w:bookmarkStart w:id="8" w:name="_Toc243492076"/>
+      <w:bookmarkStart w:id="8" w:name="_Toc243495625"/>
       <w:r>
         <w:t>Overfitting</w:t>
       </w:r>
@@ -5248,7 +5248,7 @@
       <w:pPr>
         <w:pStyle w:val="Titre2"/>
       </w:pPr>
-      <w:bookmarkStart w:id="9" w:name="_Toc243492077"/>
+      <w:bookmarkStart w:id="9" w:name="_Toc243495626"/>
       <w:r>
         <w:t>ReLU, the activation</w:t>
       </w:r>
@@ -5318,7 +5318,7 @@
       <w:pPr>
         <w:pStyle w:val="Titre2"/>
       </w:pPr>
-      <w:bookmarkStart w:id="10" w:name="_Toc243492078"/>
+      <w:bookmarkStart w:id="10" w:name="_Toc243495627"/>
       <w:r>
         <w:t>Initialisation and the first loss</w:t>
       </w:r>
@@ -5368,7 +5368,7 @@
       <w:pPr>
         <w:pStyle w:val="Titre2"/>
       </w:pPr>
-      <w:bookmarkStart w:id="11" w:name="_Toc243492079"/>
+      <w:bookmarkStart w:id="11" w:name="_Toc243495628"/>
       <w:r>
         <w:t>Standardisation of the pixels</w:t>
       </w:r>
@@ -5428,7 +5428,7 @@
       <w:pPr>
         <w:pStyle w:val="Titre2"/>
       </w:pPr>
-      <w:bookmarkStart w:id="12" w:name="_Toc243492080"/>
+      <w:bookmarkStart w:id="12" w:name="_Toc243495629"/>
       <w:r>
         <w:t>MLP versus CNN: why the MLP cannot see shapes</w:t>
       </w:r>
@@ -5488,7 +5488,7 @@
       <w:pPr>
         <w:pStyle w:val="Titre2"/>
       </w:pPr>
-      <w:bookmarkStart w:id="13" w:name="_Toc243492081"/>
+      <w:bookmarkStart w:id="13" w:name="_Toc243495630"/>
       <w:r>
         <w:t>Convolution, filters and channels (session 7 slide)</w:t>
       </w:r>
@@ -5579,7 +5579,7 @@
       <w:pPr>
         <w:pStyle w:val="Titre2"/>
       </w:pPr>
-      <w:bookmarkStart w:id="14" w:name="_Toc243492082"/>
+      <w:bookmarkStart w:id="14" w:name="_Toc243495631"/>
       <w:r>
         <w:t>A pretrained network and transfer learning</w:t>
       </w:r>
@@ -5639,7 +5639,7 @@
       <w:pPr>
         <w:pStyle w:val="Titre2"/>
       </w:pPr>
-      <w:bookmarkStart w:id="15" w:name="_Toc243492083"/>
+      <w:bookmarkStart w:id="15" w:name="_Toc243495632"/>
       <w:r>
         <w:t>Frozen features (linear probe) versus fine-tuning</w:t>
       </w:r>
@@ -5709,7 +5709,7 @@
       <w:pPr>
         <w:pStyle w:val="Titre2"/>
       </w:pPr>
-      <w:bookmarkStart w:id="16" w:name="_Toc243492084"/>
+      <w:bookmarkStart w:id="16" w:name="_Toc243495633"/>
       <w:r>
         <w:t>The tools against overfitting</w:t>
       </w:r>
@@ -5869,7 +5869,7 @@
       <w:pPr>
         <w:pStyle w:val="Titre2"/>
       </w:pPr>
-      <w:bookmarkStart w:id="17" w:name="_Toc243492085"/>
+      <w:bookmarkStart w:id="17" w:name="_Toc243495634"/>
       <w:r>
         <w:t>Vanishing gradient</w:t>
       </w:r>
@@ -5919,7 +5919,7 @@
       <w:pPr>
         <w:pStyle w:val="Titre2"/>
       </w:pPr>
-      <w:bookmarkStart w:id="18" w:name="_Toc243492086"/>
+      <w:bookmarkStart w:id="18" w:name="_Toc243495635"/>
       <w:r>
         <w:t>Data leakage</w:t>
       </w:r>
@@ -5969,7 +5969,7 @@
       <w:pPr>
         <w:pStyle w:val="Titre2"/>
       </w:pPr>
-      <w:bookmarkStart w:id="19" w:name="_Toc243492087"/>
+      <w:bookmarkStart w:id="19" w:name="_Toc243495636"/>
       <w:r>
         <w:t>Confidence interval and bootstrap</w:t>
       </w:r>
@@ -6029,7 +6029,7 @@
       <w:pPr>
         <w:pStyle w:val="Titre2"/>
       </w:pPr>
-      <w:bookmarkStart w:id="20" w:name="_Toc243492088"/>
+      <w:bookmarkStart w:id="20" w:name="_Toc243495637"/>
       <w:r>
         <w:lastRenderedPageBreak/>
         <w:t>Latency and CPU threads</w:t>
@@ -6101,7 +6101,7 @@
         <w:pStyle w:val="Titre1"/>
         <w:pageBreakBefore/>
       </w:pPr>
-      <w:bookmarkStart w:id="21" w:name="_Toc243492089"/>
+      <w:bookmarkStart w:id="21" w:name="_Toc243495638"/>
       <w:r>
         <w:lastRenderedPageBreak/>
         <w:t>3. Step 1: the data and a fair split (notebook 01)</w:t>
@@ -6214,7 +6214,7 @@
       <w:pPr>
         <w:pStyle w:val="Titre2"/>
       </w:pPr>
-      <w:bookmarkStart w:id="22" w:name="_Toc243492090"/>
+      <w:bookmarkStart w:id="22" w:name="_Toc243495639"/>
       <w:r>
         <w:t>What we downloaded</w:t>
       </w:r>
@@ -6335,7 +6335,7 @@
       <w:pPr>
         <w:pStyle w:val="Titre2"/>
       </w:pPr>
-      <w:bookmarkStart w:id="23" w:name="_Toc243492091"/>
+      <w:bookmarkStart w:id="23" w:name="_Toc243495640"/>
       <w:r>
         <w:t>The split (make_split in data.py)</w:t>
       </w:r>
@@ -6466,7 +6466,7 @@
       <w:pPr>
         <w:pStyle w:val="Titre2"/>
       </w:pPr>
-      <w:bookmarkStart w:id="24" w:name="_Toc243492092"/>
+      <w:bookmarkStart w:id="24" w:name="_Toc243495641"/>
       <w:r>
         <w:t>What we found in the data</w:t>
       </w:r>
@@ -6529,7 +6529,7 @@
         <w:pStyle w:val="Titre1"/>
         <w:pageBreakBefore/>
       </w:pPr>
-      <w:bookmarkStart w:id="25" w:name="_Toc243492093"/>
+      <w:bookmarkStart w:id="25" w:name="_Toc243495642"/>
       <w:r>
         <w:lastRenderedPageBreak/>
         <w:t>4. Step 2: the MLP and its two checks (notebook 02)</w:t>
@@ -6679,7 +6679,7 @@
       <w:pPr>
         <w:pStyle w:val="Titre2"/>
       </w:pPr>
-      <w:bookmarkStart w:id="26" w:name="_Toc243492094"/>
+      <w:bookmarkStart w:id="26" w:name="_Toc243495643"/>
       <w:r>
         <w:t>The model</w:t>
       </w:r>
@@ -6806,7 +6806,7 @@
       <w:pPr>
         <w:pStyle w:val="Titre2"/>
       </w:pPr>
-      <w:bookmarkStart w:id="27" w:name="_Toc243492095"/>
+      <w:bookmarkStart w:id="27" w:name="_Toc243495644"/>
       <w:r>
         <w:t>Check 1: the first loss</w:t>
       </w:r>
@@ -6855,7 +6855,7 @@
       <w:pPr>
         <w:pStyle w:val="Titre2"/>
       </w:pPr>
-      <w:bookmarkStart w:id="28" w:name="_Toc243492096"/>
+      <w:bookmarkStart w:id="28" w:name="_Toc243495645"/>
       <w:r>
         <w:t>Check 2: overfit one batch</w:t>
       </w:r>
@@ -6873,7 +6873,7 @@
       <w:pPr>
         <w:pStyle w:val="Titre2"/>
       </w:pPr>
-      <w:bookmarkStart w:id="29" w:name="_Toc243492097"/>
+      <w:bookmarkStart w:id="29" w:name="_Toc243495646"/>
       <w:r>
         <w:t>Baseline and image size</w:t>
       </w:r>
@@ -6949,7 +6949,7 @@
         </w:rPr>
         <w:lastRenderedPageBreak/>
         <w:drawing>
-          <wp:inline distT="0" distB="0" distL="0" distR="0" wp14:anchorId="7D92BDE8" wp14:editId="7D92BDE9">
+          <wp:inline distT="0" distB="0" distL="0" distR="0" wp14:anchorId="5E98809C" wp14:editId="5E98809D">
             <wp:extent cx="4762500" cy="1924050"/>
             <wp:effectExtent l="0" t="0" r="0" b="0"/>
             <wp:docPr id="1" name="02_baseline_curves.png" descr="MLP baseline: training loss falls to 0 while validation loss rises (overfitting)." title="MLP baseline: training loss falls to 0 while validation loss rises (overfitting)."/>
@@ -7009,7 +7009,7 @@
         <w:pStyle w:val="Titre1"/>
         <w:pageBreakBefore/>
       </w:pPr>
-      <w:bookmarkStart w:id="30" w:name="_Toc243492098"/>
+      <w:bookmarkStart w:id="30" w:name="_Toc243495647"/>
       <w:r>
         <w:lastRenderedPageBreak/>
         <w:t>5. Step 3: monitoring and regularisation (notebook 03)</w:t>
@@ -7180,7 +7180,7 @@
       <w:pPr>
         <w:pStyle w:val="Titre2"/>
       </w:pPr>
-      <w:bookmarkStart w:id="31" w:name="_Toc243492099"/>
+      <w:bookmarkStart w:id="31" w:name="_Toc243495648"/>
       <w:r>
         <w:t>What we monitored</w:t>
       </w:r>
@@ -7299,7 +7299,7 @@
       <w:pPr>
         <w:pStyle w:val="Titre2"/>
       </w:pPr>
-      <w:bookmarkStart w:id="32" w:name="_Toc243492100"/>
+      <w:bookmarkStart w:id="32" w:name="_Toc243495649"/>
       <w:r>
         <w:t>Learning-rate sweep (Adam, 8 values, 15 epochs each)</w:t>
       </w:r>
@@ -7374,7 +7374,7 @@
           <w:noProof/>
         </w:rPr>
         <w:drawing>
-          <wp:inline distT="0" distB="0" distL="0" distR="0" wp14:anchorId="7D92BDEA" wp14:editId="7D92BDEB">
+          <wp:inline distT="0" distB="0" distL="0" distR="0" wp14:anchorId="5E98809E" wp14:editId="5E98809F">
             <wp:extent cx="4191000" cy="1619250"/>
             <wp:effectExtent l="0" t="0" r="0" b="0"/>
             <wp:docPr id="2" name="03_lr_sweep.png" descr="Learning-rate sweep: a U-shaped validation loss, best at 0.0001." title="Learning-rate sweep: a U-shaped validation loss, best at 0.0001."/>
@@ -7433,7 +7433,7 @@
       <w:pPr>
         <w:pStyle w:val="Titre2"/>
       </w:pPr>
-      <w:bookmarkStart w:id="33" w:name="_Toc243492101"/>
+      <w:bookmarkStart w:id="33" w:name="_Toc243495650"/>
       <w:r>
         <w:t>The tools against overfitting (lr 0.0001, 3 seeds each)</w:t>
       </w:r>
@@ -8406,7 +8406,7 @@
         <w:pStyle w:val="Titre1"/>
         <w:pageBreakBefore/>
       </w:pPr>
-      <w:bookmarkStart w:id="34" w:name="_Toc243492102"/>
+      <w:bookmarkStart w:id="34" w:name="_Toc243495651"/>
       <w:r>
         <w:lastRenderedPageBreak/>
         <w:t>6. Step 4: the training doctor (notebook 04)</w:t>
@@ -8422,7 +8422,7 @@
           <w:b/>
           <w:bCs/>
         </w:rPr>
-        <w:t>In the talk: backup slide 18 only.</w:t>
+        <w:t>In the talk: backup slide 17 only.</w:t>
       </w:r>
       <w:r>
         <w:t xml:space="preserve"> The brief asks for monitoring and failure diagnosis of our own trainings: the talk shows them on slide 5 (inside the MLP, overfitting diagnosed and fixed) and slide 7 (ResNet curves, fine-tuning overfits). This chapter is for the questions: it proves that our monitoring tools really catch a broken training.</w:t>
@@ -9312,7 +9312,7 @@
         </w:rPr>
         <w:lastRenderedPageBreak/>
         <w:drawing>
-          <wp:inline distT="0" distB="0" distL="0" distR="0" wp14:anchorId="7D92BDEC" wp14:editId="7D92BDED">
+          <wp:inline distT="0" distB="0" distL="0" distR="0" wp14:anchorId="5E9880A0" wp14:editId="5E9880A1">
             <wp:extent cx="4000500" cy="2209800"/>
             <wp:effectExtent l="0" t="0" r="0" b="0"/>
             <wp:docPr id="3" name="04_p4_grad_per_layer.png" descr="Patient 4: the gradient vanishes layer after layer with sigmoids; ReLU + He init fixes it." title="Patient 4: the gradient vanishes layer after layer with sigmoids; ReLU + He init fixes it."/>
@@ -9371,7 +9371,7 @@
       <w:pPr>
         <w:pStyle w:val="Titre2"/>
       </w:pPr>
-      <w:bookmarkStart w:id="35" w:name="_Toc243492103"/>
+      <w:bookmarkStart w:id="35" w:name="_Toc243495652"/>
       <w:r>
         <w:t>Lessons to say at the oral</w:t>
       </w:r>
@@ -9464,7 +9464,7 @@
         <w:pStyle w:val="Titre1"/>
         <w:pageBreakBefore/>
       </w:pPr>
-      <w:bookmarkStart w:id="36" w:name="_Toc243492104"/>
+      <w:bookmarkStart w:id="36" w:name="_Toc243495653"/>
       <w:r>
         <w:lastRenderedPageBreak/>
         <w:t>7. Step 5: pretrained ResNet18 (notebook 05)</w:t>
@@ -9671,7 +9671,7 @@
       <w:pPr>
         <w:pStyle w:val="Titre2"/>
       </w:pPr>
-      <w:bookmarkStart w:id="37" w:name="_Toc243492105"/>
+      <w:bookmarkStart w:id="37" w:name="_Toc243495654"/>
       <w:r>
         <w:t>Why a CNN, and why pretrained</w:t>
       </w:r>
@@ -9735,10 +9735,10 @@
           <w:noProof/>
         </w:rPr>
         <w:drawing>
-          <wp:inline distT="0" distB="0" distL="0" distR="0" wp14:anchorId="7D92BDEE" wp14:editId="7D92BDEF">
+          <wp:inline distT="0" distB="0" distL="0" distR="0" wp14:anchorId="5E9880A2" wp14:editId="5E9880A3">
             <wp:extent cx="5905500" cy="2543175"/>
             <wp:effectExtent l="0" t="0" r="0" b="0"/>
-            <wp:docPr id="4" name="C:\Users\benca\AppData\Local\Temp\claude\c--Users-benca-OneDrive---Thelio-Documents-Perso-Albert-School\1b4fce00-cdbb-452c-8784-7dae784734de\scratchpad\deck\resnet18_diagram.png" descr="Inside ResNet18 + our linear head (backup slide 21): the frozen body (dark) turns a painting into 512 numbers; our linear head (blue) turns them into 5 scores." title="Inside ResNet18 + our linear head (backup slide 21): the frozen body (dark) turns a painting into 512 numbers; our linear head (blue) turns them into 5 scores."/>
+            <wp:docPr id="4" name="C:\Users\benca\AppData\Local\Temp\claude\c--Users-benca-OneDrive---Thelio-Documents-Perso-Albert-School\1b4fce00-cdbb-452c-8784-7dae784734de\scratchpad\deck\resnet18_diagram.png" descr="Inside ResNet18 + our linear head (backup slide 20): the frozen body (dark) turns a painting into 512 numbers; our linear head (blue) turns them into 5 scores." title="Inside ResNet18 + our linear head (backup slide 20): the frozen body (dark) turns a painting into 512 numbers; our linear head (blue) turns them into 5 scores."/>
             <wp:cNvGraphicFramePr>
               <a:graphicFrameLocks xmlns:a="http://schemas.openxmlformats.org/drawingml/2006/main" noChangeAspect="1"/>
             </wp:cNvGraphicFramePr>
@@ -9787,7 +9787,7 @@
           <w:sz w:val="18"/>
           <w:szCs w:val="18"/>
         </w:rPr>
-        <w:t>Inside ResNet18 + our linear head (backup slide 21): the frozen body (dark) turns a painting into 512 numbers; our linear head (blue) turns them into 5 scores.</w:t>
+        <w:t>Inside ResNet18 + our linear head (backup slide 20): the frozen body (dark) turns a painting into 512 numbers; our linear head (blue) turns them into 5 scores.</w:t>
       </w:r>
     </w:p>
     <w:p>
@@ -9878,7 +9878,7 @@
       <w:pPr>
         <w:pStyle w:val="Titre2"/>
       </w:pPr>
-      <w:bookmarkStart w:id="38" w:name="_Toc243492106"/>
+      <w:bookmarkStart w:id="38" w:name="_Toc243495655"/>
       <w:r>
         <w:t>Method A: frozen features + head</w:t>
       </w:r>
@@ -9985,7 +9985,7 @@
       <w:pPr>
         <w:pStyle w:val="Titre2"/>
       </w:pPr>
-      <w:bookmarkStart w:id="39" w:name="_Toc243492107"/>
+      <w:bookmarkStart w:id="39" w:name="_Toc243495656"/>
       <w:r>
         <w:t>Method B: fine-tuning layer4</w:t>
       </w:r>
@@ -10042,7 +10042,7 @@
       <w:pPr>
         <w:pStyle w:val="Titre2"/>
       </w:pPr>
-      <w:bookmarkStart w:id="40" w:name="_Toc243492108"/>
+      <w:bookmarkStart w:id="40" w:name="_Toc243495657"/>
       <w:r>
         <w:t>Two silent bugs, measured</w:t>
       </w:r>
@@ -10109,7 +10109,7 @@
       <w:pPr>
         <w:pStyle w:val="Titre2"/>
       </w:pPr>
-      <w:bookmarkStart w:id="41" w:name="_Toc243492109"/>
+      <w:bookmarkStart w:id="41" w:name="_Toc243495658"/>
       <w:r>
         <w:t>Painter leakage, measured fairly</w:t>
       </w:r>
@@ -10450,7 +10450,7 @@
           <w:noProof/>
         </w:rPr>
         <w:drawing>
-          <wp:inline distT="0" distB="0" distL="0" distR="0" wp14:anchorId="7D92BDF0" wp14:editId="7D92BDF1">
+          <wp:inline distT="0" distB="0" distL="0" distR="0" wp14:anchorId="5E9880A4" wp14:editId="5E9880A5">
             <wp:extent cx="4762500" cy="2524125"/>
             <wp:effectExtent l="0" t="0" r="0" b="0"/>
             <wp:docPr id="5" name="05_painter_leakage.png" descr="Painter leakage: same images, same model; only the known-painter group changes." title="Painter leakage: same images, same model; only the known-painter group changes."/>
@@ -10526,7 +10526,7 @@
         <w:pStyle w:val="Titre1"/>
         <w:pageBreakBefore/>
       </w:pPr>
-      <w:bookmarkStart w:id="42" w:name="_Toc243492110"/>
+      <w:bookmarkStart w:id="42" w:name="_Toc243495659"/>
       <w:r>
         <w:lastRenderedPageBreak/>
         <w:t>8. Step 6: final test, CPU cost and recommendation (notebook 06)</w:t>
@@ -10672,7 +10672,7 @@
       <w:pPr>
         <w:pStyle w:val="Titre2"/>
       </w:pPr>
-      <w:bookmarkStart w:id="43" w:name="_Toc243492111"/>
+      <w:bookmarkStart w:id="43" w:name="_Toc243495660"/>
       <w:r>
         <w:t>Classical models (settings chosen on validation)</w:t>
       </w:r>
@@ -10785,7 +10785,7 @@
       <w:pPr>
         <w:pStyle w:val="Titre2"/>
       </w:pPr>
-      <w:bookmarkStart w:id="44" w:name="_Toc243492112"/>
+      <w:bookmarkStart w:id="44" w:name="_Toc243495661"/>
       <w:r>
         <w:t>The final test, measured once</w:t>
       </w:r>
@@ -11816,7 +11816,7 @@
         </w:rPr>
         <w:lastRenderedPageBreak/>
         <w:drawing>
-          <wp:inline distT="0" distB="0" distL="0" distR="0" wp14:anchorId="7D92BDF2" wp14:editId="7D92BDF3">
+          <wp:inline distT="0" distB="0" distL="0" distR="0" wp14:anchorId="5E9880A6" wp14:editId="5E9880A7">
             <wp:extent cx="4762500" cy="1971675"/>
             <wp:effectExtent l="0" t="0" r="0" b="0"/>
             <wp:docPr id="6" name="06_test_accuracy.png" descr="Final test: 220 paintings never seen before, with 95 % bootstrap intervals." title="Final test: 220 paintings never seen before, with 95 % bootstrap intervals."/>
@@ -11875,7 +11875,7 @@
       <w:pPr>
         <w:pStyle w:val="Titre2"/>
       </w:pPr>
-      <w:bookmarkStart w:id="45" w:name="_Toc243492113"/>
+      <w:bookmarkStart w:id="45" w:name="_Toc243495662"/>
       <w:r>
         <w:t>Are the gaps real? Paired bootstrap (same 220 paintings, 5 000 redraws)</w:t>
       </w:r>
@@ -11934,7 +11934,7 @@
       <w:pPr>
         <w:pStyle w:val="Titre2"/>
       </w:pPr>
-      <w:bookmarkStart w:id="46" w:name="_Toc243492114"/>
+      <w:bookmarkStart w:id="46" w:name="_Toc243495663"/>
       <w:r>
         <w:t>Frozen or fine-tuned? Validation and test disagree</w:t>
       </w:r>
@@ -11962,7 +11962,7 @@
       <w:pPr>
         <w:pStyle w:val="Titre2"/>
       </w:pPr>
-      <w:bookmarkStart w:id="47" w:name="_Toc243492115"/>
+      <w:bookmarkStart w:id="47" w:name="_Toc243495664"/>
       <w:r>
         <w:t>Speed and size</w:t>
       </w:r>
@@ -11980,7 +11980,7 @@
       <w:pPr>
         <w:pStyle w:val="Titre2"/>
       </w:pPr>
-      <w:bookmarkStart w:id="48" w:name="_Toc243492116"/>
+      <w:bookmarkStart w:id="48" w:name="_Toc243495665"/>
       <w:r>
         <w:t>Recommendation to the director</w:t>
       </w:r>
@@ -12077,7 +12077,7 @@
         <w:pStyle w:val="Titre1"/>
         <w:pageBreakBefore/>
       </w:pPr>
-      <w:bookmarkStart w:id="49" w:name="_Toc243492117"/>
+      <w:bookmarkStart w:id="49" w:name="_Toc243495666"/>
       <w:r>
         <w:lastRenderedPageBreak/>
         <w:t>9. Step 6 bis: a second test, was it luck? (notebook 08)</w:t>
@@ -12209,7 +12209,7 @@
       <w:pPr>
         <w:pStyle w:val="Titre2"/>
       </w:pPr>
-      <w:bookmarkStart w:id="50" w:name="_Toc243492118"/>
+      <w:bookmarkStart w:id="50" w:name="_Toc243495667"/>
       <w:r>
         <w:t>How the second test was built (scripts/make_second_test.py)</w:t>
       </w:r>
@@ -12281,7 +12281,7 @@
       <w:pPr>
         <w:pStyle w:val="Titre2"/>
       </w:pPr>
-      <w:bookmarkStart w:id="51" w:name="_Toc243492119"/>
+      <w:bookmarkStart w:id="51" w:name="_Toc243495668"/>
       <w:r>
         <w:t>Results</w:t>
       </w:r>
@@ -12887,7 +12887,7 @@
           <w:noProof/>
         </w:rPr>
         <w:drawing>
-          <wp:inline distT="0" distB="0" distL="0" distR="0" wp14:anchorId="7D92BDF4" wp14:editId="7D92BDF5">
+          <wp:inline distT="0" distB="0" distL="0" distR="0" wp14:anchorId="5E9880A8" wp14:editId="5E9880A9">
             <wp:extent cx="5334000" cy="2095500"/>
             <wp:effectExtent l="0" t="0" r="0" b="0"/>
             <wp:docPr id="7" name="08_second_test.png" descr="Test 1 and the new test 2: the same ranking (black lines: 95 % bootstrap intervals)." title="Test 1 and the new test 2: the same ranking (black lines: 95 % bootstrap intervals)."/>
@@ -12996,7 +12996,7 @@
       <w:pPr>
         <w:pStyle w:val="Titre2"/>
       </w:pPr>
-      <w:bookmarkStart w:id="52" w:name="_Toc243492120"/>
+      <w:bookmarkStart w:id="52" w:name="_Toc243495669"/>
       <w:r>
         <w:t>What it changes, and the honest caveat</w:t>
       </w:r>
@@ -13025,7 +13025,7 @@
         <w:pStyle w:val="Titre1"/>
         <w:pageBreakBefore/>
       </w:pPr>
-      <w:bookmarkStart w:id="53" w:name="_Toc243492121"/>
+      <w:bookmarkStart w:id="53" w:name="_Toc243495670"/>
       <w:r>
         <w:lastRenderedPageBreak/>
         <w:t>10. The random forest, our classical challenger (notebook 06)</w:t>
@@ -13205,14 +13205,14 @@
         <w:rPr>
           <w:color w:val="1C2433"/>
         </w:rPr>
-        <w:t>The random forest on 102 hand-made numbers is our best model without a neural network: 63.5 % on validation, 67.3 % on the test, 16.4 points below the frozen ResNet18 (interval 9.1 to 24.1). Slide 8 of the talk explains it; backup slide 13 gives all the classical scores.</w:t>
+        <w:t>The random forest on 102 hand-made numbers is our best model without a neural network: 63.5 % on validation, 67.3 % on the test, 16.4 points below the frozen ResNet18 (interval 9.1 to 24.1). Slide 8 of the talk explains it; backup slide 12 gives all the classical scores.</w:t>
       </w:r>
     </w:p>
     <w:p>
       <w:pPr>
         <w:pStyle w:val="Titre2"/>
       </w:pPr>
-      <w:bookmarkStart w:id="54" w:name="_Toc243492122"/>
+      <w:bookmarkStart w:id="54" w:name="_Toc243495671"/>
       <w:r>
         <w:t>The 102 hand-made numbers (baselines.py)</w:t>
       </w:r>
@@ -13602,7 +13602,7 @@
       <w:pPr>
         <w:pStyle w:val="Titre2"/>
       </w:pPr>
-      <w:bookmarkStart w:id="55" w:name="_Toc243492123"/>
+      <w:bookmarkStart w:id="55" w:name="_Toc243495672"/>
       <w:r>
         <w:t>Our settings, chosen on validation</w:t>
       </w:r>
@@ -13770,7 +13770,7 @@
       <w:pPr>
         <w:pStyle w:val="Titre2"/>
       </w:pPr>
-      <w:bookmarkStart w:id="56" w:name="_Toc243492124"/>
+      <w:bookmarkStart w:id="56" w:name="_Toc243495673"/>
       <w:r>
         <w:t>Questions on the random forest, with answers</w:t>
       </w:r>
@@ -14035,7 +14035,7 @@
         <w:pStyle w:val="Titre1"/>
         <w:pageBreakBefore/>
       </w:pPr>
-      <w:bookmarkStart w:id="57" w:name="_Toc243492125"/>
+      <w:bookmarkStart w:id="57" w:name="_Toc243495674"/>
       <w:r>
         <w:lastRenderedPageBreak/>
         <w:t>11. Bonus: what about transformers like BERT? (notebook 07)</w:t>
@@ -14902,7 +14902,7 @@
         </w:rPr>
         <w:lastRenderedPageBreak/>
         <w:drawing>
-          <wp:inline distT="0" distB="0" distL="0" distR="0" wp14:anchorId="7D92BDF6" wp14:editId="7D92BDF7">
+          <wp:inline distT="0" distB="0" distL="0" distR="0" wp14:anchorId="5E9880AA" wp14:editId="5E9880AB">
             <wp:extent cx="4381500" cy="2486025"/>
             <wp:effectExtent l="0" t="0" r="0" b="0"/>
             <wp:docPr id="8" name="07_transformers_accuracy_vs_speed.png" descr="Transformers on validation: CLIP is more accurate, but slower." title="Transformers on validation: CLIP is more accurate, but slower."/>
@@ -14962,7 +14962,7 @@
         <w:pStyle w:val="Titre1"/>
         <w:pageBreakBefore/>
       </w:pPr>
-      <w:bookmarkStart w:id="58" w:name="_Toc243492126"/>
+      <w:bookmarkStart w:id="58" w:name="_Toc243495675"/>
       <w:r>
         <w:lastRenderedPageBreak/>
         <w:t>12. Key numbers to know by heart</w:t>
@@ -16330,7 +16330,7 @@
         <w:pStyle w:val="Titre1"/>
         <w:pageBreakBefore/>
       </w:pPr>
-      <w:bookmarkStart w:id="59" w:name="_Toc243492127"/>
+      <w:bookmarkStart w:id="59" w:name="_Toc243495676"/>
       <w:r>
         <w:lastRenderedPageBreak/>
         <w:t>13. Concepts in simple words</w:t>
@@ -18521,7 +18521,7 @@
         <w:pStyle w:val="Titre1"/>
         <w:pageBreakBefore/>
       </w:pPr>
-      <w:bookmarkStart w:id="60" w:name="_Toc243492128"/>
+      <w:bookmarkStart w:id="60" w:name="_Toc243495677"/>
       <w:r>
         <w:lastRenderedPageBreak/>
         <w:t>14. Questions you may get, with answers</w:t>
@@ -18543,7 +18543,7 @@
       <w:pPr>
         <w:pStyle w:val="Titre2"/>
       </w:pPr>
-      <w:bookmarkStart w:id="61" w:name="_Toc243492129"/>
+      <w:bookmarkStart w:id="61" w:name="_Toc243495678"/>
       <w:r>
         <w:t>About the data</w:t>
       </w:r>
@@ -18663,7 +18663,7 @@
       <w:pPr>
         <w:pStyle w:val="Titre2"/>
       </w:pPr>
-      <w:bookmarkStart w:id="62" w:name="_Toc243492130"/>
+      <w:bookmarkStart w:id="62" w:name="_Toc243495679"/>
       <w:r>
         <w:t>About the MLP</w:t>
       </w:r>
@@ -18783,7 +18783,7 @@
       <w:pPr>
         <w:pStyle w:val="Titre2"/>
       </w:pPr>
-      <w:bookmarkStart w:id="63" w:name="_Toc243492131"/>
+      <w:bookmarkStart w:id="63" w:name="_Toc243495680"/>
       <w:r>
         <w:t>About training and diagnosis</w:t>
       </w:r>
@@ -18881,7 +18881,7 @@
       <w:pPr>
         <w:pStyle w:val="Titre2"/>
       </w:pPr>
-      <w:bookmarkStart w:id="64" w:name="_Toc243492132"/>
+      <w:bookmarkStart w:id="64" w:name="_Toc243495681"/>
       <w:r>
         <w:lastRenderedPageBreak/>
         <w:t>About ResNet</w:t>
@@ -18918,7 +18918,7 @@
         <w:t>scripts/resnet_from_zero.py</w:t>
       </w:r>
       <w:r>
-        <w:t>, backup slide 22): the same ResNet18 with random weights, every layer learning for 30 epochs (24 minutes of CPU), reaches only 61.6 % on validation, against 88.1 % frozen. That is about the random forest (63.5 %), but better than our MLP (45.5 %): convolutions help, the pretraining helps much more.</w:t>
+        <w:t>, backup slide 21): the same ResNet18 with random weights, every layer learning for 30 epochs (24 minutes of CPU), reaches only 61.6 % on validation, against 88.1 % frozen. That is about the random forest (63.5 %), but better than our MLP (45.5 %): convolutions help, the pretraining helps much more.</w:t>
       </w:r>
     </w:p>
     <w:p>
@@ -19170,7 +19170,7 @@
       <w:pPr>
         <w:pStyle w:val="Titre2"/>
       </w:pPr>
-      <w:bookmarkStart w:id="65" w:name="_Toc243492133"/>
+      <w:bookmarkStart w:id="65" w:name="_Toc243495682"/>
       <w:r>
         <w:t>About the results and the recommendation</w:t>
       </w:r>
@@ -19313,7 +19313,7 @@
       <w:pPr>
         <w:pStyle w:val="Titre2"/>
       </w:pPr>
-      <w:bookmarkStart w:id="66" w:name="_Toc243492134"/>
+      <w:bookmarkStart w:id="66" w:name="_Toc243495683"/>
       <w:r>
         <w:t>About the project</w:t>
       </w:r>
@@ -19368,7 +19368,7 @@
         <w:pStyle w:val="Titre1"/>
         <w:pageBreakBefore/>
       </w:pPr>
-      <w:bookmarkStart w:id="67" w:name="_Toc243492135"/>
+      <w:bookmarkStart w:id="67" w:name="_Toc243495684"/>
       <w:r>
         <w:lastRenderedPageBreak/>
         <w:t>15. Limits to admit, and next steps</w:t>
@@ -20162,7 +20162,7 @@
         <w:pStyle w:val="Titre1"/>
         <w:pageBreakBefore/>
       </w:pPr>
-      <w:bookmarkStart w:id="68" w:name="_Toc243492136"/>
+      <w:bookmarkStart w:id="68" w:name="_Toc243495685"/>
       <w:r>
         <w:lastRenderedPageBreak/>
         <w:t>16. Git history and how to reproduce</w:t>
@@ -21190,7 +21190,7 @@
         <w:pStyle w:val="Titre1"/>
         <w:pageBreakBefore/>
       </w:pPr>
-      <w:bookmarkStart w:id="69" w:name="_Toc243492137"/>
+      <w:bookmarkStart w:id="69" w:name="_Toc243495686"/>
       <w:r>
         <w:lastRenderedPageBreak/>
         <w:t>17. The 10-minute talk, slide by slide</w:t>
@@ -21205,7 +21205,7 @@
         <w:rPr>
           <w:color w:val="1C2433"/>
         </w:rPr>
-        <w:t>The talk follows the project step by step and gives the answer only at the end. 12 slides, about 45 seconds each: about 9:35 in total, the rest of the 10 minutes is a margin. The speaker notes in the .pptx and oral_script.pdf hold the full text in simple English.</w:t>
+        <w:t>The talk follows the project step by step and gives the answer only at the end. 11 slides, about 50 seconds each: about 9:10 in total, the rest of the 10 minutes is a margin. The speaker notes in the .pptx and oral_script.pdf hold the full text in simple English.</w:t>
       </w:r>
     </w:p>
     <w:tbl>
@@ -22265,7 +22265,7 @@
                 <w:sz w:val="19"/>
                 <w:szCs w:val="19"/>
               </w:rPr>
-              <w:t>Step 5: Final test: the pretrained network wins</w:t>
+              <w:t>Step 5: Final tests: the fine-tuned ResNet18 wins</w:t>
             </w:r>
           </w:p>
         </w:tc>
@@ -22291,7 +22291,7 @@
                 <w:sz w:val="19"/>
                 <w:szCs w:val="19"/>
               </w:rPr>
-              <w:t>0:45</w:t>
+              <w:t>1:00</w:t>
             </w:r>
           </w:p>
         </w:tc>
@@ -22317,7 +22317,7 @@
                 <w:sz w:val="19"/>
                 <w:szCs w:val="19"/>
               </w:rPr>
-              <w:t>+16 points over the random forest (9 to 24); surprise: fine-tuned first (87.9 %).</w:t>
+              <w:t>Surprise on test 1 (fine-tuned first), checked on 220 new paintings: +18.0 over the random forest, fine-tuning +5.0 (2.0 to 8.2).</w:t>
             </w:r>
           </w:p>
         </w:tc>
@@ -22373,7 +22373,7 @@
                 <w:sz w:val="19"/>
                 <w:szCs w:val="19"/>
               </w:rPr>
-              <w:t>Step 5: A second test: the fine-tuned win was not luck</w:t>
+              <w:t>Step 6: Fast and cheap enough for a kiosk</w:t>
             </w:r>
           </w:p>
         </w:tc>
@@ -22427,7 +22427,7 @@
                 <w:sz w:val="19"/>
                 <w:szCs w:val="19"/>
               </w:rPr>
-              <w:t>220 new paintings, same ranking; fine-tuned +5.0 points on 440 paintings (2.0 to 8.2).</w:t>
+              <w:t>53 ms, 45 MB, 2.5 min of training, no GPU.</w:t>
             </w:r>
           </w:p>
         </w:tc>
@@ -22481,7 +22481,7 @@
                 <w:sz w:val="19"/>
                 <w:szCs w:val="19"/>
               </w:rPr>
-              <w:t>Step 6: Fast and cheap enough for a kiosk</w:t>
+              <w:t>Our choice: a fine-tuned ResNet18</w:t>
             </w:r>
           </w:p>
         </w:tc>
@@ -22507,7 +22507,7 @@
                 <w:sz w:val="19"/>
                 <w:szCs w:val="19"/>
               </w:rPr>
-              <w:t>0:40</w:t>
+              <w:t>0:55</w:t>
             </w:r>
           </w:p>
         </w:tc>
@@ -22520,116 +22520,6 @@
               <w:bottom w:val="single" w:sz="4" w:space="0" w:color="D9DCE2"/>
               <w:right w:val="single" w:sz="4" w:space="0" w:color="D9DCE2"/>
             </w:tcBorders>
-            <w:tcMar>
-              <w:top w:w="60" w:type="dxa"/>
-              <w:left w:w="100" w:type="dxa"/>
-              <w:bottom w:w="60" w:type="dxa"/>
-              <w:right w:w="100" w:type="dxa"/>
-            </w:tcMar>
-          </w:tcPr>
-          <w:p>
-            <w:r>
-              <w:rPr>
-                <w:sz w:val="19"/>
-                <w:szCs w:val="19"/>
-              </w:rPr>
-              <w:t>53 ms, 45 MB, 2.5 min of training, no GPU.</w:t>
-            </w:r>
-          </w:p>
-        </w:tc>
-      </w:tr>
-      <w:tr>
-        <w:tc>
-          <w:tcPr>
-            <w:tcW w:w="675" w:type="dxa"/>
-            <w:tcBorders>
-              <w:top w:val="single" w:sz="4" w:space="0" w:color="D9DCE2"/>
-              <w:left w:val="single" w:sz="4" w:space="0" w:color="D9DCE2"/>
-              <w:bottom w:val="single" w:sz="4" w:space="0" w:color="D9DCE2"/>
-              <w:right w:val="single" w:sz="4" w:space="0" w:color="D9DCE2"/>
-            </w:tcBorders>
-            <w:shd w:val="clear" w:color="auto" w:fill="F2F3F5"/>
-            <w:tcMar>
-              <w:top w:w="60" w:type="dxa"/>
-              <w:left w:w="100" w:type="dxa"/>
-              <w:bottom w:w="60" w:type="dxa"/>
-              <w:right w:w="100" w:type="dxa"/>
-            </w:tcMar>
-          </w:tcPr>
-          <w:p>
-            <w:r>
-              <w:rPr>
-                <w:sz w:val="19"/>
-                <w:szCs w:val="19"/>
-              </w:rPr>
-              <w:t>12</w:t>
-            </w:r>
-          </w:p>
-        </w:tc>
-        <w:tc>
-          <w:tcPr>
-            <w:tcW w:w="3181" w:type="dxa"/>
-            <w:tcBorders>
-              <w:top w:val="single" w:sz="4" w:space="0" w:color="D9DCE2"/>
-              <w:left w:val="single" w:sz="4" w:space="0" w:color="D9DCE2"/>
-              <w:bottom w:val="single" w:sz="4" w:space="0" w:color="D9DCE2"/>
-              <w:right w:val="single" w:sz="4" w:space="0" w:color="D9DCE2"/>
-            </w:tcBorders>
-            <w:shd w:val="clear" w:color="auto" w:fill="F2F3F5"/>
-            <w:tcMar>
-              <w:top w:w="60" w:type="dxa"/>
-              <w:left w:w="100" w:type="dxa"/>
-              <w:bottom w:w="60" w:type="dxa"/>
-              <w:right w:w="100" w:type="dxa"/>
-            </w:tcMar>
-          </w:tcPr>
-          <w:p>
-            <w:r>
-              <w:rPr>
-                <w:sz w:val="19"/>
-                <w:szCs w:val="19"/>
-              </w:rPr>
-              <w:t>Our choice: a fine-tuned ResNet18</w:t>
-            </w:r>
-          </w:p>
-        </w:tc>
-        <w:tc>
-          <w:tcPr>
-            <w:tcW w:w="1157" w:type="dxa"/>
-            <w:tcBorders>
-              <w:top w:val="single" w:sz="4" w:space="0" w:color="D9DCE2"/>
-              <w:left w:val="single" w:sz="4" w:space="0" w:color="D9DCE2"/>
-              <w:bottom w:val="single" w:sz="4" w:space="0" w:color="D9DCE2"/>
-              <w:right w:val="single" w:sz="4" w:space="0" w:color="D9DCE2"/>
-            </w:tcBorders>
-            <w:shd w:val="clear" w:color="auto" w:fill="F2F3F5"/>
-            <w:tcMar>
-              <w:top w:w="60" w:type="dxa"/>
-              <w:left w:w="100" w:type="dxa"/>
-              <w:bottom w:w="60" w:type="dxa"/>
-              <w:right w:w="100" w:type="dxa"/>
-            </w:tcMar>
-          </w:tcPr>
-          <w:p>
-            <w:r>
-              <w:rPr>
-                <w:sz w:val="19"/>
-                <w:szCs w:val="19"/>
-              </w:rPr>
-              <w:t>0:55</w:t>
-            </w:r>
-          </w:p>
-        </w:tc>
-        <w:tc>
-          <w:tcPr>
-            <w:tcW w:w="4625" w:type="dxa"/>
-            <w:tcBorders>
-              <w:top w:val="single" w:sz="4" w:space="0" w:color="D9DCE2"/>
-              <w:left w:val="single" w:sz="4" w:space="0" w:color="D9DCE2"/>
-              <w:bottom w:val="single" w:sz="4" w:space="0" w:color="D9DCE2"/>
-              <w:right w:val="single" w:sz="4" w:space="0" w:color="D9DCE2"/>
-            </w:tcBorders>
-            <w:shd w:val="clear" w:color="auto" w:fill="F2F3F5"/>
             <w:tcMar>
               <w:top w:w="60" w:type="dxa"/>
               <w:left w:w="100" w:type="dxa"/>
@@ -22658,7 +22548,7 @@
       <w:pPr>
         <w:pStyle w:val="Titre2"/>
       </w:pPr>
-      <w:bookmarkStart w:id="70" w:name="_Toc243492138"/>
+      <w:bookmarkStart w:id="70" w:name="_Toc243495687"/>
       <w:r>
         <w:t>The thread: each result opens the next step</w:t>
       </w:r>
@@ -22829,7 +22719,7 @@
         <w:t>Slide 8 to 9</w:t>
       </w:r>
       <w:r>
-        <w:t>: We saw how our challenger works. So now, the final test: every model, on 220 paintings never seen before.</w:t>
+        <w:t>: We saw how our challenger works. So now, the final tests: every model, on paintings never seen before.</w:t>
       </w:r>
     </w:p>
     <w:p>
@@ -22846,11 +22736,10 @@
           <w:b/>
           <w:bCs/>
         </w:rPr>
-        <w:lastRenderedPageBreak/>
         <w:t>Slide 9 to 10</w:t>
       </w:r>
       <w:r>
-        <w:t>: We saw that the test and the validation disagree. So now, we check if the fine-tuned win was luck, with 220 new paintings.</w:t>
+        <w:t>: Accuracy is only half of the director's question. So now, step six: what does it cost on a kiosk?</w:t>
       </w:r>
     </w:p>
     <w:p>
@@ -22867,29 +22756,10 @@
           <w:b/>
           <w:bCs/>
         </w:rPr>
+        <w:lastRenderedPageBreak/>
         <w:t>Slide 10 to 11</w:t>
       </w:r>
       <w:r>
-        <w:t>: Accuracy is only half of the director's question. So now, step six: what does it cost on a kiosk?</w:t>
-      </w:r>
-    </w:p>
-    <w:p>
-      <w:pPr>
-        <w:pStyle w:val="Paragraphedeliste"/>
-        <w:numPr>
-          <w:ilvl w:val="0"/>
-          <w:numId w:val="3"/>
-        </w:numPr>
-        <w:spacing w:after="80"/>
-      </w:pPr>
-      <w:r>
-        <w:rPr>
-          <w:b/>
-          <w:bCs/>
-        </w:rPr>
-        <w:t>Slide 11 to 12</w:t>
-      </w:r>
-      <w:r>
         <w:t>: We saw that it is accurate, fast and cheap. So now, we have everything we need to answer the director.</w:t>
       </w:r>
     </w:p>
@@ -22898,7 +22768,7 @@
         <w:spacing w:after="120"/>
       </w:pPr>
       <w:r>
-        <w:t>Slides 13 to 22 are backups for the questions: classical models (all the scores), seeing the painter inflates the score, validation and the two tests, why you can trust the numbers, the training recipes, the four broken runs of notebook 04, where the chosen model fails, what about transformers (BERT, ViT, CLIP), inside ResNet18 + our linear head, and why pretrained (ResNet18 trained from zero). The word-for-word script is in oral_script.pdf.</w:t>
+        <w:t>Slides 12 to 21 are backups for the questions: classical models (all the scores), seeing the painter inflates the score, validation and the two tests, why you can trust the numbers, the training recipes, the four broken runs of notebook 04, where the chosen model fails, what about transformers (BERT, ViT, CLIP), inside ResNet18 + our linear head, and why pretrained (ResNet18 trained from zero). The word-for-word script is in oral_script.pdf.</w:t>
       </w:r>
     </w:p>
     <w:sectPr>
@@ -23012,96 +22882,10 @@
 <file path=word/numbering.xml><?xml version="1.0" encoding="utf-8"?>
 <w:numbering xmlns:wpc="http://schemas.microsoft.com/office/word/2010/wordprocessingCanvas" xmlns:cx="http://schemas.microsoft.com/office/drawing/2014/chartex" xmlns:cx1="http://schemas.microsoft.com/office/drawing/2015/9/8/chartex" xmlns:cx2="http://schemas.microsoft.com/office/drawing/2015/10/21/chartex" xmlns:cx3="http://schemas.microsoft.com/office/drawing/2016/5/9/chartex" xmlns:cx4="http://schemas.microsoft.com/office/drawing/2016/5/10/chartex" xmlns:cx5="http://schemas.microsoft.com/office/drawing/2016/5/11/chartex" xmlns:cx6="http://schemas.microsoft.com/office/drawing/2016/5/12/chartex" xmlns:cx7="http://schemas.microsoft.com/office/drawing/2016/5/13/chartex" xmlns:cx8="http://schemas.microsoft.com/office/drawing/2016/5/14/chartex" xmlns:mc="http://schemas.openxmlformats.org/markup-compatibility/2006" xmlns:aink="http://schemas.microsoft.com/office/drawing/2016/ink" xmlns:am3d="http://schemas.microsoft.com/office/drawing/2017/model3d" xmlns:o="urn:schemas-microsoft-com:office:office" xmlns:oel="http://schemas.microsoft.com/office/2019/extlst" xmlns:r="http://schemas.openxmlformats.org/officeDocument/2006/relationships" xmlns:m="http://schemas.openxmlformats.org/officeDocument/2006/math" xmlns:v="urn:schemas-microsoft-com:vml" xmlns:wp14="http://schemas.microsoft.com/office/word/2010/wordprocessingDrawing" xmlns:wp="http://schemas.openxmlformats.org/drawingml/2006/wordprocessingDrawing" xmlns:w10="urn:schemas-microsoft-com:office:word" xmlns:w="http://schemas.openxmlformats.org/wordprocessingml/2006/main" xmlns:w14="http://schemas.microsoft.com/office/word/2010/wordml" xmlns:w15="http://schemas.microsoft.com/office/word/2012/wordml" xmlns:w16cex="http://schemas.microsoft.com/office/word/2018/wordml/cex" xmlns:w16cid="http://schemas.microsoft.com/office/word/2016/wordml/cid" xmlns:w16="http://schemas.microsoft.com/office/word/2018/wordml" xmlns:w16du="http://schemas.microsoft.com/office/word/2023/wordml/word16du" xmlns:w16sdtdh="http://schemas.microsoft.com/office/word/2020/wordml/sdtdatahash" xmlns:w16sdtfl="http://schemas.microsoft.com/office/word/2024/wordml/sdtformatlock" xmlns:w16se="http://schemas.microsoft.com/office/word/2015/wordml/symex" xmlns:wpg="http://schemas.microsoft.com/office/word/2010/wordprocessingGroup" xmlns:wpi="http://schemas.microsoft.com/office/word/2010/wordprocessingInk" xmlns:wne="http://schemas.microsoft.com/office/word/2006/wordml" xmlns:wps="http://schemas.microsoft.com/office/word/2010/wordprocessingShape" mc:Ignorable="w14 w15 w16se w16cid w16 w16cex w16sdtdh w16sdtfl w16du wp14">
   <w:abstractNum w:abstractNumId="0" w15:restartNumberingAfterBreak="0">
-    <w:nsid w:val="00F5688F"/>
+    <w:nsid w:val="013F75E5"/>
     <w:multiLevelType w:val="hybridMultilevel"/>
-    <w:tmpl w:val="2D72B4F6"/>
-    <w:lvl w:ilvl="0" w:tplc="DA941F0C" w:tentative="1">
-      <w:start w:val="1"/>
-      <w:numFmt w:val="bullet"/>
-      <w:lvlText w:val="●"/>
-      <w:lvlJc w:val="left"/>
-      <w:pPr>
-        <w:ind w:left="720" w:hanging="360"/>
-      </w:pPr>
-    </w:lvl>
-    <w:lvl w:ilvl="1" w:tplc="5C8007AA" w:tentative="1">
-      <w:start w:val="1"/>
-      <w:numFmt w:val="bullet"/>
-      <w:lvlText w:val="○"/>
-      <w:lvlJc w:val="left"/>
-      <w:pPr>
-        <w:ind w:left="1440" w:hanging="360"/>
-      </w:pPr>
-    </w:lvl>
-    <w:lvl w:ilvl="2" w:tplc="80F8476E" w:tentative="1">
-      <w:start w:val="1"/>
-      <w:numFmt w:val="bullet"/>
-      <w:lvlText w:val="■"/>
-      <w:lvlJc w:val="left"/>
-      <w:pPr>
-        <w:ind w:left="2160" w:hanging="360"/>
-      </w:pPr>
-    </w:lvl>
-    <w:lvl w:ilvl="3" w:tplc="A03CBEE0" w:tentative="1">
-      <w:start w:val="1"/>
-      <w:numFmt w:val="bullet"/>
-      <w:lvlText w:val="●"/>
-      <w:lvlJc w:val="left"/>
-      <w:pPr>
-        <w:ind w:left="2880" w:hanging="360"/>
-      </w:pPr>
-    </w:lvl>
-    <w:lvl w:ilvl="4" w:tplc="08F63C5A" w:tentative="1">
-      <w:start w:val="1"/>
-      <w:numFmt w:val="bullet"/>
-      <w:lvlText w:val="○"/>
-      <w:lvlJc w:val="left"/>
-      <w:pPr>
-        <w:ind w:left="3600" w:hanging="360"/>
-      </w:pPr>
-    </w:lvl>
-    <w:lvl w:ilvl="5" w:tplc="D8EC8438" w:tentative="1">
-      <w:start w:val="1"/>
-      <w:numFmt w:val="bullet"/>
-      <w:lvlText w:val="■"/>
-      <w:lvlJc w:val="left"/>
-      <w:pPr>
-        <w:ind w:left="4320" w:hanging="360"/>
-      </w:pPr>
-    </w:lvl>
-    <w:lvl w:ilvl="6" w:tplc="F3EA0864" w:tentative="1">
-      <w:start w:val="1"/>
-      <w:numFmt w:val="bullet"/>
-      <w:lvlText w:val="●"/>
-      <w:lvlJc w:val="left"/>
-      <w:pPr>
-        <w:ind w:left="5040" w:hanging="360"/>
-      </w:pPr>
-    </w:lvl>
-    <w:lvl w:ilvl="7" w:tplc="4B22CFBC" w:tentative="1">
-      <w:start w:val="1"/>
-      <w:numFmt w:val="bullet"/>
-      <w:lvlText w:val="●"/>
-      <w:lvlJc w:val="left"/>
-      <w:pPr>
-        <w:ind w:left="5760" w:hanging="360"/>
-      </w:pPr>
-    </w:lvl>
-    <w:lvl w:ilvl="8" w:tplc="1CF40D26" w:tentative="1">
-      <w:start w:val="1"/>
-      <w:numFmt w:val="bullet"/>
-      <w:lvlText w:val="●"/>
-      <w:lvlJc w:val="left"/>
-      <w:pPr>
-        <w:ind w:left="6480" w:hanging="360"/>
-      </w:pPr>
-    </w:lvl>
-  </w:abstractNum>
-  <w:abstractNum w:abstractNumId="1" w15:restartNumberingAfterBreak="0">
-    <w:nsid w:val="0AB74575"/>
-    <w:multiLevelType w:val="hybridMultilevel"/>
-    <w:tmpl w:val="BDE47868"/>
-    <w:lvl w:ilvl="0" w:tplc="93F0D608">
+    <w:tmpl w:val="27AC4DF2"/>
+    <w:lvl w:ilvl="0" w:tplc="8CD06F2E">
       <w:start w:val="1"/>
       <w:numFmt w:val="decimal"/>
       <w:lvlText w:val="%1."/>
@@ -23110,52 +22894,138 @@
         <w:ind w:left="400" w:hanging="300"/>
       </w:pPr>
     </w:lvl>
-    <w:lvl w:ilvl="1" w:tplc="89B6B594">
+    <w:lvl w:ilvl="1" w:tplc="C5109002">
       <w:numFmt w:val="decimal"/>
       <w:lvlText w:val=""/>
       <w:lvlJc w:val="left"/>
     </w:lvl>
-    <w:lvl w:ilvl="2" w:tplc="865882FA">
+    <w:lvl w:ilvl="2" w:tplc="26AC13A0">
       <w:numFmt w:val="decimal"/>
       <w:lvlText w:val=""/>
       <w:lvlJc w:val="left"/>
     </w:lvl>
-    <w:lvl w:ilvl="3" w:tplc="59F2F8E2">
+    <w:lvl w:ilvl="3" w:tplc="611AAE86">
       <w:numFmt w:val="decimal"/>
       <w:lvlText w:val=""/>
       <w:lvlJc w:val="left"/>
     </w:lvl>
-    <w:lvl w:ilvl="4" w:tplc="898EAE62">
+    <w:lvl w:ilvl="4" w:tplc="BD8AD3A0">
       <w:numFmt w:val="decimal"/>
       <w:lvlText w:val=""/>
       <w:lvlJc w:val="left"/>
     </w:lvl>
-    <w:lvl w:ilvl="5" w:tplc="86ECA9D0">
+    <w:lvl w:ilvl="5" w:tplc="1792BAD4">
       <w:numFmt w:val="decimal"/>
       <w:lvlText w:val=""/>
       <w:lvlJc w:val="left"/>
     </w:lvl>
-    <w:lvl w:ilvl="6" w:tplc="2D64C748">
+    <w:lvl w:ilvl="6" w:tplc="F13E7CDC">
       <w:numFmt w:val="decimal"/>
       <w:lvlText w:val=""/>
       <w:lvlJc w:val="left"/>
     </w:lvl>
-    <w:lvl w:ilvl="7" w:tplc="C08C6D90">
+    <w:lvl w:ilvl="7" w:tplc="90ACBB40">
       <w:numFmt w:val="decimal"/>
       <w:lvlText w:val=""/>
       <w:lvlJc w:val="left"/>
     </w:lvl>
-    <w:lvl w:ilvl="8" w:tplc="8EEC7562">
+    <w:lvl w:ilvl="8" w:tplc="1174F340">
       <w:numFmt w:val="decimal"/>
       <w:lvlText w:val=""/>
       <w:lvlJc w:val="left"/>
     </w:lvl>
   </w:abstractNum>
+  <w:abstractNum w:abstractNumId="1" w15:restartNumberingAfterBreak="0">
+    <w:nsid w:val="1AF440C7"/>
+    <w:multiLevelType w:val="hybridMultilevel"/>
+    <w:tmpl w:val="8A76347E"/>
+    <w:lvl w:ilvl="0" w:tplc="2BEA2222" w:tentative="1">
+      <w:start w:val="1"/>
+      <w:numFmt w:val="bullet"/>
+      <w:lvlText w:val="●"/>
+      <w:lvlJc w:val="left"/>
+      <w:pPr>
+        <w:ind w:left="720" w:hanging="360"/>
+      </w:pPr>
+    </w:lvl>
+    <w:lvl w:ilvl="1" w:tplc="EAFC7BB2" w:tentative="1">
+      <w:start w:val="1"/>
+      <w:numFmt w:val="bullet"/>
+      <w:lvlText w:val="○"/>
+      <w:lvlJc w:val="left"/>
+      <w:pPr>
+        <w:ind w:left="1440" w:hanging="360"/>
+      </w:pPr>
+    </w:lvl>
+    <w:lvl w:ilvl="2" w:tplc="C41AC5E6" w:tentative="1">
+      <w:start w:val="1"/>
+      <w:numFmt w:val="bullet"/>
+      <w:lvlText w:val="■"/>
+      <w:lvlJc w:val="left"/>
+      <w:pPr>
+        <w:ind w:left="2160" w:hanging="360"/>
+      </w:pPr>
+    </w:lvl>
+    <w:lvl w:ilvl="3" w:tplc="A7304EA0" w:tentative="1">
+      <w:start w:val="1"/>
+      <w:numFmt w:val="bullet"/>
+      <w:lvlText w:val="●"/>
+      <w:lvlJc w:val="left"/>
+      <w:pPr>
+        <w:ind w:left="2880" w:hanging="360"/>
+      </w:pPr>
+    </w:lvl>
+    <w:lvl w:ilvl="4" w:tplc="E1CE357E" w:tentative="1">
+      <w:start w:val="1"/>
+      <w:numFmt w:val="bullet"/>
+      <w:lvlText w:val="○"/>
+      <w:lvlJc w:val="left"/>
+      <w:pPr>
+        <w:ind w:left="3600" w:hanging="360"/>
+      </w:pPr>
+    </w:lvl>
+    <w:lvl w:ilvl="5" w:tplc="92E270AE" w:tentative="1">
+      <w:start w:val="1"/>
+      <w:numFmt w:val="bullet"/>
+      <w:lvlText w:val="■"/>
+      <w:lvlJc w:val="left"/>
+      <w:pPr>
+        <w:ind w:left="4320" w:hanging="360"/>
+      </w:pPr>
+    </w:lvl>
+    <w:lvl w:ilvl="6" w:tplc="589CC930" w:tentative="1">
+      <w:start w:val="1"/>
+      <w:numFmt w:val="bullet"/>
+      <w:lvlText w:val="●"/>
+      <w:lvlJc w:val="left"/>
+      <w:pPr>
+        <w:ind w:left="5040" w:hanging="360"/>
+      </w:pPr>
+    </w:lvl>
+    <w:lvl w:ilvl="7" w:tplc="D4B49D2C" w:tentative="1">
+      <w:start w:val="1"/>
+      <w:numFmt w:val="bullet"/>
+      <w:lvlText w:val="●"/>
+      <w:lvlJc w:val="left"/>
+      <w:pPr>
+        <w:ind w:left="5760" w:hanging="360"/>
+      </w:pPr>
+    </w:lvl>
+    <w:lvl w:ilvl="8" w:tplc="26DE67C6" w:tentative="1">
+      <w:start w:val="1"/>
+      <w:numFmt w:val="bullet"/>
+      <w:lvlText w:val="●"/>
+      <w:lvlJc w:val="left"/>
+      <w:pPr>
+        <w:ind w:left="6480" w:hanging="360"/>
+      </w:pPr>
+    </w:lvl>
+  </w:abstractNum>
   <w:abstractNum w:abstractNumId="2" w15:restartNumberingAfterBreak="0">
-    <w:nsid w:val="177F1209"/>
+    <w:nsid w:val="39077D68"/>
     <w:multiLevelType w:val="hybridMultilevel"/>
-    <w:tmpl w:val="33E8CB34"/>
-    <w:lvl w:ilvl="0" w:tplc="471C6E3C">
+    <w:tmpl w:val="B3E62726"/>
+    <w:lvl w:ilvl="0" w:tplc="50506B10">
       <w:start w:val="1"/>
       <w:numFmt w:val="decimal"/>
       <w:lvlText w:val="%1."/>
@@ -23164,181 +23034,181 @@
         <w:ind w:left="400" w:hanging="300"/>
       </w:pPr>
     </w:lvl>
-    <w:lvl w:ilvl="1" w:tplc="4C3AB36A">
+    <w:lvl w:ilvl="1" w:tplc="B5C26058">
       <w:numFmt w:val="decimal"/>
       <w:lvlText w:val=""/>
       <w:lvlJc w:val="left"/>
     </w:lvl>
-    <w:lvl w:ilvl="2" w:tplc="9300CCBC">
+    <w:lvl w:ilvl="2" w:tplc="7346C2CA">
       <w:numFmt w:val="decimal"/>
       <w:lvlText w:val=""/>
       <w:lvlJc w:val="left"/>
     </w:lvl>
-    <w:lvl w:ilvl="3" w:tplc="E53A7A74">
+    <w:lvl w:ilvl="3" w:tplc="55A4E1D6">
       <w:numFmt w:val="decimal"/>
       <w:lvlText w:val=""/>
       <w:lvlJc w:val="left"/>
     </w:lvl>
-    <w:lvl w:ilvl="4" w:tplc="51EE6B16">
+    <w:lvl w:ilvl="4" w:tplc="73D2DC24">
       <w:numFmt w:val="decimal"/>
       <w:lvlText w:val=""/>
       <w:lvlJc w:val="left"/>
     </w:lvl>
-    <w:lvl w:ilvl="5" w:tplc="8A6E0F42">
+    <w:lvl w:ilvl="5" w:tplc="CD362662">
       <w:numFmt w:val="decimal"/>
       <w:lvlText w:val=""/>
       <w:lvlJc w:val="left"/>
     </w:lvl>
-    <w:lvl w:ilvl="6" w:tplc="C9AC8876">
+    <w:lvl w:ilvl="6" w:tplc="EE5600FA">
       <w:numFmt w:val="decimal"/>
       <w:lvlText w:val=""/>
       <w:lvlJc w:val="left"/>
     </w:lvl>
-    <w:lvl w:ilvl="7" w:tplc="AD8EA204">
+    <w:lvl w:ilvl="7" w:tplc="B39299C6">
       <w:numFmt w:val="decimal"/>
       <w:lvlText w:val=""/>
       <w:lvlJc w:val="left"/>
     </w:lvl>
-    <w:lvl w:ilvl="8" w:tplc="DE586C3A">
+    <w:lvl w:ilvl="8" w:tplc="D7A8EFE6">
       <w:numFmt w:val="decimal"/>
       <w:lvlText w:val=""/>
       <w:lvlJc w:val="left"/>
     </w:lvl>
   </w:abstractNum>
   <w:abstractNum w:abstractNumId="3" w15:restartNumberingAfterBreak="0">
-    <w:nsid w:val="2573682C"/>
+    <w:nsid w:val="53D67EF3"/>
     <w:multiLevelType w:val="hybridMultilevel"/>
-    <w:tmpl w:val="4A9CB994"/>
-    <w:lvl w:ilvl="0" w:tplc="18305880">
+    <w:tmpl w:val="2DA6C926"/>
+    <w:lvl w:ilvl="0" w:tplc="6C101102">
       <w:start w:val="1"/>
-      <w:numFmt w:val="bullet"/>
-      <w:lvlText w:val="•"/>
+      <w:numFmt w:val="decimal"/>
+      <w:lvlText w:val="%1."/>
       <w:lvlJc w:val="left"/>
       <w:pPr>
-        <w:ind w:left="400" w:hanging="260"/>
+        <w:ind w:left="400" w:hanging="300"/>
       </w:pPr>
     </w:lvl>
-    <w:lvl w:ilvl="1" w:tplc="AC0E3BDA">
+    <w:lvl w:ilvl="1" w:tplc="BB9E210C">
       <w:numFmt w:val="decimal"/>
       <w:lvlText w:val=""/>
       <w:lvlJc w:val="left"/>
     </w:lvl>
-    <w:lvl w:ilvl="2" w:tplc="8674B4CA">
+    <w:lvl w:ilvl="2" w:tplc="0E58855C">
       <w:numFmt w:val="decimal"/>
       <w:lvlText w:val=""/>
       <w:lvlJc w:val="left"/>
     </w:lvl>
-    <w:lvl w:ilvl="3" w:tplc="4168B1DC">
+    <w:lvl w:ilvl="3" w:tplc="9DD470B2">
       <w:numFmt w:val="decimal"/>
       <w:lvlText w:val=""/>
       <w:lvlJc w:val="left"/>
     </w:lvl>
-    <w:lvl w:ilvl="4" w:tplc="BBEA7018">
+    <w:lvl w:ilvl="4" w:tplc="D1CAF380">
       <w:numFmt w:val="decimal"/>
       <w:lvlText w:val=""/>
       <w:lvlJc w:val="left"/>
     </w:lvl>
-    <w:lvl w:ilvl="5" w:tplc="A0AC8724">
+    <w:lvl w:ilvl="5" w:tplc="F8CC67A8">
       <w:numFmt w:val="decimal"/>
       <w:lvlText w:val=""/>
       <w:lvlJc w:val="left"/>
     </w:lvl>
-    <w:lvl w:ilvl="6" w:tplc="1792B258">
+    <w:lvl w:ilvl="6" w:tplc="11BCB6A4">
       <w:numFmt w:val="decimal"/>
       <w:lvlText w:val=""/>
       <w:lvlJc w:val="left"/>
     </w:lvl>
-    <w:lvl w:ilvl="7" w:tplc="4F2C9B14">
+    <w:lvl w:ilvl="7" w:tplc="432A257C">
       <w:numFmt w:val="decimal"/>
       <w:lvlText w:val=""/>
       <w:lvlJc w:val="left"/>
     </w:lvl>
-    <w:lvl w:ilvl="8" w:tplc="B74C7134">
+    <w:lvl w:ilvl="8" w:tplc="7396D4CC">
       <w:numFmt w:val="decimal"/>
       <w:lvlText w:val=""/>
       <w:lvlJc w:val="left"/>
     </w:lvl>
   </w:abstractNum>
   <w:abstractNum w:abstractNumId="4" w15:restartNumberingAfterBreak="0">
-    <w:nsid w:val="3A0D4306"/>
+    <w:nsid w:val="57B20062"/>
     <w:multiLevelType w:val="hybridMultilevel"/>
-    <w:tmpl w:val="0C0A3B9E"/>
-    <w:lvl w:ilvl="0" w:tplc="A352F8C4">
+    <w:tmpl w:val="A79E0C6C"/>
+    <w:lvl w:ilvl="0" w:tplc="EB4EA5E4">
       <w:start w:val="1"/>
-      <w:numFmt w:val="decimal"/>
-      <w:lvlText w:val="%1."/>
+      <w:numFmt w:val="bullet"/>
+      <w:lvlText w:val="•"/>
       <w:lvlJc w:val="left"/>
       <w:pPr>
-        <w:ind w:left="400" w:hanging="300"/>
+        <w:ind w:left="400" w:hanging="260"/>
       </w:pPr>
     </w:lvl>
-    <w:lvl w:ilvl="1" w:tplc="439E61EE">
+    <w:lvl w:ilvl="1" w:tplc="D0365178">
       <w:numFmt w:val="decimal"/>
       <w:lvlText w:val=""/>
       <w:lvlJc w:val="left"/>
     </w:lvl>
-    <w:lvl w:ilvl="2" w:tplc="49C4688E">
+    <w:lvl w:ilvl="2" w:tplc="ECFE590E">
       <w:numFmt w:val="decimal"/>
       <w:lvlText w:val=""/>
       <w:lvlJc w:val="left"/>
     </w:lvl>
-    <w:lvl w:ilvl="3" w:tplc="A91C1E60">
+    <w:lvl w:ilvl="3" w:tplc="C99CF9F8">
       <w:numFmt w:val="decimal"/>
       <w:lvlText w:val=""/>
       <w:lvlJc w:val="left"/>
     </w:lvl>
-    <w:lvl w:ilvl="4" w:tplc="B09CCECC">
+    <w:lvl w:ilvl="4" w:tplc="4672FBD8">
       <w:numFmt w:val="decimal"/>
       <w:lvlText w:val=""/>
       <w:lvlJc w:val="left"/>
     </w:lvl>
-    <w:lvl w:ilvl="5" w:tplc="0744F58A">
+    <w:lvl w:ilvl="5" w:tplc="2A9859CA">
       <w:numFmt w:val="decimal"/>
       <w:lvlText w:val=""/>
       <w:lvlJc w:val="left"/>
     </w:lvl>
-    <w:lvl w:ilvl="6" w:tplc="54129A30">
+    <w:lvl w:ilvl="6" w:tplc="0596947A">
       <w:numFmt w:val="decimal"/>
       <w:lvlText w:val=""/>
       <w:lvlJc w:val="left"/>
     </w:lvl>
-    <w:lvl w:ilvl="7" w:tplc="A7A6255E">
+    <w:lvl w:ilvl="7" w:tplc="79E00058">
       <w:numFmt w:val="decimal"/>
       <w:lvlText w:val=""/>
       <w:lvlJc w:val="left"/>
     </w:lvl>
-    <w:lvl w:ilvl="8" w:tplc="E2AECF88">
+    <w:lvl w:ilvl="8" w:tplc="ADE47F0A">
       <w:numFmt w:val="decimal"/>
       <w:lvlText w:val=""/>
       <w:lvlJc w:val="left"/>
     </w:lvl>
   </w:abstractNum>
-  <w:num w:numId="1" w16cid:durableId="2136829532">
+  <w:num w:numId="1" w16cid:durableId="680199688">
+    <w:abstractNumId w:val="1"/>
+    <w:lvlOverride w:ilvl="0">
+      <w:startOverride w:val="1"/>
+    </w:lvlOverride>
+  </w:num>
+  <w:num w:numId="2" w16cid:durableId="2046825765">
     <w:abstractNumId w:val="0"/>
     <w:lvlOverride w:ilvl="0">
       <w:startOverride w:val="1"/>
     </w:lvlOverride>
   </w:num>
-  <w:num w:numId="2" w16cid:durableId="1133524325">
+  <w:num w:numId="3" w16cid:durableId="1024749155">
     <w:abstractNumId w:val="4"/>
     <w:lvlOverride w:ilvl="0">
       <w:startOverride w:val="1"/>
     </w:lvlOverride>
   </w:num>
-  <w:num w:numId="3" w16cid:durableId="1140654564">
+  <w:num w:numId="4" w16cid:durableId="588075676">
     <w:abstractNumId w:val="3"/>
     <w:lvlOverride w:ilvl="0">
       <w:startOverride w:val="1"/>
     </w:lvlOverride>
   </w:num>
-  <w:num w:numId="4" w16cid:durableId="1392147093">
+  <w:num w:numId="5" w16cid:durableId="509026763">
     <w:abstractNumId w:val="2"/>
-    <w:lvlOverride w:ilvl="0">
-      <w:startOverride w:val="1"/>
-    </w:lvlOverride>
-  </w:num>
-  <w:num w:numId="5" w16cid:durableId="1201355970">
-    <w:abstractNumId w:val="1"/>
     <w:lvlOverride w:ilvl="0">
       <w:startOverride w:val="1"/>
     </w:lvlOverride>
@@ -23978,7 +23848,7 @@
     <w:autoRedefine/>
     <w:uiPriority w:val="39"/>
     <w:unhideWhenUsed/>
-    <w:rsid w:val="00EC48AA"/>
+    <w:rsid w:val="00051EE3"/>
     <w:pPr>
       <w:spacing w:after="100"/>
     </w:pPr>
@@ -23990,7 +23860,7 @@
     <w:autoRedefine/>
     <w:uiPriority w:val="39"/>
     <w:unhideWhenUsed/>
-    <w:rsid w:val="00EC48AA"/>
+    <w:rsid w:val="00051EE3"/>
     <w:pPr>
       <w:spacing w:after="100"/>
       <w:ind w:left="210"/>

</xml_diff>

<commit_message>
Present the two ways to reuse ResNet18, with the first layers frozen in both
</commit_message>
<xml_diff>
--- a/docs/oral_study_guide.docx
+++ b/docs/oral_study_guide.docx
@@ -93,7 +93,7 @@
     <w:sdt>
       <w:sdtPr>
         <w:alias w:val="Contents"/>
-        <w:id w:val="1342278016"/>
+        <w:id w:val="1757172170"/>
       </w:sdtPr>
       <w:sdtEndPr/>
       <w:sdtContent>
@@ -116,7 +116,7 @@
           <w:r>
             <w:fldChar w:fldCharType="separate"/>
           </w:r>
-          <w:hyperlink w:anchor="_Toc243495617" w:history="1">
+          <w:hyperlink w:anchor="_Toc243497814" w:history="1">
             <w:r>
               <w:rPr>
                 <w:rStyle w:val="Lienhypertexte"/>
@@ -140,7 +140,7 @@
               <w:rPr>
                 <w:noProof/>
               </w:rPr>
-              <w:instrText xml:space="preserve"> PAGEREF _Toc243495617 \h </w:instrText>
+              <w:instrText xml:space="preserve"> PAGEREF _Toc243497814 \h </w:instrText>
             </w:r>
             <w:r>
               <w:rPr>
@@ -177,7 +177,7 @@
               <w:noProof/>
             </w:rPr>
           </w:pPr>
-          <w:hyperlink w:anchor="_Toc243495618" w:history="1">
+          <w:hyperlink w:anchor="_Toc243497815" w:history="1">
             <w:r>
               <w:rPr>
                 <w:rStyle w:val="Lienhypertexte"/>
@@ -201,7 +201,7 @@
               <w:rPr>
                 <w:noProof/>
               </w:rPr>
-              <w:instrText xml:space="preserve"> PAGEREF _Toc243495618 \h </w:instrText>
+              <w:instrText xml:space="preserve"> PAGEREF _Toc243497815 \h </w:instrText>
             </w:r>
             <w:r>
               <w:rPr>
@@ -238,7 +238,7 @@
               <w:noProof/>
             </w:rPr>
           </w:pPr>
-          <w:hyperlink w:anchor="_Toc243495619" w:history="1">
+          <w:hyperlink w:anchor="_Toc243497816" w:history="1">
             <w:r>
               <w:rPr>
                 <w:rStyle w:val="Lienhypertexte"/>
@@ -262,7 +262,7 @@
               <w:rPr>
                 <w:noProof/>
               </w:rPr>
-              <w:instrText xml:space="preserve"> PAGEREF _Toc243495619 \h </w:instrText>
+              <w:instrText xml:space="preserve"> PAGEREF _Toc243497816 \h </w:instrText>
             </w:r>
             <w:r>
               <w:rPr>
@@ -299,7 +299,7 @@
               <w:noProof/>
             </w:rPr>
           </w:pPr>
-          <w:hyperlink w:anchor="_Toc243495620" w:history="1">
+          <w:hyperlink w:anchor="_Toc243497817" w:history="1">
             <w:r>
               <w:rPr>
                 <w:rStyle w:val="Lienhypertexte"/>
@@ -323,7 +323,7 @@
               <w:rPr>
                 <w:noProof/>
               </w:rPr>
-              <w:instrText xml:space="preserve"> PAGEREF _Toc243495620 \h </w:instrText>
+              <w:instrText xml:space="preserve"> PAGEREF _Toc243497817 \h </w:instrText>
             </w:r>
             <w:r>
               <w:rPr>
@@ -360,7 +360,7 @@
               <w:noProof/>
             </w:rPr>
           </w:pPr>
-          <w:hyperlink w:anchor="_Toc243495621" w:history="1">
+          <w:hyperlink w:anchor="_Toc243497818" w:history="1">
             <w:r>
               <w:rPr>
                 <w:rStyle w:val="Lienhypertexte"/>
@@ -384,7 +384,7 @@
               <w:rPr>
                 <w:noProof/>
               </w:rPr>
-              <w:instrText xml:space="preserve"> PAGEREF _Toc243495621 \h </w:instrText>
+              <w:instrText xml:space="preserve"> PAGEREF _Toc243497818 \h </w:instrText>
             </w:r>
             <w:r>
               <w:rPr>
@@ -421,7 +421,7 @@
               <w:noProof/>
             </w:rPr>
           </w:pPr>
-          <w:hyperlink w:anchor="_Toc243495622" w:history="1">
+          <w:hyperlink w:anchor="_Toc243497819" w:history="1">
             <w:r>
               <w:rPr>
                 <w:rStyle w:val="Lienhypertexte"/>
@@ -445,7 +445,7 @@
               <w:rPr>
                 <w:noProof/>
               </w:rPr>
-              <w:instrText xml:space="preserve"> PAGEREF _Toc243495622 \h </w:instrText>
+              <w:instrText xml:space="preserve"> PAGEREF _Toc243497819 \h </w:instrText>
             </w:r>
             <w:r>
               <w:rPr>
@@ -482,7 +482,7 @@
               <w:noProof/>
             </w:rPr>
           </w:pPr>
-          <w:hyperlink w:anchor="_Toc243495623" w:history="1">
+          <w:hyperlink w:anchor="_Toc243497820" w:history="1">
             <w:r>
               <w:rPr>
                 <w:rStyle w:val="Lienhypertexte"/>
@@ -506,7 +506,7 @@
               <w:rPr>
                 <w:noProof/>
               </w:rPr>
-              <w:instrText xml:space="preserve"> PAGEREF _Toc243495623 \h </w:instrText>
+              <w:instrText xml:space="preserve"> PAGEREF _Toc243497820 \h </w:instrText>
             </w:r>
             <w:r>
               <w:rPr>
@@ -543,7 +543,7 @@
               <w:noProof/>
             </w:rPr>
           </w:pPr>
-          <w:hyperlink w:anchor="_Toc243495624" w:history="1">
+          <w:hyperlink w:anchor="_Toc243497821" w:history="1">
             <w:r>
               <w:rPr>
                 <w:rStyle w:val="Lienhypertexte"/>
@@ -567,7 +567,7 @@
               <w:rPr>
                 <w:noProof/>
               </w:rPr>
-              <w:instrText xml:space="preserve"> PAGEREF _Toc243495624 \h </w:instrText>
+              <w:instrText xml:space="preserve"> PAGEREF _Toc243497821 \h </w:instrText>
             </w:r>
             <w:r>
               <w:rPr>
@@ -604,7 +604,7 @@
               <w:noProof/>
             </w:rPr>
           </w:pPr>
-          <w:hyperlink w:anchor="_Toc243495625" w:history="1">
+          <w:hyperlink w:anchor="_Toc243497822" w:history="1">
             <w:r>
               <w:rPr>
                 <w:rStyle w:val="Lienhypertexte"/>
@@ -628,7 +628,7 @@
               <w:rPr>
                 <w:noProof/>
               </w:rPr>
-              <w:instrText xml:space="preserve"> PAGEREF _Toc243495625 \h </w:instrText>
+              <w:instrText xml:space="preserve"> PAGEREF _Toc243497822 \h </w:instrText>
             </w:r>
             <w:r>
               <w:rPr>
@@ -665,7 +665,7 @@
               <w:noProof/>
             </w:rPr>
           </w:pPr>
-          <w:hyperlink w:anchor="_Toc243495626" w:history="1">
+          <w:hyperlink w:anchor="_Toc243497823" w:history="1">
             <w:r>
               <w:rPr>
                 <w:rStyle w:val="Lienhypertexte"/>
@@ -689,7 +689,7 @@
               <w:rPr>
                 <w:noProof/>
               </w:rPr>
-              <w:instrText xml:space="preserve"> PAGEREF _Toc243495626 \h </w:instrText>
+              <w:instrText xml:space="preserve"> PAGEREF _Toc243497823 \h </w:instrText>
             </w:r>
             <w:r>
               <w:rPr>
@@ -726,7 +726,7 @@
               <w:noProof/>
             </w:rPr>
           </w:pPr>
-          <w:hyperlink w:anchor="_Toc243495627" w:history="1">
+          <w:hyperlink w:anchor="_Toc243497824" w:history="1">
             <w:r>
               <w:rPr>
                 <w:rStyle w:val="Lienhypertexte"/>
@@ -750,7 +750,7 @@
               <w:rPr>
                 <w:noProof/>
               </w:rPr>
-              <w:instrText xml:space="preserve"> PAGEREF _Toc243495627 \h </w:instrText>
+              <w:instrText xml:space="preserve"> PAGEREF _Toc243497824 \h </w:instrText>
             </w:r>
             <w:r>
               <w:rPr>
@@ -787,7 +787,7 @@
               <w:noProof/>
             </w:rPr>
           </w:pPr>
-          <w:hyperlink w:anchor="_Toc243495628" w:history="1">
+          <w:hyperlink w:anchor="_Toc243497825" w:history="1">
             <w:r>
               <w:rPr>
                 <w:rStyle w:val="Lienhypertexte"/>
@@ -811,7 +811,7 @@
               <w:rPr>
                 <w:noProof/>
               </w:rPr>
-              <w:instrText xml:space="preserve"> PAGEREF _Toc243495628 \h </w:instrText>
+              <w:instrText xml:space="preserve"> PAGEREF _Toc243497825 \h </w:instrText>
             </w:r>
             <w:r>
               <w:rPr>
@@ -848,7 +848,7 @@
               <w:noProof/>
             </w:rPr>
           </w:pPr>
-          <w:hyperlink w:anchor="_Toc243495629" w:history="1">
+          <w:hyperlink w:anchor="_Toc243497826" w:history="1">
             <w:r>
               <w:rPr>
                 <w:rStyle w:val="Lienhypertexte"/>
@@ -872,7 +872,7 @@
               <w:rPr>
                 <w:noProof/>
               </w:rPr>
-              <w:instrText xml:space="preserve"> PAGEREF _Toc243495629 \h </w:instrText>
+              <w:instrText xml:space="preserve"> PAGEREF _Toc243497826 \h </w:instrText>
             </w:r>
             <w:r>
               <w:rPr>
@@ -909,7 +909,7 @@
               <w:noProof/>
             </w:rPr>
           </w:pPr>
-          <w:hyperlink w:anchor="_Toc243495630" w:history="1">
+          <w:hyperlink w:anchor="_Toc243497827" w:history="1">
             <w:r>
               <w:rPr>
                 <w:rStyle w:val="Lienhypertexte"/>
@@ -933,7 +933,7 @@
               <w:rPr>
                 <w:noProof/>
               </w:rPr>
-              <w:instrText xml:space="preserve"> PAGEREF _Toc243495630 \h </w:instrText>
+              <w:instrText xml:space="preserve"> PAGEREF _Toc243497827 \h </w:instrText>
             </w:r>
             <w:r>
               <w:rPr>
@@ -970,7 +970,7 @@
               <w:noProof/>
             </w:rPr>
           </w:pPr>
-          <w:hyperlink w:anchor="_Toc243495631" w:history="1">
+          <w:hyperlink w:anchor="_Toc243497828" w:history="1">
             <w:r>
               <w:rPr>
                 <w:rStyle w:val="Lienhypertexte"/>
@@ -994,7 +994,7 @@
               <w:rPr>
                 <w:noProof/>
               </w:rPr>
-              <w:instrText xml:space="preserve"> PAGEREF _Toc243495631 \h </w:instrText>
+              <w:instrText xml:space="preserve"> PAGEREF _Toc243497828 \h </w:instrText>
             </w:r>
             <w:r>
               <w:rPr>
@@ -1031,7 +1031,7 @@
               <w:noProof/>
             </w:rPr>
           </w:pPr>
-          <w:hyperlink w:anchor="_Toc243495632" w:history="1">
+          <w:hyperlink w:anchor="_Toc243497829" w:history="1">
             <w:r>
               <w:rPr>
                 <w:rStyle w:val="Lienhypertexte"/>
@@ -1055,7 +1055,7 @@
               <w:rPr>
                 <w:noProof/>
               </w:rPr>
-              <w:instrText xml:space="preserve"> PAGEREF _Toc243495632 \h </w:instrText>
+              <w:instrText xml:space="preserve"> PAGEREF _Toc243497829 \h </w:instrText>
             </w:r>
             <w:r>
               <w:rPr>
@@ -1092,7 +1092,7 @@
               <w:noProof/>
             </w:rPr>
           </w:pPr>
-          <w:hyperlink w:anchor="_Toc243495633" w:history="1">
+          <w:hyperlink w:anchor="_Toc243497830" w:history="1">
             <w:r>
               <w:rPr>
                 <w:rStyle w:val="Lienhypertexte"/>
@@ -1116,7 +1116,7 @@
               <w:rPr>
                 <w:noProof/>
               </w:rPr>
-              <w:instrText xml:space="preserve"> PAGEREF _Toc243495633 \h </w:instrText>
+              <w:instrText xml:space="preserve"> PAGEREF _Toc243497830 \h </w:instrText>
             </w:r>
             <w:r>
               <w:rPr>
@@ -1153,7 +1153,7 @@
               <w:noProof/>
             </w:rPr>
           </w:pPr>
-          <w:hyperlink w:anchor="_Toc243495634" w:history="1">
+          <w:hyperlink w:anchor="_Toc243497831" w:history="1">
             <w:r>
               <w:rPr>
                 <w:rStyle w:val="Lienhypertexte"/>
@@ -1177,7 +1177,7 @@
               <w:rPr>
                 <w:noProof/>
               </w:rPr>
-              <w:instrText xml:space="preserve"> PAGEREF _Toc243495634 \h </w:instrText>
+              <w:instrText xml:space="preserve"> PAGEREF _Toc243497831 \h </w:instrText>
             </w:r>
             <w:r>
               <w:rPr>
@@ -1214,7 +1214,7 @@
               <w:noProof/>
             </w:rPr>
           </w:pPr>
-          <w:hyperlink w:anchor="_Toc243495635" w:history="1">
+          <w:hyperlink w:anchor="_Toc243497832" w:history="1">
             <w:r>
               <w:rPr>
                 <w:rStyle w:val="Lienhypertexte"/>
@@ -1238,7 +1238,7 @@
               <w:rPr>
                 <w:noProof/>
               </w:rPr>
-              <w:instrText xml:space="preserve"> PAGEREF _Toc243495635 \h </w:instrText>
+              <w:instrText xml:space="preserve"> PAGEREF _Toc243497832 \h </w:instrText>
             </w:r>
             <w:r>
               <w:rPr>
@@ -1275,7 +1275,7 @@
               <w:noProof/>
             </w:rPr>
           </w:pPr>
-          <w:hyperlink w:anchor="_Toc243495636" w:history="1">
+          <w:hyperlink w:anchor="_Toc243497833" w:history="1">
             <w:r>
               <w:rPr>
                 <w:rStyle w:val="Lienhypertexte"/>
@@ -1299,7 +1299,7 @@
               <w:rPr>
                 <w:noProof/>
               </w:rPr>
-              <w:instrText xml:space="preserve"> PAGEREF _Toc243495636 \h </w:instrText>
+              <w:instrText xml:space="preserve"> PAGEREF _Toc243497833 \h </w:instrText>
             </w:r>
             <w:r>
               <w:rPr>
@@ -1336,7 +1336,7 @@
               <w:noProof/>
             </w:rPr>
           </w:pPr>
-          <w:hyperlink w:anchor="_Toc243495637" w:history="1">
+          <w:hyperlink w:anchor="_Toc243497834" w:history="1">
             <w:r>
               <w:rPr>
                 <w:rStyle w:val="Lienhypertexte"/>
@@ -1360,7 +1360,7 @@
               <w:rPr>
                 <w:noProof/>
               </w:rPr>
-              <w:instrText xml:space="preserve"> PAGEREF _Toc243495637 \h </w:instrText>
+              <w:instrText xml:space="preserve"> PAGEREF _Toc243497834 \h </w:instrText>
             </w:r>
             <w:r>
               <w:rPr>
@@ -1397,7 +1397,7 @@
               <w:noProof/>
             </w:rPr>
           </w:pPr>
-          <w:hyperlink w:anchor="_Toc243495638" w:history="1">
+          <w:hyperlink w:anchor="_Toc243497835" w:history="1">
             <w:r>
               <w:rPr>
                 <w:rStyle w:val="Lienhypertexte"/>
@@ -1421,7 +1421,7 @@
               <w:rPr>
                 <w:noProof/>
               </w:rPr>
-              <w:instrText xml:space="preserve"> PAGEREF _Toc243495638 \h </w:instrText>
+              <w:instrText xml:space="preserve"> PAGEREF _Toc243497835 \h </w:instrText>
             </w:r>
             <w:r>
               <w:rPr>
@@ -1458,7 +1458,7 @@
               <w:noProof/>
             </w:rPr>
           </w:pPr>
-          <w:hyperlink w:anchor="_Toc243495639" w:history="1">
+          <w:hyperlink w:anchor="_Toc243497836" w:history="1">
             <w:r>
               <w:rPr>
                 <w:rStyle w:val="Lienhypertexte"/>
@@ -1482,7 +1482,7 @@
               <w:rPr>
                 <w:noProof/>
               </w:rPr>
-              <w:instrText xml:space="preserve"> PAGEREF _Toc243495639 \h </w:instrText>
+              <w:instrText xml:space="preserve"> PAGEREF _Toc243497836 \h </w:instrText>
             </w:r>
             <w:r>
               <w:rPr>
@@ -1519,7 +1519,7 @@
               <w:noProof/>
             </w:rPr>
           </w:pPr>
-          <w:hyperlink w:anchor="_Toc243495640" w:history="1">
+          <w:hyperlink w:anchor="_Toc243497837" w:history="1">
             <w:r>
               <w:rPr>
                 <w:rStyle w:val="Lienhypertexte"/>
@@ -1543,7 +1543,7 @@
               <w:rPr>
                 <w:noProof/>
               </w:rPr>
-              <w:instrText xml:space="preserve"> PAGEREF _Toc243495640 \h </w:instrText>
+              <w:instrText xml:space="preserve"> PAGEREF _Toc243497837 \h </w:instrText>
             </w:r>
             <w:r>
               <w:rPr>
@@ -1580,7 +1580,7 @@
               <w:noProof/>
             </w:rPr>
           </w:pPr>
-          <w:hyperlink w:anchor="_Toc243495641" w:history="1">
+          <w:hyperlink w:anchor="_Toc243497838" w:history="1">
             <w:r>
               <w:rPr>
                 <w:rStyle w:val="Lienhypertexte"/>
@@ -1604,7 +1604,7 @@
               <w:rPr>
                 <w:noProof/>
               </w:rPr>
-              <w:instrText xml:space="preserve"> PAGEREF _Toc243495641 \h </w:instrText>
+              <w:instrText xml:space="preserve"> PAGEREF _Toc243497838 \h </w:instrText>
             </w:r>
             <w:r>
               <w:rPr>
@@ -1641,7 +1641,7 @@
               <w:noProof/>
             </w:rPr>
           </w:pPr>
-          <w:hyperlink w:anchor="_Toc243495642" w:history="1">
+          <w:hyperlink w:anchor="_Toc243497839" w:history="1">
             <w:r>
               <w:rPr>
                 <w:rStyle w:val="Lienhypertexte"/>
@@ -1665,7 +1665,7 @@
               <w:rPr>
                 <w:noProof/>
               </w:rPr>
-              <w:instrText xml:space="preserve"> PAGEREF _Toc243495642 \h </w:instrText>
+              <w:instrText xml:space="preserve"> PAGEREF _Toc243497839 \h </w:instrText>
             </w:r>
             <w:r>
               <w:rPr>
@@ -1702,7 +1702,7 @@
               <w:noProof/>
             </w:rPr>
           </w:pPr>
-          <w:hyperlink w:anchor="_Toc243495643" w:history="1">
+          <w:hyperlink w:anchor="_Toc243497840" w:history="1">
             <w:r>
               <w:rPr>
                 <w:rStyle w:val="Lienhypertexte"/>
@@ -1726,7 +1726,7 @@
               <w:rPr>
                 <w:noProof/>
               </w:rPr>
-              <w:instrText xml:space="preserve"> PAGEREF _Toc243495643 \h </w:instrText>
+              <w:instrText xml:space="preserve"> PAGEREF _Toc243497840 \h </w:instrText>
             </w:r>
             <w:r>
               <w:rPr>
@@ -1763,7 +1763,7 @@
               <w:noProof/>
             </w:rPr>
           </w:pPr>
-          <w:hyperlink w:anchor="_Toc243495644" w:history="1">
+          <w:hyperlink w:anchor="_Toc243497841" w:history="1">
             <w:r>
               <w:rPr>
                 <w:rStyle w:val="Lienhypertexte"/>
@@ -1787,7 +1787,7 @@
               <w:rPr>
                 <w:noProof/>
               </w:rPr>
-              <w:instrText xml:space="preserve"> PAGEREF _Toc243495644 \h </w:instrText>
+              <w:instrText xml:space="preserve"> PAGEREF _Toc243497841 \h </w:instrText>
             </w:r>
             <w:r>
               <w:rPr>
@@ -1824,7 +1824,7 @@
               <w:noProof/>
             </w:rPr>
           </w:pPr>
-          <w:hyperlink w:anchor="_Toc243495645" w:history="1">
+          <w:hyperlink w:anchor="_Toc243497842" w:history="1">
             <w:r>
               <w:rPr>
                 <w:rStyle w:val="Lienhypertexte"/>
@@ -1848,7 +1848,7 @@
               <w:rPr>
                 <w:noProof/>
               </w:rPr>
-              <w:instrText xml:space="preserve"> PAGEREF _Toc243495645 \h </w:instrText>
+              <w:instrText xml:space="preserve"> PAGEREF _Toc243497842 \h </w:instrText>
             </w:r>
             <w:r>
               <w:rPr>
@@ -1885,7 +1885,7 @@
               <w:noProof/>
             </w:rPr>
           </w:pPr>
-          <w:hyperlink w:anchor="_Toc243495646" w:history="1">
+          <w:hyperlink w:anchor="_Toc243497843" w:history="1">
             <w:r>
               <w:rPr>
                 <w:rStyle w:val="Lienhypertexte"/>
@@ -1909,7 +1909,7 @@
               <w:rPr>
                 <w:noProof/>
               </w:rPr>
-              <w:instrText xml:space="preserve"> PAGEREF _Toc243495646 \h </w:instrText>
+              <w:instrText xml:space="preserve"> PAGEREF _Toc243497843 \h </w:instrText>
             </w:r>
             <w:r>
               <w:rPr>
@@ -1946,7 +1946,7 @@
               <w:noProof/>
             </w:rPr>
           </w:pPr>
-          <w:hyperlink w:anchor="_Toc243495647" w:history="1">
+          <w:hyperlink w:anchor="_Toc243497844" w:history="1">
             <w:r>
               <w:rPr>
                 <w:rStyle w:val="Lienhypertexte"/>
@@ -1970,7 +1970,7 @@
               <w:rPr>
                 <w:noProof/>
               </w:rPr>
-              <w:instrText xml:space="preserve"> PAGEREF _Toc243495647 \h </w:instrText>
+              <w:instrText xml:space="preserve"> PAGEREF _Toc243497844 \h </w:instrText>
             </w:r>
             <w:r>
               <w:rPr>
@@ -2007,7 +2007,7 @@
               <w:noProof/>
             </w:rPr>
           </w:pPr>
-          <w:hyperlink w:anchor="_Toc243495648" w:history="1">
+          <w:hyperlink w:anchor="_Toc243497845" w:history="1">
             <w:r>
               <w:rPr>
                 <w:rStyle w:val="Lienhypertexte"/>
@@ -2031,7 +2031,7 @@
               <w:rPr>
                 <w:noProof/>
               </w:rPr>
-              <w:instrText xml:space="preserve"> PAGEREF _Toc243495648 \h </w:instrText>
+              <w:instrText xml:space="preserve"> PAGEREF _Toc243497845 \h </w:instrText>
             </w:r>
             <w:r>
               <w:rPr>
@@ -2068,7 +2068,7 @@
               <w:noProof/>
             </w:rPr>
           </w:pPr>
-          <w:hyperlink w:anchor="_Toc243495649" w:history="1">
+          <w:hyperlink w:anchor="_Toc243497846" w:history="1">
             <w:r>
               <w:rPr>
                 <w:rStyle w:val="Lienhypertexte"/>
@@ -2092,7 +2092,7 @@
               <w:rPr>
                 <w:noProof/>
               </w:rPr>
-              <w:instrText xml:space="preserve"> PAGEREF _Toc243495649 \h </w:instrText>
+              <w:instrText xml:space="preserve"> PAGEREF _Toc243497846 \h </w:instrText>
             </w:r>
             <w:r>
               <w:rPr>
@@ -2129,7 +2129,7 @@
               <w:noProof/>
             </w:rPr>
           </w:pPr>
-          <w:hyperlink w:anchor="_Toc243495650" w:history="1">
+          <w:hyperlink w:anchor="_Toc243497847" w:history="1">
             <w:r>
               <w:rPr>
                 <w:rStyle w:val="Lienhypertexte"/>
@@ -2153,7 +2153,7 @@
               <w:rPr>
                 <w:noProof/>
               </w:rPr>
-              <w:instrText xml:space="preserve"> PAGEREF _Toc243495650 \h </w:instrText>
+              <w:instrText xml:space="preserve"> PAGEREF _Toc243497847 \h </w:instrText>
             </w:r>
             <w:r>
               <w:rPr>
@@ -2190,7 +2190,7 @@
               <w:noProof/>
             </w:rPr>
           </w:pPr>
-          <w:hyperlink w:anchor="_Toc243495651" w:history="1">
+          <w:hyperlink w:anchor="_Toc243497848" w:history="1">
             <w:r>
               <w:rPr>
                 <w:rStyle w:val="Lienhypertexte"/>
@@ -2214,7 +2214,7 @@
               <w:rPr>
                 <w:noProof/>
               </w:rPr>
-              <w:instrText xml:space="preserve"> PAGEREF _Toc243495651 \h </w:instrText>
+              <w:instrText xml:space="preserve"> PAGEREF _Toc243497848 \h </w:instrText>
             </w:r>
             <w:r>
               <w:rPr>
@@ -2251,7 +2251,7 @@
               <w:noProof/>
             </w:rPr>
           </w:pPr>
-          <w:hyperlink w:anchor="_Toc243495652" w:history="1">
+          <w:hyperlink w:anchor="_Toc243497849" w:history="1">
             <w:r>
               <w:rPr>
                 <w:rStyle w:val="Lienhypertexte"/>
@@ -2275,7 +2275,7 @@
               <w:rPr>
                 <w:noProof/>
               </w:rPr>
-              <w:instrText xml:space="preserve"> PAGEREF _Toc243495652 \h </w:instrText>
+              <w:instrText xml:space="preserve"> PAGEREF _Toc243497849 \h </w:instrText>
             </w:r>
             <w:r>
               <w:rPr>
@@ -2312,7 +2312,7 @@
               <w:noProof/>
             </w:rPr>
           </w:pPr>
-          <w:hyperlink w:anchor="_Toc243495653" w:history="1">
+          <w:hyperlink w:anchor="_Toc243497850" w:history="1">
             <w:r>
               <w:rPr>
                 <w:rStyle w:val="Lienhypertexte"/>
@@ -2336,7 +2336,7 @@
               <w:rPr>
                 <w:noProof/>
               </w:rPr>
-              <w:instrText xml:space="preserve"> PAGEREF _Toc243495653 \h </w:instrText>
+              <w:instrText xml:space="preserve"> PAGEREF _Toc243497850 \h </w:instrText>
             </w:r>
             <w:r>
               <w:rPr>
@@ -2373,7 +2373,7 @@
               <w:noProof/>
             </w:rPr>
           </w:pPr>
-          <w:hyperlink w:anchor="_Toc243495654" w:history="1">
+          <w:hyperlink w:anchor="_Toc243497851" w:history="1">
             <w:r>
               <w:rPr>
                 <w:rStyle w:val="Lienhypertexte"/>
@@ -2397,7 +2397,7 @@
               <w:rPr>
                 <w:noProof/>
               </w:rPr>
-              <w:instrText xml:space="preserve"> PAGEREF _Toc243495654 \h </w:instrText>
+              <w:instrText xml:space="preserve"> PAGEREF _Toc243497851 \h </w:instrText>
             </w:r>
             <w:r>
               <w:rPr>
@@ -2434,7 +2434,7 @@
               <w:noProof/>
             </w:rPr>
           </w:pPr>
-          <w:hyperlink w:anchor="_Toc243495655" w:history="1">
+          <w:hyperlink w:anchor="_Toc243497852" w:history="1">
             <w:r>
               <w:rPr>
                 <w:rStyle w:val="Lienhypertexte"/>
@@ -2458,7 +2458,7 @@
               <w:rPr>
                 <w:noProof/>
               </w:rPr>
-              <w:instrText xml:space="preserve"> PAGEREF _Toc243495655 \h </w:instrText>
+              <w:instrText xml:space="preserve"> PAGEREF _Toc243497852 \h </w:instrText>
             </w:r>
             <w:r>
               <w:rPr>
@@ -2495,7 +2495,7 @@
               <w:noProof/>
             </w:rPr>
           </w:pPr>
-          <w:hyperlink w:anchor="_Toc243495656" w:history="1">
+          <w:hyperlink w:anchor="_Toc243497853" w:history="1">
             <w:r>
               <w:rPr>
                 <w:rStyle w:val="Lienhypertexte"/>
@@ -2519,7 +2519,7 @@
               <w:rPr>
                 <w:noProof/>
               </w:rPr>
-              <w:instrText xml:space="preserve"> PAGEREF _Toc243495656 \h </w:instrText>
+              <w:instrText xml:space="preserve"> PAGEREF _Toc243497853 \h </w:instrText>
             </w:r>
             <w:r>
               <w:rPr>
@@ -2556,7 +2556,7 @@
               <w:noProof/>
             </w:rPr>
           </w:pPr>
-          <w:hyperlink w:anchor="_Toc243495657" w:history="1">
+          <w:hyperlink w:anchor="_Toc243497854" w:history="1">
             <w:r>
               <w:rPr>
                 <w:rStyle w:val="Lienhypertexte"/>
@@ -2580,7 +2580,7 @@
               <w:rPr>
                 <w:noProof/>
               </w:rPr>
-              <w:instrText xml:space="preserve"> PAGEREF _Toc243495657 \h </w:instrText>
+              <w:instrText xml:space="preserve"> PAGEREF _Toc243497854 \h </w:instrText>
             </w:r>
             <w:r>
               <w:rPr>
@@ -2617,7 +2617,7 @@
               <w:noProof/>
             </w:rPr>
           </w:pPr>
-          <w:hyperlink w:anchor="_Toc243495658" w:history="1">
+          <w:hyperlink w:anchor="_Toc243497855" w:history="1">
             <w:r>
               <w:rPr>
                 <w:rStyle w:val="Lienhypertexte"/>
@@ -2641,7 +2641,7 @@
               <w:rPr>
                 <w:noProof/>
               </w:rPr>
-              <w:instrText xml:space="preserve"> PAGEREF _Toc243495658 \h </w:instrText>
+              <w:instrText xml:space="preserve"> PAGEREF _Toc243497855 \h </w:instrText>
             </w:r>
             <w:r>
               <w:rPr>
@@ -2678,7 +2678,7 @@
               <w:noProof/>
             </w:rPr>
           </w:pPr>
-          <w:hyperlink w:anchor="_Toc243495659" w:history="1">
+          <w:hyperlink w:anchor="_Toc243497856" w:history="1">
             <w:r>
               <w:rPr>
                 <w:rStyle w:val="Lienhypertexte"/>
@@ -2702,7 +2702,7 @@
               <w:rPr>
                 <w:noProof/>
               </w:rPr>
-              <w:instrText xml:space="preserve"> PAGEREF _Toc243495659 \h </w:instrText>
+              <w:instrText xml:space="preserve"> PAGEREF _Toc243497856 \h </w:instrText>
             </w:r>
             <w:r>
               <w:rPr>
@@ -2739,7 +2739,7 @@
               <w:noProof/>
             </w:rPr>
           </w:pPr>
-          <w:hyperlink w:anchor="_Toc243495660" w:history="1">
+          <w:hyperlink w:anchor="_Toc243497857" w:history="1">
             <w:r>
               <w:rPr>
                 <w:rStyle w:val="Lienhypertexte"/>
@@ -2763,7 +2763,7 @@
               <w:rPr>
                 <w:noProof/>
               </w:rPr>
-              <w:instrText xml:space="preserve"> PAGEREF _Toc243495660 \h </w:instrText>
+              <w:instrText xml:space="preserve"> PAGEREF _Toc243497857 \h </w:instrText>
             </w:r>
             <w:r>
               <w:rPr>
@@ -2800,7 +2800,7 @@
               <w:noProof/>
             </w:rPr>
           </w:pPr>
-          <w:hyperlink w:anchor="_Toc243495661" w:history="1">
+          <w:hyperlink w:anchor="_Toc243497858" w:history="1">
             <w:r>
               <w:rPr>
                 <w:rStyle w:val="Lienhypertexte"/>
@@ -2824,7 +2824,7 @@
               <w:rPr>
                 <w:noProof/>
               </w:rPr>
-              <w:instrText xml:space="preserve"> PAGEREF _Toc243495661 \h </w:instrText>
+              <w:instrText xml:space="preserve"> PAGEREF _Toc243497858 \h </w:instrText>
             </w:r>
             <w:r>
               <w:rPr>
@@ -2861,7 +2861,7 @@
               <w:noProof/>
             </w:rPr>
           </w:pPr>
-          <w:hyperlink w:anchor="_Toc243495662" w:history="1">
+          <w:hyperlink w:anchor="_Toc243497859" w:history="1">
             <w:r>
               <w:rPr>
                 <w:rStyle w:val="Lienhypertexte"/>
@@ -2885,7 +2885,7 @@
               <w:rPr>
                 <w:noProof/>
               </w:rPr>
-              <w:instrText xml:space="preserve"> PAGEREF _Toc243495662 \h </w:instrText>
+              <w:instrText xml:space="preserve"> PAGEREF _Toc243497859 \h </w:instrText>
             </w:r>
             <w:r>
               <w:rPr>
@@ -2922,7 +2922,7 @@
               <w:noProof/>
             </w:rPr>
           </w:pPr>
-          <w:hyperlink w:anchor="_Toc243495663" w:history="1">
+          <w:hyperlink w:anchor="_Toc243497860" w:history="1">
             <w:r>
               <w:rPr>
                 <w:rStyle w:val="Lienhypertexte"/>
@@ -2946,7 +2946,7 @@
               <w:rPr>
                 <w:noProof/>
               </w:rPr>
-              <w:instrText xml:space="preserve"> PAGEREF _Toc243495663 \h </w:instrText>
+              <w:instrText xml:space="preserve"> PAGEREF _Toc243497860 \h </w:instrText>
             </w:r>
             <w:r>
               <w:rPr>
@@ -2983,7 +2983,7 @@
               <w:noProof/>
             </w:rPr>
           </w:pPr>
-          <w:hyperlink w:anchor="_Toc243495664" w:history="1">
+          <w:hyperlink w:anchor="_Toc243497861" w:history="1">
             <w:r>
               <w:rPr>
                 <w:rStyle w:val="Lienhypertexte"/>
@@ -3007,7 +3007,7 @@
               <w:rPr>
                 <w:noProof/>
               </w:rPr>
-              <w:instrText xml:space="preserve"> PAGEREF _Toc243495664 \h </w:instrText>
+              <w:instrText xml:space="preserve"> PAGEREF _Toc243497861 \h </w:instrText>
             </w:r>
             <w:r>
               <w:rPr>
@@ -3044,7 +3044,7 @@
               <w:noProof/>
             </w:rPr>
           </w:pPr>
-          <w:hyperlink w:anchor="_Toc243495665" w:history="1">
+          <w:hyperlink w:anchor="_Toc243497862" w:history="1">
             <w:r>
               <w:rPr>
                 <w:rStyle w:val="Lienhypertexte"/>
@@ -3068,7 +3068,7 @@
               <w:rPr>
                 <w:noProof/>
               </w:rPr>
-              <w:instrText xml:space="preserve"> PAGEREF _Toc243495665 \h </w:instrText>
+              <w:instrText xml:space="preserve"> PAGEREF _Toc243497862 \h </w:instrText>
             </w:r>
             <w:r>
               <w:rPr>
@@ -3105,7 +3105,7 @@
               <w:noProof/>
             </w:rPr>
           </w:pPr>
-          <w:hyperlink w:anchor="_Toc243495666" w:history="1">
+          <w:hyperlink w:anchor="_Toc243497863" w:history="1">
             <w:r>
               <w:rPr>
                 <w:rStyle w:val="Lienhypertexte"/>
@@ -3129,7 +3129,7 @@
               <w:rPr>
                 <w:noProof/>
               </w:rPr>
-              <w:instrText xml:space="preserve"> PAGEREF _Toc243495666 \h </w:instrText>
+              <w:instrText xml:space="preserve"> PAGEREF _Toc243497863 \h </w:instrText>
             </w:r>
             <w:r>
               <w:rPr>
@@ -3166,7 +3166,7 @@
               <w:noProof/>
             </w:rPr>
           </w:pPr>
-          <w:hyperlink w:anchor="_Toc243495667" w:history="1">
+          <w:hyperlink w:anchor="_Toc243497864" w:history="1">
             <w:r>
               <w:rPr>
                 <w:rStyle w:val="Lienhypertexte"/>
@@ -3190,7 +3190,7 @@
               <w:rPr>
                 <w:noProof/>
               </w:rPr>
-              <w:instrText xml:space="preserve"> PAGEREF _Toc243495667 \h </w:instrText>
+              <w:instrText xml:space="preserve"> PAGEREF _Toc243497864 \h </w:instrText>
             </w:r>
             <w:r>
               <w:rPr>
@@ -3227,7 +3227,7 @@
               <w:noProof/>
             </w:rPr>
           </w:pPr>
-          <w:hyperlink w:anchor="_Toc243495668" w:history="1">
+          <w:hyperlink w:anchor="_Toc243497865" w:history="1">
             <w:r>
               <w:rPr>
                 <w:rStyle w:val="Lienhypertexte"/>
@@ -3251,7 +3251,7 @@
               <w:rPr>
                 <w:noProof/>
               </w:rPr>
-              <w:instrText xml:space="preserve"> PAGEREF _Toc243495668 \h </w:instrText>
+              <w:instrText xml:space="preserve"> PAGEREF _Toc243497865 \h </w:instrText>
             </w:r>
             <w:r>
               <w:rPr>
@@ -3288,7 +3288,7 @@
               <w:noProof/>
             </w:rPr>
           </w:pPr>
-          <w:hyperlink w:anchor="_Toc243495669" w:history="1">
+          <w:hyperlink w:anchor="_Toc243497866" w:history="1">
             <w:r>
               <w:rPr>
                 <w:rStyle w:val="Lienhypertexte"/>
@@ -3312,7 +3312,7 @@
               <w:rPr>
                 <w:noProof/>
               </w:rPr>
-              <w:instrText xml:space="preserve"> PAGEREF _Toc243495669 \h </w:instrText>
+              <w:instrText xml:space="preserve"> PAGEREF _Toc243497866 \h </w:instrText>
             </w:r>
             <w:r>
               <w:rPr>
@@ -3349,7 +3349,7 @@
               <w:noProof/>
             </w:rPr>
           </w:pPr>
-          <w:hyperlink w:anchor="_Toc243495670" w:history="1">
+          <w:hyperlink w:anchor="_Toc243497867" w:history="1">
             <w:r>
               <w:rPr>
                 <w:rStyle w:val="Lienhypertexte"/>
@@ -3373,7 +3373,7 @@
               <w:rPr>
                 <w:noProof/>
               </w:rPr>
-              <w:instrText xml:space="preserve"> PAGEREF _Toc243495670 \h </w:instrText>
+              <w:instrText xml:space="preserve"> PAGEREF _Toc243497867 \h </w:instrText>
             </w:r>
             <w:r>
               <w:rPr>
@@ -3410,7 +3410,7 @@
               <w:noProof/>
             </w:rPr>
           </w:pPr>
-          <w:hyperlink w:anchor="_Toc243495671" w:history="1">
+          <w:hyperlink w:anchor="_Toc243497868" w:history="1">
             <w:r>
               <w:rPr>
                 <w:rStyle w:val="Lienhypertexte"/>
@@ -3434,7 +3434,7 @@
               <w:rPr>
                 <w:noProof/>
               </w:rPr>
-              <w:instrText xml:space="preserve"> PAGEREF _Toc243495671 \h </w:instrText>
+              <w:instrText xml:space="preserve"> PAGEREF _Toc243497868 \h </w:instrText>
             </w:r>
             <w:r>
               <w:rPr>
@@ -3471,7 +3471,7 @@
               <w:noProof/>
             </w:rPr>
           </w:pPr>
-          <w:hyperlink w:anchor="_Toc243495672" w:history="1">
+          <w:hyperlink w:anchor="_Toc243497869" w:history="1">
             <w:r>
               <w:rPr>
                 <w:rStyle w:val="Lienhypertexte"/>
@@ -3495,7 +3495,7 @@
               <w:rPr>
                 <w:noProof/>
               </w:rPr>
-              <w:instrText xml:space="preserve"> PAGEREF _Toc243495672 \h </w:instrText>
+              <w:instrText xml:space="preserve"> PAGEREF _Toc243497869 \h </w:instrText>
             </w:r>
             <w:r>
               <w:rPr>
@@ -3532,7 +3532,7 @@
               <w:noProof/>
             </w:rPr>
           </w:pPr>
-          <w:hyperlink w:anchor="_Toc243495673" w:history="1">
+          <w:hyperlink w:anchor="_Toc243497870" w:history="1">
             <w:r>
               <w:rPr>
                 <w:rStyle w:val="Lienhypertexte"/>
@@ -3556,7 +3556,7 @@
               <w:rPr>
                 <w:noProof/>
               </w:rPr>
-              <w:instrText xml:space="preserve"> PAGEREF _Toc243495673 \h </w:instrText>
+              <w:instrText xml:space="preserve"> PAGEREF _Toc243497870 \h </w:instrText>
             </w:r>
             <w:r>
               <w:rPr>
@@ -3593,7 +3593,7 @@
               <w:noProof/>
             </w:rPr>
           </w:pPr>
-          <w:hyperlink w:anchor="_Toc243495674" w:history="1">
+          <w:hyperlink w:anchor="_Toc243497871" w:history="1">
             <w:r>
               <w:rPr>
                 <w:rStyle w:val="Lienhypertexte"/>
@@ -3617,7 +3617,7 @@
               <w:rPr>
                 <w:noProof/>
               </w:rPr>
-              <w:instrText xml:space="preserve"> PAGEREF _Toc243495674 \h </w:instrText>
+              <w:instrText xml:space="preserve"> PAGEREF _Toc243497871 \h </w:instrText>
             </w:r>
             <w:r>
               <w:rPr>
@@ -3654,7 +3654,7 @@
               <w:noProof/>
             </w:rPr>
           </w:pPr>
-          <w:hyperlink w:anchor="_Toc243495675" w:history="1">
+          <w:hyperlink w:anchor="_Toc243497872" w:history="1">
             <w:r>
               <w:rPr>
                 <w:rStyle w:val="Lienhypertexte"/>
@@ -3678,7 +3678,7 @@
               <w:rPr>
                 <w:noProof/>
               </w:rPr>
-              <w:instrText xml:space="preserve"> PAGEREF _Toc243495675 \h </w:instrText>
+              <w:instrText xml:space="preserve"> PAGEREF _Toc243497872 \h </w:instrText>
             </w:r>
             <w:r>
               <w:rPr>
@@ -3715,7 +3715,7 @@
               <w:noProof/>
             </w:rPr>
           </w:pPr>
-          <w:hyperlink w:anchor="_Toc243495676" w:history="1">
+          <w:hyperlink w:anchor="_Toc243497873" w:history="1">
             <w:r>
               <w:rPr>
                 <w:rStyle w:val="Lienhypertexte"/>
@@ -3739,7 +3739,7 @@
               <w:rPr>
                 <w:noProof/>
               </w:rPr>
-              <w:instrText xml:space="preserve"> PAGEREF _Toc243495676 \h </w:instrText>
+              <w:instrText xml:space="preserve"> PAGEREF _Toc243497873 \h </w:instrText>
             </w:r>
             <w:r>
               <w:rPr>
@@ -3776,7 +3776,7 @@
               <w:noProof/>
             </w:rPr>
           </w:pPr>
-          <w:hyperlink w:anchor="_Toc243495677" w:history="1">
+          <w:hyperlink w:anchor="_Toc243497874" w:history="1">
             <w:r>
               <w:rPr>
                 <w:rStyle w:val="Lienhypertexte"/>
@@ -3800,7 +3800,7 @@
               <w:rPr>
                 <w:noProof/>
               </w:rPr>
-              <w:instrText xml:space="preserve"> PAGEREF _Toc243495677 \h </w:instrText>
+              <w:instrText xml:space="preserve"> PAGEREF _Toc243497874 \h </w:instrText>
             </w:r>
             <w:r>
               <w:rPr>
@@ -3837,7 +3837,7 @@
               <w:noProof/>
             </w:rPr>
           </w:pPr>
-          <w:hyperlink w:anchor="_Toc243495678" w:history="1">
+          <w:hyperlink w:anchor="_Toc243497875" w:history="1">
             <w:r>
               <w:rPr>
                 <w:rStyle w:val="Lienhypertexte"/>
@@ -3861,7 +3861,7 @@
               <w:rPr>
                 <w:noProof/>
               </w:rPr>
-              <w:instrText xml:space="preserve"> PAGEREF _Toc243495678 \h </w:instrText>
+              <w:instrText xml:space="preserve"> PAGEREF _Toc243497875 \h </w:instrText>
             </w:r>
             <w:r>
               <w:rPr>
@@ -3898,7 +3898,7 @@
               <w:noProof/>
             </w:rPr>
           </w:pPr>
-          <w:hyperlink w:anchor="_Toc243495679" w:history="1">
+          <w:hyperlink w:anchor="_Toc243497876" w:history="1">
             <w:r>
               <w:rPr>
                 <w:rStyle w:val="Lienhypertexte"/>
@@ -3922,7 +3922,7 @@
               <w:rPr>
                 <w:noProof/>
               </w:rPr>
-              <w:instrText xml:space="preserve"> PAGEREF _Toc243495679 \h </w:instrText>
+              <w:instrText xml:space="preserve"> PAGEREF _Toc243497876 \h </w:instrText>
             </w:r>
             <w:r>
               <w:rPr>
@@ -3959,7 +3959,7 @@
               <w:noProof/>
             </w:rPr>
           </w:pPr>
-          <w:hyperlink w:anchor="_Toc243495680" w:history="1">
+          <w:hyperlink w:anchor="_Toc243497877" w:history="1">
             <w:r>
               <w:rPr>
                 <w:rStyle w:val="Lienhypertexte"/>
@@ -3983,7 +3983,7 @@
               <w:rPr>
                 <w:noProof/>
               </w:rPr>
-              <w:instrText xml:space="preserve"> PAGEREF _Toc243495680 \h </w:instrText>
+              <w:instrText xml:space="preserve"> PAGEREF _Toc243497877 \h </w:instrText>
             </w:r>
             <w:r>
               <w:rPr>
@@ -4020,7 +4020,7 @@
               <w:noProof/>
             </w:rPr>
           </w:pPr>
-          <w:hyperlink w:anchor="_Toc243495681" w:history="1">
+          <w:hyperlink w:anchor="_Toc243497878" w:history="1">
             <w:r>
               <w:rPr>
                 <w:rStyle w:val="Lienhypertexte"/>
@@ -4044,7 +4044,7 @@
               <w:rPr>
                 <w:noProof/>
               </w:rPr>
-              <w:instrText xml:space="preserve"> PAGEREF _Toc243495681 \h </w:instrText>
+              <w:instrText xml:space="preserve"> PAGEREF _Toc243497878 \h </w:instrText>
             </w:r>
             <w:r>
               <w:rPr>
@@ -4081,7 +4081,7 @@
               <w:noProof/>
             </w:rPr>
           </w:pPr>
-          <w:hyperlink w:anchor="_Toc243495682" w:history="1">
+          <w:hyperlink w:anchor="_Toc243497879" w:history="1">
             <w:r>
               <w:rPr>
                 <w:rStyle w:val="Lienhypertexte"/>
@@ -4105,7 +4105,7 @@
               <w:rPr>
                 <w:noProof/>
               </w:rPr>
-              <w:instrText xml:space="preserve"> PAGEREF _Toc243495682 \h </w:instrText>
+              <w:instrText xml:space="preserve"> PAGEREF _Toc243497879 \h </w:instrText>
             </w:r>
             <w:r>
               <w:rPr>
@@ -4142,7 +4142,7 @@
               <w:noProof/>
             </w:rPr>
           </w:pPr>
-          <w:hyperlink w:anchor="_Toc243495683" w:history="1">
+          <w:hyperlink w:anchor="_Toc243497880" w:history="1">
             <w:r>
               <w:rPr>
                 <w:rStyle w:val="Lienhypertexte"/>
@@ -4166,7 +4166,7 @@
               <w:rPr>
                 <w:noProof/>
               </w:rPr>
-              <w:instrText xml:space="preserve"> PAGEREF _Toc243495683 \h </w:instrText>
+              <w:instrText xml:space="preserve"> PAGEREF _Toc243497880 \h </w:instrText>
             </w:r>
             <w:r>
               <w:rPr>
@@ -4203,7 +4203,7 @@
               <w:noProof/>
             </w:rPr>
           </w:pPr>
-          <w:hyperlink w:anchor="_Toc243495684" w:history="1">
+          <w:hyperlink w:anchor="_Toc243497881" w:history="1">
             <w:r>
               <w:rPr>
                 <w:rStyle w:val="Lienhypertexte"/>
@@ -4227,7 +4227,7 @@
               <w:rPr>
                 <w:noProof/>
               </w:rPr>
-              <w:instrText xml:space="preserve"> PAGEREF _Toc243495684 \h </w:instrText>
+              <w:instrText xml:space="preserve"> PAGEREF _Toc243497881 \h </w:instrText>
             </w:r>
             <w:r>
               <w:rPr>
@@ -4264,7 +4264,7 @@
               <w:noProof/>
             </w:rPr>
           </w:pPr>
-          <w:hyperlink w:anchor="_Toc243495685" w:history="1">
+          <w:hyperlink w:anchor="_Toc243497882" w:history="1">
             <w:r>
               <w:rPr>
                 <w:rStyle w:val="Lienhypertexte"/>
@@ -4288,7 +4288,7 @@
               <w:rPr>
                 <w:noProof/>
               </w:rPr>
-              <w:instrText xml:space="preserve"> PAGEREF _Toc243495685 \h </w:instrText>
+              <w:instrText xml:space="preserve"> PAGEREF _Toc243497882 \h </w:instrText>
             </w:r>
             <w:r>
               <w:rPr>
@@ -4325,7 +4325,7 @@
               <w:noProof/>
             </w:rPr>
           </w:pPr>
-          <w:hyperlink w:anchor="_Toc243495686" w:history="1">
+          <w:hyperlink w:anchor="_Toc243497883" w:history="1">
             <w:r>
               <w:rPr>
                 <w:rStyle w:val="Lienhypertexte"/>
@@ -4349,7 +4349,7 @@
               <w:rPr>
                 <w:noProof/>
               </w:rPr>
-              <w:instrText xml:space="preserve"> PAGEREF _Toc243495686 \h </w:instrText>
+              <w:instrText xml:space="preserve"> PAGEREF _Toc243497883 \h </w:instrText>
             </w:r>
             <w:r>
               <w:rPr>
@@ -4386,7 +4386,7 @@
               <w:noProof/>
             </w:rPr>
           </w:pPr>
-          <w:hyperlink w:anchor="_Toc243495687" w:history="1">
+          <w:hyperlink w:anchor="_Toc243497884" w:history="1">
             <w:r>
               <w:rPr>
                 <w:rStyle w:val="Lienhypertexte"/>
@@ -4410,7 +4410,7 @@
               <w:rPr>
                 <w:noProof/>
               </w:rPr>
-              <w:instrText xml:space="preserve"> PAGEREF _Toc243495687 \h </w:instrText>
+              <w:instrText xml:space="preserve"> PAGEREF _Toc243497884 \h </w:instrText>
             </w:r>
             <w:r>
               <w:rPr>
@@ -4449,7 +4449,7 @@
         <w:pStyle w:val="Titre1"/>
         <w:pageBreakBefore/>
       </w:pPr>
-      <w:bookmarkStart w:id="0" w:name="_Toc243495617"/>
+      <w:bookmarkStart w:id="0" w:name="_Toc243497814"/>
       <w:r>
         <w:lastRenderedPageBreak/>
         <w:t>1. The pitch in 60 seconds</w:t>
@@ -4668,7 +4668,7 @@
         <w:pStyle w:val="Titre1"/>
         <w:pageBreakBefore/>
       </w:pPr>
-      <w:bookmarkStart w:id="1" w:name="_Toc243495618"/>
+      <w:bookmarkStart w:id="1" w:name="_Toc243497815"/>
       <w:r>
         <w:lastRenderedPageBreak/>
         <w:t>2. The basic ideas, explained simply</w:t>
@@ -4773,7 +4773,7 @@
       <w:pPr>
         <w:pStyle w:val="Titre2"/>
       </w:pPr>
-      <w:bookmarkStart w:id="2" w:name="_Toc243495619"/>
+      <w:bookmarkStart w:id="2" w:name="_Toc243497816"/>
       <w:r>
         <w:t>A neuron, weights and a network</w:t>
       </w:r>
@@ -4843,7 +4843,7 @@
       <w:pPr>
         <w:pStyle w:val="Titre2"/>
       </w:pPr>
-      <w:bookmarkStart w:id="3" w:name="_Toc243495620"/>
+      <w:bookmarkStart w:id="3" w:name="_Toc243497817"/>
       <w:r>
         <w:t>The loss: how wrong we are</w:t>
       </w:r>
@@ -4903,7 +4903,7 @@
       <w:pPr>
         <w:pStyle w:val="Titre2"/>
       </w:pPr>
-      <w:bookmarkStart w:id="4" w:name="_Toc243495621"/>
+      <w:bookmarkStart w:id="4" w:name="_Toc243497818"/>
       <w:r>
         <w:t>Gradient descent and the learning rate</w:t>
       </w:r>
@@ -4973,7 +4973,7 @@
       <w:pPr>
         <w:pStyle w:val="Titre2"/>
       </w:pPr>
-      <w:bookmarkStart w:id="5" w:name="_Toc243495622"/>
+      <w:bookmarkStart w:id="5" w:name="_Toc243497819"/>
       <w:r>
         <w:t>Backpropagation and the 5 lines of the training loop</w:t>
       </w:r>
@@ -5067,7 +5067,7 @@
       <w:pPr>
         <w:pStyle w:val="Titre2"/>
       </w:pPr>
-      <w:bookmarkStart w:id="6" w:name="_Toc243495623"/>
+      <w:bookmarkStart w:id="6" w:name="_Toc243497820"/>
       <w:r>
         <w:t>Epoch and mini-batch</w:t>
       </w:r>
@@ -5127,7 +5127,7 @@
       <w:pPr>
         <w:pStyle w:val="Titre2"/>
       </w:pPr>
-      <w:bookmarkStart w:id="7" w:name="_Toc243495624"/>
+      <w:bookmarkStart w:id="7" w:name="_Toc243497821"/>
       <w:r>
         <w:lastRenderedPageBreak/>
         <w:t>Train, validation, test</w:t>
@@ -5198,7 +5198,7 @@
       <w:pPr>
         <w:pStyle w:val="Titre2"/>
       </w:pPr>
-      <w:bookmarkStart w:id="8" w:name="_Toc243495625"/>
+      <w:bookmarkStart w:id="8" w:name="_Toc243497822"/>
       <w:r>
         <w:t>Overfitting</w:t>
       </w:r>
@@ -5248,7 +5248,7 @@
       <w:pPr>
         <w:pStyle w:val="Titre2"/>
       </w:pPr>
-      <w:bookmarkStart w:id="9" w:name="_Toc243495626"/>
+      <w:bookmarkStart w:id="9" w:name="_Toc243497823"/>
       <w:r>
         <w:t>ReLU, the activation</w:t>
       </w:r>
@@ -5318,7 +5318,7 @@
       <w:pPr>
         <w:pStyle w:val="Titre2"/>
       </w:pPr>
-      <w:bookmarkStart w:id="10" w:name="_Toc243495627"/>
+      <w:bookmarkStart w:id="10" w:name="_Toc243497824"/>
       <w:r>
         <w:t>Initialisation and the first loss</w:t>
       </w:r>
@@ -5368,7 +5368,7 @@
       <w:pPr>
         <w:pStyle w:val="Titre2"/>
       </w:pPr>
-      <w:bookmarkStart w:id="11" w:name="_Toc243495628"/>
+      <w:bookmarkStart w:id="11" w:name="_Toc243497825"/>
       <w:r>
         <w:t>Standardisation of the pixels</w:t>
       </w:r>
@@ -5428,7 +5428,7 @@
       <w:pPr>
         <w:pStyle w:val="Titre2"/>
       </w:pPr>
-      <w:bookmarkStart w:id="12" w:name="_Toc243495629"/>
+      <w:bookmarkStart w:id="12" w:name="_Toc243497826"/>
       <w:r>
         <w:t>MLP versus CNN: why the MLP cannot see shapes</w:t>
       </w:r>
@@ -5488,7 +5488,7 @@
       <w:pPr>
         <w:pStyle w:val="Titre2"/>
       </w:pPr>
-      <w:bookmarkStart w:id="13" w:name="_Toc243495630"/>
+      <w:bookmarkStart w:id="13" w:name="_Toc243497827"/>
       <w:r>
         <w:t>Convolution, filters and channels (session 7 slide)</w:t>
       </w:r>
@@ -5579,7 +5579,7 @@
       <w:pPr>
         <w:pStyle w:val="Titre2"/>
       </w:pPr>
-      <w:bookmarkStart w:id="14" w:name="_Toc243495631"/>
+      <w:bookmarkStart w:id="14" w:name="_Toc243497828"/>
       <w:r>
         <w:t>A pretrained network and transfer learning</w:t>
       </w:r>
@@ -5639,7 +5639,7 @@
       <w:pPr>
         <w:pStyle w:val="Titre2"/>
       </w:pPr>
-      <w:bookmarkStart w:id="15" w:name="_Toc243495632"/>
+      <w:bookmarkStart w:id="15" w:name="_Toc243497829"/>
       <w:r>
         <w:t>Frozen features (linear probe) versus fine-tuning</w:t>
       </w:r>
@@ -5709,7 +5709,7 @@
       <w:pPr>
         <w:pStyle w:val="Titre2"/>
       </w:pPr>
-      <w:bookmarkStart w:id="16" w:name="_Toc243495633"/>
+      <w:bookmarkStart w:id="16" w:name="_Toc243497830"/>
       <w:r>
         <w:t>The tools against overfitting</w:t>
       </w:r>
@@ -5869,7 +5869,7 @@
       <w:pPr>
         <w:pStyle w:val="Titre2"/>
       </w:pPr>
-      <w:bookmarkStart w:id="17" w:name="_Toc243495634"/>
+      <w:bookmarkStart w:id="17" w:name="_Toc243497831"/>
       <w:r>
         <w:t>Vanishing gradient</w:t>
       </w:r>
@@ -5919,7 +5919,7 @@
       <w:pPr>
         <w:pStyle w:val="Titre2"/>
       </w:pPr>
-      <w:bookmarkStart w:id="18" w:name="_Toc243495635"/>
+      <w:bookmarkStart w:id="18" w:name="_Toc243497832"/>
       <w:r>
         <w:t>Data leakage</w:t>
       </w:r>
@@ -5969,7 +5969,7 @@
       <w:pPr>
         <w:pStyle w:val="Titre2"/>
       </w:pPr>
-      <w:bookmarkStart w:id="19" w:name="_Toc243495636"/>
+      <w:bookmarkStart w:id="19" w:name="_Toc243497833"/>
       <w:r>
         <w:t>Confidence interval and bootstrap</w:t>
       </w:r>
@@ -6029,7 +6029,7 @@
       <w:pPr>
         <w:pStyle w:val="Titre2"/>
       </w:pPr>
-      <w:bookmarkStart w:id="20" w:name="_Toc243495637"/>
+      <w:bookmarkStart w:id="20" w:name="_Toc243497834"/>
       <w:r>
         <w:lastRenderedPageBreak/>
         <w:t>Latency and CPU threads</w:t>
@@ -6101,7 +6101,7 @@
         <w:pStyle w:val="Titre1"/>
         <w:pageBreakBefore/>
       </w:pPr>
-      <w:bookmarkStart w:id="21" w:name="_Toc243495638"/>
+      <w:bookmarkStart w:id="21" w:name="_Toc243497835"/>
       <w:r>
         <w:lastRenderedPageBreak/>
         <w:t>3. Step 1: the data and a fair split (notebook 01)</w:t>
@@ -6214,7 +6214,7 @@
       <w:pPr>
         <w:pStyle w:val="Titre2"/>
       </w:pPr>
-      <w:bookmarkStart w:id="22" w:name="_Toc243495639"/>
+      <w:bookmarkStart w:id="22" w:name="_Toc243497836"/>
       <w:r>
         <w:t>What we downloaded</w:t>
       </w:r>
@@ -6335,7 +6335,7 @@
       <w:pPr>
         <w:pStyle w:val="Titre2"/>
       </w:pPr>
-      <w:bookmarkStart w:id="23" w:name="_Toc243495640"/>
+      <w:bookmarkStart w:id="23" w:name="_Toc243497837"/>
       <w:r>
         <w:t>The split (make_split in data.py)</w:t>
       </w:r>
@@ -6466,7 +6466,7 @@
       <w:pPr>
         <w:pStyle w:val="Titre2"/>
       </w:pPr>
-      <w:bookmarkStart w:id="24" w:name="_Toc243495641"/>
+      <w:bookmarkStart w:id="24" w:name="_Toc243497838"/>
       <w:r>
         <w:t>What we found in the data</w:t>
       </w:r>
@@ -6529,7 +6529,7 @@
         <w:pStyle w:val="Titre1"/>
         <w:pageBreakBefore/>
       </w:pPr>
-      <w:bookmarkStart w:id="25" w:name="_Toc243495642"/>
+      <w:bookmarkStart w:id="25" w:name="_Toc243497839"/>
       <w:r>
         <w:lastRenderedPageBreak/>
         <w:t>4. Step 2: the MLP and its two checks (notebook 02)</w:t>
@@ -6679,7 +6679,7 @@
       <w:pPr>
         <w:pStyle w:val="Titre2"/>
       </w:pPr>
-      <w:bookmarkStart w:id="26" w:name="_Toc243495643"/>
+      <w:bookmarkStart w:id="26" w:name="_Toc243497840"/>
       <w:r>
         <w:t>The model</w:t>
       </w:r>
@@ -6806,7 +6806,7 @@
       <w:pPr>
         <w:pStyle w:val="Titre2"/>
       </w:pPr>
-      <w:bookmarkStart w:id="27" w:name="_Toc243495644"/>
+      <w:bookmarkStart w:id="27" w:name="_Toc243497841"/>
       <w:r>
         <w:t>Check 1: the first loss</w:t>
       </w:r>
@@ -6855,7 +6855,7 @@
       <w:pPr>
         <w:pStyle w:val="Titre2"/>
       </w:pPr>
-      <w:bookmarkStart w:id="28" w:name="_Toc243495645"/>
+      <w:bookmarkStart w:id="28" w:name="_Toc243497842"/>
       <w:r>
         <w:t>Check 2: overfit one batch</w:t>
       </w:r>
@@ -6873,7 +6873,7 @@
       <w:pPr>
         <w:pStyle w:val="Titre2"/>
       </w:pPr>
-      <w:bookmarkStart w:id="29" w:name="_Toc243495646"/>
+      <w:bookmarkStart w:id="29" w:name="_Toc243497843"/>
       <w:r>
         <w:t>Baseline and image size</w:t>
       </w:r>
@@ -6949,7 +6949,7 @@
         </w:rPr>
         <w:lastRenderedPageBreak/>
         <w:drawing>
-          <wp:inline distT="0" distB="0" distL="0" distR="0" wp14:anchorId="5E98809C" wp14:editId="5E98809D">
+          <wp:inline distT="0" distB="0" distL="0" distR="0" wp14:anchorId="4C212552" wp14:editId="4C212553">
             <wp:extent cx="4762500" cy="1924050"/>
             <wp:effectExtent l="0" t="0" r="0" b="0"/>
             <wp:docPr id="1" name="02_baseline_curves.png" descr="MLP baseline: training loss falls to 0 while validation loss rises (overfitting)." title="MLP baseline: training loss falls to 0 while validation loss rises (overfitting)."/>
@@ -7009,7 +7009,7 @@
         <w:pStyle w:val="Titre1"/>
         <w:pageBreakBefore/>
       </w:pPr>
-      <w:bookmarkStart w:id="30" w:name="_Toc243495647"/>
+      <w:bookmarkStart w:id="30" w:name="_Toc243497844"/>
       <w:r>
         <w:lastRenderedPageBreak/>
         <w:t>5. Step 3: monitoring and regularisation (notebook 03)</w:t>
@@ -7180,7 +7180,7 @@
       <w:pPr>
         <w:pStyle w:val="Titre2"/>
       </w:pPr>
-      <w:bookmarkStart w:id="31" w:name="_Toc243495648"/>
+      <w:bookmarkStart w:id="31" w:name="_Toc243497845"/>
       <w:r>
         <w:t>What we monitored</w:t>
       </w:r>
@@ -7299,7 +7299,7 @@
       <w:pPr>
         <w:pStyle w:val="Titre2"/>
       </w:pPr>
-      <w:bookmarkStart w:id="32" w:name="_Toc243495649"/>
+      <w:bookmarkStart w:id="32" w:name="_Toc243497846"/>
       <w:r>
         <w:t>Learning-rate sweep (Adam, 8 values, 15 epochs each)</w:t>
       </w:r>
@@ -7374,7 +7374,7 @@
           <w:noProof/>
         </w:rPr>
         <w:drawing>
-          <wp:inline distT="0" distB="0" distL="0" distR="0" wp14:anchorId="5E98809E" wp14:editId="5E98809F">
+          <wp:inline distT="0" distB="0" distL="0" distR="0" wp14:anchorId="4C212554" wp14:editId="4C212555">
             <wp:extent cx="4191000" cy="1619250"/>
             <wp:effectExtent l="0" t="0" r="0" b="0"/>
             <wp:docPr id="2" name="03_lr_sweep.png" descr="Learning-rate sweep: a U-shaped validation loss, best at 0.0001." title="Learning-rate sweep: a U-shaped validation loss, best at 0.0001."/>
@@ -7433,7 +7433,7 @@
       <w:pPr>
         <w:pStyle w:val="Titre2"/>
       </w:pPr>
-      <w:bookmarkStart w:id="33" w:name="_Toc243495650"/>
+      <w:bookmarkStart w:id="33" w:name="_Toc243497847"/>
       <w:r>
         <w:t>The tools against overfitting (lr 0.0001, 3 seeds each)</w:t>
       </w:r>
@@ -8406,7 +8406,7 @@
         <w:pStyle w:val="Titre1"/>
         <w:pageBreakBefore/>
       </w:pPr>
-      <w:bookmarkStart w:id="34" w:name="_Toc243495651"/>
+      <w:bookmarkStart w:id="34" w:name="_Toc243497848"/>
       <w:r>
         <w:lastRenderedPageBreak/>
         <w:t>6. Step 4: the training doctor (notebook 04)</w:t>
@@ -9312,7 +9312,7 @@
         </w:rPr>
         <w:lastRenderedPageBreak/>
         <w:drawing>
-          <wp:inline distT="0" distB="0" distL="0" distR="0" wp14:anchorId="5E9880A0" wp14:editId="5E9880A1">
+          <wp:inline distT="0" distB="0" distL="0" distR="0" wp14:anchorId="4C212556" wp14:editId="4C212557">
             <wp:extent cx="4000500" cy="2209800"/>
             <wp:effectExtent l="0" t="0" r="0" b="0"/>
             <wp:docPr id="3" name="04_p4_grad_per_layer.png" descr="Patient 4: the gradient vanishes layer after layer with sigmoids; ReLU + He init fixes it." title="Patient 4: the gradient vanishes layer after layer with sigmoids; ReLU + He init fixes it."/>
@@ -9371,7 +9371,7 @@
       <w:pPr>
         <w:pStyle w:val="Titre2"/>
       </w:pPr>
-      <w:bookmarkStart w:id="35" w:name="_Toc243495652"/>
+      <w:bookmarkStart w:id="35" w:name="_Toc243497849"/>
       <w:r>
         <w:t>Lessons to say at the oral</w:t>
       </w:r>
@@ -9464,7 +9464,7 @@
         <w:pStyle w:val="Titre1"/>
         <w:pageBreakBefore/>
       </w:pPr>
-      <w:bookmarkStart w:id="36" w:name="_Toc243495653"/>
+      <w:bookmarkStart w:id="36" w:name="_Toc243497850"/>
       <w:r>
         <w:lastRenderedPageBreak/>
         <w:t>7. Step 5: pretrained ResNet18 (notebook 05)</w:t>
@@ -9671,7 +9671,7 @@
       <w:pPr>
         <w:pStyle w:val="Titre2"/>
       </w:pPr>
-      <w:bookmarkStart w:id="37" w:name="_Toc243495654"/>
+      <w:bookmarkStart w:id="37" w:name="_Toc243497851"/>
       <w:r>
         <w:t>Why a CNN, and why pretrained</w:t>
       </w:r>
@@ -9735,7 +9735,7 @@
           <w:noProof/>
         </w:rPr>
         <w:drawing>
-          <wp:inline distT="0" distB="0" distL="0" distR="0" wp14:anchorId="5E9880A2" wp14:editId="5E9880A3">
+          <wp:inline distT="0" distB="0" distL="0" distR="0" wp14:anchorId="4C212558" wp14:editId="4C212559">
             <wp:extent cx="5905500" cy="2543175"/>
             <wp:effectExtent l="0" t="0" r="0" b="0"/>
             <wp:docPr id="4" name="C:\Users\benca\AppData\Local\Temp\claude\c--Users-benca-OneDrive---Thelio-Documents-Perso-Albert-School\1b4fce00-cdbb-452c-8784-7dae784734de\scratchpad\deck\resnet18_diagram.png" descr="Inside ResNet18 + our linear head (backup slide 20): the frozen body (dark) turns a painting into 512 numbers; our linear head (blue) turns them into 5 scores." title="Inside ResNet18 + our linear head (backup slide 20): the frozen body (dark) turns a painting into 512 numbers; our linear head (blue) turns them into 5 scores."/>
@@ -9878,7 +9878,7 @@
       <w:pPr>
         <w:pStyle w:val="Titre2"/>
       </w:pPr>
-      <w:bookmarkStart w:id="38" w:name="_Toc243495655"/>
+      <w:bookmarkStart w:id="38" w:name="_Toc243497852"/>
       <w:r>
         <w:t>Method A: frozen features + head</w:t>
       </w:r>
@@ -9985,7 +9985,7 @@
       <w:pPr>
         <w:pStyle w:val="Titre2"/>
       </w:pPr>
-      <w:bookmarkStart w:id="39" w:name="_Toc243495656"/>
+      <w:bookmarkStart w:id="39" w:name="_Toc243497853"/>
       <w:r>
         <w:t>Method B: fine-tuning layer4</w:t>
       </w:r>
@@ -10042,7 +10042,7 @@
       <w:pPr>
         <w:pStyle w:val="Titre2"/>
       </w:pPr>
-      <w:bookmarkStart w:id="40" w:name="_Toc243495657"/>
+      <w:bookmarkStart w:id="40" w:name="_Toc243497854"/>
       <w:r>
         <w:t>Two silent bugs, measured</w:t>
       </w:r>
@@ -10109,7 +10109,7 @@
       <w:pPr>
         <w:pStyle w:val="Titre2"/>
       </w:pPr>
-      <w:bookmarkStart w:id="41" w:name="_Toc243495658"/>
+      <w:bookmarkStart w:id="41" w:name="_Toc243497855"/>
       <w:r>
         <w:t>Painter leakage, measured fairly</w:t>
       </w:r>
@@ -10450,7 +10450,7 @@
           <w:noProof/>
         </w:rPr>
         <w:drawing>
-          <wp:inline distT="0" distB="0" distL="0" distR="0" wp14:anchorId="5E9880A4" wp14:editId="5E9880A5">
+          <wp:inline distT="0" distB="0" distL="0" distR="0" wp14:anchorId="4C21255A" wp14:editId="4C21255B">
             <wp:extent cx="4762500" cy="2524125"/>
             <wp:effectExtent l="0" t="0" r="0" b="0"/>
             <wp:docPr id="5" name="05_painter_leakage.png" descr="Painter leakage: same images, same model; only the known-painter group changes." title="Painter leakage: same images, same model; only the known-painter group changes."/>
@@ -10526,7 +10526,7 @@
         <w:pStyle w:val="Titre1"/>
         <w:pageBreakBefore/>
       </w:pPr>
-      <w:bookmarkStart w:id="42" w:name="_Toc243495659"/>
+      <w:bookmarkStart w:id="42" w:name="_Toc243497856"/>
       <w:r>
         <w:lastRenderedPageBreak/>
         <w:t>8. Step 6: final test, CPU cost and recommendation (notebook 06)</w:t>
@@ -10672,7 +10672,7 @@
       <w:pPr>
         <w:pStyle w:val="Titre2"/>
       </w:pPr>
-      <w:bookmarkStart w:id="43" w:name="_Toc243495660"/>
+      <w:bookmarkStart w:id="43" w:name="_Toc243497857"/>
       <w:r>
         <w:t>Classical models (settings chosen on validation)</w:t>
       </w:r>
@@ -10785,7 +10785,7 @@
       <w:pPr>
         <w:pStyle w:val="Titre2"/>
       </w:pPr>
-      <w:bookmarkStart w:id="44" w:name="_Toc243495661"/>
+      <w:bookmarkStart w:id="44" w:name="_Toc243497858"/>
       <w:r>
         <w:t>The final test, measured once</w:t>
       </w:r>
@@ -11816,7 +11816,7 @@
         </w:rPr>
         <w:lastRenderedPageBreak/>
         <w:drawing>
-          <wp:inline distT="0" distB="0" distL="0" distR="0" wp14:anchorId="5E9880A6" wp14:editId="5E9880A7">
+          <wp:inline distT="0" distB="0" distL="0" distR="0" wp14:anchorId="4C21255C" wp14:editId="4C21255D">
             <wp:extent cx="4762500" cy="1971675"/>
             <wp:effectExtent l="0" t="0" r="0" b="0"/>
             <wp:docPr id="6" name="06_test_accuracy.png" descr="Final test: 220 paintings never seen before, with 95 % bootstrap intervals." title="Final test: 220 paintings never seen before, with 95 % bootstrap intervals."/>
@@ -11875,7 +11875,7 @@
       <w:pPr>
         <w:pStyle w:val="Titre2"/>
       </w:pPr>
-      <w:bookmarkStart w:id="45" w:name="_Toc243495662"/>
+      <w:bookmarkStart w:id="45" w:name="_Toc243497859"/>
       <w:r>
         <w:t>Are the gaps real? Paired bootstrap (same 220 paintings, 5 000 redraws)</w:t>
       </w:r>
@@ -11934,7 +11934,7 @@
       <w:pPr>
         <w:pStyle w:val="Titre2"/>
       </w:pPr>
-      <w:bookmarkStart w:id="46" w:name="_Toc243495663"/>
+      <w:bookmarkStart w:id="46" w:name="_Toc243497860"/>
       <w:r>
         <w:t>Frozen or fine-tuned? Validation and test disagree</w:t>
       </w:r>
@@ -11962,7 +11962,7 @@
       <w:pPr>
         <w:pStyle w:val="Titre2"/>
       </w:pPr>
-      <w:bookmarkStart w:id="47" w:name="_Toc243495664"/>
+      <w:bookmarkStart w:id="47" w:name="_Toc243497861"/>
       <w:r>
         <w:t>Speed and size</w:t>
       </w:r>
@@ -11980,7 +11980,7 @@
       <w:pPr>
         <w:pStyle w:val="Titre2"/>
       </w:pPr>
-      <w:bookmarkStart w:id="48" w:name="_Toc243495665"/>
+      <w:bookmarkStart w:id="48" w:name="_Toc243497862"/>
       <w:r>
         <w:t>Recommendation to the director</w:t>
       </w:r>
@@ -12077,7 +12077,7 @@
         <w:pStyle w:val="Titre1"/>
         <w:pageBreakBefore/>
       </w:pPr>
-      <w:bookmarkStart w:id="49" w:name="_Toc243495666"/>
+      <w:bookmarkStart w:id="49" w:name="_Toc243497863"/>
       <w:r>
         <w:lastRenderedPageBreak/>
         <w:t>9. Step 6 bis: a second test, was it luck? (notebook 08)</w:t>
@@ -12209,7 +12209,7 @@
       <w:pPr>
         <w:pStyle w:val="Titre2"/>
       </w:pPr>
-      <w:bookmarkStart w:id="50" w:name="_Toc243495667"/>
+      <w:bookmarkStart w:id="50" w:name="_Toc243497864"/>
       <w:r>
         <w:t>How the second test was built (scripts/make_second_test.py)</w:t>
       </w:r>
@@ -12281,7 +12281,7 @@
       <w:pPr>
         <w:pStyle w:val="Titre2"/>
       </w:pPr>
-      <w:bookmarkStart w:id="51" w:name="_Toc243495668"/>
+      <w:bookmarkStart w:id="51" w:name="_Toc243497865"/>
       <w:r>
         <w:t>Results</w:t>
       </w:r>
@@ -12887,7 +12887,7 @@
           <w:noProof/>
         </w:rPr>
         <w:drawing>
-          <wp:inline distT="0" distB="0" distL="0" distR="0" wp14:anchorId="5E9880A8" wp14:editId="5E9880A9">
+          <wp:inline distT="0" distB="0" distL="0" distR="0" wp14:anchorId="4C21255E" wp14:editId="4C21255F">
             <wp:extent cx="5334000" cy="2095500"/>
             <wp:effectExtent l="0" t="0" r="0" b="0"/>
             <wp:docPr id="7" name="08_second_test.png" descr="Test 1 and the new test 2: the same ranking (black lines: 95 % bootstrap intervals)." title="Test 1 and the new test 2: the same ranking (black lines: 95 % bootstrap intervals)."/>
@@ -12996,7 +12996,7 @@
       <w:pPr>
         <w:pStyle w:val="Titre2"/>
       </w:pPr>
-      <w:bookmarkStart w:id="52" w:name="_Toc243495669"/>
+      <w:bookmarkStart w:id="52" w:name="_Toc243497866"/>
       <w:r>
         <w:t>What it changes, and the honest caveat</w:t>
       </w:r>
@@ -13025,7 +13025,7 @@
         <w:pStyle w:val="Titre1"/>
         <w:pageBreakBefore/>
       </w:pPr>
-      <w:bookmarkStart w:id="53" w:name="_Toc243495670"/>
+      <w:bookmarkStart w:id="53" w:name="_Toc243497867"/>
       <w:r>
         <w:lastRenderedPageBreak/>
         <w:t>10. The random forest, our classical challenger (notebook 06)</w:t>
@@ -13212,7 +13212,7 @@
       <w:pPr>
         <w:pStyle w:val="Titre2"/>
       </w:pPr>
-      <w:bookmarkStart w:id="54" w:name="_Toc243495671"/>
+      <w:bookmarkStart w:id="54" w:name="_Toc243497868"/>
       <w:r>
         <w:t>The 102 hand-made numbers (baselines.py)</w:t>
       </w:r>
@@ -13602,7 +13602,7 @@
       <w:pPr>
         <w:pStyle w:val="Titre2"/>
       </w:pPr>
-      <w:bookmarkStart w:id="55" w:name="_Toc243495672"/>
+      <w:bookmarkStart w:id="55" w:name="_Toc243497869"/>
       <w:r>
         <w:t>Our settings, chosen on validation</w:t>
       </w:r>
@@ -13770,7 +13770,7 @@
       <w:pPr>
         <w:pStyle w:val="Titre2"/>
       </w:pPr>
-      <w:bookmarkStart w:id="56" w:name="_Toc243495673"/>
+      <w:bookmarkStart w:id="56" w:name="_Toc243497870"/>
       <w:r>
         <w:t>Questions on the random forest, with answers</w:t>
       </w:r>
@@ -14035,7 +14035,7 @@
         <w:pStyle w:val="Titre1"/>
         <w:pageBreakBefore/>
       </w:pPr>
-      <w:bookmarkStart w:id="57" w:name="_Toc243495674"/>
+      <w:bookmarkStart w:id="57" w:name="_Toc243497871"/>
       <w:r>
         <w:lastRenderedPageBreak/>
         <w:t>11. Bonus: what about transformers like BERT? (notebook 07)</w:t>
@@ -14902,7 +14902,7 @@
         </w:rPr>
         <w:lastRenderedPageBreak/>
         <w:drawing>
-          <wp:inline distT="0" distB="0" distL="0" distR="0" wp14:anchorId="5E9880AA" wp14:editId="5E9880AB">
+          <wp:inline distT="0" distB="0" distL="0" distR="0" wp14:anchorId="4C212560" wp14:editId="4C212561">
             <wp:extent cx="4381500" cy="2486025"/>
             <wp:effectExtent l="0" t="0" r="0" b="0"/>
             <wp:docPr id="8" name="07_transformers_accuracy_vs_speed.png" descr="Transformers on validation: CLIP is more accurate, but slower." title="Transformers on validation: CLIP is more accurate, but slower."/>
@@ -14962,7 +14962,7 @@
         <w:pStyle w:val="Titre1"/>
         <w:pageBreakBefore/>
       </w:pPr>
-      <w:bookmarkStart w:id="58" w:name="_Toc243495675"/>
+      <w:bookmarkStart w:id="58" w:name="_Toc243497872"/>
       <w:r>
         <w:lastRenderedPageBreak/>
         <w:t>12. Key numbers to know by heart</w:t>
@@ -16330,7 +16330,7 @@
         <w:pStyle w:val="Titre1"/>
         <w:pageBreakBefore/>
       </w:pPr>
-      <w:bookmarkStart w:id="59" w:name="_Toc243495676"/>
+      <w:bookmarkStart w:id="59" w:name="_Toc243497873"/>
       <w:r>
         <w:lastRenderedPageBreak/>
         <w:t>13. Concepts in simple words</w:t>
@@ -18521,7 +18521,7 @@
         <w:pStyle w:val="Titre1"/>
         <w:pageBreakBefore/>
       </w:pPr>
-      <w:bookmarkStart w:id="60" w:name="_Toc243495677"/>
+      <w:bookmarkStart w:id="60" w:name="_Toc243497874"/>
       <w:r>
         <w:lastRenderedPageBreak/>
         <w:t>14. Questions you may get, with answers</w:t>
@@ -18543,7 +18543,7 @@
       <w:pPr>
         <w:pStyle w:val="Titre2"/>
       </w:pPr>
-      <w:bookmarkStart w:id="61" w:name="_Toc243495678"/>
+      <w:bookmarkStart w:id="61" w:name="_Toc243497875"/>
       <w:r>
         <w:t>About the data</w:t>
       </w:r>
@@ -18663,7 +18663,7 @@
       <w:pPr>
         <w:pStyle w:val="Titre2"/>
       </w:pPr>
-      <w:bookmarkStart w:id="62" w:name="_Toc243495679"/>
+      <w:bookmarkStart w:id="62" w:name="_Toc243497876"/>
       <w:r>
         <w:t>About the MLP</w:t>
       </w:r>
@@ -18783,7 +18783,7 @@
       <w:pPr>
         <w:pStyle w:val="Titre2"/>
       </w:pPr>
-      <w:bookmarkStart w:id="63" w:name="_Toc243495680"/>
+      <w:bookmarkStart w:id="63" w:name="_Toc243497877"/>
       <w:r>
         <w:t>About training and diagnosis</w:t>
       </w:r>
@@ -18881,7 +18881,7 @@
       <w:pPr>
         <w:pStyle w:val="Titre2"/>
       </w:pPr>
-      <w:bookmarkStart w:id="64" w:name="_Toc243495681"/>
+      <w:bookmarkStart w:id="64" w:name="_Toc243497878"/>
       <w:r>
         <w:lastRenderedPageBreak/>
         <w:t>About ResNet</w:t>
@@ -19170,7 +19170,7 @@
       <w:pPr>
         <w:pStyle w:val="Titre2"/>
       </w:pPr>
-      <w:bookmarkStart w:id="65" w:name="_Toc243495682"/>
+      <w:bookmarkStart w:id="65" w:name="_Toc243497879"/>
       <w:r>
         <w:t>About the results and the recommendation</w:t>
       </w:r>
@@ -19313,7 +19313,7 @@
       <w:pPr>
         <w:pStyle w:val="Titre2"/>
       </w:pPr>
-      <w:bookmarkStart w:id="66" w:name="_Toc243495683"/>
+      <w:bookmarkStart w:id="66" w:name="_Toc243497880"/>
       <w:r>
         <w:t>About the project</w:t>
       </w:r>
@@ -19368,7 +19368,7 @@
         <w:pStyle w:val="Titre1"/>
         <w:pageBreakBefore/>
       </w:pPr>
-      <w:bookmarkStart w:id="67" w:name="_Toc243495684"/>
+      <w:bookmarkStart w:id="67" w:name="_Toc243497881"/>
       <w:r>
         <w:lastRenderedPageBreak/>
         <w:t>15. Limits to admit, and next steps</w:t>
@@ -20162,7 +20162,7 @@
         <w:pStyle w:val="Titre1"/>
         <w:pageBreakBefore/>
       </w:pPr>
-      <w:bookmarkStart w:id="68" w:name="_Toc243495685"/>
+      <w:bookmarkStart w:id="68" w:name="_Toc243497882"/>
       <w:r>
         <w:lastRenderedPageBreak/>
         <w:t>16. Git history and how to reproduce</w:t>
@@ -21190,7 +21190,7 @@
         <w:pStyle w:val="Titre1"/>
         <w:pageBreakBefore/>
       </w:pPr>
-      <w:bookmarkStart w:id="69" w:name="_Toc243495686"/>
+      <w:bookmarkStart w:id="69" w:name="_Toc243497883"/>
       <w:r>
         <w:lastRenderedPageBreak/>
         <w:t>17. The 10-minute talk, slide by slide</w:t>
@@ -21205,7 +21205,7 @@
         <w:rPr>
           <w:color w:val="1C2433"/>
         </w:rPr>
-        <w:t>The talk follows the project step by step and gives the answer only at the end. 11 slides, about 50 seconds each: about 9:10 in total, the rest of the 10 minutes is a margin. The speaker notes in the .pptx and oral_script.pdf hold the full text in simple English.</w:t>
+        <w:t>The talk follows the project step by step and gives the answer only at the end. 11 slides, about 50 seconds each: about 9:20 in total, the rest of the 10 minutes is a margin. The speaker notes in the .pptx and oral_script.pdf hold the full text in simple English.</w:t>
       </w:r>
     </w:p>
     <w:tbl>
@@ -21968,7 +21968,7 @@
                 <w:sz w:val="19"/>
                 <w:szCs w:val="19"/>
               </w:rPr>
-              <w:t>1:00</w:t>
+              <w:t>1:20</w:t>
             </w:r>
           </w:p>
         </w:tc>
@@ -21995,7 +21995,7 @@
                 <w:sz w:val="19"/>
                 <w:szCs w:val="19"/>
               </w:rPr>
-              <w:t>A CNN made for images (edges, textures, shapes), pretrained on 1.2 million photos and frozen: we train only 2 565 weights.</w:t>
+              <w:t>A CNN made for images (edges, textures, shapes), pretrained on 1.2 million photos; two ways to reuse it: frozen (2 565 weights) or fine-tuned (last block too, 8.4 M).</w:t>
             </w:r>
           </w:p>
         </w:tc>
@@ -22075,7 +22075,7 @@
                 <w:sz w:val="19"/>
                 <w:szCs w:val="19"/>
               </w:rPr>
-              <w:t>1:00</w:t>
+              <w:t>0:50</w:t>
             </w:r>
           </w:p>
         </w:tc>
@@ -22548,7 +22548,7 @@
       <w:pPr>
         <w:pStyle w:val="Titre2"/>
       </w:pPr>
-      <w:bookmarkStart w:id="70" w:name="_Toc243495687"/>
+      <w:bookmarkStart w:id="70" w:name="_Toc243497884"/>
       <w:r>
         <w:t>The thread: each result opens the next step</w:t>
       </w:r>
@@ -22882,10 +22882,10 @@
 <file path=word/numbering.xml><?xml version="1.0" encoding="utf-8"?>
 <w:numbering xmlns:wpc="http://schemas.microsoft.com/office/word/2010/wordprocessingCanvas" xmlns:cx="http://schemas.microsoft.com/office/drawing/2014/chartex" xmlns:cx1="http://schemas.microsoft.com/office/drawing/2015/9/8/chartex" xmlns:cx2="http://schemas.microsoft.com/office/drawing/2015/10/21/chartex" xmlns:cx3="http://schemas.microsoft.com/office/drawing/2016/5/9/chartex" xmlns:cx4="http://schemas.microsoft.com/office/drawing/2016/5/10/chartex" xmlns:cx5="http://schemas.microsoft.com/office/drawing/2016/5/11/chartex" xmlns:cx6="http://schemas.microsoft.com/office/drawing/2016/5/12/chartex" xmlns:cx7="http://schemas.microsoft.com/office/drawing/2016/5/13/chartex" xmlns:cx8="http://schemas.microsoft.com/office/drawing/2016/5/14/chartex" xmlns:mc="http://schemas.openxmlformats.org/markup-compatibility/2006" xmlns:aink="http://schemas.microsoft.com/office/drawing/2016/ink" xmlns:am3d="http://schemas.microsoft.com/office/drawing/2017/model3d" xmlns:o="urn:schemas-microsoft-com:office:office" xmlns:oel="http://schemas.microsoft.com/office/2019/extlst" xmlns:r="http://schemas.openxmlformats.org/officeDocument/2006/relationships" xmlns:m="http://schemas.openxmlformats.org/officeDocument/2006/math" xmlns:v="urn:schemas-microsoft-com:vml" xmlns:wp14="http://schemas.microsoft.com/office/word/2010/wordprocessingDrawing" xmlns:wp="http://schemas.openxmlformats.org/drawingml/2006/wordprocessingDrawing" xmlns:w10="urn:schemas-microsoft-com:office:word" xmlns:w="http://schemas.openxmlformats.org/wordprocessingml/2006/main" xmlns:w14="http://schemas.microsoft.com/office/word/2010/wordml" xmlns:w15="http://schemas.microsoft.com/office/word/2012/wordml" xmlns:w16cex="http://schemas.microsoft.com/office/word/2018/wordml/cex" xmlns:w16cid="http://schemas.microsoft.com/office/word/2016/wordml/cid" xmlns:w16="http://schemas.microsoft.com/office/word/2018/wordml" xmlns:w16du="http://schemas.microsoft.com/office/word/2023/wordml/word16du" xmlns:w16sdtdh="http://schemas.microsoft.com/office/word/2020/wordml/sdtdatahash" xmlns:w16sdtfl="http://schemas.microsoft.com/office/word/2024/wordml/sdtformatlock" xmlns:w16se="http://schemas.microsoft.com/office/word/2015/wordml/symex" xmlns:wpg="http://schemas.microsoft.com/office/word/2010/wordprocessingGroup" xmlns:wpi="http://schemas.microsoft.com/office/word/2010/wordprocessingInk" xmlns:wne="http://schemas.microsoft.com/office/word/2006/wordml" xmlns:wps="http://schemas.microsoft.com/office/word/2010/wordprocessingShape" mc:Ignorable="w14 w15 w16se w16cid w16 w16cex w16sdtdh w16sdtfl w16du wp14">
   <w:abstractNum w:abstractNumId="0" w15:restartNumberingAfterBreak="0">
-    <w:nsid w:val="013F75E5"/>
+    <w:nsid w:val="0DC5628F"/>
     <w:multiLevelType w:val="hybridMultilevel"/>
-    <w:tmpl w:val="27AC4DF2"/>
-    <w:lvl w:ilvl="0" w:tplc="8CD06F2E">
+    <w:tmpl w:val="8FF40810"/>
+    <w:lvl w:ilvl="0" w:tplc="B05AF9DE">
       <w:start w:val="1"/>
       <w:numFmt w:val="decimal"/>
       <w:lvlText w:val="%1."/>
@@ -22894,52 +22894,52 @@
         <w:ind w:left="400" w:hanging="300"/>
       </w:pPr>
     </w:lvl>
-    <w:lvl w:ilvl="1" w:tplc="C5109002">
+    <w:lvl w:ilvl="1" w:tplc="84C88F80">
       <w:numFmt w:val="decimal"/>
       <w:lvlText w:val=""/>
       <w:lvlJc w:val="left"/>
     </w:lvl>
-    <w:lvl w:ilvl="2" w:tplc="26AC13A0">
+    <w:lvl w:ilvl="2" w:tplc="841CCE04">
       <w:numFmt w:val="decimal"/>
       <w:lvlText w:val=""/>
       <w:lvlJc w:val="left"/>
     </w:lvl>
-    <w:lvl w:ilvl="3" w:tplc="611AAE86">
+    <w:lvl w:ilvl="3" w:tplc="26BA18B4">
       <w:numFmt w:val="decimal"/>
       <w:lvlText w:val=""/>
       <w:lvlJc w:val="left"/>
     </w:lvl>
-    <w:lvl w:ilvl="4" w:tplc="BD8AD3A0">
+    <w:lvl w:ilvl="4" w:tplc="F5EE666A">
       <w:numFmt w:val="decimal"/>
       <w:lvlText w:val=""/>
       <w:lvlJc w:val="left"/>
     </w:lvl>
-    <w:lvl w:ilvl="5" w:tplc="1792BAD4">
+    <w:lvl w:ilvl="5" w:tplc="7BC0160E">
       <w:numFmt w:val="decimal"/>
       <w:lvlText w:val=""/>
       <w:lvlJc w:val="left"/>
     </w:lvl>
-    <w:lvl w:ilvl="6" w:tplc="F13E7CDC">
+    <w:lvl w:ilvl="6" w:tplc="9E10534A">
       <w:numFmt w:val="decimal"/>
       <w:lvlText w:val=""/>
       <w:lvlJc w:val="left"/>
     </w:lvl>
-    <w:lvl w:ilvl="7" w:tplc="90ACBB40">
+    <w:lvl w:ilvl="7" w:tplc="AFB8C966">
       <w:numFmt w:val="decimal"/>
       <w:lvlText w:val=""/>
       <w:lvlJc w:val="left"/>
     </w:lvl>
-    <w:lvl w:ilvl="8" w:tplc="1174F340">
+    <w:lvl w:ilvl="8" w:tplc="F2A68B18">
       <w:numFmt w:val="decimal"/>
       <w:lvlText w:val=""/>
       <w:lvlJc w:val="left"/>
     </w:lvl>
   </w:abstractNum>
   <w:abstractNum w:abstractNumId="1" w15:restartNumberingAfterBreak="0">
-    <w:nsid w:val="1AF440C7"/>
+    <w:nsid w:val="2E0B1619"/>
     <w:multiLevelType w:val="hybridMultilevel"/>
-    <w:tmpl w:val="8A76347E"/>
-    <w:lvl w:ilvl="0" w:tplc="2BEA2222" w:tentative="1">
+    <w:tmpl w:val="98F094F2"/>
+    <w:lvl w:ilvl="0" w:tplc="9166A258" w:tentative="1">
       <w:start w:val="1"/>
       <w:numFmt w:val="bullet"/>
       <w:lvlText w:val="●"/>
@@ -22948,7 +22948,7 @@
         <w:ind w:left="720" w:hanging="360"/>
       </w:pPr>
     </w:lvl>
-    <w:lvl w:ilvl="1" w:tplc="EAFC7BB2" w:tentative="1">
+    <w:lvl w:ilvl="1" w:tplc="859419E8" w:tentative="1">
       <w:start w:val="1"/>
       <w:numFmt w:val="bullet"/>
       <w:lvlText w:val="○"/>
@@ -22957,7 +22957,7 @@
         <w:ind w:left="1440" w:hanging="360"/>
       </w:pPr>
     </w:lvl>
-    <w:lvl w:ilvl="2" w:tplc="C41AC5E6" w:tentative="1">
+    <w:lvl w:ilvl="2" w:tplc="2ECEF006" w:tentative="1">
       <w:start w:val="1"/>
       <w:numFmt w:val="bullet"/>
       <w:lvlText w:val="■"/>
@@ -22966,7 +22966,7 @@
         <w:ind w:left="2160" w:hanging="360"/>
       </w:pPr>
     </w:lvl>
-    <w:lvl w:ilvl="3" w:tplc="A7304EA0" w:tentative="1">
+    <w:lvl w:ilvl="3" w:tplc="D84EE79C" w:tentative="1">
       <w:start w:val="1"/>
       <w:numFmt w:val="bullet"/>
       <w:lvlText w:val="●"/>
@@ -22975,7 +22975,7 @@
         <w:ind w:left="2880" w:hanging="360"/>
       </w:pPr>
     </w:lvl>
-    <w:lvl w:ilvl="4" w:tplc="E1CE357E" w:tentative="1">
+    <w:lvl w:ilvl="4" w:tplc="E2AEE274" w:tentative="1">
       <w:start w:val="1"/>
       <w:numFmt w:val="bullet"/>
       <w:lvlText w:val="○"/>
@@ -22984,7 +22984,7 @@
         <w:ind w:left="3600" w:hanging="360"/>
       </w:pPr>
     </w:lvl>
-    <w:lvl w:ilvl="5" w:tplc="92E270AE" w:tentative="1">
+    <w:lvl w:ilvl="5" w:tplc="12AE1436" w:tentative="1">
       <w:start w:val="1"/>
       <w:numFmt w:val="bullet"/>
       <w:lvlText w:val="■"/>
@@ -22993,7 +22993,7 @@
         <w:ind w:left="4320" w:hanging="360"/>
       </w:pPr>
     </w:lvl>
-    <w:lvl w:ilvl="6" w:tplc="589CC930" w:tentative="1">
+    <w:lvl w:ilvl="6" w:tplc="A25E57BE" w:tentative="1">
       <w:start w:val="1"/>
       <w:numFmt w:val="bullet"/>
       <w:lvlText w:val="●"/>
@@ -23002,7 +23002,7 @@
         <w:ind w:left="5040" w:hanging="360"/>
       </w:pPr>
     </w:lvl>
-    <w:lvl w:ilvl="7" w:tplc="D4B49D2C" w:tentative="1">
+    <w:lvl w:ilvl="7" w:tplc="AC328E58" w:tentative="1">
       <w:start w:val="1"/>
       <w:numFmt w:val="bullet"/>
       <w:lvlText w:val="●"/>
@@ -23011,7 +23011,7 @@
         <w:ind w:left="5760" w:hanging="360"/>
       </w:pPr>
     </w:lvl>
-    <w:lvl w:ilvl="8" w:tplc="26DE67C6" w:tentative="1">
+    <w:lvl w:ilvl="8" w:tplc="31F27DE2" w:tentative="1">
       <w:start w:val="1"/>
       <w:numFmt w:val="bullet"/>
       <w:lvlText w:val="●"/>
@@ -23022,10 +23022,10 @@
     </w:lvl>
   </w:abstractNum>
   <w:abstractNum w:abstractNumId="2" w15:restartNumberingAfterBreak="0">
-    <w:nsid w:val="39077D68"/>
+    <w:nsid w:val="3DA7617A"/>
     <w:multiLevelType w:val="hybridMultilevel"/>
-    <w:tmpl w:val="B3E62726"/>
-    <w:lvl w:ilvl="0" w:tplc="50506B10">
+    <w:tmpl w:val="B594782A"/>
+    <w:lvl w:ilvl="0" w:tplc="5AE0CC16">
       <w:start w:val="1"/>
       <w:numFmt w:val="decimal"/>
       <w:lvlText w:val="%1."/>
@@ -23034,52 +23034,52 @@
         <w:ind w:left="400" w:hanging="300"/>
       </w:pPr>
     </w:lvl>
-    <w:lvl w:ilvl="1" w:tplc="B5C26058">
+    <w:lvl w:ilvl="1" w:tplc="1F30C058">
       <w:numFmt w:val="decimal"/>
       <w:lvlText w:val=""/>
       <w:lvlJc w:val="left"/>
     </w:lvl>
-    <w:lvl w:ilvl="2" w:tplc="7346C2CA">
+    <w:lvl w:ilvl="2" w:tplc="A4B2EAB4">
       <w:numFmt w:val="decimal"/>
       <w:lvlText w:val=""/>
       <w:lvlJc w:val="left"/>
     </w:lvl>
-    <w:lvl w:ilvl="3" w:tplc="55A4E1D6">
+    <w:lvl w:ilvl="3" w:tplc="B3B84F82">
       <w:numFmt w:val="decimal"/>
       <w:lvlText w:val=""/>
       <w:lvlJc w:val="left"/>
     </w:lvl>
-    <w:lvl w:ilvl="4" w:tplc="73D2DC24">
+    <w:lvl w:ilvl="4" w:tplc="8ADCABA8">
       <w:numFmt w:val="decimal"/>
       <w:lvlText w:val=""/>
       <w:lvlJc w:val="left"/>
     </w:lvl>
-    <w:lvl w:ilvl="5" w:tplc="CD362662">
+    <w:lvl w:ilvl="5" w:tplc="D406AC04">
       <w:numFmt w:val="decimal"/>
       <w:lvlText w:val=""/>
       <w:lvlJc w:val="left"/>
     </w:lvl>
-    <w:lvl w:ilvl="6" w:tplc="EE5600FA">
+    <w:lvl w:ilvl="6" w:tplc="BBAC3394">
       <w:numFmt w:val="decimal"/>
       <w:lvlText w:val=""/>
       <w:lvlJc w:val="left"/>
     </w:lvl>
-    <w:lvl w:ilvl="7" w:tplc="B39299C6">
+    <w:lvl w:ilvl="7" w:tplc="2CCE50D0">
       <w:numFmt w:val="decimal"/>
       <w:lvlText w:val=""/>
       <w:lvlJc w:val="left"/>
     </w:lvl>
-    <w:lvl w:ilvl="8" w:tplc="D7A8EFE6">
+    <w:lvl w:ilvl="8" w:tplc="C9EAB6BA">
       <w:numFmt w:val="decimal"/>
       <w:lvlText w:val=""/>
       <w:lvlJc w:val="left"/>
     </w:lvl>
   </w:abstractNum>
   <w:abstractNum w:abstractNumId="3" w15:restartNumberingAfterBreak="0">
-    <w:nsid w:val="53D67EF3"/>
+    <w:nsid w:val="65CF76A3"/>
     <w:multiLevelType w:val="hybridMultilevel"/>
-    <w:tmpl w:val="2DA6C926"/>
-    <w:lvl w:ilvl="0" w:tplc="6C101102">
+    <w:tmpl w:val="4CAE3068"/>
+    <w:lvl w:ilvl="0" w:tplc="790C6838">
       <w:start w:val="1"/>
       <w:numFmt w:val="decimal"/>
       <w:lvlText w:val="%1."/>
@@ -23088,52 +23088,52 @@
         <w:ind w:left="400" w:hanging="300"/>
       </w:pPr>
     </w:lvl>
-    <w:lvl w:ilvl="1" w:tplc="BB9E210C">
+    <w:lvl w:ilvl="1" w:tplc="CC9C0D9E">
       <w:numFmt w:val="decimal"/>
       <w:lvlText w:val=""/>
       <w:lvlJc w:val="left"/>
     </w:lvl>
-    <w:lvl w:ilvl="2" w:tplc="0E58855C">
+    <w:lvl w:ilvl="2" w:tplc="E1120174">
       <w:numFmt w:val="decimal"/>
       <w:lvlText w:val=""/>
       <w:lvlJc w:val="left"/>
     </w:lvl>
-    <w:lvl w:ilvl="3" w:tplc="9DD470B2">
+    <w:lvl w:ilvl="3" w:tplc="FDCC12EC">
       <w:numFmt w:val="decimal"/>
       <w:lvlText w:val=""/>
       <w:lvlJc w:val="left"/>
     </w:lvl>
-    <w:lvl w:ilvl="4" w:tplc="D1CAF380">
+    <w:lvl w:ilvl="4" w:tplc="5386D5A4">
       <w:numFmt w:val="decimal"/>
       <w:lvlText w:val=""/>
       <w:lvlJc w:val="left"/>
     </w:lvl>
-    <w:lvl w:ilvl="5" w:tplc="F8CC67A8">
+    <w:lvl w:ilvl="5" w:tplc="7D443FA4">
       <w:numFmt w:val="decimal"/>
       <w:lvlText w:val=""/>
       <w:lvlJc w:val="left"/>
     </w:lvl>
-    <w:lvl w:ilvl="6" w:tplc="11BCB6A4">
+    <w:lvl w:ilvl="6" w:tplc="0122B25C">
       <w:numFmt w:val="decimal"/>
       <w:lvlText w:val=""/>
       <w:lvlJc w:val="left"/>
     </w:lvl>
-    <w:lvl w:ilvl="7" w:tplc="432A257C">
+    <w:lvl w:ilvl="7" w:tplc="FBD6FBA6">
       <w:numFmt w:val="decimal"/>
       <w:lvlText w:val=""/>
       <w:lvlJc w:val="left"/>
     </w:lvl>
-    <w:lvl w:ilvl="8" w:tplc="7396D4CC">
+    <w:lvl w:ilvl="8" w:tplc="DBA4C524">
       <w:numFmt w:val="decimal"/>
       <w:lvlText w:val=""/>
       <w:lvlJc w:val="left"/>
     </w:lvl>
   </w:abstractNum>
   <w:abstractNum w:abstractNumId="4" w15:restartNumberingAfterBreak="0">
-    <w:nsid w:val="57B20062"/>
+    <w:nsid w:val="7FCD3C5E"/>
     <w:multiLevelType w:val="hybridMultilevel"/>
-    <w:tmpl w:val="A79E0C6C"/>
-    <w:lvl w:ilvl="0" w:tplc="EB4EA5E4">
+    <w:tmpl w:val="1FFA0A7C"/>
+    <w:lvl w:ilvl="0" w:tplc="91CCEA86">
       <w:start w:val="1"/>
       <w:numFmt w:val="bullet"/>
       <w:lvlText w:val="•"/>
@@ -23142,73 +23142,73 @@
         <w:ind w:left="400" w:hanging="260"/>
       </w:pPr>
     </w:lvl>
-    <w:lvl w:ilvl="1" w:tplc="D0365178">
+    <w:lvl w:ilvl="1" w:tplc="C5F84E7A">
       <w:numFmt w:val="decimal"/>
       <w:lvlText w:val=""/>
       <w:lvlJc w:val="left"/>
     </w:lvl>
-    <w:lvl w:ilvl="2" w:tplc="ECFE590E">
+    <w:lvl w:ilvl="2" w:tplc="1794CF96">
       <w:numFmt w:val="decimal"/>
       <w:lvlText w:val=""/>
       <w:lvlJc w:val="left"/>
     </w:lvl>
-    <w:lvl w:ilvl="3" w:tplc="C99CF9F8">
+    <w:lvl w:ilvl="3" w:tplc="667655D8">
       <w:numFmt w:val="decimal"/>
       <w:lvlText w:val=""/>
       <w:lvlJc w:val="left"/>
     </w:lvl>
-    <w:lvl w:ilvl="4" w:tplc="4672FBD8">
+    <w:lvl w:ilvl="4" w:tplc="CB2E4C22">
       <w:numFmt w:val="decimal"/>
       <w:lvlText w:val=""/>
       <w:lvlJc w:val="left"/>
     </w:lvl>
-    <w:lvl w:ilvl="5" w:tplc="2A9859CA">
+    <w:lvl w:ilvl="5" w:tplc="473C3B36">
       <w:numFmt w:val="decimal"/>
       <w:lvlText w:val=""/>
       <w:lvlJc w:val="left"/>
     </w:lvl>
-    <w:lvl w:ilvl="6" w:tplc="0596947A">
+    <w:lvl w:ilvl="6" w:tplc="F33CD726">
       <w:numFmt w:val="decimal"/>
       <w:lvlText w:val=""/>
       <w:lvlJc w:val="left"/>
     </w:lvl>
-    <w:lvl w:ilvl="7" w:tplc="79E00058">
+    <w:lvl w:ilvl="7" w:tplc="82CEBCE2">
       <w:numFmt w:val="decimal"/>
       <w:lvlText w:val=""/>
       <w:lvlJc w:val="left"/>
     </w:lvl>
-    <w:lvl w:ilvl="8" w:tplc="ADE47F0A">
+    <w:lvl w:ilvl="8" w:tplc="DC844112">
       <w:numFmt w:val="decimal"/>
       <w:lvlText w:val=""/>
       <w:lvlJc w:val="left"/>
     </w:lvl>
   </w:abstractNum>
-  <w:num w:numId="1" w16cid:durableId="680199688">
+  <w:num w:numId="1" w16cid:durableId="836503378">
     <w:abstractNumId w:val="1"/>
     <w:lvlOverride w:ilvl="0">
       <w:startOverride w:val="1"/>
     </w:lvlOverride>
   </w:num>
-  <w:num w:numId="2" w16cid:durableId="2046825765">
-    <w:abstractNumId w:val="0"/>
+  <w:num w:numId="2" w16cid:durableId="861934762">
+    <w:abstractNumId w:val="2"/>
     <w:lvlOverride w:ilvl="0">
       <w:startOverride w:val="1"/>
     </w:lvlOverride>
   </w:num>
-  <w:num w:numId="3" w16cid:durableId="1024749155">
+  <w:num w:numId="3" w16cid:durableId="1124498399">
     <w:abstractNumId w:val="4"/>
     <w:lvlOverride w:ilvl="0">
       <w:startOverride w:val="1"/>
     </w:lvlOverride>
   </w:num>
-  <w:num w:numId="4" w16cid:durableId="588075676">
+  <w:num w:numId="4" w16cid:durableId="1379427500">
     <w:abstractNumId w:val="3"/>
     <w:lvlOverride w:ilvl="0">
       <w:startOverride w:val="1"/>
     </w:lvlOverride>
   </w:num>
-  <w:num w:numId="5" w16cid:durableId="509026763">
-    <w:abstractNumId w:val="2"/>
+  <w:num w:numId="5" w16cid:durableId="2074547113">
+    <w:abstractNumId w:val="0"/>
     <w:lvlOverride w:ilvl="0">
       <w:startOverride w:val="1"/>
     </w:lvlOverride>
@@ -23848,7 +23848,7 @@
     <w:autoRedefine/>
     <w:uiPriority w:val="39"/>
     <w:unhideWhenUsed/>
-    <w:rsid w:val="00051EE3"/>
+    <w:rsid w:val="0011116F"/>
     <w:pPr>
       <w:spacing w:after="100"/>
     </w:pPr>
@@ -23860,7 +23860,7 @@
     <w:autoRedefine/>
     <w:uiPriority w:val="39"/>
     <w:unhideWhenUsed/>
-    <w:rsid w:val="00051EE3"/>
+    <w:rsid w:val="0011116F"/>
     <w:pPr>
       <w:spacing w:after="100"/>
       <w:ind w:left="210"/>

</xml_diff>

<commit_message>
Introduce ResNet18 better: where it comes from and why the smallest one
</commit_message>
<xml_diff>
--- a/docs/oral_study_guide.docx
+++ b/docs/oral_study_guide.docx
@@ -93,7 +93,7 @@
     <w:sdt>
       <w:sdtPr>
         <w:alias w:val="Contents"/>
-        <w:id w:val="1757172170"/>
+        <w:id w:val="1741831283"/>
       </w:sdtPr>
       <w:sdtEndPr/>
       <w:sdtContent>
@@ -116,7 +116,7 @@
           <w:r>
             <w:fldChar w:fldCharType="separate"/>
           </w:r>
-          <w:hyperlink w:anchor="_Toc243497814" w:history="1">
+          <w:hyperlink w:anchor="_Toc243509134" w:history="1">
             <w:r>
               <w:rPr>
                 <w:rStyle w:val="Lienhypertexte"/>
@@ -140,7 +140,7 @@
               <w:rPr>
                 <w:noProof/>
               </w:rPr>
-              <w:instrText xml:space="preserve"> PAGEREF _Toc243497814 \h </w:instrText>
+              <w:instrText xml:space="preserve"> PAGEREF _Toc243509134 \h </w:instrText>
             </w:r>
             <w:r>
               <w:rPr>
@@ -177,7 +177,7 @@
               <w:noProof/>
             </w:rPr>
           </w:pPr>
-          <w:hyperlink w:anchor="_Toc243497815" w:history="1">
+          <w:hyperlink w:anchor="_Toc243509135" w:history="1">
             <w:r>
               <w:rPr>
                 <w:rStyle w:val="Lienhypertexte"/>
@@ -201,7 +201,7 @@
               <w:rPr>
                 <w:noProof/>
               </w:rPr>
-              <w:instrText xml:space="preserve"> PAGEREF _Toc243497815 \h </w:instrText>
+              <w:instrText xml:space="preserve"> PAGEREF _Toc243509135 \h </w:instrText>
             </w:r>
             <w:r>
               <w:rPr>
@@ -238,7 +238,7 @@
               <w:noProof/>
             </w:rPr>
           </w:pPr>
-          <w:hyperlink w:anchor="_Toc243497816" w:history="1">
+          <w:hyperlink w:anchor="_Toc243509136" w:history="1">
             <w:r>
               <w:rPr>
                 <w:rStyle w:val="Lienhypertexte"/>
@@ -262,7 +262,7 @@
               <w:rPr>
                 <w:noProof/>
               </w:rPr>
-              <w:instrText xml:space="preserve"> PAGEREF _Toc243497816 \h </w:instrText>
+              <w:instrText xml:space="preserve"> PAGEREF _Toc243509136 \h </w:instrText>
             </w:r>
             <w:r>
               <w:rPr>
@@ -299,7 +299,7 @@
               <w:noProof/>
             </w:rPr>
           </w:pPr>
-          <w:hyperlink w:anchor="_Toc243497817" w:history="1">
+          <w:hyperlink w:anchor="_Toc243509137" w:history="1">
             <w:r>
               <w:rPr>
                 <w:rStyle w:val="Lienhypertexte"/>
@@ -323,7 +323,7 @@
               <w:rPr>
                 <w:noProof/>
               </w:rPr>
-              <w:instrText xml:space="preserve"> PAGEREF _Toc243497817 \h </w:instrText>
+              <w:instrText xml:space="preserve"> PAGEREF _Toc243509137 \h </w:instrText>
             </w:r>
             <w:r>
               <w:rPr>
@@ -360,7 +360,7 @@
               <w:noProof/>
             </w:rPr>
           </w:pPr>
-          <w:hyperlink w:anchor="_Toc243497818" w:history="1">
+          <w:hyperlink w:anchor="_Toc243509138" w:history="1">
             <w:r>
               <w:rPr>
                 <w:rStyle w:val="Lienhypertexte"/>
@@ -384,7 +384,7 @@
               <w:rPr>
                 <w:noProof/>
               </w:rPr>
-              <w:instrText xml:space="preserve"> PAGEREF _Toc243497818 \h </w:instrText>
+              <w:instrText xml:space="preserve"> PAGEREF _Toc243509138 \h </w:instrText>
             </w:r>
             <w:r>
               <w:rPr>
@@ -421,7 +421,7 @@
               <w:noProof/>
             </w:rPr>
           </w:pPr>
-          <w:hyperlink w:anchor="_Toc243497819" w:history="1">
+          <w:hyperlink w:anchor="_Toc243509139" w:history="1">
             <w:r>
               <w:rPr>
                 <w:rStyle w:val="Lienhypertexte"/>
@@ -445,7 +445,7 @@
               <w:rPr>
                 <w:noProof/>
               </w:rPr>
-              <w:instrText xml:space="preserve"> PAGEREF _Toc243497819 \h </w:instrText>
+              <w:instrText xml:space="preserve"> PAGEREF _Toc243509139 \h </w:instrText>
             </w:r>
             <w:r>
               <w:rPr>
@@ -482,7 +482,7 @@
               <w:noProof/>
             </w:rPr>
           </w:pPr>
-          <w:hyperlink w:anchor="_Toc243497820" w:history="1">
+          <w:hyperlink w:anchor="_Toc243509140" w:history="1">
             <w:r>
               <w:rPr>
                 <w:rStyle w:val="Lienhypertexte"/>
@@ -506,7 +506,7 @@
               <w:rPr>
                 <w:noProof/>
               </w:rPr>
-              <w:instrText xml:space="preserve"> PAGEREF _Toc243497820 \h </w:instrText>
+              <w:instrText xml:space="preserve"> PAGEREF _Toc243509140 \h </w:instrText>
             </w:r>
             <w:r>
               <w:rPr>
@@ -543,7 +543,7 @@
               <w:noProof/>
             </w:rPr>
           </w:pPr>
-          <w:hyperlink w:anchor="_Toc243497821" w:history="1">
+          <w:hyperlink w:anchor="_Toc243509141" w:history="1">
             <w:r>
               <w:rPr>
                 <w:rStyle w:val="Lienhypertexte"/>
@@ -567,7 +567,7 @@
               <w:rPr>
                 <w:noProof/>
               </w:rPr>
-              <w:instrText xml:space="preserve"> PAGEREF _Toc243497821 \h </w:instrText>
+              <w:instrText xml:space="preserve"> PAGEREF _Toc243509141 \h </w:instrText>
             </w:r>
             <w:r>
               <w:rPr>
@@ -604,7 +604,7 @@
               <w:noProof/>
             </w:rPr>
           </w:pPr>
-          <w:hyperlink w:anchor="_Toc243497822" w:history="1">
+          <w:hyperlink w:anchor="_Toc243509142" w:history="1">
             <w:r>
               <w:rPr>
                 <w:rStyle w:val="Lienhypertexte"/>
@@ -628,7 +628,7 @@
               <w:rPr>
                 <w:noProof/>
               </w:rPr>
-              <w:instrText xml:space="preserve"> PAGEREF _Toc243497822 \h </w:instrText>
+              <w:instrText xml:space="preserve"> PAGEREF _Toc243509142 \h </w:instrText>
             </w:r>
             <w:r>
               <w:rPr>
@@ -665,7 +665,7 @@
               <w:noProof/>
             </w:rPr>
           </w:pPr>
-          <w:hyperlink w:anchor="_Toc243497823" w:history="1">
+          <w:hyperlink w:anchor="_Toc243509143" w:history="1">
             <w:r>
               <w:rPr>
                 <w:rStyle w:val="Lienhypertexte"/>
@@ -689,7 +689,7 @@
               <w:rPr>
                 <w:noProof/>
               </w:rPr>
-              <w:instrText xml:space="preserve"> PAGEREF _Toc243497823 \h </w:instrText>
+              <w:instrText xml:space="preserve"> PAGEREF _Toc243509143 \h </w:instrText>
             </w:r>
             <w:r>
               <w:rPr>
@@ -726,7 +726,7 @@
               <w:noProof/>
             </w:rPr>
           </w:pPr>
-          <w:hyperlink w:anchor="_Toc243497824" w:history="1">
+          <w:hyperlink w:anchor="_Toc243509144" w:history="1">
             <w:r>
               <w:rPr>
                 <w:rStyle w:val="Lienhypertexte"/>
@@ -750,7 +750,7 @@
               <w:rPr>
                 <w:noProof/>
               </w:rPr>
-              <w:instrText xml:space="preserve"> PAGEREF _Toc243497824 \h </w:instrText>
+              <w:instrText xml:space="preserve"> PAGEREF _Toc243509144 \h </w:instrText>
             </w:r>
             <w:r>
               <w:rPr>
@@ -787,7 +787,7 @@
               <w:noProof/>
             </w:rPr>
           </w:pPr>
-          <w:hyperlink w:anchor="_Toc243497825" w:history="1">
+          <w:hyperlink w:anchor="_Toc243509145" w:history="1">
             <w:r>
               <w:rPr>
                 <w:rStyle w:val="Lienhypertexte"/>
@@ -811,7 +811,7 @@
               <w:rPr>
                 <w:noProof/>
               </w:rPr>
-              <w:instrText xml:space="preserve"> PAGEREF _Toc243497825 \h </w:instrText>
+              <w:instrText xml:space="preserve"> PAGEREF _Toc243509145 \h </w:instrText>
             </w:r>
             <w:r>
               <w:rPr>
@@ -848,7 +848,7 @@
               <w:noProof/>
             </w:rPr>
           </w:pPr>
-          <w:hyperlink w:anchor="_Toc243497826" w:history="1">
+          <w:hyperlink w:anchor="_Toc243509146" w:history="1">
             <w:r>
               <w:rPr>
                 <w:rStyle w:val="Lienhypertexte"/>
@@ -872,7 +872,7 @@
               <w:rPr>
                 <w:noProof/>
               </w:rPr>
-              <w:instrText xml:space="preserve"> PAGEREF _Toc243497826 \h </w:instrText>
+              <w:instrText xml:space="preserve"> PAGEREF _Toc243509146 \h </w:instrText>
             </w:r>
             <w:r>
               <w:rPr>
@@ -909,7 +909,7 @@
               <w:noProof/>
             </w:rPr>
           </w:pPr>
-          <w:hyperlink w:anchor="_Toc243497827" w:history="1">
+          <w:hyperlink w:anchor="_Toc243509147" w:history="1">
             <w:r>
               <w:rPr>
                 <w:rStyle w:val="Lienhypertexte"/>
@@ -933,7 +933,7 @@
               <w:rPr>
                 <w:noProof/>
               </w:rPr>
-              <w:instrText xml:space="preserve"> PAGEREF _Toc243497827 \h </w:instrText>
+              <w:instrText xml:space="preserve"> PAGEREF _Toc243509147 \h </w:instrText>
             </w:r>
             <w:r>
               <w:rPr>
@@ -970,7 +970,7 @@
               <w:noProof/>
             </w:rPr>
           </w:pPr>
-          <w:hyperlink w:anchor="_Toc243497828" w:history="1">
+          <w:hyperlink w:anchor="_Toc243509148" w:history="1">
             <w:r>
               <w:rPr>
                 <w:rStyle w:val="Lienhypertexte"/>
@@ -994,7 +994,7 @@
               <w:rPr>
                 <w:noProof/>
               </w:rPr>
-              <w:instrText xml:space="preserve"> PAGEREF _Toc243497828 \h </w:instrText>
+              <w:instrText xml:space="preserve"> PAGEREF _Toc243509148 \h </w:instrText>
             </w:r>
             <w:r>
               <w:rPr>
@@ -1031,7 +1031,7 @@
               <w:noProof/>
             </w:rPr>
           </w:pPr>
-          <w:hyperlink w:anchor="_Toc243497829" w:history="1">
+          <w:hyperlink w:anchor="_Toc243509149" w:history="1">
             <w:r>
               <w:rPr>
                 <w:rStyle w:val="Lienhypertexte"/>
@@ -1055,7 +1055,7 @@
               <w:rPr>
                 <w:noProof/>
               </w:rPr>
-              <w:instrText xml:space="preserve"> PAGEREF _Toc243497829 \h </w:instrText>
+              <w:instrText xml:space="preserve"> PAGEREF _Toc243509149 \h </w:instrText>
             </w:r>
             <w:r>
               <w:rPr>
@@ -1092,7 +1092,7 @@
               <w:noProof/>
             </w:rPr>
           </w:pPr>
-          <w:hyperlink w:anchor="_Toc243497830" w:history="1">
+          <w:hyperlink w:anchor="_Toc243509150" w:history="1">
             <w:r>
               <w:rPr>
                 <w:rStyle w:val="Lienhypertexte"/>
@@ -1116,7 +1116,7 @@
               <w:rPr>
                 <w:noProof/>
               </w:rPr>
-              <w:instrText xml:space="preserve"> PAGEREF _Toc243497830 \h </w:instrText>
+              <w:instrText xml:space="preserve"> PAGEREF _Toc243509150 \h </w:instrText>
             </w:r>
             <w:r>
               <w:rPr>
@@ -1153,7 +1153,7 @@
               <w:noProof/>
             </w:rPr>
           </w:pPr>
-          <w:hyperlink w:anchor="_Toc243497831" w:history="1">
+          <w:hyperlink w:anchor="_Toc243509151" w:history="1">
             <w:r>
               <w:rPr>
                 <w:rStyle w:val="Lienhypertexte"/>
@@ -1177,7 +1177,7 @@
               <w:rPr>
                 <w:noProof/>
               </w:rPr>
-              <w:instrText xml:space="preserve"> PAGEREF _Toc243497831 \h </w:instrText>
+              <w:instrText xml:space="preserve"> PAGEREF _Toc243509151 \h </w:instrText>
             </w:r>
             <w:r>
               <w:rPr>
@@ -1214,7 +1214,7 @@
               <w:noProof/>
             </w:rPr>
           </w:pPr>
-          <w:hyperlink w:anchor="_Toc243497832" w:history="1">
+          <w:hyperlink w:anchor="_Toc243509152" w:history="1">
             <w:r>
               <w:rPr>
                 <w:rStyle w:val="Lienhypertexte"/>
@@ -1238,7 +1238,7 @@
               <w:rPr>
                 <w:noProof/>
               </w:rPr>
-              <w:instrText xml:space="preserve"> PAGEREF _Toc243497832 \h </w:instrText>
+              <w:instrText xml:space="preserve"> PAGEREF _Toc243509152 \h </w:instrText>
             </w:r>
             <w:r>
               <w:rPr>
@@ -1275,7 +1275,7 @@
               <w:noProof/>
             </w:rPr>
           </w:pPr>
-          <w:hyperlink w:anchor="_Toc243497833" w:history="1">
+          <w:hyperlink w:anchor="_Toc243509153" w:history="1">
             <w:r>
               <w:rPr>
                 <w:rStyle w:val="Lienhypertexte"/>
@@ -1299,7 +1299,7 @@
               <w:rPr>
                 <w:noProof/>
               </w:rPr>
-              <w:instrText xml:space="preserve"> PAGEREF _Toc243497833 \h </w:instrText>
+              <w:instrText xml:space="preserve"> PAGEREF _Toc243509153 \h </w:instrText>
             </w:r>
             <w:r>
               <w:rPr>
@@ -1336,7 +1336,7 @@
               <w:noProof/>
             </w:rPr>
           </w:pPr>
-          <w:hyperlink w:anchor="_Toc243497834" w:history="1">
+          <w:hyperlink w:anchor="_Toc243509154" w:history="1">
             <w:r>
               <w:rPr>
                 <w:rStyle w:val="Lienhypertexte"/>
@@ -1360,7 +1360,7 @@
               <w:rPr>
                 <w:noProof/>
               </w:rPr>
-              <w:instrText xml:space="preserve"> PAGEREF _Toc243497834 \h </w:instrText>
+              <w:instrText xml:space="preserve"> PAGEREF _Toc243509154 \h </w:instrText>
             </w:r>
             <w:r>
               <w:rPr>
@@ -1397,7 +1397,7 @@
               <w:noProof/>
             </w:rPr>
           </w:pPr>
-          <w:hyperlink w:anchor="_Toc243497835" w:history="1">
+          <w:hyperlink w:anchor="_Toc243509155" w:history="1">
             <w:r>
               <w:rPr>
                 <w:rStyle w:val="Lienhypertexte"/>
@@ -1421,7 +1421,7 @@
               <w:rPr>
                 <w:noProof/>
               </w:rPr>
-              <w:instrText xml:space="preserve"> PAGEREF _Toc243497835 \h </w:instrText>
+              <w:instrText xml:space="preserve"> PAGEREF _Toc243509155 \h </w:instrText>
             </w:r>
             <w:r>
               <w:rPr>
@@ -1458,7 +1458,7 @@
               <w:noProof/>
             </w:rPr>
           </w:pPr>
-          <w:hyperlink w:anchor="_Toc243497836" w:history="1">
+          <w:hyperlink w:anchor="_Toc243509156" w:history="1">
             <w:r>
               <w:rPr>
                 <w:rStyle w:val="Lienhypertexte"/>
@@ -1482,7 +1482,7 @@
               <w:rPr>
                 <w:noProof/>
               </w:rPr>
-              <w:instrText xml:space="preserve"> PAGEREF _Toc243497836 \h </w:instrText>
+              <w:instrText xml:space="preserve"> PAGEREF _Toc243509156 \h </w:instrText>
             </w:r>
             <w:r>
               <w:rPr>
@@ -1519,7 +1519,7 @@
               <w:noProof/>
             </w:rPr>
           </w:pPr>
-          <w:hyperlink w:anchor="_Toc243497837" w:history="1">
+          <w:hyperlink w:anchor="_Toc243509157" w:history="1">
             <w:r>
               <w:rPr>
                 <w:rStyle w:val="Lienhypertexte"/>
@@ -1543,7 +1543,7 @@
               <w:rPr>
                 <w:noProof/>
               </w:rPr>
-              <w:instrText xml:space="preserve"> PAGEREF _Toc243497837 \h </w:instrText>
+              <w:instrText xml:space="preserve"> PAGEREF _Toc243509157 \h </w:instrText>
             </w:r>
             <w:r>
               <w:rPr>
@@ -1580,7 +1580,7 @@
               <w:noProof/>
             </w:rPr>
           </w:pPr>
-          <w:hyperlink w:anchor="_Toc243497838" w:history="1">
+          <w:hyperlink w:anchor="_Toc243509158" w:history="1">
             <w:r>
               <w:rPr>
                 <w:rStyle w:val="Lienhypertexte"/>
@@ -1604,7 +1604,7 @@
               <w:rPr>
                 <w:noProof/>
               </w:rPr>
-              <w:instrText xml:space="preserve"> PAGEREF _Toc243497838 \h </w:instrText>
+              <w:instrText xml:space="preserve"> PAGEREF _Toc243509158 \h </w:instrText>
             </w:r>
             <w:r>
               <w:rPr>
@@ -1641,7 +1641,7 @@
               <w:noProof/>
             </w:rPr>
           </w:pPr>
-          <w:hyperlink w:anchor="_Toc243497839" w:history="1">
+          <w:hyperlink w:anchor="_Toc243509159" w:history="1">
             <w:r>
               <w:rPr>
                 <w:rStyle w:val="Lienhypertexte"/>
@@ -1665,7 +1665,7 @@
               <w:rPr>
                 <w:noProof/>
               </w:rPr>
-              <w:instrText xml:space="preserve"> PAGEREF _Toc243497839 \h </w:instrText>
+              <w:instrText xml:space="preserve"> PAGEREF _Toc243509159 \h </w:instrText>
             </w:r>
             <w:r>
               <w:rPr>
@@ -1702,7 +1702,7 @@
               <w:noProof/>
             </w:rPr>
           </w:pPr>
-          <w:hyperlink w:anchor="_Toc243497840" w:history="1">
+          <w:hyperlink w:anchor="_Toc243509160" w:history="1">
             <w:r>
               <w:rPr>
                 <w:rStyle w:val="Lienhypertexte"/>
@@ -1726,7 +1726,7 @@
               <w:rPr>
                 <w:noProof/>
               </w:rPr>
-              <w:instrText xml:space="preserve"> PAGEREF _Toc243497840 \h </w:instrText>
+              <w:instrText xml:space="preserve"> PAGEREF _Toc243509160 \h </w:instrText>
             </w:r>
             <w:r>
               <w:rPr>
@@ -1763,7 +1763,7 @@
               <w:noProof/>
             </w:rPr>
           </w:pPr>
-          <w:hyperlink w:anchor="_Toc243497841" w:history="1">
+          <w:hyperlink w:anchor="_Toc243509161" w:history="1">
             <w:r>
               <w:rPr>
                 <w:rStyle w:val="Lienhypertexte"/>
@@ -1787,7 +1787,7 @@
               <w:rPr>
                 <w:noProof/>
               </w:rPr>
-              <w:instrText xml:space="preserve"> PAGEREF _Toc243497841 \h </w:instrText>
+              <w:instrText xml:space="preserve"> PAGEREF _Toc243509161 \h </w:instrText>
             </w:r>
             <w:r>
               <w:rPr>
@@ -1824,7 +1824,7 @@
               <w:noProof/>
             </w:rPr>
           </w:pPr>
-          <w:hyperlink w:anchor="_Toc243497842" w:history="1">
+          <w:hyperlink w:anchor="_Toc243509162" w:history="1">
             <w:r>
               <w:rPr>
                 <w:rStyle w:val="Lienhypertexte"/>
@@ -1848,7 +1848,7 @@
               <w:rPr>
                 <w:noProof/>
               </w:rPr>
-              <w:instrText xml:space="preserve"> PAGEREF _Toc243497842 \h </w:instrText>
+              <w:instrText xml:space="preserve"> PAGEREF _Toc243509162 \h </w:instrText>
             </w:r>
             <w:r>
               <w:rPr>
@@ -1885,7 +1885,7 @@
               <w:noProof/>
             </w:rPr>
           </w:pPr>
-          <w:hyperlink w:anchor="_Toc243497843" w:history="1">
+          <w:hyperlink w:anchor="_Toc243509163" w:history="1">
             <w:r>
               <w:rPr>
                 <w:rStyle w:val="Lienhypertexte"/>
@@ -1909,7 +1909,7 @@
               <w:rPr>
                 <w:noProof/>
               </w:rPr>
-              <w:instrText xml:space="preserve"> PAGEREF _Toc243497843 \h </w:instrText>
+              <w:instrText xml:space="preserve"> PAGEREF _Toc243509163 \h </w:instrText>
             </w:r>
             <w:r>
               <w:rPr>
@@ -1946,7 +1946,7 @@
               <w:noProof/>
             </w:rPr>
           </w:pPr>
-          <w:hyperlink w:anchor="_Toc243497844" w:history="1">
+          <w:hyperlink w:anchor="_Toc243509164" w:history="1">
             <w:r>
               <w:rPr>
                 <w:rStyle w:val="Lienhypertexte"/>
@@ -1970,7 +1970,7 @@
               <w:rPr>
                 <w:noProof/>
               </w:rPr>
-              <w:instrText xml:space="preserve"> PAGEREF _Toc243497844 \h </w:instrText>
+              <w:instrText xml:space="preserve"> PAGEREF _Toc243509164 \h </w:instrText>
             </w:r>
             <w:r>
               <w:rPr>
@@ -2007,7 +2007,7 @@
               <w:noProof/>
             </w:rPr>
           </w:pPr>
-          <w:hyperlink w:anchor="_Toc243497845" w:history="1">
+          <w:hyperlink w:anchor="_Toc243509165" w:history="1">
             <w:r>
               <w:rPr>
                 <w:rStyle w:val="Lienhypertexte"/>
@@ -2031,7 +2031,7 @@
               <w:rPr>
                 <w:noProof/>
               </w:rPr>
-              <w:instrText xml:space="preserve"> PAGEREF _Toc243497845 \h </w:instrText>
+              <w:instrText xml:space="preserve"> PAGEREF _Toc243509165 \h </w:instrText>
             </w:r>
             <w:r>
               <w:rPr>
@@ -2068,7 +2068,7 @@
               <w:noProof/>
             </w:rPr>
           </w:pPr>
-          <w:hyperlink w:anchor="_Toc243497846" w:history="1">
+          <w:hyperlink w:anchor="_Toc243509166" w:history="1">
             <w:r>
               <w:rPr>
                 <w:rStyle w:val="Lienhypertexte"/>
@@ -2092,7 +2092,7 @@
               <w:rPr>
                 <w:noProof/>
               </w:rPr>
-              <w:instrText xml:space="preserve"> PAGEREF _Toc243497846 \h </w:instrText>
+              <w:instrText xml:space="preserve"> PAGEREF _Toc243509166 \h </w:instrText>
             </w:r>
             <w:r>
               <w:rPr>
@@ -2129,7 +2129,7 @@
               <w:noProof/>
             </w:rPr>
           </w:pPr>
-          <w:hyperlink w:anchor="_Toc243497847" w:history="1">
+          <w:hyperlink w:anchor="_Toc243509167" w:history="1">
             <w:r>
               <w:rPr>
                 <w:rStyle w:val="Lienhypertexte"/>
@@ -2153,7 +2153,7 @@
               <w:rPr>
                 <w:noProof/>
               </w:rPr>
-              <w:instrText xml:space="preserve"> PAGEREF _Toc243497847 \h </w:instrText>
+              <w:instrText xml:space="preserve"> PAGEREF _Toc243509167 \h </w:instrText>
             </w:r>
             <w:r>
               <w:rPr>
@@ -2190,7 +2190,7 @@
               <w:noProof/>
             </w:rPr>
           </w:pPr>
-          <w:hyperlink w:anchor="_Toc243497848" w:history="1">
+          <w:hyperlink w:anchor="_Toc243509168" w:history="1">
             <w:r>
               <w:rPr>
                 <w:rStyle w:val="Lienhypertexte"/>
@@ -2214,7 +2214,7 @@
               <w:rPr>
                 <w:noProof/>
               </w:rPr>
-              <w:instrText xml:space="preserve"> PAGEREF _Toc243497848 \h </w:instrText>
+              <w:instrText xml:space="preserve"> PAGEREF _Toc243509168 \h </w:instrText>
             </w:r>
             <w:r>
               <w:rPr>
@@ -2251,7 +2251,7 @@
               <w:noProof/>
             </w:rPr>
           </w:pPr>
-          <w:hyperlink w:anchor="_Toc243497849" w:history="1">
+          <w:hyperlink w:anchor="_Toc243509169" w:history="1">
             <w:r>
               <w:rPr>
                 <w:rStyle w:val="Lienhypertexte"/>
@@ -2275,7 +2275,7 @@
               <w:rPr>
                 <w:noProof/>
               </w:rPr>
-              <w:instrText xml:space="preserve"> PAGEREF _Toc243497849 \h </w:instrText>
+              <w:instrText xml:space="preserve"> PAGEREF _Toc243509169 \h </w:instrText>
             </w:r>
             <w:r>
               <w:rPr>
@@ -2312,7 +2312,7 @@
               <w:noProof/>
             </w:rPr>
           </w:pPr>
-          <w:hyperlink w:anchor="_Toc243497850" w:history="1">
+          <w:hyperlink w:anchor="_Toc243509170" w:history="1">
             <w:r>
               <w:rPr>
                 <w:rStyle w:val="Lienhypertexte"/>
@@ -2336,7 +2336,7 @@
               <w:rPr>
                 <w:noProof/>
               </w:rPr>
-              <w:instrText xml:space="preserve"> PAGEREF _Toc243497850 \h </w:instrText>
+              <w:instrText xml:space="preserve"> PAGEREF _Toc243509170 \h </w:instrText>
             </w:r>
             <w:r>
               <w:rPr>
@@ -2373,7 +2373,7 @@
               <w:noProof/>
             </w:rPr>
           </w:pPr>
-          <w:hyperlink w:anchor="_Toc243497851" w:history="1">
+          <w:hyperlink w:anchor="_Toc243509171" w:history="1">
             <w:r>
               <w:rPr>
                 <w:rStyle w:val="Lienhypertexte"/>
@@ -2397,7 +2397,7 @@
               <w:rPr>
                 <w:noProof/>
               </w:rPr>
-              <w:instrText xml:space="preserve"> PAGEREF _Toc243497851 \h </w:instrText>
+              <w:instrText xml:space="preserve"> PAGEREF _Toc243509171 \h </w:instrText>
             </w:r>
             <w:r>
               <w:rPr>
@@ -2434,7 +2434,7 @@
               <w:noProof/>
             </w:rPr>
           </w:pPr>
-          <w:hyperlink w:anchor="_Toc243497852" w:history="1">
+          <w:hyperlink w:anchor="_Toc243509172" w:history="1">
             <w:r>
               <w:rPr>
                 <w:rStyle w:val="Lienhypertexte"/>
@@ -2458,7 +2458,7 @@
               <w:rPr>
                 <w:noProof/>
               </w:rPr>
-              <w:instrText xml:space="preserve"> PAGEREF _Toc243497852 \h </w:instrText>
+              <w:instrText xml:space="preserve"> PAGEREF _Toc243509172 \h </w:instrText>
             </w:r>
             <w:r>
               <w:rPr>
@@ -2495,7 +2495,7 @@
               <w:noProof/>
             </w:rPr>
           </w:pPr>
-          <w:hyperlink w:anchor="_Toc243497853" w:history="1">
+          <w:hyperlink w:anchor="_Toc243509173" w:history="1">
             <w:r>
               <w:rPr>
                 <w:rStyle w:val="Lienhypertexte"/>
@@ -2519,7 +2519,7 @@
               <w:rPr>
                 <w:noProof/>
               </w:rPr>
-              <w:instrText xml:space="preserve"> PAGEREF _Toc243497853 \h </w:instrText>
+              <w:instrText xml:space="preserve"> PAGEREF _Toc243509173 \h </w:instrText>
             </w:r>
             <w:r>
               <w:rPr>
@@ -2556,7 +2556,7 @@
               <w:noProof/>
             </w:rPr>
           </w:pPr>
-          <w:hyperlink w:anchor="_Toc243497854" w:history="1">
+          <w:hyperlink w:anchor="_Toc243509174" w:history="1">
             <w:r>
               <w:rPr>
                 <w:rStyle w:val="Lienhypertexte"/>
@@ -2580,7 +2580,7 @@
               <w:rPr>
                 <w:noProof/>
               </w:rPr>
-              <w:instrText xml:space="preserve"> PAGEREF _Toc243497854 \h </w:instrText>
+              <w:instrText xml:space="preserve"> PAGEREF _Toc243509174 \h </w:instrText>
             </w:r>
             <w:r>
               <w:rPr>
@@ -2617,7 +2617,7 @@
               <w:noProof/>
             </w:rPr>
           </w:pPr>
-          <w:hyperlink w:anchor="_Toc243497855" w:history="1">
+          <w:hyperlink w:anchor="_Toc243509175" w:history="1">
             <w:r>
               <w:rPr>
                 <w:rStyle w:val="Lienhypertexte"/>
@@ -2641,7 +2641,7 @@
               <w:rPr>
                 <w:noProof/>
               </w:rPr>
-              <w:instrText xml:space="preserve"> PAGEREF _Toc243497855 \h </w:instrText>
+              <w:instrText xml:space="preserve"> PAGEREF _Toc243509175 \h </w:instrText>
             </w:r>
             <w:r>
               <w:rPr>
@@ -2678,7 +2678,7 @@
               <w:noProof/>
             </w:rPr>
           </w:pPr>
-          <w:hyperlink w:anchor="_Toc243497856" w:history="1">
+          <w:hyperlink w:anchor="_Toc243509176" w:history="1">
             <w:r>
               <w:rPr>
                 <w:rStyle w:val="Lienhypertexte"/>
@@ -2702,7 +2702,7 @@
               <w:rPr>
                 <w:noProof/>
               </w:rPr>
-              <w:instrText xml:space="preserve"> PAGEREF _Toc243497856 \h </w:instrText>
+              <w:instrText xml:space="preserve"> PAGEREF _Toc243509176 \h </w:instrText>
             </w:r>
             <w:r>
               <w:rPr>
@@ -2739,7 +2739,7 @@
               <w:noProof/>
             </w:rPr>
           </w:pPr>
-          <w:hyperlink w:anchor="_Toc243497857" w:history="1">
+          <w:hyperlink w:anchor="_Toc243509177" w:history="1">
             <w:r>
               <w:rPr>
                 <w:rStyle w:val="Lienhypertexte"/>
@@ -2763,7 +2763,7 @@
               <w:rPr>
                 <w:noProof/>
               </w:rPr>
-              <w:instrText xml:space="preserve"> PAGEREF _Toc243497857 \h </w:instrText>
+              <w:instrText xml:space="preserve"> PAGEREF _Toc243509177 \h </w:instrText>
             </w:r>
             <w:r>
               <w:rPr>
@@ -2800,7 +2800,7 @@
               <w:noProof/>
             </w:rPr>
           </w:pPr>
-          <w:hyperlink w:anchor="_Toc243497858" w:history="1">
+          <w:hyperlink w:anchor="_Toc243509178" w:history="1">
             <w:r>
               <w:rPr>
                 <w:rStyle w:val="Lienhypertexte"/>
@@ -2824,7 +2824,7 @@
               <w:rPr>
                 <w:noProof/>
               </w:rPr>
-              <w:instrText xml:space="preserve"> PAGEREF _Toc243497858 \h </w:instrText>
+              <w:instrText xml:space="preserve"> PAGEREF _Toc243509178 \h </w:instrText>
             </w:r>
             <w:r>
               <w:rPr>
@@ -2861,7 +2861,7 @@
               <w:noProof/>
             </w:rPr>
           </w:pPr>
-          <w:hyperlink w:anchor="_Toc243497859" w:history="1">
+          <w:hyperlink w:anchor="_Toc243509179" w:history="1">
             <w:r>
               <w:rPr>
                 <w:rStyle w:val="Lienhypertexte"/>
@@ -2885,7 +2885,7 @@
               <w:rPr>
                 <w:noProof/>
               </w:rPr>
-              <w:instrText xml:space="preserve"> PAGEREF _Toc243497859 \h </w:instrText>
+              <w:instrText xml:space="preserve"> PAGEREF _Toc243509179 \h </w:instrText>
             </w:r>
             <w:r>
               <w:rPr>
@@ -2922,7 +2922,7 @@
               <w:noProof/>
             </w:rPr>
           </w:pPr>
-          <w:hyperlink w:anchor="_Toc243497860" w:history="1">
+          <w:hyperlink w:anchor="_Toc243509180" w:history="1">
             <w:r>
               <w:rPr>
                 <w:rStyle w:val="Lienhypertexte"/>
@@ -2946,7 +2946,7 @@
               <w:rPr>
                 <w:noProof/>
               </w:rPr>
-              <w:instrText xml:space="preserve"> PAGEREF _Toc243497860 \h </w:instrText>
+              <w:instrText xml:space="preserve"> PAGEREF _Toc243509180 \h </w:instrText>
             </w:r>
             <w:r>
               <w:rPr>
@@ -2983,7 +2983,7 @@
               <w:noProof/>
             </w:rPr>
           </w:pPr>
-          <w:hyperlink w:anchor="_Toc243497861" w:history="1">
+          <w:hyperlink w:anchor="_Toc243509181" w:history="1">
             <w:r>
               <w:rPr>
                 <w:rStyle w:val="Lienhypertexte"/>
@@ -3007,7 +3007,7 @@
               <w:rPr>
                 <w:noProof/>
               </w:rPr>
-              <w:instrText xml:space="preserve"> PAGEREF _Toc243497861 \h </w:instrText>
+              <w:instrText xml:space="preserve"> PAGEREF _Toc243509181 \h </w:instrText>
             </w:r>
             <w:r>
               <w:rPr>
@@ -3044,7 +3044,7 @@
               <w:noProof/>
             </w:rPr>
           </w:pPr>
-          <w:hyperlink w:anchor="_Toc243497862" w:history="1">
+          <w:hyperlink w:anchor="_Toc243509182" w:history="1">
             <w:r>
               <w:rPr>
                 <w:rStyle w:val="Lienhypertexte"/>
@@ -3068,7 +3068,7 @@
               <w:rPr>
                 <w:noProof/>
               </w:rPr>
-              <w:instrText xml:space="preserve"> PAGEREF _Toc243497862 \h </w:instrText>
+              <w:instrText xml:space="preserve"> PAGEREF _Toc243509182 \h </w:instrText>
             </w:r>
             <w:r>
               <w:rPr>
@@ -3105,7 +3105,7 @@
               <w:noProof/>
             </w:rPr>
           </w:pPr>
-          <w:hyperlink w:anchor="_Toc243497863" w:history="1">
+          <w:hyperlink w:anchor="_Toc243509183" w:history="1">
             <w:r>
               <w:rPr>
                 <w:rStyle w:val="Lienhypertexte"/>
@@ -3129,7 +3129,7 @@
               <w:rPr>
                 <w:noProof/>
               </w:rPr>
-              <w:instrText xml:space="preserve"> PAGEREF _Toc243497863 \h </w:instrText>
+              <w:instrText xml:space="preserve"> PAGEREF _Toc243509183 \h </w:instrText>
             </w:r>
             <w:r>
               <w:rPr>
@@ -3166,7 +3166,7 @@
               <w:noProof/>
             </w:rPr>
           </w:pPr>
-          <w:hyperlink w:anchor="_Toc243497864" w:history="1">
+          <w:hyperlink w:anchor="_Toc243509184" w:history="1">
             <w:r>
               <w:rPr>
                 <w:rStyle w:val="Lienhypertexte"/>
@@ -3190,7 +3190,7 @@
               <w:rPr>
                 <w:noProof/>
               </w:rPr>
-              <w:instrText xml:space="preserve"> PAGEREF _Toc243497864 \h </w:instrText>
+              <w:instrText xml:space="preserve"> PAGEREF _Toc243509184 \h </w:instrText>
             </w:r>
             <w:r>
               <w:rPr>
@@ -3227,7 +3227,7 @@
               <w:noProof/>
             </w:rPr>
           </w:pPr>
-          <w:hyperlink w:anchor="_Toc243497865" w:history="1">
+          <w:hyperlink w:anchor="_Toc243509185" w:history="1">
             <w:r>
               <w:rPr>
                 <w:rStyle w:val="Lienhypertexte"/>
@@ -3251,7 +3251,7 @@
               <w:rPr>
                 <w:noProof/>
               </w:rPr>
-              <w:instrText xml:space="preserve"> PAGEREF _Toc243497865 \h </w:instrText>
+              <w:instrText xml:space="preserve"> PAGEREF _Toc243509185 \h </w:instrText>
             </w:r>
             <w:r>
               <w:rPr>
@@ -3288,7 +3288,7 @@
               <w:noProof/>
             </w:rPr>
           </w:pPr>
-          <w:hyperlink w:anchor="_Toc243497866" w:history="1">
+          <w:hyperlink w:anchor="_Toc243509186" w:history="1">
             <w:r>
               <w:rPr>
                 <w:rStyle w:val="Lienhypertexte"/>
@@ -3312,7 +3312,7 @@
               <w:rPr>
                 <w:noProof/>
               </w:rPr>
-              <w:instrText xml:space="preserve"> PAGEREF _Toc243497866 \h </w:instrText>
+              <w:instrText xml:space="preserve"> PAGEREF _Toc243509186 \h </w:instrText>
             </w:r>
             <w:r>
               <w:rPr>
@@ -3349,7 +3349,7 @@
               <w:noProof/>
             </w:rPr>
           </w:pPr>
-          <w:hyperlink w:anchor="_Toc243497867" w:history="1">
+          <w:hyperlink w:anchor="_Toc243509187" w:history="1">
             <w:r>
               <w:rPr>
                 <w:rStyle w:val="Lienhypertexte"/>
@@ -3373,7 +3373,7 @@
               <w:rPr>
                 <w:noProof/>
               </w:rPr>
-              <w:instrText xml:space="preserve"> PAGEREF _Toc243497867 \h </w:instrText>
+              <w:instrText xml:space="preserve"> PAGEREF _Toc243509187 \h </w:instrText>
             </w:r>
             <w:r>
               <w:rPr>
@@ -3410,7 +3410,7 @@
               <w:noProof/>
             </w:rPr>
           </w:pPr>
-          <w:hyperlink w:anchor="_Toc243497868" w:history="1">
+          <w:hyperlink w:anchor="_Toc243509188" w:history="1">
             <w:r>
               <w:rPr>
                 <w:rStyle w:val="Lienhypertexte"/>
@@ -3434,7 +3434,7 @@
               <w:rPr>
                 <w:noProof/>
               </w:rPr>
-              <w:instrText xml:space="preserve"> PAGEREF _Toc243497868 \h </w:instrText>
+              <w:instrText xml:space="preserve"> PAGEREF _Toc243509188 \h </w:instrText>
             </w:r>
             <w:r>
               <w:rPr>
@@ -3471,7 +3471,7 @@
               <w:noProof/>
             </w:rPr>
           </w:pPr>
-          <w:hyperlink w:anchor="_Toc243497869" w:history="1">
+          <w:hyperlink w:anchor="_Toc243509189" w:history="1">
             <w:r>
               <w:rPr>
                 <w:rStyle w:val="Lienhypertexte"/>
@@ -3495,7 +3495,7 @@
               <w:rPr>
                 <w:noProof/>
               </w:rPr>
-              <w:instrText xml:space="preserve"> PAGEREF _Toc243497869 \h </w:instrText>
+              <w:instrText xml:space="preserve"> PAGEREF _Toc243509189 \h </w:instrText>
             </w:r>
             <w:r>
               <w:rPr>
@@ -3532,7 +3532,7 @@
               <w:noProof/>
             </w:rPr>
           </w:pPr>
-          <w:hyperlink w:anchor="_Toc243497870" w:history="1">
+          <w:hyperlink w:anchor="_Toc243509190" w:history="1">
             <w:r>
               <w:rPr>
                 <w:rStyle w:val="Lienhypertexte"/>
@@ -3556,7 +3556,7 @@
               <w:rPr>
                 <w:noProof/>
               </w:rPr>
-              <w:instrText xml:space="preserve"> PAGEREF _Toc243497870 \h </w:instrText>
+              <w:instrText xml:space="preserve"> PAGEREF _Toc243509190 \h </w:instrText>
             </w:r>
             <w:r>
               <w:rPr>
@@ -3593,7 +3593,7 @@
               <w:noProof/>
             </w:rPr>
           </w:pPr>
-          <w:hyperlink w:anchor="_Toc243497871" w:history="1">
+          <w:hyperlink w:anchor="_Toc243509191" w:history="1">
             <w:r>
               <w:rPr>
                 <w:rStyle w:val="Lienhypertexte"/>
@@ -3617,7 +3617,7 @@
               <w:rPr>
                 <w:noProof/>
               </w:rPr>
-              <w:instrText xml:space="preserve"> PAGEREF _Toc243497871 \h </w:instrText>
+              <w:instrText xml:space="preserve"> PAGEREF _Toc243509191 \h </w:instrText>
             </w:r>
             <w:r>
               <w:rPr>
@@ -3654,7 +3654,7 @@
               <w:noProof/>
             </w:rPr>
           </w:pPr>
-          <w:hyperlink w:anchor="_Toc243497872" w:history="1">
+          <w:hyperlink w:anchor="_Toc243509192" w:history="1">
             <w:r>
               <w:rPr>
                 <w:rStyle w:val="Lienhypertexte"/>
@@ -3678,7 +3678,7 @@
               <w:rPr>
                 <w:noProof/>
               </w:rPr>
-              <w:instrText xml:space="preserve"> PAGEREF _Toc243497872 \h </w:instrText>
+              <w:instrText xml:space="preserve"> PAGEREF _Toc243509192 \h </w:instrText>
             </w:r>
             <w:r>
               <w:rPr>
@@ -3715,7 +3715,7 @@
               <w:noProof/>
             </w:rPr>
           </w:pPr>
-          <w:hyperlink w:anchor="_Toc243497873" w:history="1">
+          <w:hyperlink w:anchor="_Toc243509193" w:history="1">
             <w:r>
               <w:rPr>
                 <w:rStyle w:val="Lienhypertexte"/>
@@ -3739,7 +3739,7 @@
               <w:rPr>
                 <w:noProof/>
               </w:rPr>
-              <w:instrText xml:space="preserve"> PAGEREF _Toc243497873 \h </w:instrText>
+              <w:instrText xml:space="preserve"> PAGEREF _Toc243509193 \h </w:instrText>
             </w:r>
             <w:r>
               <w:rPr>
@@ -3776,7 +3776,7 @@
               <w:noProof/>
             </w:rPr>
           </w:pPr>
-          <w:hyperlink w:anchor="_Toc243497874" w:history="1">
+          <w:hyperlink w:anchor="_Toc243509194" w:history="1">
             <w:r>
               <w:rPr>
                 <w:rStyle w:val="Lienhypertexte"/>
@@ -3800,7 +3800,7 @@
               <w:rPr>
                 <w:noProof/>
               </w:rPr>
-              <w:instrText xml:space="preserve"> PAGEREF _Toc243497874 \h </w:instrText>
+              <w:instrText xml:space="preserve"> PAGEREF _Toc243509194 \h </w:instrText>
             </w:r>
             <w:r>
               <w:rPr>
@@ -3837,7 +3837,7 @@
               <w:noProof/>
             </w:rPr>
           </w:pPr>
-          <w:hyperlink w:anchor="_Toc243497875" w:history="1">
+          <w:hyperlink w:anchor="_Toc243509195" w:history="1">
             <w:r>
               <w:rPr>
                 <w:rStyle w:val="Lienhypertexte"/>
@@ -3861,7 +3861,7 @@
               <w:rPr>
                 <w:noProof/>
               </w:rPr>
-              <w:instrText xml:space="preserve"> PAGEREF _Toc243497875 \h </w:instrText>
+              <w:instrText xml:space="preserve"> PAGEREF _Toc243509195 \h </w:instrText>
             </w:r>
             <w:r>
               <w:rPr>
@@ -3898,7 +3898,7 @@
               <w:noProof/>
             </w:rPr>
           </w:pPr>
-          <w:hyperlink w:anchor="_Toc243497876" w:history="1">
+          <w:hyperlink w:anchor="_Toc243509196" w:history="1">
             <w:r>
               <w:rPr>
                 <w:rStyle w:val="Lienhypertexte"/>
@@ -3922,7 +3922,7 @@
               <w:rPr>
                 <w:noProof/>
               </w:rPr>
-              <w:instrText xml:space="preserve"> PAGEREF _Toc243497876 \h </w:instrText>
+              <w:instrText xml:space="preserve"> PAGEREF _Toc243509196 \h </w:instrText>
             </w:r>
             <w:r>
               <w:rPr>
@@ -3959,7 +3959,7 @@
               <w:noProof/>
             </w:rPr>
           </w:pPr>
-          <w:hyperlink w:anchor="_Toc243497877" w:history="1">
+          <w:hyperlink w:anchor="_Toc243509197" w:history="1">
             <w:r>
               <w:rPr>
                 <w:rStyle w:val="Lienhypertexte"/>
@@ -3983,7 +3983,7 @@
               <w:rPr>
                 <w:noProof/>
               </w:rPr>
-              <w:instrText xml:space="preserve"> PAGEREF _Toc243497877 \h </w:instrText>
+              <w:instrText xml:space="preserve"> PAGEREF _Toc243509197 \h </w:instrText>
             </w:r>
             <w:r>
               <w:rPr>
@@ -4020,7 +4020,7 @@
               <w:noProof/>
             </w:rPr>
           </w:pPr>
-          <w:hyperlink w:anchor="_Toc243497878" w:history="1">
+          <w:hyperlink w:anchor="_Toc243509198" w:history="1">
             <w:r>
               <w:rPr>
                 <w:rStyle w:val="Lienhypertexte"/>
@@ -4044,7 +4044,7 @@
               <w:rPr>
                 <w:noProof/>
               </w:rPr>
-              <w:instrText xml:space="preserve"> PAGEREF _Toc243497878 \h </w:instrText>
+              <w:instrText xml:space="preserve"> PAGEREF _Toc243509198 \h </w:instrText>
             </w:r>
             <w:r>
               <w:rPr>
@@ -4081,7 +4081,7 @@
               <w:noProof/>
             </w:rPr>
           </w:pPr>
-          <w:hyperlink w:anchor="_Toc243497879" w:history="1">
+          <w:hyperlink w:anchor="_Toc243509199" w:history="1">
             <w:r>
               <w:rPr>
                 <w:rStyle w:val="Lienhypertexte"/>
@@ -4105,7 +4105,7 @@
               <w:rPr>
                 <w:noProof/>
               </w:rPr>
-              <w:instrText xml:space="preserve"> PAGEREF _Toc243497879 \h </w:instrText>
+              <w:instrText xml:space="preserve"> PAGEREF _Toc243509199 \h </w:instrText>
             </w:r>
             <w:r>
               <w:rPr>
@@ -4122,7 +4122,7 @@
               <w:rPr>
                 <w:noProof/>
               </w:rPr>
-              <w:t>31</w:t>
+              <w:t>32</w:t>
             </w:r>
             <w:r>
               <w:rPr>
@@ -4142,7 +4142,7 @@
               <w:noProof/>
             </w:rPr>
           </w:pPr>
-          <w:hyperlink w:anchor="_Toc243497880" w:history="1">
+          <w:hyperlink w:anchor="_Toc243509200" w:history="1">
             <w:r>
               <w:rPr>
                 <w:rStyle w:val="Lienhypertexte"/>
@@ -4166,7 +4166,7 @@
               <w:rPr>
                 <w:noProof/>
               </w:rPr>
-              <w:instrText xml:space="preserve"> PAGEREF _Toc243497880 \h </w:instrText>
+              <w:instrText xml:space="preserve"> PAGEREF _Toc243509200 \h </w:instrText>
             </w:r>
             <w:r>
               <w:rPr>
@@ -4203,7 +4203,7 @@
               <w:noProof/>
             </w:rPr>
           </w:pPr>
-          <w:hyperlink w:anchor="_Toc243497881" w:history="1">
+          <w:hyperlink w:anchor="_Toc243509201" w:history="1">
             <w:r>
               <w:rPr>
                 <w:rStyle w:val="Lienhypertexte"/>
@@ -4227,7 +4227,7 @@
               <w:rPr>
                 <w:noProof/>
               </w:rPr>
-              <w:instrText xml:space="preserve"> PAGEREF _Toc243497881 \h </w:instrText>
+              <w:instrText xml:space="preserve"> PAGEREF _Toc243509201 \h </w:instrText>
             </w:r>
             <w:r>
               <w:rPr>
@@ -4264,7 +4264,7 @@
               <w:noProof/>
             </w:rPr>
           </w:pPr>
-          <w:hyperlink w:anchor="_Toc243497882" w:history="1">
+          <w:hyperlink w:anchor="_Toc243509202" w:history="1">
             <w:r>
               <w:rPr>
                 <w:rStyle w:val="Lienhypertexte"/>
@@ -4288,7 +4288,7 @@
               <w:rPr>
                 <w:noProof/>
               </w:rPr>
-              <w:instrText xml:space="preserve"> PAGEREF _Toc243497882 \h </w:instrText>
+              <w:instrText xml:space="preserve"> PAGEREF _Toc243509202 \h </w:instrText>
             </w:r>
             <w:r>
               <w:rPr>
@@ -4325,7 +4325,7 @@
               <w:noProof/>
             </w:rPr>
           </w:pPr>
-          <w:hyperlink w:anchor="_Toc243497883" w:history="1">
+          <w:hyperlink w:anchor="_Toc243509203" w:history="1">
             <w:r>
               <w:rPr>
                 <w:rStyle w:val="Lienhypertexte"/>
@@ -4349,7 +4349,7 @@
               <w:rPr>
                 <w:noProof/>
               </w:rPr>
-              <w:instrText xml:space="preserve"> PAGEREF _Toc243497883 \h </w:instrText>
+              <w:instrText xml:space="preserve"> PAGEREF _Toc243509203 \h </w:instrText>
             </w:r>
             <w:r>
               <w:rPr>
@@ -4386,7 +4386,7 @@
               <w:noProof/>
             </w:rPr>
           </w:pPr>
-          <w:hyperlink w:anchor="_Toc243497884" w:history="1">
+          <w:hyperlink w:anchor="_Toc243509204" w:history="1">
             <w:r>
               <w:rPr>
                 <w:rStyle w:val="Lienhypertexte"/>
@@ -4410,7 +4410,7 @@
               <w:rPr>
                 <w:noProof/>
               </w:rPr>
-              <w:instrText xml:space="preserve"> PAGEREF _Toc243497884 \h </w:instrText>
+              <w:instrText xml:space="preserve"> PAGEREF _Toc243509204 \h </w:instrText>
             </w:r>
             <w:r>
               <w:rPr>
@@ -4449,7 +4449,7 @@
         <w:pStyle w:val="Titre1"/>
         <w:pageBreakBefore/>
       </w:pPr>
-      <w:bookmarkStart w:id="0" w:name="_Toc243497814"/>
+      <w:bookmarkStart w:id="0" w:name="_Toc243509134"/>
       <w:r>
         <w:lastRenderedPageBreak/>
         <w:t>1. The pitch in 60 seconds</w:t>
@@ -4668,7 +4668,7 @@
         <w:pStyle w:val="Titre1"/>
         <w:pageBreakBefore/>
       </w:pPr>
-      <w:bookmarkStart w:id="1" w:name="_Toc243497815"/>
+      <w:bookmarkStart w:id="1" w:name="_Toc243509135"/>
       <w:r>
         <w:lastRenderedPageBreak/>
         <w:t>2. The basic ideas, explained simply</w:t>
@@ -4773,7 +4773,7 @@
       <w:pPr>
         <w:pStyle w:val="Titre2"/>
       </w:pPr>
-      <w:bookmarkStart w:id="2" w:name="_Toc243497816"/>
+      <w:bookmarkStart w:id="2" w:name="_Toc243509136"/>
       <w:r>
         <w:t>A neuron, weights and a network</w:t>
       </w:r>
@@ -4843,7 +4843,7 @@
       <w:pPr>
         <w:pStyle w:val="Titre2"/>
       </w:pPr>
-      <w:bookmarkStart w:id="3" w:name="_Toc243497817"/>
+      <w:bookmarkStart w:id="3" w:name="_Toc243509137"/>
       <w:r>
         <w:t>The loss: how wrong we are</w:t>
       </w:r>
@@ -4903,7 +4903,7 @@
       <w:pPr>
         <w:pStyle w:val="Titre2"/>
       </w:pPr>
-      <w:bookmarkStart w:id="4" w:name="_Toc243497818"/>
+      <w:bookmarkStart w:id="4" w:name="_Toc243509138"/>
       <w:r>
         <w:t>Gradient descent and the learning rate</w:t>
       </w:r>
@@ -4973,7 +4973,7 @@
       <w:pPr>
         <w:pStyle w:val="Titre2"/>
       </w:pPr>
-      <w:bookmarkStart w:id="5" w:name="_Toc243497819"/>
+      <w:bookmarkStart w:id="5" w:name="_Toc243509139"/>
       <w:r>
         <w:t>Backpropagation and the 5 lines of the training loop</w:t>
       </w:r>
@@ -5067,7 +5067,7 @@
       <w:pPr>
         <w:pStyle w:val="Titre2"/>
       </w:pPr>
-      <w:bookmarkStart w:id="6" w:name="_Toc243497820"/>
+      <w:bookmarkStart w:id="6" w:name="_Toc243509140"/>
       <w:r>
         <w:t>Epoch and mini-batch</w:t>
       </w:r>
@@ -5127,7 +5127,7 @@
       <w:pPr>
         <w:pStyle w:val="Titre2"/>
       </w:pPr>
-      <w:bookmarkStart w:id="7" w:name="_Toc243497821"/>
+      <w:bookmarkStart w:id="7" w:name="_Toc243509141"/>
       <w:r>
         <w:lastRenderedPageBreak/>
         <w:t>Train, validation, test</w:t>
@@ -5198,7 +5198,7 @@
       <w:pPr>
         <w:pStyle w:val="Titre2"/>
       </w:pPr>
-      <w:bookmarkStart w:id="8" w:name="_Toc243497822"/>
+      <w:bookmarkStart w:id="8" w:name="_Toc243509142"/>
       <w:r>
         <w:t>Overfitting</w:t>
       </w:r>
@@ -5248,7 +5248,7 @@
       <w:pPr>
         <w:pStyle w:val="Titre2"/>
       </w:pPr>
-      <w:bookmarkStart w:id="9" w:name="_Toc243497823"/>
+      <w:bookmarkStart w:id="9" w:name="_Toc243509143"/>
       <w:r>
         <w:t>ReLU, the activation</w:t>
       </w:r>
@@ -5318,7 +5318,7 @@
       <w:pPr>
         <w:pStyle w:val="Titre2"/>
       </w:pPr>
-      <w:bookmarkStart w:id="10" w:name="_Toc243497824"/>
+      <w:bookmarkStart w:id="10" w:name="_Toc243509144"/>
       <w:r>
         <w:t>Initialisation and the first loss</w:t>
       </w:r>
@@ -5368,7 +5368,7 @@
       <w:pPr>
         <w:pStyle w:val="Titre2"/>
       </w:pPr>
-      <w:bookmarkStart w:id="11" w:name="_Toc243497825"/>
+      <w:bookmarkStart w:id="11" w:name="_Toc243509145"/>
       <w:r>
         <w:t>Standardisation of the pixels</w:t>
       </w:r>
@@ -5428,7 +5428,7 @@
       <w:pPr>
         <w:pStyle w:val="Titre2"/>
       </w:pPr>
-      <w:bookmarkStart w:id="12" w:name="_Toc243497826"/>
+      <w:bookmarkStart w:id="12" w:name="_Toc243509146"/>
       <w:r>
         <w:t>MLP versus CNN: why the MLP cannot see shapes</w:t>
       </w:r>
@@ -5488,7 +5488,7 @@
       <w:pPr>
         <w:pStyle w:val="Titre2"/>
       </w:pPr>
-      <w:bookmarkStart w:id="13" w:name="_Toc243497827"/>
+      <w:bookmarkStart w:id="13" w:name="_Toc243509147"/>
       <w:r>
         <w:t>Convolution, filters and channels (session 7 slide)</w:t>
       </w:r>
@@ -5579,7 +5579,7 @@
       <w:pPr>
         <w:pStyle w:val="Titre2"/>
       </w:pPr>
-      <w:bookmarkStart w:id="14" w:name="_Toc243497828"/>
+      <w:bookmarkStart w:id="14" w:name="_Toc243509148"/>
       <w:r>
         <w:t>A pretrained network and transfer learning</w:t>
       </w:r>
@@ -5639,7 +5639,7 @@
       <w:pPr>
         <w:pStyle w:val="Titre2"/>
       </w:pPr>
-      <w:bookmarkStart w:id="15" w:name="_Toc243497829"/>
+      <w:bookmarkStart w:id="15" w:name="_Toc243509149"/>
       <w:r>
         <w:t>Frozen features (linear probe) versus fine-tuning</w:t>
       </w:r>
@@ -5709,7 +5709,7 @@
       <w:pPr>
         <w:pStyle w:val="Titre2"/>
       </w:pPr>
-      <w:bookmarkStart w:id="16" w:name="_Toc243497830"/>
+      <w:bookmarkStart w:id="16" w:name="_Toc243509150"/>
       <w:r>
         <w:t>The tools against overfitting</w:t>
       </w:r>
@@ -5869,7 +5869,7 @@
       <w:pPr>
         <w:pStyle w:val="Titre2"/>
       </w:pPr>
-      <w:bookmarkStart w:id="17" w:name="_Toc243497831"/>
+      <w:bookmarkStart w:id="17" w:name="_Toc243509151"/>
       <w:r>
         <w:t>Vanishing gradient</w:t>
       </w:r>
@@ -5919,7 +5919,7 @@
       <w:pPr>
         <w:pStyle w:val="Titre2"/>
       </w:pPr>
-      <w:bookmarkStart w:id="18" w:name="_Toc243497832"/>
+      <w:bookmarkStart w:id="18" w:name="_Toc243509152"/>
       <w:r>
         <w:t>Data leakage</w:t>
       </w:r>
@@ -5969,7 +5969,7 @@
       <w:pPr>
         <w:pStyle w:val="Titre2"/>
       </w:pPr>
-      <w:bookmarkStart w:id="19" w:name="_Toc243497833"/>
+      <w:bookmarkStart w:id="19" w:name="_Toc243509153"/>
       <w:r>
         <w:t>Confidence interval and bootstrap</w:t>
       </w:r>
@@ -6029,7 +6029,7 @@
       <w:pPr>
         <w:pStyle w:val="Titre2"/>
       </w:pPr>
-      <w:bookmarkStart w:id="20" w:name="_Toc243497834"/>
+      <w:bookmarkStart w:id="20" w:name="_Toc243509154"/>
       <w:r>
         <w:lastRenderedPageBreak/>
         <w:t>Latency and CPU threads</w:t>
@@ -6101,7 +6101,7 @@
         <w:pStyle w:val="Titre1"/>
         <w:pageBreakBefore/>
       </w:pPr>
-      <w:bookmarkStart w:id="21" w:name="_Toc243497835"/>
+      <w:bookmarkStart w:id="21" w:name="_Toc243509155"/>
       <w:r>
         <w:lastRenderedPageBreak/>
         <w:t>3. Step 1: the data and a fair split (notebook 01)</w:t>
@@ -6214,7 +6214,7 @@
       <w:pPr>
         <w:pStyle w:val="Titre2"/>
       </w:pPr>
-      <w:bookmarkStart w:id="22" w:name="_Toc243497836"/>
+      <w:bookmarkStart w:id="22" w:name="_Toc243509156"/>
       <w:r>
         <w:t>What we downloaded</w:t>
       </w:r>
@@ -6335,7 +6335,7 @@
       <w:pPr>
         <w:pStyle w:val="Titre2"/>
       </w:pPr>
-      <w:bookmarkStart w:id="23" w:name="_Toc243497837"/>
+      <w:bookmarkStart w:id="23" w:name="_Toc243509157"/>
       <w:r>
         <w:t>The split (make_split in data.py)</w:t>
       </w:r>
@@ -6466,7 +6466,7 @@
       <w:pPr>
         <w:pStyle w:val="Titre2"/>
       </w:pPr>
-      <w:bookmarkStart w:id="24" w:name="_Toc243497838"/>
+      <w:bookmarkStart w:id="24" w:name="_Toc243509158"/>
       <w:r>
         <w:t>What we found in the data</w:t>
       </w:r>
@@ -6529,7 +6529,7 @@
         <w:pStyle w:val="Titre1"/>
         <w:pageBreakBefore/>
       </w:pPr>
-      <w:bookmarkStart w:id="25" w:name="_Toc243497839"/>
+      <w:bookmarkStart w:id="25" w:name="_Toc243509159"/>
       <w:r>
         <w:lastRenderedPageBreak/>
         <w:t>4. Step 2: the MLP and its two checks (notebook 02)</w:t>
@@ -6679,7 +6679,7 @@
       <w:pPr>
         <w:pStyle w:val="Titre2"/>
       </w:pPr>
-      <w:bookmarkStart w:id="26" w:name="_Toc243497840"/>
+      <w:bookmarkStart w:id="26" w:name="_Toc243509160"/>
       <w:r>
         <w:t>The model</w:t>
       </w:r>
@@ -6806,7 +6806,7 @@
       <w:pPr>
         <w:pStyle w:val="Titre2"/>
       </w:pPr>
-      <w:bookmarkStart w:id="27" w:name="_Toc243497841"/>
+      <w:bookmarkStart w:id="27" w:name="_Toc243509161"/>
       <w:r>
         <w:t>Check 1: the first loss</w:t>
       </w:r>
@@ -6855,7 +6855,7 @@
       <w:pPr>
         <w:pStyle w:val="Titre2"/>
       </w:pPr>
-      <w:bookmarkStart w:id="28" w:name="_Toc243497842"/>
+      <w:bookmarkStart w:id="28" w:name="_Toc243509162"/>
       <w:r>
         <w:t>Check 2: overfit one batch</w:t>
       </w:r>
@@ -6873,7 +6873,7 @@
       <w:pPr>
         <w:pStyle w:val="Titre2"/>
       </w:pPr>
-      <w:bookmarkStart w:id="29" w:name="_Toc243497843"/>
+      <w:bookmarkStart w:id="29" w:name="_Toc243509163"/>
       <w:r>
         <w:t>Baseline and image size</w:t>
       </w:r>
@@ -6949,7 +6949,7 @@
         </w:rPr>
         <w:lastRenderedPageBreak/>
         <w:drawing>
-          <wp:inline distT="0" distB="0" distL="0" distR="0" wp14:anchorId="4C212552" wp14:editId="4C212553">
+          <wp:inline distT="0" distB="0" distL="0" distR="0" wp14:anchorId="547793A9" wp14:editId="547793AA">
             <wp:extent cx="4762500" cy="1924050"/>
             <wp:effectExtent l="0" t="0" r="0" b="0"/>
             <wp:docPr id="1" name="02_baseline_curves.png" descr="MLP baseline: training loss falls to 0 while validation loss rises (overfitting)." title="MLP baseline: training loss falls to 0 while validation loss rises (overfitting)."/>
@@ -7009,7 +7009,7 @@
         <w:pStyle w:val="Titre1"/>
         <w:pageBreakBefore/>
       </w:pPr>
-      <w:bookmarkStart w:id="30" w:name="_Toc243497844"/>
+      <w:bookmarkStart w:id="30" w:name="_Toc243509164"/>
       <w:r>
         <w:lastRenderedPageBreak/>
         <w:t>5. Step 3: monitoring and regularisation (notebook 03)</w:t>
@@ -7180,7 +7180,7 @@
       <w:pPr>
         <w:pStyle w:val="Titre2"/>
       </w:pPr>
-      <w:bookmarkStart w:id="31" w:name="_Toc243497845"/>
+      <w:bookmarkStart w:id="31" w:name="_Toc243509165"/>
       <w:r>
         <w:t>What we monitored</w:t>
       </w:r>
@@ -7299,7 +7299,7 @@
       <w:pPr>
         <w:pStyle w:val="Titre2"/>
       </w:pPr>
-      <w:bookmarkStart w:id="32" w:name="_Toc243497846"/>
+      <w:bookmarkStart w:id="32" w:name="_Toc243509166"/>
       <w:r>
         <w:t>Learning-rate sweep (Adam, 8 values, 15 epochs each)</w:t>
       </w:r>
@@ -7374,7 +7374,7 @@
           <w:noProof/>
         </w:rPr>
         <w:drawing>
-          <wp:inline distT="0" distB="0" distL="0" distR="0" wp14:anchorId="4C212554" wp14:editId="4C212555">
+          <wp:inline distT="0" distB="0" distL="0" distR="0" wp14:anchorId="547793AB" wp14:editId="547793AC">
             <wp:extent cx="4191000" cy="1619250"/>
             <wp:effectExtent l="0" t="0" r="0" b="0"/>
             <wp:docPr id="2" name="03_lr_sweep.png" descr="Learning-rate sweep: a U-shaped validation loss, best at 0.0001." title="Learning-rate sweep: a U-shaped validation loss, best at 0.0001."/>
@@ -7433,7 +7433,7 @@
       <w:pPr>
         <w:pStyle w:val="Titre2"/>
       </w:pPr>
-      <w:bookmarkStart w:id="33" w:name="_Toc243497847"/>
+      <w:bookmarkStart w:id="33" w:name="_Toc243509167"/>
       <w:r>
         <w:t>The tools against overfitting (lr 0.0001, 3 seeds each)</w:t>
       </w:r>
@@ -8406,7 +8406,7 @@
         <w:pStyle w:val="Titre1"/>
         <w:pageBreakBefore/>
       </w:pPr>
-      <w:bookmarkStart w:id="34" w:name="_Toc243497848"/>
+      <w:bookmarkStart w:id="34" w:name="_Toc243509168"/>
       <w:r>
         <w:lastRenderedPageBreak/>
         <w:t>6. Step 4: the training doctor (notebook 04)</w:t>
@@ -9312,7 +9312,7 @@
         </w:rPr>
         <w:lastRenderedPageBreak/>
         <w:drawing>
-          <wp:inline distT="0" distB="0" distL="0" distR="0" wp14:anchorId="4C212556" wp14:editId="4C212557">
+          <wp:inline distT="0" distB="0" distL="0" distR="0" wp14:anchorId="547793AD" wp14:editId="547793AE">
             <wp:extent cx="4000500" cy="2209800"/>
             <wp:effectExtent l="0" t="0" r="0" b="0"/>
             <wp:docPr id="3" name="04_p4_grad_per_layer.png" descr="Patient 4: the gradient vanishes layer after layer with sigmoids; ReLU + He init fixes it." title="Patient 4: the gradient vanishes layer after layer with sigmoids; ReLU + He init fixes it."/>
@@ -9371,7 +9371,7 @@
       <w:pPr>
         <w:pStyle w:val="Titre2"/>
       </w:pPr>
-      <w:bookmarkStart w:id="35" w:name="_Toc243497849"/>
+      <w:bookmarkStart w:id="35" w:name="_Toc243509169"/>
       <w:r>
         <w:t>Lessons to say at the oral</w:t>
       </w:r>
@@ -9464,7 +9464,7 @@
         <w:pStyle w:val="Titre1"/>
         <w:pageBreakBefore/>
       </w:pPr>
-      <w:bookmarkStart w:id="36" w:name="_Toc243497850"/>
+      <w:bookmarkStart w:id="36" w:name="_Toc243509170"/>
       <w:r>
         <w:lastRenderedPageBreak/>
         <w:t>7. Step 5: pretrained ResNet18 (notebook 05)</w:t>
@@ -9671,7 +9671,7 @@
       <w:pPr>
         <w:pStyle w:val="Titre2"/>
       </w:pPr>
-      <w:bookmarkStart w:id="37" w:name="_Toc243497851"/>
+      <w:bookmarkStart w:id="37" w:name="_Toc243509171"/>
       <w:r>
         <w:t>Why a CNN, and why pretrained</w:t>
       </w:r>
@@ -9735,7 +9735,7 @@
           <w:noProof/>
         </w:rPr>
         <w:drawing>
-          <wp:inline distT="0" distB="0" distL="0" distR="0" wp14:anchorId="4C212558" wp14:editId="4C212559">
+          <wp:inline distT="0" distB="0" distL="0" distR="0" wp14:anchorId="547793AF" wp14:editId="547793B0">
             <wp:extent cx="5905500" cy="2543175"/>
             <wp:effectExtent l="0" t="0" r="0" b="0"/>
             <wp:docPr id="4" name="C:\Users\benca\AppData\Local\Temp\claude\c--Users-benca-OneDrive---Thelio-Documents-Perso-Albert-School\1b4fce00-cdbb-452c-8784-7dae784734de\scratchpad\deck\resnet18_diagram.png" descr="Inside ResNet18 + our linear head (backup slide 20): the frozen body (dark) turns a painting into 512 numbers; our linear head (blue) turns them into 5 scores." title="Inside ResNet18 + our linear head (backup slide 20): the frozen body (dark) turns a painting into 512 numbers; our linear head (blue) turns them into 5 scores."/>
@@ -9878,7 +9878,7 @@
       <w:pPr>
         <w:pStyle w:val="Titre2"/>
       </w:pPr>
-      <w:bookmarkStart w:id="38" w:name="_Toc243497852"/>
+      <w:bookmarkStart w:id="38" w:name="_Toc243509172"/>
       <w:r>
         <w:t>Method A: frozen features + head</w:t>
       </w:r>
@@ -9985,7 +9985,7 @@
       <w:pPr>
         <w:pStyle w:val="Titre2"/>
       </w:pPr>
-      <w:bookmarkStart w:id="39" w:name="_Toc243497853"/>
+      <w:bookmarkStart w:id="39" w:name="_Toc243509173"/>
       <w:r>
         <w:t>Method B: fine-tuning layer4</w:t>
       </w:r>
@@ -10042,7 +10042,7 @@
       <w:pPr>
         <w:pStyle w:val="Titre2"/>
       </w:pPr>
-      <w:bookmarkStart w:id="40" w:name="_Toc243497854"/>
+      <w:bookmarkStart w:id="40" w:name="_Toc243509174"/>
       <w:r>
         <w:t>Two silent bugs, measured</w:t>
       </w:r>
@@ -10109,7 +10109,7 @@
       <w:pPr>
         <w:pStyle w:val="Titre2"/>
       </w:pPr>
-      <w:bookmarkStart w:id="41" w:name="_Toc243497855"/>
+      <w:bookmarkStart w:id="41" w:name="_Toc243509175"/>
       <w:r>
         <w:t>Painter leakage, measured fairly</w:t>
       </w:r>
@@ -10450,7 +10450,7 @@
           <w:noProof/>
         </w:rPr>
         <w:drawing>
-          <wp:inline distT="0" distB="0" distL="0" distR="0" wp14:anchorId="4C21255A" wp14:editId="4C21255B">
+          <wp:inline distT="0" distB="0" distL="0" distR="0" wp14:anchorId="547793B1" wp14:editId="547793B2">
             <wp:extent cx="4762500" cy="2524125"/>
             <wp:effectExtent l="0" t="0" r="0" b="0"/>
             <wp:docPr id="5" name="05_painter_leakage.png" descr="Painter leakage: same images, same model; only the known-painter group changes." title="Painter leakage: same images, same model; only the known-painter group changes."/>
@@ -10526,7 +10526,7 @@
         <w:pStyle w:val="Titre1"/>
         <w:pageBreakBefore/>
       </w:pPr>
-      <w:bookmarkStart w:id="42" w:name="_Toc243497856"/>
+      <w:bookmarkStart w:id="42" w:name="_Toc243509176"/>
       <w:r>
         <w:lastRenderedPageBreak/>
         <w:t>8. Step 6: final test, CPU cost and recommendation (notebook 06)</w:t>
@@ -10672,7 +10672,7 @@
       <w:pPr>
         <w:pStyle w:val="Titre2"/>
       </w:pPr>
-      <w:bookmarkStart w:id="43" w:name="_Toc243497857"/>
+      <w:bookmarkStart w:id="43" w:name="_Toc243509177"/>
       <w:r>
         <w:t>Classical models (settings chosen on validation)</w:t>
       </w:r>
@@ -10785,7 +10785,7 @@
       <w:pPr>
         <w:pStyle w:val="Titre2"/>
       </w:pPr>
-      <w:bookmarkStart w:id="44" w:name="_Toc243497858"/>
+      <w:bookmarkStart w:id="44" w:name="_Toc243509178"/>
       <w:r>
         <w:t>The final test, measured once</w:t>
       </w:r>
@@ -11816,7 +11816,7 @@
         </w:rPr>
         <w:lastRenderedPageBreak/>
         <w:drawing>
-          <wp:inline distT="0" distB="0" distL="0" distR="0" wp14:anchorId="4C21255C" wp14:editId="4C21255D">
+          <wp:inline distT="0" distB="0" distL="0" distR="0" wp14:anchorId="547793B3" wp14:editId="547793B4">
             <wp:extent cx="4762500" cy="1971675"/>
             <wp:effectExtent l="0" t="0" r="0" b="0"/>
             <wp:docPr id="6" name="06_test_accuracy.png" descr="Final test: 220 paintings never seen before, with 95 % bootstrap intervals." title="Final test: 220 paintings never seen before, with 95 % bootstrap intervals."/>
@@ -11875,7 +11875,7 @@
       <w:pPr>
         <w:pStyle w:val="Titre2"/>
       </w:pPr>
-      <w:bookmarkStart w:id="45" w:name="_Toc243497859"/>
+      <w:bookmarkStart w:id="45" w:name="_Toc243509179"/>
       <w:r>
         <w:t>Are the gaps real? Paired bootstrap (same 220 paintings, 5 000 redraws)</w:t>
       </w:r>
@@ -11934,7 +11934,7 @@
       <w:pPr>
         <w:pStyle w:val="Titre2"/>
       </w:pPr>
-      <w:bookmarkStart w:id="46" w:name="_Toc243497860"/>
+      <w:bookmarkStart w:id="46" w:name="_Toc243509180"/>
       <w:r>
         <w:t>Frozen or fine-tuned? Validation and test disagree</w:t>
       </w:r>
@@ -11962,7 +11962,7 @@
       <w:pPr>
         <w:pStyle w:val="Titre2"/>
       </w:pPr>
-      <w:bookmarkStart w:id="47" w:name="_Toc243497861"/>
+      <w:bookmarkStart w:id="47" w:name="_Toc243509181"/>
       <w:r>
         <w:t>Speed and size</w:t>
       </w:r>
@@ -11980,7 +11980,7 @@
       <w:pPr>
         <w:pStyle w:val="Titre2"/>
       </w:pPr>
-      <w:bookmarkStart w:id="48" w:name="_Toc243497862"/>
+      <w:bookmarkStart w:id="48" w:name="_Toc243509182"/>
       <w:r>
         <w:t>Recommendation to the director</w:t>
       </w:r>
@@ -12077,7 +12077,7 @@
         <w:pStyle w:val="Titre1"/>
         <w:pageBreakBefore/>
       </w:pPr>
-      <w:bookmarkStart w:id="49" w:name="_Toc243497863"/>
+      <w:bookmarkStart w:id="49" w:name="_Toc243509183"/>
       <w:r>
         <w:lastRenderedPageBreak/>
         <w:t>9. Step 6 bis: a second test, was it luck? (notebook 08)</w:t>
@@ -12209,7 +12209,7 @@
       <w:pPr>
         <w:pStyle w:val="Titre2"/>
       </w:pPr>
-      <w:bookmarkStart w:id="50" w:name="_Toc243497864"/>
+      <w:bookmarkStart w:id="50" w:name="_Toc243509184"/>
       <w:r>
         <w:t>How the second test was built (scripts/make_second_test.py)</w:t>
       </w:r>
@@ -12281,7 +12281,7 @@
       <w:pPr>
         <w:pStyle w:val="Titre2"/>
       </w:pPr>
-      <w:bookmarkStart w:id="51" w:name="_Toc243497865"/>
+      <w:bookmarkStart w:id="51" w:name="_Toc243509185"/>
       <w:r>
         <w:t>Results</w:t>
       </w:r>
@@ -12887,7 +12887,7 @@
           <w:noProof/>
         </w:rPr>
         <w:drawing>
-          <wp:inline distT="0" distB="0" distL="0" distR="0" wp14:anchorId="4C21255E" wp14:editId="4C21255F">
+          <wp:inline distT="0" distB="0" distL="0" distR="0" wp14:anchorId="547793B5" wp14:editId="547793B6">
             <wp:extent cx="5334000" cy="2095500"/>
             <wp:effectExtent l="0" t="0" r="0" b="0"/>
             <wp:docPr id="7" name="08_second_test.png" descr="Test 1 and the new test 2: the same ranking (black lines: 95 % bootstrap intervals)." title="Test 1 and the new test 2: the same ranking (black lines: 95 % bootstrap intervals)."/>
@@ -12996,7 +12996,7 @@
       <w:pPr>
         <w:pStyle w:val="Titre2"/>
       </w:pPr>
-      <w:bookmarkStart w:id="52" w:name="_Toc243497866"/>
+      <w:bookmarkStart w:id="52" w:name="_Toc243509186"/>
       <w:r>
         <w:t>What it changes, and the honest caveat</w:t>
       </w:r>
@@ -13025,7 +13025,7 @@
         <w:pStyle w:val="Titre1"/>
         <w:pageBreakBefore/>
       </w:pPr>
-      <w:bookmarkStart w:id="53" w:name="_Toc243497867"/>
+      <w:bookmarkStart w:id="53" w:name="_Toc243509187"/>
       <w:r>
         <w:lastRenderedPageBreak/>
         <w:t>10. The random forest, our classical challenger (notebook 06)</w:t>
@@ -13212,7 +13212,7 @@
       <w:pPr>
         <w:pStyle w:val="Titre2"/>
       </w:pPr>
-      <w:bookmarkStart w:id="54" w:name="_Toc243497868"/>
+      <w:bookmarkStart w:id="54" w:name="_Toc243509188"/>
       <w:r>
         <w:t>The 102 hand-made numbers (baselines.py)</w:t>
       </w:r>
@@ -13602,7 +13602,7 @@
       <w:pPr>
         <w:pStyle w:val="Titre2"/>
       </w:pPr>
-      <w:bookmarkStart w:id="55" w:name="_Toc243497869"/>
+      <w:bookmarkStart w:id="55" w:name="_Toc243509189"/>
       <w:r>
         <w:t>Our settings, chosen on validation</w:t>
       </w:r>
@@ -13770,7 +13770,7 @@
       <w:pPr>
         <w:pStyle w:val="Titre2"/>
       </w:pPr>
-      <w:bookmarkStart w:id="56" w:name="_Toc243497870"/>
+      <w:bookmarkStart w:id="56" w:name="_Toc243509190"/>
       <w:r>
         <w:t>Questions on the random forest, with answers</w:t>
       </w:r>
@@ -14035,7 +14035,7 @@
         <w:pStyle w:val="Titre1"/>
         <w:pageBreakBefore/>
       </w:pPr>
-      <w:bookmarkStart w:id="57" w:name="_Toc243497871"/>
+      <w:bookmarkStart w:id="57" w:name="_Toc243509191"/>
       <w:r>
         <w:lastRenderedPageBreak/>
         <w:t>11. Bonus: what about transformers like BERT? (notebook 07)</w:t>
@@ -14902,7 +14902,7 @@
         </w:rPr>
         <w:lastRenderedPageBreak/>
         <w:drawing>
-          <wp:inline distT="0" distB="0" distL="0" distR="0" wp14:anchorId="4C212560" wp14:editId="4C212561">
+          <wp:inline distT="0" distB="0" distL="0" distR="0" wp14:anchorId="547793B7" wp14:editId="547793B8">
             <wp:extent cx="4381500" cy="2486025"/>
             <wp:effectExtent l="0" t="0" r="0" b="0"/>
             <wp:docPr id="8" name="07_transformers_accuracy_vs_speed.png" descr="Transformers on validation: CLIP is more accurate, but slower." title="Transformers on validation: CLIP is more accurate, but slower."/>
@@ -14962,7 +14962,7 @@
         <w:pStyle w:val="Titre1"/>
         <w:pageBreakBefore/>
       </w:pPr>
-      <w:bookmarkStart w:id="58" w:name="_Toc243497872"/>
+      <w:bookmarkStart w:id="58" w:name="_Toc243509192"/>
       <w:r>
         <w:lastRenderedPageBreak/>
         <w:t>12. Key numbers to know by heart</w:t>
@@ -16330,7 +16330,7 @@
         <w:pStyle w:val="Titre1"/>
         <w:pageBreakBefore/>
       </w:pPr>
-      <w:bookmarkStart w:id="59" w:name="_Toc243497873"/>
+      <w:bookmarkStart w:id="59" w:name="_Toc243509193"/>
       <w:r>
         <w:lastRenderedPageBreak/>
         <w:t>13. Concepts in simple words</w:t>
@@ -18521,7 +18521,7 @@
         <w:pStyle w:val="Titre1"/>
         <w:pageBreakBefore/>
       </w:pPr>
-      <w:bookmarkStart w:id="60" w:name="_Toc243497874"/>
+      <w:bookmarkStart w:id="60" w:name="_Toc243509194"/>
       <w:r>
         <w:lastRenderedPageBreak/>
         <w:t>14. Questions you may get, with answers</w:t>
@@ -18543,7 +18543,7 @@
       <w:pPr>
         <w:pStyle w:val="Titre2"/>
       </w:pPr>
-      <w:bookmarkStart w:id="61" w:name="_Toc243497875"/>
+      <w:bookmarkStart w:id="61" w:name="_Toc243509195"/>
       <w:r>
         <w:t>About the data</w:t>
       </w:r>
@@ -18663,7 +18663,7 @@
       <w:pPr>
         <w:pStyle w:val="Titre2"/>
       </w:pPr>
-      <w:bookmarkStart w:id="62" w:name="_Toc243497876"/>
+      <w:bookmarkStart w:id="62" w:name="_Toc243509196"/>
       <w:r>
         <w:t>About the MLP</w:t>
       </w:r>
@@ -18783,7 +18783,7 @@
       <w:pPr>
         <w:pStyle w:val="Titre2"/>
       </w:pPr>
-      <w:bookmarkStart w:id="63" w:name="_Toc243497877"/>
+      <w:bookmarkStart w:id="63" w:name="_Toc243509197"/>
       <w:r>
         <w:t>About training and diagnosis</w:t>
       </w:r>
@@ -18881,7 +18881,7 @@
       <w:pPr>
         <w:pStyle w:val="Titre2"/>
       </w:pPr>
-      <w:bookmarkStart w:id="64" w:name="_Toc243497878"/>
+      <w:bookmarkStart w:id="64" w:name="_Toc243509198"/>
       <w:r>
         <w:lastRenderedPageBreak/>
         <w:t>About ResNet</w:t>
@@ -18954,7 +18954,7 @@
           <w:bCs/>
           <w:color w:val="1C2433"/>
         </w:rPr>
-        <w:t>What are the 512 numbers?</w:t>
+        <w:t>Where does ResNet18 come from?</w:t>
       </w:r>
     </w:p>
     <w:p>
@@ -18962,7 +18962,7 @@
         <w:spacing w:after="120"/>
       </w:pPr>
       <w:r>
-        <w:t>What ResNet18 gives just before its own last layer: after the convolution layers, each of its 512 feature maps is averaged over the whole picture. Each number says how much of one learned pattern is in the painting. We removed its last layer (1 000 ImageNet classes) and put ours instead (5 styles).</w:t>
+        <w:t>From Microsoft Research (He et al., 2015, "Deep Residual Learning for Image Recognition"). A ResNet won the ImageNet competition (ILSVRC) in 2015. The family has 18, 34, 50, 101 and 152 layers; ResNet18 is the smallest, and torchvision provides it with its ImageNet weights. The brief asks for a pretrained ResNet, and the kiosk CPU is small, so we took ResNet18.</w:t>
       </w:r>
     </w:p>
     <w:p>
@@ -18976,7 +18976,7 @@
           <w:bCs/>
           <w:color w:val="1C2433"/>
         </w:rPr>
-        <w:t>What does "Res" mean in ResNet?</w:t>
+        <w:t>What are the 512 numbers?</w:t>
       </w:r>
     </w:p>
     <w:p>
@@ -18984,7 +18984,7 @@
         <w:spacing w:after="120"/>
       </w:pPr>
       <w:r>
-        <w:t>Residual: each block adds its input to its output, a shortcut. The gradient flows back through these shortcuts, so an 18-layer network does not suffer from the vanishing gradient that blocked our 8 sigmoid layers.</w:t>
+        <w:t>What ResNet18 gives just before its own last layer: after the convolution layers, each of its 512 feature maps is averaged over the whole picture. Each number says how much of one learned pattern is in the painting. We removed its last layer (1 000 ImageNet classes) and put ours instead (5 styles).</w:t>
       </w:r>
     </w:p>
     <w:p>
@@ -18998,6 +18998,28 @@
           <w:bCs/>
           <w:color w:val="1C2433"/>
         </w:rPr>
+        <w:t>What does "Res" mean in ResNet?</w:t>
+      </w:r>
+    </w:p>
+    <w:p>
+      <w:pPr>
+        <w:spacing w:after="120"/>
+      </w:pPr>
+      <w:r>
+        <w:t>Residual: each block adds its input to its output, a shortcut. The gradient flows back through these shortcuts, so an 18-layer network does not suffer from the vanishing gradient that blocked our 8 sigmoid layers.</w:t>
+      </w:r>
+    </w:p>
+    <w:p>
+      <w:pPr>
+        <w:keepNext/>
+        <w:spacing w:before="120" w:after="40"/>
+      </w:pPr>
+      <w:r>
+        <w:rPr>
+          <w:b/>
+          <w:bCs/>
+          <w:color w:val="1C2433"/>
+        </w:rPr>
         <w:t>How do you freeze it in code?</w:t>
       </w:r>
     </w:p>
@@ -19170,8 +19192,9 @@
       <w:pPr>
         <w:pStyle w:val="Titre2"/>
       </w:pPr>
-      <w:bookmarkStart w:id="65" w:name="_Toc243497879"/>
-      <w:r>
+      <w:bookmarkStart w:id="65" w:name="_Toc243509199"/>
+      <w:r>
+        <w:lastRenderedPageBreak/>
         <w:t>About the results and the recommendation</w:t>
       </w:r>
       <w:bookmarkEnd w:id="65"/>
@@ -19209,7 +19232,6 @@
           <w:bCs/>
           <w:color w:val="1C2433"/>
         </w:rPr>
-        <w:lastRenderedPageBreak/>
         <w:t>Isn't it cheating to change your choice after the test?</w:t>
       </w:r>
     </w:p>
@@ -19313,7 +19335,7 @@
       <w:pPr>
         <w:pStyle w:val="Titre2"/>
       </w:pPr>
-      <w:bookmarkStart w:id="66" w:name="_Toc243497880"/>
+      <w:bookmarkStart w:id="66" w:name="_Toc243509200"/>
       <w:r>
         <w:t>About the project</w:t>
       </w:r>
@@ -19368,7 +19390,7 @@
         <w:pStyle w:val="Titre1"/>
         <w:pageBreakBefore/>
       </w:pPr>
-      <w:bookmarkStart w:id="67" w:name="_Toc243497881"/>
+      <w:bookmarkStart w:id="67" w:name="_Toc243509201"/>
       <w:r>
         <w:lastRenderedPageBreak/>
         <w:t>15. Limits to admit, and next steps</w:t>
@@ -20162,7 +20184,7 @@
         <w:pStyle w:val="Titre1"/>
         <w:pageBreakBefore/>
       </w:pPr>
-      <w:bookmarkStart w:id="68" w:name="_Toc243497882"/>
+      <w:bookmarkStart w:id="68" w:name="_Toc243509202"/>
       <w:r>
         <w:lastRenderedPageBreak/>
         <w:t>16. Git history and how to reproduce</w:t>
@@ -21190,7 +21212,7 @@
         <w:pStyle w:val="Titre1"/>
         <w:pageBreakBefore/>
       </w:pPr>
-      <w:bookmarkStart w:id="69" w:name="_Toc243497883"/>
+      <w:bookmarkStart w:id="69" w:name="_Toc243509203"/>
       <w:r>
         <w:lastRenderedPageBreak/>
         <w:t>17. The 10-minute talk, slide by slide</w:t>
@@ -21205,7 +21227,7 @@
         <w:rPr>
           <w:color w:val="1C2433"/>
         </w:rPr>
-        <w:t>The talk follows the project step by step and gives the answer only at the end. 11 slides, about 50 seconds each: about 9:20 in total, the rest of the 10 minutes is a margin. The speaker notes in the .pptx and oral_script.pdf hold the full text in simple English.</w:t>
+        <w:t>The talk follows the project step by step and gives the answer only at the end. 11 slides, about 50 seconds each: about 9:40 in total, the rest of the 10 minutes is a margin. The speaker notes in the .pptx and oral_script.pdf hold the full text in simple English.</w:t>
       </w:r>
     </w:p>
     <w:tbl>
@@ -21968,7 +21990,7 @@
                 <w:sz w:val="19"/>
                 <w:szCs w:val="19"/>
               </w:rPr>
-              <w:t>1:20</w:t>
+              <w:t>1:40</w:t>
             </w:r>
           </w:p>
         </w:tc>
@@ -22548,7 +22570,7 @@
       <w:pPr>
         <w:pStyle w:val="Titre2"/>
       </w:pPr>
-      <w:bookmarkStart w:id="70" w:name="_Toc243497884"/>
+      <w:bookmarkStart w:id="70" w:name="_Toc243509204"/>
       <w:r>
         <w:t>The thread: each result opens the next step</w:t>
       </w:r>
@@ -22882,10 +22904,10 @@
 <file path=word/numbering.xml><?xml version="1.0" encoding="utf-8"?>
 <w:numbering xmlns:wpc="http://schemas.microsoft.com/office/word/2010/wordprocessingCanvas" xmlns:cx="http://schemas.microsoft.com/office/drawing/2014/chartex" xmlns:cx1="http://schemas.microsoft.com/office/drawing/2015/9/8/chartex" xmlns:cx2="http://schemas.microsoft.com/office/drawing/2015/10/21/chartex" xmlns:cx3="http://schemas.microsoft.com/office/drawing/2016/5/9/chartex" xmlns:cx4="http://schemas.microsoft.com/office/drawing/2016/5/10/chartex" xmlns:cx5="http://schemas.microsoft.com/office/drawing/2016/5/11/chartex" xmlns:cx6="http://schemas.microsoft.com/office/drawing/2016/5/12/chartex" xmlns:cx7="http://schemas.microsoft.com/office/drawing/2016/5/13/chartex" xmlns:cx8="http://schemas.microsoft.com/office/drawing/2016/5/14/chartex" xmlns:mc="http://schemas.openxmlformats.org/markup-compatibility/2006" xmlns:aink="http://schemas.microsoft.com/office/drawing/2016/ink" xmlns:am3d="http://schemas.microsoft.com/office/drawing/2017/model3d" xmlns:o="urn:schemas-microsoft-com:office:office" xmlns:oel="http://schemas.microsoft.com/office/2019/extlst" xmlns:r="http://schemas.openxmlformats.org/officeDocument/2006/relationships" xmlns:m="http://schemas.openxmlformats.org/officeDocument/2006/math" xmlns:v="urn:schemas-microsoft-com:vml" xmlns:wp14="http://schemas.microsoft.com/office/word/2010/wordprocessingDrawing" xmlns:wp="http://schemas.openxmlformats.org/drawingml/2006/wordprocessingDrawing" xmlns:w10="urn:schemas-microsoft-com:office:word" xmlns:w="http://schemas.openxmlformats.org/wordprocessingml/2006/main" xmlns:w14="http://schemas.microsoft.com/office/word/2010/wordml" xmlns:w15="http://schemas.microsoft.com/office/word/2012/wordml" xmlns:w16cex="http://schemas.microsoft.com/office/word/2018/wordml/cex" xmlns:w16cid="http://schemas.microsoft.com/office/word/2016/wordml/cid" xmlns:w16="http://schemas.microsoft.com/office/word/2018/wordml" xmlns:w16du="http://schemas.microsoft.com/office/word/2023/wordml/word16du" xmlns:w16sdtdh="http://schemas.microsoft.com/office/word/2020/wordml/sdtdatahash" xmlns:w16sdtfl="http://schemas.microsoft.com/office/word/2024/wordml/sdtformatlock" xmlns:w16se="http://schemas.microsoft.com/office/word/2015/wordml/symex" xmlns:wpg="http://schemas.microsoft.com/office/word/2010/wordprocessingGroup" xmlns:wpi="http://schemas.microsoft.com/office/word/2010/wordprocessingInk" xmlns:wne="http://schemas.microsoft.com/office/word/2006/wordml" xmlns:wps="http://schemas.microsoft.com/office/word/2010/wordprocessingShape" mc:Ignorable="w14 w15 w16se w16cid w16 w16cex w16sdtdh w16sdtfl w16du wp14">
   <w:abstractNum w:abstractNumId="0" w15:restartNumberingAfterBreak="0">
-    <w:nsid w:val="0DC5628F"/>
+    <w:nsid w:val="069F3849"/>
     <w:multiLevelType w:val="hybridMultilevel"/>
-    <w:tmpl w:val="8FF40810"/>
-    <w:lvl w:ilvl="0" w:tplc="B05AF9DE">
+    <w:tmpl w:val="EC946A52"/>
+    <w:lvl w:ilvl="0" w:tplc="5F5CB45E">
       <w:start w:val="1"/>
       <w:numFmt w:val="decimal"/>
       <w:lvlText w:val="%1."/>
@@ -22894,52 +22916,52 @@
         <w:ind w:left="400" w:hanging="300"/>
       </w:pPr>
     </w:lvl>
-    <w:lvl w:ilvl="1" w:tplc="84C88F80">
+    <w:lvl w:ilvl="1" w:tplc="3168BDE0">
       <w:numFmt w:val="decimal"/>
       <w:lvlText w:val=""/>
       <w:lvlJc w:val="left"/>
     </w:lvl>
-    <w:lvl w:ilvl="2" w:tplc="841CCE04">
+    <w:lvl w:ilvl="2" w:tplc="DA0A3664">
       <w:numFmt w:val="decimal"/>
       <w:lvlText w:val=""/>
       <w:lvlJc w:val="left"/>
     </w:lvl>
-    <w:lvl w:ilvl="3" w:tplc="26BA18B4">
+    <w:lvl w:ilvl="3" w:tplc="05BAF770">
       <w:numFmt w:val="decimal"/>
       <w:lvlText w:val=""/>
       <w:lvlJc w:val="left"/>
     </w:lvl>
-    <w:lvl w:ilvl="4" w:tplc="F5EE666A">
+    <w:lvl w:ilvl="4" w:tplc="2C867A3E">
       <w:numFmt w:val="decimal"/>
       <w:lvlText w:val=""/>
       <w:lvlJc w:val="left"/>
     </w:lvl>
-    <w:lvl w:ilvl="5" w:tplc="7BC0160E">
+    <w:lvl w:ilvl="5" w:tplc="387C7E76">
       <w:numFmt w:val="decimal"/>
       <w:lvlText w:val=""/>
       <w:lvlJc w:val="left"/>
     </w:lvl>
-    <w:lvl w:ilvl="6" w:tplc="9E10534A">
+    <w:lvl w:ilvl="6" w:tplc="DD5838E0">
       <w:numFmt w:val="decimal"/>
       <w:lvlText w:val=""/>
       <w:lvlJc w:val="left"/>
     </w:lvl>
-    <w:lvl w:ilvl="7" w:tplc="AFB8C966">
+    <w:lvl w:ilvl="7" w:tplc="52E0E7D0">
       <w:numFmt w:val="decimal"/>
       <w:lvlText w:val=""/>
       <w:lvlJc w:val="left"/>
     </w:lvl>
-    <w:lvl w:ilvl="8" w:tplc="F2A68B18">
+    <w:lvl w:ilvl="8" w:tplc="B40814FE">
       <w:numFmt w:val="decimal"/>
       <w:lvlText w:val=""/>
       <w:lvlJc w:val="left"/>
     </w:lvl>
   </w:abstractNum>
   <w:abstractNum w:abstractNumId="1" w15:restartNumberingAfterBreak="0">
-    <w:nsid w:val="2E0B1619"/>
+    <w:nsid w:val="09D2679F"/>
     <w:multiLevelType w:val="hybridMultilevel"/>
-    <w:tmpl w:val="98F094F2"/>
-    <w:lvl w:ilvl="0" w:tplc="9166A258" w:tentative="1">
+    <w:tmpl w:val="476C5106"/>
+    <w:lvl w:ilvl="0" w:tplc="CD780BB4" w:tentative="1">
       <w:start w:val="1"/>
       <w:numFmt w:val="bullet"/>
       <w:lvlText w:val="●"/>
@@ -22948,7 +22970,7 @@
         <w:ind w:left="720" w:hanging="360"/>
       </w:pPr>
     </w:lvl>
-    <w:lvl w:ilvl="1" w:tplc="859419E8" w:tentative="1">
+    <w:lvl w:ilvl="1" w:tplc="46EC454C" w:tentative="1">
       <w:start w:val="1"/>
       <w:numFmt w:val="bullet"/>
       <w:lvlText w:val="○"/>
@@ -22957,7 +22979,7 @@
         <w:ind w:left="1440" w:hanging="360"/>
       </w:pPr>
     </w:lvl>
-    <w:lvl w:ilvl="2" w:tplc="2ECEF006" w:tentative="1">
+    <w:lvl w:ilvl="2" w:tplc="F9F2443C" w:tentative="1">
       <w:start w:val="1"/>
       <w:numFmt w:val="bullet"/>
       <w:lvlText w:val="■"/>
@@ -22966,7 +22988,7 @@
         <w:ind w:left="2160" w:hanging="360"/>
       </w:pPr>
     </w:lvl>
-    <w:lvl w:ilvl="3" w:tplc="D84EE79C" w:tentative="1">
+    <w:lvl w:ilvl="3" w:tplc="1046AD90" w:tentative="1">
       <w:start w:val="1"/>
       <w:numFmt w:val="bullet"/>
       <w:lvlText w:val="●"/>
@@ -22975,7 +22997,7 @@
         <w:ind w:left="2880" w:hanging="360"/>
       </w:pPr>
     </w:lvl>
-    <w:lvl w:ilvl="4" w:tplc="E2AEE274" w:tentative="1">
+    <w:lvl w:ilvl="4" w:tplc="01464BBA" w:tentative="1">
       <w:start w:val="1"/>
       <w:numFmt w:val="bullet"/>
       <w:lvlText w:val="○"/>
@@ -22984,7 +23006,7 @@
         <w:ind w:left="3600" w:hanging="360"/>
       </w:pPr>
     </w:lvl>
-    <w:lvl w:ilvl="5" w:tplc="12AE1436" w:tentative="1">
+    <w:lvl w:ilvl="5" w:tplc="7528F9F2" w:tentative="1">
       <w:start w:val="1"/>
       <w:numFmt w:val="bullet"/>
       <w:lvlText w:val="■"/>
@@ -22993,7 +23015,7 @@
         <w:ind w:left="4320" w:hanging="360"/>
       </w:pPr>
     </w:lvl>
-    <w:lvl w:ilvl="6" w:tplc="A25E57BE" w:tentative="1">
+    <w:lvl w:ilvl="6" w:tplc="5CE8B12E" w:tentative="1">
       <w:start w:val="1"/>
       <w:numFmt w:val="bullet"/>
       <w:lvlText w:val="●"/>
@@ -23002,7 +23024,7 @@
         <w:ind w:left="5040" w:hanging="360"/>
       </w:pPr>
     </w:lvl>
-    <w:lvl w:ilvl="7" w:tplc="AC328E58" w:tentative="1">
+    <w:lvl w:ilvl="7" w:tplc="D7706090" w:tentative="1">
       <w:start w:val="1"/>
       <w:numFmt w:val="bullet"/>
       <w:lvlText w:val="●"/>
@@ -23011,7 +23033,7 @@
         <w:ind w:left="5760" w:hanging="360"/>
       </w:pPr>
     </w:lvl>
-    <w:lvl w:ilvl="8" w:tplc="31F27DE2" w:tentative="1">
+    <w:lvl w:ilvl="8" w:tplc="00B2ECC8" w:tentative="1">
       <w:start w:val="1"/>
       <w:numFmt w:val="bullet"/>
       <w:lvlText w:val="●"/>
@@ -23022,10 +23044,10 @@
     </w:lvl>
   </w:abstractNum>
   <w:abstractNum w:abstractNumId="2" w15:restartNumberingAfterBreak="0">
-    <w:nsid w:val="3DA7617A"/>
+    <w:nsid w:val="1DC707A8"/>
     <w:multiLevelType w:val="hybridMultilevel"/>
-    <w:tmpl w:val="B594782A"/>
-    <w:lvl w:ilvl="0" w:tplc="5AE0CC16">
+    <w:tmpl w:val="E1C614D6"/>
+    <w:lvl w:ilvl="0" w:tplc="BB4A8016">
       <w:start w:val="1"/>
       <w:numFmt w:val="decimal"/>
       <w:lvlText w:val="%1."/>
@@ -23034,52 +23056,52 @@
         <w:ind w:left="400" w:hanging="300"/>
       </w:pPr>
     </w:lvl>
-    <w:lvl w:ilvl="1" w:tplc="1F30C058">
+    <w:lvl w:ilvl="1" w:tplc="30FCC44E">
       <w:numFmt w:val="decimal"/>
       <w:lvlText w:val=""/>
       <w:lvlJc w:val="left"/>
     </w:lvl>
-    <w:lvl w:ilvl="2" w:tplc="A4B2EAB4">
+    <w:lvl w:ilvl="2" w:tplc="85CE95B8">
       <w:numFmt w:val="decimal"/>
       <w:lvlText w:val=""/>
       <w:lvlJc w:val="left"/>
     </w:lvl>
-    <w:lvl w:ilvl="3" w:tplc="B3B84F82">
+    <w:lvl w:ilvl="3" w:tplc="44CCC970">
       <w:numFmt w:val="decimal"/>
       <w:lvlText w:val=""/>
       <w:lvlJc w:val="left"/>
     </w:lvl>
-    <w:lvl w:ilvl="4" w:tplc="8ADCABA8">
+    <w:lvl w:ilvl="4" w:tplc="52806868">
       <w:numFmt w:val="decimal"/>
       <w:lvlText w:val=""/>
       <w:lvlJc w:val="left"/>
     </w:lvl>
-    <w:lvl w:ilvl="5" w:tplc="D406AC04">
+    <w:lvl w:ilvl="5" w:tplc="B34E5832">
       <w:numFmt w:val="decimal"/>
       <w:lvlText w:val=""/>
       <w:lvlJc w:val="left"/>
     </w:lvl>
-    <w:lvl w:ilvl="6" w:tplc="BBAC3394">
+    <w:lvl w:ilvl="6" w:tplc="D33E6B84">
       <w:numFmt w:val="decimal"/>
       <w:lvlText w:val=""/>
       <w:lvlJc w:val="left"/>
     </w:lvl>
-    <w:lvl w:ilvl="7" w:tplc="2CCE50D0">
+    <w:lvl w:ilvl="7" w:tplc="310E3EA0">
       <w:numFmt w:val="decimal"/>
       <w:lvlText w:val=""/>
       <w:lvlJc w:val="left"/>
     </w:lvl>
-    <w:lvl w:ilvl="8" w:tplc="C9EAB6BA">
+    <w:lvl w:ilvl="8" w:tplc="EAE2922A">
       <w:numFmt w:val="decimal"/>
       <w:lvlText w:val=""/>
       <w:lvlJc w:val="left"/>
     </w:lvl>
   </w:abstractNum>
   <w:abstractNum w:abstractNumId="3" w15:restartNumberingAfterBreak="0">
-    <w:nsid w:val="65CF76A3"/>
+    <w:nsid w:val="545870B1"/>
     <w:multiLevelType w:val="hybridMultilevel"/>
-    <w:tmpl w:val="4CAE3068"/>
-    <w:lvl w:ilvl="0" w:tplc="790C6838">
+    <w:tmpl w:val="245C2FA4"/>
+    <w:lvl w:ilvl="0" w:tplc="153886EA">
       <w:start w:val="1"/>
       <w:numFmt w:val="decimal"/>
       <w:lvlText w:val="%1."/>
@@ -23088,52 +23110,52 @@
         <w:ind w:left="400" w:hanging="300"/>
       </w:pPr>
     </w:lvl>
-    <w:lvl w:ilvl="1" w:tplc="CC9C0D9E">
+    <w:lvl w:ilvl="1" w:tplc="42BEF5F6">
       <w:numFmt w:val="decimal"/>
       <w:lvlText w:val=""/>
       <w:lvlJc w:val="left"/>
     </w:lvl>
-    <w:lvl w:ilvl="2" w:tplc="E1120174">
+    <w:lvl w:ilvl="2" w:tplc="8AE85892">
       <w:numFmt w:val="decimal"/>
       <w:lvlText w:val=""/>
       <w:lvlJc w:val="left"/>
     </w:lvl>
-    <w:lvl w:ilvl="3" w:tplc="FDCC12EC">
+    <w:lvl w:ilvl="3" w:tplc="4C2A50EC">
       <w:numFmt w:val="decimal"/>
       <w:lvlText w:val=""/>
       <w:lvlJc w:val="left"/>
     </w:lvl>
-    <w:lvl w:ilvl="4" w:tplc="5386D5A4">
+    <w:lvl w:ilvl="4" w:tplc="E362EBB6">
       <w:numFmt w:val="decimal"/>
       <w:lvlText w:val=""/>
       <w:lvlJc w:val="left"/>
     </w:lvl>
-    <w:lvl w:ilvl="5" w:tplc="7D443FA4">
+    <w:lvl w:ilvl="5" w:tplc="29D89FF0">
       <w:numFmt w:val="decimal"/>
       <w:lvlText w:val=""/>
       <w:lvlJc w:val="left"/>
     </w:lvl>
-    <w:lvl w:ilvl="6" w:tplc="0122B25C">
+    <w:lvl w:ilvl="6" w:tplc="3034AF48">
       <w:numFmt w:val="decimal"/>
       <w:lvlText w:val=""/>
       <w:lvlJc w:val="left"/>
     </w:lvl>
-    <w:lvl w:ilvl="7" w:tplc="FBD6FBA6">
+    <w:lvl w:ilvl="7" w:tplc="03F2B4DA">
       <w:numFmt w:val="decimal"/>
       <w:lvlText w:val=""/>
       <w:lvlJc w:val="left"/>
     </w:lvl>
-    <w:lvl w:ilvl="8" w:tplc="DBA4C524">
+    <w:lvl w:ilvl="8" w:tplc="B2A04E4A">
       <w:numFmt w:val="decimal"/>
       <w:lvlText w:val=""/>
       <w:lvlJc w:val="left"/>
     </w:lvl>
   </w:abstractNum>
   <w:abstractNum w:abstractNumId="4" w15:restartNumberingAfterBreak="0">
-    <w:nsid w:val="7FCD3C5E"/>
+    <w:nsid w:val="75AA493A"/>
     <w:multiLevelType w:val="hybridMultilevel"/>
-    <w:tmpl w:val="1FFA0A7C"/>
-    <w:lvl w:ilvl="0" w:tplc="91CCEA86">
+    <w:tmpl w:val="0F9C39D6"/>
+    <w:lvl w:ilvl="0" w:tplc="28D243D8">
       <w:start w:val="1"/>
       <w:numFmt w:val="bullet"/>
       <w:lvlText w:val="•"/>
@@ -23142,73 +23164,73 @@
         <w:ind w:left="400" w:hanging="260"/>
       </w:pPr>
     </w:lvl>
-    <w:lvl w:ilvl="1" w:tplc="C5F84E7A">
+    <w:lvl w:ilvl="1" w:tplc="1FEE684C">
       <w:numFmt w:val="decimal"/>
       <w:lvlText w:val=""/>
       <w:lvlJc w:val="left"/>
     </w:lvl>
-    <w:lvl w:ilvl="2" w:tplc="1794CF96">
+    <w:lvl w:ilvl="2" w:tplc="BD74BD4E">
       <w:numFmt w:val="decimal"/>
       <w:lvlText w:val=""/>
       <w:lvlJc w:val="left"/>
     </w:lvl>
-    <w:lvl w:ilvl="3" w:tplc="667655D8">
+    <w:lvl w:ilvl="3" w:tplc="D9006D18">
       <w:numFmt w:val="decimal"/>
       <w:lvlText w:val=""/>
       <w:lvlJc w:val="left"/>
     </w:lvl>
-    <w:lvl w:ilvl="4" w:tplc="CB2E4C22">
+    <w:lvl w:ilvl="4" w:tplc="9C7CCEE4">
       <w:numFmt w:val="decimal"/>
       <w:lvlText w:val=""/>
       <w:lvlJc w:val="left"/>
     </w:lvl>
-    <w:lvl w:ilvl="5" w:tplc="473C3B36">
+    <w:lvl w:ilvl="5" w:tplc="B9B04914">
       <w:numFmt w:val="decimal"/>
       <w:lvlText w:val=""/>
       <w:lvlJc w:val="left"/>
     </w:lvl>
-    <w:lvl w:ilvl="6" w:tplc="F33CD726">
+    <w:lvl w:ilvl="6" w:tplc="E416CE4A">
       <w:numFmt w:val="decimal"/>
       <w:lvlText w:val=""/>
       <w:lvlJc w:val="left"/>
     </w:lvl>
-    <w:lvl w:ilvl="7" w:tplc="82CEBCE2">
+    <w:lvl w:ilvl="7" w:tplc="9D4299F8">
       <w:numFmt w:val="decimal"/>
       <w:lvlText w:val=""/>
       <w:lvlJc w:val="left"/>
     </w:lvl>
-    <w:lvl w:ilvl="8" w:tplc="DC844112">
+    <w:lvl w:ilvl="8" w:tplc="5F7ECCBA">
       <w:numFmt w:val="decimal"/>
       <w:lvlText w:val=""/>
       <w:lvlJc w:val="left"/>
     </w:lvl>
   </w:abstractNum>
-  <w:num w:numId="1" w16cid:durableId="836503378">
+  <w:num w:numId="1" w16cid:durableId="2082561696">
     <w:abstractNumId w:val="1"/>
     <w:lvlOverride w:ilvl="0">
       <w:startOverride w:val="1"/>
     </w:lvlOverride>
   </w:num>
-  <w:num w:numId="2" w16cid:durableId="861934762">
+  <w:num w:numId="2" w16cid:durableId="166210663">
     <w:abstractNumId w:val="2"/>
     <w:lvlOverride w:ilvl="0">
       <w:startOverride w:val="1"/>
     </w:lvlOverride>
   </w:num>
-  <w:num w:numId="3" w16cid:durableId="1124498399">
+  <w:num w:numId="3" w16cid:durableId="1595432162">
     <w:abstractNumId w:val="4"/>
     <w:lvlOverride w:ilvl="0">
       <w:startOverride w:val="1"/>
     </w:lvlOverride>
   </w:num>
-  <w:num w:numId="4" w16cid:durableId="1379427500">
-    <w:abstractNumId w:val="3"/>
+  <w:num w:numId="4" w16cid:durableId="140276727">
+    <w:abstractNumId w:val="0"/>
     <w:lvlOverride w:ilvl="0">
       <w:startOverride w:val="1"/>
     </w:lvlOverride>
   </w:num>
-  <w:num w:numId="5" w16cid:durableId="2074547113">
-    <w:abstractNumId w:val="0"/>
+  <w:num w:numId="5" w16cid:durableId="1820419311">
+    <w:abstractNumId w:val="3"/>
     <w:lvlOverride w:ilvl="0">
       <w:startOverride w:val="1"/>
     </w:lvlOverride>
@@ -23848,7 +23870,7 @@
     <w:autoRedefine/>
     <w:uiPriority w:val="39"/>
     <w:unhideWhenUsed/>
-    <w:rsid w:val="0011116F"/>
+    <w:rsid w:val="00DE7167"/>
     <w:pPr>
       <w:spacing w:after="100"/>
     </w:pPr>
@@ -23860,7 +23882,7 @@
     <w:autoRedefine/>
     <w:uiPriority w:val="39"/>
     <w:unhideWhenUsed/>
-    <w:rsid w:val="0011116F"/>
+    <w:rsid w:val="00DE7167"/>
     <w:pPr>
       <w:spacing w:after="100"/>
       <w:ind w:left="210"/>

</xml_diff>